<commit_message>
more writing, full intro
</commit_message>
<xml_diff>
--- a/Docs/Machine learning applied to otolith timeseries data to discriminate river of origin for Western Alaska Salmon.docx
+++ b/Docs/Machine learning applied to otolith timeseries data to discriminate river of origin for Western Alaska Salmon.docx
@@ -142,19 +142,7 @@
         <w:rPr>
           <w:rFonts w:ascii="Garamond" w:hAnsi="Garamond"/>
         </w:rPr>
-        <w:t>Isotope-based methods have emerged as a promising approach for estimating salmon provenance at relatively fine spatial resolutions, particularly in systems where genetics-based approaches offer coarser estimates relative to the scale of available habitat. Otoliths—ear stones found in teleost fishes—act as natural recorders of isotopic and chemical signals from the environment, continuously incorporating these signals into a metabolically inert calcium carbonate matrix that can be extracted and analyzed post-mortem. As such, otolith chemistry serves as a chronological archive of environmental and life-history conditions, enabling the reconstruction of factors such as growth rate, temperature, metabolic rate, and salinity.</w:t>
-      </w:r>
-      <w:r>
-        <w:rPr>
-          <w:rFonts w:ascii="Garamond" w:hAnsi="Garamond"/>
-        </w:rPr>
-        <w:t xml:space="preserve"> </w:t>
-      </w:r>
-      <w:r>
-        <w:rPr>
-          <w:rFonts w:ascii="Garamond" w:hAnsi="Garamond"/>
-        </w:rPr>
-        <w:t>For provenance applications, one of the most informative tracers is the strontium isotope ratio (</w:t>
+        <w:t>Isotope-based methods have emerged as a promising approach for estimating salmon provenance at relatively fine spatial resolutions, particularly in systems where genetics-based approaches offer coarser estimates relative to the scale of available habitat. Otoliths—ear stones found in teleost fishes—act as natural recorders of isotopic and chemical signals from the environment, continuously incorporating these signals into a metabolically inert calcium carbonate matrix that can be extracted and analyzed post-mortem. As such, otolith chemistry serves as a chronological archive of environmental and life-history conditions, enabling the reconstruction of factors such as growth rate, temperature, metabolic rate, and salinity. For provenance applications, one of the most informative tracers is the strontium isotope ratio (</w:t>
       </w:r>
       <w:r>
         <w:rPr>
@@ -209,31 +197,7 @@
         <w:rPr>
           <w:rFonts w:ascii="Garamond" w:hAnsi="Garamond"/>
         </w:rPr>
-        <w:t xml:space="preserve"> throughout the fish’s life. In most applications, analysts isolate a specific portion of this time series</w:t>
-      </w:r>
-      <w:r>
-        <w:rPr>
-          <w:rFonts w:ascii="Garamond" w:hAnsi="Garamond"/>
-        </w:rPr>
-        <w:t xml:space="preserve">, </w:t>
-      </w:r>
-      <w:r>
-        <w:rPr>
-          <w:rFonts w:ascii="Garamond" w:hAnsi="Garamond"/>
-        </w:rPr>
-        <w:t>such as the natal freshwater rearing period in Pacific salmon</w:t>
-      </w:r>
-      <w:r>
-        <w:rPr>
-          <w:rFonts w:ascii="Garamond" w:hAnsi="Garamond"/>
-        </w:rPr>
-        <w:t xml:space="preserve">, </w:t>
-      </w:r>
-      <w:r>
-        <w:rPr>
-          <w:rFonts w:ascii="Garamond" w:hAnsi="Garamond"/>
-        </w:rPr>
-        <w:t>and compare the corresponding Sr</w:t>
+        <w:t xml:space="preserve"> throughout the fish’s life. In most applications, analysts isolate a specific portion of this time series, such as the natal freshwater rearing period in Pacific salmon, and compare the corresponding Sr</w:t>
       </w:r>
       <w:r>
         <w:rPr>
@@ -257,13 +221,7 @@
         <w:rPr>
           <w:rFonts w:ascii="Garamond" w:hAnsi="Garamond"/>
         </w:rPr>
-        <w:t xml:space="preserve"> value to empirically measured or modeled values across the landscape to estimate geographic origin</w:t>
-      </w:r>
-      <w:r>
-        <w:rPr>
-          <w:rFonts w:ascii="Garamond" w:hAnsi="Garamond"/>
-        </w:rPr>
-        <w:t xml:space="preserve">. </w:t>
+        <w:t xml:space="preserve"> value to empirically measured or modeled values across the landscape to estimate geographic origin. </w:t>
       </w:r>
     </w:p>
     <w:p>
@@ -317,37 +275,7 @@
         <w:rPr>
           <w:rFonts w:ascii="Garamond" w:hAnsi="Garamond"/>
         </w:rPr>
-        <w:t xml:space="preserve"> river basins, this heterogeneity is sufficient to support sub-basin-scale provenance estimates</w:t>
-      </w:r>
-      <w:r>
-        <w:rPr>
-          <w:rFonts w:ascii="Garamond" w:hAnsi="Garamond"/>
-        </w:rPr>
-        <w:t xml:space="preserve"> by </w:t>
-      </w:r>
-      <w:r>
-        <w:rPr>
-          <w:rFonts w:ascii="Garamond" w:hAnsi="Garamond"/>
-        </w:rPr>
-        <w:t>compar</w:t>
-      </w:r>
-      <w:r>
-        <w:rPr>
-          <w:rFonts w:ascii="Garamond" w:hAnsi="Garamond"/>
-        </w:rPr>
-        <w:t>ing extracted natal origin Sr8786 values to Sr8786 values modeled across the</w:t>
-      </w:r>
-      <w:r>
-        <w:rPr>
-          <w:rFonts w:ascii="Garamond" w:hAnsi="Garamond"/>
-        </w:rPr>
-        <w:t xml:space="preserve"> landscape</w:t>
-      </w:r>
-      <w:r>
-        <w:rPr>
-          <w:rFonts w:ascii="Garamond" w:hAnsi="Garamond"/>
-        </w:rPr>
-        <w:t xml:space="preserve"> using methods such as spatial stream network modeling, also called </w:t>
+        <w:t xml:space="preserve"> river basins, this heterogeneity is sufficient to support sub-basin-scale provenance estimates by comparing extracted natal origin Sr8786 values to Sr8786 values modeled across the landscape using methods such as spatial stream network modeling, also called </w:t>
       </w:r>
       <w:proofErr w:type="spellStart"/>
       <w:r>
@@ -361,55 +289,19 @@
         <w:rPr>
           <w:rFonts w:ascii="Garamond" w:hAnsi="Garamond"/>
         </w:rPr>
-        <w:t xml:space="preserve">. </w:t>
-      </w:r>
-      <w:r>
-        <w:rPr>
-          <w:rFonts w:ascii="Garamond" w:hAnsi="Garamond"/>
-        </w:rPr>
-        <w:t xml:space="preserve">However, in larger systems like the Yukon River basin, the vast extent of potential habitat can overwhelm this geochemical signal, leading to redundancy in isotope ratios </w:t>
-      </w:r>
-      <w:r>
-        <w:rPr>
-          <w:rFonts w:ascii="Garamond" w:hAnsi="Garamond"/>
-        </w:rPr>
-        <w:t>at several locations</w:t>
-      </w:r>
-      <w:r>
-        <w:rPr>
-          <w:rFonts w:ascii="Garamond" w:hAnsi="Garamond"/>
-        </w:rPr>
-        <w:t xml:space="preserve">. As a result, individuals </w:t>
-      </w:r>
-      <w:r>
-        <w:rPr>
-          <w:rFonts w:ascii="Garamond" w:hAnsi="Garamond"/>
-        </w:rPr>
-        <w:t xml:space="preserve">may be assigned similar likelihood of provenance to several locations, introducing uncertainty in assignment estimates. </w:t>
-      </w:r>
-      <w:r>
-        <w:rPr>
-          <w:rFonts w:ascii="Garamond" w:hAnsi="Garamond"/>
-        </w:rPr>
-        <w:t>In</w:t>
-      </w:r>
-      <w:r>
-        <w:rPr>
-          <w:rFonts w:ascii="Garamond" w:hAnsi="Garamond"/>
-        </w:rPr>
-        <w:t xml:space="preserve"> some</w:t>
-      </w:r>
-      <w:r>
-        <w:rPr>
-          <w:rFonts w:ascii="Garamond" w:hAnsi="Garamond"/>
-        </w:rPr>
-        <w:t xml:space="preserve"> cases, </w:t>
-      </w:r>
-      <w:r>
-        <w:rPr>
-          <w:rFonts w:ascii="Garamond" w:hAnsi="Garamond"/>
-        </w:rPr>
-        <w:t xml:space="preserve">such is the case for Chinook salmon in the Yukon River-basin, this uncertainty can be resolved by integrating complementary data sources such as genetics-based information to constrain assignments to regions with sufficient geological diversity. </w:t>
+        <w:t xml:space="preserve">. However, in larger systems like the Yukon River basin, the vast extent of potential habitat can overwhelm this geochemical signal, leading to redundancy in isotope ratios at several locations. As a result, individuals may be assigned similar likelihood of provenance to several locations, introducing uncertainty in assignment estimates. In some cases, such is the case for Chinook salmon in the Yukon River-basin, this uncertainty can be resolved by integrating complementary data sources such as genetics-based information to constrain assignments to regions with sufficient geological diversity. </w:t>
+      </w:r>
+      <w:r>
+        <w:rPr>
+          <w:rFonts w:ascii="Garamond" w:hAnsi="Garamond"/>
+        </w:rPr>
+        <w:t xml:space="preserve">For fish sampled in the open ocean, however, the scale of potential habitat includes all three major river-basins and hundreds of thousands of river km. At this spatial scale, significant redundancy in isotope ratios exists in several locations spread across the region. </w:t>
+      </w:r>
+      <w:r>
+        <w:rPr>
+          <w:rFonts w:ascii="Garamond" w:hAnsi="Garamond"/>
+        </w:rPr>
+        <w:t>In addition, genetic data in this region is relatively poor. As a result, provenance estimation to a scale meaningful for management applications is not possible using natal origin isotope data.</w:t>
       </w:r>
     </w:p>
     <w:p>
@@ -417,15 +309,106 @@
         <w:pStyle w:val="NormalWeb"/>
         <w:spacing w:line="480" w:lineRule="auto"/>
         <w:ind w:firstLine="720"/>
-        <w:rPr>
-          <w:rFonts w:ascii="Garamond" w:hAnsi="Garamond"/>
-        </w:rPr>
-      </w:pPr>
-      <w:r>
-        <w:rPr>
-          <w:rFonts w:ascii="Garamond" w:hAnsi="Garamond"/>
-        </w:rPr>
-        <w:t xml:space="preserve">For fish sampled in the open ocean, however, the scale of potential habitat includes all three major river-basins and hundreds of thousands of river km. At this spatial scale, significant redundancy in isotope ratios exists in several locations spread across the region. </w:t>
+      </w:pPr>
+      <w:r>
+        <w:rPr>
+          <w:rFonts w:ascii="Garamond" w:hAnsi="Garamond"/>
+        </w:rPr>
+        <w:lastRenderedPageBreak/>
+        <w:t xml:space="preserve"> </w:t>
+      </w:r>
+      <w:r>
+        <w:t xml:space="preserve">Traditional provenance approaches focus narrowly on extracting natal origin signatures from a discrete portion of the otolith record. However, otolith LA-ICPMS profiles contain a wealth of additional information, including signatures from subsequent freshwater environments and data reflecting outmigration pathways from natal sites to marine waters. This signal is </w:t>
+      </w:r>
+      <w:r>
+        <w:t>often obscured</w:t>
+      </w:r>
+      <w:r>
+        <w:t xml:space="preserve"> as fish move</w:t>
+      </w:r>
+      <w:r>
+        <w:t xml:space="preserve"> too</w:t>
+      </w:r>
+      <w:r>
+        <w:t xml:space="preserve"> rapidly through multiple environments</w:t>
+      </w:r>
+      <w:r>
+        <w:t xml:space="preserve"> for otolith Sr8786 to fully equilibrate to the new water chemistry in each environment. The result are timeseries with subtle but meaningful patterns, with underlying states that cannot be directly compared to </w:t>
+      </w:r>
+      <w:proofErr w:type="spellStart"/>
+      <w:r>
+        <w:t>isoscape</w:t>
+      </w:r>
+      <w:proofErr w:type="spellEnd"/>
+      <w:r>
+        <w:t xml:space="preserve"> values. Hidden in these patterns, however, may be watershed-specific life history characteristics which </w:t>
+      </w:r>
+      <w:r>
+        <w:t xml:space="preserve">can be found in the relationship between multiple, subtle patterns across the timeseries. However, because these values do not directly reflect ambient water chemistry, manual comparison to the </w:t>
+      </w:r>
+      <w:proofErr w:type="spellStart"/>
+      <w:r>
+        <w:t>isoscape</w:t>
+      </w:r>
+      <w:proofErr w:type="spellEnd"/>
+      <w:r>
+        <w:t xml:space="preserve"> to elucidate potential pathways and discriminate among rivers is not always possible. </w:t>
+      </w:r>
+    </w:p>
+    <w:p>
+      <w:pPr>
+        <w:pStyle w:val="NormalWeb"/>
+        <w:spacing w:line="480" w:lineRule="auto"/>
+        <w:ind w:firstLine="720"/>
+      </w:pPr>
+      <w:r>
+        <w:t>The rapid proliferation of machine learning tools across scientific disciplines, driven by reduced computational requirements and their capacity to detect meaningful patterns in complex datasets, offers new opportunities for otolith-based analysis. Recent applications of machine learning to otolith classification problems have demonstrated superior performance compared to traditional approaches such as linear discriminant analysis. Simultaneously, researchers have begun recognizing the analytical power of incorporating complete otolith LA-ICPMS profiles rather than single-point extractions, using temporal patterns throughout the entire life history record to distinguish between populations. The integration of full otolith time series with advanced machine learning methods presents a promising avenue for uncovering population-specific patterns and enhancing classification accuracy when natal origin values alone prove insufficient for reliable provenance estimation.</w:t>
+      </w:r>
+      <w:r>
+        <w:t xml:space="preserve"> </w:t>
+      </w:r>
+      <w:r>
+        <w:t xml:space="preserve">Here, we demonstrate the capacity of machine </w:t>
+      </w:r>
+      <w:r>
+        <w:lastRenderedPageBreak/>
+        <w:t>learning approaches</w:t>
+      </w:r>
+      <w:r>
+        <w:t xml:space="preserve"> </w:t>
+      </w:r>
+      <w:r>
+        <w:t>including random forest classification and principal component analysis</w:t>
+      </w:r>
+      <w:r>
+        <w:t xml:space="preserve"> </w:t>
+      </w:r>
+      <w:r>
+        <w:t xml:space="preserve">to identify and exploit subtle patterns in complete otolith time series for classifying river of origin among Chinook salmon from Western Alaska. </w:t>
+      </w:r>
+      <w:r>
+        <w:t xml:space="preserve">In doing so, we </w:t>
+      </w:r>
+      <w:r>
+        <w:t xml:space="preserve">illustrate both the opportunities created by applying </w:t>
+      </w:r>
+      <w:r>
+        <w:t xml:space="preserve">emerging data science tools </w:t>
+      </w:r>
+      <w:r>
+        <w:t xml:space="preserve">to complex ecological datasets </w:t>
+      </w:r>
+      <w:r>
+        <w:t xml:space="preserve">as well as the </w:t>
+      </w:r>
+      <w:r>
+        <w:t xml:space="preserve">enhanced discriminatory power achieved by leveraging full otolith profiles rather than discrete natal origin </w:t>
+      </w:r>
+      <w:r>
+        <w:t>values</w:t>
+      </w:r>
+      <w:r>
+        <w:t>.</w:t>
       </w:r>
     </w:p>
     <w:p>
@@ -447,121 +430,6 @@
     <w:p>
       <w:pPr>
         <w:spacing w:line="480" w:lineRule="auto"/>
-        <w:ind w:firstLine="720"/>
-        <w:rPr>
-          <w:rFonts w:ascii="Garamond" w:hAnsi="Garamond"/>
-          <w:sz w:val="22"/>
-          <w:szCs w:val="22"/>
-        </w:rPr>
-      </w:pPr>
-      <w:r>
-        <w:rPr>
-          <w:rFonts w:ascii="Garamond" w:hAnsi="Garamond"/>
-          <w:sz w:val="22"/>
-          <w:szCs w:val="22"/>
-        </w:rPr>
-        <w:t xml:space="preserve">There’s a lot of data missed </w:t>
-      </w:r>
-    </w:p>
-    <w:p>
-      <w:pPr>
-        <w:spacing w:line="480" w:lineRule="auto"/>
-        <w:ind w:firstLine="720"/>
-        <w:rPr>
-          <w:rFonts w:ascii="Garamond" w:hAnsi="Garamond"/>
-          <w:sz w:val="22"/>
-          <w:szCs w:val="22"/>
-        </w:rPr>
-      </w:pPr>
-      <w:r>
-        <w:rPr>
-          <w:rFonts w:ascii="Garamond" w:hAnsi="Garamond"/>
-          <w:sz w:val="22"/>
-          <w:szCs w:val="22"/>
-        </w:rPr>
-        <w:t xml:space="preserve">Although there are redundancies in </w:t>
-      </w:r>
-    </w:p>
-    <w:p>
-      <w:pPr>
-        <w:spacing w:line="480" w:lineRule="auto"/>
-        <w:ind w:firstLine="720"/>
-        <w:rPr>
-          <w:rFonts w:ascii="Garamond" w:hAnsi="Garamond"/>
-          <w:sz w:val="22"/>
-          <w:szCs w:val="22"/>
-        </w:rPr>
-      </w:pPr>
-      <w:r>
-        <w:rPr>
-          <w:rFonts w:ascii="Garamond" w:hAnsi="Garamond"/>
-          <w:sz w:val="22"/>
-          <w:szCs w:val="22"/>
-        </w:rPr>
-        <w:t xml:space="preserve">Other people are starting to think about the full timeseries </w:t>
-      </w:r>
-    </w:p>
-    <w:p>
-      <w:pPr>
-        <w:spacing w:line="480" w:lineRule="auto"/>
-        <w:ind w:firstLine="720"/>
-        <w:rPr>
-          <w:rFonts w:ascii="Garamond" w:hAnsi="Garamond"/>
-          <w:sz w:val="22"/>
-          <w:szCs w:val="22"/>
-        </w:rPr>
-      </w:pPr>
-      <w:r>
-        <w:rPr>
-          <w:rFonts w:ascii="Garamond" w:hAnsi="Garamond"/>
-          <w:sz w:val="22"/>
-          <w:szCs w:val="22"/>
-        </w:rPr>
-        <w:t xml:space="preserve">Otolith data in large watersheds may contain any number of potential state combinations, but there may be nearly indistinguishable changes that records watershed specific life history characteristics </w:t>
-      </w:r>
-    </w:p>
-    <w:p>
-      <w:pPr>
-        <w:spacing w:line="480" w:lineRule="auto"/>
-        <w:ind w:firstLine="720"/>
-        <w:rPr>
-          <w:rFonts w:ascii="Garamond" w:hAnsi="Garamond"/>
-          <w:sz w:val="22"/>
-          <w:szCs w:val="22"/>
-        </w:rPr>
-      </w:pPr>
-      <w:r>
-        <w:rPr>
-          <w:rFonts w:ascii="Garamond" w:hAnsi="Garamond"/>
-          <w:sz w:val="22"/>
-          <w:szCs w:val="22"/>
-        </w:rPr>
-        <w:t xml:space="preserve">There is also a movement towards more rigorous machine learning and data science tools alongside ecological data. </w:t>
-      </w:r>
-    </w:p>
-    <w:p>
-      <w:pPr>
-        <w:spacing w:line="480" w:lineRule="auto"/>
-        <w:ind w:firstLine="720"/>
-        <w:rPr>
-          <w:rFonts w:ascii="Garamond" w:hAnsi="Garamond"/>
-          <w:sz w:val="22"/>
-          <w:szCs w:val="22"/>
-        </w:rPr>
-      </w:pPr>
-      <w:r>
-        <w:rPr>
-          <w:rFonts w:ascii="Garamond" w:hAnsi="Garamond"/>
-          <w:sz w:val="22"/>
-          <w:szCs w:val="22"/>
-        </w:rPr>
-        <w:t xml:space="preserve">In otoliths, this is just now beginning to be explored. </w:t>
-      </w:r>
-    </w:p>
-    <w:p>
-      <w:pPr>
-        <w:spacing w:line="480" w:lineRule="auto"/>
-        <w:ind w:firstLine="720"/>
         <w:rPr>
           <w:rFonts w:ascii="Garamond" w:hAnsi="Garamond"/>
           <w:sz w:val="22"/>
@@ -704,8 +572,16 @@
           <w:kern w:val="0"/>
           <w14:ligatures w14:val="none"/>
         </w:rPr>
+        <w:t xml:space="preserve">To assess the provenance of Chinook salmon, researchers have historically relied on otolith geochemistry, particularly strontium isotope ratios (⁸⁷Sr/⁸⁶Sr), to assign fish to natal origins. In </w:t>
+      </w:r>
+      <w:r>
+        <w:rPr>
+          <w:rFonts w:ascii="Times New Roman" w:eastAsia="Times New Roman" w:hAnsi="Times New Roman" w:cs="Times New Roman"/>
+          <w:kern w:val="0"/>
+          <w14:ligatures w14:val="none"/>
+        </w:rPr>
         <w:lastRenderedPageBreak/>
-        <w:t>To assess the provenance of Chinook salmon, researchers have historically relied on otolith geochemistry, particularly strontium isotope ratios (⁸⁷Sr/⁸⁶Sr), to assign fish to natal origins. In freshwater environments, otoliths can reliably distinguish among sub-basins due to the geochemical heterogeneity of the landscape. Fish caught in test fisheries at the mouths of major tributaries, for instance, can be assigned to specific upstream regions within a basin based on their otolith signatures. When paired with genetic data, these isotope-based approaches offer high resolution and accuracy at the sub-basin scale.</w:t>
+        <w:t>freshwater environments, otoliths can reliably distinguish among sub-basins due to the geochemical heterogeneity of the landscape. Fish caught in test fisheries at the mouths of major tributaries, for instance, can be assigned to specific upstream regions within a basin based on their otolith signatures. When paired with genetic data, these isotope-based approaches offer high resolution and accuracy at the sub-basin scale.</w:t>
       </w:r>
     </w:p>
     <w:p>

</xml_diff>

<commit_message>
up to ML Classifiers in Methods
</commit_message>
<xml_diff>
--- a/Docs/Machine learning applied to otolith timeseries data to discriminate river of origin for Western Alaska Salmon.docx
+++ b/Docs/Machine learning applied to otolith timeseries data to discriminate river of origin for Western Alaska Salmon.docx
@@ -693,16 +693,6 @@
         <w:t>individuals. Combining these approaches may allow for uncovering watershed- or stock-specific patterns in the complete record of individual life history, which may otherwise be obscured by noise. Here, we apply machine learning classification algorithms to otolith time series from Chinook salmon in western Alaska with known watershed labels to 1) test the potential of using machine learning tools alongside otolith time series data to discriminate among otherwise indistinguishable stocks and 2) develop a classification model to estimate river of origin for marine-caught Chinook salmon from western Alaska</w:t>
       </w:r>
     </w:p>
-    <w:p/>
-    <w:p>
-      <w:pPr>
-        <w:rPr>
-          <w:rFonts w:ascii="Garamond" w:hAnsi="Garamond"/>
-          <w:sz w:val="21"/>
-          <w:szCs w:val="21"/>
-        </w:rPr>
-      </w:pPr>
-    </w:p>
     <w:p>
       <w:pPr>
         <w:rPr>
@@ -711,13 +701,1017 @@
           <w:szCs w:val="32"/>
         </w:rPr>
       </w:pPr>
-      <w:r>
-        <w:rPr>
-          <w:rFonts w:ascii="Garamond" w:hAnsi="Garamond"/>
+    </w:p>
+    <w:p>
+      <w:pPr>
+        <w:rPr>
+          <w:rFonts w:ascii="Garamond" w:hAnsi="Garamond"/>
+          <w:b/>
+          <w:bCs/>
           <w:sz w:val="32"/>
           <w:szCs w:val="32"/>
+          <w:u w:val="single"/>
+        </w:rPr>
+      </w:pPr>
+      <w:r>
+        <w:rPr>
+          <w:rFonts w:ascii="Garamond" w:hAnsi="Garamond"/>
+          <w:b/>
+          <w:bCs/>
+          <w:sz w:val="32"/>
+          <w:szCs w:val="32"/>
+          <w:u w:val="single"/>
         </w:rPr>
         <w:t xml:space="preserve">Methods </w:t>
+      </w:r>
+    </w:p>
+    <w:p>
+      <w:pPr>
+        <w:spacing w:line="480" w:lineRule="auto"/>
+        <w:rPr>
+          <w:rFonts w:ascii="Garamond" w:hAnsi="Garamond"/>
+          <w:b/>
+          <w:bCs/>
+          <w:sz w:val="22"/>
+          <w:szCs w:val="22"/>
+          <w:u w:val="single"/>
+        </w:rPr>
+      </w:pPr>
+      <w:r>
+        <w:rPr>
+          <w:rFonts w:ascii="Garamond" w:hAnsi="Garamond"/>
+          <w:b/>
+          <w:bCs/>
+          <w:sz w:val="22"/>
+          <w:szCs w:val="22"/>
+          <w:u w:val="single"/>
+        </w:rPr>
+        <w:t xml:space="preserve">Otolith sample set and laboratory processing </w:t>
+      </w:r>
+    </w:p>
+    <w:p>
+      <w:pPr>
+        <w:spacing w:line="480" w:lineRule="auto"/>
+        <w:ind w:firstLine="720"/>
+        <w:rPr>
+          <w:rFonts w:ascii="Garamond" w:hAnsi="Garamond"/>
+          <w:sz w:val="22"/>
+          <w:szCs w:val="22"/>
+        </w:rPr>
+      </w:pPr>
+      <w:r>
+        <w:rPr>
+          <w:rFonts w:ascii="Garamond" w:hAnsi="Garamond"/>
+          <w:sz w:val="22"/>
+          <w:szCs w:val="22"/>
+        </w:rPr>
+        <w:t xml:space="preserve">Chinook salmon otoliths were collected from the downstream terminus of the Yukon, Kuskokwim, and </w:t>
+      </w:r>
+      <w:proofErr w:type="spellStart"/>
+      <w:r>
+        <w:rPr>
+          <w:rFonts w:ascii="Garamond" w:hAnsi="Garamond"/>
+          <w:sz w:val="22"/>
+          <w:szCs w:val="22"/>
+        </w:rPr>
+        <w:t>Nushagak</w:t>
+      </w:r>
+      <w:proofErr w:type="spellEnd"/>
+      <w:r>
+        <w:rPr>
+          <w:rFonts w:ascii="Garamond" w:hAnsi="Garamond"/>
+          <w:sz w:val="22"/>
+          <w:szCs w:val="22"/>
+        </w:rPr>
+        <w:t xml:space="preserve"> river basins as follows: </w:t>
+      </w:r>
+      <w:proofErr w:type="spellStart"/>
+      <w:r>
+        <w:rPr>
+          <w:rFonts w:ascii="Garamond" w:hAnsi="Garamond"/>
+          <w:sz w:val="22"/>
+          <w:szCs w:val="22"/>
+        </w:rPr>
+        <w:t>Nushagak</w:t>
+      </w:r>
+      <w:proofErr w:type="spellEnd"/>
+      <w:r>
+        <w:rPr>
+          <w:rFonts w:ascii="Garamond" w:hAnsi="Garamond"/>
+          <w:sz w:val="22"/>
+          <w:szCs w:val="22"/>
+        </w:rPr>
+        <w:t xml:space="preserve"> (2011, 2014, 2015), Kuskokwim (2017–2022), and Yukon (2015, 2016, 2019–2021). Fish were sampled through collaborative efforts with ADFG at the Lower Yukon Test Fishery, ONC at the Bethel Test Fishery, and </w:t>
+      </w:r>
+      <w:r>
+        <w:rPr>
+          <w:rStyle w:val="Emphasis"/>
+          <w:rFonts w:ascii="Garamond" w:hAnsi="Garamond"/>
+          <w:sz w:val="22"/>
+          <w:szCs w:val="22"/>
+        </w:rPr>
+        <w:t>[</w:t>
+      </w:r>
+      <w:proofErr w:type="spellStart"/>
+      <w:r>
+        <w:rPr>
+          <w:rStyle w:val="Emphasis"/>
+          <w:rFonts w:ascii="Garamond" w:hAnsi="Garamond"/>
+          <w:sz w:val="22"/>
+          <w:szCs w:val="22"/>
+        </w:rPr>
+        <w:t>Nushagak</w:t>
+      </w:r>
+      <w:proofErr w:type="spellEnd"/>
+      <w:r>
+        <w:rPr>
+          <w:rStyle w:val="Emphasis"/>
+          <w:rFonts w:ascii="Garamond" w:hAnsi="Garamond"/>
+          <w:sz w:val="22"/>
+          <w:szCs w:val="22"/>
+        </w:rPr>
+        <w:t>]</w:t>
+      </w:r>
+      <w:r>
+        <w:rPr>
+          <w:rFonts w:ascii="Garamond" w:hAnsi="Garamond"/>
+          <w:sz w:val="22"/>
+          <w:szCs w:val="22"/>
+        </w:rPr>
+        <w:t xml:space="preserve">. Approximately 500 otoliths were collected each year, and from these, ~250 otoliths from each year were selected for further analysis. Selected samples were then cut along the transverse plane </w:t>
+      </w:r>
+      <w:r>
+        <w:rPr>
+          <w:rFonts w:ascii="Garamond" w:hAnsi="Garamond"/>
+          <w:sz w:val="22"/>
+          <w:szCs w:val="22"/>
+        </w:rPr>
+        <w:t xml:space="preserve">to reveal the core </w:t>
+      </w:r>
+      <w:r>
+        <w:rPr>
+          <w:rFonts w:ascii="Garamond" w:hAnsi="Garamond"/>
+          <w:sz w:val="22"/>
+          <w:szCs w:val="22"/>
+        </w:rPr>
+        <w:t xml:space="preserve">using a </w:t>
+      </w:r>
+      <w:proofErr w:type="gramStart"/>
+      <w:r>
+        <w:rPr>
+          <w:rFonts w:ascii="Garamond" w:hAnsi="Garamond"/>
+          <w:sz w:val="22"/>
+          <w:szCs w:val="22"/>
+        </w:rPr>
+        <w:t>low-speed</w:t>
+      </w:r>
+      <w:proofErr w:type="gramEnd"/>
+      <w:r>
+        <w:rPr>
+          <w:rFonts w:ascii="Garamond" w:hAnsi="Garamond"/>
+          <w:sz w:val="22"/>
+          <w:szCs w:val="22"/>
+        </w:rPr>
+        <w:t xml:space="preserve"> </w:t>
+      </w:r>
+      <w:proofErr w:type="spellStart"/>
+      <w:r>
+        <w:rPr>
+          <w:rFonts w:ascii="Garamond" w:hAnsi="Garamond"/>
+          <w:sz w:val="22"/>
+          <w:szCs w:val="22"/>
+        </w:rPr>
+        <w:t>isomet</w:t>
+      </w:r>
+      <w:proofErr w:type="spellEnd"/>
+      <w:r>
+        <w:rPr>
+          <w:rFonts w:ascii="Garamond" w:hAnsi="Garamond"/>
+          <w:sz w:val="22"/>
+          <w:szCs w:val="22"/>
+        </w:rPr>
+        <w:t xml:space="preserve"> saw, mounted on microscope slides, and polished to enhance clarity of the growth structure. Otoliths were analyzed using Laser Ablation Inductively Coupled Plasma Mass Spectrometry at the University of Utah Strontium Metals Lab, except for the 2021 Kuskokwim samples, which were processed at the Keck Lab at Oregon State University.</w:t>
+      </w:r>
+      <w:r>
+        <w:rPr>
+          <w:rFonts w:ascii="Garamond" w:hAnsi="Garamond"/>
+          <w:sz w:val="22"/>
+          <w:szCs w:val="22"/>
+        </w:rPr>
+        <w:t xml:space="preserve"> </w:t>
+      </w:r>
+      <w:r>
+        <w:rPr>
+          <w:rFonts w:ascii="Garamond" w:hAnsi="Garamond"/>
+          <w:sz w:val="22"/>
+          <w:szCs w:val="22"/>
+        </w:rPr>
+        <w:t>Laser ablation lines were analyzed from the core to the _______ along the growth axis of the otolith until just after entry to the marine environment, which was identified by the dark annulus indicative of marine entry.</w:t>
+      </w:r>
+    </w:p>
+    <w:p>
+      <w:pPr>
+        <w:rPr>
+          <w:rFonts w:ascii="Garamond" w:hAnsi="Garamond"/>
+          <w:b/>
+          <w:bCs/>
+          <w:sz w:val="22"/>
+          <w:szCs w:val="22"/>
+          <w:u w:val="single"/>
+        </w:rPr>
+      </w:pPr>
+      <w:r>
+        <w:rPr>
+          <w:rFonts w:ascii="Garamond" w:hAnsi="Garamond"/>
+          <w:b/>
+          <w:bCs/>
+          <w:sz w:val="22"/>
+          <w:szCs w:val="22"/>
+          <w:u w:val="single"/>
+        </w:rPr>
+        <w:t xml:space="preserve">Data preprocessing </w:t>
+      </w:r>
+    </w:p>
+    <w:p>
+      <w:pPr>
+        <w:spacing w:line="480" w:lineRule="auto"/>
+        <w:ind w:firstLine="720"/>
+        <w:rPr>
+          <w:rFonts w:ascii="Garamond" w:hAnsi="Garamond"/>
+          <w:sz w:val="22"/>
+          <w:szCs w:val="22"/>
+        </w:rPr>
+      </w:pPr>
+      <w:r>
+        <w:rPr>
+          <w:rStyle w:val="Strong"/>
+          <w:rFonts w:ascii="Garamond" w:hAnsi="Garamond"/>
+          <w:b w:val="0"/>
+          <w:bCs w:val="0"/>
+          <w:sz w:val="22"/>
+          <w:szCs w:val="22"/>
+        </w:rPr>
+        <w:t>Because data were collected and analyzed by several different people over the course of the dataset, there is</w:t>
+      </w:r>
+      <w:r>
+        <w:rPr>
+          <w:rFonts w:ascii="Garamond" w:hAnsi="Garamond"/>
+          <w:sz w:val="22"/>
+          <w:szCs w:val="22"/>
+        </w:rPr>
+        <w:t xml:space="preserve"> significant variation in the length and location of ablation lines relative to the lifespan of the fish. To standardize all data to the same life history period, time series were trimmed to between the location of the core and the onset of marine residence. These locations on the otolith time series were identified by </w:t>
+      </w:r>
+      <w:r>
+        <w:rPr>
+          <w:rFonts w:ascii="Garamond" w:hAnsi="Garamond"/>
+          <w:sz w:val="22"/>
+          <w:szCs w:val="22"/>
+        </w:rPr>
+        <w:lastRenderedPageBreak/>
+        <w:t xml:space="preserve">examining patterns in </w:t>
+      </w:r>
+      <w:r>
+        <w:rPr>
+          <w:rFonts w:ascii="Cambria Math" w:hAnsi="Cambria Math" w:cs="Cambria Math"/>
+          <w:sz w:val="22"/>
+          <w:szCs w:val="22"/>
+        </w:rPr>
+        <w:t>⁸⁷</w:t>
+      </w:r>
+      <w:r>
+        <w:rPr>
+          <w:rFonts w:ascii="Garamond" w:hAnsi="Garamond"/>
+          <w:sz w:val="22"/>
+          <w:szCs w:val="22"/>
+        </w:rPr>
+        <w:t>Sr/</w:t>
+      </w:r>
+      <w:r>
+        <w:rPr>
+          <w:rFonts w:ascii="Cambria Math" w:hAnsi="Cambria Math" w:cs="Cambria Math"/>
+          <w:sz w:val="22"/>
+          <w:szCs w:val="22"/>
+        </w:rPr>
+        <w:t>⁸⁶</w:t>
+      </w:r>
+      <w:r>
+        <w:rPr>
+          <w:rFonts w:ascii="Garamond" w:hAnsi="Garamond"/>
+          <w:sz w:val="22"/>
+          <w:szCs w:val="22"/>
+        </w:rPr>
+        <w:t xml:space="preserve">Sr, </w:t>
+      </w:r>
+      <w:r>
+        <w:rPr>
+          <w:rFonts w:ascii="Cambria Math" w:hAnsi="Cambria Math" w:cs="Cambria Math"/>
+          <w:sz w:val="22"/>
+          <w:szCs w:val="22"/>
+        </w:rPr>
+        <w:t>⁸⁸</w:t>
+      </w:r>
+      <w:r>
+        <w:rPr>
+          <w:rFonts w:ascii="Garamond" w:hAnsi="Garamond"/>
+          <w:sz w:val="22"/>
+          <w:szCs w:val="22"/>
+        </w:rPr>
+        <w:t xml:space="preserve">Sr, and morphological features along the laser ablation line. The location closest to the core was identified by a general increase in </w:t>
+      </w:r>
+      <w:r>
+        <w:rPr>
+          <w:rFonts w:ascii="Cambria Math" w:hAnsi="Cambria Math" w:cs="Cambria Math"/>
+          <w:sz w:val="22"/>
+          <w:szCs w:val="22"/>
+        </w:rPr>
+        <w:t>⁸⁸</w:t>
+      </w:r>
+      <w:r>
+        <w:rPr>
+          <w:rFonts w:ascii="Garamond" w:hAnsi="Garamond"/>
+          <w:sz w:val="22"/>
+          <w:szCs w:val="22"/>
+        </w:rPr>
+        <w:t xml:space="preserve">Sr and a signal closer to the marine value (0.7092) compared to the freshwater region. Similarly, marine entry was identified as the portion of the time series immediately following the characteristic increase in </w:t>
+      </w:r>
+      <w:r>
+        <w:rPr>
+          <w:rFonts w:ascii="Cambria Math" w:hAnsi="Cambria Math" w:cs="Cambria Math"/>
+          <w:sz w:val="22"/>
+          <w:szCs w:val="22"/>
+        </w:rPr>
+        <w:t>⁸⁸</w:t>
+      </w:r>
+      <w:r>
+        <w:rPr>
+          <w:rFonts w:ascii="Garamond" w:hAnsi="Garamond"/>
+          <w:sz w:val="22"/>
+          <w:szCs w:val="22"/>
+        </w:rPr>
+        <w:t xml:space="preserve">Sr indicative of marine entry, as well as a shift in </w:t>
+      </w:r>
+      <w:r>
+        <w:rPr>
+          <w:rFonts w:ascii="Cambria Math" w:hAnsi="Cambria Math" w:cs="Cambria Math"/>
+          <w:sz w:val="22"/>
+          <w:szCs w:val="22"/>
+        </w:rPr>
+        <w:t>⁸⁷</w:t>
+      </w:r>
+      <w:r>
+        <w:rPr>
+          <w:rFonts w:ascii="Garamond" w:hAnsi="Garamond"/>
+          <w:sz w:val="22"/>
+          <w:szCs w:val="22"/>
+        </w:rPr>
+        <w:t>Sr/</w:t>
+      </w:r>
+      <w:r>
+        <w:rPr>
+          <w:rFonts w:ascii="Cambria Math" w:hAnsi="Cambria Math" w:cs="Cambria Math"/>
+          <w:sz w:val="22"/>
+          <w:szCs w:val="22"/>
+        </w:rPr>
+        <w:t>⁸⁶</w:t>
+      </w:r>
+      <w:r>
+        <w:rPr>
+          <w:rFonts w:ascii="Garamond" w:hAnsi="Garamond"/>
+          <w:sz w:val="22"/>
+          <w:szCs w:val="22"/>
+        </w:rPr>
+        <w:t>Sr to the marine strontium value. For all otoliths, the selection of trimming locations was randomized and blinded to avoid confounding by expected patterns or repeated patterns within a single class.</w:t>
+      </w:r>
+      <w:r>
+        <w:rPr>
+          <w:rFonts w:ascii="Garamond" w:hAnsi="Garamond"/>
+          <w:sz w:val="22"/>
+          <w:szCs w:val="22"/>
+        </w:rPr>
+        <w:t xml:space="preserve"> </w:t>
+      </w:r>
+      <w:r>
+        <w:rPr>
+          <w:rFonts w:ascii="Garamond" w:hAnsi="Garamond"/>
+          <w:sz w:val="22"/>
+          <w:szCs w:val="22"/>
+        </w:rPr>
+        <w:t>The location o</w:t>
+      </w:r>
+      <w:r>
+        <w:rPr>
+          <w:rFonts w:ascii="Garamond" w:hAnsi="Garamond"/>
+          <w:sz w:val="22"/>
+          <w:szCs w:val="22"/>
+        </w:rPr>
+        <w:t xml:space="preserve">f these trimming locations as well as the selected region of the natal origin signature were manually </w:t>
+      </w:r>
+      <w:proofErr w:type="spellStart"/>
+      <w:r>
+        <w:rPr>
+          <w:rFonts w:ascii="Garamond" w:hAnsi="Garamond"/>
+          <w:sz w:val="22"/>
+          <w:szCs w:val="22"/>
+        </w:rPr>
+        <w:t>QCd</w:t>
+      </w:r>
+      <w:proofErr w:type="spellEnd"/>
+      <w:r>
+        <w:rPr>
+          <w:rFonts w:ascii="Garamond" w:hAnsi="Garamond"/>
+          <w:sz w:val="22"/>
+          <w:szCs w:val="22"/>
+        </w:rPr>
+        <w:t xml:space="preserve"> for all individuals. Individuals with large errors from sample prep or laser ablation (i.e. large cracks</w:t>
+      </w:r>
+      <w:proofErr w:type="gramStart"/>
+      <w:r>
+        <w:rPr>
+          <w:rFonts w:ascii="Garamond" w:hAnsi="Garamond"/>
+          <w:sz w:val="22"/>
+          <w:szCs w:val="22"/>
+        </w:rPr>
+        <w:t>) ,</w:t>
+      </w:r>
+      <w:proofErr w:type="gramEnd"/>
+      <w:r>
+        <w:rPr>
+          <w:rFonts w:ascii="Garamond" w:hAnsi="Garamond"/>
+          <w:sz w:val="22"/>
+          <w:szCs w:val="22"/>
+        </w:rPr>
+        <w:t xml:space="preserve"> unclear marine entry, or no core signal were removed from the dataset. </w:t>
+      </w:r>
+    </w:p>
+    <w:p>
+      <w:pPr>
+        <w:spacing w:line="480" w:lineRule="auto"/>
+        <w:ind w:firstLine="720"/>
+        <w:rPr>
+          <w:rFonts w:ascii="Garamond" w:hAnsi="Garamond"/>
+          <w:sz w:val="22"/>
+          <w:szCs w:val="22"/>
+        </w:rPr>
+      </w:pPr>
+      <w:r>
+        <w:rPr>
+          <w:rFonts w:ascii="Garamond" w:hAnsi="Garamond"/>
+          <w:sz w:val="22"/>
+          <w:szCs w:val="22"/>
+        </w:rPr>
+        <w:t xml:space="preserve">Otolith data from LA-ICPMS analysis contains significant machine error, which can obscure subtle changes in </w:t>
+      </w:r>
+      <w:r>
+        <w:rPr>
+          <w:rFonts w:ascii="Cambria Math" w:hAnsi="Cambria Math" w:cs="Cambria Math"/>
+          <w:sz w:val="22"/>
+          <w:szCs w:val="22"/>
+        </w:rPr>
+        <w:t>⁸⁷</w:t>
+      </w:r>
+      <w:r>
+        <w:rPr>
+          <w:rFonts w:ascii="Garamond" w:hAnsi="Garamond"/>
+          <w:sz w:val="22"/>
+          <w:szCs w:val="22"/>
+        </w:rPr>
+        <w:t>Sr/</w:t>
+      </w:r>
+      <w:r>
+        <w:rPr>
+          <w:rFonts w:ascii="Cambria Math" w:hAnsi="Cambria Math" w:cs="Cambria Math"/>
+          <w:sz w:val="22"/>
+          <w:szCs w:val="22"/>
+        </w:rPr>
+        <w:t>⁸⁶</w:t>
+      </w:r>
+      <w:r>
+        <w:rPr>
+          <w:rFonts w:ascii="Garamond" w:hAnsi="Garamond"/>
+          <w:sz w:val="22"/>
+          <w:szCs w:val="22"/>
+        </w:rPr>
+        <w:t xml:space="preserve">Sr ratios that are critical for interpretation. To address this challenge and reveal underlying patterns, researchers commonly apply time series smoothing techniques to these datasets. We tested whether such smoothing could improve model performance by applying two </w:t>
+      </w:r>
+      <w:r>
+        <w:rPr>
+          <w:rFonts w:ascii="Garamond" w:hAnsi="Garamond"/>
+          <w:sz w:val="22"/>
+          <w:szCs w:val="22"/>
+        </w:rPr>
+        <w:t>commonly used</w:t>
+      </w:r>
+      <w:r>
+        <w:rPr>
+          <w:rFonts w:ascii="Garamond" w:hAnsi="Garamond"/>
+          <w:sz w:val="22"/>
+          <w:szCs w:val="22"/>
+        </w:rPr>
+        <w:t xml:space="preserve"> approaches: moving average (MA) and a generalized additive model (GAM)</w:t>
+      </w:r>
+      <w:r>
+        <w:rPr>
+          <w:rFonts w:ascii="Garamond" w:hAnsi="Garamond"/>
+          <w:sz w:val="22"/>
+          <w:szCs w:val="22"/>
+        </w:rPr>
+        <w:t xml:space="preserve"> timeseries smoothing. Moving average smoothing used a simple </w:t>
+      </w:r>
+      <w:proofErr w:type="gramStart"/>
+      <w:r>
+        <w:rPr>
+          <w:rFonts w:ascii="Garamond" w:hAnsi="Garamond"/>
+          <w:sz w:val="22"/>
+          <w:szCs w:val="22"/>
+        </w:rPr>
+        <w:t>60 point</w:t>
+      </w:r>
+      <w:proofErr w:type="gramEnd"/>
+      <w:r>
+        <w:rPr>
+          <w:rFonts w:ascii="Garamond" w:hAnsi="Garamond"/>
+          <w:sz w:val="22"/>
+          <w:szCs w:val="22"/>
+        </w:rPr>
+        <w:t xml:space="preserve"> window with center weighting. The GAM approach used fitted thin-plate regression and penalized iteratively re-weighted least squared (P-IRLS) to maximize goodness of fit. A GCV method was used to minimize over fitting (Wood, 2006). The maximum degrees of freedom (k) were scaled by the number of data points in each ablation line (n) by k = 10N </w:t>
+      </w:r>
+      <w:r>
+        <w:rPr>
+          <w:rFonts w:ascii="Garamond" w:hAnsi="Garamond"/>
+          <w:sz w:val="22"/>
+          <w:szCs w:val="22"/>
+          <w:vertAlign w:val="superscript"/>
+        </w:rPr>
+        <w:t>2/9</w:t>
+      </w:r>
+      <w:r>
+        <w:rPr>
+          <w:rFonts w:ascii="Garamond" w:hAnsi="Garamond"/>
+          <w:sz w:val="22"/>
+          <w:szCs w:val="22"/>
+          <w:vertAlign w:val="superscript"/>
+        </w:rPr>
+        <w:t xml:space="preserve"> </w:t>
+      </w:r>
+      <w:r>
+        <w:rPr>
+          <w:rFonts w:ascii="Garamond" w:hAnsi="Garamond"/>
+          <w:sz w:val="22"/>
+          <w:szCs w:val="22"/>
+        </w:rPr>
+        <w:t xml:space="preserve">(Kim and Gu, 2004, Brennan et al., </w:t>
+      </w:r>
+      <w:r>
+        <w:rPr>
+          <w:rFonts w:ascii="Garamond" w:hAnsi="Garamond"/>
+          <w:sz w:val="22"/>
+          <w:szCs w:val="22"/>
+        </w:rPr>
+        <w:t xml:space="preserve">2014). </w:t>
+      </w:r>
+    </w:p>
+    <w:p>
+      <w:pPr>
+        <w:spacing w:line="480" w:lineRule="auto"/>
+        <w:ind w:firstLine="720"/>
+        <w:rPr>
+          <w:rFonts w:ascii="Garamond" w:hAnsi="Garamond"/>
+          <w:sz w:val="22"/>
+          <w:szCs w:val="22"/>
+        </w:rPr>
+      </w:pPr>
+      <w:r>
+        <w:rPr>
+          <w:rFonts w:ascii="Garamond" w:hAnsi="Garamond"/>
+          <w:sz w:val="22"/>
+          <w:szCs w:val="22"/>
+        </w:rPr>
+        <w:t>One limitation of many common machine learning classification models is their dependence on fixed dimension vectors with a consistent length. Because otolith growth is directly proportional to individual growth, the number of microns (</w:t>
+      </w:r>
+      <w:proofErr w:type="gramStart"/>
+      <w:r>
+        <w:rPr>
+          <w:rFonts w:ascii="Garamond" w:hAnsi="Garamond"/>
+          <w:sz w:val="22"/>
+          <w:szCs w:val="22"/>
+        </w:rPr>
+        <w:t>and ,</w:t>
+      </w:r>
+      <w:proofErr w:type="gramEnd"/>
+      <w:r>
+        <w:rPr>
+          <w:rFonts w:ascii="Garamond" w:hAnsi="Garamond"/>
+          <w:sz w:val="22"/>
+          <w:szCs w:val="22"/>
+        </w:rPr>
+        <w:t xml:space="preserve"> subsequently, reads) in otolith. </w:t>
+      </w:r>
+      <w:proofErr w:type="spellStart"/>
+      <w:r>
+        <w:rPr>
+          <w:rFonts w:ascii="Garamond" w:hAnsi="Garamond"/>
+          <w:sz w:val="22"/>
+          <w:szCs w:val="22"/>
+        </w:rPr>
+        <w:t>The</w:t>
+      </w:r>
+      <w:proofErr w:type="spellEnd"/>
+      <w:r>
+        <w:rPr>
+          <w:rFonts w:ascii="Garamond" w:hAnsi="Garamond"/>
+          <w:sz w:val="22"/>
+          <w:szCs w:val="22"/>
+        </w:rPr>
+        <w:t xml:space="preserve"> number of microns, and LA data is variable among individuals. To overcome this limitation we interpolated all samples to the same length, which is the calculated average length of all timeseries (INSERT VALUE HERE) </w:t>
+      </w:r>
+      <w:r>
+        <w:rPr>
+          <w:rFonts w:ascii="Garamond" w:hAnsi="Garamond"/>
+          <w:sz w:val="22"/>
+          <w:szCs w:val="22"/>
+        </w:rPr>
+        <w:fldChar w:fldCharType="begin"/>
+      </w:r>
+      <w:r>
+        <w:rPr>
+          <w:rFonts w:ascii="Garamond" w:hAnsi="Garamond"/>
+          <w:sz w:val="22"/>
+          <w:szCs w:val="22"/>
+        </w:rPr>
+        <w:instrText xml:space="preserve"> ADDIN ZOTERO_ITEM CSL_CITATION {"citationID":"IkCFfZW4","properties":{"formattedCitation":"(Hegg &amp; Kennedy, 2021)","plainCitation":"(Hegg &amp; Kennedy, 2021)","noteIndex":0},"citationItems":[{"id":4390,"uris":["http://zotero.org/users/8421274/items/BD9UPNI2"],"itemData":{"id":4390,"type":"article-journal","abstract":"Ecological patterns are often fundamentally chronological. However, generalization of data is necessarily accompanied by a loss of detail or resolution. Temporal data in particular contain information not only in data values but in the temporal structure, which is lost when these values are aggregated to provide point estimates. Dynamic time warping (DTW) is a time series comparison method that is capable of efficiently comparing series despite temporal offsets that confound other methods. The DTW method is both efficient and remarkably flexible, capable of efficiently matching not only time series but also any sequentially structured data set, which has made it a popular technique in machine learning, artificial intelligence, and big data analytical tasks. DTW is rarely used in ecology despite the ubiquity of temporally structured data. As technological advances have increased the richness of small-scale ecological data, DTW may be an attractive analysis technique because it is able to utilize the additional information contained in the temporal structure of many ecological data sets. In this study, we use an example data set of high-resolution fish movement records obtained from otolith microchemistry to compare traditional analysis techniques with DTW clustering. Our results suggest that DTW is capable of detecting subtle behavioral patterns within otolith data sets which traditional data aggregation techniques cannot. These results provide evidence that the DTW method may be useful across many of the temporal data types commonly collected in ecology, as well other sequentially ordered “pseudo time series” data such as classification of species by shape.","container-title":"Ecosphere","DOI":"10.1002/ecs2.3742","ISSN":"2150-8925","issue":"9","language":"en","note":"_eprint: https://esajournals.onlinelibrary.wiley.com/doi/pdf/10.1002/ecs2.3742","page":"e03742","source":"Wiley Online Library","title":"Let's do the time warp again: non-linear time series matching as a tool for sequentially structured data in ecology","title-short":"Let's do the time warp again","volume":"12","author":[{"family":"Hegg","given":"Jens C."},{"family":"Kennedy","given":"Brian P."}],"issued":{"date-parts":[["2021"]]}}}],"schema":"https://github.com/citation-style-language/schema/raw/master/csl-citation.json"} </w:instrText>
+      </w:r>
+      <w:r>
+        <w:rPr>
+          <w:rFonts w:ascii="Garamond" w:hAnsi="Garamond"/>
+          <w:sz w:val="22"/>
+          <w:szCs w:val="22"/>
+        </w:rPr>
+        <w:fldChar w:fldCharType="separate"/>
+      </w:r>
+      <w:r>
+        <w:rPr>
+          <w:rFonts w:ascii="Garamond" w:hAnsi="Garamond"/>
+          <w:noProof/>
+          <w:sz w:val="22"/>
+          <w:szCs w:val="22"/>
+        </w:rPr>
+        <w:t>(Hegg &amp; Kennedy, 2021)</w:t>
+      </w:r>
+      <w:r>
+        <w:rPr>
+          <w:rFonts w:ascii="Garamond" w:hAnsi="Garamond"/>
+          <w:sz w:val="22"/>
+          <w:szCs w:val="22"/>
+        </w:rPr>
+        <w:fldChar w:fldCharType="end"/>
+      </w:r>
+      <w:r>
+        <w:rPr>
+          <w:rFonts w:ascii="Garamond" w:hAnsi="Garamond"/>
+          <w:sz w:val="22"/>
+          <w:szCs w:val="22"/>
+        </w:rPr>
+        <w:t xml:space="preserve">. The resulting dataset contained a </w:t>
+      </w:r>
+      <w:proofErr w:type="gramStart"/>
+      <w:r>
+        <w:rPr>
+          <w:rFonts w:ascii="Garamond" w:hAnsi="Garamond"/>
+          <w:sz w:val="22"/>
+          <w:szCs w:val="22"/>
+        </w:rPr>
+        <w:t>X by X</w:t>
+      </w:r>
+      <w:proofErr w:type="gramEnd"/>
+      <w:r>
+        <w:rPr>
+          <w:rFonts w:ascii="Garamond" w:hAnsi="Garamond"/>
+          <w:sz w:val="22"/>
+          <w:szCs w:val="22"/>
+        </w:rPr>
+        <w:t xml:space="preserve"> data matrix for both raw and GAM smoothed data as well as a </w:t>
+      </w:r>
+      <w:proofErr w:type="gramStart"/>
+      <w:r>
+        <w:rPr>
+          <w:rFonts w:ascii="Garamond" w:hAnsi="Garamond"/>
+          <w:sz w:val="22"/>
+          <w:szCs w:val="22"/>
+        </w:rPr>
+        <w:t>X by X</w:t>
+      </w:r>
+      <w:proofErr w:type="gramEnd"/>
+      <w:r>
+        <w:rPr>
+          <w:rFonts w:ascii="Garamond" w:hAnsi="Garamond"/>
+          <w:sz w:val="22"/>
+          <w:szCs w:val="22"/>
+        </w:rPr>
+        <w:t xml:space="preserve"> </w:t>
+      </w:r>
+      <w:r>
+        <w:rPr>
+          <w:rFonts w:ascii="Garamond" w:hAnsi="Garamond"/>
+          <w:sz w:val="22"/>
+          <w:szCs w:val="22"/>
+        </w:rPr>
+        <w:lastRenderedPageBreak/>
+        <w:t xml:space="preserve">data matrix for moving average smoothing which removed X datapoints at the beginning and end of the transect. </w:t>
+      </w:r>
+    </w:p>
+    <w:p>
+      <w:pPr>
+        <w:spacing w:line="480" w:lineRule="auto"/>
+        <w:rPr>
+          <w:rFonts w:ascii="Garamond" w:hAnsi="Garamond"/>
+          <w:b/>
+          <w:bCs/>
+          <w:sz w:val="22"/>
+          <w:szCs w:val="22"/>
+          <w:u w:val="single"/>
+        </w:rPr>
+      </w:pPr>
+      <w:r>
+        <w:rPr>
+          <w:rFonts w:ascii="Garamond" w:hAnsi="Garamond"/>
+          <w:b/>
+          <w:bCs/>
+          <w:sz w:val="22"/>
+          <w:szCs w:val="22"/>
+          <w:u w:val="single"/>
+        </w:rPr>
+        <w:t xml:space="preserve">Machine Learning Classification Models </w:t>
+      </w:r>
+    </w:p>
+    <w:p>
+      <w:pPr>
+        <w:spacing w:line="480" w:lineRule="auto"/>
+        <w:rPr>
+          <w:rFonts w:ascii="Garamond" w:hAnsi="Garamond"/>
+          <w:sz w:val="22"/>
+          <w:szCs w:val="22"/>
+        </w:rPr>
+      </w:pPr>
+      <w:r>
+        <w:rPr>
+          <w:rFonts w:ascii="Garamond" w:hAnsi="Garamond"/>
+          <w:b/>
+          <w:bCs/>
+          <w:sz w:val="22"/>
+          <w:szCs w:val="22"/>
+        </w:rPr>
+        <w:tab/>
+      </w:r>
+      <w:r>
+        <w:rPr>
+          <w:rFonts w:ascii="Garamond" w:hAnsi="Garamond"/>
+          <w:sz w:val="22"/>
+          <w:szCs w:val="22"/>
+        </w:rPr>
+        <w:t>Three common machine learning classification algorithms were testing on the data. These include K-Nearest Neighbors (KNN</w:t>
+      </w:r>
+      <w:proofErr w:type="gramStart"/>
+      <w:r>
+        <w:rPr>
+          <w:rFonts w:ascii="Garamond" w:hAnsi="Garamond"/>
+          <w:sz w:val="22"/>
+          <w:szCs w:val="22"/>
+        </w:rPr>
+        <w:t>) ,</w:t>
+      </w:r>
+      <w:proofErr w:type="gramEnd"/>
+      <w:r>
+        <w:rPr>
+          <w:rFonts w:ascii="Garamond" w:hAnsi="Garamond"/>
+          <w:sz w:val="22"/>
+          <w:szCs w:val="22"/>
+        </w:rPr>
+        <w:t xml:space="preserve"> Random Forest (RF</w:t>
+      </w:r>
+      <w:proofErr w:type="gramStart"/>
+      <w:r>
+        <w:rPr>
+          <w:rFonts w:ascii="Garamond" w:hAnsi="Garamond"/>
+          <w:sz w:val="22"/>
+          <w:szCs w:val="22"/>
+        </w:rPr>
+        <w:t>) ,</w:t>
+      </w:r>
+      <w:proofErr w:type="gramEnd"/>
+      <w:r>
+        <w:rPr>
+          <w:rFonts w:ascii="Garamond" w:hAnsi="Garamond"/>
+          <w:sz w:val="22"/>
+          <w:szCs w:val="22"/>
+        </w:rPr>
+        <w:t xml:space="preserve"> and Support Vector Machine (SVM). </w:t>
+      </w:r>
+      <w:r>
+        <w:rPr>
+          <w:rStyle w:val="Strong"/>
+          <w:rFonts w:ascii="Garamond" w:hAnsi="Garamond"/>
+          <w:sz w:val="22"/>
+          <w:szCs w:val="22"/>
+        </w:rPr>
+        <w:t>K-Nearest Neighbors (KNN)</w:t>
+      </w:r>
+      <w:r>
+        <w:rPr>
+          <w:rFonts w:ascii="Garamond" w:hAnsi="Garamond"/>
+          <w:sz w:val="22"/>
+          <w:szCs w:val="22"/>
+        </w:rPr>
+        <w:t xml:space="preserve"> classifies samples based on the majority class among the k nearest training data points in feature space, using distance metrics (typically Euclidean) to identify neighbors</w:t>
+      </w:r>
+      <w:r>
+        <w:rPr>
+          <w:rFonts w:ascii="Garamond" w:hAnsi="Garamond"/>
+          <w:sz w:val="22"/>
+          <w:szCs w:val="22"/>
+        </w:rPr>
+        <w:t xml:space="preserve"> (Cover and Hart, 1967)</w:t>
+      </w:r>
+      <w:r>
+        <w:rPr>
+          <w:rFonts w:ascii="Garamond" w:hAnsi="Garamond"/>
+          <w:sz w:val="22"/>
+          <w:szCs w:val="22"/>
+        </w:rPr>
+        <w:t xml:space="preserve">. </w:t>
+      </w:r>
+      <w:r>
+        <w:rPr>
+          <w:rStyle w:val="Strong"/>
+          <w:rFonts w:ascii="Garamond" w:hAnsi="Garamond"/>
+          <w:sz w:val="22"/>
+          <w:szCs w:val="22"/>
+        </w:rPr>
+        <w:t>Random Forest (RF)</w:t>
+      </w:r>
+      <w:r>
+        <w:rPr>
+          <w:rFonts w:ascii="Garamond" w:hAnsi="Garamond"/>
+          <w:sz w:val="22"/>
+          <w:szCs w:val="22"/>
+        </w:rPr>
+        <w:t xml:space="preserve"> creates multiple decision trees using bootstrap sampling and random feature selection, with final classification determined by majority vote across all trees</w:t>
+      </w:r>
+      <w:r>
+        <w:rPr>
+          <w:rFonts w:ascii="Garamond" w:hAnsi="Garamond"/>
+          <w:sz w:val="22"/>
+          <w:szCs w:val="22"/>
+        </w:rPr>
+        <w:t xml:space="preserve"> (</w:t>
+      </w:r>
+      <w:proofErr w:type="spellStart"/>
+      <w:r>
+        <w:rPr>
+          <w:rFonts w:ascii="Garamond" w:hAnsi="Garamond"/>
+          <w:sz w:val="22"/>
+          <w:szCs w:val="22"/>
+        </w:rPr>
+        <w:t>Briemen</w:t>
+      </w:r>
+      <w:proofErr w:type="spellEnd"/>
+      <w:r>
+        <w:rPr>
+          <w:rFonts w:ascii="Garamond" w:hAnsi="Garamond"/>
+          <w:sz w:val="22"/>
+          <w:szCs w:val="22"/>
+        </w:rPr>
+        <w:t>, 2001)</w:t>
+      </w:r>
+      <w:r>
+        <w:rPr>
+          <w:rFonts w:ascii="Garamond" w:hAnsi="Garamond"/>
+          <w:sz w:val="22"/>
+          <w:szCs w:val="22"/>
+        </w:rPr>
+        <w:t xml:space="preserve">. </w:t>
+      </w:r>
+      <w:r>
+        <w:rPr>
+          <w:rStyle w:val="Strong"/>
+          <w:rFonts w:ascii="Garamond" w:hAnsi="Garamond"/>
+          <w:sz w:val="22"/>
+          <w:szCs w:val="22"/>
+        </w:rPr>
+        <w:t>Support Vector Machine (SVM)</w:t>
+      </w:r>
+      <w:r>
+        <w:rPr>
+          <w:rFonts w:ascii="Garamond" w:hAnsi="Garamond"/>
+          <w:sz w:val="22"/>
+          <w:szCs w:val="22"/>
+        </w:rPr>
+        <w:t xml:space="preserve"> identifies the optimal hyperplane that maximally separates classes by finding support vectors closest to the decision boundary, using kernel functions to handle non-linearly separable data</w:t>
+      </w:r>
+      <w:r>
+        <w:rPr>
+          <w:rFonts w:ascii="Garamond" w:hAnsi="Garamond"/>
+          <w:sz w:val="22"/>
+          <w:szCs w:val="22"/>
+        </w:rPr>
+        <w:t xml:space="preserve"> (Cortez and </w:t>
+      </w:r>
+      <w:proofErr w:type="spellStart"/>
+      <w:r>
+        <w:rPr>
+          <w:rFonts w:ascii="Garamond" w:hAnsi="Garamond"/>
+          <w:sz w:val="22"/>
+          <w:szCs w:val="22"/>
+        </w:rPr>
+        <w:t>Vapnik</w:t>
+      </w:r>
+      <w:proofErr w:type="spellEnd"/>
+      <w:r>
+        <w:rPr>
+          <w:rFonts w:ascii="Garamond" w:hAnsi="Garamond"/>
+          <w:sz w:val="22"/>
+          <w:szCs w:val="22"/>
+        </w:rPr>
+        <w:t>, 1995)</w:t>
+      </w:r>
+      <w:r>
+        <w:rPr>
+          <w:rFonts w:ascii="Garamond" w:hAnsi="Garamond"/>
+          <w:sz w:val="22"/>
+          <w:szCs w:val="22"/>
+        </w:rPr>
+        <w:t>.</w:t>
+      </w:r>
+    </w:p>
+    <w:p>
+      <w:pPr>
+        <w:spacing w:line="480" w:lineRule="auto"/>
+        <w:rPr>
+          <w:rFonts w:ascii="Garamond" w:hAnsi="Garamond"/>
+          <w:sz w:val="22"/>
+          <w:szCs w:val="22"/>
+        </w:rPr>
+      </w:pPr>
+    </w:p>
+    <w:p>
+      <w:pPr>
+        <w:spacing w:line="480" w:lineRule="auto"/>
+        <w:rPr>
+          <w:rFonts w:ascii="Garamond" w:hAnsi="Garamond"/>
+          <w:sz w:val="22"/>
+          <w:szCs w:val="22"/>
+        </w:rPr>
+      </w:pPr>
+      <w:r>
+        <w:rPr>
+          <w:rFonts w:ascii="Garamond" w:hAnsi="Garamond"/>
+          <w:b/>
+          <w:bCs/>
+          <w:sz w:val="22"/>
+          <w:szCs w:val="22"/>
+        </w:rPr>
+        <w:t xml:space="preserve">PCA, feature importance, data exploration </w:t>
+      </w:r>
+    </w:p>
+    <w:p>
+      <w:pPr>
+        <w:rPr>
+          <w:rFonts w:ascii="Garamond" w:hAnsi="Garamond"/>
+          <w:b/>
+          <w:bCs/>
+          <w:sz w:val="22"/>
+          <w:szCs w:val="22"/>
+        </w:rPr>
+      </w:pPr>
+      <w:r>
+        <w:rPr>
+          <w:rFonts w:ascii="Garamond" w:hAnsi="Garamond"/>
+          <w:b/>
+          <w:bCs/>
+          <w:sz w:val="22"/>
+          <w:szCs w:val="22"/>
+        </w:rPr>
+        <w:t xml:space="preserve">Probability tuning </w:t>
+      </w:r>
+    </w:p>
+    <w:p>
+      <w:pPr>
+        <w:rPr>
+          <w:rFonts w:ascii="Garamond" w:hAnsi="Garamond"/>
+          <w:b/>
+          <w:bCs/>
+          <w:sz w:val="22"/>
+          <w:szCs w:val="22"/>
+        </w:rPr>
+      </w:pPr>
+      <w:r>
+        <w:rPr>
+          <w:rFonts w:ascii="Garamond" w:hAnsi="Garamond"/>
+          <w:b/>
+          <w:bCs/>
+          <w:sz w:val="22"/>
+          <w:szCs w:val="22"/>
+        </w:rPr>
+        <w:t xml:space="preserve">Combination with current models </w:t>
       </w:r>
     </w:p>
     <w:p>
@@ -731,37 +1725,110 @@
           <w:szCs w:val="32"/>
         </w:rPr>
       </w:pPr>
-      <w:r>
+    </w:p>
+    <w:p>
+      <w:pPr>
+        <w:tabs>
+          <w:tab w:val="left" w:pos="3088"/>
+        </w:tabs>
         <w:rPr>
           <w:rFonts w:ascii="Garamond" w:hAnsi="Garamond"/>
           <w:sz w:val="32"/>
           <w:szCs w:val="32"/>
         </w:rPr>
-        <w:t xml:space="preserve">Results </w:t>
-      </w:r>
-      <w:r>
+      </w:pPr>
+    </w:p>
+    <w:p>
+      <w:pPr>
+        <w:tabs>
+          <w:tab w:val="left" w:pos="3088"/>
+        </w:tabs>
         <w:rPr>
           <w:rFonts w:ascii="Garamond" w:hAnsi="Garamond"/>
           <w:sz w:val="32"/>
           <w:szCs w:val="32"/>
         </w:rPr>
-        <w:tab/>
-      </w:r>
-    </w:p>
-    <w:p>
-      <w:pPr>
+      </w:pPr>
+    </w:p>
+    <w:p>
+      <w:pPr>
+        <w:tabs>
+          <w:tab w:val="left" w:pos="3088"/>
+        </w:tabs>
         <w:rPr>
           <w:rFonts w:ascii="Garamond" w:hAnsi="Garamond"/>
           <w:sz w:val="32"/>
           <w:szCs w:val="32"/>
         </w:rPr>
       </w:pPr>
-      <w:r>
+    </w:p>
+    <w:p>
+      <w:pPr>
+        <w:tabs>
+          <w:tab w:val="left" w:pos="3088"/>
+        </w:tabs>
         <w:rPr>
           <w:rFonts w:ascii="Garamond" w:hAnsi="Garamond"/>
           <w:sz w:val="32"/>
           <w:szCs w:val="32"/>
         </w:rPr>
+      </w:pPr>
+    </w:p>
+    <w:p>
+      <w:pPr>
+        <w:tabs>
+          <w:tab w:val="left" w:pos="3088"/>
+        </w:tabs>
+        <w:rPr>
+          <w:rFonts w:ascii="Garamond" w:hAnsi="Garamond"/>
+          <w:sz w:val="32"/>
+          <w:szCs w:val="32"/>
+        </w:rPr>
+      </w:pPr>
+    </w:p>
+    <w:p>
+      <w:pPr>
+        <w:tabs>
+          <w:tab w:val="left" w:pos="3088"/>
+        </w:tabs>
+        <w:rPr>
+          <w:rFonts w:ascii="Garamond" w:hAnsi="Garamond"/>
+          <w:sz w:val="32"/>
+          <w:szCs w:val="32"/>
+        </w:rPr>
+      </w:pPr>
+      <w:r>
+        <w:rPr>
+          <w:rFonts w:ascii="Garamond" w:hAnsi="Garamond"/>
+          <w:sz w:val="32"/>
+          <w:szCs w:val="32"/>
+        </w:rPr>
+        <w:t xml:space="preserve">Results </w:t>
+      </w:r>
+      <w:r>
+        <w:rPr>
+          <w:rFonts w:ascii="Garamond" w:hAnsi="Garamond"/>
+          <w:sz w:val="32"/>
+          <w:szCs w:val="32"/>
+        </w:rPr>
+        <w:tab/>
+      </w:r>
+    </w:p>
+    <w:p>
+      <w:pPr>
+        <w:rPr>
+          <w:rFonts w:ascii="Garamond" w:hAnsi="Garamond"/>
+          <w:sz w:val="32"/>
+          <w:szCs w:val="32"/>
+        </w:rPr>
+      </w:pPr>
+      <w:r>
+        <w:rPr>
+          <w:rFonts w:ascii="Garamond" w:hAnsi="Garamond"/>
+          <w:sz w:val="32"/>
+          <w:szCs w:val="32"/>
+        </w:rPr>
+        <w:lastRenderedPageBreak/>
         <w:t xml:space="preserve">Discussion </w:t>
       </w:r>
     </w:p>
@@ -1131,7 +2198,6 @@
           <w:sz w:val="22"/>
           <w:szCs w:val="22"/>
         </w:rPr>
-        <w:lastRenderedPageBreak/>
         <w:t xml:space="preserve">Pacific salmon represent a critically important economic, subsistence, and cultural resource in Western Alaska. Their anadromous life cycle involves freshwater rearing, followed by several years of marine growth, before adults return to spawn in their natal riverine environments. This multi-ecosystem life history, combined with the extremely remote and rugged nature of these environments, makes monitoring salmon ecosystems exceedingly difficult. </w:t>
       </w:r>
     </w:p>
@@ -1267,60 +2333,59 @@
           <w:sz w:val="20"/>
           <w:szCs w:val="20"/>
         </w:rPr>
-        <w:t xml:space="preserve">Isotope-based methods can be powerful tools for estimating provenance and can achieve high precision in systems with significant isotopic heterogeneity. Otoliths, or ear stones found in fishes, continuously record isotopic and </w:t>
-      </w:r>
+        <w:t xml:space="preserve">Isotope-based methods can be powerful tools for estimating provenance and can achieve high precision in systems with significant isotopic heterogeneity. Otoliths, or ear stones found in fishes, continuously record isotopic and chemical signals from their environment into a metabolically inert calcium carbonate structure as the fish grows. These signals can then be analyzed </w:t>
+      </w:r>
+      <w:proofErr w:type="gramStart"/>
       <w:r>
         <w:rPr>
           <w:rFonts w:ascii="Garamond" w:hAnsi="Garamond"/>
           <w:sz w:val="20"/>
           <w:szCs w:val="20"/>
         </w:rPr>
-        <w:lastRenderedPageBreak/>
-        <w:t xml:space="preserve">chemical signals from their environment into a metabolically inert calcium carbonate structure as the fish grows. These signals can then be analyzed </w:t>
-      </w:r>
-      <w:proofErr w:type="gramStart"/>
+        <w:t>post mortem</w:t>
+      </w:r>
+      <w:proofErr w:type="gramEnd"/>
       <w:r>
         <w:rPr>
           <w:rFonts w:ascii="Garamond" w:hAnsi="Garamond"/>
           <w:sz w:val="20"/>
           <w:szCs w:val="20"/>
         </w:rPr>
-        <w:t>post mortem</w:t>
-      </w:r>
-      <w:proofErr w:type="gramEnd"/>
+        <w:t xml:space="preserve"> to extract a chronological archive of life history characteristics over the fish's life. For provenance applications, the strontium isotope ratio Sr87/Sr86 is particularly powerful as it is faithfully incorporated into the otolith structure, is temporally stable in many systems, and is heterogeneously distributed in geologically diverse watersheds. Sr87/86 ratios from discrete time periods of interest (e.g., freshwater rearing period) can be related to landscape values to estimate geographic origin</w:t>
+      </w:r>
       <w:r>
         <w:rPr>
           <w:rFonts w:ascii="Garamond" w:hAnsi="Garamond"/>
           <w:sz w:val="20"/>
           <w:szCs w:val="20"/>
         </w:rPr>
-        <w:t xml:space="preserve"> to extract a chronological archive of life history characteristics over the fish's life. For provenance applications, the strontium isotope ratio Sr87/Sr86 is particularly powerful as it is faithfully incorporated into the otolith structure, is temporally stable in many systems, and is heterogeneously distributed in geologically diverse watersheds. Sr87/86 ratios from discrete time periods of interest (e.g., freshwater rearing period) can be related to landscape values to estimate geographic origin</w:t>
-      </w:r>
+        <w:t xml:space="preserve">. Patterns in these data contain information about life history characteristics including rearing environments, relative growth among environments and between years, migration routes, and maternal migration patterns. In some cases, otolith data contain distinct sequential states that can be directly compared to landscape values to reconstruct migration routes. However, when movement through multiple environments occurs too quickly for the otolith to fully incorporate each environmental signal, as is often the case for </w:t>
+      </w:r>
+      <w:proofErr w:type="spellStart"/>
       <w:r>
         <w:rPr>
           <w:rFonts w:ascii="Garamond" w:hAnsi="Garamond"/>
           <w:sz w:val="20"/>
           <w:szCs w:val="20"/>
         </w:rPr>
-        <w:t xml:space="preserve">. Patterns in these data contain information about life history characteristics including rearing environments, relative growth among environments and between years, migration routes, and maternal migration patterns. In some cases, otolith data contain distinct sequential states that can be directly compared to landscape values to reconstruct migration routes. However, when movement through multiple environments occurs too quickly for the otolith to fully incorporate each environmental signal, as is often the case for </w:t>
-      </w:r>
-      <w:proofErr w:type="spellStart"/>
+        <w:t>outmigrating</w:t>
+      </w:r>
+      <w:proofErr w:type="spellEnd"/>
       <w:r>
         <w:rPr>
           <w:rFonts w:ascii="Garamond" w:hAnsi="Garamond"/>
           <w:sz w:val="20"/>
           <w:szCs w:val="20"/>
         </w:rPr>
-        <w:t>outmigrating</w:t>
-      </w:r>
-      <w:proofErr w:type="spellEnd"/>
+        <w:t xml:space="preserve"> salmon, patterns</w:t>
+      </w:r>
       <w:r>
         <w:rPr>
           <w:rFonts w:ascii="Garamond" w:hAnsi="Garamond"/>
           <w:sz w:val="20"/>
           <w:szCs w:val="20"/>
         </w:rPr>
-        <w:t xml:space="preserve"> salmon, patterns</w:t>
+        <w:t xml:space="preserve"> in the data reflecting </w:t>
       </w:r>
       <w:r>
         <w:rPr>
@@ -1328,7 +2393,7 @@
           <w:sz w:val="20"/>
           <w:szCs w:val="20"/>
         </w:rPr>
-        <w:t xml:space="preserve"> in the data reflecting </w:t>
+        <w:t xml:space="preserve">migration </w:t>
       </w:r>
       <w:r>
         <w:rPr>
@@ -1336,7 +2401,7 @@
           <w:sz w:val="20"/>
           <w:szCs w:val="20"/>
         </w:rPr>
-        <w:t xml:space="preserve">migration </w:t>
+        <w:t xml:space="preserve">routes </w:t>
       </w:r>
       <w:r>
         <w:rPr>
@@ -1344,7 +2409,7 @@
           <w:sz w:val="20"/>
           <w:szCs w:val="20"/>
         </w:rPr>
-        <w:t xml:space="preserve">routes </w:t>
+        <w:t>cannot be directly compared to landscape values.</w:t>
       </w:r>
       <w:r>
         <w:rPr>
@@ -1352,33 +2417,26 @@
           <w:sz w:val="20"/>
           <w:szCs w:val="20"/>
         </w:rPr>
-        <w:t>cannot be directly compared to landscape values.</w:t>
-      </w:r>
-      <w:r>
+        <w:t xml:space="preserve"> </w:t>
+      </w:r>
+    </w:p>
+    <w:p>
+      <w:pPr>
+        <w:pStyle w:val="NormalWeb"/>
+        <w:spacing w:line="480" w:lineRule="auto"/>
         <w:rPr>
           <w:rFonts w:ascii="Garamond" w:hAnsi="Garamond"/>
           <w:sz w:val="20"/>
           <w:szCs w:val="20"/>
         </w:rPr>
-        <w:t xml:space="preserve"> </w:t>
-      </w:r>
-    </w:p>
-    <w:p>
-      <w:pPr>
-        <w:pStyle w:val="NormalWeb"/>
-        <w:spacing w:line="480" w:lineRule="auto"/>
+      </w:pPr>
+      <w:r>
         <w:rPr>
           <w:rFonts w:ascii="Garamond" w:hAnsi="Garamond"/>
           <w:sz w:val="20"/>
           <w:szCs w:val="20"/>
         </w:rPr>
-      </w:pPr>
-      <w:r>
-        <w:rPr>
-          <w:rFonts w:ascii="Garamond" w:hAnsi="Garamond"/>
-          <w:sz w:val="20"/>
-          <w:szCs w:val="20"/>
-        </w:rPr>
+        <w:lastRenderedPageBreak/>
         <w:tab/>
       </w:r>
       <w:r>
@@ -1480,15 +2538,15 @@
 <file path=word/numbering.xml><?xml version="1.0" encoding="utf-8"?>
 <w:numbering xmlns:wpc="http://schemas.microsoft.com/office/word/2010/wordprocessingCanvas" xmlns:cx="http://schemas.microsoft.com/office/drawing/2014/chartex" xmlns:cx1="http://schemas.microsoft.com/office/drawing/2015/9/8/chartex" xmlns:cx2="http://schemas.microsoft.com/office/drawing/2015/10/21/chartex" xmlns:cx3="http://schemas.microsoft.com/office/drawing/2016/5/9/chartex" xmlns:cx4="http://schemas.microsoft.com/office/drawing/2016/5/10/chartex" xmlns:cx5="http://schemas.microsoft.com/office/drawing/2016/5/11/chartex" xmlns:cx6="http://schemas.microsoft.com/office/drawing/2016/5/12/chartex" xmlns:cx7="http://schemas.microsoft.com/office/drawing/2016/5/13/chartex" xmlns:cx8="http://schemas.microsoft.com/office/drawing/2016/5/14/chartex" xmlns:mc="http://schemas.openxmlformats.org/markup-compatibility/2006" xmlns:aink="http://schemas.microsoft.com/office/drawing/2016/ink" xmlns:am3d="http://schemas.microsoft.com/office/drawing/2017/model3d" xmlns:o="urn:schemas-microsoft-com:office:office" xmlns:oel="http://schemas.microsoft.com/office/2019/extlst" xmlns:r="http://schemas.openxmlformats.org/officeDocument/2006/relationships" xmlns:m="http://schemas.openxmlformats.org/officeDocument/2006/math" xmlns:v="urn:schemas-microsoft-com:vml" xmlns:wp14="http://schemas.microsoft.com/office/word/2010/wordprocessingDrawing" xmlns:wp="http://schemas.openxmlformats.org/drawingml/2006/wordprocessingDrawing" xmlns:w10="urn:schemas-microsoft-com:office:word" xmlns:w="http://schemas.openxmlformats.org/wordprocessingml/2006/main" xmlns:w14="http://schemas.microsoft.com/office/word/2010/wordml" xmlns:w15="http://schemas.microsoft.com/office/word/2012/wordml" xmlns:w16cex="http://schemas.microsoft.com/office/word/2018/wordml/cex" xmlns:w16cid="http://schemas.microsoft.com/office/word/2016/wordml/cid" xmlns:w16="http://schemas.microsoft.com/office/word/2018/wordml" xmlns:w16du="http://schemas.microsoft.com/office/word/2023/wordml/word16du" xmlns:w16sdtdh="http://schemas.microsoft.com/office/word/2020/wordml/sdtdatahash" xmlns:w16sdtfl="http://schemas.microsoft.com/office/word/2024/wordml/sdtformatlock" xmlns:w16se="http://schemas.microsoft.com/office/word/2015/wordml/symex" xmlns:wpg="http://schemas.microsoft.com/office/word/2010/wordprocessingGroup" xmlns:wpi="http://schemas.microsoft.com/office/word/2010/wordprocessingInk" xmlns:wne="http://schemas.microsoft.com/office/word/2006/wordml" xmlns:wps="http://schemas.microsoft.com/office/word/2010/wordprocessingShape" mc:Ignorable="w14 w15 w16se w16cid w16 w16cex w16sdtdh w16sdtfl w16du wp14">
   <w:abstractNum w:abstractNumId="0" w15:restartNumberingAfterBreak="0">
-    <w:nsid w:val="4AC941D2"/>
+    <w:nsid w:val="19237C9B"/>
     <w:multiLevelType w:val="hybridMultilevel"/>
-    <w:tmpl w:val="2682BA3A"/>
-    <w:lvl w:ilvl="0" w:tplc="D752FE1C">
+    <w:tmpl w:val="D07A6F0A"/>
+    <w:lvl w:ilvl="0" w:tplc="57C219BE">
       <w:numFmt w:val="bullet"/>
       <w:lvlText w:val="-"/>
       <w:lvlJc w:val="left"/>
       <w:pPr>
-        <w:ind w:left="720" w:hanging="360"/>
+        <w:ind w:left="1080" w:hanging="360"/>
       </w:pPr>
       <w:rPr>
         <w:rFonts w:ascii="Garamond" w:eastAsiaTheme="minorHAnsi" w:hAnsi="Garamond" w:cstheme="minorBidi" w:hint="default"/>
@@ -1500,7 +2558,7 @@
       <w:lvlText w:val="o"/>
       <w:lvlJc w:val="left"/>
       <w:pPr>
-        <w:ind w:left="1440" w:hanging="360"/>
+        <w:ind w:left="1800" w:hanging="360"/>
       </w:pPr>
       <w:rPr>
         <w:rFonts w:ascii="Courier New" w:hAnsi="Courier New" w:cs="Courier New" w:hint="default"/>
@@ -1512,7 +2570,7 @@
       <w:lvlText w:val=""/>
       <w:lvlJc w:val="left"/>
       <w:pPr>
-        <w:ind w:left="2160" w:hanging="360"/>
+        <w:ind w:left="2520" w:hanging="360"/>
       </w:pPr>
       <w:rPr>
         <w:rFonts w:ascii="Wingdings" w:hAnsi="Wingdings" w:hint="default"/>
@@ -1524,7 +2582,7 @@
       <w:lvlText w:val=""/>
       <w:lvlJc w:val="left"/>
       <w:pPr>
-        <w:ind w:left="2880" w:hanging="360"/>
+        <w:ind w:left="3240" w:hanging="360"/>
       </w:pPr>
       <w:rPr>
         <w:rFonts w:ascii="Symbol" w:hAnsi="Symbol" w:hint="default"/>
@@ -1536,7 +2594,7 @@
       <w:lvlText w:val="o"/>
       <w:lvlJc w:val="left"/>
       <w:pPr>
-        <w:ind w:left="3600" w:hanging="360"/>
+        <w:ind w:left="3960" w:hanging="360"/>
       </w:pPr>
       <w:rPr>
         <w:rFonts w:ascii="Courier New" w:hAnsi="Courier New" w:cs="Courier New" w:hint="default"/>
@@ -1548,7 +2606,7 @@
       <w:lvlText w:val=""/>
       <w:lvlJc w:val="left"/>
       <w:pPr>
-        <w:ind w:left="4320" w:hanging="360"/>
+        <w:ind w:left="4680" w:hanging="360"/>
       </w:pPr>
       <w:rPr>
         <w:rFonts w:ascii="Wingdings" w:hAnsi="Wingdings" w:hint="default"/>
@@ -1560,7 +2618,7 @@
       <w:lvlText w:val=""/>
       <w:lvlJc w:val="left"/>
       <w:pPr>
-        <w:ind w:left="5040" w:hanging="360"/>
+        <w:ind w:left="5400" w:hanging="360"/>
       </w:pPr>
       <w:rPr>
         <w:rFonts w:ascii="Symbol" w:hAnsi="Symbol" w:hint="default"/>
@@ -1572,7 +2630,7 @@
       <w:lvlText w:val="o"/>
       <w:lvlJc w:val="left"/>
       <w:pPr>
-        <w:ind w:left="5760" w:hanging="360"/>
+        <w:ind w:left="6120" w:hanging="360"/>
       </w:pPr>
       <w:rPr>
         <w:rFonts w:ascii="Courier New" w:hAnsi="Courier New" w:cs="Courier New" w:hint="default"/>
@@ -1584,7 +2642,7 @@
       <w:lvlText w:val=""/>
       <w:lvlJc w:val="left"/>
       <w:pPr>
-        <w:ind w:left="6480" w:hanging="360"/>
+        <w:ind w:left="6840" w:hanging="360"/>
       </w:pPr>
       <w:rPr>
         <w:rFonts w:ascii="Wingdings" w:hAnsi="Wingdings" w:hint="default"/>
@@ -1592,15 +2650,15 @@
     </w:lvl>
   </w:abstractNum>
   <w:abstractNum w:abstractNumId="1" w15:restartNumberingAfterBreak="0">
-    <w:nsid w:val="4F31630A"/>
+    <w:nsid w:val="4AC941D2"/>
     <w:multiLevelType w:val="hybridMultilevel"/>
-    <w:tmpl w:val="DD58292C"/>
-    <w:lvl w:ilvl="0" w:tplc="FF424106">
+    <w:tmpl w:val="2682BA3A"/>
+    <w:lvl w:ilvl="0" w:tplc="D752FE1C">
       <w:numFmt w:val="bullet"/>
       <w:lvlText w:val="-"/>
       <w:lvlJc w:val="left"/>
       <w:pPr>
-        <w:ind w:left="1800" w:hanging="360"/>
+        <w:ind w:left="720" w:hanging="360"/>
       </w:pPr>
       <w:rPr>
         <w:rFonts w:ascii="Garamond" w:eastAsiaTheme="minorHAnsi" w:hAnsi="Garamond" w:cstheme="minorBidi" w:hint="default"/>
@@ -1612,7 +2670,7 @@
       <w:lvlText w:val="o"/>
       <w:lvlJc w:val="left"/>
       <w:pPr>
-        <w:ind w:left="2520" w:hanging="360"/>
+        <w:ind w:left="1440" w:hanging="360"/>
       </w:pPr>
       <w:rPr>
         <w:rFonts w:ascii="Courier New" w:hAnsi="Courier New" w:cs="Courier New" w:hint="default"/>
@@ -1624,7 +2682,7 @@
       <w:lvlText w:val=""/>
       <w:lvlJc w:val="left"/>
       <w:pPr>
-        <w:ind w:left="3240" w:hanging="360"/>
+        <w:ind w:left="2160" w:hanging="360"/>
       </w:pPr>
       <w:rPr>
         <w:rFonts w:ascii="Wingdings" w:hAnsi="Wingdings" w:hint="default"/>
@@ -1636,7 +2694,7 @@
       <w:lvlText w:val=""/>
       <w:lvlJc w:val="left"/>
       <w:pPr>
-        <w:ind w:left="3960" w:hanging="360"/>
+        <w:ind w:left="2880" w:hanging="360"/>
       </w:pPr>
       <w:rPr>
         <w:rFonts w:ascii="Symbol" w:hAnsi="Symbol" w:hint="default"/>
@@ -1648,7 +2706,7 @@
       <w:lvlText w:val="o"/>
       <w:lvlJc w:val="left"/>
       <w:pPr>
-        <w:ind w:left="4680" w:hanging="360"/>
+        <w:ind w:left="3600" w:hanging="360"/>
       </w:pPr>
       <w:rPr>
         <w:rFonts w:ascii="Courier New" w:hAnsi="Courier New" w:cs="Courier New" w:hint="default"/>
@@ -1660,7 +2718,7 @@
       <w:lvlText w:val=""/>
       <w:lvlJc w:val="left"/>
       <w:pPr>
-        <w:ind w:left="5400" w:hanging="360"/>
+        <w:ind w:left="4320" w:hanging="360"/>
       </w:pPr>
       <w:rPr>
         <w:rFonts w:ascii="Wingdings" w:hAnsi="Wingdings" w:hint="default"/>
@@ -1672,7 +2730,7 @@
       <w:lvlText w:val=""/>
       <w:lvlJc w:val="left"/>
       <w:pPr>
-        <w:ind w:left="6120" w:hanging="360"/>
+        <w:ind w:left="5040" w:hanging="360"/>
       </w:pPr>
       <w:rPr>
         <w:rFonts w:ascii="Symbol" w:hAnsi="Symbol" w:hint="default"/>
@@ -1684,7 +2742,7 @@
       <w:lvlText w:val="o"/>
       <w:lvlJc w:val="left"/>
       <w:pPr>
-        <w:ind w:left="6840" w:hanging="360"/>
+        <w:ind w:left="5760" w:hanging="360"/>
       </w:pPr>
       <w:rPr>
         <w:rFonts w:ascii="Courier New" w:hAnsi="Courier New" w:cs="Courier New" w:hint="default"/>
@@ -1696,6 +2754,118 @@
       <w:lvlText w:val=""/>
       <w:lvlJc w:val="left"/>
       <w:pPr>
+        <w:ind w:left="6480" w:hanging="360"/>
+      </w:pPr>
+      <w:rPr>
+        <w:rFonts w:ascii="Wingdings" w:hAnsi="Wingdings" w:hint="default"/>
+      </w:rPr>
+    </w:lvl>
+  </w:abstractNum>
+  <w:abstractNum w:abstractNumId="2" w15:restartNumberingAfterBreak="0">
+    <w:nsid w:val="4F31630A"/>
+    <w:multiLevelType w:val="hybridMultilevel"/>
+    <w:tmpl w:val="DD58292C"/>
+    <w:lvl w:ilvl="0" w:tplc="FF424106">
+      <w:numFmt w:val="bullet"/>
+      <w:lvlText w:val="-"/>
+      <w:lvlJc w:val="left"/>
+      <w:pPr>
+        <w:ind w:left="1800" w:hanging="360"/>
+      </w:pPr>
+      <w:rPr>
+        <w:rFonts w:ascii="Garamond" w:eastAsiaTheme="minorHAnsi" w:hAnsi="Garamond" w:cstheme="minorBidi" w:hint="default"/>
+      </w:rPr>
+    </w:lvl>
+    <w:lvl w:ilvl="1" w:tplc="04090003" w:tentative="1">
+      <w:start w:val="1"/>
+      <w:numFmt w:val="bullet"/>
+      <w:lvlText w:val="o"/>
+      <w:lvlJc w:val="left"/>
+      <w:pPr>
+        <w:ind w:left="2520" w:hanging="360"/>
+      </w:pPr>
+      <w:rPr>
+        <w:rFonts w:ascii="Courier New" w:hAnsi="Courier New" w:cs="Courier New" w:hint="default"/>
+      </w:rPr>
+    </w:lvl>
+    <w:lvl w:ilvl="2" w:tplc="04090005" w:tentative="1">
+      <w:start w:val="1"/>
+      <w:numFmt w:val="bullet"/>
+      <w:lvlText w:val=""/>
+      <w:lvlJc w:val="left"/>
+      <w:pPr>
+        <w:ind w:left="3240" w:hanging="360"/>
+      </w:pPr>
+      <w:rPr>
+        <w:rFonts w:ascii="Wingdings" w:hAnsi="Wingdings" w:hint="default"/>
+      </w:rPr>
+    </w:lvl>
+    <w:lvl w:ilvl="3" w:tplc="04090001" w:tentative="1">
+      <w:start w:val="1"/>
+      <w:numFmt w:val="bullet"/>
+      <w:lvlText w:val=""/>
+      <w:lvlJc w:val="left"/>
+      <w:pPr>
+        <w:ind w:left="3960" w:hanging="360"/>
+      </w:pPr>
+      <w:rPr>
+        <w:rFonts w:ascii="Symbol" w:hAnsi="Symbol" w:hint="default"/>
+      </w:rPr>
+    </w:lvl>
+    <w:lvl w:ilvl="4" w:tplc="04090003" w:tentative="1">
+      <w:start w:val="1"/>
+      <w:numFmt w:val="bullet"/>
+      <w:lvlText w:val="o"/>
+      <w:lvlJc w:val="left"/>
+      <w:pPr>
+        <w:ind w:left="4680" w:hanging="360"/>
+      </w:pPr>
+      <w:rPr>
+        <w:rFonts w:ascii="Courier New" w:hAnsi="Courier New" w:cs="Courier New" w:hint="default"/>
+      </w:rPr>
+    </w:lvl>
+    <w:lvl w:ilvl="5" w:tplc="04090005" w:tentative="1">
+      <w:start w:val="1"/>
+      <w:numFmt w:val="bullet"/>
+      <w:lvlText w:val=""/>
+      <w:lvlJc w:val="left"/>
+      <w:pPr>
+        <w:ind w:left="5400" w:hanging="360"/>
+      </w:pPr>
+      <w:rPr>
+        <w:rFonts w:ascii="Wingdings" w:hAnsi="Wingdings" w:hint="default"/>
+      </w:rPr>
+    </w:lvl>
+    <w:lvl w:ilvl="6" w:tplc="04090001" w:tentative="1">
+      <w:start w:val="1"/>
+      <w:numFmt w:val="bullet"/>
+      <w:lvlText w:val=""/>
+      <w:lvlJc w:val="left"/>
+      <w:pPr>
+        <w:ind w:left="6120" w:hanging="360"/>
+      </w:pPr>
+      <w:rPr>
+        <w:rFonts w:ascii="Symbol" w:hAnsi="Symbol" w:hint="default"/>
+      </w:rPr>
+    </w:lvl>
+    <w:lvl w:ilvl="7" w:tplc="04090003" w:tentative="1">
+      <w:start w:val="1"/>
+      <w:numFmt w:val="bullet"/>
+      <w:lvlText w:val="o"/>
+      <w:lvlJc w:val="left"/>
+      <w:pPr>
+        <w:ind w:left="6840" w:hanging="360"/>
+      </w:pPr>
+      <w:rPr>
+        <w:rFonts w:ascii="Courier New" w:hAnsi="Courier New" w:cs="Courier New" w:hint="default"/>
+      </w:rPr>
+    </w:lvl>
+    <w:lvl w:ilvl="8" w:tplc="04090005" w:tentative="1">
+      <w:start w:val="1"/>
+      <w:numFmt w:val="bullet"/>
+      <w:lvlText w:val=""/>
+      <w:lvlJc w:val="left"/>
+      <w:pPr>
         <w:ind w:left="7560" w:hanging="360"/>
       </w:pPr>
       <w:rPr>
@@ -1704,9 +2874,12 @@
     </w:lvl>
   </w:abstractNum>
   <w:num w:numId="1" w16cid:durableId="1003900659">
+    <w:abstractNumId w:val="2"/>
+  </w:num>
+  <w:num w:numId="2" w16cid:durableId="1398362279">
     <w:abstractNumId w:val="1"/>
   </w:num>
-  <w:num w:numId="2" w16cid:durableId="1398362279">
+  <w:num w:numId="3" w16cid:durableId="550503404">
     <w:abstractNumId w:val="0"/>
   </w:num>
 </w:numbering>
@@ -2644,6 +3817,28 @@
       <w14:ligatures w14:val="none"/>
     </w:rPr>
   </w:style>
+  <w:style w:type="character" w:styleId="Emphasis">
+    <w:name w:val="Emphasis"/>
+    <w:basedOn w:val="DefaultParagraphFont"/>
+    <w:uiPriority w:val="20"/>
+    <w:qFormat/>
+    <w:rsid w:val="0075722E"/>
+    <w:rPr>
+      <w:i/>
+      <w:iCs/>
+    </w:rPr>
+  </w:style>
+  <w:style w:type="character" w:styleId="Strong">
+    <w:name w:val="Strong"/>
+    <w:basedOn w:val="DefaultParagraphFont"/>
+    <w:uiPriority w:val="22"/>
+    <w:qFormat/>
+    <w:rsid w:val="005E7567"/>
+    <w:rPr>
+      <w:b/>
+      <w:bCs/>
+    </w:rPr>
+  </w:style>
 </w:styles>
 </file>
 

</xml_diff>

<commit_message>
rewrote and edited intro, flowing well
</commit_message>
<xml_diff>
--- a/Docs/Machine learning applied to otolith timeseries data to discriminate river of origin for Western Alaska Salmon.docx
+++ b/Docs/Machine learning applied to otolith timeseries data to discriminate river of origin for Western Alaska Salmon.docx
@@ -113,6 +113,11 @@
       <w:pPr>
         <w:spacing w:line="480" w:lineRule="auto"/>
         <w:ind w:firstLine="720"/>
+        <w:rPr>
+          <w:rFonts w:ascii="Garamond" w:hAnsi="Garamond"/>
+          <w:sz w:val="22"/>
+          <w:szCs w:val="22"/>
+        </w:rPr>
       </w:pPr>
       <w:r>
         <w:rPr>
@@ -208,15 +213,23 @@
           <w:sz w:val="22"/>
           <w:szCs w:val="22"/>
         </w:rPr>
-        <w:t xml:space="preserve">allowed for novel insights from existing datasets which did not perform well with more traditional statistical techniques. </w:t>
-      </w:r>
-      <w:r>
-        <w:rPr>
-          <w:rFonts w:ascii="Garamond" w:hAnsi="Garamond"/>
-          <w:sz w:val="22"/>
-          <w:szCs w:val="22"/>
-        </w:rPr>
-        <w:t xml:space="preserve">As such, the uptake and incorporation of machine learning into the toolkit of fisheries science methods has allowed new insight to pressing research questions. </w:t>
+        <w:t xml:space="preserve">allowed for novel insights from existing datasets. </w:t>
+      </w:r>
+      <w:r>
+        <w:rPr>
+          <w:rFonts w:ascii="Garamond" w:hAnsi="Garamond"/>
+          <w:sz w:val="22"/>
+          <w:szCs w:val="22"/>
+        </w:rPr>
+        <w:t xml:space="preserve">As such, the </w:t>
+      </w:r>
+      <w:r>
+        <w:rPr>
+          <w:rFonts w:ascii="Garamond" w:hAnsi="Garamond"/>
+          <w:sz w:val="22"/>
+          <w:szCs w:val="22"/>
+        </w:rPr>
+        <w:t xml:space="preserve">continued integration of machine learning tools into fisheries science methods has allowed researchers with new opportunities to address pressing research questions. </w:t>
       </w:r>
     </w:p>
     <w:p>
@@ -235,23 +248,73 @@
           <w:sz w:val="22"/>
           <w:szCs w:val="22"/>
         </w:rPr>
-        <w:t xml:space="preserve">Western Alaska watersheds </w:t>
-      </w:r>
-      <w:r>
-        <w:rPr>
-          <w:rFonts w:ascii="Garamond" w:hAnsi="Garamond"/>
-          <w:sz w:val="22"/>
-          <w:szCs w:val="22"/>
-        </w:rPr>
-        <w:t xml:space="preserve">contain some of the last remaining pristine habitat for pacific salmon anywhere in the world. This region supports large and lucrative commercial fisheries, and salmon serve as an important source of subsistence harvest and cultural importance for dozens of indigenous communities. </w:t>
-      </w:r>
-      <w:r>
-        <w:rPr>
-          <w:rFonts w:ascii="Garamond" w:hAnsi="Garamond"/>
-          <w:sz w:val="22"/>
-          <w:szCs w:val="22"/>
-        </w:rPr>
-        <w:t>However, recent collapses in Chinook salmon stocks across the region's three major watersheds</w:t>
+        <w:t xml:space="preserve">One pressing issue in fisheries research is the recent collapse of pacific salmon stocks in </w:t>
+      </w:r>
+      <w:r>
+        <w:rPr>
+          <w:rFonts w:ascii="Garamond" w:hAnsi="Garamond"/>
+          <w:sz w:val="22"/>
+          <w:szCs w:val="22"/>
+        </w:rPr>
+        <w:t>Western Alaska watersheds</w:t>
+      </w:r>
+      <w:r>
+        <w:rPr>
+          <w:rFonts w:ascii="Garamond" w:hAnsi="Garamond"/>
+          <w:sz w:val="22"/>
+          <w:szCs w:val="22"/>
+        </w:rPr>
+        <w:t xml:space="preserve">. In the regions three major watersheds (The Yukon, Kuskokwim, and </w:t>
+      </w:r>
+      <w:proofErr w:type="spellStart"/>
+      <w:r>
+        <w:rPr>
+          <w:rFonts w:ascii="Garamond" w:hAnsi="Garamond"/>
+          <w:sz w:val="22"/>
+          <w:szCs w:val="22"/>
+        </w:rPr>
+        <w:t>Nushagak</w:t>
+      </w:r>
+      <w:proofErr w:type="spellEnd"/>
+      <w:r>
+        <w:rPr>
+          <w:rFonts w:ascii="Garamond" w:hAnsi="Garamond"/>
+          <w:sz w:val="22"/>
+          <w:szCs w:val="22"/>
+        </w:rPr>
+        <w:t xml:space="preserve"> River-Basins), salmon are a critical </w:t>
+      </w:r>
+      <w:r>
+        <w:rPr>
+          <w:rFonts w:ascii="Garamond" w:hAnsi="Garamond"/>
+          <w:sz w:val="22"/>
+          <w:szCs w:val="22"/>
+        </w:rPr>
+        <w:t>source of subsistence harvest and cultural importance for dozens of indigenous communities</w:t>
+      </w:r>
+      <w:r>
+        <w:rPr>
+          <w:rFonts w:ascii="Garamond" w:hAnsi="Garamond"/>
+          <w:sz w:val="22"/>
+          <w:szCs w:val="22"/>
+        </w:rPr>
+        <w:t xml:space="preserve"> as well as an important economic resource for the region. Recent declines have precipitated in a region-wide crisis characterized by limitations on both commercial and subsistence harvest, increased food insecurity, and a loss of an important cultural resource. As a result, there is an urgent need explore hypotheses related to the stock collapse in freshwater and marine ecosystems as well as to assess the spatial distribution of impacts across the region. Marine mortality has been suggested as a potential contributing factor to stock decline through mechanisms such as shifting food-web dynamics, thermal stress, density-dependent processes, or bycatch in federal trawl fisheries. Full assessing these hypotheses, however, is limited by an inability to understand the provenance of fish caught in the marine environment</w:t>
+      </w:r>
+      <w:r>
+        <w:rPr>
+          <w:rFonts w:ascii="Garamond" w:hAnsi="Garamond"/>
+          <w:sz w:val="22"/>
+          <w:szCs w:val="22"/>
+        </w:rPr>
+        <w:t>. Methods such as genetic stock identification (GSI) offer provenance estimates at relatively coarse spatial scales,</w:t>
+      </w:r>
+      <w:r>
+        <w:rPr>
+          <w:rFonts w:ascii="Garamond" w:hAnsi="Garamond"/>
+          <w:sz w:val="22"/>
+          <w:szCs w:val="22"/>
+        </w:rPr>
+        <w:t xml:space="preserve"> (i.e., coastal western Alaska)</w:t>
       </w:r>
       <w:r>
         <w:rPr>
@@ -267,41 +330,31 @@
           <w:sz w:val="22"/>
           <w:szCs w:val="22"/>
         </w:rPr>
-        <w:t xml:space="preserve">the Yukon, Kuskokwim, and </w:t>
-      </w:r>
-      <w:proofErr w:type="spellStart"/>
-      <w:r>
-        <w:rPr>
-          <w:rFonts w:ascii="Garamond" w:hAnsi="Garamond"/>
-          <w:sz w:val="22"/>
-          <w:szCs w:val="22"/>
-        </w:rPr>
-        <w:t>Nushagak</w:t>
-      </w:r>
-      <w:proofErr w:type="spellEnd"/>
-      <w:r>
-        <w:rPr>
-          <w:rFonts w:ascii="Garamond" w:hAnsi="Garamond"/>
-          <w:sz w:val="22"/>
-          <w:szCs w:val="22"/>
-        </w:rPr>
-        <w:t xml:space="preserve"> River basins</w:t>
-      </w:r>
-      <w:r>
-        <w:rPr>
-          <w:rFonts w:ascii="Garamond" w:hAnsi="Garamond"/>
-          <w:sz w:val="22"/>
-          <w:szCs w:val="22"/>
-        </w:rPr>
-        <w:t xml:space="preserve">, </w:t>
-      </w:r>
-      <w:r>
-        <w:rPr>
-          <w:rFonts w:ascii="Garamond" w:hAnsi="Garamond"/>
-          <w:sz w:val="22"/>
-          <w:szCs w:val="22"/>
-        </w:rPr>
-        <w:t>have precipitated a region-wide crisis. There is now an urgent need to test hypotheses regarding potential mechanisms driving this collapse and to assess the spatial distribution of impacts across the region.</w:t>
+        <w:t xml:space="preserve">but cannot </w:t>
+      </w:r>
+      <w:r>
+        <w:rPr>
+          <w:rFonts w:ascii="Garamond" w:hAnsi="Garamond"/>
+          <w:sz w:val="22"/>
+          <w:szCs w:val="22"/>
+        </w:rPr>
+        <w:t>reliably</w:t>
+      </w:r>
+      <w:r>
+        <w:rPr>
+          <w:rFonts w:ascii="Garamond" w:hAnsi="Garamond"/>
+          <w:sz w:val="22"/>
+          <w:szCs w:val="22"/>
+        </w:rPr>
+        <w:t xml:space="preserve"> </w:t>
+      </w:r>
+      <w:r>
+        <w:rPr>
+          <w:rFonts w:ascii="Garamond" w:hAnsi="Garamond"/>
+          <w:sz w:val="22"/>
+          <w:szCs w:val="22"/>
+        </w:rPr>
+        <w:t xml:space="preserve">distinguish between rivers within current genetic baselines for many individuals. </w:t>
       </w:r>
     </w:p>
     <w:p>
@@ -320,23 +373,64 @@
           <w:sz w:val="22"/>
           <w:szCs w:val="22"/>
         </w:rPr>
-        <w:t>Several hypotheses for contributing factors</w:t>
-      </w:r>
-      <w:r>
-        <w:rPr>
-          <w:rFonts w:ascii="Garamond" w:hAnsi="Garamond"/>
-          <w:sz w:val="22"/>
-          <w:szCs w:val="22"/>
-        </w:rPr>
-        <w:t xml:space="preserve"> of stock decline</w:t>
-      </w:r>
-      <w:r>
-        <w:rPr>
-          <w:rFonts w:ascii="Garamond" w:hAnsi="Garamond"/>
-          <w:sz w:val="22"/>
-          <w:szCs w:val="22"/>
-        </w:rPr>
-        <w:t xml:space="preserve"> focus on marine mortality, whether from shifting food web dynamics, thermal stress, density-dependent processes, or bycatch in federal trawl fisheries. However, fully exploring the relative impact of these mechanisms on stock health across the basin requires understanding the provenance of fish in the marine environment. Currently used methods such as genetic stock identification (GSI) can only identify provenance at broad spatial scales (i.e., coastal western Alaska</w:t>
+        <w:lastRenderedPageBreak/>
+        <w:t xml:space="preserve">Isotope-based methods for estimating provenance from </w:t>
+      </w:r>
+      <w:r>
+        <w:rPr>
+          <w:rFonts w:ascii="Garamond" w:hAnsi="Garamond"/>
+          <w:sz w:val="22"/>
+          <w:szCs w:val="22"/>
+        </w:rPr>
+        <w:t xml:space="preserve">ear stones found in fishes, or otoliths, </w:t>
+      </w:r>
+      <w:r>
+        <w:rPr>
+          <w:rFonts w:ascii="Garamond" w:hAnsi="Garamond"/>
+          <w:sz w:val="22"/>
+          <w:szCs w:val="22"/>
+        </w:rPr>
+        <w:t>have shown promi</w:t>
+      </w:r>
+      <w:r>
+        <w:rPr>
+          <w:rFonts w:ascii="Garamond" w:hAnsi="Garamond"/>
+          <w:sz w:val="22"/>
+          <w:szCs w:val="22"/>
+        </w:rPr>
+        <w:t xml:space="preserve">se as an alternative method to estimate </w:t>
+      </w:r>
+      <w:r>
+        <w:rPr>
+          <w:rFonts w:ascii="Garamond" w:hAnsi="Garamond"/>
+          <w:sz w:val="22"/>
+          <w:szCs w:val="22"/>
+        </w:rPr>
+        <w:t xml:space="preserve">provenance at </w:t>
+      </w:r>
+      <w:r>
+        <w:rPr>
+          <w:rFonts w:ascii="Garamond" w:hAnsi="Garamond"/>
+          <w:sz w:val="22"/>
+          <w:szCs w:val="22"/>
+        </w:rPr>
+        <w:t>more refined spatial scale than genetics in some cases</w:t>
+      </w:r>
+      <w:r>
+        <w:rPr>
+          <w:rFonts w:ascii="Garamond" w:hAnsi="Garamond"/>
+          <w:sz w:val="22"/>
+          <w:szCs w:val="22"/>
+        </w:rPr>
+        <w:t xml:space="preserve">. </w:t>
+      </w:r>
+      <w:r>
+        <w:rPr>
+          <w:rFonts w:ascii="Garamond" w:hAnsi="Garamond"/>
+          <w:sz w:val="22"/>
+          <w:szCs w:val="22"/>
+        </w:rPr>
+        <w:t xml:space="preserve">The relative ratio of Strontium 87/86 is an isotopic tracer that is heterogeneously distributed in geologically diverse landscapes, faithfully incorporated into the otolith, and has been shown to be temporally stable in Alaskan watersheds. As a result, the value of Sr8786 associated with a discrete </w:t>
       </w:r>
       <w:proofErr w:type="gramStart"/>
       <w:r>
@@ -345,15 +439,7 @@
           <w:sz w:val="22"/>
           <w:szCs w:val="22"/>
         </w:rPr>
-        <w:t>)</w:t>
-      </w:r>
-      <w:r>
-        <w:rPr>
-          <w:rFonts w:ascii="Garamond" w:hAnsi="Garamond"/>
-          <w:sz w:val="22"/>
-          <w:szCs w:val="22"/>
-        </w:rPr>
-        <w:t xml:space="preserve"> ,</w:t>
+        <w:t>time period</w:t>
       </w:r>
       <w:proofErr w:type="gramEnd"/>
       <w:r>
@@ -362,31 +448,373 @@
           <w:sz w:val="22"/>
           <w:szCs w:val="22"/>
         </w:rPr>
-        <w:t xml:space="preserve"> but cannot </w:t>
-      </w:r>
-      <w:r>
-        <w:rPr>
-          <w:rFonts w:ascii="Garamond" w:hAnsi="Garamond"/>
-          <w:sz w:val="22"/>
-          <w:szCs w:val="22"/>
-        </w:rPr>
-        <w:t>reliably</w:t>
-      </w:r>
-      <w:r>
-        <w:rPr>
-          <w:rFonts w:ascii="Garamond" w:hAnsi="Garamond"/>
-          <w:sz w:val="22"/>
-          <w:szCs w:val="22"/>
-        </w:rPr>
-        <w:t xml:space="preserve"> assign to one of the three major watersheds within this broad genetic baseline. </w:t>
-      </w:r>
-      <w:r>
-        <w:rPr>
-          <w:rFonts w:ascii="Garamond" w:hAnsi="Garamond"/>
-          <w:sz w:val="22"/>
-          <w:szCs w:val="22"/>
-        </w:rPr>
-        <w:t xml:space="preserve">Isotope-based methods for estimating provenance from otoliths (ear stones found in fishes) have shown promising </w:t>
+        <w:t xml:space="preserve"> of an individual’s life (i.e. freshwater natal rearing) has been used to estimate provenance by relating it to </w:t>
+      </w:r>
+      <w:r>
+        <w:rPr>
+          <w:rFonts w:ascii="Garamond" w:hAnsi="Garamond"/>
+          <w:sz w:val="22"/>
+          <w:szCs w:val="22"/>
+        </w:rPr>
+        <w:t xml:space="preserve">values </w:t>
+      </w:r>
+      <w:r>
+        <w:rPr>
+          <w:rFonts w:ascii="Garamond" w:hAnsi="Garamond"/>
+          <w:sz w:val="22"/>
+          <w:szCs w:val="22"/>
+        </w:rPr>
+        <w:t xml:space="preserve">measured or modeled across the landscape. </w:t>
+      </w:r>
+      <w:r>
+        <w:rPr>
+          <w:rFonts w:ascii="Garamond" w:hAnsi="Garamond"/>
+          <w:sz w:val="22"/>
+          <w:szCs w:val="22"/>
+        </w:rPr>
+        <w:t xml:space="preserve">Despite its precision, </w:t>
+      </w:r>
+      <w:r>
+        <w:rPr>
+          <w:rFonts w:ascii="Garamond" w:hAnsi="Garamond"/>
+          <w:sz w:val="22"/>
+          <w:szCs w:val="22"/>
+        </w:rPr>
+        <w:t xml:space="preserve">this method is limited by the </w:t>
+      </w:r>
+      <w:r>
+        <w:rPr>
+          <w:rFonts w:ascii="Garamond" w:hAnsi="Garamond"/>
+          <w:sz w:val="22"/>
+          <w:szCs w:val="22"/>
+        </w:rPr>
+        <w:t xml:space="preserve">level of </w:t>
+      </w:r>
+      <w:r>
+        <w:rPr>
+          <w:rFonts w:ascii="Garamond" w:hAnsi="Garamond"/>
+          <w:sz w:val="22"/>
+          <w:szCs w:val="22"/>
+        </w:rPr>
+        <w:t>isotopic heterogeneity</w:t>
+      </w:r>
+      <w:r>
+        <w:rPr>
+          <w:rFonts w:ascii="Garamond" w:hAnsi="Garamond"/>
+          <w:sz w:val="22"/>
+          <w:szCs w:val="22"/>
+        </w:rPr>
+        <w:t xml:space="preserve"> relative to the spatial scale of potential habitat</w:t>
+      </w:r>
+      <w:r>
+        <w:rPr>
+          <w:rFonts w:ascii="Garamond" w:hAnsi="Garamond"/>
+          <w:sz w:val="22"/>
+          <w:szCs w:val="22"/>
+        </w:rPr>
+        <w:t xml:space="preserve">. </w:t>
+      </w:r>
+      <w:r>
+        <w:rPr>
+          <w:rFonts w:ascii="Garamond" w:hAnsi="Garamond"/>
+          <w:sz w:val="22"/>
+          <w:szCs w:val="22"/>
+        </w:rPr>
+        <w:t xml:space="preserve">In Western Alaska, each watershed contains </w:t>
+      </w:r>
+      <w:r>
+        <w:rPr>
+          <w:rFonts w:ascii="Garamond" w:hAnsi="Garamond"/>
+          <w:sz w:val="22"/>
+          <w:szCs w:val="22"/>
+        </w:rPr>
+        <w:t xml:space="preserve">sufficient isotopic heterogeneity to </w:t>
+      </w:r>
+      <w:r>
+        <w:rPr>
+          <w:rFonts w:ascii="Garamond" w:hAnsi="Garamond"/>
+          <w:sz w:val="22"/>
+          <w:szCs w:val="22"/>
+        </w:rPr>
+        <w:t>estimate</w:t>
+      </w:r>
+      <w:r>
+        <w:rPr>
+          <w:rFonts w:ascii="Garamond" w:hAnsi="Garamond"/>
+          <w:sz w:val="22"/>
+          <w:szCs w:val="22"/>
+        </w:rPr>
+        <w:t xml:space="preserve"> provenance with reasonable uncertainty. </w:t>
+      </w:r>
+      <w:r>
+        <w:rPr>
+          <w:rFonts w:ascii="Garamond" w:hAnsi="Garamond"/>
+          <w:sz w:val="22"/>
+          <w:szCs w:val="22"/>
+        </w:rPr>
+        <w:t xml:space="preserve">However, at </w:t>
+      </w:r>
+      <w:r>
+        <w:rPr>
+          <w:rFonts w:ascii="Garamond" w:hAnsi="Garamond"/>
+          <w:sz w:val="22"/>
+          <w:szCs w:val="22"/>
+        </w:rPr>
+        <w:t>the regional scale</w:t>
+      </w:r>
+      <w:r>
+        <w:rPr>
+          <w:rFonts w:ascii="Garamond" w:hAnsi="Garamond"/>
+          <w:sz w:val="22"/>
+          <w:szCs w:val="22"/>
+        </w:rPr>
+        <w:t xml:space="preserve"> </w:t>
+      </w:r>
+      <w:r>
+        <w:rPr>
+          <w:rFonts w:ascii="Garamond" w:hAnsi="Garamond"/>
+          <w:sz w:val="22"/>
+          <w:szCs w:val="22"/>
+        </w:rPr>
+        <w:t>which incorporates all three watersheds</w:t>
+      </w:r>
+      <w:r>
+        <w:rPr>
+          <w:rFonts w:ascii="Garamond" w:hAnsi="Garamond"/>
+          <w:sz w:val="22"/>
+          <w:szCs w:val="22"/>
+        </w:rPr>
+        <w:t xml:space="preserve"> there is significant redundancy in isotope ratios across all three major watersheds, leading to high levels of uncertainty and an inability to estimate provenance using natal Sr8786 values from the otolith. </w:t>
+      </w:r>
+    </w:p>
+    <w:p>
+      <w:pPr>
+        <w:spacing w:line="480" w:lineRule="auto"/>
+        <w:ind w:firstLine="720"/>
+        <w:rPr>
+          <w:rFonts w:ascii="Garamond" w:hAnsi="Garamond"/>
+          <w:sz w:val="22"/>
+          <w:szCs w:val="22"/>
+        </w:rPr>
+      </w:pPr>
+      <w:r>
+        <w:rPr>
+          <w:rFonts w:ascii="Garamond" w:hAnsi="Garamond"/>
+          <w:sz w:val="22"/>
+          <w:szCs w:val="22"/>
+        </w:rPr>
+        <w:t xml:space="preserve">Otolith growth </w:t>
+      </w:r>
+      <w:r>
+        <w:rPr>
+          <w:rFonts w:ascii="Garamond" w:hAnsi="Garamond"/>
+          <w:sz w:val="22"/>
+          <w:szCs w:val="22"/>
+        </w:rPr>
+        <w:t>and isotopic incorporation is</w:t>
+      </w:r>
+      <w:r>
+        <w:rPr>
+          <w:rFonts w:ascii="Garamond" w:hAnsi="Garamond"/>
+          <w:sz w:val="22"/>
+          <w:szCs w:val="22"/>
+        </w:rPr>
+        <w:t xml:space="preserve"> continuous over the lifetime of the individual</w:t>
+      </w:r>
+      <w:r>
+        <w:rPr>
+          <w:rFonts w:ascii="Garamond" w:hAnsi="Garamond"/>
+          <w:sz w:val="22"/>
+          <w:szCs w:val="22"/>
+        </w:rPr>
+        <w:t xml:space="preserve">. </w:t>
+      </w:r>
+      <w:r>
+        <w:rPr>
+          <w:rFonts w:ascii="Garamond" w:hAnsi="Garamond"/>
+          <w:sz w:val="22"/>
+          <w:szCs w:val="22"/>
+        </w:rPr>
+        <w:t xml:space="preserve">As a result, measured </w:t>
+      </w:r>
+      <w:r>
+        <w:rPr>
+          <w:rFonts w:ascii="Cambria Math" w:hAnsi="Cambria Math" w:cs="Cambria Math"/>
+          <w:sz w:val="22"/>
+          <w:szCs w:val="22"/>
+        </w:rPr>
+        <w:t>⁸⁷</w:t>
+      </w:r>
+      <w:r>
+        <w:rPr>
+          <w:rFonts w:ascii="Garamond" w:hAnsi="Garamond"/>
+          <w:sz w:val="22"/>
+          <w:szCs w:val="22"/>
+        </w:rPr>
+        <w:t>Sr/</w:t>
+      </w:r>
+      <w:r>
+        <w:rPr>
+          <w:rFonts w:ascii="Cambria Math" w:hAnsi="Cambria Math" w:cs="Cambria Math"/>
+          <w:sz w:val="22"/>
+          <w:szCs w:val="22"/>
+        </w:rPr>
+        <w:t>⁸⁶</w:t>
+      </w:r>
+      <w:r>
+        <w:rPr>
+          <w:rFonts w:ascii="Garamond" w:hAnsi="Garamond"/>
+          <w:sz w:val="22"/>
+          <w:szCs w:val="22"/>
+        </w:rPr>
+        <w:t xml:space="preserve">Sr along the growth axis of the otolith represent an integrated time series from early development until capture. Contained within these data is information on sequential habitat use, relative growth among habitats, and even the migration history of the mother. </w:t>
+      </w:r>
+      <w:r>
+        <w:rPr>
+          <w:rFonts w:ascii="Garamond" w:hAnsi="Garamond"/>
+          <w:sz w:val="22"/>
+          <w:szCs w:val="22"/>
+        </w:rPr>
+        <w:t xml:space="preserve">In some cases, these sequential habitats can be used to reconstruct full life history characteristics. However, </w:t>
+      </w:r>
+      <w:r>
+        <w:rPr>
+          <w:rFonts w:ascii="Garamond" w:hAnsi="Garamond"/>
+          <w:sz w:val="22"/>
+          <w:szCs w:val="22"/>
+        </w:rPr>
+        <w:t xml:space="preserve">when </w:t>
+      </w:r>
+      <w:r>
+        <w:rPr>
+          <w:rFonts w:ascii="Garamond" w:hAnsi="Garamond"/>
+          <w:sz w:val="22"/>
+          <w:szCs w:val="22"/>
+        </w:rPr>
+        <w:t xml:space="preserve">moving </w:t>
+      </w:r>
+      <w:r>
+        <w:rPr>
+          <w:rFonts w:ascii="Garamond" w:hAnsi="Garamond"/>
+          <w:sz w:val="22"/>
+          <w:szCs w:val="22"/>
+        </w:rPr>
+        <w:t>rapidly through several environments, as is the case for salmon out-migrati</w:t>
+      </w:r>
+      <w:r>
+        <w:rPr>
+          <w:rFonts w:ascii="Garamond" w:hAnsi="Garamond"/>
+          <w:sz w:val="22"/>
+          <w:szCs w:val="22"/>
+        </w:rPr>
+        <w:t xml:space="preserve">on, </w:t>
+      </w:r>
+      <w:r>
+        <w:rPr>
+          <w:rFonts w:ascii="Garamond" w:hAnsi="Garamond"/>
+          <w:sz w:val="22"/>
+          <w:szCs w:val="22"/>
+        </w:rPr>
+        <w:t xml:space="preserve">otolith isotope ratios may not sufficiently equilibrate to </w:t>
+      </w:r>
+      <w:r>
+        <w:rPr>
+          <w:rFonts w:ascii="Garamond" w:hAnsi="Garamond"/>
+          <w:sz w:val="22"/>
+          <w:szCs w:val="22"/>
+        </w:rPr>
+        <w:t xml:space="preserve">reflect </w:t>
+      </w:r>
+      <w:r>
+        <w:rPr>
+          <w:rFonts w:ascii="Garamond" w:hAnsi="Garamond"/>
+          <w:sz w:val="22"/>
+          <w:szCs w:val="22"/>
+        </w:rPr>
+        <w:t xml:space="preserve">the water values of each habitat. </w:t>
+      </w:r>
+      <w:r>
+        <w:rPr>
+          <w:rFonts w:ascii="Garamond" w:hAnsi="Garamond"/>
+          <w:sz w:val="22"/>
+          <w:szCs w:val="22"/>
+        </w:rPr>
+        <w:t>The result are patterns in the otolith isotope data which may not be interpretable by directly relating these data to the landscape but may contain stock or watershed specific life history characteristics.</w:t>
+      </w:r>
+      <w:r>
+        <w:rPr>
+          <w:rFonts w:ascii="Garamond" w:hAnsi="Garamond"/>
+          <w:sz w:val="22"/>
+          <w:szCs w:val="22"/>
+        </w:rPr>
+        <w:t xml:space="preserve"> However, the subtlety of these patterns and number of potential combinations make manual interpretation logistically </w:t>
+      </w:r>
+      <w:r>
+        <w:rPr>
+          <w:rFonts w:ascii="Garamond" w:hAnsi="Garamond"/>
+          <w:sz w:val="22"/>
+          <w:szCs w:val="22"/>
+        </w:rPr>
+        <w:t>unfeasible</w:t>
+      </w:r>
+      <w:r>
+        <w:rPr>
+          <w:rFonts w:ascii="Garamond" w:hAnsi="Garamond"/>
+          <w:sz w:val="22"/>
+          <w:szCs w:val="22"/>
+        </w:rPr>
+        <w:t xml:space="preserve">. </w:t>
+      </w:r>
+    </w:p>
+    <w:p>
+      <w:pPr>
+        <w:spacing w:line="480" w:lineRule="auto"/>
+        <w:ind w:firstLine="720"/>
+        <w:rPr>
+          <w:rFonts w:ascii="Garamond" w:hAnsi="Garamond"/>
+          <w:sz w:val="22"/>
+          <w:szCs w:val="22"/>
+        </w:rPr>
+      </w:pPr>
+      <w:r>
+        <w:rPr>
+          <w:rFonts w:ascii="Garamond" w:hAnsi="Garamond"/>
+          <w:sz w:val="22"/>
+          <w:szCs w:val="22"/>
+        </w:rPr>
+        <w:t xml:space="preserve">Machine learning tools have only recently been recognized for their potential applications to otolith chemical applications and have shown promising performance relative to traditional techniques. </w:t>
+      </w:r>
+      <w:r>
+        <w:rPr>
+          <w:rFonts w:ascii="Garamond" w:hAnsi="Garamond"/>
+          <w:sz w:val="22"/>
+          <w:szCs w:val="22"/>
+        </w:rPr>
+        <w:t xml:space="preserve">Concurrently, </w:t>
+      </w:r>
+      <w:r>
+        <w:rPr>
+          <w:rFonts w:ascii="Garamond" w:hAnsi="Garamond"/>
+          <w:sz w:val="22"/>
+          <w:szCs w:val="22"/>
+        </w:rPr>
+        <w:t xml:space="preserve">there is </w:t>
+      </w:r>
+      <w:r>
+        <w:rPr>
+          <w:rFonts w:ascii="Garamond" w:hAnsi="Garamond"/>
+          <w:sz w:val="22"/>
+          <w:szCs w:val="22"/>
+        </w:rPr>
+        <w:t xml:space="preserve">increasing interested in </w:t>
+      </w:r>
+      <w:r>
+        <w:rPr>
+          <w:rFonts w:ascii="Garamond" w:hAnsi="Garamond"/>
+          <w:sz w:val="22"/>
+          <w:szCs w:val="22"/>
+        </w:rPr>
+        <w:t xml:space="preserve">harnessing the full potential of otolith timeseries data from </w:t>
       </w:r>
       <w:r>
         <w:rPr>
@@ -395,143 +823,47 @@
           <w:szCs w:val="22"/>
         </w:rPr>
         <w:lastRenderedPageBreak/>
-        <w:t>ability to assign provenance at refined spatial scales. This is accomplished by relating the strontium isotope ratio (</w:t>
-      </w:r>
-      <w:r>
-        <w:rPr>
-          <w:rFonts w:ascii="Cambria Math" w:hAnsi="Cambria Math" w:cs="Cambria Math"/>
-          <w:sz w:val="22"/>
-          <w:szCs w:val="22"/>
-        </w:rPr>
-        <w:t>⁸⁷</w:t>
-      </w:r>
-      <w:r>
-        <w:rPr>
-          <w:rFonts w:ascii="Garamond" w:hAnsi="Garamond"/>
-          <w:sz w:val="22"/>
-          <w:szCs w:val="22"/>
-        </w:rPr>
-        <w:t>Sr/</w:t>
-      </w:r>
-      <w:r>
-        <w:rPr>
-          <w:rFonts w:ascii="Cambria Math" w:hAnsi="Cambria Math" w:cs="Cambria Math"/>
-          <w:sz w:val="22"/>
-          <w:szCs w:val="22"/>
-        </w:rPr>
-        <w:t>⁸⁶</w:t>
-      </w:r>
-      <w:r>
-        <w:rPr>
-          <w:rFonts w:ascii="Garamond" w:hAnsi="Garamond"/>
-          <w:sz w:val="22"/>
-          <w:szCs w:val="22"/>
-        </w:rPr>
-        <w:t xml:space="preserve">Sr) </w:t>
-      </w:r>
-      <w:r>
-        <w:rPr>
-          <w:rFonts w:ascii="Garamond" w:hAnsi="Garamond"/>
-          <w:sz w:val="22"/>
-          <w:szCs w:val="22"/>
-        </w:rPr>
-        <w:t>extracted from the natal freshwater rearing period in the</w:t>
-      </w:r>
-      <w:r>
-        <w:rPr>
-          <w:rFonts w:ascii="Garamond" w:hAnsi="Garamond"/>
-          <w:sz w:val="22"/>
-          <w:szCs w:val="22"/>
-        </w:rPr>
-        <w:t xml:space="preserve"> otolith to modeled or measured ratios across the river basin. </w:t>
-      </w:r>
-      <w:r>
-        <w:rPr>
-          <w:rFonts w:ascii="Cambria Math" w:hAnsi="Cambria Math" w:cs="Cambria Math"/>
-          <w:sz w:val="22"/>
-          <w:szCs w:val="22"/>
-        </w:rPr>
-        <w:t>⁸⁷</w:t>
-      </w:r>
-      <w:r>
-        <w:rPr>
-          <w:rFonts w:ascii="Garamond" w:hAnsi="Garamond"/>
-          <w:sz w:val="22"/>
-          <w:szCs w:val="22"/>
-        </w:rPr>
-        <w:t>Sr/</w:t>
-      </w:r>
-      <w:r>
-        <w:rPr>
-          <w:rFonts w:ascii="Cambria Math" w:hAnsi="Cambria Math" w:cs="Cambria Math"/>
-          <w:sz w:val="22"/>
-          <w:szCs w:val="22"/>
-        </w:rPr>
-        <w:t>⁸⁶</w:t>
-      </w:r>
-      <w:r>
-        <w:rPr>
-          <w:rFonts w:ascii="Garamond" w:hAnsi="Garamond"/>
-          <w:sz w:val="22"/>
-          <w:szCs w:val="22"/>
-        </w:rPr>
-        <w:t xml:space="preserve">Sr </w:t>
-      </w:r>
-      <w:r>
-        <w:rPr>
-          <w:rFonts w:ascii="Garamond" w:hAnsi="Garamond"/>
-          <w:sz w:val="22"/>
-          <w:szCs w:val="22"/>
-        </w:rPr>
-        <w:t>ratios</w:t>
-      </w:r>
-      <w:r>
-        <w:rPr>
-          <w:rFonts w:ascii="Garamond" w:hAnsi="Garamond"/>
-          <w:sz w:val="22"/>
-          <w:szCs w:val="22"/>
-        </w:rPr>
-        <w:t xml:space="preserve"> </w:t>
-      </w:r>
-      <w:r>
-        <w:rPr>
-          <w:rFonts w:ascii="Garamond" w:hAnsi="Garamond"/>
-          <w:sz w:val="22"/>
-          <w:szCs w:val="22"/>
-        </w:rPr>
-        <w:t>are</w:t>
-      </w:r>
-      <w:r>
-        <w:rPr>
-          <w:rFonts w:ascii="Garamond" w:hAnsi="Garamond"/>
-          <w:sz w:val="22"/>
-          <w:szCs w:val="22"/>
-        </w:rPr>
-        <w:t xml:space="preserve"> heterogeneously distributed across geologically diverse landscapes, faithfully incorporated into the metabolically inert structure of the otolith, and has been shown to be temporally stable in Alaskan </w:t>
-      </w:r>
-      <w:r>
-        <w:rPr>
-          <w:rFonts w:ascii="Garamond" w:hAnsi="Garamond"/>
-          <w:sz w:val="22"/>
-          <w:szCs w:val="22"/>
-        </w:rPr>
-        <w:t>watersheds,</w:t>
-      </w:r>
-      <w:r>
-        <w:rPr>
-          <w:rFonts w:ascii="Garamond" w:hAnsi="Garamond"/>
-          <w:sz w:val="22"/>
-          <w:szCs w:val="22"/>
-        </w:rPr>
-        <w:t xml:space="preserve"> </w:t>
-      </w:r>
-      <w:r>
-        <w:rPr>
-          <w:rFonts w:ascii="Garamond" w:hAnsi="Garamond"/>
-          <w:sz w:val="22"/>
-          <w:szCs w:val="22"/>
-        </w:rPr>
-        <w:t>making it an ideal tracer for posthumously estimating provenance. However, this method is limited by the isotopic heterogeneity found across the landscape. At the watershed scale, all three systems in western Alaska contain sufficient isotopic heterogeneity to allow provenance estimates with reasonable uncertainty. At the regional scale, however, which incorporates all three watersheds, isotopic heterogeneity is insufficient to reliably distinguish provenance among rivers</w:t>
+        <w:t xml:space="preserve">Laser Ablation Mass Spectrometry (LA-MS), which has shown promise for uncovering life history variations otherwise obscured from discrete measurements. Applying machine learning tools directly to otolith laser ablation (LA) timeseries data provides an opportunity to uncover subtle patterns in the otherwise noisy datasets that may help shed light on important life history characteristics. Here, we apply machine learning classification algorithms to otolith LA timeseries data from Chinook salmon with known watersheds of origin in Western Alaska. In doing so we will 1) test the potential of using machine learning tools to determine stock of origin </w:t>
+      </w:r>
+      <w:r>
+        <w:rPr>
+          <w:rFonts w:ascii="Garamond" w:hAnsi="Garamond"/>
+          <w:sz w:val="22"/>
+          <w:szCs w:val="22"/>
+        </w:rPr>
+        <w:t xml:space="preserve">2) develop a classification model to </w:t>
+      </w:r>
+      <w:r>
+        <w:rPr>
+          <w:rFonts w:ascii="Garamond" w:hAnsi="Garamond"/>
+          <w:sz w:val="22"/>
+          <w:szCs w:val="22"/>
+        </w:rPr>
+        <w:t xml:space="preserve">reliably </w:t>
+      </w:r>
+      <w:r>
+        <w:rPr>
+          <w:rFonts w:ascii="Garamond" w:hAnsi="Garamond"/>
+          <w:sz w:val="22"/>
+          <w:szCs w:val="22"/>
+        </w:rPr>
+        <w:t xml:space="preserve">estimate river of origin for marine-caught Chinook salmon </w:t>
+      </w:r>
+      <w:r>
+        <w:rPr>
+          <w:rFonts w:ascii="Garamond" w:hAnsi="Garamond"/>
+          <w:sz w:val="22"/>
+          <w:szCs w:val="22"/>
+        </w:rPr>
+        <w:t xml:space="preserve">in </w:t>
+      </w:r>
+      <w:r>
+        <w:rPr>
+          <w:rFonts w:ascii="Garamond" w:hAnsi="Garamond"/>
+          <w:sz w:val="22"/>
+          <w:szCs w:val="22"/>
+        </w:rPr>
+        <w:t>western Alaska</w:t>
       </w:r>
       <w:r>
         <w:rPr>
@@ -540,157 +872,6 @@
           <w:szCs w:val="22"/>
         </w:rPr>
         <w:t xml:space="preserve">. </w:t>
-      </w:r>
-      <w:r>
-        <w:rPr>
-          <w:rFonts w:ascii="Garamond" w:hAnsi="Garamond"/>
-          <w:sz w:val="22"/>
-          <w:szCs w:val="22"/>
-        </w:rPr>
-        <w:t xml:space="preserve">As a result, provenance estimates from natal origin </w:t>
-      </w:r>
-      <w:r>
-        <w:rPr>
-          <w:rFonts w:ascii="Cambria Math" w:hAnsi="Cambria Math" w:cs="Cambria Math"/>
-          <w:sz w:val="22"/>
-          <w:szCs w:val="22"/>
-        </w:rPr>
-        <w:t>⁸⁷</w:t>
-      </w:r>
-      <w:r>
-        <w:rPr>
-          <w:rFonts w:ascii="Garamond" w:hAnsi="Garamond"/>
-          <w:sz w:val="22"/>
-          <w:szCs w:val="22"/>
-        </w:rPr>
-        <w:t>Sr/</w:t>
-      </w:r>
-      <w:r>
-        <w:rPr>
-          <w:rFonts w:ascii="Cambria Math" w:hAnsi="Cambria Math" w:cs="Cambria Math"/>
-          <w:sz w:val="22"/>
-          <w:szCs w:val="22"/>
-        </w:rPr>
-        <w:t>⁸⁶</w:t>
-      </w:r>
-      <w:r>
-        <w:rPr>
-          <w:rFonts w:ascii="Garamond" w:hAnsi="Garamond"/>
-          <w:sz w:val="22"/>
-          <w:szCs w:val="22"/>
-        </w:rPr>
-        <w:t>Sr ratios alone cannot be used to estimate provenance of marine-caught fish, which could have originated from anywhere in the region.</w:t>
-      </w:r>
-    </w:p>
-    <w:p>
-      <w:pPr>
-        <w:spacing w:line="480" w:lineRule="auto"/>
-        <w:ind w:firstLine="720"/>
-        <w:rPr>
-          <w:rFonts w:ascii="Garamond" w:hAnsi="Garamond"/>
-          <w:sz w:val="22"/>
-          <w:szCs w:val="22"/>
-        </w:rPr>
-      </w:pPr>
-      <w:r>
-        <w:rPr>
-          <w:rFonts w:ascii="Garamond" w:hAnsi="Garamond"/>
-          <w:sz w:val="22"/>
-          <w:szCs w:val="22"/>
-        </w:rPr>
-        <w:t xml:space="preserve">Otolith growth is continuous over the lifetime of the individual and records chemical and isotopic signatures from the environment into the metabolically inert structure. As a result, measured </w:t>
-      </w:r>
-      <w:r>
-        <w:rPr>
-          <w:rFonts w:ascii="Cambria Math" w:hAnsi="Cambria Math" w:cs="Cambria Math"/>
-          <w:sz w:val="22"/>
-          <w:szCs w:val="22"/>
-        </w:rPr>
-        <w:t>⁸⁷</w:t>
-      </w:r>
-      <w:r>
-        <w:rPr>
-          <w:rFonts w:ascii="Garamond" w:hAnsi="Garamond"/>
-          <w:sz w:val="22"/>
-          <w:szCs w:val="22"/>
-        </w:rPr>
-        <w:t>Sr/</w:t>
-      </w:r>
-      <w:r>
-        <w:rPr>
-          <w:rFonts w:ascii="Cambria Math" w:hAnsi="Cambria Math" w:cs="Cambria Math"/>
-          <w:sz w:val="22"/>
-          <w:szCs w:val="22"/>
-        </w:rPr>
-        <w:t>⁸⁶</w:t>
-      </w:r>
-      <w:r>
-        <w:rPr>
-          <w:rFonts w:ascii="Garamond" w:hAnsi="Garamond"/>
-          <w:sz w:val="22"/>
-          <w:szCs w:val="22"/>
-        </w:rPr>
-        <w:t xml:space="preserve">Sr values along the growth axis of the otolith represent an integrated time series of experienced </w:t>
-      </w:r>
-      <w:r>
-        <w:rPr>
-          <w:rFonts w:ascii="Cambria Math" w:hAnsi="Cambria Math" w:cs="Cambria Math"/>
-          <w:sz w:val="22"/>
-          <w:szCs w:val="22"/>
-        </w:rPr>
-        <w:t>⁸⁷</w:t>
-      </w:r>
-      <w:r>
-        <w:rPr>
-          <w:rFonts w:ascii="Garamond" w:hAnsi="Garamond"/>
-          <w:sz w:val="22"/>
-          <w:szCs w:val="22"/>
-        </w:rPr>
-        <w:t>Sr/</w:t>
-      </w:r>
-      <w:r>
-        <w:rPr>
-          <w:rFonts w:ascii="Cambria Math" w:hAnsi="Cambria Math" w:cs="Cambria Math"/>
-          <w:sz w:val="22"/>
-          <w:szCs w:val="22"/>
-        </w:rPr>
-        <w:t>⁸⁶</w:t>
-      </w:r>
-      <w:r>
-        <w:rPr>
-          <w:rFonts w:ascii="Garamond" w:hAnsi="Garamond"/>
-          <w:sz w:val="22"/>
-          <w:szCs w:val="22"/>
-        </w:rPr>
-        <w:t>Sr from early development until capture. Contained within these data is information on sequential habitat use, relative growth among habitats, and even the migration history of the mother. Patterns in the time series can therefore be used to reconstruct various characteristics of life history. However, when individuals move rapidly through several isotopically unique environments, as is the case for Pacific salmon out-migrating from their freshwater natal rearing environment to the ocean, otolith isotope ratios may not sufficiently equilibrate to the water values of each sequential habitat. Consequently, while patterns in small variations in the otolith time series may contain valuable life history information, they may not be readily interpretable by relating these values to those found in the landscape</w:t>
-      </w:r>
-    </w:p>
-    <w:p>
-      <w:pPr>
-        <w:spacing w:line="480" w:lineRule="auto"/>
-        <w:ind w:firstLine="720"/>
-        <w:rPr>
-          <w:rFonts w:ascii="Garamond" w:hAnsi="Garamond"/>
-          <w:sz w:val="22"/>
-          <w:szCs w:val="22"/>
-        </w:rPr>
-      </w:pPr>
-      <w:r>
-        <w:rPr>
-          <w:rFonts w:ascii="Garamond" w:hAnsi="Garamond"/>
-          <w:sz w:val="22"/>
-          <w:szCs w:val="22"/>
-        </w:rPr>
-        <w:t xml:space="preserve">As the use of otolith chemical tools for fisheries research continues to proliferate, there is growing interest in applying machine learning approaches to these research applications. Concurrently, researchers are increasingly interested in using the full time series of otolith data to explore differences in life histories among </w:t>
-      </w:r>
-      <w:r>
-        <w:rPr>
-          <w:rFonts w:ascii="Garamond" w:hAnsi="Garamond"/>
-          <w:sz w:val="22"/>
-          <w:szCs w:val="22"/>
-        </w:rPr>
-        <w:lastRenderedPageBreak/>
-        <w:t>individuals. Combining these approaches may allow for uncovering watershed- or stock-specific patterns in the complete record of individual life history, which may otherwise be obscured by noise. Here, we apply machine learning classification algorithms to otolith time series from Chinook salmon in western Alaska with known watershed labels to 1) test the potential of using machine learning tools alongside otolith time series data to discriminate among otherwise indistinguishable stocks and 2) develop a classification model to estimate river of origin for marine-caught Chinook salmon from western Alaska</w:t>
       </w:r>
     </w:p>
     <w:p>
@@ -838,23 +1019,7 @@
           <w:sz w:val="22"/>
           <w:szCs w:val="22"/>
         </w:rPr>
-        <w:t xml:space="preserve">. Approximately 500 otoliths were collected each year, and from these, ~250 otoliths from each year were selected for further analysis. Selected samples were then cut along the transverse plane </w:t>
-      </w:r>
-      <w:r>
-        <w:rPr>
-          <w:rFonts w:ascii="Garamond" w:hAnsi="Garamond"/>
-          <w:sz w:val="22"/>
-          <w:szCs w:val="22"/>
-        </w:rPr>
-        <w:t xml:space="preserve">to reveal the core </w:t>
-      </w:r>
-      <w:r>
-        <w:rPr>
-          <w:rFonts w:ascii="Garamond" w:hAnsi="Garamond"/>
-          <w:sz w:val="22"/>
-          <w:szCs w:val="22"/>
-        </w:rPr>
-        <w:t xml:space="preserve">using a </w:t>
+        <w:t xml:space="preserve">. Approximately 500 otoliths were collected each year, and from these, ~250 otoliths from each year were selected for further analysis. Selected samples were then cut along the transverse plane to reveal the core using a </w:t>
       </w:r>
       <w:proofErr w:type="gramStart"/>
       <w:r>
@@ -959,7 +1124,7 @@
           <w:sz w:val="22"/>
           <w:szCs w:val="22"/>
         </w:rPr>
-        <w:t xml:space="preserve"> significant variation in the length and location of ablation lines relative to the lifespan of the fish. To standardize all data to the same life history period, time series were trimmed to between the location of the core and the onset of marine residence. These locations on the otolith time series were identified by </w:t>
+        <w:t xml:space="preserve"> significant variation in the length and location of ablation lines relative to the lifespan of the fish. To </w:t>
       </w:r>
       <w:r>
         <w:rPr>
@@ -968,7 +1133,7 @@
           <w:szCs w:val="22"/>
         </w:rPr>
         <w:lastRenderedPageBreak/>
-        <w:t xml:space="preserve">examining patterns in </w:t>
+        <w:t xml:space="preserve">standardize all data to the same life history period, time series were trimmed to between the location of the core and the onset of marine residence. These locations on the otolith time series were identified by examining patterns in </w:t>
       </w:r>
       <w:r>
         <w:rPr>
@@ -1080,13 +1245,144 @@
           <w:sz w:val="22"/>
           <w:szCs w:val="22"/>
         </w:rPr>
-        <w:t>Sr to the marine strontium value. For all otoliths, the selection of trimming locations was randomized and blinded to avoid confounding by expected patterns or repeated patterns within a single class.</w:t>
-      </w:r>
-      <w:r>
-        <w:rPr>
-          <w:rFonts w:ascii="Garamond" w:hAnsi="Garamond"/>
-          <w:sz w:val="22"/>
-          <w:szCs w:val="22"/>
+        <w:t xml:space="preserve">Sr to the marine strontium value. For all otoliths, the selection of trimming locations was randomized and blinded to avoid confounding by expected patterns or repeated patterns within a single class. </w:t>
+      </w:r>
+      <w:r>
+        <w:rPr>
+          <w:rFonts w:ascii="Garamond" w:hAnsi="Garamond"/>
+          <w:sz w:val="22"/>
+          <w:szCs w:val="22"/>
+        </w:rPr>
+        <w:t>The location o</w:t>
+      </w:r>
+      <w:r>
+        <w:rPr>
+          <w:rFonts w:ascii="Garamond" w:hAnsi="Garamond"/>
+          <w:sz w:val="22"/>
+          <w:szCs w:val="22"/>
+        </w:rPr>
+        <w:t xml:space="preserve">f these trimming locations as well as the selected region of the natal origin signature were manually </w:t>
+      </w:r>
+      <w:proofErr w:type="spellStart"/>
+      <w:r>
+        <w:rPr>
+          <w:rFonts w:ascii="Garamond" w:hAnsi="Garamond"/>
+          <w:sz w:val="22"/>
+          <w:szCs w:val="22"/>
+        </w:rPr>
+        <w:t>QCd</w:t>
+      </w:r>
+      <w:proofErr w:type="spellEnd"/>
+      <w:r>
+        <w:rPr>
+          <w:rFonts w:ascii="Garamond" w:hAnsi="Garamond"/>
+          <w:sz w:val="22"/>
+          <w:szCs w:val="22"/>
+        </w:rPr>
+        <w:t xml:space="preserve"> for all individuals. Individuals with large errors from sample prep or laser ablation (i.e. large cracks</w:t>
+      </w:r>
+      <w:proofErr w:type="gramStart"/>
+      <w:r>
+        <w:rPr>
+          <w:rFonts w:ascii="Garamond" w:hAnsi="Garamond"/>
+          <w:sz w:val="22"/>
+          <w:szCs w:val="22"/>
+        </w:rPr>
+        <w:t>) ,</w:t>
+      </w:r>
+      <w:proofErr w:type="gramEnd"/>
+      <w:r>
+        <w:rPr>
+          <w:rFonts w:ascii="Garamond" w:hAnsi="Garamond"/>
+          <w:sz w:val="22"/>
+          <w:szCs w:val="22"/>
+        </w:rPr>
+        <w:t xml:space="preserve"> unclear marine entry, or no core signal were removed from the dataset. </w:t>
+      </w:r>
+    </w:p>
+    <w:p>
+      <w:pPr>
+        <w:spacing w:line="480" w:lineRule="auto"/>
+        <w:ind w:firstLine="720"/>
+        <w:rPr>
+          <w:rFonts w:ascii="Garamond" w:hAnsi="Garamond"/>
+          <w:sz w:val="22"/>
+          <w:szCs w:val="22"/>
+        </w:rPr>
+      </w:pPr>
+      <w:r>
+        <w:rPr>
+          <w:rFonts w:ascii="Garamond" w:hAnsi="Garamond"/>
+          <w:sz w:val="22"/>
+          <w:szCs w:val="22"/>
+        </w:rPr>
+        <w:t xml:space="preserve">Otolith data from LA-ICPMS analysis contains significant machine error, which can obscure subtle changes in </w:t>
+      </w:r>
+      <w:r>
+        <w:rPr>
+          <w:rFonts w:ascii="Cambria Math" w:hAnsi="Cambria Math" w:cs="Cambria Math"/>
+          <w:sz w:val="22"/>
+          <w:szCs w:val="22"/>
+        </w:rPr>
+        <w:t>⁸⁷</w:t>
+      </w:r>
+      <w:r>
+        <w:rPr>
+          <w:rFonts w:ascii="Garamond" w:hAnsi="Garamond"/>
+          <w:sz w:val="22"/>
+          <w:szCs w:val="22"/>
+        </w:rPr>
+        <w:t>Sr/</w:t>
+      </w:r>
+      <w:r>
+        <w:rPr>
+          <w:rFonts w:ascii="Cambria Math" w:hAnsi="Cambria Math" w:cs="Cambria Math"/>
+          <w:sz w:val="22"/>
+          <w:szCs w:val="22"/>
+        </w:rPr>
+        <w:t>⁸⁶</w:t>
+      </w:r>
+      <w:r>
+        <w:rPr>
+          <w:rFonts w:ascii="Garamond" w:hAnsi="Garamond"/>
+          <w:sz w:val="22"/>
+          <w:szCs w:val="22"/>
+        </w:rPr>
+        <w:t xml:space="preserve">Sr ratios that are critical for interpretation. To address this challenge and reveal underlying patterns, researchers commonly apply time series smoothing techniques to these datasets. We tested whether such smoothing could improve model performance by applying two commonly used approaches: moving average (MA) and a generalized additive model (GAM) timeseries smoothing. Moving average smoothing used a simple </w:t>
+      </w:r>
+      <w:proofErr w:type="gramStart"/>
+      <w:r>
+        <w:rPr>
+          <w:rFonts w:ascii="Garamond" w:hAnsi="Garamond"/>
+          <w:sz w:val="22"/>
+          <w:szCs w:val="22"/>
+        </w:rPr>
+        <w:t>60 point</w:t>
+      </w:r>
+      <w:proofErr w:type="gramEnd"/>
+      <w:r>
+        <w:rPr>
+          <w:rFonts w:ascii="Garamond" w:hAnsi="Garamond"/>
+          <w:sz w:val="22"/>
+          <w:szCs w:val="22"/>
+        </w:rPr>
+        <w:t xml:space="preserve"> window with center weighting. The GAM approach used fitted thin-plate regression and penalized iteratively re-weighted least squared (P-IRLS) to maximize goodness of fit. A GCV method was used to minimize over fitting (Wood, 2006). The maximum degrees of freedom (k) were scaled by the number of data points in each ablation line (n) by k = 10N </w:t>
+      </w:r>
+      <w:r>
+        <w:rPr>
+          <w:rFonts w:ascii="Garamond" w:hAnsi="Garamond"/>
+          <w:sz w:val="22"/>
+          <w:szCs w:val="22"/>
+          <w:vertAlign w:val="superscript"/>
+        </w:rPr>
+        <w:t>2/9</w:t>
+      </w:r>
+      <w:r>
+        <w:rPr>
+          <w:rFonts w:ascii="Garamond" w:hAnsi="Garamond"/>
+          <w:sz w:val="22"/>
+          <w:szCs w:val="22"/>
+          <w:vertAlign w:val="superscript"/>
         </w:rPr>
         <w:t xml:space="preserve"> </w:t>
       </w:r>
@@ -1096,33 +1392,34 @@
           <w:sz w:val="22"/>
           <w:szCs w:val="22"/>
         </w:rPr>
-        <w:t>The location o</w:t>
-      </w:r>
-      <w:r>
-        <w:rPr>
-          <w:rFonts w:ascii="Garamond" w:hAnsi="Garamond"/>
-          <w:sz w:val="22"/>
-          <w:szCs w:val="22"/>
-        </w:rPr>
-        <w:t xml:space="preserve">f these trimming locations as well as the selected region of the natal origin signature were manually </w:t>
-      </w:r>
-      <w:proofErr w:type="spellStart"/>
-      <w:r>
-        <w:rPr>
-          <w:rFonts w:ascii="Garamond" w:hAnsi="Garamond"/>
-          <w:sz w:val="22"/>
-          <w:szCs w:val="22"/>
-        </w:rPr>
-        <w:t>QCd</w:t>
-      </w:r>
-      <w:proofErr w:type="spellEnd"/>
-      <w:r>
-        <w:rPr>
-          <w:rFonts w:ascii="Garamond" w:hAnsi="Garamond"/>
-          <w:sz w:val="22"/>
-          <w:szCs w:val="22"/>
-        </w:rPr>
-        <w:t xml:space="preserve"> for all individuals. Individuals with large errors from sample prep or laser ablation (i.e. large cracks</w:t>
+        <w:t xml:space="preserve">(Kim and Gu, 2004, Brennan et al., </w:t>
+      </w:r>
+      <w:r>
+        <w:rPr>
+          <w:rFonts w:ascii="Garamond" w:hAnsi="Garamond"/>
+          <w:sz w:val="22"/>
+          <w:szCs w:val="22"/>
+        </w:rPr>
+        <w:t xml:space="preserve">2014). </w:t>
+      </w:r>
+    </w:p>
+    <w:p>
+      <w:pPr>
+        <w:spacing w:line="480" w:lineRule="auto"/>
+        <w:ind w:firstLine="720"/>
+        <w:rPr>
+          <w:rFonts w:ascii="Garamond" w:hAnsi="Garamond"/>
+          <w:sz w:val="22"/>
+          <w:szCs w:val="22"/>
+        </w:rPr>
+      </w:pPr>
+      <w:r>
+        <w:rPr>
+          <w:rFonts w:ascii="Garamond" w:hAnsi="Garamond"/>
+          <w:sz w:val="22"/>
+          <w:szCs w:val="22"/>
+        </w:rPr>
+        <w:t>One limitation of many common machine learning classification models is their dependence on fixed dimension vectors with a consistent length. Because otolith growth is directly proportional to individual growth, the number of microns (</w:t>
       </w:r>
       <w:proofErr w:type="gramStart"/>
       <w:r>
@@ -1131,7 +1428,7 @@
           <w:sz w:val="22"/>
           <w:szCs w:val="22"/>
         </w:rPr>
-        <w:t>) ,</w:t>
+        <w:t>and ,</w:t>
       </w:r>
       <w:proofErr w:type="gramEnd"/>
       <w:r>
@@ -1140,82 +1437,65 @@
           <w:sz w:val="22"/>
           <w:szCs w:val="22"/>
         </w:rPr>
-        <w:t xml:space="preserve"> unclear marine entry, or no core signal were removed from the dataset. </w:t>
-      </w:r>
-    </w:p>
-    <w:p>
-      <w:pPr>
-        <w:spacing w:line="480" w:lineRule="auto"/>
-        <w:ind w:firstLine="720"/>
-        <w:rPr>
-          <w:rFonts w:ascii="Garamond" w:hAnsi="Garamond"/>
-          <w:sz w:val="22"/>
-          <w:szCs w:val="22"/>
-        </w:rPr>
-      </w:pPr>
-      <w:r>
-        <w:rPr>
-          <w:rFonts w:ascii="Garamond" w:hAnsi="Garamond"/>
-          <w:sz w:val="22"/>
-          <w:szCs w:val="22"/>
-        </w:rPr>
-        <w:t xml:space="preserve">Otolith data from LA-ICPMS analysis contains significant machine error, which can obscure subtle changes in </w:t>
-      </w:r>
-      <w:r>
-        <w:rPr>
-          <w:rFonts w:ascii="Cambria Math" w:hAnsi="Cambria Math" w:cs="Cambria Math"/>
-          <w:sz w:val="22"/>
-          <w:szCs w:val="22"/>
-        </w:rPr>
-        <w:t>⁸⁷</w:t>
-      </w:r>
-      <w:r>
-        <w:rPr>
-          <w:rFonts w:ascii="Garamond" w:hAnsi="Garamond"/>
-          <w:sz w:val="22"/>
-          <w:szCs w:val="22"/>
-        </w:rPr>
-        <w:t>Sr/</w:t>
-      </w:r>
-      <w:r>
-        <w:rPr>
-          <w:rFonts w:ascii="Cambria Math" w:hAnsi="Cambria Math" w:cs="Cambria Math"/>
-          <w:sz w:val="22"/>
-          <w:szCs w:val="22"/>
-        </w:rPr>
-        <w:t>⁸⁶</w:t>
-      </w:r>
-      <w:r>
-        <w:rPr>
-          <w:rFonts w:ascii="Garamond" w:hAnsi="Garamond"/>
-          <w:sz w:val="22"/>
-          <w:szCs w:val="22"/>
-        </w:rPr>
-        <w:t xml:space="preserve">Sr ratios that are critical for interpretation. To address this challenge and reveal underlying patterns, researchers commonly apply time series smoothing techniques to these datasets. We tested whether such smoothing could improve model performance by applying two </w:t>
-      </w:r>
-      <w:r>
-        <w:rPr>
-          <w:rFonts w:ascii="Garamond" w:hAnsi="Garamond"/>
-          <w:sz w:val="22"/>
-          <w:szCs w:val="22"/>
-        </w:rPr>
-        <w:t>commonly used</w:t>
-      </w:r>
-      <w:r>
-        <w:rPr>
-          <w:rFonts w:ascii="Garamond" w:hAnsi="Garamond"/>
-          <w:sz w:val="22"/>
-          <w:szCs w:val="22"/>
-        </w:rPr>
-        <w:t xml:space="preserve"> approaches: moving average (MA) and a generalized additive model (GAM)</w:t>
-      </w:r>
-      <w:r>
-        <w:rPr>
-          <w:rFonts w:ascii="Garamond" w:hAnsi="Garamond"/>
-          <w:sz w:val="22"/>
-          <w:szCs w:val="22"/>
-        </w:rPr>
-        <w:t xml:space="preserve"> timeseries smoothing. Moving average smoothing used a simple </w:t>
+        <w:t xml:space="preserve"> subsequently, reads) in otolith. The number of microns, and LA data is variable among individuals. To overcome this limitation we interpolated all samples to the same length, which is the calculated average length of all timeseries (INSERT VALUE HERE) </w:t>
+      </w:r>
+      <w:r>
+        <w:rPr>
+          <w:rFonts w:ascii="Garamond" w:hAnsi="Garamond"/>
+          <w:sz w:val="22"/>
+          <w:szCs w:val="22"/>
+        </w:rPr>
+        <w:fldChar w:fldCharType="begin"/>
+      </w:r>
+      <w:r>
+        <w:rPr>
+          <w:rFonts w:ascii="Garamond" w:hAnsi="Garamond"/>
+          <w:sz w:val="22"/>
+          <w:szCs w:val="22"/>
+        </w:rPr>
+        <w:instrText xml:space="preserve"> ADDIN ZOTERO_ITEM CSL_CITATION {"citationID":"IkCFfZW4","properties":{"formattedCitation":"(Hegg &amp; Kennedy, 2021)","plainCitation":"(Hegg &amp; Kennedy, 2021)","noteIndex":0},"citationItems":[{"id":4390,"uris":["http://zotero.org/users/8421274/items/BD9UPNI2"],"itemData":{"id":4390,"type":"article-journal","abstract":"Ecological patterns are often fundamentally chronological. However, generalization of data is necessarily accompanied by a loss of detail or resolution. Temporal data in particular contain information not only in data values but in the temporal structure, which is lost when these values are aggregated to provide point estimates. Dynamic time warping (DTW) is a time series comparison method that is capable of efficiently comparing series despite temporal offsets that confound other methods. The DTW method is both efficient and remarkably flexible, capable of efficiently matching not only time series but also any sequentially structured data set, which has made it a popular technique in machine learning, artificial intelligence, and big data analytical tasks. DTW is rarely used in ecology despite the ubiquity of temporally structured data. As technological advances have increased the richness of small-scale ecological data, DTW may be an attractive analysis technique because it is able to utilize the additional information contained in the temporal structure of many ecological data sets. In this study, we use an example data set of high-resolution fish movement records obtained from otolith microchemistry to compare traditional analysis techniques with DTW clustering. Our results suggest that DTW is capable of detecting subtle behavioral patterns within otolith data sets which traditional data aggregation techniques cannot. These results provide evidence that the DTW method may be useful across many of the temporal data types commonly collected in ecology, as well other sequentially ordered “pseudo time series” data such as classification of species by shape.","container-title":"Ecosphere","DOI":"10.1002/ecs2.3742","ISSN":"2150-8925","issue":"9","language":"en","note":"_eprint: https://esajournals.onlinelibrary.wiley.com/doi/pdf/10.1002/ecs2.3742","page":"e03742","source":"Wiley Online Library","title":"Let's do the time warp again: non-linear time series matching as a tool for sequentially structured data in ecology","title-short":"Let's do the time warp again","volume":"12","author":[{"family":"Hegg","given":"Jens C."},{"family":"Kennedy","given":"Brian P."}],"issued":{"date-parts":[["2021"]]}}}],"schema":"https://github.com/citation-style-language/schema/raw/master/csl-citation.json"} </w:instrText>
+      </w:r>
+      <w:r>
+        <w:rPr>
+          <w:rFonts w:ascii="Garamond" w:hAnsi="Garamond"/>
+          <w:sz w:val="22"/>
+          <w:szCs w:val="22"/>
+        </w:rPr>
+        <w:fldChar w:fldCharType="separate"/>
+      </w:r>
+      <w:r>
+        <w:rPr>
+          <w:rFonts w:ascii="Garamond" w:hAnsi="Garamond"/>
+          <w:noProof/>
+          <w:sz w:val="22"/>
+          <w:szCs w:val="22"/>
+        </w:rPr>
+        <w:t>(Hegg &amp; Kennedy, 2021)</w:t>
+      </w:r>
+      <w:r>
+        <w:rPr>
+          <w:rFonts w:ascii="Garamond" w:hAnsi="Garamond"/>
+          <w:sz w:val="22"/>
+          <w:szCs w:val="22"/>
+        </w:rPr>
+        <w:fldChar w:fldCharType="end"/>
+      </w:r>
+      <w:r>
+        <w:rPr>
+          <w:rFonts w:ascii="Garamond" w:hAnsi="Garamond"/>
+          <w:sz w:val="22"/>
+          <w:szCs w:val="22"/>
+        </w:rPr>
+        <w:t xml:space="preserve">. The </w:t>
+      </w:r>
+      <w:r>
+        <w:rPr>
+          <w:rFonts w:ascii="Garamond" w:hAnsi="Garamond"/>
+          <w:sz w:val="22"/>
+          <w:szCs w:val="22"/>
+        </w:rPr>
+        <w:lastRenderedPageBreak/>
+        <w:t xml:space="preserve">resulting dataset contained a </w:t>
       </w:r>
       <w:proofErr w:type="gramStart"/>
       <w:r>
@@ -1224,7 +1504,7 @@
           <w:sz w:val="22"/>
           <w:szCs w:val="22"/>
         </w:rPr>
-        <w:t>60 point</w:t>
+        <w:t>X by X</w:t>
       </w:r>
       <w:proofErr w:type="gramEnd"/>
       <w:r>
@@ -1233,60 +1513,7 @@
           <w:sz w:val="22"/>
           <w:szCs w:val="22"/>
         </w:rPr>
-        <w:t xml:space="preserve"> window with center weighting. The GAM approach used fitted thin-plate regression and penalized iteratively re-weighted least squared (P-IRLS) to maximize goodness of fit. A GCV method was used to minimize over fitting (Wood, 2006). The maximum degrees of freedom (k) were scaled by the number of data points in each ablation line (n) by k = 10N </w:t>
-      </w:r>
-      <w:r>
-        <w:rPr>
-          <w:rFonts w:ascii="Garamond" w:hAnsi="Garamond"/>
-          <w:sz w:val="22"/>
-          <w:szCs w:val="22"/>
-          <w:vertAlign w:val="superscript"/>
-        </w:rPr>
-        <w:t>2/9</w:t>
-      </w:r>
-      <w:r>
-        <w:rPr>
-          <w:rFonts w:ascii="Garamond" w:hAnsi="Garamond"/>
-          <w:sz w:val="22"/>
-          <w:szCs w:val="22"/>
-          <w:vertAlign w:val="superscript"/>
-        </w:rPr>
-        <w:t xml:space="preserve"> </w:t>
-      </w:r>
-      <w:r>
-        <w:rPr>
-          <w:rFonts w:ascii="Garamond" w:hAnsi="Garamond"/>
-          <w:sz w:val="22"/>
-          <w:szCs w:val="22"/>
-        </w:rPr>
-        <w:t xml:space="preserve">(Kim and Gu, 2004, Brennan et al., </w:t>
-      </w:r>
-      <w:r>
-        <w:rPr>
-          <w:rFonts w:ascii="Garamond" w:hAnsi="Garamond"/>
-          <w:sz w:val="22"/>
-          <w:szCs w:val="22"/>
-        </w:rPr>
-        <w:t xml:space="preserve">2014). </w:t>
-      </w:r>
-    </w:p>
-    <w:p>
-      <w:pPr>
-        <w:spacing w:line="480" w:lineRule="auto"/>
-        <w:ind w:firstLine="720"/>
-        <w:rPr>
-          <w:rFonts w:ascii="Garamond" w:hAnsi="Garamond"/>
-          <w:sz w:val="22"/>
-          <w:szCs w:val="22"/>
-        </w:rPr>
-      </w:pPr>
-      <w:r>
-        <w:rPr>
-          <w:rFonts w:ascii="Garamond" w:hAnsi="Garamond"/>
-          <w:sz w:val="22"/>
-          <w:szCs w:val="22"/>
-        </w:rPr>
-        <w:t>One limitation of many common machine learning classification models is their dependence on fixed dimension vectors with a consistent length. Because otolith growth is directly proportional to individual growth, the number of microns (</w:t>
+        <w:t xml:space="preserve"> data matrix for both raw and GAM smoothed data as well as a </w:t>
       </w:r>
       <w:proofErr w:type="gramStart"/>
       <w:r>
@@ -1295,7 +1522,7 @@
           <w:sz w:val="22"/>
           <w:szCs w:val="22"/>
         </w:rPr>
-        <w:t>and ,</w:t>
+        <w:t>X by X</w:t>
       </w:r>
       <w:proofErr w:type="gramEnd"/>
       <w:r>
@@ -1304,119 +1531,7 @@
           <w:sz w:val="22"/>
           <w:szCs w:val="22"/>
         </w:rPr>
-        <w:t xml:space="preserve"> subsequently, reads) in otolith. </w:t>
-      </w:r>
-      <w:proofErr w:type="spellStart"/>
-      <w:r>
-        <w:rPr>
-          <w:rFonts w:ascii="Garamond" w:hAnsi="Garamond"/>
-          <w:sz w:val="22"/>
-          <w:szCs w:val="22"/>
-        </w:rPr>
-        <w:t>The</w:t>
-      </w:r>
-      <w:proofErr w:type="spellEnd"/>
-      <w:r>
-        <w:rPr>
-          <w:rFonts w:ascii="Garamond" w:hAnsi="Garamond"/>
-          <w:sz w:val="22"/>
-          <w:szCs w:val="22"/>
-        </w:rPr>
-        <w:t xml:space="preserve"> number of microns, and LA data is variable among individuals. To overcome this limitation we interpolated all samples to the same length, which is the calculated average length of all timeseries (INSERT VALUE HERE) </w:t>
-      </w:r>
-      <w:r>
-        <w:rPr>
-          <w:rFonts w:ascii="Garamond" w:hAnsi="Garamond"/>
-          <w:sz w:val="22"/>
-          <w:szCs w:val="22"/>
-        </w:rPr>
-        <w:fldChar w:fldCharType="begin"/>
-      </w:r>
-      <w:r>
-        <w:rPr>
-          <w:rFonts w:ascii="Garamond" w:hAnsi="Garamond"/>
-          <w:sz w:val="22"/>
-          <w:szCs w:val="22"/>
-        </w:rPr>
-        <w:instrText xml:space="preserve"> ADDIN ZOTERO_ITEM CSL_CITATION {"citationID":"IkCFfZW4","properties":{"formattedCitation":"(Hegg &amp; Kennedy, 2021)","plainCitation":"(Hegg &amp; Kennedy, 2021)","noteIndex":0},"citationItems":[{"id":4390,"uris":["http://zotero.org/users/8421274/items/BD9UPNI2"],"itemData":{"id":4390,"type":"article-journal","abstract":"Ecological patterns are often fundamentally chronological. However, generalization of data is necessarily accompanied by a loss of detail or resolution. Temporal data in particular contain information not only in data values but in the temporal structure, which is lost when these values are aggregated to provide point estimates. Dynamic time warping (DTW) is a time series comparison method that is capable of efficiently comparing series despite temporal offsets that confound other methods. The DTW method is both efficient and remarkably flexible, capable of efficiently matching not only time series but also any sequentially structured data set, which has made it a popular technique in machine learning, artificial intelligence, and big data analytical tasks. DTW is rarely used in ecology despite the ubiquity of temporally structured data. As technological advances have increased the richness of small-scale ecological data, DTW may be an attractive analysis technique because it is able to utilize the additional information contained in the temporal structure of many ecological data sets. In this study, we use an example data set of high-resolution fish movement records obtained from otolith microchemistry to compare traditional analysis techniques with DTW clustering. Our results suggest that DTW is capable of detecting subtle behavioral patterns within otolith data sets which traditional data aggregation techniques cannot. These results provide evidence that the DTW method may be useful across many of the temporal data types commonly collected in ecology, as well other sequentially ordered “pseudo time series” data such as classification of species by shape.","container-title":"Ecosphere","DOI":"10.1002/ecs2.3742","ISSN":"2150-8925","issue":"9","language":"en","note":"_eprint: https://esajournals.onlinelibrary.wiley.com/doi/pdf/10.1002/ecs2.3742","page":"e03742","source":"Wiley Online Library","title":"Let's do the time warp again: non-linear time series matching as a tool for sequentially structured data in ecology","title-short":"Let's do the time warp again","volume":"12","author":[{"family":"Hegg","given":"Jens C."},{"family":"Kennedy","given":"Brian P."}],"issued":{"date-parts":[["2021"]]}}}],"schema":"https://github.com/citation-style-language/schema/raw/master/csl-citation.json"} </w:instrText>
-      </w:r>
-      <w:r>
-        <w:rPr>
-          <w:rFonts w:ascii="Garamond" w:hAnsi="Garamond"/>
-          <w:sz w:val="22"/>
-          <w:szCs w:val="22"/>
-        </w:rPr>
-        <w:fldChar w:fldCharType="separate"/>
-      </w:r>
-      <w:r>
-        <w:rPr>
-          <w:rFonts w:ascii="Garamond" w:hAnsi="Garamond"/>
-          <w:noProof/>
-          <w:sz w:val="22"/>
-          <w:szCs w:val="22"/>
-        </w:rPr>
-        <w:t>(Hegg &amp; Kennedy, 2021)</w:t>
-      </w:r>
-      <w:r>
-        <w:rPr>
-          <w:rFonts w:ascii="Garamond" w:hAnsi="Garamond"/>
-          <w:sz w:val="22"/>
-          <w:szCs w:val="22"/>
-        </w:rPr>
-        <w:fldChar w:fldCharType="end"/>
-      </w:r>
-      <w:r>
-        <w:rPr>
-          <w:rFonts w:ascii="Garamond" w:hAnsi="Garamond"/>
-          <w:sz w:val="22"/>
-          <w:szCs w:val="22"/>
-        </w:rPr>
-        <w:t xml:space="preserve">. The resulting dataset contained a </w:t>
-      </w:r>
-      <w:proofErr w:type="gramStart"/>
-      <w:r>
-        <w:rPr>
-          <w:rFonts w:ascii="Garamond" w:hAnsi="Garamond"/>
-          <w:sz w:val="22"/>
-          <w:szCs w:val="22"/>
-        </w:rPr>
-        <w:t>X by X</w:t>
-      </w:r>
-      <w:proofErr w:type="gramEnd"/>
-      <w:r>
-        <w:rPr>
-          <w:rFonts w:ascii="Garamond" w:hAnsi="Garamond"/>
-          <w:sz w:val="22"/>
-          <w:szCs w:val="22"/>
-        </w:rPr>
-        <w:t xml:space="preserve"> data matrix for both raw and GAM smoothed data as well as a </w:t>
-      </w:r>
-      <w:proofErr w:type="gramStart"/>
-      <w:r>
-        <w:rPr>
-          <w:rFonts w:ascii="Garamond" w:hAnsi="Garamond"/>
-          <w:sz w:val="22"/>
-          <w:szCs w:val="22"/>
-        </w:rPr>
-        <w:t>X by X</w:t>
-      </w:r>
-      <w:proofErr w:type="gramEnd"/>
-      <w:r>
-        <w:rPr>
-          <w:rFonts w:ascii="Garamond" w:hAnsi="Garamond"/>
-          <w:sz w:val="22"/>
-          <w:szCs w:val="22"/>
-        </w:rPr>
-        <w:t xml:space="preserve"> </w:t>
-      </w:r>
-      <w:r>
-        <w:rPr>
-          <w:rFonts w:ascii="Garamond" w:hAnsi="Garamond"/>
-          <w:sz w:val="22"/>
-          <w:szCs w:val="22"/>
-        </w:rPr>
-        <w:lastRenderedPageBreak/>
-        <w:t xml:space="preserve">data matrix for moving average smoothing which removed X datapoints at the beginning and end of the transect. </w:t>
+        <w:t xml:space="preserve"> data matrix for moving average smoothing which removed X datapoints at the beginning and end of the transect. </w:t>
       </w:r>
     </w:p>
     <w:p>
@@ -1445,13 +1560,50 @@
     </w:p>
     <w:p>
       <w:pPr>
-        <w:spacing w:line="480" w:lineRule="auto"/>
-        <w:rPr>
-          <w:rFonts w:ascii="Garamond" w:hAnsi="Garamond"/>
-          <w:sz w:val="22"/>
-          <w:szCs w:val="22"/>
-        </w:rPr>
-      </w:pPr>
+        <w:pStyle w:val="NormalWeb"/>
+        <w:spacing w:line="480" w:lineRule="auto"/>
+        <w:ind w:firstLine="720"/>
+        <w:rPr>
+          <w:rFonts w:ascii="Garamond" w:hAnsi="Garamond"/>
+          <w:sz w:val="22"/>
+          <w:szCs w:val="22"/>
+        </w:rPr>
+      </w:pPr>
+      <w:r>
+        <w:rPr>
+          <w:rFonts w:ascii="Garamond" w:hAnsi="Garamond"/>
+          <w:sz w:val="22"/>
+          <w:szCs w:val="22"/>
+        </w:rPr>
+        <w:t>All data were randomly partitioned into training and testing sets using an 80/20 split. To ensure consistency across analyses, the same individuals were assigned to the training and testing sets for all three feature representations: raw data, generalized additive model (GAM)-smoothed data, and moving average (MA)–smoothed data.</w:t>
+      </w:r>
+      <w:r>
+        <w:rPr>
+          <w:rFonts w:ascii="Garamond" w:hAnsi="Garamond"/>
+          <w:sz w:val="22"/>
+          <w:szCs w:val="22"/>
+        </w:rPr>
+        <w:t xml:space="preserve"> </w:t>
+      </w:r>
+      <w:r>
+        <w:rPr>
+          <w:rFonts w:ascii="Garamond" w:hAnsi="Garamond"/>
+          <w:sz w:val="22"/>
+          <w:szCs w:val="22"/>
+        </w:rPr>
+        <w:t xml:space="preserve">For each feature set, we trained three supervised classification algorithms: </w:t>
+      </w:r>
+      <w:r>
+        <w:rPr>
+          <w:rStyle w:val="Strong"/>
+          <w:rFonts w:ascii="Garamond" w:eastAsiaTheme="majorEastAsia" w:hAnsi="Garamond"/>
+          <w:b w:val="0"/>
+          <w:bCs w:val="0"/>
+          <w:sz w:val="22"/>
+          <w:szCs w:val="22"/>
+        </w:rPr>
+        <w:t>K-Nearest Neighbors (KNN)</w:t>
+      </w:r>
       <w:r>
         <w:rPr>
           <w:rFonts w:ascii="Garamond" w:hAnsi="Garamond"/>
@@ -1460,207 +1612,19 @@
           <w:sz w:val="22"/>
           <w:szCs w:val="22"/>
         </w:rPr>
-        <w:tab/>
-      </w:r>
-      <w:r>
-        <w:rPr>
-          <w:rFonts w:ascii="Garamond" w:hAnsi="Garamond"/>
-          <w:sz w:val="22"/>
-          <w:szCs w:val="22"/>
-        </w:rPr>
-        <w:t>Three common machine learning classification algorithms were testing on the data. These include K-Nearest Neighbors (KNN</w:t>
-      </w:r>
-      <w:proofErr w:type="gramStart"/>
-      <w:r>
-        <w:rPr>
-          <w:rFonts w:ascii="Garamond" w:hAnsi="Garamond"/>
-          <w:sz w:val="22"/>
-          <w:szCs w:val="22"/>
-        </w:rPr>
-        <w:t>) ,</w:t>
-      </w:r>
-      <w:proofErr w:type="gramEnd"/>
-      <w:r>
-        <w:rPr>
-          <w:rFonts w:ascii="Garamond" w:hAnsi="Garamond"/>
-          <w:sz w:val="22"/>
-          <w:szCs w:val="22"/>
-        </w:rPr>
-        <w:t xml:space="preserve"> Random Forest (RF</w:t>
-      </w:r>
-      <w:proofErr w:type="gramStart"/>
-      <w:r>
-        <w:rPr>
-          <w:rFonts w:ascii="Garamond" w:hAnsi="Garamond"/>
-          <w:sz w:val="22"/>
-          <w:szCs w:val="22"/>
-        </w:rPr>
-        <w:t>) ,</w:t>
-      </w:r>
-      <w:proofErr w:type="gramEnd"/>
-      <w:r>
-        <w:rPr>
-          <w:rFonts w:ascii="Garamond" w:hAnsi="Garamond"/>
-          <w:sz w:val="22"/>
-          <w:szCs w:val="22"/>
-        </w:rPr>
-        <w:t xml:space="preserve"> and Support Vector Machine (SVM). </w:t>
+        <w:t xml:space="preserve">, </w:t>
       </w:r>
       <w:r>
         <w:rPr>
           <w:rStyle w:val="Strong"/>
-          <w:rFonts w:ascii="Garamond" w:hAnsi="Garamond"/>
-          <w:sz w:val="22"/>
-          <w:szCs w:val="22"/>
-        </w:rPr>
-        <w:t>K-Nearest Neighbors (KNN)</w:t>
-      </w:r>
-      <w:r>
-        <w:rPr>
-          <w:rFonts w:ascii="Garamond" w:hAnsi="Garamond"/>
-          <w:sz w:val="22"/>
-          <w:szCs w:val="22"/>
-        </w:rPr>
-        <w:t xml:space="preserve"> classifies samples based on the majority class among the k nearest training data points in feature space, using distance metrics (typically Euclidean) to identify neighbors</w:t>
-      </w:r>
-      <w:r>
-        <w:rPr>
-          <w:rFonts w:ascii="Garamond" w:hAnsi="Garamond"/>
-          <w:sz w:val="22"/>
-          <w:szCs w:val="22"/>
-        </w:rPr>
-        <w:t xml:space="preserve"> (Cover and Hart, 1967)</w:t>
-      </w:r>
-      <w:r>
-        <w:rPr>
-          <w:rFonts w:ascii="Garamond" w:hAnsi="Garamond"/>
-          <w:sz w:val="22"/>
-          <w:szCs w:val="22"/>
-        </w:rPr>
-        <w:t xml:space="preserve">. </w:t>
-      </w:r>
-      <w:r>
-        <w:rPr>
-          <w:rStyle w:val="Strong"/>
-          <w:rFonts w:ascii="Garamond" w:hAnsi="Garamond"/>
+          <w:rFonts w:ascii="Garamond" w:eastAsiaTheme="majorEastAsia" w:hAnsi="Garamond"/>
+          <w:b w:val="0"/>
+          <w:bCs w:val="0"/>
           <w:sz w:val="22"/>
           <w:szCs w:val="22"/>
         </w:rPr>
         <w:t>Random Forest (RF)</w:t>
       </w:r>
-      <w:r>
-        <w:rPr>
-          <w:rFonts w:ascii="Garamond" w:hAnsi="Garamond"/>
-          <w:sz w:val="22"/>
-          <w:szCs w:val="22"/>
-        </w:rPr>
-        <w:t xml:space="preserve"> creates multiple decision trees using bootstrap sampling and random feature selection, with final classification determined by majority vote across all trees</w:t>
-      </w:r>
-      <w:r>
-        <w:rPr>
-          <w:rFonts w:ascii="Garamond" w:hAnsi="Garamond"/>
-          <w:sz w:val="22"/>
-          <w:szCs w:val="22"/>
-        </w:rPr>
-        <w:t xml:space="preserve"> (</w:t>
-      </w:r>
-      <w:proofErr w:type="spellStart"/>
-      <w:r>
-        <w:rPr>
-          <w:rFonts w:ascii="Garamond" w:hAnsi="Garamond"/>
-          <w:sz w:val="22"/>
-          <w:szCs w:val="22"/>
-        </w:rPr>
-        <w:t>Briemen</w:t>
-      </w:r>
-      <w:proofErr w:type="spellEnd"/>
-      <w:r>
-        <w:rPr>
-          <w:rFonts w:ascii="Garamond" w:hAnsi="Garamond"/>
-          <w:sz w:val="22"/>
-          <w:szCs w:val="22"/>
-        </w:rPr>
-        <w:t>, 2001)</w:t>
-      </w:r>
-      <w:r>
-        <w:rPr>
-          <w:rFonts w:ascii="Garamond" w:hAnsi="Garamond"/>
-          <w:sz w:val="22"/>
-          <w:szCs w:val="22"/>
-        </w:rPr>
-        <w:t xml:space="preserve">. </w:t>
-      </w:r>
-      <w:r>
-        <w:rPr>
-          <w:rStyle w:val="Strong"/>
-          <w:rFonts w:ascii="Garamond" w:hAnsi="Garamond"/>
-          <w:sz w:val="22"/>
-          <w:szCs w:val="22"/>
-        </w:rPr>
-        <w:t>Support Vector Machine (SVM)</w:t>
-      </w:r>
-      <w:r>
-        <w:rPr>
-          <w:rFonts w:ascii="Garamond" w:hAnsi="Garamond"/>
-          <w:sz w:val="22"/>
-          <w:szCs w:val="22"/>
-        </w:rPr>
-        <w:t xml:space="preserve"> identifies the optimal hyperplane that maximally separates classes by finding support vectors closest to the decision boundary, using kernel functions to handle non-linearly separable data</w:t>
-      </w:r>
-      <w:r>
-        <w:rPr>
-          <w:rFonts w:ascii="Garamond" w:hAnsi="Garamond"/>
-          <w:sz w:val="22"/>
-          <w:szCs w:val="22"/>
-        </w:rPr>
-        <w:t xml:space="preserve"> (Cortez and </w:t>
-      </w:r>
-      <w:proofErr w:type="spellStart"/>
-      <w:r>
-        <w:rPr>
-          <w:rFonts w:ascii="Garamond" w:hAnsi="Garamond"/>
-          <w:sz w:val="22"/>
-          <w:szCs w:val="22"/>
-        </w:rPr>
-        <w:t>Vapnik</w:t>
-      </w:r>
-      <w:proofErr w:type="spellEnd"/>
-      <w:r>
-        <w:rPr>
-          <w:rFonts w:ascii="Garamond" w:hAnsi="Garamond"/>
-          <w:sz w:val="22"/>
-          <w:szCs w:val="22"/>
-        </w:rPr>
-        <w:t>, 1995)</w:t>
-      </w:r>
-      <w:r>
-        <w:rPr>
-          <w:rFonts w:ascii="Garamond" w:hAnsi="Garamond"/>
-          <w:sz w:val="22"/>
-          <w:szCs w:val="22"/>
-        </w:rPr>
-        <w:t>.</w:t>
-      </w:r>
-    </w:p>
-    <w:p>
-      <w:pPr>
-        <w:spacing w:line="480" w:lineRule="auto"/>
-        <w:rPr>
-          <w:rFonts w:ascii="Garamond" w:hAnsi="Garamond"/>
-          <w:sz w:val="22"/>
-          <w:szCs w:val="22"/>
-        </w:rPr>
-      </w:pPr>
-    </w:p>
-    <w:p>
-      <w:pPr>
-        <w:spacing w:line="480" w:lineRule="auto"/>
-        <w:rPr>
-          <w:rFonts w:ascii="Garamond" w:hAnsi="Garamond"/>
-          <w:sz w:val="22"/>
-          <w:szCs w:val="22"/>
-        </w:rPr>
-      </w:pPr>
       <w:r>
         <w:rPr>
           <w:rFonts w:ascii="Garamond" w:hAnsi="Garamond"/>
@@ -1669,11 +1633,155 @@
           <w:sz w:val="22"/>
           <w:szCs w:val="22"/>
         </w:rPr>
-        <w:t xml:space="preserve">PCA, feature importance, data exploration </w:t>
-      </w:r>
-    </w:p>
-    <w:p>
-      <w:pPr>
+        <w:t xml:space="preserve">, </w:t>
+      </w:r>
+      <w:r>
+        <w:rPr>
+          <w:rFonts w:ascii="Garamond" w:hAnsi="Garamond"/>
+          <w:sz w:val="22"/>
+          <w:szCs w:val="22"/>
+        </w:rPr>
+        <w:t xml:space="preserve">and </w:t>
+      </w:r>
+      <w:r>
+        <w:rPr>
+          <w:rStyle w:val="Strong"/>
+          <w:rFonts w:ascii="Garamond" w:eastAsiaTheme="majorEastAsia" w:hAnsi="Garamond"/>
+          <w:b w:val="0"/>
+          <w:bCs w:val="0"/>
+          <w:sz w:val="22"/>
+          <w:szCs w:val="22"/>
+        </w:rPr>
+        <w:t>Support Vector Machine (SVM)</w:t>
+      </w:r>
+      <w:r>
+        <w:rPr>
+          <w:rFonts w:ascii="Garamond" w:hAnsi="Garamond"/>
+          <w:sz w:val="22"/>
+          <w:szCs w:val="22"/>
+        </w:rPr>
+        <w:t xml:space="preserve"> with a radial basis function (RBF) kernel. The Random Forest model was configured with 500 trees, and the number of predictors randomly sampled at each split (</w:t>
+      </w:r>
+      <w:proofErr w:type="spellStart"/>
+      <w:r>
+        <w:rPr>
+          <w:rStyle w:val="HTMLCode"/>
+          <w:rFonts w:ascii="Garamond" w:eastAsiaTheme="majorEastAsia" w:hAnsi="Garamond"/>
+          <w:sz w:val="22"/>
+          <w:szCs w:val="22"/>
+        </w:rPr>
+        <w:t>mtry</w:t>
+      </w:r>
+      <w:proofErr w:type="spellEnd"/>
+      <w:r>
+        <w:rPr>
+          <w:rFonts w:ascii="Garamond" w:hAnsi="Garamond"/>
+          <w:sz w:val="22"/>
+          <w:szCs w:val="22"/>
+        </w:rPr>
+        <w:t>) was set to the square root of the total number of predictors, following standard practice for classification problems. The KNN model was trained using five neighbors, while the SVM model used default hyperparameters for the RBF kernel.</w:t>
+      </w:r>
+      <w:r>
+        <w:rPr>
+          <w:rFonts w:ascii="Garamond" w:hAnsi="Garamond"/>
+          <w:sz w:val="22"/>
+          <w:szCs w:val="22"/>
+        </w:rPr>
+        <w:t xml:space="preserve"> </w:t>
+      </w:r>
+      <w:r>
+        <w:rPr>
+          <w:rFonts w:ascii="Garamond" w:hAnsi="Garamond"/>
+          <w:sz w:val="22"/>
+          <w:szCs w:val="22"/>
+        </w:rPr>
+        <w:t xml:space="preserve">All models were implemented using the </w:t>
+      </w:r>
+      <w:proofErr w:type="spellStart"/>
+      <w:r>
+        <w:rPr>
+          <w:rStyle w:val="HTMLCode"/>
+          <w:rFonts w:ascii="Garamond" w:eastAsiaTheme="majorEastAsia" w:hAnsi="Garamond"/>
+          <w:sz w:val="22"/>
+          <w:szCs w:val="22"/>
+        </w:rPr>
+        <w:t>tidymodels</w:t>
+      </w:r>
+      <w:proofErr w:type="spellEnd"/>
+      <w:r>
+        <w:rPr>
+          <w:rFonts w:ascii="Garamond" w:hAnsi="Garamond"/>
+          <w:sz w:val="22"/>
+          <w:szCs w:val="22"/>
+        </w:rPr>
+        <w:t xml:space="preserve"> framework in R.</w:t>
+      </w:r>
+      <w:r>
+        <w:rPr>
+          <w:rFonts w:ascii="Garamond" w:hAnsi="Garamond"/>
+          <w:sz w:val="22"/>
+          <w:szCs w:val="22"/>
+        </w:rPr>
+        <w:t xml:space="preserve"> </w:t>
+      </w:r>
+    </w:p>
+    <w:p>
+      <w:pPr>
+        <w:pStyle w:val="NormalWeb"/>
+        <w:spacing w:line="480" w:lineRule="auto"/>
+        <w:ind w:firstLine="720"/>
+        <w:rPr>
+          <w:rFonts w:ascii="Garamond" w:hAnsi="Garamond"/>
+          <w:sz w:val="22"/>
+          <w:szCs w:val="22"/>
+        </w:rPr>
+      </w:pPr>
+      <w:r>
+        <w:rPr>
+          <w:rFonts w:ascii="Garamond" w:hAnsi="Garamond"/>
+          <w:sz w:val="22"/>
+          <w:szCs w:val="22"/>
+        </w:rPr>
+        <w:t xml:space="preserve">Trained models were then evaluated on two testing datasets. The first was the original 20% holdout set, used to assess classification accuracy across the full range of samples. The second testing set was a subset of this holdout set, with samples removed if their natal origin isotope values were unique to a single watershed. For example, some regions of the Yukon exhibit enriched isotope values that are not found in other watersheds, making it possible to classify these samples based on isotope data alone. By excluding such easily classifiable cases, the restricted test set allowed us to evaluate model performance on a more challenging subset: individuals whose isotopic signatures were ambiguous and could not be assigned to a watershed using univariate thresholds alone. Model performance was assessed using two metrics: </w:t>
+      </w:r>
+      <w:r>
+        <w:rPr>
+          <w:rStyle w:val="Strong"/>
+          <w:rFonts w:ascii="Garamond" w:eastAsiaTheme="majorEastAsia" w:hAnsi="Garamond"/>
+          <w:sz w:val="22"/>
+          <w:szCs w:val="22"/>
+        </w:rPr>
+        <w:t>overall accuracy</w:t>
+      </w:r>
+      <w:r>
+        <w:rPr>
+          <w:rFonts w:ascii="Garamond" w:hAnsi="Garamond"/>
+          <w:sz w:val="22"/>
+          <w:szCs w:val="22"/>
+        </w:rPr>
+        <w:t xml:space="preserve"> and the </w:t>
+      </w:r>
+      <w:r>
+        <w:rPr>
+          <w:rStyle w:val="Strong"/>
+          <w:rFonts w:ascii="Garamond" w:eastAsiaTheme="majorEastAsia" w:hAnsi="Garamond"/>
+          <w:sz w:val="22"/>
+          <w:szCs w:val="22"/>
+        </w:rPr>
+        <w:t>F1-score</w:t>
+      </w:r>
+      <w:r>
+        <w:rPr>
+          <w:rFonts w:ascii="Garamond" w:hAnsi="Garamond"/>
+          <w:sz w:val="22"/>
+          <w:szCs w:val="22"/>
+        </w:rPr>
+        <w:t>, which balances precision and recall and is particularly useful for evaluating classification performance in cases of class imbalance.</w:t>
+      </w:r>
+    </w:p>
+    <w:p>
+      <w:pPr>
+        <w:spacing w:line="480" w:lineRule="auto"/>
         <w:rPr>
           <w:rFonts w:ascii="Garamond" w:hAnsi="Garamond"/>
           <w:b/>
@@ -1682,7 +1790,10 @@
           <w:szCs w:val="22"/>
         </w:rPr>
       </w:pPr>
-      <w:r>
+    </w:p>
+    <w:p>
+      <w:pPr>
+        <w:spacing w:line="480" w:lineRule="auto"/>
         <w:rPr>
           <w:rFonts w:ascii="Garamond" w:hAnsi="Garamond"/>
           <w:b/>
@@ -1690,8 +1801,183 @@
           <w:sz w:val="22"/>
           <w:szCs w:val="22"/>
         </w:rPr>
+      </w:pPr>
+      <w:r>
+        <w:rPr>
+          <w:rFonts w:ascii="Garamond" w:hAnsi="Garamond"/>
+          <w:b/>
+          <w:bCs/>
+          <w:sz w:val="22"/>
+          <w:szCs w:val="22"/>
+        </w:rPr>
+        <w:t xml:space="preserve">PCA, feature importance, data exploration </w:t>
+      </w:r>
+    </w:p>
+    <w:p>
+      <w:pPr>
+        <w:spacing w:line="480" w:lineRule="auto"/>
+        <w:rPr>
+          <w:rFonts w:ascii="Garamond" w:hAnsi="Garamond"/>
+          <w:b/>
+          <w:bCs/>
+          <w:sz w:val="22"/>
+          <w:szCs w:val="22"/>
+        </w:rPr>
+      </w:pPr>
+      <w:r>
+        <w:rPr>
+          <w:rFonts w:ascii="Garamond" w:hAnsi="Garamond"/>
+          <w:b/>
+          <w:bCs/>
+          <w:sz w:val="22"/>
+          <w:szCs w:val="22"/>
+        </w:rPr>
+        <w:t xml:space="preserve">Principal component analysis was used on the dataset from the best preforming model (GAM RF) to qualitatively explore variation </w:t>
+      </w:r>
+      <w:proofErr w:type="spellStart"/>
+      <w:r>
+        <w:rPr>
+          <w:rFonts w:ascii="Garamond" w:hAnsi="Garamond"/>
+          <w:b/>
+          <w:bCs/>
+          <w:sz w:val="22"/>
+          <w:szCs w:val="22"/>
+        </w:rPr>
+        <w:t>amon</w:t>
+      </w:r>
+      <w:proofErr w:type="spellEnd"/>
+    </w:p>
+    <w:p>
+      <w:pPr>
+        <w:spacing w:line="480" w:lineRule="auto"/>
+        <w:rPr>
+          <w:rFonts w:ascii="Garamond" w:hAnsi="Garamond"/>
+          <w:b/>
+          <w:bCs/>
+          <w:sz w:val="22"/>
+          <w:szCs w:val="22"/>
+        </w:rPr>
+      </w:pPr>
+    </w:p>
+    <w:p>
+      <w:pPr>
+        <w:spacing w:line="480" w:lineRule="auto"/>
+        <w:rPr>
+          <w:rFonts w:ascii="Garamond" w:hAnsi="Garamond"/>
+          <w:b/>
+          <w:bCs/>
+          <w:sz w:val="22"/>
+          <w:szCs w:val="22"/>
+        </w:rPr>
+      </w:pPr>
+    </w:p>
+    <w:p>
+      <w:pPr>
+        <w:spacing w:line="480" w:lineRule="auto"/>
+        <w:rPr>
+          <w:rFonts w:ascii="Garamond" w:hAnsi="Garamond"/>
+          <w:sz w:val="22"/>
+          <w:szCs w:val="22"/>
+        </w:rPr>
+      </w:pPr>
+    </w:p>
+    <w:p>
+      <w:pPr>
+        <w:rPr>
+          <w:rFonts w:ascii="Garamond" w:hAnsi="Garamond"/>
+          <w:b/>
+          <w:bCs/>
+          <w:sz w:val="22"/>
+          <w:szCs w:val="22"/>
+        </w:rPr>
+      </w:pPr>
+      <w:r>
+        <w:rPr>
+          <w:rFonts w:ascii="Garamond" w:hAnsi="Garamond"/>
+          <w:b/>
+          <w:bCs/>
+          <w:sz w:val="22"/>
+          <w:szCs w:val="22"/>
+        </w:rPr>
         <w:t xml:space="preserve">Probability tuning </w:t>
       </w:r>
+    </w:p>
+    <w:p>
+      <w:pPr>
+        <w:rPr>
+          <w:rFonts w:ascii="Garamond" w:hAnsi="Garamond"/>
+          <w:b/>
+          <w:bCs/>
+          <w:sz w:val="22"/>
+          <w:szCs w:val="22"/>
+        </w:rPr>
+      </w:pPr>
+    </w:p>
+    <w:p>
+      <w:pPr>
+        <w:rPr>
+          <w:rFonts w:ascii="Garamond" w:hAnsi="Garamond"/>
+          <w:b/>
+          <w:bCs/>
+          <w:sz w:val="22"/>
+          <w:szCs w:val="22"/>
+        </w:rPr>
+      </w:pPr>
+    </w:p>
+    <w:p>
+      <w:pPr>
+        <w:rPr>
+          <w:rFonts w:ascii="Garamond" w:hAnsi="Garamond"/>
+          <w:b/>
+          <w:bCs/>
+          <w:sz w:val="22"/>
+          <w:szCs w:val="22"/>
+        </w:rPr>
+      </w:pPr>
+    </w:p>
+    <w:p>
+      <w:pPr>
+        <w:rPr>
+          <w:rFonts w:ascii="Garamond" w:hAnsi="Garamond"/>
+          <w:b/>
+          <w:bCs/>
+          <w:sz w:val="22"/>
+          <w:szCs w:val="22"/>
+        </w:rPr>
+      </w:pPr>
+    </w:p>
+    <w:p>
+      <w:pPr>
+        <w:rPr>
+          <w:rFonts w:ascii="Garamond" w:hAnsi="Garamond"/>
+          <w:b/>
+          <w:bCs/>
+          <w:sz w:val="22"/>
+          <w:szCs w:val="22"/>
+        </w:rPr>
+      </w:pPr>
+    </w:p>
+    <w:p>
+      <w:pPr>
+        <w:rPr>
+          <w:rFonts w:ascii="Garamond" w:hAnsi="Garamond"/>
+          <w:b/>
+          <w:bCs/>
+          <w:sz w:val="22"/>
+          <w:szCs w:val="22"/>
+        </w:rPr>
+      </w:pPr>
+    </w:p>
+    <w:p>
+      <w:pPr>
+        <w:rPr>
+          <w:rFonts w:ascii="Garamond" w:hAnsi="Garamond"/>
+          <w:b/>
+          <w:bCs/>
+          <w:sz w:val="22"/>
+          <w:szCs w:val="22"/>
+        </w:rPr>
+      </w:pPr>
     </w:p>
     <w:p>
       <w:pPr>
@@ -1828,7 +2114,6 @@
           <w:sz w:val="32"/>
           <w:szCs w:val="32"/>
         </w:rPr>
-        <w:lastRenderedPageBreak/>
         <w:t xml:space="preserve">Discussion </w:t>
       </w:r>
     </w:p>
@@ -2240,6 +2525,7 @@
         <w:ind w:firstLine="720"/>
       </w:pPr>
       <w:r>
+        <w:lastRenderedPageBreak/>
         <w:t xml:space="preserve">making it critically important to understand the mechanisms driving population </w:t>
       </w:r>
       <w:proofErr w:type="gramStart"/>
@@ -2436,7 +2722,6 @@
           <w:sz w:val="20"/>
           <w:szCs w:val="20"/>
         </w:rPr>
-        <w:lastRenderedPageBreak/>
         <w:tab/>
       </w:r>
       <w:r>
@@ -2445,7 +2730,16 @@
           <w:sz w:val="20"/>
           <w:szCs w:val="20"/>
         </w:rPr>
-        <w:t xml:space="preserve">In Western Alaska, these methods have been used to estimate provenance of Chinook and sockeye salmon to the tributary or sub-basin scale within large watersheds. However, for fish caught in the marine environment, isotope ratio heterogeneity is insufficient relative to the spatial scale of potential habitat. Estimates of provenance using natal origin Sr87/86 cannot reliably distinguish among habitats with similar isotope ratios, introducing significant error into provenance assignments and precluding the use of this method for marine-caught fish. Fish from natal rearing regions with similar Sr87/86 values but from different areas of the watershed experience different migration routes as they </w:t>
+        <w:t xml:space="preserve">In Western Alaska, these methods have been used to estimate provenance of Chinook and sockeye salmon to the tributary or sub-basin scale within large watersheds. However, for fish caught in the marine environment, isotope ratio heterogeneity is insufficient relative to the spatial scale of potential habitat. Estimates of provenance using natal </w:t>
+      </w:r>
+      <w:r>
+        <w:rPr>
+          <w:rFonts w:ascii="Garamond" w:hAnsi="Garamond"/>
+          <w:sz w:val="20"/>
+          <w:szCs w:val="20"/>
+        </w:rPr>
+        <w:lastRenderedPageBreak/>
+        <w:t xml:space="preserve">origin Sr87/86 cannot reliably distinguish among habitats with similar isotope ratios, introducing significant error into provenance assignments and precluding the use of this method for marine-caught fish. Fish from natal rearing regions with similar Sr87/86 values but from different areas of the watershed experience different migration routes as they </w:t>
       </w:r>
       <w:proofErr w:type="spellStart"/>
       <w:r>
@@ -3839,6 +4133,19 @@
       <w:bCs/>
     </w:rPr>
   </w:style>
+  <w:style w:type="character" w:styleId="HTMLCode">
+    <w:name w:val="HTML Code"/>
+    <w:basedOn w:val="DefaultParagraphFont"/>
+    <w:uiPriority w:val="99"/>
+    <w:semiHidden/>
+    <w:unhideWhenUsed/>
+    <w:rsid w:val="003606FC"/>
+    <w:rPr>
+      <w:rFonts w:ascii="Courier New" w:eastAsia="Times New Roman" w:hAnsi="Courier New" w:cs="Courier New"/>
+      <w:sz w:val="20"/>
+      <w:szCs w:val="20"/>
+    </w:rPr>
+  </w:style>
 </w:styles>
 </file>
 

</xml_diff>

<commit_message>
another go through of intro, need to add citations next
</commit_message>
<xml_diff>
--- a/Docs/Machine learning applied to otolith timeseries data to discriminate river of origin for Western Alaska Salmon.docx
+++ b/Docs/Machine learning applied to otolith timeseries data to discriminate river of origin for Western Alaska Salmon.docx
@@ -181,15 +181,39 @@
           <w:sz w:val="22"/>
           <w:szCs w:val="22"/>
         </w:rPr>
-        <w:t>, the uptake of these models</w:t>
-      </w:r>
-      <w:r>
-        <w:rPr>
-          <w:rFonts w:ascii="Garamond" w:hAnsi="Garamond"/>
-          <w:sz w:val="22"/>
-          <w:szCs w:val="22"/>
-        </w:rPr>
-        <w:t xml:space="preserve"> has improved data collection (e.g. image recognition and computer vision)</w:t>
+        <w:t xml:space="preserve">, the uptake of these </w:t>
+      </w:r>
+      <w:r>
+        <w:rPr>
+          <w:rFonts w:ascii="Garamond" w:hAnsi="Garamond"/>
+          <w:sz w:val="22"/>
+          <w:szCs w:val="22"/>
+        </w:rPr>
+        <w:t>tools</w:t>
+      </w:r>
+      <w:r>
+        <w:rPr>
+          <w:rFonts w:ascii="Garamond" w:hAnsi="Garamond"/>
+          <w:sz w:val="22"/>
+          <w:szCs w:val="22"/>
+        </w:rPr>
+        <w:t xml:space="preserve"> ha</w:t>
+      </w:r>
+      <w:r>
+        <w:rPr>
+          <w:rFonts w:ascii="Garamond" w:hAnsi="Garamond"/>
+          <w:sz w:val="22"/>
+          <w:szCs w:val="22"/>
+        </w:rPr>
+        <w:t>s</w:t>
+      </w:r>
+      <w:r>
+        <w:rPr>
+          <w:rFonts w:ascii="Garamond" w:hAnsi="Garamond"/>
+          <w:sz w:val="22"/>
+          <w:szCs w:val="22"/>
+        </w:rPr>
+        <w:t xml:space="preserve"> improved data collection (e.g. image recognition and computer vision)</w:t>
       </w:r>
       <w:r>
         <w:rPr>
@@ -221,15 +245,47 @@
           <w:sz w:val="22"/>
           <w:szCs w:val="22"/>
         </w:rPr>
-        <w:t xml:space="preserve">As such, the </w:t>
-      </w:r>
-      <w:r>
-        <w:rPr>
-          <w:rFonts w:ascii="Garamond" w:hAnsi="Garamond"/>
-          <w:sz w:val="22"/>
-          <w:szCs w:val="22"/>
-        </w:rPr>
-        <w:t xml:space="preserve">continued integration of machine learning tools into fisheries science methods has allowed researchers with new opportunities to address pressing research questions. </w:t>
+        <w:t xml:space="preserve">As such, an </w:t>
+      </w:r>
+      <w:r>
+        <w:rPr>
+          <w:rFonts w:ascii="Garamond" w:hAnsi="Garamond"/>
+          <w:sz w:val="22"/>
+          <w:szCs w:val="22"/>
+        </w:rPr>
+        <w:t xml:space="preserve">expanding toolkit of machine learning methods empowers researchers to pursue novel approaches to </w:t>
+      </w:r>
+      <w:r>
+        <w:rPr>
+          <w:rFonts w:ascii="Garamond" w:hAnsi="Garamond"/>
+          <w:sz w:val="22"/>
+          <w:szCs w:val="22"/>
+        </w:rPr>
+        <w:t>addressing urgent challenges in</w:t>
+      </w:r>
+      <w:r>
+        <w:rPr>
+          <w:rFonts w:ascii="Garamond" w:hAnsi="Garamond"/>
+          <w:sz w:val="22"/>
+          <w:szCs w:val="22"/>
+        </w:rPr>
+        <w:t xml:space="preserve"> fisheries</w:t>
+      </w:r>
+      <w:r>
+        <w:rPr>
+          <w:rFonts w:ascii="Garamond" w:hAnsi="Garamond"/>
+          <w:sz w:val="22"/>
+          <w:szCs w:val="22"/>
+        </w:rPr>
+        <w:t xml:space="preserve"> sciences</w:t>
+      </w:r>
+      <w:r>
+        <w:rPr>
+          <w:rFonts w:ascii="Garamond" w:hAnsi="Garamond"/>
+          <w:sz w:val="22"/>
+          <w:szCs w:val="22"/>
+        </w:rPr>
+        <w:t>.</w:t>
       </w:r>
     </w:p>
     <w:p>
@@ -248,7 +304,39 @@
           <w:sz w:val="22"/>
           <w:szCs w:val="22"/>
         </w:rPr>
-        <w:t xml:space="preserve">One pressing issue in fisheries research is the recent collapse of pacific salmon stocks in </w:t>
+        <w:t xml:space="preserve">One pressing </w:t>
+      </w:r>
+      <w:r>
+        <w:rPr>
+          <w:rFonts w:ascii="Garamond" w:hAnsi="Garamond"/>
+          <w:sz w:val="22"/>
+          <w:szCs w:val="22"/>
+        </w:rPr>
+        <w:t>challenge</w:t>
+      </w:r>
+      <w:r>
+        <w:rPr>
+          <w:rFonts w:ascii="Garamond" w:hAnsi="Garamond"/>
+          <w:sz w:val="22"/>
+          <w:szCs w:val="22"/>
+        </w:rPr>
+        <w:t xml:space="preserve"> is the recent collapse of </w:t>
+      </w:r>
+      <w:r>
+        <w:rPr>
+          <w:rFonts w:ascii="Garamond" w:hAnsi="Garamond"/>
+          <w:sz w:val="22"/>
+          <w:szCs w:val="22"/>
+        </w:rPr>
+        <w:t>P</w:t>
+      </w:r>
+      <w:r>
+        <w:rPr>
+          <w:rFonts w:ascii="Garamond" w:hAnsi="Garamond"/>
+          <w:sz w:val="22"/>
+          <w:szCs w:val="22"/>
+        </w:rPr>
+        <w:t xml:space="preserve">acific salmon stocks in </w:t>
       </w:r>
       <w:r>
         <w:rPr>
@@ -264,7 +352,23 @@
           <w:sz w:val="22"/>
           <w:szCs w:val="22"/>
         </w:rPr>
-        <w:t xml:space="preserve">. In the regions three major watersheds (The Yukon, Kuskokwim, and </w:t>
+        <w:t>. In the regions three major watersheds</w:t>
+      </w:r>
+      <w:r>
+        <w:rPr>
+          <w:rFonts w:ascii="Garamond" w:hAnsi="Garamond"/>
+          <w:sz w:val="22"/>
+          <w:szCs w:val="22"/>
+        </w:rPr>
+        <w:t>, t</w:t>
+      </w:r>
+      <w:r>
+        <w:rPr>
+          <w:rFonts w:ascii="Garamond" w:hAnsi="Garamond"/>
+          <w:sz w:val="22"/>
+          <w:szCs w:val="22"/>
+        </w:rPr>
+        <w:t xml:space="preserve">he Yukon, Kuskokwim, and </w:t>
       </w:r>
       <w:proofErr w:type="spellStart"/>
       <w:r>
@@ -282,31 +386,127 @@
           <w:sz w:val="22"/>
           <w:szCs w:val="22"/>
         </w:rPr>
-        <w:t xml:space="preserve"> River-Basins), salmon are a critical </w:t>
-      </w:r>
-      <w:r>
-        <w:rPr>
-          <w:rFonts w:ascii="Garamond" w:hAnsi="Garamond"/>
-          <w:sz w:val="22"/>
-          <w:szCs w:val="22"/>
-        </w:rPr>
-        <w:t>source of subsistence harvest and cultural importance for dozens of indigenous communities</w:t>
-      </w:r>
-      <w:r>
-        <w:rPr>
-          <w:rFonts w:ascii="Garamond" w:hAnsi="Garamond"/>
-          <w:sz w:val="22"/>
-          <w:szCs w:val="22"/>
-        </w:rPr>
-        <w:t xml:space="preserve"> as well as an important economic resource for the region. Recent declines have precipitated in a region-wide crisis characterized by limitations on both commercial and subsistence harvest, increased food insecurity, and a loss of an important cultural resource. As a result, there is an urgent need explore hypotheses related to the stock collapse in freshwater and marine ecosystems as well as to assess the spatial distribution of impacts across the region. Marine mortality has been suggested as a potential contributing factor to stock decline through mechanisms such as shifting food-web dynamics, thermal stress, density-dependent processes, or bycatch in federal trawl fisheries. Full assessing these hypotheses, however, is limited by an inability to understand the provenance of fish caught in the marine environment</w:t>
-      </w:r>
-      <w:r>
-        <w:rPr>
-          <w:rFonts w:ascii="Garamond" w:hAnsi="Garamond"/>
-          <w:sz w:val="22"/>
-          <w:szCs w:val="22"/>
-        </w:rPr>
-        <w:t>. Methods such as genetic stock identification (GSI) offer provenance estimates at relatively coarse spatial scales,</w:t>
+        <w:t xml:space="preserve"> River-Basins, salmon </w:t>
+      </w:r>
+      <w:r>
+        <w:rPr>
+          <w:rFonts w:ascii="Garamond" w:hAnsi="Garamond"/>
+          <w:sz w:val="22"/>
+          <w:szCs w:val="22"/>
+        </w:rPr>
+        <w:t>support a lucrative commercial fishery and are</w:t>
+      </w:r>
+      <w:r>
+        <w:rPr>
+          <w:rFonts w:ascii="Garamond" w:hAnsi="Garamond"/>
+          <w:sz w:val="22"/>
+          <w:szCs w:val="22"/>
+        </w:rPr>
+        <w:t xml:space="preserve"> a</w:t>
+      </w:r>
+      <w:r>
+        <w:rPr>
+          <w:rFonts w:ascii="Garamond" w:hAnsi="Garamond"/>
+          <w:sz w:val="22"/>
+          <w:szCs w:val="22"/>
+        </w:rPr>
+        <w:t xml:space="preserve"> </w:t>
+      </w:r>
+      <w:r>
+        <w:rPr>
+          <w:rFonts w:ascii="Garamond" w:hAnsi="Garamond"/>
+          <w:sz w:val="22"/>
+          <w:szCs w:val="22"/>
+        </w:rPr>
+        <w:t xml:space="preserve">source of subsistence harvest and cultural importance for dozens of indigenous </w:t>
+      </w:r>
+      <w:r>
+        <w:rPr>
+          <w:rFonts w:ascii="Garamond" w:hAnsi="Garamond"/>
+          <w:sz w:val="22"/>
+          <w:szCs w:val="22"/>
+        </w:rPr>
+        <w:t xml:space="preserve">communities in the </w:t>
+      </w:r>
+      <w:r>
+        <w:rPr>
+          <w:rFonts w:ascii="Garamond" w:hAnsi="Garamond"/>
+          <w:sz w:val="22"/>
+          <w:szCs w:val="22"/>
+        </w:rPr>
+        <w:t xml:space="preserve">region. Recent declines have precipitated in a region-wide crisis characterized by limitations on both commercial and subsistence harvest, increased food insecurity, and a loss of an important cultural resource. </w:t>
+      </w:r>
+      <w:r>
+        <w:rPr>
+          <w:rFonts w:ascii="Garamond" w:hAnsi="Garamond"/>
+          <w:sz w:val="22"/>
+          <w:szCs w:val="22"/>
+        </w:rPr>
+        <w:t>As a result, there is an urgent need to explore hypotheses related to the stock collapse in freshwater and marine ecosystems, as well as to assess the spatial distribution of impacts across the region.</w:t>
+      </w:r>
+      <w:r>
+        <w:rPr>
+          <w:rFonts w:ascii="Garamond" w:hAnsi="Garamond"/>
+          <w:sz w:val="22"/>
+          <w:szCs w:val="22"/>
+        </w:rPr>
+        <w:t xml:space="preserve"> Marine mortality has been suggested as a potential contributing factor to stock decline through mechanisms such as shifting food-web dynamics, thermal stress, density-dependent processes, or bycatch in federal trawl fisheries. </w:t>
+      </w:r>
+      <w:r>
+        <w:rPr>
+          <w:rFonts w:ascii="Garamond" w:hAnsi="Garamond"/>
+          <w:sz w:val="22"/>
+          <w:szCs w:val="22"/>
+        </w:rPr>
+        <w:t>However, f</w:t>
+      </w:r>
+      <w:r>
+        <w:rPr>
+          <w:rFonts w:ascii="Garamond" w:hAnsi="Garamond"/>
+          <w:sz w:val="22"/>
+          <w:szCs w:val="22"/>
+        </w:rPr>
+        <w:t>ull</w:t>
+      </w:r>
+      <w:r>
+        <w:rPr>
+          <w:rFonts w:ascii="Garamond" w:hAnsi="Garamond"/>
+          <w:sz w:val="22"/>
+          <w:szCs w:val="22"/>
+        </w:rPr>
+        <w:t>y</w:t>
+      </w:r>
+      <w:r>
+        <w:rPr>
+          <w:rFonts w:ascii="Garamond" w:hAnsi="Garamond"/>
+          <w:sz w:val="22"/>
+          <w:szCs w:val="22"/>
+        </w:rPr>
+        <w:t xml:space="preserve"> assessing these hypotheses</w:t>
+      </w:r>
+      <w:r>
+        <w:rPr>
+          <w:rFonts w:ascii="Garamond" w:hAnsi="Garamond"/>
+          <w:sz w:val="22"/>
+          <w:szCs w:val="22"/>
+        </w:rPr>
+        <w:t xml:space="preserve"> </w:t>
+      </w:r>
+      <w:r>
+        <w:rPr>
+          <w:rFonts w:ascii="Garamond" w:hAnsi="Garamond"/>
+          <w:sz w:val="22"/>
+          <w:szCs w:val="22"/>
+        </w:rPr>
+        <w:t>is limited by an inability to understand the provenance of fish caught in the marine environment</w:t>
+      </w:r>
+      <w:r>
+        <w:rPr>
+          <w:rFonts w:ascii="Garamond" w:hAnsi="Garamond"/>
+          <w:sz w:val="22"/>
+          <w:szCs w:val="22"/>
+        </w:rPr>
+        <w:t>. Methods such as genetic stock identification (GSI) offer provenance estimates at relatively coarse spatial scales</w:t>
       </w:r>
       <w:r>
         <w:rPr>
@@ -322,6 +522,264 @@
           <w:sz w:val="22"/>
           <w:szCs w:val="22"/>
         </w:rPr>
+        <w:t xml:space="preserve"> </w:t>
+      </w:r>
+      <w:r>
+        <w:rPr>
+          <w:rFonts w:ascii="Garamond" w:hAnsi="Garamond"/>
+          <w:sz w:val="22"/>
+          <w:szCs w:val="22"/>
+        </w:rPr>
+        <w:t xml:space="preserve">but cannot </w:t>
+      </w:r>
+      <w:r>
+        <w:rPr>
+          <w:rFonts w:ascii="Garamond" w:hAnsi="Garamond"/>
+          <w:sz w:val="22"/>
+          <w:szCs w:val="22"/>
+        </w:rPr>
+        <w:t>reliably</w:t>
+      </w:r>
+      <w:r>
+        <w:rPr>
+          <w:rFonts w:ascii="Garamond" w:hAnsi="Garamond"/>
+          <w:sz w:val="22"/>
+          <w:szCs w:val="22"/>
+        </w:rPr>
+        <w:t xml:space="preserve"> </w:t>
+      </w:r>
+      <w:r>
+        <w:rPr>
+          <w:rFonts w:ascii="Garamond" w:hAnsi="Garamond"/>
+          <w:sz w:val="22"/>
+          <w:szCs w:val="22"/>
+        </w:rPr>
+        <w:t>distinguish between rivers within current genetic baselines for</w:t>
+      </w:r>
+      <w:r>
+        <w:rPr>
+          <w:rFonts w:ascii="Garamond" w:hAnsi="Garamond"/>
+          <w:sz w:val="22"/>
+          <w:szCs w:val="22"/>
+        </w:rPr>
+        <w:t xml:space="preserve"> Chinook salmon</w:t>
+      </w:r>
+      <w:r>
+        <w:rPr>
+          <w:rFonts w:ascii="Garamond" w:hAnsi="Garamond"/>
+          <w:sz w:val="22"/>
+          <w:szCs w:val="22"/>
+        </w:rPr>
+        <w:t xml:space="preserve">. </w:t>
+      </w:r>
+    </w:p>
+    <w:p>
+      <w:pPr>
+        <w:spacing w:line="480" w:lineRule="auto"/>
+        <w:ind w:firstLine="720"/>
+        <w:rPr>
+          <w:rFonts w:ascii="Garamond" w:hAnsi="Garamond"/>
+          <w:sz w:val="22"/>
+          <w:szCs w:val="22"/>
+        </w:rPr>
+      </w:pPr>
+      <w:r>
+        <w:rPr>
+          <w:rFonts w:ascii="Garamond" w:hAnsi="Garamond"/>
+          <w:sz w:val="22"/>
+          <w:szCs w:val="22"/>
+        </w:rPr>
+        <w:lastRenderedPageBreak/>
+        <w:t>Isotope-based methods for estimating provenance from otoliths (ear stones found in fish) have shown promise as an alternative approach that can provide more refined spatial resolution than genetics in some cases. The relative ratio of strontium-87 to strontium-86 (</w:t>
+      </w:r>
+      <w:r>
+        <w:rPr>
+          <w:rFonts w:ascii="Cambria Math" w:hAnsi="Cambria Math" w:cs="Cambria Math"/>
+          <w:sz w:val="22"/>
+          <w:szCs w:val="22"/>
+        </w:rPr>
+        <w:t>⁸⁷</w:t>
+      </w:r>
+      <w:r>
+        <w:rPr>
+          <w:rFonts w:ascii="Garamond" w:hAnsi="Garamond"/>
+          <w:sz w:val="22"/>
+          <w:szCs w:val="22"/>
+        </w:rPr>
+        <w:t>Sr/</w:t>
+      </w:r>
+      <w:r>
+        <w:rPr>
+          <w:rFonts w:ascii="Cambria Math" w:hAnsi="Cambria Math" w:cs="Cambria Math"/>
+          <w:sz w:val="22"/>
+          <w:szCs w:val="22"/>
+        </w:rPr>
+        <w:t>⁸⁶</w:t>
+      </w:r>
+      <w:r>
+        <w:rPr>
+          <w:rFonts w:ascii="Garamond" w:hAnsi="Garamond"/>
+          <w:sz w:val="22"/>
+          <w:szCs w:val="22"/>
+        </w:rPr>
+        <w:t xml:space="preserve">Sr) is an isotopic tracer that is heterogeneously distributed across geologically diverse landscapes, faithfully incorporated into otoliths, and has been shown to be temporally stable in Alaskan watersheds. As a result, </w:t>
+      </w:r>
+      <w:r>
+        <w:rPr>
+          <w:rFonts w:ascii="Cambria Math" w:hAnsi="Cambria Math" w:cs="Cambria Math"/>
+          <w:sz w:val="22"/>
+          <w:szCs w:val="22"/>
+        </w:rPr>
+        <w:t>⁸⁷</w:t>
+      </w:r>
+      <w:r>
+        <w:rPr>
+          <w:rFonts w:ascii="Garamond" w:hAnsi="Garamond"/>
+          <w:sz w:val="22"/>
+          <w:szCs w:val="22"/>
+        </w:rPr>
+        <w:t>Sr/</w:t>
+      </w:r>
+      <w:r>
+        <w:rPr>
+          <w:rFonts w:ascii="Cambria Math" w:hAnsi="Cambria Math" w:cs="Cambria Math"/>
+          <w:sz w:val="22"/>
+          <w:szCs w:val="22"/>
+        </w:rPr>
+        <w:t>⁸⁶</w:t>
+      </w:r>
+      <w:r>
+        <w:rPr>
+          <w:rFonts w:ascii="Garamond" w:hAnsi="Garamond"/>
+          <w:sz w:val="22"/>
+          <w:szCs w:val="22"/>
+        </w:rPr>
+        <w:t>Sr values associated with discrete time periods in an individual's life (e.g., freshwater natal rearing) can be used to estimate provenance by comparing them to values measured or modeled across the landscape</w:t>
+      </w:r>
+      <w:r>
+        <w:rPr>
+          <w:rFonts w:ascii="Garamond" w:hAnsi="Garamond"/>
+          <w:sz w:val="22"/>
+          <w:szCs w:val="22"/>
+        </w:rPr>
+        <w:t>.</w:t>
+      </w:r>
+      <w:r>
+        <w:t xml:space="preserve"> </w:t>
+      </w:r>
+      <w:r>
+        <w:rPr>
+          <w:rFonts w:ascii="Garamond" w:hAnsi="Garamond"/>
+          <w:sz w:val="22"/>
+          <w:szCs w:val="22"/>
+        </w:rPr>
+        <w:t xml:space="preserve">Despite its precision, this method is limited by the level of isotopic heterogeneity relative to the spatial scale of interest. In Western Alaska, individual watersheds contain sufficient isotopic heterogeneity to estimate provenance with reasonable certainty. However, at the regional scale encompassing all three watersheds, there is significant overlap in isotope ratios across the major river systems, leading to high uncertainty and preventing reliable provenance estimation using natal </w:t>
+      </w:r>
+      <w:r>
+        <w:rPr>
+          <w:rFonts w:ascii="Cambria Math" w:hAnsi="Cambria Math" w:cs="Cambria Math"/>
+          <w:sz w:val="22"/>
+          <w:szCs w:val="22"/>
+        </w:rPr>
+        <w:t>⁸⁷</w:t>
+      </w:r>
+      <w:r>
+        <w:rPr>
+          <w:rFonts w:ascii="Garamond" w:hAnsi="Garamond"/>
+          <w:sz w:val="22"/>
+          <w:szCs w:val="22"/>
+        </w:rPr>
+        <w:t>Sr/</w:t>
+      </w:r>
+      <w:r>
+        <w:rPr>
+          <w:rFonts w:ascii="Cambria Math" w:hAnsi="Cambria Math" w:cs="Cambria Math"/>
+          <w:sz w:val="22"/>
+          <w:szCs w:val="22"/>
+        </w:rPr>
+        <w:t>⁸⁶</w:t>
+      </w:r>
+      <w:r>
+        <w:rPr>
+          <w:rFonts w:ascii="Garamond" w:hAnsi="Garamond"/>
+          <w:sz w:val="22"/>
+          <w:szCs w:val="22"/>
+        </w:rPr>
+        <w:t>Sr values from otoliths.</w:t>
+      </w:r>
+      <w:r>
+        <w:rPr>
+          <w:rFonts w:ascii="Garamond" w:hAnsi="Garamond"/>
+          <w:sz w:val="22"/>
+          <w:szCs w:val="22"/>
+        </w:rPr>
+        <w:t xml:space="preserve"> </w:t>
+      </w:r>
+    </w:p>
+    <w:p>
+      <w:pPr>
+        <w:spacing w:line="480" w:lineRule="auto"/>
+        <w:ind w:firstLine="720"/>
+        <w:rPr>
+          <w:rFonts w:ascii="Garamond" w:hAnsi="Garamond"/>
+          <w:sz w:val="22"/>
+          <w:szCs w:val="22"/>
+        </w:rPr>
+      </w:pPr>
+      <w:r>
+        <w:rPr>
+          <w:rFonts w:ascii="Garamond" w:hAnsi="Garamond"/>
+          <w:sz w:val="22"/>
+          <w:szCs w:val="22"/>
+        </w:rPr>
+        <w:t xml:space="preserve">Otolith growth and isotopic incorporation occur continuously over an individual's lifetime. As a result, measured </w:t>
+      </w:r>
+      <w:r>
+        <w:rPr>
+          <w:rFonts w:ascii="Cambria Math" w:hAnsi="Cambria Math" w:cs="Cambria Math"/>
+          <w:sz w:val="22"/>
+          <w:szCs w:val="22"/>
+        </w:rPr>
+        <w:t>⁸⁷</w:t>
+      </w:r>
+      <w:r>
+        <w:rPr>
+          <w:rFonts w:ascii="Garamond" w:hAnsi="Garamond"/>
+          <w:sz w:val="22"/>
+          <w:szCs w:val="22"/>
+        </w:rPr>
+        <w:t>Sr/</w:t>
+      </w:r>
+      <w:r>
+        <w:rPr>
+          <w:rFonts w:ascii="Cambria Math" w:hAnsi="Cambria Math" w:cs="Cambria Math"/>
+          <w:sz w:val="22"/>
+          <w:szCs w:val="22"/>
+        </w:rPr>
+        <w:t>⁸⁶</w:t>
+      </w:r>
+      <w:r>
+        <w:rPr>
+          <w:rFonts w:ascii="Garamond" w:hAnsi="Garamond"/>
+          <w:sz w:val="22"/>
+          <w:szCs w:val="22"/>
+        </w:rPr>
+        <w:t xml:space="preserve">Sr values along the growth axis of the otolith represent an integrated time series from early development until capture. These data contain information on sequential habitat use, relative growth among habitats, and even the migration history of the mother. In some cases, these sequential habitat signatures can be used to reconstruct complete life history characteristics. However, when fish move rapidly through several </w:t>
+      </w:r>
+      <w:r>
+        <w:rPr>
+          <w:rFonts w:ascii="Garamond" w:hAnsi="Garamond"/>
+          <w:sz w:val="22"/>
+          <w:szCs w:val="22"/>
+        </w:rPr>
+        <w:t>environments</w:t>
+      </w:r>
+      <w:r>
+        <w:rPr>
+          <w:rFonts w:ascii="Garamond" w:hAnsi="Garamond"/>
+          <w:sz w:val="22"/>
+          <w:szCs w:val="22"/>
+        </w:rPr>
         <w:t xml:space="preserve">, </w:t>
       </w:r>
       <w:r>
@@ -330,35 +788,36 @@
           <w:sz w:val="22"/>
           <w:szCs w:val="22"/>
         </w:rPr>
-        <w:t xml:space="preserve">but cannot </w:t>
-      </w:r>
-      <w:r>
-        <w:rPr>
-          <w:rFonts w:ascii="Garamond" w:hAnsi="Garamond"/>
-          <w:sz w:val="22"/>
-          <w:szCs w:val="22"/>
-        </w:rPr>
-        <w:t>reliably</w:t>
-      </w:r>
-      <w:r>
-        <w:rPr>
-          <w:rFonts w:ascii="Garamond" w:hAnsi="Garamond"/>
-          <w:sz w:val="22"/>
-          <w:szCs w:val="22"/>
-        </w:rPr>
-        <w:t xml:space="preserve"> </w:t>
-      </w:r>
-      <w:r>
-        <w:rPr>
-          <w:rFonts w:ascii="Garamond" w:hAnsi="Garamond"/>
-          <w:sz w:val="22"/>
-          <w:szCs w:val="22"/>
-        </w:rPr>
-        <w:t xml:space="preserve">distinguish between rivers within current genetic baselines for many individuals. </w:t>
-      </w:r>
-    </w:p>
-    <w:p>
-      <w:pPr>
+        <w:t>as occurs during salmon out-migration</w:t>
+      </w:r>
+      <w:r>
+        <w:rPr>
+          <w:rFonts w:ascii="Garamond" w:hAnsi="Garamond"/>
+          <w:sz w:val="22"/>
+          <w:szCs w:val="22"/>
+        </w:rPr>
+        <w:t xml:space="preserve">, </w:t>
+      </w:r>
+      <w:r>
+        <w:rPr>
+          <w:rFonts w:ascii="Garamond" w:hAnsi="Garamond"/>
+          <w:sz w:val="22"/>
+          <w:szCs w:val="22"/>
+        </w:rPr>
+        <w:t>otolith isotope ratios may not sufficiently equilibrate to reflect the water values of each habitat. The result is patterns in otolith isotope data that may not be interpretable by directly relating them to landscape values but may contain stock- or watershed-specific life history characteristics. However, the subtlety of these patterns and the number of potential combinations make manual interpretation logistically unfeasible</w:t>
+      </w:r>
+      <w:r>
+        <w:rPr>
+          <w:rFonts w:ascii="Garamond" w:hAnsi="Garamond"/>
+          <w:sz w:val="22"/>
+          <w:szCs w:val="22"/>
+        </w:rPr>
+        <w:t xml:space="preserve">. </w:t>
+      </w:r>
+    </w:p>
+    <w:p>
+      <w:pPr>
+        <w:pStyle w:val="whitespace-normal"/>
         <w:spacing w:line="480" w:lineRule="auto"/>
         <w:ind w:firstLine="720"/>
         <w:rPr>
@@ -373,222 +832,21 @@
           <w:sz w:val="22"/>
           <w:szCs w:val="22"/>
         </w:rPr>
+        <w:t xml:space="preserve">Machine learning tools are particularly well-suited to interpreting complex, multidimensional patterns in datasets. These methods have only recently been applied to otolith chemical analysis and have shown promising performance relative to traditional techniques. Concurrently, there is increasing recognition of the </w:t>
+      </w:r>
+      <w:r>
+        <w:rPr>
+          <w:rFonts w:ascii="Garamond" w:hAnsi="Garamond"/>
+          <w:sz w:val="22"/>
+          <w:szCs w:val="22"/>
+        </w:rPr>
         <w:lastRenderedPageBreak/>
-        <w:t xml:space="preserve">Isotope-based methods for estimating provenance from </w:t>
-      </w:r>
-      <w:r>
-        <w:rPr>
-          <w:rFonts w:ascii="Garamond" w:hAnsi="Garamond"/>
-          <w:sz w:val="22"/>
-          <w:szCs w:val="22"/>
-        </w:rPr>
-        <w:t xml:space="preserve">ear stones found in fishes, or otoliths, </w:t>
-      </w:r>
-      <w:r>
-        <w:rPr>
-          <w:rFonts w:ascii="Garamond" w:hAnsi="Garamond"/>
-          <w:sz w:val="22"/>
-          <w:szCs w:val="22"/>
-        </w:rPr>
-        <w:t>have shown promi</w:t>
-      </w:r>
-      <w:r>
-        <w:rPr>
-          <w:rFonts w:ascii="Garamond" w:hAnsi="Garamond"/>
-          <w:sz w:val="22"/>
-          <w:szCs w:val="22"/>
-        </w:rPr>
-        <w:t xml:space="preserve">se as an alternative method to estimate </w:t>
-      </w:r>
-      <w:r>
-        <w:rPr>
-          <w:rFonts w:ascii="Garamond" w:hAnsi="Garamond"/>
-          <w:sz w:val="22"/>
-          <w:szCs w:val="22"/>
-        </w:rPr>
-        <w:t xml:space="preserve">provenance at </w:t>
-      </w:r>
-      <w:r>
-        <w:rPr>
-          <w:rFonts w:ascii="Garamond" w:hAnsi="Garamond"/>
-          <w:sz w:val="22"/>
-          <w:szCs w:val="22"/>
-        </w:rPr>
-        <w:t>more refined spatial scale than genetics in some cases</w:t>
-      </w:r>
-      <w:r>
-        <w:rPr>
-          <w:rFonts w:ascii="Garamond" w:hAnsi="Garamond"/>
-          <w:sz w:val="22"/>
-          <w:szCs w:val="22"/>
-        </w:rPr>
-        <w:t xml:space="preserve">. </w:t>
-      </w:r>
-      <w:r>
-        <w:rPr>
-          <w:rFonts w:ascii="Garamond" w:hAnsi="Garamond"/>
-          <w:sz w:val="22"/>
-          <w:szCs w:val="22"/>
-        </w:rPr>
-        <w:t xml:space="preserve">The relative ratio of Strontium 87/86 is an isotopic tracer that is heterogeneously distributed in geologically diverse landscapes, faithfully incorporated into the otolith, and has been shown to be temporally stable in Alaskan watersheds. As a result, the value of Sr8786 associated with a discrete </w:t>
-      </w:r>
-      <w:proofErr w:type="gramStart"/>
-      <w:r>
-        <w:rPr>
-          <w:rFonts w:ascii="Garamond" w:hAnsi="Garamond"/>
-          <w:sz w:val="22"/>
-          <w:szCs w:val="22"/>
-        </w:rPr>
-        <w:t>time period</w:t>
-      </w:r>
-      <w:proofErr w:type="gramEnd"/>
-      <w:r>
-        <w:rPr>
-          <w:rFonts w:ascii="Garamond" w:hAnsi="Garamond"/>
-          <w:sz w:val="22"/>
-          <w:szCs w:val="22"/>
-        </w:rPr>
-        <w:t xml:space="preserve"> of an individual’s life (i.e. freshwater natal rearing) has been used to estimate provenance by relating it to </w:t>
-      </w:r>
-      <w:r>
-        <w:rPr>
-          <w:rFonts w:ascii="Garamond" w:hAnsi="Garamond"/>
-          <w:sz w:val="22"/>
-          <w:szCs w:val="22"/>
-        </w:rPr>
-        <w:t xml:space="preserve">values </w:t>
-      </w:r>
-      <w:r>
-        <w:rPr>
-          <w:rFonts w:ascii="Garamond" w:hAnsi="Garamond"/>
-          <w:sz w:val="22"/>
-          <w:szCs w:val="22"/>
-        </w:rPr>
-        <w:t xml:space="preserve">measured or modeled across the landscape. </w:t>
-      </w:r>
-      <w:r>
-        <w:rPr>
-          <w:rFonts w:ascii="Garamond" w:hAnsi="Garamond"/>
-          <w:sz w:val="22"/>
-          <w:szCs w:val="22"/>
-        </w:rPr>
-        <w:t xml:space="preserve">Despite its precision, </w:t>
-      </w:r>
-      <w:r>
-        <w:rPr>
-          <w:rFonts w:ascii="Garamond" w:hAnsi="Garamond"/>
-          <w:sz w:val="22"/>
-          <w:szCs w:val="22"/>
-        </w:rPr>
-        <w:t xml:space="preserve">this method is limited by the </w:t>
-      </w:r>
-      <w:r>
-        <w:rPr>
-          <w:rFonts w:ascii="Garamond" w:hAnsi="Garamond"/>
-          <w:sz w:val="22"/>
-          <w:szCs w:val="22"/>
-        </w:rPr>
-        <w:t xml:space="preserve">level of </w:t>
-      </w:r>
-      <w:r>
-        <w:rPr>
-          <w:rFonts w:ascii="Garamond" w:hAnsi="Garamond"/>
-          <w:sz w:val="22"/>
-          <w:szCs w:val="22"/>
-        </w:rPr>
-        <w:t>isotopic heterogeneity</w:t>
-      </w:r>
-      <w:r>
-        <w:rPr>
-          <w:rFonts w:ascii="Garamond" w:hAnsi="Garamond"/>
-          <w:sz w:val="22"/>
-          <w:szCs w:val="22"/>
-        </w:rPr>
-        <w:t xml:space="preserve"> relative to the spatial scale of potential habitat</w:t>
-      </w:r>
-      <w:r>
-        <w:rPr>
-          <w:rFonts w:ascii="Garamond" w:hAnsi="Garamond"/>
-          <w:sz w:val="22"/>
-          <w:szCs w:val="22"/>
-        </w:rPr>
-        <w:t xml:space="preserve">. </w:t>
-      </w:r>
-      <w:r>
-        <w:rPr>
-          <w:rFonts w:ascii="Garamond" w:hAnsi="Garamond"/>
-          <w:sz w:val="22"/>
-          <w:szCs w:val="22"/>
-        </w:rPr>
-        <w:t xml:space="preserve">In Western Alaska, each watershed contains </w:t>
-      </w:r>
-      <w:r>
-        <w:rPr>
-          <w:rFonts w:ascii="Garamond" w:hAnsi="Garamond"/>
-          <w:sz w:val="22"/>
-          <w:szCs w:val="22"/>
-        </w:rPr>
-        <w:t xml:space="preserve">sufficient isotopic heterogeneity to </w:t>
-      </w:r>
-      <w:r>
-        <w:rPr>
-          <w:rFonts w:ascii="Garamond" w:hAnsi="Garamond"/>
-          <w:sz w:val="22"/>
-          <w:szCs w:val="22"/>
-        </w:rPr>
-        <w:t>estimate</w:t>
-      </w:r>
-      <w:r>
-        <w:rPr>
-          <w:rFonts w:ascii="Garamond" w:hAnsi="Garamond"/>
-          <w:sz w:val="22"/>
-          <w:szCs w:val="22"/>
-        </w:rPr>
-        <w:t xml:space="preserve"> provenance with reasonable uncertainty. </w:t>
-      </w:r>
-      <w:r>
-        <w:rPr>
-          <w:rFonts w:ascii="Garamond" w:hAnsi="Garamond"/>
-          <w:sz w:val="22"/>
-          <w:szCs w:val="22"/>
-        </w:rPr>
-        <w:t xml:space="preserve">However, at </w:t>
-      </w:r>
-      <w:r>
-        <w:rPr>
-          <w:rFonts w:ascii="Garamond" w:hAnsi="Garamond"/>
-          <w:sz w:val="22"/>
-          <w:szCs w:val="22"/>
-        </w:rPr>
-        <w:t>the regional scale</w:t>
-      </w:r>
-      <w:r>
-        <w:rPr>
-          <w:rFonts w:ascii="Garamond" w:hAnsi="Garamond"/>
-          <w:sz w:val="22"/>
-          <w:szCs w:val="22"/>
-        </w:rPr>
-        <w:t xml:space="preserve"> </w:t>
-      </w:r>
-      <w:r>
-        <w:rPr>
-          <w:rFonts w:ascii="Garamond" w:hAnsi="Garamond"/>
-          <w:sz w:val="22"/>
-          <w:szCs w:val="22"/>
-        </w:rPr>
-        <w:t>which incorporates all three watersheds</w:t>
-      </w:r>
-      <w:r>
-        <w:rPr>
-          <w:rFonts w:ascii="Garamond" w:hAnsi="Garamond"/>
-          <w:sz w:val="22"/>
-          <w:szCs w:val="22"/>
-        </w:rPr>
-        <w:t xml:space="preserve"> there is significant redundancy in isotope ratios across all three major watersheds, leading to high levels of uncertainty and an inability to estimate provenance using natal Sr8786 values from the otolith. </w:t>
-      </w:r>
-    </w:p>
-    <w:p>
-      <w:pPr>
+        <w:t>wealth of data found in complete otolith laser ablation (LA) datasets. Applying machine learning tools directly to otolith LA time-series data provides an opportunity to uncover subtle patterns in otherwise noisy datasets that may help illuminate important life history characteristics.</w:t>
+      </w:r>
+    </w:p>
+    <w:p>
+      <w:pPr>
+        <w:pStyle w:val="whitespace-normal"/>
         <w:spacing w:line="480" w:lineRule="auto"/>
         <w:ind w:firstLine="720"/>
         <w:rPr>
@@ -603,275 +861,23 @@
           <w:sz w:val="22"/>
           <w:szCs w:val="22"/>
         </w:rPr>
-        <w:t xml:space="preserve">Otolith growth </w:t>
-      </w:r>
-      <w:r>
-        <w:rPr>
-          <w:rFonts w:ascii="Garamond" w:hAnsi="Garamond"/>
-          <w:sz w:val="22"/>
-          <w:szCs w:val="22"/>
-        </w:rPr>
-        <w:t>and isotopic incorporation is</w:t>
-      </w:r>
-      <w:r>
-        <w:rPr>
-          <w:rFonts w:ascii="Garamond" w:hAnsi="Garamond"/>
-          <w:sz w:val="22"/>
-          <w:szCs w:val="22"/>
-        </w:rPr>
-        <w:t xml:space="preserve"> continuous over the lifetime of the individual</w:t>
-      </w:r>
-      <w:r>
-        <w:rPr>
-          <w:rFonts w:ascii="Garamond" w:hAnsi="Garamond"/>
-          <w:sz w:val="22"/>
-          <w:szCs w:val="22"/>
-        </w:rPr>
-        <w:t xml:space="preserve">. </w:t>
-      </w:r>
-      <w:r>
-        <w:rPr>
-          <w:rFonts w:ascii="Garamond" w:hAnsi="Garamond"/>
-          <w:sz w:val="22"/>
-          <w:szCs w:val="22"/>
-        </w:rPr>
-        <w:t xml:space="preserve">As a result, measured </w:t>
-      </w:r>
-      <w:r>
-        <w:rPr>
-          <w:rFonts w:ascii="Cambria Math" w:hAnsi="Cambria Math" w:cs="Cambria Math"/>
-          <w:sz w:val="22"/>
-          <w:szCs w:val="22"/>
-        </w:rPr>
-        <w:t>⁸⁷</w:t>
-      </w:r>
-      <w:r>
-        <w:rPr>
-          <w:rFonts w:ascii="Garamond" w:hAnsi="Garamond"/>
-          <w:sz w:val="22"/>
-          <w:szCs w:val="22"/>
-        </w:rPr>
-        <w:t>Sr/</w:t>
-      </w:r>
-      <w:r>
-        <w:rPr>
-          <w:rFonts w:ascii="Cambria Math" w:hAnsi="Cambria Math" w:cs="Cambria Math"/>
-          <w:sz w:val="22"/>
-          <w:szCs w:val="22"/>
-        </w:rPr>
-        <w:t>⁸⁶</w:t>
-      </w:r>
-      <w:r>
-        <w:rPr>
-          <w:rFonts w:ascii="Garamond" w:hAnsi="Garamond"/>
-          <w:sz w:val="22"/>
-          <w:szCs w:val="22"/>
-        </w:rPr>
-        <w:t xml:space="preserve">Sr along the growth axis of the otolith represent an integrated time series from early development until capture. Contained within these data is information on sequential habitat use, relative growth among habitats, and even the migration history of the mother. </w:t>
-      </w:r>
-      <w:r>
-        <w:rPr>
-          <w:rFonts w:ascii="Garamond" w:hAnsi="Garamond"/>
-          <w:sz w:val="22"/>
-          <w:szCs w:val="22"/>
-        </w:rPr>
-        <w:t xml:space="preserve">In some cases, these sequential habitats can be used to reconstruct full life history characteristics. However, </w:t>
-      </w:r>
-      <w:r>
-        <w:rPr>
-          <w:rFonts w:ascii="Garamond" w:hAnsi="Garamond"/>
-          <w:sz w:val="22"/>
-          <w:szCs w:val="22"/>
-        </w:rPr>
-        <w:t xml:space="preserve">when </w:t>
-      </w:r>
-      <w:r>
-        <w:rPr>
-          <w:rFonts w:ascii="Garamond" w:hAnsi="Garamond"/>
-          <w:sz w:val="22"/>
-          <w:szCs w:val="22"/>
-        </w:rPr>
-        <w:t xml:space="preserve">moving </w:t>
-      </w:r>
-      <w:r>
-        <w:rPr>
-          <w:rFonts w:ascii="Garamond" w:hAnsi="Garamond"/>
-          <w:sz w:val="22"/>
-          <w:szCs w:val="22"/>
-        </w:rPr>
-        <w:t>rapidly through several environments, as is the case for salmon out-migrati</w:t>
-      </w:r>
-      <w:r>
-        <w:rPr>
-          <w:rFonts w:ascii="Garamond" w:hAnsi="Garamond"/>
-          <w:sz w:val="22"/>
-          <w:szCs w:val="22"/>
-        </w:rPr>
-        <w:t xml:space="preserve">on, </w:t>
-      </w:r>
-      <w:r>
-        <w:rPr>
-          <w:rFonts w:ascii="Garamond" w:hAnsi="Garamond"/>
-          <w:sz w:val="22"/>
-          <w:szCs w:val="22"/>
-        </w:rPr>
-        <w:t xml:space="preserve">otolith isotope ratios may not sufficiently equilibrate to </w:t>
-      </w:r>
-      <w:r>
-        <w:rPr>
-          <w:rFonts w:ascii="Garamond" w:hAnsi="Garamond"/>
-          <w:sz w:val="22"/>
-          <w:szCs w:val="22"/>
-        </w:rPr>
-        <w:t xml:space="preserve">reflect </w:t>
-      </w:r>
-      <w:r>
-        <w:rPr>
-          <w:rFonts w:ascii="Garamond" w:hAnsi="Garamond"/>
-          <w:sz w:val="22"/>
-          <w:szCs w:val="22"/>
-        </w:rPr>
-        <w:t xml:space="preserve">the water values of each habitat. </w:t>
-      </w:r>
-      <w:r>
-        <w:rPr>
-          <w:rFonts w:ascii="Garamond" w:hAnsi="Garamond"/>
-          <w:sz w:val="22"/>
-          <w:szCs w:val="22"/>
-        </w:rPr>
-        <w:t>The result are patterns in the otolith isotope data which may not be interpretable by directly relating these data to the landscape but may contain stock or watershed specific life history characteristics.</w:t>
-      </w:r>
-      <w:r>
-        <w:rPr>
-          <w:rFonts w:ascii="Garamond" w:hAnsi="Garamond"/>
-          <w:sz w:val="22"/>
-          <w:szCs w:val="22"/>
-        </w:rPr>
-        <w:t xml:space="preserve"> However, the subtlety of these patterns and number of potential combinations make manual interpretation logistically </w:t>
-      </w:r>
-      <w:r>
-        <w:rPr>
-          <w:rFonts w:ascii="Garamond" w:hAnsi="Garamond"/>
-          <w:sz w:val="22"/>
-          <w:szCs w:val="22"/>
-        </w:rPr>
-        <w:t>unfeasible</w:t>
-      </w:r>
-      <w:r>
-        <w:rPr>
-          <w:rFonts w:ascii="Garamond" w:hAnsi="Garamond"/>
-          <w:sz w:val="22"/>
-          <w:szCs w:val="22"/>
-        </w:rPr>
-        <w:t xml:space="preserve">. </w:t>
-      </w:r>
-    </w:p>
-    <w:p>
-      <w:pPr>
-        <w:spacing w:line="480" w:lineRule="auto"/>
-        <w:ind w:firstLine="720"/>
-        <w:rPr>
-          <w:rFonts w:ascii="Garamond" w:hAnsi="Garamond"/>
-          <w:sz w:val="22"/>
-          <w:szCs w:val="22"/>
-        </w:rPr>
-      </w:pPr>
-      <w:r>
-        <w:rPr>
-          <w:rFonts w:ascii="Garamond" w:hAnsi="Garamond"/>
-          <w:sz w:val="22"/>
-          <w:szCs w:val="22"/>
-        </w:rPr>
-        <w:t xml:space="preserve">Machine learning tools have only recently been recognized for their potential applications to otolith chemical applications and have shown promising performance relative to traditional techniques. </w:t>
-      </w:r>
-      <w:r>
-        <w:rPr>
-          <w:rFonts w:ascii="Garamond" w:hAnsi="Garamond"/>
-          <w:sz w:val="22"/>
-          <w:szCs w:val="22"/>
-        </w:rPr>
-        <w:t xml:space="preserve">Concurrently, </w:t>
-      </w:r>
-      <w:r>
-        <w:rPr>
-          <w:rFonts w:ascii="Garamond" w:hAnsi="Garamond"/>
-          <w:sz w:val="22"/>
-          <w:szCs w:val="22"/>
-        </w:rPr>
-        <w:t xml:space="preserve">there is </w:t>
-      </w:r>
-      <w:r>
-        <w:rPr>
-          <w:rFonts w:ascii="Garamond" w:hAnsi="Garamond"/>
-          <w:sz w:val="22"/>
-          <w:szCs w:val="22"/>
-        </w:rPr>
-        <w:t xml:space="preserve">increasing interested in </w:t>
-      </w:r>
-      <w:r>
-        <w:rPr>
-          <w:rFonts w:ascii="Garamond" w:hAnsi="Garamond"/>
-          <w:sz w:val="22"/>
-          <w:szCs w:val="22"/>
-        </w:rPr>
-        <w:t xml:space="preserve">harnessing the full potential of otolith timeseries data from </w:t>
-      </w:r>
-      <w:r>
-        <w:rPr>
-          <w:rFonts w:ascii="Garamond" w:hAnsi="Garamond"/>
-          <w:sz w:val="22"/>
-          <w:szCs w:val="22"/>
-        </w:rPr>
-        <w:lastRenderedPageBreak/>
-        <w:t xml:space="preserve">Laser Ablation Mass Spectrometry (LA-MS), which has shown promise for uncovering life history variations otherwise obscured from discrete measurements. Applying machine learning tools directly to otolith laser ablation (LA) timeseries data provides an opportunity to uncover subtle patterns in the otherwise noisy datasets that may help shed light on important life history characteristics. Here, we apply machine learning classification algorithms to otolith LA timeseries data from Chinook salmon with known watersheds of origin in Western Alaska. In doing so we will 1) test the potential of using machine learning tools to determine stock of origin </w:t>
-      </w:r>
-      <w:r>
-        <w:rPr>
-          <w:rFonts w:ascii="Garamond" w:hAnsi="Garamond"/>
-          <w:sz w:val="22"/>
-          <w:szCs w:val="22"/>
-        </w:rPr>
-        <w:t xml:space="preserve">2) develop a classification model to </w:t>
-      </w:r>
-      <w:r>
-        <w:rPr>
-          <w:rFonts w:ascii="Garamond" w:hAnsi="Garamond"/>
-          <w:sz w:val="22"/>
-          <w:szCs w:val="22"/>
-        </w:rPr>
-        <w:t xml:space="preserve">reliably </w:t>
-      </w:r>
-      <w:r>
-        <w:rPr>
-          <w:rFonts w:ascii="Garamond" w:hAnsi="Garamond"/>
-          <w:sz w:val="22"/>
-          <w:szCs w:val="22"/>
-        </w:rPr>
-        <w:t xml:space="preserve">estimate river of origin for marine-caught Chinook salmon </w:t>
-      </w:r>
-      <w:r>
-        <w:rPr>
-          <w:rFonts w:ascii="Garamond" w:hAnsi="Garamond"/>
-          <w:sz w:val="22"/>
-          <w:szCs w:val="22"/>
-        </w:rPr>
-        <w:t xml:space="preserve">in </w:t>
-      </w:r>
-      <w:r>
-        <w:rPr>
-          <w:rFonts w:ascii="Garamond" w:hAnsi="Garamond"/>
-          <w:sz w:val="22"/>
-          <w:szCs w:val="22"/>
-        </w:rPr>
-        <w:t>western Alaska</w:t>
-      </w:r>
-      <w:r>
-        <w:rPr>
-          <w:rFonts w:ascii="Garamond" w:hAnsi="Garamond"/>
-          <w:sz w:val="22"/>
-          <w:szCs w:val="22"/>
-        </w:rPr>
-        <w:t xml:space="preserve">. </w:t>
+        <w:t>Here, we apply machine learning classification algorithms to otolith LA time-series data from Chinook salmon with known watersheds of origin in Western Alaska.</w:t>
+      </w:r>
+      <w:r>
+        <w:rPr>
+          <w:rFonts w:ascii="Garamond" w:hAnsi="Garamond"/>
+          <w:sz w:val="22"/>
+          <w:szCs w:val="22"/>
+        </w:rPr>
+        <w:t xml:space="preserve"> In doing so, we </w:t>
+      </w:r>
+      <w:r>
+        <w:rPr>
+          <w:rFonts w:ascii="Garamond" w:hAnsi="Garamond"/>
+          <w:sz w:val="22"/>
+          <w:szCs w:val="22"/>
+        </w:rPr>
+        <w:t>: 1) test the potential of machine learning tools to determine stock of origin, and 2) develop a classification model to reliably estimate river of origin for marine-caught Chinook salmon in western Alaska</w:t>
       </w:r>
     </w:p>
     <w:p>
@@ -1019,25 +1025,7 @@
           <w:sz w:val="22"/>
           <w:szCs w:val="22"/>
         </w:rPr>
-        <w:t xml:space="preserve">. Approximately 500 otoliths were collected each year, and from these, ~250 otoliths from each year were selected for further analysis. Selected samples were then cut along the transverse plane to reveal the core using a </w:t>
-      </w:r>
-      <w:proofErr w:type="gramStart"/>
-      <w:r>
-        <w:rPr>
-          <w:rFonts w:ascii="Garamond" w:hAnsi="Garamond"/>
-          <w:sz w:val="22"/>
-          <w:szCs w:val="22"/>
-        </w:rPr>
-        <w:t>low-speed</w:t>
-      </w:r>
-      <w:proofErr w:type="gramEnd"/>
-      <w:r>
-        <w:rPr>
-          <w:rFonts w:ascii="Garamond" w:hAnsi="Garamond"/>
-          <w:sz w:val="22"/>
-          <w:szCs w:val="22"/>
-        </w:rPr>
-        <w:t xml:space="preserve"> </w:t>
+        <w:t xml:space="preserve">. Approximately 500 otoliths were collected each year, and from these, ~250 otoliths from each year were selected for further analysis. Selected samples were then cut along the transverse plane to reveal the core using a low-speed </w:t>
       </w:r>
       <w:proofErr w:type="spellStart"/>
       <w:r>
@@ -1279,25 +1267,7 @@
           <w:sz w:val="22"/>
           <w:szCs w:val="22"/>
         </w:rPr>
-        <w:t xml:space="preserve"> for all individuals. Individuals with large errors from sample prep or laser ablation (i.e. large cracks</w:t>
-      </w:r>
-      <w:proofErr w:type="gramStart"/>
-      <w:r>
-        <w:rPr>
-          <w:rFonts w:ascii="Garamond" w:hAnsi="Garamond"/>
-          <w:sz w:val="22"/>
-          <w:szCs w:val="22"/>
-        </w:rPr>
-        <w:t>) ,</w:t>
-      </w:r>
-      <w:proofErr w:type="gramEnd"/>
-      <w:r>
-        <w:rPr>
-          <w:rFonts w:ascii="Garamond" w:hAnsi="Garamond"/>
-          <w:sz w:val="22"/>
-          <w:szCs w:val="22"/>
-        </w:rPr>
-        <w:t xml:space="preserve"> unclear marine entry, or no core signal were removed from the dataset. </w:t>
+        <w:t xml:space="preserve"> for all individuals. Individuals with large errors from sample prep or laser ablation (i.e. large cracks) , unclear marine entry, or no core signal were removed from the dataset. </w:t>
       </w:r>
     </w:p>
     <w:p>
@@ -1348,25 +1318,7 @@
           <w:sz w:val="22"/>
           <w:szCs w:val="22"/>
         </w:rPr>
-        <w:t xml:space="preserve">Sr ratios that are critical for interpretation. To address this challenge and reveal underlying patterns, researchers commonly apply time series smoothing techniques to these datasets. We tested whether such smoothing could improve model performance by applying two commonly used approaches: moving average (MA) and a generalized additive model (GAM) timeseries smoothing. Moving average smoothing used a simple </w:t>
-      </w:r>
-      <w:proofErr w:type="gramStart"/>
-      <w:r>
-        <w:rPr>
-          <w:rFonts w:ascii="Garamond" w:hAnsi="Garamond"/>
-          <w:sz w:val="22"/>
-          <w:szCs w:val="22"/>
-        </w:rPr>
-        <w:t>60 point</w:t>
-      </w:r>
-      <w:proofErr w:type="gramEnd"/>
-      <w:r>
-        <w:rPr>
-          <w:rFonts w:ascii="Garamond" w:hAnsi="Garamond"/>
-          <w:sz w:val="22"/>
-          <w:szCs w:val="22"/>
-        </w:rPr>
-        <w:t xml:space="preserve"> window with center weighting. The GAM approach used fitted thin-plate regression and penalized iteratively re-weighted least squared (P-IRLS) to maximize goodness of fit. A GCV method was used to minimize over fitting (Wood, 2006). The maximum degrees of freedom (k) were scaled by the number of data points in each ablation line (n) by k = 10N </w:t>
+        <w:t xml:space="preserve">Sr ratios that are critical for interpretation. To address this challenge and reveal underlying patterns, researchers commonly apply time series smoothing techniques to these datasets. We tested whether such smoothing could improve model performance by applying two commonly used approaches: moving average (MA) and a generalized additive model (GAM) timeseries smoothing. Moving average smoothing used a simple 60 point window with center weighting. The GAM approach used fitted thin-plate regression and penalized iteratively re-weighted least squared (P-IRLS) to maximize goodness of fit. A GCV method was used to minimize over fitting (Wood, 2006). The maximum degrees of freedom (k) were scaled by the number of data points in each ablation line (n) by k = 10N </w:t>
       </w:r>
       <w:r>
         <w:rPr>
@@ -1419,25 +1371,7 @@
           <w:sz w:val="22"/>
           <w:szCs w:val="22"/>
         </w:rPr>
-        <w:t>One limitation of many common machine learning classification models is their dependence on fixed dimension vectors with a consistent length. Because otolith growth is directly proportional to individual growth, the number of microns (</w:t>
-      </w:r>
-      <w:proofErr w:type="gramStart"/>
-      <w:r>
-        <w:rPr>
-          <w:rFonts w:ascii="Garamond" w:hAnsi="Garamond"/>
-          <w:sz w:val="22"/>
-          <w:szCs w:val="22"/>
-        </w:rPr>
-        <w:t>and ,</w:t>
-      </w:r>
-      <w:proofErr w:type="gramEnd"/>
-      <w:r>
-        <w:rPr>
-          <w:rFonts w:ascii="Garamond" w:hAnsi="Garamond"/>
-          <w:sz w:val="22"/>
-          <w:szCs w:val="22"/>
-        </w:rPr>
-        <w:t xml:space="preserve"> subsequently, reads) in otolith. The number of microns, and LA data is variable among individuals. To overcome this limitation we interpolated all samples to the same length, which is the calculated average length of all timeseries (INSERT VALUE HERE) </w:t>
+        <w:t xml:space="preserve">One limitation of many common machine learning classification models is their dependence on fixed dimension vectors with a consistent length. Because otolith growth is directly proportional to individual growth, the number of microns (and , subsequently, reads) in otolith. The number of microns, and LA data is variable among individuals. To overcome this limitation we interpolated all samples to the same length, which is the calculated average length of all timeseries (INSERT VALUE HERE) </w:t>
       </w:r>
       <w:r>
         <w:rPr>
@@ -1495,43 +1429,7 @@
           <w:szCs w:val="22"/>
         </w:rPr>
         <w:lastRenderedPageBreak/>
-        <w:t xml:space="preserve">resulting dataset contained a </w:t>
-      </w:r>
-      <w:proofErr w:type="gramStart"/>
-      <w:r>
-        <w:rPr>
-          <w:rFonts w:ascii="Garamond" w:hAnsi="Garamond"/>
-          <w:sz w:val="22"/>
-          <w:szCs w:val="22"/>
-        </w:rPr>
-        <w:t>X by X</w:t>
-      </w:r>
-      <w:proofErr w:type="gramEnd"/>
-      <w:r>
-        <w:rPr>
-          <w:rFonts w:ascii="Garamond" w:hAnsi="Garamond"/>
-          <w:sz w:val="22"/>
-          <w:szCs w:val="22"/>
-        </w:rPr>
-        <w:t xml:space="preserve"> data matrix for both raw and GAM smoothed data as well as a </w:t>
-      </w:r>
-      <w:proofErr w:type="gramStart"/>
-      <w:r>
-        <w:rPr>
-          <w:rFonts w:ascii="Garamond" w:hAnsi="Garamond"/>
-          <w:sz w:val="22"/>
-          <w:szCs w:val="22"/>
-        </w:rPr>
-        <w:t>X by X</w:t>
-      </w:r>
-      <w:proofErr w:type="gramEnd"/>
-      <w:r>
-        <w:rPr>
-          <w:rFonts w:ascii="Garamond" w:hAnsi="Garamond"/>
-          <w:sz w:val="22"/>
-          <w:szCs w:val="22"/>
-        </w:rPr>
-        <w:t xml:space="preserve"> data matrix for moving average smoothing which removed X datapoints at the beginning and end of the transect. </w:t>
+        <w:t xml:space="preserve">resulting dataset contained a X by X data matrix for both raw and GAM smoothed data as well as a X by X data matrix for moving average smoothing which removed X datapoints at the beginning and end of the transect. </w:t>
       </w:r>
     </w:p>
     <w:p>
@@ -2416,25 +2314,7 @@
           <w:sz w:val="22"/>
           <w:szCs w:val="22"/>
         </w:rPr>
-        <w:t xml:space="preserve"> species play an important role in supporting global nutrient transport and ecosystem services. However, their reliance on multiple ecosystems </w:t>
-      </w:r>
-      <w:proofErr w:type="gramStart"/>
-      <w:r>
-        <w:rPr>
-          <w:rFonts w:ascii="Garamond" w:hAnsi="Garamond"/>
-          <w:sz w:val="22"/>
-          <w:szCs w:val="22"/>
-        </w:rPr>
-        <w:t>make</w:t>
-      </w:r>
-      <w:proofErr w:type="gramEnd"/>
-      <w:r>
-        <w:rPr>
-          <w:rFonts w:ascii="Garamond" w:hAnsi="Garamond"/>
-          <w:sz w:val="22"/>
-          <w:szCs w:val="22"/>
-        </w:rPr>
-        <w:t xml:space="preserve"> them particularly vulnerable to </w:t>
+        <w:t xml:space="preserve"> species play an important role in supporting global nutrient transport and ecosystem services. However, their reliance on multiple ecosystems make them particularly vulnerable to </w:t>
       </w:r>
       <w:r>
         <w:rPr>
@@ -2526,15 +2406,7 @@
       </w:pPr>
       <w:r>
         <w:lastRenderedPageBreak/>
-        <w:t xml:space="preserve">making it critically important to understand the mechanisms driving population </w:t>
-      </w:r>
-      <w:proofErr w:type="gramStart"/>
-      <w:r>
-        <w:t>collapse ,</w:t>
-      </w:r>
-      <w:proofErr w:type="gramEnd"/>
-      <w:r>
-        <w:t xml:space="preserve"> the stock specific impact of </w:t>
+        <w:t xml:space="preserve">making it critically important to understand the mechanisms driving population collapse , the stock specific impact of </w:t>
       </w:r>
     </w:p>
     <w:p>
@@ -2619,25 +2491,7 @@
           <w:sz w:val="20"/>
           <w:szCs w:val="20"/>
         </w:rPr>
-        <w:t xml:space="preserve">Isotope-based methods can be powerful tools for estimating provenance and can achieve high precision in systems with significant isotopic heterogeneity. Otoliths, or ear stones found in fishes, continuously record isotopic and chemical signals from their environment into a metabolically inert calcium carbonate structure as the fish grows. These signals can then be analyzed </w:t>
-      </w:r>
-      <w:proofErr w:type="gramStart"/>
-      <w:r>
-        <w:rPr>
-          <w:rFonts w:ascii="Garamond" w:hAnsi="Garamond"/>
-          <w:sz w:val="20"/>
-          <w:szCs w:val="20"/>
-        </w:rPr>
-        <w:t>post mortem</w:t>
-      </w:r>
-      <w:proofErr w:type="gramEnd"/>
-      <w:r>
-        <w:rPr>
-          <w:rFonts w:ascii="Garamond" w:hAnsi="Garamond"/>
-          <w:sz w:val="20"/>
-          <w:szCs w:val="20"/>
-        </w:rPr>
-        <w:t xml:space="preserve"> to extract a chronological archive of life history characteristics over the fish's life. For provenance applications, the strontium isotope ratio Sr87/Sr86 is particularly powerful as it is faithfully incorporated into the otolith structure, is temporally stable in many systems, and is heterogeneously distributed in geologically diverse watersheds. Sr87/86 ratios from discrete time periods of interest (e.g., freshwater rearing period) can be related to landscape values to estimate geographic origin</w:t>
+        <w:t>Isotope-based methods can be powerful tools for estimating provenance and can achieve high precision in systems with significant isotopic heterogeneity. Otoliths, or ear stones found in fishes, continuously record isotopic and chemical signals from their environment into a metabolically inert calcium carbonate structure as the fish grows. These signals can then be analyzed post mortem to extract a chronological archive of life history characteristics over the fish's life. For provenance applications, the strontium isotope ratio Sr87/Sr86 is particularly powerful as it is faithfully incorporated into the otolith structure, is temporally stable in many systems, and is heterogeneously distributed in geologically diverse watersheds. Sr87/86 ratios from discrete time periods of interest (e.g., freshwater rearing period) can be related to landscape values to estimate geographic origin</w:t>
       </w:r>
       <w:r>
         <w:rPr>
@@ -4146,6 +4000,19 @@
       <w:szCs w:val="20"/>
     </w:rPr>
   </w:style>
+  <w:style w:type="paragraph" w:customStyle="1" w:styleId="whitespace-normal">
+    <w:name w:val="whitespace-normal"/>
+    <w:basedOn w:val="Normal"/>
+    <w:rsid w:val="004C0AA3"/>
+    <w:pPr>
+      <w:spacing w:before="100" w:beforeAutospacing="1" w:after="100" w:afterAutospacing="1" w:line="240" w:lineRule="auto"/>
+    </w:pPr>
+    <w:rPr>
+      <w:rFonts w:ascii="Times New Roman" w:eastAsia="Times New Roman" w:hAnsi="Times New Roman" w:cs="Times New Roman"/>
+      <w:kern w:val="0"/>
+      <w14:ligatures w14:val="none"/>
+    </w:rPr>
+  </w:style>
 </w:styles>
 </file>
 

</xml_diff>

<commit_message>
almost a full pass through the methods, some to add
</commit_message>
<xml_diff>
--- a/Docs/Machine learning applied to otolith timeseries data to discriminate river of origin for Western Alaska Salmon.docx
+++ b/Docs/Machine learning applied to otolith timeseries data to discriminate river of origin for Western Alaska Salmon.docx
@@ -869,15 +869,33 @@
           <w:sz w:val="22"/>
           <w:szCs w:val="22"/>
         </w:rPr>
-        <w:t xml:space="preserve"> In doing so, we </w:t>
-      </w:r>
-      <w:r>
-        <w:rPr>
-          <w:rFonts w:ascii="Garamond" w:hAnsi="Garamond"/>
-          <w:sz w:val="22"/>
-          <w:szCs w:val="22"/>
-        </w:rPr>
-        <w:t>: 1) test the potential of machine learning tools to determine stock of origin, and 2) develop a classification model to reliably estimate river of origin for marine-caught Chinook salmon in western Alaska</w:t>
+        <w:t xml:space="preserve"> In doing so, </w:t>
+      </w:r>
+      <w:proofErr w:type="gramStart"/>
+      <w:r>
+        <w:rPr>
+          <w:rFonts w:ascii="Garamond" w:hAnsi="Garamond"/>
+          <w:sz w:val="22"/>
+          <w:szCs w:val="22"/>
+        </w:rPr>
+        <w:t xml:space="preserve">we </w:t>
+      </w:r>
+      <w:r>
+        <w:rPr>
+          <w:rFonts w:ascii="Garamond" w:hAnsi="Garamond"/>
+          <w:sz w:val="22"/>
+          <w:szCs w:val="22"/>
+        </w:rPr>
+        <w:t>:</w:t>
+      </w:r>
+      <w:proofErr w:type="gramEnd"/>
+      <w:r>
+        <w:rPr>
+          <w:rFonts w:ascii="Garamond" w:hAnsi="Garamond"/>
+          <w:sz w:val="22"/>
+          <w:szCs w:val="22"/>
+        </w:rPr>
+        <w:t xml:space="preserve"> 1) test the potential of machine learning tools to determine stock of origin, and 2) develop a classification model to reliably estimate river of origin for marine-caught Chinook salmon in western Alaska</w:t>
       </w:r>
     </w:p>
     <w:p>
@@ -952,7 +970,7 @@
           <w:sz w:val="22"/>
           <w:szCs w:val="22"/>
         </w:rPr>
-        <w:t xml:space="preserve">Chinook salmon otoliths were collected from the downstream terminus of the Yukon, Kuskokwim, and </w:t>
+        <w:t xml:space="preserve">Chinook salmon otoliths were collected from the Yukon (2015, 2016, 2019–2021), Kuskokwim (2017–2022), and </w:t>
       </w:r>
       <w:proofErr w:type="spellStart"/>
       <w:r>
@@ -970,7 +988,39 @@
           <w:sz w:val="22"/>
           <w:szCs w:val="22"/>
         </w:rPr>
-        <w:t xml:space="preserve"> river basins as follows: </w:t>
+        <w:t xml:space="preserve"> (2011, 2014, 2015) river basins </w:t>
+      </w:r>
+      <w:r>
+        <w:rPr>
+          <w:rFonts w:ascii="Garamond" w:hAnsi="Garamond"/>
+          <w:sz w:val="22"/>
+          <w:szCs w:val="22"/>
+        </w:rPr>
+        <w:t>at</w:t>
+      </w:r>
+      <w:r>
+        <w:rPr>
+          <w:rFonts w:ascii="Garamond" w:hAnsi="Garamond"/>
+          <w:sz w:val="22"/>
+          <w:szCs w:val="22"/>
+        </w:rPr>
+        <w:t xml:space="preserve"> test fisheries near the downstream terminus of each river. </w:t>
+      </w:r>
+      <w:r>
+        <w:rPr>
+          <w:rFonts w:ascii="Garamond" w:hAnsi="Garamond"/>
+          <w:sz w:val="22"/>
+          <w:szCs w:val="22"/>
+        </w:rPr>
+        <w:t xml:space="preserve">Fish were sampled through collaborative efforts </w:t>
+      </w:r>
+      <w:r>
+        <w:rPr>
+          <w:rFonts w:ascii="Garamond" w:hAnsi="Garamond"/>
+          <w:sz w:val="22"/>
+          <w:szCs w:val="22"/>
+        </w:rPr>
+        <w:t xml:space="preserve">with the Alaska Department of Fish and Game Lower Yukon Test Fishery (LYTF), </w:t>
       </w:r>
       <w:proofErr w:type="spellStart"/>
       <w:r>
@@ -979,7 +1029,7 @@
           <w:sz w:val="22"/>
           <w:szCs w:val="22"/>
         </w:rPr>
-        <w:t>Nushagak</w:t>
+        <w:t>Orutsararmiut</w:t>
       </w:r>
       <w:proofErr w:type="spellEnd"/>
       <w:r>
@@ -988,44 +1038,149 @@
           <w:sz w:val="22"/>
           <w:szCs w:val="22"/>
         </w:rPr>
-        <w:t xml:space="preserve"> (2011, 2014, 2015), Kuskokwim (2017–2022), and Yukon (2015, 2016, 2019–2021). Fish were sampled through collaborative efforts with ADFG at the Lower Yukon Test Fishery, ONC at the Bethel Test Fishery, and </w:t>
-      </w:r>
-      <w:r>
-        <w:rPr>
-          <w:rStyle w:val="Emphasis"/>
-          <w:rFonts w:ascii="Garamond" w:hAnsi="Garamond"/>
-          <w:sz w:val="22"/>
-          <w:szCs w:val="22"/>
-        </w:rPr>
-        <w:t>[</w:t>
+        <w:t xml:space="preserve"> Native Council at the Bethel Test Fishery, and [ </w:t>
+      </w:r>
+      <w:proofErr w:type="gramStart"/>
+      <w:r>
+        <w:rPr>
+          <w:rFonts w:ascii="Garamond" w:hAnsi="Garamond"/>
+          <w:sz w:val="22"/>
+          <w:szCs w:val="22"/>
+        </w:rPr>
+        <w:t>NUSHAGAK ]</w:t>
+      </w:r>
+      <w:proofErr w:type="gramEnd"/>
+      <w:r>
+        <w:rPr>
+          <w:rFonts w:ascii="Garamond" w:hAnsi="Garamond"/>
+          <w:sz w:val="22"/>
+          <w:szCs w:val="22"/>
+        </w:rPr>
+        <w:t xml:space="preserve">. For each year approximately 500 otoliths were collected throughout the season. From these, </w:t>
+      </w:r>
+      <w:r>
+        <w:rPr>
+          <w:rFonts w:ascii="Garamond" w:hAnsi="Garamond"/>
+          <w:sz w:val="22"/>
+          <w:szCs w:val="22"/>
+        </w:rPr>
+        <w:t>~250 otoliths from each year were selected for further analysis. Selected samples were cut along the transverse plane</w:t>
+      </w:r>
+      <w:r>
+        <w:rPr>
+          <w:rFonts w:ascii="Garamond" w:hAnsi="Garamond"/>
+          <w:sz w:val="22"/>
+          <w:szCs w:val="22"/>
+        </w:rPr>
+        <w:t xml:space="preserve"> using a low speed</w:t>
+      </w:r>
+      <w:r>
+        <w:rPr>
+          <w:rFonts w:ascii="Garamond" w:hAnsi="Garamond"/>
+          <w:sz w:val="22"/>
+          <w:szCs w:val="22"/>
+        </w:rPr>
+        <w:t xml:space="preserve"> </w:t>
       </w:r>
       <w:proofErr w:type="spellStart"/>
       <w:r>
         <w:rPr>
-          <w:rStyle w:val="Emphasis"/>
-          <w:rFonts w:ascii="Garamond" w:hAnsi="Garamond"/>
-          <w:sz w:val="22"/>
-          <w:szCs w:val="22"/>
-        </w:rPr>
-        <w:t>Nushagak</w:t>
+          <w:rFonts w:ascii="Garamond" w:hAnsi="Garamond"/>
+          <w:sz w:val="22"/>
+          <w:szCs w:val="22"/>
+        </w:rPr>
+        <w:t>isomet</w:t>
       </w:r>
       <w:proofErr w:type="spellEnd"/>
       <w:r>
         <w:rPr>
-          <w:rStyle w:val="Emphasis"/>
-          <w:rFonts w:ascii="Garamond" w:hAnsi="Garamond"/>
-          <w:sz w:val="22"/>
-          <w:szCs w:val="22"/>
-        </w:rPr>
-        <w:t>]</w:t>
-      </w:r>
-      <w:r>
-        <w:rPr>
-          <w:rFonts w:ascii="Garamond" w:hAnsi="Garamond"/>
-          <w:sz w:val="22"/>
-          <w:szCs w:val="22"/>
-        </w:rPr>
-        <w:t xml:space="preserve">. Approximately 500 otoliths were collected each year, and from these, ~250 otoliths from each year were selected for further analysis. Selected samples were then cut along the transverse plane to reveal the core using a low-speed </w:t>
+          <w:rFonts w:ascii="Garamond" w:hAnsi="Garamond"/>
+          <w:sz w:val="22"/>
+          <w:szCs w:val="22"/>
+        </w:rPr>
+        <w:t xml:space="preserve"> saw</w:t>
+      </w:r>
+      <w:r>
+        <w:rPr>
+          <w:rFonts w:ascii="Garamond" w:hAnsi="Garamond"/>
+          <w:sz w:val="22"/>
+          <w:szCs w:val="22"/>
+        </w:rPr>
+        <w:t xml:space="preserve"> to reveal the growth structure of the otolith</w:t>
+      </w:r>
+      <w:r>
+        <w:rPr>
+          <w:rFonts w:ascii="Garamond" w:hAnsi="Garamond"/>
+          <w:sz w:val="22"/>
+          <w:szCs w:val="22"/>
+        </w:rPr>
+        <w:t>, mounted on microscope slides, and polished to enhance clarity</w:t>
+      </w:r>
+      <w:r>
+        <w:rPr>
+          <w:rFonts w:ascii="Garamond" w:hAnsi="Garamond"/>
+          <w:sz w:val="22"/>
+          <w:szCs w:val="22"/>
+        </w:rPr>
+        <w:t xml:space="preserve">. </w:t>
+      </w:r>
+      <w:r>
+        <w:rPr>
+          <w:rFonts w:ascii="Garamond" w:hAnsi="Garamond"/>
+          <w:sz w:val="22"/>
+          <w:szCs w:val="22"/>
+        </w:rPr>
+        <w:t xml:space="preserve">Otoliths were analyzed using Laser Ablation Inductively Coupled Plasma Mass Spectrometry (LA-ICP-MS) at the University of Utah Strontium Metals Lab, </w:t>
+      </w:r>
+      <w:proofErr w:type="gramStart"/>
+      <w:r>
+        <w:rPr>
+          <w:rFonts w:ascii="Garamond" w:hAnsi="Garamond"/>
+          <w:sz w:val="22"/>
+          <w:szCs w:val="22"/>
+        </w:rPr>
+        <w:t>with the exception of</w:t>
+      </w:r>
+      <w:proofErr w:type="gramEnd"/>
+      <w:r>
+        <w:rPr>
+          <w:rFonts w:ascii="Garamond" w:hAnsi="Garamond"/>
+          <w:sz w:val="22"/>
+          <w:szCs w:val="22"/>
+        </w:rPr>
+        <w:t xml:space="preserve"> 2022 Kuskokwim samples, which were processed at the Keck Lab at Oregon State University.</w:t>
+      </w:r>
+      <w:r>
+        <w:rPr>
+          <w:rFonts w:ascii="Garamond" w:hAnsi="Garamond"/>
+          <w:sz w:val="22"/>
+          <w:szCs w:val="22"/>
+        </w:rPr>
+        <w:t xml:space="preserve"> </w:t>
+      </w:r>
+      <w:r>
+        <w:rPr>
+          <w:rFonts w:ascii="Garamond" w:hAnsi="Garamond"/>
+          <w:sz w:val="22"/>
+          <w:szCs w:val="22"/>
+        </w:rPr>
+        <w:t xml:space="preserve">Laser ablation </w:t>
+      </w:r>
+      <w:r>
+        <w:rPr>
+          <w:rFonts w:ascii="Garamond" w:hAnsi="Garamond"/>
+          <w:sz w:val="22"/>
+          <w:szCs w:val="22"/>
+        </w:rPr>
+        <w:t>was preformed from the core to just after the onset of the marine signature along the dorsal lobe</w:t>
+      </w:r>
+      <w:r>
+        <w:rPr>
+          <w:rFonts w:ascii="Garamond" w:hAnsi="Garamond"/>
+          <w:sz w:val="22"/>
+          <w:szCs w:val="22"/>
+        </w:rPr>
+        <w:t xml:space="preserve"> scanning at [ insert specifications here for </w:t>
       </w:r>
       <w:proofErr w:type="spellStart"/>
       <w:r>
@@ -1034,7 +1189,7 @@
           <w:sz w:val="22"/>
           <w:szCs w:val="22"/>
         </w:rPr>
-        <w:t>isomet</w:t>
+        <w:t>icpms</w:t>
       </w:r>
       <w:proofErr w:type="spellEnd"/>
       <w:r>
@@ -1043,7 +1198,25 @@
           <w:sz w:val="22"/>
           <w:szCs w:val="22"/>
         </w:rPr>
-        <w:t xml:space="preserve"> saw, mounted on microscope slides, and polished to enhance clarity of the growth structure. Otoliths were analyzed using Laser Ablation Inductively Coupled Plasma Mass Spectrometry at the University of Utah Strontium Metals Lab, except for the 2021 Kuskokwim samples, which were processed at the Keck Lab at Oregon State University.</w:t>
+        <w:t xml:space="preserve">]. The resulting dataset </w:t>
+      </w:r>
+      <w:proofErr w:type="gramStart"/>
+      <w:r>
+        <w:rPr>
+          <w:rFonts w:ascii="Garamond" w:hAnsi="Garamond"/>
+          <w:sz w:val="22"/>
+          <w:szCs w:val="22"/>
+        </w:rPr>
+        <w:t>include</w:t>
+      </w:r>
+      <w:proofErr w:type="gramEnd"/>
+      <w:r>
+        <w:rPr>
+          <w:rFonts w:ascii="Garamond" w:hAnsi="Garamond"/>
+          <w:sz w:val="22"/>
+          <w:szCs w:val="22"/>
+        </w:rPr>
+        <w:t xml:space="preserve"> a transect of both Sr8786 and Sr88 for all individuals. </w:t>
       </w:r>
       <w:r>
         <w:rPr>
@@ -1052,14 +1225,6 @@
           <w:szCs w:val="22"/>
         </w:rPr>
         <w:t xml:space="preserve"> </w:t>
-      </w:r>
-      <w:r>
-        <w:rPr>
-          <w:rFonts w:ascii="Garamond" w:hAnsi="Garamond"/>
-          <w:sz w:val="22"/>
-          <w:szCs w:val="22"/>
-        </w:rPr>
-        <w:t>Laser ablation lines were analyzed from the core to the _______ along the growth axis of the otolith until just after entry to the marine environment, which was identified by the dark annulus indicative of marine entry.</w:t>
       </w:r>
     </w:p>
     <w:p>
@@ -1073,7 +1238,9 @@
           <w:u w:val="single"/>
         </w:rPr>
       </w:pPr>
-      <w:r>
+    </w:p>
+    <w:p>
+      <w:pPr>
         <w:rPr>
           <w:rFonts w:ascii="Garamond" w:hAnsi="Garamond"/>
           <w:b/>
@@ -1082,6 +1249,17 @@
           <w:szCs w:val="22"/>
           <w:u w:val="single"/>
         </w:rPr>
+      </w:pPr>
+      <w:r>
+        <w:rPr>
+          <w:rFonts w:ascii="Garamond" w:hAnsi="Garamond"/>
+          <w:b/>
+          <w:bCs/>
+          <w:sz w:val="22"/>
+          <w:szCs w:val="22"/>
+          <w:u w:val="single"/>
+        </w:rPr>
+        <w:lastRenderedPageBreak/>
         <w:t xml:space="preserve">Data preprocessing </w:t>
       </w:r>
     </w:p>
@@ -1097,31 +1275,43 @@
       </w:pPr>
       <w:r>
         <w:rPr>
-          <w:rStyle w:val="Strong"/>
-          <w:rFonts w:ascii="Garamond" w:hAnsi="Garamond"/>
-          <w:b w:val="0"/>
-          <w:bCs w:val="0"/>
-          <w:sz w:val="22"/>
-          <w:szCs w:val="22"/>
-        </w:rPr>
-        <w:t>Because data were collected and analyzed by several different people over the course of the dataset, there is</w:t>
-      </w:r>
-      <w:r>
-        <w:rPr>
-          <w:rFonts w:ascii="Garamond" w:hAnsi="Garamond"/>
-          <w:sz w:val="22"/>
-          <w:szCs w:val="22"/>
-        </w:rPr>
-        <w:t xml:space="preserve"> significant variation in the length and location of ablation lines relative to the lifespan of the fish. To </w:t>
-      </w:r>
-      <w:r>
-        <w:rPr>
-          <w:rFonts w:ascii="Garamond" w:hAnsi="Garamond"/>
-          <w:sz w:val="22"/>
-          <w:szCs w:val="22"/>
-        </w:rPr>
-        <w:lastRenderedPageBreak/>
-        <w:t xml:space="preserve">standardize all data to the same life history period, time series were trimmed to between the location of the core and the onset of marine residence. These locations on the otolith time series were identified by examining patterns in </w:t>
+          <w:rFonts w:ascii="Garamond" w:hAnsi="Garamond"/>
+          <w:sz w:val="22"/>
+          <w:szCs w:val="22"/>
+        </w:rPr>
+        <w:t xml:space="preserve">To standardize all data to the same life history period, </w:t>
+      </w:r>
+      <w:r>
+        <w:rPr>
+          <w:rFonts w:ascii="Garamond" w:hAnsi="Garamond"/>
+          <w:sz w:val="22"/>
+          <w:szCs w:val="22"/>
+        </w:rPr>
+        <w:t xml:space="preserve">LA data include only data </w:t>
+      </w:r>
+      <w:r>
+        <w:rPr>
+          <w:rFonts w:ascii="Garamond" w:hAnsi="Garamond"/>
+          <w:sz w:val="22"/>
+          <w:szCs w:val="22"/>
+        </w:rPr>
+        <w:t xml:space="preserve">between </w:t>
+      </w:r>
+      <w:r>
+        <w:rPr>
+          <w:rFonts w:ascii="Garamond" w:hAnsi="Garamond"/>
+          <w:sz w:val="22"/>
+          <w:szCs w:val="22"/>
+        </w:rPr>
+        <w:t>the core and the onset of marine residence. These cutoff points were identified by</w:t>
+      </w:r>
+      <w:r>
+        <w:rPr>
+          <w:rFonts w:ascii="Garamond" w:hAnsi="Garamond"/>
+          <w:sz w:val="22"/>
+          <w:szCs w:val="22"/>
+        </w:rPr>
+        <w:t xml:space="preserve"> examining patterns in </w:t>
       </w:r>
       <w:r>
         <w:rPr>
@@ -1185,7 +1375,71 @@
           <w:sz w:val="22"/>
           <w:szCs w:val="22"/>
         </w:rPr>
-        <w:t xml:space="preserve">Sr and a signal closer to the marine value (0.7092) compared to the freshwater region. Similarly, marine entry was identified as the portion of the time series immediately following the characteristic increase in </w:t>
+        <w:t xml:space="preserve">Sr and </w:t>
+      </w:r>
+      <w:r>
+        <w:rPr>
+          <w:rFonts w:ascii="Garamond" w:hAnsi="Garamond"/>
+          <w:sz w:val="22"/>
+          <w:szCs w:val="22"/>
+        </w:rPr>
+        <w:t xml:space="preserve">values closer to the global marine Sr8786 value </w:t>
+      </w:r>
+      <w:r>
+        <w:rPr>
+          <w:rFonts w:ascii="Garamond" w:hAnsi="Garamond"/>
+          <w:sz w:val="22"/>
+          <w:szCs w:val="22"/>
+        </w:rPr>
+        <w:t>(0.7092)</w:t>
+      </w:r>
+      <w:r>
+        <w:rPr>
+          <w:rFonts w:ascii="Garamond" w:hAnsi="Garamond"/>
+          <w:sz w:val="22"/>
+          <w:szCs w:val="22"/>
+        </w:rPr>
+        <w:t xml:space="preserve"> than the freshwater region. </w:t>
+      </w:r>
+      <w:r>
+        <w:rPr>
+          <w:rFonts w:ascii="Garamond" w:hAnsi="Garamond"/>
+          <w:sz w:val="22"/>
+          <w:szCs w:val="22"/>
+        </w:rPr>
+        <w:t>Similarly,</w:t>
+      </w:r>
+      <w:r>
+        <w:rPr>
+          <w:rFonts w:ascii="Garamond" w:hAnsi="Garamond"/>
+          <w:sz w:val="22"/>
+          <w:szCs w:val="22"/>
+        </w:rPr>
+        <w:t xml:space="preserve"> a cutoff at the </w:t>
+      </w:r>
+      <w:r>
+        <w:rPr>
+          <w:rFonts w:ascii="Garamond" w:hAnsi="Garamond"/>
+          <w:sz w:val="22"/>
+          <w:szCs w:val="22"/>
+        </w:rPr>
+        <w:t xml:space="preserve">marine entry was identified </w:t>
+      </w:r>
+      <w:r>
+        <w:rPr>
+          <w:rFonts w:ascii="Garamond" w:hAnsi="Garamond"/>
+          <w:sz w:val="22"/>
+          <w:szCs w:val="22"/>
+        </w:rPr>
+        <w:t xml:space="preserve">by dark annuli on the otolith, a rapid increase in Sr88, and a shift in </w:t>
+      </w:r>
+      <w:r>
+        <w:rPr>
+          <w:rFonts w:ascii="Garamond" w:hAnsi="Garamond"/>
+          <w:sz w:val="22"/>
+          <w:szCs w:val="22"/>
+        </w:rPr>
+        <w:t xml:space="preserve">shift in </w:t>
       </w:r>
       <w:r>
         <w:rPr>
@@ -1193,15 +1447,15 @@
           <w:sz w:val="22"/>
           <w:szCs w:val="22"/>
         </w:rPr>
-        <w:t>⁸⁸</w:t>
-      </w:r>
-      <w:r>
-        <w:rPr>
-          <w:rFonts w:ascii="Garamond" w:hAnsi="Garamond"/>
-          <w:sz w:val="22"/>
-          <w:szCs w:val="22"/>
-        </w:rPr>
-        <w:t xml:space="preserve">Sr indicative of marine entry, as well as a shift in </w:t>
+        <w:t>⁸⁷</w:t>
+      </w:r>
+      <w:r>
+        <w:rPr>
+          <w:rFonts w:ascii="Garamond" w:hAnsi="Garamond"/>
+          <w:sz w:val="22"/>
+          <w:szCs w:val="22"/>
+        </w:rPr>
+        <w:t>Sr/</w:t>
       </w:r>
       <w:r>
         <w:rPr>
@@ -1209,22 +1463,6 @@
           <w:sz w:val="22"/>
           <w:szCs w:val="22"/>
         </w:rPr>
-        <w:t>⁸⁷</w:t>
-      </w:r>
-      <w:r>
-        <w:rPr>
-          <w:rFonts w:ascii="Garamond" w:hAnsi="Garamond"/>
-          <w:sz w:val="22"/>
-          <w:szCs w:val="22"/>
-        </w:rPr>
-        <w:t>Sr/</w:t>
-      </w:r>
-      <w:r>
-        <w:rPr>
-          <w:rFonts w:ascii="Cambria Math" w:hAnsi="Cambria Math" w:cs="Cambria Math"/>
-          <w:sz w:val="22"/>
-          <w:szCs w:val="22"/>
-        </w:rPr>
         <w:t>⁸⁶</w:t>
       </w:r>
       <w:r>
@@ -1233,23 +1471,63 @@
           <w:sz w:val="22"/>
           <w:szCs w:val="22"/>
         </w:rPr>
-        <w:t xml:space="preserve">Sr to the marine strontium value. For all otoliths, the selection of trimming locations was randomized and blinded to avoid confounding by expected patterns or repeated patterns within a single class. </w:t>
-      </w:r>
-      <w:r>
-        <w:rPr>
-          <w:rFonts w:ascii="Garamond" w:hAnsi="Garamond"/>
-          <w:sz w:val="22"/>
-          <w:szCs w:val="22"/>
-        </w:rPr>
-        <w:t>The location o</w:t>
-      </w:r>
-      <w:r>
-        <w:rPr>
-          <w:rFonts w:ascii="Garamond" w:hAnsi="Garamond"/>
-          <w:sz w:val="22"/>
-          <w:szCs w:val="22"/>
-        </w:rPr>
-        <w:t xml:space="preserve">f these trimming locations as well as the selected region of the natal origin signature were manually </w:t>
+        <w:t>Sr to</w:t>
+      </w:r>
+      <w:r>
+        <w:rPr>
+          <w:rFonts w:ascii="Garamond" w:hAnsi="Garamond"/>
+          <w:sz w:val="22"/>
+          <w:szCs w:val="22"/>
+        </w:rPr>
+        <w:t xml:space="preserve"> global marine value</w:t>
+      </w:r>
+      <w:r>
+        <w:rPr>
+          <w:rFonts w:ascii="Garamond" w:hAnsi="Garamond"/>
+          <w:sz w:val="22"/>
+          <w:szCs w:val="22"/>
+        </w:rPr>
+        <w:t xml:space="preserve">. </w:t>
+      </w:r>
+      <w:r>
+        <w:rPr>
+          <w:rFonts w:ascii="Garamond" w:hAnsi="Garamond"/>
+          <w:sz w:val="22"/>
+          <w:szCs w:val="22"/>
+        </w:rPr>
+        <w:t xml:space="preserve">Selection of trimming locations were randomized and blinded to avoid </w:t>
+      </w:r>
+      <w:r>
+        <w:rPr>
+          <w:rFonts w:ascii="Garamond" w:hAnsi="Garamond"/>
+          <w:sz w:val="22"/>
+          <w:szCs w:val="22"/>
+        </w:rPr>
+        <w:t xml:space="preserve">confounding by repeated patterns within a single class. </w:t>
+      </w:r>
+      <w:r>
+        <w:rPr>
+          <w:rFonts w:ascii="Garamond" w:hAnsi="Garamond"/>
+          <w:sz w:val="22"/>
+          <w:szCs w:val="22"/>
+        </w:rPr>
+        <w:t xml:space="preserve">Trimming </w:t>
+      </w:r>
+      <w:r>
+        <w:rPr>
+          <w:rFonts w:ascii="Garamond" w:hAnsi="Garamond"/>
+          <w:sz w:val="22"/>
+          <w:szCs w:val="22"/>
+        </w:rPr>
+        <w:t xml:space="preserve">locations were manually checked </w:t>
+      </w:r>
+      <w:r>
+        <w:rPr>
+          <w:rFonts w:ascii="Garamond" w:hAnsi="Garamond"/>
+          <w:sz w:val="22"/>
+          <w:szCs w:val="22"/>
+        </w:rPr>
+        <w:t>for all individuals. Samples with significant error from sample prep or laser ablation (</w:t>
       </w:r>
       <w:proofErr w:type="spellStart"/>
       <w:r>
@@ -1258,7 +1536,7 @@
           <w:sz w:val="22"/>
           <w:szCs w:val="22"/>
         </w:rPr>
-        <w:t>QCd</w:t>
+        <w:t>i.e</w:t>
       </w:r>
       <w:proofErr w:type="spellEnd"/>
       <w:r>
@@ -1267,7 +1545,33 @@
           <w:sz w:val="22"/>
           <w:szCs w:val="22"/>
         </w:rPr>
-        <w:t xml:space="preserve"> for all individuals. Individuals with large errors from sample prep or laser ablation (i.e. large cracks) , unclear marine entry, or no core signal were removed from the dataset. </w:t>
+        <w:t xml:space="preserve"> large cracks) or without a clear core signal were removed from the dataset. </w:t>
+      </w:r>
+      <w:r>
+        <w:rPr>
+          <w:rFonts w:ascii="Garamond" w:hAnsi="Garamond"/>
+          <w:sz w:val="22"/>
+          <w:szCs w:val="22"/>
+        </w:rPr>
+        <w:t xml:space="preserve">The resulting dataset contained [Insert final numbers </w:t>
+      </w:r>
+      <w:proofErr w:type="gramStart"/>
+      <w:r>
+        <w:rPr>
+          <w:rFonts w:ascii="Garamond" w:hAnsi="Garamond"/>
+          <w:sz w:val="22"/>
+          <w:szCs w:val="22"/>
+        </w:rPr>
+        <w:t>here ]</w:t>
+      </w:r>
+      <w:proofErr w:type="gramEnd"/>
+      <w:r>
+        <w:rPr>
+          <w:rFonts w:ascii="Garamond" w:hAnsi="Garamond"/>
+          <w:sz w:val="22"/>
+          <w:szCs w:val="22"/>
+        </w:rPr>
+        <w:t xml:space="preserve"> </w:t>
       </w:r>
     </w:p>
     <w:p>
@@ -1286,39 +1590,97 @@
           <w:sz w:val="22"/>
           <w:szCs w:val="22"/>
         </w:rPr>
-        <w:t xml:space="preserve">Otolith data from LA-ICPMS analysis contains significant machine error, which can obscure subtle changes in </w:t>
-      </w:r>
-      <w:r>
-        <w:rPr>
-          <w:rFonts w:ascii="Cambria Math" w:hAnsi="Cambria Math" w:cs="Cambria Math"/>
-          <w:sz w:val="22"/>
-          <w:szCs w:val="22"/>
-        </w:rPr>
-        <w:t>⁸⁷</w:t>
-      </w:r>
-      <w:r>
-        <w:rPr>
-          <w:rFonts w:ascii="Garamond" w:hAnsi="Garamond"/>
-          <w:sz w:val="22"/>
-          <w:szCs w:val="22"/>
-        </w:rPr>
-        <w:t>Sr/</w:t>
-      </w:r>
-      <w:r>
-        <w:rPr>
-          <w:rFonts w:ascii="Cambria Math" w:hAnsi="Cambria Math" w:cs="Cambria Math"/>
-          <w:sz w:val="22"/>
-          <w:szCs w:val="22"/>
-        </w:rPr>
-        <w:t>⁸⁶</w:t>
-      </w:r>
-      <w:r>
-        <w:rPr>
-          <w:rFonts w:ascii="Garamond" w:hAnsi="Garamond"/>
-          <w:sz w:val="22"/>
-          <w:szCs w:val="22"/>
-        </w:rPr>
-        <w:t xml:space="preserve">Sr ratios that are critical for interpretation. To address this challenge and reveal underlying patterns, researchers commonly apply time series smoothing techniques to these datasets. We tested whether such smoothing could improve model performance by applying two commonly used approaches: moving average (MA) and a generalized additive model (GAM) timeseries smoothing. Moving average smoothing used a simple 60 point window with center weighting. The GAM approach used fitted thin-plate regression and penalized iteratively re-weighted least squared (P-IRLS) to maximize goodness of fit. A GCV method was used to minimize over fitting (Wood, 2006). The maximum degrees of freedom (k) were scaled by the number of data points in each ablation line (n) by k = 10N </w:t>
+        <w:t>To test whether</w:t>
+      </w:r>
+      <w:r>
+        <w:rPr>
+          <w:rFonts w:ascii="Garamond" w:hAnsi="Garamond"/>
+          <w:sz w:val="22"/>
+          <w:szCs w:val="22"/>
+        </w:rPr>
+        <w:t xml:space="preserve"> </w:t>
+      </w:r>
+      <w:r>
+        <w:rPr>
+          <w:rFonts w:ascii="Garamond" w:hAnsi="Garamond"/>
+          <w:sz w:val="22"/>
+          <w:szCs w:val="22"/>
+        </w:rPr>
+        <w:t xml:space="preserve">time series smoothing techniques </w:t>
+      </w:r>
+      <w:r>
+        <w:rPr>
+          <w:rFonts w:ascii="Garamond" w:hAnsi="Garamond"/>
+          <w:sz w:val="22"/>
+          <w:szCs w:val="22"/>
+        </w:rPr>
+        <w:t>could improve model performance</w:t>
+      </w:r>
+      <w:r>
+        <w:rPr>
+          <w:rFonts w:ascii="Garamond" w:hAnsi="Garamond"/>
+          <w:sz w:val="22"/>
+          <w:szCs w:val="22"/>
+        </w:rPr>
+        <w:t xml:space="preserve">, we applied </w:t>
+      </w:r>
+      <w:r>
+        <w:rPr>
+          <w:rFonts w:ascii="Garamond" w:hAnsi="Garamond"/>
+          <w:sz w:val="22"/>
+          <w:szCs w:val="22"/>
+        </w:rPr>
+        <w:t xml:space="preserve">two commonly used approaches: moving average (MA) and a generalized additive model (GAM). </w:t>
+      </w:r>
+      <w:r>
+        <w:rPr>
+          <w:rFonts w:ascii="Garamond" w:hAnsi="Garamond"/>
+          <w:sz w:val="22"/>
+          <w:szCs w:val="22"/>
+        </w:rPr>
+        <w:t xml:space="preserve">We used a </w:t>
+      </w:r>
+      <w:proofErr w:type="gramStart"/>
+      <w:r>
+        <w:rPr>
+          <w:rFonts w:ascii="Garamond" w:hAnsi="Garamond"/>
+          <w:sz w:val="22"/>
+          <w:szCs w:val="22"/>
+        </w:rPr>
+        <w:t>60 point</w:t>
+      </w:r>
+      <w:proofErr w:type="gramEnd"/>
+      <w:r>
+        <w:rPr>
+          <w:rFonts w:ascii="Garamond" w:hAnsi="Garamond"/>
+          <w:sz w:val="22"/>
+          <w:szCs w:val="22"/>
+        </w:rPr>
+        <w:t xml:space="preserve"> center weighted moving average window. The GAM was fit using thin plate regression </w:t>
+      </w:r>
+      <w:r>
+        <w:rPr>
+          <w:rFonts w:ascii="Garamond" w:hAnsi="Garamond"/>
+          <w:sz w:val="22"/>
+          <w:szCs w:val="22"/>
+        </w:rPr>
+        <w:t>and penalized iteratively re-weighted least squared (P-IRLS) to maximize goodness of fit</w:t>
+      </w:r>
+      <w:r>
+        <w:rPr>
+          <w:rFonts w:ascii="Garamond" w:hAnsi="Garamond"/>
+          <w:sz w:val="22"/>
+          <w:szCs w:val="22"/>
+        </w:rPr>
+        <w:t xml:space="preserve"> and a</w:t>
+      </w:r>
+      <w:r>
+        <w:rPr>
+          <w:rFonts w:ascii="Garamond" w:hAnsi="Garamond"/>
+          <w:sz w:val="22"/>
+          <w:szCs w:val="22"/>
+        </w:rPr>
+        <w:t xml:space="preserve"> GCV method was used to minimize over fitting (Wood, 2006). The maximum degrees of freedom (k) were scaled by the number of data points in each ablation line (n) by k = 10N </w:t>
       </w:r>
       <w:r>
         <w:rPr>
@@ -1354,82 +1716,47 @@
         </w:rPr>
         <w:t xml:space="preserve">2014). </w:t>
       </w:r>
-    </w:p>
-    <w:p>
-      <w:pPr>
-        <w:spacing w:line="480" w:lineRule="auto"/>
-        <w:ind w:firstLine="720"/>
-        <w:rPr>
-          <w:rFonts w:ascii="Garamond" w:hAnsi="Garamond"/>
-          <w:sz w:val="22"/>
-          <w:szCs w:val="22"/>
-        </w:rPr>
-      </w:pPr>
-      <w:r>
-        <w:rPr>
-          <w:rFonts w:ascii="Garamond" w:hAnsi="Garamond"/>
-          <w:sz w:val="22"/>
-          <w:szCs w:val="22"/>
-        </w:rPr>
-        <w:t xml:space="preserve">One limitation of many common machine learning classification models is their dependence on fixed dimension vectors with a consistent length. Because otolith growth is directly proportional to individual growth, the number of microns (and , subsequently, reads) in otolith. The number of microns, and LA data is variable among individuals. To overcome this limitation we interpolated all samples to the same length, which is the calculated average length of all timeseries (INSERT VALUE HERE) </w:t>
-      </w:r>
-      <w:r>
-        <w:rPr>
-          <w:rFonts w:ascii="Garamond" w:hAnsi="Garamond"/>
-          <w:sz w:val="22"/>
-          <w:szCs w:val="22"/>
-        </w:rPr>
-        <w:fldChar w:fldCharType="begin"/>
-      </w:r>
-      <w:r>
-        <w:rPr>
-          <w:rFonts w:ascii="Garamond" w:hAnsi="Garamond"/>
-          <w:sz w:val="22"/>
-          <w:szCs w:val="22"/>
-        </w:rPr>
-        <w:instrText xml:space="preserve"> ADDIN ZOTERO_ITEM CSL_CITATION {"citationID":"IkCFfZW4","properties":{"formattedCitation":"(Hegg &amp; Kennedy, 2021)","plainCitation":"(Hegg &amp; Kennedy, 2021)","noteIndex":0},"citationItems":[{"id":4390,"uris":["http://zotero.org/users/8421274/items/BD9UPNI2"],"itemData":{"id":4390,"type":"article-journal","abstract":"Ecological patterns are often fundamentally chronological. However, generalization of data is necessarily accompanied by a loss of detail or resolution. Temporal data in particular contain information not only in data values but in the temporal structure, which is lost when these values are aggregated to provide point estimates. Dynamic time warping (DTW) is a time series comparison method that is capable of efficiently comparing series despite temporal offsets that confound other methods. The DTW method is both efficient and remarkably flexible, capable of efficiently matching not only time series but also any sequentially structured data set, which has made it a popular technique in machine learning, artificial intelligence, and big data analytical tasks. DTW is rarely used in ecology despite the ubiquity of temporally structured data. As technological advances have increased the richness of small-scale ecological data, DTW may be an attractive analysis technique because it is able to utilize the additional information contained in the temporal structure of many ecological data sets. In this study, we use an example data set of high-resolution fish movement records obtained from otolith microchemistry to compare traditional analysis techniques with DTW clustering. Our results suggest that DTW is capable of detecting subtle behavioral patterns within otolith data sets which traditional data aggregation techniques cannot. These results provide evidence that the DTW method may be useful across many of the temporal data types commonly collected in ecology, as well other sequentially ordered “pseudo time series” data such as classification of species by shape.","container-title":"Ecosphere","DOI":"10.1002/ecs2.3742","ISSN":"2150-8925","issue":"9","language":"en","note":"_eprint: https://esajournals.onlinelibrary.wiley.com/doi/pdf/10.1002/ecs2.3742","page":"e03742","source":"Wiley Online Library","title":"Let's do the time warp again: non-linear time series matching as a tool for sequentially structured data in ecology","title-short":"Let's do the time warp again","volume":"12","author":[{"family":"Hegg","given":"Jens C."},{"family":"Kennedy","given":"Brian P."}],"issued":{"date-parts":[["2021"]]}}}],"schema":"https://github.com/citation-style-language/schema/raw/master/csl-citation.json"} </w:instrText>
-      </w:r>
-      <w:r>
-        <w:rPr>
-          <w:rFonts w:ascii="Garamond" w:hAnsi="Garamond"/>
-          <w:sz w:val="22"/>
-          <w:szCs w:val="22"/>
-        </w:rPr>
-        <w:fldChar w:fldCharType="separate"/>
-      </w:r>
-      <w:r>
-        <w:rPr>
-          <w:rFonts w:ascii="Garamond" w:hAnsi="Garamond"/>
-          <w:noProof/>
-          <w:sz w:val="22"/>
-          <w:szCs w:val="22"/>
-        </w:rPr>
-        <w:t>(Hegg &amp; Kennedy, 2021)</w:t>
-      </w:r>
-      <w:r>
-        <w:rPr>
-          <w:rFonts w:ascii="Garamond" w:hAnsi="Garamond"/>
-          <w:sz w:val="22"/>
-          <w:szCs w:val="22"/>
-        </w:rPr>
-        <w:fldChar w:fldCharType="end"/>
-      </w:r>
-      <w:r>
-        <w:rPr>
-          <w:rFonts w:ascii="Garamond" w:hAnsi="Garamond"/>
-          <w:sz w:val="22"/>
-          <w:szCs w:val="22"/>
-        </w:rPr>
-        <w:t xml:space="preserve">. The </w:t>
-      </w:r>
-      <w:r>
-        <w:rPr>
-          <w:rFonts w:ascii="Garamond" w:hAnsi="Garamond"/>
-          <w:sz w:val="22"/>
-          <w:szCs w:val="22"/>
-        </w:rPr>
-        <w:lastRenderedPageBreak/>
-        <w:t xml:space="preserve">resulting dataset contained a X by X data matrix for both raw and GAM smoothed data as well as a X by X data matrix for moving average smoothing which removed X datapoints at the beginning and end of the transect. </w:t>
+      <w:r>
+        <w:rPr>
+          <w:rFonts w:ascii="Garamond" w:hAnsi="Garamond"/>
+          <w:sz w:val="22"/>
+          <w:szCs w:val="22"/>
+        </w:rPr>
+        <w:t xml:space="preserve">Variation in size among individuals result in timeseries of different length among samples. However, many machine learning algorithms require </w:t>
+      </w:r>
+      <w:r>
+        <w:rPr>
+          <w:rFonts w:ascii="Garamond" w:hAnsi="Garamond"/>
+          <w:sz w:val="22"/>
+          <w:szCs w:val="22"/>
+        </w:rPr>
+        <w:t xml:space="preserve">fixed dimension vectors with a consistent length. To overcome this limitation </w:t>
+      </w:r>
+      <w:r>
+        <w:rPr>
+          <w:rFonts w:ascii="Garamond" w:hAnsi="Garamond"/>
+          <w:sz w:val="22"/>
+          <w:szCs w:val="22"/>
+        </w:rPr>
+        <w:t xml:space="preserve">all samples were interpolated to a common length which was the calculated average length of all timeseries </w:t>
+      </w:r>
+      <w:proofErr w:type="gramStart"/>
+      <w:r>
+        <w:rPr>
+          <w:rFonts w:ascii="Garamond" w:hAnsi="Garamond"/>
+          <w:sz w:val="22"/>
+          <w:szCs w:val="22"/>
+        </w:rPr>
+        <w:t>( 700</w:t>
+      </w:r>
+      <w:proofErr w:type="gramEnd"/>
+      <w:r>
+        <w:rPr>
+          <w:rFonts w:ascii="Garamond" w:hAnsi="Garamond"/>
+          <w:sz w:val="22"/>
+          <w:szCs w:val="22"/>
+        </w:rPr>
+        <w:t xml:space="preserve"> for non-MA and 600 for MA samples, respectively) (Hegg and Kennedy, 2021).</w:t>
       </w:r>
     </w:p>
     <w:p>
@@ -1442,6 +1769,16 @@
           <w:sz w:val="22"/>
           <w:szCs w:val="22"/>
           <w:u w:val="single"/>
+        </w:rPr>
+      </w:pPr>
+    </w:p>
+    <w:p>
+      <w:pPr>
+        <w:spacing w:line="480" w:lineRule="auto"/>
+        <w:rPr>
+          <w:rFonts w:ascii="Garamond" w:hAnsi="Garamond"/>
+          <w:sz w:val="22"/>
+          <w:szCs w:val="22"/>
         </w:rPr>
       </w:pPr>
       <w:r>
@@ -1473,23 +1810,24 @@
           <w:sz w:val="22"/>
           <w:szCs w:val="22"/>
         </w:rPr>
-        <w:t>All data were randomly partitioned into training and testing sets using an 80/20 split. To ensure consistency across analyses, the same individuals were assigned to the training and testing sets for all three feature representations: raw data, generalized additive model (GAM)-smoothed data, and moving average (MA)–smoothed data.</w:t>
-      </w:r>
-      <w:r>
-        <w:rPr>
-          <w:rFonts w:ascii="Garamond" w:hAnsi="Garamond"/>
-          <w:sz w:val="22"/>
-          <w:szCs w:val="22"/>
-        </w:rPr>
-        <w:t xml:space="preserve"> </w:t>
-      </w:r>
-      <w:r>
-        <w:rPr>
-          <w:rFonts w:ascii="Garamond" w:hAnsi="Garamond"/>
-          <w:sz w:val="22"/>
-          <w:szCs w:val="22"/>
-        </w:rPr>
-        <w:t xml:space="preserve">For each feature set, we trained three supervised classification algorithms: </w:t>
+        <w:t xml:space="preserve">All data were randomly partitioned into training and testing sets using an 80/20 split. To ensure consistency across analyses, the same individuals were assigned to the training and testing sets for all three </w:t>
+      </w:r>
+      <w:r>
+        <w:rPr>
+          <w:rFonts w:ascii="Garamond" w:hAnsi="Garamond"/>
+          <w:sz w:val="22"/>
+          <w:szCs w:val="22"/>
+        </w:rPr>
+        <w:lastRenderedPageBreak/>
+        <w:t xml:space="preserve">datasets (non-smoothed (Raw), MA, and GAM). For each dataset we trained </w:t>
+      </w:r>
+      <w:r>
+        <w:rPr>
+          <w:rFonts w:ascii="Garamond" w:hAnsi="Garamond"/>
+          <w:sz w:val="22"/>
+          <w:szCs w:val="22"/>
+        </w:rPr>
+        <w:t xml:space="preserve">three supervised classification algorithms: </w:t>
       </w:r>
       <w:r>
         <w:rPr>
@@ -1558,7 +1896,33 @@
           <w:sz w:val="22"/>
           <w:szCs w:val="22"/>
         </w:rPr>
-        <w:t xml:space="preserve"> with a radial basis function (RBF) kernel. The Random Forest model was configured with 500 trees, and the number of predictors randomly sampled at each split (</w:t>
+        <w:t xml:space="preserve">. </w:t>
+      </w:r>
+      <w:r>
+        <w:rPr>
+          <w:rFonts w:ascii="Garamond" w:hAnsi="Garamond"/>
+          <w:sz w:val="22"/>
+          <w:szCs w:val="22"/>
+        </w:rPr>
+        <w:t xml:space="preserve">The </w:t>
+      </w:r>
+      <w:proofErr w:type="spellStart"/>
+      <w:r>
+        <w:rPr>
+          <w:rFonts w:ascii="Garamond" w:hAnsi="Garamond"/>
+          <w:sz w:val="22"/>
+          <w:szCs w:val="22"/>
+        </w:rPr>
+        <w:t>The</w:t>
+      </w:r>
+      <w:proofErr w:type="spellEnd"/>
+      <w:r>
+        <w:rPr>
+          <w:rFonts w:ascii="Garamond" w:hAnsi="Garamond"/>
+          <w:sz w:val="22"/>
+          <w:szCs w:val="22"/>
+        </w:rPr>
+        <w:t xml:space="preserve"> Random Forest model was configured with 500 trees, and the number of predictors randomly sampled at each split (</w:t>
       </w:r>
       <w:proofErr w:type="spellStart"/>
       <w:r>
@@ -1577,23 +1941,7 @@
           <w:sz w:val="22"/>
           <w:szCs w:val="22"/>
         </w:rPr>
-        <w:t>) was set to the square root of the total number of predictors, following standard practice for classification problems. The KNN model was trained using five neighbors, while the SVM model used default hyperparameters for the RBF kernel.</w:t>
-      </w:r>
-      <w:r>
-        <w:rPr>
-          <w:rFonts w:ascii="Garamond" w:hAnsi="Garamond"/>
-          <w:sz w:val="22"/>
-          <w:szCs w:val="22"/>
-        </w:rPr>
-        <w:t xml:space="preserve"> </w:t>
-      </w:r>
-      <w:r>
-        <w:rPr>
-          <w:rFonts w:ascii="Garamond" w:hAnsi="Garamond"/>
-          <w:sz w:val="22"/>
-          <w:szCs w:val="22"/>
-        </w:rPr>
-        <w:t xml:space="preserve">All models were implemented using the </w:t>
+        <w:t xml:space="preserve">) was set to the square root of the total number of predictors, following standard practice for classification problems. The KNN model was trained using five neighbors, while the SVM model used default hyperparameters for the RBF kernel. All models were implemented using the </w:t>
       </w:r>
       <w:proofErr w:type="spellStart"/>
       <w:r>
@@ -1612,15 +1960,15 @@
           <w:sz w:val="22"/>
           <w:szCs w:val="22"/>
         </w:rPr>
-        <w:t xml:space="preserve"> framework in R.</w:t>
-      </w:r>
-      <w:r>
-        <w:rPr>
-          <w:rFonts w:ascii="Garamond" w:hAnsi="Garamond"/>
-          <w:sz w:val="22"/>
-          <w:szCs w:val="22"/>
-        </w:rPr>
-        <w:t xml:space="preserve"> </w:t>
+        <w:t xml:space="preserve"> framework in R</w:t>
+      </w:r>
+      <w:r>
+        <w:rPr>
+          <w:rFonts w:ascii="Garamond" w:hAnsi="Garamond"/>
+          <w:sz w:val="22"/>
+          <w:szCs w:val="22"/>
+        </w:rPr>
+        <w:t xml:space="preserve">. </w:t>
       </w:r>
     </w:p>
     <w:p>
@@ -1640,41 +1988,55 @@
           <w:sz w:val="22"/>
           <w:szCs w:val="22"/>
         </w:rPr>
-        <w:t xml:space="preserve">Trained models were then evaluated on two testing datasets. The first was the original 20% holdout set, used to assess classification accuracy across the full range of samples. The second testing set was a subset of this holdout set, with samples removed if their natal origin isotope values were unique to a single watershed. For example, some regions of the Yukon exhibit enriched isotope values that are not found in other watersheds, making it possible to classify these samples based on isotope data alone. By excluding such easily classifiable cases, the restricted test set allowed us to evaluate model performance on a more challenging subset: individuals whose isotopic signatures were ambiguous and could not be assigned to a watershed using univariate thresholds alone. Model performance was assessed using two metrics: </w:t>
-      </w:r>
-      <w:r>
-        <w:rPr>
-          <w:rStyle w:val="Strong"/>
-          <w:rFonts w:ascii="Garamond" w:eastAsiaTheme="majorEastAsia" w:hAnsi="Garamond"/>
-          <w:sz w:val="22"/>
-          <w:szCs w:val="22"/>
-        </w:rPr>
-        <w:t>overall accuracy</w:t>
-      </w:r>
-      <w:r>
-        <w:rPr>
-          <w:rFonts w:ascii="Garamond" w:hAnsi="Garamond"/>
-          <w:sz w:val="22"/>
-          <w:szCs w:val="22"/>
-        </w:rPr>
-        <w:t xml:space="preserve"> and the </w:t>
-      </w:r>
-      <w:r>
-        <w:rPr>
-          <w:rStyle w:val="Strong"/>
-          <w:rFonts w:ascii="Garamond" w:eastAsiaTheme="majorEastAsia" w:hAnsi="Garamond"/>
-          <w:sz w:val="22"/>
-          <w:szCs w:val="22"/>
-        </w:rPr>
-        <w:t>F1-score</w:t>
-      </w:r>
-      <w:r>
-        <w:rPr>
-          <w:rFonts w:ascii="Garamond" w:hAnsi="Garamond"/>
-          <w:sz w:val="22"/>
-          <w:szCs w:val="22"/>
-        </w:rPr>
-        <w:t>, which balances precision and recall and is particularly useful for evaluating classification performance in cases of class imbalance.</w:t>
+        <w:t xml:space="preserve">Trained models were then evaluated on testing datasets in two ways. First, models were tested for accuracy and F1-score on the original 20% holdout set. Second, models were evaluated on a modified testing set with samples removed if their natal origin </w:t>
+      </w:r>
+      <w:r>
+        <w:rPr>
+          <w:rFonts w:ascii="Cambria Math" w:hAnsi="Cambria Math" w:cs="Cambria Math"/>
+          <w:sz w:val="22"/>
+          <w:szCs w:val="22"/>
+        </w:rPr>
+        <w:t>⁸⁷</w:t>
+      </w:r>
+      <w:r>
+        <w:rPr>
+          <w:rFonts w:ascii="Garamond" w:hAnsi="Garamond"/>
+          <w:sz w:val="22"/>
+          <w:szCs w:val="22"/>
+        </w:rPr>
+        <w:t>Sr/</w:t>
+      </w:r>
+      <w:r>
+        <w:rPr>
+          <w:rFonts w:ascii="Cambria Math" w:hAnsi="Cambria Math" w:cs="Cambria Math"/>
+          <w:sz w:val="22"/>
+          <w:szCs w:val="22"/>
+        </w:rPr>
+        <w:t>⁸⁶</w:t>
+      </w:r>
+      <w:r>
+        <w:rPr>
+          <w:rFonts w:ascii="Garamond" w:hAnsi="Garamond"/>
+          <w:sz w:val="22"/>
+          <w:szCs w:val="22"/>
+        </w:rPr>
+        <w:t>Sr values were below 0.7150. Only the Yukon watershed contains enriched isotope values above this threshold and can therefore be distinguished using natal origin values alone. This modified dataset therefore tests the classification accuracy of models on only those samples that are otherwise indistinguishable using natal origin values alone</w:t>
+      </w:r>
+      <w:r>
+        <w:rPr>
+          <w:rFonts w:ascii="Garamond" w:hAnsi="Garamond"/>
+          <w:sz w:val="22"/>
+          <w:szCs w:val="22"/>
+        </w:rPr>
+        <w:t xml:space="preserve">. </w:t>
+      </w:r>
+      <w:r>
+        <w:rPr>
+          <w:rFonts w:ascii="Garamond" w:hAnsi="Garamond"/>
+          <w:sz w:val="22"/>
+          <w:szCs w:val="22"/>
+        </w:rPr>
+        <w:t>Model performance was assessed using two complementary metrics. Overall accuracy measures the proportion of correct predictions across all classes, providing a straightforward assessment of model performance. The F1-score balances precision and recall, offering a more nuanced evaluation that is particularly valuable when class imbalances are present, as it accounts for both false positives and false negatives.</w:t>
       </w:r>
     </w:p>
     <w:p>
@@ -1708,12 +2070,57 @@
           <w:sz w:val="22"/>
           <w:szCs w:val="22"/>
         </w:rPr>
-        <w:t xml:space="preserve">PCA, feature importance, data exploration </w:t>
+        <w:t xml:space="preserve">Quantifying variability onto otolith timeseries. </w:t>
       </w:r>
     </w:p>
     <w:p>
       <w:pPr>
         <w:spacing w:line="480" w:lineRule="auto"/>
+        <w:ind w:firstLine="720"/>
+        <w:rPr>
+          <w:rFonts w:ascii="Garamond" w:hAnsi="Garamond"/>
+          <w:sz w:val="22"/>
+          <w:szCs w:val="22"/>
+        </w:rPr>
+      </w:pPr>
+      <w:r>
+        <w:rPr>
+          <w:rFonts w:ascii="Garamond" w:hAnsi="Garamond"/>
+          <w:sz w:val="22"/>
+          <w:szCs w:val="22"/>
+        </w:rPr>
+        <w:t xml:space="preserve">Principal component analysis (PCA) was applied to the top-performing model to qualitatively assess clustering patterns in multivariate space. PCA transforms the original variables into uncorrelated principal components that capture the greatest variance in the dataset, thereby highlighting variability among time-series that may contain distinguishing watershed characteristics. The absolute values of PCA loadings for the first and second principal components were mapped onto their corresponding time-series positions to </w:t>
+      </w:r>
+      <w:r>
+        <w:rPr>
+          <w:rFonts w:ascii="Garamond" w:hAnsi="Garamond"/>
+          <w:sz w:val="22"/>
+          <w:szCs w:val="22"/>
+        </w:rPr>
+        <w:lastRenderedPageBreak/>
+        <w:t xml:space="preserve">visualize regions driving this variability. Similarly, normalized feature importance values were extracted from the best-performing random forest model and mapped to corresponding time-series positions to identify the </w:t>
+      </w:r>
+      <w:proofErr w:type="spellStart"/>
+      <w:r>
+        <w:rPr>
+          <w:rFonts w:ascii="Garamond" w:hAnsi="Garamond"/>
+          <w:sz w:val="22"/>
+          <w:szCs w:val="22"/>
+        </w:rPr>
+        <w:t>regions</w:t>
+      </w:r>
+      <w:proofErr w:type="spellEnd"/>
+      <w:r>
+        <w:rPr>
+          <w:rFonts w:ascii="Garamond" w:hAnsi="Garamond"/>
+          <w:sz w:val="22"/>
+          <w:szCs w:val="22"/>
+        </w:rPr>
+        <w:t xml:space="preserve"> most critical for classification.</w:t>
+      </w:r>
+    </w:p>
+    <w:p>
+      <w:pPr>
         <w:rPr>
           <w:rFonts w:ascii="Garamond" w:hAnsi="Garamond"/>
           <w:b/>
@@ -1722,7 +2129,9 @@
           <w:szCs w:val="22"/>
         </w:rPr>
       </w:pPr>
-      <w:r>
+    </w:p>
+    <w:p>
+      <w:pPr>
         <w:rPr>
           <w:rFonts w:ascii="Garamond" w:hAnsi="Garamond"/>
           <w:b/>
@@ -1730,9 +2139,7 @@
           <w:sz w:val="22"/>
           <w:szCs w:val="22"/>
         </w:rPr>
-        <w:t xml:space="preserve">Principal component analysis was used on the dataset from the best preforming model (GAM RF) to qualitatively explore variation </w:t>
-      </w:r>
-      <w:proofErr w:type="spellStart"/>
+      </w:pPr>
       <w:r>
         <w:rPr>
           <w:rFonts w:ascii="Garamond" w:hAnsi="Garamond"/>
@@ -1741,13 +2148,9 @@
           <w:sz w:val="22"/>
           <w:szCs w:val="22"/>
         </w:rPr>
-        <w:t>amon</w:t>
-      </w:r>
-      <w:proofErr w:type="spellEnd"/>
-    </w:p>
-    <w:p>
-      <w:pPr>
-        <w:spacing w:line="480" w:lineRule="auto"/>
+        <w:t xml:space="preserve">Probability </w:t>
+      </w:r>
+      <w:r>
         <w:rPr>
           <w:rFonts w:ascii="Garamond" w:hAnsi="Garamond"/>
           <w:b/>
@@ -1755,11 +2158,9 @@
           <w:sz w:val="22"/>
           <w:szCs w:val="22"/>
         </w:rPr>
-      </w:pPr>
-    </w:p>
-    <w:p>
-      <w:pPr>
-        <w:spacing w:line="480" w:lineRule="auto"/>
+        <w:t xml:space="preserve">calibration </w:t>
+      </w:r>
+      <w:r>
         <w:rPr>
           <w:rFonts w:ascii="Garamond" w:hAnsi="Garamond"/>
           <w:b/>
@@ -1767,20 +2168,13 @@
           <w:sz w:val="22"/>
           <w:szCs w:val="22"/>
         </w:rPr>
-      </w:pPr>
+        <w:t xml:space="preserve">and threshold testing </w:t>
+      </w:r>
     </w:p>
     <w:p>
       <w:pPr>
         <w:spacing w:line="480" w:lineRule="auto"/>
-        <w:rPr>
-          <w:rFonts w:ascii="Garamond" w:hAnsi="Garamond"/>
-          <w:sz w:val="22"/>
-          <w:szCs w:val="22"/>
-        </w:rPr>
-      </w:pPr>
-    </w:p>
-    <w:p>
-      <w:pPr>
+        <w:ind w:firstLine="720"/>
         <w:rPr>
           <w:rFonts w:ascii="Garamond" w:hAnsi="Garamond"/>
           <w:b/>
@@ -1792,111 +2186,39 @@
       <w:r>
         <w:rPr>
           <w:rFonts w:ascii="Garamond" w:hAnsi="Garamond"/>
+          <w:sz w:val="22"/>
+          <w:szCs w:val="22"/>
+        </w:rPr>
+        <w:t xml:space="preserve">Many machine learning classification models produce probability estimates that do not accurately reflect the true likelihood of correct prediction. While these models may achieve high classification accuracy, their reported confidence levels can be systematically over- or under-estimated, limiting their utility for decision-making in scientific applications where uncertainty quantification is critical. To calibrate predictions from our models, we used the </w:t>
+      </w:r>
+      <w:r>
+        <w:rPr>
+          <w:rStyle w:val="HTMLCode"/>
+          <w:rFonts w:ascii="Garamond" w:eastAsiaTheme="majorEastAsia" w:hAnsi="Garamond"/>
+          <w:sz w:val="22"/>
+          <w:szCs w:val="22"/>
+        </w:rPr>
+        <w:t>probably</w:t>
+      </w:r>
+      <w:r>
+        <w:rPr>
+          <w:rFonts w:ascii="Garamond" w:hAnsi="Garamond"/>
+          <w:sz w:val="22"/>
+          <w:szCs w:val="22"/>
+        </w:rPr>
+        <w:t xml:space="preserve"> package to apply multinomial isotonic regression to our testing set, which adjusts the raw probability outputs to better align predicted confidence with actual classification accuracy. We verified that this calibration successfully improved probability estimates by visually assessing the relationship between predicted probabilities and observed class frequencies. Additionally, we calculated Brier scores and log loss for datasets before and after calibration to quantify improvements in probability calibration. Calibration factors were produced for all random forest models and applied to the testing set probabilities. These calibration factors represent the transformation function that can be stored and applied to future datasets analyzed with the same model, ensuring consistent probability calibration across new predictions.</w:t>
+      </w:r>
+    </w:p>
+    <w:p>
+      <w:pPr>
+        <w:rPr>
+          <w:rFonts w:ascii="Garamond" w:hAnsi="Garamond"/>
           <w:b/>
           <w:bCs/>
           <w:sz w:val="22"/>
           <w:szCs w:val="22"/>
         </w:rPr>
-        <w:t xml:space="preserve">Probability tuning </w:t>
-      </w:r>
-    </w:p>
-    <w:p>
-      <w:pPr>
-        <w:rPr>
-          <w:rFonts w:ascii="Garamond" w:hAnsi="Garamond"/>
-          <w:b/>
-          <w:bCs/>
-          <w:sz w:val="22"/>
-          <w:szCs w:val="22"/>
-        </w:rPr>
-      </w:pPr>
-    </w:p>
-    <w:p>
-      <w:pPr>
-        <w:rPr>
-          <w:rFonts w:ascii="Garamond" w:hAnsi="Garamond"/>
-          <w:b/>
-          <w:bCs/>
-          <w:sz w:val="22"/>
-          <w:szCs w:val="22"/>
-        </w:rPr>
-      </w:pPr>
-    </w:p>
-    <w:p>
-      <w:pPr>
-        <w:rPr>
-          <w:rFonts w:ascii="Garamond" w:hAnsi="Garamond"/>
-          <w:b/>
-          <w:bCs/>
-          <w:sz w:val="22"/>
-          <w:szCs w:val="22"/>
-        </w:rPr>
-      </w:pPr>
-    </w:p>
-    <w:p>
-      <w:pPr>
-        <w:rPr>
-          <w:rFonts w:ascii="Garamond" w:hAnsi="Garamond"/>
-          <w:b/>
-          <w:bCs/>
-          <w:sz w:val="22"/>
-          <w:szCs w:val="22"/>
-        </w:rPr>
-      </w:pPr>
-    </w:p>
-    <w:p>
-      <w:pPr>
-        <w:rPr>
-          <w:rFonts w:ascii="Garamond" w:hAnsi="Garamond"/>
-          <w:b/>
-          <w:bCs/>
-          <w:sz w:val="22"/>
-          <w:szCs w:val="22"/>
-        </w:rPr>
-      </w:pPr>
-    </w:p>
-    <w:p>
-      <w:pPr>
-        <w:rPr>
-          <w:rFonts w:ascii="Garamond" w:hAnsi="Garamond"/>
-          <w:b/>
-          <w:bCs/>
-          <w:sz w:val="22"/>
-          <w:szCs w:val="22"/>
-        </w:rPr>
-      </w:pPr>
-    </w:p>
-    <w:p>
-      <w:pPr>
-        <w:rPr>
-          <w:rFonts w:ascii="Garamond" w:hAnsi="Garamond"/>
-          <w:b/>
-          <w:bCs/>
-          <w:sz w:val="22"/>
-          <w:szCs w:val="22"/>
-        </w:rPr>
-      </w:pPr>
-    </w:p>
-    <w:p>
-      <w:pPr>
-        <w:rPr>
-          <w:rFonts w:ascii="Garamond" w:hAnsi="Garamond"/>
-          <w:b/>
-          <w:bCs/>
-          <w:sz w:val="22"/>
-          <w:szCs w:val="22"/>
-        </w:rPr>
-      </w:pPr>
-      <w:r>
-        <w:rPr>
-          <w:rFonts w:ascii="Garamond" w:hAnsi="Garamond"/>
-          <w:b/>
-          <w:bCs/>
-          <w:sz w:val="22"/>
-          <w:szCs w:val="22"/>
-        </w:rPr>
-        <w:t xml:space="preserve">Combination with current models </w:t>
-      </w:r>
+      </w:pPr>
     </w:p>
     <w:p>
       <w:pPr>
@@ -1905,10 +2227,22 @@
         </w:tabs>
         <w:rPr>
           <w:rFonts w:ascii="Garamond" w:hAnsi="Garamond"/>
-          <w:sz w:val="32"/>
-          <w:szCs w:val="32"/>
-        </w:rPr>
-      </w:pPr>
+          <w:b/>
+          <w:bCs/>
+          <w:sz w:val="22"/>
+          <w:szCs w:val="22"/>
+        </w:rPr>
+      </w:pPr>
+      <w:r>
+        <w:rPr>
+          <w:rFonts w:ascii="Garamond" w:hAnsi="Garamond"/>
+          <w:b/>
+          <w:bCs/>
+          <w:sz w:val="22"/>
+          <w:szCs w:val="22"/>
+        </w:rPr>
+        <w:t xml:space="preserve">Integration with current otolith-based provenance models </w:t>
+      </w:r>
     </w:p>
     <w:p>
       <w:pPr>
@@ -1917,10 +2251,18 @@
         </w:tabs>
         <w:rPr>
           <w:rFonts w:ascii="Garamond" w:hAnsi="Garamond"/>
-          <w:sz w:val="32"/>
-          <w:szCs w:val="32"/>
-        </w:rPr>
-      </w:pPr>
+          <w:sz w:val="22"/>
+          <w:szCs w:val="22"/>
+        </w:rPr>
+      </w:pPr>
+      <w:r>
+        <w:rPr>
+          <w:rFonts w:ascii="Garamond" w:hAnsi="Garamond"/>
+          <w:sz w:val="22"/>
+          <w:szCs w:val="22"/>
+        </w:rPr>
+        <w:t>Because these are well-calibrated probabilities, we can use them in probability-based frameworks such as Bayes' theorem, enabling formal uncertainty propagation and integration with other probabilistic models</w:t>
+      </w:r>
     </w:p>
     <w:p>
       <w:pPr>
@@ -1987,19 +2329,127 @@
           <w:sz w:val="32"/>
           <w:szCs w:val="32"/>
         </w:rPr>
+        <w:lastRenderedPageBreak/>
         <w:t xml:space="preserve">Results </w:t>
       </w:r>
-      <w:r>
+    </w:p>
+    <w:p>
+      <w:pPr>
+        <w:tabs>
+          <w:tab w:val="left" w:pos="3088"/>
+        </w:tabs>
+        <w:rPr>
+          <w:rFonts w:ascii="Garamond" w:hAnsi="Garamond"/>
+          <w:b/>
+          <w:bCs/>
+        </w:rPr>
+      </w:pPr>
+      <w:r>
+        <w:rPr>
+          <w:rFonts w:ascii="Garamond" w:hAnsi="Garamond"/>
+          <w:b/>
+          <w:bCs/>
+        </w:rPr>
+        <w:t xml:space="preserve">Model Performance </w:t>
+      </w:r>
+    </w:p>
+    <w:p>
+      <w:pPr>
+        <w:tabs>
+          <w:tab w:val="left" w:pos="3088"/>
+        </w:tabs>
+        <w:rPr>
+          <w:rFonts w:ascii="Garamond" w:hAnsi="Garamond"/>
+        </w:rPr>
+      </w:pPr>
+      <w:r>
+        <w:rPr>
+          <w:rFonts w:ascii="Garamond" w:hAnsi="Garamond"/>
+        </w:rPr>
+        <w:t xml:space="preserve">Classification accuracy on the full testing set ranged from 78.1% to 92.7%, with the highest  </w:t>
+      </w:r>
+    </w:p>
+    <w:p>
+      <w:pPr>
+        <w:tabs>
+          <w:tab w:val="left" w:pos="3088"/>
+        </w:tabs>
+        <w:rPr>
+          <w:rFonts w:ascii="Garamond" w:hAnsi="Garamond"/>
+          <w:b/>
+          <w:bCs/>
+        </w:rPr>
+      </w:pPr>
+    </w:p>
+    <w:p>
+      <w:pPr>
+        <w:tabs>
+          <w:tab w:val="left" w:pos="3088"/>
+        </w:tabs>
+        <w:rPr>
+          <w:rFonts w:ascii="Garamond" w:hAnsi="Garamond"/>
+          <w:b/>
+          <w:bCs/>
+        </w:rPr>
+      </w:pPr>
+      <w:r>
+        <w:rPr>
+          <w:rFonts w:ascii="Garamond" w:hAnsi="Garamond"/>
+          <w:b/>
+          <w:bCs/>
+        </w:rPr>
+        <w:t xml:space="preserve">Timeseries feature importance </w:t>
+      </w:r>
+    </w:p>
+    <w:p>
+      <w:pPr>
+        <w:tabs>
+          <w:tab w:val="left" w:pos="3088"/>
+        </w:tabs>
+        <w:rPr>
+          <w:rFonts w:ascii="Garamond" w:hAnsi="Garamond"/>
+          <w:b/>
+          <w:bCs/>
+        </w:rPr>
+      </w:pPr>
+    </w:p>
+    <w:p>
+      <w:pPr>
+        <w:tabs>
+          <w:tab w:val="left" w:pos="3088"/>
+        </w:tabs>
+        <w:rPr>
+          <w:rFonts w:ascii="Garamond" w:hAnsi="Garamond"/>
+          <w:b/>
+          <w:bCs/>
+        </w:rPr>
+      </w:pPr>
+      <w:r>
+        <w:rPr>
+          <w:rFonts w:ascii="Garamond" w:hAnsi="Garamond"/>
+          <w:b/>
+          <w:bCs/>
+        </w:rPr>
+        <w:t xml:space="preserve">Probability tuning </w:t>
+      </w:r>
+    </w:p>
+    <w:p>
+      <w:pPr>
+        <w:tabs>
+          <w:tab w:val="left" w:pos="3088"/>
+        </w:tabs>
         <w:rPr>
           <w:rFonts w:ascii="Garamond" w:hAnsi="Garamond"/>
           <w:sz w:val="32"/>
           <w:szCs w:val="32"/>
         </w:rPr>
-        <w:tab/>
-      </w:r>
-    </w:p>
-    <w:p>
-      <w:pPr>
+      </w:pPr>
+    </w:p>
+    <w:p>
+      <w:pPr>
+        <w:tabs>
+          <w:tab w:val="left" w:pos="3088"/>
+        </w:tabs>
         <w:rPr>
           <w:rFonts w:ascii="Garamond" w:hAnsi="Garamond"/>
           <w:sz w:val="32"/>
@@ -2012,652 +2462,25 @@
           <w:sz w:val="32"/>
           <w:szCs w:val="32"/>
         </w:rPr>
+        <w:tab/>
+      </w:r>
+    </w:p>
+    <w:p>
+      <w:pPr>
+        <w:rPr>
+          <w:rFonts w:ascii="Garamond" w:hAnsi="Garamond"/>
+          <w:sz w:val="32"/>
+          <w:szCs w:val="32"/>
+        </w:rPr>
+      </w:pPr>
+      <w:r>
+        <w:rPr>
+          <w:rFonts w:ascii="Garamond" w:hAnsi="Garamond"/>
+          <w:sz w:val="32"/>
+          <w:szCs w:val="32"/>
+        </w:rPr>
         <w:t xml:space="preserve">Discussion </w:t>
       </w:r>
-    </w:p>
-    <w:p>
-      <w:pPr>
-        <w:rPr>
-          <w:rFonts w:ascii="Garamond" w:hAnsi="Garamond"/>
-          <w:sz w:val="22"/>
-          <w:szCs w:val="22"/>
-        </w:rPr>
-      </w:pPr>
-    </w:p>
-    <w:p>
-      <w:pPr>
-        <w:rPr>
-          <w:rFonts w:ascii="Garamond" w:hAnsi="Garamond"/>
-          <w:sz w:val="22"/>
-          <w:szCs w:val="22"/>
-        </w:rPr>
-      </w:pPr>
-    </w:p>
-    <w:p>
-      <w:pPr>
-        <w:rPr>
-          <w:rFonts w:ascii="Garamond" w:hAnsi="Garamond"/>
-          <w:sz w:val="21"/>
-          <w:szCs w:val="21"/>
-        </w:rPr>
-      </w:pPr>
-    </w:p>
-    <w:p>
-      <w:pPr>
-        <w:ind w:left="720"/>
-        <w:rPr>
-          <w:rFonts w:ascii="Garamond" w:hAnsi="Garamond"/>
-          <w:sz w:val="21"/>
-          <w:szCs w:val="21"/>
-        </w:rPr>
-      </w:pPr>
-    </w:p>
-    <w:p>
-      <w:pPr>
-        <w:ind w:firstLine="720"/>
-        <w:rPr>
-          <w:rFonts w:ascii="Garamond" w:hAnsi="Garamond"/>
-          <w:sz w:val="21"/>
-          <w:szCs w:val="21"/>
-        </w:rPr>
-      </w:pPr>
-    </w:p>
-    <w:p>
-      <w:pPr>
-        <w:ind w:firstLine="720"/>
-        <w:rPr>
-          <w:rFonts w:ascii="Garamond" w:hAnsi="Garamond"/>
-          <w:sz w:val="21"/>
-          <w:szCs w:val="21"/>
-        </w:rPr>
-      </w:pPr>
-    </w:p>
-    <w:p>
-      <w:pPr>
-        <w:ind w:firstLine="720"/>
-        <w:rPr>
-          <w:rFonts w:ascii="Garamond" w:hAnsi="Garamond"/>
-          <w:sz w:val="21"/>
-          <w:szCs w:val="21"/>
-        </w:rPr>
-      </w:pPr>
-    </w:p>
-    <w:p>
-      <w:pPr>
-        <w:ind w:firstLine="720"/>
-        <w:rPr>
-          <w:rFonts w:ascii="Garamond" w:hAnsi="Garamond"/>
-          <w:sz w:val="21"/>
-          <w:szCs w:val="21"/>
-        </w:rPr>
-      </w:pPr>
-    </w:p>
-    <w:p>
-      <w:pPr>
-        <w:ind w:firstLine="720"/>
-        <w:rPr>
-          <w:rFonts w:ascii="Garamond" w:hAnsi="Garamond"/>
-          <w:sz w:val="21"/>
-          <w:szCs w:val="21"/>
-        </w:rPr>
-      </w:pPr>
-    </w:p>
-    <w:p>
-      <w:pPr>
-        <w:pStyle w:val="NormalWeb"/>
-        <w:spacing w:line="480" w:lineRule="auto"/>
-        <w:ind w:firstLine="720"/>
-        <w:rPr>
-          <w:rFonts w:ascii="Garamond" w:hAnsi="Garamond"/>
-          <w:sz w:val="22"/>
-          <w:szCs w:val="22"/>
-        </w:rPr>
-      </w:pPr>
-    </w:p>
-    <w:p>
-      <w:pPr>
-        <w:pStyle w:val="NormalWeb"/>
-        <w:spacing w:line="480" w:lineRule="auto"/>
-        <w:ind w:firstLine="720"/>
-        <w:rPr>
-          <w:rFonts w:ascii="Garamond" w:hAnsi="Garamond"/>
-          <w:sz w:val="22"/>
-          <w:szCs w:val="22"/>
-        </w:rPr>
-      </w:pPr>
-    </w:p>
-    <w:p>
-      <w:pPr>
-        <w:pStyle w:val="NormalWeb"/>
-        <w:spacing w:line="480" w:lineRule="auto"/>
-        <w:ind w:firstLine="720"/>
-        <w:rPr>
-          <w:rFonts w:ascii="Garamond" w:hAnsi="Garamond"/>
-          <w:sz w:val="22"/>
-          <w:szCs w:val="22"/>
-        </w:rPr>
-      </w:pPr>
-    </w:p>
-    <w:p>
-      <w:pPr>
-        <w:pStyle w:val="NormalWeb"/>
-        <w:spacing w:line="480" w:lineRule="auto"/>
-        <w:ind w:firstLine="720"/>
-        <w:rPr>
-          <w:rFonts w:ascii="Garamond" w:hAnsi="Garamond"/>
-          <w:sz w:val="22"/>
-          <w:szCs w:val="22"/>
-        </w:rPr>
-      </w:pPr>
-    </w:p>
-    <w:p>
-      <w:pPr>
-        <w:pStyle w:val="NormalWeb"/>
-        <w:spacing w:line="480" w:lineRule="auto"/>
-        <w:ind w:firstLine="720"/>
-        <w:rPr>
-          <w:rFonts w:ascii="Garamond" w:hAnsi="Garamond"/>
-          <w:sz w:val="22"/>
-          <w:szCs w:val="22"/>
-        </w:rPr>
-      </w:pPr>
-    </w:p>
-    <w:p>
-      <w:pPr>
-        <w:pStyle w:val="NormalWeb"/>
-        <w:spacing w:line="480" w:lineRule="auto"/>
-        <w:ind w:firstLine="720"/>
-        <w:rPr>
-          <w:rFonts w:ascii="Garamond" w:hAnsi="Garamond"/>
-          <w:sz w:val="22"/>
-          <w:szCs w:val="22"/>
-        </w:rPr>
-      </w:pPr>
-    </w:p>
-    <w:p>
-      <w:pPr>
-        <w:pStyle w:val="NormalWeb"/>
-        <w:spacing w:line="480" w:lineRule="auto"/>
-        <w:ind w:firstLine="720"/>
-        <w:rPr>
-          <w:rFonts w:ascii="Garamond" w:hAnsi="Garamond"/>
-          <w:sz w:val="22"/>
-          <w:szCs w:val="22"/>
-        </w:rPr>
-      </w:pPr>
-    </w:p>
-    <w:p>
-      <w:pPr>
-        <w:pStyle w:val="NormalWeb"/>
-        <w:spacing w:line="480" w:lineRule="auto"/>
-        <w:ind w:firstLine="720"/>
-        <w:rPr>
-          <w:rFonts w:ascii="Garamond" w:hAnsi="Garamond"/>
-          <w:sz w:val="22"/>
-          <w:szCs w:val="22"/>
-        </w:rPr>
-      </w:pPr>
-    </w:p>
-    <w:p>
-      <w:pPr>
-        <w:pStyle w:val="NormalWeb"/>
-        <w:spacing w:line="480" w:lineRule="auto"/>
-        <w:ind w:firstLine="720"/>
-        <w:rPr>
-          <w:rFonts w:ascii="Garamond" w:hAnsi="Garamond"/>
-          <w:sz w:val="22"/>
-          <w:szCs w:val="22"/>
-        </w:rPr>
-      </w:pPr>
-    </w:p>
-    <w:p>
-      <w:pPr>
-        <w:pStyle w:val="NormalWeb"/>
-        <w:spacing w:line="480" w:lineRule="auto"/>
-        <w:ind w:firstLine="720"/>
-        <w:rPr>
-          <w:rFonts w:ascii="Garamond" w:hAnsi="Garamond"/>
-          <w:sz w:val="22"/>
-          <w:szCs w:val="22"/>
-        </w:rPr>
-      </w:pPr>
-    </w:p>
-    <w:p>
-      <w:pPr>
-        <w:pStyle w:val="NormalWeb"/>
-        <w:spacing w:line="480" w:lineRule="auto"/>
-        <w:ind w:firstLine="720"/>
-        <w:rPr>
-          <w:rFonts w:ascii="Garamond" w:hAnsi="Garamond"/>
-          <w:sz w:val="22"/>
-          <w:szCs w:val="22"/>
-        </w:rPr>
-      </w:pPr>
-    </w:p>
-    <w:p>
-      <w:pPr>
-        <w:pStyle w:val="NormalWeb"/>
-        <w:spacing w:line="480" w:lineRule="auto"/>
-        <w:ind w:firstLine="720"/>
-        <w:rPr>
-          <w:rFonts w:ascii="Garamond" w:hAnsi="Garamond"/>
-          <w:sz w:val="22"/>
-          <w:szCs w:val="22"/>
-        </w:rPr>
-      </w:pPr>
-    </w:p>
-    <w:p>
-      <w:pPr>
-        <w:pStyle w:val="NormalWeb"/>
-        <w:spacing w:line="480" w:lineRule="auto"/>
-        <w:ind w:firstLine="720"/>
-        <w:rPr>
-          <w:rFonts w:ascii="Garamond" w:hAnsi="Garamond"/>
-          <w:sz w:val="22"/>
-          <w:szCs w:val="22"/>
-        </w:rPr>
-      </w:pPr>
-    </w:p>
-    <w:p>
-      <w:pPr>
-        <w:pStyle w:val="NormalWeb"/>
-        <w:spacing w:line="480" w:lineRule="auto"/>
-        <w:ind w:firstLine="720"/>
-        <w:rPr>
-          <w:rFonts w:ascii="Garamond" w:hAnsi="Garamond"/>
-          <w:sz w:val="22"/>
-          <w:szCs w:val="22"/>
-        </w:rPr>
-      </w:pPr>
-    </w:p>
-    <w:p>
-      <w:pPr>
-        <w:pStyle w:val="NormalWeb"/>
-        <w:spacing w:line="480" w:lineRule="auto"/>
-        <w:ind w:firstLine="720"/>
-        <w:rPr>
-          <w:rFonts w:ascii="Garamond" w:hAnsi="Garamond"/>
-          <w:sz w:val="22"/>
-          <w:szCs w:val="22"/>
-        </w:rPr>
-      </w:pPr>
-    </w:p>
-    <w:p>
-      <w:pPr>
-        <w:pStyle w:val="NormalWeb"/>
-        <w:spacing w:line="480" w:lineRule="auto"/>
-        <w:ind w:firstLine="720"/>
-        <w:rPr>
-          <w:sz w:val="22"/>
-          <w:szCs w:val="22"/>
-        </w:rPr>
-      </w:pPr>
-      <w:r>
-        <w:rPr>
-          <w:rFonts w:ascii="Garamond" w:hAnsi="Garamond"/>
-          <w:sz w:val="22"/>
-          <w:szCs w:val="22"/>
-        </w:rPr>
-        <w:t>M</w:t>
-      </w:r>
-      <w:r>
-        <w:rPr>
-          <w:rFonts w:ascii="Garamond" w:hAnsi="Garamond"/>
-          <w:sz w:val="22"/>
-          <w:szCs w:val="22"/>
-        </w:rPr>
-        <w:t>igratory</w:t>
-      </w:r>
-      <w:r>
-        <w:rPr>
-          <w:rFonts w:ascii="Garamond" w:hAnsi="Garamond"/>
-          <w:sz w:val="22"/>
-          <w:szCs w:val="22"/>
-        </w:rPr>
-        <w:t xml:space="preserve"> species play an important role in supporting global nutrient transport and ecosystem services. However, their reliance on multiple ecosystems make them particularly vulnerable to </w:t>
-      </w:r>
-      <w:r>
-        <w:rPr>
-          <w:rFonts w:ascii="Garamond" w:hAnsi="Garamond"/>
-          <w:sz w:val="22"/>
-          <w:szCs w:val="22"/>
-        </w:rPr>
-        <w:t xml:space="preserve">the impacts of environmental </w:t>
-      </w:r>
-      <w:r>
-        <w:rPr>
-          <w:rFonts w:ascii="Garamond" w:hAnsi="Garamond"/>
-          <w:sz w:val="22"/>
-          <w:szCs w:val="22"/>
-        </w:rPr>
-        <w:t xml:space="preserve">change. </w:t>
-      </w:r>
-      <w:r>
-        <w:rPr>
-          <w:rFonts w:ascii="Garamond" w:hAnsi="Garamond"/>
-          <w:sz w:val="22"/>
-          <w:szCs w:val="22"/>
-        </w:rPr>
-        <w:t xml:space="preserve">In addition, the mobile nature of migratory species makes research of their spatial ecology challenging. </w:t>
-      </w:r>
-      <w:r>
-        <w:rPr>
-          <w:sz w:val="22"/>
-          <w:szCs w:val="22"/>
-        </w:rPr>
-        <w:t>Amid accelerating climate change and anthropogenic pressures, effective management and climate adaptation strategies depend on understanding spatial ecology patterns that can establish baseline ecosystem function, reveal mechanisms driving functional changes, and map the spatial distribution of ecosystem service impacts.</w:t>
-      </w:r>
-    </w:p>
-    <w:p>
-      <w:pPr>
-        <w:pStyle w:val="NormalWeb"/>
-        <w:spacing w:line="480" w:lineRule="auto"/>
-        <w:ind w:firstLine="720"/>
-        <w:rPr>
-          <w:sz w:val="22"/>
-          <w:szCs w:val="22"/>
-        </w:rPr>
-      </w:pPr>
-      <w:r>
-        <w:rPr>
-          <w:sz w:val="22"/>
-          <w:szCs w:val="22"/>
-        </w:rPr>
-        <w:t xml:space="preserve">Pacific salmon represent a critically important economic, subsistence, and cultural resource in Western Alaska. Their anadromous life cycle involves freshwater rearing, followed by several years of marine growth, before adults return to spawn in their natal riverine environments. This multi-ecosystem life history, combined with the extremely remote and rugged nature of these environments, makes monitoring salmon ecosystems exceedingly difficult. </w:t>
-      </w:r>
-    </w:p>
-    <w:p>
-      <w:pPr>
-        <w:pStyle w:val="NormalWeb"/>
-        <w:spacing w:line="480" w:lineRule="auto"/>
-        <w:ind w:firstLine="720"/>
-        <w:rPr>
-          <w:sz w:val="22"/>
-          <w:szCs w:val="22"/>
-        </w:rPr>
-      </w:pPr>
-      <w:r>
-        <w:rPr>
-          <w:sz w:val="22"/>
-          <w:szCs w:val="22"/>
-        </w:rPr>
-        <w:t xml:space="preserve">Recent steep declines in salmon population health have created a region-wide emergency across Western Alaska. Several potential mechanisms for this population collapse are centered on the marine environment. However, assessing these hypotheses are hampered by an inability to understand the provenance of marine caught fish using current methods such as genetic stock identification (GSI). </w:t>
-      </w:r>
-    </w:p>
-    <w:p>
-      <w:pPr>
-        <w:pStyle w:val="NormalWeb"/>
-        <w:spacing w:line="480" w:lineRule="auto"/>
-        <w:ind w:firstLine="720"/>
-      </w:pPr>
-    </w:p>
-    <w:p>
-      <w:pPr>
-        <w:pStyle w:val="NormalWeb"/>
-        <w:spacing w:line="480" w:lineRule="auto"/>
-        <w:ind w:firstLine="720"/>
-      </w:pPr>
-    </w:p>
-    <w:p>
-      <w:pPr>
-        <w:pStyle w:val="NormalWeb"/>
-        <w:spacing w:line="480" w:lineRule="auto"/>
-        <w:ind w:firstLine="720"/>
-      </w:pPr>
-      <w:r>
-        <w:lastRenderedPageBreak/>
-        <w:t xml:space="preserve">making it critically important to understand the mechanisms driving population collapse , the stock specific impact of </w:t>
-      </w:r>
-    </w:p>
-    <w:p>
-      <w:pPr>
-        <w:pStyle w:val="NormalWeb"/>
-        <w:spacing w:line="480" w:lineRule="auto"/>
-        <w:ind w:firstLine="720"/>
-        <w:rPr>
-          <w:rFonts w:ascii="Garamond" w:hAnsi="Garamond"/>
-          <w:sz w:val="20"/>
-          <w:szCs w:val="20"/>
-        </w:rPr>
-      </w:pPr>
-      <w:r>
-        <w:t>However, to date c</w:t>
-      </w:r>
-      <w:r>
-        <w:rPr>
-          <w:rFonts w:ascii="Garamond" w:hAnsi="Garamond"/>
-          <w:sz w:val="20"/>
-          <w:szCs w:val="20"/>
-        </w:rPr>
-        <w:t xml:space="preserve">urrent methods for estimating provenance, including genetic stock identification, lack the required spatial resolution to </w:t>
-      </w:r>
-      <w:r>
-        <w:rPr>
-          <w:rFonts w:ascii="Garamond" w:hAnsi="Garamond"/>
-          <w:sz w:val="20"/>
-          <w:szCs w:val="20"/>
-        </w:rPr>
-        <w:t xml:space="preserve">link marine caught fish to provenance within the freshwater ecosystem and therefore evaluate the stock of origin </w:t>
-      </w:r>
-    </w:p>
-    <w:p>
-      <w:pPr>
-        <w:pStyle w:val="NormalWeb"/>
-        <w:spacing w:line="480" w:lineRule="auto"/>
-        <w:ind w:firstLine="720"/>
-        <w:rPr>
-          <w:rFonts w:ascii="Garamond" w:hAnsi="Garamond"/>
-          <w:sz w:val="20"/>
-          <w:szCs w:val="20"/>
-        </w:rPr>
-      </w:pPr>
-    </w:p>
-    <w:p>
-      <w:pPr>
-        <w:pStyle w:val="NormalWeb"/>
-        <w:spacing w:line="480" w:lineRule="auto"/>
-        <w:ind w:firstLine="720"/>
-        <w:rPr>
-          <w:rFonts w:ascii="Garamond" w:hAnsi="Garamond"/>
-          <w:sz w:val="20"/>
-          <w:szCs w:val="20"/>
-        </w:rPr>
-      </w:pPr>
-      <w:r>
-        <w:rPr>
-          <w:rFonts w:ascii="Garamond" w:hAnsi="Garamond"/>
-          <w:sz w:val="20"/>
-          <w:szCs w:val="20"/>
-        </w:rPr>
-        <w:t xml:space="preserve">As such, current tools are poorly suited to evaluate the role of marine mortality on river- or stock-specific population health, hampering the ability to more completely evaluate the impacts of marine hypotheses on stock health in Western Alaska. </w:t>
-      </w:r>
-    </w:p>
-    <w:p>
-      <w:pPr>
-        <w:pStyle w:val="NormalWeb"/>
-        <w:spacing w:line="480" w:lineRule="auto"/>
-        <w:rPr>
-          <w:rFonts w:ascii="Garamond" w:hAnsi="Garamond"/>
-          <w:sz w:val="20"/>
-          <w:szCs w:val="20"/>
-        </w:rPr>
-      </w:pPr>
-      <w:r>
-        <w:tab/>
-      </w:r>
-      <w:r>
-        <w:rPr>
-          <w:rFonts w:ascii="Garamond" w:hAnsi="Garamond"/>
-          <w:sz w:val="20"/>
-          <w:szCs w:val="20"/>
-        </w:rPr>
-        <w:t>Isotope-based methods can be powerful tools for estimating provenance and can achieve high precision in systems with significant isotopic heterogeneity. Otoliths, or ear stones found in fishes, continuously record isotopic and chemical signals from their environment into a metabolically inert calcium carbonate structure as the fish grows. These signals can then be analyzed post mortem to extract a chronological archive of life history characteristics over the fish's life. For provenance applications, the strontium isotope ratio Sr87/Sr86 is particularly powerful as it is faithfully incorporated into the otolith structure, is temporally stable in many systems, and is heterogeneously distributed in geologically diverse watersheds. Sr87/86 ratios from discrete time periods of interest (e.g., freshwater rearing period) can be related to landscape values to estimate geographic origin</w:t>
-      </w:r>
-      <w:r>
-        <w:rPr>
-          <w:rFonts w:ascii="Garamond" w:hAnsi="Garamond"/>
-          <w:sz w:val="20"/>
-          <w:szCs w:val="20"/>
-        </w:rPr>
-        <w:t xml:space="preserve">. Patterns in these data contain information about life history characteristics including rearing environments, relative growth among environments and between years, migration routes, and maternal migration patterns. In some cases, otolith data contain distinct sequential states that can be directly compared to landscape values to reconstruct migration routes. However, when movement through multiple environments occurs too quickly for the otolith to fully incorporate each environmental signal, as is often the case for </w:t>
-      </w:r>
-      <w:proofErr w:type="spellStart"/>
-      <w:r>
-        <w:rPr>
-          <w:rFonts w:ascii="Garamond" w:hAnsi="Garamond"/>
-          <w:sz w:val="20"/>
-          <w:szCs w:val="20"/>
-        </w:rPr>
-        <w:t>outmigrating</w:t>
-      </w:r>
-      <w:proofErr w:type="spellEnd"/>
-      <w:r>
-        <w:rPr>
-          <w:rFonts w:ascii="Garamond" w:hAnsi="Garamond"/>
-          <w:sz w:val="20"/>
-          <w:szCs w:val="20"/>
-        </w:rPr>
-        <w:t xml:space="preserve"> salmon, patterns</w:t>
-      </w:r>
-      <w:r>
-        <w:rPr>
-          <w:rFonts w:ascii="Garamond" w:hAnsi="Garamond"/>
-          <w:sz w:val="20"/>
-          <w:szCs w:val="20"/>
-        </w:rPr>
-        <w:t xml:space="preserve"> in the data reflecting </w:t>
-      </w:r>
-      <w:r>
-        <w:rPr>
-          <w:rFonts w:ascii="Garamond" w:hAnsi="Garamond"/>
-          <w:sz w:val="20"/>
-          <w:szCs w:val="20"/>
-        </w:rPr>
-        <w:t xml:space="preserve">migration </w:t>
-      </w:r>
-      <w:r>
-        <w:rPr>
-          <w:rFonts w:ascii="Garamond" w:hAnsi="Garamond"/>
-          <w:sz w:val="20"/>
-          <w:szCs w:val="20"/>
-        </w:rPr>
-        <w:t xml:space="preserve">routes </w:t>
-      </w:r>
-      <w:r>
-        <w:rPr>
-          <w:rFonts w:ascii="Garamond" w:hAnsi="Garamond"/>
-          <w:sz w:val="20"/>
-          <w:szCs w:val="20"/>
-        </w:rPr>
-        <w:t>cannot be directly compared to landscape values.</w:t>
-      </w:r>
-      <w:r>
-        <w:rPr>
-          <w:rFonts w:ascii="Garamond" w:hAnsi="Garamond"/>
-          <w:sz w:val="20"/>
-          <w:szCs w:val="20"/>
-        </w:rPr>
-        <w:t xml:space="preserve"> </w:t>
-      </w:r>
-    </w:p>
-    <w:p>
-      <w:pPr>
-        <w:pStyle w:val="NormalWeb"/>
-        <w:spacing w:line="480" w:lineRule="auto"/>
-        <w:rPr>
-          <w:rFonts w:ascii="Garamond" w:hAnsi="Garamond"/>
-          <w:sz w:val="20"/>
-          <w:szCs w:val="20"/>
-        </w:rPr>
-      </w:pPr>
-      <w:r>
-        <w:rPr>
-          <w:rFonts w:ascii="Garamond" w:hAnsi="Garamond"/>
-          <w:sz w:val="20"/>
-          <w:szCs w:val="20"/>
-        </w:rPr>
-        <w:tab/>
-      </w:r>
-      <w:r>
-        <w:rPr>
-          <w:rFonts w:ascii="Garamond" w:hAnsi="Garamond"/>
-          <w:sz w:val="20"/>
-          <w:szCs w:val="20"/>
-        </w:rPr>
-        <w:t xml:space="preserve">In Western Alaska, these methods have been used to estimate provenance of Chinook and sockeye salmon to the tributary or sub-basin scale within large watersheds. However, for fish caught in the marine environment, isotope ratio heterogeneity is insufficient relative to the spatial scale of potential habitat. Estimates of provenance using natal </w:t>
-      </w:r>
-      <w:r>
-        <w:rPr>
-          <w:rFonts w:ascii="Garamond" w:hAnsi="Garamond"/>
-          <w:sz w:val="20"/>
-          <w:szCs w:val="20"/>
-        </w:rPr>
-        <w:lastRenderedPageBreak/>
-        <w:t xml:space="preserve">origin Sr87/86 cannot reliably distinguish among habitats with similar isotope ratios, introducing significant error into provenance assignments and precluding the use of this method for marine-caught fish. Fish from natal rearing regions with similar Sr87/86 values but from different areas of the watershed experience different migration routes as they </w:t>
-      </w:r>
-      <w:proofErr w:type="spellStart"/>
-      <w:r>
-        <w:rPr>
-          <w:rFonts w:ascii="Garamond" w:hAnsi="Garamond"/>
-          <w:sz w:val="20"/>
-          <w:szCs w:val="20"/>
-        </w:rPr>
-        <w:t>outmigrate</w:t>
-      </w:r>
-      <w:proofErr w:type="spellEnd"/>
-      <w:r>
-        <w:rPr>
-          <w:rFonts w:ascii="Garamond" w:hAnsi="Garamond"/>
-          <w:sz w:val="20"/>
-          <w:szCs w:val="20"/>
-        </w:rPr>
-        <w:t xml:space="preserve"> to the ocean. As a result, although natal origin Sr87/86 values may be indistinguishable, there may be stock-specific or watershed-specific patterns in the remaining otolith data that can distinguish among rivers.</w:t>
-      </w:r>
-    </w:p>
-    <w:p>
-      <w:pPr>
-        <w:pStyle w:val="NormalWeb"/>
-        <w:spacing w:line="480" w:lineRule="auto"/>
-        <w:rPr>
-          <w:rFonts w:ascii="Garamond" w:hAnsi="Garamond"/>
-          <w:sz w:val="20"/>
-          <w:szCs w:val="20"/>
-        </w:rPr>
-      </w:pPr>
-      <w:r>
-        <w:rPr>
-          <w:rFonts w:ascii="Garamond" w:hAnsi="Garamond"/>
-          <w:sz w:val="20"/>
-          <w:szCs w:val="20"/>
-        </w:rPr>
-        <w:tab/>
-      </w:r>
-      <w:r>
-        <w:rPr>
-          <w:rFonts w:ascii="Garamond" w:hAnsi="Garamond"/>
-          <w:sz w:val="20"/>
-          <w:szCs w:val="20"/>
-        </w:rPr>
-        <w:t>The use of machine learning in ecological applications has increased dramatically in recent years due to the ability of these methods to identify patterns in complex datasets. There is growing interest in applying these methods to otolith isotope-based applications and in harnessing information from the full otolith dataset to distinguish among life history types and characteristics. However, it has not been explored whether machine learning tools applied to otolith timeseries data can distinguish among individuals with the same natal origin values but different watersheds of origin. Here, we apply machine learning methods to explore this utility and develop a model to classify marine-caught fish of unknown origin to their river of origin in Western Alaska.</w:t>
-      </w:r>
-    </w:p>
-    <w:p>
-      <w:pPr>
-        <w:rPr>
-          <w:rFonts w:ascii="Garamond" w:hAnsi="Garamond"/>
-          <w:sz w:val="22"/>
-          <w:szCs w:val="22"/>
-        </w:rPr>
-      </w:pPr>
-    </w:p>
-    <w:p>
-      <w:pPr>
-        <w:rPr>
-          <w:rFonts w:ascii="Garamond" w:hAnsi="Garamond"/>
-          <w:sz w:val="22"/>
-          <w:szCs w:val="22"/>
-        </w:rPr>
-      </w:pPr>
     </w:p>
     <w:p>
       <w:pPr>

</xml_diff>

<commit_message>
started on results but waiting on conversation with Daniel, valentina, figures
</commit_message>
<xml_diff>
--- a/Docs/Machine learning applied to otolith timeseries data to discriminate river of origin for Western Alaska Salmon.docx
+++ b/Docs/Machine learning applied to otolith timeseries data to discriminate river of origin for Western Alaska Salmon.docx
@@ -2344,14 +2344,6 @@
           <w:bCs/>
         </w:rPr>
       </w:pPr>
-      <w:r>
-        <w:rPr>
-          <w:rFonts w:ascii="Garamond" w:hAnsi="Garamond"/>
-          <w:b/>
-          <w:bCs/>
-        </w:rPr>
-        <w:t xml:space="preserve">Model Performance </w:t>
-      </w:r>
     </w:p>
     <w:p>
       <w:pPr>
@@ -2360,13 +2352,17 @@
         </w:tabs>
         <w:rPr>
           <w:rFonts w:ascii="Garamond" w:hAnsi="Garamond"/>
-        </w:rPr>
-      </w:pPr>
-      <w:r>
-        <w:rPr>
-          <w:rFonts w:ascii="Garamond" w:hAnsi="Garamond"/>
-        </w:rPr>
-        <w:t xml:space="preserve">Classification accuracy on the full testing set ranged from 78.1% to 92.7%, with the highest  </w:t>
+          <w:b/>
+          <w:bCs/>
+        </w:rPr>
+      </w:pPr>
+      <w:r>
+        <w:rPr>
+          <w:rFonts w:ascii="Garamond" w:hAnsi="Garamond"/>
+          <w:b/>
+          <w:bCs/>
+        </w:rPr>
+        <w:t xml:space="preserve">Model Performance </w:t>
       </w:r>
     </w:p>
     <w:p>
@@ -2374,10 +2370,11 @@
         <w:tabs>
           <w:tab w:val="left" w:pos="3088"/>
         </w:tabs>
-        <w:rPr>
-          <w:rFonts w:ascii="Garamond" w:hAnsi="Garamond"/>
-          <w:b/>
-          <w:bCs/>
+        <w:spacing w:line="480" w:lineRule="auto"/>
+        <w:rPr>
+          <w:rFonts w:ascii="Garamond" w:hAnsi="Garamond"/>
+          <w:sz w:val="22"/>
+          <w:szCs w:val="22"/>
         </w:rPr>
       </w:pPr>
     </w:p>
@@ -2386,19 +2383,98 @@
         <w:tabs>
           <w:tab w:val="left" w:pos="3088"/>
         </w:tabs>
-        <w:rPr>
-          <w:rFonts w:ascii="Garamond" w:hAnsi="Garamond"/>
-          <w:b/>
-          <w:bCs/>
-        </w:rPr>
-      </w:pPr>
-      <w:r>
-        <w:rPr>
-          <w:rFonts w:ascii="Garamond" w:hAnsi="Garamond"/>
-          <w:b/>
-          <w:bCs/>
-        </w:rPr>
-        <w:t xml:space="preserve">Timeseries feature importance </w:t>
+        <w:spacing w:line="480" w:lineRule="auto"/>
+        <w:rPr>
+          <w:rFonts w:ascii="Garamond" w:hAnsi="Garamond"/>
+          <w:sz w:val="22"/>
+          <w:szCs w:val="22"/>
+        </w:rPr>
+      </w:pPr>
+      <w:r>
+        <w:rPr>
+          <w:rFonts w:ascii="Garamond" w:hAnsi="Garamond"/>
+          <w:sz w:val="22"/>
+          <w:szCs w:val="22"/>
+        </w:rPr>
+        <w:t>Classification accuracy on the full testing set ranged from 78.1% to 92.7%, with the highest classification accuracy coming from the Random Forest model on the GAM-smoothed dataset. Both smoothed datasets significantly outperformed the raw data, indicating that noisiness in the raw data may be impacting model performance.</w:t>
+      </w:r>
+      <w:r>
+        <w:rPr>
+          <w:rFonts w:ascii="Garamond" w:hAnsi="Garamond"/>
+          <w:sz w:val="22"/>
+          <w:szCs w:val="22"/>
+        </w:rPr>
+        <w:t xml:space="preserve"> Among models, KNN </w:t>
+      </w:r>
+      <w:proofErr w:type="spellStart"/>
+      <w:r>
+        <w:rPr>
+          <w:rFonts w:ascii="Garamond" w:hAnsi="Garamond"/>
+          <w:sz w:val="22"/>
+          <w:szCs w:val="22"/>
+        </w:rPr>
+        <w:t>consistantly</w:t>
+      </w:r>
+      <w:proofErr w:type="spellEnd"/>
+      <w:r>
+        <w:rPr>
+          <w:rFonts w:ascii="Garamond" w:hAnsi="Garamond"/>
+          <w:sz w:val="22"/>
+          <w:szCs w:val="22"/>
+        </w:rPr>
+        <w:t xml:space="preserve"> underperformed both Random Forest and Support Vector Machines, with the lowest classification accuracy across the dataset found on KNN applied to the unsmoothed dataset </w:t>
+      </w:r>
+      <w:proofErr w:type="gramStart"/>
+      <w:r>
+        <w:rPr>
+          <w:rFonts w:ascii="Garamond" w:hAnsi="Garamond"/>
+          <w:sz w:val="22"/>
+          <w:szCs w:val="22"/>
+        </w:rPr>
+        <w:t>( 71.9% )</w:t>
+      </w:r>
+      <w:proofErr w:type="gramEnd"/>
+      <w:r>
+        <w:rPr>
+          <w:rFonts w:ascii="Garamond" w:hAnsi="Garamond"/>
+          <w:sz w:val="22"/>
+          <w:szCs w:val="22"/>
+        </w:rPr>
+        <w:t xml:space="preserve">. In most cases the random forest classifier preformed the best, a result that is not </w:t>
+      </w:r>
+      <w:r>
+        <w:rPr>
+          <w:rFonts w:ascii="Garamond" w:hAnsi="Garamond"/>
+          <w:sz w:val="22"/>
+          <w:szCs w:val="22"/>
+        </w:rPr>
+        <w:t>surprising</w:t>
+      </w:r>
+      <w:r>
+        <w:rPr>
+          <w:rFonts w:ascii="Garamond" w:hAnsi="Garamond"/>
+          <w:sz w:val="22"/>
+          <w:szCs w:val="22"/>
+        </w:rPr>
+        <w:t xml:space="preserve"> given </w:t>
+      </w:r>
+      <w:proofErr w:type="spellStart"/>
+      <w:r>
+        <w:rPr>
+          <w:rFonts w:ascii="Garamond" w:hAnsi="Garamond"/>
+          <w:sz w:val="22"/>
+          <w:szCs w:val="22"/>
+        </w:rPr>
+        <w:t>given</w:t>
+      </w:r>
+      <w:proofErr w:type="spellEnd"/>
+      <w:r>
+        <w:rPr>
+          <w:rFonts w:ascii="Garamond" w:hAnsi="Garamond"/>
+          <w:sz w:val="22"/>
+          <w:szCs w:val="22"/>
+        </w:rPr>
+        <w:t xml:space="preserve"> the ensemble nature of Random Forest, which tends to be robust to noise and performs well on complex datasets</w:t>
       </w:r>
     </w:p>
     <w:p>
@@ -2408,8 +2484,6 @@
         </w:tabs>
         <w:rPr>
           <w:rFonts w:ascii="Garamond" w:hAnsi="Garamond"/>
-          <w:b/>
-          <w:bCs/>
         </w:rPr>
       </w:pPr>
     </w:p>
@@ -2420,17 +2494,13 @@
         </w:tabs>
         <w:rPr>
           <w:rFonts w:ascii="Garamond" w:hAnsi="Garamond"/>
-          <w:b/>
-          <w:bCs/>
-        </w:rPr>
-      </w:pPr>
-      <w:r>
-        <w:rPr>
-          <w:rFonts w:ascii="Garamond" w:hAnsi="Garamond"/>
-          <w:b/>
-          <w:bCs/>
-        </w:rPr>
-        <w:t xml:space="preserve">Probability tuning </w:t>
+        </w:rPr>
+      </w:pPr>
+      <w:r>
+        <w:rPr>
+          <w:rFonts w:ascii="Garamond" w:hAnsi="Garamond"/>
+        </w:rPr>
+        <w:t xml:space="preserve"> </w:t>
       </w:r>
     </w:p>
     <w:p>
@@ -2440,8 +2510,8 @@
         </w:tabs>
         <w:rPr>
           <w:rFonts w:ascii="Garamond" w:hAnsi="Garamond"/>
-          <w:sz w:val="32"/>
-          <w:szCs w:val="32"/>
+          <w:b/>
+          <w:bCs/>
         </w:rPr>
       </w:pPr>
     </w:p>
@@ -2452,6 +2522,114 @@
         </w:tabs>
         <w:rPr>
           <w:rFonts w:ascii="Garamond" w:hAnsi="Garamond"/>
+          <w:b/>
+          <w:bCs/>
+        </w:rPr>
+      </w:pPr>
+      <w:r>
+        <w:rPr>
+          <w:rFonts w:ascii="Garamond" w:hAnsi="Garamond"/>
+          <w:b/>
+          <w:bCs/>
+        </w:rPr>
+        <w:t xml:space="preserve">Timeseries feature importance </w:t>
+      </w:r>
+    </w:p>
+    <w:p>
+      <w:pPr>
+        <w:tabs>
+          <w:tab w:val="left" w:pos="3088"/>
+        </w:tabs>
+        <w:rPr>
+          <w:rFonts w:ascii="Garamond" w:hAnsi="Garamond"/>
+          <w:b/>
+          <w:bCs/>
+        </w:rPr>
+      </w:pPr>
+    </w:p>
+    <w:p>
+      <w:pPr>
+        <w:tabs>
+          <w:tab w:val="left" w:pos="3088"/>
+        </w:tabs>
+        <w:rPr>
+          <w:rFonts w:ascii="Garamond" w:hAnsi="Garamond"/>
+          <w:b/>
+          <w:bCs/>
+        </w:rPr>
+      </w:pPr>
+    </w:p>
+    <w:p>
+      <w:pPr>
+        <w:tabs>
+          <w:tab w:val="left" w:pos="3088"/>
+        </w:tabs>
+        <w:rPr>
+          <w:rFonts w:ascii="Garamond" w:hAnsi="Garamond"/>
+          <w:b/>
+          <w:bCs/>
+        </w:rPr>
+      </w:pPr>
+    </w:p>
+    <w:p>
+      <w:pPr>
+        <w:tabs>
+          <w:tab w:val="left" w:pos="3088"/>
+        </w:tabs>
+        <w:rPr>
+          <w:rFonts w:ascii="Garamond" w:hAnsi="Garamond"/>
+          <w:b/>
+          <w:bCs/>
+        </w:rPr>
+      </w:pPr>
+      <w:r>
+        <w:rPr>
+          <w:rFonts w:ascii="Garamond" w:hAnsi="Garamond"/>
+          <w:b/>
+          <w:bCs/>
+        </w:rPr>
+        <w:t xml:space="preserve">Probability tuning </w:t>
+      </w:r>
+    </w:p>
+    <w:p>
+      <w:pPr>
+        <w:tabs>
+          <w:tab w:val="left" w:pos="3088"/>
+        </w:tabs>
+        <w:rPr>
+          <w:rFonts w:ascii="Garamond" w:hAnsi="Garamond"/>
+          <w:b/>
+          <w:bCs/>
+        </w:rPr>
+      </w:pPr>
+    </w:p>
+    <w:p>
+      <w:pPr>
+        <w:tabs>
+          <w:tab w:val="left" w:pos="3088"/>
+        </w:tabs>
+        <w:rPr>
+          <w:rFonts w:ascii="Garamond" w:hAnsi="Garamond"/>
+          <w:b/>
+          <w:bCs/>
+        </w:rPr>
+      </w:pPr>
+      <w:r>
+        <w:rPr>
+          <w:rFonts w:ascii="Garamond" w:hAnsi="Garamond"/>
+          <w:b/>
+          <w:bCs/>
+        </w:rPr>
+        <w:t xml:space="preserve">Thresholding impacts. </w:t>
+      </w:r>
+    </w:p>
+    <w:p>
+      <w:pPr>
+        <w:tabs>
+          <w:tab w:val="left" w:pos="3088"/>
+        </w:tabs>
+        <w:rPr>
+          <w:rFonts w:ascii="Garamond" w:hAnsi="Garamond"/>
           <w:sz w:val="32"/>
           <w:szCs w:val="32"/>
         </w:rPr>
@@ -2473,12 +2651,31 @@
           <w:szCs w:val="32"/>
         </w:rPr>
       </w:pPr>
-      <w:r>
+    </w:p>
+    <w:p>
+      <w:pPr>
         <w:rPr>
           <w:rFonts w:ascii="Garamond" w:hAnsi="Garamond"/>
           <w:sz w:val="32"/>
           <w:szCs w:val="32"/>
         </w:rPr>
+      </w:pPr>
+    </w:p>
+    <w:p>
+      <w:pPr>
+        <w:rPr>
+          <w:rFonts w:ascii="Garamond" w:hAnsi="Garamond"/>
+          <w:sz w:val="32"/>
+          <w:szCs w:val="32"/>
+        </w:rPr>
+      </w:pPr>
+      <w:r>
+        <w:rPr>
+          <w:rFonts w:ascii="Garamond" w:hAnsi="Garamond"/>
+          <w:sz w:val="32"/>
+          <w:szCs w:val="32"/>
+        </w:rPr>
+        <w:lastRenderedPageBreak/>
         <w:t xml:space="preserve">Discussion </w:t>
       </w:r>
     </w:p>

</xml_diff>

<commit_message>
worked my way through part of the intro, lots of work to do
</commit_message>
<xml_diff>
--- a/Docs/Machine learning applied to otolith timeseries data to discriminate river of origin for Western Alaska Salmon.docx
+++ b/Docs/Machine learning applied to otolith timeseries data to discriminate river of origin for Western Alaska Salmon.docx
@@ -125,145 +125,71 @@
           <w:sz w:val="22"/>
           <w:szCs w:val="22"/>
         </w:rPr>
-        <w:t xml:space="preserve">Recent rapid advances in the power and availability of </w:t>
-      </w:r>
-      <w:r>
-        <w:rPr>
-          <w:rFonts w:ascii="Garamond" w:hAnsi="Garamond"/>
-          <w:sz w:val="22"/>
-          <w:szCs w:val="22"/>
-        </w:rPr>
-        <w:t xml:space="preserve">machine learning </w:t>
-      </w:r>
-      <w:r>
-        <w:rPr>
-          <w:rFonts w:ascii="Garamond" w:hAnsi="Garamond"/>
-          <w:sz w:val="22"/>
-          <w:szCs w:val="22"/>
-        </w:rPr>
-        <w:t>tools have revolutionized the ability to collect, interpret, and analyze complex and multidimensional datasets across disciplines</w:t>
-      </w:r>
-      <w:r>
-        <w:rPr>
-          <w:rFonts w:ascii="Garamond" w:hAnsi="Garamond"/>
-          <w:sz w:val="22"/>
-          <w:szCs w:val="22"/>
-        </w:rPr>
-        <w:t xml:space="preserve"> </w:t>
-      </w:r>
-      <w:r>
-        <w:rPr>
-          <w:rFonts w:ascii="Garamond" w:hAnsi="Garamond"/>
-          <w:sz w:val="22"/>
-          <w:szCs w:val="22"/>
-        </w:rPr>
-        <w:fldChar w:fldCharType="begin"/>
-      </w:r>
-      <w:r>
-        <w:rPr>
-          <w:rFonts w:ascii="Garamond" w:hAnsi="Garamond"/>
-          <w:sz w:val="22"/>
-          <w:szCs w:val="22"/>
-        </w:rPr>
-        <w:instrText xml:space="preserve"> ADDIN ZOTERO_ITEM CSL_CITATION {"citationID":"hAKyMnYj","properties":{"formattedCitation":"(Jordan &amp; Mitchell, 2015)","plainCitation":"(Jordan &amp; Mitchell, 2015)","noteIndex":0},"citationItems":[{"id":5625,"uris":["http://zotero.org/users/8421274/items/JN9KDS24"],"itemData":{"id":5625,"type":"article-journal","abstract":"Machine learning addresses the question of how to build computers that improve automatically through experience. It is one of today’s most rapidly growing technical fields, lying at the intersection of computer science and statistics, and at the core of artificial intelligence and data science. Recent progress in machine learning has been driven both by the development of new learning algorithms and theory and by the ongoing explosion in the availability of online data and low-cost computation. The adoption of data-intensive machine-learning methods can be found throughout science, technology and commerce, leading to more evidence-based decision-making across many walks of life, including health care, manufacturing, education, financial modeling, policing, and marketing.","container-title":"Science","DOI":"10.1126/science.aaa8415","issue":"6245","note":"publisher: American Association for the Advancement of Science","page":"255-260","source":"www-science-org.offcampus.lib.washington.edu (Atypon)","title":"Machine learning: Trends, perspectives, and prospects","title-short":"Machine learning","volume":"349","author":[{"family":"Jordan","given":"M. I."},{"family":"Mitchell","given":"T. M."}],"issued":{"date-parts":[["2015",7,17]]}}}],"schema":"https://github.com/citation-style-language/schema/raw/master/csl-citation.json"} </w:instrText>
-      </w:r>
-      <w:r>
-        <w:rPr>
-          <w:rFonts w:ascii="Garamond" w:hAnsi="Garamond"/>
-          <w:sz w:val="22"/>
-          <w:szCs w:val="22"/>
-        </w:rPr>
-        <w:fldChar w:fldCharType="separate"/>
-      </w:r>
-      <w:r>
-        <w:rPr>
-          <w:rFonts w:ascii="Garamond" w:hAnsi="Garamond"/>
-          <w:noProof/>
-          <w:sz w:val="22"/>
-          <w:szCs w:val="22"/>
-        </w:rPr>
-        <w:t>(Jordan &amp; Mitchell, 2015)</w:t>
-      </w:r>
-      <w:r>
-        <w:rPr>
-          <w:rFonts w:ascii="Garamond" w:hAnsi="Garamond"/>
-          <w:sz w:val="22"/>
-          <w:szCs w:val="22"/>
-        </w:rPr>
-        <w:fldChar w:fldCharType="end"/>
-      </w:r>
-      <w:r>
-        <w:rPr>
-          <w:rFonts w:ascii="Garamond" w:hAnsi="Garamond"/>
-          <w:sz w:val="22"/>
-          <w:szCs w:val="22"/>
-        </w:rPr>
-        <w:t>. The application of these tools to ecological research ha</w:t>
-      </w:r>
-      <w:r>
-        <w:rPr>
-          <w:rFonts w:ascii="Garamond" w:hAnsi="Garamond"/>
-          <w:sz w:val="22"/>
-          <w:szCs w:val="22"/>
-        </w:rPr>
-        <w:t>s</w:t>
-      </w:r>
-      <w:r>
-        <w:rPr>
-          <w:rFonts w:ascii="Garamond" w:hAnsi="Garamond"/>
-          <w:sz w:val="22"/>
-          <w:szCs w:val="22"/>
-        </w:rPr>
-        <w:t xml:space="preserve"> been particularly powerful in uncovering novel insights from the characteristically messy datasets common to environmental science</w:t>
-      </w:r>
-      <w:r>
-        <w:rPr>
-          <w:rFonts w:ascii="Garamond" w:hAnsi="Garamond"/>
-          <w:sz w:val="22"/>
-          <w:szCs w:val="22"/>
-        </w:rPr>
-        <w:t xml:space="preserve"> </w:t>
-      </w:r>
-      <w:r>
-        <w:rPr>
-          <w:rFonts w:ascii="Garamond" w:hAnsi="Garamond"/>
-          <w:sz w:val="22"/>
-          <w:szCs w:val="22"/>
-        </w:rPr>
-        <w:fldChar w:fldCharType="begin"/>
-      </w:r>
-      <w:r>
-        <w:rPr>
-          <w:rFonts w:ascii="Garamond" w:hAnsi="Garamond"/>
-          <w:sz w:val="22"/>
-          <w:szCs w:val="22"/>
-        </w:rPr>
-        <w:instrText xml:space="preserve"> ADDIN ZOTERO_ITEM CSL_CITATION {"citationID":"fArRVoWn","properties":{"formattedCitation":"(Peters et al., 2014; Pichler &amp; Hartig, 2022)","plainCitation":"(Peters et al., 2014; Pichler &amp; Hartig, 2022)","noteIndex":0},"citationItems":[{"id":5632,"uris":["http://zotero.org/users/8421274/items/8P8UTT5H"],"itemData":{"id":5632,"type":"article-journal","abstract":"Most efforts to harness the power of big data for ecology and environmental sciences focus on data and metadata sharing, standardization, and accuracy. However, many scientists have not accepted the data deluge as an integral part of their research because the current scientific method is not scalable to large, complex datasets. Here, we explain how integrating a data-intensive, machine learning approach with a hypothesis-driven, mechanistic approach can lead to a novel knowledge, learning, analysis system (KLAS) for discovery and problem solving. Machine learning leads to more efficient, user-friendly analytics as the streams of data increase while hypothesis-driven decisions lead to the strategic design of experiments to fill knowledge gaps and to elucidate mechanisms. KLAS will transform ecology and environmental sciences by shortening the time lag between individual discoveries and leaps in knowledge by the scientific community, and will lead to paradigm shifts predicated on open access data and analytics in a machine learning environment.","container-title":"ECOSPHERE","DOI":"10.1890/ES13-00359.1","ISSN":"2150-8925","issue":"6","journalAbbreviation":"Ecosphere","language":"English","note":"number-of-pages: 15\npublisher-place: Hoboken\npublisher: Wiley\nWeb of Science ID: WOS:000338925000001","page":"67","source":"Clarivate Analytics Web of Science","title":"Harnessing the power of big data: infusing the scientific method with machine learning to transform ecology","title-short":"Harnessing the power of big data","volume":"5","author":[{"family":"Peters","given":"Debra P. C."},{"family":"Havstad","given":"Kris M."},{"family":"Cushing","given":"Judy"},{"family":"Tweedie","given":"Craig"},{"family":"Fuentes","given":"Olac"},{"family":"Villanueva-Rosales","given":"Natalia"}],"issued":{"date-parts":[["2014",6]]}}},{"id":3055,"uris":["http://zotero.org/users/8421274/items/8HIWJIVW"],"itemData":{"id":3055,"type":"article-journal","abstract":"The popularity of machine learning (ML), deep learning (DL) and artificial intelligence (AI) has risen sharply in recent years. Despite this spike in popularity, the inner workings of ML and DL algorithms are often perceived as opaque, and their relationship to classical data analysis tools remains debated. Although it is often assumed that ML and DL excel primarily at making predictions, ML and DL can also be used for analytical tasks traditionally addressed with statistical models. Moreover, most recent discussions and reviews on ML focus mainly on DL, failing to synthesise the wealth of ML algorithms with different advantages and general principles. Here, we provide a comprehensive overview of the field of ML and DL, starting by summarizing its historical developments, existing algorithm families, differences to traditional statistical tools, and universal ML principles. We then discuss why and when ML and DL models excel at prediction tasks and where they could offer alternatives to traditional statistical methods for inference, highlighting current and emerging applications for ecological problems. Finally, we summarize emerging trends such as scientific and causal ML, explainable AI, and responsible AI that may significantly impact ecological data analysis in the future. We conclude that ML and DL are powerful new tools for predictive modelling and data analysis. The superior performance of ML and DL algorithms compared to statistical models can be explained by their higher flexibility and automatic data-dependent complexity optimization. However, their use for causal inference is still disputed as the focus of ML and DL methods on predictions creates challenges for the interpretation of these models. Nevertheless, we expect ML and DL to become an indispensable tool in ecology and evolution, comparable to other traditional statistical tools.","container-title":"Methods in Ecology and Evolution","DOI":"10.1111/2041-210X.14061","ISSN":"2041-210X","issue":"n/a","language":"en","note":"_eprint: https://onlinelibrary.wiley.com/doi/pdf/10.1111/2041-210X.14061","source":"Wiley Online Library","title":"Machine learning and deep learning—A review for ecologists","URL":"https://onlinelibrary.wiley.com/doi/abs/10.1111/2041-210X.14061","volume":"n/a","author":[{"family":"Pichler","given":"Maximilian"},{"family":"Hartig","given":"Florian"}],"accessed":{"date-parts":[["2023",2,23]]},"issued":{"date-parts":[["2022",12,5]]}}}],"schema":"https://github.com/citation-style-language/schema/raw/master/csl-citation.json"} </w:instrText>
-      </w:r>
-      <w:r>
-        <w:rPr>
-          <w:rFonts w:ascii="Garamond" w:hAnsi="Garamond"/>
-          <w:sz w:val="22"/>
-          <w:szCs w:val="22"/>
-        </w:rPr>
-        <w:fldChar w:fldCharType="separate"/>
-      </w:r>
-      <w:r>
-        <w:rPr>
-          <w:rFonts w:ascii="Garamond" w:hAnsi="Garamond"/>
-          <w:noProof/>
-          <w:sz w:val="22"/>
-          <w:szCs w:val="22"/>
-        </w:rPr>
-        <w:t>(Peters et al., 2014; Pichler &amp; Hartig, 2022)</w:t>
-      </w:r>
-      <w:r>
-        <w:rPr>
-          <w:rFonts w:ascii="Garamond" w:hAnsi="Garamond"/>
-          <w:sz w:val="22"/>
-          <w:szCs w:val="22"/>
-        </w:rPr>
-        <w:fldChar w:fldCharType="end"/>
+        <w:t xml:space="preserve">Assessing the impact of environmental and anthropogenic changes </w:t>
+      </w:r>
+      <w:r>
+        <w:rPr>
+          <w:rFonts w:ascii="Garamond" w:hAnsi="Garamond"/>
+          <w:sz w:val="22"/>
+          <w:szCs w:val="22"/>
+        </w:rPr>
+        <w:t>to</w:t>
+      </w:r>
+      <w:r>
+        <w:rPr>
+          <w:rFonts w:ascii="Garamond" w:hAnsi="Garamond"/>
+          <w:sz w:val="22"/>
+          <w:szCs w:val="22"/>
+        </w:rPr>
+        <w:t xml:space="preserve"> ecosystems requires an explicit understanding of how these stressors are distributed across ecosystem components</w:t>
+      </w:r>
+      <w:r>
+        <w:rPr>
+          <w:rFonts w:ascii="Garamond" w:hAnsi="Garamond"/>
+          <w:sz w:val="22"/>
+          <w:szCs w:val="22"/>
+        </w:rPr>
+        <w:t xml:space="preserve">. To do so </w:t>
+      </w:r>
+      <w:r>
+        <w:rPr>
+          <w:rFonts w:ascii="Garamond" w:hAnsi="Garamond"/>
+          <w:sz w:val="22"/>
+          <w:szCs w:val="22"/>
+        </w:rPr>
+        <w:t xml:space="preserve">requires </w:t>
+      </w:r>
+      <w:r>
+        <w:rPr>
+          <w:rFonts w:ascii="Garamond" w:hAnsi="Garamond"/>
+          <w:sz w:val="22"/>
+          <w:szCs w:val="22"/>
+        </w:rPr>
+        <w:t xml:space="preserve">both a refined understanding of </w:t>
+      </w:r>
+      <w:r>
+        <w:rPr>
+          <w:rFonts w:ascii="Garamond" w:hAnsi="Garamond"/>
+          <w:sz w:val="22"/>
+          <w:szCs w:val="22"/>
+        </w:rPr>
+        <w:t xml:space="preserve">ecosystem function </w:t>
+      </w:r>
+      <w:r>
+        <w:rPr>
+          <w:rFonts w:ascii="Garamond" w:hAnsi="Garamond"/>
+          <w:sz w:val="22"/>
+          <w:szCs w:val="22"/>
+        </w:rPr>
+        <w:t xml:space="preserve">as well </w:t>
+      </w:r>
+      <w:r>
+        <w:rPr>
+          <w:rFonts w:ascii="Garamond" w:hAnsi="Garamond"/>
+          <w:sz w:val="22"/>
+          <w:szCs w:val="22"/>
+        </w:rPr>
+        <w:t>an assessment of how stressors vary across relevant spatial and temporal scales</w:t>
       </w:r>
       <w:r>
         <w:rPr>
@@ -279,281 +205,7 @@
           <w:sz w:val="22"/>
           <w:szCs w:val="22"/>
         </w:rPr>
-        <w:t xml:space="preserve">In </w:t>
-      </w:r>
-      <w:r>
-        <w:rPr>
-          <w:rFonts w:ascii="Garamond" w:hAnsi="Garamond"/>
-          <w:sz w:val="22"/>
-          <w:szCs w:val="22"/>
-        </w:rPr>
-        <w:t>fisheries sciences</w:t>
-      </w:r>
-      <w:r>
-        <w:rPr>
-          <w:rFonts w:ascii="Garamond" w:hAnsi="Garamond"/>
-          <w:sz w:val="22"/>
-          <w:szCs w:val="22"/>
-        </w:rPr>
-        <w:t xml:space="preserve">, the uptake of </w:t>
-      </w:r>
-      <w:r>
-        <w:rPr>
-          <w:rFonts w:ascii="Garamond" w:hAnsi="Garamond"/>
-          <w:sz w:val="22"/>
-          <w:szCs w:val="22"/>
-        </w:rPr>
-        <w:t xml:space="preserve">machine learning tools </w:t>
-      </w:r>
-      <w:r>
-        <w:rPr>
-          <w:rFonts w:ascii="Garamond" w:hAnsi="Garamond"/>
-          <w:sz w:val="22"/>
-          <w:szCs w:val="22"/>
-        </w:rPr>
-        <w:t>ha</w:t>
-      </w:r>
-      <w:r>
-        <w:rPr>
-          <w:rFonts w:ascii="Garamond" w:hAnsi="Garamond"/>
-          <w:sz w:val="22"/>
-          <w:szCs w:val="22"/>
-        </w:rPr>
-        <w:t>s</w:t>
-      </w:r>
-      <w:r>
-        <w:rPr>
-          <w:rFonts w:ascii="Garamond" w:hAnsi="Garamond"/>
-          <w:sz w:val="22"/>
-          <w:szCs w:val="22"/>
-        </w:rPr>
-        <w:t xml:space="preserve"> improved data collection (</w:t>
-      </w:r>
-      <w:r>
-        <w:rPr>
-          <w:rFonts w:ascii="Garamond" w:hAnsi="Garamond"/>
-          <w:sz w:val="22"/>
-          <w:szCs w:val="22"/>
-        </w:rPr>
-        <w:t>i.e.</w:t>
-      </w:r>
-      <w:r>
-        <w:rPr>
-          <w:rFonts w:ascii="Garamond" w:hAnsi="Garamond"/>
-          <w:sz w:val="22"/>
-          <w:szCs w:val="22"/>
-        </w:rPr>
-        <w:t xml:space="preserve"> image recognition and computer vision)</w:t>
-      </w:r>
-      <w:r>
-        <w:rPr>
-          <w:rFonts w:ascii="Garamond" w:hAnsi="Garamond"/>
-          <w:sz w:val="22"/>
-          <w:szCs w:val="22"/>
-        </w:rPr>
-        <w:t xml:space="preserve">, </w:t>
-      </w:r>
-      <w:r>
-        <w:rPr>
-          <w:rFonts w:ascii="Garamond" w:hAnsi="Garamond"/>
-          <w:sz w:val="22"/>
-          <w:szCs w:val="22"/>
-        </w:rPr>
-        <w:t xml:space="preserve">revolutionized predictive modeling, and </w:t>
-      </w:r>
-      <w:r>
-        <w:rPr>
-          <w:rFonts w:ascii="Garamond" w:hAnsi="Garamond"/>
-          <w:sz w:val="22"/>
-          <w:szCs w:val="22"/>
-        </w:rPr>
-        <w:t>allowed for novel insights from existing datasets</w:t>
-      </w:r>
-      <w:r>
-        <w:rPr>
-          <w:rFonts w:ascii="Garamond" w:hAnsi="Garamond"/>
-          <w:sz w:val="22"/>
-          <w:szCs w:val="22"/>
-        </w:rPr>
-        <w:t xml:space="preserve"> </w:t>
-      </w:r>
-      <w:r>
-        <w:rPr>
-          <w:rFonts w:ascii="Garamond" w:hAnsi="Garamond"/>
-          <w:sz w:val="22"/>
-          <w:szCs w:val="22"/>
-        </w:rPr>
-        <w:fldChar w:fldCharType="begin"/>
-      </w:r>
-      <w:r>
-        <w:rPr>
-          <w:rFonts w:ascii="Garamond" w:hAnsi="Garamond"/>
-          <w:sz w:val="22"/>
-          <w:szCs w:val="22"/>
-        </w:rPr>
-        <w:instrText xml:space="preserve"> ADDIN ZOTERO_ITEM CSL_CITATION {"citationID":"pJaMhPSf","properties":{"formattedCitation":"(Gladju et al., 2022; K\\uc0\\u252{}hn et al., 2024)","plainCitation":"(Gladju et al., 2022; Kühn et al., 2024)","noteIndex":0},"citationItems":[{"id":5633,"uris":["http://zotero.org/users/8421274/items/NIF7PTLP"],"itemData":{"id":5633,"type":"article-journal","abstract":"Aquaculture and fisheries sectors are finding ingenious ways to grow and meet the soaring human demand for nutrient-rich fish and seafood by efficiently utilizing the vast water resources and biodiversity of aquatic life on earth. This includes the progressive integration of information technology, data science and artificial intel-ligence with fishing and fish farming methods to enable intensification of aquaculture production, sustainable exploitation of natural fishery resources and mechanization-automation of allied activities. Exclusive data min-ing and machine learning systems are being developed to process complex datasets and perform intelligent tasks like analysing cause-effect associations, forecasting problems and providing smart-precision solutions for farming and catching fish. Considering the intensifying research and growing interest of stakeholders, in this review, we have consolidated basic information on the various practical applications of data mining and machine learning in aquaculture and fisheries domains from representative selection of scientific literature. This includes an overview of research and applications in (1) aquaculture activities such as monitoring and control of the production en-vironment, optimization of feed use, fish biomass monitoring and disease prevention; (2) fisheries management aspects such as resource assessment, fishing, catch monitoring and regulation; (3) environment monitoring related to hydrology, primary production and aquatic pollution; (4) automation of fish processing and quality assurance systems; and (5) fish market intelligence, price forecasting and socioeconomics. While aquaculture has been rel-atively faster in integrating data mining and machine learning tools with advanced farming systems, capture fisheries is finding reliable methods to sort the complexities in data collection and processing. Finally, we have pointed out some of the challenges and future perspectives related to large-scale adoption.","container-title":"SMART AGRICULTURAL TECHNOLOGY","DOI":"10.1016/j.atech.2022.100061","ISSN":"2772-3755","journalAbbreviation":"Smart Agric. Technol.","language":"English","note":"number-of-pages: 15\npublisher-place: Amsterdam\npublisher: Elsevier\nWeb of Science ID: WOS:001134374800002","page":"100061","source":"Clarivate Analytics Web of Science","title":"Applications of data mining and machine learning framework in aquaculture and fisheries: A review","title-short":"Applications of data mining and machine learning framework in aquaculture and fisheries","volume":"2","author":[{"family":"Gladju","given":"J."},{"family":"Kamalam","given":"Biju Sam"},{"family":"Kanagaraj","given":"A."}],"issued":{"date-parts":[["2022",12]]}}},{"id":4756,"uris":["http://zotero.org/users/8421274/items/FPURRU5M"],"itemData":{"id":4756,"type":"article-journal","abstract":"Fisheries science aims to understand and manage marine natural resources. It relies on resource-intensive sampling and data analysis. Within this context, the emergence of machine learning (ML) systems holds significant promise for understanding disparate components of these marine ecosystems and gaining a greater understanding of their dynamics. The goal of this paper is to present a review of ML applications in fisheries science. It highlights both their advantages over conventional approaches and their drawbacks, particularly in terms of operationality and possible robustness issues. This review is organized from small to large scales. It begins with genomics and subsequently expands to individuals (catch items), aggregations of different species in situ, on-board processing, stock/populations assessment and dynamics, spatial mapping, fishing-related organizational units, and finally ecosystem dynamics. Each field has its own set of challenges, such as pre-processing steps, the quantity and quality of training data, the necessity of appropriate model validation, and knowing where ML algorithms are more limited, and we discuss some of these discipline-specific challenges. The scope of discussion of applied methods ranges from conventional statistical methods to data-specific approaches that use a higher level of semantics. The paper concludes with the potential implications of ML applications on management decisions and a summary of the benefits and challenges of using these techniques in fisheries.","container-title":"Reviews in Fisheries Science &amp; Aquaculture","DOI":"10.1080/23308249.2024.2423189","ISSN":"2330-8249","issue":"0","note":"publisher: Taylor &amp; Francis\n_eprint: https://doi.org/10.1080/23308249.2024.2423189","page":"1-24","source":"Taylor and Francis+NEJM","title":"Machine Learning Applications for Fisheries—At Scales from Genomics to Ecosystems","volume":"0","author":[{"family":"Kühn","given":"Bernhard"},{"family":"Cayetano","given":"Arjay"},{"family":"Fincham","given":"Jennifer I."},{"family":"Moustahfid","given":"Hassan"},{"family":"Sokolova","given":"Maria"},{"family":"Trifonova","given":"Neda"},{"family":"Watson","given":"Jordan T."},{"family":"Fernandes-Salvador","given":"Jose A."},{"family":"Uusitalo","given":"Laura"}],"issued":{"date-parts":[["2024"]]}}}],"schema":"https://github.com/citation-style-language/schema/raw/master/csl-citation.json"} </w:instrText>
-      </w:r>
-      <w:r>
-        <w:rPr>
-          <w:rFonts w:ascii="Garamond" w:hAnsi="Garamond"/>
-          <w:sz w:val="22"/>
-          <w:szCs w:val="22"/>
-        </w:rPr>
-        <w:fldChar w:fldCharType="separate"/>
-      </w:r>
-      <w:r>
-        <w:rPr>
-          <w:rFonts w:ascii="Garamond" w:hAnsi="Garamond" w:cs="Times New Roman"/>
-          <w:kern w:val="0"/>
-          <w:sz w:val="22"/>
-        </w:rPr>
-        <w:t>(</w:t>
-      </w:r>
-      <w:proofErr w:type="spellStart"/>
-      <w:r>
-        <w:rPr>
-          <w:rFonts w:ascii="Garamond" w:hAnsi="Garamond" w:cs="Times New Roman"/>
-          <w:kern w:val="0"/>
-          <w:sz w:val="22"/>
-        </w:rPr>
-        <w:t>Gladju</w:t>
-      </w:r>
-      <w:proofErr w:type="spellEnd"/>
-      <w:r>
-        <w:rPr>
-          <w:rFonts w:ascii="Garamond" w:hAnsi="Garamond" w:cs="Times New Roman"/>
-          <w:kern w:val="0"/>
-          <w:sz w:val="22"/>
-        </w:rPr>
-        <w:t xml:space="preserve"> et al., 2022; Kühn et al., 2024)</w:t>
-      </w:r>
-      <w:r>
-        <w:rPr>
-          <w:rFonts w:ascii="Garamond" w:hAnsi="Garamond"/>
-          <w:sz w:val="22"/>
-          <w:szCs w:val="22"/>
-        </w:rPr>
-        <w:fldChar w:fldCharType="end"/>
-      </w:r>
-      <w:r>
-        <w:rPr>
-          <w:rFonts w:ascii="Garamond" w:hAnsi="Garamond"/>
-          <w:sz w:val="22"/>
-          <w:szCs w:val="22"/>
-        </w:rPr>
-        <w:fldChar w:fldCharType="begin"/>
-      </w:r>
-      <w:r>
-        <w:rPr>
-          <w:rFonts w:ascii="Garamond" w:hAnsi="Garamond"/>
-          <w:sz w:val="22"/>
-          <w:szCs w:val="22"/>
-        </w:rPr>
-        <w:instrText xml:space="preserve"> ADDIN ZOTERO_ITEM CSL_CITATION {"citationID":"i0m2U680","properties":{"formattedCitation":"(K\\uc0\\u252{}hn et al., 2024)","plainCitation":"(Kühn et al., 2024)","noteIndex":0},"citationItems":[{"id":4756,"uris":["http://zotero.org/users/8421274/items/FPURRU5M"],"itemData":{"id":4756,"type":"article-journal","abstract":"Fisheries science aims to understand and manage marine natural resources. It relies on resource-intensive sampling and data analysis. Within this context, the emergence of machine learning (ML) systems holds significant promise for understanding disparate components of these marine ecosystems and gaining a greater understanding of their dynamics. The goal of this paper is to present a review of ML applications in fisheries science. It highlights both their advantages over conventional approaches and their drawbacks, particularly in terms of operationality and possible robustness issues. This review is organized from small to large scales. It begins with genomics and subsequently expands to individuals (catch items), aggregations of different species in situ, on-board processing, stock/populations assessment and dynamics, spatial mapping, fishing-related organizational units, and finally ecosystem dynamics. Each field has its own set of challenges, such as pre-processing steps, the quantity and quality of training data, the necessity of appropriate model validation, and knowing where ML algorithms are more limited, and we discuss some of these discipline-specific challenges. The scope of discussion of applied methods ranges from conventional statistical methods to data-specific approaches that use a higher level of semantics. The paper concludes with the potential implications of ML applications on management decisions and a summary of the benefits and challenges of using these techniques in fisheries.","container-title":"Reviews in Fisheries Science &amp; Aquaculture","DOI":"10.1080/23308249.2024.2423189","ISSN":"2330-8249","issue":"0","note":"publisher: Taylor &amp; Francis\n_eprint: https://doi.org/10.1080/23308249.2024.2423189","page":"1-24","source":"Taylor and Francis+NEJM","title":"Machine Learning Applications for Fisheries—At Scales from Genomics to Ecosystems","volume":"0","author":[{"family":"Kühn","given":"Bernhard"},{"family":"Cayetano","given":"Arjay"},{"family":"Fincham","given":"Jennifer I."},{"family":"Moustahfid","given":"Hassan"},{"family":"Sokolova","given":"Maria"},{"family":"Trifonova","given":"Neda"},{"family":"Watson","given":"Jordan T."},{"family":"Fernandes-Salvador","given":"Jose A."},{"family":"Uusitalo","given":"Laura"}],"issued":{"date-parts":[["2024"]]}}}],"schema":"https://github.com/citation-style-language/schema/raw/master/csl-citation.json"} </w:instrText>
-      </w:r>
-      <w:r>
-        <w:rPr>
-          <w:rFonts w:ascii="Garamond" w:hAnsi="Garamond"/>
-          <w:sz w:val="22"/>
-          <w:szCs w:val="22"/>
-        </w:rPr>
-        <w:fldChar w:fldCharType="separate"/>
-      </w:r>
-      <w:r>
-        <w:rPr>
-          <w:rFonts w:ascii="Garamond" w:hAnsi="Garamond"/>
-          <w:sz w:val="22"/>
-          <w:szCs w:val="22"/>
-        </w:rPr>
-        <w:fldChar w:fldCharType="end"/>
-      </w:r>
-      <w:r>
-        <w:rPr>
-          <w:rFonts w:ascii="Garamond" w:hAnsi="Garamond"/>
-          <w:sz w:val="22"/>
-          <w:szCs w:val="22"/>
-        </w:rPr>
-        <w:t>.</w:t>
-      </w:r>
-      <w:r>
-        <w:rPr>
-          <w:rFonts w:ascii="Garamond" w:hAnsi="Garamond"/>
-          <w:sz w:val="22"/>
-          <w:szCs w:val="22"/>
-        </w:rPr>
-        <w:t xml:space="preserve"> </w:t>
-      </w:r>
-      <w:r>
-        <w:rPr>
-          <w:rFonts w:ascii="Garamond" w:hAnsi="Garamond"/>
-          <w:sz w:val="22"/>
-          <w:szCs w:val="22"/>
-        </w:rPr>
-        <w:t xml:space="preserve">As such, an </w:t>
-      </w:r>
-      <w:r>
-        <w:rPr>
-          <w:rFonts w:ascii="Garamond" w:hAnsi="Garamond"/>
-          <w:sz w:val="22"/>
-          <w:szCs w:val="22"/>
-        </w:rPr>
-        <w:t xml:space="preserve">expanding toolkit of machine learning methods </w:t>
-      </w:r>
-      <w:r>
-        <w:rPr>
-          <w:rFonts w:ascii="Garamond" w:hAnsi="Garamond"/>
-          <w:sz w:val="22"/>
-          <w:szCs w:val="22"/>
-        </w:rPr>
-        <w:t>is</w:t>
-      </w:r>
-      <w:r>
-        <w:rPr>
-          <w:rFonts w:ascii="Garamond" w:hAnsi="Garamond"/>
-          <w:sz w:val="22"/>
-          <w:szCs w:val="22"/>
-        </w:rPr>
-        <w:t xml:space="preserve"> empower</w:t>
-      </w:r>
-      <w:r>
-        <w:rPr>
-          <w:rFonts w:ascii="Garamond" w:hAnsi="Garamond"/>
-          <w:sz w:val="22"/>
-          <w:szCs w:val="22"/>
-        </w:rPr>
-        <w:t>ing</w:t>
-      </w:r>
-      <w:r>
-        <w:rPr>
-          <w:rFonts w:ascii="Garamond" w:hAnsi="Garamond"/>
-          <w:sz w:val="22"/>
-          <w:szCs w:val="22"/>
-        </w:rPr>
-        <w:t xml:space="preserve"> </w:t>
-      </w:r>
-      <w:r>
-        <w:rPr>
-          <w:rFonts w:ascii="Garamond" w:hAnsi="Garamond"/>
-          <w:sz w:val="22"/>
-          <w:szCs w:val="22"/>
-        </w:rPr>
-        <w:t xml:space="preserve">researchers to pursue novel approaches </w:t>
-      </w:r>
-      <w:r>
-        <w:rPr>
-          <w:rFonts w:ascii="Garamond" w:hAnsi="Garamond"/>
-          <w:sz w:val="22"/>
-          <w:szCs w:val="22"/>
-        </w:rPr>
-        <w:t xml:space="preserve">and accelerate efforts to address urgent challenges in </w:t>
-      </w:r>
-      <w:r>
-        <w:rPr>
-          <w:rFonts w:ascii="Garamond" w:hAnsi="Garamond"/>
-          <w:sz w:val="22"/>
-          <w:szCs w:val="22"/>
-        </w:rPr>
-        <w:t>fisheries sciences.</w:t>
+        <w:t>For expansive and dynamic ecosystems, exploring these effects at fine spatial scales can be challenging. However, aggregating population-level dynamics into ecosystem-level effects risks oversimplification and mischaracterization of threats to critical components of ecosystem health.</w:t>
       </w:r>
     </w:p>
     <w:p>
@@ -572,6 +224,1072 @@
           <w:sz w:val="22"/>
           <w:szCs w:val="22"/>
         </w:rPr>
+        <w:t xml:space="preserve">Watersheds in western Alaska have historically supported large Pacific salmon populations that sustain both commercial fisheries and subsistence harvest for Indigenous communities in the region. </w:t>
+      </w:r>
+      <w:r>
+        <w:rPr>
+          <w:rFonts w:ascii="Garamond" w:hAnsi="Garamond"/>
+          <w:sz w:val="22"/>
+          <w:szCs w:val="22"/>
+        </w:rPr>
+        <w:t xml:space="preserve">However, there has been a recent </w:t>
+      </w:r>
+      <w:r>
+        <w:rPr>
+          <w:rFonts w:ascii="Garamond" w:hAnsi="Garamond"/>
+          <w:sz w:val="22"/>
+          <w:szCs w:val="22"/>
+        </w:rPr>
+        <w:t>precipitous</w:t>
+      </w:r>
+      <w:r>
+        <w:rPr>
+          <w:rFonts w:ascii="Garamond" w:hAnsi="Garamond"/>
+          <w:sz w:val="22"/>
+          <w:szCs w:val="22"/>
+        </w:rPr>
+        <w:t xml:space="preserve"> and sustained decline in the health of Chinook salmon (X) </w:t>
+      </w:r>
+      <w:r>
+        <w:rPr>
+          <w:rFonts w:ascii="Garamond" w:hAnsi="Garamond"/>
+          <w:sz w:val="22"/>
+          <w:szCs w:val="22"/>
+        </w:rPr>
+        <w:t xml:space="preserve">across the region </w:t>
+      </w:r>
+      <w:r>
+        <w:rPr>
+          <w:rFonts w:ascii="Garamond" w:hAnsi="Garamond"/>
+          <w:sz w:val="22"/>
+          <w:szCs w:val="22"/>
+        </w:rPr>
+        <w:t xml:space="preserve">leading to </w:t>
+      </w:r>
+      <w:r>
+        <w:rPr>
+          <w:rFonts w:ascii="Garamond" w:hAnsi="Garamond"/>
+          <w:sz w:val="22"/>
+          <w:szCs w:val="22"/>
+        </w:rPr>
+        <w:t xml:space="preserve">undue hardship for subsistence communities. Across the region’s three major </w:t>
+      </w:r>
+      <w:proofErr w:type="spellStart"/>
+      <w:r>
+        <w:rPr>
+          <w:rFonts w:ascii="Garamond" w:hAnsi="Garamond"/>
+          <w:sz w:val="22"/>
+          <w:szCs w:val="22"/>
+        </w:rPr>
+        <w:t>major</w:t>
+      </w:r>
+      <w:proofErr w:type="spellEnd"/>
+      <w:r>
+        <w:rPr>
+          <w:rFonts w:ascii="Garamond" w:hAnsi="Garamond"/>
+          <w:sz w:val="22"/>
+          <w:szCs w:val="22"/>
+        </w:rPr>
+        <w:t xml:space="preserve"> river systems (the Yukon, Kuskokwim, and </w:t>
+      </w:r>
+      <w:proofErr w:type="spellStart"/>
+      <w:r>
+        <w:rPr>
+          <w:rFonts w:ascii="Garamond" w:hAnsi="Garamond"/>
+          <w:sz w:val="22"/>
+          <w:szCs w:val="22"/>
+        </w:rPr>
+        <w:t>Nushagak</w:t>
+      </w:r>
+      <w:proofErr w:type="spellEnd"/>
+      <w:r>
+        <w:rPr>
+          <w:rFonts w:ascii="Garamond" w:hAnsi="Garamond"/>
+          <w:sz w:val="22"/>
+          <w:szCs w:val="22"/>
+        </w:rPr>
+        <w:t xml:space="preserve"> river basins) </w:t>
+      </w:r>
+      <w:r>
+        <w:rPr>
+          <w:rFonts w:ascii="Garamond" w:hAnsi="Garamond"/>
+          <w:sz w:val="22"/>
+          <w:szCs w:val="22"/>
+        </w:rPr>
+        <w:t xml:space="preserve">life history strategies, run dynamics, and relative population health vary. As a result, there is a need to assess potential stressors as well as the relative impact of decline regional population health at the basin or sub-basin scale. </w:t>
+      </w:r>
+    </w:p>
+    <w:p>
+      <w:pPr>
+        <w:spacing w:line="480" w:lineRule="auto"/>
+        <w:ind w:firstLine="720"/>
+        <w:rPr>
+          <w:rFonts w:ascii="Garamond" w:hAnsi="Garamond"/>
+          <w:sz w:val="22"/>
+          <w:szCs w:val="22"/>
+        </w:rPr>
+      </w:pPr>
+      <w:r>
+        <w:rPr>
+          <w:rFonts w:ascii="Garamond" w:hAnsi="Garamond"/>
+          <w:sz w:val="22"/>
+          <w:szCs w:val="22"/>
+        </w:rPr>
+        <w:t>Several leading hypotheses</w:t>
+      </w:r>
+      <w:r>
+        <w:rPr>
+          <w:rFonts w:ascii="Garamond" w:hAnsi="Garamond"/>
+          <w:sz w:val="22"/>
+          <w:szCs w:val="22"/>
+        </w:rPr>
+        <w:t xml:space="preserve"> for declining population health have</w:t>
+      </w:r>
+      <w:r>
+        <w:rPr>
+          <w:rFonts w:ascii="Garamond" w:hAnsi="Garamond"/>
+          <w:sz w:val="22"/>
+          <w:szCs w:val="22"/>
+        </w:rPr>
+        <w:t xml:space="preserve"> </w:t>
+      </w:r>
+      <w:r>
+        <w:rPr>
+          <w:rFonts w:ascii="Garamond" w:hAnsi="Garamond"/>
+          <w:sz w:val="22"/>
+          <w:szCs w:val="22"/>
+        </w:rPr>
+        <w:t>been based</w:t>
+      </w:r>
+      <w:r>
+        <w:rPr>
+          <w:rFonts w:ascii="Garamond" w:hAnsi="Garamond"/>
+          <w:sz w:val="22"/>
+          <w:szCs w:val="22"/>
+        </w:rPr>
+        <w:t xml:space="preserve"> on drivers of marine mortality </w:t>
+      </w:r>
+      <w:r>
+        <w:rPr>
+          <w:rFonts w:ascii="Garamond" w:hAnsi="Garamond"/>
+          <w:sz w:val="22"/>
+          <w:szCs w:val="22"/>
+        </w:rPr>
+        <w:fldChar w:fldCharType="begin"/>
+      </w:r>
+      <w:r>
+        <w:rPr>
+          <w:rFonts w:ascii="Garamond" w:hAnsi="Garamond"/>
+          <w:sz w:val="22"/>
+          <w:szCs w:val="22"/>
+        </w:rPr>
+        <w:instrText xml:space="preserve"> ADDIN ZOTERO_ITEM CSL_CITATION {"citationID":"K3kQcsWX","properties":{"formattedCitation":"(Lamborn et al., 2025)","plainCitation":"(Lamborn et al., 2025)","noteIndex":0},"citationItems":[{"id":5644,"uris":["http://zotero.org/users/8421274/items/68HTP6NW"],"itemData":{"id":5644,"type":"article-journal","abstract":"Across Alaska, there have been synchronous declines in the abundance, mean age, and size of Chinook salmon (Oncorhynchus tshawytscha, Salmonidae), a species with immense social and ecological importance. The decline of Chinook salmon, and regulations addressing declines, have drastically impacted people who rely on Alaska's fisheries. Despite their importance, the drivers causing Chinook salmon declines are still not well understood. Therefore, to improve our understanding of the likely drivers of these large-scale synchronous declines, we synthesised the peer-reviewed Chinook salmon literature published between 2010 and 2024 using a weight-of-evidence approach. We identified 94 variables used to explain the trends in abundance and demographics of Chinook salmon. Each variable's association with trends in Chinook salmon was individually assessed and integrated using a standardised method. Results of this synthesis suggest the drivers for large-scale synchronous declines have occurred in the North Pacific Ocean. Specifically, we found marine predation, size selective harvest, and pink salmon (Oncorhynchus gorbuscha) abundance are the factors most strongly associated with reduced size and age. Results also suggest ocean productivity–specifically winter sea surface temperature and the North Pacific Gyre Oscillation–are the most frequently identified predictors of regional Chinook salmon abundance. In addition to addressing freshwater factors like adult heat stress and juvenile predation, we suggest research, policy, and management focus on how to better understand and address the interactions between ocean productivity, marine predation, size selective harvest, and pink salmon abundance to improve the condition of Chinook salmon, and the people and ecosystems benefiting from them.","container-title":"Fish and Fisheries","DOI":"10.1111/faf.12895","ISSN":"1467-2979","issue":"4","language":"en","license":"© 2025 The Author(s). Fish and Fisheries published by John Wiley &amp; Sons Ltd.","note":"_eprint: https://onlinelibrary.wiley.com/doi/pdf/10.1111/faf.12895","page":"520-532","source":"Wiley Online Library","title":"A Synthesis of Factors Related to Trends in Abundance and Demography of Alaska Chinook Salmon (Oncorhynchus tshawytscha, Salmonidae): Implications for Research, Management, and Policy","title-short":"A Synthesis of Factors Related to Trends in Abundance and Demography of Alaska Chinook Salmon (Oncorhynchus tshawytscha, Salmonidae)","volume":"26","author":[{"family":"Lamborn","given":"Chase C."},{"family":"Ohlberger","given":"Jan"},{"family":"Walsworth","given":"Timothy E."},{"family":"Westley","given":"Peter A. H."},{"family":"Cunningham","given":"Curry J."},{"family":"Wynsma","given":"Sam"},{"family":"Smith","given":"Jordan W."}],"issued":{"date-parts":[["2025"]]}}}],"schema":"https://github.com/citation-style-language/schema/raw/master/csl-citation.json"} </w:instrText>
+      </w:r>
+      <w:r>
+        <w:rPr>
+          <w:rFonts w:ascii="Garamond" w:hAnsi="Garamond"/>
+          <w:sz w:val="22"/>
+          <w:szCs w:val="22"/>
+        </w:rPr>
+        <w:fldChar w:fldCharType="separate"/>
+      </w:r>
+      <w:r>
+        <w:rPr>
+          <w:rFonts w:ascii="Garamond" w:hAnsi="Garamond"/>
+          <w:noProof/>
+          <w:sz w:val="22"/>
+          <w:szCs w:val="22"/>
+        </w:rPr>
+        <w:t>(Lamborn et al., 2025)</w:t>
+      </w:r>
+      <w:r>
+        <w:rPr>
+          <w:rFonts w:ascii="Garamond" w:hAnsi="Garamond"/>
+          <w:sz w:val="22"/>
+          <w:szCs w:val="22"/>
+        </w:rPr>
+        <w:fldChar w:fldCharType="end"/>
+      </w:r>
+      <w:r>
+        <w:rPr>
+          <w:rFonts w:ascii="Garamond" w:hAnsi="Garamond"/>
+          <w:sz w:val="22"/>
+          <w:szCs w:val="22"/>
+        </w:rPr>
+        <w:t xml:space="preserve">. </w:t>
+      </w:r>
+      <w:r>
+        <w:rPr>
+          <w:rFonts w:ascii="Garamond" w:hAnsi="Garamond"/>
+          <w:sz w:val="22"/>
+          <w:szCs w:val="22"/>
+        </w:rPr>
+        <w:t>However, a</w:t>
+      </w:r>
+      <w:r>
+        <w:rPr>
+          <w:rFonts w:ascii="Garamond" w:hAnsi="Garamond"/>
+          <w:sz w:val="22"/>
+          <w:szCs w:val="22"/>
+        </w:rPr>
+        <w:t xml:space="preserve">ssessment of </w:t>
+      </w:r>
+      <w:r>
+        <w:rPr>
+          <w:rFonts w:ascii="Garamond" w:hAnsi="Garamond"/>
+          <w:sz w:val="22"/>
+          <w:szCs w:val="22"/>
+        </w:rPr>
+        <w:t xml:space="preserve">marine-based </w:t>
+      </w:r>
+      <w:r>
+        <w:rPr>
+          <w:rFonts w:ascii="Garamond" w:hAnsi="Garamond"/>
+          <w:sz w:val="22"/>
+          <w:szCs w:val="22"/>
+        </w:rPr>
+        <w:t xml:space="preserve">hypotheses in relation to river- or stock-specific population health has been hindered by </w:t>
+      </w:r>
+      <w:r>
+        <w:rPr>
+          <w:rFonts w:ascii="Garamond" w:hAnsi="Garamond"/>
+          <w:sz w:val="22"/>
+          <w:szCs w:val="22"/>
+        </w:rPr>
+        <w:t>a</w:t>
+      </w:r>
+      <w:r>
+        <w:rPr>
+          <w:rFonts w:ascii="Garamond" w:hAnsi="Garamond"/>
+          <w:sz w:val="22"/>
+          <w:szCs w:val="22"/>
+        </w:rPr>
+        <w:t xml:space="preserve"> limited ability to determine the </w:t>
+      </w:r>
+      <w:r>
+        <w:rPr>
+          <w:rFonts w:ascii="Garamond" w:hAnsi="Garamond"/>
+          <w:sz w:val="22"/>
+          <w:szCs w:val="22"/>
+        </w:rPr>
+        <w:t>river of origin for marine-caught fish</w:t>
+      </w:r>
+      <w:r>
+        <w:rPr>
+          <w:rFonts w:ascii="Garamond" w:hAnsi="Garamond"/>
+          <w:sz w:val="22"/>
+          <w:szCs w:val="22"/>
+        </w:rPr>
+        <w:t>.</w:t>
+      </w:r>
+      <w:r>
+        <w:rPr>
+          <w:rFonts w:ascii="Garamond" w:hAnsi="Garamond"/>
+          <w:sz w:val="22"/>
+          <w:szCs w:val="22"/>
+        </w:rPr>
+        <w:t xml:space="preserve"> Genetics based approaches have provided a powerful tool for estimating provenance of Pacific salmon in many cases and have become a key method for assisting in in-season management of the mixed stock fishery for individual with a known river of origin. However, </w:t>
+      </w:r>
+      <w:r>
+        <w:rPr>
+          <w:rFonts w:ascii="Garamond" w:hAnsi="Garamond"/>
+          <w:sz w:val="22"/>
+          <w:szCs w:val="22"/>
+        </w:rPr>
+        <w:t>Chinook salmon in Western Alaska</w:t>
+      </w:r>
+      <w:r>
+        <w:rPr>
+          <w:rFonts w:ascii="Garamond" w:hAnsi="Garamond"/>
+          <w:sz w:val="22"/>
+          <w:szCs w:val="22"/>
+        </w:rPr>
+        <w:t xml:space="preserve"> lack sufficient genetic structure to reliably estimate provenance within the Coastal Western Alaska (CWAK) genetic reporting group, which contains the lower portion of the Yukon river-basin as well as the entire Kuskokwim and </w:t>
+      </w:r>
+      <w:proofErr w:type="spellStart"/>
+      <w:r>
+        <w:rPr>
+          <w:rFonts w:ascii="Garamond" w:hAnsi="Garamond"/>
+          <w:sz w:val="22"/>
+          <w:szCs w:val="22"/>
+        </w:rPr>
+        <w:t>Nushagak</w:t>
+      </w:r>
+      <w:proofErr w:type="spellEnd"/>
+      <w:r>
+        <w:rPr>
+          <w:rFonts w:ascii="Garamond" w:hAnsi="Garamond"/>
+          <w:sz w:val="22"/>
+          <w:szCs w:val="22"/>
+        </w:rPr>
+        <w:t xml:space="preserve"> River-basins. </w:t>
+      </w:r>
+      <w:r>
+        <w:rPr>
+          <w:rFonts w:ascii="Garamond" w:hAnsi="Garamond"/>
+          <w:sz w:val="22"/>
+          <w:szCs w:val="22"/>
+        </w:rPr>
+        <w:t xml:space="preserve">Isotope-based methods for estimating provenance from ear stones </w:t>
+      </w:r>
+      <w:r>
+        <w:rPr>
+          <w:rFonts w:ascii="Garamond" w:hAnsi="Garamond"/>
+          <w:sz w:val="22"/>
+          <w:szCs w:val="22"/>
+        </w:rPr>
+        <w:lastRenderedPageBreak/>
+        <w:t>found in fish</w:t>
+      </w:r>
+      <w:r>
+        <w:rPr>
+          <w:rFonts w:ascii="Garamond" w:hAnsi="Garamond"/>
+          <w:sz w:val="22"/>
+          <w:szCs w:val="22"/>
+        </w:rPr>
+        <w:t>, or otoliths,</w:t>
+      </w:r>
+      <w:r>
+        <w:rPr>
+          <w:rFonts w:ascii="Garamond" w:hAnsi="Garamond"/>
+          <w:sz w:val="22"/>
+          <w:szCs w:val="22"/>
+        </w:rPr>
+        <w:t xml:space="preserve"> have shown promise as an alternative approach that can provide more refined spatial resolution than genetics in some cases</w:t>
+      </w:r>
+      <w:r>
+        <w:rPr>
+          <w:rFonts w:ascii="Garamond" w:hAnsi="Garamond"/>
+          <w:sz w:val="22"/>
+          <w:szCs w:val="22"/>
+        </w:rPr>
+        <w:t xml:space="preserve"> </w:t>
+      </w:r>
+      <w:r>
+        <w:rPr>
+          <w:rFonts w:ascii="Garamond" w:hAnsi="Garamond"/>
+          <w:sz w:val="22"/>
+          <w:szCs w:val="22"/>
+        </w:rPr>
+        <w:fldChar w:fldCharType="begin"/>
+      </w:r>
+      <w:r>
+        <w:rPr>
+          <w:rFonts w:ascii="Garamond" w:hAnsi="Garamond"/>
+          <w:sz w:val="22"/>
+          <w:szCs w:val="22"/>
+        </w:rPr>
+        <w:instrText xml:space="preserve"> ADDIN ZOTERO_ITEM CSL_CITATION {"citationID":"Pqigyra2","properties":{"formattedCitation":"(Brennan et al., 2015; Brennan &amp; Schindler, 2017; Kennedy et al., 1997)","plainCitation":"(Brennan et al., 2015; Brennan &amp; Schindler, 2017; Kennedy et al., 1997)","noteIndex":0},"citationItems":[{"id":2313,"uris":["http://zotero.org/users/8421274/items/AJFVQJVT"],"itemData":{"id":2313,"type":"article-journal","abstract":"Highly migratory organisms present major challenges to conservation efforts. This is especially true for exploited anadromous fish species, which exhibit long-range dispersals from natal sites, complex population structures, and extensive mixing of distinct populations during exploitation. By tracing the migratory histories of individual Chinook salmon caught in fisheries using strontium isotopes, we determined the relative production of natal habitats at fine spatial scales and different life histories. Although strontium isotopes have been widely used in provenance research, we present a new robust framework to simultaneously assess natal sources and migrations of individuals within fishery harvests through time. Our results pave the way for investigating how fine-scale habitat production and life histories of salmon respond to perturbations—providing crucial insights for conservation.","container-title":"Science Advances","DOI":"10.1126/sciadv.1400124","issue":"4","note":"publisher: American Association for the Advancement of Science","page":"e1400124","source":"science.org (Atypon)","title":"Strontium isotopes delineate fine-scale natal origins and migration histories of Pacific salmon","volume":"1","author":[{"family":"Brennan","given":"Sean R."},{"family":"Zimmerman","given":"Christian E."},{"family":"Fernandez","given":"Diego P."},{"family":"Cerling","given":"Thure E."},{"family":"McPhee","given":"Megan V."},{"family":"Wooller","given":"Matthew J."}],"issued":{"date-parts":[["2015",5,15]]}}},{"id":1694,"uris":["http://zotero.org/users/8421274/items/NSWL6YPN"],"itemData":{"id":1694,"type":"article-journal","abstract":"Production patterns of highly mobile species, such as anadromous fish, often exhibit high spatial and temporal heterogeneity across landscapes. Such variability is often asynchronous in time among habitats, which stabilizes production at aggregate scales of complexity. Reconstructing production patterns explicitly in space and time across multiple scales, however, remains difficult but is important for prioritizing habitat conservation. This is especially true for fishes inhabiting river basins due to long-range dispersal, high mortality at early life stages, complex population structure and elusive life history variation. We develop a new approach for mapping production patterns of Pacific salmon across a large river basin by integrating otolith microchemistry and dendritic isoscape models. The geographically continuous Bayesian assignment framework presented here yielded high accuracies (&gt;90%) and relatively high precisions (precisions &lt;4%; i.e., assignment areas of &lt;530 river km of the 13 100 km total river length) when used to determine the natal source of known-origin juvenile Chinook salmon captured throughout the study region. Integrating these methods enabled us to base estimates of provenance and habitat use of individuals on a per location basis using strontium isotopic data throughout the continuous spatial domain of a river network. Such a framework provides substantial advantages over the more common nominal approach to employing otolith microchemistry to reconstruct movement patterns of fish. In doing so, we reconstructed the spatial production patterns of adult Chinook salmon returning to a large watershed in Bristol Bay, Alaska and illustrate the power of such an approach to conservation efforts.","container-title":"Ecological Applications","DOI":"10.1002/eap.1474","ISSN":"1939-5582","issue":"2","language":"en","note":"_eprint: https://esajournals.onlinelibrary.wiley.com/doi/pdf/10.1002/eap.1474","page":"363-377","source":"Wiley Online Library","title":"Linking otolith microchemistry and dendritic isoscapes to map heterogeneous production of fish across river basins","volume":"27","author":[{"family":"Brennan","given":"Sean R."},{"family":"Schindler","given":"Daniel E."}],"issued":{"date-parts":[["2017"]]}}},{"id":1561,"uris":["http://zotero.org/users/8421274/items/UCQYZW9Z"],"itemData":{"id":1561,"type":"article-journal","abstract":"To optimize conservation and restoration strategies for fish stocks it is important to identify the rearing habitats that produce the most successful individuals. However, tracking millions of migratory fish through multiple life stages seems to be impossible using conventional techniques. Using differences in the ratio of stable isotopes of strontium (Sr), found naturally in stream water, we have been able to distinguish juvenile Atlantic salmon (Salmo salar) from eight of ten rearing sites studied in Vermont streams. This demonstrates the potential for using environmental signals to determine the rearing stream from which salmon originate, and should help to guide restoration activities.","container-title":"Nature","DOI":"10.1038/42835","ISSN":"1476-4687","issue":"6635","language":"en","license":"1997 Macmillan Magazines Ltd.","note":"number: 6635\npublisher: Nature Publishing Group","page":"766-767","source":"www-nature-com.offcampus.lib.washington.edu","title":"Natural isotope markers in salmon","volume":"387","author":[{"family":"Kennedy","given":"Brian P."},{"family":"Folt","given":"Carol L."},{"family":"Blum","given":"Joel D."},{"family":"Chamberlain","given":"C. Page"}],"issued":{"date-parts":[["1997",6]]}}}],"schema":"https://github.com/citation-style-language/schema/raw/master/csl-citation.json"} </w:instrText>
+      </w:r>
+      <w:r>
+        <w:rPr>
+          <w:rFonts w:ascii="Garamond" w:hAnsi="Garamond"/>
+          <w:sz w:val="22"/>
+          <w:szCs w:val="22"/>
+        </w:rPr>
+        <w:fldChar w:fldCharType="separate"/>
+      </w:r>
+      <w:r>
+        <w:rPr>
+          <w:rFonts w:ascii="Garamond" w:hAnsi="Garamond"/>
+          <w:noProof/>
+          <w:sz w:val="22"/>
+          <w:szCs w:val="22"/>
+        </w:rPr>
+        <w:t>(Brennan et al., 2015; Brennan &amp; Schindler, 2017; Kennedy et al., 1997)</w:t>
+      </w:r>
+      <w:r>
+        <w:rPr>
+          <w:rFonts w:ascii="Garamond" w:hAnsi="Garamond"/>
+          <w:sz w:val="22"/>
+          <w:szCs w:val="22"/>
+        </w:rPr>
+        <w:fldChar w:fldCharType="end"/>
+      </w:r>
+      <w:r>
+        <w:rPr>
+          <w:rFonts w:ascii="Garamond" w:hAnsi="Garamond"/>
+          <w:sz w:val="22"/>
+          <w:szCs w:val="22"/>
+        </w:rPr>
+        <w:t xml:space="preserve">. </w:t>
+      </w:r>
+      <w:r>
+        <w:rPr>
+          <w:rFonts w:ascii="Garamond" w:hAnsi="Garamond"/>
+          <w:sz w:val="22"/>
+          <w:szCs w:val="22"/>
+        </w:rPr>
+        <w:t xml:space="preserve">The relative ratio of </w:t>
+      </w:r>
+      <w:r>
+        <w:rPr>
+          <w:rFonts w:ascii="Garamond" w:hAnsi="Garamond"/>
+          <w:sz w:val="22"/>
+          <w:szCs w:val="22"/>
+        </w:rPr>
+        <w:t>s</w:t>
+      </w:r>
+      <w:r>
+        <w:rPr>
+          <w:rFonts w:ascii="Garamond" w:hAnsi="Garamond"/>
+          <w:sz w:val="22"/>
+          <w:szCs w:val="22"/>
+        </w:rPr>
+        <w:t>trontium-87 to strontium-86 (</w:t>
+      </w:r>
+      <w:r>
+        <w:rPr>
+          <w:rFonts w:ascii="Cambria Math" w:hAnsi="Cambria Math" w:cs="Cambria Math"/>
+          <w:sz w:val="22"/>
+          <w:szCs w:val="22"/>
+        </w:rPr>
+        <w:t>⁸⁷</w:t>
+      </w:r>
+      <w:r>
+        <w:rPr>
+          <w:rFonts w:ascii="Garamond" w:hAnsi="Garamond"/>
+          <w:sz w:val="22"/>
+          <w:szCs w:val="22"/>
+        </w:rPr>
+        <w:t>Sr/</w:t>
+      </w:r>
+      <w:r>
+        <w:rPr>
+          <w:rFonts w:ascii="Cambria Math" w:hAnsi="Cambria Math" w:cs="Cambria Math"/>
+          <w:sz w:val="22"/>
+          <w:szCs w:val="22"/>
+        </w:rPr>
+        <w:t>⁸⁶</w:t>
+      </w:r>
+      <w:r>
+        <w:rPr>
+          <w:rFonts w:ascii="Garamond" w:hAnsi="Garamond"/>
+          <w:sz w:val="22"/>
+          <w:szCs w:val="22"/>
+        </w:rPr>
+        <w:t>Sr) is an isotopic tracer that is heterogeneously distributed across geologically diverse landscapes, faithfully incorporated into otoliths, and has been shown to be temporally stable in Alaskan watersheds</w:t>
+      </w:r>
+      <w:r>
+        <w:rPr>
+          <w:rFonts w:ascii="Garamond" w:hAnsi="Garamond"/>
+          <w:sz w:val="22"/>
+          <w:szCs w:val="22"/>
+        </w:rPr>
+        <w:t xml:space="preserve"> </w:t>
+      </w:r>
+      <w:r>
+        <w:rPr>
+          <w:rFonts w:ascii="Garamond" w:hAnsi="Garamond"/>
+          <w:sz w:val="22"/>
+          <w:szCs w:val="22"/>
+        </w:rPr>
+        <w:fldChar w:fldCharType="begin"/>
+      </w:r>
+      <w:r>
+        <w:rPr>
+          <w:rFonts w:ascii="Garamond" w:hAnsi="Garamond"/>
+          <w:sz w:val="22"/>
+          <w:szCs w:val="22"/>
+        </w:rPr>
+        <w:instrText xml:space="preserve"> ADDIN ZOTERO_ITEM CSL_CITATION {"citationID":"gCPseI7r","properties":{"formattedCitation":"(Bataille &amp; Bowen, 2012; Brennan et al., 2015; Campana, 1999; Capo et al., 1998)","plainCitation":"(Bataille &amp; Bowen, 2012; Brennan et al., 2015; Campana, 1999; Capo et al., 1998)","noteIndex":0},"citationItems":[{"id":1939,"uris":["http://zotero.org/users/8421274/items/S8GE9LUD"],"itemData":{"id":1939,"type":"article-journal","abstract":"Although variation in 87Sr/86Sr has been widely pursued as a tracer of provenance in environmental studies, forensics, archeology and food traceability, accurate methods for mapping variations in environmental 87Sr/ 86Sr at regional scale are not available. In this paper, we build upon earlier efforts to model 87Sr/86Sr in bedrock by developing GIS-based models for Sr isotopes in rock and water that include the combined effects of lithology and time. Using published data, we ﬁt lithology-speciﬁc model parameters for generalized equations describing the concentration of radiogenic Sr in silicate and carbonate rocks. The new model explained more than 50% of the observed variance in measured Sr isotope values from independent global databases of igneous, metaigneous, and carbonate rocks, but performed more poorly (explaining 33% of the variance) for sedimentary and metasedimentary rocks. In comparison, a previously applied model formulation that did not include lithology-speciﬁc parameters explained only 20% and 8% of the observed variance for igneous and sedimentary rocks, respectively, and exhibited an inverse relationship with measured carbonate rock values. Building upon the bedrock model, we also developed and applied equations to predict the contribution of different rock types to 87Sr/86Sr variations in water as a function of their weathering rates and strontium content. The resulting water model was compared to data from 68 catchments and shown to give more accurate predictions of stream water 87Sr/86Sr (R2 = 0.70) than models that did not include lithological weathering parameters. We applied these models to produce maps (“isoscapes”) predicting 87Sr/86Sr in bedrock and water across the contiguous USA, and compared the mapped Sr isotope distributions to data on Sr isotope ratios of US marijuana crops. Although the maps produced here are demonstrably imperfect and leave signiﬁcant scope for further reﬁnement, they provide an enhanced framework for lithology-based Sr isotope modeling and offer a baseline for provenance studies by constraining the 87Sr/86Sr in strontium sources at regional scales.","container-title":"Chemical Geology","DOI":"10.1016/j.chemgeo.2012.01.028","ISSN":"00092541","journalAbbreviation":"Chemical Geology","language":"en","page":"39-52","source":"DOI.org (Crossref)","title":"Mapping 87Sr/86Sr variations in bedrock and water for large scale provenance studies","volume":"304-305","author":[{"family":"Bataille","given":"Clément P."},{"family":"Bowen","given":"Gabriel J."}],"issued":{"date-parts":[["2012",4]]}}},{"id":2313,"uris":["http://zotero.org/users/8421274/items/AJFVQJVT"],"itemData":{"id":2313,"type":"article-journal","abstract":"Highly migratory organisms present major challenges to conservation efforts. This is especially true for exploited anadromous fish species, which exhibit long-range dispersals from natal sites, complex population structures, and extensive mixing of distinct populations during exploitation. By tracing the migratory histories of individual Chinook salmon caught in fisheries using strontium isotopes, we determined the relative production of natal habitats at fine spatial scales and different life histories. Although strontium isotopes have been widely used in provenance research, we present a new robust framework to simultaneously assess natal sources and migrations of individuals within fishery harvests through time. Our results pave the way for investigating how fine-scale habitat production and life histories of salmon respond to perturbations—providing crucial insights for conservation.","container-title":"Science Advances","DOI":"10.1126/sciadv.1400124","issue":"4","note":"publisher: American Association for the Advancement of Science","page":"e1400124","source":"science.org (Atypon)","title":"Strontium isotopes delineate fine-scale natal origins and migration histories of Pacific salmon","volume":"1","author":[{"family":"Brennan","given":"Sean R."},{"family":"Zimmerman","given":"Christian E."},{"family":"Fernandez","given":"Diego P."},{"family":"Cerling","given":"Thure E."},{"family":"McPhee","given":"Megan V."},{"family":"Wooller","given":"Matthew J."}],"issued":{"date-parts":[["2015",5,15]]}}},{"id":1441,"uris":["http://zotero.org/users/8421274/items/PHNAKZ8D"],"itemData":{"id":1441,"type":"article-journal","abstract":"The fish otolith (earstone) has long been known as a timekeeper, but interest in its use as a metabolically inert environmental recorder has accelerated in recent years. In part due to technological advances, applications such as stock identification, determination of rnigralon pathways, reconstruction of temperature and salinity history, age validation, detection of anadromy, use as a natural tag and chemical mass marking have been developed, some of which are difficult or impossible to implement using alternative techniques. Microsamphg and the latest advances in beam-based probes allow many elemental assays to be coupled with daily or annual growth increments, thus providing a detailed chronologcal record of the environment. However, few workers have critically assessed the assumptions upon which the environmental reconstructions are based, or considered the possibility that elemental incorporation into the otolith may proceed differently than that into other calcified structures. This paper reviews current applications and their assumptions and suggests future directions. Particular attention is given to the premises that the elemental and isotopic composition of the otolith reflects that of the environment, and the effect of physiological filters on the resulting composition. The roles of temperature, elemental uptake into the fish and the process of otolith crystahzation are also assessed. Drawing upon recent advances in geochemistry and paleoclirnate research as points of contrast, it appears that not all applications of otolith chemistry are firmly based, although others are destined to become powerful and perhaps routine tools for the mainstream fish biologst.","container-title":"Marine Ecology Progress Series","DOI":"10.3354/meps188263","ISSN":"0171-8630, 1616-1599","journalAbbreviation":"Mar. Ecol. Prog. Ser.","language":"en","page":"263-297","source":"DOI.org (Crossref)","title":"Chemistry and composition of fish otoliths:pathways, mechanisms and applications","title-short":"Chemistry and composition of fish otoliths","volume":"188","author":[{"family":"Campana","given":"Se"}],"issued":{"date-parts":[["1999"]]}}},{"id":1457,"uris":["http://zotero.org/users/8421274/items/TDIQBP7K"],"itemData":{"id":1457,"type":"article-journal","abstract":"The strontium (Sr) isotope method can be a powerful tool in studies of chemical weathering and soil genesis, cation provenance and mobility, and the chronostratigraphic correlation of marine sediments. It is a sensitive geochemical tracer, applicable to large-scale ecosystem studies as well as to centimeter-scaled examination of cation mobility within a soil profile. The 87Sr/86Sr ratios of natural materials reflect the sources of strontium available during their formation. Isotopically distinct inputs from precipitation, dryfall, soil parent material, and surface or groundwater allow determination of the relative proportions of those materials entering or leaving an ecosystem. The isotopic compositions of labile (soil exchange complex and soil solution) strontium and Sr in vegetation reflect the sources of cations available to plants. Strontium isotopes can be used to track the biogeochemical cycling of nutrient cations such as calcium. The extent of cation contributions from in situ weathering and external additions to soil from dust and rain can also be resolved with this method. In this paper, we review the geochemistry and isotopic systematics of strontium, and discuss the use of this method as a tracer of earth surface processes.","container-title":"Geoderma","DOI":"10.1016/S0016-7061(97)00102-X","ISSN":"0016-7061","issue":"1","journalAbbreviation":"Geoderma","language":"en","page":"197-225","source":"ScienceDirect","title":"Strontium isotopes as tracers of ecosystem processes: theory and methods","title-short":"Strontium isotopes as tracers of ecosystem processes","volume":"82","author":[{"family":"Capo","given":"Rosemary C."},{"family":"Stewart","given":"Brian W."},{"family":"Chadwick","given":"Oliver A."}],"issued":{"date-parts":[["1998",2,1]]}}}],"schema":"https://github.com/citation-style-language/schema/raw/master/csl-citation.json"} </w:instrText>
+      </w:r>
+      <w:r>
+        <w:rPr>
+          <w:rFonts w:ascii="Garamond" w:hAnsi="Garamond"/>
+          <w:sz w:val="22"/>
+          <w:szCs w:val="22"/>
+        </w:rPr>
+        <w:fldChar w:fldCharType="separate"/>
+      </w:r>
+      <w:r>
+        <w:rPr>
+          <w:rFonts w:ascii="Garamond" w:hAnsi="Garamond"/>
+          <w:noProof/>
+          <w:sz w:val="22"/>
+          <w:szCs w:val="22"/>
+        </w:rPr>
+        <w:t>(Bataille &amp; Bowen, 2012; Brennan et al., 2015; Campana, 1999; Capo et al., 1998)</w:t>
+      </w:r>
+      <w:r>
+        <w:rPr>
+          <w:rFonts w:ascii="Garamond" w:hAnsi="Garamond"/>
+          <w:sz w:val="22"/>
+          <w:szCs w:val="22"/>
+        </w:rPr>
+        <w:fldChar w:fldCharType="end"/>
+      </w:r>
+      <w:r>
+        <w:rPr>
+          <w:rFonts w:ascii="Garamond" w:hAnsi="Garamond"/>
+          <w:sz w:val="22"/>
+          <w:szCs w:val="22"/>
+        </w:rPr>
+        <w:t xml:space="preserve">. As a result, </w:t>
+      </w:r>
+      <w:r>
+        <w:rPr>
+          <w:rFonts w:ascii="Cambria Math" w:hAnsi="Cambria Math" w:cs="Cambria Math"/>
+          <w:sz w:val="22"/>
+          <w:szCs w:val="22"/>
+        </w:rPr>
+        <w:t>⁸⁷</w:t>
+      </w:r>
+      <w:r>
+        <w:rPr>
+          <w:rFonts w:ascii="Garamond" w:hAnsi="Garamond"/>
+          <w:sz w:val="22"/>
+          <w:szCs w:val="22"/>
+        </w:rPr>
+        <w:t>Sr/</w:t>
+      </w:r>
+      <w:r>
+        <w:rPr>
+          <w:rFonts w:ascii="Cambria Math" w:hAnsi="Cambria Math" w:cs="Cambria Math"/>
+          <w:sz w:val="22"/>
+          <w:szCs w:val="22"/>
+        </w:rPr>
+        <w:t>⁸⁶</w:t>
+      </w:r>
+      <w:r>
+        <w:rPr>
+          <w:rFonts w:ascii="Garamond" w:hAnsi="Garamond"/>
+          <w:sz w:val="22"/>
+          <w:szCs w:val="22"/>
+        </w:rPr>
+        <w:t>Sr values associated with discrete time periods in an individual's life (e.g., freshwater natal rearing) can be used to estimate provenance by comparing them to values measured or modeled across the landscape.</w:t>
+      </w:r>
+      <w:r>
+        <w:t xml:space="preserve"> </w:t>
+      </w:r>
+      <w:r>
+        <w:rPr>
+          <w:rFonts w:ascii="Garamond" w:hAnsi="Garamond"/>
+          <w:sz w:val="22"/>
+          <w:szCs w:val="22"/>
+        </w:rPr>
+        <w:t>Despite its precision, this method is limited by the level of isotopic heterogeneity relative to the spatial scale of interest</w:t>
+      </w:r>
+      <w:r>
+        <w:rPr>
+          <w:rFonts w:ascii="Garamond" w:hAnsi="Garamond"/>
+          <w:sz w:val="22"/>
+          <w:szCs w:val="22"/>
+        </w:rPr>
+        <w:t xml:space="preserve"> </w:t>
+      </w:r>
+      <w:r>
+        <w:rPr>
+          <w:rFonts w:ascii="Garamond" w:hAnsi="Garamond"/>
+          <w:sz w:val="22"/>
+          <w:szCs w:val="22"/>
+        </w:rPr>
+        <w:fldChar w:fldCharType="begin"/>
+      </w:r>
+      <w:r>
+        <w:rPr>
+          <w:rFonts w:ascii="Garamond" w:hAnsi="Garamond"/>
+          <w:sz w:val="22"/>
+          <w:szCs w:val="22"/>
+        </w:rPr>
+        <w:instrText xml:space="preserve"> ADDIN ZOTERO_ITEM CSL_CITATION {"citationID":"W3sRlFul","properties":{"formattedCitation":"(Makhlouf et al., 2025)","plainCitation":"(Makhlouf et al., 2025)","noteIndex":0},"citationItems":[{"id":5397,"uris":["http://zotero.org/users/8421274/items/WRVF2L9N"],"itemData":{"id":5397,"type":"article-journal","abstract":"Understanding the spatial ecology of migratory species is uniquely challenging using conventional approaches. In fisheries such as for Pacific salmon, genetic stock identification (GSI) and isotope-based methods have emerged as strategies for reconstructing spatial ecology but are limited by the spatial resolution of genetic differentiation and isotopic heterogeneity. We show that integrating these complementary datasets improve the spatial resolution of provenance assignments. To do so, we reconstructed basin-wide estimates of natal origin locations for Chinook salmon in the Yukon River using samples (n = 247) from an experimental fishery designed to assess in-season run timing. A combined framework improved precision of likely provenance assignments (stream km &gt; 0.7 posterior probability) by 92% over genetic assignments and 52% over strontium isotope methods. In doing so, we illustrate watershed scale estimates of natal origin distributions with a greater resolution available from GSI or isotope data alone.","container-title":"Limnology and Oceanography Letters","DOI":"10.1002/lol2.70025","ISSN":"2378-2242","issue":"n/a","language":"en","license":"© 2025 The Author(s). Limnology and Oceanography Letters published by Wiley Periodicals LLC on behalf of Association for the Sciences of Limnology and Oceanography.","note":"_eprint: https://onlinelibrary.wiley.com/doi/pdf/10.1002/lol2.70025","source":"Wiley Online Library","title":"Combining genetic and isotope frameworks improves reconstruction of fish provenance across riverscapes","URL":"https://onlinelibrary.wiley.com/doi/abs/10.1002/lol2.70025","volume":"n/a","author":[{"family":"Makhlouf","given":"Ben"},{"family":"Cline","given":"Timothy J."},{"family":"Fernandez","given":"Diego"},{"family":"Seeb","given":"Lisa"},{"family":"Lee","given":"Elizabeth"},{"family":"Gilk-Baumer","given":"Sara"},{"family":"Whited","given":"Diane"},{"family":"Zimmerman","given":"Christian E."},{"family":"Schindler","given":"Daniel E."}],"accessed":{"date-parts":[["2025",6,4]]},"issued":{"date-parts":[["2025"]]}}}],"schema":"https://github.com/citation-style-language/schema/raw/master/csl-citation.json"} </w:instrText>
+      </w:r>
+      <w:r>
+        <w:rPr>
+          <w:rFonts w:ascii="Garamond" w:hAnsi="Garamond"/>
+          <w:sz w:val="22"/>
+          <w:szCs w:val="22"/>
+        </w:rPr>
+        <w:fldChar w:fldCharType="separate"/>
+      </w:r>
+      <w:r>
+        <w:rPr>
+          <w:rFonts w:ascii="Garamond" w:hAnsi="Garamond"/>
+          <w:noProof/>
+          <w:sz w:val="22"/>
+          <w:szCs w:val="22"/>
+        </w:rPr>
+        <w:t>(Makhlouf et al., 2025)</w:t>
+      </w:r>
+      <w:r>
+        <w:rPr>
+          <w:rFonts w:ascii="Garamond" w:hAnsi="Garamond"/>
+          <w:sz w:val="22"/>
+          <w:szCs w:val="22"/>
+        </w:rPr>
+        <w:fldChar w:fldCharType="end"/>
+      </w:r>
+      <w:r>
+        <w:rPr>
+          <w:rFonts w:ascii="Garamond" w:hAnsi="Garamond"/>
+          <w:sz w:val="22"/>
+          <w:szCs w:val="22"/>
+        </w:rPr>
+        <w:t xml:space="preserve">. </w:t>
+      </w:r>
+      <w:r>
+        <w:rPr>
+          <w:rFonts w:ascii="Garamond" w:hAnsi="Garamond"/>
+          <w:sz w:val="22"/>
+          <w:szCs w:val="22"/>
+        </w:rPr>
+        <w:t xml:space="preserve">While </w:t>
+      </w:r>
+      <w:r>
+        <w:rPr>
+          <w:rFonts w:ascii="Garamond" w:hAnsi="Garamond"/>
+          <w:sz w:val="22"/>
+          <w:szCs w:val="22"/>
+        </w:rPr>
+        <w:t xml:space="preserve">reliable </w:t>
+      </w:r>
+      <w:r>
+        <w:rPr>
+          <w:rFonts w:ascii="Garamond" w:hAnsi="Garamond"/>
+          <w:sz w:val="22"/>
+          <w:szCs w:val="22"/>
+        </w:rPr>
+        <w:t>within-</w:t>
+      </w:r>
+      <w:r>
+        <w:rPr>
+          <w:rFonts w:ascii="Garamond" w:hAnsi="Garamond"/>
+          <w:sz w:val="22"/>
+          <w:szCs w:val="22"/>
+        </w:rPr>
+        <w:t>river</w:t>
+      </w:r>
+      <w:r>
+        <w:rPr>
+          <w:rFonts w:ascii="Garamond" w:hAnsi="Garamond"/>
+          <w:sz w:val="22"/>
+          <w:szCs w:val="22"/>
+        </w:rPr>
+        <w:t xml:space="preserve"> </w:t>
+      </w:r>
+      <w:r>
+        <w:rPr>
+          <w:rFonts w:ascii="Garamond" w:hAnsi="Garamond"/>
+          <w:sz w:val="22"/>
+          <w:szCs w:val="22"/>
+        </w:rPr>
+        <w:t xml:space="preserve">estimates of </w:t>
+      </w:r>
+      <w:r>
+        <w:rPr>
+          <w:rFonts w:ascii="Garamond" w:hAnsi="Garamond"/>
+          <w:sz w:val="22"/>
+          <w:szCs w:val="22"/>
+        </w:rPr>
+        <w:t xml:space="preserve">provenance </w:t>
+      </w:r>
+      <w:r>
+        <w:rPr>
+          <w:rFonts w:ascii="Garamond" w:hAnsi="Garamond"/>
+          <w:sz w:val="22"/>
+          <w:szCs w:val="22"/>
+        </w:rPr>
+        <w:t>are</w:t>
+      </w:r>
+      <w:r>
+        <w:rPr>
+          <w:rFonts w:ascii="Garamond" w:hAnsi="Garamond"/>
+          <w:sz w:val="22"/>
+          <w:szCs w:val="22"/>
+        </w:rPr>
+        <w:t xml:space="preserve"> possible in Western Alaskan watersheds, regional overlap among the three major river systems creates high uncertainty, preventing reliable assignments of marine-caught fish when relying on a single natal </w:t>
+      </w:r>
+      <w:r>
+        <w:rPr>
+          <w:rFonts w:ascii="Cambria Math" w:hAnsi="Cambria Math" w:cs="Cambria Math"/>
+          <w:sz w:val="22"/>
+          <w:szCs w:val="22"/>
+        </w:rPr>
+        <w:t>⁸⁷</w:t>
+      </w:r>
+      <w:r>
+        <w:rPr>
+          <w:rFonts w:ascii="Garamond" w:hAnsi="Garamond"/>
+          <w:sz w:val="22"/>
+          <w:szCs w:val="22"/>
+        </w:rPr>
+        <w:t>Sr/</w:t>
+      </w:r>
+      <w:r>
+        <w:rPr>
+          <w:rFonts w:ascii="Cambria Math" w:hAnsi="Cambria Math" w:cs="Cambria Math"/>
+          <w:sz w:val="22"/>
+          <w:szCs w:val="22"/>
+        </w:rPr>
+        <w:t>⁸⁶</w:t>
+      </w:r>
+      <w:r>
+        <w:rPr>
+          <w:rFonts w:ascii="Garamond" w:hAnsi="Garamond"/>
+          <w:sz w:val="22"/>
+          <w:szCs w:val="22"/>
+        </w:rPr>
+        <w:t>Sr value (Figure 1).</w:t>
+      </w:r>
+    </w:p>
+    <w:p>
+      <w:pPr>
+        <w:spacing w:line="480" w:lineRule="auto"/>
+        <w:ind w:firstLine="720"/>
+        <w:rPr>
+          <w:rFonts w:ascii="Garamond" w:hAnsi="Garamond"/>
+          <w:sz w:val="22"/>
+          <w:szCs w:val="22"/>
+        </w:rPr>
+      </w:pPr>
+    </w:p>
+    <w:p>
+      <w:pPr>
+        <w:spacing w:line="480" w:lineRule="auto"/>
+        <w:ind w:firstLine="720"/>
+        <w:rPr>
+          <w:rFonts w:ascii="Garamond" w:hAnsi="Garamond"/>
+          <w:sz w:val="22"/>
+          <w:szCs w:val="22"/>
+        </w:rPr>
+      </w:pPr>
+      <w:r>
+        <w:rPr>
+          <w:rFonts w:ascii="Garamond" w:hAnsi="Garamond"/>
+          <w:sz w:val="22"/>
+          <w:szCs w:val="22"/>
+        </w:rPr>
+        <w:t>standard approaches such as genetic stock identification (GSI) provide provenance estimates at relatively coarse spatial scales (e.g., coastal western Alaska) but cannot distinguish among rivers within current genetic baselines.</w:t>
+      </w:r>
+      <w:r>
+        <w:rPr>
+          <w:rFonts w:ascii="Garamond" w:hAnsi="Garamond"/>
+          <w:sz w:val="22"/>
+          <w:szCs w:val="22"/>
+        </w:rPr>
+        <w:t xml:space="preserve"> </w:t>
+      </w:r>
+    </w:p>
+    <w:p>
+      <w:pPr>
+        <w:spacing w:line="480" w:lineRule="auto"/>
+        <w:ind w:firstLine="720"/>
+      </w:pPr>
+    </w:p>
+    <w:p>
+      <w:pPr>
+        <w:spacing w:line="480" w:lineRule="auto"/>
+        <w:ind w:firstLine="720"/>
+      </w:pPr>
+    </w:p>
+    <w:p>
+      <w:pPr>
+        <w:spacing w:line="480" w:lineRule="auto"/>
+        <w:ind w:firstLine="720"/>
+      </w:pPr>
+      <w:r>
+        <w:t>vary in space and time, creating a</w:t>
+      </w:r>
+      <w:r>
+        <w:t xml:space="preserve"> dynamic and interactive</w:t>
+      </w:r>
+      <w:r>
+        <w:t xml:space="preserve"> mosaic of shifting ecological and environmental conditions</w:t>
+      </w:r>
+      <w:r>
+        <w:t xml:space="preserve">. </w:t>
+      </w:r>
+      <w:r>
+        <w:t xml:space="preserve">This, along with the remote and expansive nature of Western Alaska landscapes, ha </w:t>
+      </w:r>
+    </w:p>
+    <w:p>
+      <w:pPr>
+        <w:spacing w:line="480" w:lineRule="auto"/>
+        <w:ind w:firstLine="720"/>
+      </w:pPr>
+    </w:p>
+    <w:p>
+      <w:pPr>
+        <w:spacing w:line="480" w:lineRule="auto"/>
+        <w:ind w:firstLine="720"/>
+      </w:pPr>
+      <w:r>
+        <w:t xml:space="preserve"> at the basin or sub-basin scale is challenging.</w:t>
+      </w:r>
+    </w:p>
+    <w:p>
+      <w:pPr>
+        <w:spacing w:line="480" w:lineRule="auto"/>
+        <w:ind w:firstLine="720"/>
+      </w:pPr>
+    </w:p>
+    <w:p>
+      <w:pPr>
+        <w:spacing w:line="480" w:lineRule="auto"/>
+        <w:ind w:firstLine="720"/>
+      </w:pPr>
+    </w:p>
+    <w:p>
+      <w:pPr>
+        <w:spacing w:line="480" w:lineRule="auto"/>
+        <w:ind w:firstLine="720"/>
+      </w:pPr>
+    </w:p>
+    <w:p>
+      <w:pPr>
+        <w:spacing w:line="480" w:lineRule="auto"/>
+        <w:ind w:firstLine="720"/>
+      </w:pPr>
+      <w:r>
+        <w:t>ha</w:t>
+      </w:r>
+      <w:r>
+        <w:t>s</w:t>
+      </w:r>
+      <w:r>
+        <w:t xml:space="preserve"> led to </w:t>
+      </w:r>
+      <w:r>
+        <w:rPr>
+          <w:rFonts w:ascii="Garamond" w:hAnsi="Garamond"/>
+        </w:rPr>
+        <w:t xml:space="preserve">led </w:t>
+      </w:r>
+      <w:r>
+        <w:rPr>
+          <w:rFonts w:ascii="Garamond" w:hAnsi="Garamond"/>
+        </w:rPr>
+        <w:t xml:space="preserve">significant hardship for communities in the region which rely on fishery resources for subsistence and cultural value </w:t>
+      </w:r>
+      <w:r>
+        <w:rPr>
+          <w:rFonts w:ascii="Garamond" w:hAnsi="Garamond"/>
+        </w:rPr>
+        <w:fldChar w:fldCharType="begin"/>
+      </w:r>
+      <w:r>
+        <w:rPr>
+          <w:rFonts w:ascii="Garamond" w:hAnsi="Garamond"/>
+        </w:rPr>
+        <w:instrText xml:space="preserve"> ADDIN ZOTERO_ITEM CSL_CITATION {"citationID":"CRrkE0aE","properties":{"formattedCitation":"(Brown &amp; Godduhn, 2015)","plainCitation":"(Brown &amp; Godduhn, 2015)","noteIndex":0},"citationItems":[{"id":4428,"uris":["http://zotero.org/users/8421274/items/2WA8NCRM"],"itemData":{"id":4428,"type":"article-journal","language":"en","source":"Zotero","title":"Socioeconomic effects of declining salmon runs on the Yukon River","author":[{"family":"Brown","given":"Caroline L"},{"family":"Godduhn","given":"Anna"}],"issued":{"date-parts":[["2015"]]}}}],"schema":"https://github.com/citation-style-language/schema/raw/master/csl-citation.json"} </w:instrText>
+      </w:r>
+      <w:r>
+        <w:rPr>
+          <w:rFonts w:ascii="Garamond" w:hAnsi="Garamond"/>
+        </w:rPr>
+        <w:fldChar w:fldCharType="separate"/>
+      </w:r>
+      <w:r>
+        <w:rPr>
+          <w:rFonts w:ascii="Garamond" w:hAnsi="Garamond"/>
+          <w:noProof/>
+        </w:rPr>
+        <w:t>(Brown &amp; Godduhn, 2015)</w:t>
+      </w:r>
+      <w:r>
+        <w:rPr>
+          <w:rFonts w:ascii="Garamond" w:hAnsi="Garamond"/>
+        </w:rPr>
+        <w:fldChar w:fldCharType="end"/>
+      </w:r>
+      <w:r>
+        <w:rPr>
+          <w:rFonts w:ascii="Garamond" w:hAnsi="Garamond"/>
+        </w:rPr>
+        <w:t xml:space="preserve">. </w:t>
+      </w:r>
+    </w:p>
+    <w:p>
+      <w:pPr>
+        <w:spacing w:line="480" w:lineRule="auto"/>
+        <w:ind w:firstLine="720"/>
+      </w:pPr>
+    </w:p>
+    <w:p>
+      <w:pPr>
+        <w:spacing w:line="480" w:lineRule="auto"/>
+        <w:ind w:firstLine="720"/>
+        <w:rPr>
+          <w:sz w:val="22"/>
+          <w:szCs w:val="22"/>
+        </w:rPr>
+      </w:pPr>
+    </w:p>
+    <w:p>
+      <w:pPr>
+        <w:spacing w:line="480" w:lineRule="auto"/>
+        <w:ind w:firstLine="720"/>
+        <w:rPr>
+          <w:sz w:val="22"/>
+          <w:szCs w:val="22"/>
+        </w:rPr>
+      </w:pPr>
+    </w:p>
+    <w:p>
+      <w:pPr>
+        <w:spacing w:line="480" w:lineRule="auto"/>
+        <w:ind w:firstLine="720"/>
+        <w:rPr>
+          <w:rFonts w:ascii="Times New Roman" w:hAnsi="Times New Roman" w:cs="Times New Roman"/>
+          <w:sz w:val="22"/>
+          <w:szCs w:val="22"/>
+        </w:rPr>
+      </w:pPr>
+    </w:p>
+    <w:p>
+      <w:pPr>
+        <w:spacing w:line="480" w:lineRule="auto"/>
+        <w:ind w:firstLine="720"/>
+        <w:rPr>
+          <w:rFonts w:ascii="Times New Roman" w:hAnsi="Times New Roman" w:cs="Times New Roman"/>
+          <w:sz w:val="22"/>
+          <w:szCs w:val="22"/>
+        </w:rPr>
+      </w:pPr>
+    </w:p>
+    <w:p>
+      <w:pPr>
+        <w:spacing w:line="480" w:lineRule="auto"/>
+        <w:ind w:firstLine="720"/>
+        <w:rPr>
+          <w:rFonts w:ascii="Times New Roman" w:hAnsi="Times New Roman" w:cs="Times New Roman"/>
+          <w:sz w:val="22"/>
+          <w:szCs w:val="22"/>
+        </w:rPr>
+      </w:pPr>
+    </w:p>
+    <w:p>
+      <w:pPr>
+        <w:spacing w:line="480" w:lineRule="auto"/>
+        <w:ind w:firstLine="720"/>
+        <w:rPr>
+          <w:rFonts w:ascii="Garamond" w:hAnsi="Garamond"/>
+          <w:sz w:val="22"/>
+          <w:szCs w:val="22"/>
+        </w:rPr>
+      </w:pPr>
+      <w:r>
+        <w:rPr>
+          <w:rFonts w:ascii="Garamond" w:hAnsi="Garamond"/>
+          <w:sz w:val="22"/>
+          <w:szCs w:val="22"/>
+        </w:rPr>
+        <w:t xml:space="preserve">** Isotope based methods etc. etc. </w:t>
+      </w:r>
+    </w:p>
+    <w:p>
+      <w:pPr>
+        <w:spacing w:line="480" w:lineRule="auto"/>
+        <w:ind w:firstLine="720"/>
+        <w:rPr>
+          <w:rFonts w:ascii="Garamond" w:hAnsi="Garamond"/>
+          <w:sz w:val="22"/>
+          <w:szCs w:val="22"/>
+        </w:rPr>
+      </w:pPr>
+      <w:r>
+        <w:rPr>
+          <w:rFonts w:ascii="Garamond" w:hAnsi="Garamond"/>
+          <w:sz w:val="22"/>
+          <w:szCs w:val="22"/>
+        </w:rPr>
+        <w:t xml:space="preserve">** Machine learning methods. </w:t>
+      </w:r>
+    </w:p>
+    <w:p>
+      <w:pPr>
+        <w:spacing w:line="480" w:lineRule="auto"/>
+        <w:ind w:firstLine="720"/>
+        <w:rPr>
+          <w:rFonts w:ascii="Garamond" w:hAnsi="Garamond"/>
+          <w:sz w:val="22"/>
+          <w:szCs w:val="22"/>
+        </w:rPr>
+      </w:pPr>
+    </w:p>
+    <w:p>
+      <w:pPr>
+        <w:spacing w:line="480" w:lineRule="auto"/>
+        <w:ind w:firstLine="720"/>
+        <w:rPr>
+          <w:rFonts w:ascii="Garamond" w:hAnsi="Garamond"/>
+          <w:sz w:val="22"/>
+          <w:szCs w:val="22"/>
+        </w:rPr>
+      </w:pPr>
+    </w:p>
+    <w:p>
+      <w:pPr>
+        <w:spacing w:line="480" w:lineRule="auto"/>
+        <w:ind w:firstLine="720"/>
+        <w:rPr>
+          <w:rFonts w:ascii="Garamond" w:hAnsi="Garamond"/>
+          <w:sz w:val="22"/>
+          <w:szCs w:val="22"/>
+        </w:rPr>
+      </w:pPr>
+    </w:p>
+    <w:p>
+      <w:pPr>
+        <w:spacing w:line="480" w:lineRule="auto"/>
+        <w:ind w:firstLine="720"/>
+        <w:rPr>
+          <w:rFonts w:ascii="Garamond" w:hAnsi="Garamond"/>
+          <w:sz w:val="22"/>
+          <w:szCs w:val="22"/>
+        </w:rPr>
+      </w:pPr>
+    </w:p>
+    <w:p>
+      <w:pPr>
+        <w:spacing w:line="480" w:lineRule="auto"/>
+        <w:ind w:firstLine="720"/>
+        <w:rPr>
+          <w:rFonts w:ascii="Garamond" w:hAnsi="Garamond"/>
+          <w:sz w:val="22"/>
+          <w:szCs w:val="22"/>
+        </w:rPr>
+      </w:pPr>
+    </w:p>
+    <w:p>
+      <w:pPr>
+        <w:spacing w:line="480" w:lineRule="auto"/>
+        <w:ind w:firstLine="720"/>
+        <w:rPr>
+          <w:rFonts w:ascii="Garamond" w:hAnsi="Garamond"/>
+          <w:sz w:val="22"/>
+          <w:szCs w:val="22"/>
+        </w:rPr>
+      </w:pPr>
+    </w:p>
+    <w:p>
+      <w:pPr>
+        <w:spacing w:line="480" w:lineRule="auto"/>
+        <w:ind w:firstLine="720"/>
+        <w:rPr>
+          <w:rFonts w:ascii="Garamond" w:hAnsi="Garamond"/>
+          <w:sz w:val="22"/>
+          <w:szCs w:val="22"/>
+        </w:rPr>
+      </w:pPr>
+    </w:p>
+    <w:p>
+      <w:pPr>
+        <w:spacing w:line="480" w:lineRule="auto"/>
+        <w:ind w:firstLine="720"/>
+        <w:rPr>
+          <w:rFonts w:ascii="Garamond" w:hAnsi="Garamond"/>
+          <w:sz w:val="22"/>
+          <w:szCs w:val="22"/>
+        </w:rPr>
+      </w:pPr>
+      <w:r>
+        <w:rPr>
+          <w:rFonts w:ascii="Garamond" w:hAnsi="Garamond"/>
+          <w:sz w:val="22"/>
+          <w:szCs w:val="22"/>
+        </w:rPr>
         <w:t xml:space="preserve">One ongoing fisheries research challenge is the need to understand the cause and impact of recent stock collapses of </w:t>
       </w:r>
       <w:r>
@@ -892,104 +1610,7 @@
           <w:sz w:val="22"/>
           <w:szCs w:val="22"/>
         </w:rPr>
-        <w:t xml:space="preserve">have </w:t>
-      </w:r>
-      <w:r>
-        <w:rPr>
-          <w:rFonts w:ascii="Garamond" w:hAnsi="Garamond"/>
-          <w:sz w:val="22"/>
-          <w:szCs w:val="22"/>
-        </w:rPr>
-        <w:t xml:space="preserve">led to a </w:t>
-      </w:r>
-      <w:r>
-        <w:rPr>
-          <w:rFonts w:ascii="Garamond" w:hAnsi="Garamond"/>
-          <w:sz w:val="22"/>
-          <w:szCs w:val="22"/>
-        </w:rPr>
-        <w:t>region-wide crisis</w:t>
-      </w:r>
-      <w:r>
-        <w:rPr>
-          <w:rFonts w:ascii="Garamond" w:hAnsi="Garamond"/>
-          <w:sz w:val="22"/>
-          <w:szCs w:val="22"/>
-        </w:rPr>
-        <w:t xml:space="preserve"> of economic uncertainty</w:t>
-      </w:r>
-      <w:r>
-        <w:rPr>
-          <w:rFonts w:ascii="Garamond" w:hAnsi="Garamond"/>
-          <w:sz w:val="22"/>
-          <w:szCs w:val="22"/>
-        </w:rPr>
-        <w:t>,</w:t>
-      </w:r>
-      <w:r>
-        <w:rPr>
-          <w:rFonts w:ascii="Garamond" w:hAnsi="Garamond"/>
-          <w:sz w:val="22"/>
-          <w:szCs w:val="22"/>
-        </w:rPr>
-        <w:t xml:space="preserve"> </w:t>
-      </w:r>
-      <w:r>
-        <w:rPr>
-          <w:rFonts w:ascii="Garamond" w:hAnsi="Garamond"/>
-          <w:sz w:val="22"/>
-          <w:szCs w:val="22"/>
-        </w:rPr>
-        <w:t>food insecurity, and a loss of an important cultural resource</w:t>
-      </w:r>
-      <w:r>
-        <w:rPr>
-          <w:rFonts w:ascii="Garamond" w:hAnsi="Garamond"/>
-          <w:sz w:val="22"/>
-          <w:szCs w:val="22"/>
-        </w:rPr>
-        <w:t xml:space="preserve"> </w:t>
-      </w:r>
-      <w:r>
-        <w:rPr>
-          <w:rFonts w:ascii="Garamond" w:hAnsi="Garamond"/>
-          <w:sz w:val="22"/>
-          <w:szCs w:val="22"/>
-        </w:rPr>
-        <w:fldChar w:fldCharType="begin"/>
-      </w:r>
-      <w:r>
-        <w:rPr>
-          <w:rFonts w:ascii="Garamond" w:hAnsi="Garamond"/>
-          <w:sz w:val="22"/>
-          <w:szCs w:val="22"/>
-        </w:rPr>
-        <w:instrText xml:space="preserve"> ADDIN ZOTERO_ITEM CSL_CITATION {"citationID":"CRrkE0aE","properties":{"formattedCitation":"(Brown &amp; Godduhn, 2015)","plainCitation":"(Brown &amp; Godduhn, 2015)","noteIndex":0},"citationItems":[{"id":4428,"uris":["http://zotero.org/users/8421274/items/2WA8NCRM"],"itemData":{"id":4428,"type":"article-journal","language":"en","source":"Zotero","title":"Socioeconomic effects of declining salmon runs on the Yukon River","author":[{"family":"Brown","given":"Caroline L"},{"family":"Godduhn","given":"Anna"}],"issued":{"date-parts":[["2015"]]}}}],"schema":"https://github.com/citation-style-language/schema/raw/master/csl-citation.json"} </w:instrText>
-      </w:r>
-      <w:r>
-        <w:rPr>
-          <w:rFonts w:ascii="Garamond" w:hAnsi="Garamond"/>
-          <w:sz w:val="22"/>
-          <w:szCs w:val="22"/>
-        </w:rPr>
-        <w:fldChar w:fldCharType="separate"/>
-      </w:r>
-      <w:r>
-        <w:rPr>
-          <w:rFonts w:ascii="Garamond" w:hAnsi="Garamond"/>
-          <w:noProof/>
-          <w:sz w:val="22"/>
-          <w:szCs w:val="22"/>
-        </w:rPr>
-        <w:t>(Brown &amp; Godduhn, 2015)</w:t>
-      </w:r>
-      <w:r>
-        <w:rPr>
-          <w:rFonts w:ascii="Garamond" w:hAnsi="Garamond"/>
-          <w:sz w:val="22"/>
-          <w:szCs w:val="22"/>
-        </w:rPr>
-        <w:fldChar w:fldCharType="end"/>
+        <w:t>have</w:t>
       </w:r>
       <w:r>
         <w:rPr>
@@ -1171,16 +1792,7 @@
           <w:sz w:val="22"/>
           <w:szCs w:val="22"/>
         </w:rPr>
-        <w:t xml:space="preserve">, </w:t>
-      </w:r>
-      <w:r>
-        <w:rPr>
-          <w:rFonts w:ascii="Garamond" w:hAnsi="Garamond"/>
-          <w:sz w:val="22"/>
-          <w:szCs w:val="22"/>
-        </w:rPr>
-        <w:lastRenderedPageBreak/>
-        <w:t>standard</w:t>
+        <w:t>, standard</w:t>
       </w:r>
       <w:r>
         <w:rPr>
@@ -1551,7 +2163,16 @@
           <w:sz w:val="22"/>
           <w:szCs w:val="22"/>
         </w:rPr>
-        <w:t>Despite its precision, this method is limited by the level of isotopic heterogeneity relative to the spatial scale of interest</w:t>
+        <w:t xml:space="preserve">Despite its precision, this method is limited by the level of isotopic heterogeneity relative to the </w:t>
+      </w:r>
+      <w:r>
+        <w:rPr>
+          <w:rFonts w:ascii="Garamond" w:hAnsi="Garamond"/>
+          <w:sz w:val="22"/>
+          <w:szCs w:val="22"/>
+        </w:rPr>
+        <w:lastRenderedPageBreak/>
+        <w:t>spatial scale of interest</w:t>
       </w:r>
       <w:r>
         <w:rPr>
@@ -1885,24 +2506,7 @@
           <w:sz w:val="22"/>
           <w:szCs w:val="22"/>
         </w:rPr>
-        <w:t>However, d</w:t>
-      </w:r>
-      <w:r>
-        <w:rPr>
-          <w:rFonts w:ascii="Garamond" w:hAnsi="Garamond"/>
-          <w:sz w:val="22"/>
-          <w:szCs w:val="22"/>
-        </w:rPr>
-        <w:t xml:space="preserve">uring rapid movements through multiple environments, as occurs during salmon out-migration, otolith isotope ratios may not fully equilibrate to reflect the water chemistry of each habitat. Consequently, otolith isotope patterns may be difficult to interpret solely by direct comparison to landscape values, even though </w:t>
-      </w:r>
-      <w:r>
-        <w:rPr>
-          <w:rFonts w:ascii="Garamond" w:hAnsi="Garamond"/>
-          <w:sz w:val="22"/>
-          <w:szCs w:val="22"/>
-        </w:rPr>
-        <w:lastRenderedPageBreak/>
-        <w:t>they may encode stock- or watershed-specific life history information. The subtlety of these patterns, combined with the large number of possible combinations, makes manual interpretation impractical.</w:t>
+        <w:t>However, during rapid movements through multiple environments, as occurs during salmon out-migration, otolith isotope ratios may not fully equilibrate to reflect the water chemistry of each habitat. Consequently, otolith isotope patterns may be difficult to interpret solely by direct comparison to landscape values, even though they may encode stock- or watershed-specific life history information. The subtlety of these patterns, combined with the large number of possible combinations, makes manual interpretation impractical.</w:t>
       </w:r>
     </w:p>
     <w:p>
@@ -2043,14 +2647,66 @@
           <w:sz w:val="22"/>
           <w:szCs w:val="22"/>
         </w:rPr>
-        <w:t>At the same time, there is growing recognition that collapsing continuous laser ablation (LA) data into single, discrete values results in the loss of potentially powerful information</w:t>
-      </w:r>
-      <w:r>
-        <w:rPr>
-          <w:rFonts w:ascii="Garamond" w:hAnsi="Garamond"/>
-          <w:sz w:val="22"/>
-          <w:szCs w:val="22"/>
-        </w:rPr>
+        <w:t xml:space="preserve">At the same time, there is growing recognition that collapsing continuous laser ablation (LA) data into single, discrete values results in the loss of potentially powerful information </w:t>
+      </w:r>
+      <w:r>
+        <w:rPr>
+          <w:rFonts w:ascii="Garamond" w:hAnsi="Garamond"/>
+          <w:sz w:val="22"/>
+          <w:szCs w:val="22"/>
+        </w:rPr>
+        <w:fldChar w:fldCharType="begin"/>
+      </w:r>
+      <w:r>
+        <w:rPr>
+          <w:rFonts w:ascii="Garamond" w:hAnsi="Garamond"/>
+          <w:sz w:val="22"/>
+          <w:szCs w:val="22"/>
+        </w:rPr>
+        <w:instrText xml:space="preserve"> ADDIN ZOTERO_ITEM CSL_CITATION {"citationID":"MNuLFNnB","properties":{"formattedCitation":"(Hegg &amp; Kennedy, 2021)","plainCitation":"(Hegg &amp; Kennedy, 2021)","noteIndex":0},"citationItems":[{"id":4390,"uris":["http://zotero.org/users/8421274/items/BD9UPNI2"],"itemData":{"id":4390,"type":"article-journal","abstract":"Ecological patterns are often fundamentally chronological. However, generalization of data is necessarily accompanied by a loss of detail or resolution. Temporal data in particular contain information not only in data values but in the temporal structure, which is lost when these values are aggregated to provide point estimates. Dynamic time warping (DTW) is a time series comparison method that is capable of efficiently comparing series despite temporal offsets that confound other methods. The DTW method is both efficient and remarkably flexible, capable of efficiently matching not only time series but also any sequentially structured data set, which has made it a popular technique in machine learning, artificial intelligence, and big data analytical tasks. DTW is rarely used in ecology despite the ubiquity of temporally structured data. As technological advances have increased the richness of small-scale ecological data, DTW may be an attractive analysis technique because it is able to utilize the additional information contained in the temporal structure of many ecological data sets. In this study, we use an example data set of high-resolution fish movement records obtained from otolith microchemistry to compare traditional analysis techniques with DTW clustering. Our results suggest that DTW is capable of detecting subtle behavioral patterns within otolith data sets which traditional data aggregation techniques cannot. These results provide evidence that the DTW method may be useful across many of the temporal data types commonly collected in ecology, as well other sequentially ordered “pseudo time series” data such as classification of species by shape.","container-title":"Ecosphere","DOI":"10.1002/ecs2.3742","ISSN":"2150-8925","issue":"9","language":"en","note":"_eprint: https://esajournals.onlinelibrary.wiley.com/doi/pdf/10.1002/ecs2.3742","page":"e03742","source":"Wiley Online Library","title":"Let's do the time warp again: non-linear time series matching as a tool for sequentially structured data in ecology","title-short":"Let's do the time warp again","volume":"12","author":[{"family":"Hegg","given":"Jens C."},{"family":"Kennedy","given":"Brian P."}],"issued":{"date-parts":[["2021"]]}}}],"schema":"https://github.com/citation-style-language/schema/raw/master/csl-citation.json"} </w:instrText>
+      </w:r>
+      <w:r>
+        <w:rPr>
+          <w:rFonts w:ascii="Garamond" w:hAnsi="Garamond"/>
+          <w:sz w:val="22"/>
+          <w:szCs w:val="22"/>
+        </w:rPr>
+        <w:fldChar w:fldCharType="separate"/>
+      </w:r>
+      <w:r>
+        <w:rPr>
+          <w:rFonts w:ascii="Garamond" w:hAnsi="Garamond"/>
+          <w:noProof/>
+          <w:sz w:val="22"/>
+          <w:szCs w:val="22"/>
+        </w:rPr>
+        <w:t>(Hegg &amp; Kennedy, 2021)</w:t>
+      </w:r>
+      <w:r>
+        <w:rPr>
+          <w:rFonts w:ascii="Garamond" w:hAnsi="Garamond"/>
+          <w:sz w:val="22"/>
+          <w:szCs w:val="22"/>
+        </w:rPr>
+        <w:fldChar w:fldCharType="end"/>
+      </w:r>
+      <w:r>
+        <w:rPr>
+          <w:rFonts w:ascii="Garamond" w:hAnsi="Garamond"/>
+          <w:sz w:val="22"/>
+          <w:szCs w:val="22"/>
+        </w:rPr>
+        <w:t xml:space="preserve">. </w:t>
+      </w:r>
+      <w:r>
+        <w:rPr>
+          <w:rFonts w:ascii="Garamond" w:hAnsi="Garamond"/>
+          <w:sz w:val="22"/>
+          <w:szCs w:val="22"/>
+        </w:rPr>
+        <w:t>Leveraging the statistical power of machine learning on sequentially ordered otolith time-series data may enable the detection of otherwise indiscernible patterns within and across LA datasets, potentially revealing key life history traits and providing novel insights into ecological processes across space and time.</w:t>
+      </w:r>
+      <w:r>
         <w:t xml:space="preserve"> </w:t>
       </w:r>
       <w:r>
@@ -2059,82 +2715,6 @@
           <w:sz w:val="22"/>
           <w:szCs w:val="22"/>
         </w:rPr>
-        <w:fldChar w:fldCharType="begin"/>
-      </w:r>
-      <w:r>
-        <w:rPr>
-          <w:rFonts w:ascii="Garamond" w:hAnsi="Garamond"/>
-          <w:sz w:val="22"/>
-          <w:szCs w:val="22"/>
-        </w:rPr>
-        <w:instrText xml:space="preserve"> ADDIN ZOTERO_ITEM CSL_CITATION {"citationID":"MNuLFNnB","properties":{"formattedCitation":"(Hegg &amp; Kennedy, 2021)","plainCitation":"(Hegg &amp; Kennedy, 2021)","noteIndex":0},"citationItems":[{"id":4390,"uris":["http://zotero.org/users/8421274/items/BD9UPNI2"],"itemData":{"id":4390,"type":"article-journal","abstract":"Ecological patterns are often fundamentally chronological. However, generalization of data is necessarily accompanied by a loss of detail or resolution. Temporal data in particular contain information not only in data values but in the temporal structure, which is lost when these values are aggregated to provide point estimates. Dynamic time warping (DTW) is a time series comparison method that is capable of efficiently comparing series despite temporal offsets that confound other methods. The DTW method is both efficient and remarkably flexible, capable of efficiently matching not only time series but also any sequentially structured data set, which has made it a popular technique in machine learning, artificial intelligence, and big data analytical tasks. DTW is rarely used in ecology despite the ubiquity of temporally structured data. As technological advances have increased the richness of small-scale ecological data, DTW may be an attractive analysis technique because it is able to utilize the additional information contained in the temporal structure of many ecological data sets. In this study, we use an example data set of high-resolution fish movement records obtained from otolith microchemistry to compare traditional analysis techniques with DTW clustering. Our results suggest that DTW is capable of detecting subtle behavioral patterns within otolith data sets which traditional data aggregation techniques cannot. These results provide evidence that the DTW method may be useful across many of the temporal data types commonly collected in ecology, as well other sequentially ordered “pseudo time series” data such as classification of species by shape.","container-title":"Ecosphere","DOI":"10.1002/ecs2.3742","ISSN":"2150-8925","issue":"9","language":"en","note":"_eprint: https://esajournals.onlinelibrary.wiley.com/doi/pdf/10.1002/ecs2.3742","page":"e03742","source":"Wiley Online Library","title":"Let's do the time warp again: non-linear time series matching as a tool for sequentially structured data in ecology","title-short":"Let's do the time warp again","volume":"12","author":[{"family":"Hegg","given":"Jens C."},{"family":"Kennedy","given":"Brian P."}],"issued":{"date-parts":[["2021"]]}}}],"schema":"https://github.com/citation-style-language/schema/raw/master/csl-citation.json"} </w:instrText>
-      </w:r>
-      <w:r>
-        <w:rPr>
-          <w:rFonts w:ascii="Garamond" w:hAnsi="Garamond"/>
-          <w:sz w:val="22"/>
-          <w:szCs w:val="22"/>
-        </w:rPr>
-        <w:fldChar w:fldCharType="separate"/>
-      </w:r>
-      <w:r>
-        <w:rPr>
-          <w:rFonts w:ascii="Garamond" w:hAnsi="Garamond"/>
-          <w:noProof/>
-          <w:sz w:val="22"/>
-          <w:szCs w:val="22"/>
-        </w:rPr>
-        <w:t>(Hegg &amp; Kennedy, 2021)</w:t>
-      </w:r>
-      <w:r>
-        <w:rPr>
-          <w:rFonts w:ascii="Garamond" w:hAnsi="Garamond"/>
-          <w:sz w:val="22"/>
-          <w:szCs w:val="22"/>
-        </w:rPr>
-        <w:fldChar w:fldCharType="end"/>
-      </w:r>
-      <w:r>
-        <w:rPr>
-          <w:rFonts w:ascii="Garamond" w:hAnsi="Garamond"/>
-          <w:sz w:val="22"/>
-          <w:szCs w:val="22"/>
-        </w:rPr>
-        <w:t xml:space="preserve">. </w:t>
-      </w:r>
-      <w:r>
-        <w:rPr>
-          <w:rFonts w:ascii="Garamond" w:hAnsi="Garamond"/>
-          <w:sz w:val="22"/>
-          <w:szCs w:val="22"/>
-        </w:rPr>
-        <w:t xml:space="preserve">Leveraging the statistical power of machine learning on sequentially ordered otolith time-series data may enable the detection of otherwise indiscernible patterns within and across LA datasets, potentially revealing key life history traits and providing </w:t>
-      </w:r>
-      <w:r>
-        <w:rPr>
-          <w:rFonts w:ascii="Garamond" w:hAnsi="Garamond"/>
-          <w:sz w:val="22"/>
-          <w:szCs w:val="22"/>
-        </w:rPr>
-        <w:t xml:space="preserve">novel </w:t>
-      </w:r>
-      <w:r>
-        <w:rPr>
-          <w:rFonts w:ascii="Garamond" w:hAnsi="Garamond"/>
-          <w:sz w:val="22"/>
-          <w:szCs w:val="22"/>
-        </w:rPr>
-        <w:t>insights into ecological processes across space and time.</w:t>
-      </w:r>
-      <w:r>
-        <w:t xml:space="preserve"> </w:t>
-      </w:r>
-      <w:r>
-        <w:rPr>
-          <w:rFonts w:ascii="Garamond" w:hAnsi="Garamond"/>
-          <w:sz w:val="22"/>
-          <w:szCs w:val="22"/>
-        </w:rPr>
         <w:t>Here, we apply machine learning classification algorithms to otolith LA data from Chinook salmon in Western Alaska.</w:t>
       </w:r>
       <w:r>
@@ -2177,7 +2757,16 @@
           <w:sz w:val="22"/>
           <w:szCs w:val="22"/>
         </w:rPr>
-        <w:t xml:space="preserve">methods to uncover watershed specific characteristics to discriminate among watersheds of origin and 2) </w:t>
+        <w:t xml:space="preserve">methods to uncover watershed </w:t>
+      </w:r>
+      <w:r>
+        <w:rPr>
+          <w:rFonts w:ascii="Garamond" w:hAnsi="Garamond"/>
+          <w:sz w:val="22"/>
+          <w:szCs w:val="22"/>
+        </w:rPr>
+        <w:lastRenderedPageBreak/>
+        <w:t xml:space="preserve">specific characteristics to discriminate among watersheds of origin and 2) </w:t>
       </w:r>
       <w:r>
         <w:rPr>
@@ -2419,16 +3008,7 @@
           <w:sz w:val="22"/>
           <w:szCs w:val="22"/>
         </w:rPr>
-        <w:t xml:space="preserve">, </w:t>
-      </w:r>
-      <w:r>
-        <w:rPr>
-          <w:rFonts w:ascii="Garamond" w:hAnsi="Garamond"/>
-          <w:sz w:val="22"/>
-          <w:szCs w:val="22"/>
-        </w:rPr>
-        <w:lastRenderedPageBreak/>
-        <w:t>mounted on microscope slides, and polished to enhance clarity</w:t>
+        <w:t>, mounted on microscope slides, and polished to enhance clarity</w:t>
       </w:r>
       <w:r>
         <w:rPr>
@@ -2802,7 +3382,17 @@
           <w:sz w:val="22"/>
           <w:szCs w:val="22"/>
         </w:rPr>
-        <w:t>(Brennan &amp; Schindler, 2017)</w:t>
+        <w:t xml:space="preserve">(Brennan &amp; </w:t>
+      </w:r>
+      <w:r>
+        <w:rPr>
+          <w:rFonts w:ascii="Garamond" w:hAnsi="Garamond"/>
+          <w:noProof/>
+          <w:sz w:val="22"/>
+          <w:szCs w:val="22"/>
+        </w:rPr>
+        <w:lastRenderedPageBreak/>
+        <w:t>Schindler, 2017)</w:t>
       </w:r>
       <w:r>
         <w:rPr>
@@ -3399,16 +3989,7 @@
           <w:sz w:val="22"/>
           <w:szCs w:val="22"/>
         </w:rPr>
-        <w:t xml:space="preserve">(Kim </w:t>
-      </w:r>
-      <w:r>
-        <w:rPr>
-          <w:rFonts w:ascii="Garamond" w:hAnsi="Garamond"/>
-          <w:sz w:val="22"/>
-          <w:szCs w:val="22"/>
-        </w:rPr>
-        <w:lastRenderedPageBreak/>
-        <w:t xml:space="preserve">and Gu, 2004, Brennan et al., </w:t>
+        <w:t xml:space="preserve">(Kim and Gu, 2004, Brennan et al., </w:t>
       </w:r>
       <w:r>
         <w:rPr>
@@ -3466,15 +4047,7 @@
           <w:sz w:val="22"/>
           <w:szCs w:val="22"/>
         </w:rPr>
-        <w:t xml:space="preserve"> series (700 points for non-MA and 600 points for MA-smoothed samples, respectively)</w:t>
-      </w:r>
-      <w:r>
-        <w:rPr>
-          <w:rFonts w:ascii="Garamond" w:hAnsi="Garamond"/>
-          <w:sz w:val="22"/>
-          <w:szCs w:val="22"/>
-        </w:rPr>
-        <w:t xml:space="preserve"> </w:t>
+        <w:t xml:space="preserve"> series (700 points for non-MA and 600 points for MA-smoothed samples, respectively) </w:t>
       </w:r>
       <w:r>
         <w:rPr>
@@ -3531,16 +4104,7 @@
           <w:sz w:val="22"/>
           <w:szCs w:val="22"/>
         </w:rPr>
-        <w:t xml:space="preserve">datasets (non-smoothed (Raw), MA, and GAM). </w:t>
-      </w:r>
-      <w:commentRangeStart w:id="2"/>
-      <w:r>
-        <w:rPr>
-          <w:rFonts w:ascii="Garamond" w:hAnsi="Garamond"/>
-          <w:sz w:val="22"/>
-          <w:szCs w:val="22"/>
-        </w:rPr>
-        <w:t xml:space="preserve">For each dataset we trained </w:t>
+        <w:t xml:space="preserve">datasets (non-smoothed (Raw), MA, and GAM). For each dataset we trained </w:t>
       </w:r>
       <w:r>
         <w:rPr>
@@ -3662,7 +4226,16 @@
           <w:sz w:val="22"/>
           <w:szCs w:val="22"/>
         </w:rPr>
-        <w:t xml:space="preserve">) was set to the square root of the total number of predictors, following standard practice for classification problems. The KNN model was trained using five neighbors, while the SVM model used default hyperparameters for the RBF kernel. All models were implemented using the </w:t>
+        <w:t xml:space="preserve">) was set to the square root of the total number of predictors, following standard practice for </w:t>
+      </w:r>
+      <w:r>
+        <w:rPr>
+          <w:rFonts w:ascii="Garamond" w:hAnsi="Garamond"/>
+          <w:sz w:val="22"/>
+          <w:szCs w:val="22"/>
+        </w:rPr>
+        <w:lastRenderedPageBreak/>
+        <w:t xml:space="preserve">classification problems. The KNN model was trained using five neighbors, while the SVM model used default hyperparameters for the RBF kernel. All models were implemented using the </w:t>
       </w:r>
       <w:proofErr w:type="spellStart"/>
       <w:r>
@@ -3690,16 +4263,6 @@
           <w:szCs w:val="22"/>
         </w:rPr>
         <w:t xml:space="preserve">. </w:t>
-      </w:r>
-      <w:commentRangeEnd w:id="2"/>
-      <w:r>
-        <w:rPr>
-          <w:rStyle w:val="CommentReference"/>
-          <w:rFonts w:asciiTheme="minorHAnsi" w:eastAsiaTheme="minorHAnsi" w:hAnsiTheme="minorHAnsi" w:cstheme="minorBidi"/>
-          <w:kern w:val="2"/>
-          <w14:ligatures w14:val="standardContextual"/>
-        </w:rPr>
-        <w:commentReference w:id="2"/>
       </w:r>
     </w:p>
     <w:p>
@@ -3719,15 +4282,7 @@
           <w:sz w:val="22"/>
           <w:szCs w:val="22"/>
         </w:rPr>
-        <w:t>T</w:t>
-      </w:r>
-      <w:r>
-        <w:rPr>
-          <w:rFonts w:ascii="Garamond" w:hAnsi="Garamond"/>
-          <w:sz w:val="22"/>
-          <w:szCs w:val="22"/>
-        </w:rPr>
-        <w:t xml:space="preserve">rained models were evaluated on two separate testing datasets. First, models were tested on the original randomly selected 20% holdout set. Second, models were evaluated on a modified testing set in which samples with natal origin </w:t>
+        <w:t xml:space="preserve">Trained models were evaluated on two separate testing datasets. First, models were tested on the original randomly selected 20% holdout set. Second, models were evaluated on a modified testing set in which samples with natal origin </w:t>
       </w:r>
       <w:r>
         <w:rPr>
@@ -3839,7 +4394,6 @@
           <w:szCs w:val="22"/>
           <w:u w:val="single"/>
         </w:rPr>
-        <w:lastRenderedPageBreak/>
         <w:t>PCA Analysis</w:t>
       </w:r>
     </w:p>
@@ -4057,39 +4611,24 @@
           <w:sz w:val="22"/>
           <w:szCs w:val="22"/>
         </w:rPr>
-        <w:t xml:space="preserve">% of variance) and PC2 (20.93% of variance) as well as between PC1 and PC3 (10.23% of variance). </w:t>
-      </w:r>
-      <w:r>
-        <w:rPr>
-          <w:rFonts w:ascii="Garamond" w:hAnsi="Garamond"/>
-          <w:sz w:val="22"/>
-          <w:szCs w:val="22"/>
-        </w:rPr>
-        <w:t>To identify the most discriminatory portions of the timeseries, we mapped the absolute values of principal component loadings onto their</w:t>
-      </w:r>
-      <w:r>
-        <w:rPr>
-          <w:rFonts w:ascii="Garamond" w:hAnsi="Garamond"/>
-          <w:sz w:val="22"/>
-          <w:szCs w:val="22"/>
-        </w:rPr>
-        <w:t xml:space="preserve"> </w:t>
-      </w:r>
-      <w:r>
-        <w:rPr>
-          <w:rFonts w:ascii="Garamond" w:hAnsi="Garamond"/>
-          <w:sz w:val="22"/>
-          <w:szCs w:val="22"/>
-        </w:rPr>
-        <w:t>corresponding timeseries positions</w:t>
-      </w:r>
-      <w:r>
-        <w:rPr>
-          <w:rFonts w:ascii="Garamond" w:hAnsi="Garamond"/>
-          <w:sz w:val="22"/>
-          <w:szCs w:val="22"/>
-        </w:rPr>
-        <w:t xml:space="preserve"> (Figure 5b.)</w:t>
+        <w:t xml:space="preserve">% of variance) and PC2 (20.93% of variance) as </w:t>
+      </w:r>
+      <w:r>
+        <w:rPr>
+          <w:rFonts w:ascii="Garamond" w:hAnsi="Garamond"/>
+          <w:sz w:val="22"/>
+          <w:szCs w:val="22"/>
+        </w:rPr>
+        <w:lastRenderedPageBreak/>
+        <w:t xml:space="preserve">well as between PC1 and PC3 (10.23% of variance). </w:t>
+      </w:r>
+      <w:r>
+        <w:rPr>
+          <w:rFonts w:ascii="Garamond" w:hAnsi="Garamond"/>
+          <w:sz w:val="22"/>
+          <w:szCs w:val="22"/>
+        </w:rPr>
+        <w:t>To identify the most discriminatory portions of the timeseries, we mapped the absolute values of principal component loadings onto their corresponding timeseries positions (Figure 5b.)</w:t>
       </w:r>
       <w:r>
         <w:rPr>
@@ -4173,23 +4712,7 @@
           <w:sz w:val="22"/>
           <w:szCs w:val="22"/>
         </w:rPr>
-        <w:t>Many machine learning classification models produce probability estimates that do not accurately reflect the true likelihood of correct prediction. While these models may achieve high classification accuracy, their reported confidence levels may not match the true proportion of correct classifications within each confidence bin. This limits the utility of these results for decision-making based on confidence thresholds or propagation of uncertainty through further probability-based models.</w:t>
-      </w:r>
-      <w:r>
-        <w:rPr>
-          <w:rFonts w:ascii="Garamond" w:hAnsi="Garamond"/>
-          <w:sz w:val="22"/>
-          <w:szCs w:val="22"/>
-        </w:rPr>
-        <w:t xml:space="preserve"> </w:t>
-      </w:r>
-      <w:r>
-        <w:rPr>
-          <w:rFonts w:ascii="Garamond" w:hAnsi="Garamond"/>
-          <w:sz w:val="22"/>
-          <w:szCs w:val="22"/>
-        </w:rPr>
-        <w:t xml:space="preserve">To calibrate predictions from our models, we used the </w:t>
+        <w:t xml:space="preserve">Many machine learning classification models produce probability estimates that do not accurately reflect the true likelihood of correct prediction. While these models may achieve high classification accuracy, their reported confidence levels may not match the true proportion of correct classifications within each confidence bin. This limits the utility of these results for decision-making based on confidence thresholds or propagation of uncertainty through further probability-based models. To calibrate predictions from our models, we used the </w:t>
       </w:r>
       <w:r>
         <w:rPr>
@@ -4206,16 +4729,7 @@
           <w:sz w:val="22"/>
           <w:szCs w:val="22"/>
         </w:rPr>
-        <w:t xml:space="preserve"> package in R to apply multinomial isotonic regression to our testing set predictions. This approach adjusts the raw probability outputs to better align predicted confidence with actual classification accuracy through a non-parametric monotonic transformation. We verified calibration </w:t>
-      </w:r>
-      <w:r>
-        <w:rPr>
-          <w:rFonts w:ascii="Garamond" w:hAnsi="Garamond"/>
-          <w:sz w:val="22"/>
-          <w:szCs w:val="22"/>
-        </w:rPr>
-        <w:lastRenderedPageBreak/>
-        <w:t xml:space="preserve">effectiveness through diagrams that plot predicted probabilities against observed class frequencies across probability bins. Additionally, we quantified calibration improvements using Brier scores and logarithmic loss calculated before and after </w:t>
+        <w:t xml:space="preserve"> package in R to apply multinomial isotonic regression to our testing set predictions. This approach adjusts the raw probability outputs to better align predicted confidence with actual classification accuracy through a non-parametric monotonic transformation. We verified calibration effectiveness through diagrams that plot predicted probabilities against observed class frequencies across probability bins. Additionally, we quantified calibration improvements using Brier scores and logarithmic loss calculated before and after </w:t>
       </w:r>
       <w:proofErr w:type="spellStart"/>
       <w:proofErr w:type="gramStart"/>
@@ -4297,6 +4811,7 @@
           <w:sz w:val="32"/>
           <w:szCs w:val="32"/>
         </w:rPr>
+        <w:lastRenderedPageBreak/>
         <w:t xml:space="preserve">*** Unsure if this will be in this paper or the next. Basically, now that we have true </w:t>
       </w:r>
       <w:proofErr w:type="gramStart"/>
@@ -4470,16 +4985,7 @@
           <w:sz w:val="22"/>
           <w:szCs w:val="22"/>
         </w:rPr>
-        <w:t xml:space="preserve">, which may have </w:t>
-      </w:r>
-      <w:r>
-        <w:rPr>
-          <w:rFonts w:ascii="Garamond" w:hAnsi="Garamond"/>
-          <w:sz w:val="22"/>
-          <w:szCs w:val="22"/>
-        </w:rPr>
-        <w:lastRenderedPageBreak/>
-        <w:t xml:space="preserve">more dimensionality due to less autocorrelation among points. </w:t>
+        <w:t xml:space="preserve">, which may have more dimensionality due to less autocorrelation among points. </w:t>
       </w:r>
       <w:r>
         <w:rPr>
@@ -4626,7 +5132,16 @@
           <w:sz w:val="22"/>
           <w:szCs w:val="22"/>
         </w:rPr>
-        <w:t xml:space="preserve"> fish did not change (91.4%) whereas Kuskokwim saw a slight increase to 92.5%. In this testing set the most frequent misclassification was Yukon fish predicted to have been Kuskokwim (8.8% of Yukon fish</w:t>
+        <w:t xml:space="preserve"> fish did not change </w:t>
+      </w:r>
+      <w:r>
+        <w:rPr>
+          <w:rFonts w:ascii="Garamond" w:hAnsi="Garamond"/>
+          <w:sz w:val="22"/>
+          <w:szCs w:val="22"/>
+        </w:rPr>
+        <w:lastRenderedPageBreak/>
+        <w:t>(91.4%) whereas Kuskokwim saw a slight increase to 92.5%. In this testing set the most frequent misclassification was Yukon fish predicted to have been Kuskokwim (8.8% of Yukon fish</w:t>
       </w:r>
       <w:proofErr w:type="gramStart"/>
       <w:r>
@@ -4691,23 +5206,7 @@
           <w:sz w:val="22"/>
           <w:szCs w:val="22"/>
         </w:rPr>
-        <w:t>Principal component analysis of the full GAM-smoothed dataset (n = 2,531) revealed significant clustering of watershed classes in reduced-dimensional space. The first two principal components together captured 97.3% of the total variance in the dataset (PC1: 92.2%, PC2: 5.1%, Figure 4). Despite clear clustering patterns, some overlap remained among all three watersheds.</w:t>
-      </w:r>
-      <w:r>
-        <w:rPr>
-          <w:rFonts w:ascii="Garamond" w:hAnsi="Garamond"/>
-          <w:sz w:val="22"/>
-          <w:szCs w:val="22"/>
-        </w:rPr>
-        <w:t xml:space="preserve"> </w:t>
-      </w:r>
-      <w:r>
-        <w:rPr>
-          <w:rFonts w:ascii="Garamond" w:hAnsi="Garamond"/>
-          <w:sz w:val="22"/>
-          <w:szCs w:val="22"/>
-        </w:rPr>
-        <w:t xml:space="preserve">Kuskokwim samples (Figure 4, red) exhibited the greatest degree of overlap, showing significant overlap with both </w:t>
+        <w:t xml:space="preserve">Principal component analysis of the full GAM-smoothed dataset (n = 2,531) revealed significant clustering of watershed classes in reduced-dimensional space. The first two principal components together captured 97.3% of the total variance in the dataset (PC1: 92.2%, PC2: 5.1%, Figure 4). Despite clear clustering patterns, some overlap remained among all three watersheds. Kuskokwim samples (Figure 4, red) exhibited the greatest degree of overlap, showing significant overlap with both </w:t>
       </w:r>
       <w:proofErr w:type="spellStart"/>
       <w:r>
@@ -4744,40 +5243,7 @@
           <w:sz w:val="22"/>
           <w:szCs w:val="22"/>
         </w:rPr>
-        <w:lastRenderedPageBreak/>
-        <w:t>Mapping the loadings of each principal component onto the timeseries revealed distinct regions driving class separation. The first principal component showed high loading values in the middle portion of the timeseries, potentially encompassing both natal origin regions and secondary rearing locations.</w:t>
-      </w:r>
-      <w:r>
-        <w:rPr>
-          <w:rFonts w:ascii="Garamond" w:hAnsi="Garamond"/>
-          <w:sz w:val="22"/>
-          <w:szCs w:val="22"/>
-        </w:rPr>
-        <w:t xml:space="preserve"> </w:t>
-      </w:r>
-      <w:r>
-        <w:rPr>
-          <w:rFonts w:ascii="Garamond" w:hAnsi="Garamond"/>
-          <w:sz w:val="22"/>
-          <w:szCs w:val="22"/>
-        </w:rPr>
-        <w:t>The second principal component was driven by variation occurring just before the onset of the marine region, likely representing residency in mainstem tributaries during ocean migration. The relative shape at this point in the timeseries reflects differences in mainstem tributary Sr87/86 values among the three watersheds.</w:t>
-      </w:r>
-      <w:r>
-        <w:rPr>
-          <w:rFonts w:ascii="Garamond" w:hAnsi="Garamond"/>
-          <w:sz w:val="22"/>
-          <w:szCs w:val="22"/>
-        </w:rPr>
-        <w:t xml:space="preserve"> </w:t>
-      </w:r>
-      <w:r>
-        <w:rPr>
-          <w:rFonts w:ascii="Garamond" w:hAnsi="Garamond"/>
-          <w:sz w:val="22"/>
-          <w:szCs w:val="22"/>
-        </w:rPr>
-        <w:t>Principal component 3 appeared to be driven by values at the very beginning of the timeseries, corresponding to the start of the natal origin signature. The minimal discrimination among watersheds along this component was expected, as all individuals in this dataset shared the same natal origin value</w:t>
+        <w:t>Mapping the loadings of each principal component onto the timeseries revealed distinct regions driving class separation. The first principal component showed high loading values in the middle portion of the timeseries, potentially encompassing both natal origin regions and secondary rearing locations. The second principal component was driven by variation occurring just before the onset of the marine region, likely representing residency in mainstem tributaries during ocean migration. The relative shape at this point in the timeseries reflects differences in mainstem tributary Sr87/86 values among the three watersheds. Principal component 3 appeared to be driven by values at the very beginning of the timeseries, corresponding to the start of the natal origin signature. The minimal discrimination among watersheds along this component was expected, as all individuals in this dataset shared the same natal origin value</w:t>
       </w:r>
       <w:r>
         <w:rPr>
@@ -4857,23 +5323,7 @@
           <w:sz w:val="22"/>
           <w:szCs w:val="22"/>
         </w:rPr>
-        <w:t xml:space="preserve">The result of probability tuning </w:t>
-      </w:r>
-      <w:r>
-        <w:rPr>
-          <w:rFonts w:ascii="Garamond" w:hAnsi="Garamond"/>
-          <w:sz w:val="22"/>
-          <w:szCs w:val="22"/>
-        </w:rPr>
-        <w:t>demonstrated consistent improvements in probability calibration across all models. Log-loss values decreased by an average of 0.0026 (, while Brier scores improved by an average of 0. The TOTAL analysis framework showed marginally larger improvements compared to the OVERLAP framework, with GAM-smoothed data showing the most consistent calibration performance</w:t>
-      </w:r>
-      <w:r>
-        <w:rPr>
-          <w:rFonts w:ascii="Garamond" w:hAnsi="Garamond"/>
-          <w:sz w:val="22"/>
-          <w:szCs w:val="22"/>
-        </w:rPr>
-        <w:t xml:space="preserve">. Visual inspection of reliability diagrams confirmed improved alignment between predicted and observed probabilities following calibration. </w:t>
+        <w:t xml:space="preserve">The result of probability tuning demonstrated consistent improvements in probability calibration across all models. Log-loss values decreased by an average of 0.0026 (, while Brier scores improved by an average of 0. The TOTAL analysis framework showed marginally larger improvements compared to the OVERLAP framework, with GAM-smoothed data showing the most consistent calibration performance. Visual inspection of reliability diagrams confirmed improved alignment between predicted and observed probabilities following calibration. </w:t>
       </w:r>
     </w:p>
     <w:p>
@@ -4949,16 +5399,7 @@
           <w:sz w:val="22"/>
           <w:szCs w:val="22"/>
         </w:rPr>
-        <w:t xml:space="preserve"> accuracy </w:t>
-      </w:r>
-      <w:r>
-        <w:rPr>
-          <w:rFonts w:ascii="Garamond" w:hAnsi="Garamond"/>
-          <w:sz w:val="22"/>
-          <w:szCs w:val="22"/>
-        </w:rPr>
-        <w:lastRenderedPageBreak/>
-        <w:t>dropped steadily from 91% to 84</w:t>
+        <w:t xml:space="preserve"> accuracy dropped steadily from 91% to 84</w:t>
       </w:r>
       <w:proofErr w:type="gramStart"/>
       <w:r>
@@ -5075,23 +5516,6 @@
       </w:r>
     </w:p>
   </w:comment>
-  <w:comment w:id="2" w:author="Benjamin J. Makhlouf" w:date="2025-08-18T11:43:00Z" w:initials="b">
-    <w:p>
-      <w:r>
-        <w:rPr>
-          <w:rStyle w:val="CommentReference"/>
-        </w:rPr>
-        <w:annotationRef/>
-      </w:r>
-      <w:r>
-        <w:rPr>
-          <w:sz w:val="20"/>
-          <w:szCs w:val="20"/>
-        </w:rPr>
-        <w:t xml:space="preserve">Question for Valentina: How in depth do I need to go into hyperparameters? </w:t>
-      </w:r>
-    </w:p>
-  </w:comment>
 </w:comments>
 </file>
 
@@ -5099,7 +5523,6 @@
 <w15:commentsEx xmlns:wpc="http://schemas.microsoft.com/office/word/2010/wordprocessingCanvas" xmlns:cx="http://schemas.microsoft.com/office/drawing/2014/chartex" xmlns:cx1="http://schemas.microsoft.com/office/drawing/2015/9/8/chartex" xmlns:cx2="http://schemas.microsoft.com/office/drawing/2015/10/21/chartex" xmlns:cx3="http://schemas.microsoft.com/office/drawing/2016/5/9/chartex" xmlns:cx4="http://schemas.microsoft.com/office/drawing/2016/5/10/chartex" xmlns:cx5="http://schemas.microsoft.com/office/drawing/2016/5/11/chartex" xmlns:cx6="http://schemas.microsoft.com/office/drawing/2016/5/12/chartex" xmlns:cx7="http://schemas.microsoft.com/office/drawing/2016/5/13/chartex" xmlns:cx8="http://schemas.microsoft.com/office/drawing/2016/5/14/chartex" xmlns:mc="http://schemas.openxmlformats.org/markup-compatibility/2006" xmlns:aink="http://schemas.microsoft.com/office/drawing/2016/ink" xmlns:am3d="http://schemas.microsoft.com/office/drawing/2017/model3d" xmlns:o="urn:schemas-microsoft-com:office:office" xmlns:oel="http://schemas.microsoft.com/office/2019/extlst" xmlns:r="http://schemas.openxmlformats.org/officeDocument/2006/relationships" xmlns:m="http://schemas.openxmlformats.org/officeDocument/2006/math" xmlns:v="urn:schemas-microsoft-com:vml" xmlns:wp14="http://schemas.microsoft.com/office/word/2010/wordprocessingDrawing" xmlns:wp="http://schemas.openxmlformats.org/drawingml/2006/wordprocessingDrawing" xmlns:w10="urn:schemas-microsoft-com:office:word" xmlns:w="http://schemas.openxmlformats.org/wordprocessingml/2006/main" xmlns:w14="http://schemas.microsoft.com/office/word/2010/wordml" xmlns:w15="http://schemas.microsoft.com/office/word/2012/wordml" xmlns:w16cex="http://schemas.microsoft.com/office/word/2018/wordml/cex" xmlns:w16cid="http://schemas.microsoft.com/office/word/2016/wordml/cid" xmlns:w16="http://schemas.microsoft.com/office/word/2018/wordml" xmlns:w16du="http://schemas.microsoft.com/office/word/2023/wordml/word16du" xmlns:w16sdtdh="http://schemas.microsoft.com/office/word/2020/wordml/sdtdatahash" xmlns:w16sdtfl="http://schemas.microsoft.com/office/word/2024/wordml/sdtformatlock" xmlns:w16se="http://schemas.microsoft.com/office/word/2015/wordml/symex" xmlns:wpg="http://schemas.microsoft.com/office/word/2010/wordprocessingGroup" xmlns:wpi="http://schemas.microsoft.com/office/word/2010/wordprocessingInk" xmlns:wne="http://schemas.microsoft.com/office/word/2006/wordml" xmlns:wps="http://schemas.microsoft.com/office/word/2010/wordprocessingShape" mc:Ignorable="w14 w15 w16se w16cid w16 w16cex w16sdtdh w16sdtfl w16du wp14">
   <w15:commentEx w15:paraId="07B4BA5C" w15:done="0"/>
   <w15:commentEx w15:paraId="51CBD6D1" w15:done="0"/>
-  <w15:commentEx w15:paraId="28A49999" w15:done="0"/>
 </w15:commentsEx>
 </file>
 
@@ -5107,7 +5530,6 @@
 <w16cex:commentsExtensible xmlns:wpc="http://schemas.microsoft.com/office/word/2010/wordprocessingCanvas" xmlns:cx="http://schemas.microsoft.com/office/drawing/2014/chartex" xmlns:cx1="http://schemas.microsoft.com/office/drawing/2015/9/8/chartex" xmlns:cx2="http://schemas.microsoft.com/office/drawing/2015/10/21/chartex" xmlns:cx3="http://schemas.microsoft.com/office/drawing/2016/5/9/chartex" xmlns:cx4="http://schemas.microsoft.com/office/drawing/2016/5/10/chartex" xmlns:cx5="http://schemas.microsoft.com/office/drawing/2016/5/11/chartex" xmlns:cx6="http://schemas.microsoft.com/office/drawing/2016/5/12/chartex" xmlns:cx7="http://schemas.microsoft.com/office/drawing/2016/5/13/chartex" xmlns:cx8="http://schemas.microsoft.com/office/drawing/2016/5/14/chartex" xmlns:cr="http://schemas.microsoft.com/office/comments/2020/reactions" xmlns:mc="http://schemas.openxmlformats.org/markup-compatibility/2006" xmlns:aink="http://schemas.microsoft.com/office/drawing/2016/ink" xmlns:am3d="http://schemas.microsoft.com/office/drawing/2017/model3d" xmlns:o="urn:schemas-microsoft-com:office:office" xmlns:oel="http://schemas.microsoft.com/office/2019/extlst" xmlns:r="http://schemas.openxmlformats.org/officeDocument/2006/relationships" xmlns:m="http://schemas.openxmlformats.org/officeDocument/2006/math" xmlns:v="urn:schemas-microsoft-com:vml" xmlns:wp14="http://schemas.microsoft.com/office/word/2010/wordprocessingDrawing" xmlns:wp="http://schemas.openxmlformats.org/drawingml/2006/wordprocessingDrawing" xmlns:w10="urn:schemas-microsoft-com:office:word" xmlns:w="http://schemas.openxmlformats.org/wordprocessingml/2006/main" xmlns:w14="http://schemas.microsoft.com/office/word/2010/wordml" xmlns:w15="http://schemas.microsoft.com/office/word/2012/wordml" xmlns:w16cex="http://schemas.microsoft.com/office/word/2018/wordml/cex" xmlns:w16cid="http://schemas.microsoft.com/office/word/2016/wordml/cid" xmlns:w16="http://schemas.microsoft.com/office/word/2018/wordml" xmlns:w16du="http://schemas.microsoft.com/office/word/2023/wordml/word16du" xmlns:w16sdtdh="http://schemas.microsoft.com/office/word/2020/wordml/sdtdatahash" xmlns:w16sdtfl="http://schemas.microsoft.com/office/word/2024/wordml/sdtformatlock" xmlns:w16se="http://schemas.microsoft.com/office/word/2015/wordml/symex" xmlns:wpg="http://schemas.microsoft.com/office/word/2010/wordprocessingGroup" xmlns:wpi="http://schemas.microsoft.com/office/word/2010/wordprocessingInk" xmlns:wne="http://schemas.microsoft.com/office/word/2006/wordml" xmlns:wps="http://schemas.microsoft.com/office/word/2010/wordprocessingShape" mc:Ignorable="w14 w15 w16se w16cid w16 w16cex w16sdtdh w16sdtfl cr w16du wp14">
   <w16cex:commentExtensible w16cex:durableId="4A85456E" w16cex:dateUtc="2025-08-18T18:18:00Z"/>
   <w16cex:commentExtensible w16cex:durableId="6197010A" w16cex:dateUtc="2025-08-18T18:18:00Z"/>
-  <w16cex:commentExtensible w16cex:durableId="25527CCA" w16cex:dateUtc="2025-08-18T18:43:00Z"/>
 </w16cex:commentsExtensible>
 </file>
 
@@ -5115,7 +5537,6 @@
 <w16cid:commentsIds xmlns:wpc="http://schemas.microsoft.com/office/word/2010/wordprocessingCanvas" xmlns:cx="http://schemas.microsoft.com/office/drawing/2014/chartex" xmlns:cx1="http://schemas.microsoft.com/office/drawing/2015/9/8/chartex" xmlns:cx2="http://schemas.microsoft.com/office/drawing/2015/10/21/chartex" xmlns:cx3="http://schemas.microsoft.com/office/drawing/2016/5/9/chartex" xmlns:cx4="http://schemas.microsoft.com/office/drawing/2016/5/10/chartex" xmlns:cx5="http://schemas.microsoft.com/office/drawing/2016/5/11/chartex" xmlns:cx6="http://schemas.microsoft.com/office/drawing/2016/5/12/chartex" xmlns:cx7="http://schemas.microsoft.com/office/drawing/2016/5/13/chartex" xmlns:cx8="http://schemas.microsoft.com/office/drawing/2016/5/14/chartex" xmlns:mc="http://schemas.openxmlformats.org/markup-compatibility/2006" xmlns:aink="http://schemas.microsoft.com/office/drawing/2016/ink" xmlns:am3d="http://schemas.microsoft.com/office/drawing/2017/model3d" xmlns:o="urn:schemas-microsoft-com:office:office" xmlns:oel="http://schemas.microsoft.com/office/2019/extlst" xmlns:r="http://schemas.openxmlformats.org/officeDocument/2006/relationships" xmlns:m="http://schemas.openxmlformats.org/officeDocument/2006/math" xmlns:v="urn:schemas-microsoft-com:vml" xmlns:wp14="http://schemas.microsoft.com/office/word/2010/wordprocessingDrawing" xmlns:wp="http://schemas.openxmlformats.org/drawingml/2006/wordprocessingDrawing" xmlns:w10="urn:schemas-microsoft-com:office:word" xmlns:w="http://schemas.openxmlformats.org/wordprocessingml/2006/main" xmlns:w14="http://schemas.microsoft.com/office/word/2010/wordml" xmlns:w15="http://schemas.microsoft.com/office/word/2012/wordml" xmlns:w16cex="http://schemas.microsoft.com/office/word/2018/wordml/cex" xmlns:w16cid="http://schemas.microsoft.com/office/word/2016/wordml/cid" xmlns:w16="http://schemas.microsoft.com/office/word/2018/wordml" xmlns:w16du="http://schemas.microsoft.com/office/word/2023/wordml/word16du" xmlns:w16sdtdh="http://schemas.microsoft.com/office/word/2020/wordml/sdtdatahash" xmlns:w16sdtfl="http://schemas.microsoft.com/office/word/2024/wordml/sdtformatlock" xmlns:w16se="http://schemas.microsoft.com/office/word/2015/wordml/symex" xmlns:wpg="http://schemas.microsoft.com/office/word/2010/wordprocessingGroup" xmlns:wpi="http://schemas.microsoft.com/office/word/2010/wordprocessingInk" xmlns:wne="http://schemas.microsoft.com/office/word/2006/wordml" xmlns:wps="http://schemas.microsoft.com/office/word/2010/wordprocessingShape" mc:Ignorable="w14 w15 w16se w16cid w16 w16cex w16sdtdh w16sdtfl w16du wp14">
   <w16cid:commentId w16cid:paraId="07B4BA5C" w16cid:durableId="4A85456E"/>
   <w16cid:commentId w16cid:paraId="51CBD6D1" w16cid:durableId="6197010A"/>
-  <w16cid:commentId w16cid:paraId="28A49999" w16cid:durableId="25527CCA"/>
 </w16cid:commentsIds>
 </file>
 
@@ -5234,6 +5655,118 @@
     </w:lvl>
   </w:abstractNum>
   <w:abstractNum w:abstractNumId="1" w15:restartNumberingAfterBreak="0">
+    <w:nsid w:val="1A5142DC"/>
+    <w:multiLevelType w:val="hybridMultilevel"/>
+    <w:tmpl w:val="BCFEEACA"/>
+    <w:lvl w:ilvl="0" w:tplc="06206136">
+      <w:numFmt w:val="bullet"/>
+      <w:lvlText w:val=""/>
+      <w:lvlJc w:val="left"/>
+      <w:pPr>
+        <w:ind w:left="1080" w:hanging="360"/>
+      </w:pPr>
+      <w:rPr>
+        <w:rFonts w:ascii="Symbol" w:eastAsiaTheme="minorHAnsi" w:hAnsi="Symbol" w:cstheme="minorBidi" w:hint="default"/>
+      </w:rPr>
+    </w:lvl>
+    <w:lvl w:ilvl="1" w:tplc="04090003" w:tentative="1">
+      <w:start w:val="1"/>
+      <w:numFmt w:val="bullet"/>
+      <w:lvlText w:val="o"/>
+      <w:lvlJc w:val="left"/>
+      <w:pPr>
+        <w:ind w:left="1800" w:hanging="360"/>
+      </w:pPr>
+      <w:rPr>
+        <w:rFonts w:ascii="Courier New" w:hAnsi="Courier New" w:cs="Courier New" w:hint="default"/>
+      </w:rPr>
+    </w:lvl>
+    <w:lvl w:ilvl="2" w:tplc="04090005" w:tentative="1">
+      <w:start w:val="1"/>
+      <w:numFmt w:val="bullet"/>
+      <w:lvlText w:val=""/>
+      <w:lvlJc w:val="left"/>
+      <w:pPr>
+        <w:ind w:left="2520" w:hanging="360"/>
+      </w:pPr>
+      <w:rPr>
+        <w:rFonts w:ascii="Wingdings" w:hAnsi="Wingdings" w:hint="default"/>
+      </w:rPr>
+    </w:lvl>
+    <w:lvl w:ilvl="3" w:tplc="04090001" w:tentative="1">
+      <w:start w:val="1"/>
+      <w:numFmt w:val="bullet"/>
+      <w:lvlText w:val=""/>
+      <w:lvlJc w:val="left"/>
+      <w:pPr>
+        <w:ind w:left="3240" w:hanging="360"/>
+      </w:pPr>
+      <w:rPr>
+        <w:rFonts w:ascii="Symbol" w:hAnsi="Symbol" w:hint="default"/>
+      </w:rPr>
+    </w:lvl>
+    <w:lvl w:ilvl="4" w:tplc="04090003" w:tentative="1">
+      <w:start w:val="1"/>
+      <w:numFmt w:val="bullet"/>
+      <w:lvlText w:val="o"/>
+      <w:lvlJc w:val="left"/>
+      <w:pPr>
+        <w:ind w:left="3960" w:hanging="360"/>
+      </w:pPr>
+      <w:rPr>
+        <w:rFonts w:ascii="Courier New" w:hAnsi="Courier New" w:cs="Courier New" w:hint="default"/>
+      </w:rPr>
+    </w:lvl>
+    <w:lvl w:ilvl="5" w:tplc="04090005" w:tentative="1">
+      <w:start w:val="1"/>
+      <w:numFmt w:val="bullet"/>
+      <w:lvlText w:val=""/>
+      <w:lvlJc w:val="left"/>
+      <w:pPr>
+        <w:ind w:left="4680" w:hanging="360"/>
+      </w:pPr>
+      <w:rPr>
+        <w:rFonts w:ascii="Wingdings" w:hAnsi="Wingdings" w:hint="default"/>
+      </w:rPr>
+    </w:lvl>
+    <w:lvl w:ilvl="6" w:tplc="04090001" w:tentative="1">
+      <w:start w:val="1"/>
+      <w:numFmt w:val="bullet"/>
+      <w:lvlText w:val=""/>
+      <w:lvlJc w:val="left"/>
+      <w:pPr>
+        <w:ind w:left="5400" w:hanging="360"/>
+      </w:pPr>
+      <w:rPr>
+        <w:rFonts w:ascii="Symbol" w:hAnsi="Symbol" w:hint="default"/>
+      </w:rPr>
+    </w:lvl>
+    <w:lvl w:ilvl="7" w:tplc="04090003" w:tentative="1">
+      <w:start w:val="1"/>
+      <w:numFmt w:val="bullet"/>
+      <w:lvlText w:val="o"/>
+      <w:lvlJc w:val="left"/>
+      <w:pPr>
+        <w:ind w:left="6120" w:hanging="360"/>
+      </w:pPr>
+      <w:rPr>
+        <w:rFonts w:ascii="Courier New" w:hAnsi="Courier New" w:cs="Courier New" w:hint="default"/>
+      </w:rPr>
+    </w:lvl>
+    <w:lvl w:ilvl="8" w:tplc="04090005" w:tentative="1">
+      <w:start w:val="1"/>
+      <w:numFmt w:val="bullet"/>
+      <w:lvlText w:val=""/>
+      <w:lvlJc w:val="left"/>
+      <w:pPr>
+        <w:ind w:left="6840" w:hanging="360"/>
+      </w:pPr>
+      <w:rPr>
+        <w:rFonts w:ascii="Wingdings" w:hAnsi="Wingdings" w:hint="default"/>
+      </w:rPr>
+    </w:lvl>
+  </w:abstractNum>
+  <w:abstractNum w:abstractNumId="2" w15:restartNumberingAfterBreak="0">
     <w:nsid w:val="4AC941D2"/>
     <w:multiLevelType w:val="hybridMultilevel"/>
     <w:tmpl w:val="2682BA3A"/>
@@ -5345,7 +5878,7 @@
       </w:rPr>
     </w:lvl>
   </w:abstractNum>
-  <w:abstractNum w:abstractNumId="2" w15:restartNumberingAfterBreak="0">
+  <w:abstractNum w:abstractNumId="3" w15:restartNumberingAfterBreak="0">
     <w:nsid w:val="4F31630A"/>
     <w:multiLevelType w:val="hybridMultilevel"/>
     <w:tmpl w:val="DD58292C"/>
@@ -5458,13 +5991,16 @@
     </w:lvl>
   </w:abstractNum>
   <w:num w:numId="1" w16cid:durableId="1003900659">
-    <w:abstractNumId w:val="2"/>
+    <w:abstractNumId w:val="3"/>
   </w:num>
   <w:num w:numId="2" w16cid:durableId="1398362279">
-    <w:abstractNumId w:val="1"/>
+    <w:abstractNumId w:val="2"/>
   </w:num>
   <w:num w:numId="3" w16cid:durableId="550503404">
     <w:abstractNumId w:val="0"/>
+  </w:num>
+  <w:num w:numId="4" w16cid:durableId="1146969083">
+    <w:abstractNumId w:val="1"/>
   </w:num>
 </w:numbering>
 </file>

</xml_diff>

<commit_message>
another try at the first paragraph
</commit_message>
<xml_diff>
--- a/Docs/Machine learning applied to otolith timeseries data to discriminate river of origin for Western Alaska Salmon.docx
+++ b/Docs/Machine learning applied to otolith timeseries data to discriminate river of origin for Western Alaska Salmon.docx
@@ -114,98 +114,54 @@
         <w:spacing w:line="480" w:lineRule="auto"/>
         <w:ind w:firstLine="720"/>
         <w:rPr>
-          <w:rFonts w:ascii="Garamond" w:hAnsi="Garamond"/>
-          <w:sz w:val="22"/>
-          <w:szCs w:val="22"/>
-        </w:rPr>
-      </w:pPr>
-      <w:r>
-        <w:rPr>
-          <w:rFonts w:ascii="Garamond" w:hAnsi="Garamond"/>
-          <w:sz w:val="22"/>
-          <w:szCs w:val="22"/>
-        </w:rPr>
-        <w:t xml:space="preserve">Assessing the impact of environmental and anthropogenic changes </w:t>
-      </w:r>
-      <w:r>
-        <w:rPr>
-          <w:rFonts w:ascii="Garamond" w:hAnsi="Garamond"/>
-          <w:sz w:val="22"/>
-          <w:szCs w:val="22"/>
-        </w:rPr>
-        <w:t>to</w:t>
-      </w:r>
-      <w:r>
-        <w:rPr>
-          <w:rFonts w:ascii="Garamond" w:hAnsi="Garamond"/>
-          <w:sz w:val="22"/>
-          <w:szCs w:val="22"/>
-        </w:rPr>
-        <w:t xml:space="preserve"> ecosystems requires an explicit understanding of how these stressors are distributed across ecosystem components</w:t>
-      </w:r>
-      <w:r>
-        <w:rPr>
-          <w:rFonts w:ascii="Garamond" w:hAnsi="Garamond"/>
-          <w:sz w:val="22"/>
-          <w:szCs w:val="22"/>
-        </w:rPr>
-        <w:t xml:space="preserve">. To do so </w:t>
-      </w:r>
-      <w:r>
-        <w:rPr>
-          <w:rFonts w:ascii="Garamond" w:hAnsi="Garamond"/>
-          <w:sz w:val="22"/>
-          <w:szCs w:val="22"/>
-        </w:rPr>
-        <w:t xml:space="preserve">requires </w:t>
-      </w:r>
-      <w:r>
-        <w:rPr>
-          <w:rFonts w:ascii="Garamond" w:hAnsi="Garamond"/>
-          <w:sz w:val="22"/>
-          <w:szCs w:val="22"/>
-        </w:rPr>
-        <w:t xml:space="preserve">both a refined understanding of </w:t>
-      </w:r>
-      <w:r>
-        <w:rPr>
-          <w:rFonts w:ascii="Garamond" w:hAnsi="Garamond"/>
-          <w:sz w:val="22"/>
-          <w:szCs w:val="22"/>
-        </w:rPr>
-        <w:t xml:space="preserve">ecosystem function </w:t>
-      </w:r>
-      <w:r>
-        <w:rPr>
-          <w:rFonts w:ascii="Garamond" w:hAnsi="Garamond"/>
-          <w:sz w:val="22"/>
-          <w:szCs w:val="22"/>
-        </w:rPr>
-        <w:t xml:space="preserve">as well </w:t>
-      </w:r>
-      <w:r>
-        <w:rPr>
-          <w:rFonts w:ascii="Garamond" w:hAnsi="Garamond"/>
-          <w:sz w:val="22"/>
-          <w:szCs w:val="22"/>
-        </w:rPr>
-        <w:t>an assessment of how stressors vary across relevant spatial and temporal scales</w:t>
-      </w:r>
-      <w:r>
-        <w:rPr>
-          <w:rFonts w:ascii="Garamond" w:hAnsi="Garamond"/>
-          <w:sz w:val="22"/>
-          <w:szCs w:val="22"/>
-        </w:rPr>
-        <w:t xml:space="preserve">. </w:t>
-      </w:r>
-      <w:r>
-        <w:rPr>
-          <w:rFonts w:ascii="Garamond" w:hAnsi="Garamond"/>
-          <w:sz w:val="22"/>
-          <w:szCs w:val="22"/>
-        </w:rPr>
-        <w:t>For expansive and dynamic ecosystems, exploring these effects at fine spatial scales can be challenging. However, aggregating population-level dynamics into ecosystem-level effects risks oversimplification and mischaracterization of threats to critical components of ecosystem health.</w:t>
+          <w:sz w:val="22"/>
+          <w:szCs w:val="22"/>
+        </w:rPr>
+      </w:pPr>
+      <w:r>
+        <w:rPr>
+          <w:sz w:val="22"/>
+          <w:szCs w:val="22"/>
+        </w:rPr>
+        <w:t xml:space="preserve">Assessing the impact of environmental and anthropogenic changes to </w:t>
+      </w:r>
+      <w:r>
+        <w:t>requires understanding how these pressures are distributed across ecosystem components</w:t>
+      </w:r>
+      <w:r>
+        <w:rPr>
+          <w:sz w:val="22"/>
+          <w:szCs w:val="22"/>
+        </w:rPr>
+        <w:t xml:space="preserve">. To do so requires examining the interaction between stressors and ecosystem processes at relevant spatial and temporal scales. In many remote and dynamic ecosystems, understanding ecosystem processes at the sub-ecosystem scale can be challenging. However, assessing population health at the ecosystem scale as opposed to understanding regional or stock specific impacts risks </w:t>
+      </w:r>
+      <w:r>
+        <w:rPr>
+          <w:sz w:val="22"/>
+          <w:szCs w:val="22"/>
+        </w:rPr>
+        <w:t xml:space="preserve">missing threats to critical components of ecosystem health. </w:t>
+      </w:r>
+      <w:r>
+        <w:rPr>
+          <w:sz w:val="22"/>
+          <w:szCs w:val="22"/>
+        </w:rPr>
+        <w:t xml:space="preserve">As such, developing tools to more thoroughly understand ecosystem function at refined spatial scales is key to designing effective management and climate </w:t>
+      </w:r>
+      <w:r>
+        <w:rPr>
+          <w:sz w:val="22"/>
+          <w:szCs w:val="22"/>
+        </w:rPr>
+        <w:t>adaptation</w:t>
+      </w:r>
+      <w:r>
+        <w:rPr>
+          <w:sz w:val="22"/>
+          <w:szCs w:val="22"/>
+        </w:rPr>
+        <w:t xml:space="preserve"> strategies to maintain ecosystem function. </w:t>
       </w:r>
     </w:p>
     <w:p>
@@ -218,718 +174,23 @@
           <w:szCs w:val="22"/>
         </w:rPr>
       </w:pPr>
-      <w:r>
-        <w:rPr>
-          <w:rFonts w:ascii="Garamond" w:hAnsi="Garamond"/>
-          <w:sz w:val="22"/>
-          <w:szCs w:val="22"/>
-        </w:rPr>
-        <w:t xml:space="preserve">Watersheds in western Alaska have historically supported large Pacific salmon populations that sustain both commercial fisheries and subsistence harvest for Indigenous communities in the region. </w:t>
-      </w:r>
-      <w:r>
-        <w:rPr>
-          <w:rFonts w:ascii="Garamond" w:hAnsi="Garamond"/>
-          <w:sz w:val="22"/>
-          <w:szCs w:val="22"/>
-        </w:rPr>
-        <w:t xml:space="preserve">However, there has been a recent </w:t>
-      </w:r>
-      <w:r>
-        <w:rPr>
-          <w:rFonts w:ascii="Garamond" w:hAnsi="Garamond"/>
-          <w:sz w:val="22"/>
-          <w:szCs w:val="22"/>
-        </w:rPr>
-        <w:t>precipitous</w:t>
-      </w:r>
-      <w:r>
-        <w:rPr>
-          <w:rFonts w:ascii="Garamond" w:hAnsi="Garamond"/>
-          <w:sz w:val="22"/>
-          <w:szCs w:val="22"/>
-        </w:rPr>
-        <w:t xml:space="preserve"> and sustained decline in the health of Chinook salmon (X) </w:t>
-      </w:r>
-      <w:r>
-        <w:rPr>
-          <w:rFonts w:ascii="Garamond" w:hAnsi="Garamond"/>
-          <w:sz w:val="22"/>
-          <w:szCs w:val="22"/>
-        </w:rPr>
-        <w:t xml:space="preserve">across the region </w:t>
-      </w:r>
-      <w:r>
-        <w:rPr>
-          <w:rFonts w:ascii="Garamond" w:hAnsi="Garamond"/>
-          <w:sz w:val="22"/>
-          <w:szCs w:val="22"/>
-        </w:rPr>
-        <w:t xml:space="preserve">leading to </w:t>
-      </w:r>
-      <w:r>
-        <w:rPr>
-          <w:rFonts w:ascii="Garamond" w:hAnsi="Garamond"/>
-          <w:sz w:val="22"/>
-          <w:szCs w:val="22"/>
-        </w:rPr>
-        <w:t xml:space="preserve">undue hardship for subsistence communities. Across the region’s three major </w:t>
-      </w:r>
-      <w:proofErr w:type="spellStart"/>
-      <w:r>
-        <w:rPr>
-          <w:rFonts w:ascii="Garamond" w:hAnsi="Garamond"/>
-          <w:sz w:val="22"/>
-          <w:szCs w:val="22"/>
-        </w:rPr>
-        <w:t>major</w:t>
-      </w:r>
-      <w:proofErr w:type="spellEnd"/>
-      <w:r>
-        <w:rPr>
-          <w:rFonts w:ascii="Garamond" w:hAnsi="Garamond"/>
-          <w:sz w:val="22"/>
-          <w:szCs w:val="22"/>
-        </w:rPr>
-        <w:t xml:space="preserve"> river systems (the Yukon, Kuskokwim, and </w:t>
-      </w:r>
-      <w:proofErr w:type="spellStart"/>
-      <w:r>
-        <w:rPr>
-          <w:rFonts w:ascii="Garamond" w:hAnsi="Garamond"/>
-          <w:sz w:val="22"/>
-          <w:szCs w:val="22"/>
-        </w:rPr>
-        <w:t>Nushagak</w:t>
-      </w:r>
-      <w:proofErr w:type="spellEnd"/>
-      <w:r>
-        <w:rPr>
-          <w:rFonts w:ascii="Garamond" w:hAnsi="Garamond"/>
-          <w:sz w:val="22"/>
-          <w:szCs w:val="22"/>
-        </w:rPr>
-        <w:t xml:space="preserve"> river basins) </w:t>
-      </w:r>
-      <w:r>
-        <w:rPr>
-          <w:rFonts w:ascii="Garamond" w:hAnsi="Garamond"/>
-          <w:sz w:val="22"/>
-          <w:szCs w:val="22"/>
-        </w:rPr>
-        <w:t xml:space="preserve">life history strategies, run dynamics, and relative population health vary. As a result, there is a need to assess potential stressors as well as the relative impact of decline regional population health at the basin or sub-basin scale. </w:t>
-      </w:r>
     </w:p>
     <w:p>
       <w:pPr>
         <w:spacing w:line="480" w:lineRule="auto"/>
         <w:ind w:firstLine="720"/>
         <w:rPr>
-          <w:rFonts w:ascii="Garamond" w:hAnsi="Garamond"/>
-          <w:sz w:val="22"/>
-          <w:szCs w:val="22"/>
-        </w:rPr>
-      </w:pPr>
-      <w:r>
-        <w:rPr>
-          <w:rFonts w:ascii="Garamond" w:hAnsi="Garamond"/>
-          <w:sz w:val="22"/>
-          <w:szCs w:val="22"/>
-        </w:rPr>
-        <w:t>Several leading hypotheses</w:t>
-      </w:r>
-      <w:r>
-        <w:rPr>
-          <w:rFonts w:ascii="Garamond" w:hAnsi="Garamond"/>
-          <w:sz w:val="22"/>
-          <w:szCs w:val="22"/>
-        </w:rPr>
-        <w:t xml:space="preserve"> for declining population health have</w:t>
-      </w:r>
-      <w:r>
-        <w:rPr>
-          <w:rFonts w:ascii="Garamond" w:hAnsi="Garamond"/>
-          <w:sz w:val="22"/>
-          <w:szCs w:val="22"/>
-        </w:rPr>
-        <w:t xml:space="preserve"> </w:t>
-      </w:r>
-      <w:r>
-        <w:rPr>
-          <w:rFonts w:ascii="Garamond" w:hAnsi="Garamond"/>
-          <w:sz w:val="22"/>
-          <w:szCs w:val="22"/>
-        </w:rPr>
-        <w:t>been based</w:t>
-      </w:r>
-      <w:r>
-        <w:rPr>
-          <w:rFonts w:ascii="Garamond" w:hAnsi="Garamond"/>
-          <w:sz w:val="22"/>
-          <w:szCs w:val="22"/>
-        </w:rPr>
-        <w:t xml:space="preserve"> on drivers of marine mortality </w:t>
-      </w:r>
-      <w:r>
-        <w:rPr>
-          <w:rFonts w:ascii="Garamond" w:hAnsi="Garamond"/>
-          <w:sz w:val="22"/>
-          <w:szCs w:val="22"/>
-        </w:rPr>
-        <w:fldChar w:fldCharType="begin"/>
-      </w:r>
-      <w:r>
-        <w:rPr>
-          <w:rFonts w:ascii="Garamond" w:hAnsi="Garamond"/>
-          <w:sz w:val="22"/>
-          <w:szCs w:val="22"/>
-        </w:rPr>
-        <w:instrText xml:space="preserve"> ADDIN ZOTERO_ITEM CSL_CITATION {"citationID":"K3kQcsWX","properties":{"formattedCitation":"(Lamborn et al., 2025)","plainCitation":"(Lamborn et al., 2025)","noteIndex":0},"citationItems":[{"id":5644,"uris":["http://zotero.org/users/8421274/items/68HTP6NW"],"itemData":{"id":5644,"type":"article-journal","abstract":"Across Alaska, there have been synchronous declines in the abundance, mean age, and size of Chinook salmon (Oncorhynchus tshawytscha, Salmonidae), a species with immense social and ecological importance. The decline of Chinook salmon, and regulations addressing declines, have drastically impacted people who rely on Alaska's fisheries. Despite their importance, the drivers causing Chinook salmon declines are still not well understood. Therefore, to improve our understanding of the likely drivers of these large-scale synchronous declines, we synthesised the peer-reviewed Chinook salmon literature published between 2010 and 2024 using a weight-of-evidence approach. We identified 94 variables used to explain the trends in abundance and demographics of Chinook salmon. Each variable's association with trends in Chinook salmon was individually assessed and integrated using a standardised method. Results of this synthesis suggest the drivers for large-scale synchronous declines have occurred in the North Pacific Ocean. Specifically, we found marine predation, size selective harvest, and pink salmon (Oncorhynchus gorbuscha) abundance are the factors most strongly associated with reduced size and age. Results also suggest ocean productivity–specifically winter sea surface temperature and the North Pacific Gyre Oscillation–are the most frequently identified predictors of regional Chinook salmon abundance. In addition to addressing freshwater factors like adult heat stress and juvenile predation, we suggest research, policy, and management focus on how to better understand and address the interactions between ocean productivity, marine predation, size selective harvest, and pink salmon abundance to improve the condition of Chinook salmon, and the people and ecosystems benefiting from them.","container-title":"Fish and Fisheries","DOI":"10.1111/faf.12895","ISSN":"1467-2979","issue":"4","language":"en","license":"© 2025 The Author(s). Fish and Fisheries published by John Wiley &amp; Sons Ltd.","note":"_eprint: https://onlinelibrary.wiley.com/doi/pdf/10.1111/faf.12895","page":"520-532","source":"Wiley Online Library","title":"A Synthesis of Factors Related to Trends in Abundance and Demography of Alaska Chinook Salmon (Oncorhynchus tshawytscha, Salmonidae): Implications for Research, Management, and Policy","title-short":"A Synthesis of Factors Related to Trends in Abundance and Demography of Alaska Chinook Salmon (Oncorhynchus tshawytscha, Salmonidae)","volume":"26","author":[{"family":"Lamborn","given":"Chase C."},{"family":"Ohlberger","given":"Jan"},{"family":"Walsworth","given":"Timothy E."},{"family":"Westley","given":"Peter A. H."},{"family":"Cunningham","given":"Curry J."},{"family":"Wynsma","given":"Sam"},{"family":"Smith","given":"Jordan W."}],"issued":{"date-parts":[["2025"]]}}}],"schema":"https://github.com/citation-style-language/schema/raw/master/csl-citation.json"} </w:instrText>
-      </w:r>
-      <w:r>
-        <w:rPr>
-          <w:rFonts w:ascii="Garamond" w:hAnsi="Garamond"/>
-          <w:sz w:val="22"/>
-          <w:szCs w:val="22"/>
-        </w:rPr>
-        <w:fldChar w:fldCharType="separate"/>
-      </w:r>
-      <w:r>
-        <w:rPr>
-          <w:rFonts w:ascii="Garamond" w:hAnsi="Garamond"/>
-          <w:noProof/>
-          <w:sz w:val="22"/>
-          <w:szCs w:val="22"/>
-        </w:rPr>
-        <w:t>(Lamborn et al., 2025)</w:t>
-      </w:r>
-      <w:r>
-        <w:rPr>
-          <w:rFonts w:ascii="Garamond" w:hAnsi="Garamond"/>
-          <w:sz w:val="22"/>
-          <w:szCs w:val="22"/>
-        </w:rPr>
-        <w:fldChar w:fldCharType="end"/>
-      </w:r>
-      <w:r>
-        <w:rPr>
-          <w:rFonts w:ascii="Garamond" w:hAnsi="Garamond"/>
-          <w:sz w:val="22"/>
-          <w:szCs w:val="22"/>
-        </w:rPr>
-        <w:t xml:space="preserve">. </w:t>
-      </w:r>
-      <w:r>
-        <w:rPr>
-          <w:rFonts w:ascii="Garamond" w:hAnsi="Garamond"/>
-          <w:sz w:val="22"/>
-          <w:szCs w:val="22"/>
-        </w:rPr>
-        <w:t>However, a</w:t>
-      </w:r>
-      <w:r>
-        <w:rPr>
-          <w:rFonts w:ascii="Garamond" w:hAnsi="Garamond"/>
-          <w:sz w:val="22"/>
-          <w:szCs w:val="22"/>
-        </w:rPr>
-        <w:t xml:space="preserve">ssessment of </w:t>
-      </w:r>
-      <w:r>
-        <w:rPr>
-          <w:rFonts w:ascii="Garamond" w:hAnsi="Garamond"/>
-          <w:sz w:val="22"/>
-          <w:szCs w:val="22"/>
-        </w:rPr>
-        <w:t xml:space="preserve">marine-based </w:t>
-      </w:r>
-      <w:r>
-        <w:rPr>
-          <w:rFonts w:ascii="Garamond" w:hAnsi="Garamond"/>
-          <w:sz w:val="22"/>
-          <w:szCs w:val="22"/>
-        </w:rPr>
-        <w:t xml:space="preserve">hypotheses in relation to river- or stock-specific population health has been hindered by </w:t>
-      </w:r>
-      <w:r>
-        <w:rPr>
-          <w:rFonts w:ascii="Garamond" w:hAnsi="Garamond"/>
-          <w:sz w:val="22"/>
-          <w:szCs w:val="22"/>
-        </w:rPr>
-        <w:t>a</w:t>
-      </w:r>
-      <w:r>
-        <w:rPr>
-          <w:rFonts w:ascii="Garamond" w:hAnsi="Garamond"/>
-          <w:sz w:val="22"/>
-          <w:szCs w:val="22"/>
-        </w:rPr>
-        <w:t xml:space="preserve"> limited ability to determine the </w:t>
-      </w:r>
-      <w:r>
-        <w:rPr>
-          <w:rFonts w:ascii="Garamond" w:hAnsi="Garamond"/>
-          <w:sz w:val="22"/>
-          <w:szCs w:val="22"/>
-        </w:rPr>
-        <w:t>river of origin for marine-caught fish</w:t>
-      </w:r>
-      <w:r>
-        <w:rPr>
-          <w:rFonts w:ascii="Garamond" w:hAnsi="Garamond"/>
-          <w:sz w:val="22"/>
-          <w:szCs w:val="22"/>
-        </w:rPr>
-        <w:t>.</w:t>
-      </w:r>
-      <w:r>
-        <w:rPr>
-          <w:rFonts w:ascii="Garamond" w:hAnsi="Garamond"/>
-          <w:sz w:val="22"/>
-          <w:szCs w:val="22"/>
-        </w:rPr>
-        <w:t xml:space="preserve"> Genetics based approaches have provided a powerful tool for estimating provenance of Pacific salmon in many cases and have become a key method for assisting in in-season management of the mixed stock fishery for individual with a known river of origin. However, </w:t>
-      </w:r>
-      <w:r>
-        <w:rPr>
-          <w:rFonts w:ascii="Garamond" w:hAnsi="Garamond"/>
-          <w:sz w:val="22"/>
-          <w:szCs w:val="22"/>
-        </w:rPr>
-        <w:t>Chinook salmon in Western Alaska</w:t>
-      </w:r>
-      <w:r>
-        <w:rPr>
-          <w:rFonts w:ascii="Garamond" w:hAnsi="Garamond"/>
-          <w:sz w:val="22"/>
-          <w:szCs w:val="22"/>
-        </w:rPr>
-        <w:t xml:space="preserve"> lack sufficient genetic structure to reliably estimate provenance within the Coastal Western Alaska (CWAK) genetic reporting group, which contains the lower portion of the Yukon river-basin as well as the entire Kuskokwim and </w:t>
-      </w:r>
-      <w:proofErr w:type="spellStart"/>
-      <w:r>
-        <w:rPr>
-          <w:rFonts w:ascii="Garamond" w:hAnsi="Garamond"/>
-          <w:sz w:val="22"/>
-          <w:szCs w:val="22"/>
-        </w:rPr>
-        <w:t>Nushagak</w:t>
-      </w:r>
-      <w:proofErr w:type="spellEnd"/>
-      <w:r>
-        <w:rPr>
-          <w:rFonts w:ascii="Garamond" w:hAnsi="Garamond"/>
-          <w:sz w:val="22"/>
-          <w:szCs w:val="22"/>
-        </w:rPr>
-        <w:t xml:space="preserve"> River-basins. </w:t>
-      </w:r>
-      <w:r>
-        <w:rPr>
-          <w:rFonts w:ascii="Garamond" w:hAnsi="Garamond"/>
-          <w:sz w:val="22"/>
-          <w:szCs w:val="22"/>
-        </w:rPr>
-        <w:t xml:space="preserve">Isotope-based methods for estimating provenance from ear stones </w:t>
-      </w:r>
-      <w:r>
-        <w:rPr>
-          <w:rFonts w:ascii="Garamond" w:hAnsi="Garamond"/>
-          <w:sz w:val="22"/>
-          <w:szCs w:val="22"/>
-        </w:rPr>
-        <w:lastRenderedPageBreak/>
-        <w:t>found in fish</w:t>
-      </w:r>
-      <w:r>
-        <w:rPr>
-          <w:rFonts w:ascii="Garamond" w:hAnsi="Garamond"/>
-          <w:sz w:val="22"/>
-          <w:szCs w:val="22"/>
-        </w:rPr>
-        <w:t>, or otoliths,</w:t>
-      </w:r>
-      <w:r>
-        <w:rPr>
-          <w:rFonts w:ascii="Garamond" w:hAnsi="Garamond"/>
-          <w:sz w:val="22"/>
-          <w:szCs w:val="22"/>
-        </w:rPr>
-        <w:t xml:space="preserve"> have shown promise as an alternative approach that can provide more refined spatial resolution than genetics in some cases</w:t>
-      </w:r>
-      <w:r>
-        <w:rPr>
-          <w:rFonts w:ascii="Garamond" w:hAnsi="Garamond"/>
-          <w:sz w:val="22"/>
-          <w:szCs w:val="22"/>
-        </w:rPr>
-        <w:t xml:space="preserve"> </w:t>
-      </w:r>
-      <w:r>
-        <w:rPr>
-          <w:rFonts w:ascii="Garamond" w:hAnsi="Garamond"/>
-          <w:sz w:val="22"/>
-          <w:szCs w:val="22"/>
-        </w:rPr>
-        <w:fldChar w:fldCharType="begin"/>
-      </w:r>
-      <w:r>
-        <w:rPr>
-          <w:rFonts w:ascii="Garamond" w:hAnsi="Garamond"/>
-          <w:sz w:val="22"/>
-          <w:szCs w:val="22"/>
-        </w:rPr>
-        <w:instrText xml:space="preserve"> ADDIN ZOTERO_ITEM CSL_CITATION {"citationID":"Pqigyra2","properties":{"formattedCitation":"(Brennan et al., 2015; Brennan &amp; Schindler, 2017; Kennedy et al., 1997)","plainCitation":"(Brennan et al., 2015; Brennan &amp; Schindler, 2017; Kennedy et al., 1997)","noteIndex":0},"citationItems":[{"id":2313,"uris":["http://zotero.org/users/8421274/items/AJFVQJVT"],"itemData":{"id":2313,"type":"article-journal","abstract":"Highly migratory organisms present major challenges to conservation efforts. This is especially true for exploited anadromous fish species, which exhibit long-range dispersals from natal sites, complex population structures, and extensive mixing of distinct populations during exploitation. By tracing the migratory histories of individual Chinook salmon caught in fisheries using strontium isotopes, we determined the relative production of natal habitats at fine spatial scales and different life histories. Although strontium isotopes have been widely used in provenance research, we present a new robust framework to simultaneously assess natal sources and migrations of individuals within fishery harvests through time. Our results pave the way for investigating how fine-scale habitat production and life histories of salmon respond to perturbations—providing crucial insights for conservation.","container-title":"Science Advances","DOI":"10.1126/sciadv.1400124","issue":"4","note":"publisher: American Association for the Advancement of Science","page":"e1400124","source":"science.org (Atypon)","title":"Strontium isotopes delineate fine-scale natal origins and migration histories of Pacific salmon","volume":"1","author":[{"family":"Brennan","given":"Sean R."},{"family":"Zimmerman","given":"Christian E."},{"family":"Fernandez","given":"Diego P."},{"family":"Cerling","given":"Thure E."},{"family":"McPhee","given":"Megan V."},{"family":"Wooller","given":"Matthew J."}],"issued":{"date-parts":[["2015",5,15]]}}},{"id":1694,"uris":["http://zotero.org/users/8421274/items/NSWL6YPN"],"itemData":{"id":1694,"type":"article-journal","abstract":"Production patterns of highly mobile species, such as anadromous fish, often exhibit high spatial and temporal heterogeneity across landscapes. Such variability is often asynchronous in time among habitats, which stabilizes production at aggregate scales of complexity. Reconstructing production patterns explicitly in space and time across multiple scales, however, remains difficult but is important for prioritizing habitat conservation. This is especially true for fishes inhabiting river basins due to long-range dispersal, high mortality at early life stages, complex population structure and elusive life history variation. We develop a new approach for mapping production patterns of Pacific salmon across a large river basin by integrating otolith microchemistry and dendritic isoscape models. The geographically continuous Bayesian assignment framework presented here yielded high accuracies (&gt;90%) and relatively high precisions (precisions &lt;4%; i.e., assignment areas of &lt;530 river km of the 13 100 km total river length) when used to determine the natal source of known-origin juvenile Chinook salmon captured throughout the study region. Integrating these methods enabled us to base estimates of provenance and habitat use of individuals on a per location basis using strontium isotopic data throughout the continuous spatial domain of a river network. Such a framework provides substantial advantages over the more common nominal approach to employing otolith microchemistry to reconstruct movement patterns of fish. In doing so, we reconstructed the spatial production patterns of adult Chinook salmon returning to a large watershed in Bristol Bay, Alaska and illustrate the power of such an approach to conservation efforts.","container-title":"Ecological Applications","DOI":"10.1002/eap.1474","ISSN":"1939-5582","issue":"2","language":"en","note":"_eprint: https://esajournals.onlinelibrary.wiley.com/doi/pdf/10.1002/eap.1474","page":"363-377","source":"Wiley Online Library","title":"Linking otolith microchemistry and dendritic isoscapes to map heterogeneous production of fish across river basins","volume":"27","author":[{"family":"Brennan","given":"Sean R."},{"family":"Schindler","given":"Daniel E."}],"issued":{"date-parts":[["2017"]]}}},{"id":1561,"uris":["http://zotero.org/users/8421274/items/UCQYZW9Z"],"itemData":{"id":1561,"type":"article-journal","abstract":"To optimize conservation and restoration strategies for fish stocks it is important to identify the rearing habitats that produce the most successful individuals. However, tracking millions of migratory fish through multiple life stages seems to be impossible using conventional techniques. Using differences in the ratio of stable isotopes of strontium (Sr), found naturally in stream water, we have been able to distinguish juvenile Atlantic salmon (Salmo salar) from eight of ten rearing sites studied in Vermont streams. This demonstrates the potential for using environmental signals to determine the rearing stream from which salmon originate, and should help to guide restoration activities.","container-title":"Nature","DOI":"10.1038/42835","ISSN":"1476-4687","issue":"6635","language":"en","license":"1997 Macmillan Magazines Ltd.","note":"number: 6635\npublisher: Nature Publishing Group","page":"766-767","source":"www-nature-com.offcampus.lib.washington.edu","title":"Natural isotope markers in salmon","volume":"387","author":[{"family":"Kennedy","given":"Brian P."},{"family":"Folt","given":"Carol L."},{"family":"Blum","given":"Joel D."},{"family":"Chamberlain","given":"C. Page"}],"issued":{"date-parts":[["1997",6]]}}}],"schema":"https://github.com/citation-style-language/schema/raw/master/csl-citation.json"} </w:instrText>
-      </w:r>
-      <w:r>
-        <w:rPr>
-          <w:rFonts w:ascii="Garamond" w:hAnsi="Garamond"/>
-          <w:sz w:val="22"/>
-          <w:szCs w:val="22"/>
-        </w:rPr>
-        <w:fldChar w:fldCharType="separate"/>
-      </w:r>
-      <w:r>
-        <w:rPr>
-          <w:rFonts w:ascii="Garamond" w:hAnsi="Garamond"/>
-          <w:noProof/>
-          <w:sz w:val="22"/>
-          <w:szCs w:val="22"/>
-        </w:rPr>
-        <w:t>(Brennan et al., 2015; Brennan &amp; Schindler, 2017; Kennedy et al., 1997)</w:t>
-      </w:r>
-      <w:r>
-        <w:rPr>
-          <w:rFonts w:ascii="Garamond" w:hAnsi="Garamond"/>
-          <w:sz w:val="22"/>
-          <w:szCs w:val="22"/>
-        </w:rPr>
-        <w:fldChar w:fldCharType="end"/>
-      </w:r>
-      <w:r>
-        <w:rPr>
-          <w:rFonts w:ascii="Garamond" w:hAnsi="Garamond"/>
-          <w:sz w:val="22"/>
-          <w:szCs w:val="22"/>
-        </w:rPr>
-        <w:t xml:space="preserve">. </w:t>
-      </w:r>
-      <w:r>
-        <w:rPr>
-          <w:rFonts w:ascii="Garamond" w:hAnsi="Garamond"/>
-          <w:sz w:val="22"/>
-          <w:szCs w:val="22"/>
-        </w:rPr>
-        <w:t xml:space="preserve">The relative ratio of </w:t>
-      </w:r>
-      <w:r>
-        <w:rPr>
-          <w:rFonts w:ascii="Garamond" w:hAnsi="Garamond"/>
-          <w:sz w:val="22"/>
-          <w:szCs w:val="22"/>
-        </w:rPr>
-        <w:t>s</w:t>
-      </w:r>
-      <w:r>
-        <w:rPr>
-          <w:rFonts w:ascii="Garamond" w:hAnsi="Garamond"/>
-          <w:sz w:val="22"/>
-          <w:szCs w:val="22"/>
-        </w:rPr>
-        <w:t>trontium-87 to strontium-86 (</w:t>
-      </w:r>
-      <w:r>
-        <w:rPr>
-          <w:rFonts w:ascii="Cambria Math" w:hAnsi="Cambria Math" w:cs="Cambria Math"/>
-          <w:sz w:val="22"/>
-          <w:szCs w:val="22"/>
-        </w:rPr>
-        <w:t>⁸⁷</w:t>
-      </w:r>
-      <w:r>
-        <w:rPr>
-          <w:rFonts w:ascii="Garamond" w:hAnsi="Garamond"/>
-          <w:sz w:val="22"/>
-          <w:szCs w:val="22"/>
-        </w:rPr>
-        <w:t>Sr/</w:t>
-      </w:r>
-      <w:r>
-        <w:rPr>
-          <w:rFonts w:ascii="Cambria Math" w:hAnsi="Cambria Math" w:cs="Cambria Math"/>
-          <w:sz w:val="22"/>
-          <w:szCs w:val="22"/>
-        </w:rPr>
-        <w:t>⁸⁶</w:t>
-      </w:r>
-      <w:r>
-        <w:rPr>
-          <w:rFonts w:ascii="Garamond" w:hAnsi="Garamond"/>
-          <w:sz w:val="22"/>
-          <w:szCs w:val="22"/>
-        </w:rPr>
-        <w:t>Sr) is an isotopic tracer that is heterogeneously distributed across geologically diverse landscapes, faithfully incorporated into otoliths, and has been shown to be temporally stable in Alaskan watersheds</w:t>
-      </w:r>
-      <w:r>
-        <w:rPr>
-          <w:rFonts w:ascii="Garamond" w:hAnsi="Garamond"/>
-          <w:sz w:val="22"/>
-          <w:szCs w:val="22"/>
-        </w:rPr>
-        <w:t xml:space="preserve"> </w:t>
-      </w:r>
-      <w:r>
-        <w:rPr>
-          <w:rFonts w:ascii="Garamond" w:hAnsi="Garamond"/>
-          <w:sz w:val="22"/>
-          <w:szCs w:val="22"/>
-        </w:rPr>
-        <w:fldChar w:fldCharType="begin"/>
-      </w:r>
-      <w:r>
-        <w:rPr>
-          <w:rFonts w:ascii="Garamond" w:hAnsi="Garamond"/>
-          <w:sz w:val="22"/>
-          <w:szCs w:val="22"/>
-        </w:rPr>
-        <w:instrText xml:space="preserve"> ADDIN ZOTERO_ITEM CSL_CITATION {"citationID":"gCPseI7r","properties":{"formattedCitation":"(Bataille &amp; Bowen, 2012; Brennan et al., 2015; Campana, 1999; Capo et al., 1998)","plainCitation":"(Bataille &amp; Bowen, 2012; Brennan et al., 2015; Campana, 1999; Capo et al., 1998)","noteIndex":0},"citationItems":[{"id":1939,"uris":["http://zotero.org/users/8421274/items/S8GE9LUD"],"itemData":{"id":1939,"type":"article-journal","abstract":"Although variation in 87Sr/86Sr has been widely pursued as a tracer of provenance in environmental studies, forensics, archeology and food traceability, accurate methods for mapping variations in environmental 87Sr/ 86Sr at regional scale are not available. In this paper, we build upon earlier efforts to model 87Sr/86Sr in bedrock by developing GIS-based models for Sr isotopes in rock and water that include the combined effects of lithology and time. Using published data, we ﬁt lithology-speciﬁc model parameters for generalized equations describing the concentration of radiogenic Sr in silicate and carbonate rocks. The new model explained more than 50% of the observed variance in measured Sr isotope values from independent global databases of igneous, metaigneous, and carbonate rocks, but performed more poorly (explaining 33% of the variance) for sedimentary and metasedimentary rocks. In comparison, a previously applied model formulation that did not include lithology-speciﬁc parameters explained only 20% and 8% of the observed variance for igneous and sedimentary rocks, respectively, and exhibited an inverse relationship with measured carbonate rock values. Building upon the bedrock model, we also developed and applied equations to predict the contribution of different rock types to 87Sr/86Sr variations in water as a function of their weathering rates and strontium content. The resulting water model was compared to data from 68 catchments and shown to give more accurate predictions of stream water 87Sr/86Sr (R2 = 0.70) than models that did not include lithological weathering parameters. We applied these models to produce maps (“isoscapes”) predicting 87Sr/86Sr in bedrock and water across the contiguous USA, and compared the mapped Sr isotope distributions to data on Sr isotope ratios of US marijuana crops. Although the maps produced here are demonstrably imperfect and leave signiﬁcant scope for further reﬁnement, they provide an enhanced framework for lithology-based Sr isotope modeling and offer a baseline for provenance studies by constraining the 87Sr/86Sr in strontium sources at regional scales.","container-title":"Chemical Geology","DOI":"10.1016/j.chemgeo.2012.01.028","ISSN":"00092541","journalAbbreviation":"Chemical Geology","language":"en","page":"39-52","source":"DOI.org (Crossref)","title":"Mapping 87Sr/86Sr variations in bedrock and water for large scale provenance studies","volume":"304-305","author":[{"family":"Bataille","given":"Clément P."},{"family":"Bowen","given":"Gabriel J."}],"issued":{"date-parts":[["2012",4]]}}},{"id":2313,"uris":["http://zotero.org/users/8421274/items/AJFVQJVT"],"itemData":{"id":2313,"type":"article-journal","abstract":"Highly migratory organisms present major challenges to conservation efforts. This is especially true for exploited anadromous fish species, which exhibit long-range dispersals from natal sites, complex population structures, and extensive mixing of distinct populations during exploitation. By tracing the migratory histories of individual Chinook salmon caught in fisheries using strontium isotopes, we determined the relative production of natal habitats at fine spatial scales and different life histories. Although strontium isotopes have been widely used in provenance research, we present a new robust framework to simultaneously assess natal sources and migrations of individuals within fishery harvests through time. Our results pave the way for investigating how fine-scale habitat production and life histories of salmon respond to perturbations—providing crucial insights for conservation.","container-title":"Science Advances","DOI":"10.1126/sciadv.1400124","issue":"4","note":"publisher: American Association for the Advancement of Science","page":"e1400124","source":"science.org (Atypon)","title":"Strontium isotopes delineate fine-scale natal origins and migration histories of Pacific salmon","volume":"1","author":[{"family":"Brennan","given":"Sean R."},{"family":"Zimmerman","given":"Christian E."},{"family":"Fernandez","given":"Diego P."},{"family":"Cerling","given":"Thure E."},{"family":"McPhee","given":"Megan V."},{"family":"Wooller","given":"Matthew J."}],"issued":{"date-parts":[["2015",5,15]]}}},{"id":1441,"uris":["http://zotero.org/users/8421274/items/PHNAKZ8D"],"itemData":{"id":1441,"type":"article-journal","abstract":"The fish otolith (earstone) has long been known as a timekeeper, but interest in its use as a metabolically inert environmental recorder has accelerated in recent years. In part due to technological advances, applications such as stock identification, determination of rnigralon pathways, reconstruction of temperature and salinity history, age validation, detection of anadromy, use as a natural tag and chemical mass marking have been developed, some of which are difficult or impossible to implement using alternative techniques. Microsamphg and the latest advances in beam-based probes allow many elemental assays to be coupled with daily or annual growth increments, thus providing a detailed chronologcal record of the environment. However, few workers have critically assessed the assumptions upon which the environmental reconstructions are based, or considered the possibility that elemental incorporation into the otolith may proceed differently than that into other calcified structures. This paper reviews current applications and their assumptions and suggests future directions. Particular attention is given to the premises that the elemental and isotopic composition of the otolith reflects that of the environment, and the effect of physiological filters on the resulting composition. The roles of temperature, elemental uptake into the fish and the process of otolith crystahzation are also assessed. Drawing upon recent advances in geochemistry and paleoclirnate research as points of contrast, it appears that not all applications of otolith chemistry are firmly based, although others are destined to become powerful and perhaps routine tools for the mainstream fish biologst.","container-title":"Marine Ecology Progress Series","DOI":"10.3354/meps188263","ISSN":"0171-8630, 1616-1599","journalAbbreviation":"Mar. Ecol. Prog. Ser.","language":"en","page":"263-297","source":"DOI.org (Crossref)","title":"Chemistry and composition of fish otoliths:pathways, mechanisms and applications","title-short":"Chemistry and composition of fish otoliths","volume":"188","author":[{"family":"Campana","given":"Se"}],"issued":{"date-parts":[["1999"]]}}},{"id":1457,"uris":["http://zotero.org/users/8421274/items/TDIQBP7K"],"itemData":{"id":1457,"type":"article-journal","abstract":"The strontium (Sr) isotope method can be a powerful tool in studies of chemical weathering and soil genesis, cation provenance and mobility, and the chronostratigraphic correlation of marine sediments. It is a sensitive geochemical tracer, applicable to large-scale ecosystem studies as well as to centimeter-scaled examination of cation mobility within a soil profile. The 87Sr/86Sr ratios of natural materials reflect the sources of strontium available during their formation. Isotopically distinct inputs from precipitation, dryfall, soil parent material, and surface or groundwater allow determination of the relative proportions of those materials entering or leaving an ecosystem. The isotopic compositions of labile (soil exchange complex and soil solution) strontium and Sr in vegetation reflect the sources of cations available to plants. Strontium isotopes can be used to track the biogeochemical cycling of nutrient cations such as calcium. The extent of cation contributions from in situ weathering and external additions to soil from dust and rain can also be resolved with this method. In this paper, we review the geochemistry and isotopic systematics of strontium, and discuss the use of this method as a tracer of earth surface processes.","container-title":"Geoderma","DOI":"10.1016/S0016-7061(97)00102-X","ISSN":"0016-7061","issue":"1","journalAbbreviation":"Geoderma","language":"en","page":"197-225","source":"ScienceDirect","title":"Strontium isotopes as tracers of ecosystem processes: theory and methods","title-short":"Strontium isotopes as tracers of ecosystem processes","volume":"82","author":[{"family":"Capo","given":"Rosemary C."},{"family":"Stewart","given":"Brian W."},{"family":"Chadwick","given":"Oliver A."}],"issued":{"date-parts":[["1998",2,1]]}}}],"schema":"https://github.com/citation-style-language/schema/raw/master/csl-citation.json"} </w:instrText>
-      </w:r>
-      <w:r>
-        <w:rPr>
-          <w:rFonts w:ascii="Garamond" w:hAnsi="Garamond"/>
-          <w:sz w:val="22"/>
-          <w:szCs w:val="22"/>
-        </w:rPr>
-        <w:fldChar w:fldCharType="separate"/>
-      </w:r>
-      <w:r>
-        <w:rPr>
-          <w:rFonts w:ascii="Garamond" w:hAnsi="Garamond"/>
-          <w:noProof/>
-          <w:sz w:val="22"/>
-          <w:szCs w:val="22"/>
-        </w:rPr>
-        <w:t>(Bataille &amp; Bowen, 2012; Brennan et al., 2015; Campana, 1999; Capo et al., 1998)</w:t>
-      </w:r>
-      <w:r>
-        <w:rPr>
-          <w:rFonts w:ascii="Garamond" w:hAnsi="Garamond"/>
-          <w:sz w:val="22"/>
-          <w:szCs w:val="22"/>
-        </w:rPr>
-        <w:fldChar w:fldCharType="end"/>
-      </w:r>
-      <w:r>
-        <w:rPr>
-          <w:rFonts w:ascii="Garamond" w:hAnsi="Garamond"/>
-          <w:sz w:val="22"/>
-          <w:szCs w:val="22"/>
-        </w:rPr>
-        <w:t xml:space="preserve">. As a result, </w:t>
-      </w:r>
-      <w:r>
-        <w:rPr>
-          <w:rFonts w:ascii="Cambria Math" w:hAnsi="Cambria Math" w:cs="Cambria Math"/>
-          <w:sz w:val="22"/>
-          <w:szCs w:val="22"/>
-        </w:rPr>
-        <w:t>⁸⁷</w:t>
-      </w:r>
-      <w:r>
-        <w:rPr>
-          <w:rFonts w:ascii="Garamond" w:hAnsi="Garamond"/>
-          <w:sz w:val="22"/>
-          <w:szCs w:val="22"/>
-        </w:rPr>
-        <w:t>Sr/</w:t>
-      </w:r>
-      <w:r>
-        <w:rPr>
-          <w:rFonts w:ascii="Cambria Math" w:hAnsi="Cambria Math" w:cs="Cambria Math"/>
-          <w:sz w:val="22"/>
-          <w:szCs w:val="22"/>
-        </w:rPr>
-        <w:t>⁸⁶</w:t>
-      </w:r>
-      <w:r>
-        <w:rPr>
-          <w:rFonts w:ascii="Garamond" w:hAnsi="Garamond"/>
-          <w:sz w:val="22"/>
-          <w:szCs w:val="22"/>
-        </w:rPr>
-        <w:t>Sr values associated with discrete time periods in an individual's life (e.g., freshwater natal rearing) can be used to estimate provenance by comparing them to values measured or modeled across the landscape.</w:t>
-      </w:r>
-      <w:r>
-        <w:t xml:space="preserve"> </w:t>
-      </w:r>
-      <w:r>
-        <w:rPr>
-          <w:rFonts w:ascii="Garamond" w:hAnsi="Garamond"/>
-          <w:sz w:val="22"/>
-          <w:szCs w:val="22"/>
-        </w:rPr>
-        <w:t>Despite its precision, this method is limited by the level of isotopic heterogeneity relative to the spatial scale of interest</w:t>
-      </w:r>
-      <w:r>
-        <w:rPr>
-          <w:rFonts w:ascii="Garamond" w:hAnsi="Garamond"/>
-          <w:sz w:val="22"/>
-          <w:szCs w:val="22"/>
-        </w:rPr>
-        <w:t xml:space="preserve"> </w:t>
-      </w:r>
-      <w:r>
-        <w:rPr>
-          <w:rFonts w:ascii="Garamond" w:hAnsi="Garamond"/>
-          <w:sz w:val="22"/>
-          <w:szCs w:val="22"/>
-        </w:rPr>
-        <w:fldChar w:fldCharType="begin"/>
-      </w:r>
-      <w:r>
-        <w:rPr>
-          <w:rFonts w:ascii="Garamond" w:hAnsi="Garamond"/>
-          <w:sz w:val="22"/>
-          <w:szCs w:val="22"/>
-        </w:rPr>
-        <w:instrText xml:space="preserve"> ADDIN ZOTERO_ITEM CSL_CITATION {"citationID":"W3sRlFul","properties":{"formattedCitation":"(Makhlouf et al., 2025)","plainCitation":"(Makhlouf et al., 2025)","noteIndex":0},"citationItems":[{"id":5397,"uris":["http://zotero.org/users/8421274/items/WRVF2L9N"],"itemData":{"id":5397,"type":"article-journal","abstract":"Understanding the spatial ecology of migratory species is uniquely challenging using conventional approaches. In fisheries such as for Pacific salmon, genetic stock identification (GSI) and isotope-based methods have emerged as strategies for reconstructing spatial ecology but are limited by the spatial resolution of genetic differentiation and isotopic heterogeneity. We show that integrating these complementary datasets improve the spatial resolution of provenance assignments. To do so, we reconstructed basin-wide estimates of natal origin locations for Chinook salmon in the Yukon River using samples (n = 247) from an experimental fishery designed to assess in-season run timing. A combined framework improved precision of likely provenance assignments (stream km &gt; 0.7 posterior probability) by 92% over genetic assignments and 52% over strontium isotope methods. In doing so, we illustrate watershed scale estimates of natal origin distributions with a greater resolution available from GSI or isotope data alone.","container-title":"Limnology and Oceanography Letters","DOI":"10.1002/lol2.70025","ISSN":"2378-2242","issue":"n/a","language":"en","license":"© 2025 The Author(s). Limnology and Oceanography Letters published by Wiley Periodicals LLC on behalf of Association for the Sciences of Limnology and Oceanography.","note":"_eprint: https://onlinelibrary.wiley.com/doi/pdf/10.1002/lol2.70025","source":"Wiley Online Library","title":"Combining genetic and isotope frameworks improves reconstruction of fish provenance across riverscapes","URL":"https://onlinelibrary.wiley.com/doi/abs/10.1002/lol2.70025","volume":"n/a","author":[{"family":"Makhlouf","given":"Ben"},{"family":"Cline","given":"Timothy J."},{"family":"Fernandez","given":"Diego"},{"family":"Seeb","given":"Lisa"},{"family":"Lee","given":"Elizabeth"},{"family":"Gilk-Baumer","given":"Sara"},{"family":"Whited","given":"Diane"},{"family":"Zimmerman","given":"Christian E."},{"family":"Schindler","given":"Daniel E."}],"accessed":{"date-parts":[["2025",6,4]]},"issued":{"date-parts":[["2025"]]}}}],"schema":"https://github.com/citation-style-language/schema/raw/master/csl-citation.json"} </w:instrText>
-      </w:r>
-      <w:r>
-        <w:rPr>
-          <w:rFonts w:ascii="Garamond" w:hAnsi="Garamond"/>
-          <w:sz w:val="22"/>
-          <w:szCs w:val="22"/>
-        </w:rPr>
-        <w:fldChar w:fldCharType="separate"/>
-      </w:r>
-      <w:r>
-        <w:rPr>
-          <w:rFonts w:ascii="Garamond" w:hAnsi="Garamond"/>
-          <w:noProof/>
-          <w:sz w:val="22"/>
-          <w:szCs w:val="22"/>
-        </w:rPr>
-        <w:t>(Makhlouf et al., 2025)</w:t>
-      </w:r>
-      <w:r>
-        <w:rPr>
-          <w:rFonts w:ascii="Garamond" w:hAnsi="Garamond"/>
-          <w:sz w:val="22"/>
-          <w:szCs w:val="22"/>
-        </w:rPr>
-        <w:fldChar w:fldCharType="end"/>
-      </w:r>
-      <w:r>
-        <w:rPr>
-          <w:rFonts w:ascii="Garamond" w:hAnsi="Garamond"/>
-          <w:sz w:val="22"/>
-          <w:szCs w:val="22"/>
-        </w:rPr>
-        <w:t xml:space="preserve">. </w:t>
-      </w:r>
-      <w:r>
-        <w:rPr>
-          <w:rFonts w:ascii="Garamond" w:hAnsi="Garamond"/>
-          <w:sz w:val="22"/>
-          <w:szCs w:val="22"/>
-        </w:rPr>
-        <w:t xml:space="preserve">While </w:t>
-      </w:r>
-      <w:r>
-        <w:rPr>
-          <w:rFonts w:ascii="Garamond" w:hAnsi="Garamond"/>
-          <w:sz w:val="22"/>
-          <w:szCs w:val="22"/>
-        </w:rPr>
-        <w:t xml:space="preserve">reliable </w:t>
-      </w:r>
-      <w:r>
-        <w:rPr>
-          <w:rFonts w:ascii="Garamond" w:hAnsi="Garamond"/>
-          <w:sz w:val="22"/>
-          <w:szCs w:val="22"/>
-        </w:rPr>
-        <w:t>within-</w:t>
-      </w:r>
-      <w:r>
-        <w:rPr>
-          <w:rFonts w:ascii="Garamond" w:hAnsi="Garamond"/>
-          <w:sz w:val="22"/>
-          <w:szCs w:val="22"/>
-        </w:rPr>
-        <w:t>river</w:t>
-      </w:r>
-      <w:r>
-        <w:rPr>
-          <w:rFonts w:ascii="Garamond" w:hAnsi="Garamond"/>
-          <w:sz w:val="22"/>
-          <w:szCs w:val="22"/>
-        </w:rPr>
-        <w:t xml:space="preserve"> </w:t>
-      </w:r>
-      <w:r>
-        <w:rPr>
-          <w:rFonts w:ascii="Garamond" w:hAnsi="Garamond"/>
-          <w:sz w:val="22"/>
-          <w:szCs w:val="22"/>
-        </w:rPr>
-        <w:t xml:space="preserve">estimates of </w:t>
-      </w:r>
-      <w:r>
-        <w:rPr>
-          <w:rFonts w:ascii="Garamond" w:hAnsi="Garamond"/>
-          <w:sz w:val="22"/>
-          <w:szCs w:val="22"/>
-        </w:rPr>
-        <w:t xml:space="preserve">provenance </w:t>
-      </w:r>
-      <w:r>
-        <w:rPr>
-          <w:rFonts w:ascii="Garamond" w:hAnsi="Garamond"/>
-          <w:sz w:val="22"/>
-          <w:szCs w:val="22"/>
-        </w:rPr>
-        <w:t>are</w:t>
-      </w:r>
-      <w:r>
-        <w:rPr>
-          <w:rFonts w:ascii="Garamond" w:hAnsi="Garamond"/>
-          <w:sz w:val="22"/>
-          <w:szCs w:val="22"/>
-        </w:rPr>
-        <w:t xml:space="preserve"> possible in Western Alaskan watersheds, regional overlap among the three major river systems creates high uncertainty, preventing reliable assignments of marine-caught fish when relying on a single natal </w:t>
-      </w:r>
-      <w:r>
-        <w:rPr>
-          <w:rFonts w:ascii="Cambria Math" w:hAnsi="Cambria Math" w:cs="Cambria Math"/>
-          <w:sz w:val="22"/>
-          <w:szCs w:val="22"/>
-        </w:rPr>
-        <w:t>⁸⁷</w:t>
-      </w:r>
-      <w:r>
-        <w:rPr>
-          <w:rFonts w:ascii="Garamond" w:hAnsi="Garamond"/>
-          <w:sz w:val="22"/>
-          <w:szCs w:val="22"/>
-        </w:rPr>
-        <w:t>Sr/</w:t>
-      </w:r>
-      <w:r>
-        <w:rPr>
-          <w:rFonts w:ascii="Cambria Math" w:hAnsi="Cambria Math" w:cs="Cambria Math"/>
-          <w:sz w:val="22"/>
-          <w:szCs w:val="22"/>
-        </w:rPr>
-        <w:t>⁸⁶</w:t>
-      </w:r>
-      <w:r>
-        <w:rPr>
-          <w:rFonts w:ascii="Garamond" w:hAnsi="Garamond"/>
-          <w:sz w:val="22"/>
-          <w:szCs w:val="22"/>
-        </w:rPr>
-        <w:t>Sr value (Figure 1).</w:t>
+          <w:sz w:val="22"/>
+          <w:szCs w:val="22"/>
+        </w:rPr>
+      </w:pPr>
+      <w:r>
+        <w:rPr>
+          <w:rFonts w:ascii="Garamond" w:hAnsi="Garamond"/>
+          <w:sz w:val="22"/>
+          <w:szCs w:val="22"/>
+        </w:rPr>
+        <w:t>aggregating population-level dynamics into ecosystem-level effects risks oversimplification and mischaracterization of threats to critical components of ecosystem health.</w:t>
       </w:r>
     </w:p>
     <w:p>
@@ -942,6 +203,98 @@
           <w:szCs w:val="22"/>
         </w:rPr>
       </w:pPr>
+      <w:r>
+        <w:rPr>
+          <w:rFonts w:ascii="Garamond" w:hAnsi="Garamond"/>
+          <w:sz w:val="22"/>
+          <w:szCs w:val="22"/>
+        </w:rPr>
+        <w:t xml:space="preserve">Watersheds in western Alaska have historically supported large Pacific salmon populations that sustain both commercial fisheries and subsistence harvest for Indigenous communities in the region. However, there has been a recent </w:t>
+      </w:r>
+      <w:r>
+        <w:rPr>
+          <w:rFonts w:ascii="Garamond" w:hAnsi="Garamond"/>
+          <w:sz w:val="22"/>
+          <w:szCs w:val="22"/>
+        </w:rPr>
+        <w:t>precipitous</w:t>
+      </w:r>
+      <w:r>
+        <w:rPr>
+          <w:rFonts w:ascii="Garamond" w:hAnsi="Garamond"/>
+          <w:sz w:val="22"/>
+          <w:szCs w:val="22"/>
+        </w:rPr>
+        <w:t xml:space="preserve"> and sustained decline in the health of Chinook salmon (X) </w:t>
+      </w:r>
+      <w:r>
+        <w:rPr>
+          <w:rFonts w:ascii="Garamond" w:hAnsi="Garamond"/>
+          <w:sz w:val="22"/>
+          <w:szCs w:val="22"/>
+        </w:rPr>
+        <w:t xml:space="preserve">across the region </w:t>
+      </w:r>
+      <w:r>
+        <w:rPr>
+          <w:rFonts w:ascii="Garamond" w:hAnsi="Garamond"/>
+          <w:sz w:val="22"/>
+          <w:szCs w:val="22"/>
+        </w:rPr>
+        <w:t xml:space="preserve">leading to </w:t>
+      </w:r>
+      <w:r>
+        <w:rPr>
+          <w:rFonts w:ascii="Garamond" w:hAnsi="Garamond"/>
+          <w:sz w:val="22"/>
+          <w:szCs w:val="22"/>
+        </w:rPr>
+        <w:t xml:space="preserve">undue hardship for subsistence communities. Across the region’s three major </w:t>
+      </w:r>
+      <w:proofErr w:type="spellStart"/>
+      <w:r>
+        <w:rPr>
+          <w:rFonts w:ascii="Garamond" w:hAnsi="Garamond"/>
+          <w:sz w:val="22"/>
+          <w:szCs w:val="22"/>
+        </w:rPr>
+        <w:t>major</w:t>
+      </w:r>
+      <w:proofErr w:type="spellEnd"/>
+      <w:r>
+        <w:rPr>
+          <w:rFonts w:ascii="Garamond" w:hAnsi="Garamond"/>
+          <w:sz w:val="22"/>
+          <w:szCs w:val="22"/>
+        </w:rPr>
+        <w:t xml:space="preserve"> river systems (the Yukon, Kuskokwim, and </w:t>
+      </w:r>
+      <w:proofErr w:type="spellStart"/>
+      <w:r>
+        <w:rPr>
+          <w:rFonts w:ascii="Garamond" w:hAnsi="Garamond"/>
+          <w:sz w:val="22"/>
+          <w:szCs w:val="22"/>
+        </w:rPr>
+        <w:t>Nushagak</w:t>
+      </w:r>
+      <w:proofErr w:type="spellEnd"/>
+      <w:r>
+        <w:rPr>
+          <w:rFonts w:ascii="Garamond" w:hAnsi="Garamond"/>
+          <w:sz w:val="22"/>
+          <w:szCs w:val="22"/>
+        </w:rPr>
+        <w:t xml:space="preserve"> river basins) </w:t>
+      </w:r>
+      <w:r>
+        <w:rPr>
+          <w:rFonts w:ascii="Garamond" w:hAnsi="Garamond"/>
+          <w:sz w:val="22"/>
+          <w:szCs w:val="22"/>
+        </w:rPr>
+        <w:t xml:space="preserve">life history strategies, run dynamics, and relative population health vary. As a result, there is a need to assess potential stressors as well as the relative impact of decline regional population health at the basin or sub-basin scale. </w:t>
+      </w:r>
     </w:p>
     <w:p>
       <w:pPr>
@@ -959,7 +312,16 @@
           <w:sz w:val="22"/>
           <w:szCs w:val="22"/>
         </w:rPr>
-        <w:t>standard approaches such as genetic stock identification (GSI) provide provenance estimates at relatively coarse spatial scales (e.g., coastal western Alaska) but cannot distinguish among rivers within current genetic baselines.</w:t>
+        <w:lastRenderedPageBreak/>
+        <w:t>Several leading hypotheses</w:t>
+      </w:r>
+      <w:r>
+        <w:rPr>
+          <w:rFonts w:ascii="Garamond" w:hAnsi="Garamond"/>
+          <w:sz w:val="22"/>
+          <w:szCs w:val="22"/>
+        </w:rPr>
+        <w:t xml:space="preserve"> for declining population health have</w:t>
       </w:r>
       <w:r>
         <w:rPr>
@@ -968,40 +330,620 @@
           <w:szCs w:val="22"/>
         </w:rPr>
         <w:t xml:space="preserve"> </w:t>
+      </w:r>
+      <w:r>
+        <w:rPr>
+          <w:rFonts w:ascii="Garamond" w:hAnsi="Garamond"/>
+          <w:sz w:val="22"/>
+          <w:szCs w:val="22"/>
+        </w:rPr>
+        <w:t>been based</w:t>
+      </w:r>
+      <w:r>
+        <w:rPr>
+          <w:rFonts w:ascii="Garamond" w:hAnsi="Garamond"/>
+          <w:sz w:val="22"/>
+          <w:szCs w:val="22"/>
+        </w:rPr>
+        <w:t xml:space="preserve"> on drivers of marine mortality </w:t>
+      </w:r>
+      <w:r>
+        <w:rPr>
+          <w:rFonts w:ascii="Garamond" w:hAnsi="Garamond"/>
+          <w:sz w:val="22"/>
+          <w:szCs w:val="22"/>
+        </w:rPr>
+        <w:fldChar w:fldCharType="begin"/>
+      </w:r>
+      <w:r>
+        <w:rPr>
+          <w:rFonts w:ascii="Garamond" w:hAnsi="Garamond"/>
+          <w:sz w:val="22"/>
+          <w:szCs w:val="22"/>
+        </w:rPr>
+        <w:instrText xml:space="preserve"> ADDIN ZOTERO_ITEM CSL_CITATION {"citationID":"K3kQcsWX","properties":{"formattedCitation":"(Lamborn et al., 2025)","plainCitation":"(Lamborn et al., 2025)","noteIndex":0},"citationItems":[{"id":5644,"uris":["http://zotero.org/users/8421274/items/68HTP6NW"],"itemData":{"id":5644,"type":"article-journal","abstract":"Across Alaska, there have been synchronous declines in the abundance, mean age, and size of Chinook salmon (Oncorhynchus tshawytscha, Salmonidae), a species with immense social and ecological importance. The decline of Chinook salmon, and regulations addressing declines, have drastically impacted people who rely on Alaska's fisheries. Despite their importance, the drivers causing Chinook salmon declines are still not well understood. Therefore, to improve our understanding of the likely drivers of these large-scale synchronous declines, we synthesised the peer-reviewed Chinook salmon literature published between 2010 and 2024 using a weight-of-evidence approach. We identified 94 variables used to explain the trends in abundance and demographics of Chinook salmon. Each variable's association with trends in Chinook salmon was individually assessed and integrated using a standardised method. Results of this synthesis suggest the drivers for large-scale synchronous declines have occurred in the North Pacific Ocean. Specifically, we found marine predation, size selective harvest, and pink salmon (Oncorhynchus gorbuscha) abundance are the factors most strongly associated with reduced size and age. Results also suggest ocean productivity–specifically winter sea surface temperature and the North Pacific Gyre Oscillation–are the most frequently identified predictors of regional Chinook salmon abundance. In addition to addressing freshwater factors like adult heat stress and juvenile predation, we suggest research, policy, and management focus on how to better understand and address the interactions between ocean productivity, marine predation, size selective harvest, and pink salmon abundance to improve the condition of Chinook salmon, and the people and ecosystems benefiting from them.","container-title":"Fish and Fisheries","DOI":"10.1111/faf.12895","ISSN":"1467-2979","issue":"4","language":"en","license":"© 2025 The Author(s). Fish and Fisheries published by John Wiley &amp; Sons Ltd.","note":"_eprint: https://onlinelibrary.wiley.com/doi/pdf/10.1111/faf.12895","page":"520-532","source":"Wiley Online Library","title":"A Synthesis of Factors Related to Trends in Abundance and Demography of Alaska Chinook Salmon (Oncorhynchus tshawytscha, Salmonidae): Implications for Research, Management, and Policy","title-short":"A Synthesis of Factors Related to Trends in Abundance and Demography of Alaska Chinook Salmon (Oncorhynchus tshawytscha, Salmonidae)","volume":"26","author":[{"family":"Lamborn","given":"Chase C."},{"family":"Ohlberger","given":"Jan"},{"family":"Walsworth","given":"Timothy E."},{"family":"Westley","given":"Peter A. H."},{"family":"Cunningham","given":"Curry J."},{"family":"Wynsma","given":"Sam"},{"family":"Smith","given":"Jordan W."}],"issued":{"date-parts":[["2025"]]}}}],"schema":"https://github.com/citation-style-language/schema/raw/master/csl-citation.json"} </w:instrText>
+      </w:r>
+      <w:r>
+        <w:rPr>
+          <w:rFonts w:ascii="Garamond" w:hAnsi="Garamond"/>
+          <w:sz w:val="22"/>
+          <w:szCs w:val="22"/>
+        </w:rPr>
+        <w:fldChar w:fldCharType="separate"/>
+      </w:r>
+      <w:r>
+        <w:rPr>
+          <w:rFonts w:ascii="Garamond" w:hAnsi="Garamond"/>
+          <w:noProof/>
+          <w:sz w:val="22"/>
+          <w:szCs w:val="22"/>
+        </w:rPr>
+        <w:t>(Lamborn et al., 2025)</w:t>
+      </w:r>
+      <w:r>
+        <w:rPr>
+          <w:rFonts w:ascii="Garamond" w:hAnsi="Garamond"/>
+          <w:sz w:val="22"/>
+          <w:szCs w:val="22"/>
+        </w:rPr>
+        <w:fldChar w:fldCharType="end"/>
+      </w:r>
+      <w:r>
+        <w:rPr>
+          <w:rFonts w:ascii="Garamond" w:hAnsi="Garamond"/>
+          <w:sz w:val="22"/>
+          <w:szCs w:val="22"/>
+        </w:rPr>
+        <w:t xml:space="preserve">. </w:t>
+      </w:r>
+      <w:r>
+        <w:rPr>
+          <w:rFonts w:ascii="Garamond" w:hAnsi="Garamond"/>
+          <w:sz w:val="22"/>
+          <w:szCs w:val="22"/>
+        </w:rPr>
+        <w:t>However, a</w:t>
+      </w:r>
+      <w:r>
+        <w:rPr>
+          <w:rFonts w:ascii="Garamond" w:hAnsi="Garamond"/>
+          <w:sz w:val="22"/>
+          <w:szCs w:val="22"/>
+        </w:rPr>
+        <w:t xml:space="preserve">ssessment of </w:t>
+      </w:r>
+      <w:r>
+        <w:rPr>
+          <w:rFonts w:ascii="Garamond" w:hAnsi="Garamond"/>
+          <w:sz w:val="22"/>
+          <w:szCs w:val="22"/>
+        </w:rPr>
+        <w:t xml:space="preserve">marine-based </w:t>
+      </w:r>
+      <w:r>
+        <w:rPr>
+          <w:rFonts w:ascii="Garamond" w:hAnsi="Garamond"/>
+          <w:sz w:val="22"/>
+          <w:szCs w:val="22"/>
+        </w:rPr>
+        <w:t xml:space="preserve">hypotheses in relation to river- or stock-specific population health has been hindered by </w:t>
+      </w:r>
+      <w:r>
+        <w:rPr>
+          <w:rFonts w:ascii="Garamond" w:hAnsi="Garamond"/>
+          <w:sz w:val="22"/>
+          <w:szCs w:val="22"/>
+        </w:rPr>
+        <w:t>a</w:t>
+      </w:r>
+      <w:r>
+        <w:rPr>
+          <w:rFonts w:ascii="Garamond" w:hAnsi="Garamond"/>
+          <w:sz w:val="22"/>
+          <w:szCs w:val="22"/>
+        </w:rPr>
+        <w:t xml:space="preserve"> limited ability to determine the </w:t>
+      </w:r>
+      <w:r>
+        <w:rPr>
+          <w:rFonts w:ascii="Garamond" w:hAnsi="Garamond"/>
+          <w:sz w:val="22"/>
+          <w:szCs w:val="22"/>
+        </w:rPr>
+        <w:t>river of origin for marine-caught fish</w:t>
+      </w:r>
+      <w:r>
+        <w:rPr>
+          <w:rFonts w:ascii="Garamond" w:hAnsi="Garamond"/>
+          <w:sz w:val="22"/>
+          <w:szCs w:val="22"/>
+        </w:rPr>
+        <w:t>.</w:t>
+      </w:r>
+      <w:r>
+        <w:rPr>
+          <w:rFonts w:ascii="Garamond" w:hAnsi="Garamond"/>
+          <w:sz w:val="22"/>
+          <w:szCs w:val="22"/>
+        </w:rPr>
+        <w:t xml:space="preserve"> Genetics based approaches have provided a powerful tool for estimating provenance of Pacific salmon in many cases and have become a key method for assisting in in-season management of the mixed stock fishery for individual with a known river of origin. However, </w:t>
+      </w:r>
+      <w:r>
+        <w:rPr>
+          <w:rFonts w:ascii="Garamond" w:hAnsi="Garamond"/>
+          <w:sz w:val="22"/>
+          <w:szCs w:val="22"/>
+        </w:rPr>
+        <w:t>Chinook salmon in Western Alaska</w:t>
+      </w:r>
+      <w:r>
+        <w:rPr>
+          <w:rFonts w:ascii="Garamond" w:hAnsi="Garamond"/>
+          <w:sz w:val="22"/>
+          <w:szCs w:val="22"/>
+        </w:rPr>
+        <w:t xml:space="preserve"> lack sufficient genetic structure to reliably estimate provenance within the Coastal Western Alaska (CWAK) genetic reporting group, which contains the lower portion of the Yukon river-basin as well as the entire Kuskokwim and </w:t>
+      </w:r>
+      <w:proofErr w:type="spellStart"/>
+      <w:r>
+        <w:rPr>
+          <w:rFonts w:ascii="Garamond" w:hAnsi="Garamond"/>
+          <w:sz w:val="22"/>
+          <w:szCs w:val="22"/>
+        </w:rPr>
+        <w:t>Nushagak</w:t>
+      </w:r>
+      <w:proofErr w:type="spellEnd"/>
+      <w:r>
+        <w:rPr>
+          <w:rFonts w:ascii="Garamond" w:hAnsi="Garamond"/>
+          <w:sz w:val="22"/>
+          <w:szCs w:val="22"/>
+        </w:rPr>
+        <w:t xml:space="preserve"> River-basins. </w:t>
+      </w:r>
+      <w:r>
+        <w:rPr>
+          <w:rFonts w:ascii="Garamond" w:hAnsi="Garamond"/>
+          <w:sz w:val="22"/>
+          <w:szCs w:val="22"/>
+        </w:rPr>
+        <w:t>Isotope-based methods for estimating provenance from ear stones found in fish</w:t>
+      </w:r>
+      <w:r>
+        <w:rPr>
+          <w:rFonts w:ascii="Garamond" w:hAnsi="Garamond"/>
+          <w:sz w:val="22"/>
+          <w:szCs w:val="22"/>
+        </w:rPr>
+        <w:t>, or otoliths,</w:t>
+      </w:r>
+      <w:r>
+        <w:rPr>
+          <w:rFonts w:ascii="Garamond" w:hAnsi="Garamond"/>
+          <w:sz w:val="22"/>
+          <w:szCs w:val="22"/>
+        </w:rPr>
+        <w:t xml:space="preserve"> have shown promise as an alternative approach that can provide more refined spatial resolution than genetics in some cases</w:t>
+      </w:r>
+      <w:r>
+        <w:rPr>
+          <w:rFonts w:ascii="Garamond" w:hAnsi="Garamond"/>
+          <w:sz w:val="22"/>
+          <w:szCs w:val="22"/>
+        </w:rPr>
+        <w:t xml:space="preserve"> </w:t>
+      </w:r>
+      <w:r>
+        <w:rPr>
+          <w:rFonts w:ascii="Garamond" w:hAnsi="Garamond"/>
+          <w:sz w:val="22"/>
+          <w:szCs w:val="22"/>
+        </w:rPr>
+        <w:fldChar w:fldCharType="begin"/>
+      </w:r>
+      <w:r>
+        <w:rPr>
+          <w:rFonts w:ascii="Garamond" w:hAnsi="Garamond"/>
+          <w:sz w:val="22"/>
+          <w:szCs w:val="22"/>
+        </w:rPr>
+        <w:instrText xml:space="preserve"> ADDIN ZOTERO_ITEM CSL_CITATION {"citationID":"Pqigyra2","properties":{"formattedCitation":"(Brennan et al., 2015; Brennan &amp; Schindler, 2017; Kennedy et al., 1997)","plainCitation":"(Brennan et al., 2015; Brennan &amp; Schindler, 2017; Kennedy et al., 1997)","noteIndex":0},"citationItems":[{"id":2313,"uris":["http://zotero.org/users/8421274/items/AJFVQJVT"],"itemData":{"id":2313,"type":"article-journal","abstract":"Highly migratory organisms present major challenges to conservation efforts. This is especially true for exploited anadromous fish species, which exhibit long-range dispersals from natal sites, complex population structures, and extensive mixing of distinct populations during exploitation. By tracing the migratory histories of individual Chinook salmon caught in fisheries using strontium isotopes, we determined the relative production of natal habitats at fine spatial scales and different life histories. Although strontium isotopes have been widely used in provenance research, we present a new robust framework to simultaneously assess natal sources and migrations of individuals within fishery harvests through time. Our results pave the way for investigating how fine-scale habitat production and life histories of salmon respond to perturbations—providing crucial insights for conservation.","container-title":"Science Advances","DOI":"10.1126/sciadv.1400124","issue":"4","note":"publisher: American Association for the Advancement of Science","page":"e1400124","source":"science.org (Atypon)","title":"Strontium isotopes delineate fine-scale natal origins and migration histories of Pacific salmon","volume":"1","author":[{"family":"Brennan","given":"Sean R."},{"family":"Zimmerman","given":"Christian E."},{"family":"Fernandez","given":"Diego P."},{"family":"Cerling","given":"Thure E."},{"family":"McPhee","given":"Megan V."},{"family":"Wooller","given":"Matthew J."}],"issued":{"date-parts":[["2015",5,15]]}}},{"id":1694,"uris":["http://zotero.org/users/8421274/items/NSWL6YPN"],"itemData":{"id":1694,"type":"article-journal","abstract":"Production patterns of highly mobile species, such as anadromous fish, often exhibit high spatial and temporal heterogeneity across landscapes. Such variability is often asynchronous in time among habitats, which stabilizes production at aggregate scales of complexity. Reconstructing production patterns explicitly in space and time across multiple scales, however, remains difficult but is important for prioritizing habitat conservation. This is especially true for fishes inhabiting river basins due to long-range dispersal, high mortality at early life stages, complex population structure and elusive life history variation. We develop a new approach for mapping production patterns of Pacific salmon across a large river basin by integrating otolith microchemistry and dendritic isoscape models. The geographically continuous Bayesian assignment framework presented here yielded high accuracies (&gt;90%) and relatively high precisions (precisions &lt;4%; i.e., assignment areas of &lt;530 river km of the 13 100 km total river length) when used to determine the natal source of known-origin juvenile Chinook salmon captured throughout the study region. Integrating these methods enabled us to base estimates of provenance and habitat use of individuals on a per location basis using strontium isotopic data throughout the continuous spatial domain of a river network. Such a framework provides substantial advantages over the more common nominal approach to employing otolith microchemistry to reconstruct movement patterns of fish. In doing so, we reconstructed the spatial production patterns of adult Chinook salmon returning to a large watershed in Bristol Bay, Alaska and illustrate the power of such an approach to conservation efforts.","container-title":"Ecological Applications","DOI":"10.1002/eap.1474","ISSN":"1939-5582","issue":"2","language":"en","note":"_eprint: https://esajournals.onlinelibrary.wiley.com/doi/pdf/10.1002/eap.1474","page":"363-377","source":"Wiley Online Library","title":"Linking otolith microchemistry and dendritic isoscapes to map heterogeneous production of fish across river basins","volume":"27","author":[{"family":"Brennan","given":"Sean R."},{"family":"Schindler","given":"Daniel E."}],"issued":{"date-parts":[["2017"]]}}},{"id":1561,"uris":["http://zotero.org/users/8421274/items/UCQYZW9Z"],"itemData":{"id":1561,"type":"article-journal","abstract":"To optimize conservation and restoration strategies for fish stocks it is important to identify the rearing habitats that produce the most successful individuals. However, tracking millions of migratory fish through multiple life stages seems to be impossible using conventional techniques. Using differences in the ratio of stable isotopes of strontium (Sr), found naturally in stream water, we have been able to distinguish juvenile Atlantic salmon (Salmo salar) from eight of ten rearing sites studied in Vermont streams. This demonstrates the potential for using environmental signals to determine the rearing stream from which salmon originate, and should help to guide restoration activities.","container-title":"Nature","DOI":"10.1038/42835","ISSN":"1476-4687","issue":"6635","language":"en","license":"1997 Macmillan Magazines Ltd.","note":"number: 6635\npublisher: Nature Publishing Group","page":"766-767","source":"www-nature-com.offcampus.lib.washington.edu","title":"Natural isotope markers in salmon","volume":"387","author":[{"family":"Kennedy","given":"Brian P."},{"family":"Folt","given":"Carol L."},{"family":"Blum","given":"Joel D."},{"family":"Chamberlain","given":"C. Page"}],"issued":{"date-parts":[["1997",6]]}}}],"schema":"https://github.com/citation-style-language/schema/raw/master/csl-citation.json"} </w:instrText>
+      </w:r>
+      <w:r>
+        <w:rPr>
+          <w:rFonts w:ascii="Garamond" w:hAnsi="Garamond"/>
+          <w:sz w:val="22"/>
+          <w:szCs w:val="22"/>
+        </w:rPr>
+        <w:fldChar w:fldCharType="separate"/>
+      </w:r>
+      <w:r>
+        <w:rPr>
+          <w:rFonts w:ascii="Garamond" w:hAnsi="Garamond"/>
+          <w:noProof/>
+          <w:sz w:val="22"/>
+          <w:szCs w:val="22"/>
+        </w:rPr>
+        <w:t>(Brennan et al., 2015; Brennan &amp; Schindler, 2017; Kennedy et al., 1997)</w:t>
+      </w:r>
+      <w:r>
+        <w:rPr>
+          <w:rFonts w:ascii="Garamond" w:hAnsi="Garamond"/>
+          <w:sz w:val="22"/>
+          <w:szCs w:val="22"/>
+        </w:rPr>
+        <w:fldChar w:fldCharType="end"/>
+      </w:r>
+      <w:r>
+        <w:rPr>
+          <w:rFonts w:ascii="Garamond" w:hAnsi="Garamond"/>
+          <w:sz w:val="22"/>
+          <w:szCs w:val="22"/>
+        </w:rPr>
+        <w:t xml:space="preserve">. </w:t>
+      </w:r>
+      <w:r>
+        <w:rPr>
+          <w:rFonts w:ascii="Garamond" w:hAnsi="Garamond"/>
+          <w:sz w:val="22"/>
+          <w:szCs w:val="22"/>
+        </w:rPr>
+        <w:t xml:space="preserve">The relative ratio of </w:t>
+      </w:r>
+      <w:r>
+        <w:rPr>
+          <w:rFonts w:ascii="Garamond" w:hAnsi="Garamond"/>
+          <w:sz w:val="22"/>
+          <w:szCs w:val="22"/>
+        </w:rPr>
+        <w:t>s</w:t>
+      </w:r>
+      <w:r>
+        <w:rPr>
+          <w:rFonts w:ascii="Garamond" w:hAnsi="Garamond"/>
+          <w:sz w:val="22"/>
+          <w:szCs w:val="22"/>
+        </w:rPr>
+        <w:t>trontium-87 to strontium-86 (</w:t>
+      </w:r>
+      <w:r>
+        <w:rPr>
+          <w:rFonts w:ascii="Cambria Math" w:hAnsi="Cambria Math" w:cs="Cambria Math"/>
+          <w:sz w:val="22"/>
+          <w:szCs w:val="22"/>
+        </w:rPr>
+        <w:t>⁸⁷</w:t>
+      </w:r>
+      <w:r>
+        <w:rPr>
+          <w:rFonts w:ascii="Garamond" w:hAnsi="Garamond"/>
+          <w:sz w:val="22"/>
+          <w:szCs w:val="22"/>
+        </w:rPr>
+        <w:t>Sr/</w:t>
+      </w:r>
+      <w:r>
+        <w:rPr>
+          <w:rFonts w:ascii="Cambria Math" w:hAnsi="Cambria Math" w:cs="Cambria Math"/>
+          <w:sz w:val="22"/>
+          <w:szCs w:val="22"/>
+        </w:rPr>
+        <w:t>⁸⁶</w:t>
+      </w:r>
+      <w:r>
+        <w:rPr>
+          <w:rFonts w:ascii="Garamond" w:hAnsi="Garamond"/>
+          <w:sz w:val="22"/>
+          <w:szCs w:val="22"/>
+        </w:rPr>
+        <w:t>Sr) is an isotopic tracer that is heterogeneously distributed across geologically diverse landscapes, faithfully incorporated into otoliths, and has been shown to be temporally stable in Alaskan watersheds</w:t>
+      </w:r>
+      <w:r>
+        <w:rPr>
+          <w:rFonts w:ascii="Garamond" w:hAnsi="Garamond"/>
+          <w:sz w:val="22"/>
+          <w:szCs w:val="22"/>
+        </w:rPr>
+        <w:t xml:space="preserve"> </w:t>
+      </w:r>
+      <w:r>
+        <w:rPr>
+          <w:rFonts w:ascii="Garamond" w:hAnsi="Garamond"/>
+          <w:sz w:val="22"/>
+          <w:szCs w:val="22"/>
+        </w:rPr>
+        <w:fldChar w:fldCharType="begin"/>
+      </w:r>
+      <w:r>
+        <w:rPr>
+          <w:rFonts w:ascii="Garamond" w:hAnsi="Garamond"/>
+          <w:sz w:val="22"/>
+          <w:szCs w:val="22"/>
+        </w:rPr>
+        <w:instrText xml:space="preserve"> ADDIN ZOTERO_ITEM CSL_CITATION {"citationID":"gCPseI7r","properties":{"formattedCitation":"(Bataille &amp; Bowen, 2012; Brennan et al., 2015; Campana, 1999; Capo et al., 1998)","plainCitation":"(Bataille &amp; Bowen, 2012; Brennan et al., 2015; Campana, 1999; Capo et al., 1998)","noteIndex":0},"citationItems":[{"id":1939,"uris":["http://zotero.org/users/8421274/items/S8GE9LUD"],"itemData":{"id":1939,"type":"article-journal","abstract":"Although variation in 87Sr/86Sr has been widely pursued as a tracer of provenance in environmental studies, forensics, archeology and food traceability, accurate methods for mapping variations in environmental 87Sr/ 86Sr at regional scale are not available. In this paper, we build upon earlier efforts to model 87Sr/86Sr in bedrock by developing GIS-based models for Sr isotopes in rock and water that include the combined effects of lithology and time. Using published data, we ﬁt lithology-speciﬁc model parameters for generalized equations describing the concentration of radiogenic Sr in silicate and carbonate rocks. The new model explained more than 50% of the observed variance in measured Sr isotope values from independent global databases of igneous, metaigneous, and carbonate rocks, but performed more poorly (explaining 33% of the variance) for sedimentary and metasedimentary rocks. In comparison, a previously applied model formulation that did not include lithology-speciﬁc parameters explained only 20% and 8% of the observed variance for igneous and sedimentary rocks, respectively, and exhibited an inverse relationship with measured carbonate rock values. Building upon the bedrock model, we also developed and applied equations to predict the contribution of different rock types to 87Sr/86Sr variations in water as a function of their weathering rates and strontium content. The resulting water model was compared to data from 68 catchments and shown to give more accurate predictions of stream water 87Sr/86Sr (R2 = 0.70) than models that did not include lithological weathering parameters. We applied these models to produce maps (“isoscapes”) predicting 87Sr/86Sr in bedrock and water across the contiguous USA, and compared the mapped Sr isotope distributions to data on Sr isotope ratios of US marijuana crops. Although the maps produced here are demonstrably imperfect and leave signiﬁcant scope for further reﬁnement, they provide an enhanced framework for lithology-based Sr isotope modeling and offer a baseline for provenance studies by constraining the 87Sr/86Sr in strontium sources at regional scales.","container-title":"Chemical Geology","DOI":"10.1016/j.chemgeo.2012.01.028","ISSN":"00092541","journalAbbreviation":"Chemical Geology","language":"en","page":"39-52","source":"DOI.org (Crossref)","title":"Mapping 87Sr/86Sr variations in bedrock and water for large scale provenance studies","volume":"304-305","author":[{"family":"Bataille","given":"Clément P."},{"family":"Bowen","given":"Gabriel J."}],"issued":{"date-parts":[["2012",4]]}}},{"id":2313,"uris":["http://zotero.org/users/8421274/items/AJFVQJVT"],"itemData":{"id":2313,"type":"article-journal","abstract":"Highly migratory organisms present major challenges to conservation efforts. This is especially true for exploited anadromous fish species, which exhibit long-range dispersals from natal sites, complex population structures, and extensive mixing of distinct populations during exploitation. By tracing the migratory histories of individual Chinook salmon caught in fisheries using strontium isotopes, we determined the relative production of natal habitats at fine spatial scales and different life histories. Although strontium isotopes have been widely used in provenance research, we present a new robust framework to simultaneously assess natal sources and migrations of individuals within fishery harvests through time. Our results pave the way for investigating how fine-scale habitat production and life histories of salmon respond to perturbations—providing crucial insights for conservation.","container-title":"Science Advances","DOI":"10.1126/sciadv.1400124","issue":"4","note":"publisher: American Association for the Advancement of Science","page":"e1400124","source":"science.org (Atypon)","title":"Strontium isotopes delineate fine-scale natal origins and migration histories of Pacific salmon","volume":"1","author":[{"family":"Brennan","given":"Sean R."},{"family":"Zimmerman","given":"Christian E."},{"family":"Fernandez","given":"Diego P."},{"family":"Cerling","given":"Thure E."},{"family":"McPhee","given":"Megan V."},{"family":"Wooller","given":"Matthew J."}],"issued":{"date-parts":[["2015",5,15]]}}},{"id":1441,"uris":["http://zotero.org/users/8421274/items/PHNAKZ8D"],"itemData":{"id":1441,"type":"article-journal","abstract":"The fish otolith (earstone) has long been known as a timekeeper, but interest in its use as a metabolically inert environmental recorder has accelerated in recent years. In part due to technological advances, applications such as stock identification, determination of rnigralon pathways, reconstruction of temperature and salinity history, age validation, detection of anadromy, use as a natural tag and chemical mass marking have been developed, some of which are difficult or impossible to implement using alternative techniques. Microsamphg and the latest advances in beam-based probes allow many elemental assays to be coupled with daily or annual growth increments, thus providing a detailed chronologcal record of the environment. However, few workers have critically assessed the assumptions upon which the environmental reconstructions are based, or considered the possibility that elemental incorporation into the otolith may proceed differently than that into other calcified structures. This paper reviews current applications and their assumptions and suggests future directions. Particular attention is given to the premises that the elemental and isotopic composition of the otolith reflects that of the environment, and the effect of physiological filters on the resulting composition. The roles of temperature, elemental uptake into the fish and the process of otolith crystahzation are also assessed. Drawing upon recent advances in geochemistry and paleoclirnate research as points of contrast, it appears that not all applications of otolith chemistry are firmly based, although others are destined to become powerful and perhaps routine tools for the mainstream fish biologst.","container-title":"Marine Ecology Progress Series","DOI":"10.3354/meps188263","ISSN":"0171-8630, 1616-1599","journalAbbreviation":"Mar. Ecol. Prog. Ser.","language":"en","page":"263-297","source":"DOI.org (Crossref)","title":"Chemistry and composition of fish otoliths:pathways, mechanisms and applications","title-short":"Chemistry and composition of fish otoliths","volume":"188","author":[{"family":"Campana","given":"Se"}],"issued":{"date-parts":[["1999"]]}}},{"id":1457,"uris":["http://zotero.org/users/8421274/items/TDIQBP7K"],"itemData":{"id":1457,"type":"article-journal","abstract":"The strontium (Sr) isotope method can be a powerful tool in studies of chemical weathering and soil genesis, cation provenance and mobility, and the chronostratigraphic correlation of marine sediments. It is a sensitive geochemical tracer, applicable to large-scale ecosystem studies as well as to centimeter-scaled examination of cation mobility within a soil profile. The 87Sr/86Sr ratios of natural materials reflect the sources of strontium available during their formation. Isotopically distinct inputs from precipitation, dryfall, soil parent material, and surface or groundwater allow determination of the relative proportions of those materials entering or leaving an ecosystem. The isotopic compositions of labile (soil exchange complex and soil solution) strontium and Sr in vegetation reflect the sources of cations available to plants. Strontium isotopes can be used to track the biogeochemical cycling of nutrient cations such as calcium. The extent of cation contributions from in situ weathering and external additions to soil from dust and rain can also be resolved with this method. In this paper, we review the geochemistry and isotopic systematics of strontium, and discuss the use of this method as a tracer of earth surface processes.","container-title":"Geoderma","DOI":"10.1016/S0016-7061(97)00102-X","ISSN":"0016-7061","issue":"1","journalAbbreviation":"Geoderma","language":"en","page":"197-225","source":"ScienceDirect","title":"Strontium isotopes as tracers of ecosystem processes: theory and methods","title-short":"Strontium isotopes as tracers of ecosystem processes","volume":"82","author":[{"family":"Capo","given":"Rosemary C."},{"family":"Stewart","given":"Brian W."},{"family":"Chadwick","given":"Oliver A."}],"issued":{"date-parts":[["1998",2,1]]}}}],"schema":"https://github.com/citation-style-language/schema/raw/master/csl-citation.json"} </w:instrText>
+      </w:r>
+      <w:r>
+        <w:rPr>
+          <w:rFonts w:ascii="Garamond" w:hAnsi="Garamond"/>
+          <w:sz w:val="22"/>
+          <w:szCs w:val="22"/>
+        </w:rPr>
+        <w:fldChar w:fldCharType="separate"/>
+      </w:r>
+      <w:r>
+        <w:rPr>
+          <w:rFonts w:ascii="Garamond" w:hAnsi="Garamond"/>
+          <w:noProof/>
+          <w:sz w:val="22"/>
+          <w:szCs w:val="22"/>
+        </w:rPr>
+        <w:t>(Bataille &amp; Bowen, 2012; Brennan et al., 2015; Campana, 1999; Capo et al., 1998)</w:t>
+      </w:r>
+      <w:r>
+        <w:rPr>
+          <w:rFonts w:ascii="Garamond" w:hAnsi="Garamond"/>
+          <w:sz w:val="22"/>
+          <w:szCs w:val="22"/>
+        </w:rPr>
+        <w:fldChar w:fldCharType="end"/>
+      </w:r>
+      <w:r>
+        <w:rPr>
+          <w:rFonts w:ascii="Garamond" w:hAnsi="Garamond"/>
+          <w:sz w:val="22"/>
+          <w:szCs w:val="22"/>
+        </w:rPr>
+        <w:t xml:space="preserve">. As a result, </w:t>
+      </w:r>
+      <w:r>
+        <w:rPr>
+          <w:rFonts w:ascii="Cambria Math" w:hAnsi="Cambria Math" w:cs="Cambria Math"/>
+          <w:sz w:val="22"/>
+          <w:szCs w:val="22"/>
+        </w:rPr>
+        <w:t>⁸⁷</w:t>
+      </w:r>
+      <w:r>
+        <w:rPr>
+          <w:rFonts w:ascii="Garamond" w:hAnsi="Garamond"/>
+          <w:sz w:val="22"/>
+          <w:szCs w:val="22"/>
+        </w:rPr>
+        <w:t>Sr/</w:t>
+      </w:r>
+      <w:r>
+        <w:rPr>
+          <w:rFonts w:ascii="Cambria Math" w:hAnsi="Cambria Math" w:cs="Cambria Math"/>
+          <w:sz w:val="22"/>
+          <w:szCs w:val="22"/>
+        </w:rPr>
+        <w:t>⁸⁶</w:t>
+      </w:r>
+      <w:r>
+        <w:rPr>
+          <w:rFonts w:ascii="Garamond" w:hAnsi="Garamond"/>
+          <w:sz w:val="22"/>
+          <w:szCs w:val="22"/>
+        </w:rPr>
+        <w:t>Sr values associated with discrete time periods in an individual's life (e.g., freshwater natal rearing) can be used to estimate provenance by comparing them to values measured or modeled across the landscape.</w:t>
+      </w:r>
+      <w:r>
+        <w:t xml:space="preserve"> </w:t>
+      </w:r>
+      <w:r>
+        <w:rPr>
+          <w:rFonts w:ascii="Garamond" w:hAnsi="Garamond"/>
+          <w:sz w:val="22"/>
+          <w:szCs w:val="22"/>
+        </w:rPr>
+        <w:t>Despite its precision, this method is limited by the level of isotopic heterogeneity relative to the spatial scale of interest</w:t>
+      </w:r>
+      <w:r>
+        <w:rPr>
+          <w:rFonts w:ascii="Garamond" w:hAnsi="Garamond"/>
+          <w:sz w:val="22"/>
+          <w:szCs w:val="22"/>
+        </w:rPr>
+        <w:t xml:space="preserve"> </w:t>
+      </w:r>
+      <w:r>
+        <w:rPr>
+          <w:rFonts w:ascii="Garamond" w:hAnsi="Garamond"/>
+          <w:sz w:val="22"/>
+          <w:szCs w:val="22"/>
+        </w:rPr>
+        <w:fldChar w:fldCharType="begin"/>
+      </w:r>
+      <w:r>
+        <w:rPr>
+          <w:rFonts w:ascii="Garamond" w:hAnsi="Garamond"/>
+          <w:sz w:val="22"/>
+          <w:szCs w:val="22"/>
+        </w:rPr>
+        <w:instrText xml:space="preserve"> ADDIN ZOTERO_ITEM CSL_CITATION {"citationID":"W3sRlFul","properties":{"formattedCitation":"(Makhlouf et al., 2025)","plainCitation":"(Makhlouf et al., 2025)","noteIndex":0},"citationItems":[{"id":5397,"uris":["http://zotero.org/users/8421274/items/WRVF2L9N"],"itemData":{"id":5397,"type":"article-journal","abstract":"Understanding the spatial ecology of migratory species is uniquely challenging using conventional approaches. In fisheries such as for Pacific salmon, genetic stock identification (GSI) and isotope-based methods have emerged as strategies for reconstructing spatial ecology but are limited by the spatial resolution of genetic differentiation and isotopic heterogeneity. We show that integrating these complementary datasets improve the spatial resolution of provenance assignments. To do so, we reconstructed basin-wide estimates of natal origin locations for Chinook salmon in the Yukon River using samples (n = 247) from an experimental fishery designed to assess in-season run timing. A combined framework improved precision of likely provenance assignments (stream km &gt; 0.7 posterior probability) by 92% over genetic assignments and 52% over strontium isotope methods. In doing so, we illustrate watershed scale estimates of natal origin distributions with a greater resolution available from GSI or isotope data alone.","container-title":"Limnology and Oceanography Letters","DOI":"10.1002/lol2.70025","ISSN":"2378-2242","issue":"n/a","language":"en","license":"© 2025 The Author(s). Limnology and Oceanography Letters published by Wiley Periodicals LLC on behalf of Association for the Sciences of Limnology and Oceanography.","note":"_eprint: https://onlinelibrary.wiley.com/doi/pdf/10.1002/lol2.70025","source":"Wiley Online Library","title":"Combining genetic and isotope frameworks improves reconstruction of fish provenance across riverscapes","URL":"https://onlinelibrary.wiley.com/doi/abs/10.1002/lol2.70025","volume":"n/a","author":[{"family":"Makhlouf","given":"Ben"},{"family":"Cline","given":"Timothy J."},{"family":"Fernandez","given":"Diego"},{"family":"Seeb","given":"Lisa"},{"family":"Lee","given":"Elizabeth"},{"family":"Gilk-Baumer","given":"Sara"},{"family":"Whited","given":"Diane"},{"family":"Zimmerman","given":"Christian E."},{"family":"Schindler","given":"Daniel E."}],"accessed":{"date-parts":[["2025",6,4]]},"issued":{"date-parts":[["2025"]]}}}],"schema":"https://github.com/citation-style-language/schema/raw/master/csl-citation.json"} </w:instrText>
+      </w:r>
+      <w:r>
+        <w:rPr>
+          <w:rFonts w:ascii="Garamond" w:hAnsi="Garamond"/>
+          <w:sz w:val="22"/>
+          <w:szCs w:val="22"/>
+        </w:rPr>
+        <w:fldChar w:fldCharType="separate"/>
+      </w:r>
+      <w:r>
+        <w:rPr>
+          <w:rFonts w:ascii="Garamond" w:hAnsi="Garamond"/>
+          <w:noProof/>
+          <w:sz w:val="22"/>
+          <w:szCs w:val="22"/>
+        </w:rPr>
+        <w:t>(Makhlouf et al., 2025)</w:t>
+      </w:r>
+      <w:r>
+        <w:rPr>
+          <w:rFonts w:ascii="Garamond" w:hAnsi="Garamond"/>
+          <w:sz w:val="22"/>
+          <w:szCs w:val="22"/>
+        </w:rPr>
+        <w:fldChar w:fldCharType="end"/>
+      </w:r>
+      <w:r>
+        <w:rPr>
+          <w:rFonts w:ascii="Garamond" w:hAnsi="Garamond"/>
+          <w:sz w:val="22"/>
+          <w:szCs w:val="22"/>
+        </w:rPr>
+        <w:t xml:space="preserve">. </w:t>
+      </w:r>
+      <w:r>
+        <w:rPr>
+          <w:rFonts w:ascii="Garamond" w:hAnsi="Garamond"/>
+          <w:sz w:val="22"/>
+          <w:szCs w:val="22"/>
+        </w:rPr>
+        <w:t xml:space="preserve">While </w:t>
+      </w:r>
+      <w:r>
+        <w:rPr>
+          <w:rFonts w:ascii="Garamond" w:hAnsi="Garamond"/>
+          <w:sz w:val="22"/>
+          <w:szCs w:val="22"/>
+        </w:rPr>
+        <w:t xml:space="preserve">reliable </w:t>
+      </w:r>
+      <w:r>
+        <w:rPr>
+          <w:rFonts w:ascii="Garamond" w:hAnsi="Garamond"/>
+          <w:sz w:val="22"/>
+          <w:szCs w:val="22"/>
+        </w:rPr>
+        <w:t>within-</w:t>
+      </w:r>
+      <w:r>
+        <w:rPr>
+          <w:rFonts w:ascii="Garamond" w:hAnsi="Garamond"/>
+          <w:sz w:val="22"/>
+          <w:szCs w:val="22"/>
+        </w:rPr>
+        <w:t>river</w:t>
+      </w:r>
+      <w:r>
+        <w:rPr>
+          <w:rFonts w:ascii="Garamond" w:hAnsi="Garamond"/>
+          <w:sz w:val="22"/>
+          <w:szCs w:val="22"/>
+        </w:rPr>
+        <w:t xml:space="preserve"> </w:t>
+      </w:r>
+      <w:r>
+        <w:rPr>
+          <w:rFonts w:ascii="Garamond" w:hAnsi="Garamond"/>
+          <w:sz w:val="22"/>
+          <w:szCs w:val="22"/>
+        </w:rPr>
+        <w:t xml:space="preserve">estimates of </w:t>
+      </w:r>
+      <w:r>
+        <w:rPr>
+          <w:rFonts w:ascii="Garamond" w:hAnsi="Garamond"/>
+          <w:sz w:val="22"/>
+          <w:szCs w:val="22"/>
+        </w:rPr>
+        <w:t xml:space="preserve">provenance </w:t>
+      </w:r>
+      <w:r>
+        <w:rPr>
+          <w:rFonts w:ascii="Garamond" w:hAnsi="Garamond"/>
+          <w:sz w:val="22"/>
+          <w:szCs w:val="22"/>
+        </w:rPr>
+        <w:t>are</w:t>
+      </w:r>
+      <w:r>
+        <w:rPr>
+          <w:rFonts w:ascii="Garamond" w:hAnsi="Garamond"/>
+          <w:sz w:val="22"/>
+          <w:szCs w:val="22"/>
+        </w:rPr>
+        <w:t xml:space="preserve"> possible in Western Alaskan watersheds, regional overlap among the three major river systems creates high uncertainty, preventing reliable assignments of marine-caught fish when relying on a single natal </w:t>
+      </w:r>
+      <w:r>
+        <w:rPr>
+          <w:rFonts w:ascii="Cambria Math" w:hAnsi="Cambria Math" w:cs="Cambria Math"/>
+          <w:sz w:val="22"/>
+          <w:szCs w:val="22"/>
+        </w:rPr>
+        <w:t>⁸⁷</w:t>
+      </w:r>
+      <w:r>
+        <w:rPr>
+          <w:rFonts w:ascii="Garamond" w:hAnsi="Garamond"/>
+          <w:sz w:val="22"/>
+          <w:szCs w:val="22"/>
+        </w:rPr>
+        <w:t>Sr/</w:t>
+      </w:r>
+      <w:r>
+        <w:rPr>
+          <w:rFonts w:ascii="Cambria Math" w:hAnsi="Cambria Math" w:cs="Cambria Math"/>
+          <w:sz w:val="22"/>
+          <w:szCs w:val="22"/>
+        </w:rPr>
+        <w:t>⁸⁶</w:t>
+      </w:r>
+      <w:r>
+        <w:rPr>
+          <w:rFonts w:ascii="Garamond" w:hAnsi="Garamond"/>
+          <w:sz w:val="22"/>
+          <w:szCs w:val="22"/>
+        </w:rPr>
+        <w:t>Sr value (Figure 1).</w:t>
       </w:r>
     </w:p>
     <w:p>
       <w:pPr>
         <w:spacing w:line="480" w:lineRule="auto"/>
         <w:ind w:firstLine="720"/>
+        <w:rPr>
+          <w:rFonts w:ascii="Garamond" w:hAnsi="Garamond"/>
+          <w:sz w:val="22"/>
+          <w:szCs w:val="22"/>
+        </w:rPr>
       </w:pPr>
     </w:p>
     <w:p>
       <w:pPr>
         <w:spacing w:line="480" w:lineRule="auto"/>
         <w:ind w:firstLine="720"/>
-      </w:pPr>
+        <w:rPr>
+          <w:rFonts w:ascii="Garamond" w:hAnsi="Garamond"/>
+          <w:sz w:val="22"/>
+          <w:szCs w:val="22"/>
+        </w:rPr>
+      </w:pPr>
+      <w:r>
+        <w:rPr>
+          <w:rFonts w:ascii="Garamond" w:hAnsi="Garamond"/>
+          <w:sz w:val="22"/>
+          <w:szCs w:val="22"/>
+        </w:rPr>
+        <w:t>standard approaches such as genetic stock identification (GSI) provide provenance estimates at relatively coarse spatial scales (e.g., coastal western Alaska) but cannot distinguish among rivers within current genetic baselines.</w:t>
+      </w:r>
+      <w:r>
+        <w:rPr>
+          <w:rFonts w:ascii="Garamond" w:hAnsi="Garamond"/>
+          <w:sz w:val="22"/>
+          <w:szCs w:val="22"/>
+        </w:rPr>
+        <w:t xml:space="preserve"> </w:t>
+      </w:r>
     </w:p>
     <w:p>
       <w:pPr>
         <w:spacing w:line="480" w:lineRule="auto"/>
         <w:ind w:firstLine="720"/>
       </w:pPr>
-      <w:r>
-        <w:t>vary in space and time, creating a</w:t>
-      </w:r>
-      <w:r>
-        <w:t xml:space="preserve"> dynamic and interactive</w:t>
-      </w:r>
-      <w:r>
-        <w:t xml:space="preserve"> mosaic of shifting ecological and environmental conditions</w:t>
-      </w:r>
-      <w:r>
-        <w:t xml:space="preserve">. </w:t>
-      </w:r>
-      <w:r>
-        <w:t xml:space="preserve">This, along with the remote and expansive nature of Western Alaska landscapes, ha </w:t>
-      </w:r>
     </w:p>
     <w:p>
       <w:pPr>
@@ -1015,7 +957,10 @@
         <w:ind w:firstLine="720"/>
       </w:pPr>
       <w:r>
-        <w:t xml:space="preserve"> at the basin or sub-basin scale is challenging.</w:t>
+        <w:t xml:space="preserve">vary in space and time, creating a dynamic and interactive mosaic of shifting ecological and environmental conditions. </w:t>
+      </w:r>
+      <w:r>
+        <w:t xml:space="preserve">This, along with the remote and expansive nature of Western Alaska landscapes, ha </w:t>
       </w:r>
     </w:p>
     <w:p>
@@ -1029,6 +974,9 @@
         <w:spacing w:line="480" w:lineRule="auto"/>
         <w:ind w:firstLine="720"/>
       </w:pPr>
+      <w:r>
+        <w:t xml:space="preserve"> at the basin or sub-basin scale is challenging.</w:t>
+      </w:r>
     </w:p>
     <w:p>
       <w:pPr>
@@ -1041,64 +989,6 @@
         <w:spacing w:line="480" w:lineRule="auto"/>
         <w:ind w:firstLine="720"/>
       </w:pPr>
-      <w:r>
-        <w:t>ha</w:t>
-      </w:r>
-      <w:r>
-        <w:t>s</w:t>
-      </w:r>
-      <w:r>
-        <w:t xml:space="preserve"> led to </w:t>
-      </w:r>
-      <w:r>
-        <w:rPr>
-          <w:rFonts w:ascii="Garamond" w:hAnsi="Garamond"/>
-        </w:rPr>
-        <w:t xml:space="preserve">led </w:t>
-      </w:r>
-      <w:r>
-        <w:rPr>
-          <w:rFonts w:ascii="Garamond" w:hAnsi="Garamond"/>
-        </w:rPr>
-        <w:t xml:space="preserve">significant hardship for communities in the region which rely on fishery resources for subsistence and cultural value </w:t>
-      </w:r>
-      <w:r>
-        <w:rPr>
-          <w:rFonts w:ascii="Garamond" w:hAnsi="Garamond"/>
-        </w:rPr>
-        <w:fldChar w:fldCharType="begin"/>
-      </w:r>
-      <w:r>
-        <w:rPr>
-          <w:rFonts w:ascii="Garamond" w:hAnsi="Garamond"/>
-        </w:rPr>
-        <w:instrText xml:space="preserve"> ADDIN ZOTERO_ITEM CSL_CITATION {"citationID":"CRrkE0aE","properties":{"formattedCitation":"(Brown &amp; Godduhn, 2015)","plainCitation":"(Brown &amp; Godduhn, 2015)","noteIndex":0},"citationItems":[{"id":4428,"uris":["http://zotero.org/users/8421274/items/2WA8NCRM"],"itemData":{"id":4428,"type":"article-journal","language":"en","source":"Zotero","title":"Socioeconomic effects of declining salmon runs on the Yukon River","author":[{"family":"Brown","given":"Caroline L"},{"family":"Godduhn","given":"Anna"}],"issued":{"date-parts":[["2015"]]}}}],"schema":"https://github.com/citation-style-language/schema/raw/master/csl-citation.json"} </w:instrText>
-      </w:r>
-      <w:r>
-        <w:rPr>
-          <w:rFonts w:ascii="Garamond" w:hAnsi="Garamond"/>
-        </w:rPr>
-        <w:fldChar w:fldCharType="separate"/>
-      </w:r>
-      <w:r>
-        <w:rPr>
-          <w:rFonts w:ascii="Garamond" w:hAnsi="Garamond"/>
-          <w:noProof/>
-        </w:rPr>
-        <w:t>(Brown &amp; Godduhn, 2015)</w:t>
-      </w:r>
-      <w:r>
-        <w:rPr>
-          <w:rFonts w:ascii="Garamond" w:hAnsi="Garamond"/>
-        </w:rPr>
-        <w:fldChar w:fldCharType="end"/>
-      </w:r>
-      <w:r>
-        <w:rPr>
-          <w:rFonts w:ascii="Garamond" w:hAnsi="Garamond"/>
-        </w:rPr>
-        <w:t xml:space="preserve">. </w:t>
-      </w:r>
     </w:p>
     <w:p>
       <w:pPr>
@@ -1110,20 +1000,70 @@
       <w:pPr>
         <w:spacing w:line="480" w:lineRule="auto"/>
         <w:ind w:firstLine="720"/>
-        <w:rPr>
-          <w:sz w:val="22"/>
-          <w:szCs w:val="22"/>
-        </w:rPr>
-      </w:pPr>
+      </w:pPr>
+      <w:r>
+        <w:t>ha</w:t>
+      </w:r>
+      <w:r>
+        <w:t>s</w:t>
+      </w:r>
+      <w:r>
+        <w:t xml:space="preserve"> led to </w:t>
+      </w:r>
+      <w:r>
+        <w:rPr>
+          <w:rFonts w:ascii="Garamond" w:hAnsi="Garamond"/>
+        </w:rPr>
+        <w:t xml:space="preserve">led </w:t>
+      </w:r>
+      <w:r>
+        <w:rPr>
+          <w:rFonts w:ascii="Garamond" w:hAnsi="Garamond"/>
+        </w:rPr>
+        <w:t xml:space="preserve">significant hardship for communities in the region which rely on fishery resources for subsistence and cultural value </w:t>
+      </w:r>
+      <w:r>
+        <w:rPr>
+          <w:rFonts w:ascii="Garamond" w:hAnsi="Garamond"/>
+        </w:rPr>
+        <w:fldChar w:fldCharType="begin"/>
+      </w:r>
+      <w:r>
+        <w:rPr>
+          <w:rFonts w:ascii="Garamond" w:hAnsi="Garamond"/>
+        </w:rPr>
+        <w:instrText xml:space="preserve"> ADDIN ZOTERO_ITEM CSL_CITATION {"citationID":"CRrkE0aE","properties":{"formattedCitation":"(Brown &amp; Godduhn, 2015)","plainCitation":"(Brown &amp; Godduhn, 2015)","noteIndex":0},"citationItems":[{"id":4428,"uris":["http://zotero.org/users/8421274/items/2WA8NCRM"],"itemData":{"id":4428,"type":"article-journal","language":"en","source":"Zotero","title":"Socioeconomic effects of declining salmon runs on the Yukon River","author":[{"family":"Brown","given":"Caroline L"},{"family":"Godduhn","given":"Anna"}],"issued":{"date-parts":[["2015"]]}}}],"schema":"https://github.com/citation-style-language/schema/raw/master/csl-citation.json"} </w:instrText>
+      </w:r>
+      <w:r>
+        <w:rPr>
+          <w:rFonts w:ascii="Garamond" w:hAnsi="Garamond"/>
+        </w:rPr>
+        <w:fldChar w:fldCharType="separate"/>
+      </w:r>
+      <w:r>
+        <w:rPr>
+          <w:rFonts w:ascii="Garamond" w:hAnsi="Garamond"/>
+          <w:noProof/>
+        </w:rPr>
+        <w:t>(Brown &amp; Godduhn, 2015)</w:t>
+      </w:r>
+      <w:r>
+        <w:rPr>
+          <w:rFonts w:ascii="Garamond" w:hAnsi="Garamond"/>
+        </w:rPr>
+        <w:fldChar w:fldCharType="end"/>
+      </w:r>
+      <w:r>
+        <w:rPr>
+          <w:rFonts w:ascii="Garamond" w:hAnsi="Garamond"/>
+        </w:rPr>
+        <w:t xml:space="preserve">. </w:t>
+      </w:r>
     </w:p>
     <w:p>
       <w:pPr>
         <w:spacing w:line="480" w:lineRule="auto"/>
         <w:ind w:firstLine="720"/>
-        <w:rPr>
-          <w:sz w:val="22"/>
-          <w:szCs w:val="22"/>
-        </w:rPr>
       </w:pPr>
     </w:p>
     <w:p>
@@ -1131,7 +1071,6 @@
         <w:spacing w:line="480" w:lineRule="auto"/>
         <w:ind w:firstLine="720"/>
         <w:rPr>
-          <w:rFonts w:ascii="Times New Roman" w:hAnsi="Times New Roman" w:cs="Times New Roman"/>
           <w:sz w:val="22"/>
           <w:szCs w:val="22"/>
         </w:rPr>
@@ -1142,7 +1081,6 @@
         <w:spacing w:line="480" w:lineRule="auto"/>
         <w:ind w:firstLine="720"/>
         <w:rPr>
-          <w:rFonts w:ascii="Times New Roman" w:hAnsi="Times New Roman" w:cs="Times New Roman"/>
           <w:sz w:val="22"/>
           <w:szCs w:val="22"/>
         </w:rPr>
@@ -1164,38 +1102,22 @@
         <w:spacing w:line="480" w:lineRule="auto"/>
         <w:ind w:firstLine="720"/>
         <w:rPr>
-          <w:rFonts w:ascii="Garamond" w:hAnsi="Garamond"/>
-          <w:sz w:val="22"/>
-          <w:szCs w:val="22"/>
-        </w:rPr>
-      </w:pPr>
-      <w:r>
-        <w:rPr>
-          <w:rFonts w:ascii="Garamond" w:hAnsi="Garamond"/>
-          <w:sz w:val="22"/>
-          <w:szCs w:val="22"/>
-        </w:rPr>
-        <w:t xml:space="preserve">** Isotope based methods etc. etc. </w:t>
-      </w:r>
+          <w:rFonts w:ascii="Times New Roman" w:hAnsi="Times New Roman" w:cs="Times New Roman"/>
+          <w:sz w:val="22"/>
+          <w:szCs w:val="22"/>
+        </w:rPr>
+      </w:pPr>
     </w:p>
     <w:p>
       <w:pPr>
         <w:spacing w:line="480" w:lineRule="auto"/>
         <w:ind w:firstLine="720"/>
         <w:rPr>
-          <w:rFonts w:ascii="Garamond" w:hAnsi="Garamond"/>
-          <w:sz w:val="22"/>
-          <w:szCs w:val="22"/>
-        </w:rPr>
-      </w:pPr>
-      <w:r>
-        <w:rPr>
-          <w:rFonts w:ascii="Garamond" w:hAnsi="Garamond"/>
-          <w:sz w:val="22"/>
-          <w:szCs w:val="22"/>
-        </w:rPr>
-        <w:t xml:space="preserve">** Machine learning methods. </w:t>
-      </w:r>
+          <w:rFonts w:ascii="Times New Roman" w:hAnsi="Times New Roman" w:cs="Times New Roman"/>
+          <w:sz w:val="22"/>
+          <w:szCs w:val="22"/>
+        </w:rPr>
+      </w:pPr>
     </w:p>
     <w:p>
       <w:pPr>
@@ -1207,6 +1129,14 @@
           <w:szCs w:val="22"/>
         </w:rPr>
       </w:pPr>
+      <w:r>
+        <w:rPr>
+          <w:rFonts w:ascii="Garamond" w:hAnsi="Garamond"/>
+          <w:sz w:val="22"/>
+          <w:szCs w:val="22"/>
+        </w:rPr>
+        <w:t xml:space="preserve">** Isotope based methods etc. etc. </w:t>
+      </w:r>
     </w:p>
     <w:p>
       <w:pPr>
@@ -1218,6 +1148,15 @@
           <w:szCs w:val="22"/>
         </w:rPr>
       </w:pPr>
+      <w:r>
+        <w:rPr>
+          <w:rFonts w:ascii="Garamond" w:hAnsi="Garamond"/>
+          <w:sz w:val="22"/>
+          <w:szCs w:val="22"/>
+        </w:rPr>
+        <w:lastRenderedPageBreak/>
+        <w:t xml:space="preserve">** Machine learning methods. </w:t>
+      </w:r>
     </w:p>
     <w:p>
       <w:pPr>
@@ -1284,6 +1223,28 @@
           <w:szCs w:val="22"/>
         </w:rPr>
       </w:pPr>
+    </w:p>
+    <w:p>
+      <w:pPr>
+        <w:spacing w:line="480" w:lineRule="auto"/>
+        <w:ind w:firstLine="720"/>
+        <w:rPr>
+          <w:rFonts w:ascii="Garamond" w:hAnsi="Garamond"/>
+          <w:sz w:val="22"/>
+          <w:szCs w:val="22"/>
+        </w:rPr>
+      </w:pPr>
+    </w:p>
+    <w:p>
+      <w:pPr>
+        <w:spacing w:line="480" w:lineRule="auto"/>
+        <w:ind w:firstLine="720"/>
+        <w:rPr>
+          <w:rFonts w:ascii="Garamond" w:hAnsi="Garamond"/>
+          <w:sz w:val="22"/>
+          <w:szCs w:val="22"/>
+        </w:rPr>
+      </w:pPr>
       <w:r>
         <w:rPr>
           <w:rFonts w:ascii="Garamond" w:hAnsi="Garamond"/>
@@ -1934,6 +1895,7 @@
           <w:sz w:val="22"/>
           <w:szCs w:val="22"/>
         </w:rPr>
+        <w:lastRenderedPageBreak/>
         <w:t>Isotope-based methods for estimating provenance from ear stones found in fish</w:t>
       </w:r>
       <w:r>
@@ -2163,16 +2125,7 @@
           <w:sz w:val="22"/>
           <w:szCs w:val="22"/>
         </w:rPr>
-        <w:t xml:space="preserve">Despite its precision, this method is limited by the level of isotopic heterogeneity relative to the </w:t>
-      </w:r>
-      <w:r>
-        <w:rPr>
-          <w:rFonts w:ascii="Garamond" w:hAnsi="Garamond"/>
-          <w:sz w:val="22"/>
-          <w:szCs w:val="22"/>
-        </w:rPr>
-        <w:lastRenderedPageBreak/>
-        <w:t>spatial scale of interest</w:t>
+        <w:t>Despite its precision, this method is limited by the level of isotopic heterogeneity relative to the spatial scale of interest</w:t>
       </w:r>
       <w:r>
         <w:rPr>
@@ -2574,7 +2527,16 @@
           <w:sz w:val="22"/>
           <w:szCs w:val="22"/>
         </w:rPr>
-        <w:t xml:space="preserve">. However, their limited applications have </w:t>
+        <w:t xml:space="preserve">. However, </w:t>
+      </w:r>
+      <w:r>
+        <w:rPr>
+          <w:rFonts w:ascii="Garamond" w:hAnsi="Garamond"/>
+          <w:sz w:val="22"/>
+          <w:szCs w:val="22"/>
+        </w:rPr>
+        <w:lastRenderedPageBreak/>
+        <w:t xml:space="preserve">their limited applications have </w:t>
       </w:r>
       <w:r>
         <w:rPr>
@@ -2757,16 +2719,7 @@
           <w:sz w:val="22"/>
           <w:szCs w:val="22"/>
         </w:rPr>
-        <w:t xml:space="preserve">methods to uncover watershed </w:t>
-      </w:r>
-      <w:r>
-        <w:rPr>
-          <w:rFonts w:ascii="Garamond" w:hAnsi="Garamond"/>
-          <w:sz w:val="22"/>
-          <w:szCs w:val="22"/>
-        </w:rPr>
-        <w:lastRenderedPageBreak/>
-        <w:t xml:space="preserve">specific characteristics to discriminate among watersheds of origin and 2) </w:t>
+        <w:t xml:space="preserve">methods to uncover watershed specific characteristics to discriminate among watersheds of origin and 2) </w:t>
       </w:r>
       <w:r>
         <w:rPr>
@@ -3130,7 +3083,16 @@
           <w:sz w:val="22"/>
           <w:szCs w:val="22"/>
         </w:rPr>
-        <w:t>was preformed from the core to just after the onset of the marine signature along the dorsal lobe</w:t>
+        <w:t xml:space="preserve">was preformed from the core to just after the onset of the marine </w:t>
+      </w:r>
+      <w:r>
+        <w:rPr>
+          <w:rFonts w:ascii="Garamond" w:hAnsi="Garamond"/>
+          <w:sz w:val="22"/>
+          <w:szCs w:val="22"/>
+        </w:rPr>
+        <w:lastRenderedPageBreak/>
+        <w:t>signature along the dorsal lobe</w:t>
       </w:r>
       <w:r>
         <w:rPr>
@@ -3382,17 +3344,7 @@
           <w:sz w:val="22"/>
           <w:szCs w:val="22"/>
         </w:rPr>
-        <w:t xml:space="preserve">(Brennan &amp; </w:t>
-      </w:r>
-      <w:r>
-        <w:rPr>
-          <w:rFonts w:ascii="Garamond" w:hAnsi="Garamond"/>
-          <w:noProof/>
-          <w:sz w:val="22"/>
-          <w:szCs w:val="22"/>
-        </w:rPr>
-        <w:lastRenderedPageBreak/>
-        <w:t>Schindler, 2017)</w:t>
+        <w:t>(Brennan &amp; Schindler, 2017)</w:t>
       </w:r>
       <w:r>
         <w:rPr>
@@ -4029,7 +3981,16 @@
           <w:sz w:val="22"/>
           <w:szCs w:val="22"/>
         </w:rPr>
-        <w:t xml:space="preserve">Finally, variation in size among individuals produces time series of differing lengths. However, many machine learning algorithms require fixed-length vectors. To address this, all samples were interpolated to a common length, defined as the average length of </w:t>
+        <w:t xml:space="preserve">Finally, variation in size among individuals produces time series of differing lengths. However, many machine learning algorithms require fixed-length vectors. To address </w:t>
+      </w:r>
+      <w:r>
+        <w:rPr>
+          <w:rFonts w:ascii="Garamond" w:hAnsi="Garamond"/>
+          <w:sz w:val="22"/>
+          <w:szCs w:val="22"/>
+        </w:rPr>
+        <w:lastRenderedPageBreak/>
+        <w:t xml:space="preserve">this, all samples were interpolated to a common length, defined as the average length of </w:t>
       </w:r>
       <w:proofErr w:type="spellStart"/>
       <w:r>
@@ -4226,16 +4187,7 @@
           <w:sz w:val="22"/>
           <w:szCs w:val="22"/>
         </w:rPr>
-        <w:t xml:space="preserve">) was set to the square root of the total number of predictors, following standard practice for </w:t>
-      </w:r>
-      <w:r>
-        <w:rPr>
-          <w:rFonts w:ascii="Garamond" w:hAnsi="Garamond"/>
-          <w:sz w:val="22"/>
-          <w:szCs w:val="22"/>
-        </w:rPr>
-        <w:lastRenderedPageBreak/>
-        <w:t xml:space="preserve">classification problems. The KNN model was trained using five neighbors, while the SVM model used default hyperparameters for the RBF kernel. All models were implemented using the </w:t>
+        <w:t xml:space="preserve">) was set to the square root of the total number of predictors, following standard practice for classification problems. The KNN model was trained using five neighbors, while the SVM model used default hyperparameters for the RBF kernel. All models were implemented using the </w:t>
       </w:r>
       <w:proofErr w:type="spellStart"/>
       <w:r>
@@ -4476,7 +4428,16 @@
           <w:sz w:val="22"/>
           <w:szCs w:val="22"/>
         </w:rPr>
-        <w:t xml:space="preserve"> PCA transforms the original </w:t>
+        <w:t xml:space="preserve"> PCA transforms </w:t>
+      </w:r>
+      <w:r>
+        <w:rPr>
+          <w:rFonts w:ascii="Garamond" w:hAnsi="Garamond"/>
+          <w:sz w:val="22"/>
+          <w:szCs w:val="22"/>
+        </w:rPr>
+        <w:lastRenderedPageBreak/>
+        <w:t xml:space="preserve">the original </w:t>
       </w:r>
       <w:r>
         <w:rPr>
@@ -4611,16 +4572,7 @@
           <w:sz w:val="22"/>
           <w:szCs w:val="22"/>
         </w:rPr>
-        <w:t xml:space="preserve">% of variance) and PC2 (20.93% of variance) as </w:t>
-      </w:r>
-      <w:r>
-        <w:rPr>
-          <w:rFonts w:ascii="Garamond" w:hAnsi="Garamond"/>
-          <w:sz w:val="22"/>
-          <w:szCs w:val="22"/>
-        </w:rPr>
-        <w:lastRenderedPageBreak/>
-        <w:t xml:space="preserve">well as between PC1 and PC3 (10.23% of variance). </w:t>
+        <w:t xml:space="preserve">% of variance) and PC2 (20.93% of variance) as well as between PC1 and PC3 (10.23% of variance). </w:t>
       </w:r>
       <w:r>
         <w:rPr>
@@ -4749,7 +4701,16 @@
           <w:sz w:val="22"/>
           <w:szCs w:val="22"/>
         </w:rPr>
-        <w:t xml:space="preserve"> transformations were fitted separately for each model-data type combination and stored as reusable functions that can be applied consistently to future predictions. This ensures that probability estimates from our models accurately reflect true classification confidence</w:t>
+        <w:t xml:space="preserve"> transformations were fitted separately for each model-data </w:t>
+      </w:r>
+      <w:r>
+        <w:rPr>
+          <w:rFonts w:ascii="Garamond" w:hAnsi="Garamond"/>
+          <w:sz w:val="22"/>
+          <w:szCs w:val="22"/>
+        </w:rPr>
+        <w:lastRenderedPageBreak/>
+        <w:t>type combination and stored as reusable functions that can be applied consistently to future predictions. This ensures that probability estimates from our models accurately reflect true classification confidence</w:t>
       </w:r>
       <w:r>
         <w:rPr>
@@ -4811,7 +4772,6 @@
           <w:sz w:val="32"/>
           <w:szCs w:val="32"/>
         </w:rPr>
-        <w:lastRenderedPageBreak/>
         <w:t xml:space="preserve">*** Unsure if this will be in this paper or the next. Basically, now that we have true </w:t>
       </w:r>
       <w:proofErr w:type="gramStart"/>
@@ -4993,7 +4953,16 @@
           <w:sz w:val="22"/>
           <w:szCs w:val="22"/>
         </w:rPr>
-        <w:t>Unsurprisingly, the overlapping training set performance was slightly lower than that of the total training set, with the highest classification accuracy of 90.</w:t>
+        <w:t xml:space="preserve">Unsurprisingly, the overlapping training set performance was slightly lower than that of the total training set, with the highest classification accuracy of </w:t>
+      </w:r>
+      <w:r>
+        <w:rPr>
+          <w:rFonts w:ascii="Garamond" w:hAnsi="Garamond"/>
+          <w:sz w:val="22"/>
+          <w:szCs w:val="22"/>
+        </w:rPr>
+        <w:lastRenderedPageBreak/>
+        <w:t>90.</w:t>
       </w:r>
       <w:r>
         <w:rPr>
@@ -5132,16 +5101,7 @@
           <w:sz w:val="22"/>
           <w:szCs w:val="22"/>
         </w:rPr>
-        <w:t xml:space="preserve"> fish did not change </w:t>
-      </w:r>
-      <w:r>
-        <w:rPr>
-          <w:rFonts w:ascii="Garamond" w:hAnsi="Garamond"/>
-          <w:sz w:val="22"/>
-          <w:szCs w:val="22"/>
-        </w:rPr>
-        <w:lastRenderedPageBreak/>
-        <w:t>(91.4%) whereas Kuskokwim saw a slight increase to 92.5%. In this testing set the most frequent misclassification was Yukon fish predicted to have been Kuskokwim (8.8% of Yukon fish</w:t>
+        <w:t xml:space="preserve"> fish did not change (91.4%) whereas Kuskokwim saw a slight increase to 92.5%. In this testing set the most frequent misclassification was Yukon fish predicted to have been Kuskokwim (8.8% of Yukon fish</w:t>
       </w:r>
       <w:proofErr w:type="gramStart"/>
       <w:r>
@@ -5243,7 +5203,16 @@
           <w:sz w:val="22"/>
           <w:szCs w:val="22"/>
         </w:rPr>
-        <w:t>Mapping the loadings of each principal component onto the timeseries revealed distinct regions driving class separation. The first principal component showed high loading values in the middle portion of the timeseries, potentially encompassing both natal origin regions and secondary rearing locations. The second principal component was driven by variation occurring just before the onset of the marine region, likely representing residency in mainstem tributaries during ocean migration. The relative shape at this point in the timeseries reflects differences in mainstem tributary Sr87/86 values among the three watersheds. Principal component 3 appeared to be driven by values at the very beginning of the timeseries, corresponding to the start of the natal origin signature. The minimal discrimination among watersheds along this component was expected, as all individuals in this dataset shared the same natal origin value</w:t>
+        <w:t xml:space="preserve">Mapping the loadings of each principal component onto the timeseries revealed distinct regions driving class separation. The first principal component showed high loading values in the middle portion of the timeseries, potentially encompassing both natal origin regions and secondary rearing locations. The </w:t>
+      </w:r>
+      <w:r>
+        <w:rPr>
+          <w:rFonts w:ascii="Garamond" w:hAnsi="Garamond"/>
+          <w:sz w:val="22"/>
+          <w:szCs w:val="22"/>
+        </w:rPr>
+        <w:lastRenderedPageBreak/>
+        <w:t>second principal component was driven by variation occurring just before the onset of the marine region, likely representing residency in mainstem tributaries during ocean migration. The relative shape at this point in the timeseries reflects differences in mainstem tributary Sr87/86 values among the three watersheds. Principal component 3 appeared to be driven by values at the very beginning of the timeseries, corresponding to the start of the natal origin signature. The minimal discrimination among watersheds along this component was expected, as all individuals in this dataset shared the same natal origin value</w:t>
       </w:r>
       <w:r>
         <w:rPr>
@@ -5452,6 +5421,7 @@
           <w:sz w:val="32"/>
           <w:szCs w:val="32"/>
         </w:rPr>
+        <w:lastRenderedPageBreak/>
         <w:t xml:space="preserve">Discussion </w:t>
       </w:r>
     </w:p>

</xml_diff>

<commit_message>
another work through intro
</commit_message>
<xml_diff>
--- a/Docs/Machine learning applied to otolith timeseries data to discriminate river of origin for Western Alaska Salmon.docx
+++ b/Docs/Machine learning applied to otolith timeseries data to discriminate river of origin for Western Alaska Salmon.docx
@@ -102,10 +102,168 @@
     </w:p>
     <w:p>
       <w:pPr>
-        <w:rPr>
-          <w:rFonts w:ascii="Garamond" w:hAnsi="Garamond"/>
-        </w:rPr>
-      </w:pPr>
+        <w:spacing w:line="480" w:lineRule="auto"/>
+        <w:rPr>
+          <w:rFonts w:ascii="Garamond" w:hAnsi="Garamond"/>
+        </w:rPr>
+      </w:pPr>
+    </w:p>
+    <w:p>
+      <w:pPr>
+        <w:spacing w:line="480" w:lineRule="auto"/>
+        <w:rPr>
+          <w:rFonts w:ascii="Garamond" w:hAnsi="Garamond"/>
+        </w:rPr>
+      </w:pPr>
+      <w:r>
+        <w:rPr>
+          <w:rFonts w:ascii="Garamond" w:hAnsi="Garamond"/>
+        </w:rPr>
+        <w:t xml:space="preserve">Abstract: </w:t>
+      </w:r>
+    </w:p>
+    <w:p>
+      <w:pPr>
+        <w:spacing w:line="480" w:lineRule="auto"/>
+        <w:rPr>
+          <w:rFonts w:ascii="Garamond" w:hAnsi="Garamond"/>
+        </w:rPr>
+      </w:pPr>
+    </w:p>
+    <w:p>
+      <w:pPr>
+        <w:spacing w:line="480" w:lineRule="auto"/>
+        <w:rPr>
+          <w:rFonts w:ascii="Garamond" w:hAnsi="Garamond"/>
+        </w:rPr>
+      </w:pPr>
+    </w:p>
+    <w:p>
+      <w:pPr>
+        <w:spacing w:line="480" w:lineRule="auto"/>
+        <w:rPr>
+          <w:rFonts w:ascii="Garamond" w:hAnsi="Garamond"/>
+        </w:rPr>
+      </w:pPr>
+    </w:p>
+    <w:p>
+      <w:pPr>
+        <w:spacing w:line="480" w:lineRule="auto"/>
+        <w:rPr>
+          <w:rFonts w:ascii="Garamond" w:hAnsi="Garamond"/>
+        </w:rPr>
+      </w:pPr>
+    </w:p>
+    <w:p>
+      <w:pPr>
+        <w:spacing w:line="480" w:lineRule="auto"/>
+        <w:rPr>
+          <w:rFonts w:ascii="Garamond" w:hAnsi="Garamond"/>
+        </w:rPr>
+      </w:pPr>
+    </w:p>
+    <w:p>
+      <w:pPr>
+        <w:spacing w:line="480" w:lineRule="auto"/>
+        <w:rPr>
+          <w:rFonts w:ascii="Garamond" w:hAnsi="Garamond"/>
+        </w:rPr>
+      </w:pPr>
+    </w:p>
+    <w:p>
+      <w:pPr>
+        <w:spacing w:line="480" w:lineRule="auto"/>
+        <w:rPr>
+          <w:rFonts w:ascii="Garamond" w:hAnsi="Garamond"/>
+        </w:rPr>
+      </w:pPr>
+    </w:p>
+    <w:p>
+      <w:pPr>
+        <w:spacing w:line="480" w:lineRule="auto"/>
+        <w:rPr>
+          <w:rFonts w:ascii="Garamond" w:hAnsi="Garamond"/>
+        </w:rPr>
+      </w:pPr>
+    </w:p>
+    <w:p>
+      <w:pPr>
+        <w:spacing w:line="480" w:lineRule="auto"/>
+        <w:rPr>
+          <w:rFonts w:ascii="Garamond" w:hAnsi="Garamond"/>
+        </w:rPr>
+      </w:pPr>
+    </w:p>
+    <w:p>
+      <w:pPr>
+        <w:spacing w:line="480" w:lineRule="auto"/>
+        <w:rPr>
+          <w:rFonts w:ascii="Garamond" w:hAnsi="Garamond"/>
+        </w:rPr>
+      </w:pPr>
+    </w:p>
+    <w:p>
+      <w:pPr>
+        <w:spacing w:line="480" w:lineRule="auto"/>
+        <w:rPr>
+          <w:rFonts w:ascii="Garamond" w:hAnsi="Garamond"/>
+        </w:rPr>
+      </w:pPr>
+    </w:p>
+    <w:p>
+      <w:pPr>
+        <w:spacing w:line="480" w:lineRule="auto"/>
+        <w:rPr>
+          <w:rFonts w:ascii="Garamond" w:hAnsi="Garamond"/>
+        </w:rPr>
+      </w:pPr>
+    </w:p>
+    <w:p>
+      <w:pPr>
+        <w:spacing w:line="480" w:lineRule="auto"/>
+        <w:rPr>
+          <w:rFonts w:ascii="Garamond" w:hAnsi="Garamond"/>
+        </w:rPr>
+      </w:pPr>
+    </w:p>
+    <w:p>
+      <w:pPr>
+        <w:spacing w:line="480" w:lineRule="auto"/>
+        <w:rPr>
+          <w:rFonts w:ascii="Garamond" w:hAnsi="Garamond"/>
+        </w:rPr>
+      </w:pPr>
+    </w:p>
+    <w:p>
+      <w:pPr>
+        <w:spacing w:line="480" w:lineRule="auto"/>
+        <w:rPr>
+          <w:rFonts w:ascii="Garamond" w:hAnsi="Garamond"/>
+        </w:rPr>
+      </w:pPr>
+    </w:p>
+    <w:p>
+      <w:pPr>
+        <w:spacing w:line="480" w:lineRule="auto"/>
+        <w:rPr>
+          <w:rFonts w:ascii="Garamond" w:hAnsi="Garamond"/>
+          <w:b/>
+          <w:bCs/>
+          <w:sz w:val="32"/>
+          <w:szCs w:val="32"/>
+        </w:rPr>
+      </w:pPr>
+      <w:r>
+        <w:rPr>
+          <w:rFonts w:ascii="Garamond" w:hAnsi="Garamond"/>
+          <w:b/>
+          <w:bCs/>
+          <w:sz w:val="32"/>
+          <w:szCs w:val="32"/>
+        </w:rPr>
+        <w:lastRenderedPageBreak/>
+        <w:t xml:space="preserve">Introduction: </w:t>
+      </w:r>
     </w:p>
     <w:p>
       <w:pPr>
@@ -120,114 +278,20 @@
       <w:r>
         <w:rPr>
           <w:rFonts w:ascii="Garamond" w:hAnsi="Garamond"/>
-          <w:sz w:val="22"/>
-          <w:szCs w:val="22"/>
-        </w:rPr>
-        <w:t xml:space="preserve">Understanding how environmental stressors interact with ecosystem function across multiple spatial and temporal scales is fundamental to </w:t>
-      </w:r>
-      <w:r>
-        <w:rPr>
-          <w:rFonts w:ascii="Garamond" w:hAnsi="Garamond"/>
-          <w:sz w:val="22"/>
-          <w:szCs w:val="22"/>
-        </w:rPr>
-        <w:t>monitoring, detecting, and</w:t>
-      </w:r>
-      <w:r>
-        <w:rPr>
-          <w:rFonts w:ascii="Garamond" w:hAnsi="Garamond"/>
-          <w:sz w:val="22"/>
-          <w:szCs w:val="22"/>
-        </w:rPr>
-        <w:t xml:space="preserve"> managing ecological responses to global change. This </w:t>
-      </w:r>
-      <w:r>
-        <w:rPr>
-          <w:rFonts w:ascii="Garamond" w:hAnsi="Garamond"/>
-          <w:sz w:val="22"/>
-          <w:szCs w:val="22"/>
-        </w:rPr>
-        <w:t>is particularly challenging</w:t>
-      </w:r>
-      <w:r>
-        <w:rPr>
-          <w:rFonts w:ascii="Garamond" w:hAnsi="Garamond"/>
-          <w:sz w:val="22"/>
-          <w:szCs w:val="22"/>
-        </w:rPr>
-        <w:t xml:space="preserve"> in remote and complex ecosystems, where traditional monitoring approaches may be logistically difficult or insufficient to capture fine-scale ecological processes. While population-level assessments provide valuable broad-scale insights, they can obscure critical threats to key components of ecosystem health </w:t>
-      </w:r>
-      <w:r>
-        <w:rPr>
-          <w:rFonts w:ascii="Garamond" w:hAnsi="Garamond"/>
-          <w:sz w:val="22"/>
-          <w:szCs w:val="22"/>
-        </w:rPr>
-        <w:t>at smaller spatial scales or within metapopulation components. Without this relevant spatial resolution, assessments may lack the capacity to respond to local perturbations or to assess the spatial distribution of impacts to locally provided ecosystems services. D</w:t>
-      </w:r>
-      <w:r>
-        <w:rPr>
-          <w:rFonts w:ascii="Garamond" w:hAnsi="Garamond"/>
-          <w:sz w:val="22"/>
-          <w:szCs w:val="22"/>
-        </w:rPr>
-        <w:t xml:space="preserve">eveloping tools capable of reconstructing ecological patterns at refined spatial resolutions is </w:t>
-      </w:r>
-      <w:r>
-        <w:rPr>
-          <w:rFonts w:ascii="Garamond" w:hAnsi="Garamond"/>
-          <w:sz w:val="22"/>
-          <w:szCs w:val="22"/>
-        </w:rPr>
-        <w:t xml:space="preserve">therefore </w:t>
-      </w:r>
-      <w:r>
-        <w:rPr>
-          <w:rFonts w:ascii="Garamond" w:hAnsi="Garamond"/>
-          <w:sz w:val="22"/>
-          <w:szCs w:val="22"/>
-        </w:rPr>
-        <w:t xml:space="preserve">essential for targeted </w:t>
-      </w:r>
-      <w:r>
-        <w:rPr>
-          <w:rFonts w:ascii="Garamond" w:hAnsi="Garamond"/>
-          <w:sz w:val="22"/>
-          <w:szCs w:val="22"/>
-        </w:rPr>
-        <w:t xml:space="preserve">resource </w:t>
-      </w:r>
-      <w:r>
-        <w:rPr>
-          <w:rFonts w:ascii="Garamond" w:hAnsi="Garamond"/>
-          <w:sz w:val="22"/>
-          <w:szCs w:val="22"/>
-        </w:rPr>
-        <w:t>management and effective climate adaptation strategies.</w:t>
-      </w:r>
-      <w:r>
-        <w:rPr>
-          <w:rFonts w:ascii="Garamond" w:hAnsi="Garamond"/>
-          <w:sz w:val="22"/>
-          <w:szCs w:val="22"/>
+        </w:rPr>
+        <w:t>Understanding how environmental stressors affect ecosystems across spatial and temporal scales is essential for monitoring and managing ecological responses to global change. This task is especially difficult in remote, complex systems, where conventional monitoring may be impractical or inadequate for capturing fine-scale processes.</w:t>
+      </w:r>
+      <w:r>
+        <w:rPr>
+          <w:rFonts w:ascii="Garamond" w:hAnsi="Garamond"/>
         </w:rPr>
         <w:t xml:space="preserve"> </w:t>
       </w:r>
       <w:r>
         <w:rPr>
           <w:rFonts w:ascii="Garamond" w:hAnsi="Garamond"/>
-          <w:sz w:val="22"/>
-          <w:szCs w:val="22"/>
-        </w:rPr>
-        <w:t>Salmon populations in Western Alaska present a unique challenge for understanding ecosystem processes at refined spatial scales. Fish returning to this system exhibit diverse life history strategies, run timing, and spatial patterns of habitat use both among and within the region's three major watersheds. Moreover, individuals migrate over vast distances through extremely remote ecosystems, making direct monitoring logistically prohibitive.</w:t>
-      </w:r>
-      <w:r>
-        <w:rPr>
-          <w:rFonts w:ascii="Garamond" w:hAnsi="Garamond"/>
-          <w:sz w:val="22"/>
-          <w:szCs w:val="22"/>
-        </w:rPr>
-        <w:t xml:space="preserve"> </w:t>
+        </w:rPr>
+        <w:t>While population-level assessments offer broad-scale perspectives, they can mask threats to ecosystem health at finer spatial scales or within subpopulations. Without adequate spatial resolution, assessments may fail to detect local disturbances or to evaluate how impacts are distributed across ecosystem services.</w:t>
       </w:r>
     </w:p>
     <w:p>
@@ -246,24 +310,7 @@
           <w:sz w:val="22"/>
           <w:szCs w:val="22"/>
         </w:rPr>
-        <w:t>Historically, salmon populations in Western Alaska have supported commercial fisheries and served as critical subsistence and cultural resources for Indigenous communities throughout the region. However, recent sustained declines in the number of Chinook salmon (</w:t>
-      </w:r>
-      <w:r>
-        <w:rPr>
-          <w:rStyle w:val="Emphasis"/>
-          <w:rFonts w:ascii="Garamond" w:hAnsi="Garamond"/>
-          <w:sz w:val="22"/>
-          <w:szCs w:val="22"/>
-        </w:rPr>
-        <w:t>Oncorhynchus tshawytscha</w:t>
-      </w:r>
-      <w:r>
-        <w:rPr>
-          <w:rFonts w:ascii="Garamond" w:hAnsi="Garamond"/>
-          <w:sz w:val="22"/>
-          <w:szCs w:val="22"/>
-        </w:rPr>
-        <w:t xml:space="preserve">) returning to the Yukon, Kuskokwim, and </w:t>
+        <w:t xml:space="preserve">Management of Pacific salmon populations in Western Alaska exemplifies these challenges. Returning adults display diverse life histories, run timings, and habitat use across the Yukon, Kuskokwim, and </w:t>
       </w:r>
       <w:proofErr w:type="spellStart"/>
       <w:r>
@@ -281,39 +328,7 @@
           <w:sz w:val="22"/>
           <w:szCs w:val="22"/>
         </w:rPr>
-        <w:t xml:space="preserve"> river basins have led to fishery restrictions and contributed to a crisis of food insecurity and cultural loss. Consequently, there is a pressing need to assess hypotheses regarding the mechanisms of population declin</w:t>
-      </w:r>
-      <w:r>
-        <w:rPr>
-          <w:rFonts w:ascii="Garamond" w:hAnsi="Garamond"/>
-          <w:sz w:val="22"/>
-          <w:szCs w:val="22"/>
-        </w:rPr>
-        <w:t xml:space="preserve">e and to assess the spatial distribution of impacts across river-basins. However, assessment of many of these hypotheses, particularly those related to the marine life stage of salmon, have been </w:t>
-      </w:r>
-      <w:r>
-        <w:rPr>
-          <w:rFonts w:ascii="Garamond" w:hAnsi="Garamond"/>
-          <w:sz w:val="22"/>
-          <w:szCs w:val="22"/>
-        </w:rPr>
-        <w:t>hindered by</w:t>
-      </w:r>
-      <w:r>
-        <w:rPr>
-          <w:rFonts w:ascii="Garamond" w:hAnsi="Garamond"/>
-          <w:sz w:val="22"/>
-          <w:szCs w:val="22"/>
-        </w:rPr>
-        <w:t xml:space="preserve"> a</w:t>
-      </w:r>
-      <w:r>
-        <w:rPr>
-          <w:rFonts w:ascii="Garamond" w:hAnsi="Garamond"/>
-          <w:sz w:val="22"/>
-          <w:szCs w:val="22"/>
-        </w:rPr>
-        <w:t xml:space="preserve"> limited ability to determine the river of origin of marine-caught fish. </w:t>
+        <w:t xml:space="preserve"> rivers, the three major basins in the region. They also migrate vast distances through remote ecosystems, making direct monitoring logistically prohibitive. Salmon in this region support valuable commercial fisheries and serve as a critical subsistence resource for upstream communities. Understanding river- or stock-specific population health over space and time is essential for management that balances harvest opportunities, basin-wide escapement goals, and efforts to build population resilience.</w:t>
       </w:r>
     </w:p>
     <w:p>
@@ -332,588 +347,96 @@
           <w:sz w:val="22"/>
           <w:szCs w:val="22"/>
         </w:rPr>
-        <w:lastRenderedPageBreak/>
-        <w:t xml:space="preserve">Genetic </w:t>
-      </w:r>
-      <w:r>
-        <w:rPr>
-          <w:rFonts w:ascii="Garamond" w:hAnsi="Garamond"/>
-          <w:sz w:val="22"/>
-          <w:szCs w:val="22"/>
-        </w:rPr>
-        <w:t>stock identification (GSI)</w:t>
-      </w:r>
-      <w:r>
-        <w:rPr>
-          <w:rFonts w:ascii="Garamond" w:hAnsi="Garamond"/>
-          <w:sz w:val="22"/>
-          <w:szCs w:val="22"/>
-        </w:rPr>
-        <w:t xml:space="preserve"> ha</w:t>
-      </w:r>
-      <w:r>
-        <w:rPr>
-          <w:rFonts w:ascii="Garamond" w:hAnsi="Garamond"/>
-          <w:sz w:val="22"/>
-          <w:szCs w:val="22"/>
-        </w:rPr>
-        <w:t>s</w:t>
-      </w:r>
-      <w:r>
-        <w:rPr>
-          <w:rFonts w:ascii="Garamond" w:hAnsi="Garamond"/>
-          <w:sz w:val="22"/>
-          <w:szCs w:val="22"/>
-        </w:rPr>
-        <w:t xml:space="preserve"> </w:t>
-      </w:r>
-      <w:r>
-        <w:rPr>
-          <w:rFonts w:ascii="Garamond" w:hAnsi="Garamond"/>
-          <w:sz w:val="22"/>
-          <w:szCs w:val="22"/>
-        </w:rPr>
-        <w:t xml:space="preserve">emerged in recent decades as a powerful and reliable tool for </w:t>
-      </w:r>
-      <w:r>
-        <w:rPr>
-          <w:rFonts w:ascii="Garamond" w:hAnsi="Garamond"/>
-          <w:sz w:val="22"/>
-          <w:szCs w:val="22"/>
-        </w:rPr>
-        <w:t>estimating provenance</w:t>
-      </w:r>
-      <w:r>
-        <w:rPr>
-          <w:rFonts w:ascii="Garamond" w:hAnsi="Garamond"/>
-          <w:sz w:val="22"/>
-          <w:szCs w:val="22"/>
-        </w:rPr>
-        <w:t xml:space="preserve"> of many Chinook salmon stocks in </w:t>
-      </w:r>
-      <w:r>
-        <w:rPr>
-          <w:rFonts w:ascii="Garamond" w:hAnsi="Garamond"/>
-          <w:sz w:val="22"/>
-          <w:szCs w:val="22"/>
-        </w:rPr>
-        <w:t>Alaska and</w:t>
-      </w:r>
-      <w:r>
-        <w:rPr>
-          <w:rFonts w:ascii="Garamond" w:hAnsi="Garamond"/>
-          <w:sz w:val="22"/>
-          <w:szCs w:val="22"/>
-        </w:rPr>
-        <w:t xml:space="preserve"> has been used as a tool for in-season management. However, </w:t>
-      </w:r>
-      <w:r>
-        <w:rPr>
-          <w:rFonts w:ascii="Garamond" w:hAnsi="Garamond"/>
-          <w:sz w:val="22"/>
-          <w:szCs w:val="22"/>
-        </w:rPr>
-        <w:t xml:space="preserve">Chinook salmon in Western Alaska lack sufficient genetic structure to reliably assign individuals </w:t>
-      </w:r>
-      <w:r>
-        <w:rPr>
-          <w:rFonts w:ascii="Garamond" w:hAnsi="Garamond"/>
-          <w:sz w:val="22"/>
-          <w:szCs w:val="22"/>
-        </w:rPr>
-        <w:t xml:space="preserve">within the </w:t>
-      </w:r>
-      <w:r>
-        <w:rPr>
-          <w:rFonts w:ascii="Garamond" w:hAnsi="Garamond"/>
-          <w:sz w:val="22"/>
-          <w:szCs w:val="22"/>
-        </w:rPr>
-        <w:t xml:space="preserve">Coastal Western Alaska (CWAK) reporting group, which </w:t>
-      </w:r>
-      <w:r>
-        <w:rPr>
-          <w:rFonts w:ascii="Garamond" w:hAnsi="Garamond"/>
-          <w:sz w:val="22"/>
-          <w:szCs w:val="22"/>
-        </w:rPr>
-        <w:t xml:space="preserve">cannot discriminate among river systems. </w:t>
-      </w:r>
-      <w:r>
-        <w:rPr>
-          <w:rFonts w:ascii="Garamond" w:hAnsi="Garamond"/>
-          <w:sz w:val="22"/>
-          <w:szCs w:val="22"/>
-        </w:rPr>
-        <w:t>Isotope-based methods for estimating provenance from ear stones found in fish, or otoliths, ha</w:t>
-      </w:r>
-      <w:r>
-        <w:rPr>
-          <w:rFonts w:ascii="Garamond" w:hAnsi="Garamond"/>
-          <w:sz w:val="22"/>
-          <w:szCs w:val="22"/>
-        </w:rPr>
-        <w:t xml:space="preserve">s emerged in parallel as an alternative approach to estimating provenance with </w:t>
-      </w:r>
-      <w:r>
-        <w:rPr>
-          <w:rFonts w:ascii="Garamond" w:hAnsi="Garamond"/>
-          <w:sz w:val="22"/>
-          <w:szCs w:val="22"/>
-        </w:rPr>
-        <w:t xml:space="preserve">more refined spatial resolution than genetics in some cases </w:t>
-      </w:r>
-      <w:r>
-        <w:rPr>
-          <w:rFonts w:ascii="Garamond" w:hAnsi="Garamond"/>
-          <w:sz w:val="22"/>
-          <w:szCs w:val="22"/>
-        </w:rPr>
-        <w:fldChar w:fldCharType="begin"/>
-      </w:r>
-      <w:r>
-        <w:rPr>
-          <w:rFonts w:ascii="Garamond" w:hAnsi="Garamond"/>
-          <w:sz w:val="22"/>
-          <w:szCs w:val="22"/>
-        </w:rPr>
-        <w:instrText xml:space="preserve"> ADDIN ZOTERO_ITEM CSL_CITATION {"citationID":"Pqigyra2","properties":{"formattedCitation":"(Brennan et al., 2015; Brennan &amp; Schindler, 2017; Kennedy et al., 1997)","plainCitation":"(Brennan et al., 2015; Brennan &amp; Schindler, 2017; Kennedy et al., 1997)","noteIndex":0},"citationItems":[{"id":2313,"uris":["http://zotero.org/users/8421274/items/AJFVQJVT"],"itemData":{"id":2313,"type":"article-journal","abstract":"Highly migratory organisms present major challenges to conservation efforts. This is especially true for exploited anadromous fish species, which exhibit long-range dispersals from natal sites, complex population structures, and extensive mixing of distinct populations during exploitation. By tracing the migratory histories of individual Chinook salmon caught in fisheries using strontium isotopes, we determined the relative production of natal habitats at fine spatial scales and different life histories. Although strontium isotopes have been widely used in provenance research, we present a new robust framework to simultaneously assess natal sources and migrations of individuals within fishery harvests through time. Our results pave the way for investigating how fine-scale habitat production and life histories of salmon respond to perturbations—providing crucial insights for conservation.","container-title":"Science Advances","DOI":"10.1126/sciadv.1400124","issue":"4","note":"publisher: American Association for the Advancement of Science","page":"e1400124","source":"science.org (Atypon)","title":"Strontium isotopes delineate fine-scale natal origins and migration histories of Pacific salmon","volume":"1","author":[{"family":"Brennan","given":"Sean R."},{"family":"Zimmerman","given":"Christian E."},{"family":"Fernandez","given":"Diego P."},{"family":"Cerling","given":"Thure E."},{"family":"McPhee","given":"Megan V."},{"family":"Wooller","given":"Matthew J."}],"issued":{"date-parts":[["2015",5,15]]}}},{"id":1694,"uris":["http://zotero.org/users/8421274/items/NSWL6YPN"],"itemData":{"id":1694,"type":"article-journal","abstract":"Production patterns of highly mobile species, such as anadromous fish, often exhibit high spatial and temporal heterogeneity across landscapes. Such variability is often asynchronous in time among habitats, which stabilizes production at aggregate scales of complexity. Reconstructing production patterns explicitly in space and time across multiple scales, however, remains difficult but is important for prioritizing habitat conservation. This is especially true for fishes inhabiting river basins due to long-range dispersal, high mortality at early life stages, complex population structure and elusive life history variation. We develop a new approach for mapping production patterns of Pacific salmon across a large river basin by integrating otolith microchemistry and dendritic isoscape models. The geographically continuous Bayesian assignment framework presented here yielded high accuracies (&gt;90%) and relatively high precisions (precisions &lt;4%; i.e., assignment areas of &lt;530 river km of the 13 100 km total river length) when used to determine the natal source of known-origin juvenile Chinook salmon captured throughout the study region. Integrating these methods enabled us to base estimates of provenance and habitat use of individuals on a per location basis using strontium isotopic data throughout the continuous spatial domain of a river network. Such a framework provides substantial advantages over the more common nominal approach to employing otolith microchemistry to reconstruct movement patterns of fish. In doing so, we reconstructed the spatial production patterns of adult Chinook salmon returning to a large watershed in Bristol Bay, Alaska and illustrate the power of such an approach to conservation efforts.","container-title":"Ecological Applications","DOI":"10.1002/eap.1474","ISSN":"1939-5582","issue":"2","language":"en","note":"_eprint: https://esajournals.onlinelibrary.wiley.com/doi/pdf/10.1002/eap.1474","page":"363-377","source":"Wiley Online Library","title":"Linking otolith microchemistry and dendritic isoscapes to map heterogeneous production of fish across river basins","volume":"27","author":[{"family":"Brennan","given":"Sean R."},{"family":"Schindler","given":"Daniel E."}],"issued":{"date-parts":[["2017"]]}}},{"id":1561,"uris":["http://zotero.org/users/8421274/items/UCQYZW9Z"],"itemData":{"id":1561,"type":"article-journal","abstract":"To optimize conservation and restoration strategies for fish stocks it is important to identify the rearing habitats that produce the most successful individuals. However, tracking millions of migratory fish through multiple life stages seems to be impossible using conventional techniques. Using differences in the ratio of stable isotopes of strontium (Sr), found naturally in stream water, we have been able to distinguish juvenile Atlantic salmon (Salmo salar) from eight of ten rearing sites studied in Vermont streams. This demonstrates the potential for using environmental signals to determine the rearing stream from which salmon originate, and should help to guide restoration activities.","container-title":"Nature","DOI":"10.1038/42835","ISSN":"1476-4687","issue":"6635","language":"en","license":"1997 Macmillan Magazines Ltd.","note":"number: 6635\npublisher: Nature Publishing Group","page":"766-767","source":"www-nature-com.offcampus.lib.washington.edu","title":"Natural isotope markers in salmon","volume":"387","author":[{"family":"Kennedy","given":"Brian P."},{"family":"Folt","given":"Carol L."},{"family":"Blum","given":"Joel D."},{"family":"Chamberlain","given":"C. Page"}],"issued":{"date-parts":[["1997",6]]}}}],"schema":"https://github.com/citation-style-language/schema/raw/master/csl-citation.json"} </w:instrText>
-      </w:r>
-      <w:r>
-        <w:rPr>
-          <w:rFonts w:ascii="Garamond" w:hAnsi="Garamond"/>
-          <w:sz w:val="22"/>
-          <w:szCs w:val="22"/>
-        </w:rPr>
-        <w:fldChar w:fldCharType="separate"/>
-      </w:r>
-      <w:r>
-        <w:rPr>
-          <w:rFonts w:ascii="Garamond" w:hAnsi="Garamond"/>
-          <w:noProof/>
-          <w:sz w:val="22"/>
-          <w:szCs w:val="22"/>
-        </w:rPr>
-        <w:t>(Brennan et al., 2015; Brennan &amp; Schindler, 2017; Kennedy et al., 1997)</w:t>
-      </w:r>
-      <w:r>
-        <w:rPr>
-          <w:rFonts w:ascii="Garamond" w:hAnsi="Garamond"/>
-          <w:sz w:val="22"/>
-          <w:szCs w:val="22"/>
-        </w:rPr>
-        <w:fldChar w:fldCharType="end"/>
-      </w:r>
-      <w:r>
-        <w:rPr>
-          <w:rFonts w:ascii="Garamond" w:hAnsi="Garamond"/>
-          <w:sz w:val="22"/>
-          <w:szCs w:val="22"/>
-        </w:rPr>
-        <w:t>. The relative ratio of strontium-87 to strontium-86 (</w:t>
-      </w:r>
-      <w:r>
-        <w:rPr>
-          <w:rFonts w:ascii="Cambria Math" w:hAnsi="Cambria Math" w:cs="Cambria Math"/>
-          <w:sz w:val="22"/>
-          <w:szCs w:val="22"/>
-        </w:rPr>
-        <w:t>⁸⁷</w:t>
-      </w:r>
-      <w:r>
-        <w:rPr>
-          <w:rFonts w:ascii="Garamond" w:hAnsi="Garamond"/>
-          <w:sz w:val="22"/>
-          <w:szCs w:val="22"/>
-        </w:rPr>
-        <w:t>Sr/</w:t>
-      </w:r>
-      <w:r>
-        <w:rPr>
-          <w:rFonts w:ascii="Cambria Math" w:hAnsi="Cambria Math" w:cs="Cambria Math"/>
-          <w:sz w:val="22"/>
-          <w:szCs w:val="22"/>
-        </w:rPr>
-        <w:t>⁸⁶</w:t>
-      </w:r>
-      <w:r>
-        <w:rPr>
-          <w:rFonts w:ascii="Garamond" w:hAnsi="Garamond"/>
-          <w:sz w:val="22"/>
-          <w:szCs w:val="22"/>
-        </w:rPr>
-        <w:t xml:space="preserve">Sr) is an isotopic tracer that is heterogeneously distributed across geologically diverse landscapes, faithfully incorporated into otoliths, and has been shown to be temporally stable in Alaskan watersheds </w:t>
-      </w:r>
-      <w:r>
-        <w:rPr>
-          <w:rFonts w:ascii="Garamond" w:hAnsi="Garamond"/>
-          <w:sz w:val="22"/>
-          <w:szCs w:val="22"/>
-        </w:rPr>
-        <w:fldChar w:fldCharType="begin"/>
-      </w:r>
-      <w:r>
-        <w:rPr>
-          <w:rFonts w:ascii="Garamond" w:hAnsi="Garamond"/>
-          <w:sz w:val="22"/>
-          <w:szCs w:val="22"/>
-        </w:rPr>
-        <w:instrText xml:space="preserve"> ADDIN ZOTERO_ITEM CSL_CITATION {"citationID":"gCPseI7r","properties":{"formattedCitation":"(Bataille &amp; Bowen, 2012; Brennan et al., 2015; Campana, 1999; Capo et al., 1998)","plainCitation":"(Bataille &amp; Bowen, 2012; Brennan et al., 2015; Campana, 1999; Capo et al., 1998)","noteIndex":0},"citationItems":[{"id":1939,"uris":["http://zotero.org/users/8421274/items/S8GE9LUD"],"itemData":{"id":1939,"type":"article-journal","abstract":"Although variation in 87Sr/86Sr has been widely pursued as a tracer of provenance in environmental studies, forensics, archeology and food traceability, accurate methods for mapping variations in environmental 87Sr/ 86Sr at regional scale are not available. In this paper, we build upon earlier efforts to model 87Sr/86Sr in bedrock by developing GIS-based models for Sr isotopes in rock and water that include the combined effects of lithology and time. Using published data, we ﬁt lithology-speciﬁc model parameters for generalized equations describing the concentration of radiogenic Sr in silicate and carbonate rocks. The new model explained more than 50% of the observed variance in measured Sr isotope values from independent global databases of igneous, metaigneous, and carbonate rocks, but performed more poorly (explaining 33% of the variance) for sedimentary and metasedimentary rocks. In comparison, a previously applied model formulation that did not include lithology-speciﬁc parameters explained only 20% and 8% of the observed variance for igneous and sedimentary rocks, respectively, and exhibited an inverse relationship with measured carbonate rock values. Building upon the bedrock model, we also developed and applied equations to predict the contribution of different rock types to 87Sr/86Sr variations in water as a function of their weathering rates and strontium content. The resulting water model was compared to data from 68 catchments and shown to give more accurate predictions of stream water 87Sr/86Sr (R2 = 0.70) than models that did not include lithological weathering parameters. We applied these models to produce maps (“isoscapes”) predicting 87Sr/86Sr in bedrock and water across the contiguous USA, and compared the mapped Sr isotope distributions to data on Sr isotope ratios of US marijuana crops. Although the maps produced here are demonstrably imperfect and leave signiﬁcant scope for further reﬁnement, they provide an enhanced framework for lithology-based Sr isotope modeling and offer a baseline for provenance studies by constraining the 87Sr/86Sr in strontium sources at regional scales.","container-title":"Chemical Geology","DOI":"10.1016/j.chemgeo.2012.01.028","ISSN":"00092541","journalAbbreviation":"Chemical Geology","language":"en","page":"39-52","source":"DOI.org (Crossref)","title":"Mapping 87Sr/86Sr variations in bedrock and water for large scale provenance studies","volume":"304-305","author":[{"family":"Bataille","given":"Clément P."},{"family":"Bowen","given":"Gabriel J."}],"issued":{"date-parts":[["2012",4]]}}},{"id":2313,"uris":["http://zotero.org/users/8421274/items/AJFVQJVT"],"itemData":{"id":2313,"type":"article-journal","abstract":"Highly migratory organisms present major challenges to conservation efforts. This is especially true for exploited anadromous fish species, which exhibit long-range dispersals from natal sites, complex population structures, and extensive mixing of distinct populations during exploitation. By tracing the migratory histories of individual Chinook salmon caught in fisheries using strontium isotopes, we determined the relative production of natal habitats at fine spatial scales and different life histories. Although strontium isotopes have been widely used in provenance research, we present a new robust framework to simultaneously assess natal sources and migrations of individuals within fishery harvests through time. Our results pave the way for investigating how fine-scale habitat production and life histories of salmon respond to perturbations—providing crucial insights for conservation.","container-title":"Science Advances","DOI":"10.1126/sciadv.1400124","issue":"4","note":"publisher: American Association for the Advancement of Science","page":"e1400124","source":"science.org (Atypon)","title":"Strontium isotopes delineate fine-scale natal origins and migration histories of Pacific salmon","volume":"1","author":[{"family":"Brennan","given":"Sean R."},{"family":"Zimmerman","given":"Christian E."},{"family":"Fernandez","given":"Diego P."},{"family":"Cerling","given":"Thure E."},{"family":"McPhee","given":"Megan V."},{"family":"Wooller","given":"Matthew J."}],"issued":{"date-parts":[["2015",5,15]]}}},{"id":1441,"uris":["http://zotero.org/users/8421274/items/PHNAKZ8D"],"itemData":{"id":1441,"type":"article-journal","abstract":"The fish otolith (earstone) has long been known as a timekeeper, but interest in its use as a metabolically inert environmental recorder has accelerated in recent years. In part due to technological advances, applications such as stock identification, determination of rnigralon pathways, reconstruction of temperature and salinity history, age validation, detection of anadromy, use as a natural tag and chemical mass marking have been developed, some of which are difficult or impossible to implement using alternative techniques. Microsamphg and the latest advances in beam-based probes allow many elemental assays to be coupled with daily or annual growth increments, thus providing a detailed chronologcal record of the environment. However, few workers have critically assessed the assumptions upon which the environmental reconstructions are based, or considered the possibility that elemental incorporation into the otolith may proceed differently than that into other calcified structures. This paper reviews current applications and their assumptions and suggests future directions. Particular attention is given to the premises that the elemental and isotopic composition of the otolith reflects that of the environment, and the effect of physiological filters on the resulting composition. The roles of temperature, elemental uptake into the fish and the process of otolith crystahzation are also assessed. Drawing upon recent advances in geochemistry and paleoclirnate research as points of contrast, it appears that not all applications of otolith chemistry are firmly based, although others are destined to become powerful and perhaps routine tools for the mainstream fish biologst.","container-title":"Marine Ecology Progress Series","DOI":"10.3354/meps188263","ISSN":"0171-8630, 1616-1599","journalAbbreviation":"Mar. Ecol. Prog. Ser.","language":"en","page":"263-297","source":"DOI.org (Crossref)","title":"Chemistry and composition of fish otoliths:pathways, mechanisms and applications","title-short":"Chemistry and composition of fish otoliths","volume":"188","author":[{"family":"Campana","given":"Se"}],"issued":{"date-parts":[["1999"]]}}},{"id":1457,"uris":["http://zotero.org/users/8421274/items/TDIQBP7K"],"itemData":{"id":1457,"type":"article-journal","abstract":"The strontium (Sr) isotope method can be a powerful tool in studies of chemical weathering and soil genesis, cation provenance and mobility, and the chronostratigraphic correlation of marine sediments. It is a sensitive geochemical tracer, applicable to large-scale ecosystem studies as well as to centimeter-scaled examination of cation mobility within a soil profile. The 87Sr/86Sr ratios of natural materials reflect the sources of strontium available during their formation. Isotopically distinct inputs from precipitation, dryfall, soil parent material, and surface or groundwater allow determination of the relative proportions of those materials entering or leaving an ecosystem. The isotopic compositions of labile (soil exchange complex and soil solution) strontium and Sr in vegetation reflect the sources of cations available to plants. Strontium isotopes can be used to track the biogeochemical cycling of nutrient cations such as calcium. The extent of cation contributions from in situ weathering and external additions to soil from dust and rain can also be resolved with this method. In this paper, we review the geochemistry and isotopic systematics of strontium, and discuss the use of this method as a tracer of earth surface processes.","container-title":"Geoderma","DOI":"10.1016/S0016-7061(97)00102-X","ISSN":"0016-7061","issue":"1","journalAbbreviation":"Geoderma","language":"en","page":"197-225","source":"ScienceDirect","title":"Strontium isotopes as tracers of ecosystem processes: theory and methods","title-short":"Strontium isotopes as tracers of ecosystem processes","volume":"82","author":[{"family":"Capo","given":"Rosemary C."},{"family":"Stewart","given":"Brian W."},{"family":"Chadwick","given":"Oliver A."}],"issued":{"date-parts":[["1998",2,1]]}}}],"schema":"https://github.com/citation-style-language/schema/raw/master/csl-citation.json"} </w:instrText>
-      </w:r>
-      <w:r>
-        <w:rPr>
-          <w:rFonts w:ascii="Garamond" w:hAnsi="Garamond"/>
-          <w:sz w:val="22"/>
-          <w:szCs w:val="22"/>
-        </w:rPr>
-        <w:fldChar w:fldCharType="separate"/>
-      </w:r>
-      <w:r>
-        <w:rPr>
-          <w:rFonts w:ascii="Garamond" w:hAnsi="Garamond"/>
-          <w:noProof/>
-          <w:sz w:val="22"/>
-          <w:szCs w:val="22"/>
-        </w:rPr>
-        <w:t>(Bataille &amp; Bowen, 2012; Brennan et al., 2015; Campana, 1999; Capo et al., 1998)</w:t>
-      </w:r>
-      <w:r>
-        <w:rPr>
-          <w:rFonts w:ascii="Garamond" w:hAnsi="Garamond"/>
-          <w:sz w:val="22"/>
-          <w:szCs w:val="22"/>
-        </w:rPr>
-        <w:fldChar w:fldCharType="end"/>
-      </w:r>
-      <w:r>
-        <w:rPr>
-          <w:rFonts w:ascii="Garamond" w:hAnsi="Garamond"/>
-          <w:sz w:val="22"/>
-          <w:szCs w:val="22"/>
-        </w:rPr>
-        <w:t xml:space="preserve">. As a result, </w:t>
-      </w:r>
-      <w:r>
-        <w:rPr>
-          <w:rFonts w:ascii="Garamond" w:hAnsi="Garamond"/>
-          <w:sz w:val="22"/>
-          <w:szCs w:val="22"/>
-        </w:rPr>
-        <w:t xml:space="preserve">this signature has been used to estimate provenance by relating a discrete </w:t>
-      </w:r>
-      <w:r>
-        <w:rPr>
-          <w:rFonts w:ascii="Cambria Math" w:hAnsi="Cambria Math" w:cs="Cambria Math"/>
-          <w:sz w:val="22"/>
-          <w:szCs w:val="22"/>
-        </w:rPr>
-        <w:t>⁸⁷</w:t>
-      </w:r>
-      <w:r>
-        <w:rPr>
-          <w:rFonts w:ascii="Garamond" w:hAnsi="Garamond"/>
-          <w:sz w:val="22"/>
-          <w:szCs w:val="22"/>
-        </w:rPr>
-        <w:t>Sr/</w:t>
-      </w:r>
-      <w:r>
-        <w:rPr>
-          <w:rFonts w:ascii="Cambria Math" w:hAnsi="Cambria Math" w:cs="Cambria Math"/>
-          <w:sz w:val="22"/>
-          <w:szCs w:val="22"/>
-        </w:rPr>
-        <w:t>⁸⁶</w:t>
-      </w:r>
-      <w:r>
-        <w:rPr>
-          <w:rFonts w:ascii="Garamond" w:hAnsi="Garamond"/>
-          <w:sz w:val="22"/>
-          <w:szCs w:val="22"/>
-        </w:rPr>
-        <w:t>Sr</w:t>
-      </w:r>
-      <w:r>
-        <w:rPr>
-          <w:rFonts w:ascii="Garamond" w:hAnsi="Garamond"/>
-          <w:sz w:val="22"/>
-          <w:szCs w:val="22"/>
-        </w:rPr>
-        <w:t xml:space="preserve"> ratio from the freshwater natal rearing portion of the otolith to </w:t>
-      </w:r>
-      <w:r>
-        <w:rPr>
-          <w:rFonts w:ascii="Garamond" w:hAnsi="Garamond"/>
-          <w:sz w:val="22"/>
-          <w:szCs w:val="22"/>
-        </w:rPr>
-        <w:t>values modeled across the landscape</w:t>
-      </w:r>
-      <w:r>
-        <w:rPr>
-          <w:rFonts w:ascii="Garamond" w:hAnsi="Garamond"/>
-          <w:sz w:val="22"/>
-          <w:szCs w:val="22"/>
-        </w:rPr>
-        <w:t xml:space="preserve"> </w:t>
-      </w:r>
-      <w:r>
-        <w:rPr>
-          <w:rFonts w:ascii="Garamond" w:hAnsi="Garamond"/>
-          <w:sz w:val="22"/>
-          <w:szCs w:val="22"/>
-          <w:highlight w:val="yellow"/>
-        </w:rPr>
-        <w:t>(Cite).</w:t>
-      </w:r>
-      <w:r>
-        <w:rPr>
-          <w:rFonts w:ascii="Garamond" w:hAnsi="Garamond"/>
-          <w:sz w:val="22"/>
-          <w:szCs w:val="22"/>
-        </w:rPr>
-        <w:t xml:space="preserve"> </w:t>
-      </w:r>
-      <w:r>
-        <w:rPr>
-          <w:rFonts w:ascii="Garamond" w:hAnsi="Garamond"/>
-          <w:sz w:val="22"/>
-          <w:szCs w:val="22"/>
-        </w:rPr>
-        <w:t xml:space="preserve"> However</w:t>
-      </w:r>
-      <w:r>
-        <w:rPr>
-          <w:rFonts w:ascii="Garamond" w:hAnsi="Garamond"/>
-          <w:sz w:val="22"/>
-          <w:szCs w:val="22"/>
-        </w:rPr>
-        <w:t xml:space="preserve">, this method is limited by the level of isotopic heterogeneity relative to the spatial scale of interest </w:t>
-      </w:r>
-      <w:r>
-        <w:rPr>
-          <w:rFonts w:ascii="Garamond" w:hAnsi="Garamond"/>
-          <w:sz w:val="22"/>
-          <w:szCs w:val="22"/>
-        </w:rPr>
-        <w:fldChar w:fldCharType="begin"/>
-      </w:r>
-      <w:r>
-        <w:rPr>
-          <w:rFonts w:ascii="Garamond" w:hAnsi="Garamond"/>
-          <w:sz w:val="22"/>
-          <w:szCs w:val="22"/>
-        </w:rPr>
-        <w:instrText xml:space="preserve"> ADDIN ZOTERO_ITEM CSL_CITATION {"citationID":"W3sRlFul","properties":{"formattedCitation":"(Makhlouf et al., 2025)","plainCitation":"(Makhlouf et al., 2025)","noteIndex":0},"citationItems":[{"id":5397,"uris":["http://zotero.org/users/8421274/items/WRVF2L9N"],"itemData":{"id":5397,"type":"article-journal","abstract":"Understanding the spatial ecology of migratory species is uniquely challenging using conventional approaches. In fisheries such as for Pacific salmon, genetic stock identification (GSI) and isotope-based methods have emerged as strategies for reconstructing spatial ecology but are limited by the spatial resolution of genetic differentiation and isotopic heterogeneity. We show that integrating these complementary datasets improve the spatial resolution of provenance assignments. To do so, we reconstructed basin-wide estimates of natal origin locations for Chinook salmon in the Yukon River using samples (n = 247) from an experimental fishery designed to assess in-season run timing. A combined framework improved precision of likely provenance assignments (stream km &gt; 0.7 posterior probability) by 92% over genetic assignments and 52% over strontium isotope methods. In doing so, we illustrate watershed scale estimates of natal origin distributions with a greater resolution available from GSI or isotope data alone.","container-title":"Limnology and Oceanography Letters","DOI":"10.1002/lol2.70025","ISSN":"2378-2242","issue":"n/a","language":"en","license":"© 2025 The Author(s). Limnology and Oceanography Letters published by Wiley Periodicals LLC on behalf of Association for the Sciences of Limnology and Oceanography.","note":"_eprint: https://onlinelibrary.wiley.com/doi/pdf/10.1002/lol2.70025","source":"Wiley Online Library","title":"Combining genetic and isotope frameworks improves reconstruction of fish provenance across riverscapes","URL":"https://onlinelibrary.wiley.com/doi/abs/10.1002/lol2.70025","volume":"n/a","author":[{"family":"Makhlouf","given":"Ben"},{"family":"Cline","given":"Timothy J."},{"family":"Fernandez","given":"Diego"},{"family":"Seeb","given":"Lisa"},{"family":"Lee","given":"Elizabeth"},{"family":"Gilk-Baumer","given":"Sara"},{"family":"Whited","given":"Diane"},{"family":"Zimmerman","given":"Christian E."},{"family":"Schindler","given":"Daniel E."}],"accessed":{"date-parts":[["2025",6,4]]},"issued":{"date-parts":[["2025"]]}}}],"schema":"https://github.com/citation-style-language/schema/raw/master/csl-citation.json"} </w:instrText>
-      </w:r>
-      <w:r>
-        <w:rPr>
-          <w:rFonts w:ascii="Garamond" w:hAnsi="Garamond"/>
-          <w:sz w:val="22"/>
-          <w:szCs w:val="22"/>
-        </w:rPr>
-        <w:fldChar w:fldCharType="separate"/>
-      </w:r>
-      <w:r>
-        <w:rPr>
-          <w:rFonts w:ascii="Garamond" w:hAnsi="Garamond"/>
-          <w:noProof/>
-          <w:sz w:val="22"/>
-          <w:szCs w:val="22"/>
-        </w:rPr>
-        <w:t>(Makhlouf et al., 2025)</w:t>
-      </w:r>
-      <w:r>
-        <w:rPr>
-          <w:rFonts w:ascii="Garamond" w:hAnsi="Garamond"/>
-          <w:sz w:val="22"/>
-          <w:szCs w:val="22"/>
-        </w:rPr>
-        <w:fldChar w:fldCharType="end"/>
-      </w:r>
-      <w:r>
-        <w:rPr>
-          <w:rFonts w:ascii="Garamond" w:hAnsi="Garamond"/>
-          <w:sz w:val="22"/>
-          <w:szCs w:val="22"/>
-        </w:rPr>
-        <w:t xml:space="preserve">. While </w:t>
-      </w:r>
-      <w:r>
-        <w:rPr>
-          <w:rFonts w:ascii="Garamond" w:hAnsi="Garamond"/>
-          <w:sz w:val="22"/>
-          <w:szCs w:val="22"/>
-        </w:rPr>
-        <w:t xml:space="preserve">reliable </w:t>
-      </w:r>
-      <w:r>
-        <w:rPr>
-          <w:rFonts w:ascii="Garamond" w:hAnsi="Garamond"/>
-          <w:sz w:val="22"/>
-          <w:szCs w:val="22"/>
-        </w:rPr>
-        <w:t>within-</w:t>
-      </w:r>
-      <w:r>
-        <w:rPr>
-          <w:rFonts w:ascii="Garamond" w:hAnsi="Garamond"/>
-          <w:sz w:val="22"/>
-          <w:szCs w:val="22"/>
-        </w:rPr>
-        <w:t>river</w:t>
-      </w:r>
-      <w:r>
-        <w:rPr>
-          <w:rFonts w:ascii="Garamond" w:hAnsi="Garamond"/>
-          <w:sz w:val="22"/>
-          <w:szCs w:val="22"/>
-        </w:rPr>
-        <w:t xml:space="preserve"> </w:t>
-      </w:r>
-      <w:r>
-        <w:rPr>
-          <w:rFonts w:ascii="Garamond" w:hAnsi="Garamond"/>
-          <w:sz w:val="22"/>
-          <w:szCs w:val="22"/>
-        </w:rPr>
-        <w:t xml:space="preserve">estimates of </w:t>
-      </w:r>
-      <w:r>
-        <w:rPr>
-          <w:rFonts w:ascii="Garamond" w:hAnsi="Garamond"/>
-          <w:sz w:val="22"/>
-          <w:szCs w:val="22"/>
-        </w:rPr>
-        <w:t xml:space="preserve">provenance </w:t>
-      </w:r>
-      <w:r>
-        <w:rPr>
-          <w:rFonts w:ascii="Garamond" w:hAnsi="Garamond"/>
-          <w:sz w:val="22"/>
-          <w:szCs w:val="22"/>
-        </w:rPr>
-        <w:t>are</w:t>
-      </w:r>
-      <w:r>
-        <w:rPr>
-          <w:rFonts w:ascii="Garamond" w:hAnsi="Garamond"/>
-          <w:sz w:val="22"/>
-          <w:szCs w:val="22"/>
-        </w:rPr>
-        <w:t xml:space="preserve"> possible in Western Alaska, regional overlap among the three major river systems creates high uncertainty</w:t>
-      </w:r>
-      <w:r>
-        <w:rPr>
-          <w:rFonts w:ascii="Garamond" w:hAnsi="Garamond"/>
-          <w:sz w:val="22"/>
-          <w:szCs w:val="22"/>
-        </w:rPr>
-        <w:t xml:space="preserve"> and </w:t>
-      </w:r>
-      <w:r>
-        <w:rPr>
-          <w:rFonts w:ascii="Garamond" w:hAnsi="Garamond"/>
-          <w:sz w:val="22"/>
-          <w:szCs w:val="22"/>
-        </w:rPr>
-        <w:t>prevent</w:t>
-      </w:r>
-      <w:r>
-        <w:rPr>
-          <w:rFonts w:ascii="Garamond" w:hAnsi="Garamond"/>
-          <w:sz w:val="22"/>
-          <w:szCs w:val="22"/>
-        </w:rPr>
-        <w:t>s</w:t>
-      </w:r>
-      <w:r>
-        <w:rPr>
-          <w:rFonts w:ascii="Garamond" w:hAnsi="Garamond"/>
-          <w:sz w:val="22"/>
-          <w:szCs w:val="22"/>
-        </w:rPr>
-        <w:t xml:space="preserve"> reliable assignments of marine-caught fish </w:t>
-      </w:r>
-      <w:r>
-        <w:rPr>
-          <w:rFonts w:ascii="Garamond" w:hAnsi="Garamond"/>
-          <w:sz w:val="22"/>
-          <w:szCs w:val="22"/>
-        </w:rPr>
-        <w:t xml:space="preserve">using the </w:t>
-      </w:r>
-      <w:r>
-        <w:rPr>
-          <w:rFonts w:ascii="Garamond" w:hAnsi="Garamond"/>
-          <w:sz w:val="22"/>
-          <w:szCs w:val="22"/>
-        </w:rPr>
-        <w:t>natal</w:t>
-      </w:r>
-      <w:r>
-        <w:rPr>
-          <w:rFonts w:ascii="Garamond" w:hAnsi="Garamond"/>
-          <w:sz w:val="22"/>
-          <w:szCs w:val="22"/>
-        </w:rPr>
-        <w:t xml:space="preserve"> freshwater</w:t>
-      </w:r>
-      <w:r>
-        <w:rPr>
-          <w:rFonts w:ascii="Garamond" w:hAnsi="Garamond"/>
-          <w:sz w:val="22"/>
-          <w:szCs w:val="22"/>
-        </w:rPr>
-        <w:t xml:space="preserve"> </w:t>
-      </w:r>
-      <w:r>
-        <w:rPr>
-          <w:rFonts w:ascii="Cambria Math" w:hAnsi="Cambria Math" w:cs="Cambria Math"/>
-          <w:sz w:val="22"/>
-          <w:szCs w:val="22"/>
-        </w:rPr>
-        <w:t>⁸⁷</w:t>
-      </w:r>
-      <w:r>
-        <w:rPr>
-          <w:rFonts w:ascii="Garamond" w:hAnsi="Garamond"/>
-          <w:sz w:val="22"/>
-          <w:szCs w:val="22"/>
-        </w:rPr>
-        <w:t>Sr/</w:t>
-      </w:r>
-      <w:r>
-        <w:rPr>
-          <w:rFonts w:ascii="Cambria Math" w:hAnsi="Cambria Math" w:cs="Cambria Math"/>
-          <w:sz w:val="22"/>
-          <w:szCs w:val="22"/>
-        </w:rPr>
-        <w:t>⁸⁶</w:t>
-      </w:r>
-      <w:r>
-        <w:rPr>
-          <w:rFonts w:ascii="Garamond" w:hAnsi="Garamond"/>
-          <w:sz w:val="22"/>
-          <w:szCs w:val="22"/>
-        </w:rPr>
-        <w:t xml:space="preserve">Sr </w:t>
-      </w:r>
-      <w:r>
-        <w:rPr>
-          <w:rFonts w:ascii="Garamond" w:hAnsi="Garamond"/>
-          <w:sz w:val="22"/>
-          <w:szCs w:val="22"/>
-        </w:rPr>
-        <w:t>ratio</w:t>
-      </w:r>
-      <w:r>
-        <w:rPr>
-          <w:rFonts w:ascii="Garamond" w:hAnsi="Garamond"/>
-          <w:sz w:val="22"/>
-          <w:szCs w:val="22"/>
-        </w:rPr>
-        <w:t xml:space="preserve"> (Figure 1).</w:t>
+        <w:t>R</w:t>
+      </w:r>
+      <w:r>
+        <w:rPr>
+          <w:rFonts w:ascii="Garamond" w:hAnsi="Garamond"/>
+          <w:sz w:val="22"/>
+          <w:szCs w:val="22"/>
+        </w:rPr>
+        <w:t>ecent sustained declines in the number of Chinook salmon (</w:t>
+      </w:r>
+      <w:r>
+        <w:rPr>
+          <w:rStyle w:val="Emphasis"/>
+          <w:rFonts w:ascii="Garamond" w:hAnsi="Garamond"/>
+          <w:sz w:val="22"/>
+          <w:szCs w:val="22"/>
+        </w:rPr>
+        <w:t>Oncorhynchus tshawytscha</w:t>
+      </w:r>
+      <w:r>
+        <w:rPr>
+          <w:rFonts w:ascii="Garamond" w:hAnsi="Garamond"/>
+          <w:sz w:val="22"/>
+          <w:szCs w:val="22"/>
+        </w:rPr>
+        <w:t xml:space="preserve">) returning to </w:t>
+      </w:r>
+      <w:r>
+        <w:rPr>
+          <w:rFonts w:ascii="Garamond" w:hAnsi="Garamond"/>
+          <w:sz w:val="22"/>
+          <w:szCs w:val="22"/>
+        </w:rPr>
+        <w:t>Western Alaska watersheds</w:t>
+      </w:r>
+      <w:r>
+        <w:rPr>
+          <w:rFonts w:ascii="Garamond" w:hAnsi="Garamond"/>
+          <w:sz w:val="22"/>
+          <w:szCs w:val="22"/>
+        </w:rPr>
+        <w:t xml:space="preserve"> have led to fishery restrictions and contributed to a crisis of food insecurity and cultural loss. </w:t>
+      </w:r>
+      <w:r>
+        <w:rPr>
+          <w:rFonts w:ascii="Garamond" w:hAnsi="Garamond"/>
+          <w:sz w:val="22"/>
+          <w:szCs w:val="22"/>
+        </w:rPr>
+        <w:t>Consequently, there is a pressing need to evaluate the mechanisms of population decline</w:t>
+      </w:r>
+      <w:r>
+        <w:rPr>
+          <w:rFonts w:ascii="Garamond" w:hAnsi="Garamond"/>
+          <w:sz w:val="22"/>
+          <w:szCs w:val="22"/>
+        </w:rPr>
+        <w:t xml:space="preserve"> and to assess the spatial distribution of impacts across</w:t>
+      </w:r>
+      <w:r>
+        <w:rPr>
+          <w:rFonts w:ascii="Garamond" w:hAnsi="Garamond"/>
+          <w:sz w:val="22"/>
+          <w:szCs w:val="22"/>
+        </w:rPr>
+        <w:t xml:space="preserve"> the region. </w:t>
+      </w:r>
+      <w:r>
+        <w:rPr>
+          <w:rFonts w:ascii="Garamond" w:hAnsi="Garamond"/>
+          <w:sz w:val="22"/>
+          <w:szCs w:val="22"/>
+        </w:rPr>
+        <w:t>Several plausible hypotheses have been proposed, many involving mortality during the marine life stage, including effects of changing habitat conditions, bycatch in federal trawl fisheries, and harvest in targeted intercept fisheries on migrating stocks</w:t>
+      </w:r>
+      <w:r>
+        <w:rPr>
+          <w:rFonts w:ascii="Garamond" w:hAnsi="Garamond"/>
+          <w:sz w:val="22"/>
+          <w:szCs w:val="22"/>
+        </w:rPr>
+        <w:t>. P</w:t>
+      </w:r>
+      <w:r>
+        <w:rPr>
+          <w:rFonts w:ascii="Garamond" w:hAnsi="Garamond"/>
+          <w:sz w:val="22"/>
+          <w:szCs w:val="22"/>
+        </w:rPr>
+        <w:t>rogress in testing these hypotheses has been hindered by the limited ability to determine the river of origin for marine-caught fish, preventing assessment of marine mortality in the context of river- or sub-basin-specific population health.</w:t>
       </w:r>
     </w:p>
     <w:p>
@@ -932,15 +455,163 @@
           <w:sz w:val="22"/>
           <w:szCs w:val="22"/>
         </w:rPr>
-        <w:t>Otolith growth and isotopic incorporation occur continuously over an individual's lifetime</w:t>
-      </w:r>
-      <w:r>
-        <w:rPr>
-          <w:rFonts w:ascii="Garamond" w:hAnsi="Garamond"/>
-          <w:sz w:val="22"/>
-          <w:szCs w:val="22"/>
-        </w:rPr>
-        <w:t xml:space="preserve">, and, as such, </w:t>
+        <w:lastRenderedPageBreak/>
+        <w:t>Genetic stock identification (GSI) has become a powerful and widely used tool for estimating the provenance of many Chinook salmon stocks in Alaska and for supporting in-season management.</w:t>
+      </w:r>
+      <w:r>
+        <w:rPr>
+          <w:rFonts w:ascii="Garamond" w:hAnsi="Garamond"/>
+          <w:sz w:val="22"/>
+          <w:szCs w:val="22"/>
+        </w:rPr>
+        <w:t xml:space="preserve"> </w:t>
+      </w:r>
+      <w:r>
+        <w:rPr>
+          <w:rFonts w:ascii="Garamond" w:hAnsi="Garamond"/>
+          <w:sz w:val="22"/>
+          <w:szCs w:val="22"/>
+        </w:rPr>
+        <w:t xml:space="preserve">However, </w:t>
+      </w:r>
+      <w:r>
+        <w:rPr>
+          <w:rFonts w:ascii="Garamond" w:hAnsi="Garamond"/>
+          <w:sz w:val="22"/>
+          <w:szCs w:val="22"/>
+        </w:rPr>
+        <w:t xml:space="preserve">Chinook salmon in Western Alaska lack sufficient genetic structure </w:t>
+      </w:r>
+      <w:proofErr w:type="gramStart"/>
+      <w:r>
+        <w:rPr>
+          <w:rFonts w:ascii="Garamond" w:hAnsi="Garamond"/>
+          <w:sz w:val="22"/>
+          <w:szCs w:val="22"/>
+        </w:rPr>
+        <w:t xml:space="preserve">to  </w:t>
+      </w:r>
+      <w:r>
+        <w:rPr>
+          <w:rFonts w:ascii="Garamond" w:hAnsi="Garamond"/>
+          <w:sz w:val="22"/>
+          <w:szCs w:val="22"/>
+        </w:rPr>
+        <w:t>within</w:t>
+      </w:r>
+      <w:proofErr w:type="gramEnd"/>
+      <w:r>
+        <w:rPr>
+          <w:rFonts w:ascii="Garamond" w:hAnsi="Garamond"/>
+          <w:sz w:val="22"/>
+          <w:szCs w:val="22"/>
+        </w:rPr>
+        <w:t xml:space="preserve"> the </w:t>
+      </w:r>
+      <w:r>
+        <w:rPr>
+          <w:rFonts w:ascii="Garamond" w:hAnsi="Garamond"/>
+          <w:sz w:val="22"/>
+          <w:szCs w:val="22"/>
+        </w:rPr>
+        <w:t xml:space="preserve">Coastal Western Alaska (CWAK) </w:t>
+      </w:r>
+      <w:r>
+        <w:rPr>
+          <w:rFonts w:ascii="Garamond" w:hAnsi="Garamond"/>
+          <w:sz w:val="22"/>
+          <w:szCs w:val="22"/>
+        </w:rPr>
+        <w:t>genetic reporting</w:t>
+      </w:r>
+      <w:r>
+        <w:rPr>
+          <w:rFonts w:ascii="Garamond" w:hAnsi="Garamond"/>
+          <w:sz w:val="22"/>
+          <w:szCs w:val="22"/>
+        </w:rPr>
+        <w:t xml:space="preserve"> group, which </w:t>
+      </w:r>
+      <w:r>
+        <w:rPr>
+          <w:rFonts w:ascii="Garamond" w:hAnsi="Garamond"/>
+          <w:sz w:val="22"/>
+          <w:szCs w:val="22"/>
+        </w:rPr>
+        <w:t>cannot discriminate among river systems</w:t>
+      </w:r>
+      <w:r>
+        <w:rPr>
+          <w:rFonts w:ascii="Garamond" w:hAnsi="Garamond"/>
+          <w:sz w:val="22"/>
+          <w:szCs w:val="22"/>
+        </w:rPr>
+        <w:t xml:space="preserve"> (Figure 1). </w:t>
+      </w:r>
+      <w:r>
+        <w:rPr>
+          <w:rFonts w:ascii="Garamond" w:hAnsi="Garamond"/>
+          <w:sz w:val="22"/>
+          <w:szCs w:val="22"/>
+        </w:rPr>
+        <w:t xml:space="preserve"> </w:t>
+      </w:r>
+      <w:r>
+        <w:rPr>
+          <w:rFonts w:ascii="Garamond" w:hAnsi="Garamond"/>
+          <w:sz w:val="22"/>
+          <w:szCs w:val="22"/>
+        </w:rPr>
+        <w:t>In parallel, isotope-based methods using fish ear stones (otoliths) have emerged as an alternative approach, offering potentially finer spatial resolution than genetics in some cases</w:t>
+      </w:r>
+      <w:r>
+        <w:rPr>
+          <w:rFonts w:ascii="Garamond" w:hAnsi="Garamond"/>
+          <w:sz w:val="22"/>
+          <w:szCs w:val="22"/>
+        </w:rPr>
+        <w:fldChar w:fldCharType="begin"/>
+      </w:r>
+      <w:r>
+        <w:rPr>
+          <w:rFonts w:ascii="Garamond" w:hAnsi="Garamond"/>
+          <w:sz w:val="22"/>
+          <w:szCs w:val="22"/>
+        </w:rPr>
+        <w:instrText xml:space="preserve"> ADDIN ZOTERO_ITEM CSL_CITATION {"citationID":"Pqigyra2","properties":{"formattedCitation":"(Brennan et al., 2015; Brennan &amp; Schindler, 2017; Kennedy et al., 1997)","plainCitation":"(Brennan et al., 2015; Brennan &amp; Schindler, 2017; Kennedy et al., 1997)","noteIndex":0},"citationItems":[{"id":2313,"uris":["http://zotero.org/users/8421274/items/AJFVQJVT"],"itemData":{"id":2313,"type":"article-journal","abstract":"Highly migratory organisms present major challenges to conservation efforts. This is especially true for exploited anadromous fish species, which exhibit long-range dispersals from natal sites, complex population structures, and extensive mixing of distinct populations during exploitation. By tracing the migratory histories of individual Chinook salmon caught in fisheries using strontium isotopes, we determined the relative production of natal habitats at fine spatial scales and different life histories. Although strontium isotopes have been widely used in provenance research, we present a new robust framework to simultaneously assess natal sources and migrations of individuals within fishery harvests through time. Our results pave the way for investigating how fine-scale habitat production and life histories of salmon respond to perturbations—providing crucial insights for conservation.","container-title":"Science Advances","DOI":"10.1126/sciadv.1400124","issue":"4","note":"publisher: American Association for the Advancement of Science","page":"e1400124","source":"science.org (Atypon)","title":"Strontium isotopes delineate fine-scale natal origins and migration histories of Pacific salmon","volume":"1","author":[{"family":"Brennan","given":"Sean R."},{"family":"Zimmerman","given":"Christian E."},{"family":"Fernandez","given":"Diego P."},{"family":"Cerling","given":"Thure E."},{"family":"McPhee","given":"Megan V."},{"family":"Wooller","given":"Matthew J."}],"issued":{"date-parts":[["2015",5,15]]}}},{"id":1694,"uris":["http://zotero.org/users/8421274/items/NSWL6YPN"],"itemData":{"id":1694,"type":"article-journal","abstract":"Production patterns of highly mobile species, such as anadromous fish, often exhibit high spatial and temporal heterogeneity across landscapes. Such variability is often asynchronous in time among habitats, which stabilizes production at aggregate scales of complexity. Reconstructing production patterns explicitly in space and time across multiple scales, however, remains difficult but is important for prioritizing habitat conservation. This is especially true for fishes inhabiting river basins due to long-range dispersal, high mortality at early life stages, complex population structure and elusive life history variation. We develop a new approach for mapping production patterns of Pacific salmon across a large river basin by integrating otolith microchemistry and dendritic isoscape models. The geographically continuous Bayesian assignment framework presented here yielded high accuracies (&gt;90%) and relatively high precisions (precisions &lt;4%; i.e., assignment areas of &lt;530 river km of the 13 100 km total river length) when used to determine the natal source of known-origin juvenile Chinook salmon captured throughout the study region. Integrating these methods enabled us to base estimates of provenance and habitat use of individuals on a per location basis using strontium isotopic data throughout the continuous spatial domain of a river network. Such a framework provides substantial advantages over the more common nominal approach to employing otolith microchemistry to reconstruct movement patterns of fish. In doing so, we reconstructed the spatial production patterns of adult Chinook salmon returning to a large watershed in Bristol Bay, Alaska and illustrate the power of such an approach to conservation efforts.","container-title":"Ecological Applications","DOI":"10.1002/eap.1474","ISSN":"1939-5582","issue":"2","language":"en","note":"_eprint: https://esajournals.onlinelibrary.wiley.com/doi/pdf/10.1002/eap.1474","page":"363-377","source":"Wiley Online Library","title":"Linking otolith microchemistry and dendritic isoscapes to map heterogeneous production of fish across river basins","volume":"27","author":[{"family":"Brennan","given":"Sean R."},{"family":"Schindler","given":"Daniel E."}],"issued":{"date-parts":[["2017"]]}}},{"id":1561,"uris":["http://zotero.org/users/8421274/items/UCQYZW9Z"],"itemData":{"id":1561,"type":"article-journal","abstract":"To optimize conservation and restoration strategies for fish stocks it is important to identify the rearing habitats that produce the most successful individuals. However, tracking millions of migratory fish through multiple life stages seems to be impossible using conventional techniques. Using differences in the ratio of stable isotopes of strontium (Sr), found naturally in stream water, we have been able to distinguish juvenile Atlantic salmon (Salmo salar) from eight of ten rearing sites studied in Vermont streams. This demonstrates the potential for using environmental signals to determine the rearing stream from which salmon originate, and should help to guide restoration activities.","container-title":"Nature","DOI":"10.1038/42835","ISSN":"1476-4687","issue":"6635","language":"en","license":"1997 Macmillan Magazines Ltd.","note":"number: 6635\npublisher: Nature Publishing Group","page":"766-767","source":"www-nature-com.offcampus.lib.washington.edu","title":"Natural isotope markers in salmon","volume":"387","author":[{"family":"Kennedy","given":"Brian P."},{"family":"Folt","given":"Carol L."},{"family":"Blum","given":"Joel D."},{"family":"Chamberlain","given":"C. Page"}],"issued":{"date-parts":[["1997",6]]}}}],"schema":"https://github.com/citation-style-language/schema/raw/master/csl-citation.json"} </w:instrText>
+      </w:r>
+      <w:r>
+        <w:rPr>
+          <w:rFonts w:ascii="Garamond" w:hAnsi="Garamond"/>
+          <w:sz w:val="22"/>
+          <w:szCs w:val="22"/>
+        </w:rPr>
+        <w:fldChar w:fldCharType="separate"/>
+      </w:r>
+      <w:r>
+        <w:rPr>
+          <w:rFonts w:ascii="Garamond" w:hAnsi="Garamond"/>
+          <w:noProof/>
+          <w:sz w:val="22"/>
+          <w:szCs w:val="22"/>
+        </w:rPr>
+        <w:t>(Brennan et al., 2015; Brennan &amp; Schindler, 2017; Kennedy et al., 1997)</w:t>
+      </w:r>
+      <w:r>
+        <w:rPr>
+          <w:rFonts w:ascii="Garamond" w:hAnsi="Garamond"/>
+          <w:sz w:val="22"/>
+          <w:szCs w:val="22"/>
+        </w:rPr>
+        <w:fldChar w:fldCharType="end"/>
+      </w:r>
+      <w:r>
+        <w:rPr>
+          <w:rFonts w:ascii="Garamond" w:hAnsi="Garamond"/>
+          <w:sz w:val="22"/>
+          <w:szCs w:val="22"/>
+        </w:rPr>
+        <w:t>. The relative ratio of strontium-87 to strontium-86 (</w:t>
       </w:r>
       <w:r>
         <w:rPr>
@@ -972,7 +643,170 @@
           <w:sz w:val="22"/>
           <w:szCs w:val="22"/>
         </w:rPr>
-        <w:t>Sr values along the growth axis of the otolith form a continuous time series</w:t>
+        <w:t xml:space="preserve">Sr) is heterogeneously distributed across geologically diverse landscapes, faithfully incorporated </w:t>
+      </w:r>
+      <w:r>
+        <w:rPr>
+          <w:rFonts w:ascii="Garamond" w:hAnsi="Garamond"/>
+          <w:sz w:val="22"/>
+          <w:szCs w:val="22"/>
+        </w:rPr>
+        <w:t xml:space="preserve">the </w:t>
+      </w:r>
+      <w:r>
+        <w:rPr>
+          <w:rFonts w:ascii="Garamond" w:hAnsi="Garamond"/>
+          <w:sz w:val="22"/>
+          <w:szCs w:val="22"/>
+        </w:rPr>
+        <w:t>otolith</w:t>
+      </w:r>
+      <w:r>
+        <w:rPr>
+          <w:rFonts w:ascii="Garamond" w:hAnsi="Garamond"/>
+          <w:sz w:val="22"/>
+          <w:szCs w:val="22"/>
+        </w:rPr>
+        <w:t xml:space="preserve"> structure</w:t>
+      </w:r>
+      <w:r>
+        <w:rPr>
+          <w:rFonts w:ascii="Garamond" w:hAnsi="Garamond"/>
+          <w:sz w:val="22"/>
+          <w:szCs w:val="22"/>
+        </w:rPr>
+        <w:t xml:space="preserve">, and </w:t>
+      </w:r>
+      <w:r>
+        <w:rPr>
+          <w:rFonts w:ascii="Garamond" w:hAnsi="Garamond"/>
+          <w:sz w:val="22"/>
+          <w:szCs w:val="22"/>
+        </w:rPr>
+        <w:t xml:space="preserve">is </w:t>
+      </w:r>
+      <w:r>
+        <w:rPr>
+          <w:rFonts w:ascii="Garamond" w:hAnsi="Garamond"/>
+          <w:sz w:val="22"/>
+          <w:szCs w:val="22"/>
+        </w:rPr>
+        <w:t xml:space="preserve">temporally stable in Alaskan watersheds </w:t>
+      </w:r>
+      <w:r>
+        <w:rPr>
+          <w:rFonts w:ascii="Garamond" w:hAnsi="Garamond"/>
+          <w:sz w:val="22"/>
+          <w:szCs w:val="22"/>
+        </w:rPr>
+        <w:fldChar w:fldCharType="begin"/>
+      </w:r>
+      <w:r>
+        <w:rPr>
+          <w:rFonts w:ascii="Garamond" w:hAnsi="Garamond"/>
+          <w:sz w:val="22"/>
+          <w:szCs w:val="22"/>
+        </w:rPr>
+        <w:instrText xml:space="preserve"> ADDIN ZOTERO_ITEM CSL_CITATION {"citationID":"gCPseI7r","properties":{"formattedCitation":"(Bataille &amp; Bowen, 2012; Brennan et al., 2015; Campana, 1999; Capo et al., 1998)","plainCitation":"(Bataille &amp; Bowen, 2012; Brennan et al., 2015; Campana, 1999; Capo et al., 1998)","noteIndex":0},"citationItems":[{"id":1939,"uris":["http://zotero.org/users/8421274/items/S8GE9LUD"],"itemData":{"id":1939,"type":"article-journal","abstract":"Although variation in 87Sr/86Sr has been widely pursued as a tracer of provenance in environmental studies, forensics, archeology and food traceability, accurate methods for mapping variations in environmental 87Sr/ 86Sr at regional scale are not available. In this paper, we build upon earlier efforts to model 87Sr/86Sr in bedrock by developing GIS-based models for Sr isotopes in rock and water that include the combined effects of lithology and time. Using published data, we ﬁt lithology-speciﬁc model parameters for generalized equations describing the concentration of radiogenic Sr in silicate and carbonate rocks. The new model explained more than 50% of the observed variance in measured Sr isotope values from independent global databases of igneous, metaigneous, and carbonate rocks, but performed more poorly (explaining 33% of the variance) for sedimentary and metasedimentary rocks. In comparison, a previously applied model formulation that did not include lithology-speciﬁc parameters explained only 20% and 8% of the observed variance for igneous and sedimentary rocks, respectively, and exhibited an inverse relationship with measured carbonate rock values. Building upon the bedrock model, we also developed and applied equations to predict the contribution of different rock types to 87Sr/86Sr variations in water as a function of their weathering rates and strontium content. The resulting water model was compared to data from 68 catchments and shown to give more accurate predictions of stream water 87Sr/86Sr (R2 = 0.70) than models that did not include lithological weathering parameters. We applied these models to produce maps (“isoscapes”) predicting 87Sr/86Sr in bedrock and water across the contiguous USA, and compared the mapped Sr isotope distributions to data on Sr isotope ratios of US marijuana crops. Although the maps produced here are demonstrably imperfect and leave signiﬁcant scope for further reﬁnement, they provide an enhanced framework for lithology-based Sr isotope modeling and offer a baseline for provenance studies by constraining the 87Sr/86Sr in strontium sources at regional scales.","container-title":"Chemical Geology","DOI":"10.1016/j.chemgeo.2012.01.028","ISSN":"00092541","journalAbbreviation":"Chemical Geology","language":"en","page":"39-52","source":"DOI.org (Crossref)","title":"Mapping 87Sr/86Sr variations in bedrock and water for large scale provenance studies","volume":"304-305","author":[{"family":"Bataille","given":"Clément P."},{"family":"Bowen","given":"Gabriel J."}],"issued":{"date-parts":[["2012",4]]}}},{"id":2313,"uris":["http://zotero.org/users/8421274/items/AJFVQJVT"],"itemData":{"id":2313,"type":"article-journal","abstract":"Highly migratory organisms present major challenges to conservation efforts. This is especially true for exploited anadromous fish species, which exhibit long-range dispersals from natal sites, complex population structures, and extensive mixing of distinct populations during exploitation. By tracing the migratory histories of individual Chinook salmon caught in fisheries using strontium isotopes, we determined the relative production of natal habitats at fine spatial scales and different life histories. Although strontium isotopes have been widely used in provenance research, we present a new robust framework to simultaneously assess natal sources and migrations of individuals within fishery harvests through time. Our results pave the way for investigating how fine-scale habitat production and life histories of salmon respond to perturbations—providing crucial insights for conservation.","container-title":"Science Advances","DOI":"10.1126/sciadv.1400124","issue":"4","note":"publisher: American Association for the Advancement of Science","page":"e1400124","source":"science.org (Atypon)","title":"Strontium isotopes delineate fine-scale natal origins and migration histories of Pacific salmon","volume":"1","author":[{"family":"Brennan","given":"Sean R."},{"family":"Zimmerman","given":"Christian E."},{"family":"Fernandez","given":"Diego P."},{"family":"Cerling","given":"Thure E."},{"family":"McPhee","given":"Megan V."},{"family":"Wooller","given":"Matthew J."}],"issued":{"date-parts":[["2015",5,15]]}}},{"id":1441,"uris":["http://zotero.org/users/8421274/items/PHNAKZ8D"],"itemData":{"id":1441,"type":"article-journal","abstract":"The fish otolith (earstone) has long been known as a timekeeper, but interest in its use as a metabolically inert environmental recorder has accelerated in recent years. In part due to technological advances, applications such as stock identification, determination of rnigralon pathways, reconstruction of temperature and salinity history, age validation, detection of anadromy, use as a natural tag and chemical mass marking have been developed, some of which are difficult or impossible to implement using alternative techniques. Microsamphg and the latest advances in beam-based probes allow many elemental assays to be coupled with daily or annual growth increments, thus providing a detailed chronologcal record of the environment. However, few workers have critically assessed the assumptions upon which the environmental reconstructions are based, or considered the possibility that elemental incorporation into the otolith may proceed differently than that into other calcified structures. This paper reviews current applications and their assumptions and suggests future directions. Particular attention is given to the premises that the elemental and isotopic composition of the otolith reflects that of the environment, and the effect of physiological filters on the resulting composition. The roles of temperature, elemental uptake into the fish and the process of otolith crystahzation are also assessed. Drawing upon recent advances in geochemistry and paleoclirnate research as points of contrast, it appears that not all applications of otolith chemistry are firmly based, although others are destined to become powerful and perhaps routine tools for the mainstream fish biologst.","container-title":"Marine Ecology Progress Series","DOI":"10.3354/meps188263","ISSN":"0171-8630, 1616-1599","journalAbbreviation":"Mar. Ecol. Prog. Ser.","language":"en","page":"263-297","source":"DOI.org (Crossref)","title":"Chemistry and composition of fish otoliths:pathways, mechanisms and applications","title-short":"Chemistry and composition of fish otoliths","volume":"188","author":[{"family":"Campana","given":"Se"}],"issued":{"date-parts":[["1999"]]}}},{"id":1457,"uris":["http://zotero.org/users/8421274/items/TDIQBP7K"],"itemData":{"id":1457,"type":"article-journal","abstract":"The strontium (Sr) isotope method can be a powerful tool in studies of chemical weathering and soil genesis, cation provenance and mobility, and the chronostratigraphic correlation of marine sediments. It is a sensitive geochemical tracer, applicable to large-scale ecosystem studies as well as to centimeter-scaled examination of cation mobility within a soil profile. The 87Sr/86Sr ratios of natural materials reflect the sources of strontium available during their formation. Isotopically distinct inputs from precipitation, dryfall, soil parent material, and surface or groundwater allow determination of the relative proportions of those materials entering or leaving an ecosystem. The isotopic compositions of labile (soil exchange complex and soil solution) strontium and Sr in vegetation reflect the sources of cations available to plants. Strontium isotopes can be used to track the biogeochemical cycling of nutrient cations such as calcium. The extent of cation contributions from in situ weathering and external additions to soil from dust and rain can also be resolved with this method. In this paper, we review the geochemistry and isotopic systematics of strontium, and discuss the use of this method as a tracer of earth surface processes.","container-title":"Geoderma","DOI":"10.1016/S0016-7061(97)00102-X","ISSN":"0016-7061","issue":"1","journalAbbreviation":"Geoderma","language":"en","page":"197-225","source":"ScienceDirect","title":"Strontium isotopes as tracers of ecosystem processes: theory and methods","title-short":"Strontium isotopes as tracers of ecosystem processes","volume":"82","author":[{"family":"Capo","given":"Rosemary C."},{"family":"Stewart","given":"Brian W."},{"family":"Chadwick","given":"Oliver A."}],"issued":{"date-parts":[["1998",2,1]]}}}],"schema":"https://github.com/citation-style-language/schema/raw/master/csl-citation.json"} </w:instrText>
+      </w:r>
+      <w:r>
+        <w:rPr>
+          <w:rFonts w:ascii="Garamond" w:hAnsi="Garamond"/>
+          <w:sz w:val="22"/>
+          <w:szCs w:val="22"/>
+        </w:rPr>
+        <w:fldChar w:fldCharType="separate"/>
+      </w:r>
+      <w:r>
+        <w:rPr>
+          <w:rFonts w:ascii="Garamond" w:hAnsi="Garamond"/>
+          <w:noProof/>
+          <w:sz w:val="22"/>
+          <w:szCs w:val="22"/>
+        </w:rPr>
+        <w:t>(Bataille &amp; Bowen, 2012; Brennan et al., 2015; Campana, 1999; Capo et al., 1998)</w:t>
+      </w:r>
+      <w:r>
+        <w:rPr>
+          <w:rFonts w:ascii="Garamond" w:hAnsi="Garamond"/>
+          <w:sz w:val="22"/>
+          <w:szCs w:val="22"/>
+        </w:rPr>
+        <w:fldChar w:fldCharType="end"/>
+      </w:r>
+      <w:r>
+        <w:rPr>
+          <w:rFonts w:ascii="Garamond" w:hAnsi="Garamond"/>
+          <w:sz w:val="22"/>
+          <w:szCs w:val="22"/>
+        </w:rPr>
+        <w:t xml:space="preserve">. </w:t>
+      </w:r>
+      <w:r>
+        <w:rPr>
+          <w:rFonts w:ascii="Garamond" w:hAnsi="Garamond"/>
+          <w:sz w:val="22"/>
+          <w:szCs w:val="22"/>
+        </w:rPr>
+        <w:t xml:space="preserve">This signature </w:t>
+      </w:r>
+      <w:r>
+        <w:rPr>
+          <w:rFonts w:ascii="Garamond" w:hAnsi="Garamond"/>
+          <w:sz w:val="22"/>
+          <w:szCs w:val="22"/>
+        </w:rPr>
+        <w:t xml:space="preserve">has </w:t>
+      </w:r>
+      <w:proofErr w:type="gramStart"/>
+      <w:r>
+        <w:rPr>
+          <w:rFonts w:ascii="Garamond" w:hAnsi="Garamond"/>
+          <w:sz w:val="22"/>
+          <w:szCs w:val="22"/>
+        </w:rPr>
+        <w:t>be</w:t>
+      </w:r>
+      <w:proofErr w:type="gramEnd"/>
+      <w:r>
+        <w:rPr>
+          <w:rFonts w:ascii="Garamond" w:hAnsi="Garamond"/>
+          <w:sz w:val="22"/>
+          <w:szCs w:val="22"/>
+        </w:rPr>
+        <w:t xml:space="preserve"> used to estimate provenance by comparing the </w:t>
+      </w:r>
+      <w:r>
+        <w:rPr>
+          <w:rFonts w:ascii="Cambria Math" w:hAnsi="Cambria Math" w:cs="Cambria Math"/>
+          <w:sz w:val="22"/>
+          <w:szCs w:val="22"/>
+        </w:rPr>
+        <w:t>⁸⁷</w:t>
+      </w:r>
+      <w:r>
+        <w:rPr>
+          <w:rFonts w:ascii="Garamond" w:hAnsi="Garamond"/>
+          <w:sz w:val="22"/>
+          <w:szCs w:val="22"/>
+        </w:rPr>
+        <w:t>Sr/</w:t>
+      </w:r>
+      <w:r>
+        <w:rPr>
+          <w:rFonts w:ascii="Cambria Math" w:hAnsi="Cambria Math" w:cs="Cambria Math"/>
+          <w:sz w:val="22"/>
+          <w:szCs w:val="22"/>
+        </w:rPr>
+        <w:t>⁸⁶</w:t>
+      </w:r>
+      <w:r>
+        <w:rPr>
+          <w:rFonts w:ascii="Garamond" w:hAnsi="Garamond"/>
+          <w:sz w:val="22"/>
+          <w:szCs w:val="22"/>
+        </w:rPr>
+        <w:t>Sr ratio from the freshwater natal portion of the otolith to modeled landscape values (Cite).</w:t>
       </w:r>
       <w:r>
         <w:rPr>
@@ -988,7 +822,15 @@
           <w:sz w:val="22"/>
           <w:szCs w:val="22"/>
         </w:rPr>
-        <w:t xml:space="preserve">encoding sequential habitat use, relative growth, and maternal migration history </w:t>
+        <w:t>However</w:t>
+      </w:r>
+      <w:r>
+        <w:rPr>
+          <w:rFonts w:ascii="Garamond" w:hAnsi="Garamond"/>
+          <w:sz w:val="22"/>
+          <w:szCs w:val="22"/>
+        </w:rPr>
+        <w:t xml:space="preserve">, this method is limited by the level of isotopic heterogeneity relative to the spatial scale of interest </w:t>
       </w:r>
       <w:r>
         <w:rPr>
@@ -1004,7 +846,7 @@
           <w:sz w:val="22"/>
           <w:szCs w:val="22"/>
         </w:rPr>
-        <w:instrText xml:space="preserve"> ADDIN ZOTERO_ITEM CSL_CITATION {"citationID":"sawhq1ph","properties":{"formattedCitation":"(Hegg et al., 2019; Reis-Santos et al., 2022)","plainCitation":"(Hegg et al., 2019; Reis-Santos et al., 2022)","noteIndex":0},"citationItems":[{"id":3248,"uris":["http://zotero.org/users/8421274/items/FHA5HJVT"],"itemData":{"id":3248,"type":"article-journal","abstract":"Connecting maternal migratory behavior with the behavior and ecology of their progeny can reveal important details in the ecology of a population. One method for linking maternal migration to early juvenile life history is through maternal chemistry recorded in otoliths. Despite the wide use of maternal signatures to infer anadromy, the duration and dynamics of maternal otolith signatures are not well understood. Shifts in the elemental ratios and strontium isotope (87Sr/86Sr) chemistry in otoliths from juvenile Chinook salmon (Oncorhynchus tshawytscha) correlate with the timing of hatch and emergence, respectively, indicating a chemical marker of these ontological stages. Additionally, analysis of maternal signatures show that maternally derived 87Sr/86Sr may be influenced by equilibration of the mother to fresh water, and in some cases the 87Sr/86Sr signatures of the eggs can shift substantially after being laid. These results provide guidance in separating maternal and juvenile signatures as researchers increasingly target early juvenile otolith chemistry. These results also caution against the use of 87Sr/86Sr alone as a marker of anadromy in populations with major inland migrations.","container-title":"Canadian Journal of Fisheries and Aquatic Sciences","DOI":"10.1139/cjfas-2017-0341","ISSN":"0706-652X","issue":"1","journalAbbreviation":"Can. J. Fish. Aquat. Sci.","note":"publisher: NRC Research Press","page":"81-94","source":"cdnsciencepub.com (Atypon)","title":"What did you say about my mother? The complexities of maternally derived chemical signatures in otoliths","title-short":"What did you say about my mother?","volume":"76","author":[{"family":"Hegg","given":"Jens C."},{"family":"Kennedy","given":"Brian P."},{"family":"Chittaro","given":"Paul"}],"issued":{"date-parts":[["2019",1]]}}},{"id":2143,"uris":["http://zotero.org/users/8421274/items/H4CTDMKS"],"itemData":{"id":2143,"type":"article-journal","abstract":"Abstract\n            Chemical analysis of calcified structures continues to flourish, as analytical and technological advances enable researchers to tap into trace elements and isotopes taken up in otoliths and other archival tissues at ever greater resolution. Increasingly, these tracers are applied to refine age estimation and interpretation, and to chronicle responses to environmental stressors, linking these to ecological, physiological, and life-history processes. Here, we review emerging approaches and innovative research directions in otolith chemistry, as well as in the chemistry of other archival tissues, outlining their value for fisheries and ecosystem-based management, turning the spotlight on areas where such biomarkers can support decision making. We summarise recent milestones and the challenges that lie ahead to using otoliths and archival tissues as biomarkers, grouped into seven, rapidly expanding and application-oriented research areas that apply chemical analysis in a variety of contexts, namely: (1) supporting fish age estimation; (2) evaluating environmental stress, ecophysiology and individual performance; (3) confirming seafood provenance; (4) resolving connectivity and movement pathways; (5) characterising food webs and trophic interactions; (6) reconstructing reproductive life histories; and (7) tracing stock enhancement efforts. Emerging research directions that apply hard part chemistry to combat seafood fraud, quantify past food webs, as well as to reconcile growth, movement, thermal, metabolic, stress and reproductive life-histories provide opportunities to examine how harvesting and global change impact fish health and fisheries productivity. Ultimately, improved appreciation of the many practical benefits of archival tissue chemistry to fisheries and ecosystem-based management will support their increased implementation into routine monitoring.\n            \n              Graphical abstract","container-title":"Reviews in Fish Biology and Fisheries","DOI":"10.1007/s11160-022-09720-z","ISSN":"0960-3166, 1573-5184","journalAbbreviation":"Rev Fish Biol Fisheries","language":"en","source":"DOI.org (Crossref)","title":"Reading the biomineralized book of life: expanding otolith biogeochemical research and applications for fisheries and ecosystem-based management","title-short":"Reading the biomineralized book of life","URL":"https://link.springer.com/10.1007/s11160-022-09720-z","author":[{"family":"Reis-Santos","given":"Patrick"},{"family":"Gillanders","given":"Bronwyn M."},{"family":"Sturrock","given":"Anna M."},{"family":"Izzo","given":"Christopher"},{"family":"Oxman","given":"Dion S."},{"family":"Lueders-Dumont","given":"Jessica A."},{"family":"Hüssy","given":"Karin"},{"family":"Tanner","given":"Susanne E."},{"family":"Rogers","given":"Troy"},{"family":"Doubleday","given":"Zoë A."},{"family":"Andrews","given":"Allen H."},{"family":"Trueman","given":"Clive"},{"family":"Brophy","given":"Deirdre"},{"family":"Thiem","given":"Jason D."},{"family":"Baumgartner","given":"Lee J."},{"family":"Willmes","given":"Malte"},{"family":"Chung","given":"Ming-Tsung"},{"family":"Charapata","given":"Patrick"},{"family":"Johnson","given":"Rachel C."},{"family":"Trumble","given":"Stephen"},{"family":"Heimbrand","given":"Yvette"},{"family":"Limburg","given":"Karin E."},{"family":"Walther","given":"Benjamin D."}],"accessed":{"date-parts":[["2022",12,18]]},"issued":{"date-parts":[["2022",8,7]]}}}],"schema":"https://github.com/citation-style-language/schema/raw/master/csl-citation.json"} </w:instrText>
+        <w:instrText xml:space="preserve"> ADDIN ZOTERO_ITEM CSL_CITATION {"citationID":"W3sRlFul","properties":{"formattedCitation":"(Makhlouf et al., 2025)","plainCitation":"(Makhlouf et al., 2025)","noteIndex":0},"citationItems":[{"id":5397,"uris":["http://zotero.org/users/8421274/items/WRVF2L9N"],"itemData":{"id":5397,"type":"article-journal","abstract":"Understanding the spatial ecology of migratory species is uniquely challenging using conventional approaches. In fisheries such as for Pacific salmon, genetic stock identification (GSI) and isotope-based methods have emerged as strategies for reconstructing spatial ecology but are limited by the spatial resolution of genetic differentiation and isotopic heterogeneity. We show that integrating these complementary datasets improve the spatial resolution of provenance assignments. To do so, we reconstructed basin-wide estimates of natal origin locations for Chinook salmon in the Yukon River using samples (n = 247) from an experimental fishery designed to assess in-season run timing. A combined framework improved precision of likely provenance assignments (stream km &gt; 0.7 posterior probability) by 92% over genetic assignments and 52% over strontium isotope methods. In doing so, we illustrate watershed scale estimates of natal origin distributions with a greater resolution available from GSI or isotope data alone.","container-title":"Limnology and Oceanography Letters","DOI":"10.1002/lol2.70025","ISSN":"2378-2242","issue":"n/a","language":"en","license":"© 2025 The Author(s). Limnology and Oceanography Letters published by Wiley Periodicals LLC on behalf of Association for the Sciences of Limnology and Oceanography.","note":"_eprint: https://onlinelibrary.wiley.com/doi/pdf/10.1002/lol2.70025","source":"Wiley Online Library","title":"Combining genetic and isotope frameworks improves reconstruction of fish provenance across riverscapes","URL":"https://onlinelibrary.wiley.com/doi/abs/10.1002/lol2.70025","volume":"n/a","author":[{"family":"Makhlouf","given":"Ben"},{"family":"Cline","given":"Timothy J."},{"family":"Fernandez","given":"Diego"},{"family":"Seeb","given":"Lisa"},{"family":"Lee","given":"Elizabeth"},{"family":"Gilk-Baumer","given":"Sara"},{"family":"Whited","given":"Diane"},{"family":"Zimmerman","given":"Christian E."},{"family":"Schindler","given":"Daniel E."}],"accessed":{"date-parts":[["2025",6,4]]},"issued":{"date-parts":[["2025"]]}}}],"schema":"https://github.com/citation-style-language/schema/raw/master/csl-citation.json"} </w:instrText>
       </w:r>
       <w:r>
         <w:rPr>
@@ -1021,7 +863,7 @@
           <w:sz w:val="22"/>
           <w:szCs w:val="22"/>
         </w:rPr>
-        <w:t>(Hegg et al., 2019; Reis-Santos et al., 2022)</w:t>
+        <w:t>(Makhlouf et al., 2025)</w:t>
       </w:r>
       <w:r>
         <w:rPr>
@@ -1037,31 +879,79 @@
           <w:sz w:val="22"/>
           <w:szCs w:val="22"/>
         </w:rPr>
-        <w:t xml:space="preserve">. </w:t>
-      </w:r>
-      <w:r>
-        <w:rPr>
-          <w:rFonts w:ascii="Garamond" w:hAnsi="Garamond"/>
-          <w:sz w:val="22"/>
-          <w:szCs w:val="22"/>
-        </w:rPr>
-        <w:t xml:space="preserve">These patterns can be useful for reconstructing life histories. However, </w:t>
-      </w:r>
-      <w:r>
-        <w:rPr>
-          <w:rFonts w:ascii="Garamond" w:hAnsi="Garamond"/>
-          <w:sz w:val="22"/>
-          <w:szCs w:val="22"/>
-        </w:rPr>
-        <w:t>rapid movements through multiple environments may prevent full isotopic equilibration</w:t>
-      </w:r>
-      <w:r>
-        <w:rPr>
-          <w:rFonts w:ascii="Garamond" w:hAnsi="Garamond"/>
-          <w:sz w:val="22"/>
-          <w:szCs w:val="22"/>
-        </w:rPr>
-        <w:t xml:space="preserve"> and result in otolith </w:t>
+        <w:t xml:space="preserve">. While </w:t>
+      </w:r>
+      <w:r>
+        <w:rPr>
+          <w:rFonts w:ascii="Garamond" w:hAnsi="Garamond"/>
+          <w:sz w:val="22"/>
+          <w:szCs w:val="22"/>
+        </w:rPr>
+        <w:t xml:space="preserve">reliable </w:t>
+      </w:r>
+      <w:r>
+        <w:rPr>
+          <w:rFonts w:ascii="Garamond" w:hAnsi="Garamond"/>
+          <w:sz w:val="22"/>
+          <w:szCs w:val="22"/>
+        </w:rPr>
+        <w:t>within-</w:t>
+      </w:r>
+      <w:r>
+        <w:rPr>
+          <w:rFonts w:ascii="Garamond" w:hAnsi="Garamond"/>
+          <w:sz w:val="22"/>
+          <w:szCs w:val="22"/>
+        </w:rPr>
+        <w:t>river</w:t>
+      </w:r>
+      <w:r>
+        <w:rPr>
+          <w:rFonts w:ascii="Garamond" w:hAnsi="Garamond"/>
+          <w:sz w:val="22"/>
+          <w:szCs w:val="22"/>
+        </w:rPr>
+        <w:t xml:space="preserve"> </w:t>
+      </w:r>
+      <w:r>
+        <w:rPr>
+          <w:rFonts w:ascii="Garamond" w:hAnsi="Garamond"/>
+          <w:sz w:val="22"/>
+          <w:szCs w:val="22"/>
+        </w:rPr>
+        <w:t xml:space="preserve">estimates of </w:t>
+      </w:r>
+      <w:r>
+        <w:rPr>
+          <w:rFonts w:ascii="Garamond" w:hAnsi="Garamond"/>
+          <w:sz w:val="22"/>
+          <w:szCs w:val="22"/>
+        </w:rPr>
+        <w:t xml:space="preserve">provenance </w:t>
+      </w:r>
+      <w:r>
+        <w:rPr>
+          <w:rFonts w:ascii="Garamond" w:hAnsi="Garamond"/>
+          <w:sz w:val="22"/>
+          <w:szCs w:val="22"/>
+        </w:rPr>
+        <w:t>are</w:t>
+      </w:r>
+      <w:r>
+        <w:rPr>
+          <w:rFonts w:ascii="Garamond" w:hAnsi="Garamond"/>
+          <w:sz w:val="22"/>
+          <w:szCs w:val="22"/>
+        </w:rPr>
+        <w:t xml:space="preserve"> possible in Western Alaska, regional overlap</w:t>
+      </w:r>
+      <w:r>
+        <w:rPr>
+          <w:rFonts w:ascii="Garamond" w:hAnsi="Garamond"/>
+          <w:sz w:val="22"/>
+          <w:szCs w:val="22"/>
+        </w:rPr>
+        <w:t xml:space="preserve"> in </w:t>
       </w:r>
       <w:r>
         <w:rPr>
@@ -1101,80 +991,103 @@
           <w:sz w:val="22"/>
           <w:szCs w:val="22"/>
         </w:rPr>
-        <w:t xml:space="preserve"> values that do not directly reflect those of the environment. For fish such as Pacific salmon, which migrate through several sequential habitats rapidly as they migrate to the ocean, </w:t>
-      </w:r>
-      <w:r>
-        <w:rPr>
-          <w:rFonts w:ascii="Garamond" w:hAnsi="Garamond"/>
-          <w:sz w:val="22"/>
-          <w:szCs w:val="22"/>
-        </w:rPr>
-        <w:t xml:space="preserve">otolith strontium data may </w:t>
-      </w:r>
-      <w:r>
-        <w:rPr>
-          <w:rFonts w:ascii="Garamond" w:hAnsi="Garamond"/>
-          <w:sz w:val="22"/>
-          <w:szCs w:val="22"/>
-        </w:rPr>
-        <w:t xml:space="preserve">therefore </w:t>
-      </w:r>
-      <w:r>
-        <w:rPr>
-          <w:rFonts w:ascii="Garamond" w:hAnsi="Garamond"/>
-          <w:sz w:val="22"/>
-          <w:szCs w:val="22"/>
-        </w:rPr>
-        <w:t xml:space="preserve">contain subtle patterns </w:t>
-      </w:r>
-      <w:r>
-        <w:rPr>
-          <w:rFonts w:ascii="Garamond" w:hAnsi="Garamond"/>
-          <w:sz w:val="22"/>
-          <w:szCs w:val="22"/>
-        </w:rPr>
-        <w:t>that,</w:t>
-      </w:r>
-      <w:r>
-        <w:rPr>
-          <w:rFonts w:ascii="Garamond" w:hAnsi="Garamond"/>
-          <w:sz w:val="22"/>
-          <w:szCs w:val="22"/>
-        </w:rPr>
-        <w:t xml:space="preserve"> when viewed together, can be used as a “fingerprint” for </w:t>
-      </w:r>
-      <w:r>
-        <w:rPr>
-          <w:rFonts w:ascii="Garamond" w:hAnsi="Garamond"/>
-          <w:sz w:val="22"/>
-          <w:szCs w:val="22"/>
-        </w:rPr>
-        <w:t xml:space="preserve">stock- or watershed-specific </w:t>
-      </w:r>
-      <w:r>
-        <w:rPr>
-          <w:rFonts w:ascii="Garamond" w:hAnsi="Garamond"/>
-          <w:sz w:val="22"/>
-          <w:szCs w:val="22"/>
-        </w:rPr>
-        <w:t xml:space="preserve">identifier based on the unique pathways through to the marine environment. </w:t>
-      </w:r>
-      <w:r>
-        <w:rPr>
-          <w:rFonts w:ascii="Garamond" w:hAnsi="Garamond"/>
-          <w:sz w:val="22"/>
-          <w:szCs w:val="22"/>
-        </w:rPr>
-        <w:t xml:space="preserve">However, given the subtlety of these patterns as </w:t>
-      </w:r>
-      <w:r>
-        <w:rPr>
-          <w:rFonts w:ascii="Garamond" w:hAnsi="Garamond"/>
-          <w:sz w:val="22"/>
-          <w:szCs w:val="22"/>
-        </w:rPr>
-        <w:lastRenderedPageBreak/>
-        <w:t xml:space="preserve">well as the scale of potential combinations in a large river basin, these unique identifiers are not readily identifiable given traditional statistical tools or manual methods. </w:t>
+        <w:t xml:space="preserve"> ratios</w:t>
+      </w:r>
+      <w:r>
+        <w:rPr>
+          <w:rFonts w:ascii="Garamond" w:hAnsi="Garamond"/>
+          <w:sz w:val="22"/>
+          <w:szCs w:val="22"/>
+        </w:rPr>
+        <w:t xml:space="preserve"> among </w:t>
+      </w:r>
+      <w:r>
+        <w:rPr>
+          <w:rFonts w:ascii="Garamond" w:hAnsi="Garamond"/>
+          <w:sz w:val="22"/>
+          <w:szCs w:val="22"/>
+        </w:rPr>
+        <w:t xml:space="preserve">all three river systems </w:t>
+      </w:r>
+      <w:r>
+        <w:rPr>
+          <w:rFonts w:ascii="Garamond" w:hAnsi="Garamond"/>
+          <w:sz w:val="22"/>
+          <w:szCs w:val="22"/>
+        </w:rPr>
+        <w:t>prevent</w:t>
+      </w:r>
+      <w:r>
+        <w:rPr>
+          <w:rFonts w:ascii="Garamond" w:hAnsi="Garamond"/>
+          <w:sz w:val="22"/>
+          <w:szCs w:val="22"/>
+        </w:rPr>
+        <w:t>s</w:t>
+      </w:r>
+      <w:r>
+        <w:rPr>
+          <w:rFonts w:ascii="Garamond" w:hAnsi="Garamond"/>
+          <w:sz w:val="22"/>
+          <w:szCs w:val="22"/>
+        </w:rPr>
+        <w:t xml:space="preserve"> reliable assignments </w:t>
+      </w:r>
+      <w:r>
+        <w:rPr>
+          <w:rFonts w:ascii="Garamond" w:hAnsi="Garamond"/>
+          <w:sz w:val="22"/>
+          <w:szCs w:val="22"/>
+        </w:rPr>
+        <w:t xml:space="preserve">using the </w:t>
+      </w:r>
+      <w:r>
+        <w:rPr>
+          <w:rFonts w:ascii="Garamond" w:hAnsi="Garamond"/>
+          <w:sz w:val="22"/>
+          <w:szCs w:val="22"/>
+        </w:rPr>
+        <w:t>natal</w:t>
+      </w:r>
+      <w:r>
+        <w:rPr>
+          <w:rFonts w:ascii="Garamond" w:hAnsi="Garamond"/>
+          <w:sz w:val="22"/>
+          <w:szCs w:val="22"/>
+        </w:rPr>
+        <w:t xml:space="preserve"> freshwater</w:t>
+      </w:r>
+      <w:r>
+        <w:rPr>
+          <w:rFonts w:ascii="Garamond" w:hAnsi="Garamond"/>
+          <w:sz w:val="22"/>
+          <w:szCs w:val="22"/>
+        </w:rPr>
+        <w:t xml:space="preserve"> </w:t>
+      </w:r>
+      <w:r>
+        <w:rPr>
+          <w:rFonts w:ascii="Garamond" w:hAnsi="Garamond"/>
+          <w:sz w:val="22"/>
+          <w:szCs w:val="22"/>
+        </w:rPr>
+        <w:t>ratio</w:t>
+      </w:r>
+      <w:r>
+        <w:rPr>
+          <w:rFonts w:ascii="Garamond" w:hAnsi="Garamond"/>
+          <w:sz w:val="22"/>
+          <w:szCs w:val="22"/>
+        </w:rPr>
+        <w:t xml:space="preserve"> for marine-caught fish which could have originated from any of the three watersheds</w:t>
+      </w:r>
+      <w:r>
+        <w:rPr>
+          <w:rFonts w:ascii="Garamond" w:hAnsi="Garamond"/>
+          <w:sz w:val="22"/>
+          <w:szCs w:val="22"/>
+        </w:rPr>
+        <w:t xml:space="preserve"> (Figure 1).</w:t>
       </w:r>
     </w:p>
     <w:p>
@@ -1193,6 +1106,245 @@
           <w:sz w:val="22"/>
           <w:szCs w:val="22"/>
         </w:rPr>
+        <w:t xml:space="preserve">Otolith growth and isotopic incorporation occur continuously over an individual’s lifetime, producing a </w:t>
+      </w:r>
+      <w:r>
+        <w:rPr>
+          <w:rFonts w:ascii="Cambria Math" w:hAnsi="Cambria Math" w:cs="Cambria Math"/>
+          <w:sz w:val="22"/>
+          <w:szCs w:val="22"/>
+        </w:rPr>
+        <w:t>⁸⁷</w:t>
+      </w:r>
+      <w:r>
+        <w:rPr>
+          <w:rFonts w:ascii="Garamond" w:hAnsi="Garamond"/>
+          <w:sz w:val="22"/>
+          <w:szCs w:val="22"/>
+        </w:rPr>
+        <w:t>Sr/</w:t>
+      </w:r>
+      <w:r>
+        <w:rPr>
+          <w:rFonts w:ascii="Cambria Math" w:hAnsi="Cambria Math" w:cs="Cambria Math"/>
+          <w:sz w:val="22"/>
+          <w:szCs w:val="22"/>
+        </w:rPr>
+        <w:t>⁸⁶</w:t>
+      </w:r>
+      <w:r>
+        <w:rPr>
+          <w:rFonts w:ascii="Garamond" w:hAnsi="Garamond"/>
+          <w:sz w:val="22"/>
+          <w:szCs w:val="22"/>
+        </w:rPr>
+        <w:t>Sr time series along the growth axis that encodes sequential habitat use, relative growth, and maternal migration history</w:t>
+      </w:r>
+      <w:r>
+        <w:rPr>
+          <w:rFonts w:ascii="Garamond" w:hAnsi="Garamond"/>
+          <w:sz w:val="22"/>
+          <w:szCs w:val="22"/>
+        </w:rPr>
+        <w:t xml:space="preserve"> </w:t>
+      </w:r>
+      <w:r>
+        <w:rPr>
+          <w:rFonts w:ascii="Garamond" w:hAnsi="Garamond"/>
+          <w:sz w:val="22"/>
+          <w:szCs w:val="22"/>
+        </w:rPr>
+        <w:fldChar w:fldCharType="begin"/>
+      </w:r>
+      <w:r>
+        <w:rPr>
+          <w:rFonts w:ascii="Garamond" w:hAnsi="Garamond"/>
+          <w:sz w:val="22"/>
+          <w:szCs w:val="22"/>
+        </w:rPr>
+        <w:instrText xml:space="preserve"> ADDIN ZOTERO_ITEM CSL_CITATION {"citationID":"sawhq1ph","properties":{"formattedCitation":"(Hegg et al., 2019; Reis-Santos et al., 2022)","plainCitation":"(Hegg et al., 2019; Reis-Santos et al., 2022)","noteIndex":0},"citationItems":[{"id":3248,"uris":["http://zotero.org/users/8421274/items/FHA5HJVT"],"itemData":{"id":3248,"type":"article-journal","abstract":"Connecting maternal migratory behavior with the behavior and ecology of their progeny can reveal important details in the ecology of a population. One method for linking maternal migration to early juvenile life history is through maternal chemistry recorded in otoliths. Despite the wide use of maternal signatures to infer anadromy, the duration and dynamics of maternal otolith signatures are not well understood. Shifts in the elemental ratios and strontium isotope (87Sr/86Sr) chemistry in otoliths from juvenile Chinook salmon (Oncorhynchus tshawytscha) correlate with the timing of hatch and emergence, respectively, indicating a chemical marker of these ontological stages. Additionally, analysis of maternal signatures show that maternally derived 87Sr/86Sr may be influenced by equilibration of the mother to fresh water, and in some cases the 87Sr/86Sr signatures of the eggs can shift substantially after being laid. These results provide guidance in separating maternal and juvenile signatures as researchers increasingly target early juvenile otolith chemistry. These results also caution against the use of 87Sr/86Sr alone as a marker of anadromy in populations with major inland migrations.","container-title":"Canadian Journal of Fisheries and Aquatic Sciences","DOI":"10.1139/cjfas-2017-0341","ISSN":"0706-652X","issue":"1","journalAbbreviation":"Can. J. Fish. Aquat. Sci.","note":"publisher: NRC Research Press","page":"81-94","source":"cdnsciencepub.com (Atypon)","title":"What did you say about my mother? The complexities of maternally derived chemical signatures in otoliths","title-short":"What did you say about my mother?","volume":"76","author":[{"family":"Hegg","given":"Jens C."},{"family":"Kennedy","given":"Brian P."},{"family":"Chittaro","given":"Paul"}],"issued":{"date-parts":[["2019",1]]}}},{"id":2143,"uris":["http://zotero.org/users/8421274/items/H4CTDMKS"],"itemData":{"id":2143,"type":"article-journal","abstract":"Abstract\n            Chemical analysis of calcified structures continues to flourish, as analytical and technological advances enable researchers to tap into trace elements and isotopes taken up in otoliths and other archival tissues at ever greater resolution. Increasingly, these tracers are applied to refine age estimation and interpretation, and to chronicle responses to environmental stressors, linking these to ecological, physiological, and life-history processes. Here, we review emerging approaches and innovative research directions in otolith chemistry, as well as in the chemistry of other archival tissues, outlining their value for fisheries and ecosystem-based management, turning the spotlight on areas where such biomarkers can support decision making. We summarise recent milestones and the challenges that lie ahead to using otoliths and archival tissues as biomarkers, grouped into seven, rapidly expanding and application-oriented research areas that apply chemical analysis in a variety of contexts, namely: (1) supporting fish age estimation; (2) evaluating environmental stress, ecophysiology and individual performance; (3) confirming seafood provenance; (4) resolving connectivity and movement pathways; (5) characterising food webs and trophic interactions; (6) reconstructing reproductive life histories; and (7) tracing stock enhancement efforts. Emerging research directions that apply hard part chemistry to combat seafood fraud, quantify past food webs, as well as to reconcile growth, movement, thermal, metabolic, stress and reproductive life-histories provide opportunities to examine how harvesting and global change impact fish health and fisheries productivity. Ultimately, improved appreciation of the many practical benefits of archival tissue chemistry to fisheries and ecosystem-based management will support their increased implementation into routine monitoring.\n            \n              Graphical abstract","container-title":"Reviews in Fish Biology and Fisheries","DOI":"10.1007/s11160-022-09720-z","ISSN":"0960-3166, 1573-5184","journalAbbreviation":"Rev Fish Biol Fisheries","language":"en","source":"DOI.org (Crossref)","title":"Reading the biomineralized book of life: expanding otolith biogeochemical research and applications for fisheries and ecosystem-based management","title-short":"Reading the biomineralized book of life","URL":"https://link.springer.com/10.1007/s11160-022-09720-z","author":[{"family":"Reis-Santos","given":"Patrick"},{"family":"Gillanders","given":"Bronwyn M."},{"family":"Sturrock","given":"Anna M."},{"family":"Izzo","given":"Christopher"},{"family":"Oxman","given":"Dion S."},{"family":"Lueders-Dumont","given":"Jessica A."},{"family":"Hüssy","given":"Karin"},{"family":"Tanner","given":"Susanne E."},{"family":"Rogers","given":"Troy"},{"family":"Doubleday","given":"Zoë A."},{"family":"Andrews","given":"Allen H."},{"family":"Trueman","given":"Clive"},{"family":"Brophy","given":"Deirdre"},{"family":"Thiem","given":"Jason D."},{"family":"Baumgartner","given":"Lee J."},{"family":"Willmes","given":"Malte"},{"family":"Chung","given":"Ming-Tsung"},{"family":"Charapata","given":"Patrick"},{"family":"Johnson","given":"Rachel C."},{"family":"Trumble","given":"Stephen"},{"family":"Heimbrand","given":"Yvette"},{"family":"Limburg","given":"Karin E."},{"family":"Walther","given":"Benjamin D."}],"accessed":{"date-parts":[["2022",12,18]]},"issued":{"date-parts":[["2022",8,7]]}}}],"schema":"https://github.com/citation-style-language/schema/raw/master/csl-citation.json"} </w:instrText>
+      </w:r>
+      <w:r>
+        <w:rPr>
+          <w:rFonts w:ascii="Garamond" w:hAnsi="Garamond"/>
+          <w:sz w:val="22"/>
+          <w:szCs w:val="22"/>
+        </w:rPr>
+        <w:fldChar w:fldCharType="separate"/>
+      </w:r>
+      <w:r>
+        <w:rPr>
+          <w:rFonts w:ascii="Garamond" w:hAnsi="Garamond"/>
+          <w:noProof/>
+          <w:sz w:val="22"/>
+          <w:szCs w:val="22"/>
+        </w:rPr>
+        <w:t>(Hegg et al., 2019; Reis-Santos et al., 2022)</w:t>
+      </w:r>
+      <w:r>
+        <w:rPr>
+          <w:rFonts w:ascii="Garamond" w:hAnsi="Garamond"/>
+          <w:sz w:val="22"/>
+          <w:szCs w:val="22"/>
+        </w:rPr>
+        <w:fldChar w:fldCharType="end"/>
+      </w:r>
+      <w:r>
+        <w:rPr>
+          <w:rFonts w:ascii="Garamond" w:hAnsi="Garamond"/>
+          <w:sz w:val="22"/>
+          <w:szCs w:val="22"/>
+        </w:rPr>
+        <w:t xml:space="preserve">. </w:t>
+      </w:r>
+      <w:r>
+        <w:rPr>
+          <w:rFonts w:ascii="Garamond" w:hAnsi="Garamond"/>
+          <w:sz w:val="22"/>
+          <w:szCs w:val="22"/>
+        </w:rPr>
+        <w:t xml:space="preserve">These patterns can be useful for reconstructing life histories. However, </w:t>
+      </w:r>
+      <w:r>
+        <w:rPr>
+          <w:rFonts w:ascii="Garamond" w:hAnsi="Garamond"/>
+          <w:sz w:val="22"/>
+          <w:szCs w:val="22"/>
+        </w:rPr>
+        <w:t>rapid movements through multiple environments may prevent full isotopic equilibration</w:t>
+      </w:r>
+      <w:r>
+        <w:rPr>
+          <w:rFonts w:ascii="Garamond" w:hAnsi="Garamond"/>
+          <w:sz w:val="22"/>
+          <w:szCs w:val="22"/>
+        </w:rPr>
+        <w:t xml:space="preserve"> and o</w:t>
+      </w:r>
+      <w:r>
+        <w:rPr>
+          <w:rFonts w:ascii="Garamond" w:hAnsi="Garamond"/>
+          <w:sz w:val="22"/>
+          <w:szCs w:val="22"/>
+        </w:rPr>
+        <w:t xml:space="preserve">tolith </w:t>
+      </w:r>
+      <w:r>
+        <w:rPr>
+          <w:rFonts w:ascii="Cambria Math" w:hAnsi="Cambria Math" w:cs="Cambria Math"/>
+          <w:sz w:val="22"/>
+          <w:szCs w:val="22"/>
+        </w:rPr>
+        <w:t>⁸⁷</w:t>
+      </w:r>
+      <w:r>
+        <w:rPr>
+          <w:rFonts w:ascii="Garamond" w:hAnsi="Garamond"/>
+          <w:sz w:val="22"/>
+          <w:szCs w:val="22"/>
+        </w:rPr>
+        <w:t>Sr/</w:t>
+      </w:r>
+      <w:r>
+        <w:rPr>
+          <w:rFonts w:ascii="Cambria Math" w:hAnsi="Cambria Math" w:cs="Cambria Math"/>
+          <w:sz w:val="22"/>
+          <w:szCs w:val="22"/>
+        </w:rPr>
+        <w:t>⁸⁶</w:t>
+      </w:r>
+      <w:r>
+        <w:rPr>
+          <w:rFonts w:ascii="Garamond" w:hAnsi="Garamond"/>
+          <w:sz w:val="22"/>
+          <w:szCs w:val="22"/>
+        </w:rPr>
+        <w:t>Sr</w:t>
+      </w:r>
+      <w:r>
+        <w:rPr>
+          <w:rFonts w:ascii="Garamond" w:hAnsi="Garamond"/>
+          <w:sz w:val="22"/>
+          <w:szCs w:val="22"/>
+        </w:rPr>
+        <w:t xml:space="preserve"> values</w:t>
+      </w:r>
+      <w:r>
+        <w:rPr>
+          <w:rFonts w:ascii="Garamond" w:hAnsi="Garamond"/>
+          <w:sz w:val="22"/>
+          <w:szCs w:val="22"/>
+        </w:rPr>
+        <w:t xml:space="preserve"> may</w:t>
+      </w:r>
+      <w:r>
+        <w:rPr>
+          <w:rFonts w:ascii="Garamond" w:hAnsi="Garamond"/>
+          <w:sz w:val="22"/>
+          <w:szCs w:val="22"/>
+        </w:rPr>
+        <w:t xml:space="preserve"> not directly reflect those of </w:t>
+      </w:r>
+      <w:r>
+        <w:rPr>
+          <w:rFonts w:ascii="Garamond" w:hAnsi="Garamond"/>
+          <w:sz w:val="22"/>
+          <w:szCs w:val="22"/>
+        </w:rPr>
+        <w:t xml:space="preserve">each subsequent environment. </w:t>
+      </w:r>
+      <w:r>
+        <w:rPr>
+          <w:rFonts w:ascii="Garamond" w:hAnsi="Garamond"/>
+          <w:sz w:val="22"/>
+          <w:szCs w:val="22"/>
+        </w:rPr>
+        <w:t>For Pacific salmon, which migrate quickly through sequential habitats to the ocean, otolith strontium data may contain subtle patterns that together form a “fingerprint” capable of identifying stocks or watersheds based on unique migration pathways.</w:t>
+      </w:r>
+      <w:r>
+        <w:rPr>
+          <w:rFonts w:ascii="Garamond" w:hAnsi="Garamond"/>
+          <w:sz w:val="22"/>
+          <w:szCs w:val="22"/>
+        </w:rPr>
+        <w:t xml:space="preserve"> However</w:t>
+      </w:r>
+      <w:r>
+        <w:rPr>
+          <w:rFonts w:ascii="Garamond" w:hAnsi="Garamond"/>
+          <w:sz w:val="22"/>
+          <w:szCs w:val="22"/>
+        </w:rPr>
+        <w:t xml:space="preserve">, because these patterns are subtle and the number of possible combinations in large river basins is high, such identifiers are difficult to detect using traditional statistical or manual </w:t>
+      </w:r>
+      <w:proofErr w:type="spellStart"/>
+      <w:r>
+        <w:rPr>
+          <w:rFonts w:ascii="Garamond" w:hAnsi="Garamond"/>
+          <w:sz w:val="22"/>
+          <w:szCs w:val="22"/>
+        </w:rPr>
+        <w:t>methods.</w:t>
+      </w:r>
+      <w:proofErr w:type="spellEnd"/>
+    </w:p>
+    <w:p>
+      <w:pPr>
+        <w:spacing w:line="480" w:lineRule="auto"/>
+        <w:ind w:firstLine="720"/>
+        <w:rPr>
+          <w:rFonts w:ascii="Garamond" w:hAnsi="Garamond"/>
+          <w:sz w:val="22"/>
+          <w:szCs w:val="22"/>
+        </w:rPr>
+      </w:pPr>
+      <w:r>
+        <w:rPr>
+          <w:rFonts w:ascii="Garamond" w:hAnsi="Garamond"/>
+          <w:sz w:val="22"/>
+          <w:szCs w:val="22"/>
+        </w:rPr>
+        <w:lastRenderedPageBreak/>
         <w:t xml:space="preserve">Machine learning methods, which are particularly well-suited to interpreting complex, multidimensional patterns in datasets, have only recently been applied to otolith chemical analysis. However, their limited applications have shown promising performance relative to traditional techniques </w:t>
       </w:r>
       <w:r>
@@ -1346,7 +1498,6 @@
           <w:bCs/>
           <w:sz w:val="32"/>
           <w:szCs w:val="32"/>
-          <w:u w:val="single"/>
         </w:rPr>
       </w:pPr>
       <w:r>
@@ -1356,7 +1507,6 @@
           <w:bCs/>
           <w:sz w:val="32"/>
           <w:szCs w:val="32"/>
-          <w:u w:val="single"/>
         </w:rPr>
         <w:t xml:space="preserve">Methods </w:t>
       </w:r>
@@ -1373,17 +1523,18 @@
           <w:u w:val="single"/>
         </w:rPr>
       </w:pPr>
-      <w:r>
+    </w:p>
+    <w:p>
+      <w:pPr>
+        <w:spacing w:line="480" w:lineRule="auto"/>
         <w:rPr>
           <w:rFonts w:ascii="Garamond" w:hAnsi="Garamond"/>
           <w:b/>
           <w:bCs/>
           <w:sz w:val="22"/>
           <w:szCs w:val="22"/>
-          <w:u w:val="single"/>
-        </w:rPr>
-        <w:t xml:space="preserve">Otolith </w:t>
-      </w:r>
+        </w:rPr>
+      </w:pPr>
       <w:r>
         <w:rPr>
           <w:rFonts w:ascii="Garamond" w:hAnsi="Garamond"/>
@@ -1391,9 +1542,28 @@
           <w:bCs/>
           <w:sz w:val="22"/>
           <w:szCs w:val="22"/>
-          <w:u w:val="single"/>
-        </w:rPr>
-        <w:t xml:space="preserve">Laser Ablation Data. </w:t>
+        </w:rPr>
+        <w:t>Otolith</w:t>
+      </w:r>
+      <w:r>
+        <w:rPr>
+          <w:rFonts w:ascii="Garamond" w:hAnsi="Garamond"/>
+          <w:b/>
+          <w:bCs/>
+          <w:sz w:val="22"/>
+          <w:szCs w:val="22"/>
+        </w:rPr>
+        <w:t xml:space="preserve"> Data</w:t>
+      </w:r>
+      <w:r>
+        <w:rPr>
+          <w:rFonts w:ascii="Garamond" w:hAnsi="Garamond"/>
+          <w:b/>
+          <w:bCs/>
+          <w:sz w:val="22"/>
+          <w:szCs w:val="22"/>
+        </w:rPr>
+        <w:t xml:space="preserve">: </w:t>
       </w:r>
     </w:p>
     <w:p>
@@ -1563,7 +1733,47 @@
           <w:sz w:val="22"/>
           <w:szCs w:val="22"/>
         </w:rPr>
-        <w:t xml:space="preserve">, </w:t>
+        <w:t>, mounted on microscope slides, and polished to enhance clarity</w:t>
+      </w:r>
+      <w:r>
+        <w:rPr>
+          <w:rFonts w:ascii="Garamond" w:hAnsi="Garamond"/>
+          <w:sz w:val="22"/>
+          <w:szCs w:val="22"/>
+        </w:rPr>
+        <w:t xml:space="preserve"> </w:t>
+      </w:r>
+      <w:r>
+        <w:rPr>
+          <w:rFonts w:ascii="Garamond" w:hAnsi="Garamond"/>
+          <w:sz w:val="22"/>
+          <w:szCs w:val="22"/>
+        </w:rPr>
+        <w:t>Samples</w:t>
+      </w:r>
+      <w:r>
+        <w:rPr>
+          <w:rFonts w:ascii="Garamond" w:hAnsi="Garamond"/>
+          <w:sz w:val="22"/>
+          <w:szCs w:val="22"/>
+        </w:rPr>
+        <w:t xml:space="preserve"> were</w:t>
+      </w:r>
+      <w:r>
+        <w:rPr>
+          <w:rFonts w:ascii="Garamond" w:hAnsi="Garamond"/>
+          <w:sz w:val="22"/>
+          <w:szCs w:val="22"/>
+        </w:rPr>
+        <w:t xml:space="preserve"> then</w:t>
+      </w:r>
+      <w:r>
+        <w:rPr>
+          <w:rFonts w:ascii="Garamond" w:hAnsi="Garamond"/>
+          <w:sz w:val="22"/>
+          <w:szCs w:val="22"/>
+        </w:rPr>
+        <w:t xml:space="preserve"> analyzed using Laser </w:t>
       </w:r>
       <w:r>
         <w:rPr>
@@ -1572,64 +1782,7 @@
           <w:szCs w:val="22"/>
         </w:rPr>
         <w:lastRenderedPageBreak/>
-        <w:t>mounted on microscope slides, and polished to enhance clarity</w:t>
-      </w:r>
-      <w:r>
-        <w:rPr>
-          <w:rFonts w:ascii="Garamond" w:hAnsi="Garamond"/>
-          <w:sz w:val="22"/>
-          <w:szCs w:val="22"/>
-        </w:rPr>
-        <w:t xml:space="preserve"> </w:t>
-      </w:r>
-      <w:r>
-        <w:rPr>
-          <w:rFonts w:ascii="Garamond" w:hAnsi="Garamond"/>
-          <w:sz w:val="22"/>
-          <w:szCs w:val="22"/>
-          <w:highlight w:val="yellow"/>
-        </w:rPr>
-        <w:t>(CITE)</w:t>
-      </w:r>
-      <w:r>
-        <w:rPr>
-          <w:rFonts w:ascii="Garamond" w:hAnsi="Garamond"/>
-          <w:sz w:val="22"/>
-          <w:szCs w:val="22"/>
-        </w:rPr>
-        <w:t xml:space="preserve">. </w:t>
-      </w:r>
-      <w:r>
-        <w:rPr>
-          <w:rFonts w:ascii="Garamond" w:hAnsi="Garamond"/>
-          <w:sz w:val="22"/>
-          <w:szCs w:val="22"/>
-        </w:rPr>
-        <w:t>Samples</w:t>
-      </w:r>
-      <w:r>
-        <w:rPr>
-          <w:rFonts w:ascii="Garamond" w:hAnsi="Garamond"/>
-          <w:sz w:val="22"/>
-          <w:szCs w:val="22"/>
-        </w:rPr>
-        <w:t xml:space="preserve"> were</w:t>
-      </w:r>
-      <w:r>
-        <w:rPr>
-          <w:rFonts w:ascii="Garamond" w:hAnsi="Garamond"/>
-          <w:sz w:val="22"/>
-          <w:szCs w:val="22"/>
-        </w:rPr>
-        <w:t xml:space="preserve"> then</w:t>
-      </w:r>
-      <w:r>
-        <w:rPr>
-          <w:rFonts w:ascii="Garamond" w:hAnsi="Garamond"/>
-          <w:sz w:val="22"/>
-          <w:szCs w:val="22"/>
-        </w:rPr>
-        <w:t xml:space="preserve"> analyzed using Laser Ablation Inductively Coupled Plasma Mass Spectrometry (LA-ICP-MS) at the University of Utah Strontium Metals Lab, with the exception of 2022 Kuskokwim samples</w:t>
+        <w:t>Ablation Inductively Coupled Plasma Mass Spectrometry (LA-ICP-MS) at the University of Utah Strontium Metals Lab, with the exception of 2022 Kuskokwim samples</w:t>
       </w:r>
       <w:r>
         <w:rPr>
@@ -2555,7 +2708,23 @@
           <w:sz w:val="22"/>
           <w:szCs w:val="22"/>
         </w:rPr>
-        <w:t>This process resulted in three versions of the full dataset: GAM-</w:t>
+        <w:t>This process resulted in three versions of the full dataset: GAM-smoothed, MA-smoothed, and raw LA data.</w:t>
+      </w:r>
+      <w:r>
+        <w:rPr>
+          <w:rFonts w:ascii="Garamond" w:hAnsi="Garamond"/>
+          <w:sz w:val="22"/>
+          <w:szCs w:val="22"/>
+        </w:rPr>
+        <w:t xml:space="preserve"> </w:t>
+      </w:r>
+      <w:r>
+        <w:rPr>
+          <w:rFonts w:ascii="Garamond" w:hAnsi="Garamond"/>
+          <w:sz w:val="22"/>
+          <w:szCs w:val="22"/>
+        </w:rPr>
+        <w:t xml:space="preserve">Finally, variation in size among individuals produces time series </w:t>
       </w:r>
       <w:r>
         <w:rPr>
@@ -2564,23 +2733,7 @@
           <w:szCs w:val="22"/>
         </w:rPr>
         <w:lastRenderedPageBreak/>
-        <w:t>smoothed, MA-smoothed, and raw LA data.</w:t>
-      </w:r>
-      <w:r>
-        <w:rPr>
-          <w:rFonts w:ascii="Garamond" w:hAnsi="Garamond"/>
-          <w:sz w:val="22"/>
-          <w:szCs w:val="22"/>
-        </w:rPr>
-        <w:t xml:space="preserve"> </w:t>
-      </w:r>
-      <w:r>
-        <w:rPr>
-          <w:rFonts w:ascii="Garamond" w:hAnsi="Garamond"/>
-          <w:sz w:val="22"/>
-          <w:szCs w:val="22"/>
-        </w:rPr>
-        <w:t xml:space="preserve">Finally, variation in size among individuals produces time series of differing lengths. However, many machine learning algorithms require fixed-length vectors. To address this, all samples were interpolated to a common length, defined as the average length of </w:t>
+        <w:t xml:space="preserve">of differing lengths. However, many machine learning algorithms require fixed-length vectors. To address this, all samples were interpolated to a common length, defined as the average length of </w:t>
       </w:r>
       <w:proofErr w:type="spellStart"/>
       <w:r>
@@ -2865,6 +3018,19 @@
         </w:rPr>
         <w:t xml:space="preserve">. One individual from each watershed was chosen to illustrate this variability. </w:t>
       </w:r>
+    </w:p>
+    <w:p>
+      <w:pPr>
+        <w:spacing w:line="480" w:lineRule="auto"/>
+        <w:rPr>
+          <w:rFonts w:ascii="Garamond" w:hAnsi="Garamond"/>
+          <w:b/>
+          <w:bCs/>
+          <w:sz w:val="22"/>
+          <w:szCs w:val="22"/>
+          <w:u w:val="single"/>
+        </w:rPr>
+      </w:pPr>
     </w:p>
     <w:p>
       <w:pPr>

</xml_diff>

<commit_message>
full draft, placeholder discussion
</commit_message>
<xml_diff>
--- a/Docs/Machine learning applied to otolith timeseries data to discriminate river of origin for Western Alaska Salmon.docx
+++ b/Docs/Machine learning applied to otolith timeseries data to discriminate river of origin for Western Alaska Salmon.docx
@@ -1315,18 +1315,8 @@
           <w:sz w:val="22"/>
           <w:szCs w:val="22"/>
         </w:rPr>
-        <w:t xml:space="preserve">, because these patterns are subtle and the number of possible combinations in large river basins is high, such identifiers are difficult to detect using traditional statistical or manual </w:t>
-      </w:r>
-      <w:proofErr w:type="spellStart"/>
-      <w:r>
-        <w:rPr>
-          <w:rFonts w:ascii="Garamond" w:hAnsi="Garamond"/>
-          <w:sz w:val="22"/>
-          <w:szCs w:val="22"/>
-        </w:rPr>
-        <w:t>methods.</w:t>
-      </w:r>
-      <w:proofErr w:type="spellEnd"/>
+        <w:t>, because these patterns are subtle and the number of possible combinations in large river basins is high, such identifiers are difficult to detect using traditional statistical or manual methods.</w:t>
+      </w:r>
     </w:p>
     <w:p>
       <w:pPr>
@@ -1741,6 +1731,115 @@
           <w:sz w:val="22"/>
           <w:szCs w:val="22"/>
         </w:rPr>
+        <w:fldChar w:fldCharType="begin"/>
+      </w:r>
+      <w:r>
+        <w:rPr>
+          <w:rFonts w:ascii="Garamond" w:hAnsi="Garamond"/>
+          <w:sz w:val="22"/>
+          <w:szCs w:val="22"/>
+        </w:rPr>
+        <w:instrText xml:space="preserve"> ADDIN ZOTERO_ITEM CSL_CITATION {"citationID":"UdeDBfeN","properties":{"formattedCitation":"(Donohoe &amp; Zimmerman, 2010; Zimmerman &amp; Reeves, 2002)","plainCitation":"(Donohoe &amp; Zimmerman, 2010; Zimmerman &amp; Reeves, 2002)","noteIndex":0},"citationItems":[{"id":4778,"uris":["http://zotero.org/users/8421274/items/QJZIBTQC"],"itemData":{"id":4778,"type":"article-journal","abstract":"Beam-based analytical methods are widely used to measure the concentrations of elements and isotopes in otoliths. These methods usually require that otoliths be individually mounted and prepared to properly expose the desired growth region to the analytical beam. Most analytical instruments, such as LA-ICPMS and ion and electron microprobes, have sample holders that will accept only one to six slides or mounts at a time. We describe a method of mounting otoliths that allows for easy transfer of many otoliths to a single mount after they have been prepared. Such an approach increases the number of otoliths that can be analyzed in a single session by reducing the need open the sample chamber to exchange slides—a particularly time consuming step on instruments that operate under vacuum. For ion and electron microprobes, the method also greatly reduces the number of slides that must be coated with an electrical conductor prior to analysis. In this method, a narrow strip of cover glass is first glued at one end to a standard microscope slide. The otolith is then mounted in thermoplastic resin on the opposite, free end of the strip. The otolith can then be ground and flipped, if needed, by reheating the mounting medium. After otolith preparation is complete, the cover glass is cut with a scribe to free the otolith and up to 20 small otoliths can be arranged on a single petrographic slide.","container-title":"Environmental Biology of Fishes","DOI":"10.1007/s10641-010-9680-3","ISSN":"1573-5133","issue":"3","journalAbbreviation":"Environ Biol Fish","language":"en","page":"473-477","source":"Springer Link","title":"A method of mounting multiple otoliths for beam-based microchemical analyses","volume":"89","author":[{"family":"Donohoe","given":"Christopher J."},{"family":"Zimmerman","given":"Christian E."}],"issued":{"date-parts":[["2010",11,1]]}}},{"id":4132,"uris":["http://zotero.org/users/8421274/items/5YINANGC"],"itemData":{"id":4132,"type":"article-journal","abstract":"Comparisons of strontium:calcium (Sr: Ca) ratios in otolith primordia and freshwater growth regions were used to identify the progeny of steelhead Oncorhynchus mykiss (anadromous rainbow trout) and resident rainbow trout in the Deschutes River, Oregon. We cultured progeny of known adult steelhead and resident rainbow trout to confirm the relationship between Sr:Ca ratios in otolith primordia and the life history of the maternal parent. The mean (±SD) Sr:Ca ratio was significantly higher in the otolith primordia of the progeny of steelhead (0.001461 ± 0.00029; n = 100) than in those of the progeny of resident rainbow trout (0.000829 ± 0.000012; n = 100). We used comparisons of Sr:Ca ratios in the primordia and first-summer growth regions of otoliths to determine the maternal origin of unknown O. mykiss juveniles (n = 272) collected from rearing habitats within the main-stem Deschutes River and tributary rearing habitats and thus to ascertain the relative proportion of each life history morph in each rearing habitat. Resident rainbow trout fry dominated the bimonthly samples collected from main-stem rearing habitats between May and November 1995. Steelhead fry dominated samples collected from below waterfalls on two tributaries in 1996 and 1998.","container-title":"Transactions of the American Fisheries Society","DOI":"10.1577/1548-8659(2002)131&lt;0986:IOSARR&gt;2.0.CO;2","ISSN":"0002-8487","issue":"5","note":"publisher: Taylor &amp; Francis\n_eprint: https://doi.org/10.1577/1548-8659(2002)131&lt;0986:IOSARR&gt;2.0.CO;2","page":"986-993","source":"Taylor and Francis+NEJM","title":"Identification of Steelhead and Resident Rainbow Trout Progeny in the Deschutes River, Oregon, Revealed with Otolith Microchemistry","volume":"131","author":[{"family":"Zimmerman","given":"Christian E."},{"family":"Reeves","given":"Gordon H."}],"issued":{"date-parts":[["2002",9,1]]}}}],"schema":"https://github.com/citation-style-language/schema/raw/master/csl-citation.json"} </w:instrText>
+      </w:r>
+      <w:r>
+        <w:rPr>
+          <w:rFonts w:ascii="Garamond" w:hAnsi="Garamond"/>
+          <w:sz w:val="22"/>
+          <w:szCs w:val="22"/>
+        </w:rPr>
+        <w:fldChar w:fldCharType="separate"/>
+      </w:r>
+      <w:r>
+        <w:rPr>
+          <w:rFonts w:ascii="Garamond" w:hAnsi="Garamond"/>
+          <w:noProof/>
+          <w:sz w:val="22"/>
+          <w:szCs w:val="22"/>
+        </w:rPr>
+        <w:t xml:space="preserve">(Donohoe &amp; Zimmerman, 2010; Zimmerman </w:t>
+      </w:r>
+      <w:r>
+        <w:rPr>
+          <w:rFonts w:ascii="Garamond" w:hAnsi="Garamond"/>
+          <w:noProof/>
+          <w:sz w:val="22"/>
+          <w:szCs w:val="22"/>
+        </w:rPr>
+        <w:lastRenderedPageBreak/>
+        <w:t>&amp; Reeves, 2002)</w:t>
+      </w:r>
+      <w:r>
+        <w:rPr>
+          <w:rFonts w:ascii="Garamond" w:hAnsi="Garamond"/>
+          <w:sz w:val="22"/>
+          <w:szCs w:val="22"/>
+        </w:rPr>
+        <w:fldChar w:fldCharType="end"/>
+      </w:r>
+      <w:r>
+        <w:rPr>
+          <w:rFonts w:ascii="Garamond" w:hAnsi="Garamond"/>
+          <w:sz w:val="22"/>
+          <w:szCs w:val="22"/>
+        </w:rPr>
+        <w:t xml:space="preserve">. </w:t>
+      </w:r>
+      <w:r>
+        <w:rPr>
+          <w:rFonts w:ascii="Garamond" w:hAnsi="Garamond"/>
+          <w:sz w:val="22"/>
+          <w:szCs w:val="22"/>
+        </w:rPr>
+        <w:t>Samples</w:t>
+      </w:r>
+      <w:r>
+        <w:rPr>
+          <w:rFonts w:ascii="Garamond" w:hAnsi="Garamond"/>
+          <w:sz w:val="22"/>
+          <w:szCs w:val="22"/>
+        </w:rPr>
+        <w:t xml:space="preserve"> were</w:t>
+      </w:r>
+      <w:r>
+        <w:rPr>
+          <w:rFonts w:ascii="Garamond" w:hAnsi="Garamond"/>
+          <w:sz w:val="22"/>
+          <w:szCs w:val="22"/>
+        </w:rPr>
+        <w:t xml:space="preserve"> then</w:t>
+      </w:r>
+      <w:r>
+        <w:rPr>
+          <w:rFonts w:ascii="Garamond" w:hAnsi="Garamond"/>
+          <w:sz w:val="22"/>
+          <w:szCs w:val="22"/>
+        </w:rPr>
+        <w:t xml:space="preserve"> analyzed using Laser Ablation Inductively Coupled Plasma Mass Spectrometry (LA-ICP-MS) at the University of Utah Strontium Metals Lab, </w:t>
+      </w:r>
+      <w:proofErr w:type="gramStart"/>
+      <w:r>
+        <w:rPr>
+          <w:rFonts w:ascii="Garamond" w:hAnsi="Garamond"/>
+          <w:sz w:val="22"/>
+          <w:szCs w:val="22"/>
+        </w:rPr>
+        <w:t>with the exception of</w:t>
+      </w:r>
+      <w:proofErr w:type="gramEnd"/>
+      <w:r>
+        <w:rPr>
+          <w:rFonts w:ascii="Garamond" w:hAnsi="Garamond"/>
+          <w:sz w:val="22"/>
+          <w:szCs w:val="22"/>
+        </w:rPr>
+        <w:t xml:space="preserve"> 2022 Kuskokwim samples</w:t>
+      </w:r>
+      <w:r>
+        <w:rPr>
+          <w:rFonts w:ascii="Garamond" w:hAnsi="Garamond"/>
+          <w:sz w:val="22"/>
+          <w:szCs w:val="22"/>
+        </w:rPr>
         <w:t xml:space="preserve"> </w:t>
       </w:r>
       <w:r>
@@ -1749,40 +1848,23 @@
           <w:sz w:val="22"/>
           <w:szCs w:val="22"/>
         </w:rPr>
-        <w:t>Samples</w:t>
-      </w:r>
-      <w:r>
-        <w:rPr>
-          <w:rFonts w:ascii="Garamond" w:hAnsi="Garamond"/>
-          <w:sz w:val="22"/>
-          <w:szCs w:val="22"/>
-        </w:rPr>
-        <w:t xml:space="preserve"> were</w:t>
-      </w:r>
-      <w:r>
-        <w:rPr>
-          <w:rFonts w:ascii="Garamond" w:hAnsi="Garamond"/>
-          <w:sz w:val="22"/>
-          <w:szCs w:val="22"/>
-        </w:rPr>
-        <w:t xml:space="preserve"> then</w:t>
-      </w:r>
-      <w:r>
-        <w:rPr>
-          <w:rFonts w:ascii="Garamond" w:hAnsi="Garamond"/>
-          <w:sz w:val="22"/>
-          <w:szCs w:val="22"/>
-        </w:rPr>
-        <w:t xml:space="preserve"> analyzed using Laser </w:t>
-      </w:r>
-      <w:r>
-        <w:rPr>
-          <w:rFonts w:ascii="Garamond" w:hAnsi="Garamond"/>
-          <w:sz w:val="22"/>
-          <w:szCs w:val="22"/>
-        </w:rPr>
-        <w:lastRenderedPageBreak/>
-        <w:t>Ablation Inductively Coupled Plasma Mass Spectrometry (LA-ICP-MS) at the University of Utah Strontium Metals Lab, with the exception of 2022 Kuskokwim samples</w:t>
+        <w:t>which were processed at the</w:t>
+      </w:r>
+      <w:r>
+        <w:rPr>
+          <w:rFonts w:ascii="Garamond" w:hAnsi="Garamond"/>
+          <w:sz w:val="22"/>
+          <w:szCs w:val="22"/>
+        </w:rPr>
+        <w:t xml:space="preserve"> W.M. Keck Collaboratory for Plasma Spectrometry </w:t>
+      </w:r>
+      <w:r>
+        <w:rPr>
+          <w:rFonts w:ascii="Garamond" w:hAnsi="Garamond"/>
+          <w:sz w:val="22"/>
+          <w:szCs w:val="22"/>
+        </w:rPr>
+        <w:t>at Oregon State University.</w:t>
       </w:r>
       <w:r>
         <w:rPr>
@@ -1798,7 +1880,23 @@
           <w:sz w:val="22"/>
           <w:szCs w:val="22"/>
         </w:rPr>
-        <w:t xml:space="preserve">which were processed at the </w:t>
+        <w:t xml:space="preserve">Laser ablation </w:t>
+      </w:r>
+      <w:r>
+        <w:rPr>
+          <w:rFonts w:ascii="Garamond" w:hAnsi="Garamond"/>
+          <w:sz w:val="22"/>
+          <w:szCs w:val="22"/>
+        </w:rPr>
+        <w:t>was preformed from the core to just after the onset of the marine signature along the dorsal lobe</w:t>
+      </w:r>
+      <w:r>
+        <w:rPr>
+          <w:rFonts w:ascii="Garamond" w:hAnsi="Garamond"/>
+          <w:sz w:val="22"/>
+          <w:szCs w:val="22"/>
+        </w:rPr>
+        <w:t xml:space="preserve"> scanning at </w:t>
       </w:r>
       <w:commentRangeStart w:id="0"/>
       <w:r>
@@ -1807,7 +1905,25 @@
           <w:sz w:val="22"/>
           <w:szCs w:val="22"/>
         </w:rPr>
-        <w:t xml:space="preserve">Keck Lab </w:t>
+        <w:t xml:space="preserve">[ insert specifications here for </w:t>
+      </w:r>
+      <w:proofErr w:type="spellStart"/>
+      <w:r>
+        <w:rPr>
+          <w:rFonts w:ascii="Garamond" w:hAnsi="Garamond"/>
+          <w:sz w:val="22"/>
+          <w:szCs w:val="22"/>
+        </w:rPr>
+        <w:t>icpms</w:t>
+      </w:r>
+      <w:proofErr w:type="spellEnd"/>
+      <w:r>
+        <w:rPr>
+          <w:rFonts w:ascii="Garamond" w:hAnsi="Garamond"/>
+          <w:sz w:val="22"/>
+          <w:szCs w:val="22"/>
+        </w:rPr>
+        <w:t xml:space="preserve">]. </w:t>
       </w:r>
       <w:commentRangeEnd w:id="0"/>
       <w:r>
@@ -1822,7 +1938,23 @@
           <w:sz w:val="22"/>
           <w:szCs w:val="22"/>
         </w:rPr>
-        <w:t>at Oregon State University.</w:t>
+        <w:t>The resulting data</w:t>
+      </w:r>
+      <w:r>
+        <w:rPr>
+          <w:rFonts w:ascii="Garamond" w:hAnsi="Garamond"/>
+          <w:sz w:val="22"/>
+          <w:szCs w:val="22"/>
+        </w:rPr>
+        <w:t xml:space="preserve">set </w:t>
+      </w:r>
+      <w:r>
+        <w:rPr>
+          <w:rFonts w:ascii="Garamond" w:hAnsi="Garamond"/>
+          <w:sz w:val="22"/>
+          <w:szCs w:val="22"/>
+        </w:rPr>
+        <w:t>includes</w:t>
       </w:r>
       <w:r>
         <w:rPr>
@@ -1838,89 +1970,64 @@
           <w:sz w:val="22"/>
           <w:szCs w:val="22"/>
         </w:rPr>
-        <w:t xml:space="preserve">Laser ablation </w:t>
-      </w:r>
-      <w:r>
-        <w:rPr>
-          <w:rFonts w:ascii="Garamond" w:hAnsi="Garamond"/>
-          <w:sz w:val="22"/>
-          <w:szCs w:val="22"/>
-        </w:rPr>
-        <w:t>was preformed from the core to just after the onset of the marine signature along the dorsal lobe</w:t>
-      </w:r>
-      <w:r>
-        <w:rPr>
-          <w:rFonts w:ascii="Garamond" w:hAnsi="Garamond"/>
-          <w:sz w:val="22"/>
-          <w:szCs w:val="22"/>
-        </w:rPr>
-        <w:t xml:space="preserve"> scanning at </w:t>
-      </w:r>
-      <w:commentRangeStart w:id="1"/>
-      <w:r>
-        <w:rPr>
-          <w:rFonts w:ascii="Garamond" w:hAnsi="Garamond"/>
-          <w:sz w:val="22"/>
-          <w:szCs w:val="22"/>
-        </w:rPr>
-        <w:t xml:space="preserve">[ insert specifications here for </w:t>
-      </w:r>
-      <w:proofErr w:type="spellStart"/>
-      <w:r>
-        <w:rPr>
-          <w:rFonts w:ascii="Garamond" w:hAnsi="Garamond"/>
-          <w:sz w:val="22"/>
-          <w:szCs w:val="22"/>
-        </w:rPr>
-        <w:t>icpms</w:t>
-      </w:r>
-      <w:proofErr w:type="spellEnd"/>
-      <w:r>
-        <w:rPr>
-          <w:rFonts w:ascii="Garamond" w:hAnsi="Garamond"/>
-          <w:sz w:val="22"/>
-          <w:szCs w:val="22"/>
-        </w:rPr>
-        <w:t xml:space="preserve">]. </w:t>
-      </w:r>
-      <w:commentRangeEnd w:id="1"/>
-      <w:r>
-        <w:rPr>
-          <w:rStyle w:val="CommentReference"/>
-        </w:rPr>
-        <w:commentReference w:id="1"/>
-      </w:r>
-      <w:r>
-        <w:rPr>
-          <w:rFonts w:ascii="Garamond" w:hAnsi="Garamond"/>
-          <w:sz w:val="22"/>
-          <w:szCs w:val="22"/>
-        </w:rPr>
-        <w:t xml:space="preserve">The resulting dataset </w:t>
-      </w:r>
-      <w:r>
-        <w:rPr>
-          <w:rFonts w:ascii="Garamond" w:hAnsi="Garamond"/>
-          <w:sz w:val="22"/>
-          <w:szCs w:val="22"/>
-        </w:rPr>
-        <w:t>includes</w:t>
-      </w:r>
-      <w:r>
-        <w:rPr>
-          <w:rFonts w:ascii="Garamond" w:hAnsi="Garamond"/>
-          <w:sz w:val="22"/>
-          <w:szCs w:val="22"/>
-        </w:rPr>
-        <w:t xml:space="preserve"> </w:t>
-      </w:r>
-      <w:r>
-        <w:rPr>
-          <w:rFonts w:ascii="Garamond" w:hAnsi="Garamond"/>
-          <w:sz w:val="22"/>
-          <w:szCs w:val="22"/>
-        </w:rPr>
-        <w:t xml:space="preserve">a concurrently collected timeseries of Sr8786 and Sr88 along the same transect for all individuals. </w:t>
+        <w:t xml:space="preserve">a concurrently collected timeseries of </w:t>
+      </w:r>
+      <w:r>
+        <w:rPr>
+          <w:rFonts w:ascii="Cambria Math" w:hAnsi="Cambria Math" w:cs="Cambria Math"/>
+          <w:sz w:val="22"/>
+          <w:szCs w:val="22"/>
+        </w:rPr>
+        <w:t>⁸⁷</w:t>
+      </w:r>
+      <w:r>
+        <w:rPr>
+          <w:rFonts w:ascii="Garamond" w:hAnsi="Garamond"/>
+          <w:sz w:val="22"/>
+          <w:szCs w:val="22"/>
+        </w:rPr>
+        <w:t>Sr/</w:t>
+      </w:r>
+      <w:r>
+        <w:rPr>
+          <w:rFonts w:ascii="Cambria Math" w:hAnsi="Cambria Math" w:cs="Cambria Math"/>
+          <w:sz w:val="22"/>
+          <w:szCs w:val="22"/>
+        </w:rPr>
+        <w:t>⁸⁶</w:t>
+      </w:r>
+      <w:r>
+        <w:rPr>
+          <w:rFonts w:ascii="Garamond" w:hAnsi="Garamond"/>
+          <w:sz w:val="22"/>
+          <w:szCs w:val="22"/>
+        </w:rPr>
+        <w:t>Sr</w:t>
+      </w:r>
+      <w:r>
+        <w:rPr>
+          <w:rFonts w:ascii="Garamond" w:hAnsi="Garamond"/>
+          <w:sz w:val="22"/>
+          <w:szCs w:val="22"/>
+        </w:rPr>
+        <w:t xml:space="preserve"> and Sr</w:t>
+      </w:r>
+      <w:r>
+        <w:rPr>
+          <w:rFonts w:ascii="Garamond" w:hAnsi="Garamond"/>
+          <w:sz w:val="22"/>
+          <w:szCs w:val="22"/>
+          <w:vertAlign w:val="superscript"/>
+        </w:rPr>
+        <w:t>88</w:t>
+      </w:r>
+      <w:r>
+        <w:rPr>
+          <w:rFonts w:ascii="Garamond" w:hAnsi="Garamond"/>
+          <w:sz w:val="22"/>
+          <w:szCs w:val="22"/>
+        </w:rPr>
+        <w:t xml:space="preserve"> along the same transect for all individuals. </w:t>
       </w:r>
     </w:p>
     <w:p>
@@ -1982,7 +2089,23 @@
           <w:sz w:val="22"/>
           <w:szCs w:val="22"/>
         </w:rPr>
-        <w:t xml:space="preserve">full LA timeseries were trimmed to include only data between the </w:t>
+        <w:t xml:space="preserve">full </w:t>
+      </w:r>
+      <w:r>
+        <w:rPr>
+          <w:rFonts w:ascii="Garamond" w:hAnsi="Garamond"/>
+          <w:sz w:val="22"/>
+          <w:szCs w:val="22"/>
+        </w:rPr>
+        <w:t>laser ablation datasets</w:t>
+      </w:r>
+      <w:r>
+        <w:rPr>
+          <w:rFonts w:ascii="Garamond" w:hAnsi="Garamond"/>
+          <w:sz w:val="22"/>
+          <w:szCs w:val="22"/>
+        </w:rPr>
+        <w:t xml:space="preserve"> were trimmed to include only data between the </w:t>
       </w:r>
       <w:r>
         <w:rPr>
@@ -2311,7 +2434,129 @@
           <w:sz w:val="22"/>
           <w:szCs w:val="22"/>
         </w:rPr>
-        <w:t xml:space="preserve">Sr </w:t>
+        <w:t>Sr to</w:t>
+      </w:r>
+      <w:r>
+        <w:rPr>
+          <w:rFonts w:ascii="Garamond" w:hAnsi="Garamond"/>
+          <w:sz w:val="22"/>
+          <w:szCs w:val="22"/>
+        </w:rPr>
+        <w:t>war</w:t>
+      </w:r>
+      <w:r>
+        <w:rPr>
+          <w:rFonts w:ascii="Garamond" w:hAnsi="Garamond"/>
+          <w:sz w:val="22"/>
+          <w:szCs w:val="22"/>
+        </w:rPr>
+        <w:t>d</w:t>
+      </w:r>
+      <w:r>
+        <w:rPr>
+          <w:rFonts w:ascii="Garamond" w:hAnsi="Garamond"/>
+          <w:sz w:val="22"/>
+          <w:szCs w:val="22"/>
+        </w:rPr>
+        <w:t>s</w:t>
+      </w:r>
+      <w:r>
+        <w:rPr>
+          <w:rFonts w:ascii="Garamond" w:hAnsi="Garamond"/>
+          <w:sz w:val="22"/>
+          <w:szCs w:val="22"/>
+        </w:rPr>
+        <w:t xml:space="preserve"> the</w:t>
+      </w:r>
+      <w:r>
+        <w:rPr>
+          <w:rFonts w:ascii="Garamond" w:hAnsi="Garamond"/>
+          <w:sz w:val="22"/>
+          <w:szCs w:val="22"/>
+        </w:rPr>
+        <w:t xml:space="preserve"> global marine value</w:t>
+      </w:r>
+      <w:r>
+        <w:rPr>
+          <w:rFonts w:ascii="Garamond" w:hAnsi="Garamond"/>
+          <w:sz w:val="22"/>
+          <w:szCs w:val="22"/>
+        </w:rPr>
+        <w:t xml:space="preserve"> at the end of the time</w:t>
+      </w:r>
+      <w:r>
+        <w:rPr>
+          <w:rFonts w:ascii="Garamond" w:hAnsi="Garamond"/>
+          <w:sz w:val="22"/>
+          <w:szCs w:val="22"/>
+        </w:rPr>
+        <w:t>s</w:t>
+      </w:r>
+      <w:r>
+        <w:rPr>
+          <w:rFonts w:ascii="Garamond" w:hAnsi="Garamond"/>
+          <w:sz w:val="22"/>
+          <w:szCs w:val="22"/>
+        </w:rPr>
+        <w:t>eries</w:t>
+      </w:r>
+      <w:r>
+        <w:rPr>
+          <w:rFonts w:ascii="Garamond" w:hAnsi="Garamond"/>
+          <w:sz w:val="22"/>
+          <w:szCs w:val="22"/>
+        </w:rPr>
+        <w:t xml:space="preserve">. </w:t>
+      </w:r>
+      <w:r>
+        <w:rPr>
+          <w:rFonts w:ascii="Garamond" w:hAnsi="Garamond"/>
+          <w:sz w:val="22"/>
+          <w:szCs w:val="22"/>
+        </w:rPr>
+        <w:t>Manual s</w:t>
+      </w:r>
+      <w:r>
+        <w:rPr>
+          <w:rFonts w:ascii="Garamond" w:hAnsi="Garamond"/>
+          <w:sz w:val="22"/>
+          <w:szCs w:val="22"/>
+        </w:rPr>
+        <w:t xml:space="preserve">election of trimming locations </w:t>
+      </w:r>
+      <w:proofErr w:type="gramStart"/>
+      <w:r>
+        <w:rPr>
+          <w:rFonts w:ascii="Garamond" w:hAnsi="Garamond"/>
+          <w:sz w:val="22"/>
+          <w:szCs w:val="22"/>
+        </w:rPr>
+        <w:t>were</w:t>
+      </w:r>
+      <w:proofErr w:type="gramEnd"/>
+      <w:r>
+        <w:rPr>
+          <w:rFonts w:ascii="Garamond" w:hAnsi="Garamond"/>
+          <w:sz w:val="22"/>
+          <w:szCs w:val="22"/>
+        </w:rPr>
+        <w:t xml:space="preserve"> randomized and blinded to avoid </w:t>
+      </w:r>
+      <w:r>
+        <w:rPr>
+          <w:rFonts w:ascii="Garamond" w:hAnsi="Garamond"/>
+          <w:sz w:val="22"/>
+          <w:szCs w:val="22"/>
+        </w:rPr>
+        <w:t xml:space="preserve">bias. </w:t>
+      </w:r>
+      <w:r>
+        <w:rPr>
+          <w:rFonts w:ascii="Garamond" w:hAnsi="Garamond"/>
+          <w:sz w:val="22"/>
+          <w:szCs w:val="22"/>
+        </w:rPr>
+        <w:t xml:space="preserve">All trimmed datasets were then manually </w:t>
       </w:r>
       <w:proofErr w:type="spellStart"/>
       <w:r>
@@ -2320,15 +2565,7 @@
           <w:sz w:val="22"/>
           <w:szCs w:val="22"/>
         </w:rPr>
-        <w:t>to</w:t>
-      </w:r>
-      <w:r>
-        <w:rPr>
-          <w:rFonts w:ascii="Garamond" w:hAnsi="Garamond"/>
-          <w:sz w:val="22"/>
-          <w:szCs w:val="22"/>
-        </w:rPr>
-        <w:t>wars</w:t>
+        <w:t>QC’d</w:t>
       </w:r>
       <w:proofErr w:type="spellEnd"/>
       <w:r>
@@ -2337,127 +2574,15 @@
           <w:sz w:val="22"/>
           <w:szCs w:val="22"/>
         </w:rPr>
-        <w:t xml:space="preserve"> global marine value</w:t>
-      </w:r>
-      <w:r>
-        <w:rPr>
-          <w:rFonts w:ascii="Garamond" w:hAnsi="Garamond"/>
-          <w:sz w:val="22"/>
-          <w:szCs w:val="22"/>
-        </w:rPr>
-        <w:t xml:space="preserve"> at the end of the </w:t>
-      </w:r>
-      <w:proofErr w:type="spellStart"/>
-      <w:r>
-        <w:rPr>
-          <w:rFonts w:ascii="Garamond" w:hAnsi="Garamond"/>
-          <w:sz w:val="22"/>
-          <w:szCs w:val="22"/>
-        </w:rPr>
-        <w:t>timeeries</w:t>
-      </w:r>
-      <w:proofErr w:type="spellEnd"/>
-      <w:r>
-        <w:rPr>
-          <w:rFonts w:ascii="Garamond" w:hAnsi="Garamond"/>
-          <w:sz w:val="22"/>
-          <w:szCs w:val="22"/>
-        </w:rPr>
-        <w:t xml:space="preserve">. </w:t>
-      </w:r>
-      <w:r>
-        <w:rPr>
-          <w:rFonts w:ascii="Garamond" w:hAnsi="Garamond"/>
-          <w:sz w:val="22"/>
-          <w:szCs w:val="22"/>
-        </w:rPr>
-        <w:t>Manual s</w:t>
-      </w:r>
-      <w:r>
-        <w:rPr>
-          <w:rFonts w:ascii="Garamond" w:hAnsi="Garamond"/>
-          <w:sz w:val="22"/>
-          <w:szCs w:val="22"/>
-        </w:rPr>
-        <w:t xml:space="preserve">election of trimming locations </w:t>
-      </w:r>
-      <w:proofErr w:type="gramStart"/>
-      <w:r>
-        <w:rPr>
-          <w:rFonts w:ascii="Garamond" w:hAnsi="Garamond"/>
-          <w:sz w:val="22"/>
-          <w:szCs w:val="22"/>
-        </w:rPr>
-        <w:t>were</w:t>
-      </w:r>
-      <w:proofErr w:type="gramEnd"/>
-      <w:r>
-        <w:rPr>
-          <w:rFonts w:ascii="Garamond" w:hAnsi="Garamond"/>
-          <w:sz w:val="22"/>
-          <w:szCs w:val="22"/>
-        </w:rPr>
-        <w:t xml:space="preserve"> randomized and blinded to avoid </w:t>
-      </w:r>
-      <w:proofErr w:type="spellStart"/>
-      <w:r>
-        <w:rPr>
-          <w:rFonts w:ascii="Garamond" w:hAnsi="Garamond"/>
-          <w:sz w:val="22"/>
-          <w:szCs w:val="22"/>
-        </w:rPr>
-        <w:t>biase</w:t>
-      </w:r>
-      <w:proofErr w:type="spellEnd"/>
-      <w:r>
-        <w:rPr>
-          <w:rFonts w:ascii="Garamond" w:hAnsi="Garamond"/>
-          <w:sz w:val="22"/>
-          <w:szCs w:val="22"/>
-        </w:rPr>
-        <w:t xml:space="preserve"> </w:t>
-      </w:r>
-      <w:r>
-        <w:rPr>
-          <w:rFonts w:ascii="Garamond" w:hAnsi="Garamond"/>
-          <w:sz w:val="22"/>
-          <w:szCs w:val="22"/>
-        </w:rPr>
-        <w:t>by</w:t>
-      </w:r>
-      <w:r>
-        <w:rPr>
-          <w:rFonts w:ascii="Garamond" w:hAnsi="Garamond"/>
-          <w:sz w:val="22"/>
-          <w:szCs w:val="22"/>
-        </w:rPr>
-        <w:t xml:space="preserve"> watershed. </w:t>
-      </w:r>
-      <w:r>
-        <w:rPr>
-          <w:rFonts w:ascii="Garamond" w:hAnsi="Garamond"/>
-          <w:sz w:val="22"/>
-          <w:szCs w:val="22"/>
-        </w:rPr>
-        <w:t xml:space="preserve"> Samples with significant error from sample prep (</w:t>
-      </w:r>
-      <w:proofErr w:type="spellStart"/>
-      <w:r>
-        <w:rPr>
-          <w:rFonts w:ascii="Garamond" w:hAnsi="Garamond"/>
-          <w:sz w:val="22"/>
-          <w:szCs w:val="22"/>
-        </w:rPr>
-        <w:t>i.e</w:t>
-      </w:r>
-      <w:proofErr w:type="spellEnd"/>
-      <w:r>
-        <w:rPr>
-          <w:rFonts w:ascii="Garamond" w:hAnsi="Garamond"/>
-          <w:sz w:val="22"/>
-          <w:szCs w:val="22"/>
-        </w:rPr>
-        <w:t xml:space="preserve"> large cracks) </w:t>
+        <w:t>, and s</w:t>
+      </w:r>
+      <w:r>
+        <w:rPr>
+          <w:rFonts w:ascii="Garamond" w:hAnsi="Garamond"/>
+          <w:sz w:val="22"/>
+          <w:szCs w:val="22"/>
+        </w:rPr>
+        <w:t xml:space="preserve">amples with significant error (i.e large cracks) </w:t>
       </w:r>
       <w:r>
         <w:rPr>
@@ -2505,25 +2630,7 @@
           <w:sz w:val="22"/>
           <w:szCs w:val="22"/>
         </w:rPr>
-        <w:t xml:space="preserve">2,531 timeseries </w:t>
-      </w:r>
-      <w:proofErr w:type="gramStart"/>
-      <w:r>
-        <w:rPr>
-          <w:rFonts w:ascii="Garamond" w:hAnsi="Garamond"/>
-          <w:sz w:val="22"/>
-          <w:szCs w:val="22"/>
-        </w:rPr>
-        <w:t>( 971</w:t>
-      </w:r>
-      <w:proofErr w:type="gramEnd"/>
-      <w:r>
-        <w:rPr>
-          <w:rFonts w:ascii="Garamond" w:hAnsi="Garamond"/>
-          <w:sz w:val="22"/>
-          <w:szCs w:val="22"/>
-        </w:rPr>
-        <w:t xml:space="preserve"> Yukon, 875 Kuskokwim, and 685 </w:t>
+        <w:t xml:space="preserve">2,531 timeseries (971 Yukon, 875 Kuskokwim, and 685 </w:t>
       </w:r>
       <w:proofErr w:type="spellStart"/>
       <w:r>
@@ -2616,7 +2723,114 @@
           <w:sz w:val="22"/>
           <w:szCs w:val="22"/>
         </w:rPr>
-        <w:t xml:space="preserve">e used a </w:t>
+        <w:t>e used a 60</w:t>
+      </w:r>
+      <w:r>
+        <w:rPr>
+          <w:rFonts w:ascii="Garamond" w:hAnsi="Garamond"/>
+          <w:sz w:val="22"/>
+          <w:szCs w:val="22"/>
+        </w:rPr>
+        <w:t>-</w:t>
+      </w:r>
+      <w:r>
+        <w:rPr>
+          <w:rFonts w:ascii="Garamond" w:hAnsi="Garamond"/>
+          <w:sz w:val="22"/>
+          <w:szCs w:val="22"/>
+        </w:rPr>
+        <w:t>point center weighted window</w:t>
+      </w:r>
+      <w:r>
+        <w:rPr>
+          <w:rFonts w:ascii="Garamond" w:hAnsi="Garamond"/>
+          <w:sz w:val="22"/>
+          <w:szCs w:val="22"/>
+        </w:rPr>
+        <w:t xml:space="preserve">. </w:t>
+      </w:r>
+      <w:r>
+        <w:rPr>
+          <w:rFonts w:ascii="Garamond" w:hAnsi="Garamond"/>
+          <w:sz w:val="22"/>
+          <w:szCs w:val="22"/>
+        </w:rPr>
+        <w:t xml:space="preserve">The GAM was fitted using thin plate regression and penalized iteratively re-weighted least squares (P-IRLS) to maximize goodness of fit, with a generalized cross-validation (GCV) method employed to minimize overfitting </w:t>
+      </w:r>
+      <w:r>
+        <w:rPr>
+          <w:rFonts w:ascii="Garamond" w:hAnsi="Garamond"/>
+          <w:sz w:val="22"/>
+          <w:szCs w:val="22"/>
+        </w:rPr>
+        <w:t xml:space="preserve">(Wood, 2006). The maximum degrees of freedom (k) were scaled by the number of data points in each ablation line (n) by k = 10N </w:t>
+      </w:r>
+      <w:r>
+        <w:rPr>
+          <w:rFonts w:ascii="Garamond" w:hAnsi="Garamond"/>
+          <w:sz w:val="22"/>
+          <w:szCs w:val="22"/>
+          <w:vertAlign w:val="superscript"/>
+        </w:rPr>
+        <w:t>2/9</w:t>
+      </w:r>
+      <w:r>
+        <w:rPr>
+          <w:rFonts w:ascii="Garamond" w:hAnsi="Garamond"/>
+          <w:sz w:val="22"/>
+          <w:szCs w:val="22"/>
+          <w:vertAlign w:val="superscript"/>
+        </w:rPr>
+        <w:t xml:space="preserve"> </w:t>
+      </w:r>
+      <w:r>
+        <w:rPr>
+          <w:rFonts w:ascii="Garamond" w:hAnsi="Garamond"/>
+          <w:sz w:val="22"/>
+          <w:szCs w:val="22"/>
+        </w:rPr>
+        <w:t xml:space="preserve">(Kim </w:t>
+      </w:r>
+      <w:r>
+        <w:rPr>
+          <w:rFonts w:ascii="Garamond" w:hAnsi="Garamond"/>
+          <w:sz w:val="22"/>
+          <w:szCs w:val="22"/>
+        </w:rPr>
+        <w:lastRenderedPageBreak/>
+        <w:t xml:space="preserve">and Gu, 2004, Brennan et al., </w:t>
+      </w:r>
+      <w:r>
+        <w:rPr>
+          <w:rFonts w:ascii="Garamond" w:hAnsi="Garamond"/>
+          <w:sz w:val="22"/>
+          <w:szCs w:val="22"/>
+        </w:rPr>
+        <w:t>2014)</w:t>
+      </w:r>
+      <w:r>
+        <w:rPr>
+          <w:rFonts w:ascii="Garamond" w:hAnsi="Garamond"/>
+          <w:sz w:val="22"/>
+          <w:szCs w:val="22"/>
+        </w:rPr>
+        <w:t xml:space="preserve">. </w:t>
+      </w:r>
+      <w:r>
+        <w:rPr>
+          <w:rFonts w:ascii="Garamond" w:hAnsi="Garamond"/>
+          <w:sz w:val="22"/>
+          <w:szCs w:val="22"/>
+        </w:rPr>
+        <w:t>This process resulted in three versions of the</w:t>
+      </w:r>
+      <w:r>
+        <w:rPr>
+          <w:rFonts w:ascii="Garamond" w:hAnsi="Garamond"/>
+          <w:sz w:val="22"/>
+          <w:szCs w:val="22"/>
+        </w:rPr>
+        <w:t xml:space="preserve"> same laser ablation timeseries for </w:t>
       </w:r>
       <w:proofErr w:type="gramStart"/>
       <w:r>
@@ -2625,7 +2839,7 @@
           <w:sz w:val="22"/>
           <w:szCs w:val="22"/>
         </w:rPr>
-        <w:t>60 point</w:t>
+        <w:t>each individual</w:t>
       </w:r>
       <w:proofErr w:type="gramEnd"/>
       <w:r>
@@ -2634,47 +2848,13 @@
           <w:sz w:val="22"/>
           <w:szCs w:val="22"/>
         </w:rPr>
-        <w:t xml:space="preserve"> center weighted window</w:t>
-      </w:r>
-      <w:r>
-        <w:rPr>
-          <w:rFonts w:ascii="Garamond" w:hAnsi="Garamond"/>
-          <w:sz w:val="22"/>
-          <w:szCs w:val="22"/>
-        </w:rPr>
-        <w:t xml:space="preserve">. </w:t>
-      </w:r>
-      <w:r>
-        <w:rPr>
-          <w:rFonts w:ascii="Garamond" w:hAnsi="Garamond"/>
-          <w:sz w:val="22"/>
-          <w:szCs w:val="22"/>
-        </w:rPr>
-        <w:t xml:space="preserve">The GAM was fitted using thin plate regression and penalized iteratively re-weighted least squares (P-IRLS) to maximize goodness of fit, with a generalized cross-validation (GCV) method employed to minimize overfitting </w:t>
-      </w:r>
-      <w:r>
-        <w:rPr>
-          <w:rFonts w:ascii="Garamond" w:hAnsi="Garamond"/>
-          <w:sz w:val="22"/>
-          <w:szCs w:val="22"/>
-        </w:rPr>
-        <w:t xml:space="preserve">(Wood, 2006). The maximum degrees of freedom (k) were scaled by the number of data points in each ablation line (n) by k = 10N </w:t>
-      </w:r>
-      <w:r>
-        <w:rPr>
-          <w:rFonts w:ascii="Garamond" w:hAnsi="Garamond"/>
-          <w:sz w:val="22"/>
-          <w:szCs w:val="22"/>
-          <w:vertAlign w:val="superscript"/>
-        </w:rPr>
-        <w:t>2/9</w:t>
-      </w:r>
-      <w:r>
-        <w:rPr>
-          <w:rFonts w:ascii="Garamond" w:hAnsi="Garamond"/>
-          <w:sz w:val="22"/>
-          <w:szCs w:val="22"/>
-          <w:vertAlign w:val="superscript"/>
+        <w:t>: GAM-smoothed, MA-smoothed, and raw LA data.</w:t>
+      </w:r>
+      <w:r>
+        <w:rPr>
+          <w:rFonts w:ascii="Garamond" w:hAnsi="Garamond"/>
+          <w:sz w:val="22"/>
+          <w:szCs w:val="22"/>
         </w:rPr>
         <w:t xml:space="preserve"> </w:t>
       </w:r>
@@ -2684,31 +2864,7 @@
           <w:sz w:val="22"/>
           <w:szCs w:val="22"/>
         </w:rPr>
-        <w:t xml:space="preserve">(Kim and Gu, 2004, Brennan et al., </w:t>
-      </w:r>
-      <w:r>
-        <w:rPr>
-          <w:rFonts w:ascii="Garamond" w:hAnsi="Garamond"/>
-          <w:sz w:val="22"/>
-          <w:szCs w:val="22"/>
-        </w:rPr>
-        <w:t>2014)</w:t>
-      </w:r>
-      <w:r>
-        <w:rPr>
-          <w:rFonts w:ascii="Garamond" w:hAnsi="Garamond"/>
-          <w:sz w:val="22"/>
-          <w:szCs w:val="22"/>
-        </w:rPr>
-        <w:t xml:space="preserve">. </w:t>
-      </w:r>
-      <w:r>
-        <w:rPr>
-          <w:rFonts w:ascii="Garamond" w:hAnsi="Garamond"/>
-          <w:sz w:val="22"/>
-          <w:szCs w:val="22"/>
-        </w:rPr>
-        <w:t>This process resulted in three versions of the full dataset: GAM-smoothed, MA-smoothed, and raw LA data.</w:t>
+        <w:t>Finally, all samples were interpolated to a common length</w:t>
       </w:r>
       <w:r>
         <w:rPr>
@@ -2724,34 +2880,63 @@
           <w:sz w:val="22"/>
           <w:szCs w:val="22"/>
         </w:rPr>
-        <w:t xml:space="preserve">Finally, variation in size among individuals produces time series </w:t>
-      </w:r>
-      <w:r>
-        <w:rPr>
-          <w:rFonts w:ascii="Garamond" w:hAnsi="Garamond"/>
-          <w:sz w:val="22"/>
-          <w:szCs w:val="22"/>
-        </w:rPr>
-        <w:lastRenderedPageBreak/>
-        <w:t xml:space="preserve">of differing lengths. However, many machine learning algorithms require fixed-length vectors. To address this, all samples were interpolated to a common length, defined as the average length of </w:t>
-      </w:r>
-      <w:proofErr w:type="spellStart"/>
-      <w:r>
-        <w:rPr>
-          <w:rFonts w:ascii="Garamond" w:hAnsi="Garamond"/>
-          <w:sz w:val="22"/>
-          <w:szCs w:val="22"/>
-        </w:rPr>
-        <w:t>all time</w:t>
-      </w:r>
-      <w:proofErr w:type="spellEnd"/>
-      <w:r>
-        <w:rPr>
-          <w:rFonts w:ascii="Garamond" w:hAnsi="Garamond"/>
-          <w:sz w:val="22"/>
-          <w:szCs w:val="22"/>
-        </w:rPr>
-        <w:t xml:space="preserve"> series (700 points for non-MA and 600 points for MA-smoothed samples, respectively) </w:t>
+        <w:t xml:space="preserve">defined as the average length of </w:t>
+      </w:r>
+      <w:r>
+        <w:rPr>
+          <w:rFonts w:ascii="Garamond" w:hAnsi="Garamond"/>
+          <w:sz w:val="22"/>
+          <w:szCs w:val="22"/>
+        </w:rPr>
+        <w:t>all</w:t>
+      </w:r>
+      <w:r>
+        <w:rPr>
+          <w:rFonts w:ascii="Garamond" w:hAnsi="Garamond"/>
+          <w:sz w:val="22"/>
+          <w:szCs w:val="22"/>
+        </w:rPr>
+        <w:t xml:space="preserve"> t</w:t>
+      </w:r>
+      <w:r>
+        <w:rPr>
+          <w:rFonts w:ascii="Garamond" w:hAnsi="Garamond"/>
+          <w:sz w:val="22"/>
+          <w:szCs w:val="22"/>
+        </w:rPr>
+        <w:t>ime</w:t>
+      </w:r>
+      <w:r>
+        <w:rPr>
+          <w:rFonts w:ascii="Garamond" w:hAnsi="Garamond"/>
+          <w:sz w:val="22"/>
+          <w:szCs w:val="22"/>
+        </w:rPr>
+        <w:t>s</w:t>
+      </w:r>
+      <w:r>
+        <w:rPr>
+          <w:rFonts w:ascii="Garamond" w:hAnsi="Garamond"/>
+          <w:sz w:val="22"/>
+          <w:szCs w:val="22"/>
+        </w:rPr>
+        <w:t xml:space="preserve">eries </w:t>
+      </w:r>
+      <w:r>
+        <w:rPr>
+          <w:rFonts w:ascii="Garamond" w:hAnsi="Garamond"/>
+          <w:sz w:val="22"/>
+          <w:szCs w:val="22"/>
+        </w:rPr>
+        <w:t xml:space="preserve">of that type </w:t>
+      </w:r>
+      <w:r>
+        <w:rPr>
+          <w:rFonts w:ascii="Garamond" w:hAnsi="Garamond"/>
+          <w:sz w:val="22"/>
+          <w:szCs w:val="22"/>
+        </w:rPr>
+        <w:t xml:space="preserve">(700 points for non-MA and 600 points for MA-smoothed samples, respectively) </w:t>
       </w:r>
       <w:r>
         <w:rPr>
@@ -2760,6 +2945,22 @@
           <w:szCs w:val="22"/>
         </w:rPr>
         <w:t>(Hegg and Kennedy, 2021).</w:t>
+      </w:r>
+      <w:r>
+        <w:rPr>
+          <w:rFonts w:ascii="Garamond" w:hAnsi="Garamond"/>
+          <w:sz w:val="22"/>
+          <w:szCs w:val="22"/>
+        </w:rPr>
+        <w:t xml:space="preserve"> This was done to satisfy the requirement for equal length vectors for machine learning algorithms </w:t>
+      </w:r>
+      <w:r>
+        <w:rPr>
+          <w:rFonts w:ascii="Garamond" w:hAnsi="Garamond"/>
+          <w:sz w:val="22"/>
+          <w:szCs w:val="22"/>
+        </w:rPr>
+        <w:t xml:space="preserve">while minimizing warping from interpolation. </w:t>
       </w:r>
     </w:p>
     <w:p>
@@ -2809,6 +3010,14 @@
           <w:sz w:val="22"/>
           <w:szCs w:val="22"/>
         </w:rPr>
+        <w:t xml:space="preserve">to </w:t>
+      </w:r>
+      <w:r>
+        <w:rPr>
+          <w:rFonts w:ascii="Garamond" w:hAnsi="Garamond"/>
+          <w:sz w:val="22"/>
+          <w:szCs w:val="22"/>
+        </w:rPr>
         <w:t xml:space="preserve">all points from </w:t>
       </w:r>
       <w:r>
@@ -2897,7 +3106,23 @@
           <w:sz w:val="22"/>
           <w:szCs w:val="22"/>
         </w:rPr>
-        <w:t>95% confidence interval ellipses were added to visualize the extent of multivariate dispersion for each watershed group and to assess the degree of separation between populations in reduced dimensional space</w:t>
+        <w:t>95% confidence interval ellipses were added to visualize the extent of multivariate dispersion for each watershed group and to</w:t>
+      </w:r>
+      <w:r>
+        <w:rPr>
+          <w:rFonts w:ascii="Garamond" w:hAnsi="Garamond"/>
+          <w:sz w:val="22"/>
+          <w:szCs w:val="22"/>
+        </w:rPr>
+        <w:t xml:space="preserve"> visually</w:t>
+      </w:r>
+      <w:r>
+        <w:rPr>
+          <w:rFonts w:ascii="Garamond" w:hAnsi="Garamond"/>
+          <w:sz w:val="22"/>
+          <w:szCs w:val="22"/>
+        </w:rPr>
+        <w:t xml:space="preserve"> assess the degree of separation between populations in reduced dimensional space</w:t>
       </w:r>
       <w:r>
         <w:rPr>
@@ -2932,41 +3157,159 @@
           <w:sz w:val="22"/>
           <w:szCs w:val="22"/>
         </w:rPr>
-        <w:t xml:space="preserve"> can distinguish among </w:t>
-      </w:r>
-      <w:proofErr w:type="gramStart"/>
-      <w:r>
-        <w:rPr>
-          <w:rFonts w:ascii="Garamond" w:hAnsi="Garamond"/>
-          <w:sz w:val="22"/>
-          <w:szCs w:val="22"/>
-        </w:rPr>
-        <w:t xml:space="preserve">timeseries </w:t>
-      </w:r>
-      <w:r>
-        <w:rPr>
-          <w:rFonts w:ascii="Garamond" w:hAnsi="Garamond"/>
-          <w:sz w:val="22"/>
-          <w:szCs w:val="22"/>
-        </w:rPr>
-        <w:t xml:space="preserve"> that</w:t>
-      </w:r>
-      <w:proofErr w:type="gramEnd"/>
-      <w:r>
-        <w:rPr>
-          <w:rFonts w:ascii="Garamond" w:hAnsi="Garamond"/>
-          <w:sz w:val="22"/>
-          <w:szCs w:val="22"/>
-        </w:rPr>
-        <w:t xml:space="preserve"> are otherwise indistinguishable using natal origin alone</w:t>
-      </w:r>
-      <w:r>
-        <w:rPr>
-          <w:rFonts w:ascii="Garamond" w:hAnsi="Garamond"/>
-          <w:sz w:val="22"/>
-          <w:szCs w:val="22"/>
-        </w:rPr>
-        <w:t xml:space="preserve">, PCA analysis is also done on a subset of the GAM smoothed dataset which include only individuals with a natal origin Sr8786 of 0.7075- 0.7080. </w:t>
+        <w:t xml:space="preserve"> can distinguish among timeseries </w:t>
+      </w:r>
+      <w:r>
+        <w:rPr>
+          <w:rFonts w:ascii="Garamond" w:hAnsi="Garamond"/>
+          <w:sz w:val="22"/>
+          <w:szCs w:val="22"/>
+        </w:rPr>
+        <w:t xml:space="preserve">that are otherwise indistinguishable using </w:t>
+      </w:r>
+      <w:r>
+        <w:rPr>
+          <w:rFonts w:ascii="Garamond" w:hAnsi="Garamond"/>
+          <w:sz w:val="22"/>
+          <w:szCs w:val="22"/>
+        </w:rPr>
+        <w:t xml:space="preserve">the </w:t>
+      </w:r>
+      <w:r>
+        <w:rPr>
+          <w:rFonts w:ascii="Garamond" w:hAnsi="Garamond"/>
+          <w:sz w:val="22"/>
+          <w:szCs w:val="22"/>
+        </w:rPr>
+        <w:t xml:space="preserve">natal </w:t>
+      </w:r>
+      <w:r>
+        <w:rPr>
+          <w:rFonts w:ascii="Garamond" w:hAnsi="Garamond"/>
+          <w:sz w:val="22"/>
+          <w:szCs w:val="22"/>
+        </w:rPr>
+        <w:t xml:space="preserve">freshwater </w:t>
+      </w:r>
+      <w:r>
+        <w:rPr>
+          <w:rFonts w:ascii="Cambria Math" w:hAnsi="Cambria Math" w:cs="Cambria Math"/>
+          <w:sz w:val="22"/>
+          <w:szCs w:val="22"/>
+        </w:rPr>
+        <w:t>⁸⁷</w:t>
+      </w:r>
+      <w:r>
+        <w:rPr>
+          <w:rFonts w:ascii="Garamond" w:hAnsi="Garamond"/>
+          <w:sz w:val="22"/>
+          <w:szCs w:val="22"/>
+        </w:rPr>
+        <w:t>Sr/</w:t>
+      </w:r>
+      <w:r>
+        <w:rPr>
+          <w:rFonts w:ascii="Cambria Math" w:hAnsi="Cambria Math" w:cs="Cambria Math"/>
+          <w:sz w:val="22"/>
+          <w:szCs w:val="22"/>
+        </w:rPr>
+        <w:t>⁸⁶</w:t>
+      </w:r>
+      <w:r>
+        <w:rPr>
+          <w:rFonts w:ascii="Garamond" w:hAnsi="Garamond"/>
+          <w:sz w:val="22"/>
+          <w:szCs w:val="22"/>
+        </w:rPr>
+        <w:t>Sr</w:t>
+      </w:r>
+      <w:r>
+        <w:rPr>
+          <w:rFonts w:ascii="Garamond" w:hAnsi="Garamond"/>
+          <w:sz w:val="22"/>
+          <w:szCs w:val="22"/>
+        </w:rPr>
+        <w:t xml:space="preserve">, PCA analysis </w:t>
+      </w:r>
+      <w:r>
+        <w:rPr>
+          <w:rFonts w:ascii="Garamond" w:hAnsi="Garamond"/>
+          <w:sz w:val="22"/>
+          <w:szCs w:val="22"/>
+        </w:rPr>
+        <w:t>was also</w:t>
+      </w:r>
+      <w:r>
+        <w:rPr>
+          <w:rFonts w:ascii="Garamond" w:hAnsi="Garamond"/>
+          <w:sz w:val="22"/>
+          <w:szCs w:val="22"/>
+        </w:rPr>
+        <w:t xml:space="preserve"> done on a subset of the GAM smoothed dataset which include only individuals with a natal </w:t>
+      </w:r>
+      <w:r>
+        <w:rPr>
+          <w:rFonts w:ascii="Cambria Math" w:hAnsi="Cambria Math" w:cs="Cambria Math"/>
+          <w:sz w:val="22"/>
+          <w:szCs w:val="22"/>
+        </w:rPr>
+        <w:t>⁸⁷</w:t>
+      </w:r>
+      <w:r>
+        <w:rPr>
+          <w:rFonts w:ascii="Garamond" w:hAnsi="Garamond"/>
+          <w:sz w:val="22"/>
+          <w:szCs w:val="22"/>
+        </w:rPr>
+        <w:t>Sr/</w:t>
+      </w:r>
+      <w:r>
+        <w:rPr>
+          <w:rFonts w:ascii="Cambria Math" w:hAnsi="Cambria Math" w:cs="Cambria Math"/>
+          <w:sz w:val="22"/>
+          <w:szCs w:val="22"/>
+        </w:rPr>
+        <w:t>⁸⁶</w:t>
+      </w:r>
+      <w:r>
+        <w:rPr>
+          <w:rFonts w:ascii="Garamond" w:hAnsi="Garamond"/>
+          <w:sz w:val="22"/>
+          <w:szCs w:val="22"/>
+        </w:rPr>
+        <w:t xml:space="preserve">Sr </w:t>
+      </w:r>
+      <w:r>
+        <w:rPr>
+          <w:rFonts w:ascii="Garamond" w:hAnsi="Garamond"/>
+          <w:sz w:val="22"/>
+          <w:szCs w:val="22"/>
+        </w:rPr>
+        <w:t xml:space="preserve">of 0.7075- 0.7080. PCA plots were produced to visualize clustering of both PC1 (47.46% of variance) and PC2 (20.93% of variance) as well as between PC1 and PC3 (10.23% of variance). </w:t>
+      </w:r>
+      <w:r>
+        <w:rPr>
+          <w:rFonts w:ascii="Garamond" w:hAnsi="Garamond"/>
+          <w:sz w:val="22"/>
+          <w:szCs w:val="22"/>
+        </w:rPr>
+        <w:t xml:space="preserve">To identify the most discriminatory portions of the timeseries, the absolute values of principal component loadings </w:t>
+      </w:r>
+      <w:r>
+        <w:rPr>
+          <w:rFonts w:ascii="Garamond" w:hAnsi="Garamond"/>
+          <w:sz w:val="22"/>
+          <w:szCs w:val="22"/>
+        </w:rPr>
+        <w:t xml:space="preserve">were then mapped </w:t>
+      </w:r>
+      <w:r>
+        <w:rPr>
+          <w:rFonts w:ascii="Garamond" w:hAnsi="Garamond"/>
+          <w:sz w:val="22"/>
+          <w:szCs w:val="22"/>
+        </w:rPr>
+        <w:t>onto their corresponding timeseries positions</w:t>
       </w:r>
       <w:r>
         <w:rPr>
@@ -2982,42 +3325,27 @@
           <w:sz w:val="22"/>
           <w:szCs w:val="22"/>
         </w:rPr>
-        <w:t xml:space="preserve">PCA plots were produced to visualize clustering of both PC1 </w:t>
-      </w:r>
-      <w:proofErr w:type="gramStart"/>
-      <w:r>
-        <w:rPr>
-          <w:rFonts w:ascii="Garamond" w:hAnsi="Garamond"/>
-          <w:sz w:val="22"/>
-          <w:szCs w:val="22"/>
-        </w:rPr>
-        <w:t>( 47.46</w:t>
-      </w:r>
-      <w:proofErr w:type="gramEnd"/>
-      <w:r>
-        <w:rPr>
-          <w:rFonts w:ascii="Garamond" w:hAnsi="Garamond"/>
-          <w:sz w:val="22"/>
-          <w:szCs w:val="22"/>
-        </w:rPr>
-        <w:t xml:space="preserve">% of variance) and PC2 (20.93% of variance) as well as between PC1 and PC3 (10.23% of variance). </w:t>
-      </w:r>
-      <w:r>
-        <w:rPr>
-          <w:rFonts w:ascii="Garamond" w:hAnsi="Garamond"/>
-          <w:sz w:val="22"/>
-          <w:szCs w:val="22"/>
-        </w:rPr>
-        <w:t>To identify the most discriminatory portions of the timeseries, we mapped the absolute values of principal component loadings onto their corresponding timeseries positions (Figure 5b.)</w:t>
-      </w:r>
-      <w:r>
-        <w:rPr>
-          <w:rFonts w:ascii="Garamond" w:hAnsi="Garamond"/>
-          <w:sz w:val="22"/>
-          <w:szCs w:val="22"/>
-        </w:rPr>
-        <w:t xml:space="preserve">. One individual from each watershed was chosen to illustrate this variability. </w:t>
-      </w:r>
+        <w:t>(Figure 5b.)</w:t>
+      </w:r>
+      <w:r>
+        <w:rPr>
+          <w:rFonts w:ascii="Garamond" w:hAnsi="Garamond"/>
+          <w:sz w:val="22"/>
+          <w:szCs w:val="22"/>
+        </w:rPr>
+        <w:t xml:space="preserve">. </w:t>
+      </w:r>
+    </w:p>
+    <w:p>
+      <w:pPr>
+        <w:spacing w:line="480" w:lineRule="auto"/>
+        <w:ind w:firstLine="720"/>
+        <w:rPr>
+          <w:rFonts w:ascii="Garamond" w:hAnsi="Garamond"/>
+          <w:sz w:val="22"/>
+          <w:szCs w:val="22"/>
+        </w:rPr>
+      </w:pPr>
     </w:p>
     <w:p>
       <w:pPr>
@@ -3031,16 +3359,6 @@
           <w:u w:val="single"/>
         </w:rPr>
       </w:pPr>
-    </w:p>
-    <w:p>
-      <w:pPr>
-        <w:spacing w:line="480" w:lineRule="auto"/>
-        <w:rPr>
-          <w:rFonts w:ascii="Garamond" w:hAnsi="Garamond"/>
-          <w:sz w:val="22"/>
-          <w:szCs w:val="22"/>
-        </w:rPr>
-      </w:pPr>
       <w:r>
         <w:rPr>
           <w:rFonts w:ascii="Garamond" w:hAnsi="Garamond"/>
@@ -3055,7 +3373,6 @@
     </w:p>
     <w:p>
       <w:pPr>
-        <w:pStyle w:val="NormalWeb"/>
         <w:spacing w:line="480" w:lineRule="auto"/>
         <w:ind w:firstLine="720"/>
         <w:rPr>
@@ -3070,23 +3387,82 @@
           <w:sz w:val="22"/>
           <w:szCs w:val="22"/>
         </w:rPr>
-        <w:t xml:space="preserve">All data were randomly partitioned into training and testing sets using an 80/20 split. To ensure consistency across analyses, the same individuals were assigned to the training and testing sets for all three </w:t>
-      </w:r>
-      <w:r>
-        <w:rPr>
-          <w:rFonts w:ascii="Garamond" w:hAnsi="Garamond"/>
-          <w:sz w:val="22"/>
-          <w:szCs w:val="22"/>
-        </w:rPr>
-        <w:t xml:space="preserve">datasets (non-smoothed (Raw), MA, and GAM). For each dataset we trained </w:t>
-      </w:r>
-      <w:r>
-        <w:rPr>
-          <w:rFonts w:ascii="Garamond" w:hAnsi="Garamond"/>
-          <w:sz w:val="22"/>
-          <w:szCs w:val="22"/>
-        </w:rPr>
-        <w:t xml:space="preserve">three supervised classification algorithms: </w:t>
+        <w:lastRenderedPageBreak/>
+        <w:t>All individuals in the dataset</w:t>
+      </w:r>
+      <w:r>
+        <w:rPr>
+          <w:rFonts w:ascii="Garamond" w:hAnsi="Garamond"/>
+          <w:sz w:val="22"/>
+          <w:szCs w:val="22"/>
+        </w:rPr>
+        <w:t xml:space="preserve"> were partitioned into</w:t>
+      </w:r>
+      <w:r>
+        <w:rPr>
+          <w:rFonts w:ascii="Garamond" w:hAnsi="Garamond"/>
+          <w:sz w:val="22"/>
+          <w:szCs w:val="22"/>
+        </w:rPr>
+        <w:t xml:space="preserve"> either</w:t>
+      </w:r>
+      <w:r>
+        <w:rPr>
+          <w:rFonts w:ascii="Garamond" w:hAnsi="Garamond"/>
+          <w:sz w:val="22"/>
+          <w:szCs w:val="22"/>
+        </w:rPr>
+        <w:t xml:space="preserve"> training </w:t>
+      </w:r>
+      <w:proofErr w:type="gramStart"/>
+      <w:r>
+        <w:rPr>
+          <w:rFonts w:ascii="Garamond" w:hAnsi="Garamond"/>
+          <w:sz w:val="22"/>
+          <w:szCs w:val="22"/>
+        </w:rPr>
+        <w:t>and</w:t>
+      </w:r>
+      <w:proofErr w:type="gramEnd"/>
+      <w:r>
+        <w:rPr>
+          <w:rFonts w:ascii="Garamond" w:hAnsi="Garamond"/>
+          <w:sz w:val="22"/>
+          <w:szCs w:val="22"/>
+        </w:rPr>
+        <w:t xml:space="preserve"> testing sets using a</w:t>
+      </w:r>
+      <w:r>
+        <w:rPr>
+          <w:rFonts w:ascii="Garamond" w:hAnsi="Garamond"/>
+          <w:sz w:val="22"/>
+          <w:szCs w:val="22"/>
+        </w:rPr>
+        <w:t xml:space="preserve"> randomized</w:t>
+      </w:r>
+      <w:r>
+        <w:rPr>
+          <w:rFonts w:ascii="Garamond" w:hAnsi="Garamond"/>
+          <w:sz w:val="22"/>
+          <w:szCs w:val="22"/>
+        </w:rPr>
+        <w:t xml:space="preserve"> 80/20 split. To ensure consistency across analyses, the same individuals were assigned to the training and testing sets for all three </w:t>
+      </w:r>
+      <w:r>
+        <w:rPr>
+          <w:rFonts w:ascii="Garamond" w:hAnsi="Garamond"/>
+          <w:sz w:val="22"/>
+          <w:szCs w:val="22"/>
+        </w:rPr>
+        <w:t xml:space="preserve">datasets (non-smoothed (Raw), MA, and GAM). </w:t>
+      </w:r>
+      <w:r>
+        <w:rPr>
+          <w:rFonts w:ascii="Garamond" w:hAnsi="Garamond"/>
+          <w:sz w:val="22"/>
+          <w:szCs w:val="22"/>
+        </w:rPr>
+        <w:t xml:space="preserve">On the training set for each dataset, we trained three supervised classification algorithms: </w:t>
       </w:r>
       <w:r>
         <w:rPr>
@@ -3163,26 +3539,7 @@
           <w:sz w:val="22"/>
           <w:szCs w:val="22"/>
         </w:rPr>
-        <w:t xml:space="preserve">The </w:t>
-      </w:r>
-      <w:proofErr w:type="spellStart"/>
-      <w:r>
-        <w:rPr>
-          <w:rFonts w:ascii="Garamond" w:hAnsi="Garamond"/>
-          <w:sz w:val="22"/>
-          <w:szCs w:val="22"/>
-        </w:rPr>
-        <w:lastRenderedPageBreak/>
-        <w:t>The</w:t>
-      </w:r>
-      <w:proofErr w:type="spellEnd"/>
-      <w:r>
-        <w:rPr>
-          <w:rFonts w:ascii="Garamond" w:hAnsi="Garamond"/>
-          <w:sz w:val="22"/>
-          <w:szCs w:val="22"/>
-        </w:rPr>
-        <w:t xml:space="preserve"> Random Forest model was configured with 500 trees, and the number of predictors randomly sampled at each split (</w:t>
+        <w:t>The Random Forest model was configured with 500 trees, and the number of predictors randomly sampled at each split (</w:t>
       </w:r>
       <w:proofErr w:type="spellStart"/>
       <w:r>
@@ -3203,7 +3560,6 @@
         </w:rPr>
         <w:t xml:space="preserve">) was set to the square root of the total number of predictors, following standard practice for classification problems. The KNN model was trained using five neighbors, while the SVM model used default hyperparameters for the RBF kernel. All models were implemented using the </w:t>
       </w:r>
-      <w:proofErr w:type="spellStart"/>
       <w:r>
         <w:rPr>
           <w:rStyle w:val="HTMLCode"/>
@@ -3211,16 +3567,35 @@
           <w:sz w:val="22"/>
           <w:szCs w:val="22"/>
         </w:rPr>
-        <w:t>tidymodels</w:t>
-      </w:r>
-      <w:proofErr w:type="spellEnd"/>
-      <w:r>
-        <w:rPr>
-          <w:rFonts w:ascii="Garamond" w:hAnsi="Garamond"/>
-          <w:sz w:val="22"/>
-          <w:szCs w:val="22"/>
-        </w:rPr>
-        <w:t xml:space="preserve"> framework in R</w:t>
+        <w:t xml:space="preserve">tidy </w:t>
+      </w:r>
+      <w:proofErr w:type="gramStart"/>
+      <w:r>
+        <w:rPr>
+          <w:rStyle w:val="HTMLCode"/>
+          <w:rFonts w:ascii="Garamond" w:eastAsiaTheme="majorEastAsia" w:hAnsi="Garamond"/>
+          <w:sz w:val="22"/>
+          <w:szCs w:val="22"/>
+        </w:rPr>
+        <w:t>models</w:t>
+      </w:r>
+      <w:proofErr w:type="gramEnd"/>
+      <w:r>
+        <w:rPr>
+          <w:rFonts w:ascii="Garamond" w:hAnsi="Garamond"/>
+          <w:sz w:val="22"/>
+          <w:szCs w:val="22"/>
+        </w:rPr>
+        <w:t xml:space="preserve"> framework in </w:t>
+      </w:r>
+      <w:commentRangeStart w:id="1"/>
+      <w:r>
+        <w:rPr>
+          <w:rFonts w:ascii="Garamond" w:hAnsi="Garamond"/>
+          <w:sz w:val="22"/>
+          <w:szCs w:val="22"/>
+        </w:rPr>
+        <w:t>R</w:t>
       </w:r>
       <w:r>
         <w:rPr>
@@ -3229,6 +3604,13 @@
           <w:szCs w:val="22"/>
         </w:rPr>
         <w:t xml:space="preserve">. </w:t>
+      </w:r>
+      <w:commentRangeEnd w:id="1"/>
+      <w:r>
+        <w:rPr>
+          <w:rStyle w:val="CommentReference"/>
+        </w:rPr>
+        <w:commentReference w:id="1"/>
       </w:r>
     </w:p>
     <w:p>
@@ -3248,7 +3630,83 @@
           <w:sz w:val="22"/>
           <w:szCs w:val="22"/>
         </w:rPr>
-        <w:t xml:space="preserve">Trained models were evaluated on two separate testing datasets. First, models were tested on the original randomly selected 20% holdout set. Second, models were evaluated on a modified testing set in which samples with natal origin </w:t>
+        <w:t xml:space="preserve">Trained models were </w:t>
+      </w:r>
+      <w:r>
+        <w:rPr>
+          <w:rFonts w:ascii="Garamond" w:hAnsi="Garamond"/>
+          <w:sz w:val="22"/>
+          <w:szCs w:val="22"/>
+        </w:rPr>
+        <w:t xml:space="preserve">then </w:t>
+      </w:r>
+      <w:r>
+        <w:rPr>
+          <w:rFonts w:ascii="Garamond" w:hAnsi="Garamond"/>
+          <w:sz w:val="22"/>
+          <w:szCs w:val="22"/>
+        </w:rPr>
+        <w:t xml:space="preserve">evaluated on two separate </w:t>
+      </w:r>
+      <w:r>
+        <w:rPr>
+          <w:rFonts w:ascii="Garamond" w:hAnsi="Garamond"/>
+          <w:sz w:val="22"/>
+          <w:szCs w:val="22"/>
+        </w:rPr>
+        <w:t>versions of the training dataset for each data type</w:t>
+      </w:r>
+      <w:r>
+        <w:rPr>
+          <w:rFonts w:ascii="Garamond" w:hAnsi="Garamond"/>
+          <w:sz w:val="22"/>
+          <w:szCs w:val="22"/>
+        </w:rPr>
+        <w:t>. First, models were tested on the original randomly selected 20% holdout set</w:t>
+      </w:r>
+      <w:r>
+        <w:rPr>
+          <w:rFonts w:ascii="Garamond" w:hAnsi="Garamond"/>
+          <w:sz w:val="22"/>
+          <w:szCs w:val="22"/>
+        </w:rPr>
+        <w:t xml:space="preserve"> </w:t>
+      </w:r>
+      <w:proofErr w:type="gramStart"/>
+      <w:r>
+        <w:rPr>
+          <w:rFonts w:ascii="Garamond" w:hAnsi="Garamond"/>
+          <w:sz w:val="22"/>
+          <w:szCs w:val="22"/>
+        </w:rPr>
+        <w:t>( N</w:t>
+      </w:r>
+      <w:proofErr w:type="gramEnd"/>
+      <w:r>
+        <w:rPr>
+          <w:rFonts w:ascii="Garamond" w:hAnsi="Garamond"/>
+          <w:sz w:val="22"/>
+          <w:szCs w:val="22"/>
+        </w:rPr>
+        <w:t xml:space="preserve"> = </w:t>
+      </w:r>
+      <w:proofErr w:type="gramStart"/>
+      <w:r>
+        <w:rPr>
+          <w:rFonts w:ascii="Garamond" w:hAnsi="Garamond"/>
+          <w:sz w:val="22"/>
+          <w:szCs w:val="22"/>
+        </w:rPr>
+        <w:t>X )</w:t>
+      </w:r>
+      <w:proofErr w:type="gramEnd"/>
+      <w:r>
+        <w:rPr>
+          <w:rFonts w:ascii="Garamond" w:hAnsi="Garamond"/>
+          <w:sz w:val="22"/>
+          <w:szCs w:val="22"/>
+        </w:rPr>
+        <w:t xml:space="preserve">. Second, models were evaluated on a modified testing set in which samples with natal origin </w:t>
       </w:r>
       <w:r>
         <w:rPr>
@@ -3280,7 +3738,39 @@
           <w:sz w:val="22"/>
           <w:szCs w:val="22"/>
         </w:rPr>
-        <w:t>Sr values above 0.7150 were removed. Only the Yukon watershed contains enriched isotope values above this threshold and can therefore be distinguished using natal origin values alone. This modified dataset tests model classification accuracy on samples that are otherwise indistinguishable using natal origin values. These testing sets are referred to as the 'Total' and 'Overlapping' testing sets.</w:t>
+        <w:t xml:space="preserve">Sr values above 0.7150 were </w:t>
+      </w:r>
+      <w:r>
+        <w:rPr>
+          <w:rFonts w:ascii="Garamond" w:hAnsi="Garamond"/>
+          <w:sz w:val="22"/>
+          <w:szCs w:val="22"/>
+        </w:rPr>
+        <w:t>excluded</w:t>
+      </w:r>
+      <w:r>
+        <w:rPr>
+          <w:rFonts w:ascii="Garamond" w:hAnsi="Garamond"/>
+          <w:sz w:val="22"/>
+          <w:szCs w:val="22"/>
+        </w:rPr>
+        <w:t>. Only the Yukon watershed contains enriched isotope values above this threshold and can therefore be distinguished using natal origin values alone. This modified dataset</w:t>
+      </w:r>
+      <w:r>
+        <w:rPr>
+          <w:rFonts w:ascii="Garamond" w:hAnsi="Garamond"/>
+          <w:sz w:val="22"/>
+          <w:szCs w:val="22"/>
+        </w:rPr>
+        <w:t xml:space="preserve">, </w:t>
+      </w:r>
+      <w:r>
+        <w:rPr>
+          <w:rFonts w:ascii="Garamond" w:hAnsi="Garamond"/>
+          <w:sz w:val="22"/>
+          <w:szCs w:val="22"/>
+        </w:rPr>
+        <w:t>hereby</w:t>
       </w:r>
       <w:r>
         <w:rPr>
@@ -3290,6 +3780,48 @@
         </w:rPr>
         <w:t xml:space="preserve"> </w:t>
       </w:r>
+      <w:proofErr w:type="spellStart"/>
+      <w:r>
+        <w:rPr>
+          <w:rFonts w:ascii="Garamond" w:hAnsi="Garamond"/>
+          <w:sz w:val="22"/>
+          <w:szCs w:val="22"/>
+        </w:rPr>
+        <w:t>refered</w:t>
+      </w:r>
+      <w:proofErr w:type="spellEnd"/>
+      <w:r>
+        <w:rPr>
+          <w:rFonts w:ascii="Garamond" w:hAnsi="Garamond"/>
+          <w:sz w:val="22"/>
+          <w:szCs w:val="22"/>
+        </w:rPr>
+        <w:t xml:space="preserve"> to as the “Overlap” testing set evaluates the ability of the model to correctly classify </w:t>
+      </w:r>
+      <w:r>
+        <w:rPr>
+          <w:rFonts w:ascii="Garamond" w:hAnsi="Garamond"/>
+          <w:sz w:val="22"/>
+          <w:szCs w:val="22"/>
+        </w:rPr>
+        <w:t>o</w:t>
+      </w:r>
+      <w:r>
+        <w:rPr>
+          <w:rFonts w:ascii="Garamond" w:hAnsi="Garamond"/>
+          <w:sz w:val="22"/>
+          <w:szCs w:val="22"/>
+        </w:rPr>
+        <w:t>nly</w:t>
+      </w:r>
+      <w:r>
+        <w:rPr>
+          <w:rFonts w:ascii="Garamond" w:hAnsi="Garamond"/>
+          <w:sz w:val="22"/>
+          <w:szCs w:val="22"/>
+        </w:rPr>
+        <w:t xml:space="preserve"> samples that are otherwise indistinguishable using natal origin values. </w:t>
+      </w:r>
       <w:r>
         <w:rPr>
           <w:rFonts w:ascii="Garamond" w:hAnsi="Garamond"/>
@@ -3304,18 +3836,82 @@
           <w:sz w:val="22"/>
           <w:szCs w:val="22"/>
         </w:rPr>
-        <w:t xml:space="preserve">accuracy and F1-Score (Figure 2). For the highest preforming model, confusing matrices were generated for both testing sets to visualize class-specific classification accuracy and to explore trends in misclassification among classes (Figure 3). </w:t>
-      </w:r>
-    </w:p>
-    <w:p>
-      <w:pPr>
+        <w:t>accuracy and F1-Score (Figure 2).</w:t>
+      </w:r>
+      <w:r>
+        <w:rPr>
+          <w:rFonts w:ascii="Garamond" w:hAnsi="Garamond"/>
+          <w:sz w:val="22"/>
+          <w:szCs w:val="22"/>
+        </w:rPr>
+        <w:t xml:space="preserve"> </w:t>
+      </w:r>
+      <w:r>
+        <w:rPr>
+          <w:rFonts w:ascii="Garamond" w:hAnsi="Garamond"/>
+          <w:sz w:val="22"/>
+          <w:szCs w:val="22"/>
+        </w:rPr>
+        <w:t xml:space="preserve">Model performance was assessed using </w:t>
+      </w:r>
+      <w:r>
+        <w:rPr>
+          <w:rStyle w:val="Strong"/>
+          <w:rFonts w:ascii="Garamond" w:eastAsiaTheme="majorEastAsia" w:hAnsi="Garamond"/>
+          <w:b w:val="0"/>
+          <w:bCs w:val="0"/>
+          <w:sz w:val="22"/>
+          <w:szCs w:val="22"/>
+        </w:rPr>
+        <w:t>accuracy</w:t>
+      </w:r>
+      <w:r>
         <w:rPr>
           <w:rFonts w:ascii="Garamond" w:hAnsi="Garamond"/>
           <w:b/>
           <w:bCs/>
           <w:sz w:val="22"/>
           <w:szCs w:val="22"/>
-          <w:u w:val="single"/>
+        </w:rPr>
+        <w:t xml:space="preserve"> </w:t>
+      </w:r>
+      <w:r>
+        <w:rPr>
+          <w:rFonts w:ascii="Garamond" w:hAnsi="Garamond"/>
+          <w:sz w:val="22"/>
+          <w:szCs w:val="22"/>
+        </w:rPr>
+        <w:t xml:space="preserve">and </w:t>
+      </w:r>
+      <w:r>
+        <w:rPr>
+          <w:rStyle w:val="Strong"/>
+          <w:rFonts w:ascii="Garamond" w:eastAsiaTheme="majorEastAsia" w:hAnsi="Garamond"/>
+          <w:b w:val="0"/>
+          <w:bCs w:val="0"/>
+          <w:sz w:val="22"/>
+          <w:szCs w:val="22"/>
+        </w:rPr>
+        <w:t>F1-score</w:t>
+      </w:r>
+      <w:r>
+        <w:rPr>
+          <w:rFonts w:ascii="Garamond" w:hAnsi="Garamond"/>
+          <w:sz w:val="22"/>
+          <w:szCs w:val="22"/>
+        </w:rPr>
+        <w:t>. Accuracy measures the proportion of correctly classified samples:</w:t>
+      </w:r>
+    </w:p>
+    <w:p>
+      <w:pPr>
+        <w:pStyle w:val="NormalWeb"/>
+        <w:spacing w:line="480" w:lineRule="auto"/>
+        <w:jc w:val="center"/>
+        <w:rPr>
+          <w:rFonts w:ascii="Garamond" w:hAnsi="Garamond"/>
+          <w:sz w:val="22"/>
+          <w:szCs w:val="22"/>
         </w:rPr>
       </w:pPr>
       <w:r>
@@ -3325,10 +3921,105 @@
           <w:bCs/>
           <w:sz w:val="22"/>
           <w:szCs w:val="22"/>
-          <w:u w:val="single"/>
-        </w:rPr>
-        <w:t xml:space="preserve">Probability </w:t>
-      </w:r>
+        </w:rPr>
+        <w:t>Accuracy</w:t>
+      </w:r>
+      <w:r>
+        <w:rPr>
+          <w:rFonts w:ascii="Garamond" w:hAnsi="Garamond"/>
+          <w:sz w:val="22"/>
+          <w:szCs w:val="22"/>
+        </w:rPr>
+        <w:t xml:space="preserve"> = Correct predictions/ Total predictions</w:t>
+      </w:r>
+    </w:p>
+    <w:p>
+      <w:pPr>
+        <w:pStyle w:val="NormalWeb"/>
+        <w:spacing w:line="480" w:lineRule="auto"/>
+        <w:rPr>
+          <w:rFonts w:ascii="Garamond" w:hAnsi="Garamond"/>
+          <w:sz w:val="22"/>
+          <w:szCs w:val="22"/>
+        </w:rPr>
+      </w:pPr>
+      <w:r>
+        <w:rPr>
+          <w:rFonts w:ascii="Garamond" w:hAnsi="Garamond"/>
+          <w:sz w:val="22"/>
+          <w:szCs w:val="22"/>
+        </w:rPr>
+        <w:t xml:space="preserve">The </w:t>
+      </w:r>
+      <w:r>
+        <w:rPr>
+          <w:rStyle w:val="Strong"/>
+          <w:rFonts w:ascii="Garamond" w:eastAsiaTheme="majorEastAsia" w:hAnsi="Garamond"/>
+          <w:b w:val="0"/>
+          <w:bCs w:val="0"/>
+          <w:sz w:val="22"/>
+          <w:szCs w:val="22"/>
+        </w:rPr>
+        <w:t>F1-score</w:t>
+      </w:r>
+      <w:r>
+        <w:rPr>
+          <w:rFonts w:ascii="Garamond" w:hAnsi="Garamond"/>
+          <w:sz w:val="22"/>
+          <w:szCs w:val="22"/>
+        </w:rPr>
+        <w:t xml:space="preserve"> balances </w:t>
+      </w:r>
+      <w:r>
+        <w:rPr>
+          <w:rStyle w:val="Strong"/>
+          <w:rFonts w:ascii="Garamond" w:eastAsiaTheme="majorEastAsia" w:hAnsi="Garamond"/>
+          <w:b w:val="0"/>
+          <w:bCs w:val="0"/>
+          <w:sz w:val="22"/>
+          <w:szCs w:val="22"/>
+        </w:rPr>
+        <w:t>precision</w:t>
+      </w:r>
+      <w:r>
+        <w:rPr>
+          <w:rFonts w:ascii="Garamond" w:hAnsi="Garamond"/>
+          <w:sz w:val="22"/>
+          <w:szCs w:val="22"/>
+        </w:rPr>
+        <w:t xml:space="preserve"> and </w:t>
+      </w:r>
+      <w:r>
+        <w:rPr>
+          <w:rStyle w:val="Strong"/>
+          <w:rFonts w:ascii="Garamond" w:eastAsiaTheme="majorEastAsia" w:hAnsi="Garamond"/>
+          <w:b w:val="0"/>
+          <w:bCs w:val="0"/>
+          <w:sz w:val="22"/>
+          <w:szCs w:val="22"/>
+        </w:rPr>
+        <w:t>recall</w:t>
+      </w:r>
+      <w:r>
+        <w:rPr>
+          <w:rFonts w:ascii="Garamond" w:hAnsi="Garamond"/>
+          <w:sz w:val="22"/>
+          <w:szCs w:val="22"/>
+        </w:rPr>
+        <w:t xml:space="preserve"> and is calculated as their harmonic mean:</w:t>
+      </w:r>
+    </w:p>
+    <w:p>
+      <w:pPr>
+        <w:pStyle w:val="NormalWeb"/>
+        <w:spacing w:line="480" w:lineRule="auto"/>
+        <w:jc w:val="center"/>
+        <w:rPr>
+          <w:rFonts w:ascii="Garamond" w:hAnsi="Garamond"/>
+          <w:sz w:val="22"/>
+          <w:szCs w:val="22"/>
+        </w:rPr>
+      </w:pPr>
       <w:r>
         <w:rPr>
           <w:rFonts w:ascii="Garamond" w:hAnsi="Garamond"/>
@@ -3336,9 +4027,47 @@
           <w:bCs/>
           <w:sz w:val="22"/>
           <w:szCs w:val="22"/>
-          <w:u w:val="single"/>
-        </w:rPr>
-        <w:t xml:space="preserve">calibration </w:t>
+        </w:rPr>
+        <w:t>F1-Score</w:t>
+      </w:r>
+      <w:r>
+        <w:rPr>
+          <w:rFonts w:ascii="Garamond" w:hAnsi="Garamond"/>
+          <w:sz w:val="22"/>
+          <w:szCs w:val="22"/>
+        </w:rPr>
+        <w:t xml:space="preserve"> = 2 * (Precision * Recall) / (Precision + Recall)</w:t>
+      </w:r>
+    </w:p>
+    <w:p>
+      <w:pPr>
+        <w:pStyle w:val="NormalWeb"/>
+        <w:spacing w:line="480" w:lineRule="auto"/>
+        <w:ind w:firstLine="720"/>
+        <w:rPr>
+          <w:rFonts w:ascii="Garamond" w:hAnsi="Garamond"/>
+          <w:sz w:val="22"/>
+          <w:szCs w:val="22"/>
+        </w:rPr>
+      </w:pPr>
+      <w:r>
+        <w:rPr>
+          <w:rFonts w:ascii="Garamond" w:hAnsi="Garamond"/>
+          <w:sz w:val="22"/>
+          <w:szCs w:val="22"/>
+        </w:rPr>
+        <w:t xml:space="preserve">Here, </w:t>
+      </w:r>
+      <w:r>
+        <w:rPr>
+          <w:rStyle w:val="Strong"/>
+          <w:rFonts w:ascii="Garamond" w:eastAsiaTheme="majorEastAsia" w:hAnsi="Garamond"/>
+          <w:b w:val="0"/>
+          <w:bCs w:val="0"/>
+          <w:sz w:val="22"/>
+          <w:szCs w:val="22"/>
+        </w:rPr>
+        <w:t>precision</w:t>
       </w:r>
       <w:r>
         <w:rPr>
@@ -3347,7 +4076,140 @@
           <w:bCs/>
           <w:sz w:val="22"/>
           <w:szCs w:val="22"/>
-          <w:u w:val="single"/>
+        </w:rPr>
+        <w:t xml:space="preserve"> </w:t>
+      </w:r>
+      <w:r>
+        <w:rPr>
+          <w:rFonts w:ascii="Garamond" w:hAnsi="Garamond"/>
+          <w:sz w:val="22"/>
+          <w:szCs w:val="22"/>
+        </w:rPr>
+        <w:t xml:space="preserve">is the proportion of samples predicted as positive that are truly positive, and </w:t>
+      </w:r>
+      <w:r>
+        <w:rPr>
+          <w:rStyle w:val="Strong"/>
+          <w:rFonts w:ascii="Garamond" w:eastAsiaTheme="majorEastAsia" w:hAnsi="Garamond"/>
+          <w:b w:val="0"/>
+          <w:bCs w:val="0"/>
+          <w:sz w:val="22"/>
+          <w:szCs w:val="22"/>
+        </w:rPr>
+        <w:t>recall</w:t>
+      </w:r>
+      <w:r>
+        <w:rPr>
+          <w:rFonts w:ascii="Garamond" w:hAnsi="Garamond"/>
+          <w:sz w:val="22"/>
+          <w:szCs w:val="22"/>
+        </w:rPr>
+        <w:t xml:space="preserve"> is the proportion of actual positive samples that are correctly identified. The F1-score provides a single metric </w:t>
+      </w:r>
+      <w:r>
+        <w:rPr>
+          <w:rFonts w:ascii="Garamond" w:hAnsi="Garamond"/>
+          <w:sz w:val="22"/>
+          <w:szCs w:val="22"/>
+        </w:rPr>
+        <w:lastRenderedPageBreak/>
+        <w:t>that accounts for both false positives and false negatives, making it particularly useful for evaluating performance on imbalanced datasets.</w:t>
+      </w:r>
+    </w:p>
+    <w:p>
+      <w:pPr>
+        <w:pStyle w:val="NormalWeb"/>
+        <w:spacing w:line="480" w:lineRule="auto"/>
+        <w:ind w:firstLine="720"/>
+        <w:rPr>
+          <w:rFonts w:ascii="Garamond" w:hAnsi="Garamond"/>
+          <w:sz w:val="22"/>
+          <w:szCs w:val="22"/>
+        </w:rPr>
+      </w:pPr>
+      <w:r>
+        <w:rPr>
+          <w:rFonts w:ascii="Garamond" w:hAnsi="Garamond"/>
+          <w:sz w:val="22"/>
+          <w:szCs w:val="22"/>
+        </w:rPr>
+        <w:t xml:space="preserve">For the highest-performing model, </w:t>
+      </w:r>
+      <w:r>
+        <w:rPr>
+          <w:rStyle w:val="Strong"/>
+          <w:rFonts w:ascii="Garamond" w:eastAsiaTheme="majorEastAsia" w:hAnsi="Garamond"/>
+          <w:b w:val="0"/>
+          <w:bCs w:val="0"/>
+          <w:sz w:val="22"/>
+          <w:szCs w:val="22"/>
+        </w:rPr>
+        <w:t>confusion matrices</w:t>
+      </w:r>
+      <w:r>
+        <w:rPr>
+          <w:rFonts w:ascii="Garamond" w:hAnsi="Garamond"/>
+          <w:b/>
+          <w:bCs/>
+          <w:sz w:val="22"/>
+          <w:szCs w:val="22"/>
+        </w:rPr>
+        <w:t xml:space="preserve"> </w:t>
+      </w:r>
+      <w:r>
+        <w:rPr>
+          <w:rFonts w:ascii="Garamond" w:hAnsi="Garamond"/>
+          <w:sz w:val="22"/>
+          <w:szCs w:val="22"/>
+        </w:rPr>
+        <w:t>were generated to visualize class-specific accuracy and to explore trends in misclassification among classes (Figure 3).</w:t>
+      </w:r>
+      <w:r>
+        <w:rPr>
+          <w:rFonts w:ascii="Garamond" w:hAnsi="Garamond"/>
+          <w:sz w:val="22"/>
+          <w:szCs w:val="22"/>
+        </w:rPr>
+        <w:t xml:space="preserve"> In addition to accuracy by watershed, we calculated the accuracy of fish from within the CWAK (Coastal Western Alaska) genetic reporting group (Figure 1) by removing individuals with genetic assignments from the Middle or Upper Yukon reporting groups, which are outside of the CWAK region. </w:t>
+      </w:r>
+    </w:p>
+    <w:p>
+      <w:pPr>
+        <w:rPr>
+          <w:rFonts w:ascii="Garamond" w:hAnsi="Garamond"/>
+          <w:b/>
+          <w:bCs/>
+          <w:sz w:val="22"/>
+          <w:szCs w:val="22"/>
+        </w:rPr>
+      </w:pPr>
+      <w:r>
+        <w:rPr>
+          <w:rFonts w:ascii="Garamond" w:hAnsi="Garamond"/>
+          <w:b/>
+          <w:bCs/>
+          <w:sz w:val="22"/>
+          <w:szCs w:val="22"/>
+        </w:rPr>
+        <w:t xml:space="preserve">Probability </w:t>
+      </w:r>
+      <w:r>
+        <w:rPr>
+          <w:rFonts w:ascii="Garamond" w:hAnsi="Garamond"/>
+          <w:b/>
+          <w:bCs/>
+          <w:sz w:val="22"/>
+          <w:szCs w:val="22"/>
+        </w:rPr>
+        <w:t xml:space="preserve">calibration </w:t>
+      </w:r>
+      <w:r>
+        <w:rPr>
+          <w:rFonts w:ascii="Garamond" w:hAnsi="Garamond"/>
+          <w:b/>
+          <w:bCs/>
+          <w:sz w:val="22"/>
+          <w:szCs w:val="22"/>
         </w:rPr>
         <w:t xml:space="preserve">and threshold testing </w:t>
       </w:r>
@@ -3373,6 +4235,14 @@
       </w:r>
       <w:r>
         <w:rPr>
+          <w:rFonts w:ascii="Garamond" w:hAnsi="Garamond"/>
+          <w:sz w:val="22"/>
+          <w:szCs w:val="22"/>
+        </w:rPr>
+        <w:t>{</w:t>
+      </w:r>
+      <w:r>
+        <w:rPr>
           <w:rStyle w:val="HTMLCode"/>
           <w:rFonts w:ascii="Garamond" w:eastAsiaTheme="majorEastAsia" w:hAnsi="Garamond"/>
           <w:sz w:val="22"/>
@@ -3382,11 +4252,120 @@
       </w:r>
       <w:r>
         <w:rPr>
-          <w:rFonts w:ascii="Garamond" w:hAnsi="Garamond"/>
-          <w:sz w:val="22"/>
-          <w:szCs w:val="22"/>
-        </w:rPr>
-        <w:t xml:space="preserve"> package in R to apply multinomial isotonic regression to our testing set predictions. This approach adjusts the raw probability outputs to better align predicted confidence with actual classification accuracy through a non-parametric monotonic transformation. We verified calibration effectiveness through diagrams that plot predicted probabilities against observed class frequencies across probability bins. Additionally, we quantified calibration improvements using Brier scores and logarithmic loss </w:t>
+          <w:rStyle w:val="HTMLCode"/>
+          <w:rFonts w:ascii="Garamond" w:eastAsiaTheme="majorEastAsia" w:hAnsi="Garamond"/>
+          <w:sz w:val="22"/>
+          <w:szCs w:val="22"/>
+        </w:rPr>
+        <w:t>}</w:t>
+      </w:r>
+      <w:r>
+        <w:rPr>
+          <w:rFonts w:ascii="Garamond" w:hAnsi="Garamond"/>
+          <w:sz w:val="22"/>
+          <w:szCs w:val="22"/>
+        </w:rPr>
+        <w:t xml:space="preserve"> package in R to apply multinomial isotonic regression to our testing set predictions. This approach adjusts the raw probability outputs to better align predicted confidence with actual classification accuracy through a non-parametric monotonic transformation. We verified calibration effectiveness through </w:t>
+      </w:r>
+      <w:r>
+        <w:rPr>
+          <w:rFonts w:ascii="Garamond" w:hAnsi="Garamond"/>
+          <w:sz w:val="22"/>
+          <w:szCs w:val="22"/>
+        </w:rPr>
+        <w:t xml:space="preserve">visual assessment of </w:t>
+      </w:r>
+      <w:r>
+        <w:rPr>
+          <w:rFonts w:ascii="Garamond" w:hAnsi="Garamond"/>
+          <w:sz w:val="22"/>
+          <w:szCs w:val="22"/>
+        </w:rPr>
+        <w:t>diagrams that plot predicted probabilities against observed class frequencies across probability bins. Additionally, we quantified calibration improvements using Brier scores and logarithmic loss calculated before and after calibration.</w:t>
+      </w:r>
+      <w:r>
+        <w:rPr>
+          <w:rFonts w:ascii="Garamond" w:hAnsi="Garamond"/>
+          <w:sz w:val="22"/>
+          <w:szCs w:val="22"/>
+        </w:rPr>
+        <w:t xml:space="preserve"> </w:t>
+      </w:r>
+      <w:r>
+        <w:rPr>
+          <w:rFonts w:ascii="Garamond" w:hAnsi="Garamond"/>
+          <w:sz w:val="22"/>
+          <w:szCs w:val="22"/>
+        </w:rPr>
+        <w:t>Calibration transformations were fitted separately for each model-data type combination and stored as reusable functions that can be applied consistently to future predictions. This ensures that probability estimates from our models accurately reflect true classification confidence</w:t>
+      </w:r>
+      <w:r>
+        <w:rPr>
+          <w:rFonts w:ascii="Garamond" w:hAnsi="Garamond"/>
+          <w:sz w:val="22"/>
+          <w:szCs w:val="22"/>
+        </w:rPr>
+        <w:t xml:space="preserve">. </w:t>
+      </w:r>
+    </w:p>
+    <w:p>
+      <w:pPr>
+        <w:pStyle w:val="whitespace-normal"/>
+        <w:spacing w:line="480" w:lineRule="auto"/>
+        <w:ind w:firstLine="720"/>
+        <w:rPr>
+          <w:rFonts w:ascii="Garamond" w:hAnsi="Garamond"/>
+          <w:sz w:val="22"/>
+          <w:szCs w:val="22"/>
+        </w:rPr>
+      </w:pPr>
+      <w:r>
+        <w:rPr>
+          <w:rFonts w:ascii="Garamond" w:hAnsi="Garamond"/>
+          <w:sz w:val="22"/>
+          <w:szCs w:val="22"/>
+        </w:rPr>
+        <w:t xml:space="preserve">From calibrated </w:t>
+      </w:r>
+      <w:r>
+        <w:rPr>
+          <w:rFonts w:ascii="Garamond" w:hAnsi="Garamond"/>
+          <w:sz w:val="22"/>
+          <w:szCs w:val="22"/>
+        </w:rPr>
+        <w:t xml:space="preserve">testing set </w:t>
+      </w:r>
+      <w:r>
+        <w:rPr>
+          <w:rFonts w:ascii="Garamond" w:hAnsi="Garamond"/>
+          <w:sz w:val="22"/>
+          <w:szCs w:val="22"/>
+        </w:rPr>
+        <w:t>probabiliti</w:t>
+      </w:r>
+      <w:r>
+        <w:rPr>
+          <w:rFonts w:ascii="Garamond" w:hAnsi="Garamond"/>
+          <w:sz w:val="22"/>
+          <w:szCs w:val="22"/>
+        </w:rPr>
+        <w:t>es</w:t>
+      </w:r>
+      <w:r>
+        <w:rPr>
+          <w:rFonts w:ascii="Garamond" w:hAnsi="Garamond"/>
+          <w:sz w:val="22"/>
+          <w:szCs w:val="22"/>
+        </w:rPr>
+        <w:t xml:space="preserve"> we tested the accuracy obtained </w:t>
+      </w:r>
+      <w:r>
+        <w:rPr>
+          <w:rFonts w:ascii="Garamond" w:hAnsi="Garamond"/>
+          <w:sz w:val="22"/>
+          <w:szCs w:val="22"/>
+        </w:rPr>
+        <w:t xml:space="preserve">from our model with an added confidence threshold. Meaning, we evaluated the proportion of correctly assigned individuals which </w:t>
       </w:r>
       <w:r>
         <w:rPr>
@@ -3395,43 +4374,15 @@
           <w:szCs w:val="22"/>
         </w:rPr>
         <w:lastRenderedPageBreak/>
-        <w:t xml:space="preserve">calculated before and after </w:t>
-      </w:r>
-      <w:proofErr w:type="spellStart"/>
-      <w:proofErr w:type="gramStart"/>
-      <w:r>
-        <w:rPr>
-          <w:rFonts w:ascii="Garamond" w:hAnsi="Garamond"/>
-          <w:sz w:val="22"/>
-          <w:szCs w:val="22"/>
-        </w:rPr>
-        <w:t>calibration.Calibration</w:t>
-      </w:r>
-      <w:proofErr w:type="spellEnd"/>
-      <w:proofErr w:type="gramEnd"/>
-      <w:r>
-        <w:rPr>
-          <w:rFonts w:ascii="Garamond" w:hAnsi="Garamond"/>
-          <w:sz w:val="22"/>
-          <w:szCs w:val="22"/>
-        </w:rPr>
-        <w:t xml:space="preserve"> transformations were fitted separately for each model-data type combination and stored as reusable functions that can be applied consistently to future predictions. This ensures that probability estimates from our models accurately reflect true classification confidence</w:t>
-      </w:r>
-      <w:r>
-        <w:rPr>
-          <w:rFonts w:ascii="Garamond" w:hAnsi="Garamond"/>
-          <w:sz w:val="22"/>
-          <w:szCs w:val="22"/>
-        </w:rPr>
-        <w:t>. From calibrated probabilities we tested the accuracy obtained with different confidence thresholds for the highest preforming model. This is defined as the probability of correctly assigned individuals with a</w:t>
-      </w:r>
-      <w:r>
-        <w:rPr>
-          <w:rFonts w:ascii="Garamond" w:hAnsi="Garamond"/>
-          <w:sz w:val="22"/>
-          <w:szCs w:val="22"/>
-        </w:rPr>
-        <w:t xml:space="preserve">n assignment probability greater than a given threshold. We tested thresholds of 60 – 90 % confidence by 5% increments and recorded both the class specific and overall accuracy at each (Figure 6). </w:t>
+        <w:t xml:space="preserve">were also given a calibrated probability value above a given threshold. </w:t>
+      </w:r>
+      <w:r>
+        <w:rPr>
+          <w:rFonts w:ascii="Garamond" w:hAnsi="Garamond"/>
+          <w:sz w:val="22"/>
+          <w:szCs w:val="22"/>
+        </w:rPr>
+        <w:t xml:space="preserve">We tested thresholds of 60 – 90 % by 5% increments and recorded both the class specific and overall accuracy at each (Figure 6). </w:t>
       </w:r>
     </w:p>
     <w:p>
@@ -3443,8 +4394,8 @@
           <w:rFonts w:ascii="Garamond" w:hAnsi="Garamond"/>
           <w:b/>
           <w:bCs/>
-          <w:sz w:val="40"/>
-          <w:szCs w:val="40"/>
+          <w:sz w:val="32"/>
+          <w:szCs w:val="32"/>
         </w:rPr>
       </w:pPr>
       <w:r>
@@ -3452,8 +4403,8 @@
           <w:rFonts w:ascii="Garamond" w:hAnsi="Garamond"/>
           <w:b/>
           <w:bCs/>
-          <w:sz w:val="40"/>
-          <w:szCs w:val="40"/>
+          <w:sz w:val="32"/>
+          <w:szCs w:val="32"/>
         </w:rPr>
         <w:t xml:space="preserve">Results </w:t>
       </w:r>
@@ -3467,6 +4418,8 @@
           <w:rFonts w:ascii="Garamond" w:hAnsi="Garamond"/>
           <w:b/>
           <w:bCs/>
+          <w:sz w:val="22"/>
+          <w:szCs w:val="22"/>
         </w:rPr>
       </w:pPr>
     </w:p>
@@ -3479,6 +4432,8 @@
           <w:rFonts w:ascii="Garamond" w:hAnsi="Garamond"/>
           <w:b/>
           <w:bCs/>
+          <w:sz w:val="22"/>
+          <w:szCs w:val="22"/>
         </w:rPr>
       </w:pPr>
       <w:r>
@@ -3486,6 +4441,8 @@
           <w:rFonts w:ascii="Garamond" w:hAnsi="Garamond"/>
           <w:b/>
           <w:bCs/>
+          <w:sz w:val="22"/>
+          <w:szCs w:val="22"/>
         </w:rPr>
         <w:t xml:space="preserve">Model Performance </w:t>
       </w:r>
@@ -3665,7 +4622,69 @@
           <w:sz w:val="22"/>
           <w:szCs w:val="22"/>
         </w:rPr>
-        <w:t xml:space="preserve"> fish estimated to have been Kuskokwim (8.6% of Kuskokwim fish) followed by the inverse </w:t>
+        <w:t xml:space="preserve"> fish estimated to have been Kuskokwim (8.6% of Kuskokwim fish) followed by the inverse (5.6% of </w:t>
+      </w:r>
+      <w:proofErr w:type="spellStart"/>
+      <w:r>
+        <w:rPr>
+          <w:rFonts w:ascii="Garamond" w:hAnsi="Garamond"/>
+          <w:sz w:val="22"/>
+          <w:szCs w:val="22"/>
+        </w:rPr>
+        <w:t>Nushagak</w:t>
+      </w:r>
+      <w:proofErr w:type="spellEnd"/>
+      <w:r>
+        <w:rPr>
+          <w:rFonts w:ascii="Garamond" w:hAnsi="Garamond"/>
+          <w:sz w:val="22"/>
+          <w:szCs w:val="22"/>
+        </w:rPr>
+        <w:t xml:space="preserve"> fish). Interestingly, after removing the easiest discernable Yukon fish (Sr8786 &gt;</w:t>
+      </w:r>
+      <w:r>
+        <w:rPr>
+          <w:rFonts w:ascii="Garamond" w:hAnsi="Garamond"/>
+          <w:sz w:val="22"/>
+          <w:szCs w:val="22"/>
+        </w:rPr>
+        <w:t xml:space="preserve">.7150), Yukon classification accuracy dropped to 86.8%. Classification accuracy for </w:t>
+      </w:r>
+      <w:proofErr w:type="spellStart"/>
+      <w:r>
+        <w:rPr>
+          <w:rFonts w:ascii="Garamond" w:hAnsi="Garamond"/>
+          <w:sz w:val="22"/>
+          <w:szCs w:val="22"/>
+        </w:rPr>
+        <w:t>Nushagak</w:t>
+      </w:r>
+      <w:proofErr w:type="spellEnd"/>
+      <w:r>
+        <w:rPr>
+          <w:rFonts w:ascii="Garamond" w:hAnsi="Garamond"/>
+          <w:sz w:val="22"/>
+          <w:szCs w:val="22"/>
+        </w:rPr>
+        <w:t xml:space="preserve"> fish did not change (91.4%) whereas Kuskokwim saw a slight increase to 92.5%. In this testing set the most frequent misclassification was Yukon fish predicted to have been Kuskokwim (8.8% of Yukon fish</w:t>
+      </w:r>
+      <w:proofErr w:type="gramStart"/>
+      <w:r>
+        <w:rPr>
+          <w:rFonts w:ascii="Garamond" w:hAnsi="Garamond"/>
+          <w:sz w:val="22"/>
+          <w:szCs w:val="22"/>
+        </w:rPr>
+        <w:t>),</w:t>
+      </w:r>
+      <w:proofErr w:type="gramEnd"/>
+      <w:r>
+        <w:rPr>
+          <w:rFonts w:ascii="Garamond" w:hAnsi="Garamond"/>
+          <w:sz w:val="22"/>
+          <w:szCs w:val="22"/>
+        </w:rPr>
+        <w:t xml:space="preserve"> however this represented only one additional individual misclassified (9 in the total analysis vs 8 in the overlapping </w:t>
       </w:r>
       <w:r>
         <w:rPr>
@@ -3674,69 +4693,23 @@
           <w:szCs w:val="22"/>
         </w:rPr>
         <w:lastRenderedPageBreak/>
-        <w:t xml:space="preserve">(5.6% of </w:t>
-      </w:r>
-      <w:proofErr w:type="spellStart"/>
-      <w:r>
-        <w:rPr>
-          <w:rFonts w:ascii="Garamond" w:hAnsi="Garamond"/>
-          <w:sz w:val="22"/>
-          <w:szCs w:val="22"/>
-        </w:rPr>
-        <w:t>Nushagak</w:t>
-      </w:r>
-      <w:proofErr w:type="spellEnd"/>
-      <w:r>
-        <w:rPr>
-          <w:rFonts w:ascii="Garamond" w:hAnsi="Garamond"/>
-          <w:sz w:val="22"/>
-          <w:szCs w:val="22"/>
-        </w:rPr>
-        <w:t xml:space="preserve"> fish). Interestingly, after removing the easiest discernable Yukon fish (Sr8786 &gt;</w:t>
-      </w:r>
-      <w:r>
-        <w:rPr>
-          <w:rFonts w:ascii="Garamond" w:hAnsi="Garamond"/>
-          <w:sz w:val="22"/>
-          <w:szCs w:val="22"/>
-        </w:rPr>
-        <w:t xml:space="preserve">.7150), Yukon classification accuracy dropped to 86.8%. Classification accuracy for </w:t>
-      </w:r>
-      <w:proofErr w:type="spellStart"/>
-      <w:r>
-        <w:rPr>
-          <w:rFonts w:ascii="Garamond" w:hAnsi="Garamond"/>
-          <w:sz w:val="22"/>
-          <w:szCs w:val="22"/>
-        </w:rPr>
-        <w:t>Nushagak</w:t>
-      </w:r>
-      <w:proofErr w:type="spellEnd"/>
-      <w:r>
-        <w:rPr>
-          <w:rFonts w:ascii="Garamond" w:hAnsi="Garamond"/>
-          <w:sz w:val="22"/>
-          <w:szCs w:val="22"/>
-        </w:rPr>
-        <w:t xml:space="preserve"> fish did not change (91.4%) whereas Kuskokwim saw a slight increase to 92.5%. In this testing set the most frequent misclassification was Yukon fish predicted to have been Kuskokwim (8.8% of Yukon fish</w:t>
-      </w:r>
-      <w:proofErr w:type="gramStart"/>
-      <w:r>
-        <w:rPr>
-          <w:rFonts w:ascii="Garamond" w:hAnsi="Garamond"/>
-          <w:sz w:val="22"/>
-          <w:szCs w:val="22"/>
-        </w:rPr>
-        <w:t>),</w:t>
-      </w:r>
-      <w:proofErr w:type="gramEnd"/>
-      <w:r>
-        <w:rPr>
-          <w:rFonts w:ascii="Garamond" w:hAnsi="Garamond"/>
-          <w:sz w:val="22"/>
-          <w:szCs w:val="22"/>
-        </w:rPr>
-        <w:t xml:space="preserve"> however this represented only one additional individual misclassified (9 in the total analysis vs 8 in the overlapping analysis). </w:t>
+        <w:t xml:space="preserve">analysis). </w:t>
+      </w:r>
+      <w:commentRangeStart w:id="2"/>
+      <w:r>
+        <w:rPr>
+          <w:rFonts w:ascii="Garamond" w:hAnsi="Garamond"/>
+          <w:sz w:val="22"/>
+          <w:szCs w:val="22"/>
+        </w:rPr>
+        <w:t xml:space="preserve">Among Yukon fish, individuals within the CWAK region (Lower Yukon genetic reporting group, n = 30) were classified with 73.3% accuracy as compared to 97.9% in non CWAK fish. </w:t>
+      </w:r>
+      <w:commentRangeEnd w:id="2"/>
+      <w:r>
+        <w:rPr>
+          <w:rStyle w:val="CommentReference"/>
+        </w:rPr>
+        <w:commentReference w:id="2"/>
       </w:r>
     </w:p>
     <w:p>
@@ -3801,7 +4774,7 @@
           <w:sz w:val="22"/>
           <w:szCs w:val="22"/>
         </w:rPr>
-        <w:t xml:space="preserve"> and Yukon individuals. Yukon samples covered a much larger region of the principal component space, likely reflecting the broader range of potential isotope values that create unique timeseries compared to the more constrained ranges observed in the other two watershed classes</w:t>
+        <w:t xml:space="preserve"> and Yukon individuals. Yukon samples covered a much larger region of the principal component space, reflecting the broader range of potential isotope values that create unique timeseries compared to the more constrained ranges observed in the other two watershed classes</w:t>
       </w:r>
     </w:p>
     <w:p>
@@ -3820,15 +4793,149 @@
           <w:sz w:val="22"/>
           <w:szCs w:val="22"/>
         </w:rPr>
-        <w:t>Mapping the loadings of each principal component onto the timeseries revealed distinct regions driving class separation. The first principal component showed high loading values in the middle portion of the timeseries, potentially encompassing both natal origin regions and secondary rearing locations. The second principal component was driven by variation occurring just before the onset of the marine region, likely representing residency in mainstem tributaries during ocean migration. The relative shape at this point in the timeseries reflects differences in mainstem tributary Sr87/86 values among the three watersheds. Principal component 3 appeared to be driven by values at the very beginning of the timeseries, corresponding to the start of the natal origin signature. The minimal discrimination among watersheds along this component was expected, as all individuals in this dataset shared the same natal origin value</w:t>
-      </w:r>
-      <w:r>
-        <w:rPr>
-          <w:rFonts w:ascii="Garamond" w:hAnsi="Garamond"/>
-          <w:sz w:val="22"/>
-          <w:szCs w:val="22"/>
-        </w:rPr>
-        <w:t xml:space="preserve">s. </w:t>
+        <w:t xml:space="preserve">Mapping the loadings of each principal component onto the timeseries revealed distinct regions driving class separation. The first principal component showed high loading values in the middle portion of the timeseries, potentially encompassing both </w:t>
+      </w:r>
+      <w:r>
+        <w:rPr>
+          <w:rFonts w:ascii="Garamond" w:hAnsi="Garamond"/>
+          <w:sz w:val="22"/>
+          <w:szCs w:val="22"/>
+        </w:rPr>
+        <w:t xml:space="preserve">the end of the </w:t>
+      </w:r>
+      <w:r>
+        <w:rPr>
+          <w:rFonts w:ascii="Garamond" w:hAnsi="Garamond"/>
+          <w:sz w:val="22"/>
+          <w:szCs w:val="22"/>
+        </w:rPr>
+        <w:t>natal origin region</w:t>
+      </w:r>
+      <w:r>
+        <w:rPr>
+          <w:rFonts w:ascii="Garamond" w:hAnsi="Garamond"/>
+          <w:sz w:val="22"/>
+          <w:szCs w:val="22"/>
+        </w:rPr>
+        <w:t xml:space="preserve"> </w:t>
+      </w:r>
+      <w:r>
+        <w:rPr>
+          <w:rFonts w:ascii="Garamond" w:hAnsi="Garamond"/>
+          <w:sz w:val="22"/>
+          <w:szCs w:val="22"/>
+        </w:rPr>
+        <w:t>a</w:t>
+      </w:r>
+      <w:r>
+        <w:rPr>
+          <w:rFonts w:ascii="Garamond" w:hAnsi="Garamond"/>
+          <w:sz w:val="22"/>
+          <w:szCs w:val="22"/>
+        </w:rPr>
+        <w:t xml:space="preserve">s well as </w:t>
+      </w:r>
+      <w:r>
+        <w:rPr>
+          <w:rFonts w:ascii="Garamond" w:hAnsi="Garamond"/>
+          <w:sz w:val="22"/>
+          <w:szCs w:val="22"/>
+        </w:rPr>
+        <w:t>secondary rearing locations. The second principal component was driven by variation occurring just before the onset of the marine region, likely representing residency in mainstem tributaries during ocean migration. The relative shape at this point in the timeseries reflects differences in mainstem tributary Sr87/86 values among the three watersheds</w:t>
+      </w:r>
+      <w:r>
+        <w:rPr>
+          <w:rFonts w:ascii="Garamond" w:hAnsi="Garamond"/>
+          <w:sz w:val="22"/>
+          <w:szCs w:val="22"/>
+        </w:rPr>
+        <w:t xml:space="preserve"> (e.g. X, </w:t>
+      </w:r>
+      <w:proofErr w:type="gramStart"/>
+      <w:r>
+        <w:rPr>
+          <w:rFonts w:ascii="Garamond" w:hAnsi="Garamond"/>
+          <w:sz w:val="22"/>
+          <w:szCs w:val="22"/>
+        </w:rPr>
+        <w:t>Y,Z</w:t>
+      </w:r>
+      <w:proofErr w:type="gramEnd"/>
+      <w:r>
+        <w:rPr>
+          <w:rFonts w:ascii="Garamond" w:hAnsi="Garamond"/>
+          <w:sz w:val="22"/>
+          <w:szCs w:val="22"/>
+        </w:rPr>
+        <w:t xml:space="preserve"> in the Yukon, Kuskokwim, and </w:t>
+      </w:r>
+      <w:proofErr w:type="spellStart"/>
+      <w:r>
+        <w:rPr>
+          <w:rFonts w:ascii="Garamond" w:hAnsi="Garamond"/>
+          <w:sz w:val="22"/>
+          <w:szCs w:val="22"/>
+        </w:rPr>
+        <w:t>Nushagak</w:t>
+      </w:r>
+      <w:proofErr w:type="spellEnd"/>
+      <w:r>
+        <w:rPr>
+          <w:rFonts w:ascii="Garamond" w:hAnsi="Garamond"/>
+          <w:sz w:val="22"/>
+          <w:szCs w:val="22"/>
+        </w:rPr>
+        <w:t xml:space="preserve">, respectively). Interestingly, timeseries of fish from the CWAK region within the Yukon river-basin contained a less pronounced increase in Sr8786 values before the marine onset (Figure 5b.) </w:t>
+      </w:r>
+      <w:r>
+        <w:rPr>
+          <w:rFonts w:ascii="Garamond" w:hAnsi="Garamond"/>
+          <w:sz w:val="22"/>
+          <w:szCs w:val="22"/>
+        </w:rPr>
+        <w:t>Principal component 3 appeared to be driven by values at the very beginning of the timeseries, corresponding to the start of the natal origin signature. The minimal discrimination among watersheds along this component was expected</w:t>
+      </w:r>
+      <w:r>
+        <w:rPr>
+          <w:rFonts w:ascii="Garamond" w:hAnsi="Garamond"/>
+          <w:sz w:val="22"/>
+          <w:szCs w:val="22"/>
+        </w:rPr>
+        <w:t xml:space="preserve"> given that all individuals in this </w:t>
+      </w:r>
+      <w:proofErr w:type="spellStart"/>
+      <w:r>
+        <w:rPr>
+          <w:rFonts w:ascii="Garamond" w:hAnsi="Garamond"/>
+          <w:sz w:val="22"/>
+          <w:szCs w:val="22"/>
+        </w:rPr>
+        <w:t>subet</w:t>
+      </w:r>
+      <w:proofErr w:type="spellEnd"/>
+      <w:r>
+        <w:rPr>
+          <w:rFonts w:ascii="Garamond" w:hAnsi="Garamond"/>
+          <w:sz w:val="22"/>
+          <w:szCs w:val="22"/>
+        </w:rPr>
+        <w:t xml:space="preserve"> </w:t>
+      </w:r>
+      <w:r>
+        <w:rPr>
+          <w:rFonts w:ascii="Garamond" w:hAnsi="Garamond"/>
+          <w:sz w:val="22"/>
+          <w:szCs w:val="22"/>
+        </w:rPr>
+        <w:t>share the same natal origin value</w:t>
+      </w:r>
+      <w:r>
+        <w:rPr>
+          <w:rFonts w:ascii="Garamond" w:hAnsi="Garamond"/>
+          <w:sz w:val="22"/>
+          <w:szCs w:val="22"/>
+        </w:rPr>
+        <w:t xml:space="preserve">. </w:t>
       </w:r>
     </w:p>
     <w:p>
@@ -3860,6 +4967,7 @@
           <w:b/>
           <w:bCs/>
         </w:rPr>
+        <w:lastRenderedPageBreak/>
         <w:t xml:space="preserve">Probability tuning </w:t>
       </w:r>
       <w:r>
@@ -3870,6 +4978,18 @@
         </w:rPr>
         <w:t xml:space="preserve">and threshold analysis. </w:t>
       </w:r>
+    </w:p>
+    <w:p>
+      <w:pPr>
+        <w:tabs>
+          <w:tab w:val="left" w:pos="3088"/>
+        </w:tabs>
+        <w:rPr>
+          <w:rFonts w:ascii="Garamond" w:hAnsi="Garamond"/>
+          <w:b/>
+          <w:bCs/>
+        </w:rPr>
+      </w:pPr>
     </w:p>
     <w:p>
       <w:pPr>
@@ -3882,6 +5002,14 @@
           <w:szCs w:val="22"/>
         </w:rPr>
       </w:pPr>
+      <w:r>
+        <w:rPr>
+          <w:rFonts w:ascii="Garamond" w:hAnsi="Garamond"/>
+          <w:sz w:val="22"/>
+          <w:szCs w:val="22"/>
+        </w:rPr>
+        <w:t xml:space="preserve">The result of probability tuning demonstrated consistent improvements in probability calibration across all models. Log-loss values decreased by an average of 0.0026 (, while Brier scores improved by an average of 0. The TOTAL analysis framework showed marginally larger improvements compared to the OVERLAP framework, with GAM-smoothed data showing the most consistent calibration performance. Visual inspection of reliability diagrams confirmed improved alignment between predicted and observed probabilities following calibration. </w:t>
+      </w:r>
     </w:p>
     <w:p>
       <w:pPr>
@@ -3890,231 +5018,387 @@
         <w:ind w:firstLine="720"/>
         <w:rPr>
           <w:rFonts w:ascii="Garamond" w:hAnsi="Garamond"/>
-          <w:sz w:val="22"/>
-          <w:szCs w:val="22"/>
-        </w:rPr>
-      </w:pPr>
-      <w:r>
-        <w:rPr>
-          <w:rFonts w:ascii="Garamond" w:hAnsi="Garamond"/>
-          <w:sz w:val="22"/>
-          <w:szCs w:val="22"/>
-        </w:rPr>
-        <w:t xml:space="preserve">The result of probability tuning demonstrated consistent improvements in probability calibration across all models. Log-loss values decreased by an average of 0.0026 (, while Brier scores improved by an average of 0. The TOTAL analysis framework showed marginally larger improvements compared to the OVERLAP framework, with GAM-smoothed data showing the most consistent calibration performance. Visual inspection of reliability diagrams confirmed improved alignment between predicted and observed probabilities following calibration. </w:t>
-      </w:r>
-    </w:p>
-    <w:p>
-      <w:pPr>
-        <w:pStyle w:val="NoSpacing"/>
+          <w:b/>
+          <w:bCs/>
+          <w:sz w:val="22"/>
+          <w:szCs w:val="22"/>
+        </w:rPr>
+      </w:pPr>
+      <w:r>
+        <w:rPr>
+          <w:rFonts w:ascii="Garamond" w:hAnsi="Garamond"/>
+          <w:sz w:val="22"/>
+          <w:szCs w:val="22"/>
+        </w:rPr>
+        <w:t xml:space="preserve">Across the range of tested thresholds, overall accuracy ranged from 91 – 79% for the total testing set and from 89.5% to 78% for the overlapping dataset. In the total dataset, Yukon classification accuracy remained well above 90%, even at the very high (&gt;90%) confidence threshold. </w:t>
+      </w:r>
+      <w:proofErr w:type="spellStart"/>
+      <w:r>
+        <w:rPr>
+          <w:rFonts w:ascii="Garamond" w:hAnsi="Garamond"/>
+          <w:sz w:val="22"/>
+          <w:szCs w:val="22"/>
+        </w:rPr>
+        <w:t>Nushagak</w:t>
+      </w:r>
+      <w:proofErr w:type="spellEnd"/>
+      <w:r>
+        <w:rPr>
+          <w:rFonts w:ascii="Garamond" w:hAnsi="Garamond"/>
+          <w:sz w:val="22"/>
+          <w:szCs w:val="22"/>
+        </w:rPr>
+        <w:t xml:space="preserve"> and Kuskokwim, however, fell steadily as the threshold was raised. Kuskokwim classification accuracy dropped steadily from 87% to 71% whereas </w:t>
+      </w:r>
+      <w:proofErr w:type="spellStart"/>
+      <w:r>
+        <w:rPr>
+          <w:rFonts w:ascii="Garamond" w:hAnsi="Garamond"/>
+          <w:sz w:val="22"/>
+          <w:szCs w:val="22"/>
+        </w:rPr>
+        <w:t>Nushagak</w:t>
+      </w:r>
+      <w:proofErr w:type="spellEnd"/>
+      <w:r>
+        <w:rPr>
+          <w:rFonts w:ascii="Garamond" w:hAnsi="Garamond"/>
+          <w:sz w:val="22"/>
+          <w:szCs w:val="22"/>
+        </w:rPr>
+        <w:t xml:space="preserve"> accuracy declined more quickly at higher probability thresholds from 92% to 75%. The overlapping dataset contained slightly different trends, with Yukon accuracy remaining relatively stable between 89% and 83% over the full range of threshold values. In this testing set </w:t>
+      </w:r>
+      <w:proofErr w:type="spellStart"/>
+      <w:r>
+        <w:rPr>
+          <w:rFonts w:ascii="Garamond" w:hAnsi="Garamond"/>
+          <w:sz w:val="22"/>
+          <w:szCs w:val="22"/>
+        </w:rPr>
+        <w:t>Nushagak</w:t>
+      </w:r>
+      <w:proofErr w:type="spellEnd"/>
+      <w:r>
+        <w:rPr>
+          <w:rFonts w:ascii="Garamond" w:hAnsi="Garamond"/>
+          <w:sz w:val="22"/>
+          <w:szCs w:val="22"/>
+        </w:rPr>
+        <w:t xml:space="preserve"> accuracy dropped steadily from 91% to 84%, whereas Kuskokwim accuracy declined rapidly from 89% to 69%. (Figure 6). </w:t>
+      </w:r>
+    </w:p>
+    <w:p>
+      <w:pPr>
+        <w:rPr>
+          <w:rFonts w:ascii="Garamond" w:hAnsi="Garamond"/>
+          <w:sz w:val="32"/>
+          <w:szCs w:val="32"/>
+        </w:rPr>
+      </w:pPr>
+    </w:p>
+    <w:p>
+      <w:pPr>
+        <w:rPr>
+          <w:rFonts w:ascii="Garamond" w:hAnsi="Garamond"/>
+          <w:sz w:val="32"/>
+          <w:szCs w:val="32"/>
+        </w:rPr>
+      </w:pPr>
+    </w:p>
+    <w:p>
+      <w:pPr>
+        <w:rPr>
+          <w:rFonts w:ascii="Garamond" w:hAnsi="Garamond"/>
+          <w:b/>
+          <w:bCs/>
+          <w:sz w:val="32"/>
+          <w:szCs w:val="32"/>
+        </w:rPr>
+      </w:pPr>
+      <w:r>
+        <w:rPr>
+          <w:rFonts w:ascii="Garamond" w:hAnsi="Garamond"/>
+          <w:b/>
+          <w:bCs/>
+          <w:sz w:val="32"/>
+          <w:szCs w:val="32"/>
+        </w:rPr>
+        <w:t xml:space="preserve">Discussion </w:t>
+      </w:r>
+    </w:p>
+    <w:p>
+      <w:pPr>
+        <w:rPr>
+          <w:rFonts w:ascii="Garamond" w:hAnsi="Garamond"/>
+          <w:b/>
+          <w:bCs/>
+          <w:sz w:val="32"/>
+          <w:szCs w:val="32"/>
+        </w:rPr>
+      </w:pPr>
+    </w:p>
+    <w:p>
+      <w:pPr>
         <w:spacing w:line="480" w:lineRule="auto"/>
         <w:ind w:firstLine="720"/>
         <w:rPr>
           <w:rFonts w:ascii="Garamond" w:hAnsi="Garamond"/>
+          <w:sz w:val="22"/>
+          <w:szCs w:val="22"/>
+        </w:rPr>
+      </w:pPr>
+      <w:r>
+        <w:rPr>
+          <w:rFonts w:ascii="Garamond" w:hAnsi="Garamond"/>
+          <w:sz w:val="22"/>
+          <w:szCs w:val="22"/>
+        </w:rPr>
+        <w:t xml:space="preserve">Machine learning applied to otolith timeseries data proved highly effective for watershed classification in Western Alaska Chinook salmon. Random forest emerged as a particularly powerful and robust method for classifying individuals, though other algorithms also performed relatively well, with even the relatively simple KNN approach providing reasonably high classification accuracy. This demonstrates the broad utility of machine learning methods for analyzing multidimensional ecological datasets, particularly </w:t>
+      </w:r>
+      <w:r>
+        <w:rPr>
+          <w:rFonts w:ascii="Garamond" w:hAnsi="Garamond"/>
+          <w:sz w:val="22"/>
+          <w:szCs w:val="22"/>
+        </w:rPr>
+        <w:lastRenderedPageBreak/>
+        <w:t>their specific application to often noisy and complicated otolith LA data. Importantly, these results highlight the power of utilizing the full suite of available timeseries data rather than collapsing datasets into discrete values, which risks losing important contextual information that may be critical for discrimination.</w:t>
+      </w:r>
+      <w:r>
+        <w:rPr>
+          <w:rFonts w:ascii="Garamond" w:hAnsi="Garamond"/>
+          <w:sz w:val="22"/>
+          <w:szCs w:val="22"/>
+        </w:rPr>
+        <w:t xml:space="preserve"> </w:t>
+      </w:r>
+      <w:r>
+        <w:rPr>
+          <w:rFonts w:ascii="Garamond" w:hAnsi="Garamond"/>
+          <w:sz w:val="22"/>
+          <w:szCs w:val="22"/>
+        </w:rPr>
+        <w:t>The superior performance of smoothed timeseries data compared to raw data across all models indicates that noise in the raw laser ablation data may inhibit model performance by obscuring meaningful patterns. GAM smoothing</w:t>
+      </w:r>
+      <w:r>
+        <w:rPr>
+          <w:rFonts w:ascii="Garamond" w:hAnsi="Garamond"/>
+          <w:sz w:val="22"/>
+          <w:szCs w:val="22"/>
+        </w:rPr>
+        <w:t xml:space="preserve"> effectively</w:t>
+      </w:r>
+      <w:r>
+        <w:rPr>
+          <w:rFonts w:ascii="Garamond" w:hAnsi="Garamond"/>
+          <w:sz w:val="22"/>
+          <w:szCs w:val="22"/>
+        </w:rPr>
+        <w:t xml:space="preserve"> preserved biologically relevant signals while reducing measurement noise, suggesting that appropriate preprocessing is essential for maximizing the discriminatory power of otolith chemistry data in machine learning applications.</w:t>
+      </w:r>
+    </w:p>
+    <w:p>
+      <w:pPr>
+        <w:pStyle w:val="whitespace-normal"/>
+        <w:spacing w:line="480" w:lineRule="auto"/>
+        <w:ind w:firstLine="720"/>
+        <w:rPr>
+          <w:rFonts w:ascii="Garamond" w:hAnsi="Garamond"/>
+          <w:sz w:val="22"/>
+          <w:szCs w:val="22"/>
+        </w:rPr>
+      </w:pPr>
+      <w:r>
+        <w:rPr>
+          <w:rFonts w:ascii="Garamond" w:hAnsi="Garamond"/>
+          <w:sz w:val="22"/>
+          <w:szCs w:val="22"/>
+        </w:rPr>
+        <w:t>Our approach provided reliably accurate assignments across all three river basins, with overall accuracies ranging from 71.9% to 92.5% depending on the model and dataset combination. However, classification performance was notably lower within the CWAK (Coastal Western Alaska) genetic reporting group, where Yukon fish were classified with only 73.3% accuracy compared to 97.9% for non-CWAK fish. This pattern aligns with expectations, as geographic proximity correlates with greater similarity in both natal isotope values and features of the otolith timeseries data.</w:t>
+      </w:r>
+    </w:p>
+    <w:p>
+      <w:pPr>
+        <w:pStyle w:val="whitespace-normal"/>
+        <w:spacing w:line="480" w:lineRule="auto"/>
+        <w:ind w:firstLine="720"/>
+        <w:rPr>
+          <w:rFonts w:ascii="Garamond" w:hAnsi="Garamond"/>
+          <w:sz w:val="22"/>
+          <w:szCs w:val="22"/>
+        </w:rPr>
+      </w:pPr>
+      <w:r>
+        <w:rPr>
+          <w:rFonts w:ascii="Garamond" w:hAnsi="Garamond"/>
+          <w:sz w:val="22"/>
+          <w:szCs w:val="22"/>
+        </w:rPr>
+        <w:t>This geographical constraint is clearly demonstrated by CWAK Yukon individuals, which contain a much less pronounced increase in isotope values before marine onset compared to other Yukon fish, thereby lacking a distinguishing feature that appears to drive variation among watershed classes. Given the complex interactions between potential rearing environments, otolith incorporation dynamics, and migration strategies within geographically proximate watersheds, this limitation may be unavoidable for fish originating from similar isotopic landscapes. Nevertheless, PCA analysis indicates that multiple interactive regions of the otolith timeseries data, when considered collectively, can still separate individuals among stocks even when individual features are subtle.</w:t>
+      </w:r>
+    </w:p>
+    <w:p>
+      <w:pPr>
+        <w:spacing w:before="100" w:beforeAutospacing="1" w:after="100" w:afterAutospacing="1" w:line="240" w:lineRule="auto"/>
+        <w:outlineLvl w:val="1"/>
+        <w:rPr>
+          <w:rFonts w:ascii="Times New Roman" w:eastAsia="Times New Roman" w:hAnsi="Times New Roman" w:cs="Times New Roman"/>
           <w:b/>
           <w:bCs/>
-          <w:sz w:val="22"/>
-          <w:szCs w:val="22"/>
-        </w:rPr>
-      </w:pPr>
-      <w:r>
-        <w:rPr>
-          <w:rFonts w:ascii="Garamond" w:hAnsi="Garamond"/>
-          <w:sz w:val="22"/>
-          <w:szCs w:val="22"/>
-        </w:rPr>
-        <w:t xml:space="preserve">Across the range of tested thresholds, overall accuracy ranged from 91 – 79% for the total testing set and from 89.5% to 78% for the overlapping dataset. In the total dataset, Yukon classification accuracy remained well above 90%, even at the very high (&gt;90%) confidence threshold. </w:t>
-      </w:r>
-      <w:proofErr w:type="spellStart"/>
-      <w:r>
-        <w:rPr>
-          <w:rFonts w:ascii="Garamond" w:hAnsi="Garamond"/>
-          <w:sz w:val="22"/>
-          <w:szCs w:val="22"/>
-        </w:rPr>
-        <w:t>Nushagak</w:t>
-      </w:r>
-      <w:proofErr w:type="spellEnd"/>
-      <w:r>
-        <w:rPr>
-          <w:rFonts w:ascii="Garamond" w:hAnsi="Garamond"/>
-          <w:sz w:val="22"/>
-          <w:szCs w:val="22"/>
-        </w:rPr>
-        <w:t xml:space="preserve"> and Kuskokwim, however, fell steadily as the threshold was raised. Kuskokwim classification accuracy dropped steadily from 87% to 71% whereas </w:t>
-      </w:r>
-      <w:proofErr w:type="spellStart"/>
-      <w:r>
-        <w:rPr>
-          <w:rFonts w:ascii="Garamond" w:hAnsi="Garamond"/>
-          <w:sz w:val="22"/>
-          <w:szCs w:val="22"/>
-        </w:rPr>
-        <w:t>Nushagak</w:t>
-      </w:r>
-      <w:proofErr w:type="spellEnd"/>
-      <w:r>
-        <w:rPr>
-          <w:rFonts w:ascii="Garamond" w:hAnsi="Garamond"/>
-          <w:sz w:val="22"/>
-          <w:szCs w:val="22"/>
-        </w:rPr>
-        <w:t xml:space="preserve"> accuracy declined more quickly at higher probability thresholds from 92% to 75%. The overlapping dataset contained slightly different trends, with Yukon accuracy remaining relatively stable between 89% and 83% over the full range of threshold values. In this testing set </w:t>
-      </w:r>
-      <w:proofErr w:type="spellStart"/>
-      <w:r>
-        <w:rPr>
-          <w:rFonts w:ascii="Garamond" w:hAnsi="Garamond"/>
-          <w:sz w:val="22"/>
-          <w:szCs w:val="22"/>
-        </w:rPr>
-        <w:t>Nushagak</w:t>
-      </w:r>
-      <w:proofErr w:type="spellEnd"/>
-      <w:r>
-        <w:rPr>
-          <w:rFonts w:ascii="Garamond" w:hAnsi="Garamond"/>
-          <w:sz w:val="22"/>
-          <w:szCs w:val="22"/>
-        </w:rPr>
-        <w:t xml:space="preserve"> accuracy dropped steadily from 91% to 84</w:t>
-      </w:r>
-      <w:proofErr w:type="gramStart"/>
-      <w:r>
-        <w:rPr>
-          <w:rFonts w:ascii="Garamond" w:hAnsi="Garamond"/>
-          <w:sz w:val="22"/>
-          <w:szCs w:val="22"/>
-        </w:rPr>
-        <w:t>% ,</w:t>
-      </w:r>
-      <w:proofErr w:type="gramEnd"/>
-      <w:r>
-        <w:rPr>
-          <w:rFonts w:ascii="Garamond" w:hAnsi="Garamond"/>
-          <w:sz w:val="22"/>
-          <w:szCs w:val="22"/>
-        </w:rPr>
-        <w:t xml:space="preserve"> whereas Kuskokwim accuracy declined rapidly from 89% to 69%. (Figure 6). </w:t>
-      </w:r>
-    </w:p>
-    <w:p>
-      <w:pPr>
-        <w:rPr>
-          <w:rFonts w:ascii="Garamond" w:hAnsi="Garamond"/>
-          <w:sz w:val="32"/>
-          <w:szCs w:val="32"/>
-        </w:rPr>
-      </w:pPr>
-    </w:p>
-    <w:p>
-      <w:pPr>
-        <w:rPr>
-          <w:rFonts w:ascii="Garamond" w:hAnsi="Garamond"/>
-          <w:sz w:val="32"/>
-          <w:szCs w:val="32"/>
-        </w:rPr>
-      </w:pPr>
-    </w:p>
-    <w:p>
-      <w:pPr>
-        <w:rPr>
-          <w:rFonts w:ascii="Garamond" w:hAnsi="Garamond"/>
-          <w:sz w:val="32"/>
-          <w:szCs w:val="32"/>
-        </w:rPr>
-      </w:pPr>
-      <w:r>
-        <w:rPr>
-          <w:rFonts w:ascii="Garamond" w:hAnsi="Garamond"/>
-          <w:sz w:val="32"/>
-          <w:szCs w:val="32"/>
-        </w:rPr>
-        <w:t xml:space="preserve">Discussion </w:t>
-      </w:r>
-    </w:p>
-    <w:p>
-      <w:pPr>
-        <w:rPr>
-          <w:rFonts w:ascii="Garamond" w:hAnsi="Garamond"/>
-          <w:sz w:val="32"/>
-          <w:szCs w:val="32"/>
-        </w:rPr>
-      </w:pPr>
-    </w:p>
-    <w:p>
-      <w:pPr>
-        <w:rPr>
-          <w:rFonts w:ascii="Garamond" w:hAnsi="Garamond"/>
-          <w:sz w:val="32"/>
-          <w:szCs w:val="32"/>
-        </w:rPr>
-      </w:pPr>
-      <w:r>
-        <w:rPr>
-          <w:rFonts w:ascii="Garamond" w:hAnsi="Garamond"/>
-          <w:sz w:val="32"/>
-          <w:szCs w:val="32"/>
-        </w:rPr>
-        <w:t xml:space="preserve">We demonstrated variability in timeseries, present in unsupervised </w:t>
-      </w:r>
-      <w:proofErr w:type="gramStart"/>
-      <w:r>
-        <w:rPr>
-          <w:rFonts w:ascii="Garamond" w:hAnsi="Garamond"/>
-          <w:sz w:val="32"/>
-          <w:szCs w:val="32"/>
-        </w:rPr>
-        <w:t>clustering ,</w:t>
-      </w:r>
-      <w:proofErr w:type="gramEnd"/>
-      <w:r>
-        <w:rPr>
-          <w:rFonts w:ascii="Garamond" w:hAnsi="Garamond"/>
-          <w:sz w:val="32"/>
-          <w:szCs w:val="32"/>
-        </w:rPr>
-        <w:t xml:space="preserve"> as well as where this variability helps to drive separation among otherwise undistinguishable samples using just the natal origin </w:t>
-      </w:r>
-    </w:p>
-    <w:p>
-      <w:pPr>
-        <w:rPr>
-          <w:rFonts w:ascii="Garamond" w:hAnsi="Garamond"/>
-          <w:sz w:val="32"/>
-          <w:szCs w:val="32"/>
-        </w:rPr>
-      </w:pPr>
-    </w:p>
-    <w:p>
-      <w:pPr>
-        <w:rPr>
-          <w:rFonts w:ascii="Garamond" w:hAnsi="Garamond"/>
-          <w:sz w:val="22"/>
-          <w:szCs w:val="22"/>
-        </w:rPr>
-      </w:pPr>
-    </w:p>
-    <w:p>
-      <w:r>
-        <w:t xml:space="preserve"> </w:t>
-      </w:r>
-      <w:r>
-        <w:t xml:space="preserve">This cannot currently be used for </w:t>
-      </w:r>
-      <w:proofErr w:type="gramStart"/>
-      <w:r>
-        <w:t>In</w:t>
-      </w:r>
-      <w:proofErr w:type="gramEnd"/>
-      <w:r>
-        <w:t xml:space="preserve"> season analysis, and is expensive </w:t>
-      </w:r>
-    </w:p>
-    <w:p>
-      <w:r>
-        <w:t xml:space="preserve">We expect these dynamics change at several temporal scales, but this dataset is huge </w:t>
-      </w:r>
-    </w:p>
+          <w:kern w:val="0"/>
+          <w:sz w:val="20"/>
+          <w:szCs w:val="20"/>
+          <w14:ligatures w14:val="none"/>
+        </w:rPr>
+      </w:pPr>
+    </w:p>
+    <w:p>
+      <w:pPr>
+        <w:spacing w:before="100" w:beforeAutospacing="1" w:after="100" w:afterAutospacing="1" w:line="240" w:lineRule="auto"/>
+        <w:outlineLvl w:val="1"/>
+        <w:rPr>
+          <w:rFonts w:ascii="Times New Roman" w:eastAsia="Times New Roman" w:hAnsi="Times New Roman" w:cs="Times New Roman"/>
+          <w:b/>
+          <w:bCs/>
+          <w:kern w:val="0"/>
+          <w:sz w:val="20"/>
+          <w:szCs w:val="20"/>
+          <w14:ligatures w14:val="none"/>
+        </w:rPr>
+      </w:pPr>
+      <w:r>
+        <w:rPr>
+          <w:rFonts w:ascii="Times New Roman" w:eastAsia="Times New Roman" w:hAnsi="Times New Roman" w:cs="Times New Roman"/>
+          <w:b/>
+          <w:bCs/>
+          <w:kern w:val="0"/>
+          <w:sz w:val="20"/>
+          <w:szCs w:val="20"/>
+          <w14:ligatures w14:val="none"/>
+        </w:rPr>
+        <w:t>Implications for Stock Assessment and Management</w:t>
+      </w:r>
+    </w:p>
+    <w:p>
+      <w:pPr>
+        <w:pStyle w:val="whitespace-normal"/>
+        <w:spacing w:line="480" w:lineRule="auto"/>
+        <w:ind w:firstLine="720"/>
+        <w:rPr>
+          <w:rFonts w:ascii="Garamond" w:hAnsi="Garamond"/>
+        </w:rPr>
+      </w:pPr>
+      <w:r>
+        <w:rPr>
+          <w:rFonts w:ascii="Garamond" w:hAnsi="Garamond"/>
+        </w:rPr>
+        <w:lastRenderedPageBreak/>
+        <w:t>A tool to estimate provenance of marine-caught Pacific salmon has the potential to expand our ability to assess important marine-based hypotheses of declining salmon health and to better incorporate river-specific management efforts into intercept-based marine fisheries. Given the pressing situation in Western Alaska, this provides a new tool for understanding salmon ecology and the impacts of global change and human pressures on the ecosystem, as well as better understanding the impact of these stressors across stocks and communities in the region. Doing so increases our potential to understand the full salmon life cycle and to address pressing research questions related to it.</w:t>
+      </w:r>
+    </w:p>
+    <w:p>
+      <w:pPr>
+        <w:pStyle w:val="whitespace-normal"/>
+        <w:spacing w:line="480" w:lineRule="auto"/>
+        <w:ind w:firstLine="720"/>
+        <w:rPr>
+          <w:rFonts w:ascii="Garamond" w:hAnsi="Garamond"/>
+        </w:rPr>
+      </w:pPr>
+      <w:r>
+        <w:rPr>
+          <w:rFonts w:ascii="Garamond" w:hAnsi="Garamond"/>
+        </w:rPr>
+        <w:t>The dataset presented here represents one of the largest of its kind and contains samples spanning several years across the basin. This library of information can continue to be built upon and improved through the addition of new samples, new analytical techniques, or through the combination of powerful timeseries analysis tools not addressed here. In addition, the methods presented here provide quantifiable confidence values which can be directly used by managers to make decisions based on changing thresholds of misassignment risk, offering a practical framework for incorporating uncertainty into management decisions.</w:t>
+      </w:r>
+    </w:p>
+    <w:p>
+      <w:pPr>
+        <w:pStyle w:val="whitespace-normal"/>
+        <w:spacing w:line="480" w:lineRule="auto"/>
+        <w:ind w:firstLine="720"/>
+        <w:rPr>
+          <w:rFonts w:ascii="Garamond" w:hAnsi="Garamond"/>
+        </w:rPr>
+      </w:pPr>
+      <w:r>
+        <w:rPr>
+          <w:rFonts w:ascii="Garamond" w:hAnsi="Garamond"/>
+        </w:rPr>
+        <w:t>These methods are not without limitations. They are expensive and have a slow turnaround time, meaning they cannot be used for in-season management, which would be a powerful application of river-specific provenance estimates. Sampling otoliths is lethal, meaning they may not be able to be collected in large numbers for stocks or species of concern, particularly as population health continues to decline.</w:t>
+      </w:r>
+    </w:p>
+    <w:p>
+      <w:pPr>
+        <w:pStyle w:val="whitespace-normal"/>
+        <w:spacing w:line="480" w:lineRule="auto"/>
+        <w:ind w:firstLine="720"/>
+        <w:rPr>
+          <w:rFonts w:ascii="Garamond" w:hAnsi="Garamond"/>
+        </w:rPr>
+      </w:pPr>
+      <w:r>
+        <w:rPr>
+          <w:rFonts w:ascii="Garamond" w:hAnsi="Garamond"/>
+        </w:rPr>
+        <w:t xml:space="preserve">In addition, this model is specifically built for Chinook salmon and leverages the strength of a large existing dataset. Similar datasets do not exist for other species of concern, for example chum </w:t>
+      </w:r>
+      <w:r>
+        <w:rPr>
+          <w:rFonts w:ascii="Garamond" w:hAnsi="Garamond"/>
+        </w:rPr>
+        <w:lastRenderedPageBreak/>
+        <w:t>salmon, limiting broader application. These species may not contain the spatial resolution of multiple environments given their uniquely short life history. However, there may be some patterns in the limited data that would make this approach appropriate for future exploration.</w:t>
+      </w:r>
+    </w:p>
+    <w:p>
+      <w:pPr>
+        <w:spacing w:before="100" w:beforeAutospacing="1" w:after="100" w:afterAutospacing="1" w:line="480" w:lineRule="auto"/>
+        <w:ind w:firstLine="720"/>
+        <w:outlineLvl w:val="1"/>
+        <w:rPr>
+          <w:rFonts w:ascii="Garamond" w:eastAsia="Times New Roman" w:hAnsi="Garamond" w:cs="Times New Roman"/>
+          <w:b/>
+          <w:bCs/>
+          <w:kern w:val="0"/>
+          <w:sz w:val="20"/>
+          <w:szCs w:val="20"/>
+          <w14:ligatures w14:val="none"/>
+        </w:rPr>
+      </w:pPr>
+      <w:r>
+        <w:rPr>
+          <w:rFonts w:ascii="Garamond" w:hAnsi="Garamond"/>
+        </w:rPr>
+        <w:t>This work addresses the fundamental challenge of achieving adequate spatial resolution for ecosystem monitoring and management in remote, complex systems, particularly as global change accelerates and stakeholder needs intensify. By enabling stock-specific assessments of marine-caught salmon, these methods bridge the critical gap between broad population-level monitoring—which can mask local threats and stock-specific declines—and the fine-scale processes that drive ecosystem health. As climate change continues to alter marine and freshwater environments at unprecedented rates, and as fishing pressures and subsistence needs create competing demands on declining salmon resources, tools that can detect subtle, population-specific responses across spatial scales become increasingly essential. The machine learning framework developed here demonstrates how methodological innovation can unlock information hidden within existing datasets, potentially transforming our capacity to understand and manage ecological systems under mounting environmental and social pressures. Ultimately, such approaches offer pathways toward more spatially explicit management that can better balance conservation goals with the subsistence and commercial needs of communities whose livelihoods depend on these critical resources</w:t>
+      </w:r>
+    </w:p>
+    <w:p>
+      <w:pPr>
+        <w:spacing w:before="100" w:beforeAutospacing="1" w:after="100" w:afterAutospacing="1" w:line="240" w:lineRule="auto"/>
+        <w:outlineLvl w:val="1"/>
+        <w:rPr>
+          <w:rFonts w:ascii="Times New Roman" w:eastAsia="Times New Roman" w:hAnsi="Times New Roman" w:cs="Times New Roman"/>
+          <w:b/>
+          <w:bCs/>
+          <w:kern w:val="0"/>
+          <w:sz w:val="20"/>
+          <w:szCs w:val="20"/>
+          <w14:ligatures w14:val="none"/>
+        </w:rPr>
+      </w:pPr>
+    </w:p>
+    <w:p/>
+    <w:p>
+      <w:pPr>
+        <w:rPr>
+          <w:rFonts w:ascii="Garamond" w:hAnsi="Garamond"/>
+          <w:sz w:val="20"/>
+          <w:szCs w:val="20"/>
+        </w:rPr>
+      </w:pPr>
+    </w:p>
+    <w:p/>
     <w:sectPr>
       <w:pgSz w:w="12240" w:h="15840"/>
       <w:pgMar w:top="1440" w:right="1440" w:bottom="1440" w:left="1440" w:header="720" w:footer="720" w:gutter="0"/>
@@ -4140,12 +5424,11 @@
           <w:sz w:val="20"/>
           <w:szCs w:val="20"/>
         </w:rPr>
-        <w:t>Note to self: check for the full name</w:t>
-      </w:r>
-    </w:p>
-    <w:p/>
+        <w:t>Note to self: Ask diego for the specifications for all years</w:t>
+      </w:r>
+    </w:p>
   </w:comment>
-  <w:comment w:id="1" w:author="Benjamin J. Makhlouf" w:date="2025-08-18T11:18:00Z" w:initials="b">
+  <w:comment w:id="1" w:author="Benjamin J. Makhlouf" w:date="2025-09-02T09:56:00Z" w:initials="b">
     <w:p>
       <w:r>
         <w:rPr>
@@ -4158,7 +5441,24 @@
           <w:sz w:val="20"/>
           <w:szCs w:val="20"/>
         </w:rPr>
-        <w:t>Note to self: Ask diego for the specifications for all years</w:t>
+        <w:t xml:space="preserve">I did not iterate through hyperparameters, just chose them and trained on training data. Does this convey that? </w:t>
+      </w:r>
+    </w:p>
+  </w:comment>
+  <w:comment w:id="2" w:author="Benjamin J. Makhlouf" w:date="2025-09-02T10:22:00Z" w:initials="b">
+    <w:p>
+      <w:r>
+        <w:rPr>
+          <w:rStyle w:val="CommentReference"/>
+        </w:rPr>
+        <w:annotationRef/>
+      </w:r>
+      <w:r>
+        <w:rPr>
+          <w:sz w:val="20"/>
+          <w:szCs w:val="20"/>
+        </w:rPr>
+        <w:t>Will do a full CWAK (All watersheds) vs non</w:t>
       </w:r>
     </w:p>
   </w:comment>
@@ -4167,22 +5467,25 @@
 
 <file path=word/commentsExtended.xml><?xml version="1.0" encoding="utf-8"?>
 <w15:commentsEx xmlns:wpc="http://schemas.microsoft.com/office/word/2010/wordprocessingCanvas" xmlns:cx="http://schemas.microsoft.com/office/drawing/2014/chartex" xmlns:cx1="http://schemas.microsoft.com/office/drawing/2015/9/8/chartex" xmlns:cx2="http://schemas.microsoft.com/office/drawing/2015/10/21/chartex" xmlns:cx3="http://schemas.microsoft.com/office/drawing/2016/5/9/chartex" xmlns:cx4="http://schemas.microsoft.com/office/drawing/2016/5/10/chartex" xmlns:cx5="http://schemas.microsoft.com/office/drawing/2016/5/11/chartex" xmlns:cx6="http://schemas.microsoft.com/office/drawing/2016/5/12/chartex" xmlns:cx7="http://schemas.microsoft.com/office/drawing/2016/5/13/chartex" xmlns:cx8="http://schemas.microsoft.com/office/drawing/2016/5/14/chartex" xmlns:mc="http://schemas.openxmlformats.org/markup-compatibility/2006" xmlns:aink="http://schemas.microsoft.com/office/drawing/2016/ink" xmlns:am3d="http://schemas.microsoft.com/office/drawing/2017/model3d" xmlns:o="urn:schemas-microsoft-com:office:office" xmlns:oel="http://schemas.microsoft.com/office/2019/extlst" xmlns:r="http://schemas.openxmlformats.org/officeDocument/2006/relationships" xmlns:m="http://schemas.openxmlformats.org/officeDocument/2006/math" xmlns:v="urn:schemas-microsoft-com:vml" xmlns:wp14="http://schemas.microsoft.com/office/word/2010/wordprocessingDrawing" xmlns:wp="http://schemas.openxmlformats.org/drawingml/2006/wordprocessingDrawing" xmlns:w10="urn:schemas-microsoft-com:office:word" xmlns:w="http://schemas.openxmlformats.org/wordprocessingml/2006/main" xmlns:w14="http://schemas.microsoft.com/office/word/2010/wordml" xmlns:w15="http://schemas.microsoft.com/office/word/2012/wordml" xmlns:w16cex="http://schemas.microsoft.com/office/word/2018/wordml/cex" xmlns:w16cid="http://schemas.microsoft.com/office/word/2016/wordml/cid" xmlns:w16="http://schemas.microsoft.com/office/word/2018/wordml" xmlns:w16du="http://schemas.microsoft.com/office/word/2023/wordml/word16du" xmlns:w16sdtdh="http://schemas.microsoft.com/office/word/2020/wordml/sdtdatahash" xmlns:w16sdtfl="http://schemas.microsoft.com/office/word/2024/wordml/sdtformatlock" xmlns:w16se="http://schemas.microsoft.com/office/word/2015/wordml/symex" xmlns:wpg="http://schemas.microsoft.com/office/word/2010/wordprocessingGroup" xmlns:wpi="http://schemas.microsoft.com/office/word/2010/wordprocessingInk" xmlns:wne="http://schemas.microsoft.com/office/word/2006/wordml" xmlns:wps="http://schemas.microsoft.com/office/word/2010/wordprocessingShape" mc:Ignorable="w14 w15 w16se w16cid w16 w16cex w16sdtdh w16sdtfl w16du wp14">
-  <w15:commentEx w15:paraId="07B4BA5C" w15:done="0"/>
   <w15:commentEx w15:paraId="51CBD6D1" w15:done="0"/>
+  <w15:commentEx w15:paraId="4E3434D0" w15:done="0"/>
+  <w15:commentEx w15:paraId="084F4B46" w15:done="0"/>
 </w15:commentsEx>
 </file>
 
 <file path=word/commentsExtensible.xml><?xml version="1.0" encoding="utf-8"?>
 <w16cex:commentsExtensible xmlns:wpc="http://schemas.microsoft.com/office/word/2010/wordprocessingCanvas" xmlns:cx="http://schemas.microsoft.com/office/drawing/2014/chartex" xmlns:cx1="http://schemas.microsoft.com/office/drawing/2015/9/8/chartex" xmlns:cx2="http://schemas.microsoft.com/office/drawing/2015/10/21/chartex" xmlns:cx3="http://schemas.microsoft.com/office/drawing/2016/5/9/chartex" xmlns:cx4="http://schemas.microsoft.com/office/drawing/2016/5/10/chartex" xmlns:cx5="http://schemas.microsoft.com/office/drawing/2016/5/11/chartex" xmlns:cx6="http://schemas.microsoft.com/office/drawing/2016/5/12/chartex" xmlns:cx7="http://schemas.microsoft.com/office/drawing/2016/5/13/chartex" xmlns:cx8="http://schemas.microsoft.com/office/drawing/2016/5/14/chartex" xmlns:cr="http://schemas.microsoft.com/office/comments/2020/reactions" xmlns:mc="http://schemas.openxmlformats.org/markup-compatibility/2006" xmlns:aink="http://schemas.microsoft.com/office/drawing/2016/ink" xmlns:am3d="http://schemas.microsoft.com/office/drawing/2017/model3d" xmlns:o="urn:schemas-microsoft-com:office:office" xmlns:oel="http://schemas.microsoft.com/office/2019/extlst" xmlns:r="http://schemas.openxmlformats.org/officeDocument/2006/relationships" xmlns:m="http://schemas.openxmlformats.org/officeDocument/2006/math" xmlns:v="urn:schemas-microsoft-com:vml" xmlns:wp14="http://schemas.microsoft.com/office/word/2010/wordprocessingDrawing" xmlns:wp="http://schemas.openxmlformats.org/drawingml/2006/wordprocessingDrawing" xmlns:w10="urn:schemas-microsoft-com:office:word" xmlns:w="http://schemas.openxmlformats.org/wordprocessingml/2006/main" xmlns:w14="http://schemas.microsoft.com/office/word/2010/wordml" xmlns:w15="http://schemas.microsoft.com/office/word/2012/wordml" xmlns:w16cex="http://schemas.microsoft.com/office/word/2018/wordml/cex" xmlns:w16cid="http://schemas.microsoft.com/office/word/2016/wordml/cid" xmlns:w16="http://schemas.microsoft.com/office/word/2018/wordml" xmlns:w16du="http://schemas.microsoft.com/office/word/2023/wordml/word16du" xmlns:w16sdtdh="http://schemas.microsoft.com/office/word/2020/wordml/sdtdatahash" xmlns:w16sdtfl="http://schemas.microsoft.com/office/word/2024/wordml/sdtformatlock" xmlns:w16se="http://schemas.microsoft.com/office/word/2015/wordml/symex" xmlns:wpg="http://schemas.microsoft.com/office/word/2010/wordprocessingGroup" xmlns:wpi="http://schemas.microsoft.com/office/word/2010/wordprocessingInk" xmlns:wne="http://schemas.microsoft.com/office/word/2006/wordml" xmlns:wps="http://schemas.microsoft.com/office/word/2010/wordprocessingShape" mc:Ignorable="w14 w15 w16se w16cid w16 w16cex w16sdtdh w16sdtfl cr w16du wp14">
-  <w16cex:commentExtensible w16cex:durableId="4A85456E" w16cex:dateUtc="2025-08-18T18:18:00Z"/>
   <w16cex:commentExtensible w16cex:durableId="6197010A" w16cex:dateUtc="2025-08-18T18:18:00Z"/>
+  <w16cex:commentExtensible w16cex:durableId="208C7FE7" w16cex:dateUtc="2025-09-02T16:56:00Z"/>
+  <w16cex:commentExtensible w16cex:durableId="3FDF2CD4" w16cex:dateUtc="2025-09-02T17:22:00Z"/>
 </w16cex:commentsExtensible>
 </file>
 
 <file path=word/commentsIds.xml><?xml version="1.0" encoding="utf-8"?>
 <w16cid:commentsIds xmlns:wpc="http://schemas.microsoft.com/office/word/2010/wordprocessingCanvas" xmlns:cx="http://schemas.microsoft.com/office/drawing/2014/chartex" xmlns:cx1="http://schemas.microsoft.com/office/drawing/2015/9/8/chartex" xmlns:cx2="http://schemas.microsoft.com/office/drawing/2015/10/21/chartex" xmlns:cx3="http://schemas.microsoft.com/office/drawing/2016/5/9/chartex" xmlns:cx4="http://schemas.microsoft.com/office/drawing/2016/5/10/chartex" xmlns:cx5="http://schemas.microsoft.com/office/drawing/2016/5/11/chartex" xmlns:cx6="http://schemas.microsoft.com/office/drawing/2016/5/12/chartex" xmlns:cx7="http://schemas.microsoft.com/office/drawing/2016/5/13/chartex" xmlns:cx8="http://schemas.microsoft.com/office/drawing/2016/5/14/chartex" xmlns:mc="http://schemas.openxmlformats.org/markup-compatibility/2006" xmlns:aink="http://schemas.microsoft.com/office/drawing/2016/ink" xmlns:am3d="http://schemas.microsoft.com/office/drawing/2017/model3d" xmlns:o="urn:schemas-microsoft-com:office:office" xmlns:oel="http://schemas.microsoft.com/office/2019/extlst" xmlns:r="http://schemas.openxmlformats.org/officeDocument/2006/relationships" xmlns:m="http://schemas.openxmlformats.org/officeDocument/2006/math" xmlns:v="urn:schemas-microsoft-com:vml" xmlns:wp14="http://schemas.microsoft.com/office/word/2010/wordprocessingDrawing" xmlns:wp="http://schemas.openxmlformats.org/drawingml/2006/wordprocessingDrawing" xmlns:w10="urn:schemas-microsoft-com:office:word" xmlns:w="http://schemas.openxmlformats.org/wordprocessingml/2006/main" xmlns:w14="http://schemas.microsoft.com/office/word/2010/wordml" xmlns:w15="http://schemas.microsoft.com/office/word/2012/wordml" xmlns:w16cex="http://schemas.microsoft.com/office/word/2018/wordml/cex" xmlns:w16cid="http://schemas.microsoft.com/office/word/2016/wordml/cid" xmlns:w16="http://schemas.microsoft.com/office/word/2018/wordml" xmlns:w16du="http://schemas.microsoft.com/office/word/2023/wordml/word16du" xmlns:w16sdtdh="http://schemas.microsoft.com/office/word/2020/wordml/sdtdatahash" xmlns:w16sdtfl="http://schemas.microsoft.com/office/word/2024/wordml/sdtformatlock" xmlns:w16se="http://schemas.microsoft.com/office/word/2015/wordml/symex" xmlns:wpg="http://schemas.microsoft.com/office/word/2010/wordprocessingGroup" xmlns:wpi="http://schemas.microsoft.com/office/word/2010/wordprocessingInk" xmlns:wne="http://schemas.microsoft.com/office/word/2006/wordml" xmlns:wps="http://schemas.microsoft.com/office/word/2010/wordprocessingShape" mc:Ignorable="w14 w15 w16se w16cid w16 w16cex w16sdtdh w16sdtfl w16du wp14">
-  <w16cid:commentId w16cid:paraId="07B4BA5C" w16cid:durableId="4A85456E"/>
   <w16cid:commentId w16cid:paraId="51CBD6D1" w16cid:durableId="6197010A"/>
+  <w16cid:commentId w16cid:paraId="4E3434D0" w16cid:durableId="208C7FE7"/>
+  <w16cid:commentId w16cid:paraId="084F4B46" w16cid:durableId="3FDF2CD4"/>
 </w16cid:commentsIds>
 </file>
 
@@ -4413,10 +5716,10 @@
     </w:lvl>
   </w:abstractNum>
   <w:abstractNum w:abstractNumId="2" w15:restartNumberingAfterBreak="0">
-    <w:nsid w:val="4AC941D2"/>
+    <w:nsid w:val="3E3C549E"/>
     <w:multiLevelType w:val="hybridMultilevel"/>
-    <w:tmpl w:val="2682BA3A"/>
-    <w:lvl w:ilvl="0" w:tplc="D752FE1C">
+    <w:tmpl w:val="248A195C"/>
+    <w:lvl w:ilvl="0" w:tplc="862EF43C">
       <w:numFmt w:val="bullet"/>
       <w:lvlText w:val="-"/>
       <w:lvlJc w:val="left"/>
@@ -4525,15 +5828,15 @@
     </w:lvl>
   </w:abstractNum>
   <w:abstractNum w:abstractNumId="3" w15:restartNumberingAfterBreak="0">
-    <w:nsid w:val="4F31630A"/>
+    <w:nsid w:val="4AC941D2"/>
     <w:multiLevelType w:val="hybridMultilevel"/>
-    <w:tmpl w:val="DD58292C"/>
-    <w:lvl w:ilvl="0" w:tplc="FF424106">
+    <w:tmpl w:val="2682BA3A"/>
+    <w:lvl w:ilvl="0" w:tplc="D752FE1C">
       <w:numFmt w:val="bullet"/>
       <w:lvlText w:val="-"/>
       <w:lvlJc w:val="left"/>
       <w:pPr>
-        <w:ind w:left="1800" w:hanging="360"/>
+        <w:ind w:left="720" w:hanging="360"/>
       </w:pPr>
       <w:rPr>
         <w:rFonts w:ascii="Garamond" w:eastAsiaTheme="minorHAnsi" w:hAnsi="Garamond" w:cstheme="minorBidi" w:hint="default"/>
@@ -4545,7 +5848,7 @@
       <w:lvlText w:val="o"/>
       <w:lvlJc w:val="left"/>
       <w:pPr>
-        <w:ind w:left="2520" w:hanging="360"/>
+        <w:ind w:left="1440" w:hanging="360"/>
       </w:pPr>
       <w:rPr>
         <w:rFonts w:ascii="Courier New" w:hAnsi="Courier New" w:cs="Courier New" w:hint="default"/>
@@ -4557,7 +5860,7 @@
       <w:lvlText w:val=""/>
       <w:lvlJc w:val="left"/>
       <w:pPr>
-        <w:ind w:left="3240" w:hanging="360"/>
+        <w:ind w:left="2160" w:hanging="360"/>
       </w:pPr>
       <w:rPr>
         <w:rFonts w:ascii="Wingdings" w:hAnsi="Wingdings" w:hint="default"/>
@@ -4569,7 +5872,7 @@
       <w:lvlText w:val=""/>
       <w:lvlJc w:val="left"/>
       <w:pPr>
-        <w:ind w:left="3960" w:hanging="360"/>
+        <w:ind w:left="2880" w:hanging="360"/>
       </w:pPr>
       <w:rPr>
         <w:rFonts w:ascii="Symbol" w:hAnsi="Symbol" w:hint="default"/>
@@ -4581,7 +5884,7 @@
       <w:lvlText w:val="o"/>
       <w:lvlJc w:val="left"/>
       <w:pPr>
-        <w:ind w:left="4680" w:hanging="360"/>
+        <w:ind w:left="3600" w:hanging="360"/>
       </w:pPr>
       <w:rPr>
         <w:rFonts w:ascii="Courier New" w:hAnsi="Courier New" w:cs="Courier New" w:hint="default"/>
@@ -4593,7 +5896,7 @@
       <w:lvlText w:val=""/>
       <w:lvlJc w:val="left"/>
       <w:pPr>
-        <w:ind w:left="5400" w:hanging="360"/>
+        <w:ind w:left="4320" w:hanging="360"/>
       </w:pPr>
       <w:rPr>
         <w:rFonts w:ascii="Wingdings" w:hAnsi="Wingdings" w:hint="default"/>
@@ -4605,7 +5908,7 @@
       <w:lvlText w:val=""/>
       <w:lvlJc w:val="left"/>
       <w:pPr>
-        <w:ind w:left="6120" w:hanging="360"/>
+        <w:ind w:left="5040" w:hanging="360"/>
       </w:pPr>
       <w:rPr>
         <w:rFonts w:ascii="Symbol" w:hAnsi="Symbol" w:hint="default"/>
@@ -4617,7 +5920,7 @@
       <w:lvlText w:val="o"/>
       <w:lvlJc w:val="left"/>
       <w:pPr>
-        <w:ind w:left="6840" w:hanging="360"/>
+        <w:ind w:left="5760" w:hanging="360"/>
       </w:pPr>
       <w:rPr>
         <w:rFonts w:ascii="Courier New" w:hAnsi="Courier New" w:cs="Courier New" w:hint="default"/>
@@ -4629,6 +5932,118 @@
       <w:lvlText w:val=""/>
       <w:lvlJc w:val="left"/>
       <w:pPr>
+        <w:ind w:left="6480" w:hanging="360"/>
+      </w:pPr>
+      <w:rPr>
+        <w:rFonts w:ascii="Wingdings" w:hAnsi="Wingdings" w:hint="default"/>
+      </w:rPr>
+    </w:lvl>
+  </w:abstractNum>
+  <w:abstractNum w:abstractNumId="4" w15:restartNumberingAfterBreak="0">
+    <w:nsid w:val="4F31630A"/>
+    <w:multiLevelType w:val="hybridMultilevel"/>
+    <w:tmpl w:val="DD58292C"/>
+    <w:lvl w:ilvl="0" w:tplc="FF424106">
+      <w:numFmt w:val="bullet"/>
+      <w:lvlText w:val="-"/>
+      <w:lvlJc w:val="left"/>
+      <w:pPr>
+        <w:ind w:left="1800" w:hanging="360"/>
+      </w:pPr>
+      <w:rPr>
+        <w:rFonts w:ascii="Garamond" w:eastAsiaTheme="minorHAnsi" w:hAnsi="Garamond" w:cstheme="minorBidi" w:hint="default"/>
+      </w:rPr>
+    </w:lvl>
+    <w:lvl w:ilvl="1" w:tplc="04090003" w:tentative="1">
+      <w:start w:val="1"/>
+      <w:numFmt w:val="bullet"/>
+      <w:lvlText w:val="o"/>
+      <w:lvlJc w:val="left"/>
+      <w:pPr>
+        <w:ind w:left="2520" w:hanging="360"/>
+      </w:pPr>
+      <w:rPr>
+        <w:rFonts w:ascii="Courier New" w:hAnsi="Courier New" w:cs="Courier New" w:hint="default"/>
+      </w:rPr>
+    </w:lvl>
+    <w:lvl w:ilvl="2" w:tplc="04090005" w:tentative="1">
+      <w:start w:val="1"/>
+      <w:numFmt w:val="bullet"/>
+      <w:lvlText w:val=""/>
+      <w:lvlJc w:val="left"/>
+      <w:pPr>
+        <w:ind w:left="3240" w:hanging="360"/>
+      </w:pPr>
+      <w:rPr>
+        <w:rFonts w:ascii="Wingdings" w:hAnsi="Wingdings" w:hint="default"/>
+      </w:rPr>
+    </w:lvl>
+    <w:lvl w:ilvl="3" w:tplc="04090001" w:tentative="1">
+      <w:start w:val="1"/>
+      <w:numFmt w:val="bullet"/>
+      <w:lvlText w:val=""/>
+      <w:lvlJc w:val="left"/>
+      <w:pPr>
+        <w:ind w:left="3960" w:hanging="360"/>
+      </w:pPr>
+      <w:rPr>
+        <w:rFonts w:ascii="Symbol" w:hAnsi="Symbol" w:hint="default"/>
+      </w:rPr>
+    </w:lvl>
+    <w:lvl w:ilvl="4" w:tplc="04090003" w:tentative="1">
+      <w:start w:val="1"/>
+      <w:numFmt w:val="bullet"/>
+      <w:lvlText w:val="o"/>
+      <w:lvlJc w:val="left"/>
+      <w:pPr>
+        <w:ind w:left="4680" w:hanging="360"/>
+      </w:pPr>
+      <w:rPr>
+        <w:rFonts w:ascii="Courier New" w:hAnsi="Courier New" w:cs="Courier New" w:hint="default"/>
+      </w:rPr>
+    </w:lvl>
+    <w:lvl w:ilvl="5" w:tplc="04090005" w:tentative="1">
+      <w:start w:val="1"/>
+      <w:numFmt w:val="bullet"/>
+      <w:lvlText w:val=""/>
+      <w:lvlJc w:val="left"/>
+      <w:pPr>
+        <w:ind w:left="5400" w:hanging="360"/>
+      </w:pPr>
+      <w:rPr>
+        <w:rFonts w:ascii="Wingdings" w:hAnsi="Wingdings" w:hint="default"/>
+      </w:rPr>
+    </w:lvl>
+    <w:lvl w:ilvl="6" w:tplc="04090001" w:tentative="1">
+      <w:start w:val="1"/>
+      <w:numFmt w:val="bullet"/>
+      <w:lvlText w:val=""/>
+      <w:lvlJc w:val="left"/>
+      <w:pPr>
+        <w:ind w:left="6120" w:hanging="360"/>
+      </w:pPr>
+      <w:rPr>
+        <w:rFonts w:ascii="Symbol" w:hAnsi="Symbol" w:hint="default"/>
+      </w:rPr>
+    </w:lvl>
+    <w:lvl w:ilvl="7" w:tplc="04090003" w:tentative="1">
+      <w:start w:val="1"/>
+      <w:numFmt w:val="bullet"/>
+      <w:lvlText w:val="o"/>
+      <w:lvlJc w:val="left"/>
+      <w:pPr>
+        <w:ind w:left="6840" w:hanging="360"/>
+      </w:pPr>
+      <w:rPr>
+        <w:rFonts w:ascii="Courier New" w:hAnsi="Courier New" w:cs="Courier New" w:hint="default"/>
+      </w:rPr>
+    </w:lvl>
+    <w:lvl w:ilvl="8" w:tplc="04090005" w:tentative="1">
+      <w:start w:val="1"/>
+      <w:numFmt w:val="bullet"/>
+      <w:lvlText w:val=""/>
+      <w:lvlJc w:val="left"/>
+      <w:pPr>
         <w:ind w:left="7560" w:hanging="360"/>
       </w:pPr>
       <w:rPr>
@@ -4637,16 +6052,19 @@
     </w:lvl>
   </w:abstractNum>
   <w:num w:numId="1" w16cid:durableId="1003900659">
-    <w:abstractNumId w:val="3"/>
+    <w:abstractNumId w:val="4"/>
   </w:num>
   <w:num w:numId="2" w16cid:durableId="1398362279">
-    <w:abstractNumId w:val="2"/>
+    <w:abstractNumId w:val="3"/>
   </w:num>
   <w:num w:numId="3" w16cid:durableId="550503404">
     <w:abstractNumId w:val="0"/>
   </w:num>
   <w:num w:numId="4" w16cid:durableId="1146969083">
     <w:abstractNumId w:val="1"/>
+  </w:num>
+  <w:num w:numId="5" w16cid:durableId="886913943">
+    <w:abstractNumId w:val="2"/>
   </w:num>
 </w:numbering>
 </file>
@@ -5087,7 +6505,6 @@
     <w:next w:val="Normal"/>
     <w:link w:val="Heading2Char"/>
     <w:uiPriority w:val="9"/>
-    <w:semiHidden/>
     <w:unhideWhenUsed/>
     <w:qFormat/>
     <w:rsid w:val="00071CCC"/>
@@ -5304,7 +6721,6 @@
     <w:basedOn w:val="DefaultParagraphFont"/>
     <w:link w:val="Heading2"/>
     <w:uiPriority w:val="9"/>
-    <w:semiHidden/>
     <w:rsid w:val="00071CCC"/>
     <w:rPr>
       <w:rFonts w:asciiTheme="majorHAnsi" w:eastAsiaTheme="majorEastAsia" w:hAnsiTheme="majorHAnsi" w:cstheme="majorBidi"/>

</xml_diff>

<commit_message>
re ordered methods to better reflect logical flow
</commit_message>
<xml_diff>
--- a/Docs/Machine learning applied to otolith timeseries data to discriminate river of origin for Western Alaska Salmon.docx
+++ b/Docs/Machine learning applied to otolith timeseries data to discriminate river of origin for Western Alaska Salmon.docx
@@ -4428,6 +4428,7 @@
         <w:tabs>
           <w:tab w:val="left" w:pos="3088"/>
         </w:tabs>
+        <w:spacing w:line="480" w:lineRule="auto"/>
         <w:rPr>
           <w:rFonts w:ascii="Garamond" w:hAnsi="Garamond"/>
           <w:b/>
@@ -4444,7 +4445,47 @@
           <w:sz w:val="22"/>
           <w:szCs w:val="22"/>
         </w:rPr>
-        <w:t xml:space="preserve">Model Performance </w:t>
+        <w:t>Principal Component Analysis</w:t>
+      </w:r>
+    </w:p>
+    <w:p>
+      <w:pPr>
+        <w:pStyle w:val="whitespace-normal"/>
+        <w:spacing w:line="480" w:lineRule="auto"/>
+        <w:rPr>
+          <w:rFonts w:ascii="Garamond" w:hAnsi="Garamond"/>
+          <w:sz w:val="22"/>
+          <w:szCs w:val="22"/>
+        </w:rPr>
+      </w:pPr>
+      <w:r>
+        <w:tab/>
+      </w:r>
+      <w:r>
+        <w:rPr>
+          <w:rFonts w:ascii="Garamond" w:hAnsi="Garamond"/>
+          <w:sz w:val="22"/>
+          <w:szCs w:val="22"/>
+        </w:rPr>
+        <w:t xml:space="preserve">Principal component analysis of the full GAM-smoothed dataset (n = 2,531) revealed significant clustering of watershed classes in reduced-dimensional space. The first two principal components together captured 97.3% of the total variance in the dataset (PC1: 92.2%, PC2: 5.1%, Figure 4). Despite clear clustering patterns, some overlap remained among all three watersheds. Kuskokwim samples (Figure 4, red) exhibited the greatest degree of overlap, showing significant overlap with both </w:t>
+      </w:r>
+      <w:proofErr w:type="spellStart"/>
+      <w:r>
+        <w:rPr>
+          <w:rFonts w:ascii="Garamond" w:hAnsi="Garamond"/>
+          <w:sz w:val="22"/>
+          <w:szCs w:val="22"/>
+        </w:rPr>
+        <w:t>Nushagak</w:t>
+      </w:r>
+      <w:proofErr w:type="spellEnd"/>
+      <w:r>
+        <w:rPr>
+          <w:rFonts w:ascii="Garamond" w:hAnsi="Garamond"/>
+          <w:sz w:val="22"/>
+          <w:szCs w:val="22"/>
+        </w:rPr>
+        <w:t xml:space="preserve"> and Yukon individuals. Yukon samples covered a much larger region of the principal component space, reflecting the broader range of potential isotope values that create unique timeseries compared to the more constrained ranges observed in the other two watershed classes</w:t>
       </w:r>
     </w:p>
     <w:p>
@@ -4463,130 +4504,81 @@
           <w:sz w:val="22"/>
           <w:szCs w:val="22"/>
         </w:rPr>
-        <w:t>Accuracy a</w:t>
-      </w:r>
-      <w:r>
-        <w:rPr>
-          <w:rFonts w:ascii="Garamond" w:hAnsi="Garamond"/>
-          <w:sz w:val="22"/>
-          <w:szCs w:val="22"/>
-        </w:rPr>
-        <w:t xml:space="preserve">cross both </w:t>
-      </w:r>
-      <w:r>
-        <w:rPr>
-          <w:rFonts w:ascii="Garamond" w:hAnsi="Garamond"/>
-          <w:sz w:val="22"/>
-          <w:szCs w:val="22"/>
-        </w:rPr>
-        <w:t xml:space="preserve">testing sets ranged from 71.9% to 92.5% and F1-Score values ranged from 72.6% to </w:t>
-      </w:r>
-      <w:r>
-        <w:rPr>
-          <w:rFonts w:ascii="Garamond" w:hAnsi="Garamond"/>
-          <w:sz w:val="22"/>
-          <w:szCs w:val="22"/>
-        </w:rPr>
-        <w:t xml:space="preserve">92.2%. The </w:t>
-      </w:r>
-      <w:r>
-        <w:rPr>
-          <w:rFonts w:ascii="Garamond" w:hAnsi="Garamond"/>
-          <w:sz w:val="22"/>
-          <w:szCs w:val="22"/>
-        </w:rPr>
-        <w:t xml:space="preserve">accuracy and F1-score achieved by applying the random forest model to the GAM smoothed dataset and tested on the full testing set. Smoothed timeseries data outperformed the raw data in all cases, indicating that the noise in the raw data may inhibited model </w:t>
-      </w:r>
-      <w:r>
-        <w:rPr>
-          <w:rFonts w:ascii="Garamond" w:hAnsi="Garamond"/>
-          <w:sz w:val="22"/>
-          <w:szCs w:val="22"/>
-        </w:rPr>
-        <w:t xml:space="preserve">performance by obscuring meaningful patterns in the data. Among model types KNN consistently preformed the lowest in both accuracy and F1-Score. </w:t>
-      </w:r>
-      <w:r>
-        <w:rPr>
-          <w:rFonts w:ascii="Garamond" w:hAnsi="Garamond"/>
-          <w:sz w:val="22"/>
-          <w:szCs w:val="22"/>
-        </w:rPr>
-        <w:t>In general, RF analysis outperformed both KNN and SVM, however, SVM was the highest performer on Raw datasets (89.8% accuracy on total testing set and 87.0% on overlapping testing set)</w:t>
-      </w:r>
-      <w:r>
-        <w:rPr>
-          <w:rFonts w:ascii="Garamond" w:hAnsi="Garamond"/>
-          <w:sz w:val="22"/>
-          <w:szCs w:val="22"/>
-        </w:rPr>
-        <w:t xml:space="preserve">, which may have more dimensionality due to less autocorrelation among points. </w:t>
-      </w:r>
-      <w:r>
-        <w:rPr>
-          <w:rFonts w:ascii="Garamond" w:hAnsi="Garamond"/>
-          <w:sz w:val="22"/>
-          <w:szCs w:val="22"/>
-        </w:rPr>
-        <w:t>Unsurprisingly, the overlapping training set performance was slightly lower than that of the total training set, with the highest classification accuracy of 90.</w:t>
-      </w:r>
-      <w:r>
-        <w:rPr>
-          <w:rFonts w:ascii="Garamond" w:hAnsi="Garamond"/>
-          <w:sz w:val="22"/>
-          <w:szCs w:val="22"/>
-        </w:rPr>
-        <w:t>9</w:t>
-      </w:r>
-      <w:r>
-        <w:rPr>
-          <w:rFonts w:ascii="Garamond" w:hAnsi="Garamond"/>
-          <w:sz w:val="22"/>
-          <w:szCs w:val="22"/>
-        </w:rPr>
-        <w:t>% as compared to 92.</w:t>
-      </w:r>
-      <w:r>
-        <w:rPr>
-          <w:rFonts w:ascii="Garamond" w:hAnsi="Garamond"/>
-          <w:sz w:val="22"/>
-          <w:szCs w:val="22"/>
-        </w:rPr>
-        <w:t>2</w:t>
-      </w:r>
-      <w:r>
-        <w:rPr>
-          <w:rFonts w:ascii="Garamond" w:hAnsi="Garamond"/>
-          <w:sz w:val="22"/>
-          <w:szCs w:val="22"/>
-        </w:rPr>
-        <w:t xml:space="preserve">%. </w:t>
-      </w:r>
-      <w:r>
-        <w:rPr>
-          <w:rFonts w:ascii="Garamond" w:hAnsi="Garamond"/>
-          <w:sz w:val="22"/>
-          <w:szCs w:val="22"/>
-        </w:rPr>
-        <w:t xml:space="preserve">These results are expected given the relatively straightforward discrimination of highly enriched Yukon samples which were removed in the overlapping comparison.  </w:t>
-      </w:r>
-    </w:p>
-    <w:p>
-      <w:pPr>
-        <w:spacing w:line="480" w:lineRule="auto"/>
-        <w:ind w:firstLine="720"/>
-        <w:rPr>
-          <w:rFonts w:ascii="Garamond" w:hAnsi="Garamond"/>
-          <w:sz w:val="22"/>
-          <w:szCs w:val="22"/>
-        </w:rPr>
-      </w:pPr>
-      <w:r>
-        <w:rPr>
-          <w:rFonts w:ascii="Garamond" w:hAnsi="Garamond"/>
-          <w:sz w:val="22"/>
-          <w:szCs w:val="22"/>
-        </w:rPr>
-        <w:t xml:space="preserve">The best preforming model (RF, GAM-smoothed data) displayed some variation in overall accuracy among classes. On the Total testing set 92.0% of Kuskokwim, 91.4% of </w:t>
+        <w:t xml:space="preserve">Mapping the loadings of each principal component onto the timeseries revealed distinct regions driving class separation. The first principal component showed high loading values in the middle portion of the timeseries, potentially encompassing both </w:t>
+      </w:r>
+      <w:r>
+        <w:rPr>
+          <w:rFonts w:ascii="Garamond" w:hAnsi="Garamond"/>
+          <w:sz w:val="22"/>
+          <w:szCs w:val="22"/>
+        </w:rPr>
+        <w:t xml:space="preserve">the end of the </w:t>
+      </w:r>
+      <w:r>
+        <w:rPr>
+          <w:rFonts w:ascii="Garamond" w:hAnsi="Garamond"/>
+          <w:sz w:val="22"/>
+          <w:szCs w:val="22"/>
+        </w:rPr>
+        <w:t>natal origin region</w:t>
+      </w:r>
+      <w:r>
+        <w:rPr>
+          <w:rFonts w:ascii="Garamond" w:hAnsi="Garamond"/>
+          <w:sz w:val="22"/>
+          <w:szCs w:val="22"/>
+        </w:rPr>
+        <w:t xml:space="preserve"> </w:t>
+      </w:r>
+      <w:r>
+        <w:rPr>
+          <w:rFonts w:ascii="Garamond" w:hAnsi="Garamond"/>
+          <w:sz w:val="22"/>
+          <w:szCs w:val="22"/>
+        </w:rPr>
+        <w:t>a</w:t>
+      </w:r>
+      <w:r>
+        <w:rPr>
+          <w:rFonts w:ascii="Garamond" w:hAnsi="Garamond"/>
+          <w:sz w:val="22"/>
+          <w:szCs w:val="22"/>
+        </w:rPr>
+        <w:t xml:space="preserve">s well as </w:t>
+      </w:r>
+      <w:r>
+        <w:rPr>
+          <w:rFonts w:ascii="Garamond" w:hAnsi="Garamond"/>
+          <w:sz w:val="22"/>
+          <w:szCs w:val="22"/>
+        </w:rPr>
+        <w:t>secondary rearing locations. The second principal component was driven by variation occurring just before the onset of the marine region, likely representing residency in mainstem tributaries during ocean migration. The relative shape at this point in the timeseries reflects differences in mainstem tributary Sr87/86 values among the three watersheds</w:t>
+      </w:r>
+      <w:r>
+        <w:rPr>
+          <w:rFonts w:ascii="Garamond" w:hAnsi="Garamond"/>
+          <w:sz w:val="22"/>
+          <w:szCs w:val="22"/>
+        </w:rPr>
+        <w:t xml:space="preserve"> (e.g. X, </w:t>
+      </w:r>
+      <w:proofErr w:type="gramStart"/>
+      <w:r>
+        <w:rPr>
+          <w:rFonts w:ascii="Garamond" w:hAnsi="Garamond"/>
+          <w:sz w:val="22"/>
+          <w:szCs w:val="22"/>
+        </w:rPr>
+        <w:t>Y,Z</w:t>
+      </w:r>
+      <w:proofErr w:type="gramEnd"/>
+      <w:r>
+        <w:rPr>
+          <w:rFonts w:ascii="Garamond" w:hAnsi="Garamond"/>
+          <w:sz w:val="22"/>
+          <w:szCs w:val="22"/>
+        </w:rPr>
+        <w:t xml:space="preserve"> in the Yukon, Kuskokwim, and </w:t>
       </w:r>
       <w:proofErr w:type="spellStart"/>
       <w:r>
@@ -4604,7 +4596,32 @@
           <w:sz w:val="22"/>
           <w:szCs w:val="22"/>
         </w:rPr>
-        <w:t xml:space="preserve">, and 93.7% of Yukon samples were correctly identified (Figure 3). By percentage of each class the most common misclassification was </w:t>
+        <w:t xml:space="preserve">, respectively). Interestingly, timeseries of fish from the CWAK region within the Yukon river-basin contained a less pronounced increase in Sr8786 values before the marine onset (Figure 5b.) </w:t>
+      </w:r>
+      <w:r>
+        <w:rPr>
+          <w:rFonts w:ascii="Garamond" w:hAnsi="Garamond"/>
+          <w:sz w:val="22"/>
+          <w:szCs w:val="22"/>
+        </w:rPr>
+        <w:t xml:space="preserve">Principal component 3 appeared to be driven by values at the very beginning of the timeseries, corresponding to the start of the natal origin signature. The minimal </w:t>
+      </w:r>
+      <w:r>
+        <w:rPr>
+          <w:rFonts w:ascii="Garamond" w:hAnsi="Garamond"/>
+          <w:sz w:val="22"/>
+          <w:szCs w:val="22"/>
+        </w:rPr>
+        <w:lastRenderedPageBreak/>
+        <w:t>discrimination among watersheds along this component was expected</w:t>
+      </w:r>
+      <w:r>
+        <w:rPr>
+          <w:rFonts w:ascii="Garamond" w:hAnsi="Garamond"/>
+          <w:sz w:val="22"/>
+          <w:szCs w:val="22"/>
+        </w:rPr>
+        <w:t xml:space="preserve"> given that all individuals in this </w:t>
       </w:r>
       <w:proofErr w:type="spellStart"/>
       <w:r>
@@ -4613,7 +4630,7 @@
           <w:sz w:val="22"/>
           <w:szCs w:val="22"/>
         </w:rPr>
-        <w:t>Nushagak</w:t>
+        <w:t>subet</w:t>
       </w:r>
       <w:proofErr w:type="spellEnd"/>
       <w:r>
@@ -4622,94 +4639,23 @@
           <w:sz w:val="22"/>
           <w:szCs w:val="22"/>
         </w:rPr>
-        <w:t xml:space="preserve"> fish estimated to have been Kuskokwim (8.6% of Kuskokwim fish) followed by the inverse (5.6% of </w:t>
-      </w:r>
-      <w:proofErr w:type="spellStart"/>
-      <w:r>
-        <w:rPr>
-          <w:rFonts w:ascii="Garamond" w:hAnsi="Garamond"/>
-          <w:sz w:val="22"/>
-          <w:szCs w:val="22"/>
-        </w:rPr>
-        <w:t>Nushagak</w:t>
-      </w:r>
-      <w:proofErr w:type="spellEnd"/>
-      <w:r>
-        <w:rPr>
-          <w:rFonts w:ascii="Garamond" w:hAnsi="Garamond"/>
-          <w:sz w:val="22"/>
-          <w:szCs w:val="22"/>
-        </w:rPr>
-        <w:t xml:space="preserve"> fish). Interestingly, after removing the easiest discernable Yukon fish (Sr8786 &gt;</w:t>
-      </w:r>
-      <w:r>
-        <w:rPr>
-          <w:rFonts w:ascii="Garamond" w:hAnsi="Garamond"/>
-          <w:sz w:val="22"/>
-          <w:szCs w:val="22"/>
-        </w:rPr>
-        <w:t xml:space="preserve">.7150), Yukon classification accuracy dropped to 86.8%. Classification accuracy for </w:t>
-      </w:r>
-      <w:proofErr w:type="spellStart"/>
-      <w:r>
-        <w:rPr>
-          <w:rFonts w:ascii="Garamond" w:hAnsi="Garamond"/>
-          <w:sz w:val="22"/>
-          <w:szCs w:val="22"/>
-        </w:rPr>
-        <w:t>Nushagak</w:t>
-      </w:r>
-      <w:proofErr w:type="spellEnd"/>
-      <w:r>
-        <w:rPr>
-          <w:rFonts w:ascii="Garamond" w:hAnsi="Garamond"/>
-          <w:sz w:val="22"/>
-          <w:szCs w:val="22"/>
-        </w:rPr>
-        <w:t xml:space="preserve"> fish did not change (91.4%) whereas Kuskokwim saw a slight increase to 92.5%. In this testing set the most frequent misclassification was Yukon fish predicted to have been Kuskokwim (8.8% of Yukon fish</w:t>
-      </w:r>
-      <w:proofErr w:type="gramStart"/>
-      <w:r>
-        <w:rPr>
-          <w:rFonts w:ascii="Garamond" w:hAnsi="Garamond"/>
-          <w:sz w:val="22"/>
-          <w:szCs w:val="22"/>
-        </w:rPr>
-        <w:t>),</w:t>
-      </w:r>
-      <w:proofErr w:type="gramEnd"/>
-      <w:r>
-        <w:rPr>
-          <w:rFonts w:ascii="Garamond" w:hAnsi="Garamond"/>
-          <w:sz w:val="22"/>
-          <w:szCs w:val="22"/>
-        </w:rPr>
-        <w:t xml:space="preserve"> however this represented only one additional individual misclassified (9 in the total analysis vs 8 in the overlapping </w:t>
-      </w:r>
-      <w:r>
-        <w:rPr>
-          <w:rFonts w:ascii="Garamond" w:hAnsi="Garamond"/>
-          <w:sz w:val="22"/>
-          <w:szCs w:val="22"/>
-        </w:rPr>
-        <w:lastRenderedPageBreak/>
-        <w:t xml:space="preserve">analysis). </w:t>
-      </w:r>
-      <w:commentRangeStart w:id="2"/>
-      <w:r>
-        <w:rPr>
-          <w:rFonts w:ascii="Garamond" w:hAnsi="Garamond"/>
-          <w:sz w:val="22"/>
-          <w:szCs w:val="22"/>
-        </w:rPr>
-        <w:t xml:space="preserve">Among Yukon fish, individuals within the CWAK region (Lower Yukon genetic reporting group, n = 30) were classified with 73.3% accuracy as compared to 97.9% in non CWAK fish. </w:t>
-      </w:r>
-      <w:commentRangeEnd w:id="2"/>
-      <w:r>
-        <w:rPr>
-          <w:rStyle w:val="CommentReference"/>
-        </w:rPr>
-        <w:commentReference w:id="2"/>
+        <w:t xml:space="preserve"> </w:t>
+      </w:r>
+      <w:r>
+        <w:rPr>
+          <w:rFonts w:ascii="Garamond" w:hAnsi="Garamond"/>
+          <w:sz w:val="22"/>
+          <w:szCs w:val="22"/>
+        </w:rPr>
+        <w:t>share the same natal origin value</w:t>
+      </w:r>
+      <w:r>
+        <w:rPr>
+          <w:rFonts w:ascii="Garamond" w:hAnsi="Garamond"/>
+          <w:sz w:val="22"/>
+          <w:szCs w:val="22"/>
+        </w:rPr>
+        <w:t xml:space="preserve">. </w:t>
       </w:r>
     </w:p>
     <w:p>
@@ -4717,7 +4663,6 @@
         <w:tabs>
           <w:tab w:val="left" w:pos="3088"/>
         </w:tabs>
-        <w:spacing w:line="480" w:lineRule="auto"/>
         <w:rPr>
           <w:rFonts w:ascii="Garamond" w:hAnsi="Garamond"/>
           <w:b/>
@@ -4734,47 +4679,7 @@
           <w:sz w:val="22"/>
           <w:szCs w:val="22"/>
         </w:rPr>
-        <w:t>Principal Component Analysis</w:t>
-      </w:r>
-    </w:p>
-    <w:p>
-      <w:pPr>
-        <w:pStyle w:val="whitespace-normal"/>
-        <w:spacing w:line="480" w:lineRule="auto"/>
-        <w:rPr>
-          <w:rFonts w:ascii="Garamond" w:hAnsi="Garamond"/>
-          <w:sz w:val="22"/>
-          <w:szCs w:val="22"/>
-        </w:rPr>
-      </w:pPr>
-      <w:r>
-        <w:tab/>
-      </w:r>
-      <w:r>
-        <w:rPr>
-          <w:rFonts w:ascii="Garamond" w:hAnsi="Garamond"/>
-          <w:sz w:val="22"/>
-          <w:szCs w:val="22"/>
-        </w:rPr>
-        <w:t xml:space="preserve">Principal component analysis of the full GAM-smoothed dataset (n = 2,531) revealed significant clustering of watershed classes in reduced-dimensional space. The first two principal components together captured 97.3% of the total variance in the dataset (PC1: 92.2%, PC2: 5.1%, Figure 4). Despite clear clustering patterns, some overlap remained among all three watersheds. Kuskokwim samples (Figure 4, red) exhibited the greatest degree of overlap, showing significant overlap with both </w:t>
-      </w:r>
-      <w:proofErr w:type="spellStart"/>
-      <w:r>
-        <w:rPr>
-          <w:rFonts w:ascii="Garamond" w:hAnsi="Garamond"/>
-          <w:sz w:val="22"/>
-          <w:szCs w:val="22"/>
-        </w:rPr>
-        <w:t>Nushagak</w:t>
-      </w:r>
-      <w:proofErr w:type="spellEnd"/>
-      <w:r>
-        <w:rPr>
-          <w:rFonts w:ascii="Garamond" w:hAnsi="Garamond"/>
-          <w:sz w:val="22"/>
-          <w:szCs w:val="22"/>
-        </w:rPr>
-        <w:t xml:space="preserve"> and Yukon individuals. Yukon samples covered a much larger region of the principal component space, reflecting the broader range of potential isotope values that create unique timeseries compared to the more constrained ranges observed in the other two watershed classes</w:t>
+        <w:t xml:space="preserve">Model Performance </w:t>
       </w:r>
     </w:p>
     <w:p>
@@ -4793,63 +4698,194 @@
           <w:sz w:val="22"/>
           <w:szCs w:val="22"/>
         </w:rPr>
-        <w:t xml:space="preserve">Mapping the loadings of each principal component onto the timeseries revealed distinct regions driving class separation. The first principal component showed high loading values in the middle portion of the timeseries, potentially encompassing both </w:t>
-      </w:r>
-      <w:r>
-        <w:rPr>
-          <w:rFonts w:ascii="Garamond" w:hAnsi="Garamond"/>
-          <w:sz w:val="22"/>
-          <w:szCs w:val="22"/>
-        </w:rPr>
-        <w:t xml:space="preserve">the end of the </w:t>
-      </w:r>
-      <w:r>
-        <w:rPr>
-          <w:rFonts w:ascii="Garamond" w:hAnsi="Garamond"/>
-          <w:sz w:val="22"/>
-          <w:szCs w:val="22"/>
-        </w:rPr>
-        <w:t>natal origin region</w:t>
-      </w:r>
-      <w:r>
-        <w:rPr>
-          <w:rFonts w:ascii="Garamond" w:hAnsi="Garamond"/>
-          <w:sz w:val="22"/>
-          <w:szCs w:val="22"/>
-        </w:rPr>
-        <w:t xml:space="preserve"> </w:t>
-      </w:r>
-      <w:r>
-        <w:rPr>
-          <w:rFonts w:ascii="Garamond" w:hAnsi="Garamond"/>
-          <w:sz w:val="22"/>
-          <w:szCs w:val="22"/>
-        </w:rPr>
-        <w:t>a</w:t>
-      </w:r>
-      <w:r>
-        <w:rPr>
-          <w:rFonts w:ascii="Garamond" w:hAnsi="Garamond"/>
-          <w:sz w:val="22"/>
-          <w:szCs w:val="22"/>
-        </w:rPr>
-        <w:t xml:space="preserve">s well as </w:t>
-      </w:r>
-      <w:r>
-        <w:rPr>
-          <w:rFonts w:ascii="Garamond" w:hAnsi="Garamond"/>
-          <w:sz w:val="22"/>
-          <w:szCs w:val="22"/>
-        </w:rPr>
-        <w:t>secondary rearing locations. The second principal component was driven by variation occurring just before the onset of the marine region, likely representing residency in mainstem tributaries during ocean migration. The relative shape at this point in the timeseries reflects differences in mainstem tributary Sr87/86 values among the three watersheds</w:t>
-      </w:r>
-      <w:r>
-        <w:rPr>
-          <w:rFonts w:ascii="Garamond" w:hAnsi="Garamond"/>
-          <w:sz w:val="22"/>
-          <w:szCs w:val="22"/>
-        </w:rPr>
-        <w:t xml:space="preserve"> (e.g. X, </w:t>
+        <w:t>Accuracy a</w:t>
+      </w:r>
+      <w:r>
+        <w:rPr>
+          <w:rFonts w:ascii="Garamond" w:hAnsi="Garamond"/>
+          <w:sz w:val="22"/>
+          <w:szCs w:val="22"/>
+        </w:rPr>
+        <w:t xml:space="preserve">cross both </w:t>
+      </w:r>
+      <w:r>
+        <w:rPr>
+          <w:rFonts w:ascii="Garamond" w:hAnsi="Garamond"/>
+          <w:sz w:val="22"/>
+          <w:szCs w:val="22"/>
+        </w:rPr>
+        <w:t xml:space="preserve">testing sets ranged from 71.9% to 92.5% and F1-Score values ranged from 72.6% to 92.2%. The </w:t>
+      </w:r>
+      <w:r>
+        <w:rPr>
+          <w:rFonts w:ascii="Garamond" w:hAnsi="Garamond"/>
+          <w:sz w:val="22"/>
+          <w:szCs w:val="22"/>
+        </w:rPr>
+        <w:t xml:space="preserve">accuracy and F1-score achieved by applying the random forest model to the GAM smoothed dataset and tested on the full testing set. Smoothed timeseries data outperformed the raw data in all cases, indicating that the noise in the raw data may inhibited model </w:t>
+      </w:r>
+      <w:r>
+        <w:rPr>
+          <w:rFonts w:ascii="Garamond" w:hAnsi="Garamond"/>
+          <w:sz w:val="22"/>
+          <w:szCs w:val="22"/>
+        </w:rPr>
+        <w:t xml:space="preserve">performance by obscuring meaningful patterns in the data. Among model types KNN consistently preformed the lowest in both accuracy and F1-Score. </w:t>
+      </w:r>
+      <w:r>
+        <w:rPr>
+          <w:rFonts w:ascii="Garamond" w:hAnsi="Garamond"/>
+          <w:sz w:val="22"/>
+          <w:szCs w:val="22"/>
+        </w:rPr>
+        <w:t>In general, RF analysis outperformed both KNN and SVM, however, SVM was the highest performer on Raw datasets (89.8% accuracy on total testing set and 87.0% on overlapping testing set)</w:t>
+      </w:r>
+      <w:r>
+        <w:rPr>
+          <w:rFonts w:ascii="Garamond" w:hAnsi="Garamond"/>
+          <w:sz w:val="22"/>
+          <w:szCs w:val="22"/>
+        </w:rPr>
+        <w:t xml:space="preserve">, which may have more dimensionality due to less autocorrelation among points. </w:t>
+      </w:r>
+      <w:r>
+        <w:rPr>
+          <w:rFonts w:ascii="Garamond" w:hAnsi="Garamond"/>
+          <w:sz w:val="22"/>
+          <w:szCs w:val="22"/>
+        </w:rPr>
+        <w:t>Unsurprisingly, the overlapping training set performance was slightly lower than that of the total training set, with the highest classification accuracy of 90.</w:t>
+      </w:r>
+      <w:r>
+        <w:rPr>
+          <w:rFonts w:ascii="Garamond" w:hAnsi="Garamond"/>
+          <w:sz w:val="22"/>
+          <w:szCs w:val="22"/>
+        </w:rPr>
+        <w:t>9</w:t>
+      </w:r>
+      <w:r>
+        <w:rPr>
+          <w:rFonts w:ascii="Garamond" w:hAnsi="Garamond"/>
+          <w:sz w:val="22"/>
+          <w:szCs w:val="22"/>
+        </w:rPr>
+        <w:t>% as compared to 92.</w:t>
+      </w:r>
+      <w:r>
+        <w:rPr>
+          <w:rFonts w:ascii="Garamond" w:hAnsi="Garamond"/>
+          <w:sz w:val="22"/>
+          <w:szCs w:val="22"/>
+        </w:rPr>
+        <w:t>2</w:t>
+      </w:r>
+      <w:r>
+        <w:rPr>
+          <w:rFonts w:ascii="Garamond" w:hAnsi="Garamond"/>
+          <w:sz w:val="22"/>
+          <w:szCs w:val="22"/>
+        </w:rPr>
+        <w:t xml:space="preserve">%. </w:t>
+      </w:r>
+      <w:r>
+        <w:rPr>
+          <w:rFonts w:ascii="Garamond" w:hAnsi="Garamond"/>
+          <w:sz w:val="22"/>
+          <w:szCs w:val="22"/>
+        </w:rPr>
+        <w:t xml:space="preserve">These results are expected given the relatively straightforward discrimination of highly enriched Yukon samples which were removed in the overlapping comparison.  </w:t>
+      </w:r>
+    </w:p>
+    <w:p>
+      <w:pPr>
+        <w:spacing w:line="480" w:lineRule="auto"/>
+        <w:ind w:firstLine="720"/>
+        <w:rPr>
+          <w:rFonts w:ascii="Garamond" w:hAnsi="Garamond"/>
+          <w:sz w:val="22"/>
+          <w:szCs w:val="22"/>
+        </w:rPr>
+      </w:pPr>
+      <w:r>
+        <w:rPr>
+          <w:rFonts w:ascii="Garamond" w:hAnsi="Garamond"/>
+          <w:sz w:val="22"/>
+          <w:szCs w:val="22"/>
+        </w:rPr>
+        <w:t xml:space="preserve">The best preforming model (RF, GAM-smoothed data) displayed some variation in overall accuracy among classes. On the Total testing set 92.0% of Kuskokwim, 91.4% of </w:t>
+      </w:r>
+      <w:proofErr w:type="spellStart"/>
+      <w:r>
+        <w:rPr>
+          <w:rFonts w:ascii="Garamond" w:hAnsi="Garamond"/>
+          <w:sz w:val="22"/>
+          <w:szCs w:val="22"/>
+        </w:rPr>
+        <w:t>Nushagak</w:t>
+      </w:r>
+      <w:proofErr w:type="spellEnd"/>
+      <w:r>
+        <w:rPr>
+          <w:rFonts w:ascii="Garamond" w:hAnsi="Garamond"/>
+          <w:sz w:val="22"/>
+          <w:szCs w:val="22"/>
+        </w:rPr>
+        <w:t xml:space="preserve">, and 93.7% of Yukon samples were correctly identified (Figure 3). By percentage of each class the most common misclassification was </w:t>
+      </w:r>
+      <w:proofErr w:type="spellStart"/>
+      <w:r>
+        <w:rPr>
+          <w:rFonts w:ascii="Garamond" w:hAnsi="Garamond"/>
+          <w:sz w:val="22"/>
+          <w:szCs w:val="22"/>
+        </w:rPr>
+        <w:t>Nushagak</w:t>
+      </w:r>
+      <w:proofErr w:type="spellEnd"/>
+      <w:r>
+        <w:rPr>
+          <w:rFonts w:ascii="Garamond" w:hAnsi="Garamond"/>
+          <w:sz w:val="22"/>
+          <w:szCs w:val="22"/>
+        </w:rPr>
+        <w:t xml:space="preserve"> fish estimated to have been Kuskokwim (8.6% of Kuskokwim fish) followed by the inverse (5.6% of </w:t>
+      </w:r>
+      <w:proofErr w:type="spellStart"/>
+      <w:r>
+        <w:rPr>
+          <w:rFonts w:ascii="Garamond" w:hAnsi="Garamond"/>
+          <w:sz w:val="22"/>
+          <w:szCs w:val="22"/>
+        </w:rPr>
+        <w:t>Nushagak</w:t>
+      </w:r>
+      <w:proofErr w:type="spellEnd"/>
+      <w:r>
+        <w:rPr>
+          <w:rFonts w:ascii="Garamond" w:hAnsi="Garamond"/>
+          <w:sz w:val="22"/>
+          <w:szCs w:val="22"/>
+        </w:rPr>
+        <w:t xml:space="preserve"> fish). Interestingly, after removing the easiest discernable Yukon fish (Sr8786 &gt;.7150), Yukon classification accuracy dropped to 86.8%. Classification accuracy for </w:t>
+      </w:r>
+      <w:proofErr w:type="spellStart"/>
+      <w:r>
+        <w:rPr>
+          <w:rFonts w:ascii="Garamond" w:hAnsi="Garamond"/>
+          <w:sz w:val="22"/>
+          <w:szCs w:val="22"/>
+        </w:rPr>
+        <w:t>Nushagak</w:t>
+      </w:r>
+      <w:proofErr w:type="spellEnd"/>
+      <w:r>
+        <w:rPr>
+          <w:rFonts w:ascii="Garamond" w:hAnsi="Garamond"/>
+          <w:sz w:val="22"/>
+          <w:szCs w:val="22"/>
+        </w:rPr>
+        <w:t xml:space="preserve"> fish did not change (91.4%) whereas Kuskokwim saw a slight increase to 92.5%. In this testing set the most frequent misclassification was Yukon fish predicted to have been Kuskokwim (8.8% of Yukon fish</w:t>
       </w:r>
       <w:proofErr w:type="gramStart"/>
       <w:r>
@@ -4858,7 +4894,7 @@
           <w:sz w:val="22"/>
           <w:szCs w:val="22"/>
         </w:rPr>
-        <w:t>Y,Z</w:t>
+        <w:t>),</w:t>
       </w:r>
       <w:proofErr w:type="gramEnd"/>
       <w:r>
@@ -4867,75 +4903,23 @@
           <w:sz w:val="22"/>
           <w:szCs w:val="22"/>
         </w:rPr>
-        <w:t xml:space="preserve"> in the Yukon, Kuskokwim, and </w:t>
-      </w:r>
-      <w:proofErr w:type="spellStart"/>
-      <w:r>
-        <w:rPr>
-          <w:rFonts w:ascii="Garamond" w:hAnsi="Garamond"/>
-          <w:sz w:val="22"/>
-          <w:szCs w:val="22"/>
-        </w:rPr>
-        <w:t>Nushagak</w:t>
-      </w:r>
-      <w:proofErr w:type="spellEnd"/>
-      <w:r>
-        <w:rPr>
-          <w:rFonts w:ascii="Garamond" w:hAnsi="Garamond"/>
-          <w:sz w:val="22"/>
-          <w:szCs w:val="22"/>
-        </w:rPr>
-        <w:t xml:space="preserve">, respectively). Interestingly, timeseries of fish from the CWAK region within the Yukon river-basin contained a less pronounced increase in Sr8786 values before the marine onset (Figure 5b.) </w:t>
-      </w:r>
-      <w:r>
-        <w:rPr>
-          <w:rFonts w:ascii="Garamond" w:hAnsi="Garamond"/>
-          <w:sz w:val="22"/>
-          <w:szCs w:val="22"/>
-        </w:rPr>
-        <w:t>Principal component 3 appeared to be driven by values at the very beginning of the timeseries, corresponding to the start of the natal origin signature. The minimal discrimination among watersheds along this component was expected</w:t>
-      </w:r>
-      <w:r>
-        <w:rPr>
-          <w:rFonts w:ascii="Garamond" w:hAnsi="Garamond"/>
-          <w:sz w:val="22"/>
-          <w:szCs w:val="22"/>
-        </w:rPr>
-        <w:t xml:space="preserve"> given that all individuals in this </w:t>
-      </w:r>
-      <w:proofErr w:type="spellStart"/>
-      <w:r>
-        <w:rPr>
-          <w:rFonts w:ascii="Garamond" w:hAnsi="Garamond"/>
-          <w:sz w:val="22"/>
-          <w:szCs w:val="22"/>
-        </w:rPr>
-        <w:t>subet</w:t>
-      </w:r>
-      <w:proofErr w:type="spellEnd"/>
-      <w:r>
-        <w:rPr>
-          <w:rFonts w:ascii="Garamond" w:hAnsi="Garamond"/>
-          <w:sz w:val="22"/>
-          <w:szCs w:val="22"/>
-        </w:rPr>
-        <w:t xml:space="preserve"> </w:t>
-      </w:r>
-      <w:r>
-        <w:rPr>
-          <w:rFonts w:ascii="Garamond" w:hAnsi="Garamond"/>
-          <w:sz w:val="22"/>
-          <w:szCs w:val="22"/>
-        </w:rPr>
-        <w:t>share the same natal origin value</w:t>
-      </w:r>
-      <w:r>
-        <w:rPr>
-          <w:rFonts w:ascii="Garamond" w:hAnsi="Garamond"/>
-          <w:sz w:val="22"/>
-          <w:szCs w:val="22"/>
-        </w:rPr>
-        <w:t xml:space="preserve">. </w:t>
+        <w:t xml:space="preserve"> however this represented only one additional individual misclassified (9 in the total analysis vs 8 in the overlapping analysis). </w:t>
+      </w:r>
+      <w:commentRangeStart w:id="2"/>
+      <w:r>
+        <w:rPr>
+          <w:rFonts w:ascii="Garamond" w:hAnsi="Garamond"/>
+          <w:sz w:val="22"/>
+          <w:szCs w:val="22"/>
+        </w:rPr>
+        <w:t xml:space="preserve">Among Yukon fish, individuals within the CWAK region (Lower Yukon genetic reporting group, n = 30) were classified with 73.3% accuracy as compared to 97.9% in non CWAK fish. </w:t>
+      </w:r>
+      <w:commentRangeEnd w:id="2"/>
+      <w:r>
+        <w:rPr>
+          <w:rStyle w:val="CommentReference"/>
+        </w:rPr>
+        <w:commentReference w:id="2"/>
       </w:r>
     </w:p>
     <w:p>
@@ -4967,7 +4951,6 @@
           <w:b/>
           <w:bCs/>
         </w:rPr>
-        <w:lastRenderedPageBreak/>
         <w:t xml:space="preserve">Probability tuning </w:t>
       </w:r>
       <w:r>
@@ -5125,17 +5108,6 @@
         </w:rPr>
         <w:t xml:space="preserve">Discussion </w:t>
       </w:r>
-    </w:p>
-    <w:p>
-      <w:pPr>
-        <w:rPr>
-          <w:rFonts w:ascii="Garamond" w:hAnsi="Garamond"/>
-          <w:b/>
-          <w:bCs/>
-          <w:sz w:val="32"/>
-          <w:szCs w:val="32"/>
-        </w:rPr>
-      </w:pPr>
     </w:p>
     <w:p>
       <w:pPr>
@@ -5469,7 +5441,7 @@
 <w15:commentsEx xmlns:wpc="http://schemas.microsoft.com/office/word/2010/wordprocessingCanvas" xmlns:cx="http://schemas.microsoft.com/office/drawing/2014/chartex" xmlns:cx1="http://schemas.microsoft.com/office/drawing/2015/9/8/chartex" xmlns:cx2="http://schemas.microsoft.com/office/drawing/2015/10/21/chartex" xmlns:cx3="http://schemas.microsoft.com/office/drawing/2016/5/9/chartex" xmlns:cx4="http://schemas.microsoft.com/office/drawing/2016/5/10/chartex" xmlns:cx5="http://schemas.microsoft.com/office/drawing/2016/5/11/chartex" xmlns:cx6="http://schemas.microsoft.com/office/drawing/2016/5/12/chartex" xmlns:cx7="http://schemas.microsoft.com/office/drawing/2016/5/13/chartex" xmlns:cx8="http://schemas.microsoft.com/office/drawing/2016/5/14/chartex" xmlns:mc="http://schemas.openxmlformats.org/markup-compatibility/2006" xmlns:aink="http://schemas.microsoft.com/office/drawing/2016/ink" xmlns:am3d="http://schemas.microsoft.com/office/drawing/2017/model3d" xmlns:o="urn:schemas-microsoft-com:office:office" xmlns:oel="http://schemas.microsoft.com/office/2019/extlst" xmlns:r="http://schemas.openxmlformats.org/officeDocument/2006/relationships" xmlns:m="http://schemas.openxmlformats.org/officeDocument/2006/math" xmlns:v="urn:schemas-microsoft-com:vml" xmlns:wp14="http://schemas.microsoft.com/office/word/2010/wordprocessingDrawing" xmlns:wp="http://schemas.openxmlformats.org/drawingml/2006/wordprocessingDrawing" xmlns:w10="urn:schemas-microsoft-com:office:word" xmlns:w="http://schemas.openxmlformats.org/wordprocessingml/2006/main" xmlns:w14="http://schemas.microsoft.com/office/word/2010/wordml" xmlns:w15="http://schemas.microsoft.com/office/word/2012/wordml" xmlns:w16cex="http://schemas.microsoft.com/office/word/2018/wordml/cex" xmlns:w16cid="http://schemas.microsoft.com/office/word/2016/wordml/cid" xmlns:w16="http://schemas.microsoft.com/office/word/2018/wordml" xmlns:w16du="http://schemas.microsoft.com/office/word/2023/wordml/word16du" xmlns:w16sdtdh="http://schemas.microsoft.com/office/word/2020/wordml/sdtdatahash" xmlns:w16sdtfl="http://schemas.microsoft.com/office/word/2024/wordml/sdtformatlock" xmlns:w16se="http://schemas.microsoft.com/office/word/2015/wordml/symex" xmlns:wpg="http://schemas.microsoft.com/office/word/2010/wordprocessingGroup" xmlns:wpi="http://schemas.microsoft.com/office/word/2010/wordprocessingInk" xmlns:wne="http://schemas.microsoft.com/office/word/2006/wordml" xmlns:wps="http://schemas.microsoft.com/office/word/2010/wordprocessingShape" mc:Ignorable="w14 w15 w16se w16cid w16 w16cex w16sdtdh w16sdtfl w16du wp14">
   <w15:commentEx w15:paraId="51CBD6D1" w15:done="0"/>
   <w15:commentEx w15:paraId="4E3434D0" w15:done="0"/>
-  <w15:commentEx w15:paraId="084F4B46" w15:done="0"/>
+  <w15:commentEx w15:paraId="16C43ACC" w15:done="0"/>
 </w15:commentsEx>
 </file>
 
@@ -5485,7 +5457,7 @@
 <w16cid:commentsIds xmlns:wpc="http://schemas.microsoft.com/office/word/2010/wordprocessingCanvas" xmlns:cx="http://schemas.microsoft.com/office/drawing/2014/chartex" xmlns:cx1="http://schemas.microsoft.com/office/drawing/2015/9/8/chartex" xmlns:cx2="http://schemas.microsoft.com/office/drawing/2015/10/21/chartex" xmlns:cx3="http://schemas.microsoft.com/office/drawing/2016/5/9/chartex" xmlns:cx4="http://schemas.microsoft.com/office/drawing/2016/5/10/chartex" xmlns:cx5="http://schemas.microsoft.com/office/drawing/2016/5/11/chartex" xmlns:cx6="http://schemas.microsoft.com/office/drawing/2016/5/12/chartex" xmlns:cx7="http://schemas.microsoft.com/office/drawing/2016/5/13/chartex" xmlns:cx8="http://schemas.microsoft.com/office/drawing/2016/5/14/chartex" xmlns:mc="http://schemas.openxmlformats.org/markup-compatibility/2006" xmlns:aink="http://schemas.microsoft.com/office/drawing/2016/ink" xmlns:am3d="http://schemas.microsoft.com/office/drawing/2017/model3d" xmlns:o="urn:schemas-microsoft-com:office:office" xmlns:oel="http://schemas.microsoft.com/office/2019/extlst" xmlns:r="http://schemas.openxmlformats.org/officeDocument/2006/relationships" xmlns:m="http://schemas.openxmlformats.org/officeDocument/2006/math" xmlns:v="urn:schemas-microsoft-com:vml" xmlns:wp14="http://schemas.microsoft.com/office/word/2010/wordprocessingDrawing" xmlns:wp="http://schemas.openxmlformats.org/drawingml/2006/wordprocessingDrawing" xmlns:w10="urn:schemas-microsoft-com:office:word" xmlns:w="http://schemas.openxmlformats.org/wordprocessingml/2006/main" xmlns:w14="http://schemas.microsoft.com/office/word/2010/wordml" xmlns:w15="http://schemas.microsoft.com/office/word/2012/wordml" xmlns:w16cex="http://schemas.microsoft.com/office/word/2018/wordml/cex" xmlns:w16cid="http://schemas.microsoft.com/office/word/2016/wordml/cid" xmlns:w16="http://schemas.microsoft.com/office/word/2018/wordml" xmlns:w16du="http://schemas.microsoft.com/office/word/2023/wordml/word16du" xmlns:w16sdtdh="http://schemas.microsoft.com/office/word/2020/wordml/sdtdatahash" xmlns:w16sdtfl="http://schemas.microsoft.com/office/word/2024/wordml/sdtformatlock" xmlns:w16se="http://schemas.microsoft.com/office/word/2015/wordml/symex" xmlns:wpg="http://schemas.microsoft.com/office/word/2010/wordprocessingGroup" xmlns:wpi="http://schemas.microsoft.com/office/word/2010/wordprocessingInk" xmlns:wne="http://schemas.microsoft.com/office/word/2006/wordml" xmlns:wps="http://schemas.microsoft.com/office/word/2010/wordprocessingShape" mc:Ignorable="w14 w15 w16se w16cid w16 w16cex w16sdtdh w16sdtfl w16du wp14">
   <w16cid:commentId w16cid:paraId="51CBD6D1" w16cid:durableId="6197010A"/>
   <w16cid:commentId w16cid:paraId="4E3434D0" w16cid:durableId="208C7FE7"/>
-  <w16cid:commentId w16cid:paraId="084F4B46" w16cid:durableId="3FDF2CD4"/>
+  <w16cid:commentId w16cid:paraId="16C43ACC" w16cid:durableId="3FDF2CD4"/>
 </w16cid:commentsIds>
 </file>
 

</xml_diff>

<commit_message>
alll the way through
</commit_message>
<xml_diff>
--- a/Docs/Machine learning applied to otolith timeseries data to discriminate river of origin for Western Alaska Salmon.docx
+++ b/Docs/Machine learning applied to otolith timeseries data to discriminate river of origin for Western Alaska Salmon.docx
@@ -1594,7 +1594,103 @@
           <w:sz w:val="22"/>
           <w:szCs w:val="22"/>
         </w:rPr>
-        <w:t>In some cases,</w:t>
+        <w:t xml:space="preserve">In some cases, rapid movement through multiple environments prevents full isotopic equilibration between the otolith and ambient water. For Pacific salmon, which migrate quickly from freshwater rearing habitats to the ocean, post-natal otolith strontium data may not reflect the true </w:t>
+      </w:r>
+      <w:r>
+        <w:rPr>
+          <w:rFonts w:ascii="Cambria Math" w:hAnsi="Cambria Math" w:cs="Cambria Math"/>
+          <w:sz w:val="22"/>
+          <w:szCs w:val="22"/>
+        </w:rPr>
+        <w:t>⁸⁷</w:t>
+      </w:r>
+      <w:r>
+        <w:rPr>
+          <w:rFonts w:ascii="Garamond" w:hAnsi="Garamond"/>
+          <w:sz w:val="22"/>
+          <w:szCs w:val="22"/>
+        </w:rPr>
+        <w:t>Sr/</w:t>
+      </w:r>
+      <w:r>
+        <w:rPr>
+          <w:rFonts w:ascii="Cambria Math" w:hAnsi="Cambria Math" w:cs="Cambria Math"/>
+          <w:sz w:val="22"/>
+          <w:szCs w:val="22"/>
+        </w:rPr>
+        <w:t>⁸⁶</w:t>
+      </w:r>
+      <w:r>
+        <w:rPr>
+          <w:rFonts w:ascii="Garamond" w:hAnsi="Garamond"/>
+          <w:sz w:val="22"/>
+          <w:szCs w:val="22"/>
+        </w:rPr>
+        <w:t xml:space="preserve">Sr values of each outmigration habitat. Instead, </w:t>
+      </w:r>
+      <w:r>
+        <w:rPr>
+          <w:rFonts w:ascii="Garamond" w:hAnsi="Garamond"/>
+          <w:sz w:val="22"/>
+          <w:szCs w:val="22"/>
+        </w:rPr>
+        <w:t xml:space="preserve">sequentially ordered otolith </w:t>
+      </w:r>
+      <w:r>
+        <w:rPr>
+          <w:rFonts w:ascii="Cambria Math" w:hAnsi="Cambria Math" w:cs="Cambria Math"/>
+          <w:sz w:val="22"/>
+          <w:szCs w:val="22"/>
+        </w:rPr>
+        <w:t>⁸⁷</w:t>
+      </w:r>
+      <w:r>
+        <w:rPr>
+          <w:rFonts w:ascii="Garamond" w:hAnsi="Garamond"/>
+          <w:sz w:val="22"/>
+          <w:szCs w:val="22"/>
+        </w:rPr>
+        <w:t>Sr/</w:t>
+      </w:r>
+      <w:r>
+        <w:rPr>
+          <w:rFonts w:ascii="Cambria Math" w:hAnsi="Cambria Math" w:cs="Cambria Math"/>
+          <w:sz w:val="22"/>
+          <w:szCs w:val="22"/>
+        </w:rPr>
+        <w:t>⁸⁶</w:t>
+      </w:r>
+      <w:r>
+        <w:rPr>
+          <w:rFonts w:ascii="Garamond" w:hAnsi="Garamond"/>
+          <w:sz w:val="22"/>
+          <w:szCs w:val="22"/>
+        </w:rPr>
+        <w:t>Sr</w:t>
+      </w:r>
+      <w:r>
+        <w:rPr>
+          <w:rFonts w:ascii="Garamond" w:hAnsi="Garamond"/>
+          <w:sz w:val="22"/>
+          <w:szCs w:val="22"/>
+        </w:rPr>
+        <w:t xml:space="preserve"> data</w:t>
+      </w:r>
+      <w:r>
+        <w:rPr>
+          <w:rFonts w:ascii="Garamond" w:hAnsi="Garamond"/>
+          <w:sz w:val="22"/>
+          <w:szCs w:val="22"/>
+        </w:rPr>
+        <w:t xml:space="preserve"> record a series of subtle patterns produced by incomplete and ongoing turnover reactions. The shape of these patterns, and the relationships among them, may encode distinctive river-specific life histories that together form an identifiable “fingerprint</w:t>
+      </w:r>
+      <w:r>
+        <w:rPr>
+          <w:rFonts w:ascii="Garamond" w:hAnsi="Garamond"/>
+          <w:sz w:val="22"/>
+          <w:szCs w:val="22"/>
+        </w:rPr>
+        <w:t>” of river-specific stocks.</w:t>
       </w:r>
       <w:r>
         <w:rPr>
@@ -1610,96 +1706,16 @@
           <w:sz w:val="22"/>
           <w:szCs w:val="22"/>
         </w:rPr>
-        <w:t>rapid movements through multiple environments may prevent full isotopic equilibration</w:t>
-      </w:r>
-      <w:r>
-        <w:rPr>
-          <w:rFonts w:ascii="Garamond" w:hAnsi="Garamond"/>
-          <w:sz w:val="22"/>
-          <w:szCs w:val="22"/>
-        </w:rPr>
-        <w:t xml:space="preserve"> between the otolith and the ambient water of the environment. </w:t>
-      </w:r>
-      <w:r>
-        <w:rPr>
-          <w:rFonts w:ascii="Garamond" w:hAnsi="Garamond"/>
-          <w:sz w:val="22"/>
-          <w:szCs w:val="22"/>
-        </w:rPr>
-        <w:t>For Pacific salmon, which migrate quickly through sequential habitats to the ocean</w:t>
-      </w:r>
-      <w:r>
-        <w:rPr>
-          <w:rFonts w:ascii="Garamond" w:hAnsi="Garamond"/>
-          <w:sz w:val="22"/>
-          <w:szCs w:val="22"/>
-        </w:rPr>
-        <w:t xml:space="preserve"> following freshwater rearing, </w:t>
-      </w:r>
-      <w:r>
-        <w:rPr>
-          <w:rFonts w:ascii="Garamond" w:hAnsi="Garamond"/>
-          <w:sz w:val="22"/>
-          <w:szCs w:val="22"/>
-        </w:rPr>
-        <w:t xml:space="preserve">otolith strontium data </w:t>
-      </w:r>
-      <w:r>
-        <w:rPr>
-          <w:rFonts w:ascii="Garamond" w:hAnsi="Garamond"/>
-          <w:sz w:val="22"/>
-          <w:szCs w:val="22"/>
-        </w:rPr>
-        <w:t xml:space="preserve">following natal origin does not necessarily reflect the true Sr8786 ratio of successive outmigration habitats but rather a series of subtle patterns resulting from incomplete and ongoing turnover reactions. The shape of these patterns and the relationship between them may encode meaningful relationships which together form </w:t>
-      </w:r>
-      <w:r>
-        <w:rPr>
-          <w:rFonts w:ascii="Garamond" w:hAnsi="Garamond"/>
-          <w:sz w:val="22"/>
-          <w:szCs w:val="22"/>
-        </w:rPr>
-        <w:t>a</w:t>
-      </w:r>
-      <w:r>
-        <w:rPr>
-          <w:rFonts w:ascii="Garamond" w:hAnsi="Garamond"/>
-          <w:sz w:val="22"/>
-          <w:szCs w:val="22"/>
-        </w:rPr>
-        <w:t xml:space="preserve">n identifiable </w:t>
-      </w:r>
-      <w:r>
-        <w:rPr>
-          <w:rFonts w:ascii="Garamond" w:hAnsi="Garamond"/>
-          <w:sz w:val="22"/>
-          <w:szCs w:val="22"/>
-        </w:rPr>
-        <w:t xml:space="preserve">“fingerprint” </w:t>
-      </w:r>
-      <w:r>
-        <w:rPr>
-          <w:rFonts w:ascii="Garamond" w:hAnsi="Garamond"/>
-          <w:sz w:val="22"/>
-          <w:szCs w:val="22"/>
-        </w:rPr>
-        <w:t xml:space="preserve">of a river-specific life history. </w:t>
-      </w:r>
-      <w:r>
-        <w:rPr>
-          <w:rFonts w:ascii="Garamond" w:hAnsi="Garamond"/>
-          <w:sz w:val="22"/>
-          <w:szCs w:val="22"/>
-        </w:rPr>
-        <w:t xml:space="preserve">However, because these patterns are subtle and the number of </w:t>
-      </w:r>
-      <w:r>
-        <w:rPr>
-          <w:rFonts w:ascii="Garamond" w:hAnsi="Garamond"/>
-          <w:sz w:val="22"/>
-          <w:szCs w:val="22"/>
-        </w:rPr>
         <w:lastRenderedPageBreak/>
-        <w:t>possible combinations in large river basins is high, such identifiers are difficult to detect using traditional statistical or manual methods.</w:t>
+        <w:t>However, because these patterns are subtle and the number of possible combinations in large river basins is high, such identifiers are difficult to detect using traditional statistical or manual approaches</w:t>
+      </w:r>
+      <w:r>
+        <w:rPr>
+          <w:rFonts w:ascii="Garamond" w:hAnsi="Garamond"/>
+          <w:sz w:val="22"/>
+          <w:szCs w:val="22"/>
+        </w:rPr>
+        <w:t xml:space="preserve">. </w:t>
       </w:r>
     </w:p>
     <w:p>
@@ -1767,7 +1783,47 @@
           <w:sz w:val="22"/>
           <w:szCs w:val="22"/>
         </w:rPr>
-        <w:t xml:space="preserve">. At the same time, there is growing recognition that collapsing continuous laser ablation (LA) data into single, discrete values results in the loss of potentially powerful information </w:t>
+        <w:t xml:space="preserve">. </w:t>
+      </w:r>
+      <w:r>
+        <w:rPr>
+          <w:rFonts w:ascii="Garamond" w:hAnsi="Garamond"/>
+          <w:sz w:val="22"/>
+          <w:szCs w:val="22"/>
+        </w:rPr>
+        <w:t xml:space="preserve">At the same time, there is increasing recognition that reducing continuous otolith laser ablation (LA) </w:t>
+      </w:r>
+      <w:r>
+        <w:rPr>
+          <w:rFonts w:ascii="Cambria Math" w:hAnsi="Cambria Math" w:cs="Cambria Math"/>
+          <w:sz w:val="22"/>
+          <w:szCs w:val="22"/>
+        </w:rPr>
+        <w:t>⁸⁷</w:t>
+      </w:r>
+      <w:r>
+        <w:rPr>
+          <w:rFonts w:ascii="Garamond" w:hAnsi="Garamond"/>
+          <w:sz w:val="22"/>
+          <w:szCs w:val="22"/>
+        </w:rPr>
+        <w:t>Sr/</w:t>
+      </w:r>
+      <w:r>
+        <w:rPr>
+          <w:rFonts w:ascii="Cambria Math" w:hAnsi="Cambria Math" w:cs="Cambria Math"/>
+          <w:sz w:val="22"/>
+          <w:szCs w:val="22"/>
+        </w:rPr>
+        <w:t>⁸⁶</w:t>
+      </w:r>
+      <w:r>
+        <w:rPr>
+          <w:rFonts w:ascii="Garamond" w:hAnsi="Garamond"/>
+          <w:sz w:val="22"/>
+          <w:szCs w:val="22"/>
+        </w:rPr>
+        <w:t xml:space="preserve">Sr data to single values discards potentially powerful contextual information about life history strategies </w:t>
       </w:r>
       <w:r>
         <w:rPr>
@@ -1816,15 +1872,82 @@
           <w:sz w:val="22"/>
           <w:szCs w:val="22"/>
         </w:rPr>
-        <w:t xml:space="preserve">. Leveraging the statistical power of machine learning on sequentially ordered otolith time-series data may enable the detection of otherwise indiscernible patterns within and across LA datasets, potentially revealing key life history traits and providing novel insights into ecological processes across space and time. Here, we apply machine learning classification algorithms to </w:t>
-      </w:r>
-      <w:r>
-        <w:rPr>
-          <w:rFonts w:ascii="Garamond" w:hAnsi="Garamond"/>
-          <w:sz w:val="22"/>
-          <w:szCs w:val="22"/>
-        </w:rPr>
-        <w:t xml:space="preserve">a large dataset of </w:t>
+        <w:t xml:space="preserve">. </w:t>
+      </w:r>
+      <w:r>
+        <w:rPr>
+          <w:rFonts w:ascii="Garamond" w:hAnsi="Garamond"/>
+          <w:sz w:val="22"/>
+          <w:szCs w:val="22"/>
+        </w:rPr>
+        <w:t xml:space="preserve">Combining the temporal resolution of otolith timeseries data with the statistical power of machine learning offers the potential to detect otherwise indiscernible patterns within and across LA datasets. With the addition of known watershed labels, these methods could be used to </w:t>
+      </w:r>
+      <w:r>
+        <w:rPr>
+          <w:rFonts w:ascii="Garamond" w:hAnsi="Garamond"/>
+          <w:sz w:val="22"/>
+          <w:szCs w:val="22"/>
+        </w:rPr>
+        <w:t xml:space="preserve">develop a model capable of </w:t>
+      </w:r>
+      <w:r>
+        <w:rPr>
+          <w:rFonts w:ascii="Garamond" w:hAnsi="Garamond"/>
+          <w:sz w:val="22"/>
+          <w:szCs w:val="22"/>
+        </w:rPr>
+        <w:t>discriminate the river of origin for</w:t>
+      </w:r>
+      <w:r>
+        <w:rPr>
+          <w:rFonts w:ascii="Garamond" w:hAnsi="Garamond"/>
+          <w:sz w:val="22"/>
+          <w:szCs w:val="22"/>
+        </w:rPr>
+        <w:t xml:space="preserve"> marine caught Chinook salmon in Western Alaska</w:t>
+      </w:r>
+      <w:r>
+        <w:rPr>
+          <w:rFonts w:ascii="Garamond" w:hAnsi="Garamond"/>
+          <w:sz w:val="22"/>
+          <w:szCs w:val="22"/>
+        </w:rPr>
+        <w:t>.</w:t>
+      </w:r>
+    </w:p>
+    <w:p>
+      <w:pPr>
+        <w:spacing w:line="480" w:lineRule="auto"/>
+        <w:ind w:firstLine="720"/>
+        <w:rPr>
+          <w:rFonts w:ascii="Garamond" w:hAnsi="Garamond"/>
+          <w:sz w:val="22"/>
+          <w:szCs w:val="22"/>
+        </w:rPr>
+      </w:pPr>
+      <w:r>
+        <w:rPr>
+          <w:rFonts w:ascii="Garamond" w:hAnsi="Garamond"/>
+          <w:sz w:val="22"/>
+          <w:szCs w:val="22"/>
+        </w:rPr>
+        <w:t xml:space="preserve">Here, we apply machine learning classification algorithms to </w:t>
+      </w:r>
+      <w:r>
+        <w:rPr>
+          <w:rFonts w:ascii="Garamond" w:hAnsi="Garamond"/>
+          <w:sz w:val="22"/>
+          <w:szCs w:val="22"/>
+        </w:rPr>
+        <w:t>a large dataset</w:t>
+      </w:r>
+      <w:r>
+        <w:rPr>
+          <w:rFonts w:ascii="Garamond" w:hAnsi="Garamond"/>
+          <w:sz w:val="22"/>
+          <w:szCs w:val="22"/>
+        </w:rPr>
+        <w:t xml:space="preserve"> of </w:t>
       </w:r>
       <w:r>
         <w:rPr>
@@ -2005,7 +2128,16 @@
           <w:sz w:val="22"/>
           <w:szCs w:val="22"/>
         </w:rPr>
-        <w:t xml:space="preserve">with the Alaska Department of Fish and Game Lower Yukon Test Fishery (LYTF), </w:t>
+        <w:t xml:space="preserve">with the Alaska Department of Fish </w:t>
+      </w:r>
+      <w:r>
+        <w:rPr>
+          <w:rFonts w:ascii="Garamond" w:hAnsi="Garamond"/>
+          <w:sz w:val="22"/>
+          <w:szCs w:val="22"/>
+        </w:rPr>
+        <w:lastRenderedPageBreak/>
+        <w:t xml:space="preserve">and Game Lower Yukon Test Fishery (LYTF), </w:t>
       </w:r>
       <w:proofErr w:type="spellStart"/>
       <w:r>
@@ -2056,16 +2188,7 @@
           <w:sz w:val="22"/>
           <w:szCs w:val="22"/>
         </w:rPr>
-        <w:t xml:space="preserve">~250 otoliths from each year were selected for further analysis. Selected samples were </w:t>
-      </w:r>
-      <w:r>
-        <w:rPr>
-          <w:rFonts w:ascii="Garamond" w:hAnsi="Garamond"/>
-          <w:sz w:val="22"/>
-          <w:szCs w:val="22"/>
-        </w:rPr>
-        <w:lastRenderedPageBreak/>
-        <w:t>cut along the transverse plane</w:t>
+        <w:t>~250 otoliths from each year were selected for further analysis. Selected samples were cut along the transverse plane</w:t>
       </w:r>
       <w:r>
         <w:rPr>
@@ -2116,6 +2239,14 @@
           <w:szCs w:val="22"/>
         </w:rPr>
         <w:t>, mounted on microscope slides, and polished to enhance clarity</w:t>
+      </w:r>
+      <w:r>
+        <w:rPr>
+          <w:rFonts w:ascii="Garamond" w:hAnsi="Garamond"/>
+          <w:sz w:val="22"/>
+          <w:szCs w:val="22"/>
+        </w:rPr>
+        <w:t xml:space="preserve"> </w:t>
       </w:r>
       <w:r>
         <w:rPr>
@@ -2457,581 +2588,6 @@
           <w:szCs w:val="22"/>
         </w:rPr>
       </w:pPr>
-      <w:r>
-        <w:rPr>
-          <w:rFonts w:ascii="Garamond" w:hAnsi="Garamond"/>
-          <w:sz w:val="22"/>
-          <w:szCs w:val="22"/>
-        </w:rPr>
-        <w:t xml:space="preserve">To standardize all data to the same life history period, </w:t>
-      </w:r>
-      <w:r>
-        <w:rPr>
-          <w:rFonts w:ascii="Garamond" w:hAnsi="Garamond"/>
-          <w:sz w:val="22"/>
-          <w:szCs w:val="22"/>
-        </w:rPr>
-        <w:t xml:space="preserve">full </w:t>
-      </w:r>
-      <w:r>
-        <w:rPr>
-          <w:rFonts w:ascii="Garamond" w:hAnsi="Garamond"/>
-          <w:sz w:val="22"/>
-          <w:szCs w:val="22"/>
-        </w:rPr>
-        <w:t>laser ablation datasets</w:t>
-      </w:r>
-      <w:r>
-        <w:rPr>
-          <w:rFonts w:ascii="Garamond" w:hAnsi="Garamond"/>
-          <w:sz w:val="22"/>
-          <w:szCs w:val="22"/>
-        </w:rPr>
-        <w:t xml:space="preserve"> were trimmed to include only data between the </w:t>
-      </w:r>
-      <w:r>
-        <w:rPr>
-          <w:rFonts w:ascii="Garamond" w:hAnsi="Garamond"/>
-          <w:sz w:val="22"/>
-          <w:szCs w:val="22"/>
-        </w:rPr>
-        <w:t>core and the onset of marine residence. These cutoff points were identified by</w:t>
-      </w:r>
-      <w:r>
-        <w:rPr>
-          <w:rFonts w:ascii="Garamond" w:hAnsi="Garamond"/>
-          <w:sz w:val="22"/>
-          <w:szCs w:val="22"/>
-        </w:rPr>
-        <w:t xml:space="preserve"> examining patterns in </w:t>
-      </w:r>
-      <w:r>
-        <w:rPr>
-          <w:rFonts w:ascii="Cambria Math" w:hAnsi="Cambria Math" w:cs="Cambria Math"/>
-          <w:sz w:val="22"/>
-          <w:szCs w:val="22"/>
-        </w:rPr>
-        <w:t>⁸⁷</w:t>
-      </w:r>
-      <w:r>
-        <w:rPr>
-          <w:rFonts w:ascii="Garamond" w:hAnsi="Garamond"/>
-          <w:sz w:val="22"/>
-          <w:szCs w:val="22"/>
-        </w:rPr>
-        <w:t>Sr/</w:t>
-      </w:r>
-      <w:r>
-        <w:rPr>
-          <w:rFonts w:ascii="Cambria Math" w:hAnsi="Cambria Math" w:cs="Cambria Math"/>
-          <w:sz w:val="22"/>
-          <w:szCs w:val="22"/>
-        </w:rPr>
-        <w:t>⁸⁶</w:t>
-      </w:r>
-      <w:r>
-        <w:rPr>
-          <w:rFonts w:ascii="Garamond" w:hAnsi="Garamond"/>
-          <w:sz w:val="22"/>
-          <w:szCs w:val="22"/>
-        </w:rPr>
-        <w:t xml:space="preserve">Sr, </w:t>
-      </w:r>
-      <w:r>
-        <w:rPr>
-          <w:rFonts w:ascii="Cambria Math" w:hAnsi="Cambria Math" w:cs="Cambria Math"/>
-          <w:sz w:val="22"/>
-          <w:szCs w:val="22"/>
-        </w:rPr>
-        <w:t>⁸⁸</w:t>
-      </w:r>
-      <w:r>
-        <w:rPr>
-          <w:rFonts w:ascii="Garamond" w:hAnsi="Garamond"/>
-          <w:sz w:val="22"/>
-          <w:szCs w:val="22"/>
-        </w:rPr>
-        <w:t>Sr, and morphological features along the laser ablation line</w:t>
-      </w:r>
-      <w:r>
-        <w:rPr>
-          <w:rFonts w:ascii="Garamond" w:hAnsi="Garamond"/>
-          <w:sz w:val="22"/>
-          <w:szCs w:val="22"/>
-        </w:rPr>
-        <w:t xml:space="preserve"> </w:t>
-      </w:r>
-      <w:r>
-        <w:rPr>
-          <w:rFonts w:ascii="Garamond" w:hAnsi="Garamond"/>
-          <w:sz w:val="22"/>
-          <w:szCs w:val="22"/>
-        </w:rPr>
-        <w:fldChar w:fldCharType="begin"/>
-      </w:r>
-      <w:r>
-        <w:rPr>
-          <w:rFonts w:ascii="Garamond" w:hAnsi="Garamond"/>
-          <w:sz w:val="22"/>
-          <w:szCs w:val="22"/>
-        </w:rPr>
-        <w:instrText xml:space="preserve"> ADDIN ZOTERO_ITEM CSL_CITATION {"citationID":"DX3Ucg21","properties":{"formattedCitation":"(Brennan &amp; Schindler, 2017)","plainCitation":"(Brennan &amp; Schindler, 2017)","noteIndex":0},"citationItems":[{"id":1694,"uris":["http://zotero.org/users/8421274/items/NSWL6YPN"],"itemData":{"id":1694,"type":"article-journal","abstract":"Production patterns of highly mobile species, such as anadromous fish, often exhibit high spatial and temporal heterogeneity across landscapes. Such variability is often asynchronous in time among habitats, which stabilizes production at aggregate scales of complexity. Reconstructing production patterns explicitly in space and time across multiple scales, however, remains difficult but is important for prioritizing habitat conservation. This is especially true for fishes inhabiting river basins due to long-range dispersal, high mortality at early life stages, complex population structure and elusive life history variation. We develop a new approach for mapping production patterns of Pacific salmon across a large river basin by integrating otolith microchemistry and dendritic isoscape models. The geographically continuous Bayesian assignment framework presented here yielded high accuracies (&gt;90%) and relatively high precisions (precisions &lt;4%; i.e., assignment areas of &lt;530 river km of the 13 100 km total river length) when used to determine the natal source of known-origin juvenile Chinook salmon captured throughout the study region. Integrating these methods enabled us to base estimates of provenance and habitat use of individuals on a per location basis using strontium isotopic data throughout the continuous spatial domain of a river network. Such a framework provides substantial advantages over the more common nominal approach to employing otolith microchemistry to reconstruct movement patterns of fish. In doing so, we reconstructed the spatial production patterns of adult Chinook salmon returning to a large watershed in Bristol Bay, Alaska and illustrate the power of such an approach to conservation efforts.","container-title":"Ecological Applications","DOI":"10.1002/eap.1474","ISSN":"1939-5582","issue":"2","language":"en","note":"_eprint: https://esajournals.onlinelibrary.wiley.com/doi/pdf/10.1002/eap.1474","page":"363-377","source":"Wiley Online Library","title":"Linking otolith microchemistry and dendritic isoscapes to map heterogeneous production of fish across river basins","volume":"27","author":[{"family":"Brennan","given":"Sean R."},{"family":"Schindler","given":"Daniel E."}],"issued":{"date-parts":[["2017"]]}}}],"schema":"https://github.com/citation-style-language/schema/raw/master/csl-citation.json"} </w:instrText>
-      </w:r>
-      <w:r>
-        <w:rPr>
-          <w:rFonts w:ascii="Garamond" w:hAnsi="Garamond"/>
-          <w:sz w:val="22"/>
-          <w:szCs w:val="22"/>
-        </w:rPr>
-        <w:fldChar w:fldCharType="separate"/>
-      </w:r>
-      <w:r>
-        <w:rPr>
-          <w:rFonts w:ascii="Garamond" w:hAnsi="Garamond"/>
-          <w:noProof/>
-          <w:sz w:val="22"/>
-          <w:szCs w:val="22"/>
-        </w:rPr>
-        <w:t>(Brennan &amp; Schindler, 2017)</w:t>
-      </w:r>
-      <w:r>
-        <w:rPr>
-          <w:rFonts w:ascii="Garamond" w:hAnsi="Garamond"/>
-          <w:sz w:val="22"/>
-          <w:szCs w:val="22"/>
-        </w:rPr>
-        <w:fldChar w:fldCharType="end"/>
-      </w:r>
-      <w:r>
-        <w:rPr>
-          <w:rFonts w:ascii="Garamond" w:hAnsi="Garamond"/>
-          <w:sz w:val="22"/>
-          <w:szCs w:val="22"/>
-        </w:rPr>
-        <w:t xml:space="preserve">. The location closest to the core was identified by a general increase in </w:t>
-      </w:r>
-      <w:r>
-        <w:rPr>
-          <w:rFonts w:ascii="Cambria Math" w:hAnsi="Cambria Math" w:cs="Cambria Math"/>
-          <w:sz w:val="22"/>
-          <w:szCs w:val="22"/>
-        </w:rPr>
-        <w:t>⁸⁸</w:t>
-      </w:r>
-      <w:r>
-        <w:rPr>
-          <w:rFonts w:ascii="Garamond" w:hAnsi="Garamond"/>
-          <w:sz w:val="22"/>
-          <w:szCs w:val="22"/>
-        </w:rPr>
-        <w:t xml:space="preserve">Sr and </w:t>
-      </w:r>
-      <w:r>
-        <w:rPr>
-          <w:rFonts w:ascii="Garamond" w:hAnsi="Garamond"/>
-          <w:sz w:val="22"/>
-          <w:szCs w:val="22"/>
-        </w:rPr>
-        <w:t xml:space="preserve">a convergency of </w:t>
-      </w:r>
-      <w:r>
-        <w:rPr>
-          <w:rFonts w:ascii="Cambria Math" w:hAnsi="Cambria Math" w:cs="Cambria Math"/>
-          <w:sz w:val="22"/>
-          <w:szCs w:val="22"/>
-        </w:rPr>
-        <w:t>⁸⁷</w:t>
-      </w:r>
-      <w:r>
-        <w:rPr>
-          <w:rFonts w:ascii="Garamond" w:hAnsi="Garamond"/>
-          <w:sz w:val="22"/>
-          <w:szCs w:val="22"/>
-        </w:rPr>
-        <w:t>Sr/</w:t>
-      </w:r>
-      <w:r>
-        <w:rPr>
-          <w:rFonts w:ascii="Cambria Math" w:hAnsi="Cambria Math" w:cs="Cambria Math"/>
-          <w:sz w:val="22"/>
-          <w:szCs w:val="22"/>
-        </w:rPr>
-        <w:t>⁸⁶</w:t>
-      </w:r>
-      <w:r>
-        <w:rPr>
-          <w:rFonts w:ascii="Garamond" w:hAnsi="Garamond"/>
-          <w:sz w:val="22"/>
-          <w:szCs w:val="22"/>
-        </w:rPr>
-        <w:t>Sr</w:t>
-      </w:r>
-      <w:r>
-        <w:rPr>
-          <w:rFonts w:ascii="Garamond" w:hAnsi="Garamond"/>
-          <w:sz w:val="22"/>
-          <w:szCs w:val="22"/>
-        </w:rPr>
-        <w:t xml:space="preserve"> </w:t>
-      </w:r>
-      <w:r>
-        <w:rPr>
-          <w:rFonts w:ascii="Garamond" w:hAnsi="Garamond"/>
-          <w:sz w:val="22"/>
-          <w:szCs w:val="22"/>
-        </w:rPr>
-        <w:t xml:space="preserve">values </w:t>
-      </w:r>
-      <w:r>
-        <w:rPr>
-          <w:rFonts w:ascii="Garamond" w:hAnsi="Garamond"/>
-          <w:sz w:val="22"/>
-          <w:szCs w:val="22"/>
-        </w:rPr>
-        <w:t xml:space="preserve">towards the </w:t>
-      </w:r>
-      <w:r>
-        <w:rPr>
-          <w:rFonts w:ascii="Garamond" w:hAnsi="Garamond"/>
-          <w:sz w:val="22"/>
-          <w:szCs w:val="22"/>
-        </w:rPr>
-        <w:t xml:space="preserve">global marine value </w:t>
-      </w:r>
-      <w:r>
-        <w:rPr>
-          <w:rFonts w:ascii="Garamond" w:hAnsi="Garamond"/>
-          <w:sz w:val="22"/>
-          <w:szCs w:val="22"/>
-        </w:rPr>
-        <w:t>(0.7092)</w:t>
-      </w:r>
-      <w:r>
-        <w:rPr>
-          <w:rFonts w:ascii="Garamond" w:hAnsi="Garamond"/>
-          <w:sz w:val="22"/>
-          <w:szCs w:val="22"/>
-        </w:rPr>
-        <w:t xml:space="preserve">. </w:t>
-      </w:r>
-      <w:r>
-        <w:rPr>
-          <w:rFonts w:ascii="Garamond" w:hAnsi="Garamond"/>
-          <w:sz w:val="22"/>
-          <w:szCs w:val="22"/>
-        </w:rPr>
-        <w:t>Similarly,</w:t>
-      </w:r>
-      <w:r>
-        <w:rPr>
-          <w:rFonts w:ascii="Garamond" w:hAnsi="Garamond"/>
-          <w:sz w:val="22"/>
-          <w:szCs w:val="22"/>
-        </w:rPr>
-        <w:t xml:space="preserve"> a cutoff at the </w:t>
-      </w:r>
-      <w:r>
-        <w:rPr>
-          <w:rFonts w:ascii="Garamond" w:hAnsi="Garamond"/>
-          <w:sz w:val="22"/>
-          <w:szCs w:val="22"/>
-        </w:rPr>
-        <w:t xml:space="preserve">marine entry was identified </w:t>
-      </w:r>
-      <w:r>
-        <w:rPr>
-          <w:rFonts w:ascii="Garamond" w:hAnsi="Garamond"/>
-          <w:sz w:val="22"/>
-          <w:szCs w:val="22"/>
-        </w:rPr>
-        <w:t xml:space="preserve">by </w:t>
-      </w:r>
-      <w:r>
-        <w:rPr>
-          <w:rFonts w:ascii="Garamond" w:hAnsi="Garamond"/>
-          <w:sz w:val="22"/>
-          <w:szCs w:val="22"/>
-        </w:rPr>
-        <w:t xml:space="preserve">the marine check </w:t>
-      </w:r>
-      <w:r>
-        <w:rPr>
-          <w:rFonts w:ascii="Garamond" w:hAnsi="Garamond"/>
-          <w:sz w:val="22"/>
-          <w:szCs w:val="22"/>
-        </w:rPr>
-        <w:t>on the otolith</w:t>
-      </w:r>
-      <w:r>
-        <w:rPr>
-          <w:rFonts w:ascii="Garamond" w:hAnsi="Garamond"/>
-          <w:sz w:val="22"/>
-          <w:szCs w:val="22"/>
-        </w:rPr>
-        <w:t xml:space="preserve"> (dark annuli region)</w:t>
-      </w:r>
-      <w:r>
-        <w:rPr>
-          <w:rFonts w:ascii="Garamond" w:hAnsi="Garamond"/>
-          <w:sz w:val="22"/>
-          <w:szCs w:val="22"/>
-        </w:rPr>
-        <w:t xml:space="preserve">, a rapid increase in Sr88, and a </w:t>
-      </w:r>
-      <w:r>
-        <w:rPr>
-          <w:rFonts w:ascii="Garamond" w:hAnsi="Garamond"/>
-          <w:sz w:val="22"/>
-          <w:szCs w:val="22"/>
-        </w:rPr>
-        <w:t xml:space="preserve">shift in </w:t>
-      </w:r>
-      <w:r>
-        <w:rPr>
-          <w:rFonts w:ascii="Cambria Math" w:hAnsi="Cambria Math" w:cs="Cambria Math"/>
-          <w:sz w:val="22"/>
-          <w:szCs w:val="22"/>
-        </w:rPr>
-        <w:t>⁸⁷</w:t>
-      </w:r>
-      <w:r>
-        <w:rPr>
-          <w:rFonts w:ascii="Garamond" w:hAnsi="Garamond"/>
-          <w:sz w:val="22"/>
-          <w:szCs w:val="22"/>
-        </w:rPr>
-        <w:t>Sr/</w:t>
-      </w:r>
-      <w:r>
-        <w:rPr>
-          <w:rFonts w:ascii="Cambria Math" w:hAnsi="Cambria Math" w:cs="Cambria Math"/>
-          <w:sz w:val="22"/>
-          <w:szCs w:val="22"/>
-        </w:rPr>
-        <w:t>⁸⁶</w:t>
-      </w:r>
-      <w:r>
-        <w:rPr>
-          <w:rFonts w:ascii="Garamond" w:hAnsi="Garamond"/>
-          <w:sz w:val="22"/>
-          <w:szCs w:val="22"/>
-        </w:rPr>
-        <w:t>Sr to</w:t>
-      </w:r>
-      <w:r>
-        <w:rPr>
-          <w:rFonts w:ascii="Garamond" w:hAnsi="Garamond"/>
-          <w:sz w:val="22"/>
-          <w:szCs w:val="22"/>
-        </w:rPr>
-        <w:t>war</w:t>
-      </w:r>
-      <w:r>
-        <w:rPr>
-          <w:rFonts w:ascii="Garamond" w:hAnsi="Garamond"/>
-          <w:sz w:val="22"/>
-          <w:szCs w:val="22"/>
-        </w:rPr>
-        <w:t>d</w:t>
-      </w:r>
-      <w:r>
-        <w:rPr>
-          <w:rFonts w:ascii="Garamond" w:hAnsi="Garamond"/>
-          <w:sz w:val="22"/>
-          <w:szCs w:val="22"/>
-        </w:rPr>
-        <w:t>s</w:t>
-      </w:r>
-      <w:r>
-        <w:rPr>
-          <w:rFonts w:ascii="Garamond" w:hAnsi="Garamond"/>
-          <w:sz w:val="22"/>
-          <w:szCs w:val="22"/>
-        </w:rPr>
-        <w:t xml:space="preserve"> the</w:t>
-      </w:r>
-      <w:r>
-        <w:rPr>
-          <w:rFonts w:ascii="Garamond" w:hAnsi="Garamond"/>
-          <w:sz w:val="22"/>
-          <w:szCs w:val="22"/>
-        </w:rPr>
-        <w:t xml:space="preserve"> global marine value</w:t>
-      </w:r>
-      <w:r>
-        <w:rPr>
-          <w:rFonts w:ascii="Garamond" w:hAnsi="Garamond"/>
-          <w:sz w:val="22"/>
-          <w:szCs w:val="22"/>
-        </w:rPr>
-        <w:t xml:space="preserve"> at the end of the time</w:t>
-      </w:r>
-      <w:r>
-        <w:rPr>
-          <w:rFonts w:ascii="Garamond" w:hAnsi="Garamond"/>
-          <w:sz w:val="22"/>
-          <w:szCs w:val="22"/>
-        </w:rPr>
-        <w:t>s</w:t>
-      </w:r>
-      <w:r>
-        <w:rPr>
-          <w:rFonts w:ascii="Garamond" w:hAnsi="Garamond"/>
-          <w:sz w:val="22"/>
-          <w:szCs w:val="22"/>
-        </w:rPr>
-        <w:t>eries</w:t>
-      </w:r>
-      <w:r>
-        <w:rPr>
-          <w:rFonts w:ascii="Garamond" w:hAnsi="Garamond"/>
-          <w:sz w:val="22"/>
-          <w:szCs w:val="22"/>
-        </w:rPr>
-        <w:t xml:space="preserve">. </w:t>
-      </w:r>
-      <w:r>
-        <w:rPr>
-          <w:rFonts w:ascii="Garamond" w:hAnsi="Garamond"/>
-          <w:sz w:val="22"/>
-          <w:szCs w:val="22"/>
-        </w:rPr>
-        <w:t>Manual s</w:t>
-      </w:r>
-      <w:r>
-        <w:rPr>
-          <w:rFonts w:ascii="Garamond" w:hAnsi="Garamond"/>
-          <w:sz w:val="22"/>
-          <w:szCs w:val="22"/>
-        </w:rPr>
-        <w:t xml:space="preserve">election of trimming locations </w:t>
-      </w:r>
-      <w:proofErr w:type="gramStart"/>
-      <w:r>
-        <w:rPr>
-          <w:rFonts w:ascii="Garamond" w:hAnsi="Garamond"/>
-          <w:sz w:val="22"/>
-          <w:szCs w:val="22"/>
-        </w:rPr>
-        <w:t>were</w:t>
-      </w:r>
-      <w:proofErr w:type="gramEnd"/>
-      <w:r>
-        <w:rPr>
-          <w:rFonts w:ascii="Garamond" w:hAnsi="Garamond"/>
-          <w:sz w:val="22"/>
-          <w:szCs w:val="22"/>
-        </w:rPr>
-        <w:t xml:space="preserve"> randomized and blinded to avoid </w:t>
-      </w:r>
-      <w:r>
-        <w:rPr>
-          <w:rFonts w:ascii="Garamond" w:hAnsi="Garamond"/>
-          <w:sz w:val="22"/>
-          <w:szCs w:val="22"/>
-        </w:rPr>
-        <w:t xml:space="preserve">bias. </w:t>
-      </w:r>
-      <w:r>
-        <w:rPr>
-          <w:rFonts w:ascii="Garamond" w:hAnsi="Garamond"/>
-          <w:sz w:val="22"/>
-          <w:szCs w:val="22"/>
-        </w:rPr>
-        <w:t xml:space="preserve">All trimmed datasets were then manually </w:t>
-      </w:r>
-      <w:proofErr w:type="spellStart"/>
-      <w:r>
-        <w:rPr>
-          <w:rFonts w:ascii="Garamond" w:hAnsi="Garamond"/>
-          <w:sz w:val="22"/>
-          <w:szCs w:val="22"/>
-        </w:rPr>
-        <w:t>QC’d</w:t>
-      </w:r>
-      <w:proofErr w:type="spellEnd"/>
-      <w:r>
-        <w:rPr>
-          <w:rFonts w:ascii="Garamond" w:hAnsi="Garamond"/>
-          <w:sz w:val="22"/>
-          <w:szCs w:val="22"/>
-        </w:rPr>
-        <w:t>, and s</w:t>
-      </w:r>
-      <w:r>
-        <w:rPr>
-          <w:rFonts w:ascii="Garamond" w:hAnsi="Garamond"/>
-          <w:sz w:val="22"/>
-          <w:szCs w:val="22"/>
-        </w:rPr>
-        <w:t xml:space="preserve">amples with significant error (i.e large cracks) </w:t>
-      </w:r>
-      <w:r>
-        <w:rPr>
-          <w:rFonts w:ascii="Garamond" w:hAnsi="Garamond"/>
-          <w:sz w:val="22"/>
-          <w:szCs w:val="22"/>
-        </w:rPr>
-        <w:t>or</w:t>
-      </w:r>
-      <w:r>
-        <w:rPr>
-          <w:rFonts w:ascii="Garamond" w:hAnsi="Garamond"/>
-          <w:sz w:val="22"/>
-          <w:szCs w:val="22"/>
-        </w:rPr>
-        <w:t xml:space="preserve"> without a clear core </w:t>
-      </w:r>
-      <w:r>
-        <w:rPr>
-          <w:rFonts w:ascii="Garamond" w:hAnsi="Garamond"/>
-          <w:sz w:val="22"/>
-          <w:szCs w:val="22"/>
-        </w:rPr>
-        <w:t xml:space="preserve">and marine </w:t>
-      </w:r>
-      <w:r>
-        <w:rPr>
-          <w:rFonts w:ascii="Garamond" w:hAnsi="Garamond"/>
-          <w:sz w:val="22"/>
-          <w:szCs w:val="22"/>
-        </w:rPr>
-        <w:t xml:space="preserve">signal were removed from the dataset. </w:t>
-      </w:r>
-      <w:r>
-        <w:rPr>
-          <w:rFonts w:ascii="Garamond" w:hAnsi="Garamond"/>
-          <w:sz w:val="22"/>
-          <w:szCs w:val="22"/>
-        </w:rPr>
-        <w:t xml:space="preserve">The resulting dataset contained </w:t>
-      </w:r>
-      <w:r>
-        <w:rPr>
-          <w:rFonts w:ascii="Garamond" w:hAnsi="Garamond"/>
-          <w:sz w:val="22"/>
-          <w:szCs w:val="22"/>
-        </w:rPr>
-        <w:t xml:space="preserve">2,531 timeseries (971 Yukon, 875 Kuskokwim, and 685 </w:t>
-      </w:r>
-      <w:proofErr w:type="spellStart"/>
-      <w:r>
-        <w:rPr>
-          <w:rFonts w:ascii="Garamond" w:hAnsi="Garamond"/>
-          <w:sz w:val="22"/>
-          <w:szCs w:val="22"/>
-        </w:rPr>
-        <w:t>Nushagak</w:t>
-      </w:r>
-      <w:proofErr w:type="spellEnd"/>
-      <w:r>
-        <w:rPr>
-          <w:rFonts w:ascii="Garamond" w:hAnsi="Garamond"/>
-          <w:sz w:val="22"/>
-          <w:szCs w:val="22"/>
-        </w:rPr>
-        <w:t xml:space="preserve">). </w:t>
-      </w:r>
     </w:p>
     <w:p>
       <w:pPr>
@@ -3049,7 +2605,103 @@
           <w:sz w:val="22"/>
           <w:szCs w:val="22"/>
         </w:rPr>
-        <w:t>To test whether</w:t>
+        <w:t xml:space="preserve">To standardize all data to the same life history period, </w:t>
+      </w:r>
+      <w:r>
+        <w:rPr>
+          <w:rFonts w:ascii="Garamond" w:hAnsi="Garamond"/>
+          <w:sz w:val="22"/>
+          <w:szCs w:val="22"/>
+        </w:rPr>
+        <w:t xml:space="preserve">full </w:t>
+      </w:r>
+      <w:r>
+        <w:rPr>
+          <w:rFonts w:ascii="Garamond" w:hAnsi="Garamond"/>
+          <w:sz w:val="22"/>
+          <w:szCs w:val="22"/>
+        </w:rPr>
+        <w:t>laser ablation datasets</w:t>
+      </w:r>
+      <w:r>
+        <w:rPr>
+          <w:rFonts w:ascii="Garamond" w:hAnsi="Garamond"/>
+          <w:sz w:val="22"/>
+          <w:szCs w:val="22"/>
+        </w:rPr>
+        <w:t xml:space="preserve"> were trimmed to include only data between the </w:t>
+      </w:r>
+      <w:r>
+        <w:rPr>
+          <w:rFonts w:ascii="Garamond" w:hAnsi="Garamond"/>
+          <w:sz w:val="22"/>
+          <w:szCs w:val="22"/>
+        </w:rPr>
+        <w:t>onset of the natal origin region</w:t>
+      </w:r>
+      <w:r>
+        <w:rPr>
+          <w:rFonts w:ascii="Garamond" w:hAnsi="Garamond"/>
+          <w:sz w:val="22"/>
+          <w:szCs w:val="22"/>
+        </w:rPr>
+        <w:t xml:space="preserve"> and the marine residence. These cutoff points were identified by</w:t>
+      </w:r>
+      <w:r>
+        <w:rPr>
+          <w:rFonts w:ascii="Garamond" w:hAnsi="Garamond"/>
+          <w:sz w:val="22"/>
+          <w:szCs w:val="22"/>
+        </w:rPr>
+        <w:t xml:space="preserve"> examining patterns in </w:t>
+      </w:r>
+      <w:r>
+        <w:rPr>
+          <w:rFonts w:ascii="Cambria Math" w:hAnsi="Cambria Math" w:cs="Cambria Math"/>
+          <w:sz w:val="22"/>
+          <w:szCs w:val="22"/>
+        </w:rPr>
+        <w:t>⁸⁷</w:t>
+      </w:r>
+      <w:r>
+        <w:rPr>
+          <w:rFonts w:ascii="Garamond" w:hAnsi="Garamond"/>
+          <w:sz w:val="22"/>
+          <w:szCs w:val="22"/>
+        </w:rPr>
+        <w:t>Sr/</w:t>
+      </w:r>
+      <w:r>
+        <w:rPr>
+          <w:rFonts w:ascii="Cambria Math" w:hAnsi="Cambria Math" w:cs="Cambria Math"/>
+          <w:sz w:val="22"/>
+          <w:szCs w:val="22"/>
+        </w:rPr>
+        <w:t>⁸⁶</w:t>
+      </w:r>
+      <w:r>
+        <w:rPr>
+          <w:rFonts w:ascii="Garamond" w:hAnsi="Garamond"/>
+          <w:sz w:val="22"/>
+          <w:szCs w:val="22"/>
+        </w:rPr>
+        <w:t xml:space="preserve">Sr, </w:t>
+      </w:r>
+      <w:r>
+        <w:rPr>
+          <w:rFonts w:ascii="Cambria Math" w:hAnsi="Cambria Math" w:cs="Cambria Math"/>
+          <w:sz w:val="22"/>
+          <w:szCs w:val="22"/>
+        </w:rPr>
+        <w:t>⁸⁸</w:t>
+      </w:r>
+      <w:r>
+        <w:rPr>
+          <w:rFonts w:ascii="Garamond" w:hAnsi="Garamond"/>
+          <w:sz w:val="22"/>
+          <w:szCs w:val="22"/>
+        </w:rPr>
+        <w:t>Sr, and morphological features along the laser ablation line</w:t>
       </w:r>
       <w:r>
         <w:rPr>
@@ -3065,63 +2717,40 @@
           <w:sz w:val="22"/>
           <w:szCs w:val="22"/>
         </w:rPr>
-        <w:t xml:space="preserve">time series smoothing techniques </w:t>
-      </w:r>
-      <w:r>
-        <w:rPr>
-          <w:rFonts w:ascii="Garamond" w:hAnsi="Garamond"/>
-          <w:sz w:val="22"/>
-          <w:szCs w:val="22"/>
-        </w:rPr>
-        <w:t>could improve model performance</w:t>
-      </w:r>
-      <w:r>
-        <w:rPr>
-          <w:rFonts w:ascii="Garamond" w:hAnsi="Garamond"/>
-          <w:sz w:val="22"/>
-          <w:szCs w:val="22"/>
-        </w:rPr>
-        <w:t xml:space="preserve">, we applied </w:t>
-      </w:r>
-      <w:r>
-        <w:rPr>
-          <w:rFonts w:ascii="Garamond" w:hAnsi="Garamond"/>
-          <w:sz w:val="22"/>
-          <w:szCs w:val="22"/>
-        </w:rPr>
-        <w:t xml:space="preserve">two commonly used approaches: moving average (MA) and a generalized additive model (GAM). </w:t>
-      </w:r>
-      <w:r>
-        <w:rPr>
-          <w:rFonts w:ascii="Garamond" w:hAnsi="Garamond"/>
-          <w:sz w:val="22"/>
-          <w:szCs w:val="22"/>
-        </w:rPr>
-        <w:t>For the moving average smoothing w</w:t>
-      </w:r>
-      <w:r>
-        <w:rPr>
-          <w:rFonts w:ascii="Garamond" w:hAnsi="Garamond"/>
-          <w:sz w:val="22"/>
-          <w:szCs w:val="22"/>
-        </w:rPr>
-        <w:t>e used a 60</w:t>
-      </w:r>
-      <w:r>
-        <w:rPr>
-          <w:rFonts w:ascii="Garamond" w:hAnsi="Garamond"/>
-          <w:sz w:val="22"/>
-          <w:szCs w:val="22"/>
-        </w:rPr>
-        <w:t>-</w:t>
-      </w:r>
-      <w:r>
-        <w:rPr>
-          <w:rFonts w:ascii="Garamond" w:hAnsi="Garamond"/>
-          <w:sz w:val="22"/>
-          <w:szCs w:val="22"/>
-        </w:rPr>
-        <w:t>point center weighted window</w:t>
+        <w:fldChar w:fldCharType="begin"/>
+      </w:r>
+      <w:r>
+        <w:rPr>
+          <w:rFonts w:ascii="Garamond" w:hAnsi="Garamond"/>
+          <w:sz w:val="22"/>
+          <w:szCs w:val="22"/>
+        </w:rPr>
+        <w:instrText xml:space="preserve"> ADDIN ZOTERO_ITEM CSL_CITATION {"citationID":"DX3Ucg21","properties":{"formattedCitation":"(Brennan &amp; Schindler, 2017)","plainCitation":"(Brennan &amp; Schindler, 2017)","noteIndex":0},"citationItems":[{"id":1694,"uris":["http://zotero.org/users/8421274/items/NSWL6YPN"],"itemData":{"id":1694,"type":"article-journal","abstract":"Production patterns of highly mobile species, such as anadromous fish, often exhibit high spatial and temporal heterogeneity across landscapes. Such variability is often asynchronous in time among habitats, which stabilizes production at aggregate scales of complexity. Reconstructing production patterns explicitly in space and time across multiple scales, however, remains difficult but is important for prioritizing habitat conservation. This is especially true for fishes inhabiting river basins due to long-range dispersal, high mortality at early life stages, complex population structure and elusive life history variation. We develop a new approach for mapping production patterns of Pacific salmon across a large river basin by integrating otolith microchemistry and dendritic isoscape models. The geographically continuous Bayesian assignment framework presented here yielded high accuracies (&gt;90%) and relatively high precisions (precisions &lt;4%; i.e., assignment areas of &lt;530 river km of the 13 100 km total river length) when used to determine the natal source of known-origin juvenile Chinook salmon captured throughout the study region. Integrating these methods enabled us to base estimates of provenance and habitat use of individuals on a per location basis using strontium isotopic data throughout the continuous spatial domain of a river network. Such a framework provides substantial advantages over the more common nominal approach to employing otolith microchemistry to reconstruct movement patterns of fish. In doing so, we reconstructed the spatial production patterns of adult Chinook salmon returning to a large watershed in Bristol Bay, Alaska and illustrate the power of such an approach to conservation efforts.","container-title":"Ecological Applications","DOI":"10.1002/eap.1474","ISSN":"1939-5582","issue":"2","language":"en","note":"_eprint: https://esajournals.onlinelibrary.wiley.com/doi/pdf/10.1002/eap.1474","page":"363-377","source":"Wiley Online Library","title":"Linking otolith microchemistry and dendritic isoscapes to map heterogeneous production of fish across river basins","volume":"27","author":[{"family":"Brennan","given":"Sean R."},{"family":"Schindler","given":"Daniel E."}],"issued":{"date-parts":[["2017"]]}}}],"schema":"https://github.com/citation-style-language/schema/raw/master/csl-citation.json"} </w:instrText>
+      </w:r>
+      <w:r>
+        <w:rPr>
+          <w:rFonts w:ascii="Garamond" w:hAnsi="Garamond"/>
+          <w:sz w:val="22"/>
+          <w:szCs w:val="22"/>
+        </w:rPr>
+        <w:fldChar w:fldCharType="separate"/>
+      </w:r>
+      <w:r>
+        <w:rPr>
+          <w:rFonts w:ascii="Garamond" w:hAnsi="Garamond"/>
+          <w:noProof/>
+          <w:sz w:val="22"/>
+          <w:szCs w:val="22"/>
+        </w:rPr>
+        <w:t>(Brennan &amp; Schindler, 2017)</w:t>
+      </w:r>
+      <w:r>
+        <w:rPr>
+          <w:rFonts w:ascii="Garamond" w:hAnsi="Garamond"/>
+          <w:sz w:val="22"/>
+          <w:szCs w:val="22"/>
+        </w:rPr>
+        <w:fldChar w:fldCharType="end"/>
       </w:r>
       <w:r>
         <w:rPr>
@@ -3137,58 +2766,247 @@
           <w:sz w:val="22"/>
           <w:szCs w:val="22"/>
         </w:rPr>
-        <w:t xml:space="preserve">The GAM was fitted using thin plate regression and penalized iteratively re-weighted least squares (P-IRLS) to maximize goodness of fit, with a </w:t>
-      </w:r>
-      <w:r>
-        <w:rPr>
-          <w:rFonts w:ascii="Garamond" w:hAnsi="Garamond"/>
-          <w:sz w:val="22"/>
-          <w:szCs w:val="22"/>
-        </w:rPr>
-        <w:lastRenderedPageBreak/>
-        <w:t xml:space="preserve">generalized cross-validation (GCV) method employed to minimize overfitting </w:t>
-      </w:r>
-      <w:r>
-        <w:rPr>
-          <w:rFonts w:ascii="Garamond" w:hAnsi="Garamond"/>
-          <w:sz w:val="22"/>
-          <w:szCs w:val="22"/>
-        </w:rPr>
-        <w:t xml:space="preserve">(Wood, 2006). The maximum degrees of freedom (k) were scaled by the number of data points in each ablation line (n) by k = 10N </w:t>
-      </w:r>
-      <w:r>
-        <w:rPr>
-          <w:rFonts w:ascii="Garamond" w:hAnsi="Garamond"/>
-          <w:sz w:val="22"/>
-          <w:szCs w:val="22"/>
-          <w:vertAlign w:val="superscript"/>
-        </w:rPr>
-        <w:t>2/9</w:t>
-      </w:r>
-      <w:r>
-        <w:rPr>
-          <w:rFonts w:ascii="Garamond" w:hAnsi="Garamond"/>
-          <w:sz w:val="22"/>
-          <w:szCs w:val="22"/>
-          <w:vertAlign w:val="superscript"/>
+        <w:t xml:space="preserve">Natal origin region was manually identified by the first steady state after the decline in Sr88 and movement of </w:t>
+      </w:r>
+      <w:r>
+        <w:rPr>
+          <w:rFonts w:ascii="Cambria Math" w:hAnsi="Cambria Math" w:cs="Cambria Math"/>
+          <w:sz w:val="22"/>
+          <w:szCs w:val="22"/>
+        </w:rPr>
+        <w:t>⁸⁷</w:t>
+      </w:r>
+      <w:r>
+        <w:rPr>
+          <w:rFonts w:ascii="Garamond" w:hAnsi="Garamond"/>
+          <w:sz w:val="22"/>
+          <w:szCs w:val="22"/>
+        </w:rPr>
+        <w:t>Sr/</w:t>
+      </w:r>
+      <w:r>
+        <w:rPr>
+          <w:rFonts w:ascii="Cambria Math" w:hAnsi="Cambria Math" w:cs="Cambria Math"/>
+          <w:sz w:val="22"/>
+          <w:szCs w:val="22"/>
+        </w:rPr>
+        <w:t>⁸⁶</w:t>
+      </w:r>
+      <w:r>
+        <w:rPr>
+          <w:rFonts w:ascii="Garamond" w:hAnsi="Garamond"/>
+          <w:sz w:val="22"/>
+          <w:szCs w:val="22"/>
+        </w:rPr>
+        <w:t>Sr</w:t>
+      </w:r>
+      <w:r>
+        <w:rPr>
+          <w:rFonts w:ascii="Garamond" w:hAnsi="Garamond"/>
+          <w:sz w:val="22"/>
+          <w:szCs w:val="22"/>
+        </w:rPr>
+        <w:t xml:space="preserve"> away from the global marine value (0.7092). </w:t>
+      </w:r>
+      <w:r>
+        <w:rPr>
+          <w:rFonts w:ascii="Garamond" w:hAnsi="Garamond"/>
+          <w:sz w:val="22"/>
+          <w:szCs w:val="22"/>
+        </w:rPr>
+        <w:t>Similarly,</w:t>
+      </w:r>
+      <w:r>
+        <w:rPr>
+          <w:rFonts w:ascii="Garamond" w:hAnsi="Garamond"/>
+          <w:sz w:val="22"/>
+          <w:szCs w:val="22"/>
+        </w:rPr>
+        <w:t xml:space="preserve"> a cutoff at the </w:t>
+      </w:r>
+      <w:r>
+        <w:rPr>
+          <w:rFonts w:ascii="Garamond" w:hAnsi="Garamond"/>
+          <w:sz w:val="22"/>
+          <w:szCs w:val="22"/>
+        </w:rPr>
+        <w:t xml:space="preserve">marine entry was identified </w:t>
+      </w:r>
+      <w:r>
+        <w:rPr>
+          <w:rFonts w:ascii="Garamond" w:hAnsi="Garamond"/>
+          <w:sz w:val="22"/>
+          <w:szCs w:val="22"/>
+        </w:rPr>
+        <w:t xml:space="preserve">by </w:t>
+      </w:r>
+      <w:r>
+        <w:rPr>
+          <w:rFonts w:ascii="Garamond" w:hAnsi="Garamond"/>
+          <w:sz w:val="22"/>
+          <w:szCs w:val="22"/>
+        </w:rPr>
+        <w:t xml:space="preserve">the marine check </w:t>
+      </w:r>
+      <w:r>
+        <w:rPr>
+          <w:rFonts w:ascii="Garamond" w:hAnsi="Garamond"/>
+          <w:sz w:val="22"/>
+          <w:szCs w:val="22"/>
+        </w:rPr>
+        <w:t>on the otolith</w:t>
+      </w:r>
+      <w:r>
+        <w:rPr>
+          <w:rFonts w:ascii="Garamond" w:hAnsi="Garamond"/>
+          <w:sz w:val="22"/>
+          <w:szCs w:val="22"/>
+        </w:rPr>
+        <w:t xml:space="preserve"> (dark annuli region)</w:t>
+      </w:r>
+      <w:r>
+        <w:rPr>
+          <w:rFonts w:ascii="Garamond" w:hAnsi="Garamond"/>
+          <w:sz w:val="22"/>
+          <w:szCs w:val="22"/>
+        </w:rPr>
+        <w:t>, a rapid increase in</w:t>
+      </w:r>
+      <w:r>
+        <w:rPr>
+          <w:rFonts w:ascii="Garamond" w:hAnsi="Garamond"/>
+          <w:sz w:val="22"/>
+          <w:szCs w:val="22"/>
         </w:rPr>
         <w:t xml:space="preserve"> </w:t>
       </w:r>
       <w:r>
         <w:rPr>
-          <w:rFonts w:ascii="Garamond" w:hAnsi="Garamond"/>
-          <w:sz w:val="22"/>
-          <w:szCs w:val="22"/>
-        </w:rPr>
-        <w:t xml:space="preserve">(Kim and Gu, 2004, Brennan et al., </w:t>
-      </w:r>
-      <w:r>
-        <w:rPr>
-          <w:rFonts w:ascii="Garamond" w:hAnsi="Garamond"/>
-          <w:sz w:val="22"/>
-          <w:szCs w:val="22"/>
-        </w:rPr>
-        <w:t>2014)</w:t>
+          <w:rFonts w:ascii="Cambria Math" w:hAnsi="Cambria Math" w:cs="Cambria Math"/>
+          <w:sz w:val="22"/>
+          <w:szCs w:val="22"/>
+        </w:rPr>
+        <w:t>⁸⁸</w:t>
+      </w:r>
+      <w:r>
+        <w:rPr>
+          <w:rFonts w:ascii="Garamond" w:hAnsi="Garamond"/>
+          <w:sz w:val="22"/>
+          <w:szCs w:val="22"/>
+        </w:rPr>
+        <w:t>Sr</w:t>
+      </w:r>
+      <w:r>
+        <w:rPr>
+          <w:rFonts w:ascii="Garamond" w:hAnsi="Garamond"/>
+          <w:sz w:val="22"/>
+          <w:szCs w:val="22"/>
+        </w:rPr>
+        <w:t xml:space="preserve">, and a </w:t>
+      </w:r>
+      <w:r>
+        <w:rPr>
+          <w:rFonts w:ascii="Garamond" w:hAnsi="Garamond"/>
+          <w:sz w:val="22"/>
+          <w:szCs w:val="22"/>
+        </w:rPr>
+        <w:t xml:space="preserve">shift in </w:t>
+      </w:r>
+      <w:r>
+        <w:rPr>
+          <w:rFonts w:ascii="Cambria Math" w:hAnsi="Cambria Math" w:cs="Cambria Math"/>
+          <w:sz w:val="22"/>
+          <w:szCs w:val="22"/>
+        </w:rPr>
+        <w:t>⁸⁷</w:t>
+      </w:r>
+      <w:r>
+        <w:rPr>
+          <w:rFonts w:ascii="Garamond" w:hAnsi="Garamond"/>
+          <w:sz w:val="22"/>
+          <w:szCs w:val="22"/>
+        </w:rPr>
+        <w:t>Sr/</w:t>
+      </w:r>
+      <w:r>
+        <w:rPr>
+          <w:rFonts w:ascii="Cambria Math" w:hAnsi="Cambria Math" w:cs="Cambria Math"/>
+          <w:sz w:val="22"/>
+          <w:szCs w:val="22"/>
+        </w:rPr>
+        <w:t>⁸⁶</w:t>
+      </w:r>
+      <w:r>
+        <w:rPr>
+          <w:rFonts w:ascii="Garamond" w:hAnsi="Garamond"/>
+          <w:sz w:val="22"/>
+          <w:szCs w:val="22"/>
+        </w:rPr>
+        <w:t>Sr to</w:t>
+      </w:r>
+      <w:r>
+        <w:rPr>
+          <w:rFonts w:ascii="Garamond" w:hAnsi="Garamond"/>
+          <w:sz w:val="22"/>
+          <w:szCs w:val="22"/>
+        </w:rPr>
+        <w:t>war</w:t>
+      </w:r>
+      <w:r>
+        <w:rPr>
+          <w:rFonts w:ascii="Garamond" w:hAnsi="Garamond"/>
+          <w:sz w:val="22"/>
+          <w:szCs w:val="22"/>
+        </w:rPr>
+        <w:t>d</w:t>
+      </w:r>
+      <w:r>
+        <w:rPr>
+          <w:rFonts w:ascii="Garamond" w:hAnsi="Garamond"/>
+          <w:sz w:val="22"/>
+          <w:szCs w:val="22"/>
+        </w:rPr>
+        <w:t>s</w:t>
+      </w:r>
+      <w:r>
+        <w:rPr>
+          <w:rFonts w:ascii="Garamond" w:hAnsi="Garamond"/>
+          <w:sz w:val="22"/>
+          <w:szCs w:val="22"/>
+        </w:rPr>
+        <w:t xml:space="preserve"> the</w:t>
+      </w:r>
+      <w:r>
+        <w:rPr>
+          <w:rFonts w:ascii="Garamond" w:hAnsi="Garamond"/>
+          <w:sz w:val="22"/>
+          <w:szCs w:val="22"/>
+        </w:rPr>
+        <w:t xml:space="preserve"> global marine value</w:t>
+      </w:r>
+      <w:r>
+        <w:rPr>
+          <w:rFonts w:ascii="Garamond" w:hAnsi="Garamond"/>
+          <w:sz w:val="22"/>
+          <w:szCs w:val="22"/>
+        </w:rPr>
+        <w:t xml:space="preserve"> at the end of the time</w:t>
+      </w:r>
+      <w:r>
+        <w:rPr>
+          <w:rFonts w:ascii="Garamond" w:hAnsi="Garamond"/>
+          <w:sz w:val="22"/>
+          <w:szCs w:val="22"/>
+        </w:rPr>
+        <w:t>s</w:t>
+      </w:r>
+      <w:r>
+        <w:rPr>
+          <w:rFonts w:ascii="Garamond" w:hAnsi="Garamond"/>
+          <w:sz w:val="22"/>
+          <w:szCs w:val="22"/>
+        </w:rPr>
+        <w:t>eries</w:t>
       </w:r>
       <w:r>
         <w:rPr>
@@ -3204,150 +3022,446 @@
           <w:sz w:val="22"/>
           <w:szCs w:val="22"/>
         </w:rPr>
-        <w:t>This process resulted in three versions of the</w:t>
-      </w:r>
-      <w:r>
-        <w:rPr>
-          <w:rFonts w:ascii="Garamond" w:hAnsi="Garamond"/>
-          <w:sz w:val="22"/>
-          <w:szCs w:val="22"/>
-        </w:rPr>
-        <w:t xml:space="preserve"> same laser ablation timeseries for </w:t>
-      </w:r>
-      <w:proofErr w:type="gramStart"/>
-      <w:r>
-        <w:rPr>
-          <w:rFonts w:ascii="Garamond" w:hAnsi="Garamond"/>
-          <w:sz w:val="22"/>
-          <w:szCs w:val="22"/>
-        </w:rPr>
-        <w:t>each individual</w:t>
-      </w:r>
-      <w:proofErr w:type="gramEnd"/>
-      <w:r>
-        <w:rPr>
-          <w:rFonts w:ascii="Garamond" w:hAnsi="Garamond"/>
-          <w:sz w:val="22"/>
-          <w:szCs w:val="22"/>
-        </w:rPr>
-        <w:t>: GAM-smoothed, MA-smoothed, and raw LA data.</w:t>
-      </w:r>
-      <w:r>
-        <w:rPr>
-          <w:rFonts w:ascii="Garamond" w:hAnsi="Garamond"/>
-          <w:sz w:val="22"/>
-          <w:szCs w:val="22"/>
-        </w:rPr>
-        <w:t xml:space="preserve"> </w:t>
-      </w:r>
-      <w:r>
-        <w:rPr>
-          <w:rFonts w:ascii="Garamond" w:hAnsi="Garamond"/>
-          <w:sz w:val="22"/>
-          <w:szCs w:val="22"/>
-        </w:rPr>
-        <w:t>Finally, all samples were interpolated to a common length</w:t>
-      </w:r>
-      <w:r>
-        <w:rPr>
-          <w:rFonts w:ascii="Garamond" w:hAnsi="Garamond"/>
-          <w:sz w:val="22"/>
-          <w:szCs w:val="22"/>
-        </w:rPr>
-        <w:t xml:space="preserve"> </w:t>
-      </w:r>
-      <w:r>
-        <w:rPr>
-          <w:rFonts w:ascii="Garamond" w:hAnsi="Garamond"/>
-          <w:sz w:val="22"/>
-          <w:szCs w:val="22"/>
-        </w:rPr>
-        <w:t xml:space="preserve">defined as the average length of </w:t>
-      </w:r>
-      <w:r>
-        <w:rPr>
-          <w:rFonts w:ascii="Garamond" w:hAnsi="Garamond"/>
-          <w:sz w:val="22"/>
-          <w:szCs w:val="22"/>
-        </w:rPr>
-        <w:t>all</w:t>
-      </w:r>
-      <w:r>
-        <w:rPr>
-          <w:rFonts w:ascii="Garamond" w:hAnsi="Garamond"/>
-          <w:sz w:val="22"/>
-          <w:szCs w:val="22"/>
-        </w:rPr>
-        <w:t xml:space="preserve"> t</w:t>
-      </w:r>
-      <w:r>
-        <w:rPr>
-          <w:rFonts w:ascii="Garamond" w:hAnsi="Garamond"/>
-          <w:sz w:val="22"/>
-          <w:szCs w:val="22"/>
-        </w:rPr>
-        <w:t>ime</w:t>
-      </w:r>
-      <w:r>
-        <w:rPr>
-          <w:rFonts w:ascii="Garamond" w:hAnsi="Garamond"/>
-          <w:sz w:val="22"/>
-          <w:szCs w:val="22"/>
-        </w:rPr>
-        <w:t>s</w:t>
-      </w:r>
-      <w:r>
-        <w:rPr>
-          <w:rFonts w:ascii="Garamond" w:hAnsi="Garamond"/>
-          <w:sz w:val="22"/>
-          <w:szCs w:val="22"/>
-        </w:rPr>
-        <w:t xml:space="preserve">eries </w:t>
-      </w:r>
-      <w:r>
-        <w:rPr>
-          <w:rFonts w:ascii="Garamond" w:hAnsi="Garamond"/>
-          <w:sz w:val="22"/>
-          <w:szCs w:val="22"/>
-        </w:rPr>
-        <w:t xml:space="preserve">of that type </w:t>
-      </w:r>
-      <w:r>
-        <w:rPr>
-          <w:rFonts w:ascii="Garamond" w:hAnsi="Garamond"/>
-          <w:sz w:val="22"/>
-          <w:szCs w:val="22"/>
-        </w:rPr>
-        <w:t xml:space="preserve">(700 points for non-MA and 600 points for MA-smoothed samples, respectively) </w:t>
-      </w:r>
-      <w:r>
-        <w:rPr>
-          <w:rFonts w:ascii="Garamond" w:hAnsi="Garamond"/>
-          <w:sz w:val="22"/>
-          <w:szCs w:val="22"/>
-        </w:rPr>
-        <w:t>(Hegg and Kennedy, 2021).</w:t>
-      </w:r>
-      <w:r>
-        <w:rPr>
-          <w:rFonts w:ascii="Garamond" w:hAnsi="Garamond"/>
-          <w:sz w:val="22"/>
-          <w:szCs w:val="22"/>
-        </w:rPr>
-        <w:t xml:space="preserve"> This was done to satisfy the requirement for equal length vectors for machine learning algorithms </w:t>
-      </w:r>
-      <w:r>
-        <w:rPr>
-          <w:rFonts w:ascii="Garamond" w:hAnsi="Garamond"/>
-          <w:sz w:val="22"/>
-          <w:szCs w:val="22"/>
-        </w:rPr>
-        <w:t xml:space="preserve">while minimizing warping from interpolation. </w:t>
+        <w:t>Manual s</w:t>
+      </w:r>
+      <w:r>
+        <w:rPr>
+          <w:rFonts w:ascii="Garamond" w:hAnsi="Garamond"/>
+          <w:sz w:val="22"/>
+          <w:szCs w:val="22"/>
+        </w:rPr>
+        <w:t xml:space="preserve">election of trimming locations </w:t>
+      </w:r>
+      <w:r>
+        <w:rPr>
+          <w:rFonts w:ascii="Garamond" w:hAnsi="Garamond"/>
+          <w:sz w:val="22"/>
+          <w:szCs w:val="22"/>
+        </w:rPr>
+        <w:t>was</w:t>
+      </w:r>
+      <w:r>
+        <w:rPr>
+          <w:rFonts w:ascii="Garamond" w:hAnsi="Garamond"/>
+          <w:sz w:val="22"/>
+          <w:szCs w:val="22"/>
+        </w:rPr>
+        <w:t xml:space="preserve"> randomized and blinded to avoid </w:t>
+      </w:r>
+      <w:r>
+        <w:rPr>
+          <w:rFonts w:ascii="Garamond" w:hAnsi="Garamond"/>
+          <w:sz w:val="22"/>
+          <w:szCs w:val="22"/>
+        </w:rPr>
+        <w:t xml:space="preserve">bias. </w:t>
+      </w:r>
+      <w:r>
+        <w:rPr>
+          <w:rFonts w:ascii="Garamond" w:hAnsi="Garamond"/>
+          <w:sz w:val="22"/>
+          <w:szCs w:val="22"/>
+        </w:rPr>
+        <w:t>All trimmed datasets were then manually</w:t>
+      </w:r>
+      <w:r>
+        <w:rPr>
+          <w:rFonts w:ascii="Garamond" w:hAnsi="Garamond"/>
+          <w:sz w:val="22"/>
+          <w:szCs w:val="22"/>
+        </w:rPr>
+        <w:t xml:space="preserve"> checked for quality</w:t>
+      </w:r>
+      <w:r>
+        <w:rPr>
+          <w:rFonts w:ascii="Garamond" w:hAnsi="Garamond"/>
+          <w:sz w:val="22"/>
+          <w:szCs w:val="22"/>
+        </w:rPr>
+        <w:t xml:space="preserve"> and s</w:t>
+      </w:r>
+      <w:r>
+        <w:rPr>
+          <w:rFonts w:ascii="Garamond" w:hAnsi="Garamond"/>
+          <w:sz w:val="22"/>
+          <w:szCs w:val="22"/>
+        </w:rPr>
+        <w:t xml:space="preserve">amples with significant error (i.e large cracks) </w:t>
+      </w:r>
+      <w:r>
+        <w:rPr>
+          <w:rFonts w:ascii="Garamond" w:hAnsi="Garamond"/>
+          <w:sz w:val="22"/>
+          <w:szCs w:val="22"/>
+        </w:rPr>
+        <w:t>or</w:t>
+      </w:r>
+      <w:r>
+        <w:rPr>
+          <w:rFonts w:ascii="Garamond" w:hAnsi="Garamond"/>
+          <w:sz w:val="22"/>
+          <w:szCs w:val="22"/>
+        </w:rPr>
+        <w:t xml:space="preserve"> without a clear core </w:t>
+      </w:r>
+      <w:r>
+        <w:rPr>
+          <w:rFonts w:ascii="Garamond" w:hAnsi="Garamond"/>
+          <w:sz w:val="22"/>
+          <w:szCs w:val="22"/>
+        </w:rPr>
+        <w:t xml:space="preserve">and marine </w:t>
+      </w:r>
+      <w:r>
+        <w:rPr>
+          <w:rFonts w:ascii="Garamond" w:hAnsi="Garamond"/>
+          <w:sz w:val="22"/>
+          <w:szCs w:val="22"/>
+        </w:rPr>
+        <w:t xml:space="preserve">signal were removed from the dataset. </w:t>
+      </w:r>
+      <w:r>
+        <w:rPr>
+          <w:rFonts w:ascii="Garamond" w:hAnsi="Garamond"/>
+          <w:sz w:val="22"/>
+          <w:szCs w:val="22"/>
+        </w:rPr>
+        <w:t xml:space="preserve">The resulting dataset contained </w:t>
+      </w:r>
+      <w:r>
+        <w:rPr>
+          <w:rFonts w:ascii="Garamond" w:hAnsi="Garamond"/>
+          <w:sz w:val="22"/>
+          <w:szCs w:val="22"/>
+        </w:rPr>
+        <w:t xml:space="preserve">2,531 timeseries (971 Yukon, 875 Kuskokwim, and 685 </w:t>
+      </w:r>
+      <w:proofErr w:type="spellStart"/>
+      <w:r>
+        <w:rPr>
+          <w:rFonts w:ascii="Garamond" w:hAnsi="Garamond"/>
+          <w:sz w:val="22"/>
+          <w:szCs w:val="22"/>
+        </w:rPr>
+        <w:t>Nushagak</w:t>
+      </w:r>
+      <w:proofErr w:type="spellEnd"/>
+      <w:r>
+        <w:rPr>
+          <w:rFonts w:ascii="Garamond" w:hAnsi="Garamond"/>
+          <w:sz w:val="22"/>
+          <w:szCs w:val="22"/>
+        </w:rPr>
+        <w:t xml:space="preserve">). </w:t>
       </w:r>
     </w:p>
     <w:p>
       <w:pPr>
         <w:spacing w:line="480" w:lineRule="auto"/>
+        <w:ind w:firstLine="720"/>
+        <w:rPr>
+          <w:rFonts w:ascii="Garamond" w:hAnsi="Garamond"/>
+          <w:sz w:val="22"/>
+          <w:szCs w:val="22"/>
+        </w:rPr>
+      </w:pPr>
+      <w:r>
+        <w:rPr>
+          <w:rFonts w:ascii="Garamond" w:hAnsi="Garamond"/>
+          <w:sz w:val="22"/>
+          <w:szCs w:val="22"/>
+        </w:rPr>
+        <w:lastRenderedPageBreak/>
+        <w:t>To test whether</w:t>
+      </w:r>
+      <w:r>
+        <w:rPr>
+          <w:rFonts w:ascii="Garamond" w:hAnsi="Garamond"/>
+          <w:sz w:val="22"/>
+          <w:szCs w:val="22"/>
+        </w:rPr>
+        <w:t xml:space="preserve"> </w:t>
+      </w:r>
+      <w:r>
+        <w:rPr>
+          <w:rFonts w:ascii="Garamond" w:hAnsi="Garamond"/>
+          <w:sz w:val="22"/>
+          <w:szCs w:val="22"/>
+        </w:rPr>
+        <w:t xml:space="preserve">time series smoothing techniques </w:t>
+      </w:r>
+      <w:r>
+        <w:rPr>
+          <w:rFonts w:ascii="Garamond" w:hAnsi="Garamond"/>
+          <w:sz w:val="22"/>
+          <w:szCs w:val="22"/>
+        </w:rPr>
+        <w:t>could improve model performance</w:t>
+      </w:r>
+      <w:r>
+        <w:rPr>
+          <w:rFonts w:ascii="Garamond" w:hAnsi="Garamond"/>
+          <w:sz w:val="22"/>
+          <w:szCs w:val="22"/>
+        </w:rPr>
+        <w:t xml:space="preserve">, we applied </w:t>
+      </w:r>
+      <w:r>
+        <w:rPr>
+          <w:rFonts w:ascii="Garamond" w:hAnsi="Garamond"/>
+          <w:sz w:val="22"/>
+          <w:szCs w:val="22"/>
+        </w:rPr>
+        <w:t xml:space="preserve">two commonly used approaches: moving average (MA) and a generalized additive model (GAM). </w:t>
+      </w:r>
+      <w:r>
+        <w:rPr>
+          <w:rFonts w:ascii="Garamond" w:hAnsi="Garamond"/>
+          <w:sz w:val="22"/>
+          <w:szCs w:val="22"/>
+        </w:rPr>
+        <w:t>For the moving average smoothing w</w:t>
+      </w:r>
+      <w:r>
+        <w:rPr>
+          <w:rFonts w:ascii="Garamond" w:hAnsi="Garamond"/>
+          <w:sz w:val="22"/>
+          <w:szCs w:val="22"/>
+        </w:rPr>
+        <w:t>e used a 60</w:t>
+      </w:r>
+      <w:r>
+        <w:rPr>
+          <w:rFonts w:ascii="Garamond" w:hAnsi="Garamond"/>
+          <w:sz w:val="22"/>
+          <w:szCs w:val="22"/>
+        </w:rPr>
+        <w:t>-</w:t>
+      </w:r>
+      <w:r>
+        <w:rPr>
+          <w:rFonts w:ascii="Garamond" w:hAnsi="Garamond"/>
+          <w:sz w:val="22"/>
+          <w:szCs w:val="22"/>
+        </w:rPr>
+        <w:t>point center weighted window</w:t>
+      </w:r>
+      <w:r>
+        <w:rPr>
+          <w:rFonts w:ascii="Garamond" w:hAnsi="Garamond"/>
+          <w:sz w:val="22"/>
+          <w:szCs w:val="22"/>
+        </w:rPr>
+        <w:t xml:space="preserve">. </w:t>
+      </w:r>
+      <w:r>
+        <w:rPr>
+          <w:rFonts w:ascii="Garamond" w:hAnsi="Garamond"/>
+          <w:sz w:val="22"/>
+          <w:szCs w:val="22"/>
+        </w:rPr>
+        <w:t xml:space="preserve">The GAM was fitted using thin plate regression and penalized iteratively re-weighted least squares (P-IRLS) to maximize goodness of fit, with a generalized cross-validation (GCV) method employed to minimize overfitting </w:t>
+      </w:r>
+      <w:r>
+        <w:rPr>
+          <w:rFonts w:ascii="Garamond" w:hAnsi="Garamond"/>
+          <w:sz w:val="22"/>
+          <w:szCs w:val="22"/>
+        </w:rPr>
+        <w:t xml:space="preserve">(Wood, 2006). The maximum degrees of freedom (k) were scaled by the number of data points in each ablation line (n) by k = 10N </w:t>
+      </w:r>
+      <w:r>
+        <w:rPr>
+          <w:rFonts w:ascii="Garamond" w:hAnsi="Garamond"/>
+          <w:sz w:val="22"/>
+          <w:szCs w:val="22"/>
+          <w:vertAlign w:val="superscript"/>
+        </w:rPr>
+        <w:t>2/9</w:t>
+      </w:r>
+      <w:r>
+        <w:rPr>
+          <w:rFonts w:ascii="Garamond" w:hAnsi="Garamond"/>
+          <w:sz w:val="22"/>
+          <w:szCs w:val="22"/>
+          <w:vertAlign w:val="superscript"/>
+        </w:rPr>
+        <w:t xml:space="preserve"> </w:t>
+      </w:r>
+      <w:r>
+        <w:rPr>
+          <w:rFonts w:ascii="Garamond" w:hAnsi="Garamond"/>
+          <w:sz w:val="22"/>
+          <w:szCs w:val="22"/>
+        </w:rPr>
+        <w:t xml:space="preserve">(Kim and Gu, 2004, Brennan et al., </w:t>
+      </w:r>
+      <w:r>
+        <w:rPr>
+          <w:rFonts w:ascii="Garamond" w:hAnsi="Garamond"/>
+          <w:sz w:val="22"/>
+          <w:szCs w:val="22"/>
+        </w:rPr>
+        <w:t>2014)</w:t>
+      </w:r>
+      <w:r>
+        <w:rPr>
+          <w:rFonts w:ascii="Garamond" w:hAnsi="Garamond"/>
+          <w:sz w:val="22"/>
+          <w:szCs w:val="22"/>
+        </w:rPr>
+        <w:t xml:space="preserve">. </w:t>
+      </w:r>
+      <w:r>
+        <w:rPr>
+          <w:rFonts w:ascii="Garamond" w:hAnsi="Garamond"/>
+          <w:sz w:val="22"/>
+          <w:szCs w:val="22"/>
+        </w:rPr>
+        <w:t>This process resulted in three versions of the</w:t>
+      </w:r>
+      <w:r>
+        <w:rPr>
+          <w:rFonts w:ascii="Garamond" w:hAnsi="Garamond"/>
+          <w:sz w:val="22"/>
+          <w:szCs w:val="22"/>
+        </w:rPr>
+        <w:t xml:space="preserve"> same laser ablation timeseries for </w:t>
+      </w:r>
+      <w:proofErr w:type="gramStart"/>
+      <w:r>
+        <w:rPr>
+          <w:rFonts w:ascii="Garamond" w:hAnsi="Garamond"/>
+          <w:sz w:val="22"/>
+          <w:szCs w:val="22"/>
+        </w:rPr>
+        <w:t>each individual</w:t>
+      </w:r>
+      <w:proofErr w:type="gramEnd"/>
+      <w:r>
+        <w:rPr>
+          <w:rFonts w:ascii="Garamond" w:hAnsi="Garamond"/>
+          <w:sz w:val="22"/>
+          <w:szCs w:val="22"/>
+        </w:rPr>
+        <w:t>: GAM-smoothed, MA-smoothed, and raw LA data.</w:t>
+      </w:r>
+      <w:r>
+        <w:rPr>
+          <w:rFonts w:ascii="Garamond" w:hAnsi="Garamond"/>
+          <w:sz w:val="22"/>
+          <w:szCs w:val="22"/>
+        </w:rPr>
+        <w:t xml:space="preserve"> </w:t>
+      </w:r>
+      <w:r>
+        <w:rPr>
+          <w:rFonts w:ascii="Garamond" w:hAnsi="Garamond"/>
+          <w:sz w:val="22"/>
+          <w:szCs w:val="22"/>
+        </w:rPr>
+        <w:t>Finally, all samples were interpolated to a common length</w:t>
+      </w:r>
+      <w:r>
+        <w:rPr>
+          <w:rFonts w:ascii="Garamond" w:hAnsi="Garamond"/>
+          <w:sz w:val="22"/>
+          <w:szCs w:val="22"/>
+        </w:rPr>
+        <w:t xml:space="preserve"> </w:t>
+      </w:r>
+      <w:r>
+        <w:rPr>
+          <w:rFonts w:ascii="Garamond" w:hAnsi="Garamond"/>
+          <w:sz w:val="22"/>
+          <w:szCs w:val="22"/>
+        </w:rPr>
+        <w:t xml:space="preserve">defined as the average length of </w:t>
+      </w:r>
+      <w:r>
+        <w:rPr>
+          <w:rFonts w:ascii="Garamond" w:hAnsi="Garamond"/>
+          <w:sz w:val="22"/>
+          <w:szCs w:val="22"/>
+        </w:rPr>
+        <w:t>all</w:t>
+      </w:r>
+      <w:r>
+        <w:rPr>
+          <w:rFonts w:ascii="Garamond" w:hAnsi="Garamond"/>
+          <w:sz w:val="22"/>
+          <w:szCs w:val="22"/>
+        </w:rPr>
+        <w:t xml:space="preserve"> t</w:t>
+      </w:r>
+      <w:r>
+        <w:rPr>
+          <w:rFonts w:ascii="Garamond" w:hAnsi="Garamond"/>
+          <w:sz w:val="22"/>
+          <w:szCs w:val="22"/>
+        </w:rPr>
+        <w:t>ime</w:t>
+      </w:r>
+      <w:r>
+        <w:rPr>
+          <w:rFonts w:ascii="Garamond" w:hAnsi="Garamond"/>
+          <w:sz w:val="22"/>
+          <w:szCs w:val="22"/>
+        </w:rPr>
+        <w:t>s</w:t>
+      </w:r>
+      <w:r>
+        <w:rPr>
+          <w:rFonts w:ascii="Garamond" w:hAnsi="Garamond"/>
+          <w:sz w:val="22"/>
+          <w:szCs w:val="22"/>
+        </w:rPr>
+        <w:t xml:space="preserve">eries </w:t>
+      </w:r>
+      <w:r>
+        <w:rPr>
+          <w:rFonts w:ascii="Garamond" w:hAnsi="Garamond"/>
+          <w:sz w:val="22"/>
+          <w:szCs w:val="22"/>
+        </w:rPr>
+        <w:t xml:space="preserve">of that type </w:t>
+      </w:r>
+      <w:r>
+        <w:rPr>
+          <w:rFonts w:ascii="Garamond" w:hAnsi="Garamond"/>
+          <w:sz w:val="22"/>
+          <w:szCs w:val="22"/>
+        </w:rPr>
+        <w:t xml:space="preserve">(700 points for non-MA and 600 points for MA-smoothed samples, respectively) </w:t>
+      </w:r>
+      <w:r>
+        <w:rPr>
+          <w:rFonts w:ascii="Garamond" w:hAnsi="Garamond"/>
+          <w:sz w:val="22"/>
+          <w:szCs w:val="22"/>
+        </w:rPr>
+        <w:t>(Hegg and Kennedy, 2021).</w:t>
+      </w:r>
+      <w:r>
+        <w:rPr>
+          <w:rFonts w:ascii="Garamond" w:hAnsi="Garamond"/>
+          <w:sz w:val="22"/>
+          <w:szCs w:val="22"/>
+        </w:rPr>
+        <w:t xml:space="preserve"> This was done to satisfy the requirement for equal length vectors for machine learning algorithms </w:t>
+      </w:r>
+      <w:r>
+        <w:rPr>
+          <w:rFonts w:ascii="Garamond" w:hAnsi="Garamond"/>
+          <w:sz w:val="22"/>
+          <w:szCs w:val="22"/>
+        </w:rPr>
+        <w:t xml:space="preserve">while minimizing warping from interpolation. </w:t>
+      </w:r>
+    </w:p>
+    <w:p>
+      <w:pPr>
+        <w:spacing w:line="480" w:lineRule="auto"/>
         <w:rPr>
           <w:rFonts w:ascii="Garamond" w:hAnsi="Garamond"/>
           <w:b/>
@@ -3667,31 +3781,48 @@
           <w:sz w:val="22"/>
           <w:szCs w:val="22"/>
         </w:rPr>
-        <w:t xml:space="preserve">of 0.7075- 0.7080. PCA plots were produced to visualize clustering of both PC1 (47.46% of variance) and PC2 (20.93% of variance) as well as between PC1 and PC3 (10.23% of variance). </w:t>
-      </w:r>
-      <w:r>
-        <w:rPr>
-          <w:rFonts w:ascii="Garamond" w:hAnsi="Garamond"/>
-          <w:sz w:val="22"/>
-          <w:szCs w:val="22"/>
-        </w:rPr>
-        <w:t xml:space="preserve">To identify the most discriminatory portions of the timeseries, the absolute values of principal component loadings </w:t>
-      </w:r>
-      <w:r>
-        <w:rPr>
-          <w:rFonts w:ascii="Garamond" w:hAnsi="Garamond"/>
-          <w:sz w:val="22"/>
-          <w:szCs w:val="22"/>
-        </w:rPr>
-        <w:t xml:space="preserve">were then mapped </w:t>
-      </w:r>
-      <w:r>
-        <w:rPr>
-          <w:rFonts w:ascii="Garamond" w:hAnsi="Garamond"/>
-          <w:sz w:val="22"/>
-          <w:szCs w:val="22"/>
-        </w:rPr>
-        <w:t>onto their corresponding timeseries positions</w:t>
+        <w:t>between</w:t>
+      </w:r>
+      <w:r>
+        <w:rPr>
+          <w:rFonts w:ascii="Garamond" w:hAnsi="Garamond"/>
+          <w:sz w:val="22"/>
+          <w:szCs w:val="22"/>
+        </w:rPr>
+        <w:t xml:space="preserve"> 0.7075</w:t>
+      </w:r>
+      <w:r>
+        <w:rPr>
+          <w:rFonts w:ascii="Garamond" w:hAnsi="Garamond"/>
+          <w:sz w:val="22"/>
+          <w:szCs w:val="22"/>
+        </w:rPr>
+        <w:t xml:space="preserve"> and </w:t>
+      </w:r>
+      <w:r>
+        <w:rPr>
+          <w:rFonts w:ascii="Garamond" w:hAnsi="Garamond"/>
+          <w:sz w:val="22"/>
+          <w:szCs w:val="22"/>
+        </w:rPr>
+        <w:t xml:space="preserve">0.7080. PCA plots were produced to visualize clustering of both PC1 (47.46% of variance) and PC2 (20.93% of variance) as well as between PC1 and PC3 (10.23% of variance). </w:t>
+      </w:r>
+      <w:r>
+        <w:rPr>
+          <w:rFonts w:ascii="Garamond" w:hAnsi="Garamond"/>
+          <w:sz w:val="22"/>
+          <w:szCs w:val="22"/>
+        </w:rPr>
+        <w:t xml:space="preserve">We then displayed the absolutely values of </w:t>
+      </w:r>
+      <w:r>
+        <w:rPr>
+          <w:rFonts w:ascii="Garamond" w:hAnsi="Garamond"/>
+          <w:sz w:val="22"/>
+          <w:szCs w:val="22"/>
+        </w:rPr>
+        <w:lastRenderedPageBreak/>
+        <w:t>the principal component loading from each point along the timeseries to identify portions of the timeseries contributing to these interclass separation</w:t>
       </w:r>
       <w:r>
         <w:rPr>
@@ -3750,7 +3881,6 @@
           <w:szCs w:val="22"/>
           <w:u w:val="single"/>
         </w:rPr>
-        <w:lastRenderedPageBreak/>
         <w:t xml:space="preserve">Machine Learning Classification Models </w:t>
       </w:r>
     </w:p>
@@ -3794,25 +3924,57 @@
           <w:sz w:val="22"/>
           <w:szCs w:val="22"/>
         </w:rPr>
-        <w:t xml:space="preserve"> training </w:t>
-      </w:r>
-      <w:proofErr w:type="gramStart"/>
-      <w:r>
-        <w:rPr>
-          <w:rFonts w:ascii="Garamond" w:hAnsi="Garamond"/>
-          <w:sz w:val="22"/>
-          <w:szCs w:val="22"/>
-        </w:rPr>
-        <w:t>and</w:t>
-      </w:r>
-      <w:proofErr w:type="gramEnd"/>
-      <w:r>
-        <w:rPr>
-          <w:rFonts w:ascii="Garamond" w:hAnsi="Garamond"/>
-          <w:sz w:val="22"/>
-          <w:szCs w:val="22"/>
-        </w:rPr>
-        <w:t xml:space="preserve"> testing sets using a</w:t>
+        <w:t xml:space="preserve"> </w:t>
+      </w:r>
+      <w:r>
+        <w:rPr>
+          <w:rFonts w:ascii="Garamond" w:hAnsi="Garamond"/>
+          <w:sz w:val="22"/>
+          <w:szCs w:val="22"/>
+        </w:rPr>
+        <w:t xml:space="preserve">training </w:t>
+      </w:r>
+      <w:r>
+        <w:rPr>
+          <w:rFonts w:ascii="Garamond" w:hAnsi="Garamond"/>
+          <w:sz w:val="22"/>
+          <w:szCs w:val="22"/>
+        </w:rPr>
+        <w:t>or</w:t>
+      </w:r>
+      <w:r>
+        <w:rPr>
+          <w:rFonts w:ascii="Garamond" w:hAnsi="Garamond"/>
+          <w:sz w:val="22"/>
+          <w:szCs w:val="22"/>
+        </w:rPr>
+        <w:t xml:space="preserve"> testing </w:t>
+      </w:r>
+      <w:proofErr w:type="spellStart"/>
+      <w:r>
+        <w:rPr>
+          <w:rFonts w:ascii="Garamond" w:hAnsi="Garamond"/>
+          <w:sz w:val="22"/>
+          <w:szCs w:val="22"/>
+        </w:rPr>
+        <w:t>datasets</w:t>
+      </w:r>
+      <w:r>
+        <w:rPr>
+          <w:rFonts w:ascii="Garamond" w:hAnsi="Garamond"/>
+          <w:sz w:val="22"/>
+          <w:szCs w:val="22"/>
+        </w:rPr>
+        <w:t>ets</w:t>
+      </w:r>
+      <w:proofErr w:type="spellEnd"/>
+      <w:r>
+        <w:rPr>
+          <w:rFonts w:ascii="Garamond" w:hAnsi="Garamond"/>
+          <w:sz w:val="22"/>
+          <w:szCs w:val="22"/>
+        </w:rPr>
+        <w:t xml:space="preserve"> using a</w:t>
       </w:r>
       <w:r>
         <w:rPr>
@@ -3844,7 +4006,31 @@
           <w:sz w:val="22"/>
           <w:szCs w:val="22"/>
         </w:rPr>
-        <w:t xml:space="preserve">On the training set for each dataset, we trained three supervised classification algorithms: </w:t>
+        <w:t>W</w:t>
+      </w:r>
+      <w:r>
+        <w:rPr>
+          <w:rFonts w:ascii="Garamond" w:hAnsi="Garamond"/>
+          <w:sz w:val="22"/>
+          <w:szCs w:val="22"/>
+        </w:rPr>
+        <w:t>e trained three supervised classification algorithms</w:t>
+      </w:r>
+      <w:r>
+        <w:rPr>
+          <w:rFonts w:ascii="Garamond" w:hAnsi="Garamond"/>
+          <w:sz w:val="22"/>
+          <w:szCs w:val="22"/>
+        </w:rPr>
+        <w:t xml:space="preserve"> on the training set for each dataset</w:t>
+      </w:r>
+      <w:r>
+        <w:rPr>
+          <w:rFonts w:ascii="Garamond" w:hAnsi="Garamond"/>
+          <w:sz w:val="22"/>
+          <w:szCs w:val="22"/>
+        </w:rPr>
+        <w:t xml:space="preserve">: </w:t>
       </w:r>
       <w:r>
         <w:rPr>
@@ -4036,15 +4222,95 @@
           <w:sz w:val="22"/>
           <w:szCs w:val="22"/>
         </w:rPr>
-        <w:t>versions of the training dataset for each data type</w:t>
-      </w:r>
-      <w:r>
-        <w:rPr>
-          <w:rFonts w:ascii="Garamond" w:hAnsi="Garamond"/>
-          <w:sz w:val="22"/>
-          <w:szCs w:val="22"/>
-        </w:rPr>
-        <w:t>. First, models were tested on the original randomly selected 20% holdout set</w:t>
+        <w:t>versions of the t</w:t>
+      </w:r>
+      <w:r>
+        <w:rPr>
+          <w:rFonts w:ascii="Garamond" w:hAnsi="Garamond"/>
+          <w:sz w:val="22"/>
+          <w:szCs w:val="22"/>
+        </w:rPr>
+        <w:t>esting</w:t>
+      </w:r>
+      <w:r>
+        <w:rPr>
+          <w:rFonts w:ascii="Garamond" w:hAnsi="Garamond"/>
+          <w:sz w:val="22"/>
+          <w:szCs w:val="22"/>
+        </w:rPr>
+        <w:t xml:space="preserve"> dataset for each data type</w:t>
+      </w:r>
+      <w:r>
+        <w:rPr>
+          <w:rFonts w:ascii="Garamond" w:hAnsi="Garamond"/>
+          <w:sz w:val="22"/>
+          <w:szCs w:val="22"/>
+        </w:rPr>
+        <w:t xml:space="preserve">. First, models were tested on the original randomly selected 20% holdout set. Second, models were evaluated on a modified testing set in which samples with natal origin </w:t>
+      </w:r>
+      <w:r>
+        <w:rPr>
+          <w:rFonts w:ascii="Cambria Math" w:hAnsi="Cambria Math" w:cs="Cambria Math"/>
+          <w:sz w:val="22"/>
+          <w:szCs w:val="22"/>
+        </w:rPr>
+        <w:t>⁸⁷</w:t>
+      </w:r>
+      <w:r>
+        <w:rPr>
+          <w:rFonts w:ascii="Garamond" w:hAnsi="Garamond"/>
+          <w:sz w:val="22"/>
+          <w:szCs w:val="22"/>
+        </w:rPr>
+        <w:t>Sr/</w:t>
+      </w:r>
+      <w:r>
+        <w:rPr>
+          <w:rFonts w:ascii="Cambria Math" w:hAnsi="Cambria Math" w:cs="Cambria Math"/>
+          <w:sz w:val="22"/>
+          <w:szCs w:val="22"/>
+        </w:rPr>
+        <w:t>⁸⁶</w:t>
+      </w:r>
+      <w:r>
+        <w:rPr>
+          <w:rFonts w:ascii="Garamond" w:hAnsi="Garamond"/>
+          <w:sz w:val="22"/>
+          <w:szCs w:val="22"/>
+        </w:rPr>
+        <w:t xml:space="preserve">Sr values above 0.7150 were </w:t>
+      </w:r>
+      <w:r>
+        <w:rPr>
+          <w:rFonts w:ascii="Garamond" w:hAnsi="Garamond"/>
+          <w:sz w:val="22"/>
+          <w:szCs w:val="22"/>
+        </w:rPr>
+        <w:t>excluded</w:t>
+      </w:r>
+      <w:r>
+        <w:rPr>
+          <w:rFonts w:ascii="Garamond" w:hAnsi="Garamond"/>
+          <w:sz w:val="22"/>
+          <w:szCs w:val="22"/>
+        </w:rPr>
+        <w:t>. Only the Yukon watershed contains enriched isotope values above this threshold and can therefore be distinguished using natal origin values alone. This modified dataset</w:t>
+      </w:r>
+      <w:r>
+        <w:rPr>
+          <w:rFonts w:ascii="Garamond" w:hAnsi="Garamond"/>
+          <w:sz w:val="22"/>
+          <w:szCs w:val="22"/>
+        </w:rPr>
+        <w:t xml:space="preserve">, </w:t>
+      </w:r>
+      <w:r>
+        <w:rPr>
+          <w:rFonts w:ascii="Garamond" w:hAnsi="Garamond"/>
+          <w:sz w:val="22"/>
+          <w:szCs w:val="22"/>
+        </w:rPr>
+        <w:t>hereby</w:t>
       </w:r>
       <w:r>
         <w:rPr>
@@ -4054,124 +4320,14 @@
         </w:rPr>
         <w:t xml:space="preserve"> </w:t>
       </w:r>
-      <w:proofErr w:type="gramStart"/>
-      <w:r>
-        <w:rPr>
-          <w:rFonts w:ascii="Garamond" w:hAnsi="Garamond"/>
-          <w:sz w:val="22"/>
-          <w:szCs w:val="22"/>
-        </w:rPr>
-        <w:t>( N</w:t>
-      </w:r>
-      <w:proofErr w:type="gramEnd"/>
-      <w:r>
-        <w:rPr>
-          <w:rFonts w:ascii="Garamond" w:hAnsi="Garamond"/>
-          <w:sz w:val="22"/>
-          <w:szCs w:val="22"/>
-        </w:rPr>
-        <w:t xml:space="preserve"> = </w:t>
-      </w:r>
-      <w:proofErr w:type="gramStart"/>
-      <w:r>
-        <w:rPr>
-          <w:rFonts w:ascii="Garamond" w:hAnsi="Garamond"/>
-          <w:sz w:val="22"/>
-          <w:szCs w:val="22"/>
-        </w:rPr>
-        <w:t>X )</w:t>
-      </w:r>
-      <w:proofErr w:type="gramEnd"/>
-      <w:r>
-        <w:rPr>
-          <w:rFonts w:ascii="Garamond" w:hAnsi="Garamond"/>
-          <w:sz w:val="22"/>
-          <w:szCs w:val="22"/>
-        </w:rPr>
-        <w:t xml:space="preserve">. Second, models were evaluated on a modified testing set in which samples with natal origin </w:t>
-      </w:r>
-      <w:r>
-        <w:rPr>
-          <w:rFonts w:ascii="Cambria Math" w:hAnsi="Cambria Math" w:cs="Cambria Math"/>
-          <w:sz w:val="22"/>
-          <w:szCs w:val="22"/>
-        </w:rPr>
-        <w:t>⁸⁷</w:t>
-      </w:r>
-      <w:r>
-        <w:rPr>
-          <w:rFonts w:ascii="Garamond" w:hAnsi="Garamond"/>
-          <w:sz w:val="22"/>
-          <w:szCs w:val="22"/>
-        </w:rPr>
-        <w:t>Sr/</w:t>
-      </w:r>
-      <w:r>
-        <w:rPr>
-          <w:rFonts w:ascii="Cambria Math" w:hAnsi="Cambria Math" w:cs="Cambria Math"/>
-          <w:sz w:val="22"/>
-          <w:szCs w:val="22"/>
-        </w:rPr>
-        <w:t>⁸⁶</w:t>
-      </w:r>
-      <w:r>
-        <w:rPr>
-          <w:rFonts w:ascii="Garamond" w:hAnsi="Garamond"/>
-          <w:sz w:val="22"/>
-          <w:szCs w:val="22"/>
-        </w:rPr>
-        <w:t xml:space="preserve">Sr values above 0.7150 were </w:t>
-      </w:r>
-      <w:r>
-        <w:rPr>
-          <w:rFonts w:ascii="Garamond" w:hAnsi="Garamond"/>
-          <w:sz w:val="22"/>
-          <w:szCs w:val="22"/>
-        </w:rPr>
-        <w:t>excluded</w:t>
-      </w:r>
-      <w:r>
-        <w:rPr>
-          <w:rFonts w:ascii="Garamond" w:hAnsi="Garamond"/>
-          <w:sz w:val="22"/>
-          <w:szCs w:val="22"/>
-        </w:rPr>
-        <w:t>. Only the Yukon watershed contains enriched isotope values above this threshold and can therefore be distinguished using natal origin values alone. This modified dataset</w:t>
-      </w:r>
-      <w:r>
-        <w:rPr>
-          <w:rFonts w:ascii="Garamond" w:hAnsi="Garamond"/>
-          <w:sz w:val="22"/>
-          <w:szCs w:val="22"/>
-        </w:rPr>
-        <w:t xml:space="preserve">, </w:t>
-      </w:r>
-      <w:r>
-        <w:rPr>
-          <w:rFonts w:ascii="Garamond" w:hAnsi="Garamond"/>
-          <w:sz w:val="22"/>
-          <w:szCs w:val="22"/>
-        </w:rPr>
-        <w:t>hereby</w:t>
-      </w:r>
-      <w:r>
-        <w:rPr>
-          <w:rFonts w:ascii="Garamond" w:hAnsi="Garamond"/>
-          <w:sz w:val="22"/>
-          <w:szCs w:val="22"/>
-        </w:rPr>
-        <w:t xml:space="preserve"> </w:t>
-      </w:r>
-      <w:proofErr w:type="spellStart"/>
-      <w:r>
-        <w:rPr>
-          <w:rFonts w:ascii="Garamond" w:hAnsi="Garamond"/>
-          <w:sz w:val="22"/>
-          <w:szCs w:val="22"/>
-        </w:rPr>
-        <w:t>refered</w:t>
-      </w:r>
-      <w:proofErr w:type="spellEnd"/>
+      <w:r>
+        <w:rPr>
+          <w:rFonts w:ascii="Garamond" w:hAnsi="Garamond"/>
+          <w:sz w:val="22"/>
+          <w:szCs w:val="22"/>
+        </w:rPr>
+        <w:t>referred</w:t>
+      </w:r>
       <w:r>
         <w:rPr>
           <w:rFonts w:ascii="Garamond" w:hAnsi="Garamond"/>
@@ -4202,39 +4358,39 @@
           <w:sz w:val="22"/>
           <w:szCs w:val="22"/>
         </w:rPr>
-        <w:t xml:space="preserve"> samples that are otherwise indistinguishable using natal origin values. </w:t>
-      </w:r>
-      <w:r>
-        <w:rPr>
-          <w:rFonts w:ascii="Garamond" w:hAnsi="Garamond"/>
-          <w:sz w:val="22"/>
-          <w:szCs w:val="22"/>
-        </w:rPr>
-        <w:t xml:space="preserve">Model performance was assessed using </w:t>
-      </w:r>
-      <w:r>
-        <w:rPr>
-          <w:rFonts w:ascii="Garamond" w:hAnsi="Garamond"/>
-          <w:sz w:val="22"/>
-          <w:szCs w:val="22"/>
-        </w:rPr>
-        <w:t>accuracy and F1-Score (Figure 2).</w:t>
-      </w:r>
-      <w:r>
-        <w:rPr>
-          <w:rFonts w:ascii="Garamond" w:hAnsi="Garamond"/>
-          <w:sz w:val="22"/>
-          <w:szCs w:val="22"/>
-        </w:rPr>
-        <w:t xml:space="preserve"> </w:t>
-      </w:r>
-      <w:r>
-        <w:rPr>
-          <w:rFonts w:ascii="Garamond" w:hAnsi="Garamond"/>
-          <w:sz w:val="22"/>
-          <w:szCs w:val="22"/>
-        </w:rPr>
-        <w:t xml:space="preserve">Model performance was assessed using </w:t>
+        <w:t xml:space="preserve"> samples that are otherwise indistinguishable using natal origin values</w:t>
+      </w:r>
+      <w:r>
+        <w:rPr>
+          <w:rFonts w:ascii="Garamond" w:hAnsi="Garamond"/>
+          <w:sz w:val="22"/>
+          <w:szCs w:val="22"/>
+        </w:rPr>
+        <w:t xml:space="preserve"> alone. </w:t>
+      </w:r>
+      <w:r>
+        <w:rPr>
+          <w:rFonts w:ascii="Garamond" w:hAnsi="Garamond"/>
+          <w:sz w:val="22"/>
+          <w:szCs w:val="22"/>
+        </w:rPr>
+        <w:t>Model performance was</w:t>
+      </w:r>
+      <w:r>
+        <w:rPr>
+          <w:rFonts w:ascii="Garamond" w:hAnsi="Garamond"/>
+          <w:sz w:val="22"/>
+          <w:szCs w:val="22"/>
+        </w:rPr>
+        <w:t xml:space="preserve"> then</w:t>
+      </w:r>
+      <w:r>
+        <w:rPr>
+          <w:rFonts w:ascii="Garamond" w:hAnsi="Garamond"/>
+          <w:sz w:val="22"/>
+          <w:szCs w:val="22"/>
+        </w:rPr>
+        <w:t xml:space="preserve"> assessed using </w:t>
       </w:r>
       <w:r>
         <w:rPr>
@@ -4282,7 +4438,23 @@
           <w:sz w:val="22"/>
           <w:szCs w:val="22"/>
         </w:rPr>
-        <w:t>. Accuracy measures the proportion of correctly classified samples:</w:t>
+        <w:t xml:space="preserve"> </w:t>
+      </w:r>
+      <w:r>
+        <w:rPr>
+          <w:rFonts w:ascii="Garamond" w:hAnsi="Garamond"/>
+          <w:sz w:val="22"/>
+          <w:szCs w:val="22"/>
+        </w:rPr>
+        <w:t xml:space="preserve">(Figure 2). </w:t>
+      </w:r>
+      <w:r>
+        <w:rPr>
+          <w:rFonts w:ascii="Garamond" w:hAnsi="Garamond"/>
+          <w:sz w:val="22"/>
+          <w:szCs w:val="22"/>
+        </w:rPr>
+        <w:t>Accuracy measures the proportion of correctly classified samples:</w:t>
       </w:r>
     </w:p>
     <w:p>
@@ -4410,6 +4582,7 @@
           <w:sz w:val="22"/>
           <w:szCs w:val="22"/>
         </w:rPr>
+        <w:lastRenderedPageBreak/>
         <w:t>F1-Score</w:t>
       </w:r>
       <w:r>
@@ -4438,7 +4611,6 @@
           <w:sz w:val="22"/>
           <w:szCs w:val="22"/>
         </w:rPr>
-        <w:lastRenderedPageBreak/>
         <w:t xml:space="preserve">Here, </w:t>
       </w:r>
       <w:r>
@@ -4655,7 +4827,23 @@
           <w:sz w:val="22"/>
           <w:szCs w:val="22"/>
         </w:rPr>
-        <w:t>diagrams that plot predicted probabilities against observed class frequencies across probability bins. Additionally, we quantified calibration improvements using Brier scores and logarithmic loss calculated before and after calibration.</w:t>
+        <w:t>diagrams that plot predicted probabilities against observed class frequencies across probability bins</w:t>
+      </w:r>
+      <w:r>
+        <w:rPr>
+          <w:rFonts w:ascii="Garamond" w:hAnsi="Garamond"/>
+          <w:sz w:val="22"/>
+          <w:szCs w:val="22"/>
+        </w:rPr>
+        <w:t xml:space="preserve"> (Supplemental?)</w:t>
+      </w:r>
+      <w:r>
+        <w:rPr>
+          <w:rFonts w:ascii="Garamond" w:hAnsi="Garamond"/>
+          <w:sz w:val="22"/>
+          <w:szCs w:val="22"/>
+        </w:rPr>
+        <w:t>. Additionally, we quantified calibration improvements using Brier scores and logarithmic loss calculated before and after calibration.</w:t>
       </w:r>
       <w:r>
         <w:rPr>
@@ -4671,7 +4859,16 @@
           <w:sz w:val="22"/>
           <w:szCs w:val="22"/>
         </w:rPr>
-        <w:t>Calibration transformations were fitted separately for each model-data type combination and stored as reusable functions that can be applied consistently to future predictions. This ensures that probability estimates from our models accurately reflect true classification confidence</w:t>
+        <w:t xml:space="preserve">Calibration transformations were fitted separately for each model-data type combination and stored as reusable functions that can be applied consistently to future predictions. This ensures that probability estimates from our models accurately </w:t>
+      </w:r>
+      <w:r>
+        <w:rPr>
+          <w:rFonts w:ascii="Garamond" w:hAnsi="Garamond"/>
+          <w:sz w:val="22"/>
+          <w:szCs w:val="22"/>
+        </w:rPr>
+        <w:lastRenderedPageBreak/>
+        <w:t>reflect true classification confidence</w:t>
       </w:r>
       <w:r>
         <w:rPr>
@@ -4681,26 +4878,21 @@
         </w:rPr>
         <w:t xml:space="preserve">. </w:t>
       </w:r>
-    </w:p>
-    <w:p>
-      <w:pPr>
-        <w:pStyle w:val="whitespace-normal"/>
-        <w:spacing w:line="480" w:lineRule="auto"/>
-        <w:ind w:firstLine="720"/>
-        <w:rPr>
-          <w:rFonts w:ascii="Garamond" w:hAnsi="Garamond"/>
-          <w:sz w:val="22"/>
-          <w:szCs w:val="22"/>
-        </w:rPr>
-      </w:pPr>
-      <w:r>
-        <w:rPr>
-          <w:rFonts w:ascii="Garamond" w:hAnsi="Garamond"/>
-          <w:sz w:val="22"/>
-          <w:szCs w:val="22"/>
-        </w:rPr>
-        <w:lastRenderedPageBreak/>
-        <w:t xml:space="preserve">From calibrated </w:t>
+      <w:r>
+        <w:rPr>
+          <w:rFonts w:ascii="Garamond" w:hAnsi="Garamond"/>
+          <w:sz w:val="22"/>
+          <w:szCs w:val="22"/>
+        </w:rPr>
+        <w:t xml:space="preserve">Using </w:t>
+      </w:r>
+      <w:r>
+        <w:rPr>
+          <w:rFonts w:ascii="Garamond" w:hAnsi="Garamond"/>
+          <w:sz w:val="22"/>
+          <w:szCs w:val="22"/>
+        </w:rPr>
+        <w:t xml:space="preserve">calibrated </w:t>
       </w:r>
       <w:r>
         <w:rPr>
@@ -4740,15 +4932,39 @@
           <w:sz w:val="22"/>
           <w:szCs w:val="22"/>
         </w:rPr>
-        <w:t xml:space="preserve">from our model with an added confidence threshold. Meaning, we evaluated the proportion of correctly assigned individuals which were also given a calibrated probability value above a given threshold. </w:t>
-      </w:r>
-      <w:r>
-        <w:rPr>
-          <w:rFonts w:ascii="Garamond" w:hAnsi="Garamond"/>
-          <w:sz w:val="22"/>
-          <w:szCs w:val="22"/>
-        </w:rPr>
-        <w:t xml:space="preserve">We tested thresholds of 60 – 90 % by 5% increments and recorded both the class specific and overall accuracy at each (Figure 6). </w:t>
+        <w:t xml:space="preserve">from our model with an added confidence threshold. </w:t>
+      </w:r>
+      <w:r>
+        <w:rPr>
+          <w:rFonts w:ascii="Garamond" w:hAnsi="Garamond"/>
+          <w:sz w:val="22"/>
+          <w:szCs w:val="22"/>
+        </w:rPr>
+        <w:t xml:space="preserve">We </w:t>
+      </w:r>
+      <w:r>
+        <w:rPr>
+          <w:rFonts w:ascii="Garamond" w:hAnsi="Garamond"/>
+          <w:sz w:val="22"/>
+          <w:szCs w:val="22"/>
+        </w:rPr>
+        <w:t xml:space="preserve">evaluated the proportion of correctly assigned individuals </w:t>
+      </w:r>
+      <w:r>
+        <w:rPr>
+          <w:rFonts w:ascii="Garamond" w:hAnsi="Garamond"/>
+          <w:sz w:val="22"/>
+          <w:szCs w:val="22"/>
+        </w:rPr>
+        <w:t>in which the assigned and calibrated probability value is above a given threshold value from 60-90%. From these results we recorded both class specific and overall accuracy at each threshold value</w:t>
+      </w:r>
+      <w:r>
+        <w:rPr>
+          <w:rFonts w:ascii="Garamond" w:hAnsi="Garamond"/>
+          <w:sz w:val="22"/>
+          <w:szCs w:val="22"/>
+        </w:rPr>
+        <w:t xml:space="preserve"> (Figure 6). </w:t>
       </w:r>
     </w:p>
     <w:p>
@@ -4833,7 +5049,23 @@
           <w:sz w:val="22"/>
           <w:szCs w:val="22"/>
         </w:rPr>
-        <w:t xml:space="preserve">Principal component analysis of the full GAM-smoothed dataset (n = 2,531) revealed significant clustering of watershed classes in reduced-dimensional space. The first two principal components together captured 97.3% of the total variance in the dataset (PC1: 92.2%, PC2: 5.1%, Figure 4). Despite clear clustering patterns, some overlap remained among all three watersheds. Kuskokwim samples (Figure 4, red) exhibited the greatest degree of overlap, showing significant overlap with both </w:t>
+        <w:t xml:space="preserve">Principal component analysis of the full GAM-smoothed dataset (n = 2,531) revealed significant clustering </w:t>
+      </w:r>
+      <w:r>
+        <w:rPr>
+          <w:rFonts w:ascii="Garamond" w:hAnsi="Garamond"/>
+          <w:sz w:val="22"/>
+          <w:szCs w:val="22"/>
+        </w:rPr>
+        <w:t>by watershed</w:t>
+      </w:r>
+      <w:r>
+        <w:rPr>
+          <w:rFonts w:ascii="Garamond" w:hAnsi="Garamond"/>
+          <w:sz w:val="22"/>
+          <w:szCs w:val="22"/>
+        </w:rPr>
+        <w:t xml:space="preserve">. The first two principal components together captured 97.3% of the total variance in the dataset (PC1: 92.2%, PC2: 5.1%, Figure 4). Despite clear clustering patterns, some overlap remained among all three watersheds. Kuskokwim samples (Figure 4, red) exhibited the greatest degree of overlap, both </w:t>
       </w:r>
       <w:proofErr w:type="spellStart"/>
       <w:r>
@@ -4851,7 +5083,39 @@
           <w:sz w:val="22"/>
           <w:szCs w:val="22"/>
         </w:rPr>
-        <w:t xml:space="preserve"> and Yukon individuals. Yukon samples covered a much larger region of the principal component space, reflecting the broader range of potential isotope values that create unique timeseries compared to the more constrained ranges observed in the other two watershed classes</w:t>
+        <w:t xml:space="preserve"> and Yukon </w:t>
+      </w:r>
+      <w:r>
+        <w:rPr>
+          <w:rFonts w:ascii="Garamond" w:hAnsi="Garamond"/>
+          <w:sz w:val="22"/>
+          <w:szCs w:val="22"/>
+        </w:rPr>
+        <w:t>samples</w:t>
+      </w:r>
+      <w:r>
+        <w:rPr>
+          <w:rFonts w:ascii="Garamond" w:hAnsi="Garamond"/>
+          <w:sz w:val="22"/>
+          <w:szCs w:val="22"/>
+        </w:rPr>
+        <w:t>. Yukon samples</w:t>
+      </w:r>
+      <w:r>
+        <w:rPr>
+          <w:rFonts w:ascii="Garamond" w:hAnsi="Garamond"/>
+          <w:sz w:val="22"/>
+          <w:szCs w:val="22"/>
+        </w:rPr>
+        <w:t xml:space="preserve"> (Figure 4, blue)</w:t>
+      </w:r>
+      <w:r>
+        <w:rPr>
+          <w:rFonts w:ascii="Garamond" w:hAnsi="Garamond"/>
+          <w:sz w:val="22"/>
+          <w:szCs w:val="22"/>
+        </w:rPr>
+        <w:t xml:space="preserve"> covered a much larger region of the principal component space, reflecting the broader range of potential isotope values that create unique timeseries compared to the more constrained ranges observed in the other two watershed classes</w:t>
       </w:r>
     </w:p>
     <w:p>
@@ -4918,15 +5182,72 @@
           <w:sz w:val="22"/>
           <w:szCs w:val="22"/>
         </w:rPr>
-        <w:t>secondary rearing locations. The second principal component was driven by variation occurring just before the onset of the marine region, likely representing residency in mainstem tributaries during ocean migration. The relative shape at this point in the timeseries reflects differences in mainstem tributary Sr87/86 values among the three watersheds</w:t>
-      </w:r>
-      <w:r>
-        <w:rPr>
-          <w:rFonts w:ascii="Garamond" w:hAnsi="Garamond"/>
-          <w:sz w:val="22"/>
-          <w:szCs w:val="22"/>
-        </w:rPr>
-        <w:t xml:space="preserve"> (e.g. X, </w:t>
+        <w:t xml:space="preserve">secondary rearing locations. The second principal component was driven by variation occurring just before the onset of the marine region, likely representing residency in mainstem tributaries during ocean migration. The relative shape at this point in the timeseries reflects differences in mainstem tributary </w:t>
+      </w:r>
+      <w:r>
+        <w:rPr>
+          <w:rFonts w:ascii="Cambria Math" w:hAnsi="Cambria Math" w:cs="Cambria Math"/>
+          <w:sz w:val="22"/>
+          <w:szCs w:val="22"/>
+        </w:rPr>
+        <w:t>⁸⁷</w:t>
+      </w:r>
+      <w:r>
+        <w:rPr>
+          <w:rFonts w:ascii="Garamond" w:hAnsi="Garamond"/>
+          <w:sz w:val="22"/>
+          <w:szCs w:val="22"/>
+        </w:rPr>
+        <w:t>Sr/</w:t>
+      </w:r>
+      <w:r>
+        <w:rPr>
+          <w:rFonts w:ascii="Cambria Math" w:hAnsi="Cambria Math" w:cs="Cambria Math"/>
+          <w:sz w:val="22"/>
+          <w:szCs w:val="22"/>
+        </w:rPr>
+        <w:t>⁸⁶</w:t>
+      </w:r>
+      <w:r>
+        <w:rPr>
+          <w:rFonts w:ascii="Garamond" w:hAnsi="Garamond"/>
+          <w:sz w:val="22"/>
+          <w:szCs w:val="22"/>
+        </w:rPr>
+        <w:t>Sr</w:t>
+      </w:r>
+      <w:r>
+        <w:rPr>
+          <w:rFonts w:ascii="Garamond" w:hAnsi="Garamond"/>
+          <w:sz w:val="22"/>
+          <w:szCs w:val="22"/>
+        </w:rPr>
+        <w:t xml:space="preserve"> </w:t>
+      </w:r>
+      <w:r>
+        <w:rPr>
+          <w:rFonts w:ascii="Garamond" w:hAnsi="Garamond"/>
+          <w:sz w:val="22"/>
+          <w:szCs w:val="22"/>
+        </w:rPr>
+        <w:t>values among the three watersheds</w:t>
+      </w:r>
+      <w:r>
+        <w:rPr>
+          <w:rFonts w:ascii="Garamond" w:hAnsi="Garamond"/>
+          <w:sz w:val="22"/>
+          <w:szCs w:val="22"/>
+        </w:rPr>
+        <w:t xml:space="preserve"> (e.g. </w:t>
+      </w:r>
+      <w:commentRangeStart w:id="3"/>
+      <w:r>
+        <w:rPr>
+          <w:rFonts w:ascii="Garamond" w:hAnsi="Garamond"/>
+          <w:sz w:val="22"/>
+          <w:szCs w:val="22"/>
+        </w:rPr>
+        <w:t xml:space="preserve">X, </w:t>
       </w:r>
       <w:proofErr w:type="gramStart"/>
       <w:r>
@@ -4944,7 +5265,22 @@
           <w:sz w:val="22"/>
           <w:szCs w:val="22"/>
         </w:rPr>
-        <w:t xml:space="preserve"> in the Yukon, Kuskokwim, and </w:t>
+        <w:t xml:space="preserve"> </w:t>
+      </w:r>
+      <w:commentRangeEnd w:id="3"/>
+      <w:r>
+        <w:rPr>
+          <w:rStyle w:val="CommentReference"/>
+        </w:rPr>
+        <w:commentReference w:id="3"/>
+      </w:r>
+      <w:r>
+        <w:rPr>
+          <w:rFonts w:ascii="Garamond" w:hAnsi="Garamond"/>
+          <w:sz w:val="22"/>
+          <w:szCs w:val="22"/>
+        </w:rPr>
+        <w:t xml:space="preserve">in the Yukon, Kuskokwim, and </w:t>
       </w:r>
       <w:proofErr w:type="spellStart"/>
       <w:r>
@@ -4962,15 +5298,87 @@
           <w:sz w:val="22"/>
           <w:szCs w:val="22"/>
         </w:rPr>
-        <w:t xml:space="preserve">, respectively). Interestingly, timeseries of fish from the CWAK region within the Yukon river-basin contained a less pronounced increase in Sr8786 values before the marine onset (Figure 5b.) </w:t>
-      </w:r>
-      <w:r>
-        <w:rPr>
-          <w:rFonts w:ascii="Garamond" w:hAnsi="Garamond"/>
-          <w:sz w:val="22"/>
-          <w:szCs w:val="22"/>
-        </w:rPr>
-        <w:t xml:space="preserve">Principal component 3 appeared to be driven by values at the very </w:t>
+        <w:t xml:space="preserve">, respectively). Interestingly, timeseries of fish from the CWAK region within the Yukon river-basin contained a less pronounced increase in </w:t>
+      </w:r>
+      <w:r>
+        <w:rPr>
+          <w:rFonts w:ascii="Cambria Math" w:hAnsi="Cambria Math" w:cs="Cambria Math"/>
+          <w:sz w:val="22"/>
+          <w:szCs w:val="22"/>
+        </w:rPr>
+        <w:t>⁸⁷</w:t>
+      </w:r>
+      <w:r>
+        <w:rPr>
+          <w:rFonts w:ascii="Garamond" w:hAnsi="Garamond"/>
+          <w:sz w:val="22"/>
+          <w:szCs w:val="22"/>
+        </w:rPr>
+        <w:t>Sr/</w:t>
+      </w:r>
+      <w:r>
+        <w:rPr>
+          <w:rFonts w:ascii="Cambria Math" w:hAnsi="Cambria Math" w:cs="Cambria Math"/>
+          <w:sz w:val="22"/>
+          <w:szCs w:val="22"/>
+        </w:rPr>
+        <w:t>⁸⁶</w:t>
+      </w:r>
+      <w:r>
+        <w:rPr>
+          <w:rFonts w:ascii="Garamond" w:hAnsi="Garamond"/>
+          <w:sz w:val="22"/>
+          <w:szCs w:val="22"/>
+        </w:rPr>
+        <w:t>Sr</w:t>
+      </w:r>
+      <w:r>
+        <w:rPr>
+          <w:rFonts w:ascii="Garamond" w:hAnsi="Garamond"/>
+          <w:sz w:val="22"/>
+          <w:szCs w:val="22"/>
+        </w:rPr>
+        <w:t xml:space="preserve"> values before the marine onset</w:t>
+      </w:r>
+      <w:r>
+        <w:rPr>
+          <w:rFonts w:ascii="Garamond" w:hAnsi="Garamond"/>
+          <w:sz w:val="22"/>
+          <w:szCs w:val="22"/>
+        </w:rPr>
+        <w:t xml:space="preserve"> </w:t>
+      </w:r>
+      <w:r>
+        <w:rPr>
+          <w:rFonts w:ascii="Garamond" w:hAnsi="Garamond"/>
+          <w:sz w:val="22"/>
+          <w:szCs w:val="22"/>
+        </w:rPr>
+        <w:t xml:space="preserve">(Figure 5b.) </w:t>
+      </w:r>
+      <w:r>
+        <w:rPr>
+          <w:rFonts w:ascii="Garamond" w:hAnsi="Garamond"/>
+          <w:sz w:val="22"/>
+          <w:szCs w:val="22"/>
+        </w:rPr>
+        <w:t>Principal component 3 appear</w:t>
+      </w:r>
+      <w:r>
+        <w:rPr>
+          <w:rFonts w:ascii="Garamond" w:hAnsi="Garamond"/>
+          <w:sz w:val="22"/>
+          <w:szCs w:val="22"/>
+        </w:rPr>
+        <w:t>s</w:t>
+      </w:r>
+      <w:r>
+        <w:rPr>
+          <w:rFonts w:ascii="Garamond" w:hAnsi="Garamond"/>
+          <w:sz w:val="22"/>
+          <w:szCs w:val="22"/>
+        </w:rPr>
+        <w:t xml:space="preserve"> to be driven by </w:t>
       </w:r>
       <w:r>
         <w:rPr>
@@ -4979,7 +5387,55 @@
           <w:szCs w:val="22"/>
         </w:rPr>
         <w:lastRenderedPageBreak/>
-        <w:t>beginning of the timeseries, corresponding to the start of the natal origin signature. The minimal discrimination among watersheds along this component was expected</w:t>
+        <w:t>values at the very beginning of the timeseries</w:t>
+      </w:r>
+      <w:r>
+        <w:rPr>
+          <w:rFonts w:ascii="Garamond" w:hAnsi="Garamond"/>
+          <w:sz w:val="22"/>
+          <w:szCs w:val="22"/>
+        </w:rPr>
+        <w:t xml:space="preserve"> </w:t>
+      </w:r>
+      <w:r>
+        <w:rPr>
+          <w:rFonts w:ascii="Garamond" w:hAnsi="Garamond"/>
+          <w:sz w:val="22"/>
+          <w:szCs w:val="22"/>
+        </w:rPr>
+        <w:t xml:space="preserve">corresponding to the start of the natal origin signature. </w:t>
+      </w:r>
+      <w:r>
+        <w:rPr>
+          <w:rFonts w:ascii="Garamond" w:hAnsi="Garamond"/>
+          <w:sz w:val="22"/>
+          <w:szCs w:val="22"/>
+        </w:rPr>
+        <w:t xml:space="preserve"> as well as some variation in values towards the values just before the mainstem value described above. </w:t>
+      </w:r>
+      <w:r>
+        <w:rPr>
+          <w:rFonts w:ascii="Garamond" w:hAnsi="Garamond"/>
+          <w:sz w:val="22"/>
+          <w:szCs w:val="22"/>
+        </w:rPr>
+        <w:t xml:space="preserve">The minimal discrimination among watersheds along this component </w:t>
+      </w:r>
+      <w:r>
+        <w:rPr>
+          <w:rFonts w:ascii="Garamond" w:hAnsi="Garamond"/>
+          <w:sz w:val="22"/>
+          <w:szCs w:val="22"/>
+        </w:rPr>
+        <w:t>is</w:t>
+      </w:r>
+      <w:r>
+        <w:rPr>
+          <w:rFonts w:ascii="Garamond" w:hAnsi="Garamond"/>
+          <w:sz w:val="22"/>
+          <w:szCs w:val="22"/>
+        </w:rPr>
+        <w:t xml:space="preserve"> expected</w:t>
       </w:r>
       <w:r>
         <w:rPr>
@@ -4989,16 +5445,14 @@
         </w:rPr>
         <w:t xml:space="preserve"> given that all individuals in this </w:t>
       </w:r>
-      <w:proofErr w:type="spellStart"/>
-      <w:r>
-        <w:rPr>
-          <w:rFonts w:ascii="Garamond" w:hAnsi="Garamond"/>
-          <w:sz w:val="22"/>
-          <w:szCs w:val="22"/>
-        </w:rPr>
-        <w:t>subet</w:t>
-      </w:r>
-      <w:proofErr w:type="spellEnd"/>
+      <w:r>
+        <w:rPr>
+          <w:rFonts w:ascii="Garamond" w:hAnsi="Garamond"/>
+          <w:sz w:val="22"/>
+          <w:szCs w:val="22"/>
+        </w:rPr>
+        <w:t>subset</w:t>
+      </w:r>
       <w:r>
         <w:rPr>
           <w:rFonts w:ascii="Garamond" w:hAnsi="Garamond"/>
@@ -5058,110 +5512,6 @@
           <w:szCs w:val="22"/>
         </w:rPr>
       </w:pPr>
-      <w:r>
-        <w:rPr>
-          <w:rFonts w:ascii="Garamond" w:hAnsi="Garamond"/>
-          <w:sz w:val="22"/>
-          <w:szCs w:val="22"/>
-        </w:rPr>
-        <w:t>Accuracy a</w:t>
-      </w:r>
-      <w:r>
-        <w:rPr>
-          <w:rFonts w:ascii="Garamond" w:hAnsi="Garamond"/>
-          <w:sz w:val="22"/>
-          <w:szCs w:val="22"/>
-        </w:rPr>
-        <w:t xml:space="preserve">cross both </w:t>
-      </w:r>
-      <w:r>
-        <w:rPr>
-          <w:rFonts w:ascii="Garamond" w:hAnsi="Garamond"/>
-          <w:sz w:val="22"/>
-          <w:szCs w:val="22"/>
-        </w:rPr>
-        <w:t xml:space="preserve">testing sets ranged from 71.9% to 92.5% and F1-Score values ranged from 72.6% to 92.2%. The </w:t>
-      </w:r>
-      <w:r>
-        <w:rPr>
-          <w:rFonts w:ascii="Garamond" w:hAnsi="Garamond"/>
-          <w:sz w:val="22"/>
-          <w:szCs w:val="22"/>
-        </w:rPr>
-        <w:t xml:space="preserve">accuracy and F1-score achieved by applying the random forest model to the GAM smoothed dataset and tested on the full testing set. Smoothed timeseries data outperformed the raw data in all cases, indicating that the noise in the raw data may inhibited model </w:t>
-      </w:r>
-      <w:r>
-        <w:rPr>
-          <w:rFonts w:ascii="Garamond" w:hAnsi="Garamond"/>
-          <w:sz w:val="22"/>
-          <w:szCs w:val="22"/>
-        </w:rPr>
-        <w:t xml:space="preserve">performance by obscuring meaningful patterns in the data. Among model types KNN consistently preformed the lowest in both accuracy and F1-Score. </w:t>
-      </w:r>
-      <w:r>
-        <w:rPr>
-          <w:rFonts w:ascii="Garamond" w:hAnsi="Garamond"/>
-          <w:sz w:val="22"/>
-          <w:szCs w:val="22"/>
-        </w:rPr>
-        <w:t>In general, RF analysis outperformed both KNN and SVM, however, SVM was the highest performer on Raw datasets (89.8% accuracy on total testing set and 87.0% on overlapping testing set)</w:t>
-      </w:r>
-      <w:r>
-        <w:rPr>
-          <w:rFonts w:ascii="Garamond" w:hAnsi="Garamond"/>
-          <w:sz w:val="22"/>
-          <w:szCs w:val="22"/>
-        </w:rPr>
-        <w:t xml:space="preserve">, which may have more dimensionality due to less autocorrelation among points. </w:t>
-      </w:r>
-      <w:r>
-        <w:rPr>
-          <w:rFonts w:ascii="Garamond" w:hAnsi="Garamond"/>
-          <w:sz w:val="22"/>
-          <w:szCs w:val="22"/>
-        </w:rPr>
-        <w:t>Unsurprisingly, the overlapping training set performance was slightly lower than that of the total training set, with the highest classification accuracy of 90.</w:t>
-      </w:r>
-      <w:r>
-        <w:rPr>
-          <w:rFonts w:ascii="Garamond" w:hAnsi="Garamond"/>
-          <w:sz w:val="22"/>
-          <w:szCs w:val="22"/>
-        </w:rPr>
-        <w:t>9</w:t>
-      </w:r>
-      <w:r>
-        <w:rPr>
-          <w:rFonts w:ascii="Garamond" w:hAnsi="Garamond"/>
-          <w:sz w:val="22"/>
-          <w:szCs w:val="22"/>
-        </w:rPr>
-        <w:t>% as compared to 92.</w:t>
-      </w:r>
-      <w:r>
-        <w:rPr>
-          <w:rFonts w:ascii="Garamond" w:hAnsi="Garamond"/>
-          <w:sz w:val="22"/>
-          <w:szCs w:val="22"/>
-        </w:rPr>
-        <w:t>2</w:t>
-      </w:r>
-      <w:r>
-        <w:rPr>
-          <w:rFonts w:ascii="Garamond" w:hAnsi="Garamond"/>
-          <w:sz w:val="22"/>
-          <w:szCs w:val="22"/>
-        </w:rPr>
-        <w:t xml:space="preserve">%. </w:t>
-      </w:r>
-      <w:r>
-        <w:rPr>
-          <w:rFonts w:ascii="Garamond" w:hAnsi="Garamond"/>
-          <w:sz w:val="22"/>
-          <w:szCs w:val="22"/>
-        </w:rPr>
-        <w:t xml:space="preserve">These results are expected given the relatively straightforward discrimination of highly enriched Yukon samples which were removed in the overlapping comparison.  </w:t>
-      </w:r>
     </w:p>
     <w:p>
       <w:pPr>
@@ -5179,6 +5529,121 @@
           <w:sz w:val="22"/>
           <w:szCs w:val="22"/>
         </w:rPr>
+        <w:t>Accuracy a</w:t>
+      </w:r>
+      <w:r>
+        <w:rPr>
+          <w:rFonts w:ascii="Garamond" w:hAnsi="Garamond"/>
+          <w:sz w:val="22"/>
+          <w:szCs w:val="22"/>
+        </w:rPr>
+        <w:t xml:space="preserve">cross both </w:t>
+      </w:r>
+      <w:r>
+        <w:rPr>
+          <w:rFonts w:ascii="Garamond" w:hAnsi="Garamond"/>
+          <w:sz w:val="22"/>
+          <w:szCs w:val="22"/>
+        </w:rPr>
+        <w:t xml:space="preserve">testing sets ranged from 71.9% to 92.5% and F1-Score values ranged from 72.6% to 92.2%. The </w:t>
+      </w:r>
+      <w:r>
+        <w:rPr>
+          <w:rFonts w:ascii="Garamond" w:hAnsi="Garamond"/>
+          <w:sz w:val="22"/>
+          <w:szCs w:val="22"/>
+        </w:rPr>
+        <w:t xml:space="preserve">accuracy and F1-score achieved by applying the random forest model to the GAM smoothed dataset and tested on the full testing set. Smoothed timeseries data outperformed the raw data in all cases, indicating that the noise in the raw data may inhibited model </w:t>
+      </w:r>
+      <w:r>
+        <w:rPr>
+          <w:rFonts w:ascii="Garamond" w:hAnsi="Garamond"/>
+          <w:sz w:val="22"/>
+          <w:szCs w:val="22"/>
+        </w:rPr>
+        <w:t xml:space="preserve">performance by obscuring meaningful patterns in the data. Among model types KNN consistently preformed the lowest in both accuracy and F1-Score. </w:t>
+      </w:r>
+      <w:r>
+        <w:rPr>
+          <w:rFonts w:ascii="Garamond" w:hAnsi="Garamond"/>
+          <w:sz w:val="22"/>
+          <w:szCs w:val="22"/>
+        </w:rPr>
+        <w:t>In general, RF analysis outperformed both KNN and SVM, however, SVM was the highest performer on Raw datasets (89.8% accuracy on total testing set and 87.0% on overlapping testing set)</w:t>
+      </w:r>
+      <w:r>
+        <w:rPr>
+          <w:rFonts w:ascii="Garamond" w:hAnsi="Garamond"/>
+          <w:sz w:val="22"/>
+          <w:szCs w:val="22"/>
+        </w:rPr>
+        <w:t xml:space="preserve">, which may have more dimensionality due to less autocorrelation among points. </w:t>
+      </w:r>
+      <w:r>
+        <w:rPr>
+          <w:rFonts w:ascii="Garamond" w:hAnsi="Garamond"/>
+          <w:sz w:val="22"/>
+          <w:szCs w:val="22"/>
+        </w:rPr>
+        <w:t>Unsurprisingly, the overlapping training set performance was slightly lower than that of the total training set, with the highest classification accuracy of 90.</w:t>
+      </w:r>
+      <w:r>
+        <w:rPr>
+          <w:rFonts w:ascii="Garamond" w:hAnsi="Garamond"/>
+          <w:sz w:val="22"/>
+          <w:szCs w:val="22"/>
+        </w:rPr>
+        <w:t>9</w:t>
+      </w:r>
+      <w:r>
+        <w:rPr>
+          <w:rFonts w:ascii="Garamond" w:hAnsi="Garamond"/>
+          <w:sz w:val="22"/>
+          <w:szCs w:val="22"/>
+        </w:rPr>
+        <w:t>% as compared to 92.</w:t>
+      </w:r>
+      <w:r>
+        <w:rPr>
+          <w:rFonts w:ascii="Garamond" w:hAnsi="Garamond"/>
+          <w:sz w:val="22"/>
+          <w:szCs w:val="22"/>
+        </w:rPr>
+        <w:t>2</w:t>
+      </w:r>
+      <w:r>
+        <w:rPr>
+          <w:rFonts w:ascii="Garamond" w:hAnsi="Garamond"/>
+          <w:sz w:val="22"/>
+          <w:szCs w:val="22"/>
+        </w:rPr>
+        <w:t xml:space="preserve">%. </w:t>
+      </w:r>
+      <w:r>
+        <w:rPr>
+          <w:rFonts w:ascii="Garamond" w:hAnsi="Garamond"/>
+          <w:sz w:val="22"/>
+          <w:szCs w:val="22"/>
+        </w:rPr>
+        <w:t xml:space="preserve">These results are expected given the relatively straightforward discrimination of highly enriched Yukon samples which were removed in the overlapping comparison.  </w:t>
+      </w:r>
+    </w:p>
+    <w:p>
+      <w:pPr>
+        <w:spacing w:line="480" w:lineRule="auto"/>
+        <w:ind w:firstLine="720"/>
+        <w:rPr>
+          <w:rFonts w:ascii="Garamond" w:hAnsi="Garamond"/>
+          <w:sz w:val="22"/>
+          <w:szCs w:val="22"/>
+        </w:rPr>
+      </w:pPr>
+      <w:r>
+        <w:rPr>
+          <w:rFonts w:ascii="Garamond" w:hAnsi="Garamond"/>
+          <w:sz w:val="22"/>
+          <w:szCs w:val="22"/>
+        </w:rPr>
         <w:t xml:space="preserve">The best preforming model (RF, GAM-smoothed data) displayed some variation in overall accuracy among classes. On the Total testing set 92.0% of Kuskokwim, 91.4% of </w:t>
       </w:r>
       <w:proofErr w:type="spellStart"/>
@@ -5233,7 +5698,63 @@
           <w:sz w:val="22"/>
           <w:szCs w:val="22"/>
         </w:rPr>
-        <w:t xml:space="preserve"> fish). Interestingly, after removing the easiest discernable Yukon fish (Sr8786 &gt;.7150), Yukon classification accuracy dropped to 86.8%. Classification accuracy for </w:t>
+        <w:t xml:space="preserve"> fish). Interestingly, after removing the easiest discernable Yukon fish (</w:t>
+      </w:r>
+      <w:r>
+        <w:rPr>
+          <w:rFonts w:ascii="Cambria Math" w:hAnsi="Cambria Math" w:cs="Cambria Math"/>
+          <w:sz w:val="22"/>
+          <w:szCs w:val="22"/>
+        </w:rPr>
+        <w:t>⁸⁷</w:t>
+      </w:r>
+      <w:r>
+        <w:rPr>
+          <w:rFonts w:ascii="Garamond" w:hAnsi="Garamond"/>
+          <w:sz w:val="22"/>
+          <w:szCs w:val="22"/>
+        </w:rPr>
+        <w:t>Sr/</w:t>
+      </w:r>
+      <w:r>
+        <w:rPr>
+          <w:rFonts w:ascii="Cambria Math" w:hAnsi="Cambria Math" w:cs="Cambria Math"/>
+          <w:sz w:val="22"/>
+          <w:szCs w:val="22"/>
+        </w:rPr>
+        <w:t>⁸⁶</w:t>
+      </w:r>
+      <w:r>
+        <w:rPr>
+          <w:rFonts w:ascii="Garamond" w:hAnsi="Garamond"/>
+          <w:sz w:val="22"/>
+          <w:szCs w:val="22"/>
+        </w:rPr>
+        <w:t>Sr</w:t>
+      </w:r>
+      <w:r>
+        <w:rPr>
+          <w:rFonts w:ascii="Garamond" w:hAnsi="Garamond"/>
+          <w:sz w:val="22"/>
+          <w:szCs w:val="22"/>
+        </w:rPr>
+        <w:t xml:space="preserve"> &gt;</w:t>
+      </w:r>
+      <w:r>
+        <w:rPr>
+          <w:rFonts w:ascii="Garamond" w:hAnsi="Garamond"/>
+          <w:sz w:val="22"/>
+          <w:szCs w:val="22"/>
+        </w:rPr>
+        <w:t xml:space="preserve"> 0</w:t>
+      </w:r>
+      <w:r>
+        <w:rPr>
+          <w:rFonts w:ascii="Garamond" w:hAnsi="Garamond"/>
+          <w:sz w:val="22"/>
+          <w:szCs w:val="22"/>
+        </w:rPr>
+        <w:t xml:space="preserve">.7150), Yukon classification accuracy dropped to 86.8%. Classification accuracy for </w:t>
       </w:r>
       <w:proofErr w:type="spellStart"/>
       <w:r>
@@ -5269,9 +5790,18 @@
           <w:sz w:val="22"/>
           <w:szCs w:val="22"/>
         </w:rPr>
-        <w:t xml:space="preserve"> however this represented only one additional individual misclassified (9 in the total analysis vs 8 in the overlapping analysis). </w:t>
-      </w:r>
-      <w:commentRangeStart w:id="3"/>
+        <w:t xml:space="preserve"> however this </w:t>
+      </w:r>
+      <w:r>
+        <w:rPr>
+          <w:rFonts w:ascii="Garamond" w:hAnsi="Garamond"/>
+          <w:sz w:val="22"/>
+          <w:szCs w:val="22"/>
+        </w:rPr>
+        <w:lastRenderedPageBreak/>
+        <w:t xml:space="preserve">represented only one additional individual misclassified (9 in the total analysis vs 8 in the overlapping analysis). </w:t>
+      </w:r>
+      <w:commentRangeStart w:id="4"/>
       <w:r>
         <w:rPr>
           <w:rFonts w:ascii="Garamond" w:hAnsi="Garamond"/>
@@ -5280,12 +5810,12 @@
         </w:rPr>
         <w:t xml:space="preserve">Among Yukon fish, individuals within the CWAK region (Lower Yukon genetic reporting group, n = 30) were classified with 73.3% accuracy as compared to 97.9% in non CWAK fish. </w:t>
       </w:r>
-      <w:commentRangeEnd w:id="3"/>
+      <w:commentRangeEnd w:id="4"/>
       <w:r>
         <w:rPr>
           <w:rStyle w:val="CommentReference"/>
         </w:rPr>
-        <w:commentReference w:id="3"/>
+        <w:commentReference w:id="4"/>
       </w:r>
     </w:p>
     <w:p>
@@ -5491,23 +6021,47 @@
           <w:sz w:val="22"/>
           <w:szCs w:val="22"/>
         </w:rPr>
-        <w:t xml:space="preserve">Machine learning tools applied to otolith laser ablation timeseries data proved highly effective for classifying Western Alaska Chinook salmon to their rivers of origin. We selected three methods (KNN, RF, and SVM) to represent a spectrum of commonly used machine learning techniques, ranging from the </w:t>
-      </w:r>
-      <w:r>
-        <w:rPr>
-          <w:rFonts w:ascii="Garamond" w:hAnsi="Garamond"/>
-          <w:sz w:val="22"/>
-          <w:szCs w:val="22"/>
-        </w:rPr>
-        <w:t xml:space="preserve">relatively simple KNN to more complex, nonlinear approaches like RF and SVM. Among these, random forest algorithms emerged as particularly powerful and robust, achieving over 90% classification accuracy on </w:t>
-      </w:r>
-      <w:r>
-        <w:rPr>
-          <w:rFonts w:ascii="Garamond" w:hAnsi="Garamond"/>
-          <w:sz w:val="22"/>
-          <w:szCs w:val="22"/>
-        </w:rPr>
         <w:lastRenderedPageBreak/>
+        <w:t>Machine learning tools applied to otolith laser ablation timeseries data proved highly effective for classifying Western Alaska Chinook salmon to their rivers of origin</w:t>
+      </w:r>
+      <w:r>
+        <w:rPr>
+          <w:rFonts w:ascii="Garamond" w:hAnsi="Garamond"/>
+          <w:sz w:val="22"/>
+          <w:szCs w:val="22"/>
+        </w:rPr>
+        <w:t xml:space="preserve"> when trained on a large dataset of known-origin individuals.</w:t>
+      </w:r>
+      <w:r>
+        <w:rPr>
+          <w:rFonts w:ascii="Garamond" w:hAnsi="Garamond"/>
+          <w:sz w:val="22"/>
+          <w:szCs w:val="22"/>
+        </w:rPr>
+        <w:t xml:space="preserve"> We selected three methods (KNN, RF, and SVM) to represent a spectrum of commonly used machine learning techniques, ranging from the </w:t>
+      </w:r>
+      <w:r>
+        <w:rPr>
+          <w:rFonts w:ascii="Garamond" w:hAnsi="Garamond"/>
+          <w:sz w:val="22"/>
+          <w:szCs w:val="22"/>
+        </w:rPr>
+        <w:t xml:space="preserve">relatively simple KNN to more complex, nonlinear approaches like RF and SVM. Among these, random forest algorithms emerged as particularly powerful and robust, achieving over 90% classification accuracy </w:t>
+      </w:r>
+      <w:r>
+        <w:rPr>
+          <w:rFonts w:ascii="Garamond" w:hAnsi="Garamond"/>
+          <w:sz w:val="22"/>
+          <w:szCs w:val="22"/>
+        </w:rPr>
+        <w:t xml:space="preserve">across the </w:t>
+      </w:r>
+      <w:r>
+        <w:rPr>
+          <w:rFonts w:ascii="Garamond" w:hAnsi="Garamond"/>
+          <w:sz w:val="22"/>
+          <w:szCs w:val="22"/>
+        </w:rPr>
         <w:t xml:space="preserve">smoothed datasets. Notably, even our simplest model (KNN) performed well, delivering reasonably high classification accuracy across both testing sets. </w:t>
       </w:r>
       <w:r>
@@ -5516,15 +6070,103 @@
           <w:sz w:val="22"/>
           <w:szCs w:val="22"/>
         </w:rPr>
-        <w:t>Datasets preprocessed with timeseries smoothing techniques significantly outperformed raw laser ablation data. While unsurprising given the inherent noise in otolith LA data, this result demonstrates the added value of incorporating timeseries analysis into otolith datasets. Taken together, these findings highlight the potential for leveraging otolith laser ablation timeseries to characterize fish life history patterns, particularly when paired with statistical techniques capable of handling noisy, multidimensional data</w:t>
-      </w:r>
-      <w:r>
-        <w:rPr>
-          <w:rFonts w:ascii="Garamond" w:hAnsi="Garamond"/>
-          <w:sz w:val="22"/>
-          <w:szCs w:val="22"/>
-        </w:rPr>
-        <w:t xml:space="preserve">. </w:t>
+        <w:t xml:space="preserve">Datasets preprocessed with timeseries smoothing techniques significantly outperformed raw laser ablation data. </w:t>
+      </w:r>
+      <w:r>
+        <w:rPr>
+          <w:rFonts w:ascii="Garamond" w:hAnsi="Garamond"/>
+          <w:sz w:val="22"/>
+          <w:szCs w:val="22"/>
+        </w:rPr>
+        <w:t xml:space="preserve">This is </w:t>
+      </w:r>
+      <w:r>
+        <w:rPr>
+          <w:rFonts w:ascii="Garamond" w:hAnsi="Garamond"/>
+          <w:sz w:val="22"/>
+          <w:szCs w:val="22"/>
+        </w:rPr>
+        <w:t>unsurprising given the inherent noise in otolith LA data</w:t>
+      </w:r>
+      <w:r>
+        <w:rPr>
+          <w:rFonts w:ascii="Garamond" w:hAnsi="Garamond"/>
+          <w:sz w:val="22"/>
+          <w:szCs w:val="22"/>
+        </w:rPr>
+        <w:t>, however,</w:t>
+      </w:r>
+      <w:r>
+        <w:rPr>
+          <w:rFonts w:ascii="Garamond" w:hAnsi="Garamond"/>
+          <w:sz w:val="22"/>
+          <w:szCs w:val="22"/>
+        </w:rPr>
+        <w:t xml:space="preserve"> </w:t>
+      </w:r>
+      <w:r>
+        <w:rPr>
+          <w:rFonts w:ascii="Garamond" w:hAnsi="Garamond"/>
+          <w:sz w:val="22"/>
+          <w:szCs w:val="22"/>
+        </w:rPr>
+        <w:t xml:space="preserve">these results </w:t>
+      </w:r>
+      <w:r>
+        <w:rPr>
+          <w:rFonts w:ascii="Garamond" w:hAnsi="Garamond"/>
+          <w:sz w:val="22"/>
+          <w:szCs w:val="22"/>
+        </w:rPr>
+        <w:t>demonstrate</w:t>
+      </w:r>
+      <w:r>
+        <w:rPr>
+          <w:rFonts w:ascii="Garamond" w:hAnsi="Garamond"/>
+          <w:sz w:val="22"/>
+          <w:szCs w:val="22"/>
+        </w:rPr>
+        <w:t xml:space="preserve"> the added value of </w:t>
+      </w:r>
+      <w:r>
+        <w:rPr>
+          <w:rFonts w:ascii="Garamond" w:hAnsi="Garamond"/>
+          <w:sz w:val="22"/>
+          <w:szCs w:val="22"/>
+        </w:rPr>
+        <w:t>applying</w:t>
+      </w:r>
+      <w:r>
+        <w:rPr>
+          <w:rFonts w:ascii="Garamond" w:hAnsi="Garamond"/>
+          <w:sz w:val="22"/>
+          <w:szCs w:val="22"/>
+        </w:rPr>
+        <w:t xml:space="preserve"> timeseries analysis</w:t>
+      </w:r>
+      <w:r>
+        <w:rPr>
+          <w:rFonts w:ascii="Garamond" w:hAnsi="Garamond"/>
+          <w:sz w:val="22"/>
+          <w:szCs w:val="22"/>
+        </w:rPr>
+        <w:t xml:space="preserve"> techniques to sequentially ordered otolith LA </w:t>
+      </w:r>
+      <w:r>
+        <w:rPr>
+          <w:rFonts w:ascii="Garamond" w:hAnsi="Garamond"/>
+          <w:sz w:val="22"/>
+          <w:szCs w:val="22"/>
+        </w:rPr>
+        <w:t>datasets</w:t>
+      </w:r>
+      <w:r>
+        <w:rPr>
+          <w:rFonts w:ascii="Garamond" w:hAnsi="Garamond"/>
+          <w:sz w:val="22"/>
+          <w:szCs w:val="22"/>
+        </w:rPr>
+        <w:t xml:space="preserve"> and suggests that even greater discriminatory power may be possible through the addition of more complex timeseries analysis techniques. </w:t>
       </w:r>
     </w:p>
     <w:p>
@@ -5543,7 +6185,47 @@
           <w:sz w:val="22"/>
           <w:szCs w:val="22"/>
         </w:rPr>
-        <w:t xml:space="preserve">Our best classification model achieved watershed-specific accuracies exceeding 90% for all three watersheds when tested against the full dataset. Most misclassifications occurred between </w:t>
+        <w:t xml:space="preserve">Among our best model, </w:t>
+      </w:r>
+      <w:r>
+        <w:rPr>
+          <w:rFonts w:ascii="Garamond" w:hAnsi="Garamond"/>
+          <w:sz w:val="22"/>
+          <w:szCs w:val="22"/>
+        </w:rPr>
+        <w:t xml:space="preserve">watershed-specific </w:t>
+      </w:r>
+      <w:r>
+        <w:rPr>
+          <w:rFonts w:ascii="Garamond" w:hAnsi="Garamond"/>
+          <w:sz w:val="22"/>
+          <w:szCs w:val="22"/>
+        </w:rPr>
+        <w:t xml:space="preserve">classification </w:t>
+      </w:r>
+      <w:r>
+        <w:rPr>
+          <w:rFonts w:ascii="Garamond" w:hAnsi="Garamond"/>
+          <w:sz w:val="22"/>
+          <w:szCs w:val="22"/>
+        </w:rPr>
+        <w:t xml:space="preserve">accuracies exceeding 90% for all three watersheds when tested against the full </w:t>
+      </w:r>
+      <w:r>
+        <w:rPr>
+          <w:rFonts w:ascii="Garamond" w:hAnsi="Garamond"/>
+          <w:sz w:val="22"/>
+          <w:szCs w:val="22"/>
+        </w:rPr>
+        <w:t>testing set</w:t>
+      </w:r>
+      <w:r>
+        <w:rPr>
+          <w:rFonts w:ascii="Garamond" w:hAnsi="Garamond"/>
+          <w:sz w:val="22"/>
+          <w:szCs w:val="22"/>
+        </w:rPr>
+        <w:t xml:space="preserve">. Most misclassifications occurred between </w:t>
       </w:r>
       <w:proofErr w:type="spellStart"/>
       <w:r>
@@ -5561,7 +6243,63 @@
           <w:sz w:val="22"/>
           <w:szCs w:val="22"/>
         </w:rPr>
-        <w:t xml:space="preserve"> and Kuskokwim fish, consistent with expectations given the greater overlap in Sr87/86 values and closer spatial proximity between these watersheds. In contrast, Yukon fish exhibited distinct otolith patterns due to the watershed's extreme spatial scale, broader range of isotope values, and extended migration timing. Consequently, very few Yukon individuals were misclassified, with those misidentifications slightly favoring Kuskokwim over </w:t>
+        <w:t xml:space="preserve"> and Kuskokwim fish, consistent with expectations given the greater overlap in </w:t>
+      </w:r>
+      <w:r>
+        <w:rPr>
+          <w:rFonts w:ascii="Cambria Math" w:hAnsi="Cambria Math" w:cs="Cambria Math"/>
+          <w:sz w:val="22"/>
+          <w:szCs w:val="22"/>
+        </w:rPr>
+        <w:t>⁸⁷</w:t>
+      </w:r>
+      <w:r>
+        <w:rPr>
+          <w:rFonts w:ascii="Garamond" w:hAnsi="Garamond"/>
+          <w:sz w:val="22"/>
+          <w:szCs w:val="22"/>
+        </w:rPr>
+        <w:t>Sr/</w:t>
+      </w:r>
+      <w:r>
+        <w:rPr>
+          <w:rFonts w:ascii="Cambria Math" w:hAnsi="Cambria Math" w:cs="Cambria Math"/>
+          <w:sz w:val="22"/>
+          <w:szCs w:val="22"/>
+        </w:rPr>
+        <w:t>⁸⁶</w:t>
+      </w:r>
+      <w:r>
+        <w:rPr>
+          <w:rFonts w:ascii="Garamond" w:hAnsi="Garamond"/>
+          <w:sz w:val="22"/>
+          <w:szCs w:val="22"/>
+        </w:rPr>
+        <w:t>Sr</w:t>
+      </w:r>
+      <w:r>
+        <w:rPr>
+          <w:rFonts w:ascii="Garamond" w:hAnsi="Garamond"/>
+          <w:sz w:val="22"/>
+          <w:szCs w:val="22"/>
+        </w:rPr>
+        <w:t xml:space="preserve"> </w:t>
+      </w:r>
+      <w:r>
+        <w:rPr>
+          <w:rFonts w:ascii="Garamond" w:hAnsi="Garamond"/>
+          <w:sz w:val="22"/>
+          <w:szCs w:val="22"/>
+        </w:rPr>
+        <w:t>values and closer spatial proximity between these watersheds. In contrast, Yukon fish exhibited distinct otolith patterns due to the watershed's extreme spatial scale, broader range of isotope values, and extended migration timing</w:t>
+      </w:r>
+      <w:r>
+        <w:rPr>
+          <w:rFonts w:ascii="Garamond" w:hAnsi="Garamond"/>
+          <w:sz w:val="22"/>
+          <w:szCs w:val="22"/>
+        </w:rPr>
+        <w:t>. This likely resulted in otolith timeseries which were distinct compared distinct compared to the other watersheds either because of distinct natal origin values or prominent features indicating migration through the enriched mainstem tributary (</w:t>
       </w:r>
       <w:proofErr w:type="spellStart"/>
       <w:r>
@@ -5570,6 +6308,145 @@
           <w:sz w:val="22"/>
           <w:szCs w:val="22"/>
         </w:rPr>
+        <w:t>i.e</w:t>
+      </w:r>
+      <w:proofErr w:type="spellEnd"/>
+      <w:r>
+        <w:rPr>
+          <w:rFonts w:ascii="Garamond" w:hAnsi="Garamond"/>
+          <w:sz w:val="22"/>
+          <w:szCs w:val="22"/>
+        </w:rPr>
+        <w:t xml:space="preserve"> Figure 5b, column 3). </w:t>
+      </w:r>
+      <w:r>
+        <w:rPr>
+          <w:rFonts w:ascii="Garamond" w:hAnsi="Garamond"/>
+          <w:sz w:val="22"/>
+          <w:szCs w:val="22"/>
+        </w:rPr>
+        <w:t xml:space="preserve">Yukon classification accuracy dropped substantially in the "overlap" testing set (86.86% vs. 93.7% in the total testing set), despite similar numbers of misidentified individuals. </w:t>
+      </w:r>
+      <w:r>
+        <w:rPr>
+          <w:rFonts w:ascii="Garamond" w:hAnsi="Garamond"/>
+          <w:sz w:val="22"/>
+          <w:szCs w:val="22"/>
+        </w:rPr>
+        <w:t xml:space="preserve">This </w:t>
+      </w:r>
+      <w:r>
+        <w:rPr>
+          <w:rFonts w:ascii="Garamond" w:hAnsi="Garamond"/>
+          <w:sz w:val="22"/>
+          <w:szCs w:val="22"/>
+        </w:rPr>
+        <w:t>decline likely reflects the removal of the most easily classified cases</w:t>
+      </w:r>
+      <w:r>
+        <w:rPr>
+          <w:rFonts w:ascii="Garamond" w:hAnsi="Garamond"/>
+          <w:sz w:val="22"/>
+          <w:szCs w:val="22"/>
+        </w:rPr>
+        <w:t xml:space="preserve">, which is further supported by </w:t>
+      </w:r>
+      <w:r>
+        <w:rPr>
+          <w:rFonts w:ascii="Garamond" w:hAnsi="Garamond"/>
+          <w:sz w:val="22"/>
+          <w:szCs w:val="22"/>
+        </w:rPr>
+        <w:t>supported by higher misclassification rates among CWAK individuals compared to those from the middle and upper Yukon regions</w:t>
+      </w:r>
+      <w:r>
+        <w:rPr>
+          <w:rFonts w:ascii="Garamond" w:hAnsi="Garamond"/>
+          <w:sz w:val="22"/>
+          <w:szCs w:val="22"/>
+        </w:rPr>
+        <w:t xml:space="preserve">. </w:t>
+      </w:r>
+      <w:r>
+        <w:rPr>
+          <w:rFonts w:ascii="Garamond" w:hAnsi="Garamond"/>
+          <w:sz w:val="22"/>
+          <w:szCs w:val="22"/>
+        </w:rPr>
+        <w:t>The</w:t>
+      </w:r>
+      <w:r>
+        <w:rPr>
+          <w:rFonts w:ascii="Garamond" w:hAnsi="Garamond"/>
+          <w:sz w:val="22"/>
+          <w:szCs w:val="22"/>
+        </w:rPr>
+        <w:t xml:space="preserve">se </w:t>
+      </w:r>
+      <w:r>
+        <w:rPr>
+          <w:rFonts w:ascii="Garamond" w:hAnsi="Garamond"/>
+          <w:sz w:val="22"/>
+          <w:szCs w:val="22"/>
+        </w:rPr>
+        <w:t xml:space="preserve">challenges </w:t>
+      </w:r>
+      <w:r>
+        <w:rPr>
+          <w:rFonts w:ascii="Garamond" w:hAnsi="Garamond"/>
+          <w:sz w:val="22"/>
+          <w:szCs w:val="22"/>
+        </w:rPr>
+        <w:t xml:space="preserve">likely stem </w:t>
+      </w:r>
+      <w:r>
+        <w:rPr>
+          <w:rFonts w:ascii="Garamond" w:hAnsi="Garamond"/>
+          <w:sz w:val="22"/>
+          <w:szCs w:val="22"/>
+        </w:rPr>
+        <w:t>from shorter migration patterns that include less residence time in the mainstem Yukon River</w:t>
+      </w:r>
+      <w:r>
+        <w:rPr>
+          <w:rFonts w:ascii="Garamond" w:hAnsi="Garamond"/>
+          <w:sz w:val="22"/>
+          <w:szCs w:val="22"/>
+        </w:rPr>
+        <w:t>, and, subsequently, a</w:t>
+      </w:r>
+      <w:r>
+        <w:rPr>
+          <w:rFonts w:ascii="Garamond" w:hAnsi="Garamond"/>
+          <w:sz w:val="22"/>
+          <w:szCs w:val="22"/>
+        </w:rPr>
+        <w:t xml:space="preserve"> less pronounced increase in isotope values before marine entry</w:t>
+      </w:r>
+      <w:r>
+        <w:rPr>
+          <w:rFonts w:ascii="Garamond" w:hAnsi="Garamond"/>
+          <w:sz w:val="22"/>
+          <w:szCs w:val="22"/>
+        </w:rPr>
+        <w:t xml:space="preserve">. Without this distinguishing feature, CWAK individuals from the Yukon </w:t>
+      </w:r>
+      <w:r>
+        <w:rPr>
+          <w:rFonts w:ascii="Garamond" w:hAnsi="Garamond"/>
+          <w:sz w:val="22"/>
+          <w:szCs w:val="22"/>
+        </w:rPr>
+        <w:lastRenderedPageBreak/>
+        <w:t xml:space="preserve">(i.e. Figure 5b, column 4) are more likely to be misclassified with Kuskokwim or </w:t>
+      </w:r>
+      <w:proofErr w:type="spellStart"/>
+      <w:r>
+        <w:rPr>
+          <w:rFonts w:ascii="Garamond" w:hAnsi="Garamond"/>
+          <w:sz w:val="22"/>
+          <w:szCs w:val="22"/>
+        </w:rPr>
         <w:t>Nushagak</w:t>
       </w:r>
       <w:proofErr w:type="spellEnd"/>
@@ -5579,137 +6456,77 @@
           <w:sz w:val="22"/>
           <w:szCs w:val="22"/>
         </w:rPr>
-        <w:t xml:space="preserve"> due to spatial proximity. </w:t>
-      </w:r>
-      <w:r>
-        <w:rPr>
-          <w:rFonts w:ascii="Garamond" w:hAnsi="Garamond"/>
-          <w:sz w:val="22"/>
-          <w:szCs w:val="22"/>
-        </w:rPr>
-        <w:t>However, Yukon classification accuracy dropped substantially in the "overlap" testing set (86.86% vs. 93.7% in the total testing set), despite similar numbers of misidentified individuals. Since the overlap dataset includes only individuals with natal origins found across all three watersheds, this decline likely reflects the removal of the most easily classified cases. This interpretation is supported by higher misclassification rates among CWAK individuals compared to those from the middle and upper Yukon regions, which contain enriched isotope values absent from the overlap dataset</w:t>
-      </w:r>
-      <w:r>
-        <w:rPr>
-          <w:rFonts w:ascii="Garamond" w:hAnsi="Garamond"/>
-          <w:sz w:val="22"/>
-          <w:szCs w:val="22"/>
-        </w:rPr>
-        <w:t xml:space="preserve">. </w:t>
+        <w:t xml:space="preserve"> fish, resulting in lower overall accuracy. </w:t>
+      </w:r>
+      <w:r>
+        <w:rPr>
+          <w:rFonts w:ascii="Garamond" w:hAnsi="Garamond"/>
+          <w:sz w:val="22"/>
+          <w:szCs w:val="22"/>
+        </w:rPr>
+        <w:t xml:space="preserve">Still, </w:t>
+      </w:r>
+      <w:r>
+        <w:rPr>
+          <w:rFonts w:ascii="Garamond" w:hAnsi="Garamond"/>
+          <w:sz w:val="22"/>
+          <w:szCs w:val="22"/>
+        </w:rPr>
+        <w:t>PCA analysis suggests that other features in the timeseries may also</w:t>
+      </w:r>
+      <w:r>
+        <w:rPr>
+          <w:rFonts w:ascii="Garamond" w:hAnsi="Garamond"/>
+          <w:sz w:val="22"/>
+          <w:szCs w:val="22"/>
+        </w:rPr>
+        <w:t xml:space="preserve"> contribute to </w:t>
+      </w:r>
+      <w:r>
+        <w:rPr>
+          <w:rFonts w:ascii="Garamond" w:hAnsi="Garamond"/>
+          <w:sz w:val="22"/>
+          <w:szCs w:val="22"/>
+        </w:rPr>
+        <w:t xml:space="preserve">the ability to distinguish among watersheds (Figure 5). These small </w:t>
+      </w:r>
+      <w:r>
+        <w:rPr>
+          <w:rFonts w:ascii="Garamond" w:hAnsi="Garamond"/>
+          <w:sz w:val="22"/>
+          <w:szCs w:val="22"/>
+        </w:rPr>
+        <w:t xml:space="preserve">variations may become more readily apparent for classification </w:t>
+      </w:r>
+      <w:r>
+        <w:rPr>
+          <w:rFonts w:ascii="Garamond" w:hAnsi="Garamond"/>
+          <w:sz w:val="22"/>
+          <w:szCs w:val="22"/>
+        </w:rPr>
+        <w:t xml:space="preserve">when used alongside other </w:t>
+      </w:r>
+      <w:r>
+        <w:rPr>
+          <w:rFonts w:ascii="Garamond" w:hAnsi="Garamond"/>
+          <w:sz w:val="22"/>
+          <w:szCs w:val="22"/>
+        </w:rPr>
+        <w:t>timeseries analysis techniques</w:t>
+      </w:r>
+      <w:r>
+        <w:rPr>
+          <w:rFonts w:ascii="Garamond" w:hAnsi="Garamond"/>
+          <w:sz w:val="22"/>
+          <w:szCs w:val="22"/>
+        </w:rPr>
+        <w:t xml:space="preserve"> or by increasing the sample size of Yukon CWAK individuals in the training set. </w:t>
       </w:r>
     </w:p>
     <w:p>
       <w:pPr>
-        <w:spacing w:line="480" w:lineRule="auto"/>
-        <w:ind w:firstLine="720"/>
-        <w:rPr>
-          <w:rFonts w:ascii="Garamond" w:hAnsi="Garamond"/>
-          <w:sz w:val="22"/>
-          <w:szCs w:val="22"/>
-        </w:rPr>
-      </w:pPr>
-      <w:r>
-        <w:rPr>
-          <w:rFonts w:ascii="Garamond" w:hAnsi="Garamond"/>
-          <w:sz w:val="22"/>
-          <w:szCs w:val="22"/>
-        </w:rPr>
-        <w:t>The classification challenges for CWAK individuals may stem from shorter migration patterns that include less residence time in the mainstem Yukon River, which contains elevated Sr87/86 values.</w:t>
-      </w:r>
-      <w:r>
-        <w:rPr>
-          <w:rFonts w:ascii="Garamond" w:hAnsi="Garamond"/>
-          <w:sz w:val="22"/>
-          <w:szCs w:val="22"/>
-        </w:rPr>
-        <w:t xml:space="preserve"> As a result, CWAK individuals contain a much less pronounced increase in isotope values before marine entry</w:t>
-      </w:r>
-      <w:r>
-        <w:rPr>
-          <w:rFonts w:ascii="Garamond" w:hAnsi="Garamond"/>
-          <w:sz w:val="22"/>
-          <w:szCs w:val="22"/>
-        </w:rPr>
-        <w:t>, which appears to be</w:t>
-      </w:r>
-      <w:r>
-        <w:rPr>
-          <w:rFonts w:ascii="Garamond" w:hAnsi="Garamond"/>
-          <w:sz w:val="22"/>
-          <w:szCs w:val="22"/>
-        </w:rPr>
-        <w:t xml:space="preserve"> a distinguishing feature that appears to drive variation </w:t>
-      </w:r>
-      <w:r>
-        <w:rPr>
-          <w:rFonts w:ascii="Garamond" w:hAnsi="Garamond"/>
-          <w:sz w:val="22"/>
-          <w:szCs w:val="22"/>
-        </w:rPr>
-        <w:t>among watershed classes</w:t>
-      </w:r>
-      <w:r>
-        <w:rPr>
-          <w:rFonts w:ascii="Garamond" w:hAnsi="Garamond"/>
-          <w:sz w:val="22"/>
-          <w:szCs w:val="22"/>
-        </w:rPr>
-        <w:t xml:space="preserve"> (Figure X). </w:t>
-      </w:r>
-      <w:r>
-        <w:rPr>
-          <w:rFonts w:ascii="Garamond" w:hAnsi="Garamond"/>
-          <w:sz w:val="22"/>
-          <w:szCs w:val="22"/>
-        </w:rPr>
-        <w:t>This</w:t>
-      </w:r>
-      <w:r>
-        <w:rPr>
-          <w:rFonts w:ascii="Garamond" w:hAnsi="Garamond"/>
-          <w:sz w:val="22"/>
-          <w:szCs w:val="22"/>
-        </w:rPr>
-        <w:t>, c</w:t>
-      </w:r>
-      <w:r>
-        <w:rPr>
-          <w:rFonts w:ascii="Garamond" w:hAnsi="Garamond"/>
-          <w:sz w:val="22"/>
-          <w:szCs w:val="22"/>
-        </w:rPr>
-        <w:t>ombine</w:t>
-      </w:r>
-      <w:r>
-        <w:rPr>
-          <w:rFonts w:ascii="Garamond" w:hAnsi="Garamond"/>
-          <w:sz w:val="22"/>
-          <w:szCs w:val="22"/>
-        </w:rPr>
-        <w:t>d</w:t>
-      </w:r>
-      <w:r>
-        <w:rPr>
-          <w:rFonts w:ascii="Garamond" w:hAnsi="Garamond"/>
-          <w:sz w:val="22"/>
-          <w:szCs w:val="22"/>
-        </w:rPr>
-        <w:t xml:space="preserve"> with a greater overlap in isotope values between CWAK fish, make classification more difficult. Still, secondary features in the otolith data appear to contribute to class separation (Figure X), and </w:t>
-      </w:r>
-      <w:r>
-        <w:rPr>
-          <w:rFonts w:ascii="Garamond" w:hAnsi="Garamond"/>
-          <w:sz w:val="22"/>
-          <w:szCs w:val="22"/>
-        </w:rPr>
-        <w:lastRenderedPageBreak/>
-        <w:t xml:space="preserve">these small variations may become more readily apparent for classification given greater timeseries analysis techniques, data resolution, or increasing sample size. </w:t>
-      </w:r>
-    </w:p>
-    <w:p>
-      <w:pPr>
-        <w:spacing w:line="480" w:lineRule="auto"/>
-        <w:ind w:firstLine="720"/>
+        <w:spacing w:before="100" w:beforeAutospacing="1" w:after="100" w:afterAutospacing="1" w:line="240" w:lineRule="auto"/>
+        <w:outlineLvl w:val="1"/>
         <w:rPr>
           <w:rFonts w:ascii="Garamond" w:hAnsi="Garamond"/>
           <w:sz w:val="22"/>
@@ -5731,11 +6548,7 @@
           <w14:ligatures w14:val="none"/>
         </w:rPr>
       </w:pPr>
-    </w:p>
-    <w:p>
-      <w:pPr>
-        <w:spacing w:before="100" w:beforeAutospacing="1" w:after="100" w:afterAutospacing="1" w:line="240" w:lineRule="auto"/>
-        <w:outlineLvl w:val="1"/>
+      <w:r>
         <w:rPr>
           <w:rFonts w:ascii="Times New Roman" w:eastAsia="Times New Roman" w:hAnsi="Times New Roman" w:cs="Times New Roman"/>
           <w:b/>
@@ -5745,17 +6558,6 @@
           <w:szCs w:val="20"/>
           <w14:ligatures w14:val="none"/>
         </w:rPr>
-      </w:pPr>
-      <w:r>
-        <w:rPr>
-          <w:rFonts w:ascii="Times New Roman" w:eastAsia="Times New Roman" w:hAnsi="Times New Roman" w:cs="Times New Roman"/>
-          <w:b/>
-          <w:bCs/>
-          <w:kern w:val="0"/>
-          <w:sz w:val="20"/>
-          <w:szCs w:val="20"/>
-          <w14:ligatures w14:val="none"/>
-        </w:rPr>
         <w:t>Implications for Stock Assessment and Management</w:t>
       </w:r>
     </w:p>
@@ -5764,9 +6566,99 @@
         <w:pStyle w:val="whitespace-normal"/>
         <w:spacing w:line="480" w:lineRule="auto"/>
         <w:ind w:firstLine="720"/>
-      </w:pPr>
-      <w:r>
-        <w:t>A tool to estimate provenance of marine-caught Chinook salmon in Western Alaska has the potential to expand assessment of important hypotheses regarding declining salmon health and better incorporate river-specific management efforts into intercept-based marine fisheries. Given the ongoing crisis of declining population health, these methods may also help understand the differential impact of stressors across stocks and communities in the region.</w:t>
+        <w:rPr>
+          <w:rFonts w:ascii="Garamond" w:hAnsi="Garamond"/>
+          <w:sz w:val="22"/>
+          <w:szCs w:val="22"/>
+        </w:rPr>
+      </w:pPr>
+      <w:r>
+        <w:rPr>
+          <w:rFonts w:ascii="Garamond" w:hAnsi="Garamond"/>
+        </w:rPr>
+        <w:t xml:space="preserve">A tool to estimate provenance of marine-caught Chinook salmon in Western Alaska has the potential to expand assessment </w:t>
+      </w:r>
+      <w:r>
+        <w:rPr>
+          <w:rFonts w:ascii="Garamond" w:hAnsi="Garamond"/>
+        </w:rPr>
+        <w:t xml:space="preserve">of hypotheses of declining population health by allowing for an explicit assessment of marine mortality on stock specific health. </w:t>
+      </w:r>
+      <w:r>
+        <w:rPr>
+          <w:rFonts w:ascii="Garamond" w:hAnsi="Garamond"/>
+        </w:rPr>
+        <w:t xml:space="preserve">The models presented here provide an immediately available tool </w:t>
+      </w:r>
+      <w:r>
+        <w:rPr>
+          <w:rFonts w:ascii="Garamond" w:hAnsi="Garamond"/>
+        </w:rPr>
+        <w:t xml:space="preserve">that can be used alongside </w:t>
+      </w:r>
+      <w:r>
+        <w:rPr>
+          <w:rFonts w:ascii="Garamond" w:hAnsi="Garamond"/>
+        </w:rPr>
+        <w:t>otolith LA-ICPMS data</w:t>
+      </w:r>
+      <w:r>
+        <w:rPr>
+          <w:rFonts w:ascii="Garamond" w:hAnsi="Garamond"/>
+        </w:rPr>
+        <w:t xml:space="preserve">. Because of the size of this dataset and the temporal scale of sampling efforts, we expect that this model will perform well on new datasets despite shifting patterns of habitat use throughout the basin which may alter the shape of otolith timeseries data. </w:t>
+      </w:r>
+      <w:r>
+        <w:rPr>
+          <w:rFonts w:ascii="Garamond" w:hAnsi="Garamond"/>
+        </w:rPr>
+        <w:t>In addition, the methods presented here provide quantifiable confidence values which can be directly used by managers to make decisions based on changing thresholds of misassignment risk, offering a practical framework for incorporating uncertainty into management decisions.</w:t>
+      </w:r>
+      <w:r>
+        <w:rPr>
+          <w:rFonts w:ascii="Garamond" w:hAnsi="Garamond"/>
+        </w:rPr>
+        <w:t xml:space="preserve"> Even with extremely high confidence threshold values, our model achieved between ~70% and ~85% accuracy for all classes. The exception to this is the Yukon classification on the “Total” testing set, in which distinct </w:t>
+      </w:r>
+      <w:r>
+        <w:rPr>
+          <w:rFonts w:ascii="Cambria Math" w:hAnsi="Cambria Math" w:cs="Cambria Math"/>
+          <w:sz w:val="22"/>
+          <w:szCs w:val="22"/>
+        </w:rPr>
+        <w:t>⁸⁷</w:t>
+      </w:r>
+      <w:r>
+        <w:rPr>
+          <w:rFonts w:ascii="Garamond" w:hAnsi="Garamond"/>
+          <w:sz w:val="22"/>
+          <w:szCs w:val="22"/>
+        </w:rPr>
+        <w:t>Sr/</w:t>
+      </w:r>
+      <w:r>
+        <w:rPr>
+          <w:rFonts w:ascii="Cambria Math" w:hAnsi="Cambria Math" w:cs="Cambria Math"/>
+          <w:sz w:val="22"/>
+          <w:szCs w:val="22"/>
+        </w:rPr>
+        <w:t>⁸⁶</w:t>
+      </w:r>
+      <w:r>
+        <w:rPr>
+          <w:rFonts w:ascii="Garamond" w:hAnsi="Garamond"/>
+          <w:sz w:val="22"/>
+          <w:szCs w:val="22"/>
+        </w:rPr>
+        <w:t>Sr</w:t>
+      </w:r>
+      <w:r>
+        <w:rPr>
+          <w:rFonts w:ascii="Garamond" w:hAnsi="Garamond"/>
+          <w:sz w:val="22"/>
+          <w:szCs w:val="22"/>
+        </w:rPr>
+        <w:t xml:space="preserve"> values in the Yukon buoy correct classification with extremely high confidence values. </w:t>
       </w:r>
     </w:p>
     <w:p>
@@ -5774,60 +6666,44 @@
         <w:pStyle w:val="whitespace-normal"/>
         <w:spacing w:line="480" w:lineRule="auto"/>
         <w:ind w:firstLine="720"/>
-      </w:pPr>
-      <w:r>
-        <w:t>The models presented here provide an immediately available tool for estimating provenance from otolith LA-ICPMS data of adult or juvenile marine-caught Chinook salmon. These models were developed from one of the largest datasets of its kind, including samples spanning several years across all three major river basins.</w:t>
-      </w:r>
-      <w:r>
-        <w:t xml:space="preserve"> However, these models can continue to be improved on through additional sampling efforts, application of additional timeseries analysis tools, or through application of other machine or deep learning approaches. </w:t>
-      </w:r>
-    </w:p>
-    <w:p>
-      <w:pPr>
-        <w:pStyle w:val="whitespace-normal"/>
-        <w:spacing w:line="480" w:lineRule="auto"/>
-        <w:rPr>
-          <w:rFonts w:ascii="Garamond" w:hAnsi="Garamond"/>
-        </w:rPr>
-      </w:pPr>
-      <w:r>
-        <w:rPr>
-          <w:rFonts w:ascii="Garamond" w:hAnsi="Garamond"/>
-        </w:rPr>
-        <w:t>This library of information can continue to be built upon and improved through the addition of new samples, new analytical techniques, or through the combination of powerful timeseries analysis tools not addressed here. In addition, the methods presented here provide quantifiable confidence values which can be directly used by managers to make decisions based on changing thresholds of misassignment risk, offering a practical framework for incorporating uncertainty into management decisions.</w:t>
-      </w:r>
-    </w:p>
-    <w:p>
-      <w:pPr>
-        <w:pStyle w:val="whitespace-normal"/>
-        <w:spacing w:line="480" w:lineRule="auto"/>
-        <w:ind w:firstLine="720"/>
-        <w:rPr>
-          <w:rFonts w:ascii="Garamond" w:hAnsi="Garamond"/>
-        </w:rPr>
-      </w:pPr>
-      <w:r>
-        <w:rPr>
-          <w:rFonts w:ascii="Garamond" w:hAnsi="Garamond"/>
+        <w:rPr>
+          <w:rFonts w:ascii="Garamond" w:hAnsi="Garamond"/>
+          <w:sz w:val="22"/>
+          <w:szCs w:val="22"/>
+        </w:rPr>
+      </w:pPr>
+      <w:r>
+        <w:rPr>
+          <w:rFonts w:ascii="Garamond" w:hAnsi="Garamond"/>
+          <w:sz w:val="22"/>
+          <w:szCs w:val="22"/>
+        </w:rPr>
+        <w:t xml:space="preserve">Although the methods presented here advance the ability to discriminate among rivers for Western Alaska Chinook salmon, they remain limited for in-season management or rapid research applications. Otolith LA-ICPMS is costly and labor-intensive, making large-scale, real-time assessment of river origin for marine-caught samples impractical. Moreover, otolith collection is lethal, which may be prohibitive given the </w:t>
+      </w:r>
+      <w:r>
+        <w:rPr>
+          <w:rFonts w:ascii="Garamond" w:hAnsi="Garamond"/>
+          <w:sz w:val="22"/>
+          <w:szCs w:val="22"/>
         </w:rPr>
         <w:lastRenderedPageBreak/>
-        <w:t>These methods are not without limitations. They are expensive and have a slow turnaround time, meaning they cannot be used for in-season management, which would be a powerful application of river-specific provenance estimates. Sampling otoliths is lethal, meaning they may not be able to be collected in large numbers for stocks or species of concern, particularly as population health continues to decline.</w:t>
-      </w:r>
-    </w:p>
-    <w:p>
-      <w:pPr>
-        <w:pStyle w:val="whitespace-normal"/>
-        <w:spacing w:line="480" w:lineRule="auto"/>
-        <w:ind w:firstLine="720"/>
-        <w:rPr>
-          <w:rFonts w:ascii="Garamond" w:hAnsi="Garamond"/>
-        </w:rPr>
-      </w:pPr>
-      <w:r>
-        <w:rPr>
-          <w:rFonts w:ascii="Garamond" w:hAnsi="Garamond"/>
-        </w:rPr>
-        <w:t>In addition, this model is specifically built for Chinook salmon and leverages the strength of a large existing dataset. Similar datasets do not exist for other species of concern, for example chum salmon, limiting broader application. These species may not contain the spatial resolution of multiple environments given their uniquely short life history. However, there may be some patterns in the limited data that would make this approach appropriate for future exploration.</w:t>
+        <w:t>increasingly endangered status of Chinook salmon in this region.</w:t>
+      </w:r>
+      <w:r>
+        <w:rPr>
+          <w:rFonts w:ascii="Garamond" w:hAnsi="Garamond"/>
+          <w:sz w:val="22"/>
+          <w:szCs w:val="22"/>
+        </w:rPr>
+        <w:t xml:space="preserve"> </w:t>
+      </w:r>
+      <w:r>
+        <w:rPr>
+          <w:rFonts w:ascii="Garamond" w:hAnsi="Garamond"/>
+          <w:sz w:val="22"/>
+          <w:szCs w:val="22"/>
+        </w:rPr>
+        <w:t>The model also relies on a large existing dataset with known river-of-origin labels derived from unique sampling efforts, a resource not available for most other species of concern. For example, comparable datasets do not exist for chum salmon, constraining the broader application of these methods across species.</w:t>
       </w:r>
     </w:p>
     <w:p>
@@ -5836,51 +6712,148 @@
         <w:ind w:firstLine="720"/>
         <w:outlineLvl w:val="1"/>
         <w:rPr>
-          <w:rFonts w:ascii="Garamond" w:eastAsia="Times New Roman" w:hAnsi="Garamond" w:cs="Times New Roman"/>
-          <w:b/>
-          <w:bCs/>
-          <w:kern w:val="0"/>
-          <w:sz w:val="20"/>
-          <w:szCs w:val="20"/>
-          <w14:ligatures w14:val="none"/>
-        </w:rPr>
-      </w:pPr>
-      <w:r>
-        <w:rPr>
-          <w:rFonts w:ascii="Garamond" w:hAnsi="Garamond"/>
-        </w:rPr>
-        <w:t xml:space="preserve">This work addresses the fundamental challenge of achieving adequate spatial resolution for ecosystem monitoring and management in remote, complex systems, particularly as global change accelerates and stakeholder needs intensify. By enabling stock-specific assessments of marine-caught salmon, these methods bridge the critical gap between broad population-level monitoring—which can mask local threats and stock-specific declines—and the fine-scale processes that drive ecosystem health. As climate change continues to alter marine and freshwater environments at unprecedented rates, and as fishing pressures and subsistence needs create competing demands on declining salmon resources, tools that can detect subtle, population-specific responses across spatial scales become increasingly essential. The machine learning framework developed here demonstrates how methodological innovation can unlock information hidden within existing datasets, potentially transforming our capacity to understand and manage ecological systems under mounting environmental and social pressures. Ultimately, such approaches offer pathways toward more </w:t>
-      </w:r>
-      <w:r>
-        <w:rPr>
-          <w:rFonts w:ascii="Garamond" w:hAnsi="Garamond"/>
-        </w:rPr>
-        <w:lastRenderedPageBreak/>
-        <w:t>spatially explicit management that can better balance conservation goals with the subsistence and commercial needs of communities whose livelihoods depend on these critical resources</w:t>
+          <w:rFonts w:ascii="Garamond" w:hAnsi="Garamond"/>
+          <w:sz w:val="22"/>
+          <w:szCs w:val="22"/>
+        </w:rPr>
+      </w:pPr>
+      <w:r>
+        <w:rPr>
+          <w:rFonts w:ascii="Garamond" w:hAnsi="Garamond"/>
+          <w:sz w:val="22"/>
+          <w:szCs w:val="22"/>
+        </w:rPr>
+        <w:t xml:space="preserve">Cutting edge statistical tools such as machine learning models provide an opportunity to uncover new insights in ecological datasets that may be critical for management or conservation </w:t>
+      </w:r>
+      <w:proofErr w:type="spellStart"/>
+      <w:r>
+        <w:rPr>
+          <w:rFonts w:ascii="Garamond" w:hAnsi="Garamond"/>
+          <w:sz w:val="22"/>
+          <w:szCs w:val="22"/>
+        </w:rPr>
+        <w:t xml:space="preserve">efforts. </w:t>
+      </w:r>
+      <w:proofErr w:type="spellEnd"/>
+      <w:r>
+        <w:rPr>
+          <w:rFonts w:ascii="Garamond" w:hAnsi="Garamond"/>
+          <w:sz w:val="22"/>
+          <w:szCs w:val="22"/>
+        </w:rPr>
+        <w:t>In this case, e</w:t>
+      </w:r>
+      <w:r>
+        <w:rPr>
+          <w:rFonts w:ascii="Garamond" w:hAnsi="Garamond"/>
+          <w:sz w:val="22"/>
+          <w:szCs w:val="22"/>
+        </w:rPr>
+        <w:t xml:space="preserve">nabling river-basin scale determination of provenance for marine-caught Chinook </w:t>
+      </w:r>
+      <w:r>
+        <w:rPr>
+          <w:rFonts w:ascii="Garamond" w:hAnsi="Garamond"/>
+          <w:sz w:val="22"/>
+          <w:szCs w:val="22"/>
+        </w:rPr>
+        <w:t>salmon allows</w:t>
+      </w:r>
+      <w:r>
+        <w:rPr>
+          <w:rFonts w:ascii="Garamond" w:hAnsi="Garamond"/>
+          <w:sz w:val="22"/>
+          <w:szCs w:val="22"/>
+        </w:rPr>
+        <w:t xml:space="preserve"> managers to connect region-wide </w:t>
+      </w:r>
+      <w:r>
+        <w:rPr>
+          <w:rFonts w:ascii="Garamond" w:hAnsi="Garamond"/>
+          <w:sz w:val="22"/>
+          <w:szCs w:val="22"/>
+        </w:rPr>
+        <w:t xml:space="preserve">salmon population </w:t>
+      </w:r>
+      <w:r>
+        <w:rPr>
+          <w:rFonts w:ascii="Garamond" w:hAnsi="Garamond"/>
+          <w:sz w:val="22"/>
+          <w:szCs w:val="22"/>
+        </w:rPr>
+        <w:t>patterns with</w:t>
+      </w:r>
+      <w:r>
+        <w:rPr>
+          <w:rFonts w:ascii="Garamond" w:hAnsi="Garamond"/>
+          <w:sz w:val="22"/>
+          <w:szCs w:val="22"/>
+        </w:rPr>
+        <w:t xml:space="preserve"> river-specific population health. In doing so, </w:t>
+      </w:r>
+      <w:r>
+        <w:rPr>
+          <w:rFonts w:ascii="Garamond" w:hAnsi="Garamond"/>
+          <w:sz w:val="22"/>
+          <w:szCs w:val="22"/>
+        </w:rPr>
+        <w:t xml:space="preserve">researchers </w:t>
+      </w:r>
+      <w:r>
+        <w:rPr>
+          <w:rFonts w:ascii="Garamond" w:hAnsi="Garamond"/>
+          <w:sz w:val="22"/>
+          <w:szCs w:val="22"/>
+        </w:rPr>
+        <w:t xml:space="preserve">may </w:t>
+      </w:r>
+      <w:r>
+        <w:rPr>
+          <w:rFonts w:ascii="Garamond" w:hAnsi="Garamond"/>
+          <w:sz w:val="22"/>
+          <w:szCs w:val="22"/>
+        </w:rPr>
+        <w:t xml:space="preserve">better understand </w:t>
+      </w:r>
+      <w:r>
+        <w:rPr>
+          <w:rFonts w:ascii="Garamond" w:hAnsi="Garamond"/>
+          <w:sz w:val="22"/>
+          <w:szCs w:val="22"/>
+        </w:rPr>
+        <w:t xml:space="preserve">how ecosystem processes at several spatial scales and across ecosystems are interconnected to informing overall ecosystem health. </w:t>
+      </w:r>
+      <w:r>
+        <w:rPr>
+          <w:rFonts w:ascii="Garamond" w:hAnsi="Garamond"/>
+          <w:sz w:val="22"/>
+          <w:szCs w:val="22"/>
+        </w:rPr>
+        <w:t xml:space="preserve">Developing this knowledge of ecosystem function </w:t>
+      </w:r>
+      <w:r>
+        <w:rPr>
+          <w:rFonts w:ascii="Garamond" w:hAnsi="Garamond"/>
+          <w:sz w:val="22"/>
+          <w:szCs w:val="22"/>
+        </w:rPr>
+        <w:t xml:space="preserve">across scales </w:t>
+      </w:r>
+      <w:r>
+        <w:rPr>
+          <w:rFonts w:ascii="Garamond" w:hAnsi="Garamond"/>
+          <w:sz w:val="22"/>
+          <w:szCs w:val="22"/>
+        </w:rPr>
+        <w:t>is essential for informing management and conservation strategies that sustain the services provided by healthy, functioning ecosystems.</w:t>
       </w:r>
     </w:p>
     <w:p>
       <w:pPr>
-        <w:spacing w:before="100" w:beforeAutospacing="1" w:after="100" w:afterAutospacing="1" w:line="240" w:lineRule="auto"/>
+        <w:spacing w:before="100" w:beforeAutospacing="1" w:after="100" w:afterAutospacing="1" w:line="480" w:lineRule="auto"/>
         <w:outlineLvl w:val="1"/>
         <w:rPr>
-          <w:rFonts w:ascii="Times New Roman" w:eastAsia="Times New Roman" w:hAnsi="Times New Roman" w:cs="Times New Roman"/>
-          <w:b/>
-          <w:bCs/>
-          <w:kern w:val="0"/>
-          <w:sz w:val="20"/>
-          <w:szCs w:val="20"/>
-          <w14:ligatures w14:val="none"/>
-        </w:rPr>
-      </w:pPr>
-    </w:p>
-    <w:p/>
-    <w:p>
-      <w:pPr>
-        <w:rPr>
-          <w:rFonts w:ascii="Garamond" w:hAnsi="Garamond"/>
-          <w:sz w:val="20"/>
-          <w:szCs w:val="20"/>
+          <w:rFonts w:ascii="Garamond" w:hAnsi="Garamond"/>
         </w:rPr>
       </w:pPr>
     </w:p>
@@ -5949,7 +6922,24 @@
       </w:r>
     </w:p>
   </w:comment>
-  <w:comment w:id="3" w:author="Benjamin J. Makhlouf" w:date="2025-09-02T10:22:00Z" w:initials="b">
+  <w:comment w:id="3" w:author="Benjamin J. Makhlouf" w:date="2025-09-06T17:57:00Z" w:initials="b">
+    <w:p>
+      <w:r>
+        <w:rPr>
+          <w:rStyle w:val="CommentReference"/>
+        </w:rPr>
+        <w:annotationRef/>
+      </w:r>
+      <w:r>
+        <w:rPr>
+          <w:sz w:val="20"/>
+          <w:szCs w:val="20"/>
+        </w:rPr>
+        <w:t xml:space="preserve">Thoughts on whether to just use an average, or show the range. </w:t>
+      </w:r>
+    </w:p>
+  </w:comment>
+  <w:comment w:id="4" w:author="Benjamin J. Makhlouf" w:date="2025-09-02T10:22:00Z" w:initials="b">
     <w:p>
       <w:r>
         <w:rPr>
@@ -5974,6 +6964,7 @@
   <w15:commentEx w15:paraId="678C87C1" w15:done="0"/>
   <w15:commentEx w15:paraId="51CBD6D1" w15:done="0"/>
   <w15:commentEx w15:paraId="4E3434D0" w15:done="0"/>
+  <w15:commentEx w15:paraId="7EA423C7" w15:done="0"/>
   <w15:commentEx w15:paraId="16C43ACC" w15:done="0"/>
 </w15:commentsEx>
 </file>
@@ -5983,6 +6974,7 @@
   <w16cex:commentExtensible w16cex:durableId="79E2A6E3" w16cex:dateUtc="2025-09-06T23:49:00Z"/>
   <w16cex:commentExtensible w16cex:durableId="6197010A" w16cex:dateUtc="2025-08-18T18:18:00Z"/>
   <w16cex:commentExtensible w16cex:durableId="208C7FE7" w16cex:dateUtc="2025-09-02T16:56:00Z"/>
+  <w16cex:commentExtensible w16cex:durableId="7BF59F8C" w16cex:dateUtc="2025-09-07T00:57:00Z"/>
   <w16cex:commentExtensible w16cex:durableId="3FDF2CD4" w16cex:dateUtc="2025-09-02T17:22:00Z"/>
 </w16cex:commentsExtensible>
 </file>
@@ -5992,6 +6984,7 @@
   <w16cid:commentId w16cid:paraId="678C87C1" w16cid:durableId="79E2A6E3"/>
   <w16cid:commentId w16cid:paraId="51CBD6D1" w16cid:durableId="6197010A"/>
   <w16cid:commentId w16cid:paraId="4E3434D0" w16cid:durableId="208C7FE7"/>
+  <w16cid:commentId w16cid:paraId="7EA423C7" w16cid:durableId="7BF59F8C"/>
   <w16cid:commentId w16cid:paraId="16C43ACC" w16cid:durableId="3FDF2CD4"/>
 </w16cid:commentsIds>
 </file>

</xml_diff>

<commit_message>
sent to valentina and Daniel for feedback
</commit_message>
<xml_diff>
--- a/Docs/Machine learning applied to otolith timeseries data to discriminate river of origin for Western Alaska Salmon.docx
+++ b/Docs/Machine learning applied to otolith timeseries data to discriminate river of origin for Western Alaska Salmon.docx
@@ -5814,21 +5814,31 @@
         <w:lastRenderedPageBreak/>
         <w:t xml:space="preserve">represented only one additional individual misclassified (9 in the total analysis vs 8 in the overlapping analysis). </w:t>
       </w:r>
-      <w:commentRangeStart w:id="4"/>
-      <w:r>
-        <w:rPr>
-          <w:rFonts w:ascii="Garamond" w:hAnsi="Garamond"/>
-          <w:sz w:val="22"/>
-          <w:szCs w:val="22"/>
-        </w:rPr>
-        <w:t xml:space="preserve">Among Yukon fish, individuals within the CWAK region (Lower Yukon genetic reporting group, n = 30) were classified with 73.3% accuracy as compared to 97.9% in non CWAK fish. </w:t>
-      </w:r>
-      <w:commentRangeEnd w:id="4"/>
-      <w:r>
-        <w:rPr>
-          <w:rStyle w:val="CommentReference"/>
-        </w:rPr>
-        <w:commentReference w:id="4"/>
+      <w:r>
+        <w:rPr>
+          <w:rFonts w:ascii="Garamond" w:hAnsi="Garamond"/>
+          <w:sz w:val="22"/>
+          <w:szCs w:val="22"/>
+        </w:rPr>
+        <w:t xml:space="preserve">Classification accuracy within the CWAK reporting group, which includes the Kuskokwim, </w:t>
+      </w:r>
+      <w:proofErr w:type="spellStart"/>
+      <w:r>
+        <w:rPr>
+          <w:rFonts w:ascii="Garamond" w:hAnsi="Garamond"/>
+          <w:sz w:val="22"/>
+          <w:szCs w:val="22"/>
+        </w:rPr>
+        <w:t>Nushagak</w:t>
+      </w:r>
+      <w:proofErr w:type="spellEnd"/>
+      <w:r>
+        <w:rPr>
+          <w:rFonts w:ascii="Garamond" w:hAnsi="Garamond"/>
+          <w:sz w:val="22"/>
+          <w:szCs w:val="22"/>
+        </w:rPr>
+        <w:t xml:space="preserve">, and Lower Yukon regions was 90.0%. Classification accuracy for regions in our dataset not within CWAK was 97.9%. Yukon classification accuracy for those within the CWAK group fell to 73.3%. However, it should be noted that the sample size of CWAK Yukon individuals was significantly lower than other groups ( n = 29 ) , resulting in a more pronounced impact to class- specific accuracy from misassignment to relatively few individuals. </w:t>
       </w:r>
     </w:p>
     <w:p>
@@ -6034,7 +6044,6 @@
           <w:sz w:val="22"/>
           <w:szCs w:val="22"/>
         </w:rPr>
-        <w:lastRenderedPageBreak/>
         <w:t>Machine learning tools applied to otolith laser ablation timeseries data proved highly effective for classifying Western Alaska Chinook salmon to their rivers of origin</w:t>
       </w:r>
       <w:r>
@@ -6370,7 +6379,16 @@
           <w:sz w:val="22"/>
           <w:szCs w:val="22"/>
         </w:rPr>
-        <w:t>supported by higher misclassification rates among CWAK individuals compared to those from the middle and upper Yukon regions</w:t>
+        <w:t xml:space="preserve">supported by higher misclassification rates among CWAK individuals compared to those from </w:t>
+      </w:r>
+      <w:r>
+        <w:rPr>
+          <w:rFonts w:ascii="Garamond" w:hAnsi="Garamond"/>
+          <w:sz w:val="22"/>
+          <w:szCs w:val="22"/>
+        </w:rPr>
+        <w:lastRenderedPageBreak/>
+        <w:t>the middle and upper Yukon regions</w:t>
       </w:r>
       <w:r>
         <w:rPr>
@@ -6442,16 +6460,7 @@
           <w:sz w:val="22"/>
           <w:szCs w:val="22"/>
         </w:rPr>
-        <w:t xml:space="preserve">. Without this distinguishing feature, CWAK individuals from the Yukon </w:t>
-      </w:r>
-      <w:r>
-        <w:rPr>
-          <w:rFonts w:ascii="Garamond" w:hAnsi="Garamond"/>
-          <w:sz w:val="22"/>
-          <w:szCs w:val="22"/>
-        </w:rPr>
-        <w:lastRenderedPageBreak/>
-        <w:t xml:space="preserve">(i.e. Figure 5b, column 4) are more likely to be misclassified with Kuskokwim or </w:t>
+        <w:t xml:space="preserve">. Without this distinguishing feature, CWAK individuals from the Yukon (i.e. Figure 5b, column 4) are more likely to be misclassified with Kuskokwim or </w:t>
       </w:r>
       <w:proofErr w:type="spellStart"/>
       <w:r>
@@ -6691,16 +6700,8 @@
           <w:sz w:val="22"/>
           <w:szCs w:val="22"/>
         </w:rPr>
-        <w:t xml:space="preserve">Although the methods presented here advance the ability to discriminate among rivers for Western Alaska Chinook salmon, they remain limited for in-season management or rapid research applications. Otolith LA-ICPMS is costly and labor-intensive, making large-scale, real-time assessment of river origin for marine-caught samples impractical. Moreover, otolith collection is lethal, which may be prohibitive given the </w:t>
-      </w:r>
-      <w:r>
-        <w:rPr>
-          <w:rFonts w:ascii="Garamond" w:hAnsi="Garamond"/>
-          <w:sz w:val="22"/>
-          <w:szCs w:val="22"/>
-        </w:rPr>
         <w:lastRenderedPageBreak/>
-        <w:t>increasingly endangered status of Chinook salmon in this region.</w:t>
+        <w:t>Although the methods presented here advance the ability to discriminate among rivers for Western Alaska Chinook salmon, they remain limited for in-season management or rapid research applications. Otolith LA-ICPMS is costly and labor-intensive, making large-scale, real-time assessment of river origin for marine-caught samples impractical. Moreover, otolith collection is lethal, which may be prohibitive given the increasingly endangered status of Chinook salmon in this region.</w:t>
       </w:r>
       <w:r>
         <w:rPr>
@@ -6934,23 +6935,6 @@
       </w:r>
     </w:p>
   </w:comment>
-  <w:comment w:id="4" w:author="Benjamin J. Makhlouf" w:date="2025-09-02T10:22:00Z" w:initials="b">
-    <w:p>
-      <w:r>
-        <w:rPr>
-          <w:rStyle w:val="CommentReference"/>
-        </w:rPr>
-        <w:annotationRef/>
-      </w:r>
-      <w:r>
-        <w:rPr>
-          <w:sz w:val="20"/>
-          <w:szCs w:val="20"/>
-        </w:rPr>
-        <w:t>Will do a full CWAK (All watersheds) vs non</w:t>
-      </w:r>
-    </w:p>
-  </w:comment>
 </w:comments>
 </file>
 
@@ -6960,7 +6944,6 @@
   <w15:commentEx w15:paraId="51CBD6D1" w15:done="0"/>
   <w15:commentEx w15:paraId="4E3434D0" w15:done="0"/>
   <w15:commentEx w15:paraId="7EA423C7" w15:done="0"/>
-  <w15:commentEx w15:paraId="16C43ACC" w15:done="0"/>
 </w15:commentsEx>
 </file>
 
@@ -6970,7 +6953,6 @@
   <w16cex:commentExtensible w16cex:durableId="6197010A" w16cex:dateUtc="2025-08-18T18:18:00Z"/>
   <w16cex:commentExtensible w16cex:durableId="208C7FE7" w16cex:dateUtc="2025-09-02T16:56:00Z"/>
   <w16cex:commentExtensible w16cex:durableId="7BF59F8C" w16cex:dateUtc="2025-09-07T00:57:00Z"/>
-  <w16cex:commentExtensible w16cex:durableId="3FDF2CD4" w16cex:dateUtc="2025-09-02T17:22:00Z"/>
 </w16cex:commentsExtensible>
 </file>
 
@@ -6980,7 +6962,6 @@
   <w16cid:commentId w16cid:paraId="51CBD6D1" w16cid:durableId="6197010A"/>
   <w16cid:commentId w16cid:paraId="4E3434D0" w16cid:durableId="208C7FE7"/>
   <w16cid:commentId w16cid:paraId="7EA423C7" w16cid:durableId="7BF59F8C"/>
-  <w16cid:commentId w16cid:paraId="16C43ACC" w16cid:durableId="3FDF2CD4"/>
 </w16cid:commentsIds>
 </file>
 

</xml_diff>

<commit_message>
updated format and sending to Daniel
</commit_message>
<xml_diff>
--- a/Docs/Machine learning applied to otolith timeseries data to discriminate river of origin for Western Alaska Salmon.docx
+++ b/Docs/Machine learning applied to otolith timeseries data to discriminate river of origin for Western Alaska Salmon.docx
@@ -5915,7 +5915,12 @@
           <w:szCs w:val="22"/>
         </w:rPr>
       </w:pPr>
-      <w:r>
+    </w:p>
+    <w:p>
+      <w:pPr>
+        <w:tabs>
+          <w:tab w:val="left" w:pos="3088"/>
+        </w:tabs>
         <w:rPr>
           <w:rFonts w:ascii="Garamond" w:hAnsi="Garamond"/>
           <w:b/>
@@ -5923,6 +5928,15 @@
           <w:sz w:val="22"/>
           <w:szCs w:val="22"/>
         </w:rPr>
+      </w:pPr>
+      <w:r>
+        <w:rPr>
+          <w:rFonts w:ascii="Garamond" w:hAnsi="Garamond"/>
+          <w:b/>
+          <w:bCs/>
+          <w:sz w:val="22"/>
+          <w:szCs w:val="22"/>
+        </w:rPr>
         <w:t xml:space="preserve">Model Performance </w:t>
       </w:r>
     </w:p>
@@ -5936,6 +5950,126 @@
           <w:szCs w:val="22"/>
         </w:rPr>
       </w:pPr>
+      <w:r>
+        <w:rPr>
+          <w:rFonts w:ascii="Garamond" w:hAnsi="Garamond"/>
+          <w:sz w:val="22"/>
+          <w:szCs w:val="22"/>
+        </w:rPr>
+        <w:t>Accuracy a</w:t>
+      </w:r>
+      <w:r>
+        <w:rPr>
+          <w:rFonts w:ascii="Garamond" w:hAnsi="Garamond"/>
+          <w:sz w:val="22"/>
+          <w:szCs w:val="22"/>
+        </w:rPr>
+        <w:t xml:space="preserve">cross both </w:t>
+      </w:r>
+      <w:r>
+        <w:rPr>
+          <w:rFonts w:ascii="Garamond" w:hAnsi="Garamond"/>
+          <w:sz w:val="22"/>
+          <w:szCs w:val="22"/>
+        </w:rPr>
+        <w:t xml:space="preserve">testing sets ranged from 71.9% to 92.5% and F1-Score values ranged from 72.6% to 92.2%. The </w:t>
+      </w:r>
+      <w:r>
+        <w:rPr>
+          <w:rFonts w:ascii="Garamond" w:hAnsi="Garamond"/>
+          <w:sz w:val="22"/>
+          <w:szCs w:val="22"/>
+        </w:rPr>
+        <w:t>accuracy and F1-score achieved by applying the random forest model to the GAM smoothed dataset and tested on the full testing set. Smoothed timeseries data outperformed the raw data in all cases, indicating that the noise in the raw data ma</w:t>
+      </w:r>
+      <w:r>
+        <w:rPr>
+          <w:rFonts w:ascii="Garamond" w:hAnsi="Garamond"/>
+          <w:sz w:val="22"/>
+          <w:szCs w:val="22"/>
+        </w:rPr>
+        <w:t>y have</w:t>
+      </w:r>
+      <w:r>
+        <w:rPr>
+          <w:rFonts w:ascii="Garamond" w:hAnsi="Garamond"/>
+          <w:sz w:val="22"/>
+          <w:szCs w:val="22"/>
+        </w:rPr>
+        <w:t xml:space="preserve"> inhibited model </w:t>
+      </w:r>
+      <w:r>
+        <w:rPr>
+          <w:rFonts w:ascii="Garamond" w:hAnsi="Garamond"/>
+          <w:sz w:val="22"/>
+          <w:szCs w:val="22"/>
+        </w:rPr>
+        <w:t xml:space="preserve">performance by obscuring meaningful patterns in the data. Among model types KNN consistently preformed the lowest in both accuracy and F1-Score. </w:t>
+      </w:r>
+      <w:r>
+        <w:rPr>
+          <w:rFonts w:ascii="Garamond" w:hAnsi="Garamond"/>
+          <w:sz w:val="22"/>
+          <w:szCs w:val="22"/>
+        </w:rPr>
+        <w:t>In general, RF analysis outperformed both KNN and SVM, however, SVM was the highest performer on Raw datasets (89.8% accuracy on total testing set and 87.0% on overlapping testing set)</w:t>
+      </w:r>
+      <w:r>
+        <w:rPr>
+          <w:rFonts w:ascii="Garamond" w:hAnsi="Garamond"/>
+          <w:sz w:val="22"/>
+          <w:szCs w:val="22"/>
+        </w:rPr>
+        <w:t xml:space="preserve">, which may have more dimensionality due to less autocorrelation among points. </w:t>
+      </w:r>
+      <w:r>
+        <w:rPr>
+          <w:rFonts w:ascii="Garamond" w:hAnsi="Garamond"/>
+          <w:sz w:val="22"/>
+          <w:szCs w:val="22"/>
+        </w:rPr>
+        <w:t>Unsurprisingly, the overlapping training set performance was slightly lower than that of the total training set, with the highest classification accuracy of 90.</w:t>
+      </w:r>
+      <w:r>
+        <w:rPr>
+          <w:rFonts w:ascii="Garamond" w:hAnsi="Garamond"/>
+          <w:sz w:val="22"/>
+          <w:szCs w:val="22"/>
+        </w:rPr>
+        <w:t>9</w:t>
+      </w:r>
+      <w:r>
+        <w:rPr>
+          <w:rFonts w:ascii="Garamond" w:hAnsi="Garamond"/>
+          <w:sz w:val="22"/>
+          <w:szCs w:val="22"/>
+        </w:rPr>
+        <w:t>% as compared to 92.</w:t>
+      </w:r>
+      <w:r>
+        <w:rPr>
+          <w:rFonts w:ascii="Garamond" w:hAnsi="Garamond"/>
+          <w:sz w:val="22"/>
+          <w:szCs w:val="22"/>
+        </w:rPr>
+        <w:t>2</w:t>
+      </w:r>
+      <w:r>
+        <w:rPr>
+          <w:rFonts w:ascii="Garamond" w:hAnsi="Garamond"/>
+          <w:sz w:val="22"/>
+          <w:szCs w:val="22"/>
+        </w:rPr>
+        <w:t xml:space="preserve">%. </w:t>
+      </w:r>
+      <w:r>
+        <w:rPr>
+          <w:rFonts w:ascii="Garamond" w:hAnsi="Garamond"/>
+          <w:sz w:val="22"/>
+          <w:szCs w:val="22"/>
+        </w:rPr>
+        <w:t xml:space="preserve">These results are expected given the relatively straightforward discrimination of highly enriched Yukon samples which were removed in the overlapping comparison.  </w:t>
+      </w:r>
     </w:p>
     <w:p>
       <w:pPr>
@@ -5953,137 +6087,6 @@
           <w:sz w:val="22"/>
           <w:szCs w:val="22"/>
         </w:rPr>
-        <w:t>Accuracy a</w:t>
-      </w:r>
-      <w:r>
-        <w:rPr>
-          <w:rFonts w:ascii="Garamond" w:hAnsi="Garamond"/>
-          <w:sz w:val="22"/>
-          <w:szCs w:val="22"/>
-        </w:rPr>
-        <w:t xml:space="preserve">cross both </w:t>
-      </w:r>
-      <w:r>
-        <w:rPr>
-          <w:rFonts w:ascii="Garamond" w:hAnsi="Garamond"/>
-          <w:sz w:val="22"/>
-          <w:szCs w:val="22"/>
-        </w:rPr>
-        <w:t xml:space="preserve">testing sets ranged from 71.9% to 92.5% and F1-Score values ranged from 72.6% to 92.2%. The </w:t>
-      </w:r>
-      <w:r>
-        <w:rPr>
-          <w:rFonts w:ascii="Garamond" w:hAnsi="Garamond"/>
-          <w:sz w:val="22"/>
-          <w:szCs w:val="22"/>
-        </w:rPr>
-        <w:t>accuracy and F1-score achieved by applying the random forest model to the GAM smoothed dataset and tested on the full testing set. Smoothed timeseries data outperformed the raw data in all cases, indicating that the noise in the raw data ma</w:t>
-      </w:r>
-      <w:r>
-        <w:rPr>
-          <w:rFonts w:ascii="Garamond" w:hAnsi="Garamond"/>
-          <w:sz w:val="22"/>
-          <w:szCs w:val="22"/>
-        </w:rPr>
-        <w:t>y have</w:t>
-      </w:r>
-      <w:r>
-        <w:rPr>
-          <w:rFonts w:ascii="Garamond" w:hAnsi="Garamond"/>
-          <w:sz w:val="22"/>
-          <w:szCs w:val="22"/>
-        </w:rPr>
-        <w:t xml:space="preserve"> inhibited model </w:t>
-      </w:r>
-      <w:r>
-        <w:rPr>
-          <w:rFonts w:ascii="Garamond" w:hAnsi="Garamond"/>
-          <w:sz w:val="22"/>
-          <w:szCs w:val="22"/>
-        </w:rPr>
-        <w:t xml:space="preserve">performance by obscuring meaningful patterns in the data. Among model types KNN consistently preformed the lowest in both accuracy and F1-Score. </w:t>
-      </w:r>
-      <w:r>
-        <w:rPr>
-          <w:rFonts w:ascii="Garamond" w:hAnsi="Garamond"/>
-          <w:sz w:val="22"/>
-          <w:szCs w:val="22"/>
-        </w:rPr>
-        <w:t>In general, RF analysis outperformed both KNN and SVM, however, SVM was the highest performer on Raw datasets (89.8% accuracy on total testing set and 87.0% on overlapping testing set)</w:t>
-      </w:r>
-      <w:r>
-        <w:rPr>
-          <w:rFonts w:ascii="Garamond" w:hAnsi="Garamond"/>
-          <w:sz w:val="22"/>
-          <w:szCs w:val="22"/>
-        </w:rPr>
-        <w:t xml:space="preserve">, which may have more dimensionality due to less autocorrelation among points. </w:t>
-      </w:r>
-      <w:r>
-        <w:rPr>
-          <w:rFonts w:ascii="Garamond" w:hAnsi="Garamond"/>
-          <w:sz w:val="22"/>
-          <w:szCs w:val="22"/>
-        </w:rPr>
-        <w:t>Unsurprisingly, the overlapping training set performance was slightly lower than that of the total training set, with the highest classification accuracy of 90.</w:t>
-      </w:r>
-      <w:r>
-        <w:rPr>
-          <w:rFonts w:ascii="Garamond" w:hAnsi="Garamond"/>
-          <w:sz w:val="22"/>
-          <w:szCs w:val="22"/>
-        </w:rPr>
-        <w:t>9</w:t>
-      </w:r>
-      <w:r>
-        <w:rPr>
-          <w:rFonts w:ascii="Garamond" w:hAnsi="Garamond"/>
-          <w:sz w:val="22"/>
-          <w:szCs w:val="22"/>
-        </w:rPr>
-        <w:t>% as compared to 92.</w:t>
-      </w:r>
-      <w:r>
-        <w:rPr>
-          <w:rFonts w:ascii="Garamond" w:hAnsi="Garamond"/>
-          <w:sz w:val="22"/>
-          <w:szCs w:val="22"/>
-        </w:rPr>
-        <w:t>2</w:t>
-      </w:r>
-      <w:r>
-        <w:rPr>
-          <w:rFonts w:ascii="Garamond" w:hAnsi="Garamond"/>
-          <w:sz w:val="22"/>
-          <w:szCs w:val="22"/>
-        </w:rPr>
-        <w:t xml:space="preserve">%. </w:t>
-      </w:r>
-      <w:r>
-        <w:rPr>
-          <w:rFonts w:ascii="Garamond" w:hAnsi="Garamond"/>
-          <w:sz w:val="22"/>
-          <w:szCs w:val="22"/>
-        </w:rPr>
-        <w:t xml:space="preserve">These results are expected given the relatively straightforward discrimination of highly enriched Yukon samples which were removed in the overlapping comparison.  </w:t>
-      </w:r>
-    </w:p>
-    <w:p>
-      <w:pPr>
-        <w:spacing w:line="480" w:lineRule="auto"/>
-        <w:ind w:firstLine="720"/>
-        <w:rPr>
-          <w:rFonts w:ascii="Garamond" w:hAnsi="Garamond"/>
-          <w:sz w:val="22"/>
-          <w:szCs w:val="22"/>
-        </w:rPr>
-      </w:pPr>
-      <w:r>
-        <w:rPr>
-          <w:rFonts w:ascii="Garamond" w:hAnsi="Garamond"/>
-          <w:sz w:val="22"/>
-          <w:szCs w:val="22"/>
-        </w:rPr>
         <w:t xml:space="preserve">The best preforming model (RF, GAM-smoothed data) displayed some variation in overall accuracy among classes. On the Total testing set 92.0% of Kuskokwim, 91.4% of </w:t>
       </w:r>
       <w:proofErr w:type="spellStart"/>
@@ -6212,7 +6215,25 @@
           <w:sz w:val="22"/>
           <w:szCs w:val="22"/>
         </w:rPr>
-        <w:t xml:space="preserve"> fish did not change (91.4%) whereas Kuskokwim saw a slight increase to 92.5%. In this testing set the most frequent </w:t>
+        <w:t xml:space="preserve"> fish did not change (91.4%) whereas Kuskokwim saw a slight increase to 92.5%. In this testing set the most frequent misclassification was Yukon fish predicted to have been Kuskokwim (8.8% of Yukon fish</w:t>
+      </w:r>
+      <w:proofErr w:type="gramStart"/>
+      <w:r>
+        <w:rPr>
+          <w:rFonts w:ascii="Garamond" w:hAnsi="Garamond"/>
+          <w:sz w:val="22"/>
+          <w:szCs w:val="22"/>
+        </w:rPr>
+        <w:t>),</w:t>
+      </w:r>
+      <w:proofErr w:type="gramEnd"/>
+      <w:r>
+        <w:rPr>
+          <w:rFonts w:ascii="Garamond" w:hAnsi="Garamond"/>
+          <w:sz w:val="22"/>
+          <w:szCs w:val="22"/>
+        </w:rPr>
+        <w:t xml:space="preserve"> however this </w:t>
       </w:r>
       <w:r>
         <w:rPr>
@@ -6221,25 +6242,7 @@
           <w:szCs w:val="22"/>
         </w:rPr>
         <w:lastRenderedPageBreak/>
-        <w:t>misclassification was Yukon fish predicted to have been Kuskokwim (8.8% of Yukon fish</w:t>
-      </w:r>
-      <w:proofErr w:type="gramStart"/>
-      <w:r>
-        <w:rPr>
-          <w:rFonts w:ascii="Garamond" w:hAnsi="Garamond"/>
-          <w:sz w:val="22"/>
-          <w:szCs w:val="22"/>
-        </w:rPr>
-        <w:t>),</w:t>
-      </w:r>
-      <w:proofErr w:type="gramEnd"/>
-      <w:r>
-        <w:rPr>
-          <w:rFonts w:ascii="Garamond" w:hAnsi="Garamond"/>
-          <w:sz w:val="22"/>
-          <w:szCs w:val="22"/>
-        </w:rPr>
-        <w:t xml:space="preserve"> however this represented only one additional individual misclassified (9 in the total analysis vs 8 in the overlapping analysis). </w:t>
+        <w:t xml:space="preserve">represented only one additional individual misclassified (9 in the total analysis vs 8 in the overlapping analysis). </w:t>
       </w:r>
       <w:r>
         <w:rPr>
@@ -6984,7 +6987,55 @@
           <w:sz w:val="22"/>
           <w:szCs w:val="22"/>
         </w:rPr>
-        <w:t xml:space="preserve">higher misclassification rates among CWAK individuals compared to </w:t>
+        <w:t>higher misclassification rates among CWAK individuals compared to those from the middle and upper Yukon regions</w:t>
+      </w:r>
+      <w:r>
+        <w:rPr>
+          <w:rFonts w:ascii="Garamond" w:hAnsi="Garamond"/>
+          <w:sz w:val="22"/>
+          <w:szCs w:val="22"/>
+        </w:rPr>
+        <w:t xml:space="preserve">. </w:t>
+      </w:r>
+      <w:r>
+        <w:rPr>
+          <w:rFonts w:ascii="Garamond" w:hAnsi="Garamond"/>
+          <w:sz w:val="22"/>
+          <w:szCs w:val="22"/>
+        </w:rPr>
+        <w:t>The</w:t>
+      </w:r>
+      <w:r>
+        <w:rPr>
+          <w:rFonts w:ascii="Garamond" w:hAnsi="Garamond"/>
+          <w:sz w:val="22"/>
+          <w:szCs w:val="22"/>
+        </w:rPr>
+        <w:t xml:space="preserve">se </w:t>
+      </w:r>
+      <w:r>
+        <w:rPr>
+          <w:rFonts w:ascii="Garamond" w:hAnsi="Garamond"/>
+          <w:sz w:val="22"/>
+          <w:szCs w:val="22"/>
+        </w:rPr>
+        <w:t xml:space="preserve">challenges </w:t>
+      </w:r>
+      <w:r>
+        <w:rPr>
+          <w:rFonts w:ascii="Garamond" w:hAnsi="Garamond"/>
+          <w:sz w:val="22"/>
+          <w:szCs w:val="22"/>
+        </w:rPr>
+        <w:t xml:space="preserve">likely stem </w:t>
+      </w:r>
+      <w:r>
+        <w:rPr>
+          <w:rFonts w:ascii="Garamond" w:hAnsi="Garamond"/>
+          <w:sz w:val="22"/>
+          <w:szCs w:val="22"/>
+        </w:rPr>
+        <w:t xml:space="preserve">from shorter migration </w:t>
       </w:r>
       <w:r>
         <w:rPr>
@@ -6993,55 +7044,7 @@
           <w:szCs w:val="22"/>
         </w:rPr>
         <w:lastRenderedPageBreak/>
-        <w:t>those from the middle and upper Yukon regions</w:t>
-      </w:r>
-      <w:r>
-        <w:rPr>
-          <w:rFonts w:ascii="Garamond" w:hAnsi="Garamond"/>
-          <w:sz w:val="22"/>
-          <w:szCs w:val="22"/>
-        </w:rPr>
-        <w:t xml:space="preserve">. </w:t>
-      </w:r>
-      <w:r>
-        <w:rPr>
-          <w:rFonts w:ascii="Garamond" w:hAnsi="Garamond"/>
-          <w:sz w:val="22"/>
-          <w:szCs w:val="22"/>
-        </w:rPr>
-        <w:t>The</w:t>
-      </w:r>
-      <w:r>
-        <w:rPr>
-          <w:rFonts w:ascii="Garamond" w:hAnsi="Garamond"/>
-          <w:sz w:val="22"/>
-          <w:szCs w:val="22"/>
-        </w:rPr>
-        <w:t xml:space="preserve">se </w:t>
-      </w:r>
-      <w:r>
-        <w:rPr>
-          <w:rFonts w:ascii="Garamond" w:hAnsi="Garamond"/>
-          <w:sz w:val="22"/>
-          <w:szCs w:val="22"/>
-        </w:rPr>
-        <w:t xml:space="preserve">challenges </w:t>
-      </w:r>
-      <w:r>
-        <w:rPr>
-          <w:rFonts w:ascii="Garamond" w:hAnsi="Garamond"/>
-          <w:sz w:val="22"/>
-          <w:szCs w:val="22"/>
-        </w:rPr>
-        <w:t xml:space="preserve">likely stem </w:t>
-      </w:r>
-      <w:r>
-        <w:rPr>
-          <w:rFonts w:ascii="Garamond" w:hAnsi="Garamond"/>
-          <w:sz w:val="22"/>
-          <w:szCs w:val="22"/>
-        </w:rPr>
-        <w:t>from shorter migration patterns that include less residence time in the mainstem Yukon River</w:t>
+        <w:t>patterns that include less residence time in the mainstem Yukon River</w:t>
       </w:r>
       <w:r>
         <w:rPr>
@@ -7182,23 +7185,19 @@
         <w:spacing w:before="100" w:beforeAutospacing="1" w:after="100" w:afterAutospacing="1" w:line="240" w:lineRule="auto"/>
         <w:outlineLvl w:val="1"/>
         <w:rPr>
-          <w:rFonts w:ascii="Times New Roman" w:eastAsia="Times New Roman" w:hAnsi="Times New Roman" w:cs="Times New Roman"/>
+          <w:rFonts w:ascii="Garamond" w:eastAsia="Times New Roman" w:hAnsi="Garamond" w:cs="Times New Roman"/>
           <w:b/>
           <w:bCs/>
           <w:kern w:val="0"/>
-          <w:sz w:val="20"/>
-          <w:szCs w:val="20"/>
           <w14:ligatures w14:val="none"/>
         </w:rPr>
       </w:pPr>
       <w:r>
         <w:rPr>
-          <w:rFonts w:ascii="Times New Roman" w:eastAsia="Times New Roman" w:hAnsi="Times New Roman" w:cs="Times New Roman"/>
+          <w:rFonts w:ascii="Garamond" w:eastAsia="Times New Roman" w:hAnsi="Garamond" w:cs="Times New Roman"/>
           <w:b/>
           <w:bCs/>
           <w:kern w:val="0"/>
-          <w:sz w:val="20"/>
-          <w:szCs w:val="20"/>
           <w14:ligatures w14:val="none"/>
         </w:rPr>
         <w:t>Implications for Stock Assessment and Management</w:t>
@@ -7211,107 +7210,135 @@
         <w:ind w:firstLine="720"/>
         <w:rPr>
           <w:rFonts w:ascii="Garamond" w:hAnsi="Garamond"/>
-        </w:rPr>
-      </w:pPr>
-      <w:r>
-        <w:rPr>
-          <w:rFonts w:ascii="Garamond" w:hAnsi="Garamond"/>
+          <w:sz w:val="22"/>
+          <w:szCs w:val="22"/>
+        </w:rPr>
+      </w:pPr>
+      <w:r>
+        <w:rPr>
+          <w:rFonts w:ascii="Garamond" w:hAnsi="Garamond"/>
+          <w:sz w:val="22"/>
+          <w:szCs w:val="22"/>
         </w:rPr>
         <w:t xml:space="preserve">A tool to estimate provenance of marine-caught Chinook salmon in Western Alaska has the potential to expand assessment </w:t>
       </w:r>
       <w:r>
         <w:rPr>
           <w:rFonts w:ascii="Garamond" w:hAnsi="Garamond"/>
+          <w:sz w:val="22"/>
+          <w:szCs w:val="22"/>
         </w:rPr>
         <w:t xml:space="preserve">of hypotheses of declining population health by allowing for an explicit assessment of marine mortality on stock specific health. </w:t>
       </w:r>
       <w:r>
         <w:rPr>
           <w:rFonts w:ascii="Garamond" w:hAnsi="Garamond"/>
+          <w:sz w:val="22"/>
+          <w:szCs w:val="22"/>
         </w:rPr>
         <w:t xml:space="preserve">The </w:t>
       </w:r>
       <w:r>
         <w:rPr>
           <w:rFonts w:ascii="Garamond" w:hAnsi="Garamond"/>
+          <w:sz w:val="22"/>
+          <w:szCs w:val="22"/>
         </w:rPr>
         <w:t xml:space="preserve">workflow </w:t>
       </w:r>
       <w:r>
         <w:rPr>
           <w:rFonts w:ascii="Garamond" w:hAnsi="Garamond"/>
+          <w:sz w:val="22"/>
+          <w:szCs w:val="22"/>
         </w:rPr>
         <w:t xml:space="preserve">presented </w:t>
       </w:r>
       <w:r>
         <w:rPr>
           <w:rFonts w:ascii="Garamond" w:hAnsi="Garamond"/>
-        </w:rPr>
-        <w:t xml:space="preserve">illustrates </w:t>
-      </w:r>
-      <w:r>
-        <w:rPr>
-          <w:rFonts w:ascii="Garamond" w:hAnsi="Garamond"/>
-        </w:rPr>
-        <w:t>an</w:t>
-      </w:r>
-      <w:r>
-        <w:rPr>
-          <w:rFonts w:ascii="Garamond" w:hAnsi="Garamond"/>
+          <w:sz w:val="22"/>
+          <w:szCs w:val="22"/>
+        </w:rPr>
+        <w:t>illustrates an</w:t>
+      </w:r>
+      <w:r>
+        <w:rPr>
+          <w:rFonts w:ascii="Garamond" w:hAnsi="Garamond"/>
+          <w:sz w:val="22"/>
+          <w:szCs w:val="22"/>
         </w:rPr>
         <w:t xml:space="preserve"> </w:t>
       </w:r>
       <w:r>
         <w:rPr>
           <w:rFonts w:ascii="Garamond" w:hAnsi="Garamond"/>
+          <w:sz w:val="22"/>
+          <w:szCs w:val="22"/>
         </w:rPr>
         <w:t xml:space="preserve">approach </w:t>
       </w:r>
       <w:r>
         <w:rPr>
           <w:rFonts w:ascii="Garamond" w:hAnsi="Garamond"/>
+          <w:sz w:val="22"/>
+          <w:szCs w:val="22"/>
         </w:rPr>
         <w:t xml:space="preserve">that can be used alongside </w:t>
       </w:r>
       <w:r>
         <w:rPr>
           <w:rFonts w:ascii="Garamond" w:hAnsi="Garamond"/>
+          <w:sz w:val="22"/>
+          <w:szCs w:val="22"/>
         </w:rPr>
         <w:t>otolith LA-ICPMS data</w:t>
       </w:r>
       <w:r>
         <w:rPr>
           <w:rFonts w:ascii="Garamond" w:hAnsi="Garamond"/>
+          <w:sz w:val="22"/>
+          <w:szCs w:val="22"/>
         </w:rPr>
         <w:t xml:space="preserve"> to provide probabilistic estimates of provenance, and calibrated models presented here may be immediately useful for classifying adult Chinook salmon from western Alaska watershed. </w:t>
       </w:r>
       <w:r>
         <w:rPr>
           <w:rFonts w:ascii="Garamond" w:hAnsi="Garamond"/>
+          <w:sz w:val="22"/>
+          <w:szCs w:val="22"/>
         </w:rPr>
         <w:t>Because of the size of this dataset and the temporal scale of sampling efforts, we expect that th</w:t>
       </w:r>
       <w:r>
         <w:rPr>
           <w:rFonts w:ascii="Garamond" w:hAnsi="Garamond"/>
+          <w:sz w:val="22"/>
+          <w:szCs w:val="22"/>
         </w:rPr>
         <w:t>e library of otolith data included in this model includes variability among years that will allow it to perform well on new data</w:t>
       </w:r>
       <w:r>
         <w:rPr>
           <w:rFonts w:ascii="Garamond" w:hAnsi="Garamond"/>
+          <w:sz w:val="22"/>
+          <w:szCs w:val="22"/>
         </w:rPr>
         <w:t>sets</w:t>
       </w:r>
       <w:r>
         <w:rPr>
           <w:rFonts w:ascii="Garamond" w:hAnsi="Garamond"/>
+          <w:sz w:val="22"/>
+          <w:szCs w:val="22"/>
         </w:rPr>
         <w:t xml:space="preserve">. However, because we opted not to include a true validation set given sample-size constraints, there remains the potential that performance on a new year may be lower due to overfitting to our dataset. In addition, because these data include only the juvenile freshwater residence </w:t>
       </w:r>
       <w:r>
         <w:rPr>
           <w:rFonts w:ascii="Garamond" w:hAnsi="Garamond"/>
+          <w:sz w:val="22"/>
+          <w:szCs w:val="22"/>
         </w:rPr>
         <w:t xml:space="preserve">period, we expect that this model can be applied to juvenile chinook salmon expected to be from western Alaska watersheds. However, this assumption should be tested using known-origin individuals before large scale implementation. </w:t>
       </w:r>
@@ -7323,20 +7350,34 @@
         <w:ind w:firstLine="720"/>
         <w:rPr>
           <w:rFonts w:ascii="Garamond" w:hAnsi="Garamond"/>
-        </w:rPr>
-      </w:pPr>
-      <w:r>
-        <w:rPr>
-          <w:rFonts w:ascii="Garamond" w:hAnsi="Garamond"/>
+          <w:sz w:val="22"/>
+          <w:szCs w:val="22"/>
+        </w:rPr>
+      </w:pPr>
+      <w:r>
+        <w:rPr>
+          <w:rFonts w:ascii="Garamond" w:hAnsi="Garamond"/>
+          <w:sz w:val="22"/>
+          <w:szCs w:val="22"/>
+        </w:rPr>
+        <w:t>In addition, the methods presented here provide quantifiable confidence values which can be directly used by managers to make decisions based on changing thresholds of misassignment risk, offering a practical framework for incorporating uncertainty into management decisions.</w:t>
+      </w:r>
+      <w:r>
+        <w:rPr>
+          <w:rFonts w:ascii="Garamond" w:hAnsi="Garamond"/>
+          <w:sz w:val="22"/>
+          <w:szCs w:val="22"/>
+        </w:rPr>
+        <w:t xml:space="preserve"> Even with extremely high confidence threshold values, our model achieved between ~70% and ~85% accuracy for all classes. The exception to this </w:t>
+      </w:r>
+      <w:r>
+        <w:rPr>
+          <w:rFonts w:ascii="Garamond" w:hAnsi="Garamond"/>
+          <w:sz w:val="22"/>
+          <w:szCs w:val="22"/>
         </w:rPr>
         <w:lastRenderedPageBreak/>
-        <w:t>In addition, the methods presented here provide quantifiable confidence values which can be directly used by managers to make decisions based on changing thresholds of misassignment risk, offering a practical framework for incorporating uncertainty into management decisions.</w:t>
-      </w:r>
-      <w:r>
-        <w:rPr>
-          <w:rFonts w:ascii="Garamond" w:hAnsi="Garamond"/>
-        </w:rPr>
-        <w:t xml:space="preserve"> Even with extremely high confidence threshold values, our model achieved between ~70% and ~85% accuracy for all classes. The exception to this is the Yukon classification on the “Total” testing set, in which distinct </w:t>
+        <w:t xml:space="preserve">is the Yukon classification on the “Total” testing set, in which distinct </w:t>
       </w:r>
       <w:r>
         <w:rPr>
@@ -7368,15 +7409,7 @@
           <w:sz w:val="22"/>
           <w:szCs w:val="22"/>
         </w:rPr>
-        <w:t>Sr</w:t>
-      </w:r>
-      <w:r>
-        <w:rPr>
-          <w:rFonts w:ascii="Garamond" w:hAnsi="Garamond"/>
-          <w:sz w:val="22"/>
-          <w:szCs w:val="22"/>
-        </w:rPr>
-        <w:t xml:space="preserve"> values in the Yukon buoy correct classification with extremely high confidence </w:t>
+        <w:t xml:space="preserve">Sr values in the Yukon buoy correct classification with extremely high confidence </w:t>
       </w:r>
       <w:commentRangeStart w:id="12"/>
       <w:r>
@@ -7391,8 +7424,10 @@
       <w:r>
         <w:rPr>
           <w:rStyle w:val="CommentReference"/>
-          <w:rFonts w:asciiTheme="minorHAnsi" w:eastAsiaTheme="minorHAnsi" w:hAnsiTheme="minorHAnsi" w:cstheme="minorBidi"/>
+          <w:rFonts w:ascii="Garamond" w:eastAsiaTheme="minorHAnsi" w:hAnsi="Garamond" w:cstheme="minorBidi"/>
           <w:kern w:val="2"/>
+          <w:sz w:val="22"/>
+          <w:szCs w:val="22"/>
           <w14:ligatures w14:val="standardContextual"/>
         </w:rPr>
         <w:commentReference w:id="12"/>
@@ -7437,29 +7472,21 @@
           <w:szCs w:val="22"/>
         </w:rPr>
       </w:pPr>
-      <w:commentRangeStart w:id="13"/>
-      <w:r>
-        <w:rPr>
-          <w:rFonts w:ascii="Garamond" w:hAnsi="Garamond"/>
-          <w:sz w:val="22"/>
-          <w:szCs w:val="22"/>
-        </w:rPr>
-        <w:t>Cutting edge statistical tools such as machine learning models</w:t>
-      </w:r>
-      <w:commentRangeEnd w:id="13"/>
-      <w:r>
-        <w:rPr>
-          <w:rStyle w:val="CommentReference"/>
-        </w:rPr>
-        <w:commentReference w:id="13"/>
-      </w:r>
-      <w:r>
-        <w:rPr>
-          <w:rFonts w:ascii="Garamond" w:hAnsi="Garamond"/>
-          <w:sz w:val="22"/>
-          <w:szCs w:val="22"/>
-        </w:rPr>
-        <w:t xml:space="preserve"> provide an opportunity to uncover new insights in ecological datasets that may be critical for management or conservation efforts. In this case, enabling river-basin scale determination of provenance for marine-caught Chinook salmon allows managers to connect region-wide salmon population patterns with river-specific population health. In doing so, researchers may better understand how ecosystem processes at several spatial scales and across ecosystems are interconnected to informing overall ecosystem health. </w:t>
+      <w:r>
+        <w:rPr>
+          <w:rFonts w:ascii="Garamond" w:hAnsi="Garamond"/>
+          <w:sz w:val="22"/>
+          <w:szCs w:val="22"/>
+        </w:rPr>
+        <w:t xml:space="preserve">Machine learning methods provide </w:t>
+      </w:r>
+      <w:r>
+        <w:rPr>
+          <w:rFonts w:ascii="Garamond" w:hAnsi="Garamond"/>
+          <w:sz w:val="22"/>
+          <w:szCs w:val="22"/>
+        </w:rPr>
+        <w:t xml:space="preserve">an opportunity to uncover new insights in ecological datasets that may be critical for management or conservation efforts. In this case, enabling river-basin scale determination of provenance for marine-caught Chinook salmon allows managers to connect region-wide salmon population patterns with river-specific population health. In doing so, researchers may better understand how ecosystem processes at several spatial scales and across ecosystems are interconnected to informing overall ecosystem health. </w:t>
       </w:r>
       <w:r>
         <w:rPr>
@@ -7709,23 +7736,6 @@
           <w:szCs w:val="20"/>
         </w:rPr>
         <w:t xml:space="preserve">Could add that the whole approach is rather general and can be implemented for other such data (other fish, other region). </w:t>
-      </w:r>
-    </w:p>
-  </w:comment>
-  <w:comment w:id="13" w:author="Valentina M. Staneva" w:date="2025-09-28T18:15:00Z" w:initials="VMS">
-    <w:p>
-      <w:r>
-        <w:rPr>
-          <w:rStyle w:val="CommentReference"/>
-        </w:rPr>
-        <w:annotationRef/>
-      </w:r>
-      <w:r>
-        <w:rPr>
-          <w:sz w:val="20"/>
-          <w:szCs w:val="20"/>
-        </w:rPr>
-        <w:t>The fundamental methods you are using are actually quite old. Maybe you can just have "Machine learning methods provide ..." or Statistical learning methods (if you want to stress on the statistical approach incorporating uncertainty)</w:t>
       </w:r>
     </w:p>
   </w:comment>
@@ -7747,7 +7757,6 @@
   <w15:commentEx w15:paraId="31E84DFE" w15:done="1"/>
   <w15:commentEx w15:paraId="7D7AD7A5" w15:done="1"/>
   <w15:commentEx w15:paraId="2B055E78" w15:done="0"/>
-  <w15:commentEx w15:paraId="540E6716" w15:done="0"/>
 </w15:commentsEx>
 </file>
 
@@ -7766,7 +7775,6 @@
   <w16cex:commentExtensible w16cex:durableId="7B5EF19A" w16cex:dateUtc="2025-09-28T23:25:00Z"/>
   <w16cex:commentExtensible w16cex:durableId="7C4DD3A0" w16cex:dateUtc="2025-09-28T23:28:00Z"/>
   <w16cex:commentExtensible w16cex:durableId="22307157" w16cex:dateUtc="2025-09-29T01:30:00Z"/>
-  <w16cex:commentExtensible w16cex:durableId="57669968" w16cex:dateUtc="2025-09-29T01:15:00Z"/>
 </w16cex:commentsExtensible>
 </file>
 
@@ -7785,7 +7793,6 @@
   <w16cid:commentId w16cid:paraId="31E84DFE" w16cid:durableId="7B5EF19A"/>
   <w16cid:commentId w16cid:paraId="7D7AD7A5" w16cid:durableId="7C4DD3A0"/>
   <w16cid:commentId w16cid:paraId="2B055E78" w16cid:durableId="22307157"/>
-  <w16cid:commentId w16cid:paraId="540E6716" w16cid:durableId="57669968"/>
 </w16cid:commentsIds>
 </file>
 

</xml_diff>

<commit_message>
updated discussion, full go through
</commit_message>
<xml_diff>
--- a/Docs/Machine learning applied to otolith timeseries data to discriminate river of origin for Western Alaska Salmon.docx
+++ b/Docs/Machine learning applied to otolith timeseries data to discriminate river of origin for Western Alaska Salmon.docx
@@ -8083,9 +8083,7 @@
           <w:t>0.714</w:t>
         </w:r>
       </w:ins>
-      <w:commentRangeStart w:id="83"/>
-      <w:commentRangeStart w:id="84"/>
-      <w:del w:id="85" w:author="Benjamin J. Makhlouf" w:date="2025-10-09T09:44:00Z" w16du:dateUtc="2025-10-09T16:44:00Z">
+      <w:del w:id="83" w:author="Benjamin J. Makhlouf" w:date="2025-10-09T09:44:00Z" w16du:dateUtc="2025-10-09T16:44:00Z">
         <w:r>
           <w:rPr>
             <w:rFonts w:ascii="Garamond" w:hAnsi="Garamond"/>
@@ -8103,7 +8101,7 @@
         </w:rPr>
         <w:t xml:space="preserve">, </w:t>
       </w:r>
-      <w:ins w:id="86" w:author="Benjamin J. Makhlouf" w:date="2025-10-09T09:42:00Z" w16du:dateUtc="2025-10-09T16:42:00Z">
+      <w:ins w:id="84" w:author="Benjamin J. Makhlouf" w:date="2025-10-09T09:42:00Z" w16du:dateUtc="2025-10-09T16:42:00Z">
         <w:r>
           <w:rPr>
             <w:rFonts w:ascii="Garamond" w:hAnsi="Garamond"/>
@@ -8113,6 +8111,34 @@
           <w:t>0.70</w:t>
         </w:r>
       </w:ins>
+      <w:ins w:id="85" w:author="Benjamin J. Makhlouf" w:date="2025-10-09T09:44:00Z" w16du:dateUtc="2025-10-09T16:44:00Z">
+        <w:r>
+          <w:rPr>
+            <w:rFonts w:ascii="Garamond" w:hAnsi="Garamond"/>
+            <w:sz w:val="22"/>
+            <w:szCs w:val="22"/>
+          </w:rPr>
+          <w:t>9</w:t>
+        </w:r>
+      </w:ins>
+      <w:del w:id="86" w:author="Benjamin J. Makhlouf" w:date="2025-10-09T09:42:00Z" w16du:dateUtc="2025-10-09T16:42:00Z">
+        <w:r>
+          <w:rPr>
+            <w:rFonts w:ascii="Garamond" w:hAnsi="Garamond"/>
+            <w:sz w:val="22"/>
+            <w:szCs w:val="22"/>
+          </w:rPr>
+          <w:delText>Y</w:delText>
+        </w:r>
+      </w:del>
+      <w:r>
+        <w:rPr>
+          <w:rFonts w:ascii="Garamond" w:hAnsi="Garamond"/>
+          <w:sz w:val="22"/>
+          <w:szCs w:val="22"/>
+        </w:rPr>
+        <w:t>,</w:t>
+      </w:r>
       <w:ins w:id="87" w:author="Benjamin J. Makhlouf" w:date="2025-10-09T09:44:00Z" w16du:dateUtc="2025-10-09T16:44:00Z">
         <w:r>
           <w:rPr>
@@ -8120,17 +8146,27 @@
             <w:sz w:val="22"/>
             <w:szCs w:val="22"/>
           </w:rPr>
-          <w:t>9</w:t>
+          <w:t xml:space="preserve"> </w:t>
         </w:r>
       </w:ins>
-      <w:del w:id="88" w:author="Benjamin J. Makhlouf" w:date="2025-10-09T09:42:00Z" w16du:dateUtc="2025-10-09T16:42:00Z">
-        <w:r>
-          <w:rPr>
-            <w:rFonts w:ascii="Garamond" w:hAnsi="Garamond"/>
-            <w:sz w:val="22"/>
-            <w:szCs w:val="22"/>
-          </w:rPr>
-          <w:delText>Y</w:delText>
+      <w:ins w:id="88" w:author="Benjamin J. Makhlouf" w:date="2025-10-09T09:50:00Z" w16du:dateUtc="2025-10-09T16:50:00Z">
+        <w:r>
+          <w:rPr>
+            <w:rFonts w:ascii="Garamond" w:hAnsi="Garamond"/>
+            <w:sz w:val="22"/>
+            <w:szCs w:val="22"/>
+          </w:rPr>
+          <w:t xml:space="preserve"> 0.707</w:t>
+        </w:r>
+      </w:ins>
+      <w:del w:id="89" w:author="Benjamin J. Makhlouf" w:date="2025-10-09T09:50:00Z" w16du:dateUtc="2025-10-09T16:50:00Z">
+        <w:r>
+          <w:rPr>
+            <w:rFonts w:ascii="Garamond" w:hAnsi="Garamond"/>
+            <w:sz w:val="22"/>
+            <w:szCs w:val="22"/>
+          </w:rPr>
+          <w:delText>Z</w:delText>
         </w:r>
       </w:del>
       <w:r>
@@ -8139,80 +8175,20 @@
           <w:sz w:val="22"/>
           <w:szCs w:val="22"/>
         </w:rPr>
-        <w:t>,</w:t>
-      </w:r>
-      <w:ins w:id="89" w:author="Benjamin J. Makhlouf" w:date="2025-10-09T09:44:00Z" w16du:dateUtc="2025-10-09T16:44:00Z">
-        <w:r>
-          <w:rPr>
-            <w:rFonts w:ascii="Garamond" w:hAnsi="Garamond"/>
-            <w:sz w:val="22"/>
-            <w:szCs w:val="22"/>
-          </w:rPr>
-          <w:t xml:space="preserve"> </w:t>
-        </w:r>
-      </w:ins>
-      <w:ins w:id="90" w:author="Benjamin J. Makhlouf" w:date="2025-10-09T09:50:00Z" w16du:dateUtc="2025-10-09T16:50:00Z">
-        <w:r>
-          <w:rPr>
-            <w:rFonts w:ascii="Garamond" w:hAnsi="Garamond"/>
-            <w:sz w:val="22"/>
-            <w:szCs w:val="22"/>
-          </w:rPr>
-          <w:t xml:space="preserve"> 0.707</w:t>
-        </w:r>
-      </w:ins>
-      <w:del w:id="91" w:author="Benjamin J. Makhlouf" w:date="2025-10-09T09:50:00Z" w16du:dateUtc="2025-10-09T16:50:00Z">
-        <w:r>
-          <w:rPr>
-            <w:rFonts w:ascii="Garamond" w:hAnsi="Garamond"/>
-            <w:sz w:val="22"/>
-            <w:szCs w:val="22"/>
-          </w:rPr>
-          <w:delText>Z</w:delText>
+        <w:t xml:space="preserve"> in the Yukon, Kuskokwim, and Nushagak, respectively). </w:t>
+      </w:r>
+      <w:del w:id="90" w:author="Benjamin J. Makhlouf" w:date="2025-10-06T15:55:00Z" w16du:dateUtc="2025-10-06T22:55:00Z">
+        <w:r>
+          <w:rPr>
+            <w:rFonts w:ascii="Garamond" w:hAnsi="Garamond"/>
+            <w:sz w:val="22"/>
+            <w:szCs w:val="22"/>
+          </w:rPr>
+          <w:delText xml:space="preserve">Interestingly, </w:delText>
         </w:r>
       </w:del>
-      <w:r>
-        <w:rPr>
-          <w:rFonts w:ascii="Garamond" w:hAnsi="Garamond"/>
-          <w:sz w:val="22"/>
-          <w:szCs w:val="22"/>
-        </w:rPr>
-        <w:t xml:space="preserve"> </w:t>
-      </w:r>
-      <w:commentRangeEnd w:id="83"/>
-      <w:r>
-        <w:rPr>
-          <w:rStyle w:val="CommentReference"/>
-        </w:rPr>
-        <w:commentReference w:id="83"/>
-      </w:r>
-      <w:commentRangeEnd w:id="84"/>
-      <w:r>
-        <w:rPr>
-          <w:rStyle w:val="CommentReference"/>
-        </w:rPr>
-        <w:commentReference w:id="84"/>
-      </w:r>
-      <w:r>
-        <w:rPr>
-          <w:rFonts w:ascii="Garamond" w:hAnsi="Garamond"/>
-          <w:sz w:val="22"/>
-          <w:szCs w:val="22"/>
-        </w:rPr>
-        <w:t xml:space="preserve">in the Yukon, Kuskokwim, and Nushagak, respectively). </w:t>
-      </w:r>
-      <w:del w:id="92" w:author="Benjamin J. Makhlouf" w:date="2025-10-06T15:55:00Z" w16du:dateUtc="2025-10-06T22:55:00Z">
-        <w:r>
-          <w:rPr>
-            <w:rFonts w:ascii="Garamond" w:hAnsi="Garamond"/>
-            <w:sz w:val="22"/>
-            <w:szCs w:val="22"/>
-          </w:rPr>
-          <w:delText xml:space="preserve">Interestingly, </w:delText>
-        </w:r>
-      </w:del>
-      <w:ins w:id="93" w:author="Daniel Schindler" w:date="2025-10-02T15:16:00Z" w16du:dateUtc="2025-10-02T22:16:00Z">
-        <w:del w:id="94" w:author="Benjamin J. Makhlouf" w:date="2025-10-06T15:55:00Z" w16du:dateUtc="2025-10-06T22:55:00Z">
+      <w:ins w:id="91" w:author="Daniel Schindler" w:date="2025-10-02T15:16:00Z" w16du:dateUtc="2025-10-02T22:16:00Z">
+        <w:del w:id="92" w:author="Benjamin J. Makhlouf" w:date="2025-10-06T15:55:00Z" w16du:dateUtc="2025-10-06T22:55:00Z">
           <w:r>
             <w:rPr>
               <w:rFonts w:ascii="Garamond" w:hAnsi="Garamond"/>
@@ -8223,7 +8199,7 @@
           </w:r>
         </w:del>
       </w:ins>
-      <w:del w:id="95" w:author="Benjamin J. Makhlouf" w:date="2025-10-06T15:55:00Z" w16du:dateUtc="2025-10-06T22:55:00Z">
+      <w:del w:id="93" w:author="Benjamin J. Makhlouf" w:date="2025-10-06T15:55:00Z" w16du:dateUtc="2025-10-06T22:55:00Z">
         <w:r>
           <w:rPr>
             <w:rFonts w:ascii="Garamond" w:hAnsi="Garamond"/>
@@ -8233,8 +8209,8 @@
           <w:delText xml:space="preserve"> of </w:delText>
         </w:r>
       </w:del>
-      <w:ins w:id="96" w:author="Daniel Schindler" w:date="2025-10-02T15:29:00Z" w16du:dateUtc="2025-10-02T22:29:00Z">
-        <w:del w:id="97" w:author="Benjamin J. Makhlouf" w:date="2025-10-06T15:55:00Z" w16du:dateUtc="2025-10-06T22:55:00Z">
+      <w:ins w:id="94" w:author="Daniel Schindler" w:date="2025-10-02T15:29:00Z" w16du:dateUtc="2025-10-02T22:29:00Z">
+        <w:del w:id="95" w:author="Benjamin J. Makhlouf" w:date="2025-10-06T15:55:00Z" w16du:dateUtc="2025-10-06T22:55:00Z">
           <w:r>
             <w:rPr>
               <w:rFonts w:ascii="Garamond" w:hAnsi="Garamond"/>
@@ -8245,6 +8221,130 @@
           </w:r>
         </w:del>
       </w:ins>
+      <w:del w:id="96" w:author="Benjamin J. Makhlouf" w:date="2025-10-06T15:55:00Z" w16du:dateUtc="2025-10-06T22:55:00Z">
+        <w:r>
+          <w:rPr>
+            <w:rFonts w:ascii="Garamond" w:hAnsi="Garamond"/>
+            <w:sz w:val="22"/>
+            <w:szCs w:val="22"/>
+          </w:rPr>
+          <w:delText xml:space="preserve">fish from the CWAK region within the Yukon river-basin contained a less pronounced increase in </w:delText>
+        </w:r>
+        <w:r>
+          <w:rPr>
+            <w:rFonts w:ascii="Cambria Math" w:hAnsi="Cambria Math" w:cs="Cambria Math"/>
+            <w:sz w:val="22"/>
+            <w:szCs w:val="22"/>
+          </w:rPr>
+          <w:delText>⁸⁷</w:delText>
+        </w:r>
+        <w:r>
+          <w:rPr>
+            <w:rFonts w:ascii="Garamond" w:hAnsi="Garamond"/>
+            <w:sz w:val="22"/>
+            <w:szCs w:val="22"/>
+          </w:rPr>
+          <w:delText>Sr/</w:delText>
+        </w:r>
+        <w:r>
+          <w:rPr>
+            <w:rFonts w:ascii="Cambria Math" w:hAnsi="Cambria Math" w:cs="Cambria Math"/>
+            <w:sz w:val="22"/>
+            <w:szCs w:val="22"/>
+          </w:rPr>
+          <w:delText>⁸⁶</w:delText>
+        </w:r>
+        <w:r>
+          <w:rPr>
+            <w:rFonts w:ascii="Garamond" w:hAnsi="Garamond"/>
+            <w:sz w:val="22"/>
+            <w:szCs w:val="22"/>
+          </w:rPr>
+          <w:delText>Sr</w:delText>
+        </w:r>
+        <w:r>
+          <w:rPr>
+            <w:rFonts w:ascii="Garamond" w:hAnsi="Garamond"/>
+            <w:sz w:val="22"/>
+            <w:szCs w:val="22"/>
+          </w:rPr>
+          <w:delText xml:space="preserve"> values before the marine onset</w:delText>
+        </w:r>
+        <w:r>
+          <w:rPr>
+            <w:rFonts w:ascii="Garamond" w:hAnsi="Garamond"/>
+            <w:sz w:val="22"/>
+            <w:szCs w:val="22"/>
+          </w:rPr>
+          <w:delText xml:space="preserve"> </w:delText>
+        </w:r>
+        <w:r>
+          <w:rPr>
+            <w:rFonts w:ascii="Garamond" w:hAnsi="Garamond"/>
+            <w:sz w:val="22"/>
+            <w:szCs w:val="22"/>
+          </w:rPr>
+          <w:delText xml:space="preserve">(Figure 5b.) </w:delText>
+        </w:r>
+      </w:del>
+      <w:r>
+        <w:rPr>
+          <w:rFonts w:ascii="Garamond" w:hAnsi="Garamond"/>
+          <w:sz w:val="22"/>
+          <w:szCs w:val="22"/>
+        </w:rPr>
+        <w:t>Principal component 3 appear</w:t>
+      </w:r>
+      <w:r>
+        <w:rPr>
+          <w:rFonts w:ascii="Garamond" w:hAnsi="Garamond"/>
+          <w:sz w:val="22"/>
+          <w:szCs w:val="22"/>
+        </w:rPr>
+        <w:t>s</w:t>
+      </w:r>
+      <w:r>
+        <w:rPr>
+          <w:rFonts w:ascii="Garamond" w:hAnsi="Garamond"/>
+          <w:sz w:val="22"/>
+          <w:szCs w:val="22"/>
+        </w:rPr>
+        <w:t xml:space="preserve"> to be driven by values at the very beginning of the </w:t>
+      </w:r>
+      <w:r>
+        <w:rPr>
+          <w:rFonts w:ascii="Garamond" w:hAnsi="Garamond"/>
+          <w:sz w:val="22"/>
+          <w:szCs w:val="22"/>
+        </w:rPr>
+        <w:t>time series</w:t>
+      </w:r>
+      <w:r>
+        <w:rPr>
+          <w:rFonts w:ascii="Garamond" w:hAnsi="Garamond"/>
+          <w:sz w:val="22"/>
+          <w:szCs w:val="22"/>
+        </w:rPr>
+        <w:t xml:space="preserve"> </w:t>
+      </w:r>
+      <w:r>
+        <w:rPr>
+          <w:rFonts w:ascii="Garamond" w:hAnsi="Garamond"/>
+          <w:sz w:val="22"/>
+          <w:szCs w:val="22"/>
+        </w:rPr>
+        <w:t>corresponding to the start of the natal origin signature</w:t>
+      </w:r>
+      <w:del w:id="97" w:author="Benjamin J. Makhlouf" w:date="2025-10-06T15:56:00Z" w16du:dateUtc="2025-10-06T22:56:00Z">
+        <w:r>
+          <w:rPr>
+            <w:rFonts w:ascii="Garamond" w:hAnsi="Garamond"/>
+            <w:sz w:val="22"/>
+            <w:szCs w:val="22"/>
+          </w:rPr>
+          <w:delText>.</w:delText>
+        </w:r>
+      </w:del>
       <w:del w:id="98" w:author="Benjamin J. Makhlouf" w:date="2025-10-06T15:55:00Z" w16du:dateUtc="2025-10-06T22:55:00Z">
         <w:r>
           <w:rPr>
@@ -8252,64 +8352,8 @@
             <w:sz w:val="22"/>
             <w:szCs w:val="22"/>
           </w:rPr>
-          <w:delText xml:space="preserve">fish from the CWAK region within the Yukon river-basin contained a less pronounced increase in </w:delText>
-        </w:r>
-        <w:r>
-          <w:rPr>
-            <w:rFonts w:ascii="Cambria Math" w:hAnsi="Cambria Math" w:cs="Cambria Math"/>
-            <w:sz w:val="22"/>
-            <w:szCs w:val="22"/>
-          </w:rPr>
-          <w:delText>⁸⁷</w:delText>
-        </w:r>
-        <w:r>
-          <w:rPr>
-            <w:rFonts w:ascii="Garamond" w:hAnsi="Garamond"/>
-            <w:sz w:val="22"/>
-            <w:szCs w:val="22"/>
-          </w:rPr>
-          <w:delText>Sr/</w:delText>
-        </w:r>
-        <w:r>
-          <w:rPr>
-            <w:rFonts w:ascii="Cambria Math" w:hAnsi="Cambria Math" w:cs="Cambria Math"/>
-            <w:sz w:val="22"/>
-            <w:szCs w:val="22"/>
-          </w:rPr>
-          <w:delText>⁸⁶</w:delText>
-        </w:r>
-        <w:r>
-          <w:rPr>
-            <w:rFonts w:ascii="Garamond" w:hAnsi="Garamond"/>
-            <w:sz w:val="22"/>
-            <w:szCs w:val="22"/>
-          </w:rPr>
-          <w:delText>Sr</w:delText>
-        </w:r>
-        <w:r>
-          <w:rPr>
-            <w:rFonts w:ascii="Garamond" w:hAnsi="Garamond"/>
-            <w:sz w:val="22"/>
-            <w:szCs w:val="22"/>
-          </w:rPr>
-          <w:delText xml:space="preserve"> values before the marine onset</w:delText>
-        </w:r>
-        <w:r>
-          <w:rPr>
-            <w:rFonts w:ascii="Garamond" w:hAnsi="Garamond"/>
-            <w:sz w:val="22"/>
-            <w:szCs w:val="22"/>
-          </w:rPr>
           <w:delText xml:space="preserve"> </w:delText>
         </w:r>
-        <w:r>
-          <w:rPr>
-            <w:rFonts w:ascii="Garamond" w:hAnsi="Garamond"/>
-            <w:sz w:val="22"/>
-            <w:szCs w:val="22"/>
-          </w:rPr>
-          <w:delText xml:space="preserve">(Figure 5b.) </w:delText>
-        </w:r>
       </w:del>
       <w:r>
         <w:rPr>
@@ -8317,47 +8361,7 @@
           <w:sz w:val="22"/>
           <w:szCs w:val="22"/>
         </w:rPr>
-        <w:t>Principal component 3 appear</w:t>
-      </w:r>
-      <w:r>
-        <w:rPr>
-          <w:rFonts w:ascii="Garamond" w:hAnsi="Garamond"/>
-          <w:sz w:val="22"/>
-          <w:szCs w:val="22"/>
-        </w:rPr>
-        <w:t>s</w:t>
-      </w:r>
-      <w:r>
-        <w:rPr>
-          <w:rFonts w:ascii="Garamond" w:hAnsi="Garamond"/>
-          <w:sz w:val="22"/>
-          <w:szCs w:val="22"/>
-        </w:rPr>
-        <w:t xml:space="preserve"> to be driven by values at the very beginning of the </w:t>
-      </w:r>
-      <w:r>
-        <w:rPr>
-          <w:rFonts w:ascii="Garamond" w:hAnsi="Garamond"/>
-          <w:sz w:val="22"/>
-          <w:szCs w:val="22"/>
-        </w:rPr>
-        <w:t>time series</w:t>
-      </w:r>
-      <w:r>
-        <w:rPr>
-          <w:rFonts w:ascii="Garamond" w:hAnsi="Garamond"/>
-          <w:sz w:val="22"/>
-          <w:szCs w:val="22"/>
-        </w:rPr>
-        <w:t xml:space="preserve"> </w:t>
-      </w:r>
-      <w:r>
-        <w:rPr>
-          <w:rFonts w:ascii="Garamond" w:hAnsi="Garamond"/>
-          <w:sz w:val="22"/>
-          <w:szCs w:val="22"/>
-        </w:rPr>
-        <w:t>corresponding to the start of the natal origin signature</w:t>
+        <w:t xml:space="preserve"> as well as some variation in values </w:t>
       </w:r>
       <w:del w:id="99" w:author="Benjamin J. Makhlouf" w:date="2025-10-06T15:56:00Z" w16du:dateUtc="2025-10-06T22:56:00Z">
         <w:r>
@@ -8366,17 +8370,35 @@
             <w:sz w:val="22"/>
             <w:szCs w:val="22"/>
           </w:rPr>
-          <w:delText>.</w:delText>
+          <w:delText xml:space="preserve">towards the values </w:delText>
         </w:r>
       </w:del>
-      <w:del w:id="100" w:author="Benjamin J. Makhlouf" w:date="2025-10-06T15:55:00Z" w16du:dateUtc="2025-10-06T22:55:00Z">
-        <w:r>
-          <w:rPr>
-            <w:rFonts w:ascii="Garamond" w:hAnsi="Garamond"/>
-            <w:sz w:val="22"/>
-            <w:szCs w:val="22"/>
-          </w:rPr>
-          <w:delText xml:space="preserve"> </w:delText>
+      <w:r>
+        <w:rPr>
+          <w:rFonts w:ascii="Garamond" w:hAnsi="Garamond"/>
+          <w:sz w:val="22"/>
+          <w:szCs w:val="22"/>
+        </w:rPr>
+        <w:t>just before the mainstem</w:t>
+      </w:r>
+      <w:ins w:id="100" w:author="Benjamin J. Makhlouf" w:date="2025-10-06T15:56:00Z" w16du:dateUtc="2025-10-06T22:56:00Z">
+        <w:r>
+          <w:rPr>
+            <w:rFonts w:ascii="Garamond" w:hAnsi="Garamond"/>
+            <w:sz w:val="22"/>
+            <w:szCs w:val="22"/>
+          </w:rPr>
+          <w:t xml:space="preserve"> region</w:t>
+        </w:r>
+      </w:ins>
+      <w:del w:id="101" w:author="Benjamin J. Makhlouf" w:date="2025-10-06T15:56:00Z" w16du:dateUtc="2025-10-06T22:56:00Z">
+        <w:r>
+          <w:rPr>
+            <w:rFonts w:ascii="Garamond" w:hAnsi="Garamond"/>
+            <w:sz w:val="22"/>
+            <w:szCs w:val="22"/>
+          </w:rPr>
+          <w:delText xml:space="preserve"> value</w:delText>
         </w:r>
       </w:del>
       <w:r>
@@ -8385,25 +8407,7 @@
           <w:sz w:val="22"/>
           <w:szCs w:val="22"/>
         </w:rPr>
-        <w:t xml:space="preserve"> as well as some variation in values </w:t>
-      </w:r>
-      <w:del w:id="101" w:author="Benjamin J. Makhlouf" w:date="2025-10-06T15:56:00Z" w16du:dateUtc="2025-10-06T22:56:00Z">
-        <w:r>
-          <w:rPr>
-            <w:rFonts w:ascii="Garamond" w:hAnsi="Garamond"/>
-            <w:sz w:val="22"/>
-            <w:szCs w:val="22"/>
-          </w:rPr>
-          <w:delText xml:space="preserve">towards the values </w:delText>
-        </w:r>
-      </w:del>
-      <w:r>
-        <w:rPr>
-          <w:rFonts w:ascii="Garamond" w:hAnsi="Garamond"/>
-          <w:sz w:val="22"/>
-          <w:szCs w:val="22"/>
-        </w:rPr>
-        <w:t>just before the mainstem</w:t>
+        <w:t xml:space="preserve"> described above. </w:t>
       </w:r>
       <w:ins w:id="102" w:author="Benjamin J. Makhlouf" w:date="2025-10-06T15:56:00Z" w16du:dateUtc="2025-10-06T22:56:00Z">
         <w:r>
@@ -8412,48 +8416,20 @@
             <w:sz w:val="22"/>
             <w:szCs w:val="22"/>
           </w:rPr>
-          <w:t xml:space="preserve"> region</w:t>
+          <w:t>There is minimal separation by watershed along this principal component</w:t>
         </w:r>
       </w:ins>
-      <w:del w:id="103" w:author="Benjamin J. Makhlouf" w:date="2025-10-06T15:56:00Z" w16du:dateUtc="2025-10-06T22:56:00Z">
-        <w:r>
-          <w:rPr>
-            <w:rFonts w:ascii="Garamond" w:hAnsi="Garamond"/>
-            <w:sz w:val="22"/>
-            <w:szCs w:val="22"/>
-          </w:rPr>
-          <w:delText xml:space="preserve"> value</w:delText>
-        </w:r>
-      </w:del>
-      <w:r>
-        <w:rPr>
-          <w:rFonts w:ascii="Garamond" w:hAnsi="Garamond"/>
-          <w:sz w:val="22"/>
-          <w:szCs w:val="22"/>
-        </w:rPr>
-        <w:t xml:space="preserve"> described above. </w:t>
-      </w:r>
-      <w:ins w:id="104" w:author="Benjamin J. Makhlouf" w:date="2025-10-06T15:56:00Z" w16du:dateUtc="2025-10-06T22:56:00Z">
-        <w:r>
-          <w:rPr>
-            <w:rFonts w:ascii="Garamond" w:hAnsi="Garamond"/>
-            <w:sz w:val="22"/>
-            <w:szCs w:val="22"/>
-          </w:rPr>
-          <w:t>There is minimal separation by watershed along this principal component</w:t>
+      <w:ins w:id="103" w:author="Benjamin J. Makhlouf" w:date="2025-10-06T15:57:00Z" w16du:dateUtc="2025-10-06T22:57:00Z">
+        <w:r>
+          <w:rPr>
+            <w:rFonts w:ascii="Garamond" w:hAnsi="Garamond"/>
+            <w:sz w:val="22"/>
+            <w:szCs w:val="22"/>
+          </w:rPr>
+          <w:t>,</w:t>
         </w:r>
       </w:ins>
-      <w:ins w:id="105" w:author="Benjamin J. Makhlouf" w:date="2025-10-06T15:57:00Z" w16du:dateUtc="2025-10-06T22:57:00Z">
-        <w:r>
-          <w:rPr>
-            <w:rFonts w:ascii="Garamond" w:hAnsi="Garamond"/>
-            <w:sz w:val="22"/>
-            <w:szCs w:val="22"/>
-          </w:rPr>
-          <w:t>,</w:t>
-        </w:r>
-      </w:ins>
-      <w:ins w:id="106" w:author="Benjamin J. Makhlouf" w:date="2025-10-06T15:58:00Z" w16du:dateUtc="2025-10-06T22:58:00Z">
+      <w:ins w:id="104" w:author="Benjamin J. Makhlouf" w:date="2025-10-06T15:58:00Z" w16du:dateUtc="2025-10-06T22:58:00Z">
         <w:r>
           <w:rPr>
             <w:rFonts w:ascii="Garamond" w:hAnsi="Garamond"/>
@@ -8469,14 +8445,14 @@
         <w:spacing w:line="480" w:lineRule="auto"/>
         <w:ind w:firstLine="720"/>
         <w:rPr>
-          <w:del w:id="107" w:author="Benjamin J. Makhlouf" w:date="2025-10-06T15:58:00Z" w16du:dateUtc="2025-10-06T22:58:00Z"/>
+          <w:del w:id="105" w:author="Benjamin J. Makhlouf" w:date="2025-10-06T15:58:00Z" w16du:dateUtc="2025-10-06T22:58:00Z"/>
           <w:rFonts w:ascii="Garamond" w:hAnsi="Garamond"/>
           <w:sz w:val="22"/>
           <w:szCs w:val="22"/>
         </w:rPr>
       </w:pPr>
-      <w:commentRangeStart w:id="108"/>
-      <w:del w:id="109" w:author="Benjamin J. Makhlouf" w:date="2025-10-06T15:58:00Z" w16du:dateUtc="2025-10-06T22:58:00Z">
+      <w:commentRangeStart w:id="106"/>
+      <w:del w:id="107" w:author="Benjamin J. Makhlouf" w:date="2025-10-06T15:58:00Z" w16du:dateUtc="2025-10-06T22:58:00Z">
         <w:r>
           <w:rPr>
             <w:rFonts w:ascii="Garamond" w:hAnsi="Garamond"/>
@@ -8509,60 +8485,60 @@
           </w:rPr>
           <w:delText xml:space="preserve"> given that </w:delText>
         </w:r>
+        <w:commentRangeEnd w:id="106"/>
+        <w:r>
+          <w:rPr>
+            <w:rStyle w:val="CommentReference"/>
+          </w:rPr>
+          <w:commentReference w:id="106"/>
+        </w:r>
+        <w:r>
+          <w:rPr>
+            <w:rFonts w:ascii="Garamond" w:hAnsi="Garamond"/>
+            <w:sz w:val="22"/>
+            <w:szCs w:val="22"/>
+          </w:rPr>
+          <w:delText xml:space="preserve">all individuals in this </w:delText>
+        </w:r>
+        <w:r>
+          <w:rPr>
+            <w:rFonts w:ascii="Garamond" w:hAnsi="Garamond"/>
+            <w:sz w:val="22"/>
+            <w:szCs w:val="22"/>
+          </w:rPr>
+          <w:delText>subset</w:delText>
+        </w:r>
+        <w:r>
+          <w:rPr>
+            <w:rFonts w:ascii="Garamond" w:hAnsi="Garamond"/>
+            <w:sz w:val="22"/>
+            <w:szCs w:val="22"/>
+          </w:rPr>
+          <w:delText xml:space="preserve"> </w:delText>
+        </w:r>
+        <w:r>
+          <w:rPr>
+            <w:rFonts w:ascii="Garamond" w:hAnsi="Garamond"/>
+            <w:sz w:val="22"/>
+            <w:szCs w:val="22"/>
+          </w:rPr>
+          <w:delText xml:space="preserve">share the </w:delText>
+        </w:r>
+        <w:commentRangeStart w:id="108"/>
+        <w:r>
+          <w:rPr>
+            <w:rFonts w:ascii="Garamond" w:hAnsi="Garamond"/>
+            <w:sz w:val="22"/>
+            <w:szCs w:val="22"/>
+          </w:rPr>
+          <w:delText xml:space="preserve">same natal origin </w:delText>
+        </w:r>
         <w:commentRangeEnd w:id="108"/>
         <w:r>
           <w:rPr>
             <w:rStyle w:val="CommentReference"/>
           </w:rPr>
           <w:commentReference w:id="108"/>
-        </w:r>
-        <w:r>
-          <w:rPr>
-            <w:rFonts w:ascii="Garamond" w:hAnsi="Garamond"/>
-            <w:sz w:val="22"/>
-            <w:szCs w:val="22"/>
-          </w:rPr>
-          <w:delText xml:space="preserve">all individuals in this </w:delText>
-        </w:r>
-        <w:r>
-          <w:rPr>
-            <w:rFonts w:ascii="Garamond" w:hAnsi="Garamond"/>
-            <w:sz w:val="22"/>
-            <w:szCs w:val="22"/>
-          </w:rPr>
-          <w:delText>subset</w:delText>
-        </w:r>
-        <w:r>
-          <w:rPr>
-            <w:rFonts w:ascii="Garamond" w:hAnsi="Garamond"/>
-            <w:sz w:val="22"/>
-            <w:szCs w:val="22"/>
-          </w:rPr>
-          <w:delText xml:space="preserve"> </w:delText>
-        </w:r>
-        <w:r>
-          <w:rPr>
-            <w:rFonts w:ascii="Garamond" w:hAnsi="Garamond"/>
-            <w:sz w:val="22"/>
-            <w:szCs w:val="22"/>
-          </w:rPr>
-          <w:delText xml:space="preserve">share the </w:delText>
-        </w:r>
-        <w:commentRangeStart w:id="110"/>
-        <w:r>
-          <w:rPr>
-            <w:rFonts w:ascii="Garamond" w:hAnsi="Garamond"/>
-            <w:sz w:val="22"/>
-            <w:szCs w:val="22"/>
-          </w:rPr>
-          <w:delText xml:space="preserve">same natal origin </w:delText>
-        </w:r>
-        <w:commentRangeEnd w:id="110"/>
-        <w:r>
-          <w:rPr>
-            <w:rStyle w:val="CommentReference"/>
-          </w:rPr>
-          <w:commentReference w:id="110"/>
         </w:r>
         <w:r>
           <w:rPr>
@@ -8654,22 +8630,14 @@
         </w:rPr>
         <w:t xml:space="preserve">testing sets ranged from 71.9% to 92.5% and F1-Score values ranged from 72.6% to 92.2%. The </w:t>
       </w:r>
-      <w:r>
-        <w:rPr>
-          <w:rFonts w:ascii="Garamond" w:hAnsi="Garamond"/>
-          <w:sz w:val="22"/>
-          <w:szCs w:val="22"/>
-        </w:rPr>
-        <w:t xml:space="preserve">accuracy and F1-score achieved by applying the random forest model to the GAM smoothed dataset and tested on the full testing set. Smoothed </w:t>
-      </w:r>
-      <w:ins w:id="111" w:author="Daniel Schindler" w:date="2025-10-02T15:16:00Z" w16du:dateUtc="2025-10-02T22:16:00Z">
-        <w:r>
-          <w:rPr>
-            <w:rFonts w:ascii="Garamond" w:hAnsi="Garamond"/>
-            <w:sz w:val="22"/>
-            <w:szCs w:val="22"/>
-          </w:rPr>
-          <w:t>time series</w:t>
+      <w:ins w:id="109" w:author="Benjamin J. Makhlouf" w:date="2025-10-09T09:55:00Z" w16du:dateUtc="2025-10-09T16:55:00Z">
+        <w:r>
+          <w:rPr>
+            <w:rFonts w:ascii="Garamond" w:hAnsi="Garamond"/>
+            <w:sz w:val="22"/>
+            <w:szCs w:val="22"/>
+          </w:rPr>
+          <w:t xml:space="preserve">highest </w:t>
         </w:r>
       </w:ins>
       <w:r>
@@ -8678,6 +8646,68 @@
           <w:sz w:val="22"/>
           <w:szCs w:val="22"/>
         </w:rPr>
+        <w:t>accuracy and F1-score</w:t>
+      </w:r>
+      <w:ins w:id="110" w:author="Benjamin J. Makhlouf" w:date="2025-10-09T09:55:00Z" w16du:dateUtc="2025-10-09T16:55:00Z">
+        <w:r>
+          <w:rPr>
+            <w:rFonts w:ascii="Garamond" w:hAnsi="Garamond"/>
+            <w:sz w:val="22"/>
+            <w:szCs w:val="22"/>
+          </w:rPr>
+          <w:t xml:space="preserve"> </w:t>
+        </w:r>
+        <w:proofErr w:type="gramStart"/>
+        <w:r>
+          <w:rPr>
+            <w:rFonts w:ascii="Garamond" w:hAnsi="Garamond"/>
+            <w:sz w:val="22"/>
+            <w:szCs w:val="22"/>
+          </w:rPr>
+          <w:t>was</w:t>
+        </w:r>
+      </w:ins>
+      <w:proofErr w:type="gramEnd"/>
+      <w:r>
+        <w:rPr>
+          <w:rFonts w:ascii="Garamond" w:hAnsi="Garamond"/>
+          <w:sz w:val="22"/>
+          <w:szCs w:val="22"/>
+        </w:rPr>
+        <w:t xml:space="preserve"> achieved by applying the random forest model to the GAM smoothed dataset and tested on the full testing set</w:t>
+      </w:r>
+      <w:ins w:id="111" w:author="Benjamin J. Makhlouf" w:date="2025-10-09T09:56:00Z" w16du:dateUtc="2025-10-09T16:56:00Z">
+        <w:r>
+          <w:rPr>
+            <w:rFonts w:ascii="Garamond" w:hAnsi="Garamond"/>
+            <w:sz w:val="22"/>
+            <w:szCs w:val="22"/>
+          </w:rPr>
+          <w:t xml:space="preserve"> (Figure 1)</w:t>
+        </w:r>
+      </w:ins>
+      <w:r>
+        <w:rPr>
+          <w:rFonts w:ascii="Garamond" w:hAnsi="Garamond"/>
+          <w:sz w:val="22"/>
+          <w:szCs w:val="22"/>
+        </w:rPr>
+        <w:t xml:space="preserve">. Smoothed </w:t>
+      </w:r>
+      <w:r>
+        <w:rPr>
+          <w:rFonts w:ascii="Garamond" w:hAnsi="Garamond"/>
+          <w:sz w:val="22"/>
+          <w:szCs w:val="22"/>
+        </w:rPr>
+        <w:t>time series</w:t>
+      </w:r>
+      <w:r>
+        <w:rPr>
+          <w:rFonts w:ascii="Garamond" w:hAnsi="Garamond"/>
+          <w:sz w:val="22"/>
+          <w:szCs w:val="22"/>
+        </w:rPr>
         <w:t xml:space="preserve"> data outperformed the raw data in all cases, indicating that the noise in the raw data ma</w:t>
       </w:r>
       <w:r>
@@ -8710,7 +8740,35 @@
           <w:sz w:val="22"/>
           <w:szCs w:val="22"/>
         </w:rPr>
-        <w:t>In general, RF analysis outperformed both KNN and SVM, however, SVM was the highest performer on Raw datasets (89.8% accuracy on total testing set and 87.0% on overlapping testing set)</w:t>
+        <w:t xml:space="preserve">In general, RF analysis outperformed both KNN and SVM, however, SVM was the highest performer on </w:t>
+      </w:r>
+      <w:ins w:id="112" w:author="Benjamin J. Makhlouf" w:date="2025-10-09T09:56:00Z" w16du:dateUtc="2025-10-09T16:56:00Z">
+        <w:r>
+          <w:rPr>
+            <w:rFonts w:ascii="Garamond" w:hAnsi="Garamond"/>
+            <w:sz w:val="22"/>
+            <w:szCs w:val="22"/>
+          </w:rPr>
+          <w:t>r</w:t>
+        </w:r>
+      </w:ins>
+      <w:del w:id="113" w:author="Benjamin J. Makhlouf" w:date="2025-10-09T09:56:00Z" w16du:dateUtc="2025-10-09T16:56:00Z">
+        <w:r>
+          <w:rPr>
+            <w:rFonts w:ascii="Garamond" w:hAnsi="Garamond"/>
+            <w:sz w:val="22"/>
+            <w:szCs w:val="22"/>
+          </w:rPr>
+          <w:delText>R</w:delText>
+        </w:r>
+      </w:del>
+      <w:r>
+        <w:rPr>
+          <w:rFonts w:ascii="Garamond" w:hAnsi="Garamond"/>
+          <w:sz w:val="22"/>
+          <w:szCs w:val="22"/>
+        </w:rPr>
+        <w:t>aw datasets (89.8% accuracy on total testing set and 87.0% on overlapping testing set)</w:t>
       </w:r>
       <w:r>
         <w:rPr>
@@ -8787,7 +8845,7 @@
         </w:rPr>
         <w:t>The best p</w:t>
       </w:r>
-      <w:ins w:id="112" w:author="Daniel Schindler" w:date="2025-10-06T10:54:00Z" w16du:dateUtc="2025-10-06T17:54:00Z">
+      <w:ins w:id="114" w:author="Daniel Schindler" w:date="2025-10-06T10:54:00Z" w16du:dateUtc="2025-10-06T17:54:00Z">
         <w:r>
           <w:rPr>
             <w:rFonts w:ascii="Garamond" w:hAnsi="Garamond"/>
@@ -8803,7 +8861,25 @@
           <w:sz w:val="22"/>
           <w:szCs w:val="22"/>
         </w:rPr>
-        <w:t xml:space="preserve">forming model (RF, GAM-smoothed data) displayed some variation in overall accuracy among classes. On the Total testing set 92.0% of Kuskokwim, 91.4% of Nushagak, and 93.7% of Yukon samples were correctly identified (Figure 3). By percentage of each class the most common misclassification </w:t>
+        <w:t>forming model (RF, GAM-smoothed data) displayed some variation in overall accuracy among classes. On the Total testing set 92.0% of Kuskokwim, 91.4% of Nushagak, and 93.7% of Yukon samples were correctly identified (Figure 3). By percentage of each class</w:t>
+      </w:r>
+      <w:ins w:id="115" w:author="Benjamin J. Makhlouf" w:date="2025-10-09T09:57:00Z" w16du:dateUtc="2025-10-09T16:57:00Z">
+        <w:r>
+          <w:rPr>
+            <w:rFonts w:ascii="Garamond" w:hAnsi="Garamond"/>
+            <w:sz w:val="22"/>
+            <w:szCs w:val="22"/>
+          </w:rPr>
+          <w:t>,</w:t>
+        </w:r>
+      </w:ins>
+      <w:r>
+        <w:rPr>
+          <w:rFonts w:ascii="Garamond" w:hAnsi="Garamond"/>
+          <w:sz w:val="22"/>
+          <w:szCs w:val="22"/>
+        </w:rPr>
+        <w:t xml:space="preserve"> the most common misclassification </w:t>
       </w:r>
       <w:r>
         <w:rPr>
@@ -8812,18 +8888,62 @@
           <w:szCs w:val="22"/>
         </w:rPr>
         <w:lastRenderedPageBreak/>
-        <w:t xml:space="preserve">was Nushagak fish estimated to have been Kuskokwim (8.6% of Kuskokwim fish) followed by the inverse (5.6% of Nushagak fish). Interestingly, after removing the </w:t>
-      </w:r>
-      <w:ins w:id="113" w:author="Daniel Schindler" w:date="2025-10-06T10:55:00Z" w16du:dateUtc="2025-10-06T17:55:00Z">
-        <w:r>
-          <w:rPr>
-            <w:rFonts w:ascii="Garamond" w:hAnsi="Garamond"/>
-            <w:sz w:val="22"/>
-            <w:szCs w:val="22"/>
-          </w:rPr>
-          <w:t xml:space="preserve">most </w:t>
+        <w:t xml:space="preserve">was </w:t>
+      </w:r>
+      <w:proofErr w:type="spellStart"/>
+      <w:r>
+        <w:rPr>
+          <w:rFonts w:ascii="Garamond" w:hAnsi="Garamond"/>
+          <w:sz w:val="22"/>
+          <w:szCs w:val="22"/>
+        </w:rPr>
+        <w:t>Nushagak</w:t>
+      </w:r>
+      <w:proofErr w:type="spellEnd"/>
+      <w:r>
+        <w:rPr>
+          <w:rFonts w:ascii="Garamond" w:hAnsi="Garamond"/>
+          <w:sz w:val="22"/>
+          <w:szCs w:val="22"/>
+        </w:rPr>
+        <w:t xml:space="preserve"> fish </w:t>
+      </w:r>
+      <w:ins w:id="116" w:author="Benjamin J. Makhlouf" w:date="2025-10-09T09:57:00Z" w16du:dateUtc="2025-10-09T16:57:00Z">
+        <w:r>
+          <w:rPr>
+            <w:rFonts w:ascii="Garamond" w:hAnsi="Garamond"/>
+            <w:sz w:val="22"/>
+            <w:szCs w:val="22"/>
+          </w:rPr>
+          <w:t xml:space="preserve">classified as </w:t>
         </w:r>
       </w:ins>
+      <w:del w:id="117" w:author="Benjamin J. Makhlouf" w:date="2025-10-09T09:57:00Z" w16du:dateUtc="2025-10-09T16:57:00Z">
+        <w:r>
+          <w:rPr>
+            <w:rFonts w:ascii="Garamond" w:hAnsi="Garamond"/>
+            <w:sz w:val="22"/>
+            <w:szCs w:val="22"/>
+          </w:rPr>
+          <w:delText xml:space="preserve">estimated to have been </w:delText>
+        </w:r>
+      </w:del>
+      <w:r>
+        <w:rPr>
+          <w:rFonts w:ascii="Garamond" w:hAnsi="Garamond"/>
+          <w:sz w:val="22"/>
+          <w:szCs w:val="22"/>
+        </w:rPr>
+        <w:t xml:space="preserve">Kuskokwim (8.6% of Kuskokwim fish) followed by the inverse (5.6% of Nushagak fish). Interestingly, after removing the </w:t>
+      </w:r>
+      <w:r>
+        <w:rPr>
+          <w:rFonts w:ascii="Garamond" w:hAnsi="Garamond"/>
+          <w:sz w:val="22"/>
+          <w:szCs w:val="22"/>
+        </w:rPr>
+        <w:t xml:space="preserve">most </w:t>
+      </w:r>
       <w:r>
         <w:rPr>
           <w:rFonts w:ascii="Garamond" w:hAnsi="Garamond"/>
@@ -8886,18 +9006,44 @@
           <w:sz w:val="22"/>
           <w:szCs w:val="22"/>
         </w:rPr>
-        <w:t xml:space="preserve">.7150), Yukon classification accuracy dropped to 86.8%. Classification accuracy for Nushagak fish did not change (91.4%) whereas Kuskokwim saw a slight increase to 92.5%. In this testing </w:t>
-      </w:r>
-      <w:ins w:id="114" w:author="Daniel Schindler" w:date="2025-10-06T10:55:00Z" w16du:dateUtc="2025-10-06T17:55:00Z">
-        <w:r>
-          <w:rPr>
-            <w:rFonts w:ascii="Garamond" w:hAnsi="Garamond"/>
-            <w:sz w:val="22"/>
-            <w:szCs w:val="22"/>
-          </w:rPr>
-          <w:t>data</w:t>
+        <w:t>.71</w:t>
+      </w:r>
+      <w:ins w:id="118" w:author="Benjamin J. Makhlouf" w:date="2025-10-09T09:57:00Z" w16du:dateUtc="2025-10-09T16:57:00Z">
+        <w:r>
+          <w:rPr>
+            <w:rFonts w:ascii="Garamond" w:hAnsi="Garamond"/>
+            <w:sz w:val="22"/>
+            <w:szCs w:val="22"/>
+          </w:rPr>
+          <w:t>3</w:t>
         </w:r>
       </w:ins>
+      <w:del w:id="119" w:author="Benjamin J. Makhlouf" w:date="2025-10-09T09:57:00Z" w16du:dateUtc="2025-10-09T16:57:00Z">
+        <w:r>
+          <w:rPr>
+            <w:rFonts w:ascii="Garamond" w:hAnsi="Garamond"/>
+            <w:sz w:val="22"/>
+            <w:szCs w:val="22"/>
+          </w:rPr>
+          <w:delText>5</w:delText>
+        </w:r>
+      </w:del>
+      <w:r>
+        <w:rPr>
+          <w:rFonts w:ascii="Garamond" w:hAnsi="Garamond"/>
+          <w:sz w:val="22"/>
+          <w:szCs w:val="22"/>
+        </w:rPr>
+        <w:t xml:space="preserve">0), Yukon classification accuracy dropped to 86.8%. Classification accuracy for Nushagak fish did not change (91.4%) whereas Kuskokwim saw a slight increase to 92.5%. In this testing </w:t>
+      </w:r>
+      <w:r>
+        <w:rPr>
+          <w:rFonts w:ascii="Garamond" w:hAnsi="Garamond"/>
+          <w:sz w:val="22"/>
+          <w:szCs w:val="22"/>
+        </w:rPr>
+        <w:t>data</w:t>
+      </w:r>
       <w:r>
         <w:rPr>
           <w:rFonts w:ascii="Garamond" w:hAnsi="Garamond"/>
@@ -8922,7 +9068,25 @@
           <w:sz w:val="22"/>
           <w:szCs w:val="22"/>
         </w:rPr>
-        <w:t xml:space="preserve"> however this represented only one additional individual misclassified (9 in the total analysis vs 8 in the overlapping analysis). </w:t>
+        <w:t xml:space="preserve"> however this represented only one additional individual misclassified (9 in the total analysis vs</w:t>
+      </w:r>
+      <w:ins w:id="120" w:author="Benjamin J. Makhlouf" w:date="2025-10-09T09:58:00Z" w16du:dateUtc="2025-10-09T16:58:00Z">
+        <w:r>
+          <w:rPr>
+            <w:rFonts w:ascii="Garamond" w:hAnsi="Garamond"/>
+            <w:sz w:val="22"/>
+            <w:szCs w:val="22"/>
+          </w:rPr>
+          <w:t>.</w:t>
+        </w:r>
+      </w:ins>
+      <w:r>
+        <w:rPr>
+          <w:rFonts w:ascii="Garamond" w:hAnsi="Garamond"/>
+          <w:sz w:val="22"/>
+          <w:szCs w:val="22"/>
+        </w:rPr>
+        <w:t xml:space="preserve"> 8 in the overlapping analysis). </w:t>
       </w:r>
       <w:r>
         <w:rPr>
@@ -8951,6 +9115,7 @@
           <w:tab w:val="left" w:pos="3088"/>
         </w:tabs>
         <w:rPr>
+          <w:del w:id="121" w:author="Benjamin J. Makhlouf" w:date="2025-10-09T09:59:00Z" w16du:dateUtc="2025-10-09T16:59:00Z"/>
           <w:rFonts w:ascii="Garamond" w:hAnsi="Garamond"/>
           <w:b/>
           <w:bCs/>
@@ -8991,67 +9156,155 @@
         <w:spacing w:line="480" w:lineRule="auto"/>
         <w:ind w:firstLine="720"/>
         <w:rPr>
-          <w:rFonts w:ascii="Garamond" w:hAnsi="Garamond"/>
-          <w:sz w:val="22"/>
-          <w:szCs w:val="22"/>
-        </w:rPr>
+          <w:del w:id="122" w:author="Benjamin J. Makhlouf" w:date="2025-10-09T10:05:00Z" w16du:dateUtc="2025-10-09T17:05:00Z"/>
+          <w:rFonts w:ascii="Garamond" w:hAnsi="Garamond"/>
+          <w:bCs/>
+          <w:sz w:val="22"/>
+          <w:szCs w:val="22"/>
+        </w:rPr>
+        <w:pPrChange w:id="123" w:author="Benjamin J. Makhlouf" w:date="2025-10-09T10:05:00Z" w16du:dateUtc="2025-10-09T17:05:00Z">
+          <w:pPr>
+            <w:pStyle w:val="NoSpacing"/>
+            <w:spacing w:line="480" w:lineRule="auto"/>
+            <w:ind w:firstLine="720"/>
+          </w:pPr>
+        </w:pPrChange>
       </w:pPr>
-      <w:r>
-        <w:rPr>
-          <w:rFonts w:ascii="Garamond" w:hAnsi="Garamond"/>
-          <w:sz w:val="22"/>
-          <w:szCs w:val="22"/>
-        </w:rPr>
-        <w:t xml:space="preserve">The result of </w:t>
-      </w:r>
-      <w:commentRangeStart w:id="115"/>
-      <w:r>
-        <w:rPr>
-          <w:rFonts w:ascii="Garamond" w:hAnsi="Garamond"/>
-          <w:sz w:val="22"/>
-          <w:szCs w:val="22"/>
-        </w:rPr>
-        <w:t xml:space="preserve">probability tuning </w:t>
-      </w:r>
-      <w:commentRangeEnd w:id="115"/>
-      <w:r>
-        <w:rPr>
-          <w:rStyle w:val="CommentReference"/>
-        </w:rPr>
-        <w:commentReference w:id="115"/>
-      </w:r>
-      <w:r>
-        <w:rPr>
-          <w:rFonts w:ascii="Garamond" w:hAnsi="Garamond"/>
-          <w:sz w:val="22"/>
-          <w:szCs w:val="22"/>
-        </w:rPr>
-        <w:t xml:space="preserve">demonstrated consistent improvements in probability calibration across all models. Log-loss values decreased by an average of 0.0026 (, while Brier scores improved by an average of 0. The TOTAL analysis framework showed marginally larger improvements compared to the OVERLAP framework, with GAM-smoothed data showing the most consistent calibration performance. Visual inspection of </w:t>
-      </w:r>
-      <w:commentRangeStart w:id="116"/>
-      <w:r>
-        <w:rPr>
-          <w:rFonts w:ascii="Garamond" w:hAnsi="Garamond"/>
-          <w:sz w:val="22"/>
-          <w:szCs w:val="22"/>
-        </w:rPr>
-        <w:t xml:space="preserve">reliability diagrams </w:t>
-      </w:r>
-      <w:commentRangeEnd w:id="116"/>
-      <w:r>
-        <w:rPr>
-          <w:rStyle w:val="CommentReference"/>
-        </w:rPr>
-        <w:commentReference w:id="116"/>
-      </w:r>
-      <w:r>
-        <w:rPr>
-          <w:rFonts w:ascii="Garamond" w:hAnsi="Garamond"/>
-          <w:sz w:val="22"/>
-          <w:szCs w:val="22"/>
-        </w:rPr>
-        <w:t xml:space="preserve">confirmed improved alignment between predicted and observed probabilities following calibration. </w:t>
-      </w:r>
+      <w:ins w:id="124" w:author="Benjamin J. Makhlouf" w:date="2025-10-09T10:04:00Z" w16du:dateUtc="2025-10-09T17:04:00Z">
+        <w:r>
+          <w:rPr>
+            <w:rFonts w:ascii="Garamond" w:hAnsi="Garamond"/>
+            <w:sz w:val="22"/>
+            <w:szCs w:val="22"/>
+            <w:rPrChange w:id="125" w:author="Benjamin J. Makhlouf" w:date="2025-10-09T10:04:00Z" w16du:dateUtc="2025-10-09T17:04:00Z">
+              <w:rPr/>
+            </w:rPrChange>
+          </w:rPr>
+          <w:t>Probability tuning was used to align predicted probabilities from classification algorithms with the observed probabilities through calibration of model outputs to better reflect true class likelihoods</w:t>
+        </w:r>
+      </w:ins>
+      <w:ins w:id="126" w:author="Benjamin J. Makhlouf" w:date="2025-10-09T10:05:00Z" w16du:dateUtc="2025-10-09T17:05:00Z">
+        <w:r>
+          <w:rPr>
+            <w:rFonts w:ascii="Garamond" w:hAnsi="Garamond"/>
+            <w:sz w:val="22"/>
+            <w:szCs w:val="22"/>
+          </w:rPr>
+          <w:t xml:space="preserve"> (cite)</w:t>
+        </w:r>
+      </w:ins>
+      <w:ins w:id="127" w:author="Benjamin J. Makhlouf" w:date="2025-10-09T10:04:00Z" w16du:dateUtc="2025-10-09T17:04:00Z">
+        <w:r>
+          <w:rPr>
+            <w:rFonts w:ascii="Garamond" w:hAnsi="Garamond"/>
+            <w:sz w:val="22"/>
+            <w:szCs w:val="22"/>
+            <w:rPrChange w:id="128" w:author="Benjamin J. Makhlouf" w:date="2025-10-09T10:04:00Z" w16du:dateUtc="2025-10-09T17:04:00Z">
+              <w:rPr/>
+            </w:rPrChange>
+          </w:rPr>
+          <w:t>. Visual assessments indicated improved calibration, with the relationship between predicted and observed probabilities approximating a 1:1 line across all classes and model–data type combinations</w:t>
+        </w:r>
+      </w:ins>
+      <w:ins w:id="129" w:author="Benjamin J. Makhlouf" w:date="2025-10-09T10:05:00Z" w16du:dateUtc="2025-10-09T17:05:00Z">
+        <w:r>
+          <w:rPr>
+            <w:rFonts w:ascii="Garamond" w:hAnsi="Garamond"/>
+            <w:sz w:val="22"/>
+            <w:szCs w:val="22"/>
+          </w:rPr>
+          <w:t xml:space="preserve"> (ex. Supp. Fig 1</w:t>
+        </w:r>
+        <w:proofErr w:type="gramStart"/>
+        <w:r>
+          <w:rPr>
+            <w:rFonts w:ascii="Garamond" w:hAnsi="Garamond"/>
+            <w:sz w:val="22"/>
+            <w:szCs w:val="22"/>
+          </w:rPr>
+          <w:t xml:space="preserve">) </w:t>
+        </w:r>
+      </w:ins>
+      <w:ins w:id="130" w:author="Benjamin J. Makhlouf" w:date="2025-10-09T10:04:00Z" w16du:dateUtc="2025-10-09T17:04:00Z">
+        <w:r>
+          <w:rPr>
+            <w:rFonts w:ascii="Garamond" w:hAnsi="Garamond"/>
+            <w:sz w:val="22"/>
+            <w:szCs w:val="22"/>
+            <w:rPrChange w:id="131" w:author="Benjamin J. Makhlouf" w:date="2025-10-09T10:04:00Z" w16du:dateUtc="2025-10-09T17:04:00Z">
+              <w:rPr/>
+            </w:rPrChange>
+          </w:rPr>
+          <w:t>.</w:t>
+        </w:r>
+        <w:proofErr w:type="gramEnd"/>
+        <w:r>
+          <w:rPr>
+            <w:rFonts w:ascii="Garamond" w:hAnsi="Garamond"/>
+            <w:sz w:val="22"/>
+            <w:szCs w:val="22"/>
+          </w:rPr>
+          <w:t xml:space="preserve"> </w:t>
+        </w:r>
+      </w:ins>
+      <w:del w:id="132" w:author="Benjamin J. Makhlouf" w:date="2025-10-09T10:05:00Z" w16du:dateUtc="2025-10-09T17:05:00Z">
+        <w:r>
+          <w:rPr>
+            <w:rFonts w:ascii="Garamond" w:hAnsi="Garamond"/>
+            <w:sz w:val="22"/>
+            <w:szCs w:val="22"/>
+          </w:rPr>
+          <w:delText xml:space="preserve">The result of </w:delText>
+        </w:r>
+        <w:commentRangeStart w:id="133"/>
+        <w:r>
+          <w:rPr>
+            <w:rFonts w:ascii="Garamond" w:hAnsi="Garamond"/>
+            <w:sz w:val="22"/>
+            <w:szCs w:val="22"/>
+          </w:rPr>
+          <w:delText xml:space="preserve">probability tuning </w:delText>
+        </w:r>
+        <w:commentRangeEnd w:id="133"/>
+        <w:r>
+          <w:rPr>
+            <w:rStyle w:val="CommentReference"/>
+          </w:rPr>
+          <w:commentReference w:id="133"/>
+        </w:r>
+        <w:r>
+          <w:rPr>
+            <w:rFonts w:ascii="Garamond" w:hAnsi="Garamond"/>
+            <w:sz w:val="22"/>
+            <w:szCs w:val="22"/>
+          </w:rPr>
+          <w:delText xml:space="preserve">demonstrated consistent improvements in probability calibration across all models. Log-loss values decreased by an average of 0.0026 (, while Brier scores improved by an average of 0. The TOTAL analysis framework showed marginally larger improvements compared to the OVERLAP framework, with GAM-smoothed data showing the most consistent calibration performance. Visual inspection of </w:delText>
+        </w:r>
+        <w:commentRangeStart w:id="134"/>
+        <w:r>
+          <w:rPr>
+            <w:rFonts w:ascii="Garamond" w:hAnsi="Garamond"/>
+            <w:sz w:val="22"/>
+            <w:szCs w:val="22"/>
+          </w:rPr>
+          <w:delText xml:space="preserve">reliability diagrams </w:delText>
+        </w:r>
+        <w:commentRangeEnd w:id="134"/>
+        <w:r>
+          <w:rPr>
+            <w:rStyle w:val="CommentReference"/>
+          </w:rPr>
+          <w:commentReference w:id="134"/>
+        </w:r>
+        <w:r>
+          <w:rPr>
+            <w:rFonts w:ascii="Garamond" w:hAnsi="Garamond"/>
+            <w:sz w:val="22"/>
+            <w:szCs w:val="22"/>
+          </w:rPr>
+          <w:delText xml:space="preserve">confirmed improved alignment between predicted and observed probabilities following calibration. </w:delText>
+        </w:r>
+      </w:del>
     </w:p>
     <w:p>
       <w:pPr>
@@ -9059,6 +9312,7 @@
         <w:spacing w:line="480" w:lineRule="auto"/>
         <w:ind w:firstLine="720"/>
         <w:rPr>
+          <w:del w:id="135" w:author="Benjamin J. Makhlouf" w:date="2025-10-09T10:06:00Z" w16du:dateUtc="2025-10-09T17:06:00Z"/>
           <w:rFonts w:ascii="Garamond" w:hAnsi="Garamond"/>
           <w:b/>
           <w:bCs/>
@@ -9066,7 +9320,7 @@
           <w:szCs w:val="22"/>
         </w:rPr>
       </w:pPr>
-      <w:commentRangeStart w:id="117"/>
+      <w:commentRangeStart w:id="136"/>
       <w:r>
         <w:rPr>
           <w:rFonts w:ascii="Garamond" w:hAnsi="Garamond"/>
@@ -9075,12 +9329,12 @@
         </w:rPr>
         <w:t>Across the range of tested thresholds, overall accuracy ranged from 91 – 79% for the total testing set and from 89.5% to 78% for the overlapping dataset</w:t>
       </w:r>
-      <w:commentRangeEnd w:id="117"/>
+      <w:commentRangeEnd w:id="136"/>
       <w:r>
         <w:rPr>
           <w:rStyle w:val="CommentReference"/>
         </w:rPr>
-        <w:commentReference w:id="117"/>
+        <w:commentReference w:id="136"/>
       </w:r>
       <w:r>
         <w:rPr>
@@ -9096,21 +9350,13 @@
           <w:sz w:val="22"/>
           <w:szCs w:val="22"/>
         </w:rPr>
-        <w:t xml:space="preserve">. In the total dataset, Yukon classification accuracy remained well above 90%, even at the very high (&gt;90%) confidence threshold. Nushagak and Kuskokwim, however, fell steadily as the threshold was raised. Kuskokwim classification accuracy dropped steadily from 87% to 71% whereas Nushagak accuracy declined more quickly at higher </w:t>
-      </w:r>
-      <w:r>
-        <w:rPr>
-          <w:rFonts w:ascii="Garamond" w:hAnsi="Garamond"/>
-          <w:sz w:val="22"/>
-          <w:szCs w:val="22"/>
-        </w:rPr>
-        <w:lastRenderedPageBreak/>
-        <w:t xml:space="preserve">probability thresholds from 92% to 75%. The overlapping dataset contained slightly different trends, with Yukon accuracy remaining relatively stable between 89% and 83% over the full range of threshold values. In this testing set Nushagak accuracy dropped steadily from 91% to 84%, whereas Kuskokwim accuracy declined rapidly from 89% to 69%. (Figure 6). </w:t>
+        <w:t xml:space="preserve">. In the total dataset, Yukon classification accuracy remained well above 90%, even at the very high (&gt;90%) confidence threshold. Nushagak and Kuskokwim, however, fell steadily as the threshold was raised. Kuskokwim classification accuracy dropped steadily from 87% to 71% whereas Nushagak accuracy declined more quickly at higher probability thresholds from 92% to 75%. The overlapping dataset contained slightly different trends, with Yukon accuracy remaining relatively stable between 89% and 83% over the full range of threshold values. In this testing set Nushagak accuracy dropped steadily from 91% to 84%, whereas Kuskokwim accuracy declined rapidly from 89% to 69%. (Figure 6). </w:t>
       </w:r>
     </w:p>
     <w:p>
       <w:pPr>
         <w:rPr>
+          <w:del w:id="137" w:author="Benjamin J. Makhlouf" w:date="2025-10-09T10:06:00Z" w16du:dateUtc="2025-10-09T17:06:00Z"/>
           <w:rFonts w:ascii="Garamond" w:hAnsi="Garamond"/>
           <w:sz w:val="32"/>
           <w:szCs w:val="32"/>
@@ -9119,11 +9365,12 @@
     </w:p>
     <w:p>
       <w:pPr>
-        <w:rPr>
-          <w:rFonts w:ascii="Garamond" w:hAnsi="Garamond"/>
-          <w:sz w:val="32"/>
-          <w:szCs w:val="32"/>
-        </w:rPr>
+        <w:pStyle w:val="NoSpacing"/>
+        <w:spacing w:line="480" w:lineRule="auto"/>
+        <w:ind w:firstLine="720"/>
+        <w:pPrChange w:id="138" w:author="Benjamin J. Makhlouf" w:date="2025-10-09T10:06:00Z" w16du:dateUtc="2025-10-09T17:06:00Z">
+          <w:pPr/>
+        </w:pPrChange>
       </w:pPr>
     </w:p>
     <w:p>
@@ -9144,6 +9391,7 @@
           <w:sz w:val="32"/>
           <w:szCs w:val="32"/>
         </w:rPr>
+        <w:lastRenderedPageBreak/>
         <w:t xml:space="preserve">Discussion </w:t>
       </w:r>
     </w:p>
@@ -9165,299 +9413,311 @@
         </w:rPr>
         <w:t xml:space="preserve">Machine learning tools applied to otolith laser ablation </w:t>
       </w:r>
-      <w:ins w:id="118" w:author="Daniel Schindler" w:date="2025-10-02T15:16:00Z" w16du:dateUtc="2025-10-02T22:16:00Z">
-        <w:r>
-          <w:rPr>
-            <w:rFonts w:ascii="Garamond" w:hAnsi="Garamond"/>
-            <w:sz w:val="22"/>
-            <w:szCs w:val="22"/>
-          </w:rPr>
-          <w:t>time series</w:t>
+      <w:r>
+        <w:rPr>
+          <w:rFonts w:ascii="Garamond" w:hAnsi="Garamond"/>
+          <w:sz w:val="22"/>
+          <w:szCs w:val="22"/>
+        </w:rPr>
+        <w:t>time series</w:t>
+      </w:r>
+      <w:r>
+        <w:rPr>
+          <w:rFonts w:ascii="Garamond" w:hAnsi="Garamond"/>
+          <w:sz w:val="22"/>
+          <w:szCs w:val="22"/>
+        </w:rPr>
+        <w:t xml:space="preserve"> data proved highly effective for classifying </w:t>
+      </w:r>
+      <w:r>
+        <w:rPr>
+          <w:rFonts w:ascii="Garamond" w:hAnsi="Garamond"/>
+          <w:sz w:val="22"/>
+          <w:szCs w:val="22"/>
+        </w:rPr>
+        <w:t>w</w:t>
+      </w:r>
+      <w:r>
+        <w:rPr>
+          <w:rFonts w:ascii="Garamond" w:hAnsi="Garamond"/>
+          <w:sz w:val="22"/>
+          <w:szCs w:val="22"/>
+        </w:rPr>
+        <w:t>estern Alaska Chinook salmon to their rivers of origin</w:t>
+      </w:r>
+      <w:r>
+        <w:rPr>
+          <w:rFonts w:ascii="Garamond" w:hAnsi="Garamond"/>
+          <w:sz w:val="22"/>
+          <w:szCs w:val="22"/>
+        </w:rPr>
+        <w:t xml:space="preserve"> when trained on a large dataset of known-origin individuals.</w:t>
+      </w:r>
+      <w:r>
+        <w:rPr>
+          <w:rFonts w:ascii="Garamond" w:hAnsi="Garamond"/>
+          <w:sz w:val="22"/>
+          <w:szCs w:val="22"/>
+        </w:rPr>
+        <w:t xml:space="preserve"> We selected three methods (KNN, RF, and SVM) to represent a spectrum of commonly used </w:t>
+      </w:r>
+      <w:r>
+        <w:rPr>
+          <w:rFonts w:ascii="Garamond" w:hAnsi="Garamond"/>
+          <w:sz w:val="22"/>
+          <w:szCs w:val="22"/>
+        </w:rPr>
+        <w:t>ML</w:t>
+      </w:r>
+      <w:r>
+        <w:rPr>
+          <w:rFonts w:ascii="Garamond" w:hAnsi="Garamond"/>
+          <w:sz w:val="22"/>
+          <w:szCs w:val="22"/>
+        </w:rPr>
+        <w:t xml:space="preserve"> techniques, ranging from the </w:t>
+      </w:r>
+      <w:r>
+        <w:rPr>
+          <w:rFonts w:ascii="Garamond" w:hAnsi="Garamond"/>
+          <w:sz w:val="22"/>
+          <w:szCs w:val="22"/>
+        </w:rPr>
+        <w:t xml:space="preserve">relatively simple KNN to more complex, nonlinear approaches like RF and SVM. Among these, random forest algorithms emerged as particularly powerful and robust, achieving over 90% classification accuracy </w:t>
+      </w:r>
+      <w:r>
+        <w:rPr>
+          <w:rFonts w:ascii="Garamond" w:hAnsi="Garamond"/>
+          <w:sz w:val="22"/>
+          <w:szCs w:val="22"/>
+        </w:rPr>
+        <w:t xml:space="preserve">across the </w:t>
+      </w:r>
+      <w:r>
+        <w:rPr>
+          <w:rFonts w:ascii="Garamond" w:hAnsi="Garamond"/>
+          <w:sz w:val="22"/>
+          <w:szCs w:val="22"/>
+        </w:rPr>
+        <w:t xml:space="preserve">smoothed datasets. Notably, even our simplest model (KNN) performed well, delivering reasonably high classification accuracy across both testing sets. </w:t>
+      </w:r>
+      <w:r>
+        <w:rPr>
+          <w:rFonts w:ascii="Garamond" w:hAnsi="Garamond"/>
+          <w:sz w:val="22"/>
+          <w:szCs w:val="22"/>
+        </w:rPr>
+        <w:t xml:space="preserve">Datasets preprocessed with </w:t>
+      </w:r>
+      <w:r>
+        <w:rPr>
+          <w:rFonts w:ascii="Garamond" w:hAnsi="Garamond"/>
+          <w:sz w:val="22"/>
+          <w:szCs w:val="22"/>
+        </w:rPr>
+        <w:t>time series</w:t>
+      </w:r>
+      <w:r>
+        <w:rPr>
+          <w:rFonts w:ascii="Garamond" w:hAnsi="Garamond"/>
+          <w:sz w:val="22"/>
+          <w:szCs w:val="22"/>
+        </w:rPr>
+        <w:t xml:space="preserve"> smoothing techniques significantly outperformed raw laser ablation data. </w:t>
+      </w:r>
+      <w:commentRangeStart w:id="139"/>
+      <w:r>
+        <w:rPr>
+          <w:rFonts w:ascii="Garamond" w:hAnsi="Garamond"/>
+          <w:sz w:val="22"/>
+          <w:szCs w:val="22"/>
+        </w:rPr>
+        <w:t xml:space="preserve">This is </w:t>
+      </w:r>
+      <w:r>
+        <w:rPr>
+          <w:rFonts w:ascii="Garamond" w:hAnsi="Garamond"/>
+          <w:sz w:val="22"/>
+          <w:szCs w:val="22"/>
+        </w:rPr>
+        <w:t>unsurprising given the inherent noise in otolith LA data</w:t>
+      </w:r>
+      <w:r>
+        <w:rPr>
+          <w:rFonts w:ascii="Garamond" w:hAnsi="Garamond"/>
+          <w:sz w:val="22"/>
+          <w:szCs w:val="22"/>
+        </w:rPr>
+        <w:t>, however,</w:t>
+      </w:r>
+      <w:r>
+        <w:rPr>
+          <w:rFonts w:ascii="Garamond" w:hAnsi="Garamond"/>
+          <w:sz w:val="22"/>
+          <w:szCs w:val="22"/>
+        </w:rPr>
+        <w:t xml:space="preserve"> </w:t>
+      </w:r>
+      <w:r>
+        <w:rPr>
+          <w:rFonts w:ascii="Garamond" w:hAnsi="Garamond"/>
+          <w:sz w:val="22"/>
+          <w:szCs w:val="22"/>
+        </w:rPr>
+        <w:t xml:space="preserve">these results </w:t>
+      </w:r>
+      <w:r>
+        <w:rPr>
+          <w:rFonts w:ascii="Garamond" w:hAnsi="Garamond"/>
+          <w:sz w:val="22"/>
+          <w:szCs w:val="22"/>
+        </w:rPr>
+        <w:t>demonstrate</w:t>
+      </w:r>
+      <w:r>
+        <w:rPr>
+          <w:rFonts w:ascii="Garamond" w:hAnsi="Garamond"/>
+          <w:sz w:val="22"/>
+          <w:szCs w:val="22"/>
+        </w:rPr>
+        <w:t xml:space="preserve"> the added value of </w:t>
+      </w:r>
+      <w:r>
+        <w:rPr>
+          <w:rFonts w:ascii="Garamond" w:hAnsi="Garamond"/>
+          <w:sz w:val="22"/>
+          <w:szCs w:val="22"/>
+        </w:rPr>
+        <w:t>applying</w:t>
+      </w:r>
+      <w:r>
+        <w:rPr>
+          <w:rFonts w:ascii="Garamond" w:hAnsi="Garamond"/>
+          <w:sz w:val="22"/>
+          <w:szCs w:val="22"/>
+        </w:rPr>
+        <w:t xml:space="preserve"> </w:t>
+      </w:r>
+      <w:r>
+        <w:rPr>
+          <w:rFonts w:ascii="Garamond" w:hAnsi="Garamond"/>
+          <w:sz w:val="22"/>
+          <w:szCs w:val="22"/>
+        </w:rPr>
+        <w:t>time series</w:t>
+      </w:r>
+      <w:r>
+        <w:rPr>
+          <w:rFonts w:ascii="Garamond" w:hAnsi="Garamond"/>
+          <w:sz w:val="22"/>
+          <w:szCs w:val="22"/>
+        </w:rPr>
+        <w:t xml:space="preserve"> </w:t>
+      </w:r>
+      <w:proofErr w:type="spellStart"/>
+      <w:ins w:id="140" w:author="Benjamin J. Makhlouf" w:date="2025-10-09T10:07:00Z" w16du:dateUtc="2025-10-09T17:07:00Z">
+        <w:r>
+          <w:rPr>
+            <w:rFonts w:ascii="Garamond" w:hAnsi="Garamond"/>
+            <w:sz w:val="22"/>
+            <w:szCs w:val="22"/>
+          </w:rPr>
+          <w:t>preprocesing</w:t>
         </w:r>
       </w:ins>
-      <w:r>
-        <w:rPr>
-          <w:rFonts w:ascii="Garamond" w:hAnsi="Garamond"/>
-          <w:sz w:val="22"/>
-          <w:szCs w:val="22"/>
-        </w:rPr>
-        <w:t xml:space="preserve"> data proved highly effective for classifying </w:t>
-      </w:r>
-      <w:ins w:id="119" w:author="Daniel Schindler" w:date="2025-10-06T11:01:00Z" w16du:dateUtc="2025-10-06T18:01:00Z">
-        <w:r>
-          <w:rPr>
-            <w:rFonts w:ascii="Garamond" w:hAnsi="Garamond"/>
-            <w:sz w:val="22"/>
-            <w:szCs w:val="22"/>
-          </w:rPr>
-          <w:t>w</w:t>
+      <w:proofErr w:type="spellEnd"/>
+      <w:del w:id="141" w:author="Benjamin J. Makhlouf" w:date="2025-10-09T10:07:00Z" w16du:dateUtc="2025-10-09T17:07:00Z">
+        <w:r>
+          <w:rPr>
+            <w:rFonts w:ascii="Garamond" w:hAnsi="Garamond"/>
+            <w:sz w:val="22"/>
+            <w:szCs w:val="22"/>
+          </w:rPr>
+          <w:delText>analysis</w:delText>
+        </w:r>
+      </w:del>
+      <w:r>
+        <w:rPr>
+          <w:rFonts w:ascii="Garamond" w:hAnsi="Garamond"/>
+          <w:sz w:val="22"/>
+          <w:szCs w:val="22"/>
+        </w:rPr>
+        <w:t xml:space="preserve"> techniques to otolith LA </w:t>
+      </w:r>
+      <w:r>
+        <w:rPr>
+          <w:rFonts w:ascii="Garamond" w:hAnsi="Garamond"/>
+          <w:sz w:val="22"/>
+          <w:szCs w:val="22"/>
+        </w:rPr>
+        <w:t>datasets</w:t>
+      </w:r>
+      <w:r>
+        <w:rPr>
+          <w:rFonts w:ascii="Garamond" w:hAnsi="Garamond"/>
+          <w:sz w:val="22"/>
+          <w:szCs w:val="22"/>
+        </w:rPr>
+        <w:t xml:space="preserve"> and suggests that even greater discriminatory power may be possible through the </w:t>
+      </w:r>
+      <w:r>
+        <w:rPr>
+          <w:rFonts w:ascii="Garamond" w:hAnsi="Garamond"/>
+          <w:sz w:val="22"/>
+          <w:szCs w:val="22"/>
+        </w:rPr>
+        <w:t>use of additional</w:t>
+      </w:r>
+      <w:ins w:id="142" w:author="Benjamin J. Makhlouf" w:date="2025-10-09T10:07:00Z" w16du:dateUtc="2025-10-09T17:07:00Z">
+        <w:r>
+          <w:rPr>
+            <w:rFonts w:ascii="Garamond" w:hAnsi="Garamond"/>
+            <w:sz w:val="22"/>
+            <w:szCs w:val="22"/>
+          </w:rPr>
+          <w:t>, more complicated approaches</w:t>
         </w:r>
       </w:ins>
-      <w:r>
-        <w:rPr>
-          <w:rFonts w:ascii="Garamond" w:hAnsi="Garamond"/>
-          <w:sz w:val="22"/>
-          <w:szCs w:val="22"/>
-        </w:rPr>
-        <w:t>estern Alaska Chinook salmon to their rivers of origin</w:t>
-      </w:r>
-      <w:r>
-        <w:rPr>
-          <w:rFonts w:ascii="Garamond" w:hAnsi="Garamond"/>
-          <w:sz w:val="22"/>
-          <w:szCs w:val="22"/>
-        </w:rPr>
-        <w:t xml:space="preserve"> when trained on a large dataset of known-origin individuals.</w:t>
-      </w:r>
-      <w:r>
-        <w:rPr>
-          <w:rFonts w:ascii="Garamond" w:hAnsi="Garamond"/>
-          <w:sz w:val="22"/>
-          <w:szCs w:val="22"/>
-        </w:rPr>
-        <w:t xml:space="preserve"> We selected three methods (KNN, RF, and SVM) to represent a spectrum of commonly used </w:t>
-      </w:r>
-      <w:ins w:id="120" w:author="Daniel Schindler" w:date="2025-10-02T14:29:00Z" w16du:dateUtc="2025-10-02T21:29:00Z">
-        <w:r>
-          <w:rPr>
-            <w:rFonts w:ascii="Garamond" w:hAnsi="Garamond"/>
-            <w:sz w:val="22"/>
-            <w:szCs w:val="22"/>
-          </w:rPr>
-          <w:t>ML</w:t>
-        </w:r>
-      </w:ins>
-      <w:r>
-        <w:rPr>
-          <w:rFonts w:ascii="Garamond" w:hAnsi="Garamond"/>
-          <w:sz w:val="22"/>
-          <w:szCs w:val="22"/>
-        </w:rPr>
-        <w:t xml:space="preserve"> techniques, ranging from the </w:t>
-      </w:r>
-      <w:r>
-        <w:rPr>
-          <w:rFonts w:ascii="Garamond" w:hAnsi="Garamond"/>
-          <w:sz w:val="22"/>
-          <w:szCs w:val="22"/>
-        </w:rPr>
-        <w:t xml:space="preserve">relatively simple KNN to more complex, nonlinear approaches like RF and SVM. Among these, random forest algorithms emerged as particularly powerful and robust, achieving over 90% classification accuracy </w:t>
-      </w:r>
-      <w:r>
-        <w:rPr>
-          <w:rFonts w:ascii="Garamond" w:hAnsi="Garamond"/>
-          <w:sz w:val="22"/>
-          <w:szCs w:val="22"/>
-        </w:rPr>
-        <w:t xml:space="preserve">across the </w:t>
-      </w:r>
-      <w:r>
-        <w:rPr>
-          <w:rFonts w:ascii="Garamond" w:hAnsi="Garamond"/>
-          <w:sz w:val="22"/>
-          <w:szCs w:val="22"/>
-        </w:rPr>
-        <w:t xml:space="preserve">smoothed datasets. Notably, even our simplest model (KNN) performed well, delivering reasonably high classification accuracy across both testing sets. </w:t>
-      </w:r>
-      <w:r>
-        <w:rPr>
-          <w:rFonts w:ascii="Garamond" w:hAnsi="Garamond"/>
-          <w:sz w:val="22"/>
-          <w:szCs w:val="22"/>
-        </w:rPr>
-        <w:t xml:space="preserve">Datasets preprocessed with </w:t>
-      </w:r>
-      <w:r>
-        <w:rPr>
-          <w:rFonts w:ascii="Garamond" w:hAnsi="Garamond"/>
-          <w:sz w:val="22"/>
-          <w:szCs w:val="22"/>
-        </w:rPr>
-        <w:t>time series</w:t>
-      </w:r>
-      <w:r>
-        <w:rPr>
-          <w:rFonts w:ascii="Garamond" w:hAnsi="Garamond"/>
-          <w:sz w:val="22"/>
-          <w:szCs w:val="22"/>
-        </w:rPr>
-        <w:t xml:space="preserve"> smoothing techniques significantly outperformed raw laser ablation data. </w:t>
-      </w:r>
-      <w:commentRangeStart w:id="121"/>
-      <w:r>
-        <w:rPr>
-          <w:rFonts w:ascii="Garamond" w:hAnsi="Garamond"/>
-          <w:sz w:val="22"/>
-          <w:szCs w:val="22"/>
-        </w:rPr>
-        <w:t xml:space="preserve">This is </w:t>
-      </w:r>
-      <w:r>
-        <w:rPr>
-          <w:rFonts w:ascii="Garamond" w:hAnsi="Garamond"/>
-          <w:sz w:val="22"/>
-          <w:szCs w:val="22"/>
-        </w:rPr>
-        <w:t>unsurprising given the inherent noise in otolith LA data</w:t>
-      </w:r>
-      <w:r>
-        <w:rPr>
-          <w:rFonts w:ascii="Garamond" w:hAnsi="Garamond"/>
-          <w:sz w:val="22"/>
-          <w:szCs w:val="22"/>
-        </w:rPr>
-        <w:t>, however,</w:t>
-      </w:r>
-      <w:r>
-        <w:rPr>
-          <w:rFonts w:ascii="Garamond" w:hAnsi="Garamond"/>
-          <w:sz w:val="22"/>
-          <w:szCs w:val="22"/>
-        </w:rPr>
-        <w:t xml:space="preserve"> </w:t>
-      </w:r>
-      <w:r>
-        <w:rPr>
-          <w:rFonts w:ascii="Garamond" w:hAnsi="Garamond"/>
-          <w:sz w:val="22"/>
-          <w:szCs w:val="22"/>
-        </w:rPr>
-        <w:t xml:space="preserve">these results </w:t>
-      </w:r>
-      <w:r>
-        <w:rPr>
-          <w:rFonts w:ascii="Garamond" w:hAnsi="Garamond"/>
-          <w:sz w:val="22"/>
-          <w:szCs w:val="22"/>
-        </w:rPr>
-        <w:t>demonstrate</w:t>
-      </w:r>
-      <w:r>
-        <w:rPr>
-          <w:rFonts w:ascii="Garamond" w:hAnsi="Garamond"/>
-          <w:sz w:val="22"/>
-          <w:szCs w:val="22"/>
-        </w:rPr>
-        <w:t xml:space="preserve"> the added value of </w:t>
-      </w:r>
-      <w:r>
-        <w:rPr>
-          <w:rFonts w:ascii="Garamond" w:hAnsi="Garamond"/>
-          <w:sz w:val="22"/>
-          <w:szCs w:val="22"/>
-        </w:rPr>
-        <w:t>applying</w:t>
-      </w:r>
-      <w:r>
-        <w:rPr>
-          <w:rFonts w:ascii="Garamond" w:hAnsi="Garamond"/>
-          <w:sz w:val="22"/>
-          <w:szCs w:val="22"/>
-        </w:rPr>
-        <w:t xml:space="preserve"> </w:t>
-      </w:r>
-      <w:ins w:id="122" w:author="Daniel Schindler" w:date="2025-10-02T15:16:00Z" w16du:dateUtc="2025-10-02T22:16:00Z">
-        <w:r>
-          <w:rPr>
-            <w:rFonts w:ascii="Garamond" w:hAnsi="Garamond"/>
-            <w:sz w:val="22"/>
-            <w:szCs w:val="22"/>
-          </w:rPr>
-          <w:t>time series</w:t>
-        </w:r>
-      </w:ins>
-      <w:r>
-        <w:rPr>
-          <w:rFonts w:ascii="Garamond" w:hAnsi="Garamond"/>
-          <w:sz w:val="22"/>
-          <w:szCs w:val="22"/>
-        </w:rPr>
-        <w:t xml:space="preserve"> analysis</w:t>
-      </w:r>
-      <w:r>
-        <w:rPr>
-          <w:rFonts w:ascii="Garamond" w:hAnsi="Garamond"/>
-          <w:sz w:val="22"/>
-          <w:szCs w:val="22"/>
-        </w:rPr>
-        <w:t xml:space="preserve"> techniques to otolith LA </w:t>
-      </w:r>
-      <w:r>
-        <w:rPr>
-          <w:rFonts w:ascii="Garamond" w:hAnsi="Garamond"/>
-          <w:sz w:val="22"/>
-          <w:szCs w:val="22"/>
-        </w:rPr>
-        <w:t>datasets</w:t>
-      </w:r>
-      <w:r>
-        <w:rPr>
-          <w:rFonts w:ascii="Garamond" w:hAnsi="Garamond"/>
-          <w:sz w:val="22"/>
-          <w:szCs w:val="22"/>
-        </w:rPr>
-        <w:t xml:space="preserve"> and suggests that even greater discriminatory power may be possible </w:t>
-      </w:r>
-      <w:proofErr w:type="gramStart"/>
-      <w:r>
-        <w:rPr>
-          <w:rFonts w:ascii="Garamond" w:hAnsi="Garamond"/>
-          <w:sz w:val="22"/>
-          <w:szCs w:val="22"/>
-        </w:rPr>
-        <w:t xml:space="preserve">through the </w:t>
-      </w:r>
-      <w:r>
-        <w:rPr>
-          <w:rFonts w:ascii="Garamond" w:hAnsi="Garamond"/>
-          <w:sz w:val="22"/>
-          <w:szCs w:val="22"/>
-        </w:rPr>
-        <w:t>use of</w:t>
-      </w:r>
-      <w:proofErr w:type="gramEnd"/>
-      <w:r>
-        <w:rPr>
-          <w:rFonts w:ascii="Garamond" w:hAnsi="Garamond"/>
-          <w:sz w:val="22"/>
-          <w:szCs w:val="22"/>
-        </w:rPr>
-        <w:t xml:space="preserve"> additional </w:t>
-      </w:r>
-      <w:del w:id="123" w:author="Daniel Schindler" w:date="2025-10-02T15:16:00Z" w16du:dateUtc="2025-10-02T22:16:00Z">
-        <w:r>
-          <w:rPr>
-            <w:rFonts w:ascii="Garamond" w:hAnsi="Garamond"/>
-            <w:sz w:val="22"/>
-            <w:szCs w:val="22"/>
-          </w:rPr>
-          <w:delText>timeseries</w:delText>
+      <w:del w:id="143" w:author="Benjamin J. Makhlouf" w:date="2025-10-09T10:07:00Z" w16du:dateUtc="2025-10-09T17:07:00Z">
+        <w:r>
+          <w:rPr>
+            <w:rFonts w:ascii="Garamond" w:hAnsi="Garamond"/>
+            <w:sz w:val="22"/>
+            <w:szCs w:val="22"/>
+          </w:rPr>
+          <w:delText xml:space="preserve"> </w:delText>
+        </w:r>
+        <w:r>
+          <w:rPr>
+            <w:rFonts w:ascii="Garamond" w:hAnsi="Garamond"/>
+            <w:sz w:val="22"/>
+            <w:szCs w:val="22"/>
+          </w:rPr>
+          <w:delText>time series</w:delText>
+        </w:r>
+        <w:r>
+          <w:rPr>
+            <w:rFonts w:ascii="Garamond" w:hAnsi="Garamond"/>
+            <w:sz w:val="22"/>
+            <w:szCs w:val="22"/>
+          </w:rPr>
+          <w:delText xml:space="preserve"> analysis techniques</w:delText>
         </w:r>
       </w:del>
-      <w:ins w:id="124" w:author="Daniel Schindler" w:date="2025-10-02T15:16:00Z" w16du:dateUtc="2025-10-02T22:16:00Z">
-        <w:r>
-          <w:rPr>
-            <w:rFonts w:ascii="Garamond" w:hAnsi="Garamond"/>
-            <w:sz w:val="22"/>
-            <w:szCs w:val="22"/>
-          </w:rPr>
-          <w:t>time series</w:t>
-        </w:r>
-      </w:ins>
-      <w:r>
-        <w:rPr>
-          <w:rFonts w:ascii="Garamond" w:hAnsi="Garamond"/>
-          <w:sz w:val="22"/>
-          <w:szCs w:val="22"/>
-        </w:rPr>
-        <w:t xml:space="preserve"> analysis techniques. </w:t>
-      </w:r>
-      <w:commentRangeEnd w:id="121"/>
+      <w:r>
+        <w:rPr>
+          <w:rFonts w:ascii="Garamond" w:hAnsi="Garamond"/>
+          <w:sz w:val="22"/>
+          <w:szCs w:val="22"/>
+        </w:rPr>
+        <w:t xml:space="preserve">. </w:t>
+      </w:r>
+      <w:commentRangeEnd w:id="139"/>
       <w:r>
         <w:rPr>
           <w:rStyle w:val="CommentReference"/>
         </w:rPr>
-        <w:commentReference w:id="121"/>
+        <w:commentReference w:id="139"/>
       </w:r>
     </w:p>
     <w:p>
@@ -9465,600 +9725,824 @@
         <w:spacing w:line="480" w:lineRule="auto"/>
         <w:ind w:firstLine="720"/>
         <w:rPr>
+          <w:del w:id="144" w:author="Benjamin J. Makhlouf" w:date="2025-10-09T10:30:00Z" w16du:dateUtc="2025-10-09T17:30:00Z"/>
           <w:rFonts w:ascii="Garamond" w:hAnsi="Garamond"/>
           <w:sz w:val="22"/>
           <w:szCs w:val="22"/>
         </w:rPr>
       </w:pPr>
-      <w:del w:id="125" w:author="Daniel Schindler" w:date="2025-10-06T11:02:00Z" w16du:dateUtc="2025-10-06T18:02:00Z">
-        <w:r>
-          <w:rPr>
-            <w:rFonts w:ascii="Garamond" w:hAnsi="Garamond"/>
-            <w:sz w:val="22"/>
-            <w:szCs w:val="22"/>
-          </w:rPr>
-          <w:delText xml:space="preserve">Among </w:delText>
+      <w:r>
+        <w:rPr>
+          <w:rFonts w:ascii="Garamond" w:hAnsi="Garamond"/>
+          <w:sz w:val="22"/>
+          <w:szCs w:val="22"/>
+        </w:rPr>
+        <w:t>Using the</w:t>
+      </w:r>
+      <w:del w:id="145" w:author="Daniel Schindler" w:date="2025-10-06T11:03:00Z" w16du:dateUtc="2025-10-06T18:03:00Z">
+        <w:r>
+          <w:rPr>
+            <w:rFonts w:ascii="Garamond" w:hAnsi="Garamond"/>
+            <w:sz w:val="22"/>
+            <w:szCs w:val="22"/>
+          </w:rPr>
+          <w:delText xml:space="preserve">our </w:delText>
         </w:r>
       </w:del>
-      <w:ins w:id="126" w:author="Daniel Schindler" w:date="2025-10-06T11:02:00Z" w16du:dateUtc="2025-10-06T18:02:00Z">
-        <w:r>
-          <w:rPr>
-            <w:rFonts w:ascii="Garamond" w:hAnsi="Garamond"/>
-            <w:sz w:val="22"/>
-            <w:szCs w:val="22"/>
-          </w:rPr>
-          <w:t>Using the</w:t>
+      <w:ins w:id="146" w:author="Daniel Schindler" w:date="2025-10-06T11:03:00Z" w16du:dateUtc="2025-10-06T18:03:00Z">
+        <w:r>
+          <w:rPr>
+            <w:rFonts w:ascii="Garamond" w:hAnsi="Garamond"/>
+            <w:sz w:val="22"/>
+            <w:szCs w:val="22"/>
+          </w:rPr>
+          <w:t xml:space="preserve"> </w:t>
         </w:r>
       </w:ins>
-      <w:del w:id="127" w:author="Daniel Schindler" w:date="2025-10-06T11:03:00Z" w16du:dateUtc="2025-10-06T18:03:00Z">
-        <w:r>
-          <w:rPr>
-            <w:rFonts w:ascii="Garamond" w:hAnsi="Garamond"/>
-            <w:sz w:val="22"/>
-            <w:szCs w:val="22"/>
-          </w:rPr>
-          <w:delText xml:space="preserve">our </w:delText>
+      <w:r>
+        <w:rPr>
+          <w:rFonts w:ascii="Garamond" w:hAnsi="Garamond"/>
+          <w:sz w:val="22"/>
+          <w:szCs w:val="22"/>
+        </w:rPr>
+        <w:t xml:space="preserve">best model, </w:t>
+      </w:r>
+      <w:r>
+        <w:rPr>
+          <w:rFonts w:ascii="Garamond" w:hAnsi="Garamond"/>
+          <w:sz w:val="22"/>
+          <w:szCs w:val="22"/>
+        </w:rPr>
+        <w:t xml:space="preserve">watershed-specific </w:t>
+      </w:r>
+      <w:r>
+        <w:rPr>
+          <w:rFonts w:ascii="Garamond" w:hAnsi="Garamond"/>
+          <w:sz w:val="22"/>
+          <w:szCs w:val="22"/>
+        </w:rPr>
+        <w:t xml:space="preserve">classification </w:t>
+      </w:r>
+      <w:r>
+        <w:rPr>
+          <w:rFonts w:ascii="Garamond" w:hAnsi="Garamond"/>
+          <w:sz w:val="22"/>
+          <w:szCs w:val="22"/>
+        </w:rPr>
+        <w:t xml:space="preserve">accuracies exceeding 90% for all three watersheds when tested against the full </w:t>
+      </w:r>
+      <w:r>
+        <w:rPr>
+          <w:rFonts w:ascii="Garamond" w:hAnsi="Garamond"/>
+          <w:sz w:val="22"/>
+          <w:szCs w:val="22"/>
+        </w:rPr>
+        <w:t>testing set</w:t>
+      </w:r>
+      <w:r>
+        <w:rPr>
+          <w:rFonts w:ascii="Garamond" w:hAnsi="Garamond"/>
+          <w:sz w:val="22"/>
+          <w:szCs w:val="22"/>
+        </w:rPr>
+        <w:t xml:space="preserve">. Most misclassifications occurred between Nushagak and Kuskokwim fish, consistent with expectations given the greater overlap in </w:t>
+      </w:r>
+      <w:r>
+        <w:rPr>
+          <w:rFonts w:ascii="Cambria Math" w:hAnsi="Cambria Math" w:cs="Cambria Math"/>
+          <w:sz w:val="22"/>
+          <w:szCs w:val="22"/>
+        </w:rPr>
+        <w:t>⁸⁷</w:t>
+      </w:r>
+      <w:r>
+        <w:rPr>
+          <w:rFonts w:ascii="Garamond" w:hAnsi="Garamond"/>
+          <w:sz w:val="22"/>
+          <w:szCs w:val="22"/>
+        </w:rPr>
+        <w:t>Sr/</w:t>
+      </w:r>
+      <w:r>
+        <w:rPr>
+          <w:rFonts w:ascii="Cambria Math" w:hAnsi="Cambria Math" w:cs="Cambria Math"/>
+          <w:sz w:val="22"/>
+          <w:szCs w:val="22"/>
+        </w:rPr>
+        <w:t>⁸⁶</w:t>
+      </w:r>
+      <w:r>
+        <w:rPr>
+          <w:rFonts w:ascii="Garamond" w:hAnsi="Garamond"/>
+          <w:sz w:val="22"/>
+          <w:szCs w:val="22"/>
+        </w:rPr>
+        <w:t>Sr</w:t>
+      </w:r>
+      <w:r>
+        <w:rPr>
+          <w:rFonts w:ascii="Garamond" w:hAnsi="Garamond"/>
+          <w:sz w:val="22"/>
+          <w:szCs w:val="22"/>
+        </w:rPr>
+        <w:t xml:space="preserve"> </w:t>
+      </w:r>
+      <w:r>
+        <w:rPr>
+          <w:rFonts w:ascii="Garamond" w:hAnsi="Garamond"/>
+          <w:sz w:val="22"/>
+          <w:szCs w:val="22"/>
+        </w:rPr>
+        <w:t xml:space="preserve">values </w:t>
+      </w:r>
+      <w:r>
+        <w:rPr>
+          <w:rFonts w:ascii="Garamond" w:hAnsi="Garamond"/>
+          <w:sz w:val="22"/>
+          <w:szCs w:val="22"/>
+        </w:rPr>
+        <w:t>in potential strontium sources in these two watersheds and the</w:t>
+      </w:r>
+      <w:ins w:id="147" w:author="Daniel Schindler" w:date="2025-10-06T11:03:00Z" w16du:dateUtc="2025-10-06T18:03:00Z">
+        <w:r>
+          <w:rPr>
+            <w:rFonts w:ascii="Garamond" w:hAnsi="Garamond"/>
+            <w:sz w:val="22"/>
+            <w:szCs w:val="22"/>
+          </w:rPr>
+          <w:t xml:space="preserve"> </w:t>
+        </w:r>
+      </w:ins>
+      <w:r>
+        <w:rPr>
+          <w:rFonts w:ascii="Garamond" w:hAnsi="Garamond"/>
+          <w:sz w:val="22"/>
+          <w:szCs w:val="22"/>
+        </w:rPr>
+        <w:t xml:space="preserve">closer spatial proximity between these watersheds. In contrast, Yukon fish exhibited </w:t>
+      </w:r>
+      <w:r>
+        <w:rPr>
+          <w:rFonts w:ascii="Garamond" w:hAnsi="Garamond"/>
+          <w:sz w:val="22"/>
+          <w:szCs w:val="22"/>
+        </w:rPr>
+        <w:t xml:space="preserve">unique </w:t>
+      </w:r>
+      <w:r>
+        <w:rPr>
+          <w:rFonts w:ascii="Garamond" w:hAnsi="Garamond"/>
+          <w:sz w:val="22"/>
+          <w:szCs w:val="22"/>
+        </w:rPr>
+        <w:t>patterns</w:t>
+      </w:r>
+      <w:r>
+        <w:rPr>
+          <w:rFonts w:ascii="Garamond" w:hAnsi="Garamond"/>
+          <w:sz w:val="22"/>
+          <w:szCs w:val="22"/>
+        </w:rPr>
+        <w:t xml:space="preserve"> in otolith LA data</w:t>
+      </w:r>
+      <w:r>
+        <w:rPr>
+          <w:rFonts w:ascii="Garamond" w:hAnsi="Garamond"/>
+          <w:sz w:val="22"/>
+          <w:szCs w:val="22"/>
+        </w:rPr>
+        <w:t xml:space="preserve"> due to the watershed's extreme spatial scale, broader range of isotope values, and extended migration timing</w:t>
+      </w:r>
+      <w:ins w:id="148" w:author="Benjamin J. Makhlouf" w:date="2025-10-09T10:08:00Z" w16du:dateUtc="2025-10-09T17:08:00Z">
+        <w:r>
+          <w:rPr>
+            <w:rFonts w:ascii="Garamond" w:hAnsi="Garamond"/>
+            <w:sz w:val="22"/>
+            <w:szCs w:val="22"/>
+          </w:rPr>
+          <w:t xml:space="preserve"> (PCA figure)</w:t>
+        </w:r>
+      </w:ins>
+      <w:r>
+        <w:rPr>
+          <w:rFonts w:ascii="Garamond" w:hAnsi="Garamond"/>
+          <w:sz w:val="22"/>
+          <w:szCs w:val="22"/>
+        </w:rPr>
+        <w:t xml:space="preserve">. This likely resulted in otolith </w:t>
+      </w:r>
+      <w:r>
+        <w:rPr>
+          <w:rFonts w:ascii="Garamond" w:hAnsi="Garamond"/>
+          <w:sz w:val="22"/>
+          <w:szCs w:val="22"/>
+        </w:rPr>
+        <w:t>time series</w:t>
+      </w:r>
+      <w:r>
+        <w:rPr>
+          <w:rFonts w:ascii="Garamond" w:hAnsi="Garamond"/>
+          <w:sz w:val="22"/>
+          <w:szCs w:val="22"/>
+        </w:rPr>
+        <w:t xml:space="preserve"> which were distinct compared to the other watersheds either because of natal origin values</w:t>
+      </w:r>
+      <w:r>
+        <w:rPr>
+          <w:rFonts w:ascii="Garamond" w:hAnsi="Garamond"/>
+          <w:sz w:val="22"/>
+          <w:szCs w:val="22"/>
+        </w:rPr>
+        <w:t xml:space="preserve"> only found in the Yukon (</w:t>
+      </w:r>
+      <w:r>
+        <w:rPr>
+          <w:rFonts w:ascii="Cambria Math" w:hAnsi="Cambria Math" w:cs="Cambria Math"/>
+          <w:sz w:val="22"/>
+          <w:szCs w:val="22"/>
+        </w:rPr>
+        <w:t>⁸⁷</w:t>
+      </w:r>
+      <w:r>
+        <w:rPr>
+          <w:rFonts w:ascii="Garamond" w:hAnsi="Garamond"/>
+          <w:sz w:val="22"/>
+          <w:szCs w:val="22"/>
+        </w:rPr>
+        <w:t>Sr/</w:t>
+      </w:r>
+      <w:r>
+        <w:rPr>
+          <w:rFonts w:ascii="Cambria Math" w:hAnsi="Cambria Math" w:cs="Cambria Math"/>
+          <w:sz w:val="22"/>
+          <w:szCs w:val="22"/>
+        </w:rPr>
+        <w:t>⁸⁶</w:t>
+      </w:r>
+      <w:r>
+        <w:rPr>
+          <w:rFonts w:ascii="Garamond" w:hAnsi="Garamond"/>
+          <w:sz w:val="22"/>
+          <w:szCs w:val="22"/>
+        </w:rPr>
+        <w:t>Sr</w:t>
+      </w:r>
+      <w:r>
+        <w:rPr>
+          <w:rFonts w:ascii="Garamond" w:hAnsi="Garamond"/>
+          <w:sz w:val="22"/>
+          <w:szCs w:val="22"/>
+        </w:rPr>
+        <w:t xml:space="preserve"> &gt; 0.715)</w:t>
+      </w:r>
+      <w:r>
+        <w:rPr>
+          <w:rFonts w:ascii="Garamond" w:hAnsi="Garamond"/>
+          <w:sz w:val="22"/>
+          <w:szCs w:val="22"/>
+        </w:rPr>
+        <w:t xml:space="preserve"> or prominent features </w:t>
+      </w:r>
+      <w:r>
+        <w:rPr>
+          <w:rFonts w:ascii="Garamond" w:hAnsi="Garamond"/>
+          <w:sz w:val="22"/>
+          <w:szCs w:val="22"/>
+        </w:rPr>
+        <w:t xml:space="preserve">resulting from a longer </w:t>
+      </w:r>
+      <w:r>
+        <w:rPr>
+          <w:rFonts w:ascii="Garamond" w:hAnsi="Garamond"/>
+          <w:sz w:val="22"/>
+          <w:szCs w:val="22"/>
+        </w:rPr>
+        <w:t>migration through the enriched mainstem tributary (</w:t>
+      </w:r>
+      <w:proofErr w:type="spellStart"/>
+      <w:r>
+        <w:rPr>
+          <w:rFonts w:ascii="Garamond" w:hAnsi="Garamond"/>
+          <w:sz w:val="22"/>
+          <w:szCs w:val="22"/>
+        </w:rPr>
+        <w:t>i.e</w:t>
+      </w:r>
+      <w:proofErr w:type="spellEnd"/>
+      <w:r>
+        <w:rPr>
+          <w:rFonts w:ascii="Garamond" w:hAnsi="Garamond"/>
+          <w:sz w:val="22"/>
+          <w:szCs w:val="22"/>
+        </w:rPr>
+        <w:t xml:space="preserve"> Figure 5b, column 3). </w:t>
+      </w:r>
+      <w:r>
+        <w:rPr>
+          <w:rFonts w:ascii="Garamond" w:hAnsi="Garamond"/>
+          <w:sz w:val="22"/>
+          <w:szCs w:val="22"/>
+        </w:rPr>
+        <w:t xml:space="preserve">Yukon classification accuracy dropped substantially in the "overlap" testing set (86.86% vs. 93.7% in the total testing set), despite similar numbers of misidentified individuals. </w:t>
+      </w:r>
+      <w:r>
+        <w:rPr>
+          <w:rFonts w:ascii="Garamond" w:hAnsi="Garamond"/>
+          <w:sz w:val="22"/>
+          <w:szCs w:val="22"/>
+        </w:rPr>
+        <w:t xml:space="preserve">This </w:t>
+      </w:r>
+      <w:r>
+        <w:rPr>
+          <w:rFonts w:ascii="Garamond" w:hAnsi="Garamond"/>
+          <w:sz w:val="22"/>
+          <w:szCs w:val="22"/>
+        </w:rPr>
+        <w:t>decline likely reflects the removal of the most easily classified cases</w:t>
+      </w:r>
+      <w:r>
+        <w:rPr>
+          <w:rFonts w:ascii="Garamond" w:hAnsi="Garamond"/>
+          <w:sz w:val="22"/>
+          <w:szCs w:val="22"/>
+        </w:rPr>
+        <w:t>, which is further supported by</w:t>
+      </w:r>
+      <w:r>
+        <w:rPr>
+          <w:rFonts w:ascii="Garamond" w:hAnsi="Garamond"/>
+          <w:sz w:val="22"/>
+          <w:szCs w:val="22"/>
+        </w:rPr>
+        <w:t xml:space="preserve"> </w:t>
+      </w:r>
+      <w:r>
+        <w:rPr>
+          <w:rFonts w:ascii="Garamond" w:hAnsi="Garamond"/>
+          <w:sz w:val="22"/>
+          <w:szCs w:val="22"/>
+        </w:rPr>
+        <w:t>higher misclassification rates among CWAK individuals compared to those from the middle and upper Yukon regions</w:t>
+      </w:r>
+      <w:r>
+        <w:rPr>
+          <w:rFonts w:ascii="Garamond" w:hAnsi="Garamond"/>
+          <w:sz w:val="22"/>
+          <w:szCs w:val="22"/>
+        </w:rPr>
+        <w:t xml:space="preserve">. </w:t>
+      </w:r>
+      <w:r>
+        <w:rPr>
+          <w:rFonts w:ascii="Garamond" w:hAnsi="Garamond"/>
+          <w:sz w:val="22"/>
+          <w:szCs w:val="22"/>
+        </w:rPr>
+        <w:t>The</w:t>
+      </w:r>
+      <w:r>
+        <w:rPr>
+          <w:rFonts w:ascii="Garamond" w:hAnsi="Garamond"/>
+          <w:sz w:val="22"/>
+          <w:szCs w:val="22"/>
+        </w:rPr>
+        <w:t xml:space="preserve">se </w:t>
+      </w:r>
+      <w:r>
+        <w:rPr>
+          <w:rFonts w:ascii="Garamond" w:hAnsi="Garamond"/>
+          <w:sz w:val="22"/>
+          <w:szCs w:val="22"/>
+        </w:rPr>
+        <w:t xml:space="preserve">challenges </w:t>
+      </w:r>
+      <w:r>
+        <w:rPr>
+          <w:rFonts w:ascii="Garamond" w:hAnsi="Garamond"/>
+          <w:sz w:val="22"/>
+          <w:szCs w:val="22"/>
+        </w:rPr>
+        <w:t xml:space="preserve">likely stem </w:t>
+      </w:r>
+      <w:r>
+        <w:rPr>
+          <w:rFonts w:ascii="Garamond" w:hAnsi="Garamond"/>
+          <w:sz w:val="22"/>
+          <w:szCs w:val="22"/>
+        </w:rPr>
+        <w:t>from shorter migration patterns that include less residence time in the mainstem Yukon River</w:t>
+      </w:r>
+      <w:r>
+        <w:rPr>
+          <w:rFonts w:ascii="Garamond" w:hAnsi="Garamond"/>
+          <w:sz w:val="22"/>
+          <w:szCs w:val="22"/>
+        </w:rPr>
+        <w:t>, and, subsequently, a</w:t>
+      </w:r>
+      <w:r>
+        <w:rPr>
+          <w:rFonts w:ascii="Garamond" w:hAnsi="Garamond"/>
+          <w:sz w:val="22"/>
+          <w:szCs w:val="22"/>
+        </w:rPr>
+        <w:t xml:space="preserve"> less pronounced increase in isotope values </w:t>
+      </w:r>
+      <w:r>
+        <w:rPr>
+          <w:rFonts w:ascii="Garamond" w:hAnsi="Garamond"/>
+          <w:sz w:val="22"/>
+          <w:szCs w:val="22"/>
+        </w:rPr>
+        <w:lastRenderedPageBreak/>
+        <w:t>before marine entry</w:t>
+      </w:r>
+      <w:r>
+        <w:rPr>
+          <w:rFonts w:ascii="Garamond" w:hAnsi="Garamond"/>
+          <w:sz w:val="22"/>
+          <w:szCs w:val="22"/>
+        </w:rPr>
+        <w:t xml:space="preserve">. </w:t>
+      </w:r>
+      <w:moveToRangeStart w:id="149" w:author="Benjamin J. Makhlouf" w:date="2025-10-09T10:30:00Z" w:name="move210898217"/>
+      <w:moveTo w:id="150" w:author="Benjamin J. Makhlouf" w:date="2025-10-09T10:30:00Z" w16du:dateUtc="2025-10-09T17:30:00Z">
+        <w:r>
+          <w:rPr>
+            <w:rFonts w:ascii="Garamond" w:hAnsi="Garamond"/>
+            <w:sz w:val="22"/>
+            <w:szCs w:val="22"/>
+          </w:rPr>
+          <w:t xml:space="preserve">Without this distinguishing feature, CWAK individuals from the Yukon (i.e. Figure 5b, column 4) are more likely to be misclassified with Kuskokwim or </w:t>
+        </w:r>
+        <w:proofErr w:type="spellStart"/>
+        <w:r>
+          <w:rPr>
+            <w:rFonts w:ascii="Garamond" w:hAnsi="Garamond"/>
+            <w:sz w:val="22"/>
+            <w:szCs w:val="22"/>
+          </w:rPr>
+          <w:t>Nushagak</w:t>
+        </w:r>
+        <w:proofErr w:type="spellEnd"/>
+        <w:r>
+          <w:rPr>
+            <w:rFonts w:ascii="Garamond" w:hAnsi="Garamond"/>
+            <w:sz w:val="22"/>
+            <w:szCs w:val="22"/>
+          </w:rPr>
+          <w:t xml:space="preserve"> fish, resulting in lower overall accuracy. </w:t>
+        </w:r>
+      </w:moveTo>
+    </w:p>
+    <w:p>
+      <w:pPr>
+        <w:spacing w:line="480" w:lineRule="auto"/>
+        <w:ind w:firstLine="720"/>
+        <w:rPr>
+          <w:ins w:id="151" w:author="Benjamin J. Makhlouf" w:date="2025-10-09T10:30:00Z" w16du:dateUtc="2025-10-09T17:30:00Z"/>
+          <w:moveTo w:id="152" w:author="Benjamin J. Makhlouf" w:date="2025-10-09T10:30:00Z" w16du:dateUtc="2025-10-09T17:30:00Z"/>
+          <w:rFonts w:ascii="Garamond" w:hAnsi="Garamond"/>
+          <w:sz w:val="22"/>
+          <w:szCs w:val="22"/>
+        </w:rPr>
+      </w:pPr>
+    </w:p>
+    <w:moveToRangeEnd w:id="149"/>
+    <w:p>
+      <w:pPr>
+        <w:spacing w:line="480" w:lineRule="auto"/>
+        <w:ind w:firstLine="720"/>
+        <w:rPr>
+          <w:ins w:id="153" w:author="Benjamin J. Makhlouf" w:date="2025-10-09T10:34:00Z" w16du:dateUtc="2025-10-09T17:34:00Z"/>
+          <w:rFonts w:ascii="Garamond" w:hAnsi="Garamond"/>
+          <w:sz w:val="22"/>
+          <w:szCs w:val="22"/>
+        </w:rPr>
+      </w:pPr>
+      <w:ins w:id="154" w:author="Benjamin J. Makhlouf" w:date="2025-10-09T10:30:00Z" w16du:dateUtc="2025-10-09T17:30:00Z">
+        <w:r>
+          <w:rPr>
+            <w:rFonts w:ascii="Garamond" w:hAnsi="Garamond"/>
+            <w:sz w:val="22"/>
+            <w:szCs w:val="22"/>
+          </w:rPr>
+          <w:t xml:space="preserve">Despite this challenge for this application, the observed difference in </w:t>
+        </w:r>
+      </w:ins>
+      <w:ins w:id="155" w:author="Benjamin J. Makhlouf" w:date="2025-10-09T10:31:00Z" w16du:dateUtc="2025-10-09T17:31:00Z">
+        <w:r>
+          <w:rPr>
+            <w:rFonts w:ascii="Garamond" w:hAnsi="Garamond"/>
+            <w:sz w:val="22"/>
+            <w:szCs w:val="22"/>
+          </w:rPr>
+          <w:t xml:space="preserve">this distinguishing increase in Sr8786 between CWAK and non-CWAK individuals suggests that </w:t>
+        </w:r>
+      </w:ins>
+      <w:ins w:id="156" w:author="Benjamin J. Makhlouf" w:date="2025-10-09T10:27:00Z" w16du:dateUtc="2025-10-09T17:27:00Z">
+        <w:r>
+          <w:rPr>
+            <w:rFonts w:ascii="Garamond" w:hAnsi="Garamond"/>
+            <w:sz w:val="22"/>
+            <w:szCs w:val="22"/>
+            <w:rPrChange w:id="157" w:author="Benjamin J. Makhlouf" w:date="2025-10-09T10:28:00Z" w16du:dateUtc="2025-10-09T17:28:00Z">
+              <w:rPr/>
+            </w:rPrChange>
+          </w:rPr>
+          <w:t xml:space="preserve">the approaches described here may be capable of resolving spatial structure within a single watershed. </w:t>
+        </w:r>
+      </w:ins>
+      <w:ins w:id="158" w:author="Benjamin J. Makhlouf" w:date="2025-10-09T10:32:00Z" w16du:dateUtc="2025-10-09T17:32:00Z">
+        <w:r>
+          <w:rPr>
+            <w:rFonts w:ascii="Garamond" w:hAnsi="Garamond"/>
+            <w:sz w:val="22"/>
+            <w:szCs w:val="22"/>
+          </w:rPr>
+          <w:t xml:space="preserve">For example, </w:t>
+        </w:r>
+      </w:ins>
+      <w:ins w:id="159" w:author="Benjamin J. Makhlouf" w:date="2025-10-09T10:34:00Z" w16du:dateUtc="2025-10-09T17:34:00Z">
+        <w:r>
+          <w:rPr>
+            <w:rFonts w:ascii="Garamond" w:hAnsi="Garamond"/>
+            <w:sz w:val="22"/>
+            <w:szCs w:val="22"/>
+          </w:rPr>
+          <w:t>genetics-based</w:t>
+        </w:r>
+      </w:ins>
+      <w:ins w:id="160" w:author="Benjamin J. Makhlouf" w:date="2025-10-09T10:32:00Z" w16du:dateUtc="2025-10-09T17:32:00Z">
+        <w:r>
+          <w:rPr>
+            <w:rFonts w:ascii="Garamond" w:hAnsi="Garamond"/>
+            <w:sz w:val="22"/>
+            <w:szCs w:val="22"/>
+          </w:rPr>
+          <w:t xml:space="preserve"> data in this dataset </w:t>
+        </w:r>
+        <w:proofErr w:type="gramStart"/>
+        <w:r>
+          <w:rPr>
+            <w:rFonts w:ascii="Garamond" w:hAnsi="Garamond"/>
+            <w:sz w:val="22"/>
+            <w:szCs w:val="22"/>
+          </w:rPr>
+          <w:t>are capable of producing</w:t>
+        </w:r>
+        <w:proofErr w:type="gramEnd"/>
+        <w:r>
+          <w:rPr>
+            <w:rFonts w:ascii="Garamond" w:hAnsi="Garamond"/>
+            <w:sz w:val="22"/>
+            <w:szCs w:val="22"/>
+          </w:rPr>
+          <w:t xml:space="preserve"> known sub-watershed labels, which, given sufficient sample size, could be used to trai</w:t>
+        </w:r>
+      </w:ins>
+      <w:ins w:id="161" w:author="Benjamin J. Makhlouf" w:date="2025-10-09T10:33:00Z" w16du:dateUtc="2025-10-09T17:33:00Z">
+        <w:r>
+          <w:rPr>
+            <w:rFonts w:ascii="Garamond" w:hAnsi="Garamond"/>
+            <w:sz w:val="22"/>
+            <w:szCs w:val="22"/>
+          </w:rPr>
+          <w:t>n a model to distinguish among genetic regions in the Yukon using isotope time series data alone. P</w:t>
+        </w:r>
+      </w:ins>
+      <w:ins w:id="162" w:author="Benjamin J. Makhlouf" w:date="2025-10-09T10:27:00Z" w16du:dateUtc="2025-10-09T17:27:00Z">
+        <w:r>
+          <w:rPr>
+            <w:rFonts w:ascii="Garamond" w:hAnsi="Garamond"/>
+            <w:sz w:val="22"/>
+            <w:szCs w:val="22"/>
+            <w:rPrChange w:id="163" w:author="Benjamin J. Makhlouf" w:date="2025-10-09T10:28:00Z" w16du:dateUtc="2025-10-09T17:28:00Z">
+              <w:rPr/>
+            </w:rPrChange>
+          </w:rPr>
+          <w:t xml:space="preserve">revious work has demonstrated that integrating data sources </w:t>
+        </w:r>
+      </w:ins>
+      <w:ins w:id="164" w:author="Benjamin J. Makhlouf" w:date="2025-10-09T10:33:00Z" w16du:dateUtc="2025-10-09T17:33:00Z">
+        <w:r>
+          <w:rPr>
+            <w:rFonts w:ascii="Garamond" w:hAnsi="Garamond"/>
+            <w:sz w:val="22"/>
+            <w:szCs w:val="22"/>
+          </w:rPr>
+          <w:t xml:space="preserve">such as genetics </w:t>
+        </w:r>
+      </w:ins>
+      <w:ins w:id="165" w:author="Benjamin J. Makhlouf" w:date="2025-10-09T10:27:00Z" w16du:dateUtc="2025-10-09T17:27:00Z">
+        <w:r>
+          <w:rPr>
+            <w:rFonts w:ascii="Garamond" w:hAnsi="Garamond"/>
+            <w:sz w:val="22"/>
+            <w:szCs w:val="22"/>
+            <w:rPrChange w:id="166" w:author="Benjamin J. Makhlouf" w:date="2025-10-09T10:28:00Z" w16du:dateUtc="2025-10-09T17:28:00Z">
+              <w:rPr/>
+            </w:rPrChange>
+          </w:rPr>
+          <w:t>can enhance isotope-based assignment precision</w:t>
+        </w:r>
+      </w:ins>
+      <w:ins w:id="167" w:author="Benjamin J. Makhlouf" w:date="2025-10-09T10:33:00Z" w16du:dateUtc="2025-10-09T17:33:00Z">
+        <w:r>
+          <w:rPr>
+            <w:rFonts w:ascii="Garamond" w:hAnsi="Garamond"/>
+            <w:sz w:val="22"/>
+            <w:szCs w:val="22"/>
+          </w:rPr>
+          <w:t xml:space="preserve"> in some cases</w:t>
+        </w:r>
+      </w:ins>
+      <w:ins w:id="168" w:author="Benjamin J. Makhlouf" w:date="2025-10-09T10:27:00Z" w16du:dateUtc="2025-10-09T17:27:00Z">
+        <w:r>
+          <w:rPr>
+            <w:rFonts w:ascii="Garamond" w:hAnsi="Garamond"/>
+            <w:sz w:val="22"/>
+            <w:szCs w:val="22"/>
+            <w:rPrChange w:id="169" w:author="Benjamin J. Makhlouf" w:date="2025-10-09T10:28:00Z" w16du:dateUtc="2025-10-09T17:28:00Z">
+              <w:rPr/>
+            </w:rPrChange>
+          </w:rPr>
+          <w:t xml:space="preserve"> (Makhlouf et al., 2025)</w:t>
+        </w:r>
+      </w:ins>
+      <w:ins w:id="170" w:author="Benjamin J. Makhlouf" w:date="2025-10-09T10:33:00Z" w16du:dateUtc="2025-10-09T17:33:00Z">
+        <w:r>
+          <w:rPr>
+            <w:rFonts w:ascii="Garamond" w:hAnsi="Garamond"/>
+            <w:sz w:val="22"/>
+            <w:szCs w:val="22"/>
+          </w:rPr>
+          <w:t xml:space="preserve">. However, these preliminary observations suggest that </w:t>
+        </w:r>
+      </w:ins>
+      <w:ins w:id="171" w:author="Benjamin J. Makhlouf" w:date="2025-10-09T10:34:00Z" w16du:dateUtc="2025-10-09T17:34:00Z">
+        <w:r>
+          <w:rPr>
+            <w:rFonts w:ascii="Garamond" w:hAnsi="Garamond"/>
+            <w:sz w:val="22"/>
+            <w:szCs w:val="22"/>
+          </w:rPr>
+          <w:t xml:space="preserve">similar approaches to the one outlined here may have the potential to improve assignment precision to the sub-basin scale without the need for additional data sources. </w:t>
+        </w:r>
+      </w:ins>
+    </w:p>
+    <w:p>
+      <w:pPr>
+        <w:spacing w:line="480" w:lineRule="auto"/>
+        <w:ind w:firstLine="720"/>
+        <w:rPr>
+          <w:del w:id="172" w:author="Benjamin J. Makhlouf" w:date="2025-10-09T10:34:00Z" w16du:dateUtc="2025-10-09T17:34:00Z"/>
+          <w:rFonts w:ascii="Garamond" w:hAnsi="Garamond"/>
+          <w:sz w:val="22"/>
+          <w:szCs w:val="22"/>
+        </w:rPr>
+      </w:pPr>
+      <w:moveFromRangeStart w:id="173" w:author="Benjamin J. Makhlouf" w:date="2025-10-09T10:30:00Z" w:name="move210898217"/>
+      <w:moveFrom w:id="174" w:author="Benjamin J. Makhlouf" w:date="2025-10-09T10:30:00Z" w16du:dateUtc="2025-10-09T17:30:00Z">
+        <w:del w:id="175" w:author="Benjamin J. Makhlouf" w:date="2025-10-09T10:34:00Z" w16du:dateUtc="2025-10-09T17:34:00Z">
+          <w:r>
+            <w:rPr>
+              <w:rFonts w:ascii="Garamond" w:hAnsi="Garamond"/>
+              <w:sz w:val="22"/>
+              <w:szCs w:val="22"/>
+            </w:rPr>
+            <w:delText xml:space="preserve">Without this distinguishing feature, CWAK individuals from the Yukon (i.e. Figure 5b, column 4) are more likely to be misclassified with Kuskokwim or Nushagak fish, resulting in lower overall accuracy. </w:delText>
+          </w:r>
+        </w:del>
+      </w:moveFrom>
+      <w:moveFromRangeEnd w:id="173"/>
+      <w:del w:id="176" w:author="Benjamin J. Makhlouf" w:date="2025-10-09T10:34:00Z" w16du:dateUtc="2025-10-09T17:34:00Z">
+        <w:r>
+          <w:rPr>
+            <w:rFonts w:ascii="Garamond" w:hAnsi="Garamond"/>
+            <w:sz w:val="22"/>
+            <w:szCs w:val="22"/>
+          </w:rPr>
+          <w:delText xml:space="preserve">Still, </w:delText>
+        </w:r>
+        <w:r>
+          <w:rPr>
+            <w:rFonts w:ascii="Garamond" w:hAnsi="Garamond"/>
+            <w:sz w:val="22"/>
+            <w:szCs w:val="22"/>
+          </w:rPr>
+          <w:delText>PCA analysis suggests that other features in the timeseries</w:delText>
         </w:r>
       </w:del>
-      <w:ins w:id="128" w:author="Daniel Schindler" w:date="2025-10-06T11:03:00Z" w16du:dateUtc="2025-10-06T18:03:00Z">
-        <w:r>
-          <w:rPr>
-            <w:rFonts w:ascii="Garamond" w:hAnsi="Garamond"/>
-            <w:sz w:val="22"/>
-            <w:szCs w:val="22"/>
-          </w:rPr>
-          <w:t xml:space="preserve"> </w:t>
-        </w:r>
+      <w:ins w:id="177" w:author="Daniel Schindler" w:date="2025-10-02T15:16:00Z" w16du:dateUtc="2025-10-02T22:16:00Z">
+        <w:del w:id="178" w:author="Benjamin J. Makhlouf" w:date="2025-10-09T10:34:00Z" w16du:dateUtc="2025-10-09T17:34:00Z">
+          <w:r>
+            <w:rPr>
+              <w:rFonts w:ascii="Garamond" w:hAnsi="Garamond"/>
+              <w:sz w:val="22"/>
+              <w:szCs w:val="22"/>
+            </w:rPr>
+            <w:delText>time series</w:delText>
+          </w:r>
+        </w:del>
       </w:ins>
-      <w:r>
-        <w:rPr>
-          <w:rFonts w:ascii="Garamond" w:hAnsi="Garamond"/>
-          <w:sz w:val="22"/>
-          <w:szCs w:val="22"/>
-        </w:rPr>
-        <w:t xml:space="preserve">best model, </w:t>
-      </w:r>
-      <w:r>
-        <w:rPr>
-          <w:rFonts w:ascii="Garamond" w:hAnsi="Garamond"/>
-          <w:sz w:val="22"/>
-          <w:szCs w:val="22"/>
-        </w:rPr>
-        <w:t xml:space="preserve">watershed-specific </w:t>
-      </w:r>
-      <w:r>
-        <w:rPr>
-          <w:rFonts w:ascii="Garamond" w:hAnsi="Garamond"/>
-          <w:sz w:val="22"/>
-          <w:szCs w:val="22"/>
-        </w:rPr>
-        <w:t xml:space="preserve">classification </w:t>
-      </w:r>
-      <w:r>
-        <w:rPr>
-          <w:rFonts w:ascii="Garamond" w:hAnsi="Garamond"/>
-          <w:sz w:val="22"/>
-          <w:szCs w:val="22"/>
-        </w:rPr>
-        <w:t xml:space="preserve">accuracies exceeding 90% for all three watersheds when tested against the full </w:t>
-      </w:r>
-      <w:r>
-        <w:rPr>
-          <w:rFonts w:ascii="Garamond" w:hAnsi="Garamond"/>
-          <w:sz w:val="22"/>
-          <w:szCs w:val="22"/>
-        </w:rPr>
-        <w:t>testing set</w:t>
-      </w:r>
-      <w:r>
-        <w:rPr>
-          <w:rFonts w:ascii="Garamond" w:hAnsi="Garamond"/>
-          <w:sz w:val="22"/>
-          <w:szCs w:val="22"/>
-        </w:rPr>
-        <w:t xml:space="preserve">. Most misclassifications occurred between Nushagak and Kuskokwim fish, consistent with expectations given the greater overlap in </w:t>
-      </w:r>
-      <w:r>
-        <w:rPr>
-          <w:rFonts w:ascii="Cambria Math" w:hAnsi="Cambria Math" w:cs="Cambria Math"/>
-          <w:sz w:val="22"/>
-          <w:szCs w:val="22"/>
-        </w:rPr>
-        <w:t>⁸⁷</w:t>
-      </w:r>
-      <w:r>
-        <w:rPr>
-          <w:rFonts w:ascii="Garamond" w:hAnsi="Garamond"/>
-          <w:sz w:val="22"/>
-          <w:szCs w:val="22"/>
-        </w:rPr>
-        <w:t>Sr/</w:t>
-      </w:r>
-      <w:r>
-        <w:rPr>
-          <w:rFonts w:ascii="Cambria Math" w:hAnsi="Cambria Math" w:cs="Cambria Math"/>
-          <w:sz w:val="22"/>
-          <w:szCs w:val="22"/>
-        </w:rPr>
-        <w:t>⁸⁶</w:t>
-      </w:r>
-      <w:r>
-        <w:rPr>
-          <w:rFonts w:ascii="Garamond" w:hAnsi="Garamond"/>
-          <w:sz w:val="22"/>
-          <w:szCs w:val="22"/>
-        </w:rPr>
-        <w:t>Sr</w:t>
-      </w:r>
-      <w:r>
-        <w:rPr>
-          <w:rFonts w:ascii="Garamond" w:hAnsi="Garamond"/>
-          <w:sz w:val="22"/>
-          <w:szCs w:val="22"/>
-        </w:rPr>
-        <w:t xml:space="preserve"> </w:t>
-      </w:r>
-      <w:r>
-        <w:rPr>
-          <w:rFonts w:ascii="Garamond" w:hAnsi="Garamond"/>
-          <w:sz w:val="22"/>
-          <w:szCs w:val="22"/>
-        </w:rPr>
-        <w:t xml:space="preserve">values </w:t>
-      </w:r>
-      <w:ins w:id="129" w:author="Daniel Schindler" w:date="2025-10-06T11:03:00Z" w16du:dateUtc="2025-10-06T18:03:00Z">
-        <w:r>
-          <w:rPr>
-            <w:rFonts w:ascii="Garamond" w:hAnsi="Garamond"/>
-            <w:sz w:val="22"/>
-            <w:szCs w:val="22"/>
-          </w:rPr>
-          <w:t>in potential strontium sources in these two watersheds and the</w:t>
-        </w:r>
+      <w:del w:id="179" w:author="Benjamin J. Makhlouf" w:date="2025-10-09T10:34:00Z" w16du:dateUtc="2025-10-09T17:34:00Z">
+        <w:r>
+          <w:rPr>
+            <w:rFonts w:ascii="Garamond" w:hAnsi="Garamond"/>
+            <w:sz w:val="22"/>
+            <w:szCs w:val="22"/>
+          </w:rPr>
+          <w:delText xml:space="preserve"> may also</w:delText>
+        </w:r>
+        <w:r>
+          <w:rPr>
+            <w:rFonts w:ascii="Garamond" w:hAnsi="Garamond"/>
+            <w:sz w:val="22"/>
+            <w:szCs w:val="22"/>
+          </w:rPr>
+          <w:delText xml:space="preserve"> contribute to </w:delText>
+        </w:r>
+        <w:r>
+          <w:rPr>
+            <w:rFonts w:ascii="Garamond" w:hAnsi="Garamond"/>
+            <w:sz w:val="22"/>
+            <w:szCs w:val="22"/>
+          </w:rPr>
+          <w:delText xml:space="preserve">the ability to distinguish among watersheds (Figure 5). These small </w:delText>
+        </w:r>
+        <w:r>
+          <w:rPr>
+            <w:rFonts w:ascii="Garamond" w:hAnsi="Garamond"/>
+            <w:sz w:val="22"/>
+            <w:szCs w:val="22"/>
+          </w:rPr>
+          <w:delText xml:space="preserve">variations may become more readily apparent for classification </w:delText>
+        </w:r>
+        <w:r>
+          <w:rPr>
+            <w:rFonts w:ascii="Garamond" w:hAnsi="Garamond"/>
+            <w:sz w:val="22"/>
+            <w:szCs w:val="22"/>
+          </w:rPr>
+          <w:delText>when used alongside other</w:delText>
+        </w:r>
+        <w:commentRangeStart w:id="180"/>
+        <w:r>
+          <w:rPr>
+            <w:rFonts w:ascii="Garamond" w:hAnsi="Garamond"/>
+            <w:sz w:val="22"/>
+            <w:szCs w:val="22"/>
+          </w:rPr>
+          <w:delText xml:space="preserve"> </w:delText>
+        </w:r>
+        <w:r>
+          <w:rPr>
+            <w:rFonts w:ascii="Garamond" w:hAnsi="Garamond"/>
+            <w:sz w:val="22"/>
+            <w:szCs w:val="22"/>
+          </w:rPr>
+          <w:delText>timeseries</w:delText>
+        </w:r>
+      </w:del>
+      <w:ins w:id="181" w:author="Daniel Schindler" w:date="2025-10-02T15:16:00Z" w16du:dateUtc="2025-10-02T22:16:00Z">
+        <w:del w:id="182" w:author="Benjamin J. Makhlouf" w:date="2025-10-09T10:34:00Z" w16du:dateUtc="2025-10-09T17:34:00Z">
+          <w:r>
+            <w:rPr>
+              <w:rFonts w:ascii="Garamond" w:hAnsi="Garamond"/>
+              <w:sz w:val="22"/>
+              <w:szCs w:val="22"/>
+            </w:rPr>
+            <w:delText>time series</w:delText>
+          </w:r>
+        </w:del>
       </w:ins>
-      <w:del w:id="130" w:author="Daniel Schindler" w:date="2025-10-06T11:03:00Z" w16du:dateUtc="2025-10-06T18:03:00Z">
-        <w:r>
-          <w:rPr>
-            <w:rFonts w:ascii="Garamond" w:hAnsi="Garamond"/>
-            <w:sz w:val="22"/>
-            <w:szCs w:val="22"/>
-          </w:rPr>
-          <w:delText xml:space="preserve">and </w:delText>
+      <w:del w:id="183" w:author="Benjamin J. Makhlouf" w:date="2025-10-09T10:34:00Z" w16du:dateUtc="2025-10-09T17:34:00Z">
+        <w:r>
+          <w:rPr>
+            <w:rFonts w:ascii="Garamond" w:hAnsi="Garamond"/>
+            <w:sz w:val="22"/>
+            <w:szCs w:val="22"/>
+          </w:rPr>
+          <w:delText xml:space="preserve"> analysis techniques</w:delText>
+        </w:r>
+        <w:commentRangeEnd w:id="180"/>
+        <w:r>
+          <w:rPr>
+            <w:rStyle w:val="CommentReference"/>
+          </w:rPr>
+          <w:commentReference w:id="180"/>
+        </w:r>
+        <w:r>
+          <w:rPr>
+            <w:rFonts w:ascii="Garamond" w:hAnsi="Garamond"/>
+            <w:sz w:val="22"/>
+            <w:szCs w:val="22"/>
+          </w:rPr>
+          <w:delText xml:space="preserve"> or by increasing the sample size of Yukon CWAK individuals in the training set. </w:delText>
         </w:r>
       </w:del>
-      <w:ins w:id="131" w:author="Daniel Schindler" w:date="2025-10-06T11:03:00Z" w16du:dateUtc="2025-10-06T18:03:00Z">
-        <w:r>
-          <w:rPr>
-            <w:rFonts w:ascii="Garamond" w:hAnsi="Garamond"/>
-            <w:sz w:val="22"/>
-            <w:szCs w:val="22"/>
-          </w:rPr>
-          <w:t xml:space="preserve"> </w:t>
-        </w:r>
-      </w:ins>
-      <w:r>
-        <w:rPr>
-          <w:rFonts w:ascii="Garamond" w:hAnsi="Garamond"/>
-          <w:sz w:val="22"/>
-          <w:szCs w:val="22"/>
-        </w:rPr>
-        <w:t xml:space="preserve">closer spatial proximity between these watersheds. In contrast, Yukon fish exhibited </w:t>
-      </w:r>
-      <w:r>
-        <w:rPr>
-          <w:rFonts w:ascii="Garamond" w:hAnsi="Garamond"/>
-          <w:sz w:val="22"/>
-          <w:szCs w:val="22"/>
-        </w:rPr>
-        <w:t xml:space="preserve">unique </w:t>
-      </w:r>
-      <w:r>
-        <w:rPr>
-          <w:rFonts w:ascii="Garamond" w:hAnsi="Garamond"/>
-          <w:sz w:val="22"/>
-          <w:szCs w:val="22"/>
-        </w:rPr>
-        <w:t>patterns</w:t>
-      </w:r>
-      <w:r>
-        <w:rPr>
-          <w:rFonts w:ascii="Garamond" w:hAnsi="Garamond"/>
-          <w:sz w:val="22"/>
-          <w:szCs w:val="22"/>
-        </w:rPr>
-        <w:t xml:space="preserve"> in otolith LA data</w:t>
-      </w:r>
-      <w:r>
-        <w:rPr>
-          <w:rFonts w:ascii="Garamond" w:hAnsi="Garamond"/>
-          <w:sz w:val="22"/>
-          <w:szCs w:val="22"/>
-        </w:rPr>
-        <w:t xml:space="preserve"> due to the watershed's extreme spatial scale, broader range of isotope values, and extended migration timing</w:t>
-      </w:r>
-      <w:r>
-        <w:rPr>
-          <w:rFonts w:ascii="Garamond" w:hAnsi="Garamond"/>
-          <w:sz w:val="22"/>
-          <w:szCs w:val="22"/>
-        </w:rPr>
-        <w:t xml:space="preserve">. This likely resulted in otolith </w:t>
-      </w:r>
-      <w:del w:id="132" w:author="Daniel Schindler" w:date="2025-10-02T15:16:00Z" w16du:dateUtc="2025-10-02T22:16:00Z">
-        <w:r>
-          <w:rPr>
-            <w:rFonts w:ascii="Garamond" w:hAnsi="Garamond"/>
-            <w:sz w:val="22"/>
-            <w:szCs w:val="22"/>
-          </w:rPr>
-          <w:delText>timeseries</w:delText>
-        </w:r>
-      </w:del>
-      <w:ins w:id="133" w:author="Daniel Schindler" w:date="2025-10-02T15:16:00Z" w16du:dateUtc="2025-10-02T22:16:00Z">
-        <w:r>
-          <w:rPr>
-            <w:rFonts w:ascii="Garamond" w:hAnsi="Garamond"/>
-            <w:sz w:val="22"/>
-            <w:szCs w:val="22"/>
-          </w:rPr>
-          <w:t>time series</w:t>
-        </w:r>
-      </w:ins>
-      <w:r>
-        <w:rPr>
-          <w:rFonts w:ascii="Garamond" w:hAnsi="Garamond"/>
-          <w:sz w:val="22"/>
-          <w:szCs w:val="22"/>
-        </w:rPr>
-        <w:t xml:space="preserve"> which were distinct compared to the other watersheds either because of natal origin values</w:t>
-      </w:r>
-      <w:r>
-        <w:rPr>
-          <w:rFonts w:ascii="Garamond" w:hAnsi="Garamond"/>
-          <w:sz w:val="22"/>
-          <w:szCs w:val="22"/>
-        </w:rPr>
-        <w:t xml:space="preserve"> only found in the </w:t>
-      </w:r>
-      <w:r>
-        <w:rPr>
-          <w:rFonts w:ascii="Garamond" w:hAnsi="Garamond"/>
-          <w:sz w:val="22"/>
-          <w:szCs w:val="22"/>
-        </w:rPr>
-        <w:lastRenderedPageBreak/>
-        <w:t>Yukon (</w:t>
-      </w:r>
-      <w:r>
-        <w:rPr>
-          <w:rFonts w:ascii="Cambria Math" w:hAnsi="Cambria Math" w:cs="Cambria Math"/>
-          <w:sz w:val="22"/>
-          <w:szCs w:val="22"/>
-        </w:rPr>
-        <w:t>⁸⁷</w:t>
-      </w:r>
-      <w:r>
-        <w:rPr>
-          <w:rFonts w:ascii="Garamond" w:hAnsi="Garamond"/>
-          <w:sz w:val="22"/>
-          <w:szCs w:val="22"/>
-        </w:rPr>
-        <w:t>Sr/</w:t>
-      </w:r>
-      <w:r>
-        <w:rPr>
-          <w:rFonts w:ascii="Cambria Math" w:hAnsi="Cambria Math" w:cs="Cambria Math"/>
-          <w:sz w:val="22"/>
-          <w:szCs w:val="22"/>
-        </w:rPr>
-        <w:t>⁸⁶</w:t>
-      </w:r>
-      <w:r>
-        <w:rPr>
-          <w:rFonts w:ascii="Garamond" w:hAnsi="Garamond"/>
-          <w:sz w:val="22"/>
-          <w:szCs w:val="22"/>
-        </w:rPr>
-        <w:t>Sr</w:t>
-      </w:r>
-      <w:r>
-        <w:rPr>
-          <w:rFonts w:ascii="Garamond" w:hAnsi="Garamond"/>
-          <w:sz w:val="22"/>
-          <w:szCs w:val="22"/>
-        </w:rPr>
-        <w:t xml:space="preserve"> &gt; 0.715)</w:t>
-      </w:r>
-      <w:r>
-        <w:rPr>
-          <w:rFonts w:ascii="Garamond" w:hAnsi="Garamond"/>
-          <w:sz w:val="22"/>
-          <w:szCs w:val="22"/>
-        </w:rPr>
-        <w:t xml:space="preserve"> or prominent features </w:t>
-      </w:r>
-      <w:r>
-        <w:rPr>
-          <w:rFonts w:ascii="Garamond" w:hAnsi="Garamond"/>
-          <w:sz w:val="22"/>
-          <w:szCs w:val="22"/>
-        </w:rPr>
-        <w:t xml:space="preserve">resulting from a longer </w:t>
-      </w:r>
-      <w:r>
-        <w:rPr>
-          <w:rFonts w:ascii="Garamond" w:hAnsi="Garamond"/>
-          <w:sz w:val="22"/>
-          <w:szCs w:val="22"/>
-        </w:rPr>
-        <w:t>migration through the enriched mainstem tributary (</w:t>
-      </w:r>
-      <w:proofErr w:type="spellStart"/>
-      <w:r>
-        <w:rPr>
-          <w:rFonts w:ascii="Garamond" w:hAnsi="Garamond"/>
-          <w:sz w:val="22"/>
-          <w:szCs w:val="22"/>
-        </w:rPr>
-        <w:t>i.e</w:t>
-      </w:r>
-      <w:proofErr w:type="spellEnd"/>
-      <w:r>
-        <w:rPr>
-          <w:rFonts w:ascii="Garamond" w:hAnsi="Garamond"/>
-          <w:sz w:val="22"/>
-          <w:szCs w:val="22"/>
-        </w:rPr>
-        <w:t xml:space="preserve"> Figure 5b, column 3). </w:t>
-      </w:r>
-      <w:r>
-        <w:rPr>
-          <w:rFonts w:ascii="Garamond" w:hAnsi="Garamond"/>
-          <w:sz w:val="22"/>
-          <w:szCs w:val="22"/>
-        </w:rPr>
-        <w:t xml:space="preserve">Yukon classification accuracy dropped substantially in the "overlap" testing set (86.86% vs. 93.7% in the total testing set), despite similar numbers of misidentified individuals. </w:t>
-      </w:r>
-      <w:r>
-        <w:rPr>
-          <w:rFonts w:ascii="Garamond" w:hAnsi="Garamond"/>
-          <w:sz w:val="22"/>
-          <w:szCs w:val="22"/>
-        </w:rPr>
-        <w:t xml:space="preserve">This </w:t>
-      </w:r>
-      <w:r>
-        <w:rPr>
-          <w:rFonts w:ascii="Garamond" w:hAnsi="Garamond"/>
-          <w:sz w:val="22"/>
-          <w:szCs w:val="22"/>
-        </w:rPr>
-        <w:t>decline likely reflects the removal of the most easily classified cases</w:t>
-      </w:r>
-      <w:r>
-        <w:rPr>
-          <w:rFonts w:ascii="Garamond" w:hAnsi="Garamond"/>
-          <w:sz w:val="22"/>
-          <w:szCs w:val="22"/>
-        </w:rPr>
-        <w:t>, which is further supported by</w:t>
-      </w:r>
-      <w:r>
-        <w:rPr>
-          <w:rFonts w:ascii="Garamond" w:hAnsi="Garamond"/>
-          <w:sz w:val="22"/>
-          <w:szCs w:val="22"/>
-        </w:rPr>
-        <w:t xml:space="preserve"> </w:t>
-      </w:r>
-      <w:r>
-        <w:rPr>
-          <w:rFonts w:ascii="Garamond" w:hAnsi="Garamond"/>
-          <w:sz w:val="22"/>
-          <w:szCs w:val="22"/>
-        </w:rPr>
-        <w:t>higher misclassification rates among CWAK individuals compared to those from the middle and upper Yukon regions</w:t>
-      </w:r>
-      <w:r>
-        <w:rPr>
-          <w:rFonts w:ascii="Garamond" w:hAnsi="Garamond"/>
-          <w:sz w:val="22"/>
-          <w:szCs w:val="22"/>
-        </w:rPr>
-        <w:t xml:space="preserve">. </w:t>
-      </w:r>
-      <w:r>
-        <w:rPr>
-          <w:rFonts w:ascii="Garamond" w:hAnsi="Garamond"/>
-          <w:sz w:val="22"/>
-          <w:szCs w:val="22"/>
-        </w:rPr>
-        <w:t>The</w:t>
-      </w:r>
-      <w:r>
-        <w:rPr>
-          <w:rFonts w:ascii="Garamond" w:hAnsi="Garamond"/>
-          <w:sz w:val="22"/>
-          <w:szCs w:val="22"/>
-        </w:rPr>
-        <w:t xml:space="preserve">se </w:t>
-      </w:r>
-      <w:r>
-        <w:rPr>
-          <w:rFonts w:ascii="Garamond" w:hAnsi="Garamond"/>
-          <w:sz w:val="22"/>
-          <w:szCs w:val="22"/>
-        </w:rPr>
-        <w:t xml:space="preserve">challenges </w:t>
-      </w:r>
-      <w:r>
-        <w:rPr>
-          <w:rFonts w:ascii="Garamond" w:hAnsi="Garamond"/>
-          <w:sz w:val="22"/>
-          <w:szCs w:val="22"/>
-        </w:rPr>
-        <w:t xml:space="preserve">likely stem </w:t>
-      </w:r>
-      <w:r>
-        <w:rPr>
-          <w:rFonts w:ascii="Garamond" w:hAnsi="Garamond"/>
-          <w:sz w:val="22"/>
-          <w:szCs w:val="22"/>
-        </w:rPr>
-        <w:t>from shorter migration patterns that include less residence time in the mainstem Yukon River</w:t>
-      </w:r>
-      <w:r>
-        <w:rPr>
-          <w:rFonts w:ascii="Garamond" w:hAnsi="Garamond"/>
-          <w:sz w:val="22"/>
-          <w:szCs w:val="22"/>
-        </w:rPr>
-        <w:t>, and, subsequently, a</w:t>
-      </w:r>
-      <w:r>
-        <w:rPr>
-          <w:rFonts w:ascii="Garamond" w:hAnsi="Garamond"/>
-          <w:sz w:val="22"/>
-          <w:szCs w:val="22"/>
-        </w:rPr>
-        <w:t xml:space="preserve"> less pronounced increase in isotope values before marine entry</w:t>
-      </w:r>
-      <w:r>
-        <w:rPr>
-          <w:rFonts w:ascii="Garamond" w:hAnsi="Garamond"/>
-          <w:sz w:val="22"/>
-          <w:szCs w:val="22"/>
-        </w:rPr>
-        <w:t xml:space="preserve">. Without this distinguishing feature, CWAK individuals from the Yukon (i.e. Figure 5b, column 4) are more likely to be misclassified with Kuskokwim or Nushagak fish, resulting in lower overall accuracy. </w:t>
-      </w:r>
-      <w:r>
-        <w:rPr>
-          <w:rFonts w:ascii="Garamond" w:hAnsi="Garamond"/>
-          <w:sz w:val="22"/>
-          <w:szCs w:val="22"/>
-        </w:rPr>
-        <w:t xml:space="preserve">Still, </w:t>
-      </w:r>
-      <w:r>
-        <w:rPr>
-          <w:rFonts w:ascii="Garamond" w:hAnsi="Garamond"/>
-          <w:sz w:val="22"/>
-          <w:szCs w:val="22"/>
-        </w:rPr>
-        <w:t xml:space="preserve">PCA analysis suggests that other features in the </w:t>
-      </w:r>
-      <w:del w:id="134" w:author="Daniel Schindler" w:date="2025-10-02T15:16:00Z" w16du:dateUtc="2025-10-02T22:16:00Z">
-        <w:r>
-          <w:rPr>
-            <w:rFonts w:ascii="Garamond" w:hAnsi="Garamond"/>
-            <w:sz w:val="22"/>
-            <w:szCs w:val="22"/>
-          </w:rPr>
-          <w:delText>timeseries</w:delText>
-        </w:r>
-      </w:del>
-      <w:ins w:id="135" w:author="Daniel Schindler" w:date="2025-10-02T15:16:00Z" w16du:dateUtc="2025-10-02T22:16:00Z">
-        <w:r>
-          <w:rPr>
-            <w:rFonts w:ascii="Garamond" w:hAnsi="Garamond"/>
-            <w:sz w:val="22"/>
-            <w:szCs w:val="22"/>
-          </w:rPr>
-          <w:t>time series</w:t>
-        </w:r>
-      </w:ins>
-      <w:r>
-        <w:rPr>
-          <w:rFonts w:ascii="Garamond" w:hAnsi="Garamond"/>
-          <w:sz w:val="22"/>
-          <w:szCs w:val="22"/>
-        </w:rPr>
-        <w:t xml:space="preserve"> may also</w:t>
-      </w:r>
-      <w:r>
-        <w:rPr>
-          <w:rFonts w:ascii="Garamond" w:hAnsi="Garamond"/>
-          <w:sz w:val="22"/>
-          <w:szCs w:val="22"/>
-        </w:rPr>
-        <w:t xml:space="preserve"> contribute to </w:t>
-      </w:r>
-      <w:r>
-        <w:rPr>
-          <w:rFonts w:ascii="Garamond" w:hAnsi="Garamond"/>
-          <w:sz w:val="22"/>
-          <w:szCs w:val="22"/>
-        </w:rPr>
-        <w:t xml:space="preserve">the ability to distinguish among watersheds (Figure 5). These small </w:t>
-      </w:r>
-      <w:r>
-        <w:rPr>
-          <w:rFonts w:ascii="Garamond" w:hAnsi="Garamond"/>
-          <w:sz w:val="22"/>
-          <w:szCs w:val="22"/>
-        </w:rPr>
-        <w:t xml:space="preserve">variations may become more readily apparent for classification </w:t>
-      </w:r>
-      <w:r>
-        <w:rPr>
-          <w:rFonts w:ascii="Garamond" w:hAnsi="Garamond"/>
-          <w:sz w:val="22"/>
-          <w:szCs w:val="22"/>
-        </w:rPr>
-        <w:t>when used alongside other</w:t>
-      </w:r>
-      <w:commentRangeStart w:id="136"/>
-      <w:r>
-        <w:rPr>
-          <w:rFonts w:ascii="Garamond" w:hAnsi="Garamond"/>
-          <w:sz w:val="22"/>
-          <w:szCs w:val="22"/>
-        </w:rPr>
-        <w:t xml:space="preserve"> </w:t>
-      </w:r>
-      <w:del w:id="137" w:author="Daniel Schindler" w:date="2025-10-02T15:16:00Z" w16du:dateUtc="2025-10-02T22:16:00Z">
-        <w:r>
-          <w:rPr>
-            <w:rFonts w:ascii="Garamond" w:hAnsi="Garamond"/>
-            <w:sz w:val="22"/>
-            <w:szCs w:val="22"/>
-          </w:rPr>
-          <w:delText>timeseries</w:delText>
-        </w:r>
-      </w:del>
-      <w:ins w:id="138" w:author="Daniel Schindler" w:date="2025-10-02T15:16:00Z" w16du:dateUtc="2025-10-02T22:16:00Z">
-        <w:r>
-          <w:rPr>
-            <w:rFonts w:ascii="Garamond" w:hAnsi="Garamond"/>
-            <w:sz w:val="22"/>
-            <w:szCs w:val="22"/>
-          </w:rPr>
-          <w:t>time series</w:t>
-        </w:r>
-      </w:ins>
-      <w:r>
-        <w:rPr>
-          <w:rFonts w:ascii="Garamond" w:hAnsi="Garamond"/>
-          <w:sz w:val="22"/>
-          <w:szCs w:val="22"/>
-        </w:rPr>
-        <w:t xml:space="preserve"> analysis techniques</w:t>
-      </w:r>
-      <w:commentRangeEnd w:id="136"/>
-      <w:r>
-        <w:rPr>
-          <w:rStyle w:val="CommentReference"/>
-        </w:rPr>
-        <w:commentReference w:id="136"/>
-      </w:r>
-      <w:r>
-        <w:rPr>
-          <w:rFonts w:ascii="Garamond" w:hAnsi="Garamond"/>
-          <w:sz w:val="22"/>
-          <w:szCs w:val="22"/>
-        </w:rPr>
-        <w:t xml:space="preserve"> or by increasing the sample size of Yukon CWAK individuals in the training set. </w:t>
-      </w:r>
     </w:p>
     <w:p>
       <w:pPr>
@@ -10096,14 +10580,17 @@
     </w:p>
     <w:p>
       <w:pPr>
-        <w:pStyle w:val="whitespace-normal"/>
+        <w:pStyle w:val="NormalWeb"/>
         <w:spacing w:line="480" w:lineRule="auto"/>
         <w:ind w:firstLine="720"/>
         <w:rPr>
-          <w:rFonts w:ascii="Garamond" w:hAnsi="Garamond"/>
-          <w:sz w:val="22"/>
-          <w:szCs w:val="22"/>
-        </w:rPr>
+          <w:ins w:id="184" w:author="Benjamin J. Makhlouf" w:date="2025-10-09T10:55:00Z" w16du:dateUtc="2025-10-09T17:55:00Z"/>
+        </w:rPr>
+        <w:pPrChange w:id="185" w:author="Benjamin J. Makhlouf" w:date="2025-10-09T11:02:00Z" w16du:dateUtc="2025-10-09T18:02:00Z">
+          <w:pPr>
+            <w:pStyle w:val="NormalWeb"/>
+          </w:pPr>
+        </w:pPrChange>
       </w:pPr>
       <w:r>
         <w:rPr>
@@ -10191,48 +10678,16 @@
           <w:sz w:val="22"/>
           <w:szCs w:val="22"/>
         </w:rPr>
-        <w:t xml:space="preserve"> to provide probabilistic estimates of provenance, and calibrated models presented here may be immediately useful for classifying adult Chinook salmon from western Alaska watershed. </w:t>
-      </w:r>
-      <w:r>
-        <w:rPr>
-          <w:rFonts w:ascii="Garamond" w:hAnsi="Garamond"/>
-          <w:sz w:val="22"/>
-          <w:szCs w:val="22"/>
-        </w:rPr>
-        <w:t>Because of the size of this dataset and the temporal scale of sampling efforts, we expect that th</w:t>
-      </w:r>
-      <w:r>
-        <w:rPr>
-          <w:rFonts w:ascii="Garamond" w:hAnsi="Garamond"/>
-          <w:sz w:val="22"/>
-          <w:szCs w:val="22"/>
-        </w:rPr>
-        <w:t>e library of otolith data included in this model includes variability among years that will allow it to perform well on new data</w:t>
-      </w:r>
-      <w:r>
-        <w:rPr>
-          <w:rFonts w:ascii="Garamond" w:hAnsi="Garamond"/>
-          <w:sz w:val="22"/>
-          <w:szCs w:val="22"/>
-        </w:rPr>
-        <w:t>sets</w:t>
-      </w:r>
-      <w:r>
-        <w:rPr>
-          <w:rFonts w:ascii="Garamond" w:hAnsi="Garamond"/>
-          <w:sz w:val="22"/>
-          <w:szCs w:val="22"/>
-        </w:rPr>
-        <w:t xml:space="preserve">. However, because we opted not to include a true validation set given sample-size constraints, there remains the potential that performance on a new year may be lower due to </w:t>
-      </w:r>
-      <w:ins w:id="139" w:author="Daniel Schindler" w:date="2025-10-06T11:05:00Z" w16du:dateUtc="2025-10-06T18:05:00Z">
-        <w:r>
-          <w:rPr>
-            <w:rFonts w:ascii="Garamond" w:hAnsi="Garamond"/>
-            <w:sz w:val="22"/>
-            <w:szCs w:val="22"/>
-          </w:rPr>
-          <w:t xml:space="preserve">potential </w:t>
+        <w:t xml:space="preserve"> to provide probabilistic estimates of provenance, and calibrated models presented here may be immediately useful for classifying adult Chinook salmon from western Alaska watershed</w:t>
+      </w:r>
+      <w:ins w:id="186" w:author="Benjamin J. Makhlouf" w:date="2025-10-09T10:44:00Z" w16du:dateUtc="2025-10-09T17:44:00Z">
+        <w:r>
+          <w:rPr>
+            <w:rFonts w:ascii="Garamond" w:hAnsi="Garamond"/>
+            <w:sz w:val="22"/>
+            <w:szCs w:val="22"/>
+          </w:rPr>
+          <w:t>s</w:t>
         </w:r>
       </w:ins>
       <w:r>
@@ -10241,17 +10696,211 @@
           <w:sz w:val="22"/>
           <w:szCs w:val="22"/>
         </w:rPr>
-        <w:t xml:space="preserve">overfitting to our dataset. In addition, because these data include only the juvenile freshwater residence </w:t>
-      </w:r>
-      <w:r>
-        <w:rPr>
-          <w:rFonts w:ascii="Garamond" w:hAnsi="Garamond"/>
-          <w:sz w:val="22"/>
-          <w:szCs w:val="22"/>
-        </w:rPr>
-        <w:lastRenderedPageBreak/>
-        <w:t xml:space="preserve">period, we expect that this model can be applied to juvenile chinook salmon expected to be from western Alaska watersheds. However, this assumption should be tested using known-origin individuals before large scale implementation. </w:t>
-      </w:r>
+        <w:t xml:space="preserve">. </w:t>
+      </w:r>
+      <w:ins w:id="187" w:author="Benjamin J. Makhlouf" w:date="2025-10-09T10:55:00Z" w16du:dateUtc="2025-10-09T17:55:00Z">
+        <w:r>
+          <w:rPr>
+            <w:rFonts w:ascii="Garamond" w:hAnsi="Garamond"/>
+            <w:sz w:val="22"/>
+            <w:szCs w:val="22"/>
+            <w:rPrChange w:id="188" w:author="Benjamin J. Makhlouf" w:date="2025-10-09T10:59:00Z" w16du:dateUtc="2025-10-09T17:59:00Z">
+              <w:rPr/>
+            </w:rPrChange>
+          </w:rPr>
+          <w:t xml:space="preserve">Our dataset is unusually large for its type and includes samples collected across several years and from nearly all parts of the </w:t>
+        </w:r>
+      </w:ins>
+      <w:ins w:id="189" w:author="Benjamin J. Makhlouf" w:date="2025-10-09T10:56:00Z" w16du:dateUtc="2025-10-09T17:56:00Z">
+        <w:r>
+          <w:rPr>
+            <w:rFonts w:ascii="Garamond" w:hAnsi="Garamond"/>
+            <w:sz w:val="22"/>
+            <w:szCs w:val="22"/>
+            <w:rPrChange w:id="190" w:author="Benjamin J. Makhlouf" w:date="2025-10-09T10:59:00Z" w16du:dateUtc="2025-10-09T17:59:00Z">
+              <w:rPr/>
+            </w:rPrChange>
+          </w:rPr>
+          <w:t xml:space="preserve">sampled </w:t>
+        </w:r>
+      </w:ins>
+      <w:ins w:id="191" w:author="Benjamin J. Makhlouf" w:date="2025-10-09T10:55:00Z" w16du:dateUtc="2025-10-09T17:55:00Z">
+        <w:r>
+          <w:rPr>
+            <w:rFonts w:ascii="Garamond" w:hAnsi="Garamond"/>
+            <w:sz w:val="22"/>
+            <w:szCs w:val="22"/>
+            <w:rPrChange w:id="192" w:author="Benjamin J. Makhlouf" w:date="2025-10-09T10:59:00Z" w16du:dateUtc="2025-10-09T17:59:00Z">
+              <w:rPr/>
+            </w:rPrChange>
+          </w:rPr>
+          <w:t>watershed</w:t>
+        </w:r>
+      </w:ins>
+      <w:ins w:id="193" w:author="Benjamin J. Makhlouf" w:date="2025-10-09T10:56:00Z" w16du:dateUtc="2025-10-09T17:56:00Z">
+        <w:r>
+          <w:rPr>
+            <w:rFonts w:ascii="Garamond" w:hAnsi="Garamond"/>
+            <w:sz w:val="22"/>
+            <w:szCs w:val="22"/>
+            <w:rPrChange w:id="194" w:author="Benjamin J. Makhlouf" w:date="2025-10-09T10:59:00Z" w16du:dateUtc="2025-10-09T17:59:00Z">
+              <w:rPr/>
+            </w:rPrChange>
+          </w:rPr>
+          <w:t>s</w:t>
+        </w:r>
+      </w:ins>
+      <w:ins w:id="195" w:author="Benjamin J. Makhlouf" w:date="2025-10-09T10:55:00Z" w16du:dateUtc="2025-10-09T17:55:00Z">
+        <w:r>
+          <w:rPr>
+            <w:rFonts w:ascii="Garamond" w:hAnsi="Garamond"/>
+            <w:sz w:val="22"/>
+            <w:szCs w:val="22"/>
+            <w:rPrChange w:id="196" w:author="Benjamin J. Makhlouf" w:date="2025-10-09T10:59:00Z" w16du:dateUtc="2025-10-09T17:59:00Z">
+              <w:rPr/>
+            </w:rPrChange>
+          </w:rPr>
+          <w:t>. As such, we expect it to be broadly representative of the natural variability among years, and that the model presented here will generalize well to new years of data. However, due to sample size constraints</w:t>
+        </w:r>
+        <w:r>
+          <w:rPr>
+            <w:rFonts w:ascii="Garamond" w:hAnsi="Garamond"/>
+            <w:sz w:val="22"/>
+            <w:szCs w:val="22"/>
+            <w:rPrChange w:id="197" w:author="Benjamin J. Makhlouf" w:date="2025-10-09T10:59:00Z" w16du:dateUtc="2025-10-09T17:59:00Z">
+              <w:rPr/>
+            </w:rPrChange>
+          </w:rPr>
+          <w:t xml:space="preserve"> </w:t>
+        </w:r>
+        <w:r>
+          <w:rPr>
+            <w:rFonts w:ascii="Garamond" w:hAnsi="Garamond"/>
+            <w:sz w:val="22"/>
+            <w:szCs w:val="22"/>
+            <w:rPrChange w:id="198" w:author="Benjamin J. Makhlouf" w:date="2025-10-09T10:59:00Z" w16du:dateUtc="2025-10-09T17:59:00Z">
+              <w:rPr/>
+            </w:rPrChange>
+          </w:rPr>
+          <w:t xml:space="preserve">we did not include a true validation set from a year excluded from the training and testing data, leaving open the possibility that some degree of overfitting to this dataset could affect assignment accuracy for unseen years. Additionally, sample preparation procedures and ICP-MS </w:t>
+        </w:r>
+        <w:r>
+          <w:rPr>
+            <w:rFonts w:ascii="Garamond" w:hAnsi="Garamond"/>
+            <w:sz w:val="22"/>
+            <w:szCs w:val="22"/>
+            <w:rPrChange w:id="199" w:author="Benjamin J. Makhlouf" w:date="2025-10-09T10:59:00Z" w16du:dateUtc="2025-10-09T17:59:00Z">
+              <w:rPr/>
+            </w:rPrChange>
+          </w:rPr>
+          <w:lastRenderedPageBreak/>
+          <w:t xml:space="preserve">specifications may vary among research groups, which could complicate direct comparisons between our dataset and </w:t>
+        </w:r>
+        <w:proofErr w:type="spellStart"/>
+        <w:proofErr w:type="gramStart"/>
+        <w:r>
+          <w:rPr>
+            <w:rFonts w:ascii="Garamond" w:hAnsi="Garamond"/>
+            <w:sz w:val="22"/>
+            <w:szCs w:val="22"/>
+            <w:rPrChange w:id="200" w:author="Benjamin J. Makhlouf" w:date="2025-10-09T10:59:00Z" w16du:dateUtc="2025-10-09T17:59:00Z">
+              <w:rPr/>
+            </w:rPrChange>
+          </w:rPr>
+          <w:t>others.This</w:t>
+        </w:r>
+        <w:proofErr w:type="spellEnd"/>
+        <w:proofErr w:type="gramEnd"/>
+        <w:r>
+          <w:rPr>
+            <w:rFonts w:ascii="Garamond" w:hAnsi="Garamond"/>
+            <w:sz w:val="22"/>
+            <w:szCs w:val="22"/>
+            <w:rPrChange w:id="201" w:author="Benjamin J. Makhlouf" w:date="2025-10-09T10:59:00Z" w16du:dateUtc="2025-10-09T17:59:00Z">
+              <w:rPr/>
+            </w:rPrChange>
+          </w:rPr>
+          <w:t xml:space="preserve"> consideration also applies to analyses of juvenile Chinook salmon, which should display comparable isotopic patterns since our model used only the freshwater region of the otolith. Nevertheless, differences in analytical approaches</w:t>
+        </w:r>
+      </w:ins>
+      <w:ins w:id="202" w:author="Benjamin J. Makhlouf" w:date="2025-10-09T10:56:00Z" w16du:dateUtc="2025-10-09T17:56:00Z">
+        <w:r>
+          <w:rPr>
+            <w:rFonts w:ascii="Garamond" w:hAnsi="Garamond"/>
+            <w:sz w:val="22"/>
+            <w:szCs w:val="22"/>
+            <w:rPrChange w:id="203" w:author="Benjamin J. Makhlouf" w:date="2025-10-09T10:59:00Z" w16du:dateUtc="2025-10-09T17:59:00Z">
+              <w:rPr/>
+            </w:rPrChange>
+          </w:rPr>
+          <w:t xml:space="preserve">, </w:t>
+        </w:r>
+      </w:ins>
+      <w:ins w:id="204" w:author="Benjamin J. Makhlouf" w:date="2025-10-09T10:55:00Z" w16du:dateUtc="2025-10-09T17:55:00Z">
+        <w:r>
+          <w:rPr>
+            <w:rFonts w:ascii="Garamond" w:hAnsi="Garamond"/>
+            <w:sz w:val="22"/>
+            <w:szCs w:val="22"/>
+            <w:rPrChange w:id="205" w:author="Benjamin J. Makhlouf" w:date="2025-10-09T10:59:00Z" w16du:dateUtc="2025-10-09T17:59:00Z">
+              <w:rPr/>
+            </w:rPrChange>
+          </w:rPr>
+          <w:t>particularly when working with much smaller otoliths</w:t>
+        </w:r>
+      </w:ins>
+      <w:ins w:id="206" w:author="Benjamin J. Makhlouf" w:date="2025-10-09T10:56:00Z" w16du:dateUtc="2025-10-09T17:56:00Z">
+        <w:r>
+          <w:rPr>
+            <w:rFonts w:ascii="Garamond" w:hAnsi="Garamond"/>
+            <w:sz w:val="22"/>
+            <w:szCs w:val="22"/>
+            <w:rPrChange w:id="207" w:author="Benjamin J. Makhlouf" w:date="2025-10-09T10:59:00Z" w16du:dateUtc="2025-10-09T17:59:00Z">
+              <w:rPr/>
+            </w:rPrChange>
+          </w:rPr>
+          <w:t xml:space="preserve">, </w:t>
+        </w:r>
+      </w:ins>
+      <w:ins w:id="208" w:author="Benjamin J. Makhlouf" w:date="2025-10-09T10:55:00Z" w16du:dateUtc="2025-10-09T17:55:00Z">
+        <w:r>
+          <w:rPr>
+            <w:rFonts w:ascii="Garamond" w:hAnsi="Garamond"/>
+            <w:sz w:val="22"/>
+            <w:szCs w:val="22"/>
+            <w:rPrChange w:id="209" w:author="Benjamin J. Makhlouf" w:date="2025-10-09T10:59:00Z" w16du:dateUtc="2025-10-09T17:59:00Z">
+              <w:rPr/>
+            </w:rPrChange>
+          </w:rPr>
+          <w:t>could influence results, and this assumption should be evaluated before large-scale application. Despite these caveats, we expect the patterns identified here to be robust across similar data types, particularly when paired with advanced time-series methods such as dynamic time warping</w:t>
+        </w:r>
+      </w:ins>
+      <w:ins w:id="210" w:author="Benjamin J. Makhlouf" w:date="2025-10-09T10:56:00Z" w16du:dateUtc="2025-10-09T17:56:00Z">
+        <w:r>
+          <w:rPr>
+            <w:rFonts w:ascii="Garamond" w:hAnsi="Garamond"/>
+            <w:sz w:val="22"/>
+            <w:szCs w:val="22"/>
+            <w:rPrChange w:id="211" w:author="Benjamin J. Makhlouf" w:date="2025-10-09T10:59:00Z" w16du:dateUtc="2025-10-09T17:59:00Z">
+              <w:rPr/>
+            </w:rPrChange>
+          </w:rPr>
+          <w:t xml:space="preserve"> (cite, cite)</w:t>
+        </w:r>
+      </w:ins>
+      <w:ins w:id="212" w:author="Benjamin J. Makhlouf" w:date="2025-10-09T10:55:00Z" w16du:dateUtc="2025-10-09T17:55:00Z">
+        <w:r>
+          <w:rPr>
+            <w:rFonts w:ascii="Garamond" w:hAnsi="Garamond"/>
+            <w:sz w:val="22"/>
+            <w:szCs w:val="22"/>
+            <w:rPrChange w:id="213" w:author="Benjamin J. Makhlouf" w:date="2025-10-09T10:59:00Z" w16du:dateUtc="2025-10-09T17:59:00Z">
+              <w:rPr/>
+            </w:rPrChange>
+          </w:rPr>
+          <w:t>, which can account for small temporal misalignments, or deep learning approaches, which can accommodate variation in time-series length and thereby minimize interpolation error.</w:t>
+        </w:r>
+      </w:ins>
     </w:p>
     <w:p>
       <w:pPr>
@@ -10259,95 +10908,130 @@
         <w:spacing w:line="480" w:lineRule="auto"/>
         <w:ind w:firstLine="720"/>
         <w:rPr>
-          <w:rFonts w:ascii="Garamond" w:hAnsi="Garamond"/>
-          <w:sz w:val="22"/>
-          <w:szCs w:val="22"/>
-        </w:rPr>
+          <w:del w:id="214" w:author="Benjamin J. Makhlouf" w:date="2025-10-09T10:59:00Z" w16du:dateUtc="2025-10-09T17:59:00Z"/>
+          <w:rFonts w:ascii="Garamond" w:hAnsi="Garamond"/>
+          <w:sz w:val="22"/>
+          <w:szCs w:val="22"/>
+        </w:rPr>
+        <w:pPrChange w:id="215" w:author="Benjamin J. Makhlouf" w:date="2025-10-09T10:59:00Z" w16du:dateUtc="2025-10-09T17:59:00Z">
+          <w:pPr>
+            <w:pStyle w:val="whitespace-normal"/>
+            <w:spacing w:line="480" w:lineRule="auto"/>
+            <w:ind w:firstLine="720"/>
+          </w:pPr>
+        </w:pPrChange>
       </w:pPr>
-      <w:r>
-        <w:rPr>
-          <w:rFonts w:ascii="Garamond" w:hAnsi="Garamond"/>
-          <w:sz w:val="22"/>
-          <w:szCs w:val="22"/>
-        </w:rPr>
-        <w:t>In addition, the methods presented here provide quantifiable confidence values which can be directly used by managers to make decisions based on changing thresholds of misassignment risk, offering a practical framework for incorporating uncertainty into management decisions.</w:t>
-      </w:r>
-      <w:r>
-        <w:rPr>
-          <w:rFonts w:ascii="Garamond" w:hAnsi="Garamond"/>
-          <w:sz w:val="22"/>
-          <w:szCs w:val="22"/>
-        </w:rPr>
-        <w:t xml:space="preserve"> Even with extremely high confidence threshold values, our model achieved between ~70% and ~85% accuracy for all classes. The exception to this is the Yukon classification on the “Total” testing set, in which distinct </w:t>
-      </w:r>
-      <w:r>
-        <w:rPr>
-          <w:rFonts w:ascii="Cambria Math" w:hAnsi="Cambria Math" w:cs="Cambria Math"/>
-          <w:sz w:val="22"/>
-          <w:szCs w:val="22"/>
-        </w:rPr>
-        <w:t>⁸⁷</w:t>
-      </w:r>
-      <w:r>
-        <w:rPr>
-          <w:rFonts w:ascii="Garamond" w:hAnsi="Garamond"/>
-          <w:sz w:val="22"/>
-          <w:szCs w:val="22"/>
-        </w:rPr>
-        <w:t>Sr/</w:t>
-      </w:r>
-      <w:r>
-        <w:rPr>
-          <w:rFonts w:ascii="Cambria Math" w:hAnsi="Cambria Math" w:cs="Cambria Math"/>
-          <w:sz w:val="22"/>
-          <w:szCs w:val="22"/>
-        </w:rPr>
-        <w:t>⁸⁶</w:t>
-      </w:r>
-      <w:r>
-        <w:rPr>
-          <w:rFonts w:ascii="Garamond" w:hAnsi="Garamond"/>
-          <w:sz w:val="22"/>
-          <w:szCs w:val="22"/>
-        </w:rPr>
-        <w:t xml:space="preserve">Sr values in the Yukon buoy correct classification with extremely high confidence </w:t>
-      </w:r>
-      <w:commentRangeStart w:id="140"/>
-      <w:r>
-        <w:rPr>
-          <w:rFonts w:ascii="Garamond" w:hAnsi="Garamond"/>
-          <w:sz w:val="22"/>
-          <w:szCs w:val="22"/>
-        </w:rPr>
-        <w:t>values</w:t>
-      </w:r>
-      <w:commentRangeEnd w:id="140"/>
-      <w:r>
-        <w:rPr>
-          <w:rStyle w:val="CommentReference"/>
-          <w:rFonts w:ascii="Garamond" w:eastAsiaTheme="minorHAnsi" w:hAnsi="Garamond" w:cstheme="minorBidi"/>
-          <w:kern w:val="2"/>
-          <w:sz w:val="22"/>
-          <w:szCs w:val="22"/>
-          <w14:ligatures w14:val="standardContextual"/>
-        </w:rPr>
-        <w:commentReference w:id="140"/>
-      </w:r>
-      <w:r>
-        <w:rPr>
-          <w:rFonts w:ascii="Garamond" w:hAnsi="Garamond"/>
-          <w:sz w:val="22"/>
-          <w:szCs w:val="22"/>
-        </w:rPr>
-        <w:t xml:space="preserve">. </w:t>
-      </w:r>
+      <w:del w:id="216" w:author="Benjamin J. Makhlouf" w:date="2025-10-09T10:47:00Z" w16du:dateUtc="2025-10-09T17:47:00Z">
+        <w:r>
+          <w:rPr>
+            <w:rFonts w:ascii="Garamond" w:hAnsi="Garamond"/>
+            <w:sz w:val="22"/>
+            <w:szCs w:val="22"/>
+          </w:rPr>
+          <w:delText>Because of the size of this dataset and the temporal scale of sampling efforts, we expect that th</w:delText>
+        </w:r>
+        <w:r>
+          <w:rPr>
+            <w:rFonts w:ascii="Garamond" w:hAnsi="Garamond"/>
+            <w:sz w:val="22"/>
+            <w:szCs w:val="22"/>
+          </w:rPr>
+          <w:delText>e library of otolith data included in this model includes variability among years that will allow it to perform well on new data</w:delText>
+        </w:r>
+        <w:r>
+          <w:rPr>
+            <w:rFonts w:ascii="Garamond" w:hAnsi="Garamond"/>
+            <w:sz w:val="22"/>
+            <w:szCs w:val="22"/>
+          </w:rPr>
+          <w:delText>sets</w:delText>
+        </w:r>
+        <w:r>
+          <w:rPr>
+            <w:rFonts w:ascii="Garamond" w:hAnsi="Garamond"/>
+            <w:sz w:val="22"/>
+            <w:szCs w:val="22"/>
+          </w:rPr>
+          <w:delText xml:space="preserve">. However, because we </w:delText>
+        </w:r>
+      </w:del>
+      <w:del w:id="217" w:author="Benjamin J. Makhlouf" w:date="2025-10-09T10:55:00Z" w16du:dateUtc="2025-10-09T17:55:00Z">
+        <w:r>
+          <w:rPr>
+            <w:rFonts w:ascii="Garamond" w:hAnsi="Garamond"/>
+            <w:sz w:val="22"/>
+            <w:szCs w:val="22"/>
+          </w:rPr>
+          <w:delText xml:space="preserve">opted not to include a true validation set </w:delText>
+        </w:r>
+      </w:del>
+      <w:ins w:id="218" w:author="Benjamin J. Makhlouf" w:date="2025-10-09T10:59:00Z" w16du:dateUtc="2025-10-09T17:59:00Z">
+        <w:r>
+          <w:rPr>
+            <w:rFonts w:ascii="Garamond" w:hAnsi="Garamond"/>
+            <w:sz w:val="22"/>
+            <w:szCs w:val="22"/>
+          </w:rPr>
+          <w:tab/>
+        </w:r>
+      </w:ins>
+      <w:del w:id="219" w:author="Benjamin J. Makhlouf" w:date="2025-10-09T10:49:00Z" w16du:dateUtc="2025-10-09T17:49:00Z">
+        <w:r>
+          <w:rPr>
+            <w:rFonts w:ascii="Garamond" w:hAnsi="Garamond"/>
+            <w:sz w:val="22"/>
+            <w:szCs w:val="22"/>
+          </w:rPr>
+          <w:delText xml:space="preserve">given sample-size constraints, there remains the potential that performance on a new year may be lower due to </w:delText>
+        </w:r>
+      </w:del>
+      <w:ins w:id="220" w:author="Daniel Schindler" w:date="2025-10-06T11:05:00Z" w16du:dateUtc="2025-10-06T18:05:00Z">
+        <w:del w:id="221" w:author="Benjamin J. Makhlouf" w:date="2025-10-09T10:49:00Z" w16du:dateUtc="2025-10-09T17:49:00Z">
+          <w:r>
+            <w:rPr>
+              <w:rFonts w:ascii="Garamond" w:hAnsi="Garamond"/>
+              <w:sz w:val="22"/>
+              <w:szCs w:val="22"/>
+            </w:rPr>
+            <w:delText xml:space="preserve">potential </w:delText>
+          </w:r>
+        </w:del>
+      </w:ins>
+      <w:del w:id="222" w:author="Benjamin J. Makhlouf" w:date="2025-10-09T10:49:00Z" w16du:dateUtc="2025-10-09T17:49:00Z">
+        <w:r>
+          <w:rPr>
+            <w:rFonts w:ascii="Garamond" w:hAnsi="Garamond"/>
+            <w:sz w:val="22"/>
+            <w:szCs w:val="22"/>
+          </w:rPr>
+          <w:delText>overfitting to our dataset.</w:delText>
+        </w:r>
+      </w:del>
+      <w:del w:id="223" w:author="Benjamin J. Makhlouf" w:date="2025-10-09T10:59:00Z" w16du:dateUtc="2025-10-09T17:59:00Z">
+        <w:r>
+          <w:rPr>
+            <w:rFonts w:ascii="Garamond" w:hAnsi="Garamond"/>
+            <w:sz w:val="22"/>
+            <w:szCs w:val="22"/>
+          </w:rPr>
+          <w:delText xml:space="preserve"> In addition, because these data include only the juvenile freshwater residence </w:delText>
+        </w:r>
+        <w:r>
+          <w:rPr>
+            <w:rFonts w:ascii="Garamond" w:hAnsi="Garamond"/>
+            <w:sz w:val="22"/>
+            <w:szCs w:val="22"/>
+          </w:rPr>
+          <w:delText xml:space="preserve">period, we expect that this model can be applied to juvenile chinook salmon expected to be from western Alaska watersheds. However, this assumption should be tested using known-origin individuals before large scale implementation. </w:delText>
+        </w:r>
+      </w:del>
     </w:p>
     <w:p>
       <w:pPr>
         <w:pStyle w:val="whitespace-normal"/>
         <w:spacing w:line="480" w:lineRule="auto"/>
-        <w:ind w:firstLine="720"/>
-        <w:rPr>
+        <w:rPr>
+          <w:ins w:id="224" w:author="Benjamin J. Makhlouf" w:date="2025-10-09T11:02:00Z" w16du:dateUtc="2025-10-09T18:02:00Z"/>
           <w:rFonts w:ascii="Garamond" w:hAnsi="Garamond"/>
           <w:sz w:val="22"/>
           <w:szCs w:val="22"/>
@@ -10359,8 +11043,601 @@
           <w:sz w:val="22"/>
           <w:szCs w:val="22"/>
         </w:rPr>
-        <w:t>Although the methods presented here advance the ability to discriminate among rivers for Western Alaska Chinook salmon, they remain limited for in-season management or rapid research applications. Otolith LA-ICPMS is costly and labor-intensive, making large-scale, real-time assessment of river origin for marine-caught samples impractical. Moreover, otolith collection is lethal, which may be prohibitive given the increasingly endangered status of Chinook salmon in this region. The model also relies on a large existing dataset with known river-of-origin labels derived from unique sampling efforts, a resource not available for most other species of concern. For example, comparable datasets do not exist for chum salmon, constraining the broader application of these methods across species.</w:t>
-      </w:r>
+        <w:t>In addition</w:t>
+      </w:r>
+      <w:ins w:id="225" w:author="Benjamin J. Makhlouf" w:date="2025-10-09T11:00:00Z" w16du:dateUtc="2025-10-09T18:00:00Z">
+        <w:r>
+          <w:rPr>
+            <w:rFonts w:ascii="Garamond" w:hAnsi="Garamond"/>
+            <w:sz w:val="22"/>
+            <w:szCs w:val="22"/>
+          </w:rPr>
+          <w:t xml:space="preserve"> to providing accurate watershed assignment estimates, </w:t>
+        </w:r>
+      </w:ins>
+      <w:del w:id="226" w:author="Benjamin J. Makhlouf" w:date="2025-10-09T11:00:00Z" w16du:dateUtc="2025-10-09T18:00:00Z">
+        <w:r>
+          <w:rPr>
+            <w:rFonts w:ascii="Garamond" w:hAnsi="Garamond"/>
+            <w:sz w:val="22"/>
+            <w:szCs w:val="22"/>
+          </w:rPr>
+          <w:delText xml:space="preserve">, </w:delText>
+        </w:r>
+      </w:del>
+      <w:r>
+        <w:rPr>
+          <w:rFonts w:ascii="Garamond" w:hAnsi="Garamond"/>
+          <w:sz w:val="22"/>
+          <w:szCs w:val="22"/>
+        </w:rPr>
+        <w:t xml:space="preserve">the </w:t>
+      </w:r>
+      <w:ins w:id="227" w:author="Benjamin J. Makhlouf" w:date="2025-10-09T11:00:00Z" w16du:dateUtc="2025-10-09T18:00:00Z">
+        <w:r>
+          <w:rPr>
+            <w:rFonts w:ascii="Garamond" w:hAnsi="Garamond"/>
+            <w:sz w:val="22"/>
+            <w:szCs w:val="22"/>
+          </w:rPr>
+          <w:t>workflow</w:t>
+        </w:r>
+      </w:ins>
+      <w:del w:id="228" w:author="Benjamin J. Makhlouf" w:date="2025-10-09T11:00:00Z" w16du:dateUtc="2025-10-09T18:00:00Z">
+        <w:r>
+          <w:rPr>
+            <w:rFonts w:ascii="Garamond" w:hAnsi="Garamond"/>
+            <w:sz w:val="22"/>
+            <w:szCs w:val="22"/>
+          </w:rPr>
+          <w:delText>methods</w:delText>
+        </w:r>
+      </w:del>
+      <w:r>
+        <w:rPr>
+          <w:rFonts w:ascii="Garamond" w:hAnsi="Garamond"/>
+          <w:sz w:val="22"/>
+          <w:szCs w:val="22"/>
+        </w:rPr>
+        <w:t xml:space="preserve"> presented here provide</w:t>
+      </w:r>
+      <w:ins w:id="229" w:author="Benjamin J. Makhlouf" w:date="2025-10-09T11:00:00Z" w16du:dateUtc="2025-10-09T18:00:00Z">
+        <w:r>
+          <w:rPr>
+            <w:rFonts w:ascii="Garamond" w:hAnsi="Garamond"/>
+            <w:sz w:val="22"/>
+            <w:szCs w:val="22"/>
+          </w:rPr>
+          <w:t>s</w:t>
+        </w:r>
+      </w:ins>
+      <w:r>
+        <w:rPr>
+          <w:rFonts w:ascii="Garamond" w:hAnsi="Garamond"/>
+          <w:sz w:val="22"/>
+          <w:szCs w:val="22"/>
+        </w:rPr>
+        <w:t xml:space="preserve"> </w:t>
+      </w:r>
+      <w:ins w:id="230" w:author="Benjamin J. Makhlouf" w:date="2025-10-09T11:00:00Z" w16du:dateUtc="2025-10-09T18:00:00Z">
+        <w:r>
+          <w:rPr>
+            <w:rFonts w:ascii="Garamond" w:hAnsi="Garamond"/>
+            <w:sz w:val="22"/>
+            <w:szCs w:val="22"/>
+          </w:rPr>
+          <w:t xml:space="preserve">true </w:t>
+        </w:r>
+      </w:ins>
+      <w:del w:id="231" w:author="Benjamin J. Makhlouf" w:date="2025-10-09T11:00:00Z" w16du:dateUtc="2025-10-09T18:00:00Z">
+        <w:r>
+          <w:rPr>
+            <w:rFonts w:ascii="Garamond" w:hAnsi="Garamond"/>
+            <w:sz w:val="22"/>
+            <w:szCs w:val="22"/>
+          </w:rPr>
+          <w:delText xml:space="preserve">quantifiable </w:delText>
+        </w:r>
+      </w:del>
+      <w:ins w:id="232" w:author="Benjamin J. Makhlouf" w:date="2025-10-09T11:00:00Z" w16du:dateUtc="2025-10-09T18:00:00Z">
+        <w:r>
+          <w:rPr>
+            <w:rFonts w:ascii="Garamond" w:hAnsi="Garamond"/>
+            <w:sz w:val="22"/>
+            <w:szCs w:val="22"/>
+          </w:rPr>
+          <w:t xml:space="preserve">probability </w:t>
+        </w:r>
+      </w:ins>
+      <w:del w:id="233" w:author="Benjamin J. Makhlouf" w:date="2025-10-09T11:00:00Z" w16du:dateUtc="2025-10-09T18:00:00Z">
+        <w:r>
+          <w:rPr>
+            <w:rFonts w:ascii="Garamond" w:hAnsi="Garamond"/>
+            <w:sz w:val="22"/>
+            <w:szCs w:val="22"/>
+          </w:rPr>
+          <w:delText xml:space="preserve">confidence </w:delText>
+        </w:r>
+      </w:del>
+      <w:r>
+        <w:rPr>
+          <w:rFonts w:ascii="Garamond" w:hAnsi="Garamond"/>
+          <w:sz w:val="22"/>
+          <w:szCs w:val="22"/>
+        </w:rPr>
+        <w:t xml:space="preserve">values </w:t>
+      </w:r>
+      <w:ins w:id="234" w:author="Benjamin J. Makhlouf" w:date="2025-10-09T11:04:00Z" w16du:dateUtc="2025-10-09T18:04:00Z">
+        <w:r>
+          <w:rPr>
+            <w:rFonts w:ascii="Garamond" w:hAnsi="Garamond"/>
+            <w:sz w:val="22"/>
+            <w:szCs w:val="22"/>
+          </w:rPr>
+          <w:t xml:space="preserve">through </w:t>
+        </w:r>
+      </w:ins>
+      <w:ins w:id="235" w:author="Benjamin J. Makhlouf" w:date="2025-10-09T11:01:00Z" w16du:dateUtc="2025-10-09T18:01:00Z">
+        <w:r>
+          <w:rPr>
+            <w:rFonts w:ascii="Garamond" w:hAnsi="Garamond"/>
+            <w:sz w:val="22"/>
+            <w:szCs w:val="22"/>
+          </w:rPr>
+          <w:t xml:space="preserve">probability calibration. </w:t>
+        </w:r>
+      </w:ins>
+      <w:del w:id="236" w:author="Benjamin J. Makhlouf" w:date="2025-10-09T11:01:00Z" w16du:dateUtc="2025-10-09T18:01:00Z">
+        <w:r>
+          <w:rPr>
+            <w:rFonts w:ascii="Garamond" w:hAnsi="Garamond"/>
+            <w:sz w:val="22"/>
+            <w:szCs w:val="22"/>
+          </w:rPr>
+          <w:delText xml:space="preserve">which can be </w:delText>
+        </w:r>
+      </w:del>
+      <w:del w:id="237" w:author="Benjamin J. Makhlouf" w:date="2025-10-09T11:02:00Z" w16du:dateUtc="2025-10-09T18:02:00Z">
+        <w:r>
+          <w:rPr>
+            <w:rFonts w:ascii="Garamond" w:hAnsi="Garamond"/>
+            <w:sz w:val="22"/>
+            <w:szCs w:val="22"/>
+          </w:rPr>
+          <w:delText>directly</w:delText>
+        </w:r>
+      </w:del>
+      <w:del w:id="238" w:author="Benjamin J. Makhlouf" w:date="2025-10-09T11:03:00Z" w16du:dateUtc="2025-10-09T18:03:00Z">
+        <w:r>
+          <w:rPr>
+            <w:rFonts w:ascii="Garamond" w:hAnsi="Garamond"/>
+            <w:sz w:val="22"/>
+            <w:szCs w:val="22"/>
+          </w:rPr>
+          <w:delText xml:space="preserve"> used by managers to make decisions based on changing thresholds of misassignment risk, offering a practical framework for incorporating uncertainty into management decisions.</w:delText>
+        </w:r>
+        <w:r>
+          <w:rPr>
+            <w:rFonts w:ascii="Garamond" w:hAnsi="Garamond"/>
+            <w:sz w:val="22"/>
+            <w:szCs w:val="22"/>
+          </w:rPr>
+          <w:delText xml:space="preserve"> </w:delText>
+        </w:r>
+      </w:del>
+      <w:r>
+        <w:rPr>
+          <w:rFonts w:ascii="Garamond" w:hAnsi="Garamond"/>
+          <w:sz w:val="22"/>
+          <w:szCs w:val="22"/>
+        </w:rPr>
+        <w:t xml:space="preserve">Even with extremely high confidence threshold values, our model achieved between ~70% and ~85% accuracy for all classes. The exception to this is the Yukon classification on the “Total” testing set, in which distinct </w:t>
+      </w:r>
+      <w:r>
+        <w:rPr>
+          <w:rFonts w:ascii="Cambria Math" w:hAnsi="Cambria Math" w:cs="Cambria Math"/>
+          <w:sz w:val="22"/>
+          <w:szCs w:val="22"/>
+        </w:rPr>
+        <w:t>⁸⁷</w:t>
+      </w:r>
+      <w:r>
+        <w:rPr>
+          <w:rFonts w:ascii="Garamond" w:hAnsi="Garamond"/>
+          <w:sz w:val="22"/>
+          <w:szCs w:val="22"/>
+        </w:rPr>
+        <w:t>Sr/</w:t>
+      </w:r>
+      <w:r>
+        <w:rPr>
+          <w:rFonts w:ascii="Cambria Math" w:hAnsi="Cambria Math" w:cs="Cambria Math"/>
+          <w:sz w:val="22"/>
+          <w:szCs w:val="22"/>
+        </w:rPr>
+        <w:t>⁸⁶</w:t>
+      </w:r>
+      <w:r>
+        <w:rPr>
+          <w:rFonts w:ascii="Garamond" w:hAnsi="Garamond"/>
+          <w:sz w:val="22"/>
+          <w:szCs w:val="22"/>
+        </w:rPr>
+        <w:t xml:space="preserve">Sr values in the Yukon buoy correct classification with extremely high confidence </w:t>
+      </w:r>
+      <w:commentRangeStart w:id="239"/>
+      <w:r>
+        <w:rPr>
+          <w:rFonts w:ascii="Garamond" w:hAnsi="Garamond"/>
+          <w:sz w:val="22"/>
+          <w:szCs w:val="22"/>
+        </w:rPr>
+        <w:t>values</w:t>
+      </w:r>
+      <w:commentRangeEnd w:id="239"/>
+      <w:r>
+        <w:rPr>
+          <w:rStyle w:val="CommentReference"/>
+          <w:rFonts w:ascii="Garamond" w:eastAsiaTheme="minorHAnsi" w:hAnsi="Garamond" w:cstheme="minorBidi"/>
+          <w:kern w:val="2"/>
+          <w:sz w:val="22"/>
+          <w:szCs w:val="22"/>
+          <w14:ligatures w14:val="standardContextual"/>
+        </w:rPr>
+        <w:commentReference w:id="239"/>
+      </w:r>
+      <w:ins w:id="240" w:author="Benjamin J. Makhlouf" w:date="2025-10-09T11:03:00Z" w16du:dateUtc="2025-10-09T18:03:00Z">
+        <w:r>
+          <w:rPr>
+            <w:rFonts w:ascii="Garamond" w:hAnsi="Garamond"/>
+            <w:sz w:val="22"/>
+            <w:szCs w:val="22"/>
+          </w:rPr>
+          <w:t xml:space="preserve">, keeping accuracy high even at high confidence thresholds. </w:t>
+        </w:r>
+      </w:ins>
+      <w:ins w:id="241" w:author="Benjamin J. Makhlouf" w:date="2025-10-09T11:08:00Z" w16du:dateUtc="2025-10-09T18:08:00Z">
+        <w:r>
+          <w:rPr>
+            <w:rFonts w:ascii="Garamond" w:hAnsi="Garamond"/>
+            <w:sz w:val="22"/>
+            <w:szCs w:val="22"/>
+            <w:rPrChange w:id="242" w:author="Benjamin J. Makhlouf" w:date="2025-10-09T11:08:00Z" w16du:dateUtc="2025-10-09T18:08:00Z">
+              <w:rPr/>
+            </w:rPrChange>
+          </w:rPr>
+          <w:t>Calibrating probability scores enables managers to base decisions on flexible thresholds of misassignment risk</w:t>
+        </w:r>
+      </w:ins>
+      <w:ins w:id="243" w:author="Benjamin J. Makhlouf" w:date="2025-10-09T11:09:00Z" w16du:dateUtc="2025-10-09T18:09:00Z">
+        <w:r>
+          <w:rPr>
+            <w:rFonts w:ascii="Garamond" w:hAnsi="Garamond"/>
+            <w:sz w:val="22"/>
+            <w:szCs w:val="22"/>
+          </w:rPr>
+          <w:t xml:space="preserve"> </w:t>
+        </w:r>
+      </w:ins>
+      <w:ins w:id="244" w:author="Benjamin J. Makhlouf" w:date="2025-10-09T11:11:00Z" w16du:dateUtc="2025-10-09T18:11:00Z">
+        <w:r>
+          <w:rPr>
+            <w:rFonts w:ascii="Garamond" w:hAnsi="Garamond"/>
+            <w:sz w:val="22"/>
+            <w:szCs w:val="22"/>
+          </w:rPr>
+          <w:t xml:space="preserve">which more accurately represent the true model uncertainty. In addition, these values can be used in probabilistic frameworks, thereby allowing a </w:t>
+        </w:r>
+      </w:ins>
+      <w:proofErr w:type="gramStart"/>
+      <w:ins w:id="245" w:author="Benjamin J. Makhlouf" w:date="2025-10-09T11:12:00Z" w16du:dateUtc="2025-10-09T18:12:00Z">
+        <w:r>
+          <w:rPr>
+            <w:rFonts w:ascii="Garamond" w:hAnsi="Garamond"/>
+            <w:sz w:val="22"/>
+            <w:szCs w:val="22"/>
+          </w:rPr>
+          <w:t>mechanisms</w:t>
+        </w:r>
+      </w:ins>
+      <w:proofErr w:type="gramEnd"/>
+      <w:ins w:id="246" w:author="Benjamin J. Makhlouf" w:date="2025-10-09T11:11:00Z" w16du:dateUtc="2025-10-09T18:11:00Z">
+        <w:r>
+          <w:rPr>
+            <w:rFonts w:ascii="Garamond" w:hAnsi="Garamond"/>
+            <w:sz w:val="22"/>
+            <w:szCs w:val="22"/>
+          </w:rPr>
+          <w:t xml:space="preserve"> to more effectively quantify and carry uncertainty </w:t>
+        </w:r>
+      </w:ins>
+      <w:ins w:id="247" w:author="Benjamin J. Makhlouf" w:date="2025-10-09T11:12:00Z" w16du:dateUtc="2025-10-09T18:12:00Z">
+        <w:r>
+          <w:rPr>
+            <w:rFonts w:ascii="Garamond" w:hAnsi="Garamond"/>
+            <w:sz w:val="22"/>
+            <w:szCs w:val="22"/>
+          </w:rPr>
+          <w:t xml:space="preserve">through to management outcomes. </w:t>
+        </w:r>
+      </w:ins>
+      <w:del w:id="248" w:author="Benjamin J. Makhlouf" w:date="2025-10-09T11:03:00Z" w16du:dateUtc="2025-10-09T18:03:00Z">
+        <w:r>
+          <w:rPr>
+            <w:rFonts w:ascii="Garamond" w:hAnsi="Garamond"/>
+            <w:sz w:val="22"/>
+            <w:szCs w:val="22"/>
+          </w:rPr>
+          <w:delText xml:space="preserve">. </w:delText>
+        </w:r>
+      </w:del>
+    </w:p>
+    <w:p>
+      <w:pPr>
+        <w:pStyle w:val="whitespace-normal"/>
+        <w:spacing w:line="480" w:lineRule="auto"/>
+        <w:rPr>
+          <w:del w:id="249" w:author="Benjamin J. Makhlouf" w:date="2025-10-09T11:12:00Z" w16du:dateUtc="2025-10-09T18:12:00Z"/>
+          <w:rFonts w:ascii="Garamond" w:hAnsi="Garamond"/>
+          <w:sz w:val="22"/>
+          <w:szCs w:val="22"/>
+        </w:rPr>
+        <w:pPrChange w:id="250" w:author="Benjamin J. Makhlouf" w:date="2025-10-09T10:59:00Z" w16du:dateUtc="2025-10-09T17:59:00Z">
+          <w:pPr>
+            <w:pStyle w:val="whitespace-normal"/>
+            <w:spacing w:line="480" w:lineRule="auto"/>
+            <w:ind w:firstLine="720"/>
+          </w:pPr>
+        </w:pPrChange>
+      </w:pPr>
+      <w:ins w:id="251" w:author="Benjamin J. Makhlouf" w:date="2025-10-09T11:12:00Z" w16du:dateUtc="2025-10-09T18:12:00Z">
+        <w:r>
+          <w:rPr>
+            <w:rFonts w:ascii="Garamond" w:hAnsi="Garamond"/>
+            <w:sz w:val="22"/>
+            <w:szCs w:val="22"/>
+          </w:rPr>
+          <w:tab/>
+        </w:r>
+      </w:ins>
+    </w:p>
+    <w:p>
+      <w:pPr>
+        <w:pStyle w:val="whitespace-normal"/>
+        <w:spacing w:line="480" w:lineRule="auto"/>
+        <w:rPr>
+          <w:rFonts w:ascii="Garamond" w:hAnsi="Garamond"/>
+          <w:sz w:val="22"/>
+          <w:szCs w:val="22"/>
+        </w:rPr>
+        <w:pPrChange w:id="252" w:author="Benjamin J. Makhlouf" w:date="2025-10-09T11:12:00Z" w16du:dateUtc="2025-10-09T18:12:00Z">
+          <w:pPr>
+            <w:pStyle w:val="whitespace-normal"/>
+            <w:spacing w:line="480" w:lineRule="auto"/>
+            <w:ind w:firstLine="720"/>
+          </w:pPr>
+        </w:pPrChange>
+      </w:pPr>
+      <w:proofErr w:type="spellStart"/>
+      <w:ins w:id="253" w:author="Benjamin J. Makhlouf" w:date="2025-10-09T11:12:00Z" w16du:dateUtc="2025-10-09T18:12:00Z">
+        <w:r>
+          <w:rPr>
+            <w:rFonts w:ascii="Garamond" w:hAnsi="Garamond"/>
+            <w:sz w:val="22"/>
+            <w:szCs w:val="22"/>
+          </w:rPr>
+          <w:t>Despute</w:t>
+        </w:r>
+        <w:proofErr w:type="spellEnd"/>
+        <w:r>
+          <w:rPr>
+            <w:rFonts w:ascii="Garamond" w:hAnsi="Garamond"/>
+            <w:sz w:val="22"/>
+            <w:szCs w:val="22"/>
+          </w:rPr>
+          <w:t xml:space="preserve"> an</w:t>
+        </w:r>
+      </w:ins>
+      <w:del w:id="254" w:author="Benjamin J. Makhlouf" w:date="2025-10-09T11:12:00Z" w16du:dateUtc="2025-10-09T18:12:00Z">
+        <w:r>
+          <w:rPr>
+            <w:rFonts w:ascii="Garamond" w:hAnsi="Garamond"/>
+            <w:sz w:val="22"/>
+            <w:szCs w:val="22"/>
+          </w:rPr>
+          <w:delText>Although the methods presented he</w:delText>
+        </w:r>
+      </w:del>
+      <w:ins w:id="255" w:author="Benjamin J. Makhlouf" w:date="2025-10-09T11:12:00Z" w16du:dateUtc="2025-10-09T18:12:00Z">
+        <w:r>
+          <w:rPr>
+            <w:rFonts w:ascii="Garamond" w:hAnsi="Garamond"/>
+            <w:sz w:val="22"/>
+            <w:szCs w:val="22"/>
+          </w:rPr>
+          <w:t xml:space="preserve"> advancement in</w:t>
+        </w:r>
+      </w:ins>
+      <w:del w:id="256" w:author="Benjamin J. Makhlouf" w:date="2025-10-09T11:12:00Z" w16du:dateUtc="2025-10-09T18:12:00Z">
+        <w:r>
+          <w:rPr>
+            <w:rFonts w:ascii="Garamond" w:hAnsi="Garamond"/>
+            <w:sz w:val="22"/>
+            <w:szCs w:val="22"/>
+          </w:rPr>
+          <w:delText>re advance</w:delText>
+        </w:r>
+      </w:del>
+      <w:r>
+        <w:rPr>
+          <w:rFonts w:ascii="Garamond" w:hAnsi="Garamond"/>
+          <w:sz w:val="22"/>
+          <w:szCs w:val="22"/>
+        </w:rPr>
+        <w:t xml:space="preserve"> the ability to discriminate among rivers for Western Alaska Chinook salmon, the</w:t>
+      </w:r>
+      <w:ins w:id="257" w:author="Benjamin J. Makhlouf" w:date="2025-10-09T11:12:00Z" w16du:dateUtc="2025-10-09T18:12:00Z">
+        <w:r>
+          <w:rPr>
+            <w:rFonts w:ascii="Garamond" w:hAnsi="Garamond"/>
+            <w:sz w:val="22"/>
+            <w:szCs w:val="22"/>
+          </w:rPr>
+          <w:t xml:space="preserve"> workflow presented here</w:t>
+        </w:r>
+      </w:ins>
+      <w:del w:id="258" w:author="Benjamin J. Makhlouf" w:date="2025-10-09T11:12:00Z" w16du:dateUtc="2025-10-09T18:12:00Z">
+        <w:r>
+          <w:rPr>
+            <w:rFonts w:ascii="Garamond" w:hAnsi="Garamond"/>
+            <w:sz w:val="22"/>
+            <w:szCs w:val="22"/>
+          </w:rPr>
+          <w:delText>y</w:delText>
+        </w:r>
+      </w:del>
+      <w:r>
+        <w:rPr>
+          <w:rFonts w:ascii="Garamond" w:hAnsi="Garamond"/>
+          <w:sz w:val="22"/>
+          <w:szCs w:val="22"/>
+        </w:rPr>
+        <w:t xml:space="preserve"> remain</w:t>
+      </w:r>
+      <w:ins w:id="259" w:author="Benjamin J. Makhlouf" w:date="2025-10-09T11:12:00Z" w16du:dateUtc="2025-10-09T18:12:00Z">
+        <w:r>
+          <w:rPr>
+            <w:rFonts w:ascii="Garamond" w:hAnsi="Garamond"/>
+            <w:sz w:val="22"/>
+            <w:szCs w:val="22"/>
+          </w:rPr>
+          <w:t>s</w:t>
+        </w:r>
+      </w:ins>
+      <w:r>
+        <w:rPr>
+          <w:rFonts w:ascii="Garamond" w:hAnsi="Garamond"/>
+          <w:sz w:val="22"/>
+          <w:szCs w:val="22"/>
+        </w:rPr>
+        <w:t xml:space="preserve"> limited for in-season management or rapid research applications. Otolith LA-ICPMS is costly and labor-intensive, making large-scale, real-time assessment of river origin for marine-caught samples impractical. Moreover, otolith collection is lethal, which may be prohibitive given the increasingly endangered status of Chinook salmon in this region. The model also relies on a large existing dataset with known river-of-origin labels derived from unique sampling efforts, a resource not available for most other species of concern. For example, comparable datasets do not exist for chum </w:t>
+      </w:r>
+      <w:r>
+        <w:rPr>
+          <w:rFonts w:ascii="Garamond" w:hAnsi="Garamond"/>
+          <w:sz w:val="22"/>
+          <w:szCs w:val="22"/>
+        </w:rPr>
+        <w:lastRenderedPageBreak/>
+        <w:t xml:space="preserve">salmon, constraining the </w:t>
+      </w:r>
+      <w:ins w:id="260" w:author="Benjamin J. Makhlouf" w:date="2025-10-09T11:13:00Z" w16du:dateUtc="2025-10-09T18:13:00Z">
+        <w:r>
+          <w:rPr>
+            <w:rFonts w:ascii="Garamond" w:hAnsi="Garamond"/>
+            <w:sz w:val="22"/>
+            <w:szCs w:val="22"/>
+          </w:rPr>
+          <w:t xml:space="preserve">application of these methods to other similar species of concern in the region. </w:t>
+        </w:r>
+      </w:ins>
+      <w:ins w:id="261" w:author="Benjamin J. Makhlouf" w:date="2025-10-09T11:15:00Z" w16du:dateUtc="2025-10-09T18:15:00Z">
+        <w:r>
+          <w:rPr>
+            <w:rFonts w:ascii="Garamond" w:hAnsi="Garamond"/>
+            <w:sz w:val="22"/>
+            <w:szCs w:val="22"/>
+            <w:rPrChange w:id="262" w:author="Benjamin J. Makhlouf" w:date="2025-10-09T11:16:00Z" w16du:dateUtc="2025-10-09T18:16:00Z">
+              <w:rPr/>
+            </w:rPrChange>
+          </w:rPr>
+          <w:t xml:space="preserve">However, </w:t>
+        </w:r>
+      </w:ins>
+      <w:ins w:id="263" w:author="Benjamin J. Makhlouf" w:date="2025-10-09T11:16:00Z" w16du:dateUtc="2025-10-09T18:16:00Z">
+        <w:r>
+          <w:rPr>
+            <w:rFonts w:ascii="Garamond" w:hAnsi="Garamond"/>
+            <w:sz w:val="22"/>
+            <w:szCs w:val="22"/>
+            <w:rPrChange w:id="264" w:author="Benjamin J. Makhlouf" w:date="2025-10-09T11:16:00Z" w16du:dateUtc="2025-10-09T18:16:00Z">
+              <w:rPr/>
+            </w:rPrChange>
+          </w:rPr>
+          <w:t xml:space="preserve">if these </w:t>
+        </w:r>
+      </w:ins>
+      <w:ins w:id="265" w:author="Benjamin J. Makhlouf" w:date="2025-10-09T11:15:00Z" w16du:dateUtc="2025-10-09T18:15:00Z">
+        <w:r>
+          <w:rPr>
+            <w:rFonts w:ascii="Garamond" w:hAnsi="Garamond"/>
+            <w:sz w:val="22"/>
+            <w:szCs w:val="22"/>
+            <w:rPrChange w:id="266" w:author="Benjamin J. Makhlouf" w:date="2025-10-09T11:16:00Z" w16du:dateUtc="2025-10-09T18:16:00Z">
+              <w:rPr/>
+            </w:rPrChange>
+          </w:rPr>
+          <w:t>data and logistical limitations</w:t>
+        </w:r>
+      </w:ins>
+      <w:ins w:id="267" w:author="Benjamin J. Makhlouf" w:date="2025-10-09T11:16:00Z" w16du:dateUtc="2025-10-09T18:16:00Z">
+        <w:r>
+          <w:rPr>
+            <w:rFonts w:ascii="Garamond" w:hAnsi="Garamond"/>
+            <w:sz w:val="22"/>
+            <w:szCs w:val="22"/>
+            <w:rPrChange w:id="268" w:author="Benjamin J. Makhlouf" w:date="2025-10-09T11:16:00Z" w16du:dateUtc="2025-10-09T18:16:00Z">
+              <w:rPr/>
+            </w:rPrChange>
+          </w:rPr>
+          <w:t xml:space="preserve"> are satisfied</w:t>
+        </w:r>
+      </w:ins>
+      <w:ins w:id="269" w:author="Benjamin J. Makhlouf" w:date="2025-10-09T11:15:00Z" w16du:dateUtc="2025-10-09T18:15:00Z">
+        <w:r>
+          <w:rPr>
+            <w:rFonts w:ascii="Garamond" w:hAnsi="Garamond"/>
+            <w:sz w:val="22"/>
+            <w:szCs w:val="22"/>
+            <w:rPrChange w:id="270" w:author="Benjamin J. Makhlouf" w:date="2025-10-09T11:16:00Z" w16du:dateUtc="2025-10-09T18:16:00Z">
+              <w:rPr/>
+            </w:rPrChange>
+          </w:rPr>
+          <w:t>, the overall workflow is broadly generalizable and can be implemented to address similar challenges in other systems</w:t>
+        </w:r>
+        <w:r>
+          <w:rPr>
+            <w:rFonts w:ascii="Garamond" w:hAnsi="Garamond"/>
+            <w:sz w:val="22"/>
+            <w:szCs w:val="22"/>
+            <w:rPrChange w:id="271" w:author="Benjamin J. Makhlouf" w:date="2025-10-09T11:16:00Z" w16du:dateUtc="2025-10-09T18:16:00Z">
+              <w:rPr/>
+            </w:rPrChange>
+          </w:rPr>
+          <w:t xml:space="preserve"> or for other species</w:t>
+        </w:r>
+        <w:r>
+          <w:rPr>
+            <w:rFonts w:ascii="Garamond" w:hAnsi="Garamond"/>
+            <w:sz w:val="22"/>
+            <w:szCs w:val="22"/>
+            <w:rPrChange w:id="272" w:author="Benjamin J. Makhlouf" w:date="2025-10-09T11:16:00Z" w16du:dateUtc="2025-10-09T18:16:00Z">
+              <w:rPr/>
+            </w:rPrChange>
+          </w:rPr>
+          <w:t>.</w:t>
+        </w:r>
+      </w:ins>
+      <w:del w:id="273" w:author="Benjamin J. Makhlouf" w:date="2025-10-09T11:13:00Z" w16du:dateUtc="2025-10-09T18:13:00Z">
+        <w:r>
+          <w:rPr>
+            <w:rFonts w:ascii="Garamond" w:hAnsi="Garamond"/>
+            <w:sz w:val="22"/>
+            <w:szCs w:val="22"/>
+          </w:rPr>
+          <w:delText>broader application of these methods across species.</w:delText>
+        </w:r>
+      </w:del>
     </w:p>
     <w:p>
       <w:pPr>
@@ -10389,16 +11666,14 @@
         </w:rPr>
         <w:t xml:space="preserve">an opportunity to uncover new insights in ecological datasets that may be critical for </w:t>
       </w:r>
-      <w:ins w:id="141" w:author="Daniel Schindler" w:date="2025-10-06T11:06:00Z" w16du:dateUtc="2025-10-06T18:06:00Z">
-        <w:r>
-          <w:rPr>
-            <w:rFonts w:ascii="Garamond" w:hAnsi="Garamond"/>
-            <w:sz w:val="22"/>
-            <w:szCs w:val="22"/>
-          </w:rPr>
-          <w:t xml:space="preserve">ecosystem-based </w:t>
-        </w:r>
-      </w:ins>
+      <w:r>
+        <w:rPr>
+          <w:rFonts w:ascii="Garamond" w:hAnsi="Garamond"/>
+          <w:sz w:val="22"/>
+          <w:szCs w:val="22"/>
+        </w:rPr>
+        <w:t xml:space="preserve">ecosystem-based </w:t>
+      </w:r>
       <w:r>
         <w:rPr>
           <w:rFonts w:ascii="Garamond" w:hAnsi="Garamond"/>
@@ -10407,52 +11682,39 @@
         </w:rPr>
         <w:t xml:space="preserve">management </w:t>
       </w:r>
-      <w:ins w:id="142" w:author="Daniel Schindler" w:date="2025-10-06T11:06:00Z" w16du:dateUtc="2025-10-06T18:06:00Z">
-        <w:r>
-          <w:rPr>
-            <w:rFonts w:ascii="Garamond" w:hAnsi="Garamond"/>
-            <w:sz w:val="22"/>
-            <w:szCs w:val="22"/>
-          </w:rPr>
-          <w:t>attempting to maintain fishing opportunity while protecting species and populations of conservation con</w:t>
-        </w:r>
-      </w:ins>
-      <w:ins w:id="143" w:author="Daniel Schindler" w:date="2025-10-06T11:07:00Z" w16du:dateUtc="2025-10-06T18:07:00Z">
-        <w:r>
-          <w:rPr>
-            <w:rFonts w:ascii="Garamond" w:hAnsi="Garamond"/>
-            <w:sz w:val="22"/>
-            <w:szCs w:val="22"/>
-          </w:rPr>
-          <w:t>cern.</w:t>
-        </w:r>
-      </w:ins>
-      <w:del w:id="144" w:author="Daniel Schindler" w:date="2025-10-06T11:06:00Z" w16du:dateUtc="2025-10-06T18:06:00Z">
-        <w:r>
-          <w:rPr>
-            <w:rFonts w:ascii="Garamond" w:hAnsi="Garamond"/>
-            <w:sz w:val="22"/>
-            <w:szCs w:val="22"/>
-          </w:rPr>
-          <w:delText>or conservation efforts</w:delText>
-        </w:r>
-      </w:del>
-      <w:r>
-        <w:rPr>
-          <w:rFonts w:ascii="Garamond" w:hAnsi="Garamond"/>
-          <w:sz w:val="22"/>
-          <w:szCs w:val="22"/>
-        </w:rPr>
-        <w:t xml:space="preserve">. In this case, enabling river-basin scale determination of provenance for marine-caught Chinook salmon allows managers to connect region-wide salmon population patterns with river-specific population health. In doing so, researchers may better understand how ecosystem processes at several spatial scales and across ecosystems are interconnected to informing overall ecosystem </w:t>
-      </w:r>
-      <w:r>
-        <w:rPr>
-          <w:rFonts w:ascii="Garamond" w:hAnsi="Garamond"/>
-          <w:sz w:val="22"/>
-          <w:szCs w:val="22"/>
-        </w:rPr>
-        <w:lastRenderedPageBreak/>
-        <w:t xml:space="preserve">health. </w:t>
+      <w:r>
+        <w:rPr>
+          <w:rFonts w:ascii="Garamond" w:hAnsi="Garamond"/>
+          <w:sz w:val="22"/>
+          <w:szCs w:val="22"/>
+        </w:rPr>
+        <w:t xml:space="preserve">attempting to maintain fishing opportunity while protecting species and populations of conservation </w:t>
+      </w:r>
+      <w:proofErr w:type="gramStart"/>
+      <w:r>
+        <w:rPr>
+          <w:rFonts w:ascii="Garamond" w:hAnsi="Garamond"/>
+          <w:sz w:val="22"/>
+          <w:szCs w:val="22"/>
+        </w:rPr>
+        <w:t>concern.</w:t>
+      </w:r>
+      <w:r>
+        <w:rPr>
+          <w:rFonts w:ascii="Garamond" w:hAnsi="Garamond"/>
+          <w:sz w:val="22"/>
+          <w:szCs w:val="22"/>
+        </w:rPr>
+        <w:t>.</w:t>
+      </w:r>
+      <w:proofErr w:type="gramEnd"/>
+      <w:r>
+        <w:rPr>
+          <w:rFonts w:ascii="Garamond" w:hAnsi="Garamond"/>
+          <w:sz w:val="22"/>
+          <w:szCs w:val="22"/>
+        </w:rPr>
+        <w:t xml:space="preserve"> In this case, enabling river-basin scale determination of provenance for marine-caught Chinook salmon allows managers to connect region-wide salmon population patterns with river-specific population health. In doing so, researchers may better understand how ecosystem processes at several spatial scales and across ecosystems are interconnected to informing overall ecosystem health. </w:t>
       </w:r>
       <w:r>
         <w:rPr>
@@ -10700,24 +11962,7 @@
       </w:r>
     </w:p>
   </w:comment>
-  <w:comment w:id="83" w:author="Benjamin J. Makhlouf" w:date="2025-09-06T17:57:00Z" w:initials="b">
-    <w:p>
-      <w:r>
-        <w:rPr>
-          <w:rStyle w:val="CommentReference"/>
-        </w:rPr>
-        <w:annotationRef/>
-      </w:r>
-      <w:r>
-        <w:rPr>
-          <w:sz w:val="20"/>
-          <w:szCs w:val="20"/>
-        </w:rPr>
-        <w:t xml:space="preserve">Thoughts on whether to just use an average, or show the range. </w:t>
-      </w:r>
-    </w:p>
-  </w:comment>
-  <w:comment w:id="84" w:author="Daniel Schindler" w:date="2025-10-02T15:29:00Z" w:initials="DS">
+  <w:comment w:id="106" w:author="Daniel Schindler" w:date="2025-10-03T12:50:00Z" w:initials="DS">
     <w:p>
       <w:pPr>
         <w:pStyle w:val="CommentText"/>
@@ -10729,11 +11974,11 @@
         <w:annotationRef/>
       </w:r>
       <w:r>
-        <w:t>I would state the averages for the highest order tributary</w:t>
+        <w:t>This statement is confusing. Are you talking about Yukon CWAK fish or all CWAK fish?</w:t>
       </w:r>
     </w:p>
   </w:comment>
-  <w:comment w:id="108" w:author="Daniel Schindler" w:date="2025-10-03T12:50:00Z" w:initials="DS">
+  <w:comment w:id="108" w:author="Daniel Schindler" w:date="2025-10-02T15:30:00Z" w:initials="DS">
     <w:p>
       <w:pPr>
         <w:pStyle w:val="CommentText"/>
@@ -10745,11 +11990,11 @@
         <w:annotationRef/>
       </w:r>
       <w:r>
-        <w:t>This statement is confusing. Are you talking about Yukon CWAK fish or all CWAK fish?</w:t>
+        <w:t>Maternal?</w:t>
       </w:r>
     </w:p>
   </w:comment>
-  <w:comment w:id="110" w:author="Daniel Schindler" w:date="2025-10-02T15:30:00Z" w:initials="DS">
+  <w:comment w:id="133" w:author="Daniel Schindler" w:date="2025-10-06T10:56:00Z" w:initials="DS">
     <w:p>
       <w:pPr>
         <w:pStyle w:val="CommentText"/>
@@ -10761,11 +12006,11 @@
         <w:annotationRef/>
       </w:r>
       <w:r>
-        <w:t>Maternal?</w:t>
+        <w:t>Remind us what this is here. One phrase.</w:t>
       </w:r>
     </w:p>
   </w:comment>
-  <w:comment w:id="115" w:author="Daniel Schindler" w:date="2025-10-06T10:56:00Z" w:initials="DS">
+  <w:comment w:id="134" w:author="Daniel Schindler" w:date="2025-10-06T10:56:00Z" w:initials="DS">
     <w:p>
       <w:pPr>
         <w:pStyle w:val="CommentText"/>
@@ -10777,15 +12022,12 @@
         <w:annotationRef/>
       </w:r>
       <w:r>
-        <w:t>Remind us what this is here. One phrase.</w:t>
+        <w:t>Is this a technical term?</w:t>
       </w:r>
     </w:p>
   </w:comment>
-  <w:comment w:id="116" w:author="Daniel Schindler" w:date="2025-10-06T10:56:00Z" w:initials="DS">
+  <w:comment w:id="136" w:author="Valentina M. Staneva" w:date="2025-09-29T10:51:00Z" w:initials="VMS">
     <w:p>
-      <w:pPr>
-        <w:pStyle w:val="CommentText"/>
-      </w:pPr>
       <w:r>
         <w:rPr>
           <w:rStyle w:val="CommentReference"/>
@@ -10793,11 +12035,15 @@
         <w:annotationRef/>
       </w:r>
       <w:r>
-        <w:t>Is this a technical term?</w:t>
+        <w:rPr>
+          <w:sz w:val="20"/>
+          <w:szCs w:val="20"/>
+        </w:rPr>
+        <w:t>Is this after calibration?</w:t>
       </w:r>
     </w:p>
   </w:comment>
-  <w:comment w:id="117" w:author="Valentina M. Staneva" w:date="2025-09-29T10:51:00Z" w:initials="VMS">
+  <w:comment w:id="139" w:author="Valentina M. Staneva" w:date="2025-09-28T16:25:00Z" w:initials="VMS">
     <w:p>
       <w:r>
         <w:rPr>
@@ -10810,11 +12056,11 @@
           <w:sz w:val="20"/>
           <w:szCs w:val="20"/>
         </w:rPr>
-        <w:t>Is this after calibration?</w:t>
+        <w:t>language regarding time-series analysis techniques</w:t>
       </w:r>
     </w:p>
   </w:comment>
-  <w:comment w:id="121" w:author="Valentina M. Staneva" w:date="2025-09-28T16:25:00Z" w:initials="VMS">
+  <w:comment w:id="180" w:author="Valentina M. Staneva" w:date="2025-09-28T16:28:00Z" w:initials="VMS">
     <w:p>
       <w:r>
         <w:rPr>
@@ -10827,28 +12073,11 @@
           <w:sz w:val="20"/>
           <w:szCs w:val="20"/>
         </w:rPr>
-        <w:t>language regarding time-series analysis techniques</w:t>
+        <w:t>which?</w:t>
       </w:r>
     </w:p>
   </w:comment>
-  <w:comment w:id="136" w:author="Valentina M. Staneva" w:date="2025-09-28T16:28:00Z" w:initials="VMS">
-    <w:p>
-      <w:r>
-        <w:rPr>
-          <w:rStyle w:val="CommentReference"/>
-        </w:rPr>
-        <w:annotationRef/>
-      </w:r>
-      <w:r>
-        <w:rPr>
-          <w:sz w:val="20"/>
-          <w:szCs w:val="20"/>
-        </w:rPr>
-        <w:t>which?</w:t>
-      </w:r>
-    </w:p>
-  </w:comment>
-  <w:comment w:id="140" w:author="Valentina M. Staneva" w:date="2025-09-28T18:30:00Z" w:initials="VMS">
+  <w:comment w:id="239" w:author="Valentina M. Staneva" w:date="2025-09-28T18:30:00Z" w:initials="VMS">
     <w:p>
       <w:r>
         <w:rPr>
@@ -10882,17 +12111,15 @@
   <w15:commentEx w15:paraId="3471AB53" w15:done="1"/>
   <w15:commentEx w15:paraId="148A0BEE" w15:done="0"/>
   <w15:commentEx w15:paraId="55BD51FF" w15:paraIdParent="148A0BEE" w15:done="0"/>
-  <w15:commentEx w15:paraId="0A19D0FE" w15:done="0"/>
-  <w15:commentEx w15:paraId="7EA423C7" w15:done="0"/>
-  <w15:commentEx w15:paraId="211C6244" w15:paraIdParent="7EA423C7" w15:done="0"/>
-  <w15:commentEx w15:paraId="79D3B7F7" w15:done="0"/>
+  <w15:commentEx w15:paraId="0A19D0FE" w15:done="1"/>
+  <w15:commentEx w15:paraId="79D3B7F7" w15:done="1"/>
   <w15:commentEx w15:paraId="1363313F" w15:done="0"/>
   <w15:commentEx w15:paraId="44FE1596" w15:done="0"/>
   <w15:commentEx w15:paraId="752E5439" w15:done="0"/>
   <w15:commentEx w15:paraId="00A06E06" w15:done="1"/>
   <w15:commentEx w15:paraId="31E84DFE" w15:done="1"/>
   <w15:commentEx w15:paraId="7D7AD7A5" w15:done="1"/>
-  <w15:commentEx w15:paraId="2B055E78" w15:done="0"/>
+  <w15:commentEx w15:paraId="2B055E78" w15:done="1"/>
 </w15:commentsEx>
 </file>
 
@@ -10911,8 +12138,6 @@
   <w16cex:commentExtensible w16cex:durableId="0444BDF2" w16cex:dateUtc="2025-09-29T15:43:00Z"/>
   <w16cex:commentExtensible w16cex:durableId="1AE1AF2B" w16cex:dateUtc="2025-09-29T15:46:00Z"/>
   <w16cex:commentExtensible w16cex:durableId="350AADE7" w16cex:dateUtc="2025-10-02T22:26:00Z"/>
-  <w16cex:commentExtensible w16cex:durableId="7BF59F8C" w16cex:dateUtc="2025-09-07T00:57:00Z"/>
-  <w16cex:commentExtensible w16cex:durableId="3940C8BB" w16cex:dateUtc="2025-10-02T22:29:00Z"/>
   <w16cex:commentExtensible w16cex:durableId="210F527C" w16cex:dateUtc="2025-10-03T19:50:00Z"/>
   <w16cex:commentExtensible w16cex:durableId="30F3436A" w16cex:dateUtc="2025-10-02T22:30:00Z"/>
   <w16cex:commentExtensible w16cex:durableId="764798DA" w16cex:dateUtc="2025-10-06T17:56:00Z"/>
@@ -10939,8 +12164,6 @@
   <w16cid:commentId w16cid:paraId="148A0BEE" w16cid:durableId="0444BDF2"/>
   <w16cid:commentId w16cid:paraId="55BD51FF" w16cid:durableId="1AE1AF2B"/>
   <w16cid:commentId w16cid:paraId="0A19D0FE" w16cid:durableId="350AADE7"/>
-  <w16cid:commentId w16cid:paraId="7EA423C7" w16cid:durableId="7BF59F8C"/>
-  <w16cid:commentId w16cid:paraId="211C6244" w16cid:durableId="3940C8BB"/>
   <w16cid:commentId w16cid:paraId="79D3B7F7" w16cid:durableId="210F527C"/>
   <w16cid:commentId w16cid:paraId="1363313F" w16cid:durableId="30F3436A"/>
   <w16cid:commentId w16cid:paraId="44FE1596" w16cid:durableId="764798DA"/>

</xml_diff>

<commit_message>
updated the manuscript title page
</commit_message>
<xml_diff>
--- a/Docs/Machine learning applied to otolith timeseries data to discriminate river of origin for Western Alaska Salmon.docx
+++ b/Docs/Machine learning applied to otolith timeseries data to discriminate river of origin for Western Alaska Salmon.docx
@@ -9,8 +9,8 @@
           <w:rFonts w:ascii="Garamond" w:hAnsi="Garamond"/>
           <w:b/>
           <w:bCs/>
-          <w:sz w:val="32"/>
-          <w:szCs w:val="32"/>
+          <w:sz w:val="36"/>
+          <w:szCs w:val="36"/>
         </w:rPr>
       </w:pPr>
       <w:r>
@@ -18,80 +18,10 @@
           <w:rFonts w:ascii="Garamond" w:hAnsi="Garamond"/>
           <w:b/>
           <w:bCs/>
-          <w:sz w:val="32"/>
-          <w:szCs w:val="32"/>
-        </w:rPr>
-        <w:t xml:space="preserve">Machine learning applied to otolith </w:t>
-      </w:r>
-      <w:r>
-        <w:rPr>
-          <w:rFonts w:ascii="Garamond" w:hAnsi="Garamond"/>
-          <w:b/>
-          <w:bCs/>
-          <w:sz w:val="32"/>
-          <w:szCs w:val="32"/>
-        </w:rPr>
-        <w:t>microchemical</w:t>
-      </w:r>
-      <w:r>
-        <w:rPr>
-          <w:rFonts w:ascii="Garamond" w:hAnsi="Garamond"/>
-          <w:b/>
-          <w:bCs/>
-          <w:sz w:val="32"/>
-          <w:szCs w:val="32"/>
-        </w:rPr>
-        <w:t xml:space="preserve"> data to discriminate </w:t>
-      </w:r>
-      <w:r>
-        <w:rPr>
-          <w:rFonts w:ascii="Garamond" w:hAnsi="Garamond"/>
-          <w:b/>
-          <w:bCs/>
-          <w:sz w:val="32"/>
-          <w:szCs w:val="32"/>
-        </w:rPr>
-        <w:t>stock</w:t>
-      </w:r>
-      <w:r>
-        <w:rPr>
-          <w:rFonts w:ascii="Garamond" w:hAnsi="Garamond"/>
-          <w:b/>
-          <w:bCs/>
-          <w:sz w:val="32"/>
-          <w:szCs w:val="32"/>
-        </w:rPr>
-        <w:t xml:space="preserve"> </w:t>
-      </w:r>
-      <w:r>
-        <w:rPr>
-          <w:rFonts w:ascii="Garamond" w:hAnsi="Garamond"/>
-          <w:b/>
-          <w:bCs/>
-          <w:sz w:val="32"/>
-          <w:szCs w:val="32"/>
-        </w:rPr>
-        <w:t xml:space="preserve">of origin </w:t>
-      </w:r>
-      <w:r>
-        <w:rPr>
-          <w:rFonts w:ascii="Garamond" w:hAnsi="Garamond"/>
-          <w:b/>
-          <w:bCs/>
-          <w:sz w:val="32"/>
-          <w:szCs w:val="32"/>
-        </w:rPr>
-        <w:t>in salmon</w:t>
-      </w:r>
-      <w:r>
-        <w:rPr>
-          <w:rFonts w:ascii="Garamond" w:hAnsi="Garamond"/>
-          <w:b/>
-          <w:bCs/>
-          <w:sz w:val="32"/>
-          <w:szCs w:val="32"/>
-        </w:rPr>
-        <w:t>.</w:t>
+          <w:sz w:val="36"/>
+          <w:szCs w:val="36"/>
+        </w:rPr>
+        <w:t xml:space="preserve">Ecological Applications </w:t>
       </w:r>
     </w:p>
     <w:p>
@@ -99,40 +29,177 @@
         <w:jc w:val="center"/>
         <w:rPr>
           <w:rFonts w:ascii="Garamond" w:hAnsi="Garamond"/>
-          <w:sz w:val="21"/>
-          <w:szCs w:val="21"/>
+          <w:b/>
+          <w:bCs/>
+          <w:sz w:val="36"/>
+          <w:szCs w:val="36"/>
         </w:rPr>
       </w:pPr>
       <w:r>
         <w:rPr>
           <w:rFonts w:ascii="Garamond" w:hAnsi="Garamond"/>
-          <w:sz w:val="21"/>
-          <w:szCs w:val="21"/>
-        </w:rPr>
-        <w:t xml:space="preserve">Ben Makhlouf, Daniel </w:t>
-      </w:r>
-      <w:r>
-        <w:rPr>
-          <w:rFonts w:ascii="Garamond" w:hAnsi="Garamond"/>
-          <w:sz w:val="21"/>
-          <w:szCs w:val="21"/>
+          <w:b/>
+          <w:bCs/>
+          <w:sz w:val="36"/>
+          <w:szCs w:val="36"/>
+        </w:rPr>
+        <w:t xml:space="preserve">Article </w:t>
+      </w:r>
+    </w:p>
+    <w:p>
+      <w:pPr>
+        <w:jc w:val="center"/>
+        <w:rPr>
+          <w:rFonts w:ascii="Garamond" w:hAnsi="Garamond"/>
+          <w:b/>
+          <w:bCs/>
+          <w:sz w:val="36"/>
+          <w:szCs w:val="36"/>
+        </w:rPr>
+      </w:pPr>
+      <w:r>
+        <w:rPr>
+          <w:rFonts w:ascii="Garamond" w:hAnsi="Garamond"/>
+          <w:b/>
+          <w:bCs/>
+          <w:sz w:val="36"/>
+          <w:szCs w:val="36"/>
+        </w:rPr>
+        <w:t xml:space="preserve">Machine learning applied to otolith </w:t>
+      </w:r>
+      <w:r>
+        <w:rPr>
+          <w:rFonts w:ascii="Garamond" w:hAnsi="Garamond"/>
+          <w:b/>
+          <w:bCs/>
+          <w:sz w:val="36"/>
+          <w:szCs w:val="36"/>
+        </w:rPr>
+        <w:t>microchemical</w:t>
+      </w:r>
+      <w:r>
+        <w:rPr>
+          <w:rFonts w:ascii="Garamond" w:hAnsi="Garamond"/>
+          <w:b/>
+          <w:bCs/>
+          <w:sz w:val="36"/>
+          <w:szCs w:val="36"/>
+        </w:rPr>
+        <w:t xml:space="preserve"> data to discriminate </w:t>
+      </w:r>
+      <w:r>
+        <w:rPr>
+          <w:rFonts w:ascii="Garamond" w:hAnsi="Garamond"/>
+          <w:b/>
+          <w:bCs/>
+          <w:sz w:val="36"/>
+          <w:szCs w:val="36"/>
+        </w:rPr>
+        <w:t xml:space="preserve">stock </w:t>
+      </w:r>
+      <w:r>
+        <w:rPr>
+          <w:rFonts w:ascii="Garamond" w:hAnsi="Garamond"/>
+          <w:b/>
+          <w:bCs/>
+          <w:sz w:val="36"/>
+          <w:szCs w:val="36"/>
+        </w:rPr>
+        <w:t xml:space="preserve">of origin </w:t>
+      </w:r>
+      <w:r>
+        <w:rPr>
+          <w:rFonts w:ascii="Garamond" w:hAnsi="Garamond"/>
+          <w:b/>
+          <w:bCs/>
+          <w:sz w:val="36"/>
+          <w:szCs w:val="36"/>
+        </w:rPr>
+        <w:t>in salmon</w:t>
+      </w:r>
+    </w:p>
+    <w:p>
+      <w:pPr>
+        <w:jc w:val="center"/>
+        <w:rPr>
+          <w:rFonts w:ascii="Garamond" w:hAnsi="Garamond"/>
+          <w:sz w:val="28"/>
+          <w:szCs w:val="28"/>
+          <w:vertAlign w:val="superscript"/>
+        </w:rPr>
+      </w:pPr>
+      <w:r>
+        <w:rPr>
+          <w:rFonts w:ascii="Garamond" w:hAnsi="Garamond"/>
+          <w:sz w:val="28"/>
+          <w:szCs w:val="28"/>
+        </w:rPr>
+        <w:t>Ben Makhlouf</w:t>
+      </w:r>
+      <w:r>
+        <w:rPr>
+          <w:rFonts w:ascii="Garamond" w:hAnsi="Garamond"/>
+          <w:sz w:val="28"/>
+          <w:szCs w:val="28"/>
+          <w:vertAlign w:val="superscript"/>
+        </w:rPr>
+        <w:t xml:space="preserve"> 1</w:t>
+      </w:r>
+      <w:r>
+        <w:rPr>
+          <w:rFonts w:ascii="Garamond" w:hAnsi="Garamond"/>
+          <w:sz w:val="28"/>
+          <w:szCs w:val="28"/>
+        </w:rPr>
+        <w:t xml:space="preserve">, Daniel </w:t>
+      </w:r>
+      <w:r>
+        <w:rPr>
+          <w:rFonts w:ascii="Garamond" w:hAnsi="Garamond"/>
+          <w:sz w:val="28"/>
+          <w:szCs w:val="28"/>
         </w:rPr>
         <w:t xml:space="preserve">E. </w:t>
       </w:r>
       <w:r>
         <w:rPr>
           <w:rFonts w:ascii="Garamond" w:hAnsi="Garamond"/>
-          <w:sz w:val="21"/>
-          <w:szCs w:val="21"/>
-        </w:rPr>
-        <w:t xml:space="preserve">Schindler, Valentina </w:t>
+          <w:sz w:val="28"/>
+          <w:szCs w:val="28"/>
+        </w:rPr>
+        <w:t>Schindler</w:t>
+      </w:r>
+      <w:r>
+        <w:rPr>
+          <w:rFonts w:ascii="Garamond" w:hAnsi="Garamond"/>
+          <w:sz w:val="28"/>
+          <w:szCs w:val="28"/>
+        </w:rPr>
+        <w:t xml:space="preserve"> </w:t>
+      </w:r>
+      <w:r>
+        <w:rPr>
+          <w:rFonts w:ascii="Garamond" w:hAnsi="Garamond"/>
+          <w:sz w:val="28"/>
+          <w:szCs w:val="28"/>
+          <w:vertAlign w:val="superscript"/>
+        </w:rPr>
+        <w:t>1</w:t>
+      </w:r>
+      <w:r>
+        <w:rPr>
+          <w:rFonts w:ascii="Garamond" w:hAnsi="Garamond"/>
+          <w:sz w:val="28"/>
+          <w:szCs w:val="28"/>
+        </w:rPr>
+        <w:t xml:space="preserve">, Valentina </w:t>
       </w:r>
       <w:proofErr w:type="spellStart"/>
       <w:r>
         <w:rPr>
           <w:rFonts w:ascii="Garamond" w:hAnsi="Garamond"/>
-          <w:sz w:val="21"/>
-          <w:szCs w:val="21"/>
+          <w:sz w:val="28"/>
+          <w:szCs w:val="28"/>
         </w:rPr>
         <w:t>Staneva</w:t>
       </w:r>
@@ -140,23 +207,311 @@
       <w:r>
         <w:rPr>
           <w:rFonts w:ascii="Garamond" w:hAnsi="Garamond"/>
-          <w:sz w:val="21"/>
-          <w:szCs w:val="21"/>
+          <w:sz w:val="28"/>
+          <w:szCs w:val="28"/>
         </w:rPr>
         <w:t xml:space="preserve"> </w:t>
+      </w:r>
+      <w:r>
+        <w:rPr>
+          <w:rFonts w:ascii="Garamond" w:hAnsi="Garamond"/>
+          <w:sz w:val="28"/>
+          <w:szCs w:val="28"/>
+          <w:vertAlign w:val="superscript"/>
+        </w:rPr>
+        <w:t>2</w:t>
+      </w:r>
+    </w:p>
+    <w:p>
+      <w:pPr>
+        <w:spacing w:line="240" w:lineRule="auto"/>
+        <w:jc w:val="center"/>
+        <w:rPr>
+          <w:rFonts w:ascii="Garamond" w:hAnsi="Garamond"/>
+          <w:i/>
+          <w:iCs/>
+          <w:sz w:val="20"/>
+          <w:szCs w:val="20"/>
+        </w:rPr>
+      </w:pPr>
+      <w:r>
+        <w:rPr>
+          <w:rFonts w:ascii="Garamond" w:hAnsi="Garamond"/>
+          <w:i/>
+          <w:iCs/>
+          <w:sz w:val="20"/>
+          <w:szCs w:val="20"/>
+          <w:vertAlign w:val="superscript"/>
+        </w:rPr>
+        <w:t>1</w:t>
+      </w:r>
+      <w:r>
+        <w:rPr>
+          <w:rFonts w:ascii="Garamond" w:hAnsi="Garamond"/>
+          <w:i/>
+          <w:iCs/>
+          <w:sz w:val="20"/>
+          <w:szCs w:val="20"/>
+        </w:rPr>
+        <w:t>School of Aquatic and Fisheries Sciences, University of Washington, Seattle, Washington, 98195 USA</w:t>
+      </w:r>
+    </w:p>
+    <w:p>
+      <w:pPr>
+        <w:spacing w:line="240" w:lineRule="auto"/>
+        <w:jc w:val="center"/>
+        <w:rPr>
+          <w:rFonts w:ascii="Garamond" w:hAnsi="Garamond"/>
+          <w:i/>
+          <w:iCs/>
+          <w:sz w:val="20"/>
+          <w:szCs w:val="20"/>
+        </w:rPr>
+      </w:pPr>
+      <w:r>
+        <w:rPr>
+          <w:rFonts w:ascii="Garamond" w:hAnsi="Garamond"/>
+          <w:i/>
+          <w:iCs/>
+          <w:sz w:val="20"/>
+          <w:szCs w:val="20"/>
+          <w:vertAlign w:val="superscript"/>
+        </w:rPr>
+        <w:t>2</w:t>
+      </w:r>
+      <w:r>
+        <w:rPr>
+          <w:rFonts w:ascii="Garamond" w:hAnsi="Garamond"/>
+          <w:i/>
+          <w:iCs/>
+          <w:sz w:val="20"/>
+          <w:szCs w:val="20"/>
+        </w:rPr>
+        <w:t xml:space="preserve">School of Computer </w:t>
+      </w:r>
+      <w:proofErr w:type="gramStart"/>
+      <w:r>
+        <w:rPr>
+          <w:rFonts w:ascii="Garamond" w:hAnsi="Garamond"/>
+          <w:i/>
+          <w:iCs/>
+          <w:sz w:val="20"/>
+          <w:szCs w:val="20"/>
+        </w:rPr>
+        <w:t>Science ,</w:t>
+      </w:r>
+      <w:proofErr w:type="gramEnd"/>
+      <w:r>
+        <w:rPr>
+          <w:rFonts w:ascii="Garamond" w:hAnsi="Garamond"/>
+          <w:i/>
+          <w:iCs/>
+          <w:sz w:val="20"/>
+          <w:szCs w:val="20"/>
+        </w:rPr>
+        <w:t xml:space="preserve"> University of Washington, Seattle, Washington, 98195 USA</w:t>
       </w:r>
     </w:p>
     <w:p>
       <w:pPr>
         <w:spacing w:line="480" w:lineRule="auto"/>
-        <w:rPr>
-          <w:rFonts w:ascii="Garamond" w:hAnsi="Garamond"/>
+        <w:jc w:val="center"/>
+        <w:rPr>
+          <w:rFonts w:ascii="Garamond" w:hAnsi="Garamond"/>
+          <w:sz w:val="22"/>
+          <w:szCs w:val="22"/>
         </w:rPr>
       </w:pPr>
     </w:p>
     <w:p>
       <w:pPr>
         <w:spacing w:line="480" w:lineRule="auto"/>
+        <w:jc w:val="center"/>
+        <w:rPr>
+          <w:rFonts w:ascii="Garamond" w:hAnsi="Garamond"/>
+          <w:sz w:val="22"/>
+          <w:szCs w:val="22"/>
+        </w:rPr>
+      </w:pPr>
+      <w:r>
+        <w:rPr>
+          <w:rFonts w:ascii="Garamond" w:hAnsi="Garamond"/>
+          <w:sz w:val="22"/>
+          <w:szCs w:val="22"/>
+        </w:rPr>
+        <w:t>Corresponding Author: Ben Makhlouf</w:t>
+      </w:r>
+      <w:r>
+        <w:rPr>
+          <w:rFonts w:ascii="Garamond" w:hAnsi="Garamond"/>
+          <w:sz w:val="22"/>
+          <w:szCs w:val="22"/>
+        </w:rPr>
+        <w:t xml:space="preserve"> (</w:t>
+      </w:r>
+      <w:hyperlink r:id="rId5" w:history="1">
+        <w:r>
+          <w:rPr>
+            <w:rStyle w:val="Hyperlink"/>
+            <w:rFonts w:ascii="Garamond" w:hAnsi="Garamond"/>
+            <w:sz w:val="22"/>
+            <w:szCs w:val="22"/>
+          </w:rPr>
+          <w:t>bmak29@uw.edu</w:t>
+        </w:r>
+      </w:hyperlink>
+      <w:r>
+        <w:rPr>
+          <w:rFonts w:ascii="Garamond" w:hAnsi="Garamond"/>
+          <w:sz w:val="22"/>
+          <w:szCs w:val="22"/>
+        </w:rPr>
+        <w:t>)</w:t>
+      </w:r>
+    </w:p>
+    <w:p>
+      <w:pPr>
+        <w:spacing w:line="480" w:lineRule="auto"/>
+        <w:jc w:val="center"/>
+        <w:rPr>
+          <w:rFonts w:ascii="Garamond" w:hAnsi="Garamond"/>
+          <w:sz w:val="22"/>
+          <w:szCs w:val="22"/>
+        </w:rPr>
+      </w:pPr>
+    </w:p>
+    <w:p>
+      <w:pPr>
+        <w:spacing w:line="480" w:lineRule="auto"/>
+        <w:jc w:val="center"/>
+        <w:rPr>
+          <w:rFonts w:ascii="Garamond" w:hAnsi="Garamond"/>
+          <w:sz w:val="22"/>
+          <w:szCs w:val="22"/>
+        </w:rPr>
+      </w:pPr>
+      <w:r>
+        <w:rPr>
+          <w:rFonts w:ascii="Garamond" w:hAnsi="Garamond"/>
+          <w:sz w:val="22"/>
+          <w:szCs w:val="22"/>
+        </w:rPr>
+        <w:t xml:space="preserve">Open research statement: </w:t>
+      </w:r>
+    </w:p>
+    <w:p>
+      <w:pPr>
+        <w:spacing w:line="480" w:lineRule="auto"/>
+        <w:jc w:val="center"/>
+        <w:rPr>
+          <w:rFonts w:ascii="Garamond" w:hAnsi="Garamond"/>
+          <w:i/>
+          <w:iCs/>
+          <w:sz w:val="22"/>
+          <w:szCs w:val="22"/>
+        </w:rPr>
+      </w:pPr>
+      <w:r>
+        <w:rPr>
+          <w:rFonts w:ascii="Garamond" w:hAnsi="Garamond"/>
+          <w:sz w:val="22"/>
+          <w:szCs w:val="22"/>
+        </w:rPr>
+        <w:t xml:space="preserve">Key words: </w:t>
+      </w:r>
+      <w:r>
+        <w:rPr>
+          <w:rFonts w:ascii="Garamond" w:hAnsi="Garamond"/>
+          <w:i/>
+          <w:iCs/>
+          <w:sz w:val="22"/>
+          <w:szCs w:val="22"/>
+        </w:rPr>
+        <w:t>Salmon, Otoliths, Machine Learning</w:t>
+      </w:r>
+    </w:p>
+    <w:p>
+      <w:pPr>
+        <w:spacing w:line="480" w:lineRule="auto"/>
+        <w:jc w:val="center"/>
+        <w:rPr>
+          <w:rFonts w:ascii="Garamond" w:hAnsi="Garamond"/>
+        </w:rPr>
+      </w:pPr>
+    </w:p>
+    <w:p>
+      <w:pPr>
+        <w:spacing w:line="480" w:lineRule="auto"/>
+        <w:jc w:val="center"/>
+        <w:rPr>
+          <w:rFonts w:ascii="Garamond" w:hAnsi="Garamond"/>
+        </w:rPr>
+      </w:pPr>
+    </w:p>
+    <w:p>
+      <w:pPr>
+        <w:spacing w:line="480" w:lineRule="auto"/>
+        <w:jc w:val="center"/>
+        <w:rPr>
+          <w:rFonts w:ascii="Garamond" w:hAnsi="Garamond"/>
+        </w:rPr>
+      </w:pPr>
+    </w:p>
+    <w:p>
+      <w:pPr>
+        <w:spacing w:line="480" w:lineRule="auto"/>
+        <w:jc w:val="center"/>
+        <w:rPr>
+          <w:rFonts w:ascii="Garamond" w:hAnsi="Garamond"/>
+        </w:rPr>
+      </w:pPr>
+    </w:p>
+    <w:p>
+      <w:pPr>
+        <w:spacing w:line="480" w:lineRule="auto"/>
+        <w:jc w:val="center"/>
+        <w:rPr>
+          <w:rFonts w:ascii="Garamond" w:hAnsi="Garamond"/>
+        </w:rPr>
+      </w:pPr>
+    </w:p>
+    <w:p>
+      <w:pPr>
+        <w:spacing w:line="480" w:lineRule="auto"/>
+        <w:jc w:val="center"/>
+        <w:rPr>
+          <w:rFonts w:ascii="Garamond" w:hAnsi="Garamond"/>
+        </w:rPr>
+      </w:pPr>
+    </w:p>
+    <w:p>
+      <w:pPr>
+        <w:spacing w:line="480" w:lineRule="auto"/>
+        <w:jc w:val="center"/>
+        <w:rPr>
+          <w:rFonts w:ascii="Garamond" w:hAnsi="Garamond"/>
+        </w:rPr>
+      </w:pPr>
+    </w:p>
+    <w:p>
+      <w:pPr>
+        <w:spacing w:line="480" w:lineRule="auto"/>
+        <w:rPr>
+          <w:rFonts w:ascii="Garamond" w:hAnsi="Garamond"/>
+        </w:rPr>
+      </w:pPr>
+    </w:p>
+    <w:p>
+      <w:pPr>
+        <w:spacing w:line="480" w:lineRule="auto"/>
+        <w:rPr>
+          <w:rFonts w:ascii="Garamond" w:hAnsi="Garamond"/>
+        </w:rPr>
+      </w:pPr>
+    </w:p>
+    <w:p>
+      <w:pPr>
+        <w:spacing w:line="480" w:lineRule="auto"/>
         <w:rPr>
           <w:rFonts w:ascii="Garamond" w:hAnsi="Garamond"/>
           <w:b/>
@@ -169,6 +524,7 @@
           <w:b/>
           <w:bCs/>
         </w:rPr>
+        <w:lastRenderedPageBreak/>
         <w:t xml:space="preserve">Abstract: </w:t>
       </w:r>
     </w:p>
@@ -635,7 +991,6 @@
           <w:sz w:val="32"/>
           <w:szCs w:val="32"/>
         </w:rPr>
-        <w:lastRenderedPageBreak/>
         <w:t xml:space="preserve">Introduction: </w:t>
       </w:r>
     </w:p>
@@ -719,7 +1074,16 @@
           <w:sz w:val="22"/>
           <w:szCs w:val="22"/>
         </w:rPr>
-        <w:t xml:space="preserve">a serious impediment towards developing ecosystem-based approaches to management that accounts </w:t>
+        <w:t xml:space="preserve">a serious impediment towards developing ecosystem-based </w:t>
+      </w:r>
+      <w:r>
+        <w:rPr>
+          <w:rFonts w:ascii="Garamond" w:hAnsi="Garamond"/>
+          <w:sz w:val="22"/>
+          <w:szCs w:val="22"/>
+        </w:rPr>
+        <w:lastRenderedPageBreak/>
+        <w:t xml:space="preserve">approaches to management that accounts </w:t>
       </w:r>
       <w:r>
         <w:rPr>
@@ -2216,16 +2580,7 @@
           <w:sz w:val="22"/>
           <w:szCs w:val="22"/>
         </w:rPr>
-        <w:t xml:space="preserve">upper portions of the Yukon can be reliability </w:t>
-      </w:r>
-      <w:r>
-        <w:rPr>
-          <w:rFonts w:ascii="Garamond" w:hAnsi="Garamond"/>
-          <w:sz w:val="22"/>
-          <w:szCs w:val="22"/>
-        </w:rPr>
-        <w:lastRenderedPageBreak/>
-        <w:t>distinguished using GSI,</w:t>
+        <w:t>upper portions of the Yukon can be reliability distinguished using GSI,</w:t>
       </w:r>
       <w:r>
         <w:rPr>
@@ -2436,6 +2791,7 @@
           <w:sz w:val="22"/>
           <w:szCs w:val="22"/>
         </w:rPr>
+        <w:lastRenderedPageBreak/>
         <w:t>I</w:t>
       </w:r>
       <w:r>
@@ -3565,168 +3921,176 @@
           <w:sz w:val="22"/>
           <w:szCs w:val="22"/>
         </w:rPr>
+        <w:t xml:space="preserve">on their migration </w:t>
+      </w:r>
+      <w:r>
+        <w:rPr>
+          <w:rFonts w:ascii="Garamond" w:hAnsi="Garamond"/>
+          <w:sz w:val="22"/>
+          <w:szCs w:val="22"/>
+        </w:rPr>
+        <w:t>to the ocean, otolith strontium data</w:t>
+      </w:r>
+      <w:r>
+        <w:rPr>
+          <w:rFonts w:ascii="Garamond" w:hAnsi="Garamond"/>
+          <w:sz w:val="22"/>
+          <w:szCs w:val="22"/>
+        </w:rPr>
+        <w:t xml:space="preserve"> following the natal origin region</w:t>
+      </w:r>
+      <w:r>
+        <w:rPr>
+          <w:rFonts w:ascii="Garamond" w:hAnsi="Garamond"/>
+          <w:sz w:val="22"/>
+          <w:szCs w:val="22"/>
+        </w:rPr>
+        <w:t xml:space="preserve"> may not reflect the true </w:t>
+      </w:r>
+      <w:r>
+        <w:rPr>
+          <w:rFonts w:ascii="Cambria Math" w:hAnsi="Cambria Math" w:cs="Cambria Math"/>
+          <w:sz w:val="22"/>
+          <w:szCs w:val="22"/>
+        </w:rPr>
+        <w:t>⁸⁷</w:t>
+      </w:r>
+      <w:r>
+        <w:rPr>
+          <w:rFonts w:ascii="Garamond" w:hAnsi="Garamond"/>
+          <w:sz w:val="22"/>
+          <w:szCs w:val="22"/>
+        </w:rPr>
+        <w:t>Sr/</w:t>
+      </w:r>
+      <w:r>
+        <w:rPr>
+          <w:rFonts w:ascii="Cambria Math" w:hAnsi="Cambria Math" w:cs="Cambria Math"/>
+          <w:sz w:val="22"/>
+          <w:szCs w:val="22"/>
+        </w:rPr>
+        <w:t>⁸⁶</w:t>
+      </w:r>
+      <w:r>
+        <w:rPr>
+          <w:rFonts w:ascii="Garamond" w:hAnsi="Garamond"/>
+          <w:sz w:val="22"/>
+          <w:szCs w:val="22"/>
+        </w:rPr>
+        <w:t xml:space="preserve">Sr values of each outmigration habitat. Instead, </w:t>
+      </w:r>
+      <w:r>
+        <w:rPr>
+          <w:rFonts w:ascii="Garamond" w:hAnsi="Garamond"/>
+          <w:sz w:val="22"/>
+          <w:szCs w:val="22"/>
+        </w:rPr>
+        <w:t xml:space="preserve">these </w:t>
+      </w:r>
+      <w:r>
+        <w:rPr>
+          <w:rFonts w:ascii="Garamond" w:hAnsi="Garamond"/>
+          <w:sz w:val="22"/>
+          <w:szCs w:val="22"/>
+        </w:rPr>
+        <w:t xml:space="preserve">data </w:t>
+      </w:r>
+      <w:r>
+        <w:rPr>
+          <w:rFonts w:ascii="Garamond" w:hAnsi="Garamond"/>
+          <w:sz w:val="22"/>
+          <w:szCs w:val="22"/>
+        </w:rPr>
+        <w:t>provide</w:t>
+      </w:r>
+      <w:r>
+        <w:rPr>
+          <w:rFonts w:ascii="Garamond" w:hAnsi="Garamond"/>
+          <w:sz w:val="22"/>
+          <w:szCs w:val="22"/>
+        </w:rPr>
+        <w:t xml:space="preserve"> </w:t>
+      </w:r>
+      <w:r>
+        <w:rPr>
+          <w:rFonts w:ascii="Garamond" w:hAnsi="Garamond"/>
+          <w:sz w:val="22"/>
+          <w:szCs w:val="22"/>
+        </w:rPr>
+        <w:t xml:space="preserve">a series of </w:t>
+      </w:r>
+      <w:r>
+        <w:rPr>
+          <w:rFonts w:ascii="Garamond" w:hAnsi="Garamond"/>
+          <w:sz w:val="22"/>
+          <w:szCs w:val="22"/>
+        </w:rPr>
+        <w:t>transient</w:t>
+      </w:r>
+      <w:r>
+        <w:rPr>
+          <w:rFonts w:ascii="Garamond" w:hAnsi="Garamond"/>
+          <w:sz w:val="22"/>
+          <w:szCs w:val="22"/>
+        </w:rPr>
+        <w:t xml:space="preserve"> </w:t>
+      </w:r>
+      <w:r>
+        <w:rPr>
+          <w:rFonts w:ascii="Garamond" w:hAnsi="Garamond"/>
+          <w:sz w:val="22"/>
+          <w:szCs w:val="22"/>
+        </w:rPr>
+        <w:t xml:space="preserve">patterns produced by incomplete and ongoing turnover </w:t>
+      </w:r>
+      <w:r>
+        <w:rPr>
+          <w:rFonts w:ascii="Garamond" w:hAnsi="Garamond"/>
+          <w:sz w:val="22"/>
+          <w:szCs w:val="22"/>
+        </w:rPr>
+        <w:t xml:space="preserve">dynamics within </w:t>
+      </w:r>
+      <w:r>
+        <w:rPr>
+          <w:rFonts w:ascii="Garamond" w:hAnsi="Garamond"/>
+          <w:sz w:val="22"/>
+          <w:szCs w:val="22"/>
+        </w:rPr>
+        <w:t xml:space="preserve">each habitat. </w:t>
+      </w:r>
+      <w:r>
+        <w:rPr>
+          <w:rFonts w:ascii="Garamond" w:hAnsi="Garamond"/>
+          <w:sz w:val="22"/>
+          <w:szCs w:val="22"/>
+        </w:rPr>
+        <w:t xml:space="preserve">The shape of these patterns, and the relationships among them, may encode distinctive river-specific life histories that together form a </w:t>
+      </w:r>
+      <w:r>
+        <w:rPr>
+          <w:rFonts w:ascii="Garamond" w:hAnsi="Garamond"/>
+          <w:sz w:val="22"/>
+          <w:szCs w:val="22"/>
+        </w:rPr>
+        <w:t xml:space="preserve">unique </w:t>
+      </w:r>
+      <w:r>
+        <w:rPr>
+          <w:rFonts w:ascii="Garamond" w:hAnsi="Garamond"/>
+          <w:sz w:val="22"/>
+          <w:szCs w:val="22"/>
+        </w:rPr>
+        <w:t xml:space="preserve">“fingerprint” of river-specific stocks. However, because these patterns are subtle and the number of </w:t>
+      </w:r>
+      <w:r>
+        <w:rPr>
+          <w:rFonts w:ascii="Garamond" w:hAnsi="Garamond"/>
+          <w:sz w:val="22"/>
+          <w:szCs w:val="22"/>
+        </w:rPr>
         <w:lastRenderedPageBreak/>
-        <w:t xml:space="preserve">on their migration </w:t>
-      </w:r>
-      <w:r>
-        <w:rPr>
-          <w:rFonts w:ascii="Garamond" w:hAnsi="Garamond"/>
-          <w:sz w:val="22"/>
-          <w:szCs w:val="22"/>
-        </w:rPr>
-        <w:t>to the ocean, otolith strontium data</w:t>
-      </w:r>
-      <w:r>
-        <w:rPr>
-          <w:rFonts w:ascii="Garamond" w:hAnsi="Garamond"/>
-          <w:sz w:val="22"/>
-          <w:szCs w:val="22"/>
-        </w:rPr>
-        <w:t xml:space="preserve"> following the natal origin region</w:t>
-      </w:r>
-      <w:r>
-        <w:rPr>
-          <w:rFonts w:ascii="Garamond" w:hAnsi="Garamond"/>
-          <w:sz w:val="22"/>
-          <w:szCs w:val="22"/>
-        </w:rPr>
-        <w:t xml:space="preserve"> may not reflect the true </w:t>
-      </w:r>
-      <w:r>
-        <w:rPr>
-          <w:rFonts w:ascii="Cambria Math" w:hAnsi="Cambria Math" w:cs="Cambria Math"/>
-          <w:sz w:val="22"/>
-          <w:szCs w:val="22"/>
-        </w:rPr>
-        <w:t>⁸⁷</w:t>
-      </w:r>
-      <w:r>
-        <w:rPr>
-          <w:rFonts w:ascii="Garamond" w:hAnsi="Garamond"/>
-          <w:sz w:val="22"/>
-          <w:szCs w:val="22"/>
-        </w:rPr>
-        <w:t>Sr/</w:t>
-      </w:r>
-      <w:r>
-        <w:rPr>
-          <w:rFonts w:ascii="Cambria Math" w:hAnsi="Cambria Math" w:cs="Cambria Math"/>
-          <w:sz w:val="22"/>
-          <w:szCs w:val="22"/>
-        </w:rPr>
-        <w:t>⁸⁶</w:t>
-      </w:r>
-      <w:r>
-        <w:rPr>
-          <w:rFonts w:ascii="Garamond" w:hAnsi="Garamond"/>
-          <w:sz w:val="22"/>
-          <w:szCs w:val="22"/>
-        </w:rPr>
-        <w:t xml:space="preserve">Sr values of each outmigration habitat. Instead, </w:t>
-      </w:r>
-      <w:r>
-        <w:rPr>
-          <w:rFonts w:ascii="Garamond" w:hAnsi="Garamond"/>
-          <w:sz w:val="22"/>
-          <w:szCs w:val="22"/>
-        </w:rPr>
-        <w:t xml:space="preserve">these </w:t>
-      </w:r>
-      <w:r>
-        <w:rPr>
-          <w:rFonts w:ascii="Garamond" w:hAnsi="Garamond"/>
-          <w:sz w:val="22"/>
-          <w:szCs w:val="22"/>
-        </w:rPr>
-        <w:t xml:space="preserve">data </w:t>
-      </w:r>
-      <w:r>
-        <w:rPr>
-          <w:rFonts w:ascii="Garamond" w:hAnsi="Garamond"/>
-          <w:sz w:val="22"/>
-          <w:szCs w:val="22"/>
-        </w:rPr>
-        <w:t>provide</w:t>
-      </w:r>
-      <w:r>
-        <w:rPr>
-          <w:rFonts w:ascii="Garamond" w:hAnsi="Garamond"/>
-          <w:sz w:val="22"/>
-          <w:szCs w:val="22"/>
-        </w:rPr>
-        <w:t xml:space="preserve"> </w:t>
-      </w:r>
-      <w:r>
-        <w:rPr>
-          <w:rFonts w:ascii="Garamond" w:hAnsi="Garamond"/>
-          <w:sz w:val="22"/>
-          <w:szCs w:val="22"/>
-        </w:rPr>
-        <w:t xml:space="preserve">a series of </w:t>
-      </w:r>
-      <w:r>
-        <w:rPr>
-          <w:rFonts w:ascii="Garamond" w:hAnsi="Garamond"/>
-          <w:sz w:val="22"/>
-          <w:szCs w:val="22"/>
-        </w:rPr>
-        <w:t>transient</w:t>
-      </w:r>
-      <w:r>
-        <w:rPr>
-          <w:rFonts w:ascii="Garamond" w:hAnsi="Garamond"/>
-          <w:sz w:val="22"/>
-          <w:szCs w:val="22"/>
-        </w:rPr>
-        <w:t xml:space="preserve"> </w:t>
-      </w:r>
-      <w:r>
-        <w:rPr>
-          <w:rFonts w:ascii="Garamond" w:hAnsi="Garamond"/>
-          <w:sz w:val="22"/>
-          <w:szCs w:val="22"/>
-        </w:rPr>
-        <w:t xml:space="preserve">patterns produced by incomplete and ongoing turnover </w:t>
-      </w:r>
-      <w:r>
-        <w:rPr>
-          <w:rFonts w:ascii="Garamond" w:hAnsi="Garamond"/>
-          <w:sz w:val="22"/>
-          <w:szCs w:val="22"/>
-        </w:rPr>
-        <w:t xml:space="preserve">dynamics within </w:t>
-      </w:r>
-      <w:r>
-        <w:rPr>
-          <w:rFonts w:ascii="Garamond" w:hAnsi="Garamond"/>
-          <w:sz w:val="22"/>
-          <w:szCs w:val="22"/>
-        </w:rPr>
-        <w:t xml:space="preserve">each habitat. </w:t>
-      </w:r>
-      <w:r>
-        <w:rPr>
-          <w:rFonts w:ascii="Garamond" w:hAnsi="Garamond"/>
-          <w:sz w:val="22"/>
-          <w:szCs w:val="22"/>
-        </w:rPr>
-        <w:t xml:space="preserve">The shape of these patterns, and the relationships among them, may encode distinctive river-specific life histories that together form a </w:t>
-      </w:r>
-      <w:r>
-        <w:rPr>
-          <w:rFonts w:ascii="Garamond" w:hAnsi="Garamond"/>
-          <w:sz w:val="22"/>
-          <w:szCs w:val="22"/>
-        </w:rPr>
-        <w:t xml:space="preserve">unique </w:t>
-      </w:r>
-      <w:r>
-        <w:rPr>
-          <w:rFonts w:ascii="Garamond" w:hAnsi="Garamond"/>
-          <w:sz w:val="22"/>
-          <w:szCs w:val="22"/>
-        </w:rPr>
-        <w:t xml:space="preserve">“fingerprint” of river-specific stocks. However, because these patterns are subtle and the number of possible combinations in large river basins is high, such identifiers are difficult to detect using traditional statistical or manual approaches. </w:t>
+        <w:t xml:space="preserve">possible combinations in large river basins is high, such identifiers are difficult to detect using traditional statistical or manual approaches. </w:t>
       </w:r>
       <w:r>
         <w:rPr>
@@ -4372,80 +4736,88 @@
           <w:sz w:val="22"/>
           <w:szCs w:val="22"/>
         </w:rPr>
+        <w:t>Chinook salmon otoliths were collected from the Yukon (2015, 2016, 2019–2021), Kuskokwim (2017–2022), and Nushagak (2011, 2014, 2015) river basins at</w:t>
+      </w:r>
+      <w:r>
+        <w:rPr>
+          <w:rFonts w:ascii="Garamond" w:hAnsi="Garamond"/>
+          <w:sz w:val="22"/>
+          <w:szCs w:val="22"/>
+        </w:rPr>
+        <w:t xml:space="preserve"> test fisheries near the downstream terminus of each river</w:t>
+      </w:r>
+      <w:r>
+        <w:rPr>
+          <w:rFonts w:ascii="Garamond" w:hAnsi="Garamond"/>
+          <w:sz w:val="22"/>
+          <w:szCs w:val="22"/>
+        </w:rPr>
+        <w:t xml:space="preserve"> (</w:t>
+      </w:r>
+      <w:commentRangeStart w:id="2"/>
+      <w:r>
+        <w:rPr>
+          <w:rFonts w:ascii="Garamond" w:hAnsi="Garamond"/>
+          <w:sz w:val="22"/>
+          <w:szCs w:val="22"/>
+        </w:rPr>
+        <w:t xml:space="preserve">Figure </w:t>
+      </w:r>
+      <w:commentRangeEnd w:id="2"/>
+      <w:r>
+        <w:rPr>
+          <w:rStyle w:val="CommentReference"/>
+        </w:rPr>
+        <w:commentReference w:id="2"/>
+      </w:r>
+      <w:r>
+        <w:rPr>
+          <w:rFonts w:ascii="Garamond" w:hAnsi="Garamond"/>
+          <w:sz w:val="22"/>
+          <w:szCs w:val="22"/>
+        </w:rPr>
+        <w:t xml:space="preserve">1). </w:t>
+      </w:r>
+      <w:r>
+        <w:rPr>
+          <w:rFonts w:ascii="Garamond" w:hAnsi="Garamond"/>
+          <w:sz w:val="22"/>
+          <w:szCs w:val="22"/>
+        </w:rPr>
+        <w:t xml:space="preserve">Fish were sampled through collaborative efforts </w:t>
+      </w:r>
+      <w:r>
+        <w:rPr>
+          <w:rFonts w:ascii="Garamond" w:hAnsi="Garamond"/>
+          <w:sz w:val="22"/>
+          <w:szCs w:val="22"/>
+        </w:rPr>
+        <w:t xml:space="preserve">with the Alaska Department of Fish and Game Lower Yukon Test Fishery (LYTF), Orutsararmiut Native Council at the Bethel Test Fishery, and </w:t>
+      </w:r>
+      <w:r>
+        <w:rPr>
+          <w:rFonts w:ascii="Garamond" w:hAnsi="Garamond"/>
+          <w:sz w:val="22"/>
+          <w:szCs w:val="22"/>
+        </w:rPr>
+        <w:t>from Chinook salmon caught within the Nushagak commercial fishing district in Bristol Bay</w:t>
+      </w:r>
+      <w:r>
+        <w:rPr>
+          <w:rFonts w:ascii="Garamond" w:hAnsi="Garamond"/>
+          <w:sz w:val="22"/>
+          <w:szCs w:val="22"/>
+        </w:rPr>
+        <w:t xml:space="preserve"> (Black dots, </w:t>
+      </w:r>
+      <w:r>
+        <w:rPr>
+          <w:rFonts w:ascii="Garamond" w:hAnsi="Garamond"/>
+          <w:sz w:val="22"/>
+          <w:szCs w:val="22"/>
+        </w:rPr>
         <w:lastRenderedPageBreak/>
-        <w:t>Chinook salmon otoliths were collected from the Yukon (2015, 2016, 2019–2021), Kuskokwim (2017–2022), and Nushagak (2011, 2014, 2015) river basins at</w:t>
-      </w:r>
-      <w:r>
-        <w:rPr>
-          <w:rFonts w:ascii="Garamond" w:hAnsi="Garamond"/>
-          <w:sz w:val="22"/>
-          <w:szCs w:val="22"/>
-        </w:rPr>
-        <w:t xml:space="preserve"> test fisheries near the downstream terminus of each river</w:t>
-      </w:r>
-      <w:r>
-        <w:rPr>
-          <w:rFonts w:ascii="Garamond" w:hAnsi="Garamond"/>
-          <w:sz w:val="22"/>
-          <w:szCs w:val="22"/>
-        </w:rPr>
-        <w:t xml:space="preserve"> (</w:t>
-      </w:r>
-      <w:commentRangeStart w:id="2"/>
-      <w:r>
-        <w:rPr>
-          <w:rFonts w:ascii="Garamond" w:hAnsi="Garamond"/>
-          <w:sz w:val="22"/>
-          <w:szCs w:val="22"/>
-        </w:rPr>
-        <w:t xml:space="preserve">Figure </w:t>
-      </w:r>
-      <w:commentRangeEnd w:id="2"/>
-      <w:r>
-        <w:rPr>
-          <w:rStyle w:val="CommentReference"/>
-        </w:rPr>
-        <w:commentReference w:id="2"/>
-      </w:r>
-      <w:r>
-        <w:rPr>
-          <w:rFonts w:ascii="Garamond" w:hAnsi="Garamond"/>
-          <w:sz w:val="22"/>
-          <w:szCs w:val="22"/>
-        </w:rPr>
-        <w:t xml:space="preserve">1). </w:t>
-      </w:r>
-      <w:r>
-        <w:rPr>
-          <w:rFonts w:ascii="Garamond" w:hAnsi="Garamond"/>
-          <w:sz w:val="22"/>
-          <w:szCs w:val="22"/>
-        </w:rPr>
-        <w:t xml:space="preserve">Fish were sampled through collaborative efforts </w:t>
-      </w:r>
-      <w:r>
-        <w:rPr>
-          <w:rFonts w:ascii="Garamond" w:hAnsi="Garamond"/>
-          <w:sz w:val="22"/>
-          <w:szCs w:val="22"/>
-        </w:rPr>
-        <w:t xml:space="preserve">with the Alaska Department of Fish and Game Lower Yukon Test Fishery (LYTF), Orutsararmiut Native Council at the Bethel Test Fishery, and </w:t>
-      </w:r>
-      <w:r>
-        <w:rPr>
-          <w:rFonts w:ascii="Garamond" w:hAnsi="Garamond"/>
-          <w:sz w:val="22"/>
-          <w:szCs w:val="22"/>
-        </w:rPr>
-        <w:t>from Chinook salmon caught within the Nushagak commercial fishing district in Bristol Bay</w:t>
-      </w:r>
-      <w:r>
-        <w:rPr>
-          <w:rFonts w:ascii="Garamond" w:hAnsi="Garamond"/>
-          <w:sz w:val="22"/>
-          <w:szCs w:val="22"/>
-        </w:rPr>
-        <w:t xml:space="preserve"> (Black dots, Figure 1)</w:t>
+        <w:t>Figure 1)</w:t>
       </w:r>
       <w:r>
         <w:rPr>
@@ -5220,7 +5592,184 @@
           <w:sz w:val="22"/>
           <w:szCs w:val="22"/>
         </w:rPr>
-        <w:t xml:space="preserve">morphological </w:t>
+        <w:t>morphological features along the laser ablation line</w:t>
+      </w:r>
+      <w:r>
+        <w:rPr>
+          <w:rFonts w:ascii="Garamond" w:hAnsi="Garamond"/>
+          <w:sz w:val="22"/>
+          <w:szCs w:val="22"/>
+        </w:rPr>
+        <w:t xml:space="preserve"> </w:t>
+      </w:r>
+      <w:r>
+        <w:rPr>
+          <w:rFonts w:ascii="Garamond" w:hAnsi="Garamond"/>
+          <w:sz w:val="22"/>
+          <w:szCs w:val="22"/>
+        </w:rPr>
+        <w:fldChar w:fldCharType="begin"/>
+      </w:r>
+      <w:r>
+        <w:rPr>
+          <w:rFonts w:ascii="Garamond" w:hAnsi="Garamond"/>
+          <w:sz w:val="22"/>
+          <w:szCs w:val="22"/>
+        </w:rPr>
+        <w:instrText xml:space="preserve"> ADDIN ZOTERO_ITEM CSL_CITATION {"citationID":"DX3Ucg21","properties":{"formattedCitation":"(Brennan &amp; Schindler, 2017)","plainCitation":"(Brennan &amp; Schindler, 2017)","noteIndex":0},"citationItems":[{"id":1694,"uris":["http://zotero.org/users/8421274/items/NSWL6YPN"],"itemData":{"id":1694,"type":"article-journal","abstract":"Production patterns of highly mobile species, such as anadromous fish, often exhibit high spatial and temporal heterogeneity across landscapes. Such variability is often asynchronous in time among habitats, which stabilizes production at aggregate scales of complexity. Reconstructing production patterns explicitly in space and time across multiple scales, however, remains difficult but is important for prioritizing habitat conservation. This is especially true for fishes inhabiting river basins due to long-range dispersal, high mortality at early life stages, complex population structure and elusive life history variation. We develop a new approach for mapping production patterns of Pacific salmon across a large river basin by integrating otolith microchemistry and dendritic isoscape models. The geographically continuous Bayesian assignment framework presented here yielded high accuracies (&gt;90%) and relatively high precisions (precisions &lt;4%; i.e., assignment areas of &lt;530 river km of the 13 100 km total river length) when used to determine the natal source of known-origin juvenile Chinook salmon captured throughout the study region. Integrating these methods enabled us to base estimates of provenance and habitat use of individuals on a per location basis using strontium isotopic data throughout the continuous spatial domain of a river network. Such a framework provides substantial advantages over the more common nominal approach to employing otolith microchemistry to reconstruct movement patterns of fish. In doing so, we reconstructed the spatial production patterns of adult Chinook salmon returning to a large watershed in Bristol Bay, Alaska and illustrate the power of such an approach to conservation efforts.","container-title":"Ecological Applications","DOI":"10.1002/eap.1474","ISSN":"1939-5582","issue":"2","language":"en","note":"_eprint: https://esajournals.onlinelibrary.wiley.com/doi/pdf/10.1002/eap.1474","page":"363-377","source":"Wiley Online Library","title":"Linking otolith microchemistry and dendritic isoscapes to map heterogeneous production of fish across river basins","volume":"27","author":[{"family":"Brennan","given":"Sean R."},{"family":"Schindler","given":"Daniel E."}],"issued":{"date-parts":[["2017"]]}}}],"schema":"https://github.com/citation-style-language/schema/raw/master/csl-citation.json"} </w:instrText>
+      </w:r>
+      <w:r>
+        <w:rPr>
+          <w:rFonts w:ascii="Garamond" w:hAnsi="Garamond"/>
+          <w:sz w:val="22"/>
+          <w:szCs w:val="22"/>
+        </w:rPr>
+        <w:fldChar w:fldCharType="separate"/>
+      </w:r>
+      <w:r>
+        <w:rPr>
+          <w:rFonts w:ascii="Garamond" w:hAnsi="Garamond"/>
+          <w:noProof/>
+          <w:sz w:val="22"/>
+          <w:szCs w:val="22"/>
+        </w:rPr>
+        <w:t>(Brennan &amp; Schindler, 2017)</w:t>
+      </w:r>
+      <w:r>
+        <w:rPr>
+          <w:rFonts w:ascii="Garamond" w:hAnsi="Garamond"/>
+          <w:sz w:val="22"/>
+          <w:szCs w:val="22"/>
+        </w:rPr>
+        <w:fldChar w:fldCharType="end"/>
+      </w:r>
+      <w:r>
+        <w:rPr>
+          <w:rFonts w:ascii="Garamond" w:hAnsi="Garamond"/>
+          <w:sz w:val="22"/>
+          <w:szCs w:val="22"/>
+        </w:rPr>
+        <w:t xml:space="preserve">. </w:t>
+      </w:r>
+      <w:r>
+        <w:rPr>
+          <w:rFonts w:ascii="Garamond" w:hAnsi="Garamond"/>
+          <w:sz w:val="22"/>
+          <w:szCs w:val="22"/>
+        </w:rPr>
+        <w:t>The n</w:t>
+      </w:r>
+      <w:r>
+        <w:rPr>
+          <w:rFonts w:ascii="Garamond" w:hAnsi="Garamond"/>
+          <w:sz w:val="22"/>
+          <w:szCs w:val="22"/>
+        </w:rPr>
+        <w:t xml:space="preserve">atal origin region was manually identified by the first steady state after the decline in Sr88 and movement of </w:t>
+      </w:r>
+      <w:r>
+        <w:rPr>
+          <w:rFonts w:ascii="Cambria Math" w:hAnsi="Cambria Math" w:cs="Cambria Math"/>
+          <w:sz w:val="22"/>
+          <w:szCs w:val="22"/>
+        </w:rPr>
+        <w:t>⁸⁷</w:t>
+      </w:r>
+      <w:r>
+        <w:rPr>
+          <w:rFonts w:ascii="Garamond" w:hAnsi="Garamond"/>
+          <w:sz w:val="22"/>
+          <w:szCs w:val="22"/>
+        </w:rPr>
+        <w:t>Sr/</w:t>
+      </w:r>
+      <w:r>
+        <w:rPr>
+          <w:rFonts w:ascii="Cambria Math" w:hAnsi="Cambria Math" w:cs="Cambria Math"/>
+          <w:sz w:val="22"/>
+          <w:szCs w:val="22"/>
+        </w:rPr>
+        <w:t>⁸⁶</w:t>
+      </w:r>
+      <w:r>
+        <w:rPr>
+          <w:rFonts w:ascii="Garamond" w:hAnsi="Garamond"/>
+          <w:sz w:val="22"/>
+          <w:szCs w:val="22"/>
+        </w:rPr>
+        <w:t>Sr</w:t>
+      </w:r>
+      <w:r>
+        <w:rPr>
+          <w:rFonts w:ascii="Garamond" w:hAnsi="Garamond"/>
+          <w:sz w:val="22"/>
+          <w:szCs w:val="22"/>
+        </w:rPr>
+        <w:t xml:space="preserve"> away from the global marine value (0.7092)</w:t>
+      </w:r>
+      <w:r>
+        <w:rPr>
+          <w:rFonts w:ascii="Garamond" w:hAnsi="Garamond"/>
+          <w:sz w:val="22"/>
+          <w:szCs w:val="22"/>
+        </w:rPr>
+        <w:t>, which</w:t>
+      </w:r>
+      <w:r>
+        <w:rPr>
+          <w:rFonts w:ascii="Garamond" w:hAnsi="Garamond"/>
+          <w:sz w:val="22"/>
+          <w:szCs w:val="22"/>
+        </w:rPr>
+        <w:t xml:space="preserve"> represent</w:t>
+      </w:r>
+      <w:r>
+        <w:rPr>
+          <w:rFonts w:ascii="Garamond" w:hAnsi="Garamond"/>
+          <w:sz w:val="22"/>
+          <w:szCs w:val="22"/>
+        </w:rPr>
+        <w:t>s</w:t>
+      </w:r>
+      <w:r>
+        <w:rPr>
+          <w:rFonts w:ascii="Garamond" w:hAnsi="Garamond"/>
+          <w:sz w:val="22"/>
+          <w:szCs w:val="22"/>
+        </w:rPr>
+        <w:t xml:space="preserve"> the maternal signal in the otolith</w:t>
+      </w:r>
+      <w:r>
+        <w:rPr>
+          <w:rFonts w:ascii="Garamond" w:hAnsi="Garamond"/>
+          <w:sz w:val="22"/>
+          <w:szCs w:val="22"/>
+        </w:rPr>
+        <w:t>.</w:t>
+      </w:r>
+      <w:r>
+        <w:rPr>
+          <w:rFonts w:ascii="Garamond" w:hAnsi="Garamond"/>
+          <w:sz w:val="22"/>
+          <w:szCs w:val="22"/>
+        </w:rPr>
+        <w:t xml:space="preserve"> Although we hypothesized that the maternal signature would differ among watersheds</w:t>
+      </w:r>
+      <w:r>
+        <w:rPr>
+          <w:rFonts w:ascii="Garamond" w:hAnsi="Garamond"/>
+          <w:sz w:val="22"/>
+          <w:szCs w:val="22"/>
+        </w:rPr>
+        <w:t xml:space="preserve">, and thus could be useful for classification, </w:t>
+      </w:r>
+      <w:r>
+        <w:rPr>
+          <w:rFonts w:ascii="Garamond" w:hAnsi="Garamond"/>
+          <w:sz w:val="22"/>
+          <w:szCs w:val="22"/>
+        </w:rPr>
+        <w:t xml:space="preserve">the start of the </w:t>
       </w:r>
       <w:r>
         <w:rPr>
@@ -5229,184 +5778,7 @@
           <w:szCs w:val="22"/>
         </w:rPr>
         <w:lastRenderedPageBreak/>
-        <w:t>features along the laser ablation line</w:t>
-      </w:r>
-      <w:r>
-        <w:rPr>
-          <w:rFonts w:ascii="Garamond" w:hAnsi="Garamond"/>
-          <w:sz w:val="22"/>
-          <w:szCs w:val="22"/>
-        </w:rPr>
-        <w:t xml:space="preserve"> </w:t>
-      </w:r>
-      <w:r>
-        <w:rPr>
-          <w:rFonts w:ascii="Garamond" w:hAnsi="Garamond"/>
-          <w:sz w:val="22"/>
-          <w:szCs w:val="22"/>
-        </w:rPr>
-        <w:fldChar w:fldCharType="begin"/>
-      </w:r>
-      <w:r>
-        <w:rPr>
-          <w:rFonts w:ascii="Garamond" w:hAnsi="Garamond"/>
-          <w:sz w:val="22"/>
-          <w:szCs w:val="22"/>
-        </w:rPr>
-        <w:instrText xml:space="preserve"> ADDIN ZOTERO_ITEM CSL_CITATION {"citationID":"DX3Ucg21","properties":{"formattedCitation":"(Brennan &amp; Schindler, 2017)","plainCitation":"(Brennan &amp; Schindler, 2017)","noteIndex":0},"citationItems":[{"id":1694,"uris":["http://zotero.org/users/8421274/items/NSWL6YPN"],"itemData":{"id":1694,"type":"article-journal","abstract":"Production patterns of highly mobile species, such as anadromous fish, often exhibit high spatial and temporal heterogeneity across landscapes. Such variability is often asynchronous in time among habitats, which stabilizes production at aggregate scales of complexity. Reconstructing production patterns explicitly in space and time across multiple scales, however, remains difficult but is important for prioritizing habitat conservation. This is especially true for fishes inhabiting river basins due to long-range dispersal, high mortality at early life stages, complex population structure and elusive life history variation. We develop a new approach for mapping production patterns of Pacific salmon across a large river basin by integrating otolith microchemistry and dendritic isoscape models. The geographically continuous Bayesian assignment framework presented here yielded high accuracies (&gt;90%) and relatively high precisions (precisions &lt;4%; i.e., assignment areas of &lt;530 river km of the 13 100 km total river length) when used to determine the natal source of known-origin juvenile Chinook salmon captured throughout the study region. Integrating these methods enabled us to base estimates of provenance and habitat use of individuals on a per location basis using strontium isotopic data throughout the continuous spatial domain of a river network. Such a framework provides substantial advantages over the more common nominal approach to employing otolith microchemistry to reconstruct movement patterns of fish. In doing so, we reconstructed the spatial production patterns of adult Chinook salmon returning to a large watershed in Bristol Bay, Alaska and illustrate the power of such an approach to conservation efforts.","container-title":"Ecological Applications","DOI":"10.1002/eap.1474","ISSN":"1939-5582","issue":"2","language":"en","note":"_eprint: https://esajournals.onlinelibrary.wiley.com/doi/pdf/10.1002/eap.1474","page":"363-377","source":"Wiley Online Library","title":"Linking otolith microchemistry and dendritic isoscapes to map heterogeneous production of fish across river basins","volume":"27","author":[{"family":"Brennan","given":"Sean R."},{"family":"Schindler","given":"Daniel E."}],"issued":{"date-parts":[["2017"]]}}}],"schema":"https://github.com/citation-style-language/schema/raw/master/csl-citation.json"} </w:instrText>
-      </w:r>
-      <w:r>
-        <w:rPr>
-          <w:rFonts w:ascii="Garamond" w:hAnsi="Garamond"/>
-          <w:sz w:val="22"/>
-          <w:szCs w:val="22"/>
-        </w:rPr>
-        <w:fldChar w:fldCharType="separate"/>
-      </w:r>
-      <w:r>
-        <w:rPr>
-          <w:rFonts w:ascii="Garamond" w:hAnsi="Garamond"/>
-          <w:noProof/>
-          <w:sz w:val="22"/>
-          <w:szCs w:val="22"/>
-        </w:rPr>
-        <w:t>(Brennan &amp; Schindler, 2017)</w:t>
-      </w:r>
-      <w:r>
-        <w:rPr>
-          <w:rFonts w:ascii="Garamond" w:hAnsi="Garamond"/>
-          <w:sz w:val="22"/>
-          <w:szCs w:val="22"/>
-        </w:rPr>
-        <w:fldChar w:fldCharType="end"/>
-      </w:r>
-      <w:r>
-        <w:rPr>
-          <w:rFonts w:ascii="Garamond" w:hAnsi="Garamond"/>
-          <w:sz w:val="22"/>
-          <w:szCs w:val="22"/>
-        </w:rPr>
-        <w:t xml:space="preserve">. </w:t>
-      </w:r>
-      <w:r>
-        <w:rPr>
-          <w:rFonts w:ascii="Garamond" w:hAnsi="Garamond"/>
-          <w:sz w:val="22"/>
-          <w:szCs w:val="22"/>
-        </w:rPr>
-        <w:t>The n</w:t>
-      </w:r>
-      <w:r>
-        <w:rPr>
-          <w:rFonts w:ascii="Garamond" w:hAnsi="Garamond"/>
-          <w:sz w:val="22"/>
-          <w:szCs w:val="22"/>
-        </w:rPr>
-        <w:t xml:space="preserve">atal origin region was manually identified by the first steady state after the decline in Sr88 and movement of </w:t>
-      </w:r>
-      <w:r>
-        <w:rPr>
-          <w:rFonts w:ascii="Cambria Math" w:hAnsi="Cambria Math" w:cs="Cambria Math"/>
-          <w:sz w:val="22"/>
-          <w:szCs w:val="22"/>
-        </w:rPr>
-        <w:t>⁸⁷</w:t>
-      </w:r>
-      <w:r>
-        <w:rPr>
-          <w:rFonts w:ascii="Garamond" w:hAnsi="Garamond"/>
-          <w:sz w:val="22"/>
-          <w:szCs w:val="22"/>
-        </w:rPr>
-        <w:t>Sr/</w:t>
-      </w:r>
-      <w:r>
-        <w:rPr>
-          <w:rFonts w:ascii="Cambria Math" w:hAnsi="Cambria Math" w:cs="Cambria Math"/>
-          <w:sz w:val="22"/>
-          <w:szCs w:val="22"/>
-        </w:rPr>
-        <w:t>⁸⁶</w:t>
-      </w:r>
-      <w:r>
-        <w:rPr>
-          <w:rFonts w:ascii="Garamond" w:hAnsi="Garamond"/>
-          <w:sz w:val="22"/>
-          <w:szCs w:val="22"/>
-        </w:rPr>
-        <w:t>Sr</w:t>
-      </w:r>
-      <w:r>
-        <w:rPr>
-          <w:rFonts w:ascii="Garamond" w:hAnsi="Garamond"/>
-          <w:sz w:val="22"/>
-          <w:szCs w:val="22"/>
-        </w:rPr>
-        <w:t xml:space="preserve"> away from the global marine value (0.7092)</w:t>
-      </w:r>
-      <w:r>
-        <w:rPr>
-          <w:rFonts w:ascii="Garamond" w:hAnsi="Garamond"/>
-          <w:sz w:val="22"/>
-          <w:szCs w:val="22"/>
-        </w:rPr>
-        <w:t>, which</w:t>
-      </w:r>
-      <w:r>
-        <w:rPr>
-          <w:rFonts w:ascii="Garamond" w:hAnsi="Garamond"/>
-          <w:sz w:val="22"/>
-          <w:szCs w:val="22"/>
-        </w:rPr>
-        <w:t xml:space="preserve"> represent</w:t>
-      </w:r>
-      <w:r>
-        <w:rPr>
-          <w:rFonts w:ascii="Garamond" w:hAnsi="Garamond"/>
-          <w:sz w:val="22"/>
-          <w:szCs w:val="22"/>
-        </w:rPr>
-        <w:t>s</w:t>
-      </w:r>
-      <w:r>
-        <w:rPr>
-          <w:rFonts w:ascii="Garamond" w:hAnsi="Garamond"/>
-          <w:sz w:val="22"/>
-          <w:szCs w:val="22"/>
-        </w:rPr>
-        <w:t xml:space="preserve"> the maternal signal in the otolith</w:t>
-      </w:r>
-      <w:r>
-        <w:rPr>
-          <w:rFonts w:ascii="Garamond" w:hAnsi="Garamond"/>
-          <w:sz w:val="22"/>
-          <w:szCs w:val="22"/>
-        </w:rPr>
-        <w:t>.</w:t>
-      </w:r>
-      <w:r>
-        <w:rPr>
-          <w:rFonts w:ascii="Garamond" w:hAnsi="Garamond"/>
-          <w:sz w:val="22"/>
-          <w:szCs w:val="22"/>
-        </w:rPr>
-        <w:t xml:space="preserve"> Although we hypothesized that the maternal signature would differ among watersheds</w:t>
-      </w:r>
-      <w:r>
-        <w:rPr>
-          <w:rFonts w:ascii="Garamond" w:hAnsi="Garamond"/>
-          <w:sz w:val="22"/>
-          <w:szCs w:val="22"/>
-        </w:rPr>
-        <w:t xml:space="preserve">, and thus could be useful for classification, </w:t>
-      </w:r>
-      <w:r>
-        <w:rPr>
-          <w:rFonts w:ascii="Garamond" w:hAnsi="Garamond"/>
-          <w:sz w:val="22"/>
-          <w:szCs w:val="22"/>
-        </w:rPr>
-        <w:t xml:space="preserve">the start of the laser ablation </w:t>
+        <w:t xml:space="preserve">laser ablation </w:t>
       </w:r>
       <w:proofErr w:type="gramStart"/>
       <w:r>
@@ -6310,232 +6682,240 @@
           <w:sz w:val="22"/>
           <w:szCs w:val="22"/>
         </w:rPr>
+        <w:t xml:space="preserve">Principal component analysis (PCA) was applied </w:t>
+      </w:r>
+      <w:r>
+        <w:rPr>
+          <w:rFonts w:ascii="Garamond" w:hAnsi="Garamond"/>
+          <w:sz w:val="22"/>
+          <w:szCs w:val="22"/>
+        </w:rPr>
+        <w:t xml:space="preserve">to </w:t>
+      </w:r>
+      <w:r>
+        <w:rPr>
+          <w:rFonts w:ascii="Garamond" w:hAnsi="Garamond"/>
+          <w:sz w:val="22"/>
+          <w:szCs w:val="22"/>
+        </w:rPr>
+        <w:t xml:space="preserve">all </w:t>
+      </w:r>
+      <w:r>
+        <w:rPr>
+          <w:rFonts w:ascii="Garamond" w:hAnsi="Garamond"/>
+          <w:sz w:val="22"/>
+          <w:szCs w:val="22"/>
+        </w:rPr>
+        <w:t>timeseries</w:t>
+      </w:r>
+      <w:r>
+        <w:rPr>
+          <w:rFonts w:ascii="Garamond" w:hAnsi="Garamond"/>
+          <w:sz w:val="22"/>
+          <w:szCs w:val="22"/>
+        </w:rPr>
+        <w:t xml:space="preserve"> from </w:t>
+      </w:r>
+      <w:r>
+        <w:rPr>
+          <w:rFonts w:ascii="Garamond" w:hAnsi="Garamond"/>
+          <w:sz w:val="22"/>
+          <w:szCs w:val="22"/>
+        </w:rPr>
+        <w:t>the</w:t>
+      </w:r>
+      <w:r>
+        <w:rPr>
+          <w:rFonts w:ascii="Garamond" w:hAnsi="Garamond"/>
+          <w:sz w:val="22"/>
+          <w:szCs w:val="22"/>
+        </w:rPr>
+        <w:t xml:space="preserve"> dataset in the</w:t>
+      </w:r>
+      <w:r>
+        <w:rPr>
+          <w:rFonts w:ascii="Garamond" w:hAnsi="Garamond"/>
+          <w:sz w:val="22"/>
+          <w:szCs w:val="22"/>
+        </w:rPr>
+        <w:t xml:space="preserve"> top-performing model</w:t>
+      </w:r>
+      <w:r>
+        <w:rPr>
+          <w:rFonts w:ascii="Garamond" w:hAnsi="Garamond"/>
+          <w:sz w:val="22"/>
+          <w:szCs w:val="22"/>
+        </w:rPr>
+        <w:t xml:space="preserve"> (GAM smoothed data)</w:t>
+      </w:r>
+      <w:r>
+        <w:rPr>
+          <w:rFonts w:ascii="Garamond" w:hAnsi="Garamond"/>
+          <w:sz w:val="22"/>
+          <w:szCs w:val="22"/>
+        </w:rPr>
+        <w:t xml:space="preserve"> to qualitatively assess clustering patterns in multivariate space</w:t>
+      </w:r>
+      <w:r>
+        <w:rPr>
+          <w:rFonts w:ascii="Garamond" w:hAnsi="Garamond"/>
+          <w:sz w:val="22"/>
+          <w:szCs w:val="22"/>
+        </w:rPr>
+        <w:t xml:space="preserve"> (</w:t>
+      </w:r>
+      <w:commentRangeStart w:id="7"/>
+      <w:r>
+        <w:rPr>
+          <w:rFonts w:ascii="Garamond" w:hAnsi="Garamond"/>
+          <w:sz w:val="22"/>
+          <w:szCs w:val="22"/>
+        </w:rPr>
+        <w:t>Figure</w:t>
+      </w:r>
+      <w:commentRangeEnd w:id="7"/>
+      <w:r>
+        <w:rPr>
+          <w:rStyle w:val="CommentReference"/>
+        </w:rPr>
+        <w:commentReference w:id="7"/>
+      </w:r>
+      <w:r>
+        <w:rPr>
+          <w:rFonts w:ascii="Garamond" w:hAnsi="Garamond"/>
+          <w:sz w:val="22"/>
+          <w:szCs w:val="22"/>
+        </w:rPr>
+        <w:t xml:space="preserve"> </w:t>
+      </w:r>
+      <w:r>
+        <w:rPr>
+          <w:rFonts w:ascii="Garamond" w:hAnsi="Garamond"/>
+          <w:sz w:val="22"/>
+          <w:szCs w:val="22"/>
+        </w:rPr>
+        <w:t>2</w:t>
+      </w:r>
+      <w:r>
+        <w:rPr>
+          <w:rFonts w:ascii="Garamond" w:hAnsi="Garamond"/>
+          <w:sz w:val="22"/>
+          <w:szCs w:val="22"/>
+        </w:rPr>
+        <w:t>)</w:t>
+      </w:r>
+      <w:r>
+        <w:rPr>
+          <w:rFonts w:ascii="Garamond" w:hAnsi="Garamond"/>
+          <w:sz w:val="22"/>
+          <w:szCs w:val="22"/>
+        </w:rPr>
+        <w:t xml:space="preserve"> PCA transforms the original </w:t>
+      </w:r>
+      <w:r>
+        <w:rPr>
+          <w:rFonts w:ascii="Garamond" w:hAnsi="Garamond"/>
+          <w:sz w:val="22"/>
+          <w:szCs w:val="22"/>
+        </w:rPr>
+        <w:t>time</w:t>
+      </w:r>
+      <w:r>
+        <w:rPr>
+          <w:rFonts w:ascii="Garamond" w:hAnsi="Garamond"/>
+          <w:sz w:val="22"/>
+          <w:szCs w:val="22"/>
+        </w:rPr>
+        <w:t xml:space="preserve"> </w:t>
+      </w:r>
+      <w:r>
+        <w:rPr>
+          <w:rFonts w:ascii="Garamond" w:hAnsi="Garamond"/>
+          <w:sz w:val="22"/>
+          <w:szCs w:val="22"/>
+        </w:rPr>
+        <w:t xml:space="preserve">series </w:t>
+      </w:r>
+      <w:r>
+        <w:rPr>
+          <w:rFonts w:ascii="Garamond" w:hAnsi="Garamond"/>
+          <w:sz w:val="22"/>
+          <w:szCs w:val="22"/>
+        </w:rPr>
+        <w:t xml:space="preserve">into uncorrelated principal components that capture the greatest variance in the dataset, thereby highlighting variability among </w:t>
+      </w:r>
+      <w:r>
+        <w:rPr>
+          <w:rFonts w:ascii="Garamond" w:hAnsi="Garamond"/>
+          <w:sz w:val="22"/>
+          <w:szCs w:val="22"/>
+        </w:rPr>
+        <w:t>time series</w:t>
+      </w:r>
+      <w:r>
+        <w:rPr>
+          <w:rFonts w:ascii="Garamond" w:hAnsi="Garamond"/>
+          <w:sz w:val="22"/>
+          <w:szCs w:val="22"/>
+        </w:rPr>
+        <w:t xml:space="preserve"> that may contain distinguishing watershed characteristics</w:t>
+      </w:r>
+      <w:r>
+        <w:rPr>
+          <w:rFonts w:ascii="Garamond" w:hAnsi="Garamond"/>
+          <w:sz w:val="22"/>
+          <w:szCs w:val="22"/>
+        </w:rPr>
+        <w:t xml:space="preserve">. </w:t>
+      </w:r>
+      <w:r>
+        <w:rPr>
+          <w:rFonts w:ascii="Garamond" w:hAnsi="Garamond"/>
+          <w:sz w:val="22"/>
+          <w:szCs w:val="22"/>
+        </w:rPr>
+        <w:t>To further illustrate how</w:t>
+      </w:r>
+      <w:r>
+        <w:rPr>
+          <w:rFonts w:ascii="Garamond" w:hAnsi="Garamond"/>
+          <w:sz w:val="22"/>
+          <w:szCs w:val="22"/>
+        </w:rPr>
+        <w:t xml:space="preserve"> this</w:t>
+      </w:r>
+      <w:r>
+        <w:rPr>
+          <w:rFonts w:ascii="Garamond" w:hAnsi="Garamond"/>
+          <w:sz w:val="22"/>
+          <w:szCs w:val="22"/>
+        </w:rPr>
+        <w:t xml:space="preserve"> variability among </w:t>
+      </w:r>
+      <w:r>
+        <w:rPr>
+          <w:rFonts w:ascii="Garamond" w:hAnsi="Garamond"/>
+          <w:sz w:val="22"/>
+          <w:szCs w:val="22"/>
+        </w:rPr>
+        <w:t>time series</w:t>
+      </w:r>
+      <w:r>
+        <w:rPr>
+          <w:rFonts w:ascii="Garamond" w:hAnsi="Garamond"/>
+          <w:sz w:val="22"/>
+          <w:szCs w:val="22"/>
+        </w:rPr>
+        <w:t xml:space="preserve"> can </w:t>
+      </w:r>
+      <w:r>
+        <w:rPr>
+          <w:rFonts w:ascii="Garamond" w:hAnsi="Garamond"/>
+          <w:sz w:val="22"/>
+          <w:szCs w:val="22"/>
+        </w:rPr>
         <w:lastRenderedPageBreak/>
-        <w:t xml:space="preserve">Principal component analysis (PCA) was applied </w:t>
-      </w:r>
-      <w:r>
-        <w:rPr>
-          <w:rFonts w:ascii="Garamond" w:hAnsi="Garamond"/>
-          <w:sz w:val="22"/>
-          <w:szCs w:val="22"/>
-        </w:rPr>
-        <w:t xml:space="preserve">to </w:t>
-      </w:r>
-      <w:r>
-        <w:rPr>
-          <w:rFonts w:ascii="Garamond" w:hAnsi="Garamond"/>
-          <w:sz w:val="22"/>
-          <w:szCs w:val="22"/>
-        </w:rPr>
-        <w:t xml:space="preserve">all </w:t>
-      </w:r>
-      <w:r>
-        <w:rPr>
-          <w:rFonts w:ascii="Garamond" w:hAnsi="Garamond"/>
-          <w:sz w:val="22"/>
-          <w:szCs w:val="22"/>
-        </w:rPr>
-        <w:t>timeseries</w:t>
-      </w:r>
-      <w:r>
-        <w:rPr>
-          <w:rFonts w:ascii="Garamond" w:hAnsi="Garamond"/>
-          <w:sz w:val="22"/>
-          <w:szCs w:val="22"/>
-        </w:rPr>
-        <w:t xml:space="preserve"> from </w:t>
-      </w:r>
-      <w:r>
-        <w:rPr>
-          <w:rFonts w:ascii="Garamond" w:hAnsi="Garamond"/>
-          <w:sz w:val="22"/>
-          <w:szCs w:val="22"/>
-        </w:rPr>
-        <w:t>the</w:t>
-      </w:r>
-      <w:r>
-        <w:rPr>
-          <w:rFonts w:ascii="Garamond" w:hAnsi="Garamond"/>
-          <w:sz w:val="22"/>
-          <w:szCs w:val="22"/>
-        </w:rPr>
-        <w:t xml:space="preserve"> dataset in the</w:t>
-      </w:r>
-      <w:r>
-        <w:rPr>
-          <w:rFonts w:ascii="Garamond" w:hAnsi="Garamond"/>
-          <w:sz w:val="22"/>
-          <w:szCs w:val="22"/>
-        </w:rPr>
-        <w:t xml:space="preserve"> top-performing model</w:t>
-      </w:r>
-      <w:r>
-        <w:rPr>
-          <w:rFonts w:ascii="Garamond" w:hAnsi="Garamond"/>
-          <w:sz w:val="22"/>
-          <w:szCs w:val="22"/>
-        </w:rPr>
-        <w:t xml:space="preserve"> (GAM smoothed data)</w:t>
-      </w:r>
-      <w:r>
-        <w:rPr>
-          <w:rFonts w:ascii="Garamond" w:hAnsi="Garamond"/>
-          <w:sz w:val="22"/>
-          <w:szCs w:val="22"/>
-        </w:rPr>
-        <w:t xml:space="preserve"> to qualitatively assess clustering patterns in multivariate space</w:t>
-      </w:r>
-      <w:r>
-        <w:rPr>
-          <w:rFonts w:ascii="Garamond" w:hAnsi="Garamond"/>
-          <w:sz w:val="22"/>
-          <w:szCs w:val="22"/>
-        </w:rPr>
-        <w:t xml:space="preserve"> (</w:t>
-      </w:r>
-      <w:commentRangeStart w:id="7"/>
-      <w:r>
-        <w:rPr>
-          <w:rFonts w:ascii="Garamond" w:hAnsi="Garamond"/>
-          <w:sz w:val="22"/>
-          <w:szCs w:val="22"/>
-        </w:rPr>
-        <w:t>Figure</w:t>
-      </w:r>
-      <w:commentRangeEnd w:id="7"/>
-      <w:r>
-        <w:rPr>
-          <w:rStyle w:val="CommentReference"/>
-        </w:rPr>
-        <w:commentReference w:id="7"/>
-      </w:r>
-      <w:r>
-        <w:rPr>
-          <w:rFonts w:ascii="Garamond" w:hAnsi="Garamond"/>
-          <w:sz w:val="22"/>
-          <w:szCs w:val="22"/>
-        </w:rPr>
-        <w:t xml:space="preserve"> </w:t>
-      </w:r>
-      <w:r>
-        <w:rPr>
-          <w:rFonts w:ascii="Garamond" w:hAnsi="Garamond"/>
-          <w:sz w:val="22"/>
-          <w:szCs w:val="22"/>
-        </w:rPr>
-        <w:t>2</w:t>
-      </w:r>
-      <w:r>
-        <w:rPr>
-          <w:rFonts w:ascii="Garamond" w:hAnsi="Garamond"/>
-          <w:sz w:val="22"/>
-          <w:szCs w:val="22"/>
-        </w:rPr>
-        <w:t>)</w:t>
-      </w:r>
-      <w:r>
-        <w:rPr>
-          <w:rFonts w:ascii="Garamond" w:hAnsi="Garamond"/>
-          <w:sz w:val="22"/>
-          <w:szCs w:val="22"/>
-        </w:rPr>
-        <w:t xml:space="preserve"> PCA transforms the original </w:t>
-      </w:r>
-      <w:r>
-        <w:rPr>
-          <w:rFonts w:ascii="Garamond" w:hAnsi="Garamond"/>
-          <w:sz w:val="22"/>
-          <w:szCs w:val="22"/>
-        </w:rPr>
-        <w:t>time</w:t>
-      </w:r>
-      <w:r>
-        <w:rPr>
-          <w:rFonts w:ascii="Garamond" w:hAnsi="Garamond"/>
-          <w:sz w:val="22"/>
-          <w:szCs w:val="22"/>
-        </w:rPr>
-        <w:t xml:space="preserve"> </w:t>
-      </w:r>
-      <w:r>
-        <w:rPr>
-          <w:rFonts w:ascii="Garamond" w:hAnsi="Garamond"/>
-          <w:sz w:val="22"/>
-          <w:szCs w:val="22"/>
-        </w:rPr>
-        <w:t xml:space="preserve">series </w:t>
-      </w:r>
-      <w:r>
-        <w:rPr>
-          <w:rFonts w:ascii="Garamond" w:hAnsi="Garamond"/>
-          <w:sz w:val="22"/>
-          <w:szCs w:val="22"/>
-        </w:rPr>
-        <w:t xml:space="preserve">into uncorrelated principal components that capture the greatest variance in the dataset, thereby highlighting variability among </w:t>
-      </w:r>
-      <w:r>
-        <w:rPr>
-          <w:rFonts w:ascii="Garamond" w:hAnsi="Garamond"/>
-          <w:sz w:val="22"/>
-          <w:szCs w:val="22"/>
-        </w:rPr>
-        <w:t>time series</w:t>
-      </w:r>
-      <w:r>
-        <w:rPr>
-          <w:rFonts w:ascii="Garamond" w:hAnsi="Garamond"/>
-          <w:sz w:val="22"/>
-          <w:szCs w:val="22"/>
-        </w:rPr>
-        <w:t xml:space="preserve"> that may contain distinguishing watershed characteristics</w:t>
-      </w:r>
-      <w:r>
-        <w:rPr>
-          <w:rFonts w:ascii="Garamond" w:hAnsi="Garamond"/>
-          <w:sz w:val="22"/>
-          <w:szCs w:val="22"/>
-        </w:rPr>
-        <w:t xml:space="preserve">. </w:t>
-      </w:r>
-      <w:r>
-        <w:rPr>
-          <w:rFonts w:ascii="Garamond" w:hAnsi="Garamond"/>
-          <w:sz w:val="22"/>
-          <w:szCs w:val="22"/>
-        </w:rPr>
-        <w:t>To further illustrate how</w:t>
-      </w:r>
-      <w:r>
-        <w:rPr>
-          <w:rFonts w:ascii="Garamond" w:hAnsi="Garamond"/>
-          <w:sz w:val="22"/>
-          <w:szCs w:val="22"/>
-        </w:rPr>
-        <w:t xml:space="preserve"> this</w:t>
-      </w:r>
-      <w:r>
-        <w:rPr>
-          <w:rFonts w:ascii="Garamond" w:hAnsi="Garamond"/>
-          <w:sz w:val="22"/>
-          <w:szCs w:val="22"/>
-        </w:rPr>
-        <w:t xml:space="preserve"> variability among </w:t>
-      </w:r>
-      <w:r>
-        <w:rPr>
-          <w:rFonts w:ascii="Garamond" w:hAnsi="Garamond"/>
-          <w:sz w:val="22"/>
-          <w:szCs w:val="22"/>
-        </w:rPr>
-        <w:t>time series</w:t>
-      </w:r>
-      <w:r>
-        <w:rPr>
-          <w:rFonts w:ascii="Garamond" w:hAnsi="Garamond"/>
-          <w:sz w:val="22"/>
-          <w:szCs w:val="22"/>
-        </w:rPr>
-        <w:t xml:space="preserve"> can distinguish among </w:t>
+        <w:t xml:space="preserve">distinguish among </w:t>
       </w:r>
       <w:r>
         <w:rPr>
@@ -7422,144 +7802,152 @@
           <w:sz w:val="22"/>
           <w:szCs w:val="22"/>
         </w:rPr>
+        <w:t>excluded</w:t>
+      </w:r>
+      <w:r>
+        <w:rPr>
+          <w:rFonts w:ascii="Garamond" w:hAnsi="Garamond"/>
+          <w:sz w:val="22"/>
+          <w:szCs w:val="22"/>
+        </w:rPr>
+        <w:t xml:space="preserve">. Only the Yukon </w:t>
+      </w:r>
+      <w:r>
+        <w:rPr>
+          <w:rFonts w:ascii="Garamond" w:hAnsi="Garamond"/>
+          <w:sz w:val="22"/>
+          <w:szCs w:val="22"/>
+        </w:rPr>
+        <w:t xml:space="preserve">River </w:t>
+      </w:r>
+      <w:r>
+        <w:rPr>
+          <w:rFonts w:ascii="Garamond" w:hAnsi="Garamond"/>
+          <w:sz w:val="22"/>
+          <w:szCs w:val="22"/>
+        </w:rPr>
+        <w:t>watershed contains enriched isotope values above this threshold and</w:t>
+      </w:r>
+      <w:r>
+        <w:rPr>
+          <w:rFonts w:ascii="Garamond" w:hAnsi="Garamond"/>
+          <w:sz w:val="22"/>
+          <w:szCs w:val="22"/>
+        </w:rPr>
+        <w:t xml:space="preserve"> samples with a natal origin in this range</w:t>
+      </w:r>
+      <w:r>
+        <w:rPr>
+          <w:rFonts w:ascii="Garamond" w:hAnsi="Garamond"/>
+          <w:sz w:val="22"/>
+          <w:szCs w:val="22"/>
+        </w:rPr>
+        <w:t xml:space="preserve"> can therefore be distinguished using natal origin values alone. This modified dataset</w:t>
+      </w:r>
+      <w:r>
+        <w:rPr>
+          <w:rFonts w:ascii="Garamond" w:hAnsi="Garamond"/>
+          <w:sz w:val="22"/>
+          <w:szCs w:val="22"/>
+        </w:rPr>
+        <w:t xml:space="preserve">, </w:t>
+      </w:r>
+      <w:r>
+        <w:rPr>
+          <w:rFonts w:ascii="Garamond" w:hAnsi="Garamond"/>
+          <w:sz w:val="22"/>
+          <w:szCs w:val="22"/>
+        </w:rPr>
+        <w:t>hereby</w:t>
+      </w:r>
+      <w:r>
+        <w:rPr>
+          <w:rFonts w:ascii="Garamond" w:hAnsi="Garamond"/>
+          <w:sz w:val="22"/>
+          <w:szCs w:val="22"/>
+        </w:rPr>
+        <w:t xml:space="preserve"> </w:t>
+      </w:r>
+      <w:r>
+        <w:rPr>
+          <w:rFonts w:ascii="Garamond" w:hAnsi="Garamond"/>
+          <w:sz w:val="22"/>
+          <w:szCs w:val="22"/>
+        </w:rPr>
+        <w:t>referred</w:t>
+      </w:r>
+      <w:r>
+        <w:rPr>
+          <w:rFonts w:ascii="Garamond" w:hAnsi="Garamond"/>
+          <w:sz w:val="22"/>
+          <w:szCs w:val="22"/>
+        </w:rPr>
+        <w:t xml:space="preserve"> to as the “</w:t>
+      </w:r>
+      <w:r>
+        <w:rPr>
+          <w:rFonts w:ascii="Garamond" w:hAnsi="Garamond"/>
+          <w:sz w:val="22"/>
+          <w:szCs w:val="22"/>
+        </w:rPr>
+        <w:t>Restricted”</w:t>
+      </w:r>
+      <w:r>
+        <w:rPr>
+          <w:rFonts w:ascii="Garamond" w:hAnsi="Garamond"/>
+          <w:sz w:val="22"/>
+          <w:szCs w:val="22"/>
+        </w:rPr>
+        <w:t xml:space="preserve"> testing set evaluates the ability of the model to correctly classify </w:t>
+      </w:r>
+      <w:r>
+        <w:rPr>
+          <w:rFonts w:ascii="Garamond" w:hAnsi="Garamond"/>
+          <w:sz w:val="22"/>
+          <w:szCs w:val="22"/>
+        </w:rPr>
+        <w:t>o</w:t>
+      </w:r>
+      <w:r>
+        <w:rPr>
+          <w:rFonts w:ascii="Garamond" w:hAnsi="Garamond"/>
+          <w:sz w:val="22"/>
+          <w:szCs w:val="22"/>
+        </w:rPr>
+        <w:t>nly</w:t>
+      </w:r>
+      <w:r>
+        <w:rPr>
+          <w:rFonts w:ascii="Garamond" w:hAnsi="Garamond"/>
+          <w:sz w:val="22"/>
+          <w:szCs w:val="22"/>
+        </w:rPr>
+        <w:t xml:space="preserve"> samples that are otherwise indistinguishable using natal origin values</w:t>
+      </w:r>
+      <w:r>
+        <w:rPr>
+          <w:rFonts w:ascii="Garamond" w:hAnsi="Garamond"/>
+          <w:sz w:val="22"/>
+          <w:szCs w:val="22"/>
+        </w:rPr>
+        <w:t xml:space="preserve"> alone. </w:t>
+      </w:r>
+      <w:r>
+        <w:rPr>
+          <w:rFonts w:ascii="Garamond" w:hAnsi="Garamond"/>
+          <w:sz w:val="22"/>
+          <w:szCs w:val="22"/>
+        </w:rPr>
+        <w:t xml:space="preserve">Model </w:t>
+      </w:r>
+      <w:r>
+        <w:rPr>
+          <w:rFonts w:ascii="Garamond" w:hAnsi="Garamond"/>
+          <w:sz w:val="22"/>
+          <w:szCs w:val="22"/>
+        </w:rPr>
         <w:lastRenderedPageBreak/>
-        <w:t>excluded</w:t>
-      </w:r>
-      <w:r>
-        <w:rPr>
-          <w:rFonts w:ascii="Garamond" w:hAnsi="Garamond"/>
-          <w:sz w:val="22"/>
-          <w:szCs w:val="22"/>
-        </w:rPr>
-        <w:t xml:space="preserve">. Only the Yukon </w:t>
-      </w:r>
-      <w:r>
-        <w:rPr>
-          <w:rFonts w:ascii="Garamond" w:hAnsi="Garamond"/>
-          <w:sz w:val="22"/>
-          <w:szCs w:val="22"/>
-        </w:rPr>
-        <w:t xml:space="preserve">River </w:t>
-      </w:r>
-      <w:r>
-        <w:rPr>
-          <w:rFonts w:ascii="Garamond" w:hAnsi="Garamond"/>
-          <w:sz w:val="22"/>
-          <w:szCs w:val="22"/>
-        </w:rPr>
-        <w:t>watershed contains enriched isotope values above this threshold and</w:t>
-      </w:r>
-      <w:r>
-        <w:rPr>
-          <w:rFonts w:ascii="Garamond" w:hAnsi="Garamond"/>
-          <w:sz w:val="22"/>
-          <w:szCs w:val="22"/>
-        </w:rPr>
-        <w:t xml:space="preserve"> samples with a natal origin in this range</w:t>
-      </w:r>
-      <w:r>
-        <w:rPr>
-          <w:rFonts w:ascii="Garamond" w:hAnsi="Garamond"/>
-          <w:sz w:val="22"/>
-          <w:szCs w:val="22"/>
-        </w:rPr>
-        <w:t xml:space="preserve"> can therefore be distinguished using natal origin values alone. This modified dataset</w:t>
-      </w:r>
-      <w:r>
-        <w:rPr>
-          <w:rFonts w:ascii="Garamond" w:hAnsi="Garamond"/>
-          <w:sz w:val="22"/>
-          <w:szCs w:val="22"/>
-        </w:rPr>
-        <w:t xml:space="preserve">, </w:t>
-      </w:r>
-      <w:r>
-        <w:rPr>
-          <w:rFonts w:ascii="Garamond" w:hAnsi="Garamond"/>
-          <w:sz w:val="22"/>
-          <w:szCs w:val="22"/>
-        </w:rPr>
-        <w:t>hereby</w:t>
-      </w:r>
-      <w:r>
-        <w:rPr>
-          <w:rFonts w:ascii="Garamond" w:hAnsi="Garamond"/>
-          <w:sz w:val="22"/>
-          <w:szCs w:val="22"/>
-        </w:rPr>
-        <w:t xml:space="preserve"> </w:t>
-      </w:r>
-      <w:r>
-        <w:rPr>
-          <w:rFonts w:ascii="Garamond" w:hAnsi="Garamond"/>
-          <w:sz w:val="22"/>
-          <w:szCs w:val="22"/>
-        </w:rPr>
-        <w:t>referred</w:t>
-      </w:r>
-      <w:r>
-        <w:rPr>
-          <w:rFonts w:ascii="Garamond" w:hAnsi="Garamond"/>
-          <w:sz w:val="22"/>
-          <w:szCs w:val="22"/>
-        </w:rPr>
-        <w:t xml:space="preserve"> to as the “</w:t>
-      </w:r>
-      <w:r>
-        <w:rPr>
-          <w:rFonts w:ascii="Garamond" w:hAnsi="Garamond"/>
-          <w:sz w:val="22"/>
-          <w:szCs w:val="22"/>
-        </w:rPr>
-        <w:t>Restricted”</w:t>
-      </w:r>
-      <w:r>
-        <w:rPr>
-          <w:rFonts w:ascii="Garamond" w:hAnsi="Garamond"/>
-          <w:sz w:val="22"/>
-          <w:szCs w:val="22"/>
-        </w:rPr>
-        <w:t xml:space="preserve"> testing set evaluates the ability of the model to correctly classify </w:t>
-      </w:r>
-      <w:r>
-        <w:rPr>
-          <w:rFonts w:ascii="Garamond" w:hAnsi="Garamond"/>
-          <w:sz w:val="22"/>
-          <w:szCs w:val="22"/>
-        </w:rPr>
-        <w:t>o</w:t>
-      </w:r>
-      <w:r>
-        <w:rPr>
-          <w:rFonts w:ascii="Garamond" w:hAnsi="Garamond"/>
-          <w:sz w:val="22"/>
-          <w:szCs w:val="22"/>
-        </w:rPr>
-        <w:t>nly</w:t>
-      </w:r>
-      <w:r>
-        <w:rPr>
-          <w:rFonts w:ascii="Garamond" w:hAnsi="Garamond"/>
-          <w:sz w:val="22"/>
-          <w:szCs w:val="22"/>
-        </w:rPr>
-        <w:t xml:space="preserve"> samples that are otherwise indistinguishable using natal origin values</w:t>
-      </w:r>
-      <w:r>
-        <w:rPr>
-          <w:rFonts w:ascii="Garamond" w:hAnsi="Garamond"/>
-          <w:sz w:val="22"/>
-          <w:szCs w:val="22"/>
-        </w:rPr>
-        <w:t xml:space="preserve"> alone. </w:t>
-      </w:r>
-      <w:r>
-        <w:rPr>
-          <w:rFonts w:ascii="Garamond" w:hAnsi="Garamond"/>
-          <w:sz w:val="22"/>
-          <w:szCs w:val="22"/>
-        </w:rPr>
-        <w:t xml:space="preserve">Model performance was assessed using </w:t>
+        <w:t xml:space="preserve">performance was assessed using </w:t>
       </w:r>
       <w:r>
         <w:rPr>
@@ -8236,16 +8624,7 @@
           <w:sz w:val="22"/>
           <w:szCs w:val="22"/>
         </w:rPr>
-        <w:t xml:space="preserve">To be treated as true confidence values, we should expect that the observed proportion of individuals belonging to a given class aligns with the model’s </w:t>
-      </w:r>
-      <w:r>
-        <w:rPr>
-          <w:rFonts w:ascii="Garamond" w:hAnsi="Garamond"/>
-          <w:sz w:val="22"/>
-          <w:szCs w:val="22"/>
-        </w:rPr>
-        <w:lastRenderedPageBreak/>
-        <w:t xml:space="preserve">assigned probability for that class. For example, if </w:t>
+        <w:t xml:space="preserve">To be treated as true confidence values, we should expect that the observed proportion of individuals belonging to a given class aligns with the model’s assigned probability for that class. For example, if </w:t>
       </w:r>
       <w:r>
         <w:rPr>
@@ -8352,7 +8731,16 @@
           <w:sz w:val="22"/>
           <w:szCs w:val="22"/>
         </w:rPr>
-        <w:t xml:space="preserve"> or propagation of uncertainty through further probability-based models. To calibrate predictions from our models, we used the </w:t>
+        <w:t xml:space="preserve"> or propagation of </w:t>
+      </w:r>
+      <w:r>
+        <w:rPr>
+          <w:rFonts w:ascii="Garamond" w:hAnsi="Garamond"/>
+          <w:sz w:val="22"/>
+          <w:szCs w:val="22"/>
+        </w:rPr>
+        <w:lastRenderedPageBreak/>
+        <w:t xml:space="preserve">uncertainty through further probability-based models. To calibrate predictions from our models, we used the </w:t>
       </w:r>
       <w:r>
         <w:rPr>
@@ -8982,7 +9370,6 @@
           <w:sz w:val="22"/>
           <w:szCs w:val="22"/>
         </w:rPr>
-        <w:lastRenderedPageBreak/>
         <w:t xml:space="preserve">The pattern observed in the full dataset was also found among only individuals with the same natal origin value (0.7080 – 0.7085). The PCA results on this subset also displayed clustering by watershed, with a larger </w:t>
       </w:r>
       <w:commentRangeStart w:id="16"/>
@@ -9023,7 +9410,16 @@
           <w:sz w:val="22"/>
           <w:szCs w:val="22"/>
         </w:rPr>
-        <w:t xml:space="preserve">Mapping the loadings of each principal component onto the </w:t>
+        <w:t xml:space="preserve">Mapping the loadings of </w:t>
+      </w:r>
+      <w:r>
+        <w:rPr>
+          <w:rFonts w:ascii="Garamond" w:hAnsi="Garamond"/>
+          <w:sz w:val="22"/>
+          <w:szCs w:val="22"/>
+        </w:rPr>
+        <w:lastRenderedPageBreak/>
+        <w:t xml:space="preserve">each principal component onto the </w:t>
       </w:r>
       <w:r>
         <w:rPr>
@@ -9784,7 +10180,87 @@
           <w:sz w:val="22"/>
           <w:szCs w:val="22"/>
         </w:rPr>
-        <w:t xml:space="preserve">In general, RF analysis outperformed both KNN and SVM, however, SVM was the </w:t>
+        <w:t xml:space="preserve">In general, RF analysis outperformed both KNN and SVM, however, SVM was the highest performer on </w:t>
+      </w:r>
+      <w:r>
+        <w:rPr>
+          <w:rFonts w:ascii="Garamond" w:hAnsi="Garamond"/>
+          <w:sz w:val="22"/>
+          <w:szCs w:val="22"/>
+        </w:rPr>
+        <w:t>r</w:t>
+      </w:r>
+      <w:r>
+        <w:rPr>
+          <w:rFonts w:ascii="Garamond" w:hAnsi="Garamond"/>
+          <w:sz w:val="22"/>
+          <w:szCs w:val="22"/>
+        </w:rPr>
+        <w:t xml:space="preserve">aw datasets (89.8% accuracy on total testing set and 87.0% on </w:t>
+      </w:r>
+      <w:r>
+        <w:rPr>
+          <w:rFonts w:ascii="Garamond" w:hAnsi="Garamond"/>
+          <w:sz w:val="22"/>
+          <w:szCs w:val="22"/>
+        </w:rPr>
+        <w:t xml:space="preserve">restricted </w:t>
+      </w:r>
+      <w:r>
+        <w:rPr>
+          <w:rFonts w:ascii="Garamond" w:hAnsi="Garamond"/>
+          <w:sz w:val="22"/>
+          <w:szCs w:val="22"/>
+        </w:rPr>
+        <w:t>testing set)</w:t>
+      </w:r>
+      <w:r>
+        <w:rPr>
+          <w:rFonts w:ascii="Garamond" w:hAnsi="Garamond"/>
+          <w:sz w:val="22"/>
+          <w:szCs w:val="22"/>
+        </w:rPr>
+        <w:t xml:space="preserve">, which may have more dimensionality due to less autocorrelation among points. </w:t>
+      </w:r>
+      <w:r>
+        <w:rPr>
+          <w:rFonts w:ascii="Garamond" w:hAnsi="Garamond"/>
+          <w:sz w:val="22"/>
+          <w:szCs w:val="22"/>
+        </w:rPr>
+        <w:t xml:space="preserve">Unsurprisingly, the </w:t>
+      </w:r>
+      <w:r>
+        <w:rPr>
+          <w:rFonts w:ascii="Garamond" w:hAnsi="Garamond"/>
+          <w:sz w:val="22"/>
+          <w:szCs w:val="22"/>
+        </w:rPr>
+        <w:t>restricted</w:t>
+      </w:r>
+      <w:r>
+        <w:rPr>
+          <w:rFonts w:ascii="Garamond" w:hAnsi="Garamond"/>
+          <w:sz w:val="22"/>
+          <w:szCs w:val="22"/>
+        </w:rPr>
+        <w:t xml:space="preserve"> t</w:t>
+      </w:r>
+      <w:r>
+        <w:rPr>
+          <w:rFonts w:ascii="Garamond" w:hAnsi="Garamond"/>
+          <w:sz w:val="22"/>
+          <w:szCs w:val="22"/>
+        </w:rPr>
+        <w:t>esting</w:t>
+      </w:r>
+      <w:r>
+        <w:rPr>
+          <w:rFonts w:ascii="Garamond" w:hAnsi="Garamond"/>
+          <w:sz w:val="22"/>
+          <w:szCs w:val="22"/>
+        </w:rPr>
+        <w:t xml:space="preserve"> set performance was slightly lower than that of the total training set, with the highest classification </w:t>
       </w:r>
       <w:r>
         <w:rPr>
@@ -9793,87 +10269,7 @@
           <w:szCs w:val="22"/>
         </w:rPr>
         <w:lastRenderedPageBreak/>
-        <w:t xml:space="preserve">highest performer on </w:t>
-      </w:r>
-      <w:r>
-        <w:rPr>
-          <w:rFonts w:ascii="Garamond" w:hAnsi="Garamond"/>
-          <w:sz w:val="22"/>
-          <w:szCs w:val="22"/>
-        </w:rPr>
-        <w:t>r</w:t>
-      </w:r>
-      <w:r>
-        <w:rPr>
-          <w:rFonts w:ascii="Garamond" w:hAnsi="Garamond"/>
-          <w:sz w:val="22"/>
-          <w:szCs w:val="22"/>
-        </w:rPr>
-        <w:t xml:space="preserve">aw datasets (89.8% accuracy on total testing set and 87.0% on </w:t>
-      </w:r>
-      <w:r>
-        <w:rPr>
-          <w:rFonts w:ascii="Garamond" w:hAnsi="Garamond"/>
-          <w:sz w:val="22"/>
-          <w:szCs w:val="22"/>
-        </w:rPr>
-        <w:t xml:space="preserve">restricted </w:t>
-      </w:r>
-      <w:r>
-        <w:rPr>
-          <w:rFonts w:ascii="Garamond" w:hAnsi="Garamond"/>
-          <w:sz w:val="22"/>
-          <w:szCs w:val="22"/>
-        </w:rPr>
-        <w:t>testing set)</w:t>
-      </w:r>
-      <w:r>
-        <w:rPr>
-          <w:rFonts w:ascii="Garamond" w:hAnsi="Garamond"/>
-          <w:sz w:val="22"/>
-          <w:szCs w:val="22"/>
-        </w:rPr>
-        <w:t xml:space="preserve">, which may have more dimensionality due to less autocorrelation among points. </w:t>
-      </w:r>
-      <w:r>
-        <w:rPr>
-          <w:rFonts w:ascii="Garamond" w:hAnsi="Garamond"/>
-          <w:sz w:val="22"/>
-          <w:szCs w:val="22"/>
-        </w:rPr>
-        <w:t xml:space="preserve">Unsurprisingly, the </w:t>
-      </w:r>
-      <w:r>
-        <w:rPr>
-          <w:rFonts w:ascii="Garamond" w:hAnsi="Garamond"/>
-          <w:sz w:val="22"/>
-          <w:szCs w:val="22"/>
-        </w:rPr>
-        <w:t>restricted</w:t>
-      </w:r>
-      <w:r>
-        <w:rPr>
-          <w:rFonts w:ascii="Garamond" w:hAnsi="Garamond"/>
-          <w:sz w:val="22"/>
-          <w:szCs w:val="22"/>
-        </w:rPr>
-        <w:t xml:space="preserve"> t</w:t>
-      </w:r>
-      <w:r>
-        <w:rPr>
-          <w:rFonts w:ascii="Garamond" w:hAnsi="Garamond"/>
-          <w:sz w:val="22"/>
-          <w:szCs w:val="22"/>
-        </w:rPr>
-        <w:t>esting</w:t>
-      </w:r>
-      <w:r>
-        <w:rPr>
-          <w:rFonts w:ascii="Garamond" w:hAnsi="Garamond"/>
-          <w:sz w:val="22"/>
-          <w:szCs w:val="22"/>
-        </w:rPr>
-        <w:t xml:space="preserve"> set performance was slightly lower than that of the total training set, with the highest classification accuracy of 90.</w:t>
+        <w:t>accuracy of 90.</w:t>
       </w:r>
       <w:r>
         <w:rPr>
@@ -10298,7 +10694,143 @@
           <w:sz w:val="22"/>
           <w:szCs w:val="22"/>
         </w:rPr>
-        <w:t xml:space="preserve"> Visual assessments indicated improved calibration, with the relationship between predicted and observed </w:t>
+        <w:t xml:space="preserve"> Visual assessments indicated improved calibration, with the relationship between predicted and observed probabilities approximating a 1:1 line across all classes and model–data type combinations</w:t>
+      </w:r>
+      <w:r>
+        <w:rPr>
+          <w:rFonts w:ascii="Garamond" w:hAnsi="Garamond"/>
+          <w:sz w:val="22"/>
+          <w:szCs w:val="22"/>
+        </w:rPr>
+        <w:t xml:space="preserve"> (ex. </w:t>
+      </w:r>
+      <w:commentRangeStart w:id="20"/>
+      <w:r>
+        <w:rPr>
+          <w:rFonts w:ascii="Garamond" w:hAnsi="Garamond"/>
+          <w:sz w:val="22"/>
+          <w:szCs w:val="22"/>
+        </w:rPr>
+        <w:t>Supp</w:t>
+      </w:r>
+      <w:commentRangeEnd w:id="20"/>
+      <w:r>
+        <w:rPr>
+          <w:rStyle w:val="CommentReference"/>
+        </w:rPr>
+        <w:commentReference w:id="20"/>
+      </w:r>
+      <w:r>
+        <w:rPr>
+          <w:rFonts w:ascii="Garamond" w:hAnsi="Garamond"/>
+          <w:sz w:val="22"/>
+          <w:szCs w:val="22"/>
+        </w:rPr>
+        <w:t xml:space="preserve">. Fig 1) </w:t>
+      </w:r>
+      <w:r>
+        <w:rPr>
+          <w:rFonts w:ascii="Garamond" w:hAnsi="Garamond"/>
+          <w:sz w:val="22"/>
+          <w:szCs w:val="22"/>
+        </w:rPr>
+        <w:t>.</w:t>
+      </w:r>
+      <w:r>
+        <w:rPr>
+          <w:rFonts w:ascii="Garamond" w:hAnsi="Garamond"/>
+          <w:sz w:val="22"/>
+          <w:szCs w:val="22"/>
+        </w:rPr>
+        <w:t xml:space="preserve"> </w:t>
+      </w:r>
+      <w:commentRangeStart w:id="21"/>
+      <w:r>
+        <w:rPr>
+          <w:rFonts w:ascii="Garamond" w:hAnsi="Garamond"/>
+          <w:sz w:val="22"/>
+          <w:szCs w:val="22"/>
+        </w:rPr>
+        <w:t xml:space="preserve">Across the range of tested thresholds, overall accuracy ranged from 91 – 79% for the total testing set and from 89.5% to 78% for the </w:t>
+      </w:r>
+      <w:r>
+        <w:rPr>
+          <w:rFonts w:ascii="Garamond" w:hAnsi="Garamond"/>
+          <w:sz w:val="22"/>
+          <w:szCs w:val="22"/>
+        </w:rPr>
+        <w:t>restricted</w:t>
+      </w:r>
+      <w:r>
+        <w:rPr>
+          <w:rFonts w:ascii="Garamond" w:hAnsi="Garamond"/>
+          <w:sz w:val="22"/>
+          <w:szCs w:val="22"/>
+        </w:rPr>
+        <w:t xml:space="preserve"> dataset</w:t>
+      </w:r>
+      <w:commentRangeEnd w:id="21"/>
+      <w:r>
+        <w:rPr>
+          <w:rStyle w:val="CommentReference"/>
+        </w:rPr>
+        <w:commentReference w:id="21"/>
+      </w:r>
+      <w:r>
+        <w:rPr>
+          <w:rFonts w:ascii="Garamond" w:hAnsi="Garamond"/>
+          <w:sz w:val="22"/>
+          <w:szCs w:val="22"/>
+        </w:rPr>
+        <w:t xml:space="preserve"> </w:t>
+      </w:r>
+      <w:r>
+        <w:rPr>
+          <w:rFonts w:ascii="Garamond" w:hAnsi="Garamond"/>
+          <w:sz w:val="22"/>
+          <w:szCs w:val="22"/>
+        </w:rPr>
+        <w:t xml:space="preserve">after </w:t>
+      </w:r>
+      <w:r>
+        <w:rPr>
+          <w:rFonts w:ascii="Garamond" w:hAnsi="Garamond"/>
+          <w:sz w:val="22"/>
+          <w:szCs w:val="22"/>
+        </w:rPr>
+        <w:t>calibration</w:t>
+      </w:r>
+      <w:r>
+        <w:rPr>
+          <w:rFonts w:ascii="Garamond" w:hAnsi="Garamond"/>
+          <w:sz w:val="22"/>
+          <w:szCs w:val="22"/>
+        </w:rPr>
+        <w:t xml:space="preserve"> (Figure 6)</w:t>
+      </w:r>
+      <w:r>
+        <w:rPr>
+          <w:rFonts w:ascii="Garamond" w:hAnsi="Garamond"/>
+          <w:sz w:val="22"/>
+          <w:szCs w:val="22"/>
+        </w:rPr>
+        <w:t xml:space="preserve">. In the </w:t>
+      </w:r>
+      <w:r>
+        <w:rPr>
+          <w:rFonts w:ascii="Garamond" w:hAnsi="Garamond"/>
+          <w:sz w:val="22"/>
+          <w:szCs w:val="22"/>
+        </w:rPr>
+        <w:t xml:space="preserve">complete </w:t>
+      </w:r>
+      <w:r>
+        <w:rPr>
+          <w:rFonts w:ascii="Garamond" w:hAnsi="Garamond"/>
+          <w:sz w:val="22"/>
+          <w:szCs w:val="22"/>
+        </w:rPr>
+        <w:t xml:space="preserve">dataset, Yukon </w:t>
       </w:r>
       <w:r>
         <w:rPr>
@@ -10307,143 +10839,7 @@
           <w:szCs w:val="22"/>
         </w:rPr>
         <w:lastRenderedPageBreak/>
-        <w:t>probabilities approximating a 1:1 line across all classes and model–data type combinations</w:t>
-      </w:r>
-      <w:r>
-        <w:rPr>
-          <w:rFonts w:ascii="Garamond" w:hAnsi="Garamond"/>
-          <w:sz w:val="22"/>
-          <w:szCs w:val="22"/>
-        </w:rPr>
-        <w:t xml:space="preserve"> (ex. </w:t>
-      </w:r>
-      <w:commentRangeStart w:id="20"/>
-      <w:r>
-        <w:rPr>
-          <w:rFonts w:ascii="Garamond" w:hAnsi="Garamond"/>
-          <w:sz w:val="22"/>
-          <w:szCs w:val="22"/>
-        </w:rPr>
-        <w:t>Supp</w:t>
-      </w:r>
-      <w:commentRangeEnd w:id="20"/>
-      <w:r>
-        <w:rPr>
-          <w:rStyle w:val="CommentReference"/>
-        </w:rPr>
-        <w:commentReference w:id="20"/>
-      </w:r>
-      <w:r>
-        <w:rPr>
-          <w:rFonts w:ascii="Garamond" w:hAnsi="Garamond"/>
-          <w:sz w:val="22"/>
-          <w:szCs w:val="22"/>
-        </w:rPr>
-        <w:t xml:space="preserve">. Fig 1) </w:t>
-      </w:r>
-      <w:r>
-        <w:rPr>
-          <w:rFonts w:ascii="Garamond" w:hAnsi="Garamond"/>
-          <w:sz w:val="22"/>
-          <w:szCs w:val="22"/>
-        </w:rPr>
-        <w:t>.</w:t>
-      </w:r>
-      <w:r>
-        <w:rPr>
-          <w:rFonts w:ascii="Garamond" w:hAnsi="Garamond"/>
-          <w:sz w:val="22"/>
-          <w:szCs w:val="22"/>
-        </w:rPr>
-        <w:t xml:space="preserve"> </w:t>
-      </w:r>
-      <w:commentRangeStart w:id="21"/>
-      <w:r>
-        <w:rPr>
-          <w:rFonts w:ascii="Garamond" w:hAnsi="Garamond"/>
-          <w:sz w:val="22"/>
-          <w:szCs w:val="22"/>
-        </w:rPr>
-        <w:t xml:space="preserve">Across the range of tested thresholds, overall accuracy ranged from 91 – 79% for the total testing set and from 89.5% to 78% for the </w:t>
-      </w:r>
-      <w:r>
-        <w:rPr>
-          <w:rFonts w:ascii="Garamond" w:hAnsi="Garamond"/>
-          <w:sz w:val="22"/>
-          <w:szCs w:val="22"/>
-        </w:rPr>
-        <w:t>restricted</w:t>
-      </w:r>
-      <w:r>
-        <w:rPr>
-          <w:rFonts w:ascii="Garamond" w:hAnsi="Garamond"/>
-          <w:sz w:val="22"/>
-          <w:szCs w:val="22"/>
-        </w:rPr>
-        <w:t xml:space="preserve"> dataset</w:t>
-      </w:r>
-      <w:commentRangeEnd w:id="21"/>
-      <w:r>
-        <w:rPr>
-          <w:rStyle w:val="CommentReference"/>
-        </w:rPr>
-        <w:commentReference w:id="21"/>
-      </w:r>
-      <w:r>
-        <w:rPr>
-          <w:rFonts w:ascii="Garamond" w:hAnsi="Garamond"/>
-          <w:sz w:val="22"/>
-          <w:szCs w:val="22"/>
-        </w:rPr>
-        <w:t xml:space="preserve"> </w:t>
-      </w:r>
-      <w:r>
-        <w:rPr>
-          <w:rFonts w:ascii="Garamond" w:hAnsi="Garamond"/>
-          <w:sz w:val="22"/>
-          <w:szCs w:val="22"/>
-        </w:rPr>
-        <w:t xml:space="preserve">after </w:t>
-      </w:r>
-      <w:r>
-        <w:rPr>
-          <w:rFonts w:ascii="Garamond" w:hAnsi="Garamond"/>
-          <w:sz w:val="22"/>
-          <w:szCs w:val="22"/>
-        </w:rPr>
-        <w:t>calibration</w:t>
-      </w:r>
-      <w:r>
-        <w:rPr>
-          <w:rFonts w:ascii="Garamond" w:hAnsi="Garamond"/>
-          <w:sz w:val="22"/>
-          <w:szCs w:val="22"/>
-        </w:rPr>
-        <w:t xml:space="preserve"> (Figure 6)</w:t>
-      </w:r>
-      <w:r>
-        <w:rPr>
-          <w:rFonts w:ascii="Garamond" w:hAnsi="Garamond"/>
-          <w:sz w:val="22"/>
-          <w:szCs w:val="22"/>
-        </w:rPr>
-        <w:t xml:space="preserve">. In the </w:t>
-      </w:r>
-      <w:r>
-        <w:rPr>
-          <w:rFonts w:ascii="Garamond" w:hAnsi="Garamond"/>
-          <w:sz w:val="22"/>
-          <w:szCs w:val="22"/>
-        </w:rPr>
-        <w:t xml:space="preserve">complete </w:t>
-      </w:r>
-      <w:r>
-        <w:rPr>
-          <w:rFonts w:ascii="Garamond" w:hAnsi="Garamond"/>
-          <w:sz w:val="22"/>
-          <w:szCs w:val="22"/>
-        </w:rPr>
-        <w:t xml:space="preserve">dataset, Yukon classification accuracy remained well above 90%, even at the very high (&gt;90%) confidence threshold. </w:t>
+        <w:t xml:space="preserve">classification accuracy remained well above 90%, even at the very high (&gt;90%) confidence threshold. </w:t>
       </w:r>
       <w:proofErr w:type="spellStart"/>
       <w:r>
@@ -10975,7 +11371,103 @@
           <w:sz w:val="22"/>
           <w:szCs w:val="22"/>
         </w:rPr>
-        <w:t xml:space="preserve"> 90% for all three watersheds. Most misclassifications occurred between Nushagak and </w:t>
+        <w:t xml:space="preserve"> 90% for all three watersheds. Most misclassifications occurred between Nushagak and Kuskokwim fish, consistent with expectations given the greater overlap in </w:t>
+      </w:r>
+      <w:r>
+        <w:rPr>
+          <w:rFonts w:ascii="Cambria Math" w:hAnsi="Cambria Math" w:cs="Cambria Math"/>
+          <w:sz w:val="22"/>
+          <w:szCs w:val="22"/>
+        </w:rPr>
+        <w:t>⁸⁷</w:t>
+      </w:r>
+      <w:r>
+        <w:rPr>
+          <w:rFonts w:ascii="Garamond" w:hAnsi="Garamond"/>
+          <w:sz w:val="22"/>
+          <w:szCs w:val="22"/>
+        </w:rPr>
+        <w:t>Sr/</w:t>
+      </w:r>
+      <w:r>
+        <w:rPr>
+          <w:rFonts w:ascii="Cambria Math" w:hAnsi="Cambria Math" w:cs="Cambria Math"/>
+          <w:sz w:val="22"/>
+          <w:szCs w:val="22"/>
+        </w:rPr>
+        <w:t>⁸⁶</w:t>
+      </w:r>
+      <w:r>
+        <w:rPr>
+          <w:rFonts w:ascii="Garamond" w:hAnsi="Garamond"/>
+          <w:sz w:val="22"/>
+          <w:szCs w:val="22"/>
+        </w:rPr>
+        <w:t>Sr</w:t>
+      </w:r>
+      <w:r>
+        <w:rPr>
+          <w:rFonts w:ascii="Garamond" w:hAnsi="Garamond"/>
+          <w:sz w:val="22"/>
+          <w:szCs w:val="22"/>
+        </w:rPr>
+        <w:t xml:space="preserve"> </w:t>
+      </w:r>
+      <w:r>
+        <w:rPr>
+          <w:rFonts w:ascii="Garamond" w:hAnsi="Garamond"/>
+          <w:sz w:val="22"/>
+          <w:szCs w:val="22"/>
+        </w:rPr>
+        <w:t xml:space="preserve">values </w:t>
+      </w:r>
+      <w:r>
+        <w:rPr>
+          <w:rFonts w:ascii="Garamond" w:hAnsi="Garamond"/>
+          <w:sz w:val="22"/>
+          <w:szCs w:val="22"/>
+        </w:rPr>
+        <w:t xml:space="preserve">in potential strontium sources and </w:t>
+      </w:r>
+      <w:r>
+        <w:rPr>
+          <w:rFonts w:ascii="Garamond" w:hAnsi="Garamond"/>
+          <w:sz w:val="22"/>
+          <w:szCs w:val="22"/>
+        </w:rPr>
+        <w:t xml:space="preserve">closer spatial proximity between these watersheds. In contrast, Yukon fish exhibited </w:t>
+      </w:r>
+      <w:r>
+        <w:rPr>
+          <w:rFonts w:ascii="Garamond" w:hAnsi="Garamond"/>
+          <w:sz w:val="22"/>
+          <w:szCs w:val="22"/>
+        </w:rPr>
+        <w:t xml:space="preserve">unique </w:t>
+      </w:r>
+      <w:r>
+        <w:rPr>
+          <w:rFonts w:ascii="Garamond" w:hAnsi="Garamond"/>
+          <w:sz w:val="22"/>
+          <w:szCs w:val="22"/>
+        </w:rPr>
+        <w:t>patterns</w:t>
+      </w:r>
+      <w:r>
+        <w:rPr>
+          <w:rFonts w:ascii="Garamond" w:hAnsi="Garamond"/>
+          <w:sz w:val="22"/>
+          <w:szCs w:val="22"/>
+        </w:rPr>
+        <w:t xml:space="preserve"> in otolith LA data</w:t>
+      </w:r>
+      <w:r>
+        <w:rPr>
+          <w:rFonts w:ascii="Garamond" w:hAnsi="Garamond"/>
+          <w:sz w:val="22"/>
+          <w:szCs w:val="22"/>
+        </w:rPr>
+        <w:t xml:space="preserve"> due to the watershed's extreme spatial scale, broader range of isotope </w:t>
       </w:r>
       <w:r>
         <w:rPr>
@@ -10984,103 +11476,7 @@
           <w:szCs w:val="22"/>
         </w:rPr>
         <w:lastRenderedPageBreak/>
-        <w:t xml:space="preserve">Kuskokwim fish, consistent with expectations given the greater overlap in </w:t>
-      </w:r>
-      <w:r>
-        <w:rPr>
-          <w:rFonts w:ascii="Cambria Math" w:hAnsi="Cambria Math" w:cs="Cambria Math"/>
-          <w:sz w:val="22"/>
-          <w:szCs w:val="22"/>
-        </w:rPr>
-        <w:t>⁸⁷</w:t>
-      </w:r>
-      <w:r>
-        <w:rPr>
-          <w:rFonts w:ascii="Garamond" w:hAnsi="Garamond"/>
-          <w:sz w:val="22"/>
-          <w:szCs w:val="22"/>
-        </w:rPr>
-        <w:t>Sr/</w:t>
-      </w:r>
-      <w:r>
-        <w:rPr>
-          <w:rFonts w:ascii="Cambria Math" w:hAnsi="Cambria Math" w:cs="Cambria Math"/>
-          <w:sz w:val="22"/>
-          <w:szCs w:val="22"/>
-        </w:rPr>
-        <w:t>⁸⁶</w:t>
-      </w:r>
-      <w:r>
-        <w:rPr>
-          <w:rFonts w:ascii="Garamond" w:hAnsi="Garamond"/>
-          <w:sz w:val="22"/>
-          <w:szCs w:val="22"/>
-        </w:rPr>
-        <w:t>Sr</w:t>
-      </w:r>
-      <w:r>
-        <w:rPr>
-          <w:rFonts w:ascii="Garamond" w:hAnsi="Garamond"/>
-          <w:sz w:val="22"/>
-          <w:szCs w:val="22"/>
-        </w:rPr>
-        <w:t xml:space="preserve"> </w:t>
-      </w:r>
-      <w:r>
-        <w:rPr>
-          <w:rFonts w:ascii="Garamond" w:hAnsi="Garamond"/>
-          <w:sz w:val="22"/>
-          <w:szCs w:val="22"/>
-        </w:rPr>
-        <w:t xml:space="preserve">values </w:t>
-      </w:r>
-      <w:r>
-        <w:rPr>
-          <w:rFonts w:ascii="Garamond" w:hAnsi="Garamond"/>
-          <w:sz w:val="22"/>
-          <w:szCs w:val="22"/>
-        </w:rPr>
-        <w:t xml:space="preserve">in potential strontium sources and </w:t>
-      </w:r>
-      <w:r>
-        <w:rPr>
-          <w:rFonts w:ascii="Garamond" w:hAnsi="Garamond"/>
-          <w:sz w:val="22"/>
-          <w:szCs w:val="22"/>
-        </w:rPr>
-        <w:t xml:space="preserve">closer spatial proximity between these watersheds. In contrast, Yukon fish exhibited </w:t>
-      </w:r>
-      <w:r>
-        <w:rPr>
-          <w:rFonts w:ascii="Garamond" w:hAnsi="Garamond"/>
-          <w:sz w:val="22"/>
-          <w:szCs w:val="22"/>
-        </w:rPr>
-        <w:t xml:space="preserve">unique </w:t>
-      </w:r>
-      <w:r>
-        <w:rPr>
-          <w:rFonts w:ascii="Garamond" w:hAnsi="Garamond"/>
-          <w:sz w:val="22"/>
-          <w:szCs w:val="22"/>
-        </w:rPr>
-        <w:t>patterns</w:t>
-      </w:r>
-      <w:r>
-        <w:rPr>
-          <w:rFonts w:ascii="Garamond" w:hAnsi="Garamond"/>
-          <w:sz w:val="22"/>
-          <w:szCs w:val="22"/>
-        </w:rPr>
-        <w:t xml:space="preserve"> in otolith LA data</w:t>
-      </w:r>
-      <w:r>
-        <w:rPr>
-          <w:rFonts w:ascii="Garamond" w:hAnsi="Garamond"/>
-          <w:sz w:val="22"/>
-          <w:szCs w:val="22"/>
-        </w:rPr>
-        <w:t xml:space="preserve"> due to the watershed's extreme spatial scale, broader range of isotope values, and extended migration timing</w:t>
+        <w:t>values, and extended migration timing</w:t>
       </w:r>
       <w:r>
         <w:rPr>
@@ -11784,6 +12180,7 @@
           <w:sz w:val="22"/>
           <w:szCs w:val="22"/>
         </w:rPr>
+        <w:lastRenderedPageBreak/>
         <w:t xml:space="preserve">A tool to estimate provenance of marine-caught Chinook salmon in </w:t>
       </w:r>
       <w:r>
@@ -12215,16 +12612,7 @@
           <w:sz w:val="22"/>
           <w:szCs w:val="22"/>
         </w:rPr>
-        <w:t xml:space="preserve">model uncertainty. In addition, </w:t>
-      </w:r>
-      <w:r>
-        <w:rPr>
-          <w:rFonts w:ascii="Garamond" w:hAnsi="Garamond"/>
-          <w:sz w:val="22"/>
-          <w:szCs w:val="22"/>
-        </w:rPr>
-        <w:lastRenderedPageBreak/>
-        <w:t xml:space="preserve">these values can be </w:t>
+        <w:t xml:space="preserve">model uncertainty. In addition, these values can be </w:t>
       </w:r>
       <w:r>
         <w:rPr>
@@ -12307,6 +12695,7 @@
           <w:sz w:val="22"/>
           <w:szCs w:val="22"/>
         </w:rPr>
+        <w:lastRenderedPageBreak/>
         <w:tab/>
       </w:r>
       <w:r>
@@ -12620,7 +13009,6 @@
           <w:sz w:val="22"/>
           <w:szCs w:val="22"/>
         </w:rPr>
-        <w:lastRenderedPageBreak/>
         <w:t xml:space="preserve">Acknowledgements: </w:t>
       </w:r>
     </w:p>
@@ -12640,6 +13028,7 @@
           <w:sz w:val="22"/>
           <w:szCs w:val="22"/>
         </w:rPr>
+        <w:lastRenderedPageBreak/>
         <w:t xml:space="preserve">This work is not possible without the efforts of Dr. Sean Brennan, who collected the data used in this study and worked tirelessly to </w:t>
       </w:r>
       <w:r>
@@ -14861,6 +15250,29 @@
       <w:spacing w:after="0" w:line="240" w:lineRule="auto"/>
     </w:pPr>
   </w:style>
+  <w:style w:type="character" w:styleId="Hyperlink">
+    <w:name w:val="Hyperlink"/>
+    <w:basedOn w:val="DefaultParagraphFont"/>
+    <w:uiPriority w:val="99"/>
+    <w:unhideWhenUsed/>
+    <w:rsid w:val="006D5064"/>
+    <w:rPr>
+      <w:color w:val="467886" w:themeColor="hyperlink"/>
+      <w:u w:val="single"/>
+    </w:rPr>
+  </w:style>
+  <w:style w:type="character" w:styleId="UnresolvedMention">
+    <w:name w:val="Unresolved Mention"/>
+    <w:basedOn w:val="DefaultParagraphFont"/>
+    <w:uiPriority w:val="99"/>
+    <w:semiHidden/>
+    <w:unhideWhenUsed/>
+    <w:rsid w:val="006D5064"/>
+    <w:rPr>
+      <w:color w:val="605E5C"/>
+      <w:shd w:val="clear" w:color="auto" w:fill="E1DFDD"/>
+    </w:rPr>
+  </w:style>
 </w:styles>
 </file>
 

</xml_diff>

<commit_message>
added a list of formatting to go through
</commit_message>
<xml_diff>
--- a/Docs/Machine learning applied to otolith timeseries data to discriminate river of origin for Western Alaska Salmon.docx
+++ b/Docs/Machine learning applied to otolith timeseries data to discriminate river of origin for Western Alaska Salmon.docx
@@ -4,6 +4,7 @@
   <w:body>
     <w:p>
       <w:pPr>
+        <w:spacing w:line="480" w:lineRule="auto"/>
         <w:jc w:val="center"/>
         <w:rPr>
           <w:rFonts w:ascii="Garamond" w:hAnsi="Garamond"/>
@@ -26,6 +27,26 @@
     </w:p>
     <w:p>
       <w:pPr>
+        <w:spacing w:line="480" w:lineRule="auto"/>
+        <w:jc w:val="center"/>
+        <w:rPr>
+          <w:rFonts w:ascii="Garamond" w:hAnsi="Garamond"/>
+          <w:sz w:val="36"/>
+          <w:szCs w:val="36"/>
+        </w:rPr>
+      </w:pPr>
+      <w:r>
+        <w:rPr>
+          <w:rFonts w:ascii="Garamond" w:hAnsi="Garamond"/>
+          <w:sz w:val="36"/>
+          <w:szCs w:val="36"/>
+        </w:rPr>
+        <w:t xml:space="preserve">Article </w:t>
+      </w:r>
+    </w:p>
+    <w:p>
+      <w:pPr>
+        <w:spacing w:line="480" w:lineRule="auto"/>
         <w:jc w:val="center"/>
         <w:rPr>
           <w:rFonts w:ascii="Garamond" w:hAnsi="Garamond"/>
@@ -43,12 +64,9 @@
           <w:sz w:val="36"/>
           <w:szCs w:val="36"/>
         </w:rPr>
-        <w:t xml:space="preserve">Article </w:t>
-      </w:r>
-    </w:p>
-    <w:p>
-      <w:pPr>
-        <w:jc w:val="center"/>
+        <w:t xml:space="preserve">Machine learning applied to otolith </w:t>
+      </w:r>
+      <w:r>
         <w:rPr>
           <w:rFonts w:ascii="Garamond" w:hAnsi="Garamond"/>
           <w:b/>
@@ -56,7 +74,8 @@
           <w:sz w:val="36"/>
           <w:szCs w:val="36"/>
         </w:rPr>
-      </w:pPr>
+        <w:t>microchemical</w:t>
+      </w:r>
       <w:r>
         <w:rPr>
           <w:rFonts w:ascii="Garamond" w:hAnsi="Garamond"/>
@@ -65,7 +84,7 @@
           <w:sz w:val="36"/>
           <w:szCs w:val="36"/>
         </w:rPr>
-        <w:t xml:space="preserve">Machine learning applied to otolith </w:t>
+        <w:t xml:space="preserve"> data to discriminate </w:t>
       </w:r>
       <w:r>
         <w:rPr>
@@ -75,7 +94,7 @@
           <w:sz w:val="36"/>
           <w:szCs w:val="36"/>
         </w:rPr>
-        <w:t>microchemical</w:t>
+        <w:t xml:space="preserve">stock </w:t>
       </w:r>
       <w:r>
         <w:rPr>
@@ -85,7 +104,7 @@
           <w:sz w:val="36"/>
           <w:szCs w:val="36"/>
         </w:rPr>
-        <w:t xml:space="preserve"> data to discriminate </w:t>
+        <w:t xml:space="preserve">of origin </w:t>
       </w:r>
       <w:r>
         <w:rPr>
@@ -95,31 +114,23 @@
           <w:sz w:val="36"/>
           <w:szCs w:val="36"/>
         </w:rPr>
-        <w:t xml:space="preserve">stock </w:t>
-      </w:r>
-      <w:r>
+        <w:t>in salmon</w:t>
+      </w:r>
+    </w:p>
+    <w:p>
+      <w:pPr>
+        <w:spacing w:line="480" w:lineRule="auto"/>
+        <w:jc w:val="center"/>
         <w:rPr>
           <w:rFonts w:ascii="Garamond" w:hAnsi="Garamond"/>
-          <w:b/>
-          <w:bCs/>
-          <w:sz w:val="36"/>
-          <w:szCs w:val="36"/>
-        </w:rPr>
-        <w:t xml:space="preserve">of origin </w:t>
-      </w:r>
-      <w:r>
-        <w:rPr>
-          <w:rFonts w:ascii="Garamond" w:hAnsi="Garamond"/>
-          <w:b/>
-          <w:bCs/>
-          <w:sz w:val="36"/>
-          <w:szCs w:val="36"/>
-        </w:rPr>
-        <w:t>in salmon</w:t>
-      </w:r>
-    </w:p>
-    <w:p>
-      <w:pPr>
+          <w:sz w:val="28"/>
+          <w:szCs w:val="28"/>
+        </w:rPr>
+      </w:pPr>
+    </w:p>
+    <w:p>
+      <w:pPr>
+        <w:spacing w:line="480" w:lineRule="auto"/>
         <w:jc w:val="center"/>
         <w:rPr>
           <w:rFonts w:ascii="Garamond" w:hAnsi="Garamond"/>
@@ -224,7 +235,7 @@
     </w:p>
     <w:p>
       <w:pPr>
-        <w:spacing w:line="240" w:lineRule="auto"/>
+        <w:spacing w:line="480" w:lineRule="auto"/>
         <w:jc w:val="center"/>
         <w:rPr>
           <w:rFonts w:ascii="Garamond" w:hAnsi="Garamond"/>
@@ -258,7 +269,7 @@
     </w:p>
     <w:p>
       <w:pPr>
-        <w:spacing w:line="240" w:lineRule="auto"/>
+        <w:spacing w:line="480" w:lineRule="auto"/>
         <w:jc w:val="center"/>
         <w:rPr>
           <w:rFonts w:ascii="Garamond" w:hAnsi="Garamond"/>
@@ -287,7 +298,29 @@
           <w:sz w:val="20"/>
           <w:szCs w:val="20"/>
         </w:rPr>
-        <w:t>School of Computer Science , University of Washington, Seattle, Washington, 98195 USA</w:t>
+        <w:t xml:space="preserve">School of Computer </w:t>
+      </w:r>
+      <w:proofErr w:type="gramStart"/>
+      <w:r>
+        <w:rPr>
+          <w:rFonts w:ascii="Garamond" w:hAnsi="Garamond"/>
+          <w:i/>
+          <w:iCs/>
+          <w:sz w:val="20"/>
+          <w:szCs w:val="20"/>
+        </w:rPr>
+        <w:t>Science ,</w:t>
+      </w:r>
+      <w:proofErr w:type="gramEnd"/>
+      <w:r>
+        <w:rPr>
+          <w:rFonts w:ascii="Garamond" w:hAnsi="Garamond"/>
+          <w:i/>
+          <w:iCs/>
+          <w:sz w:val="20"/>
+          <w:szCs w:val="20"/>
+        </w:rPr>
+        <w:t xml:space="preserve"> University of Washington, Seattle, Washington, 98195 USA</w:t>
       </w:r>
     </w:p>
     <w:p>
@@ -447,41 +480,6 @@
     <w:p>
       <w:pPr>
         <w:spacing w:line="480" w:lineRule="auto"/>
-        <w:jc w:val="center"/>
-        <w:rPr>
-          <w:rFonts w:ascii="Garamond" w:hAnsi="Garamond"/>
-        </w:rPr>
-      </w:pPr>
-    </w:p>
-    <w:p>
-      <w:pPr>
-        <w:spacing w:line="480" w:lineRule="auto"/>
-        <w:jc w:val="center"/>
-        <w:rPr>
-          <w:rFonts w:ascii="Garamond" w:hAnsi="Garamond"/>
-        </w:rPr>
-      </w:pPr>
-    </w:p>
-    <w:p>
-      <w:pPr>
-        <w:spacing w:line="480" w:lineRule="auto"/>
-        <w:jc w:val="center"/>
-        <w:rPr>
-          <w:rFonts w:ascii="Garamond" w:hAnsi="Garamond"/>
-        </w:rPr>
-      </w:pPr>
-    </w:p>
-    <w:p>
-      <w:pPr>
-        <w:spacing w:line="480" w:lineRule="auto"/>
-        <w:rPr>
-          <w:rFonts w:ascii="Garamond" w:hAnsi="Garamond"/>
-        </w:rPr>
-      </w:pPr>
-    </w:p>
-    <w:p>
-      <w:pPr>
-        <w:spacing w:line="480" w:lineRule="auto"/>
         <w:rPr>
           <w:rFonts w:ascii="Garamond" w:hAnsi="Garamond"/>
         </w:rPr>
@@ -3303,7 +3301,21 @@
         <w:rPr>
           <w:rFonts w:ascii="Times New Roman" w:hAnsi="Times New Roman" w:cs="Times New Roman"/>
         </w:rPr>
-        <w:t xml:space="preserve"> analyzed using Laser Ablation Inductively Coupled Plasma Mass Spectrometry (LA-ICP-MS) at the University of Utah Strontium Metals Lab, with the exception of 2022 Kuskokwim samples</w:t>
+        <w:t xml:space="preserve"> analyzed using Laser Ablation Inductively Coupled Plasma Mass Spectrometry (LA-ICP-MS) at the University of Utah Strontium Metals Lab, </w:t>
+      </w:r>
+      <w:proofErr w:type="gramStart"/>
+      <w:r>
+        <w:rPr>
+          <w:rFonts w:ascii="Times New Roman" w:hAnsi="Times New Roman" w:cs="Times New Roman"/>
+        </w:rPr>
+        <w:t>with the exception of</w:t>
+      </w:r>
+      <w:proofErr w:type="gramEnd"/>
+      <w:r>
+        <w:rPr>
+          <w:rFonts w:ascii="Times New Roman" w:hAnsi="Times New Roman" w:cs="Times New Roman"/>
+        </w:rPr>
+        <w:t xml:space="preserve"> 2022 Kuskokwim samples</w:t>
       </w:r>
       <w:r>
         <w:rPr>
@@ -3521,7 +3533,21 @@
         <w:rPr>
           <w:rFonts w:ascii="Times New Roman" w:hAnsi="Times New Roman" w:cs="Times New Roman"/>
         </w:rPr>
-        <w:t xml:space="preserve">. Each individual with available genetic data was </w:t>
+        <w:t xml:space="preserve">. </w:t>
+      </w:r>
+      <w:proofErr w:type="gramStart"/>
+      <w:r>
+        <w:rPr>
+          <w:rFonts w:ascii="Times New Roman" w:hAnsi="Times New Roman" w:cs="Times New Roman"/>
+        </w:rPr>
+        <w:t>Each individual</w:t>
+      </w:r>
+      <w:proofErr w:type="gramEnd"/>
+      <w:r>
+        <w:rPr>
+          <w:rFonts w:ascii="Times New Roman" w:hAnsi="Times New Roman" w:cs="Times New Roman"/>
+        </w:rPr>
+        <w:t xml:space="preserve"> with available genetic data was </w:t>
       </w:r>
       <w:r>
         <w:rPr>
@@ -3749,7 +3775,21 @@
         <w:rPr>
           <w:rFonts w:ascii="Times New Roman" w:hAnsi="Times New Roman" w:cs="Times New Roman"/>
         </w:rPr>
-        <w:t>the start of the laser ablation transect and quality of the core signal varied among samples and years. T</w:t>
+        <w:t xml:space="preserve">the start of the laser ablation </w:t>
+      </w:r>
+      <w:proofErr w:type="gramStart"/>
+      <w:r>
+        <w:rPr>
+          <w:rFonts w:ascii="Times New Roman" w:hAnsi="Times New Roman" w:cs="Times New Roman"/>
+        </w:rPr>
+        <w:t>transect</w:t>
+      </w:r>
+      <w:proofErr w:type="gramEnd"/>
+      <w:r>
+        <w:rPr>
+          <w:rFonts w:ascii="Times New Roman" w:hAnsi="Times New Roman" w:cs="Times New Roman"/>
+        </w:rPr>
+        <w:t xml:space="preserve"> and quality of the core signal varied among samples and years. T</w:t>
       </w:r>
       <w:r>
         <w:rPr>
@@ -4216,8 +4256,16 @@
         <w:rPr>
           <w:rFonts w:ascii="Times New Roman" w:hAnsi="Times New Roman" w:cs="Times New Roman"/>
         </w:rPr>
-        <w:t>for each individual</w:t>
-      </w:r>
+        <w:t xml:space="preserve">for </w:t>
+      </w:r>
+      <w:proofErr w:type="gramStart"/>
+      <w:r>
+        <w:rPr>
+          <w:rFonts w:ascii="Times New Roman" w:hAnsi="Times New Roman" w:cs="Times New Roman"/>
+        </w:rPr>
+        <w:t>each individual</w:t>
+      </w:r>
+      <w:proofErr w:type="gramEnd"/>
       <w:r>
         <w:rPr>
           <w:rFonts w:ascii="Times New Roman" w:hAnsi="Times New Roman" w:cs="Times New Roman"/>
@@ -6027,20 +6075,28 @@
         <w:rPr>
           <w:rFonts w:ascii="Times New Roman" w:hAnsi="Times New Roman" w:cs="Times New Roman"/>
         </w:rPr>
-        <w:t xml:space="preserve"> (</w:t>
-      </w:r>
-      <w:r>
-        <w:rPr>
-          <w:rFonts w:ascii="Times New Roman" w:hAnsi="Times New Roman" w:cs="Times New Roman"/>
-        </w:rPr>
         <w:t xml:space="preserve"> </w:t>
       </w:r>
+      <w:proofErr w:type="gramStart"/>
+      <w:r>
+        <w:rPr>
+          <w:rFonts w:ascii="Times New Roman" w:hAnsi="Times New Roman" w:cs="Times New Roman"/>
+        </w:rPr>
+        <w:t>(</w:t>
+      </w:r>
+      <w:r>
+        <w:rPr>
+          <w:rFonts w:ascii="Times New Roman" w:hAnsi="Times New Roman" w:cs="Times New Roman"/>
+        </w:rPr>
+        <w:t xml:space="preserve"> </w:t>
+      </w:r>
       <w:r>
         <w:rPr>
           <w:rFonts w:ascii="Times New Roman" w:hAnsi="Times New Roman" w:cs="Times New Roman"/>
         </w:rPr>
         <w:t>0.714</w:t>
       </w:r>
+      <w:proofErr w:type="gramEnd"/>
       <w:r>
         <w:rPr>
           <w:rFonts w:ascii="Times New Roman" w:hAnsi="Times New Roman" w:cs="Times New Roman"/>
@@ -6053,6 +6109,7 @@
         </w:rPr>
         <w:t>0.709</w:t>
       </w:r>
+      <w:proofErr w:type="gramStart"/>
       <w:r>
         <w:rPr>
           <w:rFonts w:ascii="Times New Roman" w:hAnsi="Times New Roman" w:cs="Times New Roman"/>
@@ -6071,6 +6128,7 @@
         </w:rPr>
         <w:t xml:space="preserve"> 0.707</w:t>
       </w:r>
+      <w:proofErr w:type="gramEnd"/>
       <w:r>
         <w:rPr>
           <w:rFonts w:ascii="Times New Roman" w:hAnsi="Times New Roman" w:cs="Times New Roman"/>
@@ -6159,13 +6217,27 @@
         <w:rPr>
           <w:rFonts w:ascii="Times New Roman" w:hAnsi="Times New Roman" w:cs="Times New Roman"/>
         </w:rPr>
-        <w:t xml:space="preserve">a) </w:t>
-      </w:r>
-      <w:r>
-        <w:rPr>
-          <w:rFonts w:ascii="Times New Roman" w:hAnsi="Times New Roman" w:cs="Times New Roman"/>
-        </w:rPr>
-        <w:t xml:space="preserve">, which is expected given that all individuals in this subset have very similar natal origin values. </w:t>
+        <w:t>a</w:t>
+      </w:r>
+      <w:proofErr w:type="gramStart"/>
+      <w:r>
+        <w:rPr>
+          <w:rFonts w:ascii="Times New Roman" w:hAnsi="Times New Roman" w:cs="Times New Roman"/>
+        </w:rPr>
+        <w:t xml:space="preserve">) </w:t>
+      </w:r>
+      <w:r>
+        <w:rPr>
+          <w:rFonts w:ascii="Times New Roman" w:hAnsi="Times New Roman" w:cs="Times New Roman"/>
+        </w:rPr>
+        <w:t>,</w:t>
+      </w:r>
+      <w:proofErr w:type="gramEnd"/>
+      <w:r>
+        <w:rPr>
+          <w:rFonts w:ascii="Times New Roman" w:hAnsi="Times New Roman" w:cs="Times New Roman"/>
+        </w:rPr>
+        <w:t xml:space="preserve"> which is expected given that all individuals in this subset have very similar natal origin values. </w:t>
       </w:r>
     </w:p>
     <w:p>
@@ -6254,8 +6326,16 @@
         <w:rPr>
           <w:rFonts w:ascii="Times New Roman" w:hAnsi="Times New Roman" w:cs="Times New Roman"/>
         </w:rPr>
-        <w:t xml:space="preserve"> was</w:t>
-      </w:r>
+        <w:t xml:space="preserve"> </w:t>
+      </w:r>
+      <w:proofErr w:type="gramStart"/>
+      <w:r>
+        <w:rPr>
+          <w:rFonts w:ascii="Times New Roman" w:hAnsi="Times New Roman" w:cs="Times New Roman"/>
+        </w:rPr>
+        <w:t>was</w:t>
+      </w:r>
+      <w:proofErr w:type="gramEnd"/>
       <w:r>
         <w:rPr>
           <w:rFonts w:ascii="Times New Roman" w:hAnsi="Times New Roman" w:cs="Times New Roman"/>
@@ -6598,7 +6678,21 @@
         <w:rPr>
           <w:rFonts w:ascii="Times New Roman" w:hAnsi="Times New Roman" w:cs="Times New Roman"/>
         </w:rPr>
-        <w:t xml:space="preserve"> the most frequent misclassification was Yukon fish predicted to have been Kuskokwim (8.8% of Yukon fish), however this represented only one additional individual misclassified (9 in the total analysis vs</w:t>
+        <w:t xml:space="preserve"> the most frequent misclassification was Yukon fish predicted to have been Kuskokwim (8.8% of Yukon fish</w:t>
+      </w:r>
+      <w:proofErr w:type="gramStart"/>
+      <w:r>
+        <w:rPr>
+          <w:rFonts w:ascii="Times New Roman" w:hAnsi="Times New Roman" w:cs="Times New Roman"/>
+        </w:rPr>
+        <w:t>),</w:t>
+      </w:r>
+      <w:proofErr w:type="gramEnd"/>
+      <w:r>
+        <w:rPr>
+          <w:rFonts w:ascii="Times New Roman" w:hAnsi="Times New Roman" w:cs="Times New Roman"/>
+        </w:rPr>
+        <w:t xml:space="preserve"> however this represented only one additional individual misclassified (9 in the total analysis vs</w:t>
       </w:r>
       <w:r>
         <w:rPr>
@@ -6635,7 +6729,35 @@
         <w:rPr>
           <w:rFonts w:ascii="Times New Roman" w:hAnsi="Times New Roman" w:cs="Times New Roman"/>
         </w:rPr>
-        <w:t xml:space="preserve">Classification accuracy within the CWAK reporting group, which includes the Kuskokwim, Nushagak, and Lower Yukon regions was 90.0%. Classification accuracy for regions in our dataset not within CWAK was 97.9%. Yukon classification accuracy for those within the CWAK group fell to 73.3%. However, it should be noted that the sample size of CWAK Yukon individuals was significantly lower than other groups ( n = 29 ) , resulting in a more pronounced impact to class- specific accuracy from misassignment to relatively few individuals. </w:t>
+        <w:t xml:space="preserve">Classification accuracy within the CWAK reporting group, which includes the Kuskokwim, Nushagak, and Lower Yukon regions was 90.0%. Classification accuracy for regions in our dataset not within CWAK was 97.9%. Yukon classification accuracy for those within the CWAK group fell to 73.3%. However, it should be noted that the sample size of CWAK Yukon individuals was significantly lower than other groups </w:t>
+      </w:r>
+      <w:proofErr w:type="gramStart"/>
+      <w:r>
+        <w:rPr>
+          <w:rFonts w:ascii="Times New Roman" w:hAnsi="Times New Roman" w:cs="Times New Roman"/>
+        </w:rPr>
+        <w:t>( n</w:t>
+      </w:r>
+      <w:proofErr w:type="gramEnd"/>
+      <w:r>
+        <w:rPr>
+          <w:rFonts w:ascii="Times New Roman" w:hAnsi="Times New Roman" w:cs="Times New Roman"/>
+        </w:rPr>
+        <w:t xml:space="preserve"> = </w:t>
+      </w:r>
+      <w:proofErr w:type="gramStart"/>
+      <w:r>
+        <w:rPr>
+          <w:rFonts w:ascii="Times New Roman" w:hAnsi="Times New Roman" w:cs="Times New Roman"/>
+        </w:rPr>
+        <w:t>29 )</w:t>
+      </w:r>
+      <w:proofErr w:type="gramEnd"/>
+      <w:r>
+        <w:rPr>
+          <w:rFonts w:ascii="Times New Roman" w:hAnsi="Times New Roman" w:cs="Times New Roman"/>
+        </w:rPr>
+        <w:t xml:space="preserve"> , resulting in a more pronounced impact to class- specific accuracy from misassignment to relatively few individuals. </w:t>
       </w:r>
     </w:p>
     <w:p>
@@ -6737,7 +6859,21 @@
         <w:rPr>
           <w:rFonts w:ascii="Times New Roman" w:hAnsi="Times New Roman" w:cs="Times New Roman"/>
         </w:rPr>
-        <w:t xml:space="preserve">. Fig 1) . </w:t>
+        <w:t>. Fig 1</w:t>
+      </w:r>
+      <w:proofErr w:type="gramStart"/>
+      <w:r>
+        <w:rPr>
+          <w:rFonts w:ascii="Times New Roman" w:hAnsi="Times New Roman" w:cs="Times New Roman"/>
+        </w:rPr>
+        <w:t>) .</w:t>
+      </w:r>
+      <w:proofErr w:type="gramEnd"/>
+      <w:r>
+        <w:rPr>
+          <w:rFonts w:ascii="Times New Roman" w:hAnsi="Times New Roman" w:cs="Times New Roman"/>
+        </w:rPr>
+        <w:t xml:space="preserve"> </w:t>
       </w:r>
       <w:commentRangeStart w:id="21"/>
       <w:r>
@@ -7083,13 +7219,27 @@
         <w:rPr>
           <w:rFonts w:ascii="Times New Roman" w:hAnsi="Times New Roman" w:cs="Times New Roman"/>
         </w:rPr>
-        <w:t xml:space="preserve"> techniques to otolith LA datasets and suggests that even greater discriminatory power may be possible through the </w:t>
-      </w:r>
-      <w:r>
-        <w:rPr>
-          <w:rFonts w:ascii="Times New Roman" w:hAnsi="Times New Roman" w:cs="Times New Roman"/>
-        </w:rPr>
-        <w:t>use of additional</w:t>
+        <w:t xml:space="preserve"> techniques to otolith LA datasets and suggests that even greater discriminatory power may be possible </w:t>
+      </w:r>
+      <w:proofErr w:type="gramStart"/>
+      <w:r>
+        <w:rPr>
+          <w:rFonts w:ascii="Times New Roman" w:hAnsi="Times New Roman" w:cs="Times New Roman"/>
+        </w:rPr>
+        <w:t xml:space="preserve">through the </w:t>
+      </w:r>
+      <w:r>
+        <w:rPr>
+          <w:rFonts w:ascii="Times New Roman" w:hAnsi="Times New Roman" w:cs="Times New Roman"/>
+        </w:rPr>
+        <w:t>use of</w:t>
+      </w:r>
+      <w:proofErr w:type="gramEnd"/>
+      <w:r>
+        <w:rPr>
+          <w:rFonts w:ascii="Times New Roman" w:hAnsi="Times New Roman" w:cs="Times New Roman"/>
+        </w:rPr>
+        <w:t xml:space="preserve"> additional</w:t>
       </w:r>
       <w:r>
         <w:rPr>
@@ -7547,7 +7697,21 @@
         <w:rPr>
           <w:rFonts w:ascii="Times New Roman" w:hAnsi="Times New Roman" w:cs="Times New Roman"/>
         </w:rPr>
-        <w:t xml:space="preserve">from the Yukon river </w:t>
+        <w:t xml:space="preserve">from the </w:t>
+      </w:r>
+      <w:proofErr w:type="gramStart"/>
+      <w:r>
+        <w:rPr>
+          <w:rFonts w:ascii="Times New Roman" w:hAnsi="Times New Roman" w:cs="Times New Roman"/>
+        </w:rPr>
+        <w:t>Yukon river</w:t>
+      </w:r>
+      <w:proofErr w:type="gramEnd"/>
+      <w:r>
+        <w:rPr>
+          <w:rFonts w:ascii="Times New Roman" w:hAnsi="Times New Roman" w:cs="Times New Roman"/>
+        </w:rPr>
+        <w:t xml:space="preserve"> </w:t>
       </w:r>
       <w:r>
         <w:rPr>
@@ -7777,7 +7941,15 @@
         <w:t>otolith LA-ICPMS data</w:t>
       </w:r>
       <w:r>
-        <w:t xml:space="preserve"> to provide probabilistic estimates of provenance, and calibrated may be immediately useful for classifying adult Chinook salmon from western Alaska watershed</w:t>
+        <w:t xml:space="preserve"> to provide probabilistic estimates of </w:t>
+      </w:r>
+      <w:proofErr w:type="gramStart"/>
+      <w:r>
+        <w:t>provenance, and</w:t>
+      </w:r>
+      <w:proofErr w:type="gramEnd"/>
+      <w:r>
+        <w:t xml:space="preserve"> calibrated may be immediately useful for classifying adult Chinook salmon from western Alaska watershed</w:t>
       </w:r>
       <w:r>
         <w:t>s</w:t>
@@ -8640,6 +8812,7 @@
         <w:t xml:space="preserve">Campana, S. (1999). Chemistry and composition of fish </w:t>
       </w:r>
       <w:proofErr w:type="spellStart"/>
+      <w:proofErr w:type="gramStart"/>
       <w:r>
         <w:rPr>
           <w:rFonts w:ascii="Times New Roman" w:hAnsi="Times New Roman" w:cs="Times New Roman"/>
@@ -8647,6 +8820,7 @@
         <w:t>otoliths:pathways</w:t>
       </w:r>
       <w:proofErr w:type="spellEnd"/>
+      <w:proofErr w:type="gramEnd"/>
       <w:r>
         <w:rPr>
           <w:rFonts w:ascii="Times New Roman" w:hAnsi="Times New Roman" w:cs="Times New Roman"/>
@@ -9748,7 +9922,21 @@
         <w:rPr>
           <w:rFonts w:ascii="Times New Roman" w:hAnsi="Times New Roman" w:cs="Times New Roman"/>
         </w:rPr>
-        <w:t>(5), 986–993. https://doi.org/10.1577/1548-8659(2002)131&lt;0986:IOSARR&gt;2.0.CO;2</w:t>
+        <w:t>(5), 986–993. https://doi.org/10.1577/1548-8659(2002)131&lt;</w:t>
+      </w:r>
+      <w:proofErr w:type="gramStart"/>
+      <w:r>
+        <w:rPr>
+          <w:rFonts w:ascii="Times New Roman" w:hAnsi="Times New Roman" w:cs="Times New Roman"/>
+        </w:rPr>
+        <w:t>0986:IOSARR</w:t>
+      </w:r>
+      <w:proofErr w:type="gramEnd"/>
+      <w:r>
+        <w:rPr>
+          <w:rFonts w:ascii="Times New Roman" w:hAnsi="Times New Roman" w:cs="Times New Roman"/>
+        </w:rPr>
+        <w:t>&gt;2.0.CO;2</w:t>
       </w:r>
     </w:p>
     <w:p>
@@ -9771,6 +9959,7 @@
     <w:sectPr>
       <w:pgSz w:w="12240" w:h="15840"/>
       <w:pgMar w:top="1440" w:right="1440" w:bottom="1440" w:left="1440" w:header="720" w:footer="720" w:gutter="0"/>
+      <w:lnNumType w:countBy="1" w:restart="continuous"/>
       <w:cols w:space="720"/>
       <w:docGrid w:linePitch="360"/>
     </w:sectPr>
@@ -11948,6 +12137,14 @@
     <w:unhideWhenUsed/>
     <w:rsid w:val="00D74BAF"/>
   </w:style>
+  <w:style w:type="character" w:styleId="LineNumber">
+    <w:name w:val="line number"/>
+    <w:basedOn w:val="DefaultParagraphFont"/>
+    <w:uiPriority w:val="99"/>
+    <w:semiHidden/>
+    <w:unhideWhenUsed/>
+    <w:rsid w:val="00E81C64"/>
+  </w:style>
 </w:styles>
 </file>
 

</xml_diff>

<commit_message>
added valentina's comments on the formatted manuscript
</commit_message>
<xml_diff>
--- a/Docs/Machine learning applied to otolith timeseries data to discriminate river of origin for Western Alaska Salmon.docx
+++ b/Docs/Machine learning applied to otolith timeseries data to discriminate river of origin for Western Alaska Salmon.docx
@@ -203,25 +203,7 @@
           <w:sz w:val="28"/>
           <w:szCs w:val="28"/>
         </w:rPr>
-        <w:t xml:space="preserve">, Valentina </w:t>
-      </w:r>
-      <w:proofErr w:type="spellStart"/>
-      <w:r>
-        <w:rPr>
-          <w:rFonts w:ascii="Times New Roman" w:hAnsi="Times New Roman" w:cs="Times New Roman"/>
-          <w:sz w:val="28"/>
-          <w:szCs w:val="28"/>
-        </w:rPr>
-        <w:t>Staneva</w:t>
-      </w:r>
-      <w:proofErr w:type="spellEnd"/>
-      <w:r>
-        <w:rPr>
-          <w:rFonts w:ascii="Times New Roman" w:hAnsi="Times New Roman" w:cs="Times New Roman"/>
-          <w:sz w:val="28"/>
-          <w:szCs w:val="28"/>
-        </w:rPr>
-        <w:t xml:space="preserve"> </w:t>
+        <w:t xml:space="preserve">, Valentina Staneva </w:t>
       </w:r>
       <w:r>
         <w:rPr>
@@ -436,25 +418,7 @@
           <w:sz w:val="22"/>
           <w:szCs w:val="22"/>
         </w:rPr>
-        <w:t xml:space="preserve">in </w:t>
-      </w:r>
-      <w:proofErr w:type="spellStart"/>
-      <w:r>
-        <w:rPr>
-          <w:rFonts w:ascii="Garamond" w:hAnsi="Garamond" w:cs="Times New Roman"/>
-          <w:sz w:val="22"/>
-          <w:szCs w:val="22"/>
-        </w:rPr>
-        <w:t>Zenodo</w:t>
-      </w:r>
-      <w:proofErr w:type="spellEnd"/>
-      <w:r>
-        <w:rPr>
-          <w:rFonts w:ascii="Garamond" w:hAnsi="Garamond" w:cs="Times New Roman"/>
-          <w:sz w:val="22"/>
-          <w:szCs w:val="22"/>
-        </w:rPr>
-        <w:t xml:space="preserve">: </w:t>
+        <w:t xml:space="preserve">in Zenodo: </w:t>
       </w:r>
       <w:r>
         <w:rPr>
@@ -5537,16 +5501,50 @@
         <w:t xml:space="preserve">predicted </w:t>
       </w:r>
       <w:r>
-        <w:t xml:space="preserve">probability estimates that </w:t>
+        <w:t>probability estimates</w:t>
+      </w:r>
+      <w:commentRangeStart w:id="0"/>
+      <w:r>
+        <w:t xml:space="preserve"> </w:t>
+      </w:r>
+      <w:commentRangeEnd w:id="0"/>
+      <w:r>
+        <w:rPr>
+          <w:rStyle w:val="CommentReference"/>
+          <w:rFonts w:asciiTheme="minorHAnsi" w:eastAsiaTheme="minorHAnsi" w:hAnsiTheme="minorHAnsi" w:cstheme="minorBidi"/>
+          <w:kern w:val="2"/>
+          <w14:ligatures w14:val="standardContextual"/>
+        </w:rPr>
+        <w:commentReference w:id="0"/>
+      </w:r>
+      <w:r>
+        <w:t xml:space="preserve">that </w:t>
       </w:r>
       <w:r>
         <w:t>correctly identify rank class likelihood but produce estimated probability values that do</w:t>
       </w:r>
       <w:r>
-        <w:t xml:space="preserve"> not accurately reflect true </w:t>
-      </w:r>
-      <w:r>
-        <w:t xml:space="preserve">confidence </w:t>
+        <w:t xml:space="preserve"> not accurately reflect </w:t>
+      </w:r>
+      <w:commentRangeStart w:id="1"/>
+      <w:r>
+        <w:t xml:space="preserve">true </w:t>
+      </w:r>
+      <w:r>
+        <w:t>confidence</w:t>
+      </w:r>
+      <w:commentRangeEnd w:id="1"/>
+      <w:r>
+        <w:rPr>
+          <w:rStyle w:val="CommentReference"/>
+          <w:rFonts w:asciiTheme="minorHAnsi" w:eastAsiaTheme="minorHAnsi" w:hAnsiTheme="minorHAnsi" w:cstheme="minorBidi"/>
+          <w:kern w:val="2"/>
+          <w14:ligatures w14:val="standardContextual"/>
+        </w:rPr>
+        <w:commentReference w:id="1"/>
+      </w:r>
+      <w:r>
+        <w:t xml:space="preserve"> </w:t>
       </w:r>
       <w:r>
         <w:t>of correct prediction</w:t>
@@ -5576,7 +5574,41 @@
         <w:t xml:space="preserve">. </w:t>
       </w:r>
       <w:r>
-        <w:t>To be treated as true confidence values, we should expect that the observed proportion of individuals belonging to a given class aligns with the model’s assigned probability for that class. For example, if our model predicts individuals to have originated from the Kuskokwim watershed with 80% probability, then approximately 80% of those individuals should in fact be Kuskokwim fish.</w:t>
+        <w:t xml:space="preserve">To be treated as </w:t>
+      </w:r>
+      <w:commentRangeStart w:id="2"/>
+      <w:r>
+        <w:t>true</w:t>
+      </w:r>
+      <w:commentRangeEnd w:id="2"/>
+      <w:r>
+        <w:rPr>
+          <w:rStyle w:val="CommentReference"/>
+          <w:rFonts w:asciiTheme="minorHAnsi" w:eastAsiaTheme="minorHAnsi" w:hAnsiTheme="minorHAnsi" w:cstheme="minorBidi"/>
+          <w:kern w:val="2"/>
+          <w14:ligatures w14:val="standardContextual"/>
+        </w:rPr>
+        <w:commentReference w:id="2"/>
+      </w:r>
+      <w:r>
+        <w:t xml:space="preserve"> confidence values, </w:t>
+      </w:r>
+      <w:commentRangeStart w:id="3"/>
+      <w:r>
+        <w:t>we should expect that the observed proportion of individuals belonging to a given class aligns with the model’s assigned probability for that class.</w:t>
+      </w:r>
+      <w:commentRangeEnd w:id="3"/>
+      <w:r>
+        <w:rPr>
+          <w:rStyle w:val="CommentReference"/>
+          <w:rFonts w:asciiTheme="minorHAnsi" w:eastAsiaTheme="minorHAnsi" w:hAnsiTheme="minorHAnsi" w:cstheme="minorBidi"/>
+          <w:kern w:val="2"/>
+          <w14:ligatures w14:val="standardContextual"/>
+        </w:rPr>
+        <w:commentReference w:id="3"/>
+      </w:r>
+      <w:r>
+        <w:t xml:space="preserve"> For example, if our model predicts individuals to have originated from the Kuskokwim watershed with 80% probability, then approximately 80% of those individuals should in fact be Kuskokwim fish.</w:t>
       </w:r>
       <w:r>
         <w:t xml:space="preserve"> </w:t>
@@ -5715,7 +5747,21 @@
         <w:t>ing</w:t>
       </w:r>
       <w:r>
-        <w:t xml:space="preserve"> that probability estimates from our models accurately reflect true classification confidence</w:t>
+        <w:t xml:space="preserve"> that probability estimates from our models accurately </w:t>
+      </w:r>
+      <w:commentRangeStart w:id="4"/>
+      <w:r>
+        <w:t>reflect true classification confidence</w:t>
+      </w:r>
+      <w:commentRangeEnd w:id="4"/>
+      <w:r>
+        <w:rPr>
+          <w:rStyle w:val="CommentReference"/>
+          <w:rFonts w:asciiTheme="minorHAnsi" w:eastAsiaTheme="minorHAnsi" w:hAnsiTheme="minorHAnsi" w:cstheme="minorBidi"/>
+          <w:kern w:val="2"/>
+          <w14:ligatures w14:val="standardContextual"/>
+        </w:rPr>
+        <w:commentReference w:id="4"/>
       </w:r>
       <w:r>
         <w:t xml:space="preserve">. </w:t>
@@ -5766,7 +5812,24 @@
         <w:t xml:space="preserve"> model </w:t>
       </w:r>
       <w:r>
-        <w:t xml:space="preserve">above confidence thresholds ranging from </w:t>
+        <w:t>above</w:t>
+      </w:r>
+      <w:commentRangeStart w:id="5"/>
+      <w:r>
+        <w:t xml:space="preserve"> </w:t>
+      </w:r>
+      <w:commentRangeEnd w:id="5"/>
+      <w:r>
+        <w:rPr>
+          <w:rStyle w:val="CommentReference"/>
+          <w:rFonts w:asciiTheme="minorHAnsi" w:eastAsiaTheme="minorHAnsi" w:hAnsiTheme="minorHAnsi" w:cstheme="minorBidi"/>
+          <w:kern w:val="2"/>
+          <w14:ligatures w14:val="standardContextual"/>
+        </w:rPr>
+        <w:commentReference w:id="5"/>
+      </w:r>
+      <w:r>
+        <w:t xml:space="preserve">confidence thresholds ranging from </w:t>
       </w:r>
       <w:r>
         <w:t>60% to 90%. Class-specific and overall accuracies were then recorded for each threshold value (Figure 6).</w:t>
@@ -5861,15 +5924,7 @@
         <w:t xml:space="preserve">with </w:t>
       </w:r>
       <w:r>
-        <w:t xml:space="preserve">both </w:t>
-      </w:r>
-      <w:proofErr w:type="spellStart"/>
-      <w:r>
-        <w:t>Nushagak</w:t>
-      </w:r>
-      <w:proofErr w:type="spellEnd"/>
-      <w:r>
-        <w:t xml:space="preserve"> and Yukon </w:t>
+        <w:t xml:space="preserve">both Nushagak and Yukon </w:t>
       </w:r>
       <w:r>
         <w:t>samples</w:t>
@@ -6495,7 +6550,27 @@
         <w:rPr>
           <w:rFonts w:ascii="Times New Roman" w:hAnsi="Times New Roman" w:cs="Times New Roman"/>
         </w:rPr>
-        <w:t xml:space="preserve">testing set), which may have more dimensionality due to less autocorrelation among points. Unsurprisingly, the </w:t>
+        <w:t xml:space="preserve">testing set), </w:t>
+      </w:r>
+      <w:commentRangeStart w:id="6"/>
+      <w:r>
+        <w:rPr>
+          <w:rFonts w:ascii="Times New Roman" w:hAnsi="Times New Roman" w:cs="Times New Roman"/>
+        </w:rPr>
+        <w:t xml:space="preserve">which may have more dimensionality due to less autocorrelation among points. </w:t>
+      </w:r>
+      <w:commentRangeEnd w:id="6"/>
+      <w:r>
+        <w:rPr>
+          <w:rStyle w:val="CommentReference"/>
+        </w:rPr>
+        <w:commentReference w:id="6"/>
+      </w:r>
+      <w:r>
+        <w:rPr>
+          <w:rFonts w:ascii="Times New Roman" w:hAnsi="Times New Roman" w:cs="Times New Roman"/>
+        </w:rPr>
+        <w:t xml:space="preserve">Unsurprisingly, the </w:t>
       </w:r>
       <w:r>
         <w:rPr>
@@ -6690,21 +6765,7 @@
         <w:rPr>
           <w:rFonts w:ascii="Times New Roman" w:hAnsi="Times New Roman" w:cs="Times New Roman"/>
         </w:rPr>
-        <w:t xml:space="preserve">), Yukon classification accuracy dropped to 86.8%. Classification accuracy for </w:t>
-      </w:r>
-      <w:proofErr w:type="spellStart"/>
-      <w:r>
-        <w:rPr>
-          <w:rFonts w:ascii="Times New Roman" w:hAnsi="Times New Roman" w:cs="Times New Roman"/>
-        </w:rPr>
-        <w:t>Nushagak</w:t>
-      </w:r>
-      <w:proofErr w:type="spellEnd"/>
-      <w:r>
-        <w:rPr>
-          <w:rFonts w:ascii="Times New Roman" w:hAnsi="Times New Roman" w:cs="Times New Roman"/>
-        </w:rPr>
-        <w:t xml:space="preserve"> fish did not change (91.4%) whereas Kuskokwim saw a slight increase to 92.5%. In this testing </w:t>
+        <w:t xml:space="preserve">), Yukon classification accuracy dropped to 86.8%. Classification accuracy for Nushagak fish did not change (91.4%) whereas Kuskokwim saw a slight increase to 92.5%. In this testing </w:t>
       </w:r>
       <w:r>
         <w:rPr>
@@ -6911,11 +6972,25 @@
         </w:rPr>
         <w:t xml:space="preserve"> Visual assessments indicated improved calibration, with the relationship between predicted and observed probabilities approximating a 1:1 line across all classes and model–data type combinations (ex. Supp. Fig 1). </w:t>
       </w:r>
-      <w:r>
-        <w:rPr>
-          <w:rFonts w:ascii="Times New Roman" w:hAnsi="Times New Roman" w:cs="Times New Roman"/>
-        </w:rPr>
-        <w:t xml:space="preserve">Notably, many of the predicted probability values from our models appeared to follow this assumption relatively well even before calibration. </w:t>
+      <w:commentRangeStart w:id="7"/>
+      <w:r>
+        <w:rPr>
+          <w:rFonts w:ascii="Times New Roman" w:hAnsi="Times New Roman" w:cs="Times New Roman"/>
+        </w:rPr>
+        <w:t>Notably, many of the predicted probability values from our models appeared to follow this assumption relatively well even before calibration.</w:t>
+      </w:r>
+      <w:commentRangeEnd w:id="7"/>
+      <w:r>
+        <w:rPr>
+          <w:rStyle w:val="CommentReference"/>
+        </w:rPr>
+        <w:commentReference w:id="7"/>
+      </w:r>
+      <w:r>
+        <w:rPr>
+          <w:rFonts w:ascii="Times New Roman" w:hAnsi="Times New Roman" w:cs="Times New Roman"/>
+        </w:rPr>
+        <w:t xml:space="preserve"> </w:t>
       </w:r>
       <w:r>
         <w:rPr>
@@ -6975,21 +7050,7 @@
         <w:rPr>
           <w:rFonts w:ascii="Times New Roman" w:hAnsi="Times New Roman" w:cs="Times New Roman"/>
         </w:rPr>
-        <w:t xml:space="preserve">dataset, Yukon classification accuracy remained well above 90%, even at the very high (&gt;90%) confidence threshold. </w:t>
-      </w:r>
-      <w:proofErr w:type="spellStart"/>
-      <w:r>
-        <w:rPr>
-          <w:rFonts w:ascii="Times New Roman" w:hAnsi="Times New Roman" w:cs="Times New Roman"/>
-        </w:rPr>
-        <w:t>Nushagak</w:t>
-      </w:r>
-      <w:proofErr w:type="spellEnd"/>
-      <w:r>
-        <w:rPr>
-          <w:rFonts w:ascii="Times New Roman" w:hAnsi="Times New Roman" w:cs="Times New Roman"/>
-        </w:rPr>
-        <w:t xml:space="preserve"> and Kuskokwim</w:t>
+        <w:t>dataset, Yukon classification accuracy remained well above 90%, even at the very high (&gt;90%) confidence threshold. Nushagak and Kuskokwim</w:t>
       </w:r>
       <w:r>
         <w:rPr>
@@ -7028,19 +7089,11 @@
         </w:rPr>
         <w:t xml:space="preserve">, </w:t>
       </w:r>
-      <w:proofErr w:type="spellStart"/>
-      <w:r>
-        <w:rPr>
-          <w:rFonts w:ascii="Times New Roman" w:hAnsi="Times New Roman" w:cs="Times New Roman"/>
-        </w:rPr>
-        <w:t>Nushagak</w:t>
-      </w:r>
-      <w:proofErr w:type="spellEnd"/>
-      <w:r>
-        <w:rPr>
-          <w:rFonts w:ascii="Times New Roman" w:hAnsi="Times New Roman" w:cs="Times New Roman"/>
-        </w:rPr>
-        <w:t xml:space="preserve"> accuracy dropped steadily from 91% to 84%, whereas Kuskokwim accuracy declined rapidly from 89% to 69%.</w:t>
+      <w:r>
+        <w:rPr>
+          <w:rFonts w:ascii="Times New Roman" w:hAnsi="Times New Roman" w:cs="Times New Roman"/>
+        </w:rPr>
+        <w:t>Nushagak accuracy dropped steadily from 91% to 84%, whereas Kuskokwim accuracy declined rapidly from 89% to 69%.</w:t>
       </w:r>
     </w:p>
     <w:p>
@@ -7641,21 +7694,7 @@
         <w:rPr>
           <w:rFonts w:ascii="Times New Roman" w:hAnsi="Times New Roman" w:cs="Times New Roman"/>
         </w:rPr>
-        <w:t xml:space="preserve">b, column 4) are more likely to be misclassified with Kuskokwim or </w:t>
-      </w:r>
-      <w:proofErr w:type="spellStart"/>
-      <w:r>
-        <w:rPr>
-          <w:rFonts w:ascii="Times New Roman" w:hAnsi="Times New Roman" w:cs="Times New Roman"/>
-        </w:rPr>
-        <w:t>Nushagak</w:t>
-      </w:r>
-      <w:proofErr w:type="spellEnd"/>
-      <w:r>
-        <w:rPr>
-          <w:rFonts w:ascii="Times New Roman" w:hAnsi="Times New Roman" w:cs="Times New Roman"/>
-        </w:rPr>
-        <w:t xml:space="preserve"> fish, resulting in lower overall accuracy. </w:t>
+        <w:t xml:space="preserve">b, column 4) are more likely to be misclassified with Kuskokwim or Nushagak fish, resulting in lower overall accuracy. </w:t>
       </w:r>
       <w:r>
         <w:rPr>
@@ -7746,21 +7785,7 @@
         <w:rPr>
           <w:rFonts w:ascii="Times New Roman" w:hAnsi="Times New Roman" w:cs="Times New Roman"/>
         </w:rPr>
-        <w:t xml:space="preserve">from the </w:t>
-      </w:r>
-      <w:proofErr w:type="gramStart"/>
-      <w:r>
-        <w:rPr>
-          <w:rFonts w:ascii="Times New Roman" w:hAnsi="Times New Roman" w:cs="Times New Roman"/>
-        </w:rPr>
-        <w:t>Yukon river</w:t>
-      </w:r>
-      <w:proofErr w:type="gramEnd"/>
-      <w:r>
-        <w:rPr>
-          <w:rFonts w:ascii="Times New Roman" w:hAnsi="Times New Roman" w:cs="Times New Roman"/>
-        </w:rPr>
-        <w:t xml:space="preserve"> </w:t>
+        <w:t xml:space="preserve">from the Yukon river </w:t>
       </w:r>
       <w:r>
         <w:rPr>
@@ -8005,7 +8030,24 @@
         <w:t xml:space="preserve">. </w:t>
       </w:r>
       <w:r>
-        <w:t xml:space="preserve">Our dataset is unusually large for its type and includes samples collected across several years and from nearly all parts of the sampled watersheds. As such, we expect it to be broadly representative of the natural variability among years, and that the model presented here will generalize well to new years of data. However, due to sample size constraints we did not include a true validation set from a year excluded from the training and testing data, leaving open the possibility that some degree of overfitting to this dataset could affect assignment accuracy for unseen years. Additionally, sample preparation procedures and </w:t>
+        <w:t xml:space="preserve">Our dataset is unusually large for its type and includes samples collected across several years and from nearly all parts of the sampled watersheds. As such, we expect it to be broadly representative of the natural variability among years, and that the model presented here will generalize well to new years of data. However, due to sample size constraints we did not include a true validation set from a year excluded from the training and testing data, leaving open the possibility that some degree of overfitting to this dataset could affect assignment </w:t>
+      </w:r>
+      <w:commentRangeStart w:id="8"/>
+      <w:r>
+        <w:t>accuracy for unseen years.</w:t>
+      </w:r>
+      <w:commentRangeEnd w:id="8"/>
+      <w:r>
+        <w:rPr>
+          <w:rStyle w:val="CommentReference"/>
+          <w:rFonts w:asciiTheme="minorHAnsi" w:eastAsiaTheme="minorHAnsi" w:hAnsiTheme="minorHAnsi" w:cstheme="minorBidi"/>
+          <w:kern w:val="2"/>
+          <w14:ligatures w14:val="standardContextual"/>
+        </w:rPr>
+        <w:commentReference w:id="8"/>
+      </w:r>
+      <w:r>
+        <w:t xml:space="preserve"> Additionally, sample preparation procedures and </w:t>
       </w:r>
       <w:r>
         <w:t xml:space="preserve">LA-ICPMS </w:t>
@@ -9830,6 +9872,207 @@
     </w:sectPr>
   </w:body>
 </w:document>
+</file>
+
+<file path=word/comments.xml><?xml version="1.0" encoding="utf-8"?>
+<w:comments xmlns:wpc="http://schemas.microsoft.com/office/word/2010/wordprocessingCanvas" xmlns:cx="http://schemas.microsoft.com/office/drawing/2014/chartex" xmlns:cx1="http://schemas.microsoft.com/office/drawing/2015/9/8/chartex" xmlns:cx2="http://schemas.microsoft.com/office/drawing/2015/10/21/chartex" xmlns:cx3="http://schemas.microsoft.com/office/drawing/2016/5/9/chartex" xmlns:cx4="http://schemas.microsoft.com/office/drawing/2016/5/10/chartex" xmlns:cx5="http://schemas.microsoft.com/office/drawing/2016/5/11/chartex" xmlns:cx6="http://schemas.microsoft.com/office/drawing/2016/5/12/chartex" xmlns:cx7="http://schemas.microsoft.com/office/drawing/2016/5/13/chartex" xmlns:cx8="http://schemas.microsoft.com/office/drawing/2016/5/14/chartex" xmlns:mc="http://schemas.openxmlformats.org/markup-compatibility/2006" xmlns:aink="http://schemas.microsoft.com/office/drawing/2016/ink" xmlns:am3d="http://schemas.microsoft.com/office/drawing/2017/model3d" xmlns:o="urn:schemas-microsoft-com:office:office" xmlns:oel="http://schemas.microsoft.com/office/2019/extlst" xmlns:r="http://schemas.openxmlformats.org/officeDocument/2006/relationships" xmlns:m="http://schemas.openxmlformats.org/officeDocument/2006/math" xmlns:v="urn:schemas-microsoft-com:vml" xmlns:wp14="http://schemas.microsoft.com/office/word/2010/wordprocessingDrawing" xmlns:wp="http://schemas.openxmlformats.org/drawingml/2006/wordprocessingDrawing" xmlns:w10="urn:schemas-microsoft-com:office:word" xmlns:w="http://schemas.openxmlformats.org/wordprocessingml/2006/main" xmlns:w14="http://schemas.microsoft.com/office/word/2010/wordml" xmlns:w15="http://schemas.microsoft.com/office/word/2012/wordml" xmlns:w16cex="http://schemas.microsoft.com/office/word/2018/wordml/cex" xmlns:w16cid="http://schemas.microsoft.com/office/word/2016/wordml/cid" xmlns:w16="http://schemas.microsoft.com/office/word/2018/wordml" xmlns:w16du="http://schemas.microsoft.com/office/word/2023/wordml/word16du" xmlns:w16sdtdh="http://schemas.microsoft.com/office/word/2020/wordml/sdtdatahash" xmlns:w16sdtfl="http://schemas.microsoft.com/office/word/2024/wordml/sdtformatlock" xmlns:w16se="http://schemas.microsoft.com/office/word/2015/wordml/symex" xmlns:wpg="http://schemas.microsoft.com/office/word/2010/wordprocessingGroup" xmlns:wpi="http://schemas.microsoft.com/office/word/2010/wordprocessingInk" xmlns:wne="http://schemas.microsoft.com/office/word/2006/wordml" xmlns:wps="http://schemas.microsoft.com/office/word/2010/wordprocessingShape" mc:Ignorable="w14 w15 w16se w16cid w16 w16cex w16sdtdh w16sdtfl w16du wp14">
+  <w:comment w:id="0" w:author="Valentina M. Staneva" w:date="2025-11-11T14:44:00Z" w:initials="VMS">
+    <w:p>
+      <w:r>
+        <w:rPr>
+          <w:rStyle w:val="CommentReference"/>
+        </w:rPr>
+        <w:annotationRef/>
+      </w:r>
+      <w:r>
+        <w:rPr>
+          <w:sz w:val="20"/>
+          <w:szCs w:val="20"/>
+        </w:rPr>
+        <w:t>(confidence scores) you can add this here to mention confidence.</w:t>
+      </w:r>
+    </w:p>
+  </w:comment>
+  <w:comment w:id="1" w:author="Valentina M. Staneva" w:date="2025-11-11T14:43:00Z" w:initials="VMS">
+    <w:p>
+      <w:r>
+        <w:rPr>
+          <w:rStyle w:val="CommentReference"/>
+        </w:rPr>
+        <w:annotationRef/>
+      </w:r>
+      <w:r>
+        <w:rPr>
+          <w:sz w:val="20"/>
+          <w:szCs w:val="20"/>
+        </w:rPr>
+        <w:t>the observed probability, or empirical probability of correct prediction. I have some reservation about "true confidence" because confidence is internal belief (i.e. not true or wrong). You can add in the first sentence "confidence scores" if you want to introduce the notion of confidence but better in the context of the predicted probability.</w:t>
+      </w:r>
+    </w:p>
+  </w:comment>
+  <w:comment w:id="2" w:author="Valentina M. Staneva" w:date="2025-11-11T14:44:00Z" w:initials="VMS">
+    <w:p>
+      <w:r>
+        <w:rPr>
+          <w:rStyle w:val="CommentReference"/>
+        </w:rPr>
+        <w:annotationRef/>
+      </w:r>
+      <w:r>
+        <w:rPr>
+          <w:sz w:val="20"/>
+          <w:szCs w:val="20"/>
+        </w:rPr>
+        <w:t>reliable confidence values (instead of true)</w:t>
+      </w:r>
+    </w:p>
+  </w:comment>
+  <w:comment w:id="3" w:author="Valentina M. Staneva" w:date="2025-11-11T14:45:00Z" w:initials="VMS">
+    <w:p>
+      <w:r>
+        <w:rPr>
+          <w:rStyle w:val="CommentReference"/>
+        </w:rPr>
+        <w:annotationRef/>
+      </w:r>
+      <w:r>
+        <w:rPr>
+          <w:sz w:val="20"/>
+          <w:szCs w:val="20"/>
+        </w:rPr>
+        <w:t>I like that you define it.</w:t>
+      </w:r>
+    </w:p>
+  </w:comment>
+  <w:comment w:id="4" w:author="Valentina M. Staneva" w:date="2025-11-11T15:21:00Z" w:initials="VMS">
+    <w:p>
+      <w:r>
+        <w:rPr>
+          <w:rStyle w:val="CommentReference"/>
+        </w:rPr>
+        <w:annotationRef/>
+      </w:r>
+      <w:r>
+        <w:rPr>
+          <w:sz w:val="20"/>
+          <w:szCs w:val="20"/>
+        </w:rPr>
+        <w:t xml:space="preserve">reflect observed/empirical/true classification probability. </w:t>
+      </w:r>
+    </w:p>
+  </w:comment>
+  <w:comment w:id="5" w:author="Valentina M. Staneva" w:date="2025-11-11T14:47:00Z" w:initials="VMS">
+    <w:p>
+      <w:r>
+        <w:rPr>
+          <w:rStyle w:val="CommentReference"/>
+        </w:rPr>
+        <w:annotationRef/>
+      </w:r>
+      <w:r>
+        <w:rPr>
+          <w:sz w:val="20"/>
+          <w:szCs w:val="20"/>
+        </w:rPr>
+        <w:t>can add calibrated confidence thresholds so that it is clear that it is based on the calibrated confidence values.</w:t>
+      </w:r>
+    </w:p>
+  </w:comment>
+  <w:comment w:id="6" w:author="Valentina M. Staneva" w:date="2025-11-11T17:30:00Z" w:initials="VMS">
+    <w:p>
+      <w:r>
+        <w:rPr>
+          <w:rStyle w:val="CommentReference"/>
+        </w:rPr>
+        <w:annotationRef/>
+      </w:r>
+      <w:r>
+        <w:rPr>
+          <w:sz w:val="20"/>
+          <w:szCs w:val="20"/>
+        </w:rPr>
+        <w:t>This statement might not be entirely clear. In fact, I am not very sure the reason for the performance: it is possible that random forest has overfitted on the noise since the sample size is not very large. It is possible that the intrinsic dimensionality is low and there exists a separating plane.The original dimension is as the number of features but it is true that if we remove the noise, due to autocorrelation the intrinsic dimenion will be low. Did the SVM have a regularizer?: it is possible that  that smoothed the series and avoided overfitting.</w:t>
+      </w:r>
+    </w:p>
+  </w:comment>
+  <w:comment w:id="7" w:author="Valentina M. Staneva" w:date="2025-11-11T14:48:00Z" w:initials="VMS">
+    <w:p>
+      <w:r>
+        <w:rPr>
+          <w:rStyle w:val="CommentReference"/>
+        </w:rPr>
+        <w:annotationRef/>
+      </w:r>
+      <w:r>
+        <w:rPr>
+          <w:sz w:val="20"/>
+          <w:szCs w:val="20"/>
+        </w:rPr>
+        <w:t>I think this is good and justifies that the plots did not need that much change. The important point is that we have checked it.</w:t>
+      </w:r>
+    </w:p>
+  </w:comment>
+  <w:comment w:id="8" w:author="Valentina M. Staneva" w:date="2025-11-11T17:36:00Z" w:initials="VMS">
+    <w:p>
+      <w:r>
+        <w:rPr>
+          <w:rStyle w:val="CommentReference"/>
+        </w:rPr>
+        <w:annotationRef/>
+      </w:r>
+      <w:r>
+        <w:rPr>
+          <w:sz w:val="20"/>
+          <w:szCs w:val="20"/>
+        </w:rPr>
+        <w:t>Could you say something about how you plan to study this as you receive data for future years (so they do not ask you to do that). I remember you fiddled a bit with that: was one year particularly bad, what was the lesson learnt?</w:t>
+      </w:r>
+    </w:p>
+    <w:p/>
+  </w:comment>
+</w:comments>
+</file>
+
+<file path=word/commentsExtended.xml><?xml version="1.0" encoding="utf-8"?>
+<w15:commentsEx xmlns:wpc="http://schemas.microsoft.com/office/word/2010/wordprocessingCanvas" xmlns:cx="http://schemas.microsoft.com/office/drawing/2014/chartex" xmlns:cx1="http://schemas.microsoft.com/office/drawing/2015/9/8/chartex" xmlns:cx2="http://schemas.microsoft.com/office/drawing/2015/10/21/chartex" xmlns:cx3="http://schemas.microsoft.com/office/drawing/2016/5/9/chartex" xmlns:cx4="http://schemas.microsoft.com/office/drawing/2016/5/10/chartex" xmlns:cx5="http://schemas.microsoft.com/office/drawing/2016/5/11/chartex" xmlns:cx6="http://schemas.microsoft.com/office/drawing/2016/5/12/chartex" xmlns:cx7="http://schemas.microsoft.com/office/drawing/2016/5/13/chartex" xmlns:cx8="http://schemas.microsoft.com/office/drawing/2016/5/14/chartex" xmlns:mc="http://schemas.openxmlformats.org/markup-compatibility/2006" xmlns:aink="http://schemas.microsoft.com/office/drawing/2016/ink" xmlns:am3d="http://schemas.microsoft.com/office/drawing/2017/model3d" xmlns:o="urn:schemas-microsoft-com:office:office" xmlns:oel="http://schemas.microsoft.com/office/2019/extlst" xmlns:r="http://schemas.openxmlformats.org/officeDocument/2006/relationships" xmlns:m="http://schemas.openxmlformats.org/officeDocument/2006/math" xmlns:v="urn:schemas-microsoft-com:vml" xmlns:wp14="http://schemas.microsoft.com/office/word/2010/wordprocessingDrawing" xmlns:wp="http://schemas.openxmlformats.org/drawingml/2006/wordprocessingDrawing" xmlns:w10="urn:schemas-microsoft-com:office:word" xmlns:w="http://schemas.openxmlformats.org/wordprocessingml/2006/main" xmlns:w14="http://schemas.microsoft.com/office/word/2010/wordml" xmlns:w15="http://schemas.microsoft.com/office/word/2012/wordml" xmlns:w16cex="http://schemas.microsoft.com/office/word/2018/wordml/cex" xmlns:w16cid="http://schemas.microsoft.com/office/word/2016/wordml/cid" xmlns:w16="http://schemas.microsoft.com/office/word/2018/wordml" xmlns:w16du="http://schemas.microsoft.com/office/word/2023/wordml/word16du" xmlns:w16sdtdh="http://schemas.microsoft.com/office/word/2020/wordml/sdtdatahash" xmlns:w16sdtfl="http://schemas.microsoft.com/office/word/2024/wordml/sdtformatlock" xmlns:w16se="http://schemas.microsoft.com/office/word/2015/wordml/symex" xmlns:wpg="http://schemas.microsoft.com/office/word/2010/wordprocessingGroup" xmlns:wpi="http://schemas.microsoft.com/office/word/2010/wordprocessingInk" xmlns:wne="http://schemas.microsoft.com/office/word/2006/wordml" xmlns:wps="http://schemas.microsoft.com/office/word/2010/wordprocessingShape" mc:Ignorable="w14 w15 w16se w16cid w16 w16cex w16sdtdh w16sdtfl w16du wp14">
+  <w15:commentEx w15:paraId="57D2B23C" w15:done="0"/>
+  <w15:commentEx w15:paraId="5F63F689" w15:done="0"/>
+  <w15:commentEx w15:paraId="45834483" w15:done="0"/>
+  <w15:commentEx w15:paraId="4347B15F" w15:done="0"/>
+  <w15:commentEx w15:paraId="57F929B1" w15:done="0"/>
+  <w15:commentEx w15:paraId="2FCF05AF" w15:done="0"/>
+  <w15:commentEx w15:paraId="752169F3" w15:done="0"/>
+  <w15:commentEx w15:paraId="4647A70C" w15:done="0"/>
+  <w15:commentEx w15:paraId="60777E8F" w15:done="0"/>
+</w15:commentsEx>
+</file>
+
+<file path=word/commentsExtensible.xml><?xml version="1.0" encoding="utf-8"?>
+<w16cex:commentsExtensible xmlns:wpc="http://schemas.microsoft.com/office/word/2010/wordprocessingCanvas" xmlns:cx="http://schemas.microsoft.com/office/drawing/2014/chartex" xmlns:cx1="http://schemas.microsoft.com/office/drawing/2015/9/8/chartex" xmlns:cx2="http://schemas.microsoft.com/office/drawing/2015/10/21/chartex" xmlns:cx3="http://schemas.microsoft.com/office/drawing/2016/5/9/chartex" xmlns:cx4="http://schemas.microsoft.com/office/drawing/2016/5/10/chartex" xmlns:cx5="http://schemas.microsoft.com/office/drawing/2016/5/11/chartex" xmlns:cx6="http://schemas.microsoft.com/office/drawing/2016/5/12/chartex" xmlns:cx7="http://schemas.microsoft.com/office/drawing/2016/5/13/chartex" xmlns:cx8="http://schemas.microsoft.com/office/drawing/2016/5/14/chartex" xmlns:cr="http://schemas.microsoft.com/office/comments/2020/reactions" xmlns:mc="http://schemas.openxmlformats.org/markup-compatibility/2006" xmlns:aink="http://schemas.microsoft.com/office/drawing/2016/ink" xmlns:am3d="http://schemas.microsoft.com/office/drawing/2017/model3d" xmlns:o="urn:schemas-microsoft-com:office:office" xmlns:oel="http://schemas.microsoft.com/office/2019/extlst" xmlns:r="http://schemas.openxmlformats.org/officeDocument/2006/relationships" xmlns:m="http://schemas.openxmlformats.org/officeDocument/2006/math" xmlns:v="urn:schemas-microsoft-com:vml" xmlns:wp14="http://schemas.microsoft.com/office/word/2010/wordprocessingDrawing" xmlns:wp="http://schemas.openxmlformats.org/drawingml/2006/wordprocessingDrawing" xmlns:w10="urn:schemas-microsoft-com:office:word" xmlns:w="http://schemas.openxmlformats.org/wordprocessingml/2006/main" xmlns:w14="http://schemas.microsoft.com/office/word/2010/wordml" xmlns:w15="http://schemas.microsoft.com/office/word/2012/wordml" xmlns:w16cex="http://schemas.microsoft.com/office/word/2018/wordml/cex" xmlns:w16cid="http://schemas.microsoft.com/office/word/2016/wordml/cid" xmlns:w16="http://schemas.microsoft.com/office/word/2018/wordml" xmlns:w16du="http://schemas.microsoft.com/office/word/2023/wordml/word16du" xmlns:w16sdtdh="http://schemas.microsoft.com/office/word/2020/wordml/sdtdatahash" xmlns:w16sdtfl="http://schemas.microsoft.com/office/word/2024/wordml/sdtformatlock" xmlns:w16se="http://schemas.microsoft.com/office/word/2015/wordml/symex" xmlns:wpg="http://schemas.microsoft.com/office/word/2010/wordprocessingGroup" xmlns:wpi="http://schemas.microsoft.com/office/word/2010/wordprocessingInk" xmlns:wne="http://schemas.microsoft.com/office/word/2006/wordml" xmlns:wps="http://schemas.microsoft.com/office/word/2010/wordprocessingShape" mc:Ignorable="w14 w15 w16se w16cid w16 w16cex w16sdtdh w16sdtfl cr w16du wp14">
+  <w16cex:commentExtensible w16cex:durableId="1027EFAC" w16cex:dateUtc="2025-11-11T22:44:00Z"/>
+  <w16cex:commentExtensible w16cex:durableId="50C86736" w16cex:dateUtc="2025-11-11T22:43:00Z"/>
+  <w16cex:commentExtensible w16cex:durableId="012C4E6E" w16cex:dateUtc="2025-11-11T22:44:00Z"/>
+  <w16cex:commentExtensible w16cex:durableId="0F4C449E" w16cex:dateUtc="2025-11-11T22:45:00Z"/>
+  <w16cex:commentExtensible w16cex:durableId="0A55F087" w16cex:dateUtc="2025-11-11T23:21:00Z"/>
+  <w16cex:commentExtensible w16cex:durableId="782CA893" w16cex:dateUtc="2025-11-11T22:47:00Z"/>
+  <w16cex:commentExtensible w16cex:durableId="167E8668" w16cex:dateUtc="2025-11-12T01:30:00Z"/>
+  <w16cex:commentExtensible w16cex:durableId="1014085E" w16cex:dateUtc="2025-11-11T22:48:00Z"/>
+  <w16cex:commentExtensible w16cex:durableId="12DFF61C" w16cex:dateUtc="2025-11-12T01:36:00Z"/>
+</w16cex:commentsExtensible>
+</file>
+
+<file path=word/commentsIds.xml><?xml version="1.0" encoding="utf-8"?>
+<w16cid:commentsIds xmlns:wpc="http://schemas.microsoft.com/office/word/2010/wordprocessingCanvas" xmlns:cx="http://schemas.microsoft.com/office/drawing/2014/chartex" xmlns:cx1="http://schemas.microsoft.com/office/drawing/2015/9/8/chartex" xmlns:cx2="http://schemas.microsoft.com/office/drawing/2015/10/21/chartex" xmlns:cx3="http://schemas.microsoft.com/office/drawing/2016/5/9/chartex" xmlns:cx4="http://schemas.microsoft.com/office/drawing/2016/5/10/chartex" xmlns:cx5="http://schemas.microsoft.com/office/drawing/2016/5/11/chartex" xmlns:cx6="http://schemas.microsoft.com/office/drawing/2016/5/12/chartex" xmlns:cx7="http://schemas.microsoft.com/office/drawing/2016/5/13/chartex" xmlns:cx8="http://schemas.microsoft.com/office/drawing/2016/5/14/chartex" xmlns:mc="http://schemas.openxmlformats.org/markup-compatibility/2006" xmlns:aink="http://schemas.microsoft.com/office/drawing/2016/ink" xmlns:am3d="http://schemas.microsoft.com/office/drawing/2017/model3d" xmlns:o="urn:schemas-microsoft-com:office:office" xmlns:oel="http://schemas.microsoft.com/office/2019/extlst" xmlns:r="http://schemas.openxmlformats.org/officeDocument/2006/relationships" xmlns:m="http://schemas.openxmlformats.org/officeDocument/2006/math" xmlns:v="urn:schemas-microsoft-com:vml" xmlns:wp14="http://schemas.microsoft.com/office/word/2010/wordprocessingDrawing" xmlns:wp="http://schemas.openxmlformats.org/drawingml/2006/wordprocessingDrawing" xmlns:w10="urn:schemas-microsoft-com:office:word" xmlns:w="http://schemas.openxmlformats.org/wordprocessingml/2006/main" xmlns:w14="http://schemas.microsoft.com/office/word/2010/wordml" xmlns:w15="http://schemas.microsoft.com/office/word/2012/wordml" xmlns:w16cex="http://schemas.microsoft.com/office/word/2018/wordml/cex" xmlns:w16cid="http://schemas.microsoft.com/office/word/2016/wordml/cid" xmlns:w16="http://schemas.microsoft.com/office/word/2018/wordml" xmlns:w16du="http://schemas.microsoft.com/office/word/2023/wordml/word16du" xmlns:w16sdtdh="http://schemas.microsoft.com/office/word/2020/wordml/sdtdatahash" xmlns:w16sdtfl="http://schemas.microsoft.com/office/word/2024/wordml/sdtformatlock" xmlns:w16se="http://schemas.microsoft.com/office/word/2015/wordml/symex" xmlns:wpg="http://schemas.microsoft.com/office/word/2010/wordprocessingGroup" xmlns:wpi="http://schemas.microsoft.com/office/word/2010/wordprocessingInk" xmlns:wne="http://schemas.microsoft.com/office/word/2006/wordml" xmlns:wps="http://schemas.microsoft.com/office/word/2010/wordprocessingShape" mc:Ignorable="w14 w15 w16se w16cid w16 w16cex w16sdtdh w16sdtfl w16du wp14">
+  <w16cid:commentId w16cid:paraId="57D2B23C" w16cid:durableId="1027EFAC"/>
+  <w16cid:commentId w16cid:paraId="5F63F689" w16cid:durableId="50C86736"/>
+  <w16cid:commentId w16cid:paraId="45834483" w16cid:durableId="012C4E6E"/>
+  <w16cid:commentId w16cid:paraId="4347B15F" w16cid:durableId="0F4C449E"/>
+  <w16cid:commentId w16cid:paraId="57F929B1" w16cid:durableId="0A55F087"/>
+  <w16cid:commentId w16cid:paraId="2FCF05AF" w16cid:durableId="782CA893"/>
+  <w16cid:commentId w16cid:paraId="752169F3" w16cid:durableId="167E8668"/>
+  <w16cid:commentId w16cid:paraId="4647A70C" w16cid:durableId="1014085E"/>
+  <w16cid:commentId w16cid:paraId="60777E8F" w16cid:durableId="12DFF61C"/>
+</w16cid:commentsIds>
 </file>
 
 <file path=word/numbering.xml><?xml version="1.0" encoding="utf-8"?>
@@ -10410,6 +10653,14 @@
     <w:abstractNumId w:val="2"/>
   </w:num>
 </w:numbering>
+</file>
+
+<file path=word/people.xml><?xml version="1.0" encoding="utf-8"?>
+<w15:people xmlns:wpc="http://schemas.microsoft.com/office/word/2010/wordprocessingCanvas" xmlns:cx="http://schemas.microsoft.com/office/drawing/2014/chartex" xmlns:cx1="http://schemas.microsoft.com/office/drawing/2015/9/8/chartex" xmlns:cx2="http://schemas.microsoft.com/office/drawing/2015/10/21/chartex" xmlns:cx3="http://schemas.microsoft.com/office/drawing/2016/5/9/chartex" xmlns:cx4="http://schemas.microsoft.com/office/drawing/2016/5/10/chartex" xmlns:cx5="http://schemas.microsoft.com/office/drawing/2016/5/11/chartex" xmlns:cx6="http://schemas.microsoft.com/office/drawing/2016/5/12/chartex" xmlns:cx7="http://schemas.microsoft.com/office/drawing/2016/5/13/chartex" xmlns:cx8="http://schemas.microsoft.com/office/drawing/2016/5/14/chartex" xmlns:mc="http://schemas.openxmlformats.org/markup-compatibility/2006" xmlns:aink="http://schemas.microsoft.com/office/drawing/2016/ink" xmlns:am3d="http://schemas.microsoft.com/office/drawing/2017/model3d" xmlns:o="urn:schemas-microsoft-com:office:office" xmlns:oel="http://schemas.microsoft.com/office/2019/extlst" xmlns:r="http://schemas.openxmlformats.org/officeDocument/2006/relationships" xmlns:m="http://schemas.openxmlformats.org/officeDocument/2006/math" xmlns:v="urn:schemas-microsoft-com:vml" xmlns:wp14="http://schemas.microsoft.com/office/word/2010/wordprocessingDrawing" xmlns:wp="http://schemas.openxmlformats.org/drawingml/2006/wordprocessingDrawing" xmlns:w10="urn:schemas-microsoft-com:office:word" xmlns:w="http://schemas.openxmlformats.org/wordprocessingml/2006/main" xmlns:w14="http://schemas.microsoft.com/office/word/2010/wordml" xmlns:w15="http://schemas.microsoft.com/office/word/2012/wordml" xmlns:w16cex="http://schemas.microsoft.com/office/word/2018/wordml/cex" xmlns:w16cid="http://schemas.microsoft.com/office/word/2016/wordml/cid" xmlns:w16="http://schemas.microsoft.com/office/word/2018/wordml" xmlns:w16du="http://schemas.microsoft.com/office/word/2023/wordml/word16du" xmlns:w16sdtdh="http://schemas.microsoft.com/office/word/2020/wordml/sdtdatahash" xmlns:w16sdtfl="http://schemas.microsoft.com/office/word/2024/wordml/sdtformatlock" xmlns:w16se="http://schemas.microsoft.com/office/word/2015/wordml/symex" xmlns:wpg="http://schemas.microsoft.com/office/word/2010/wordprocessingGroup" xmlns:wpi="http://schemas.microsoft.com/office/word/2010/wordprocessingInk" xmlns:wne="http://schemas.microsoft.com/office/word/2006/wordml" xmlns:wps="http://schemas.microsoft.com/office/word/2010/wordprocessingShape" mc:Ignorable="w14 w15 w16se w16cid w16 w16cex w16sdtdh w16sdtfl w16du wp14">
+  <w15:person w15:author="Valentina M. Staneva">
+    <w15:presenceInfo w15:providerId="AD" w15:userId="S::vms16@uw.edu::39002d1f-c79c-469f-9108-ea31440063df"/>
+  </w15:person>
+</w15:people>
 </file>
 
 <file path=word/styles.xml><?xml version="1.0" encoding="utf-8"?>

</xml_diff>

<commit_message>
incorporated Valentina's edits, added escience as an agnowledgement
</commit_message>
<xml_diff>
--- a/Docs/Machine learning applied to otolith timeseries data to discriminate river of origin for Western Alaska Salmon.docx
+++ b/Docs/Machine learning applied to otolith timeseries data to discriminate river of origin for Western Alaska Salmon.docx
@@ -3652,24 +3652,26 @@
           <w:u w:val="single"/>
         </w:rPr>
       </w:pPr>
-      <w:r>
+    </w:p>
+    <w:p>
+      <w:pPr>
         <w:rPr>
           <w:rFonts w:ascii="Times New Roman" w:hAnsi="Times New Roman" w:cs="Times New Roman"/>
           <w:b/>
           <w:bCs/>
           <w:u w:val="single"/>
         </w:rPr>
-        <w:t>Data pre</w:t>
-      </w:r>
-      <w:r>
+      </w:pPr>
+    </w:p>
+    <w:p>
+      <w:pPr>
         <w:rPr>
           <w:rFonts w:ascii="Times New Roman" w:hAnsi="Times New Roman" w:cs="Times New Roman"/>
           <w:b/>
           <w:bCs/>
           <w:u w:val="single"/>
         </w:rPr>
-        <w:t>-</w:t>
-      </w:r>
+      </w:pPr>
       <w:r>
         <w:rPr>
           <w:rFonts w:ascii="Times New Roman" w:hAnsi="Times New Roman" w:cs="Times New Roman"/>
@@ -3677,1216 +3679,1235 @@
           <w:bCs/>
           <w:u w:val="single"/>
         </w:rPr>
-        <w:t xml:space="preserve">processing </w:t>
-      </w:r>
-    </w:p>
-    <w:p>
-      <w:pPr>
-        <w:spacing w:line="480" w:lineRule="auto"/>
-        <w:ind w:firstLine="720"/>
-        <w:rPr>
-          <w:rFonts w:ascii="Times New Roman" w:hAnsi="Times New Roman" w:cs="Times New Roman"/>
-        </w:rPr>
-      </w:pPr>
-      <w:r>
-        <w:rPr>
-          <w:rFonts w:ascii="Times New Roman" w:hAnsi="Times New Roman" w:cs="Times New Roman"/>
-        </w:rPr>
         <w:lastRenderedPageBreak/>
-        <w:t xml:space="preserve">To standardize all data to the same life history period </w:t>
-      </w:r>
-      <w:r>
-        <w:rPr>
-          <w:rFonts w:ascii="Times New Roman" w:hAnsi="Times New Roman" w:cs="Times New Roman"/>
-        </w:rPr>
-        <w:t xml:space="preserve">full </w:t>
-      </w:r>
-      <w:r>
-        <w:rPr>
-          <w:rFonts w:ascii="Times New Roman" w:hAnsi="Times New Roman" w:cs="Times New Roman"/>
-        </w:rPr>
-        <w:t>laser ablation datasets</w:t>
-      </w:r>
-      <w:r>
-        <w:rPr>
-          <w:rFonts w:ascii="Times New Roman" w:hAnsi="Times New Roman" w:cs="Times New Roman"/>
-        </w:rPr>
-        <w:t xml:space="preserve"> were trimmed to include only data between the </w:t>
-      </w:r>
-      <w:r>
-        <w:rPr>
-          <w:rFonts w:ascii="Times New Roman" w:hAnsi="Times New Roman" w:cs="Times New Roman"/>
-        </w:rPr>
-        <w:t>onset of the natal origin region</w:t>
-      </w:r>
-      <w:r>
-        <w:rPr>
-          <w:rFonts w:ascii="Times New Roman" w:hAnsi="Times New Roman" w:cs="Times New Roman"/>
-        </w:rPr>
-        <w:t xml:space="preserve"> and the </w:t>
-      </w:r>
-      <w:r>
-        <w:rPr>
-          <w:rFonts w:ascii="Times New Roman" w:hAnsi="Times New Roman" w:cs="Times New Roman"/>
-        </w:rPr>
-        <w:t xml:space="preserve">beginning of </w:t>
-      </w:r>
-      <w:r>
-        <w:rPr>
-          <w:rFonts w:ascii="Times New Roman" w:hAnsi="Times New Roman" w:cs="Times New Roman"/>
-        </w:rPr>
-        <w:t>marine residence. These cutoff points were identified by</w:t>
-      </w:r>
-      <w:r>
-        <w:rPr>
-          <w:rFonts w:ascii="Times New Roman" w:hAnsi="Times New Roman" w:cs="Times New Roman"/>
-        </w:rPr>
-        <w:t xml:space="preserve"> examining patterns in ⁸⁷Sr/⁸⁶Sr, ⁸⁸Sr, and </w:t>
-      </w:r>
-      <w:r>
-        <w:rPr>
-          <w:rFonts w:ascii="Times New Roman" w:hAnsi="Times New Roman" w:cs="Times New Roman"/>
-        </w:rPr>
-        <w:t xml:space="preserve">visually apparent </w:t>
-      </w:r>
-      <w:r>
-        <w:rPr>
-          <w:rFonts w:ascii="Times New Roman" w:hAnsi="Times New Roman" w:cs="Times New Roman"/>
-        </w:rPr>
-        <w:t>morphological features along the laser ablation line</w:t>
-      </w:r>
-      <w:r>
-        <w:rPr>
-          <w:rFonts w:ascii="Times New Roman" w:hAnsi="Times New Roman" w:cs="Times New Roman"/>
-        </w:rPr>
-        <w:t xml:space="preserve"> </w:t>
-      </w:r>
-      <w:r>
-        <w:rPr>
-          <w:rFonts w:ascii="Times New Roman" w:hAnsi="Times New Roman" w:cs="Times New Roman"/>
-        </w:rPr>
-        <w:fldChar w:fldCharType="begin"/>
-      </w:r>
-      <w:r>
-        <w:rPr>
-          <w:rFonts w:ascii="Times New Roman" w:hAnsi="Times New Roman" w:cs="Times New Roman"/>
-        </w:rPr>
-        <w:instrText xml:space="preserve"> ADDIN ZOTERO_ITEM CSL_CITATION {"citationID":"DX3Ucg21","properties":{"formattedCitation":"(Brennan &amp; Schindler, 2017)","plainCitation":"(Brennan &amp; Schindler, 2017)","noteIndex":0},"citationItems":[{"id":1694,"uris":["http://zotero.org/users/8421274/items/NSWL6YPN"],"itemData":{"id":1694,"type":"article-journal","abstract":"Production patterns of highly mobile species, such as anadromous fish, often exhibit high spatial and temporal heterogeneity across landscapes. Such variability is often asynchronous in time among habitats, which stabilizes production at aggregate scales of complexity. Reconstructing production patterns explicitly in space and time across multiple scales, however, remains difficult but is important for prioritizing habitat conservation. This is especially true for fishes inhabiting river basins due to long-range dispersal, high mortality at early life stages, complex population structure and elusive life history variation. We develop a new approach for mapping production patterns of Pacific salmon across a large river basin by integrating otolith microchemistry and dendritic isoscape models. The geographically continuous Bayesian assignment framework presented here yielded high accuracies (&gt;90%) and relatively high precisions (precisions &lt;4%; i.e., assignment areas of &lt;530 river km of the 13 100 km total river length) when used to determine the natal source of known-origin juvenile Chinook salmon captured throughout the study region. Integrating these methods enabled us to base estimates of provenance and habitat use of individuals on a per location basis using strontium isotopic data throughout the continuous spatial domain of a river network. Such a framework provides substantial advantages over the more common nominal approach to employing otolith microchemistry to reconstruct movement patterns of fish. In doing so, we reconstructed the spatial production patterns of adult Chinook salmon returning to a large watershed in Bristol Bay, Alaska and illustrate the power of such an approach to conservation efforts.","container-title":"Ecological Applications","DOI":"10.1002/eap.1474","ISSN":"1939-5582","issue":"2","language":"en","note":"_eprint: https://esajournals.onlinelibrary.wiley.com/doi/pdf/10.1002/eap.1474","page":"363-377","source":"Wiley Online Library","title":"Linking otolith microchemistry and dendritic isoscapes to map heterogeneous production of fish across river basins","volume":"27","author":[{"family":"Brennan","given":"Sean R."},{"family":"Schindler","given":"Daniel E."}],"issued":{"date-parts":[["2017"]]}}}],"schema":"https://github.com/citation-style-language/schema/raw/master/csl-citation.json"} </w:instrText>
-      </w:r>
-      <w:r>
-        <w:rPr>
-          <w:rFonts w:ascii="Times New Roman" w:hAnsi="Times New Roman" w:cs="Times New Roman"/>
-        </w:rPr>
-        <w:fldChar w:fldCharType="separate"/>
-      </w:r>
-      <w:r>
-        <w:rPr>
-          <w:rFonts w:ascii="Times New Roman" w:hAnsi="Times New Roman" w:cs="Times New Roman"/>
-          <w:noProof/>
-        </w:rPr>
-        <w:t>(Brennan &amp; Schindler, 2017)</w:t>
-      </w:r>
-      <w:r>
-        <w:rPr>
-          <w:rFonts w:ascii="Times New Roman" w:hAnsi="Times New Roman" w:cs="Times New Roman"/>
-        </w:rPr>
-        <w:fldChar w:fldCharType="end"/>
-      </w:r>
-      <w:r>
-        <w:rPr>
-          <w:rFonts w:ascii="Times New Roman" w:hAnsi="Times New Roman" w:cs="Times New Roman"/>
-        </w:rPr>
-        <w:t xml:space="preserve">. </w:t>
-      </w:r>
-      <w:r>
-        <w:rPr>
-          <w:rFonts w:ascii="Times New Roman" w:hAnsi="Times New Roman" w:cs="Times New Roman"/>
-        </w:rPr>
-        <w:t>The n</w:t>
-      </w:r>
-      <w:r>
-        <w:rPr>
-          <w:rFonts w:ascii="Times New Roman" w:hAnsi="Times New Roman" w:cs="Times New Roman"/>
-        </w:rPr>
-        <w:t xml:space="preserve">atal origin region was manually identified by the first steady state after the decline in </w:t>
-      </w:r>
-      <w:r>
-        <w:rPr>
-          <w:rFonts w:ascii="Times New Roman" w:hAnsi="Times New Roman" w:cs="Times New Roman"/>
-          <w:vertAlign w:val="superscript"/>
-        </w:rPr>
-        <w:t>88</w:t>
-      </w:r>
-      <w:r>
-        <w:rPr>
-          <w:rFonts w:ascii="Times New Roman" w:hAnsi="Times New Roman" w:cs="Times New Roman"/>
-        </w:rPr>
-        <w:t>Sr and movement of ⁸⁷Sr/⁸⁶Sr away from the global marine value (0.7092)</w:t>
-      </w:r>
-      <w:r>
-        <w:rPr>
-          <w:rFonts w:ascii="Times New Roman" w:hAnsi="Times New Roman" w:cs="Times New Roman"/>
-        </w:rPr>
-        <w:t>, which</w:t>
-      </w:r>
-      <w:r>
-        <w:rPr>
-          <w:rFonts w:ascii="Times New Roman" w:hAnsi="Times New Roman" w:cs="Times New Roman"/>
-        </w:rPr>
-        <w:t xml:space="preserve"> represent</w:t>
-      </w:r>
-      <w:r>
-        <w:rPr>
-          <w:rFonts w:ascii="Times New Roman" w:hAnsi="Times New Roman" w:cs="Times New Roman"/>
-        </w:rPr>
-        <w:t>s</w:t>
-      </w:r>
-      <w:r>
-        <w:rPr>
-          <w:rFonts w:ascii="Times New Roman" w:hAnsi="Times New Roman" w:cs="Times New Roman"/>
-        </w:rPr>
-        <w:t xml:space="preserve"> the maternal signal in the otolith</w:t>
-      </w:r>
-      <w:r>
-        <w:rPr>
-          <w:rFonts w:ascii="Times New Roman" w:hAnsi="Times New Roman" w:cs="Times New Roman"/>
-        </w:rPr>
-        <w:t>.</w:t>
-      </w:r>
-      <w:r>
-        <w:rPr>
-          <w:rFonts w:ascii="Times New Roman" w:hAnsi="Times New Roman" w:cs="Times New Roman"/>
-        </w:rPr>
-        <w:t xml:space="preserve"> Although we hypothesized that the maternal signature would differ among watersheds</w:t>
-      </w:r>
-      <w:r>
-        <w:rPr>
-          <w:rFonts w:ascii="Times New Roman" w:hAnsi="Times New Roman" w:cs="Times New Roman"/>
-        </w:rPr>
-        <w:t xml:space="preserve">, and thus could be useful for classification, </w:t>
-      </w:r>
-      <w:r>
-        <w:rPr>
-          <w:rFonts w:ascii="Times New Roman" w:hAnsi="Times New Roman" w:cs="Times New Roman"/>
-        </w:rPr>
-        <w:t xml:space="preserve">the start of the laser ablation </w:t>
-      </w:r>
-      <w:proofErr w:type="gramStart"/>
-      <w:r>
-        <w:rPr>
-          <w:rFonts w:ascii="Times New Roman" w:hAnsi="Times New Roman" w:cs="Times New Roman"/>
-        </w:rPr>
-        <w:t>transect</w:t>
-      </w:r>
-      <w:proofErr w:type="gramEnd"/>
-      <w:r>
-        <w:rPr>
-          <w:rFonts w:ascii="Times New Roman" w:hAnsi="Times New Roman" w:cs="Times New Roman"/>
-        </w:rPr>
-        <w:t xml:space="preserve"> and quality of the core signal varied among samples and years. T</w:t>
-      </w:r>
-      <w:r>
-        <w:rPr>
-          <w:rFonts w:ascii="Times New Roman" w:hAnsi="Times New Roman" w:cs="Times New Roman"/>
-        </w:rPr>
-        <w:t>herefore, to maximize consistency among years we did not include the portion</w:t>
-      </w:r>
-      <w:r>
-        <w:rPr>
-          <w:rFonts w:ascii="Times New Roman" w:hAnsi="Times New Roman" w:cs="Times New Roman"/>
-        </w:rPr>
-        <w:t xml:space="preserve"> of the time series</w:t>
-      </w:r>
-      <w:r>
-        <w:rPr>
-          <w:rFonts w:ascii="Times New Roman" w:hAnsi="Times New Roman" w:cs="Times New Roman"/>
-        </w:rPr>
-        <w:t xml:space="preserve"> before the natal origin region. A </w:t>
-      </w:r>
-      <w:r>
-        <w:rPr>
-          <w:rFonts w:ascii="Times New Roman" w:hAnsi="Times New Roman" w:cs="Times New Roman"/>
-        </w:rPr>
-        <w:t xml:space="preserve">cutoff at the </w:t>
-      </w:r>
-      <w:r>
-        <w:rPr>
-          <w:rFonts w:ascii="Times New Roman" w:hAnsi="Times New Roman" w:cs="Times New Roman"/>
-        </w:rPr>
-        <w:t xml:space="preserve">marine entry was identified </w:t>
-      </w:r>
-      <w:r>
-        <w:rPr>
-          <w:rFonts w:ascii="Times New Roman" w:hAnsi="Times New Roman" w:cs="Times New Roman"/>
-        </w:rPr>
-        <w:t xml:space="preserve">by </w:t>
-      </w:r>
-      <w:r>
-        <w:rPr>
-          <w:rFonts w:ascii="Times New Roman" w:hAnsi="Times New Roman" w:cs="Times New Roman"/>
-        </w:rPr>
-        <w:t xml:space="preserve">the marine check </w:t>
-      </w:r>
-      <w:r>
-        <w:rPr>
-          <w:rFonts w:ascii="Times New Roman" w:hAnsi="Times New Roman" w:cs="Times New Roman"/>
-        </w:rPr>
-        <w:t>on the otolith</w:t>
-      </w:r>
-      <w:r>
-        <w:rPr>
-          <w:rFonts w:ascii="Times New Roman" w:hAnsi="Times New Roman" w:cs="Times New Roman"/>
-        </w:rPr>
-        <w:t xml:space="preserve"> (dark annuli region)</w:t>
-      </w:r>
-      <w:r>
-        <w:rPr>
-          <w:rFonts w:ascii="Times New Roman" w:hAnsi="Times New Roman" w:cs="Times New Roman"/>
-        </w:rPr>
-        <w:t>, a rapid increase in</w:t>
-      </w:r>
-      <w:r>
-        <w:rPr>
-          <w:rFonts w:ascii="Times New Roman" w:hAnsi="Times New Roman" w:cs="Times New Roman"/>
-        </w:rPr>
-        <w:t xml:space="preserve"> ⁸⁸Sr</w:t>
-      </w:r>
-      <w:r>
-        <w:rPr>
-          <w:rFonts w:ascii="Times New Roman" w:hAnsi="Times New Roman" w:cs="Times New Roman"/>
-        </w:rPr>
-        <w:t xml:space="preserve"> concentration</w:t>
-      </w:r>
-      <w:r>
-        <w:rPr>
-          <w:rFonts w:ascii="Times New Roman" w:hAnsi="Times New Roman" w:cs="Times New Roman"/>
-        </w:rPr>
-        <w:t xml:space="preserve">, and a </w:t>
-      </w:r>
-      <w:r>
-        <w:rPr>
-          <w:rFonts w:ascii="Times New Roman" w:hAnsi="Times New Roman" w:cs="Times New Roman"/>
-        </w:rPr>
-        <w:t>shift in ⁸⁷Sr/⁸⁶Sr to</w:t>
-      </w:r>
-      <w:r>
-        <w:rPr>
-          <w:rFonts w:ascii="Times New Roman" w:hAnsi="Times New Roman" w:cs="Times New Roman"/>
-        </w:rPr>
-        <w:t>war</w:t>
-      </w:r>
-      <w:r>
-        <w:rPr>
-          <w:rFonts w:ascii="Times New Roman" w:hAnsi="Times New Roman" w:cs="Times New Roman"/>
-        </w:rPr>
-        <w:t>d</w:t>
-      </w:r>
-      <w:r>
-        <w:rPr>
-          <w:rFonts w:ascii="Times New Roman" w:hAnsi="Times New Roman" w:cs="Times New Roman"/>
-        </w:rPr>
-        <w:t>s</w:t>
-      </w:r>
-      <w:r>
-        <w:rPr>
-          <w:rFonts w:ascii="Times New Roman" w:hAnsi="Times New Roman" w:cs="Times New Roman"/>
-        </w:rPr>
-        <w:t xml:space="preserve"> the</w:t>
-      </w:r>
-      <w:r>
-        <w:rPr>
-          <w:rFonts w:ascii="Times New Roman" w:hAnsi="Times New Roman" w:cs="Times New Roman"/>
-        </w:rPr>
-        <w:t xml:space="preserve"> global marine value</w:t>
-      </w:r>
-      <w:r>
-        <w:rPr>
-          <w:rFonts w:ascii="Times New Roman" w:hAnsi="Times New Roman" w:cs="Times New Roman"/>
-        </w:rPr>
-        <w:t xml:space="preserve"> at the end of the </w:t>
-      </w:r>
-      <w:r>
-        <w:rPr>
-          <w:rFonts w:ascii="Times New Roman" w:hAnsi="Times New Roman" w:cs="Times New Roman"/>
-        </w:rPr>
-        <w:t>time series</w:t>
-      </w:r>
-      <w:r>
-        <w:rPr>
-          <w:rFonts w:ascii="Times New Roman" w:hAnsi="Times New Roman" w:cs="Times New Roman"/>
-        </w:rPr>
-        <w:t xml:space="preserve">. </w:t>
-      </w:r>
-      <w:r>
-        <w:rPr>
-          <w:rFonts w:ascii="Times New Roman" w:hAnsi="Times New Roman" w:cs="Times New Roman"/>
-        </w:rPr>
-        <w:t>Manual s</w:t>
-      </w:r>
-      <w:r>
-        <w:rPr>
-          <w:rFonts w:ascii="Times New Roman" w:hAnsi="Times New Roman" w:cs="Times New Roman"/>
-        </w:rPr>
-        <w:t xml:space="preserve">election of trimming locations </w:t>
-      </w:r>
-      <w:r>
-        <w:rPr>
-          <w:rFonts w:ascii="Times New Roman" w:hAnsi="Times New Roman" w:cs="Times New Roman"/>
-        </w:rPr>
-        <w:t>was</w:t>
-      </w:r>
-      <w:r>
-        <w:rPr>
-          <w:rFonts w:ascii="Times New Roman" w:hAnsi="Times New Roman" w:cs="Times New Roman"/>
-        </w:rPr>
-        <w:t xml:space="preserve"> randomized and blinded to avoid </w:t>
-      </w:r>
-      <w:r>
-        <w:rPr>
-          <w:rFonts w:ascii="Times New Roman" w:hAnsi="Times New Roman" w:cs="Times New Roman"/>
-        </w:rPr>
-        <w:t xml:space="preserve">bias. </w:t>
-      </w:r>
-      <w:r>
-        <w:rPr>
-          <w:rFonts w:ascii="Times New Roman" w:hAnsi="Times New Roman" w:cs="Times New Roman"/>
-        </w:rPr>
-        <w:t>All trimmed datasets were then manually</w:t>
-      </w:r>
-      <w:r>
-        <w:rPr>
-          <w:rFonts w:ascii="Times New Roman" w:hAnsi="Times New Roman" w:cs="Times New Roman"/>
-        </w:rPr>
-        <w:t xml:space="preserve"> checked for quality</w:t>
-      </w:r>
-      <w:r>
-        <w:rPr>
-          <w:rFonts w:ascii="Times New Roman" w:hAnsi="Times New Roman" w:cs="Times New Roman"/>
-        </w:rPr>
-        <w:t xml:space="preserve"> and s</w:t>
-      </w:r>
-      <w:r>
-        <w:rPr>
-          <w:rFonts w:ascii="Times New Roman" w:hAnsi="Times New Roman" w:cs="Times New Roman"/>
-        </w:rPr>
-        <w:t xml:space="preserve">amples with significant error (i.e large cracks) </w:t>
-      </w:r>
-      <w:r>
-        <w:rPr>
-          <w:rFonts w:ascii="Times New Roman" w:hAnsi="Times New Roman" w:cs="Times New Roman"/>
-        </w:rPr>
-        <w:t>or</w:t>
-      </w:r>
-      <w:r>
-        <w:rPr>
-          <w:rFonts w:ascii="Times New Roman" w:hAnsi="Times New Roman" w:cs="Times New Roman"/>
-        </w:rPr>
-        <w:t xml:space="preserve"> without a clear core </w:t>
-      </w:r>
-      <w:r>
-        <w:rPr>
-          <w:rFonts w:ascii="Times New Roman" w:hAnsi="Times New Roman" w:cs="Times New Roman"/>
-        </w:rPr>
-        <w:t xml:space="preserve">and marine </w:t>
-      </w:r>
-      <w:r>
-        <w:rPr>
-          <w:rFonts w:ascii="Times New Roman" w:hAnsi="Times New Roman" w:cs="Times New Roman"/>
-        </w:rPr>
-        <w:t xml:space="preserve">signal were removed from the dataset. </w:t>
-      </w:r>
-      <w:r>
-        <w:rPr>
-          <w:rFonts w:ascii="Times New Roman" w:hAnsi="Times New Roman" w:cs="Times New Roman"/>
-        </w:rPr>
-        <w:t xml:space="preserve">The resulting dataset contained </w:t>
-      </w:r>
-      <w:r>
-        <w:rPr>
-          <w:rFonts w:ascii="Times New Roman" w:hAnsi="Times New Roman" w:cs="Times New Roman"/>
-        </w:rPr>
-        <w:t>time series</w:t>
-      </w:r>
-      <w:r>
-        <w:rPr>
-          <w:rFonts w:ascii="Times New Roman" w:hAnsi="Times New Roman" w:cs="Times New Roman"/>
-        </w:rPr>
-        <w:t xml:space="preserve"> from 2,531 individual otoliths</w:t>
-      </w:r>
-      <w:r>
-        <w:rPr>
-          <w:rFonts w:ascii="Times New Roman" w:hAnsi="Times New Roman" w:cs="Times New Roman"/>
-        </w:rPr>
-        <w:t xml:space="preserve"> (971 Yukon, 875 Kuskokwim, and 685 Nushagak). </w:t>
-      </w:r>
-    </w:p>
-    <w:p>
-      <w:pPr>
-        <w:spacing w:line="480" w:lineRule="auto"/>
-        <w:ind w:firstLine="720"/>
-        <w:rPr>
-          <w:rFonts w:ascii="Times New Roman" w:hAnsi="Times New Roman" w:cs="Times New Roman"/>
-        </w:rPr>
-      </w:pPr>
-      <w:r>
-        <w:rPr>
-          <w:rFonts w:ascii="Times New Roman" w:hAnsi="Times New Roman" w:cs="Times New Roman"/>
-        </w:rPr>
-        <w:t>To test whether</w:t>
-      </w:r>
-      <w:r>
-        <w:rPr>
-          <w:rFonts w:ascii="Times New Roman" w:hAnsi="Times New Roman" w:cs="Times New Roman"/>
-        </w:rPr>
-        <w:t xml:space="preserve"> </w:t>
-      </w:r>
-      <w:r>
-        <w:rPr>
-          <w:rFonts w:ascii="Times New Roman" w:hAnsi="Times New Roman" w:cs="Times New Roman"/>
-        </w:rPr>
-        <w:t>time</w:t>
-      </w:r>
-      <w:r>
-        <w:rPr>
-          <w:rFonts w:ascii="Times New Roman" w:hAnsi="Times New Roman" w:cs="Times New Roman"/>
-        </w:rPr>
-        <w:t>-</w:t>
-      </w:r>
-      <w:r>
-        <w:rPr>
-          <w:rFonts w:ascii="Times New Roman" w:hAnsi="Times New Roman" w:cs="Times New Roman"/>
-        </w:rPr>
-        <w:t xml:space="preserve">series smoothing techniques </w:t>
-      </w:r>
-      <w:r>
-        <w:rPr>
-          <w:rFonts w:ascii="Times New Roman" w:hAnsi="Times New Roman" w:cs="Times New Roman"/>
-        </w:rPr>
-        <w:t xml:space="preserve">could improve </w:t>
-      </w:r>
-      <w:r>
-        <w:rPr>
-          <w:rFonts w:ascii="Times New Roman" w:hAnsi="Times New Roman" w:cs="Times New Roman"/>
-        </w:rPr>
-        <w:t xml:space="preserve">classification </w:t>
-      </w:r>
-      <w:r>
-        <w:rPr>
-          <w:rFonts w:ascii="Times New Roman" w:hAnsi="Times New Roman" w:cs="Times New Roman"/>
-        </w:rPr>
-        <w:t>model performance</w:t>
-      </w:r>
-      <w:r>
-        <w:rPr>
-          <w:rFonts w:ascii="Times New Roman" w:hAnsi="Times New Roman" w:cs="Times New Roman"/>
-        </w:rPr>
-        <w:t xml:space="preserve">, we applied </w:t>
-      </w:r>
-      <w:r>
-        <w:rPr>
-          <w:rFonts w:ascii="Times New Roman" w:hAnsi="Times New Roman" w:cs="Times New Roman"/>
-        </w:rPr>
-        <w:t>two commonly used approaches: moving average (MA) and a generalized additive model (GAM)</w:t>
-      </w:r>
-      <w:r>
-        <w:rPr>
-          <w:rFonts w:ascii="Times New Roman" w:hAnsi="Times New Roman" w:cs="Times New Roman"/>
-        </w:rPr>
-        <w:t xml:space="preserve"> on the raw strontium isotope data</w:t>
-      </w:r>
-      <w:r>
-        <w:rPr>
-          <w:rFonts w:ascii="Times New Roman" w:hAnsi="Times New Roman" w:cs="Times New Roman"/>
-        </w:rPr>
-        <w:t xml:space="preserve">. </w:t>
-      </w:r>
-      <w:r>
-        <w:rPr>
-          <w:rFonts w:ascii="Times New Roman" w:hAnsi="Times New Roman" w:cs="Times New Roman"/>
-        </w:rPr>
-        <w:t>For the moving average smoothing w</w:t>
-      </w:r>
-      <w:r>
-        <w:rPr>
-          <w:rFonts w:ascii="Times New Roman" w:hAnsi="Times New Roman" w:cs="Times New Roman"/>
-        </w:rPr>
-        <w:t>e used a 60</w:t>
-      </w:r>
-      <w:r>
-        <w:rPr>
-          <w:rFonts w:ascii="Times New Roman" w:hAnsi="Times New Roman" w:cs="Times New Roman"/>
-        </w:rPr>
-        <w:t>-</w:t>
-      </w:r>
-      <w:r>
-        <w:rPr>
-          <w:rFonts w:ascii="Times New Roman" w:hAnsi="Times New Roman" w:cs="Times New Roman"/>
-        </w:rPr>
-        <w:t>point center weighted window</w:t>
-      </w:r>
-      <w:r>
-        <w:rPr>
-          <w:rFonts w:ascii="Times New Roman" w:hAnsi="Times New Roman" w:cs="Times New Roman"/>
-        </w:rPr>
-        <w:t xml:space="preserve">. </w:t>
-      </w:r>
-      <w:r>
-        <w:rPr>
-          <w:rFonts w:ascii="Times New Roman" w:hAnsi="Times New Roman" w:cs="Times New Roman"/>
-        </w:rPr>
-        <w:t xml:space="preserve">The GAM was fitted using thin plate regression and penalized iteratively re-weighted least squares (P-IRLS) to maximize goodness of fit, with a generalized cross-validation (GCV) method </w:t>
-      </w:r>
-      <w:r>
-        <w:rPr>
-          <w:rFonts w:ascii="Times New Roman" w:hAnsi="Times New Roman" w:cs="Times New Roman"/>
-        </w:rPr>
-        <w:t xml:space="preserve">used </w:t>
-      </w:r>
-      <w:r>
-        <w:rPr>
-          <w:rFonts w:ascii="Times New Roman" w:hAnsi="Times New Roman" w:cs="Times New Roman"/>
-        </w:rPr>
-        <w:t xml:space="preserve">to minimize overfitting </w:t>
-      </w:r>
-      <w:r>
-        <w:rPr>
-          <w:rFonts w:ascii="Times New Roman" w:hAnsi="Times New Roman" w:cs="Times New Roman"/>
-        </w:rPr>
-        <w:t xml:space="preserve">(Wood, </w:t>
-      </w:r>
-      <w:r>
-        <w:rPr>
-          <w:rFonts w:ascii="Times New Roman" w:hAnsi="Times New Roman" w:cs="Times New Roman"/>
-        </w:rPr>
-        <w:lastRenderedPageBreak/>
-        <w:t>2006). The maximum degrees of freedom (k) were scaled by the number of data points in each ablation line (n) by k = 10</w:t>
-      </w:r>
-      <w:r>
-        <w:rPr>
-          <w:rFonts w:ascii="Times New Roman" w:hAnsi="Times New Roman" w:cs="Times New Roman"/>
-        </w:rPr>
-        <w:t xml:space="preserve"> * n</w:t>
-      </w:r>
-      <w:r>
-        <w:rPr>
-          <w:rFonts w:ascii="Times New Roman" w:hAnsi="Times New Roman" w:cs="Times New Roman"/>
-        </w:rPr>
-        <w:t xml:space="preserve"> </w:t>
-      </w:r>
-      <w:r>
-        <w:rPr>
-          <w:rFonts w:ascii="Times New Roman" w:hAnsi="Times New Roman" w:cs="Times New Roman"/>
-          <w:vertAlign w:val="superscript"/>
-        </w:rPr>
-        <w:t>2/9</w:t>
-      </w:r>
-      <w:r>
-        <w:rPr>
-          <w:rFonts w:ascii="Times New Roman" w:hAnsi="Times New Roman" w:cs="Times New Roman"/>
-          <w:vertAlign w:val="superscript"/>
-        </w:rPr>
-        <w:t xml:space="preserve"> </w:t>
-      </w:r>
-      <w:r>
-        <w:rPr>
-          <w:rFonts w:ascii="Times New Roman" w:hAnsi="Times New Roman" w:cs="Times New Roman"/>
-        </w:rPr>
-        <w:t xml:space="preserve">(Kim and Gu, 2004, Brennan et al., </w:t>
-      </w:r>
-      <w:r>
-        <w:rPr>
-          <w:rFonts w:ascii="Times New Roman" w:hAnsi="Times New Roman" w:cs="Times New Roman"/>
-        </w:rPr>
-        <w:t>2014)</w:t>
-      </w:r>
-      <w:r>
-        <w:rPr>
-          <w:rFonts w:ascii="Times New Roman" w:hAnsi="Times New Roman" w:cs="Times New Roman"/>
-        </w:rPr>
-        <w:t xml:space="preserve">. </w:t>
-      </w:r>
-      <w:r>
-        <w:rPr>
-          <w:rFonts w:ascii="Times New Roman" w:hAnsi="Times New Roman" w:cs="Times New Roman"/>
-        </w:rPr>
-        <w:t>This process resulted in three versions of the</w:t>
-      </w:r>
-      <w:r>
-        <w:rPr>
-          <w:rFonts w:ascii="Times New Roman" w:hAnsi="Times New Roman" w:cs="Times New Roman"/>
-        </w:rPr>
-        <w:t xml:space="preserve"> same laser ablation time</w:t>
-      </w:r>
-      <w:r>
-        <w:rPr>
-          <w:rFonts w:ascii="Times New Roman" w:hAnsi="Times New Roman" w:cs="Times New Roman"/>
-        </w:rPr>
-        <w:t xml:space="preserve"> </w:t>
-      </w:r>
-      <w:r>
-        <w:rPr>
-          <w:rFonts w:ascii="Times New Roman" w:hAnsi="Times New Roman" w:cs="Times New Roman"/>
-        </w:rPr>
-        <w:t xml:space="preserve">series for </w:t>
-      </w:r>
-      <w:proofErr w:type="gramStart"/>
-      <w:r>
-        <w:rPr>
-          <w:rFonts w:ascii="Times New Roman" w:hAnsi="Times New Roman" w:cs="Times New Roman"/>
-        </w:rPr>
-        <w:t>each individual</w:t>
-      </w:r>
-      <w:proofErr w:type="gramEnd"/>
-      <w:r>
-        <w:rPr>
-          <w:rFonts w:ascii="Times New Roman" w:hAnsi="Times New Roman" w:cs="Times New Roman"/>
-        </w:rPr>
-        <w:t>: GAM-smoothed, MA-smoothed, and raw LA data. Finally, all samples were interpolated to a common length</w:t>
-      </w:r>
-      <w:r>
-        <w:rPr>
-          <w:rFonts w:ascii="Times New Roman" w:hAnsi="Times New Roman" w:cs="Times New Roman"/>
-        </w:rPr>
-        <w:t xml:space="preserve"> </w:t>
-      </w:r>
-      <w:r>
-        <w:rPr>
-          <w:rFonts w:ascii="Times New Roman" w:hAnsi="Times New Roman" w:cs="Times New Roman"/>
-        </w:rPr>
-        <w:t xml:space="preserve">defined as the average length of </w:t>
-      </w:r>
-      <w:proofErr w:type="spellStart"/>
-      <w:r>
-        <w:rPr>
-          <w:rFonts w:ascii="Times New Roman" w:hAnsi="Times New Roman" w:cs="Times New Roman"/>
-        </w:rPr>
-        <w:t>all time</w:t>
-      </w:r>
-      <w:proofErr w:type="spellEnd"/>
-      <w:r>
-        <w:rPr>
-          <w:rFonts w:ascii="Times New Roman" w:hAnsi="Times New Roman" w:cs="Times New Roman"/>
-        </w:rPr>
-        <w:t xml:space="preserve"> </w:t>
-      </w:r>
-      <w:r>
-        <w:rPr>
-          <w:rFonts w:ascii="Times New Roman" w:hAnsi="Times New Roman" w:cs="Times New Roman"/>
-        </w:rPr>
-        <w:t>s</w:t>
-      </w:r>
-      <w:r>
-        <w:rPr>
-          <w:rFonts w:ascii="Times New Roman" w:hAnsi="Times New Roman" w:cs="Times New Roman"/>
-        </w:rPr>
-        <w:t xml:space="preserve">eries </w:t>
-      </w:r>
-      <w:r>
-        <w:rPr>
-          <w:rFonts w:ascii="Times New Roman" w:hAnsi="Times New Roman" w:cs="Times New Roman"/>
-        </w:rPr>
-        <w:t xml:space="preserve">of that type </w:t>
-      </w:r>
-      <w:r>
-        <w:rPr>
-          <w:rFonts w:ascii="Times New Roman" w:hAnsi="Times New Roman" w:cs="Times New Roman"/>
-        </w:rPr>
-        <w:t>(</w:t>
-      </w:r>
-      <w:r>
-        <w:rPr>
-          <w:rFonts w:ascii="Times New Roman" w:hAnsi="Times New Roman" w:cs="Times New Roman"/>
-        </w:rPr>
-        <w:t>694</w:t>
-      </w:r>
-      <w:r>
-        <w:rPr>
-          <w:rFonts w:ascii="Times New Roman" w:hAnsi="Times New Roman" w:cs="Times New Roman"/>
-        </w:rPr>
-        <w:t xml:space="preserve"> points for non-MA and 6</w:t>
-      </w:r>
-      <w:r>
-        <w:rPr>
-          <w:rFonts w:ascii="Times New Roman" w:hAnsi="Times New Roman" w:cs="Times New Roman"/>
-        </w:rPr>
-        <w:t>64</w:t>
-      </w:r>
-      <w:r>
-        <w:rPr>
-          <w:rFonts w:ascii="Times New Roman" w:hAnsi="Times New Roman" w:cs="Times New Roman"/>
-        </w:rPr>
-        <w:t xml:space="preserve"> points for MA-smoothed samples, respectively) </w:t>
-      </w:r>
-      <w:r>
-        <w:rPr>
-          <w:rFonts w:ascii="Times New Roman" w:hAnsi="Times New Roman" w:cs="Times New Roman"/>
-        </w:rPr>
-        <w:t>(Hegg and Kennedy, 2021).</w:t>
-      </w:r>
-      <w:r>
-        <w:rPr>
-          <w:rFonts w:ascii="Times New Roman" w:hAnsi="Times New Roman" w:cs="Times New Roman"/>
-        </w:rPr>
-        <w:t xml:space="preserve"> This was done to satisfy the requirement for equal length vectors for </w:t>
-      </w:r>
-      <w:r>
-        <w:rPr>
-          <w:rFonts w:ascii="Times New Roman" w:hAnsi="Times New Roman" w:cs="Times New Roman"/>
-        </w:rPr>
-        <w:t>ML</w:t>
-      </w:r>
-      <w:r>
-        <w:rPr>
-          <w:rFonts w:ascii="Times New Roman" w:hAnsi="Times New Roman" w:cs="Times New Roman"/>
-        </w:rPr>
-        <w:t xml:space="preserve"> algorithms </w:t>
-      </w:r>
-      <w:r>
-        <w:rPr>
-          <w:rFonts w:ascii="Times New Roman" w:hAnsi="Times New Roman" w:cs="Times New Roman"/>
-        </w:rPr>
-        <w:t xml:space="preserve">while minimizing warping from interpolation. </w:t>
-      </w:r>
-    </w:p>
-    <w:p>
-      <w:pPr>
-        <w:spacing w:line="480" w:lineRule="auto"/>
-        <w:ind w:firstLine="720"/>
-        <w:rPr>
-          <w:rFonts w:ascii="Times New Roman" w:hAnsi="Times New Roman" w:cs="Times New Roman"/>
-        </w:rPr>
-      </w:pPr>
-      <w:r>
-        <w:rPr>
-          <w:rFonts w:ascii="Times New Roman" w:hAnsi="Times New Roman" w:cs="Times New Roman"/>
-        </w:rPr>
-        <w:t xml:space="preserve">Principal component analysis (PCA) was applied </w:t>
-      </w:r>
-      <w:r>
-        <w:rPr>
-          <w:rFonts w:ascii="Times New Roman" w:hAnsi="Times New Roman" w:cs="Times New Roman"/>
-        </w:rPr>
-        <w:t xml:space="preserve">to </w:t>
-      </w:r>
-      <w:r>
-        <w:rPr>
-          <w:rFonts w:ascii="Times New Roman" w:hAnsi="Times New Roman" w:cs="Times New Roman"/>
-        </w:rPr>
-        <w:t xml:space="preserve">all </w:t>
-      </w:r>
-      <w:r>
-        <w:rPr>
-          <w:rFonts w:ascii="Times New Roman" w:hAnsi="Times New Roman" w:cs="Times New Roman"/>
-        </w:rPr>
-        <w:t>timeseries</w:t>
-      </w:r>
-      <w:r>
-        <w:rPr>
-          <w:rFonts w:ascii="Times New Roman" w:hAnsi="Times New Roman" w:cs="Times New Roman"/>
-        </w:rPr>
-        <w:t xml:space="preserve"> from </w:t>
-      </w:r>
-      <w:r>
-        <w:rPr>
-          <w:rFonts w:ascii="Times New Roman" w:hAnsi="Times New Roman" w:cs="Times New Roman"/>
-        </w:rPr>
-        <w:t>the</w:t>
-      </w:r>
-      <w:r>
-        <w:rPr>
-          <w:rFonts w:ascii="Times New Roman" w:hAnsi="Times New Roman" w:cs="Times New Roman"/>
-        </w:rPr>
-        <w:t xml:space="preserve"> dataset in the</w:t>
-      </w:r>
-      <w:r>
-        <w:rPr>
-          <w:rFonts w:ascii="Times New Roman" w:hAnsi="Times New Roman" w:cs="Times New Roman"/>
-        </w:rPr>
-        <w:t xml:space="preserve"> top-performing model</w:t>
-      </w:r>
-      <w:r>
-        <w:rPr>
-          <w:rFonts w:ascii="Times New Roman" w:hAnsi="Times New Roman" w:cs="Times New Roman"/>
-        </w:rPr>
-        <w:t xml:space="preserve"> (GAM smoothed data)</w:t>
-      </w:r>
-      <w:r>
-        <w:rPr>
-          <w:rFonts w:ascii="Times New Roman" w:hAnsi="Times New Roman" w:cs="Times New Roman"/>
-        </w:rPr>
-        <w:t xml:space="preserve"> to qualitatively assess clustering patterns in multivariate space</w:t>
-      </w:r>
-      <w:r>
-        <w:rPr>
-          <w:rFonts w:ascii="Times New Roman" w:hAnsi="Times New Roman" w:cs="Times New Roman"/>
-        </w:rPr>
-        <w:t xml:space="preserve"> (Figure </w:t>
-      </w:r>
-      <w:r>
-        <w:rPr>
-          <w:rFonts w:ascii="Times New Roman" w:hAnsi="Times New Roman" w:cs="Times New Roman"/>
-        </w:rPr>
-        <w:t>2</w:t>
-      </w:r>
-      <w:r>
-        <w:rPr>
-          <w:rFonts w:ascii="Times New Roman" w:hAnsi="Times New Roman" w:cs="Times New Roman"/>
-        </w:rPr>
-        <w:t>)</w:t>
-      </w:r>
-      <w:r>
-        <w:rPr>
-          <w:rFonts w:ascii="Times New Roman" w:hAnsi="Times New Roman" w:cs="Times New Roman"/>
-        </w:rPr>
-        <w:t>.</w:t>
-      </w:r>
-      <w:r>
-        <w:rPr>
-          <w:rFonts w:ascii="Times New Roman" w:hAnsi="Times New Roman" w:cs="Times New Roman"/>
-        </w:rPr>
-        <w:t xml:space="preserve"> PCA transforms the original </w:t>
-      </w:r>
-      <w:r>
-        <w:rPr>
-          <w:rFonts w:ascii="Times New Roman" w:hAnsi="Times New Roman" w:cs="Times New Roman"/>
-        </w:rPr>
-        <w:t>time</w:t>
-      </w:r>
-      <w:r>
-        <w:rPr>
-          <w:rFonts w:ascii="Times New Roman" w:hAnsi="Times New Roman" w:cs="Times New Roman"/>
-        </w:rPr>
-        <w:t xml:space="preserve"> </w:t>
-      </w:r>
-      <w:r>
-        <w:rPr>
-          <w:rFonts w:ascii="Times New Roman" w:hAnsi="Times New Roman" w:cs="Times New Roman"/>
-        </w:rPr>
-        <w:t xml:space="preserve">series </w:t>
-      </w:r>
-      <w:r>
-        <w:rPr>
-          <w:rFonts w:ascii="Times New Roman" w:hAnsi="Times New Roman" w:cs="Times New Roman"/>
-        </w:rPr>
-        <w:t xml:space="preserve">into uncorrelated principal components that capture the greatest variance in the dataset, thereby highlighting variability among </w:t>
-      </w:r>
-      <w:r>
-        <w:rPr>
-          <w:rFonts w:ascii="Times New Roman" w:hAnsi="Times New Roman" w:cs="Times New Roman"/>
-        </w:rPr>
-        <w:t>time series</w:t>
-      </w:r>
-      <w:r>
-        <w:rPr>
-          <w:rFonts w:ascii="Times New Roman" w:hAnsi="Times New Roman" w:cs="Times New Roman"/>
-        </w:rPr>
-        <w:t xml:space="preserve"> that may contain distinguishing watershed characteristics</w:t>
-      </w:r>
-      <w:r>
-        <w:rPr>
-          <w:rFonts w:ascii="Times New Roman" w:hAnsi="Times New Roman" w:cs="Times New Roman"/>
-        </w:rPr>
-        <w:t xml:space="preserve">. </w:t>
-      </w:r>
-      <w:r>
-        <w:rPr>
-          <w:rFonts w:ascii="Times New Roman" w:hAnsi="Times New Roman" w:cs="Times New Roman"/>
-        </w:rPr>
-        <w:t>To further illustrate how</w:t>
-      </w:r>
-      <w:r>
-        <w:rPr>
-          <w:rFonts w:ascii="Times New Roman" w:hAnsi="Times New Roman" w:cs="Times New Roman"/>
-        </w:rPr>
-        <w:t xml:space="preserve"> this</w:t>
-      </w:r>
-      <w:r>
-        <w:rPr>
-          <w:rFonts w:ascii="Times New Roman" w:hAnsi="Times New Roman" w:cs="Times New Roman"/>
-        </w:rPr>
-        <w:t xml:space="preserve"> variability among </w:t>
-      </w:r>
-      <w:r>
-        <w:rPr>
-          <w:rFonts w:ascii="Times New Roman" w:hAnsi="Times New Roman" w:cs="Times New Roman"/>
-        </w:rPr>
-        <w:t>time series</w:t>
-      </w:r>
-      <w:r>
-        <w:rPr>
-          <w:rFonts w:ascii="Times New Roman" w:hAnsi="Times New Roman" w:cs="Times New Roman"/>
-        </w:rPr>
-        <w:t xml:space="preserve"> can distinguish among </w:t>
-      </w:r>
-      <w:r>
-        <w:rPr>
-          <w:rFonts w:ascii="Times New Roman" w:hAnsi="Times New Roman" w:cs="Times New Roman"/>
-        </w:rPr>
-        <w:t>individuals</w:t>
-      </w:r>
-      <w:r>
-        <w:rPr>
-          <w:rFonts w:ascii="Times New Roman" w:hAnsi="Times New Roman" w:cs="Times New Roman"/>
-        </w:rPr>
-        <w:t xml:space="preserve"> </w:t>
-      </w:r>
-      <w:r>
-        <w:rPr>
-          <w:rFonts w:ascii="Times New Roman" w:hAnsi="Times New Roman" w:cs="Times New Roman"/>
-        </w:rPr>
-        <w:t xml:space="preserve">that are otherwise indistinguishable using </w:t>
-      </w:r>
-      <w:r>
-        <w:rPr>
-          <w:rFonts w:ascii="Times New Roman" w:hAnsi="Times New Roman" w:cs="Times New Roman"/>
-        </w:rPr>
-        <w:t xml:space="preserve">the </w:t>
-      </w:r>
-      <w:r>
-        <w:rPr>
-          <w:rFonts w:ascii="Times New Roman" w:hAnsi="Times New Roman" w:cs="Times New Roman"/>
-        </w:rPr>
-        <w:t xml:space="preserve">natal </w:t>
-      </w:r>
-      <w:r>
-        <w:rPr>
-          <w:rFonts w:ascii="Times New Roman" w:hAnsi="Times New Roman" w:cs="Times New Roman"/>
-        </w:rPr>
-        <w:t>freshwater ⁸⁷Sr/⁸⁶Sr</w:t>
-      </w:r>
-      <w:r>
-        <w:rPr>
-          <w:rFonts w:ascii="Times New Roman" w:hAnsi="Times New Roman" w:cs="Times New Roman"/>
-        </w:rPr>
-        <w:t xml:space="preserve">, PCA analysis </w:t>
-      </w:r>
-      <w:r>
-        <w:rPr>
-          <w:rFonts w:ascii="Times New Roman" w:hAnsi="Times New Roman" w:cs="Times New Roman"/>
-        </w:rPr>
-        <w:t>was also</w:t>
-      </w:r>
-      <w:r>
-        <w:rPr>
-          <w:rFonts w:ascii="Times New Roman" w:hAnsi="Times New Roman" w:cs="Times New Roman"/>
-        </w:rPr>
-        <w:t xml:space="preserve"> done on a subset of the GAM smoothed dataset which include only individuals with a natal </w:t>
-      </w:r>
-      <w:r>
-        <w:rPr>
-          <w:rFonts w:ascii="Times New Roman" w:hAnsi="Times New Roman" w:cs="Times New Roman"/>
-        </w:rPr>
-        <w:t xml:space="preserve">⁸⁷Sr/⁸⁶Sr </w:t>
-      </w:r>
-      <w:r>
-        <w:rPr>
-          <w:rFonts w:ascii="Times New Roman" w:hAnsi="Times New Roman" w:cs="Times New Roman"/>
-        </w:rPr>
-        <w:t>between</w:t>
-      </w:r>
-      <w:r>
-        <w:rPr>
-          <w:rFonts w:ascii="Times New Roman" w:hAnsi="Times New Roman" w:cs="Times New Roman"/>
-        </w:rPr>
-        <w:t xml:space="preserve"> 0.70</w:t>
-      </w:r>
-      <w:r>
-        <w:rPr>
-          <w:rFonts w:ascii="Times New Roman" w:hAnsi="Times New Roman" w:cs="Times New Roman"/>
-        </w:rPr>
-        <w:t>80</w:t>
-      </w:r>
-      <w:r>
-        <w:rPr>
-          <w:rFonts w:ascii="Times New Roman" w:hAnsi="Times New Roman" w:cs="Times New Roman"/>
-        </w:rPr>
-        <w:t xml:space="preserve"> and </w:t>
-      </w:r>
-      <w:r>
-        <w:rPr>
-          <w:rFonts w:ascii="Times New Roman" w:hAnsi="Times New Roman" w:cs="Times New Roman"/>
-        </w:rPr>
-        <w:t>0.708</w:t>
-      </w:r>
-      <w:r>
-        <w:rPr>
-          <w:rFonts w:ascii="Times New Roman" w:hAnsi="Times New Roman" w:cs="Times New Roman"/>
-        </w:rPr>
-        <w:t>5</w:t>
-      </w:r>
-      <w:r>
-        <w:rPr>
-          <w:rFonts w:ascii="Times New Roman" w:hAnsi="Times New Roman" w:cs="Times New Roman"/>
-        </w:rPr>
-        <w:t>. PCA plots were produced to visualize clustering of both PC1 (47.</w:t>
-      </w:r>
-      <w:r>
-        <w:rPr>
-          <w:rFonts w:ascii="Times New Roman" w:hAnsi="Times New Roman" w:cs="Times New Roman"/>
-        </w:rPr>
-        <w:t>5</w:t>
-      </w:r>
-      <w:r>
-        <w:rPr>
-          <w:rFonts w:ascii="Times New Roman" w:hAnsi="Times New Roman" w:cs="Times New Roman"/>
-        </w:rPr>
-        <w:t>% of variance) and PC2 (20.9% of variance) as well as between PC1 and PC3 (10.2% of variance)</w:t>
-      </w:r>
-      <w:r>
-        <w:rPr>
-          <w:rFonts w:ascii="Times New Roman" w:hAnsi="Times New Roman" w:cs="Times New Roman"/>
-        </w:rPr>
-        <w:t xml:space="preserve"> (Figure 3a)</w:t>
-      </w:r>
-      <w:r>
-        <w:rPr>
-          <w:rFonts w:ascii="Times New Roman" w:hAnsi="Times New Roman" w:cs="Times New Roman"/>
-        </w:rPr>
-        <w:t xml:space="preserve">. </w:t>
-      </w:r>
-      <w:r>
-        <w:rPr>
-          <w:rFonts w:ascii="Times New Roman" w:hAnsi="Times New Roman" w:cs="Times New Roman"/>
-        </w:rPr>
-        <w:t>We then displayed the absolute values</w:t>
-      </w:r>
-      <w:r>
-        <w:rPr>
-          <w:rFonts w:ascii="Times New Roman" w:hAnsi="Times New Roman" w:cs="Times New Roman"/>
-        </w:rPr>
-        <w:t xml:space="preserve"> of each point’s</w:t>
-      </w:r>
-      <w:r>
-        <w:rPr>
-          <w:rFonts w:ascii="Times New Roman" w:hAnsi="Times New Roman" w:cs="Times New Roman"/>
-        </w:rPr>
-        <w:t xml:space="preserve"> loading </w:t>
-      </w:r>
-      <w:r>
-        <w:rPr>
-          <w:rFonts w:ascii="Times New Roman" w:hAnsi="Times New Roman" w:cs="Times New Roman"/>
-        </w:rPr>
-        <w:t xml:space="preserve">on the corresponding index of the time series </w:t>
-      </w:r>
-      <w:r>
-        <w:rPr>
-          <w:rFonts w:ascii="Times New Roman" w:hAnsi="Times New Roman" w:cs="Times New Roman"/>
-        </w:rPr>
-        <w:t xml:space="preserve">to identify </w:t>
-      </w:r>
-      <w:r>
-        <w:rPr>
-          <w:rFonts w:ascii="Times New Roman" w:hAnsi="Times New Roman" w:cs="Times New Roman"/>
-        </w:rPr>
-        <w:t>regions</w:t>
-      </w:r>
-      <w:r>
-        <w:rPr>
-          <w:rFonts w:ascii="Times New Roman" w:hAnsi="Times New Roman" w:cs="Times New Roman"/>
-        </w:rPr>
-        <w:t xml:space="preserve"> of the </w:t>
-      </w:r>
-      <w:r>
-        <w:rPr>
-          <w:rFonts w:ascii="Times New Roman" w:hAnsi="Times New Roman" w:cs="Times New Roman"/>
-        </w:rPr>
-        <w:t>time series</w:t>
-      </w:r>
-      <w:r>
-        <w:rPr>
-          <w:rFonts w:ascii="Times New Roman" w:hAnsi="Times New Roman" w:cs="Times New Roman"/>
-        </w:rPr>
-        <w:t xml:space="preserve"> </w:t>
-      </w:r>
-      <w:r>
-        <w:rPr>
-          <w:rFonts w:ascii="Times New Roman" w:hAnsi="Times New Roman" w:cs="Times New Roman"/>
-        </w:rPr>
-        <w:t xml:space="preserve">which </w:t>
-      </w:r>
-      <w:r>
-        <w:rPr>
-          <w:rFonts w:ascii="Times New Roman" w:hAnsi="Times New Roman" w:cs="Times New Roman"/>
-        </w:rPr>
-        <w:t>contribut</w:t>
-      </w:r>
-      <w:r>
-        <w:rPr>
-          <w:rFonts w:ascii="Times New Roman" w:hAnsi="Times New Roman" w:cs="Times New Roman"/>
-        </w:rPr>
-        <w:t>e</w:t>
-      </w:r>
-      <w:r>
-        <w:rPr>
-          <w:rFonts w:ascii="Times New Roman" w:hAnsi="Times New Roman" w:cs="Times New Roman"/>
-        </w:rPr>
-        <w:t xml:space="preserve"> to interclass separation</w:t>
-      </w:r>
-      <w:r>
-        <w:rPr>
-          <w:rFonts w:ascii="Times New Roman" w:hAnsi="Times New Roman" w:cs="Times New Roman"/>
-        </w:rPr>
-        <w:t xml:space="preserve"> among individuals with the same natal origin ratio</w:t>
-      </w:r>
-      <w:r>
-        <w:rPr>
-          <w:rFonts w:ascii="Times New Roman" w:hAnsi="Times New Roman" w:cs="Times New Roman"/>
-        </w:rPr>
-        <w:t xml:space="preserve"> </w:t>
-      </w:r>
-      <w:r>
-        <w:rPr>
-          <w:rFonts w:ascii="Times New Roman" w:hAnsi="Times New Roman" w:cs="Times New Roman"/>
-        </w:rPr>
-        <w:t xml:space="preserve">(Figure </w:t>
-      </w:r>
-      <w:r>
-        <w:rPr>
-          <w:rFonts w:ascii="Times New Roman" w:hAnsi="Times New Roman" w:cs="Times New Roman"/>
-        </w:rPr>
-        <w:t>3</w:t>
-      </w:r>
-      <w:r>
-        <w:rPr>
-          <w:rFonts w:ascii="Times New Roman" w:hAnsi="Times New Roman" w:cs="Times New Roman"/>
-        </w:rPr>
-        <w:t>b)</w:t>
-      </w:r>
-      <w:r>
-        <w:rPr>
-          <w:rFonts w:ascii="Times New Roman" w:hAnsi="Times New Roman" w:cs="Times New Roman"/>
-        </w:rPr>
-        <w:t xml:space="preserve">. </w:t>
-      </w:r>
-    </w:p>
-    <w:p>
-      <w:pPr>
-        <w:spacing w:line="480" w:lineRule="auto"/>
+        <w:t>Data pre</w:t>
+      </w:r>
+      <w:r>
         <w:rPr>
           <w:rFonts w:ascii="Times New Roman" w:hAnsi="Times New Roman" w:cs="Times New Roman"/>
           <w:b/>
           <w:bCs/>
           <w:u w:val="single"/>
         </w:rPr>
-      </w:pPr>
-    </w:p>
-    <w:p>
-      <w:pPr>
-        <w:spacing w:line="480" w:lineRule="auto"/>
+        <w:t>-</w:t>
+      </w:r>
+      <w:r>
         <w:rPr>
           <w:rFonts w:ascii="Times New Roman" w:hAnsi="Times New Roman" w:cs="Times New Roman"/>
           <w:b/>
           <w:bCs/>
           <w:u w:val="single"/>
         </w:rPr>
-      </w:pPr>
-      <w:r>
+        <w:t xml:space="preserve">processing </w:t>
+      </w:r>
+    </w:p>
+    <w:p>
+      <w:pPr>
+        <w:spacing w:line="480" w:lineRule="auto"/>
+        <w:ind w:firstLine="720"/>
+        <w:rPr>
+          <w:rFonts w:ascii="Times New Roman" w:hAnsi="Times New Roman" w:cs="Times New Roman"/>
+        </w:rPr>
+      </w:pPr>
+      <w:r>
+        <w:rPr>
+          <w:rFonts w:ascii="Times New Roman" w:hAnsi="Times New Roman" w:cs="Times New Roman"/>
+        </w:rPr>
+        <w:t xml:space="preserve">To standardize all data to the same life history period </w:t>
+      </w:r>
+      <w:r>
+        <w:rPr>
+          <w:rFonts w:ascii="Times New Roman" w:hAnsi="Times New Roman" w:cs="Times New Roman"/>
+        </w:rPr>
+        <w:t xml:space="preserve">full </w:t>
+      </w:r>
+      <w:r>
+        <w:rPr>
+          <w:rFonts w:ascii="Times New Roman" w:hAnsi="Times New Roman" w:cs="Times New Roman"/>
+        </w:rPr>
+        <w:t>laser ablation datasets</w:t>
+      </w:r>
+      <w:r>
+        <w:rPr>
+          <w:rFonts w:ascii="Times New Roman" w:hAnsi="Times New Roman" w:cs="Times New Roman"/>
+        </w:rPr>
+        <w:t xml:space="preserve"> were trimmed to include only data between the </w:t>
+      </w:r>
+      <w:r>
+        <w:rPr>
+          <w:rFonts w:ascii="Times New Roman" w:hAnsi="Times New Roman" w:cs="Times New Roman"/>
+        </w:rPr>
+        <w:t>onset of the natal origin region</w:t>
+      </w:r>
+      <w:r>
+        <w:rPr>
+          <w:rFonts w:ascii="Times New Roman" w:hAnsi="Times New Roman" w:cs="Times New Roman"/>
+        </w:rPr>
+        <w:t xml:space="preserve"> and the </w:t>
+      </w:r>
+      <w:r>
+        <w:rPr>
+          <w:rFonts w:ascii="Times New Roman" w:hAnsi="Times New Roman" w:cs="Times New Roman"/>
+        </w:rPr>
+        <w:t xml:space="preserve">beginning of </w:t>
+      </w:r>
+      <w:r>
+        <w:rPr>
+          <w:rFonts w:ascii="Times New Roman" w:hAnsi="Times New Roman" w:cs="Times New Roman"/>
+        </w:rPr>
+        <w:t>marine residence. These cutoff points were identified by</w:t>
+      </w:r>
+      <w:r>
+        <w:rPr>
+          <w:rFonts w:ascii="Times New Roman" w:hAnsi="Times New Roman" w:cs="Times New Roman"/>
+        </w:rPr>
+        <w:t xml:space="preserve"> examining patterns in ⁸⁷Sr/⁸⁶Sr, ⁸⁸Sr, and </w:t>
+      </w:r>
+      <w:r>
+        <w:rPr>
+          <w:rFonts w:ascii="Times New Roman" w:hAnsi="Times New Roman" w:cs="Times New Roman"/>
+        </w:rPr>
+        <w:t xml:space="preserve">visually apparent </w:t>
+      </w:r>
+      <w:r>
+        <w:rPr>
+          <w:rFonts w:ascii="Times New Roman" w:hAnsi="Times New Roman" w:cs="Times New Roman"/>
+        </w:rPr>
+        <w:t>morphological features along the laser ablation line</w:t>
+      </w:r>
+      <w:r>
+        <w:rPr>
+          <w:rFonts w:ascii="Times New Roman" w:hAnsi="Times New Roman" w:cs="Times New Roman"/>
+        </w:rPr>
+        <w:t xml:space="preserve"> </w:t>
+      </w:r>
+      <w:r>
+        <w:rPr>
+          <w:rFonts w:ascii="Times New Roman" w:hAnsi="Times New Roman" w:cs="Times New Roman"/>
+        </w:rPr>
+        <w:fldChar w:fldCharType="begin"/>
+      </w:r>
+      <w:r>
+        <w:rPr>
+          <w:rFonts w:ascii="Times New Roman" w:hAnsi="Times New Roman" w:cs="Times New Roman"/>
+        </w:rPr>
+        <w:instrText xml:space="preserve"> ADDIN ZOTERO_ITEM CSL_CITATION {"citationID":"DX3Ucg21","properties":{"formattedCitation":"(Brennan &amp; Schindler, 2017)","plainCitation":"(Brennan &amp; Schindler, 2017)","noteIndex":0},"citationItems":[{"id":1694,"uris":["http://zotero.org/users/8421274/items/NSWL6YPN"],"itemData":{"id":1694,"type":"article-journal","abstract":"Production patterns of highly mobile species, such as anadromous fish, often exhibit high spatial and temporal heterogeneity across landscapes. Such variability is often asynchronous in time among habitats, which stabilizes production at aggregate scales of complexity. Reconstructing production patterns explicitly in space and time across multiple scales, however, remains difficult but is important for prioritizing habitat conservation. This is especially true for fishes inhabiting river basins due to long-range dispersal, high mortality at early life stages, complex population structure and elusive life history variation. We develop a new approach for mapping production patterns of Pacific salmon across a large river basin by integrating otolith microchemistry and dendritic isoscape models. The geographically continuous Bayesian assignment framework presented here yielded high accuracies (&gt;90%) and relatively high precisions (precisions &lt;4%; i.e., assignment areas of &lt;530 river km of the 13 100 km total river length) when used to determine the natal source of known-origin juvenile Chinook salmon captured throughout the study region. Integrating these methods enabled us to base estimates of provenance and habitat use of individuals on a per location basis using strontium isotopic data throughout the continuous spatial domain of a river network. Such a framework provides substantial advantages over the more common nominal approach to employing otolith microchemistry to reconstruct movement patterns of fish. In doing so, we reconstructed the spatial production patterns of adult Chinook salmon returning to a large watershed in Bristol Bay, Alaska and illustrate the power of such an approach to conservation efforts.","container-title":"Ecological Applications","DOI":"10.1002/eap.1474","ISSN":"1939-5582","issue":"2","language":"en","note":"_eprint: https://esajournals.onlinelibrary.wiley.com/doi/pdf/10.1002/eap.1474","page":"363-377","source":"Wiley Online Library","title":"Linking otolith microchemistry and dendritic isoscapes to map heterogeneous production of fish across river basins","volume":"27","author":[{"family":"Brennan","given":"Sean R."},{"family":"Schindler","given":"Daniel E."}],"issued":{"date-parts":[["2017"]]}}}],"schema":"https://github.com/citation-style-language/schema/raw/master/csl-citation.json"} </w:instrText>
+      </w:r>
+      <w:r>
+        <w:rPr>
+          <w:rFonts w:ascii="Times New Roman" w:hAnsi="Times New Roman" w:cs="Times New Roman"/>
+        </w:rPr>
+        <w:fldChar w:fldCharType="separate"/>
+      </w:r>
+      <w:r>
+        <w:rPr>
+          <w:rFonts w:ascii="Times New Roman" w:hAnsi="Times New Roman" w:cs="Times New Roman"/>
+          <w:noProof/>
+        </w:rPr>
+        <w:t>(Brennan &amp; Schindler, 2017)</w:t>
+      </w:r>
+      <w:r>
+        <w:rPr>
+          <w:rFonts w:ascii="Times New Roman" w:hAnsi="Times New Roman" w:cs="Times New Roman"/>
+        </w:rPr>
+        <w:fldChar w:fldCharType="end"/>
+      </w:r>
+      <w:r>
+        <w:rPr>
+          <w:rFonts w:ascii="Times New Roman" w:hAnsi="Times New Roman" w:cs="Times New Roman"/>
+        </w:rPr>
+        <w:t xml:space="preserve">. </w:t>
+      </w:r>
+      <w:r>
+        <w:rPr>
+          <w:rFonts w:ascii="Times New Roman" w:hAnsi="Times New Roman" w:cs="Times New Roman"/>
+        </w:rPr>
+        <w:t>The n</w:t>
+      </w:r>
+      <w:r>
+        <w:rPr>
+          <w:rFonts w:ascii="Times New Roman" w:hAnsi="Times New Roman" w:cs="Times New Roman"/>
+        </w:rPr>
+        <w:t xml:space="preserve">atal origin region was manually identified by the first steady state after the decline in </w:t>
+      </w:r>
+      <w:r>
+        <w:rPr>
+          <w:rFonts w:ascii="Times New Roman" w:hAnsi="Times New Roman" w:cs="Times New Roman"/>
+          <w:vertAlign w:val="superscript"/>
+        </w:rPr>
+        <w:t>88</w:t>
+      </w:r>
+      <w:r>
+        <w:rPr>
+          <w:rFonts w:ascii="Times New Roman" w:hAnsi="Times New Roman" w:cs="Times New Roman"/>
+        </w:rPr>
+        <w:t>Sr and movement of ⁸⁷Sr/⁸⁶Sr away from the global marine value (0.7092)</w:t>
+      </w:r>
+      <w:r>
+        <w:rPr>
+          <w:rFonts w:ascii="Times New Roman" w:hAnsi="Times New Roman" w:cs="Times New Roman"/>
+        </w:rPr>
+        <w:t>, which</w:t>
+      </w:r>
+      <w:r>
+        <w:rPr>
+          <w:rFonts w:ascii="Times New Roman" w:hAnsi="Times New Roman" w:cs="Times New Roman"/>
+        </w:rPr>
+        <w:t xml:space="preserve"> represent</w:t>
+      </w:r>
+      <w:r>
+        <w:rPr>
+          <w:rFonts w:ascii="Times New Roman" w:hAnsi="Times New Roman" w:cs="Times New Roman"/>
+        </w:rPr>
+        <w:t>s</w:t>
+      </w:r>
+      <w:r>
+        <w:rPr>
+          <w:rFonts w:ascii="Times New Roman" w:hAnsi="Times New Roman" w:cs="Times New Roman"/>
+        </w:rPr>
+        <w:t xml:space="preserve"> the maternal signal in the otolith</w:t>
+      </w:r>
+      <w:r>
+        <w:rPr>
+          <w:rFonts w:ascii="Times New Roman" w:hAnsi="Times New Roman" w:cs="Times New Roman"/>
+        </w:rPr>
+        <w:t>.</w:t>
+      </w:r>
+      <w:r>
+        <w:rPr>
+          <w:rFonts w:ascii="Times New Roman" w:hAnsi="Times New Roman" w:cs="Times New Roman"/>
+        </w:rPr>
+        <w:t xml:space="preserve"> Although we hypothesized that the maternal signature would differ among watersheds</w:t>
+      </w:r>
+      <w:r>
+        <w:rPr>
+          <w:rFonts w:ascii="Times New Roman" w:hAnsi="Times New Roman" w:cs="Times New Roman"/>
+        </w:rPr>
+        <w:t xml:space="preserve">, and thus could be useful for classification, </w:t>
+      </w:r>
+      <w:r>
+        <w:rPr>
+          <w:rFonts w:ascii="Times New Roman" w:hAnsi="Times New Roman" w:cs="Times New Roman"/>
+        </w:rPr>
+        <w:t xml:space="preserve">the start of the laser ablation </w:t>
+      </w:r>
+      <w:proofErr w:type="gramStart"/>
+      <w:r>
+        <w:rPr>
+          <w:rFonts w:ascii="Times New Roman" w:hAnsi="Times New Roman" w:cs="Times New Roman"/>
+        </w:rPr>
+        <w:t>transect</w:t>
+      </w:r>
+      <w:proofErr w:type="gramEnd"/>
+      <w:r>
+        <w:rPr>
+          <w:rFonts w:ascii="Times New Roman" w:hAnsi="Times New Roman" w:cs="Times New Roman"/>
+        </w:rPr>
+        <w:t xml:space="preserve"> and quality of the core signal varied among samples and years. T</w:t>
+      </w:r>
+      <w:r>
+        <w:rPr>
+          <w:rFonts w:ascii="Times New Roman" w:hAnsi="Times New Roman" w:cs="Times New Roman"/>
+        </w:rPr>
+        <w:t>herefore, to maximize consistency among years we did not include the portion</w:t>
+      </w:r>
+      <w:r>
+        <w:rPr>
+          <w:rFonts w:ascii="Times New Roman" w:hAnsi="Times New Roman" w:cs="Times New Roman"/>
+        </w:rPr>
+        <w:t xml:space="preserve"> of the time series</w:t>
+      </w:r>
+      <w:r>
+        <w:rPr>
+          <w:rFonts w:ascii="Times New Roman" w:hAnsi="Times New Roman" w:cs="Times New Roman"/>
+        </w:rPr>
+        <w:t xml:space="preserve"> before the natal origin region. A </w:t>
+      </w:r>
+      <w:r>
+        <w:rPr>
+          <w:rFonts w:ascii="Times New Roman" w:hAnsi="Times New Roman" w:cs="Times New Roman"/>
+        </w:rPr>
+        <w:t xml:space="preserve">cutoff at the </w:t>
+      </w:r>
+      <w:r>
+        <w:rPr>
+          <w:rFonts w:ascii="Times New Roman" w:hAnsi="Times New Roman" w:cs="Times New Roman"/>
+        </w:rPr>
+        <w:t xml:space="preserve">marine entry was identified </w:t>
+      </w:r>
+      <w:r>
+        <w:rPr>
+          <w:rFonts w:ascii="Times New Roman" w:hAnsi="Times New Roman" w:cs="Times New Roman"/>
+        </w:rPr>
+        <w:t xml:space="preserve">by </w:t>
+      </w:r>
+      <w:r>
+        <w:rPr>
+          <w:rFonts w:ascii="Times New Roman" w:hAnsi="Times New Roman" w:cs="Times New Roman"/>
+        </w:rPr>
+        <w:t xml:space="preserve">the marine check </w:t>
+      </w:r>
+      <w:r>
+        <w:rPr>
+          <w:rFonts w:ascii="Times New Roman" w:hAnsi="Times New Roman" w:cs="Times New Roman"/>
+        </w:rPr>
+        <w:t>on the otolith</w:t>
+      </w:r>
+      <w:r>
+        <w:rPr>
+          <w:rFonts w:ascii="Times New Roman" w:hAnsi="Times New Roman" w:cs="Times New Roman"/>
+        </w:rPr>
+        <w:t xml:space="preserve"> (dark annuli region)</w:t>
+      </w:r>
+      <w:r>
+        <w:rPr>
+          <w:rFonts w:ascii="Times New Roman" w:hAnsi="Times New Roman" w:cs="Times New Roman"/>
+        </w:rPr>
+        <w:t>, a rapid increase in</w:t>
+      </w:r>
+      <w:r>
+        <w:rPr>
+          <w:rFonts w:ascii="Times New Roman" w:hAnsi="Times New Roman" w:cs="Times New Roman"/>
+        </w:rPr>
+        <w:t xml:space="preserve"> ⁸⁸Sr</w:t>
+      </w:r>
+      <w:r>
+        <w:rPr>
+          <w:rFonts w:ascii="Times New Roman" w:hAnsi="Times New Roman" w:cs="Times New Roman"/>
+        </w:rPr>
+        <w:t xml:space="preserve"> concentration</w:t>
+      </w:r>
+      <w:r>
+        <w:rPr>
+          <w:rFonts w:ascii="Times New Roman" w:hAnsi="Times New Roman" w:cs="Times New Roman"/>
+        </w:rPr>
+        <w:t xml:space="preserve">, and a </w:t>
+      </w:r>
+      <w:r>
+        <w:rPr>
+          <w:rFonts w:ascii="Times New Roman" w:hAnsi="Times New Roman" w:cs="Times New Roman"/>
+        </w:rPr>
+        <w:t>shift in ⁸⁷Sr/⁸⁶Sr to</w:t>
+      </w:r>
+      <w:r>
+        <w:rPr>
+          <w:rFonts w:ascii="Times New Roman" w:hAnsi="Times New Roman" w:cs="Times New Roman"/>
+        </w:rPr>
+        <w:t>war</w:t>
+      </w:r>
+      <w:r>
+        <w:rPr>
+          <w:rFonts w:ascii="Times New Roman" w:hAnsi="Times New Roman" w:cs="Times New Roman"/>
+        </w:rPr>
+        <w:t>d</w:t>
+      </w:r>
+      <w:r>
+        <w:rPr>
+          <w:rFonts w:ascii="Times New Roman" w:hAnsi="Times New Roman" w:cs="Times New Roman"/>
+        </w:rPr>
+        <w:t>s</w:t>
+      </w:r>
+      <w:r>
+        <w:rPr>
+          <w:rFonts w:ascii="Times New Roman" w:hAnsi="Times New Roman" w:cs="Times New Roman"/>
+        </w:rPr>
+        <w:t xml:space="preserve"> the</w:t>
+      </w:r>
+      <w:r>
+        <w:rPr>
+          <w:rFonts w:ascii="Times New Roman" w:hAnsi="Times New Roman" w:cs="Times New Roman"/>
+        </w:rPr>
+        <w:t xml:space="preserve"> global marine value</w:t>
+      </w:r>
+      <w:r>
+        <w:rPr>
+          <w:rFonts w:ascii="Times New Roman" w:hAnsi="Times New Roman" w:cs="Times New Roman"/>
+        </w:rPr>
+        <w:t xml:space="preserve"> at the end of the </w:t>
+      </w:r>
+      <w:r>
+        <w:rPr>
+          <w:rFonts w:ascii="Times New Roman" w:hAnsi="Times New Roman" w:cs="Times New Roman"/>
+        </w:rPr>
+        <w:t>time series</w:t>
+      </w:r>
+      <w:r>
+        <w:rPr>
+          <w:rFonts w:ascii="Times New Roman" w:hAnsi="Times New Roman" w:cs="Times New Roman"/>
+        </w:rPr>
+        <w:t xml:space="preserve">. </w:t>
+      </w:r>
+      <w:r>
+        <w:rPr>
+          <w:rFonts w:ascii="Times New Roman" w:hAnsi="Times New Roman" w:cs="Times New Roman"/>
+        </w:rPr>
+        <w:t>Manual s</w:t>
+      </w:r>
+      <w:r>
+        <w:rPr>
+          <w:rFonts w:ascii="Times New Roman" w:hAnsi="Times New Roman" w:cs="Times New Roman"/>
+        </w:rPr>
+        <w:t xml:space="preserve">election of trimming locations </w:t>
+      </w:r>
+      <w:r>
+        <w:rPr>
+          <w:rFonts w:ascii="Times New Roman" w:hAnsi="Times New Roman" w:cs="Times New Roman"/>
+        </w:rPr>
+        <w:t>was</w:t>
+      </w:r>
+      <w:r>
+        <w:rPr>
+          <w:rFonts w:ascii="Times New Roman" w:hAnsi="Times New Roman" w:cs="Times New Roman"/>
+        </w:rPr>
+        <w:t xml:space="preserve"> randomized and blinded to avoid </w:t>
+      </w:r>
+      <w:r>
+        <w:rPr>
+          <w:rFonts w:ascii="Times New Roman" w:hAnsi="Times New Roman" w:cs="Times New Roman"/>
+        </w:rPr>
+        <w:t xml:space="preserve">bias. </w:t>
+      </w:r>
+      <w:r>
+        <w:rPr>
+          <w:rFonts w:ascii="Times New Roman" w:hAnsi="Times New Roman" w:cs="Times New Roman"/>
+        </w:rPr>
+        <w:t>All trimmed datasets were then manually</w:t>
+      </w:r>
+      <w:r>
+        <w:rPr>
+          <w:rFonts w:ascii="Times New Roman" w:hAnsi="Times New Roman" w:cs="Times New Roman"/>
+        </w:rPr>
+        <w:t xml:space="preserve"> checked for quality</w:t>
+      </w:r>
+      <w:r>
+        <w:rPr>
+          <w:rFonts w:ascii="Times New Roman" w:hAnsi="Times New Roman" w:cs="Times New Roman"/>
+        </w:rPr>
+        <w:t xml:space="preserve"> and s</w:t>
+      </w:r>
+      <w:r>
+        <w:rPr>
+          <w:rFonts w:ascii="Times New Roman" w:hAnsi="Times New Roman" w:cs="Times New Roman"/>
+        </w:rPr>
+        <w:t xml:space="preserve">amples with significant error (i.e large cracks) </w:t>
+      </w:r>
+      <w:r>
+        <w:rPr>
+          <w:rFonts w:ascii="Times New Roman" w:hAnsi="Times New Roman" w:cs="Times New Roman"/>
+        </w:rPr>
+        <w:t>or</w:t>
+      </w:r>
+      <w:r>
+        <w:rPr>
+          <w:rFonts w:ascii="Times New Roman" w:hAnsi="Times New Roman" w:cs="Times New Roman"/>
+        </w:rPr>
+        <w:t xml:space="preserve"> without a clear core </w:t>
+      </w:r>
+      <w:r>
+        <w:rPr>
+          <w:rFonts w:ascii="Times New Roman" w:hAnsi="Times New Roman" w:cs="Times New Roman"/>
+        </w:rPr>
+        <w:t xml:space="preserve">and marine </w:t>
+      </w:r>
+      <w:r>
+        <w:rPr>
+          <w:rFonts w:ascii="Times New Roman" w:hAnsi="Times New Roman" w:cs="Times New Roman"/>
+        </w:rPr>
+        <w:t xml:space="preserve">signal were removed from the dataset. </w:t>
+      </w:r>
+      <w:r>
+        <w:rPr>
+          <w:rFonts w:ascii="Times New Roman" w:hAnsi="Times New Roman" w:cs="Times New Roman"/>
+        </w:rPr>
+        <w:t xml:space="preserve">The resulting dataset contained </w:t>
+      </w:r>
+      <w:r>
+        <w:rPr>
+          <w:rFonts w:ascii="Times New Roman" w:hAnsi="Times New Roman" w:cs="Times New Roman"/>
+        </w:rPr>
+        <w:t>time series</w:t>
+      </w:r>
+      <w:r>
+        <w:rPr>
+          <w:rFonts w:ascii="Times New Roman" w:hAnsi="Times New Roman" w:cs="Times New Roman"/>
+        </w:rPr>
+        <w:t xml:space="preserve"> from 2,531 individual otoliths</w:t>
+      </w:r>
+      <w:r>
+        <w:rPr>
+          <w:rFonts w:ascii="Times New Roman" w:hAnsi="Times New Roman" w:cs="Times New Roman"/>
+        </w:rPr>
+        <w:t xml:space="preserve"> (971 Yukon, 875 Kuskokwim, and 685 Nushagak). </w:t>
+      </w:r>
+    </w:p>
+    <w:p>
+      <w:pPr>
+        <w:spacing w:line="480" w:lineRule="auto"/>
+        <w:ind w:firstLine="720"/>
+        <w:rPr>
+          <w:rFonts w:ascii="Times New Roman" w:hAnsi="Times New Roman" w:cs="Times New Roman"/>
+        </w:rPr>
+      </w:pPr>
+      <w:r>
+        <w:rPr>
+          <w:rFonts w:ascii="Times New Roman" w:hAnsi="Times New Roman" w:cs="Times New Roman"/>
+        </w:rPr>
+        <w:t>To test whether</w:t>
+      </w:r>
+      <w:r>
+        <w:rPr>
+          <w:rFonts w:ascii="Times New Roman" w:hAnsi="Times New Roman" w:cs="Times New Roman"/>
+        </w:rPr>
+        <w:t xml:space="preserve"> </w:t>
+      </w:r>
+      <w:r>
+        <w:rPr>
+          <w:rFonts w:ascii="Times New Roman" w:hAnsi="Times New Roman" w:cs="Times New Roman"/>
+        </w:rPr>
+        <w:t>time</w:t>
+      </w:r>
+      <w:r>
+        <w:rPr>
+          <w:rFonts w:ascii="Times New Roman" w:hAnsi="Times New Roman" w:cs="Times New Roman"/>
+        </w:rPr>
+        <w:t>-</w:t>
+      </w:r>
+      <w:r>
+        <w:rPr>
+          <w:rFonts w:ascii="Times New Roman" w:hAnsi="Times New Roman" w:cs="Times New Roman"/>
+        </w:rPr>
+        <w:t xml:space="preserve">series smoothing techniques </w:t>
+      </w:r>
+      <w:r>
+        <w:rPr>
+          <w:rFonts w:ascii="Times New Roman" w:hAnsi="Times New Roman" w:cs="Times New Roman"/>
+        </w:rPr>
+        <w:t xml:space="preserve">could improve </w:t>
+      </w:r>
+      <w:r>
+        <w:rPr>
+          <w:rFonts w:ascii="Times New Roman" w:hAnsi="Times New Roman" w:cs="Times New Roman"/>
+        </w:rPr>
+        <w:t xml:space="preserve">classification </w:t>
+      </w:r>
+      <w:r>
+        <w:rPr>
+          <w:rFonts w:ascii="Times New Roman" w:hAnsi="Times New Roman" w:cs="Times New Roman"/>
+        </w:rPr>
+        <w:t>model performance</w:t>
+      </w:r>
+      <w:r>
+        <w:rPr>
+          <w:rFonts w:ascii="Times New Roman" w:hAnsi="Times New Roman" w:cs="Times New Roman"/>
+        </w:rPr>
+        <w:t xml:space="preserve">, we applied </w:t>
+      </w:r>
+      <w:r>
+        <w:rPr>
+          <w:rFonts w:ascii="Times New Roman" w:hAnsi="Times New Roman" w:cs="Times New Roman"/>
+        </w:rPr>
+        <w:t>two commonly used approaches: moving average (MA) and a generalized additive model (GAM)</w:t>
+      </w:r>
+      <w:r>
+        <w:rPr>
+          <w:rFonts w:ascii="Times New Roman" w:hAnsi="Times New Roman" w:cs="Times New Roman"/>
+        </w:rPr>
+        <w:t xml:space="preserve"> on the raw strontium isotope data</w:t>
+      </w:r>
+      <w:r>
+        <w:rPr>
+          <w:rFonts w:ascii="Times New Roman" w:hAnsi="Times New Roman" w:cs="Times New Roman"/>
+        </w:rPr>
+        <w:t xml:space="preserve">. </w:t>
+      </w:r>
+      <w:r>
+        <w:rPr>
+          <w:rFonts w:ascii="Times New Roman" w:hAnsi="Times New Roman" w:cs="Times New Roman"/>
+        </w:rPr>
+        <w:t>For the moving average smoothing w</w:t>
+      </w:r>
+      <w:r>
+        <w:rPr>
+          <w:rFonts w:ascii="Times New Roman" w:hAnsi="Times New Roman" w:cs="Times New Roman"/>
+        </w:rPr>
+        <w:t>e used a 60</w:t>
+      </w:r>
+      <w:r>
+        <w:rPr>
+          <w:rFonts w:ascii="Times New Roman" w:hAnsi="Times New Roman" w:cs="Times New Roman"/>
+        </w:rPr>
+        <w:t>-</w:t>
+      </w:r>
+      <w:r>
+        <w:rPr>
+          <w:rFonts w:ascii="Times New Roman" w:hAnsi="Times New Roman" w:cs="Times New Roman"/>
+        </w:rPr>
+        <w:t>point center weighted window</w:t>
+      </w:r>
+      <w:r>
+        <w:rPr>
+          <w:rFonts w:ascii="Times New Roman" w:hAnsi="Times New Roman" w:cs="Times New Roman"/>
+        </w:rPr>
+        <w:t xml:space="preserve">. </w:t>
+      </w:r>
+      <w:r>
+        <w:rPr>
+          <w:rFonts w:ascii="Times New Roman" w:hAnsi="Times New Roman" w:cs="Times New Roman"/>
+        </w:rPr>
+        <w:t xml:space="preserve">The GAM was fitted using thin plate regression and penalized iteratively re-weighted least squares (P-IRLS) to maximize goodness of </w:t>
+      </w:r>
+      <w:r>
+        <w:rPr>
+          <w:rFonts w:ascii="Times New Roman" w:hAnsi="Times New Roman" w:cs="Times New Roman"/>
+        </w:rPr>
+        <w:lastRenderedPageBreak/>
+        <w:t xml:space="preserve">fit, with a generalized cross-validation (GCV) method </w:t>
+      </w:r>
+      <w:r>
+        <w:rPr>
+          <w:rFonts w:ascii="Times New Roman" w:hAnsi="Times New Roman" w:cs="Times New Roman"/>
+        </w:rPr>
+        <w:t xml:space="preserve">used </w:t>
+      </w:r>
+      <w:r>
+        <w:rPr>
+          <w:rFonts w:ascii="Times New Roman" w:hAnsi="Times New Roman" w:cs="Times New Roman"/>
+        </w:rPr>
+        <w:t xml:space="preserve">to minimize overfitting </w:t>
+      </w:r>
+      <w:r>
+        <w:rPr>
+          <w:rFonts w:ascii="Times New Roman" w:hAnsi="Times New Roman" w:cs="Times New Roman"/>
+        </w:rPr>
+        <w:t>(Wood, 2006). The maximum degrees of freedom (k) were scaled by the number of data points in each ablation line (n) by k = 10</w:t>
+      </w:r>
+      <w:r>
+        <w:rPr>
+          <w:rFonts w:ascii="Times New Roman" w:hAnsi="Times New Roman" w:cs="Times New Roman"/>
+        </w:rPr>
+        <w:t xml:space="preserve"> * n</w:t>
+      </w:r>
+      <w:r>
+        <w:rPr>
+          <w:rFonts w:ascii="Times New Roman" w:hAnsi="Times New Roman" w:cs="Times New Roman"/>
+        </w:rPr>
+        <w:t xml:space="preserve"> </w:t>
+      </w:r>
+      <w:r>
+        <w:rPr>
+          <w:rFonts w:ascii="Times New Roman" w:hAnsi="Times New Roman" w:cs="Times New Roman"/>
+          <w:vertAlign w:val="superscript"/>
+        </w:rPr>
+        <w:t>2/9</w:t>
+      </w:r>
+      <w:r>
+        <w:rPr>
+          <w:rFonts w:ascii="Times New Roman" w:hAnsi="Times New Roman" w:cs="Times New Roman"/>
+          <w:vertAlign w:val="superscript"/>
+        </w:rPr>
+        <w:t xml:space="preserve"> </w:t>
+      </w:r>
+      <w:r>
+        <w:rPr>
+          <w:rFonts w:ascii="Times New Roman" w:hAnsi="Times New Roman" w:cs="Times New Roman"/>
+        </w:rPr>
+        <w:t xml:space="preserve">(Kim and Gu, 2004, Brennan et al., </w:t>
+      </w:r>
+      <w:r>
+        <w:rPr>
+          <w:rFonts w:ascii="Times New Roman" w:hAnsi="Times New Roman" w:cs="Times New Roman"/>
+        </w:rPr>
+        <w:t>2014)</w:t>
+      </w:r>
+      <w:r>
+        <w:rPr>
+          <w:rFonts w:ascii="Times New Roman" w:hAnsi="Times New Roman" w:cs="Times New Roman"/>
+        </w:rPr>
+        <w:t xml:space="preserve">. </w:t>
+      </w:r>
+      <w:r>
+        <w:rPr>
+          <w:rFonts w:ascii="Times New Roman" w:hAnsi="Times New Roman" w:cs="Times New Roman"/>
+        </w:rPr>
+        <w:t>This process resulted in three versions of the</w:t>
+      </w:r>
+      <w:r>
+        <w:rPr>
+          <w:rFonts w:ascii="Times New Roman" w:hAnsi="Times New Roman" w:cs="Times New Roman"/>
+        </w:rPr>
+        <w:t xml:space="preserve"> same laser ablation time</w:t>
+      </w:r>
+      <w:r>
+        <w:rPr>
+          <w:rFonts w:ascii="Times New Roman" w:hAnsi="Times New Roman" w:cs="Times New Roman"/>
+        </w:rPr>
+        <w:t xml:space="preserve"> </w:t>
+      </w:r>
+      <w:r>
+        <w:rPr>
+          <w:rFonts w:ascii="Times New Roman" w:hAnsi="Times New Roman" w:cs="Times New Roman"/>
+        </w:rPr>
+        <w:t xml:space="preserve">series for </w:t>
+      </w:r>
+      <w:proofErr w:type="gramStart"/>
+      <w:r>
+        <w:rPr>
+          <w:rFonts w:ascii="Times New Roman" w:hAnsi="Times New Roman" w:cs="Times New Roman"/>
+        </w:rPr>
+        <w:t>each individual</w:t>
+      </w:r>
+      <w:proofErr w:type="gramEnd"/>
+      <w:r>
+        <w:rPr>
+          <w:rFonts w:ascii="Times New Roman" w:hAnsi="Times New Roman" w:cs="Times New Roman"/>
+        </w:rPr>
+        <w:t>: GAM-smoothed, MA-smoothed, and raw LA data. Finally, all samples were interpolated to a common length</w:t>
+      </w:r>
+      <w:r>
+        <w:rPr>
+          <w:rFonts w:ascii="Times New Roman" w:hAnsi="Times New Roman" w:cs="Times New Roman"/>
+        </w:rPr>
+        <w:t xml:space="preserve"> </w:t>
+      </w:r>
+      <w:r>
+        <w:rPr>
+          <w:rFonts w:ascii="Times New Roman" w:hAnsi="Times New Roman" w:cs="Times New Roman"/>
+        </w:rPr>
+        <w:t xml:space="preserve">defined as the average length of </w:t>
+      </w:r>
+      <w:proofErr w:type="spellStart"/>
+      <w:r>
+        <w:rPr>
+          <w:rFonts w:ascii="Times New Roman" w:hAnsi="Times New Roman" w:cs="Times New Roman"/>
+        </w:rPr>
+        <w:t>all time</w:t>
+      </w:r>
+      <w:proofErr w:type="spellEnd"/>
+      <w:r>
+        <w:rPr>
+          <w:rFonts w:ascii="Times New Roman" w:hAnsi="Times New Roman" w:cs="Times New Roman"/>
+        </w:rPr>
+        <w:t xml:space="preserve"> </w:t>
+      </w:r>
+      <w:r>
+        <w:rPr>
+          <w:rFonts w:ascii="Times New Roman" w:hAnsi="Times New Roman" w:cs="Times New Roman"/>
+        </w:rPr>
+        <w:t>s</w:t>
+      </w:r>
+      <w:r>
+        <w:rPr>
+          <w:rFonts w:ascii="Times New Roman" w:hAnsi="Times New Roman" w:cs="Times New Roman"/>
+        </w:rPr>
+        <w:t xml:space="preserve">eries </w:t>
+      </w:r>
+      <w:r>
+        <w:rPr>
+          <w:rFonts w:ascii="Times New Roman" w:hAnsi="Times New Roman" w:cs="Times New Roman"/>
+        </w:rPr>
+        <w:t xml:space="preserve">of that type </w:t>
+      </w:r>
+      <w:r>
+        <w:rPr>
+          <w:rFonts w:ascii="Times New Roman" w:hAnsi="Times New Roman" w:cs="Times New Roman"/>
+        </w:rPr>
+        <w:t>(</w:t>
+      </w:r>
+      <w:r>
+        <w:rPr>
+          <w:rFonts w:ascii="Times New Roman" w:hAnsi="Times New Roman" w:cs="Times New Roman"/>
+        </w:rPr>
+        <w:t>694</w:t>
+      </w:r>
+      <w:r>
+        <w:rPr>
+          <w:rFonts w:ascii="Times New Roman" w:hAnsi="Times New Roman" w:cs="Times New Roman"/>
+        </w:rPr>
+        <w:t xml:space="preserve"> points for non-MA and 6</w:t>
+      </w:r>
+      <w:r>
+        <w:rPr>
+          <w:rFonts w:ascii="Times New Roman" w:hAnsi="Times New Roman" w:cs="Times New Roman"/>
+        </w:rPr>
+        <w:t>64</w:t>
+      </w:r>
+      <w:r>
+        <w:rPr>
+          <w:rFonts w:ascii="Times New Roman" w:hAnsi="Times New Roman" w:cs="Times New Roman"/>
+        </w:rPr>
+        <w:t xml:space="preserve"> points for MA-smoothed samples, respectively) </w:t>
+      </w:r>
+      <w:r>
+        <w:rPr>
+          <w:rFonts w:ascii="Times New Roman" w:hAnsi="Times New Roman" w:cs="Times New Roman"/>
+        </w:rPr>
+        <w:t>(Hegg and Kennedy, 2021).</w:t>
+      </w:r>
+      <w:r>
+        <w:rPr>
+          <w:rFonts w:ascii="Times New Roman" w:hAnsi="Times New Roman" w:cs="Times New Roman"/>
+        </w:rPr>
+        <w:t xml:space="preserve"> This was done to satisfy the requirement for equal length vectors for </w:t>
+      </w:r>
+      <w:r>
+        <w:rPr>
+          <w:rFonts w:ascii="Times New Roman" w:hAnsi="Times New Roman" w:cs="Times New Roman"/>
+        </w:rPr>
+        <w:t>ML</w:t>
+      </w:r>
+      <w:r>
+        <w:rPr>
+          <w:rFonts w:ascii="Times New Roman" w:hAnsi="Times New Roman" w:cs="Times New Roman"/>
+        </w:rPr>
+        <w:t xml:space="preserve"> algorithms </w:t>
+      </w:r>
+      <w:r>
+        <w:rPr>
+          <w:rFonts w:ascii="Times New Roman" w:hAnsi="Times New Roman" w:cs="Times New Roman"/>
+        </w:rPr>
+        <w:t xml:space="preserve">while minimizing warping from interpolation. </w:t>
+      </w:r>
+    </w:p>
+    <w:p>
+      <w:pPr>
+        <w:spacing w:line="480" w:lineRule="auto"/>
+        <w:ind w:firstLine="720"/>
+        <w:rPr>
+          <w:rFonts w:ascii="Times New Roman" w:hAnsi="Times New Roman" w:cs="Times New Roman"/>
+        </w:rPr>
+      </w:pPr>
+      <w:r>
+        <w:rPr>
+          <w:rFonts w:ascii="Times New Roman" w:hAnsi="Times New Roman" w:cs="Times New Roman"/>
+        </w:rPr>
+        <w:t xml:space="preserve">Principal component analysis (PCA) was applied </w:t>
+      </w:r>
+      <w:r>
+        <w:rPr>
+          <w:rFonts w:ascii="Times New Roman" w:hAnsi="Times New Roman" w:cs="Times New Roman"/>
+        </w:rPr>
+        <w:t xml:space="preserve">to </w:t>
+      </w:r>
+      <w:r>
+        <w:rPr>
+          <w:rFonts w:ascii="Times New Roman" w:hAnsi="Times New Roman" w:cs="Times New Roman"/>
+        </w:rPr>
+        <w:t xml:space="preserve">all </w:t>
+      </w:r>
+      <w:r>
+        <w:rPr>
+          <w:rFonts w:ascii="Times New Roman" w:hAnsi="Times New Roman" w:cs="Times New Roman"/>
+        </w:rPr>
+        <w:t>timeseries</w:t>
+      </w:r>
+      <w:r>
+        <w:rPr>
+          <w:rFonts w:ascii="Times New Roman" w:hAnsi="Times New Roman" w:cs="Times New Roman"/>
+        </w:rPr>
+        <w:t xml:space="preserve"> from </w:t>
+      </w:r>
+      <w:r>
+        <w:rPr>
+          <w:rFonts w:ascii="Times New Roman" w:hAnsi="Times New Roman" w:cs="Times New Roman"/>
+        </w:rPr>
+        <w:t>the</w:t>
+      </w:r>
+      <w:r>
+        <w:rPr>
+          <w:rFonts w:ascii="Times New Roman" w:hAnsi="Times New Roman" w:cs="Times New Roman"/>
+        </w:rPr>
+        <w:t xml:space="preserve"> dataset in the</w:t>
+      </w:r>
+      <w:r>
+        <w:rPr>
+          <w:rFonts w:ascii="Times New Roman" w:hAnsi="Times New Roman" w:cs="Times New Roman"/>
+        </w:rPr>
+        <w:t xml:space="preserve"> top-performing model</w:t>
+      </w:r>
+      <w:r>
+        <w:rPr>
+          <w:rFonts w:ascii="Times New Roman" w:hAnsi="Times New Roman" w:cs="Times New Roman"/>
+        </w:rPr>
+        <w:t xml:space="preserve"> (GAM smoothed data)</w:t>
+      </w:r>
+      <w:r>
+        <w:rPr>
+          <w:rFonts w:ascii="Times New Roman" w:hAnsi="Times New Roman" w:cs="Times New Roman"/>
+        </w:rPr>
+        <w:t xml:space="preserve"> to qualitatively assess clustering patterns in multivariate space</w:t>
+      </w:r>
+      <w:r>
+        <w:rPr>
+          <w:rFonts w:ascii="Times New Roman" w:hAnsi="Times New Roman" w:cs="Times New Roman"/>
+        </w:rPr>
+        <w:t xml:space="preserve"> (Figure </w:t>
+      </w:r>
+      <w:r>
+        <w:rPr>
+          <w:rFonts w:ascii="Times New Roman" w:hAnsi="Times New Roman" w:cs="Times New Roman"/>
+        </w:rPr>
+        <w:t>2</w:t>
+      </w:r>
+      <w:r>
+        <w:rPr>
+          <w:rFonts w:ascii="Times New Roman" w:hAnsi="Times New Roman" w:cs="Times New Roman"/>
+        </w:rPr>
+        <w:t>)</w:t>
+      </w:r>
+      <w:r>
+        <w:rPr>
+          <w:rFonts w:ascii="Times New Roman" w:hAnsi="Times New Roman" w:cs="Times New Roman"/>
+        </w:rPr>
+        <w:t>.</w:t>
+      </w:r>
+      <w:r>
+        <w:rPr>
+          <w:rFonts w:ascii="Times New Roman" w:hAnsi="Times New Roman" w:cs="Times New Roman"/>
+        </w:rPr>
+        <w:t xml:space="preserve"> PCA transforms the original </w:t>
+      </w:r>
+      <w:r>
+        <w:rPr>
+          <w:rFonts w:ascii="Times New Roman" w:hAnsi="Times New Roman" w:cs="Times New Roman"/>
+        </w:rPr>
+        <w:t>time</w:t>
+      </w:r>
+      <w:r>
+        <w:rPr>
+          <w:rFonts w:ascii="Times New Roman" w:hAnsi="Times New Roman" w:cs="Times New Roman"/>
+        </w:rPr>
+        <w:t xml:space="preserve"> </w:t>
+      </w:r>
+      <w:r>
+        <w:rPr>
+          <w:rFonts w:ascii="Times New Roman" w:hAnsi="Times New Roman" w:cs="Times New Roman"/>
+        </w:rPr>
+        <w:t xml:space="preserve">series </w:t>
+      </w:r>
+      <w:r>
+        <w:rPr>
+          <w:rFonts w:ascii="Times New Roman" w:hAnsi="Times New Roman" w:cs="Times New Roman"/>
+        </w:rPr>
+        <w:t xml:space="preserve">into uncorrelated principal components that capture the greatest variance in the dataset, thereby highlighting variability among </w:t>
+      </w:r>
+      <w:r>
+        <w:rPr>
+          <w:rFonts w:ascii="Times New Roman" w:hAnsi="Times New Roman" w:cs="Times New Roman"/>
+        </w:rPr>
+        <w:t>time series</w:t>
+      </w:r>
+      <w:r>
+        <w:rPr>
+          <w:rFonts w:ascii="Times New Roman" w:hAnsi="Times New Roman" w:cs="Times New Roman"/>
+        </w:rPr>
+        <w:t xml:space="preserve"> that may contain distinguishing watershed characteristics</w:t>
+      </w:r>
+      <w:r>
+        <w:rPr>
+          <w:rFonts w:ascii="Times New Roman" w:hAnsi="Times New Roman" w:cs="Times New Roman"/>
+        </w:rPr>
+        <w:t xml:space="preserve">. </w:t>
+      </w:r>
+      <w:r>
+        <w:rPr>
+          <w:rFonts w:ascii="Times New Roman" w:hAnsi="Times New Roman" w:cs="Times New Roman"/>
+        </w:rPr>
+        <w:t>To further illustrate how</w:t>
+      </w:r>
+      <w:r>
+        <w:rPr>
+          <w:rFonts w:ascii="Times New Roman" w:hAnsi="Times New Roman" w:cs="Times New Roman"/>
+        </w:rPr>
+        <w:t xml:space="preserve"> this</w:t>
+      </w:r>
+      <w:r>
+        <w:rPr>
+          <w:rFonts w:ascii="Times New Roman" w:hAnsi="Times New Roman" w:cs="Times New Roman"/>
+        </w:rPr>
+        <w:t xml:space="preserve"> variability among </w:t>
+      </w:r>
+      <w:r>
+        <w:rPr>
+          <w:rFonts w:ascii="Times New Roman" w:hAnsi="Times New Roman" w:cs="Times New Roman"/>
+        </w:rPr>
+        <w:t>time series</w:t>
+      </w:r>
+      <w:r>
+        <w:rPr>
+          <w:rFonts w:ascii="Times New Roman" w:hAnsi="Times New Roman" w:cs="Times New Roman"/>
+        </w:rPr>
+        <w:t xml:space="preserve"> can distinguish among </w:t>
+      </w:r>
+      <w:r>
+        <w:rPr>
+          <w:rFonts w:ascii="Times New Roman" w:hAnsi="Times New Roman" w:cs="Times New Roman"/>
+        </w:rPr>
+        <w:t>individuals</w:t>
+      </w:r>
+      <w:r>
+        <w:rPr>
+          <w:rFonts w:ascii="Times New Roman" w:hAnsi="Times New Roman" w:cs="Times New Roman"/>
+        </w:rPr>
+        <w:t xml:space="preserve"> </w:t>
+      </w:r>
+      <w:r>
+        <w:rPr>
+          <w:rFonts w:ascii="Times New Roman" w:hAnsi="Times New Roman" w:cs="Times New Roman"/>
+        </w:rPr>
+        <w:t xml:space="preserve">that are otherwise indistinguishable using </w:t>
+      </w:r>
+      <w:r>
+        <w:rPr>
+          <w:rFonts w:ascii="Times New Roman" w:hAnsi="Times New Roman" w:cs="Times New Roman"/>
+        </w:rPr>
+        <w:t xml:space="preserve">the </w:t>
+      </w:r>
+      <w:r>
+        <w:rPr>
+          <w:rFonts w:ascii="Times New Roman" w:hAnsi="Times New Roman" w:cs="Times New Roman"/>
+        </w:rPr>
+        <w:t xml:space="preserve">natal </w:t>
+      </w:r>
+      <w:r>
+        <w:rPr>
+          <w:rFonts w:ascii="Times New Roman" w:hAnsi="Times New Roman" w:cs="Times New Roman"/>
+        </w:rPr>
+        <w:t>freshwater ⁸⁷Sr/⁸⁶Sr</w:t>
+      </w:r>
+      <w:r>
+        <w:rPr>
+          <w:rFonts w:ascii="Times New Roman" w:hAnsi="Times New Roman" w:cs="Times New Roman"/>
+        </w:rPr>
+        <w:t xml:space="preserve">, PCA analysis </w:t>
+      </w:r>
+      <w:r>
+        <w:rPr>
+          <w:rFonts w:ascii="Times New Roman" w:hAnsi="Times New Roman" w:cs="Times New Roman"/>
+        </w:rPr>
+        <w:t>was also</w:t>
+      </w:r>
+      <w:r>
+        <w:rPr>
+          <w:rFonts w:ascii="Times New Roman" w:hAnsi="Times New Roman" w:cs="Times New Roman"/>
+        </w:rPr>
+        <w:t xml:space="preserve"> done on a subset of the GAM smoothed dataset which include only individuals with a natal </w:t>
+      </w:r>
+      <w:r>
+        <w:rPr>
+          <w:rFonts w:ascii="Times New Roman" w:hAnsi="Times New Roman" w:cs="Times New Roman"/>
+        </w:rPr>
+        <w:t xml:space="preserve">⁸⁷Sr/⁸⁶Sr </w:t>
+      </w:r>
+      <w:r>
+        <w:rPr>
+          <w:rFonts w:ascii="Times New Roman" w:hAnsi="Times New Roman" w:cs="Times New Roman"/>
+        </w:rPr>
+        <w:t>between</w:t>
+      </w:r>
+      <w:r>
+        <w:rPr>
+          <w:rFonts w:ascii="Times New Roman" w:hAnsi="Times New Roman" w:cs="Times New Roman"/>
+        </w:rPr>
+        <w:t xml:space="preserve"> 0.70</w:t>
+      </w:r>
+      <w:r>
+        <w:rPr>
+          <w:rFonts w:ascii="Times New Roman" w:hAnsi="Times New Roman" w:cs="Times New Roman"/>
+        </w:rPr>
+        <w:t>80</w:t>
+      </w:r>
+      <w:r>
+        <w:rPr>
+          <w:rFonts w:ascii="Times New Roman" w:hAnsi="Times New Roman" w:cs="Times New Roman"/>
+        </w:rPr>
+        <w:t xml:space="preserve"> and </w:t>
+      </w:r>
+      <w:r>
+        <w:rPr>
+          <w:rFonts w:ascii="Times New Roman" w:hAnsi="Times New Roman" w:cs="Times New Roman"/>
+        </w:rPr>
+        <w:t>0.708</w:t>
+      </w:r>
+      <w:r>
+        <w:rPr>
+          <w:rFonts w:ascii="Times New Roman" w:hAnsi="Times New Roman" w:cs="Times New Roman"/>
+        </w:rPr>
+        <w:t>5</w:t>
+      </w:r>
+      <w:r>
+        <w:rPr>
+          <w:rFonts w:ascii="Times New Roman" w:hAnsi="Times New Roman" w:cs="Times New Roman"/>
+        </w:rPr>
+        <w:t>. PCA plots were produced to visualize clustering of both PC1 (47.</w:t>
+      </w:r>
+      <w:r>
+        <w:rPr>
+          <w:rFonts w:ascii="Times New Roman" w:hAnsi="Times New Roman" w:cs="Times New Roman"/>
+        </w:rPr>
+        <w:t>5</w:t>
+      </w:r>
+      <w:r>
+        <w:rPr>
+          <w:rFonts w:ascii="Times New Roman" w:hAnsi="Times New Roman" w:cs="Times New Roman"/>
+        </w:rPr>
+        <w:t>% of variance) and PC2 (20.9% of variance) as well as between PC1 and PC3 (10.2% of variance)</w:t>
+      </w:r>
+      <w:r>
+        <w:rPr>
+          <w:rFonts w:ascii="Times New Roman" w:hAnsi="Times New Roman" w:cs="Times New Roman"/>
+        </w:rPr>
+        <w:t xml:space="preserve"> (Figure 3a)</w:t>
+      </w:r>
+      <w:r>
+        <w:rPr>
+          <w:rFonts w:ascii="Times New Roman" w:hAnsi="Times New Roman" w:cs="Times New Roman"/>
+        </w:rPr>
+        <w:t xml:space="preserve">. </w:t>
+      </w:r>
+      <w:r>
+        <w:rPr>
+          <w:rFonts w:ascii="Times New Roman" w:hAnsi="Times New Roman" w:cs="Times New Roman"/>
+        </w:rPr>
+        <w:t>We then displayed the absolute values</w:t>
+      </w:r>
+      <w:r>
+        <w:rPr>
+          <w:rFonts w:ascii="Times New Roman" w:hAnsi="Times New Roman" w:cs="Times New Roman"/>
+        </w:rPr>
+        <w:t xml:space="preserve"> of each point’s</w:t>
+      </w:r>
+      <w:r>
+        <w:rPr>
+          <w:rFonts w:ascii="Times New Roman" w:hAnsi="Times New Roman" w:cs="Times New Roman"/>
+        </w:rPr>
+        <w:t xml:space="preserve"> loading </w:t>
+      </w:r>
+      <w:r>
+        <w:rPr>
+          <w:rFonts w:ascii="Times New Roman" w:hAnsi="Times New Roman" w:cs="Times New Roman"/>
+        </w:rPr>
+        <w:t xml:space="preserve">on the corresponding index of the time series </w:t>
+      </w:r>
+      <w:r>
+        <w:rPr>
+          <w:rFonts w:ascii="Times New Roman" w:hAnsi="Times New Roman" w:cs="Times New Roman"/>
+        </w:rPr>
+        <w:t xml:space="preserve">to identify </w:t>
+      </w:r>
+      <w:r>
+        <w:rPr>
+          <w:rFonts w:ascii="Times New Roman" w:hAnsi="Times New Roman" w:cs="Times New Roman"/>
+        </w:rPr>
+        <w:t>regions</w:t>
+      </w:r>
+      <w:r>
+        <w:rPr>
+          <w:rFonts w:ascii="Times New Roman" w:hAnsi="Times New Roman" w:cs="Times New Roman"/>
+        </w:rPr>
+        <w:t xml:space="preserve"> of the </w:t>
+      </w:r>
+      <w:r>
+        <w:rPr>
+          <w:rFonts w:ascii="Times New Roman" w:hAnsi="Times New Roman" w:cs="Times New Roman"/>
+        </w:rPr>
+        <w:t>time series</w:t>
+      </w:r>
+      <w:r>
+        <w:rPr>
+          <w:rFonts w:ascii="Times New Roman" w:hAnsi="Times New Roman" w:cs="Times New Roman"/>
+        </w:rPr>
+        <w:t xml:space="preserve"> </w:t>
+      </w:r>
+      <w:r>
+        <w:rPr>
+          <w:rFonts w:ascii="Times New Roman" w:hAnsi="Times New Roman" w:cs="Times New Roman"/>
+        </w:rPr>
+        <w:t xml:space="preserve">which </w:t>
+      </w:r>
+      <w:r>
+        <w:rPr>
+          <w:rFonts w:ascii="Times New Roman" w:hAnsi="Times New Roman" w:cs="Times New Roman"/>
+        </w:rPr>
+        <w:t>contribut</w:t>
+      </w:r>
+      <w:r>
+        <w:rPr>
+          <w:rFonts w:ascii="Times New Roman" w:hAnsi="Times New Roman" w:cs="Times New Roman"/>
+        </w:rPr>
+        <w:t>e</w:t>
+      </w:r>
+      <w:r>
+        <w:rPr>
+          <w:rFonts w:ascii="Times New Roman" w:hAnsi="Times New Roman" w:cs="Times New Roman"/>
+        </w:rPr>
+        <w:t xml:space="preserve"> to interclass separation</w:t>
+      </w:r>
+      <w:r>
+        <w:rPr>
+          <w:rFonts w:ascii="Times New Roman" w:hAnsi="Times New Roman" w:cs="Times New Roman"/>
+        </w:rPr>
+        <w:t xml:space="preserve"> among individuals with the same natal origin ratio</w:t>
+      </w:r>
+      <w:r>
+        <w:rPr>
+          <w:rFonts w:ascii="Times New Roman" w:hAnsi="Times New Roman" w:cs="Times New Roman"/>
+        </w:rPr>
+        <w:t xml:space="preserve"> </w:t>
+      </w:r>
+      <w:r>
+        <w:rPr>
+          <w:rFonts w:ascii="Times New Roman" w:hAnsi="Times New Roman" w:cs="Times New Roman"/>
+        </w:rPr>
+        <w:t xml:space="preserve">(Figure </w:t>
+      </w:r>
+      <w:r>
+        <w:rPr>
+          <w:rFonts w:ascii="Times New Roman" w:hAnsi="Times New Roman" w:cs="Times New Roman"/>
+        </w:rPr>
+        <w:t>3</w:t>
+      </w:r>
+      <w:r>
+        <w:rPr>
+          <w:rFonts w:ascii="Times New Roman" w:hAnsi="Times New Roman" w:cs="Times New Roman"/>
+        </w:rPr>
+        <w:t>b)</w:t>
+      </w:r>
+      <w:r>
+        <w:rPr>
+          <w:rFonts w:ascii="Times New Roman" w:hAnsi="Times New Roman" w:cs="Times New Roman"/>
+        </w:rPr>
+        <w:t xml:space="preserve">. </w:t>
+      </w:r>
+    </w:p>
+    <w:p>
+      <w:pPr>
+        <w:spacing w:line="480" w:lineRule="auto"/>
         <w:rPr>
           <w:rFonts w:ascii="Times New Roman" w:hAnsi="Times New Roman" w:cs="Times New Roman"/>
           <w:b/>
           <w:bCs/>
           <w:u w:val="single"/>
         </w:rPr>
+      </w:pPr>
+    </w:p>
+    <w:p>
+      <w:pPr>
+        <w:spacing w:line="480" w:lineRule="auto"/>
+        <w:rPr>
+          <w:rFonts w:ascii="Times New Roman" w:hAnsi="Times New Roman" w:cs="Times New Roman"/>
+          <w:b/>
+          <w:bCs/>
+          <w:u w:val="single"/>
+        </w:rPr>
+      </w:pPr>
+      <w:r>
+        <w:rPr>
+          <w:rFonts w:ascii="Times New Roman" w:hAnsi="Times New Roman" w:cs="Times New Roman"/>
+          <w:b/>
+          <w:bCs/>
+          <w:u w:val="single"/>
+        </w:rPr>
+        <w:lastRenderedPageBreak/>
         <w:t xml:space="preserve">Machine Learning Classification Models </w:t>
       </w:r>
     </w:p>
@@ -4902,7 +4923,6 @@
         <w:rPr>
           <w:rFonts w:ascii="Times New Roman" w:hAnsi="Times New Roman" w:cs="Times New Roman"/>
         </w:rPr>
-        <w:lastRenderedPageBreak/>
         <w:t>All individuals in the dataset</w:t>
       </w:r>
       <w:r>
@@ -5271,6 +5291,7 @@
         <w:spacing w:line="480" w:lineRule="auto"/>
       </w:pPr>
       <w:r>
+        <w:lastRenderedPageBreak/>
         <w:t xml:space="preserve">The </w:t>
       </w:r>
       <w:r>
@@ -5321,7 +5342,6 @@
           <w:b/>
           <w:bCs/>
         </w:rPr>
-        <w:lastRenderedPageBreak/>
         <w:t>F1-Score</w:t>
       </w:r>
       <w:r>
@@ -5518,6 +5538,9 @@
         <w:commentReference w:id="0"/>
       </w:r>
       <w:r>
+        <w:t xml:space="preserve">(confidence scores) </w:t>
+      </w:r>
+      <w:r>
         <w:t xml:space="preserve">that </w:t>
       </w:r>
       <w:r>
@@ -5526,12 +5549,48 @@
       <w:r>
         <w:t xml:space="preserve"> not accurately reflect </w:t>
       </w:r>
+      <w:r>
+        <w:t xml:space="preserve">the observed probability </w:t>
+      </w:r>
+      <w:r>
+        <w:t>of correct prediction</w:t>
+      </w:r>
+      <w:r>
+        <w:t xml:space="preserve"> </w:t>
+      </w:r>
+      <w:r>
+        <w:fldChar w:fldCharType="begin"/>
+      </w:r>
+      <w:r>
+        <w:instrText xml:space="preserve"> ADDIN ZOTERO_ITEM CSL_CITATION {"citationID":"CSw8QQVO","properties":{"formattedCitation":"(Dormann, 2020; Silva Filho et al., 2023)","plainCitation":"(Dormann, 2020; Silva Filho et al., 2023)","noteIndex":0},"citationItems":[{"id":5927,"uris":["http://zotero.org/users/8421274/items/AKSL3IZB"],"itemData":{"id":5927,"type":"article-journal","abstract":"Aim Predictions from statistical models may be uncalibrated, meaning that the predicted values do not have the nominal coverage probability. This is easiest seen with probability predictions in machine-learning classification, including the common species occurrence probabilities. Here, a predicted probability of, say, .7 should indicate that out of 100 cases with these environmental conditions, and hence the same predicted probability, the species should be present in 70 and absent in 30. Innovation A simple calibration plot shows that this is not necessarily the case, particularly not for overfitted models or algorithms that use non-likelihood target functions. As a consequence, ‘raw’ predictions from such a model could easily be off by .2, are unsuitable for averaging across model types, and resulting maps hence be substantially distorted. The solution, a flexible calibration regression, is simple and can be applied whenever deviations are observed. Main conclusions ‘Raw’, uncalibrated probability predictions should be calibrated before interpreting or averaging them in a probabilistic way.","container-title":"Global Ecology and Biogeography","DOI":"10.1111/geb.13070","ISSN":"1466-8238","issue":"4","language":"en","license":"© 2020 The Authors. Global Ecology and Biogeography published by John Wiley &amp; Sons Ltd","note":"_eprint: https://onlinelibrary.wiley.com/doi/pdf/10.1111/geb.13070","page":"760-765","source":"Wiley Online Library","title":"Calibration of probability predictions from machine-learning and statistical models","volume":"29","author":[{"family":"Dormann","given":"Carsten F."}],"issued":{"date-parts":[["2020"]]}}},{"id":5930,"uris":["http://zotero.org/users/8421274/items/SMJZ8UHT"],"itemData":{"id":5930,"type":"article-journal","abstract":"This paper provides both an introduction to and a detailed overview of the principles and practice of classifier calibration. A well-calibrated classifier correctly quantifies the level of uncertainty or confidence associated with its instance-wise predictions. This is essential for critical applications, optimal decision making, cost-sensitive classification, and for some types of context change. Calibration research has a rich history which predates the birth of machine learning as an academic field by decades. However, a recent increase in the interest on calibration has led to new methods and the extension from binary to the multiclass setting. The space of options and issues to consider is large, and navigating it requires the right set of concepts and tools. We provide both introductory material and up-to-date technical details of the main concepts and methods, including proper scoring rules and other evaluation metrics, visualisation approaches, a comprehensive account of post-hoc calibration methods for binary and multiclass classification, and several advanced topics.","container-title":"Machine Learning","DOI":"10.1007/s10994-023-06336-7","ISSN":"1573-0565","issue":"9","journalAbbreviation":"Mach Learn","language":"en","page":"3211-3260","source":"Springer Link","title":"Classifier calibration: a survey on how to assess and improve predicted class probabilities","title-short":"Classifier calibration","volume":"112","author":[{"family":"Silva Filho","given":"Telmo"},{"family":"Song","given":"Hao"},{"family":"Perello-Nieto","given":"Miquel"},{"family":"Santos-Rodriguez","given":"Raul"},{"family":"Kull","given":"Meelis"},{"family":"Flach","given":"Peter"}],"issued":{"date-parts":[["2023",9,1]]}}}],"schema":"https://github.com/citation-style-language/schema/raw/master/csl-citation.json"} </w:instrText>
+      </w:r>
+      <w:r>
+        <w:fldChar w:fldCharType="separate"/>
+      </w:r>
+      <w:r>
+        <w:rPr>
+          <w:noProof/>
+        </w:rPr>
+        <w:t>(Dormann, 2020; Silva Filho et al., 2023)</w:t>
+      </w:r>
+      <w:r>
+        <w:fldChar w:fldCharType="end"/>
+      </w:r>
+      <w:r>
+        <w:t xml:space="preserve">. </w:t>
+      </w:r>
+      <w:r>
+        <w:t xml:space="preserve">To be treated as </w:t>
+      </w:r>
+      <w:r>
+        <w:t xml:space="preserve">reliable </w:t>
+      </w:r>
+      <w:r>
+        <w:t xml:space="preserve">confidence values, </w:t>
+      </w:r>
       <w:commentRangeStart w:id="1"/>
       <w:r>
-        <w:t xml:space="preserve">true </w:t>
-      </w:r>
-      <w:r>
-        <w:t>confidence</w:t>
+        <w:t>we should expect that the observed proportion of individuals belonging to a given class aligns with the model’s assigned probability for that class.</w:t>
       </w:r>
       <w:commentRangeEnd w:id="1"/>
       <w:r>
@@ -5544,10 +5603,65 @@
         <w:commentReference w:id="1"/>
       </w:r>
       <w:r>
+        <w:t xml:space="preserve"> For example, if our model predicts individuals to have originated from the Kuskokwim watershed with 80% probability, then approximately 80% of those individuals should in fact be Kuskokwim fish.</w:t>
+      </w:r>
+      <w:r>
         <w:t xml:space="preserve"> </w:t>
       </w:r>
       <w:r>
-        <w:t>of correct prediction</w:t>
+        <w:t xml:space="preserve">However, this assumption is oftentimes not met, limiting </w:t>
+      </w:r>
+      <w:r>
+        <w:t xml:space="preserve">the </w:t>
+      </w:r>
+      <w:r>
+        <w:lastRenderedPageBreak/>
+        <w:t xml:space="preserve">utility of these </w:t>
+      </w:r>
+      <w:r>
+        <w:t xml:space="preserve">values </w:t>
+      </w:r>
+      <w:r>
+        <w:t xml:space="preserve">for decision-making </w:t>
+      </w:r>
+      <w:r>
+        <w:t xml:space="preserve">which relies on </w:t>
+      </w:r>
+      <w:r>
+        <w:t xml:space="preserve">confidence </w:t>
+      </w:r>
+      <w:r>
+        <w:t>thresholds</w:t>
+      </w:r>
+      <w:r>
+        <w:t xml:space="preserve"> of correct assignment probability</w:t>
+      </w:r>
+      <w:r>
+        <w:t xml:space="preserve"> or propagation of uncertainty through further probability-based models. To calibrate predictions from our models, we used the </w:t>
+      </w:r>
+      <w:r>
+        <w:t>{</w:t>
+      </w:r>
+      <w:r>
+        <w:rPr>
+          <w:rStyle w:val="HTMLCode"/>
+          <w:rFonts w:ascii="Times New Roman" w:eastAsiaTheme="majorEastAsia" w:hAnsi="Times New Roman" w:cs="Times New Roman"/>
+          <w:sz w:val="24"/>
+          <w:szCs w:val="24"/>
+        </w:rPr>
+        <w:t>probably</w:t>
+      </w:r>
+      <w:r>
+        <w:rPr>
+          <w:rStyle w:val="HTMLCode"/>
+          <w:rFonts w:ascii="Times New Roman" w:eastAsiaTheme="majorEastAsia" w:hAnsi="Times New Roman" w:cs="Times New Roman"/>
+          <w:sz w:val="24"/>
+          <w:szCs w:val="24"/>
+        </w:rPr>
+        <w:t>}</w:t>
+      </w:r>
+      <w:r>
+        <w:t xml:space="preserve"> package in R to apply multinomial isotonic regression to our testing set predictions</w:t>
       </w:r>
       <w:r>
         <w:t xml:space="preserve"> </w:t>
@@ -5556,7 +5670,7 @@
         <w:fldChar w:fldCharType="begin"/>
       </w:r>
       <w:r>
-        <w:instrText xml:space="preserve"> ADDIN ZOTERO_ITEM CSL_CITATION {"citationID":"CSw8QQVO","properties":{"formattedCitation":"(Dormann, 2020; Silva Filho et al., 2023)","plainCitation":"(Dormann, 2020; Silva Filho et al., 2023)","noteIndex":0},"citationItems":[{"id":5927,"uris":["http://zotero.org/users/8421274/items/AKSL3IZB"],"itemData":{"id":5927,"type":"article-journal","abstract":"Aim Predictions from statistical models may be uncalibrated, meaning that the predicted values do not have the nominal coverage probability. This is easiest seen with probability predictions in machine-learning classification, including the common species occurrence probabilities. Here, a predicted probability of, say, .7 should indicate that out of 100 cases with these environmental conditions, and hence the same predicted probability, the species should be present in 70 and absent in 30. Innovation A simple calibration plot shows that this is not necessarily the case, particularly not for overfitted models or algorithms that use non-likelihood target functions. As a consequence, ‘raw’ predictions from such a model could easily be off by .2, are unsuitable for averaging across model types, and resulting maps hence be substantially distorted. The solution, a flexible calibration regression, is simple and can be applied whenever deviations are observed. Main conclusions ‘Raw’, uncalibrated probability predictions should be calibrated before interpreting or averaging them in a probabilistic way.","container-title":"Global Ecology and Biogeography","DOI":"10.1111/geb.13070","ISSN":"1466-8238","issue":"4","language":"en","license":"© 2020 The Authors. Global Ecology and Biogeography published by John Wiley &amp; Sons Ltd","note":"_eprint: https://onlinelibrary.wiley.com/doi/pdf/10.1111/geb.13070","page":"760-765","source":"Wiley Online Library","title":"Calibration of probability predictions from machine-learning and statistical models","volume":"29","author":[{"family":"Dormann","given":"Carsten F."}],"issued":{"date-parts":[["2020"]]}}},{"id":5930,"uris":["http://zotero.org/users/8421274/items/SMJZ8UHT"],"itemData":{"id":5930,"type":"article-journal","abstract":"This paper provides both an introduction to and a detailed overview of the principles and practice of classifier calibration. A well-calibrated classifier correctly quantifies the level of uncertainty or confidence associated with its instance-wise predictions. This is essential for critical applications, optimal decision making, cost-sensitive classification, and for some types of context change. Calibration research has a rich history which predates the birth of machine learning as an academic field by decades. However, a recent increase in the interest on calibration has led to new methods and the extension from binary to the multiclass setting. The space of options and issues to consider is large, and navigating it requires the right set of concepts and tools. We provide both introductory material and up-to-date technical details of the main concepts and methods, including proper scoring rules and other evaluation metrics, visualisation approaches, a comprehensive account of post-hoc calibration methods for binary and multiclass classification, and several advanced topics.","container-title":"Machine Learning","DOI":"10.1007/s10994-023-06336-7","ISSN":"1573-0565","issue":"9","journalAbbreviation":"Mach Learn","language":"en","page":"3211-3260","source":"Springer Link","title":"Classifier calibration: a survey on how to assess and improve predicted class probabilities","title-short":"Classifier calibration","volume":"112","author":[{"family":"Silva Filho","given":"Telmo"},{"family":"Song","given":"Hao"},{"family":"Perello-Nieto","given":"Miquel"},{"family":"Santos-Rodriguez","given":"Raul"},{"family":"Kull","given":"Meelis"},{"family":"Flach","given":"Peter"}],"issued":{"date-parts":[["2023",9,1]]}}}],"schema":"https://github.com/citation-style-language/schema/raw/master/csl-citation.json"} </w:instrText>
+        <w:instrText xml:space="preserve"> ADDIN ZOTERO_ITEM CSL_CITATION {"citationID":"FsUssuNw","properties":{"formattedCitation":"(Kuhn et al., 2025)","plainCitation":"(Kuhn et al., 2025)","noteIndex":0},"citationItems":[{"id":5932,"uris":["http://zotero.org/users/8421274/items/5T9KPPTV"],"itemData":{"id":5932,"type":"software","title":"probably: Tools for Post-Processing Predicted Values","URL":"https://github.com/tidymodels/probably","author":[{"family":"Kuhn","given":"Max"},{"family":"Vaughn","given":"Davis"},{"family":"Ruiz","given":"Edgar"}],"issued":{"date-parts":[["2025"]]}}}],"schema":"https://github.com/citation-style-language/schema/raw/master/csl-citation.json"} </w:instrText>
       </w:r>
       <w:r>
         <w:fldChar w:fldCharType="separate"/>
@@ -5565,7 +5679,7 @@
         <w:rPr>
           <w:noProof/>
         </w:rPr>
-        <w:t>(Dormann, 2020; Silva Filho et al., 2023)</w:t>
+        <w:t>(Kuhn et al., 2025)</w:t>
       </w:r>
       <w:r>
         <w:fldChar w:fldCharType="end"/>
@@ -5574,11 +5688,125 @@
         <w:t xml:space="preserve">. </w:t>
       </w:r>
       <w:r>
-        <w:t xml:space="preserve">To be treated as </w:t>
+        <w:t xml:space="preserve">This approach adjusts the </w:t>
+      </w:r>
+      <w:r>
+        <w:t xml:space="preserve">predicted probability </w:t>
+      </w:r>
+      <w:r>
+        <w:t>scores</w:t>
+      </w:r>
+      <w:r>
+        <w:t xml:space="preserve"> to better align </w:t>
+      </w:r>
+      <w:r>
+        <w:t>with the true observed probabilities</w:t>
+      </w:r>
+      <w:r>
+        <w:t xml:space="preserve"> through a non-parametric monotonic transformation. We verified calibration effectiveness through </w:t>
+      </w:r>
+      <w:r>
+        <w:t xml:space="preserve">a </w:t>
+      </w:r>
+      <w:r>
+        <w:t xml:space="preserve">visual assessment of </w:t>
+      </w:r>
+      <w:r>
+        <w:t xml:space="preserve">plots </w:t>
+      </w:r>
+      <w:r>
+        <w:t>showing the</w:t>
+      </w:r>
+      <w:r>
+        <w:t xml:space="preserve"> predicted probabilities against observed class frequencies across probability bins</w:t>
+      </w:r>
+      <w:r>
+        <w:t xml:space="preserve"> (</w:t>
+      </w:r>
+      <w:r>
+        <w:t xml:space="preserve">ex. </w:t>
+      </w:r>
+      <w:r>
+        <w:t>Supp</w:t>
+      </w:r>
+      <w:r>
+        <w:t>. Fig 1.</w:t>
+      </w:r>
+      <w:r>
+        <w:t>)</w:t>
+      </w:r>
+      <w:r>
+        <w:t>. Calibration transformations were fitted separately for each model-data type combination ensur</w:t>
+      </w:r>
+      <w:r>
+        <w:t>ing</w:t>
+      </w:r>
+      <w:r>
+        <w:t xml:space="preserve"> that probability estimates from our models accurately reflect </w:t>
+      </w:r>
+      <w:r>
+        <w:t xml:space="preserve">observed </w:t>
+      </w:r>
+      <w:r>
+        <w:t xml:space="preserve">classification </w:t>
+      </w:r>
+      <w:r>
+        <w:t xml:space="preserve">probability. </w:t>
+      </w:r>
+      <w:r>
+        <w:t xml:space="preserve">Using </w:t>
+      </w:r>
+      <w:r>
+        <w:t xml:space="preserve">the </w:t>
+      </w:r>
+      <w:r>
+        <w:t xml:space="preserve">calibrated </w:t>
+      </w:r>
+      <w:r>
+        <w:t xml:space="preserve">testing set </w:t>
+      </w:r>
+      <w:r>
+        <w:t>probabiliti</w:t>
+      </w:r>
+      <w:r>
+        <w:t>es</w:t>
+      </w:r>
+      <w:r>
+        <w:t xml:space="preserve">, </w:t>
+      </w:r>
+      <w:r>
+        <w:t xml:space="preserve">we </w:t>
+      </w:r>
+      <w:r>
+        <w:t xml:space="preserve">then </w:t>
+      </w:r>
+      <w:r>
+        <w:t xml:space="preserve">tested the </w:t>
+      </w:r>
+      <w:r>
+        <w:t xml:space="preserve">classification </w:t>
+      </w:r>
+      <w:r>
+        <w:t xml:space="preserve">accuracy obtained </w:t>
+      </w:r>
+      <w:r>
+        <w:t>from our</w:t>
+      </w:r>
+      <w:r>
+        <w:t xml:space="preserve"> best</w:t>
+      </w:r>
+      <w:r>
+        <w:t xml:space="preserve"> model </w:t>
+      </w:r>
+      <w:r>
+        <w:t>above</w:t>
+      </w:r>
+      <w:r>
+        <w:t xml:space="preserve"> calibrated </w:t>
       </w:r>
       <w:commentRangeStart w:id="2"/>
       <w:r>
-        <w:t>true</w:t>
+        <w:t xml:space="preserve"> </w:t>
       </w:r>
       <w:commentRangeEnd w:id="2"/>
       <w:r>
@@ -5591,244 +5819,6 @@
         <w:commentReference w:id="2"/>
       </w:r>
       <w:r>
-        <w:t xml:space="preserve"> confidence values, </w:t>
-      </w:r>
-      <w:commentRangeStart w:id="3"/>
-      <w:r>
-        <w:t>we should expect that the observed proportion of individuals belonging to a given class aligns with the model’s assigned probability for that class.</w:t>
-      </w:r>
-      <w:commentRangeEnd w:id="3"/>
-      <w:r>
-        <w:rPr>
-          <w:rStyle w:val="CommentReference"/>
-          <w:rFonts w:asciiTheme="minorHAnsi" w:eastAsiaTheme="minorHAnsi" w:hAnsiTheme="minorHAnsi" w:cstheme="minorBidi"/>
-          <w:kern w:val="2"/>
-          <w14:ligatures w14:val="standardContextual"/>
-        </w:rPr>
-        <w:commentReference w:id="3"/>
-      </w:r>
-      <w:r>
-        <w:t xml:space="preserve"> For example, if our model predicts individuals to have originated from the Kuskokwim watershed with 80% probability, then approximately 80% of those individuals should in fact be Kuskokwim fish.</w:t>
-      </w:r>
-      <w:r>
-        <w:t xml:space="preserve"> </w:t>
-      </w:r>
-      <w:r>
-        <w:t xml:space="preserve">However, this assumption is oftentimes not met, limiting </w:t>
-      </w:r>
-      <w:r>
-        <w:t xml:space="preserve">the utility of these </w:t>
-      </w:r>
-      <w:r>
-        <w:t xml:space="preserve">values </w:t>
-      </w:r>
-      <w:r>
-        <w:t xml:space="preserve">for decision-making </w:t>
-      </w:r>
-      <w:r>
-        <w:t xml:space="preserve">which relies on </w:t>
-      </w:r>
-      <w:r>
-        <w:t xml:space="preserve">confidence </w:t>
-      </w:r>
-      <w:r>
-        <w:t>thresholds</w:t>
-      </w:r>
-      <w:r>
-        <w:t xml:space="preserve"> of correct assignment probability</w:t>
-      </w:r>
-      <w:r>
-        <w:t xml:space="preserve"> or propagation of uncertainty through further probability-based models. To calibrate predictions </w:t>
-      </w:r>
-      <w:r>
-        <w:lastRenderedPageBreak/>
-        <w:t xml:space="preserve">from our models, we used the </w:t>
-      </w:r>
-      <w:r>
-        <w:t>{</w:t>
-      </w:r>
-      <w:r>
-        <w:rPr>
-          <w:rStyle w:val="HTMLCode"/>
-          <w:rFonts w:ascii="Times New Roman" w:eastAsiaTheme="majorEastAsia" w:hAnsi="Times New Roman" w:cs="Times New Roman"/>
-          <w:sz w:val="24"/>
-          <w:szCs w:val="24"/>
-        </w:rPr>
-        <w:t>probably</w:t>
-      </w:r>
-      <w:r>
-        <w:rPr>
-          <w:rStyle w:val="HTMLCode"/>
-          <w:rFonts w:ascii="Times New Roman" w:eastAsiaTheme="majorEastAsia" w:hAnsi="Times New Roman" w:cs="Times New Roman"/>
-          <w:sz w:val="24"/>
-          <w:szCs w:val="24"/>
-        </w:rPr>
-        <w:t>}</w:t>
-      </w:r>
-      <w:r>
-        <w:t xml:space="preserve"> package in R to apply multinomial isotonic regression to our testing set predictions</w:t>
-      </w:r>
-      <w:r>
-        <w:t xml:space="preserve"> </w:t>
-      </w:r>
-      <w:r>
-        <w:fldChar w:fldCharType="begin"/>
-      </w:r>
-      <w:r>
-        <w:instrText xml:space="preserve"> ADDIN ZOTERO_ITEM CSL_CITATION {"citationID":"FsUssuNw","properties":{"formattedCitation":"(Kuhn et al., 2025)","plainCitation":"(Kuhn et al., 2025)","noteIndex":0},"citationItems":[{"id":5932,"uris":["http://zotero.org/users/8421274/items/5T9KPPTV"],"itemData":{"id":5932,"type":"software","title":"probably: Tools for Post-Processing Predicted Values","URL":"https://github.com/tidymodels/probably","author":[{"family":"Kuhn","given":"Max"},{"family":"Vaughn","given":"Davis"},{"family":"Ruiz","given":"Edgar"}],"issued":{"date-parts":[["2025"]]}}}],"schema":"https://github.com/citation-style-language/schema/raw/master/csl-citation.json"} </w:instrText>
-      </w:r>
-      <w:r>
-        <w:fldChar w:fldCharType="separate"/>
-      </w:r>
-      <w:r>
-        <w:rPr>
-          <w:noProof/>
-        </w:rPr>
-        <w:t>(Kuhn et al., 2025)</w:t>
-      </w:r>
-      <w:r>
-        <w:fldChar w:fldCharType="end"/>
-      </w:r>
-      <w:r>
-        <w:t xml:space="preserve">. </w:t>
-      </w:r>
-      <w:r>
-        <w:t xml:space="preserve">This approach adjusts the </w:t>
-      </w:r>
-      <w:r>
-        <w:t xml:space="preserve">predicted probability </w:t>
-      </w:r>
-      <w:r>
-        <w:t>scores</w:t>
-      </w:r>
-      <w:r>
-        <w:t xml:space="preserve"> to better align </w:t>
-      </w:r>
-      <w:r>
-        <w:t>with the true observed probabilities</w:t>
-      </w:r>
-      <w:r>
-        <w:t xml:space="preserve"> through a non-parametric monotonic transformation. We verified calibration effectiveness through </w:t>
-      </w:r>
-      <w:r>
-        <w:t xml:space="preserve">a </w:t>
-      </w:r>
-      <w:r>
-        <w:t xml:space="preserve">visual assessment of </w:t>
-      </w:r>
-      <w:r>
-        <w:t xml:space="preserve">plots </w:t>
-      </w:r>
-      <w:r>
-        <w:t>showing the</w:t>
-      </w:r>
-      <w:r>
-        <w:t xml:space="preserve"> predicted probabilities against observed class frequencies across probability bins</w:t>
-      </w:r>
-      <w:r>
-        <w:t xml:space="preserve"> (</w:t>
-      </w:r>
-      <w:r>
-        <w:t xml:space="preserve">ex. </w:t>
-      </w:r>
-      <w:r>
-        <w:t>Supp</w:t>
-      </w:r>
-      <w:r>
-        <w:t>. Fig 1.</w:t>
-      </w:r>
-      <w:r>
-        <w:t>)</w:t>
-      </w:r>
-      <w:r>
-        <w:t>. Calibration transformations were fitted separately for each model-data type combination ensur</w:t>
-      </w:r>
-      <w:r>
-        <w:t>ing</w:t>
-      </w:r>
-      <w:r>
-        <w:t xml:space="preserve"> that probability estimates from our models accurately </w:t>
-      </w:r>
-      <w:commentRangeStart w:id="4"/>
-      <w:r>
-        <w:t>reflect true classification confidence</w:t>
-      </w:r>
-      <w:commentRangeEnd w:id="4"/>
-      <w:r>
-        <w:rPr>
-          <w:rStyle w:val="CommentReference"/>
-          <w:rFonts w:asciiTheme="minorHAnsi" w:eastAsiaTheme="minorHAnsi" w:hAnsiTheme="minorHAnsi" w:cstheme="minorBidi"/>
-          <w:kern w:val="2"/>
-          <w14:ligatures w14:val="standardContextual"/>
-        </w:rPr>
-        <w:commentReference w:id="4"/>
-      </w:r>
-      <w:r>
-        <w:t xml:space="preserve">. </w:t>
-      </w:r>
-      <w:r>
-        <w:t xml:space="preserve">Using </w:t>
-      </w:r>
-      <w:r>
-        <w:t xml:space="preserve">the </w:t>
-      </w:r>
-      <w:r>
-        <w:t xml:space="preserve">calibrated </w:t>
-      </w:r>
-      <w:r>
-        <w:t xml:space="preserve">testing set </w:t>
-      </w:r>
-      <w:r>
-        <w:t>probabiliti</w:t>
-      </w:r>
-      <w:r>
-        <w:t>es</w:t>
-      </w:r>
-      <w:r>
-        <w:t xml:space="preserve">, </w:t>
-      </w:r>
-      <w:r>
-        <w:t xml:space="preserve">we </w:t>
-      </w:r>
-      <w:r>
-        <w:t xml:space="preserve">then </w:t>
-      </w:r>
-      <w:r>
-        <w:t xml:space="preserve">tested the </w:t>
-      </w:r>
-      <w:r>
-        <w:t xml:space="preserve">classification </w:t>
-      </w:r>
-      <w:r>
-        <w:t xml:space="preserve">accuracy obtained </w:t>
-      </w:r>
-      <w:r>
-        <w:t>from our</w:t>
-      </w:r>
-      <w:r>
-        <w:t xml:space="preserve"> best</w:t>
-      </w:r>
-      <w:r>
-        <w:t xml:space="preserve"> model </w:t>
-      </w:r>
-      <w:r>
-        <w:t>above</w:t>
-      </w:r>
-      <w:commentRangeStart w:id="5"/>
-      <w:r>
-        <w:t xml:space="preserve"> </w:t>
-      </w:r>
-      <w:commentRangeEnd w:id="5"/>
-      <w:r>
-        <w:rPr>
-          <w:rStyle w:val="CommentReference"/>
-          <w:rFonts w:asciiTheme="minorHAnsi" w:eastAsiaTheme="minorHAnsi" w:hAnsiTheme="minorHAnsi" w:cstheme="minorBidi"/>
-          <w:kern w:val="2"/>
-          <w14:ligatures w14:val="standardContextual"/>
-        </w:rPr>
-        <w:commentReference w:id="5"/>
-      </w:r>
-      <w:r>
         <w:t xml:space="preserve">confidence thresholds ranging from </w:t>
       </w:r>
       <w:r>
@@ -5942,7 +5932,11 @@
         <w:t>, blue)</w:t>
       </w:r>
       <w:r>
-        <w:t xml:space="preserve"> covered a much larger region of the principal component space, reflecting the broader range of potential isotope values that create unique </w:t>
+        <w:t xml:space="preserve"> covered a much larger region of the principal component space, </w:t>
+      </w:r>
+      <w:r>
+        <w:lastRenderedPageBreak/>
+        <w:t xml:space="preserve">reflecting the broader range of potential isotope values that create unique </w:t>
       </w:r>
       <w:r>
         <w:t>time series</w:t>
@@ -5963,7 +5957,6 @@
         <w:rPr>
           <w:rFonts w:ascii="Times New Roman" w:hAnsi="Times New Roman" w:cs="Times New Roman"/>
         </w:rPr>
-        <w:lastRenderedPageBreak/>
         <w:t>The pattern observed in the full dataset was also found among only individuals with the same natal origin value (0.7080 – 0.7085)</w:t>
       </w:r>
       <w:r>
@@ -6376,7 +6369,6 @@
           <w:b/>
           <w:bCs/>
         </w:rPr>
-        <w:lastRenderedPageBreak/>
         <w:t xml:space="preserve">Model Performance </w:t>
       </w:r>
     </w:p>
@@ -6550,21 +6542,21 @@
         <w:rPr>
           <w:rFonts w:ascii="Times New Roman" w:hAnsi="Times New Roman" w:cs="Times New Roman"/>
         </w:rPr>
-        <w:t xml:space="preserve">testing set), </w:t>
-      </w:r>
-      <w:commentRangeStart w:id="6"/>
-      <w:r>
-        <w:rPr>
-          <w:rFonts w:ascii="Times New Roman" w:hAnsi="Times New Roman" w:cs="Times New Roman"/>
-        </w:rPr>
-        <w:t xml:space="preserve">which may have more dimensionality due to less autocorrelation among points. </w:t>
-      </w:r>
-      <w:commentRangeEnd w:id="6"/>
+        <w:t>testing set</w:t>
+      </w:r>
+      <w:commentRangeStart w:id="3"/>
+      <w:r>
+        <w:rPr>
+          <w:rFonts w:ascii="Times New Roman" w:hAnsi="Times New Roman" w:cs="Times New Roman"/>
+        </w:rPr>
+        <w:t xml:space="preserve">. </w:t>
+      </w:r>
+      <w:commentRangeEnd w:id="3"/>
       <w:r>
         <w:rPr>
           <w:rStyle w:val="CommentReference"/>
         </w:rPr>
-        <w:commentReference w:id="6"/>
+        <w:commentReference w:id="3"/>
       </w:r>
       <w:r>
         <w:rPr>
@@ -6972,19 +6964,19 @@
         </w:rPr>
         <w:t xml:space="preserve"> Visual assessments indicated improved calibration, with the relationship between predicted and observed probabilities approximating a 1:1 line across all classes and model–data type combinations (ex. Supp. Fig 1). </w:t>
       </w:r>
-      <w:commentRangeStart w:id="7"/>
+      <w:commentRangeStart w:id="4"/>
       <w:r>
         <w:rPr>
           <w:rFonts w:ascii="Times New Roman" w:hAnsi="Times New Roman" w:cs="Times New Roman"/>
         </w:rPr>
         <w:t>Notably, many of the predicted probability values from our models appeared to follow this assumption relatively well even before calibration.</w:t>
       </w:r>
-      <w:commentRangeEnd w:id="7"/>
+      <w:commentRangeEnd w:id="4"/>
       <w:r>
         <w:rPr>
           <w:rStyle w:val="CommentReference"/>
         </w:rPr>
-        <w:commentReference w:id="7"/>
+        <w:commentReference w:id="4"/>
       </w:r>
       <w:r>
         <w:rPr>
@@ -8032,11 +8024,11 @@
       <w:r>
         <w:t xml:space="preserve">Our dataset is unusually large for its type and includes samples collected across several years and from nearly all parts of the sampled watersheds. As such, we expect it to be broadly representative of the natural variability among years, and that the model presented here will generalize well to new years of data. However, due to sample size constraints we did not include a true validation set from a year excluded from the training and testing data, leaving open the possibility that some degree of overfitting to this dataset could affect assignment </w:t>
       </w:r>
-      <w:commentRangeStart w:id="8"/>
+      <w:commentRangeStart w:id="5"/>
       <w:r>
         <w:t>accuracy for unseen years.</w:t>
       </w:r>
-      <w:commentRangeEnd w:id="8"/>
+      <w:commentRangeEnd w:id="5"/>
       <w:r>
         <w:rPr>
           <w:rStyle w:val="CommentReference"/>
@@ -8044,10 +8036,32 @@
           <w:kern w:val="2"/>
           <w14:ligatures w14:val="standardContextual"/>
         </w:rPr>
-        <w:commentReference w:id="8"/>
-      </w:r>
-      <w:r>
-        <w:t xml:space="preserve"> Additionally, sample preparation procedures and </w:t>
+        <w:commentReference w:id="5"/>
+      </w:r>
+      <w:r>
+        <w:t xml:space="preserve"> </w:t>
+      </w:r>
+      <w:r>
+        <w:t>During exploratory analyses, we conducted a preliminary cross-year validation in which one year of Yukon data was withheld in each run and used as a validation set. Classification accuracy across years was generally consistent with testing performance, except for 2019, which performed moderately worse</w:t>
+      </w:r>
+      <w:r>
+        <w:t xml:space="preserve">, </w:t>
+      </w:r>
+      <w:r>
+        <w:t xml:space="preserve">possibly due to differences in sample preparation or data quality. While these preliminary results </w:t>
+      </w:r>
+      <w:r>
+        <w:lastRenderedPageBreak/>
+        <w:t xml:space="preserve">were not included in the final analysis, they support the potential for this model to generalize to new years of data, </w:t>
+      </w:r>
+      <w:r>
+        <w:t>which we</w:t>
+      </w:r>
+      <w:r>
+        <w:t xml:space="preserve"> plan to further evaluate as additional, currently unprocessed years of otolith data become available from this collection effort. </w:t>
+      </w:r>
+      <w:r>
+        <w:t xml:space="preserve">Additionally, sample preparation procedures and </w:t>
       </w:r>
       <w:r>
         <w:t xml:space="preserve">LA-ICPMS </w:t>
@@ -8065,11 +8079,7 @@
         <w:t xml:space="preserve">given that </w:t>
       </w:r>
       <w:r>
-        <w:t xml:space="preserve">our model used only the freshwater region of the otolith. Nevertheless, differences in </w:t>
-      </w:r>
-      <w:r>
-        <w:lastRenderedPageBreak/>
-        <w:t xml:space="preserve">analytical approaches, particularly when working with much smaller otoliths, could influence results, and this assumption should be evaluated before large-scale application. Despite these caveats, we expect the patterns identified here to be robust across similar data types, particularly when paired with advanced time-series methods </w:t>
+        <w:t xml:space="preserve">our model used only the freshwater region of the otolith. Nevertheless, differences in analytical approaches, particularly when working with much smaller otoliths, could influence results, and this assumption should be evaluated before large-scale application. Despite these caveats, we expect the patterns identified here to be robust across similar data types, particularly when paired with advanced time-series methods </w:t>
       </w:r>
       <w:r>
         <w:t xml:space="preserve">(ex. </w:t>
@@ -8230,13 +8240,16 @@
         <w:t>s</w:t>
       </w:r>
       <w:r>
-        <w:t xml:space="preserve"> limited for in-season management or rapid research applications. Otolith LA-ICPMS is costly and labor-intensive, making large-scale, real-time assessment of river origin for marine-caught samples impractical. Moreover, otolith collection is lethal, which may be prohibitive given the increasingly endangered status of Chinook salmon in this region. The model also relies on a large existing dataset with known river-of-origin labels derived from unique sampling efforts, a resource not available for most other species of concern. For example, comparable datasets do not exist for chum salmon, constraining the </w:t>
+        <w:t xml:space="preserve"> limited for in-season management or </w:t>
+      </w:r>
+      <w:r>
+        <w:lastRenderedPageBreak/>
+        <w:t xml:space="preserve">rapid research applications. Otolith LA-ICPMS is costly and labor-intensive, making large-scale, real-time assessment of river origin for marine-caught samples impractical. Moreover, otolith collection is lethal, which may be prohibitive given the increasingly endangered status of Chinook salmon in this region. The model also relies on a large existing dataset with known river-of-origin labels derived from unique sampling efforts, a resource not available for most other species of concern. For example, comparable datasets do not exist for chum salmon, constraining the </w:t>
       </w:r>
       <w:r>
         <w:t xml:space="preserve">application of these methods to other similar species of concern in the region. </w:t>
       </w:r>
       <w:r>
-        <w:lastRenderedPageBreak/>
         <w:t xml:space="preserve">However, </w:t>
       </w:r>
       <w:r>
@@ -8392,6 +8405,7 @@
           <w:b/>
           <w:bCs/>
         </w:rPr>
+        <w:lastRenderedPageBreak/>
         <w:t xml:space="preserve">Acknowledgements: </w:t>
       </w:r>
     </w:p>
@@ -8420,6 +8434,12 @@
         <w:rPr>
           <w:rFonts w:ascii="Times New Roman" w:hAnsi="Times New Roman" w:cs="Times New Roman"/>
         </w:rPr>
+        <w:t xml:space="preserve">We thank the University of Washington’s eScience Institute Data Science and AI Accelerator program, which provided mentorship and resources to progress this project alongside subject matter experts in a collaborative interdisciplinary environment. </w:t>
+      </w:r>
+      <w:r>
+        <w:rPr>
+          <w:rFonts w:ascii="Times New Roman" w:hAnsi="Times New Roman" w:cs="Times New Roman"/>
+        </w:rPr>
         <w:t xml:space="preserve">We thank the </w:t>
       </w:r>
       <w:r>
@@ -8438,14 +8458,7 @@
         <w:rPr>
           <w:rFonts w:ascii="Times New Roman" w:hAnsi="Times New Roman" w:cs="Times New Roman"/>
         </w:rPr>
-        <w:t xml:space="preserve"> lab who provided the genetics data for this </w:t>
-      </w:r>
-      <w:r>
-        <w:rPr>
-          <w:rFonts w:ascii="Times New Roman" w:hAnsi="Times New Roman" w:cs="Times New Roman"/>
-        </w:rPr>
-        <w:lastRenderedPageBreak/>
-        <w:t xml:space="preserve">study. This work is supported by the </w:t>
+        <w:t xml:space="preserve"> lab who provided the genetics data for this study. This work is supported by the </w:t>
       </w:r>
       <w:r>
         <w:rPr>
@@ -8459,6 +8472,16 @@
         </w:rPr>
         <w:t xml:space="preserve">(KRITFC). </w:t>
       </w:r>
+    </w:p>
+    <w:p>
+      <w:pPr>
+        <w:spacing w:before="100" w:beforeAutospacing="1" w:after="100" w:afterAutospacing="1" w:line="480" w:lineRule="auto"/>
+        <w:ind w:firstLine="720"/>
+        <w:outlineLvl w:val="1"/>
+        <w:rPr>
+          <w:rFonts w:ascii="Times New Roman" w:hAnsi="Times New Roman" w:cs="Times New Roman"/>
+        </w:rPr>
+      </w:pPr>
     </w:p>
     <w:p>
       <w:pPr>
@@ -8466,8 +8489,18 @@
         <w:outlineLvl w:val="1"/>
         <w:rPr>
           <w:rFonts w:ascii="Times New Roman" w:hAnsi="Times New Roman" w:cs="Times New Roman"/>
-        </w:rPr>
-      </w:pPr>
+          <w:b/>
+          <w:bCs/>
+        </w:rPr>
+      </w:pPr>
+      <w:r>
+        <w:rPr>
+          <w:rFonts w:ascii="Times New Roman" w:hAnsi="Times New Roman" w:cs="Times New Roman"/>
+          <w:b/>
+          <w:bCs/>
+        </w:rPr>
+        <w:t xml:space="preserve">Author Contributions: </w:t>
+      </w:r>
     </w:p>
     <w:p>
       <w:pPr>
@@ -8481,7 +8514,7 @@
         <w:rPr>
           <w:rFonts w:ascii="Times New Roman" w:hAnsi="Times New Roman" w:cs="Times New Roman"/>
         </w:rPr>
-        <w:t xml:space="preserve">Author Contributions: </w:t>
+        <w:t xml:space="preserve">Ben Makhlouf preformed data analysis and wrote the manuscript. Valentina Staneva provided technical expertise and provided extensive consultation on project direction. Daniel E. Schindler directed the project and analysis, secured funding, and helped develop the manuscript. All authors contributed to editing the final manuscript. </w:t>
       </w:r>
     </w:p>
     <w:p>
@@ -8492,12 +8525,6 @@
           <w:rFonts w:ascii="Times New Roman" w:hAnsi="Times New Roman" w:cs="Times New Roman"/>
         </w:rPr>
       </w:pPr>
-      <w:r>
-        <w:rPr>
-          <w:rFonts w:ascii="Times New Roman" w:hAnsi="Times New Roman" w:cs="Times New Roman"/>
-        </w:rPr>
-        <w:t xml:space="preserve">Ben Makhlouf preformed data analysis and wrote the manuscript. Valentina Staneva provided technical expertise and provided extensive consultation on project direction. Daniel E. Schindler directed the project and analysis, secured funding, and helped develop the manuscript. All authors contributed to editing the final manuscript. </w:t>
-      </w:r>
     </w:p>
     <w:p>
       <w:pPr>
@@ -8505,8 +8532,18 @@
         <w:outlineLvl w:val="1"/>
         <w:rPr>
           <w:rFonts w:ascii="Times New Roman" w:hAnsi="Times New Roman" w:cs="Times New Roman"/>
-        </w:rPr>
-      </w:pPr>
+          <w:b/>
+          <w:bCs/>
+        </w:rPr>
+      </w:pPr>
+      <w:r>
+        <w:rPr>
+          <w:rFonts w:ascii="Times New Roman" w:hAnsi="Times New Roman" w:cs="Times New Roman"/>
+          <w:b/>
+          <w:bCs/>
+        </w:rPr>
+        <w:t xml:space="preserve">Conflict of Interest statement </w:t>
+      </w:r>
     </w:p>
     <w:p>
       <w:pPr>
@@ -8520,7 +8557,7 @@
         <w:rPr>
           <w:rFonts w:ascii="Times New Roman" w:hAnsi="Times New Roman" w:cs="Times New Roman"/>
         </w:rPr>
-        <w:t xml:space="preserve">Conflict of Interest statement </w:t>
+        <w:t>There is no conflict of interest declared</w:t>
       </w:r>
     </w:p>
     <w:p>
@@ -8531,12 +8568,6 @@
           <w:rFonts w:ascii="Times New Roman" w:hAnsi="Times New Roman" w:cs="Times New Roman"/>
         </w:rPr>
       </w:pPr>
-      <w:r>
-        <w:rPr>
-          <w:rFonts w:ascii="Times New Roman" w:hAnsi="Times New Roman" w:cs="Times New Roman"/>
-        </w:rPr>
-        <w:t>There is no conflict of interest declared</w:t>
-      </w:r>
     </w:p>
     <w:p>
       <w:pPr>
@@ -8546,15 +8577,6 @@
           <w:rFonts w:ascii="Times New Roman" w:hAnsi="Times New Roman" w:cs="Times New Roman"/>
         </w:rPr>
       </w:pPr>
-    </w:p>
-    <w:p>
-      <w:pPr>
-        <w:spacing w:before="100" w:beforeAutospacing="1" w:after="100" w:afterAutospacing="1" w:line="480" w:lineRule="auto"/>
-        <w:outlineLvl w:val="1"/>
-        <w:rPr>
-          <w:rFonts w:ascii="Times New Roman" w:hAnsi="Times New Roman" w:cs="Times New Roman"/>
-        </w:rPr>
-      </w:pPr>
       <w:r>
         <w:rPr>
           <w:rFonts w:ascii="Times New Roman" w:hAnsi="Times New Roman" w:cs="Times New Roman"/>
@@ -8694,7 +8716,6 @@
         <w:rPr>
           <w:rFonts w:ascii="Times New Roman" w:hAnsi="Times New Roman" w:cs="Times New Roman"/>
         </w:rPr>
-        <w:lastRenderedPageBreak/>
         <w:t xml:space="preserve">Beacham, T. D., Lapointe, M., Candy, J. R., Miller, K. M., &amp; Withler, R. E. (2004). DNA in Action: Rapid Application of DNA Variation to Sockeye Salmon Fisheries Management. </w:t>
       </w:r>
       <w:r>
@@ -8947,7 +8968,14 @@
         <w:rPr>
           <w:rFonts w:ascii="Times New Roman" w:hAnsi="Times New Roman" w:cs="Times New Roman"/>
         </w:rPr>
-        <w:t xml:space="preserve">DeFilippo, L. B., Larson, W. A., Barry, P. D., Cunningham, C. J., Langan, J. A., Garcia, S., Howard, K. G., Ianelli, J. N., &amp; Stram, D. L. (2025). Drivers and Dynamics of Salmon Bycatch in the Eastern Bering Sea Pollock Fishery. </w:t>
+        <w:t xml:space="preserve">DeFilippo, L. B., Larson, W. A., Barry, P. D., Cunningham, C. J., Langan, J. A., Garcia, S., Howard, K. G., Ianelli, J. N., &amp; Stram, D. L. (2025). Drivers and Dynamics of Salmon Bycatch </w:t>
+      </w:r>
+      <w:r>
+        <w:rPr>
+          <w:rFonts w:ascii="Times New Roman" w:hAnsi="Times New Roman" w:cs="Times New Roman"/>
+        </w:rPr>
+        <w:lastRenderedPageBreak/>
+        <w:t xml:space="preserve">in the Eastern Bering Sea Pollock Fishery. </w:t>
       </w:r>
       <w:r>
         <w:rPr>
@@ -9115,14 +9143,7 @@
         <w:rPr>
           <w:rFonts w:ascii="Times New Roman" w:hAnsi="Times New Roman" w:cs="Times New Roman"/>
         </w:rPr>
-        <w:t xml:space="preserve">Feddern, M. L., Schoen, E. R., Shaftel, R., Cunningham, C. J., Chythlook, C., Connors, B. M., Murdoch, A. D., von Biela, V. R., &amp; Woods, B. (2023). Kings of the North: Bridging Disciplines </w:t>
-      </w:r>
-      <w:r>
-        <w:rPr>
-          <w:rFonts w:ascii="Times New Roman" w:hAnsi="Times New Roman" w:cs="Times New Roman"/>
-        </w:rPr>
-        <w:lastRenderedPageBreak/>
-        <w:t xml:space="preserve">to Understand the Effects of Changing Climate on Chinook Salmon in the Arctic-Yukon-Kuskokwim Region. </w:t>
+        <w:t xml:space="preserve">Feddern, M. L., Schoen, E. R., Shaftel, R., Cunningham, C. J., Chythlook, C., Connors, B. M., Murdoch, A. D., von Biela, V. R., &amp; Woods, B. (2023). Kings of the North: Bridging Disciplines to Understand the Effects of Changing Climate on Chinook Salmon in the Arctic-Yukon-Kuskokwim Region. </w:t>
       </w:r>
       <w:r>
         <w:rPr>
@@ -9388,7 +9409,14 @@
         <w:rPr>
           <w:rFonts w:ascii="Times New Roman" w:hAnsi="Times New Roman" w:cs="Times New Roman"/>
         </w:rPr>
-        <w:t xml:space="preserve">Lamborn, C. C., Ohlberger, J., Walsworth, T. E., Westley, P. A. H., Cunningham, C. J., Wynsma, S., &amp; Smith, J. W. (2025). A Synthesis of Factors Related to Trends in Abundance and Demography of Alaska Chinook Salmon (Oncorhynchus tshawytscha, Salmonidae): Implications for Research, Management, and Policy. </w:t>
+        <w:t xml:space="preserve">Lamborn, C. C., Ohlberger, J., Walsworth, T. E., Westley, P. A. H., Cunningham, C. J., Wynsma, S., &amp; Smith, J. W. (2025). A Synthesis of Factors Related to Trends in Abundance and Demography of Alaska Chinook Salmon (Oncorhynchus tshawytscha, Salmonidae): Implications </w:t>
+      </w:r>
+      <w:r>
+        <w:rPr>
+          <w:rFonts w:ascii="Times New Roman" w:hAnsi="Times New Roman" w:cs="Times New Roman"/>
+        </w:rPr>
+        <w:lastRenderedPageBreak/>
+        <w:t xml:space="preserve">for Research, Management, and Policy. </w:t>
       </w:r>
       <w:r>
         <w:rPr>
@@ -9514,14 +9542,7 @@
         <w:rPr>
           <w:rFonts w:ascii="Times New Roman" w:hAnsi="Times New Roman" w:cs="Times New Roman"/>
         </w:rPr>
-        <w:t xml:space="preserve">Mercier, L., Darnaude, A. M., Bruguier, O., Vasconcelos, R. P., Cabral, H. N., Costa, M. J., Lara, M., Jones, D. L., &amp; Mouillot, D. (2011). Selecting statistical models and variable combinations </w:t>
-      </w:r>
-      <w:r>
-        <w:rPr>
-          <w:rFonts w:ascii="Times New Roman" w:hAnsi="Times New Roman" w:cs="Times New Roman"/>
-        </w:rPr>
-        <w:lastRenderedPageBreak/>
-        <w:t xml:space="preserve">for optimal classification using otolith microchemistry. </w:t>
+        <w:t xml:space="preserve">Mercier, L., Darnaude, A. M., Bruguier, O., Vasconcelos, R. P., Cabral, H. N., Costa, M. J., Lara, M., Jones, D. L., &amp; Mouillot, D. (2011). Selecting statistical models and variable combinations for optimal classification using otolith microchemistry. </w:t>
       </w:r>
       <w:r>
         <w:rPr>
@@ -9759,6 +9780,7 @@
         <w:rPr>
           <w:rFonts w:ascii="Times New Roman" w:hAnsi="Times New Roman" w:cs="Times New Roman"/>
         </w:rPr>
+        <w:lastRenderedPageBreak/>
         <w:t xml:space="preserve">Van Rijsbergen, C. J. (1975). </w:t>
       </w:r>
       <w:r>
@@ -9893,7 +9915,7 @@
       </w:r>
     </w:p>
   </w:comment>
-  <w:comment w:id="1" w:author="Valentina M. Staneva" w:date="2025-11-11T14:43:00Z" w:initials="VMS">
+  <w:comment w:id="1" w:author="Valentina M. Staneva" w:date="2025-11-11T14:45:00Z" w:initials="VMS">
     <w:p>
       <w:r>
         <w:rPr>
@@ -9906,11 +9928,11 @@
           <w:sz w:val="20"/>
           <w:szCs w:val="20"/>
         </w:rPr>
-        <w:t>the observed probability, or empirical probability of correct prediction. I have some reservation about "true confidence" because confidence is internal belief (i.e. not true or wrong). You can add in the first sentence "confidence scores" if you want to introduce the notion of confidence but better in the context of the predicted probability.</w:t>
+        <w:t>I like that you define it.</w:t>
       </w:r>
     </w:p>
   </w:comment>
-  <w:comment w:id="2" w:author="Valentina M. Staneva" w:date="2025-11-11T14:44:00Z" w:initials="VMS">
+  <w:comment w:id="2" w:author="Valentina M. Staneva" w:date="2025-11-11T14:47:00Z" w:initials="VMS">
     <w:p>
       <w:r>
         <w:rPr>
@@ -9923,11 +9945,11 @@
           <w:sz w:val="20"/>
           <w:szCs w:val="20"/>
         </w:rPr>
-        <w:t>reliable confidence values (instead of true)</w:t>
+        <w:t>can add calibrated confidence thresholds so that it is clear that it is based on the calibrated confidence values.</w:t>
       </w:r>
     </w:p>
   </w:comment>
-  <w:comment w:id="3" w:author="Valentina M. Staneva" w:date="2025-11-11T14:45:00Z" w:initials="VMS">
+  <w:comment w:id="3" w:author="Valentina M. Staneva" w:date="2025-11-11T17:30:00Z" w:initials="VMS">
     <w:p>
       <w:r>
         <w:rPr>
@@ -9940,11 +9962,11 @@
           <w:sz w:val="20"/>
           <w:szCs w:val="20"/>
         </w:rPr>
-        <w:t>I like that you define it.</w:t>
+        <w:t>This statement might not be entirely clear. In fact, I am not very sure the reason for the performance: it is possible that random forest has overfitted on the noise since the sample size is not very large. It is possible that the intrinsic dimensionality is low and there exists a separating plane.The original dimension is as the number of features but it is true that if we remove the noise, due to autocorrelation the intrinsic dimenion will be low. Did the SVM have a regularizer?: it is possible that  that smoothed the series and avoided overfitting.</w:t>
       </w:r>
     </w:p>
   </w:comment>
-  <w:comment w:id="4" w:author="Valentina M. Staneva" w:date="2025-11-11T15:21:00Z" w:initials="VMS">
+  <w:comment w:id="4" w:author="Valentina M. Staneva" w:date="2025-11-11T14:48:00Z" w:initials="VMS">
     <w:p>
       <w:r>
         <w:rPr>
@@ -9957,62 +9979,11 @@
           <w:sz w:val="20"/>
           <w:szCs w:val="20"/>
         </w:rPr>
-        <w:t xml:space="preserve">reflect observed/empirical/true classification probability. </w:t>
+        <w:t>I think this is good and justifies that the plots did not need that much change. The important point is that we have checked it.</w:t>
       </w:r>
     </w:p>
   </w:comment>
-  <w:comment w:id="5" w:author="Valentina M. Staneva" w:date="2025-11-11T14:47:00Z" w:initials="VMS">
-    <w:p>
-      <w:r>
-        <w:rPr>
-          <w:rStyle w:val="CommentReference"/>
-        </w:rPr>
-        <w:annotationRef/>
-      </w:r>
-      <w:r>
-        <w:rPr>
-          <w:sz w:val="20"/>
-          <w:szCs w:val="20"/>
-        </w:rPr>
-        <w:t>can add calibrated confidence thresholds so that it is clear that it is based on the calibrated confidence values.</w:t>
-      </w:r>
-    </w:p>
-  </w:comment>
-  <w:comment w:id="6" w:author="Valentina M. Staneva" w:date="2025-11-11T17:30:00Z" w:initials="VMS">
-    <w:p>
-      <w:r>
-        <w:rPr>
-          <w:rStyle w:val="CommentReference"/>
-        </w:rPr>
-        <w:annotationRef/>
-      </w:r>
-      <w:r>
-        <w:rPr>
-          <w:sz w:val="20"/>
-          <w:szCs w:val="20"/>
-        </w:rPr>
-        <w:t>This statement might not be entirely clear. In fact, I am not very sure the reason for the performance: it is possible that random forest has overfitted on the noise since the sample size is not very large. It is possible that the intrinsic dimensionality is low and there exists a separating plane.The original dimension is as the number of features but it is true that if we remove the noise, due to autocorrelation the intrinsic dimenion will be low. Did the SVM have a regularizer?: it is possible that  that smoothed the series and avoided overfitting.</w:t>
-      </w:r>
-    </w:p>
-  </w:comment>
-  <w:comment w:id="7" w:author="Valentina M. Staneva" w:date="2025-11-11T14:48:00Z" w:initials="VMS">
-    <w:p>
-      <w:r>
-        <w:rPr>
-          <w:rStyle w:val="CommentReference"/>
-        </w:rPr>
-        <w:annotationRef/>
-      </w:r>
-      <w:r>
-        <w:rPr>
-          <w:sz w:val="20"/>
-          <w:szCs w:val="20"/>
-        </w:rPr>
-        <w:t>I think this is good and justifies that the plots did not need that much change. The important point is that we have checked it.</w:t>
-      </w:r>
-    </w:p>
-  </w:comment>
-  <w:comment w:id="8" w:author="Valentina M. Staneva" w:date="2025-11-11T17:36:00Z" w:initials="VMS">
+  <w:comment w:id="5" w:author="Valentina M. Staneva" w:date="2025-11-11T17:36:00Z" w:initials="VMS">
     <w:p>
       <w:r>
         <w:rPr>
@@ -10035,14 +10006,11 @@
 
 <file path=word/commentsExtended.xml><?xml version="1.0" encoding="utf-8"?>
 <w15:commentsEx xmlns:wpc="http://schemas.microsoft.com/office/word/2010/wordprocessingCanvas" xmlns:cx="http://schemas.microsoft.com/office/drawing/2014/chartex" xmlns:cx1="http://schemas.microsoft.com/office/drawing/2015/9/8/chartex" xmlns:cx2="http://schemas.microsoft.com/office/drawing/2015/10/21/chartex" xmlns:cx3="http://schemas.microsoft.com/office/drawing/2016/5/9/chartex" xmlns:cx4="http://schemas.microsoft.com/office/drawing/2016/5/10/chartex" xmlns:cx5="http://schemas.microsoft.com/office/drawing/2016/5/11/chartex" xmlns:cx6="http://schemas.microsoft.com/office/drawing/2016/5/12/chartex" xmlns:cx7="http://schemas.microsoft.com/office/drawing/2016/5/13/chartex" xmlns:cx8="http://schemas.microsoft.com/office/drawing/2016/5/14/chartex" xmlns:mc="http://schemas.openxmlformats.org/markup-compatibility/2006" xmlns:aink="http://schemas.microsoft.com/office/drawing/2016/ink" xmlns:am3d="http://schemas.microsoft.com/office/drawing/2017/model3d" xmlns:o="urn:schemas-microsoft-com:office:office" xmlns:oel="http://schemas.microsoft.com/office/2019/extlst" xmlns:r="http://schemas.openxmlformats.org/officeDocument/2006/relationships" xmlns:m="http://schemas.openxmlformats.org/officeDocument/2006/math" xmlns:v="urn:schemas-microsoft-com:vml" xmlns:wp14="http://schemas.microsoft.com/office/word/2010/wordprocessingDrawing" xmlns:wp="http://schemas.openxmlformats.org/drawingml/2006/wordprocessingDrawing" xmlns:w10="urn:schemas-microsoft-com:office:word" xmlns:w="http://schemas.openxmlformats.org/wordprocessingml/2006/main" xmlns:w14="http://schemas.microsoft.com/office/word/2010/wordml" xmlns:w15="http://schemas.microsoft.com/office/word/2012/wordml" xmlns:w16cex="http://schemas.microsoft.com/office/word/2018/wordml/cex" xmlns:w16cid="http://schemas.microsoft.com/office/word/2016/wordml/cid" xmlns:w16="http://schemas.microsoft.com/office/word/2018/wordml" xmlns:w16du="http://schemas.microsoft.com/office/word/2023/wordml/word16du" xmlns:w16sdtdh="http://schemas.microsoft.com/office/word/2020/wordml/sdtdatahash" xmlns:w16sdtfl="http://schemas.microsoft.com/office/word/2024/wordml/sdtformatlock" xmlns:w16se="http://schemas.microsoft.com/office/word/2015/wordml/symex" xmlns:wpg="http://schemas.microsoft.com/office/word/2010/wordprocessingGroup" xmlns:wpi="http://schemas.microsoft.com/office/word/2010/wordprocessingInk" xmlns:wne="http://schemas.microsoft.com/office/word/2006/wordml" xmlns:wps="http://schemas.microsoft.com/office/word/2010/wordprocessingShape" mc:Ignorable="w14 w15 w16se w16cid w16 w16cex w16sdtdh w16sdtfl w16du wp14">
-  <w15:commentEx w15:paraId="57D2B23C" w15:done="0"/>
-  <w15:commentEx w15:paraId="5F63F689" w15:done="0"/>
-  <w15:commentEx w15:paraId="45834483" w15:done="0"/>
-  <w15:commentEx w15:paraId="4347B15F" w15:done="0"/>
-  <w15:commentEx w15:paraId="57F929B1" w15:done="0"/>
-  <w15:commentEx w15:paraId="2FCF05AF" w15:done="0"/>
-  <w15:commentEx w15:paraId="752169F3" w15:done="0"/>
-  <w15:commentEx w15:paraId="4647A70C" w15:done="0"/>
+  <w15:commentEx w15:paraId="57D2B23C" w15:done="1"/>
+  <w15:commentEx w15:paraId="4347B15F" w15:done="1"/>
+  <w15:commentEx w15:paraId="2FCF05AF" w15:done="1"/>
+  <w15:commentEx w15:paraId="752169F3" w15:done="1"/>
+  <w15:commentEx w15:paraId="4647A70C" w15:done="1"/>
   <w15:commentEx w15:paraId="60777E8F" w15:done="0"/>
 </w15:commentsEx>
 </file>
@@ -10050,10 +10018,7 @@
 <file path=word/commentsExtensible.xml><?xml version="1.0" encoding="utf-8"?>
 <w16cex:commentsExtensible xmlns:wpc="http://schemas.microsoft.com/office/word/2010/wordprocessingCanvas" xmlns:cx="http://schemas.microsoft.com/office/drawing/2014/chartex" xmlns:cx1="http://schemas.microsoft.com/office/drawing/2015/9/8/chartex" xmlns:cx2="http://schemas.microsoft.com/office/drawing/2015/10/21/chartex" xmlns:cx3="http://schemas.microsoft.com/office/drawing/2016/5/9/chartex" xmlns:cx4="http://schemas.microsoft.com/office/drawing/2016/5/10/chartex" xmlns:cx5="http://schemas.microsoft.com/office/drawing/2016/5/11/chartex" xmlns:cx6="http://schemas.microsoft.com/office/drawing/2016/5/12/chartex" xmlns:cx7="http://schemas.microsoft.com/office/drawing/2016/5/13/chartex" xmlns:cx8="http://schemas.microsoft.com/office/drawing/2016/5/14/chartex" xmlns:cr="http://schemas.microsoft.com/office/comments/2020/reactions" xmlns:mc="http://schemas.openxmlformats.org/markup-compatibility/2006" xmlns:aink="http://schemas.microsoft.com/office/drawing/2016/ink" xmlns:am3d="http://schemas.microsoft.com/office/drawing/2017/model3d" xmlns:o="urn:schemas-microsoft-com:office:office" xmlns:oel="http://schemas.microsoft.com/office/2019/extlst" xmlns:r="http://schemas.openxmlformats.org/officeDocument/2006/relationships" xmlns:m="http://schemas.openxmlformats.org/officeDocument/2006/math" xmlns:v="urn:schemas-microsoft-com:vml" xmlns:wp14="http://schemas.microsoft.com/office/word/2010/wordprocessingDrawing" xmlns:wp="http://schemas.openxmlformats.org/drawingml/2006/wordprocessingDrawing" xmlns:w10="urn:schemas-microsoft-com:office:word" xmlns:w="http://schemas.openxmlformats.org/wordprocessingml/2006/main" xmlns:w14="http://schemas.microsoft.com/office/word/2010/wordml" xmlns:w15="http://schemas.microsoft.com/office/word/2012/wordml" xmlns:w16cex="http://schemas.microsoft.com/office/word/2018/wordml/cex" xmlns:w16cid="http://schemas.microsoft.com/office/word/2016/wordml/cid" xmlns:w16="http://schemas.microsoft.com/office/word/2018/wordml" xmlns:w16du="http://schemas.microsoft.com/office/word/2023/wordml/word16du" xmlns:w16sdtdh="http://schemas.microsoft.com/office/word/2020/wordml/sdtdatahash" xmlns:w16sdtfl="http://schemas.microsoft.com/office/word/2024/wordml/sdtformatlock" xmlns:w16se="http://schemas.microsoft.com/office/word/2015/wordml/symex" xmlns:wpg="http://schemas.microsoft.com/office/word/2010/wordprocessingGroup" xmlns:wpi="http://schemas.microsoft.com/office/word/2010/wordprocessingInk" xmlns:wne="http://schemas.microsoft.com/office/word/2006/wordml" xmlns:wps="http://schemas.microsoft.com/office/word/2010/wordprocessingShape" mc:Ignorable="w14 w15 w16se w16cid w16 w16cex w16sdtdh w16sdtfl cr w16du wp14">
   <w16cex:commentExtensible w16cex:durableId="1027EFAC" w16cex:dateUtc="2025-11-11T22:44:00Z"/>
-  <w16cex:commentExtensible w16cex:durableId="50C86736" w16cex:dateUtc="2025-11-11T22:43:00Z"/>
-  <w16cex:commentExtensible w16cex:durableId="012C4E6E" w16cex:dateUtc="2025-11-11T22:44:00Z"/>
   <w16cex:commentExtensible w16cex:durableId="0F4C449E" w16cex:dateUtc="2025-11-11T22:45:00Z"/>
-  <w16cex:commentExtensible w16cex:durableId="0A55F087" w16cex:dateUtc="2025-11-11T23:21:00Z"/>
   <w16cex:commentExtensible w16cex:durableId="782CA893" w16cex:dateUtc="2025-11-11T22:47:00Z"/>
   <w16cex:commentExtensible w16cex:durableId="167E8668" w16cex:dateUtc="2025-11-12T01:30:00Z"/>
   <w16cex:commentExtensible w16cex:durableId="1014085E" w16cex:dateUtc="2025-11-11T22:48:00Z"/>
@@ -10064,10 +10029,7 @@
 <file path=word/commentsIds.xml><?xml version="1.0" encoding="utf-8"?>
 <w16cid:commentsIds xmlns:wpc="http://schemas.microsoft.com/office/word/2010/wordprocessingCanvas" xmlns:cx="http://schemas.microsoft.com/office/drawing/2014/chartex" xmlns:cx1="http://schemas.microsoft.com/office/drawing/2015/9/8/chartex" xmlns:cx2="http://schemas.microsoft.com/office/drawing/2015/10/21/chartex" xmlns:cx3="http://schemas.microsoft.com/office/drawing/2016/5/9/chartex" xmlns:cx4="http://schemas.microsoft.com/office/drawing/2016/5/10/chartex" xmlns:cx5="http://schemas.microsoft.com/office/drawing/2016/5/11/chartex" xmlns:cx6="http://schemas.microsoft.com/office/drawing/2016/5/12/chartex" xmlns:cx7="http://schemas.microsoft.com/office/drawing/2016/5/13/chartex" xmlns:cx8="http://schemas.microsoft.com/office/drawing/2016/5/14/chartex" xmlns:mc="http://schemas.openxmlformats.org/markup-compatibility/2006" xmlns:aink="http://schemas.microsoft.com/office/drawing/2016/ink" xmlns:am3d="http://schemas.microsoft.com/office/drawing/2017/model3d" xmlns:o="urn:schemas-microsoft-com:office:office" xmlns:oel="http://schemas.microsoft.com/office/2019/extlst" xmlns:r="http://schemas.openxmlformats.org/officeDocument/2006/relationships" xmlns:m="http://schemas.openxmlformats.org/officeDocument/2006/math" xmlns:v="urn:schemas-microsoft-com:vml" xmlns:wp14="http://schemas.microsoft.com/office/word/2010/wordprocessingDrawing" xmlns:wp="http://schemas.openxmlformats.org/drawingml/2006/wordprocessingDrawing" xmlns:w10="urn:schemas-microsoft-com:office:word" xmlns:w="http://schemas.openxmlformats.org/wordprocessingml/2006/main" xmlns:w14="http://schemas.microsoft.com/office/word/2010/wordml" xmlns:w15="http://schemas.microsoft.com/office/word/2012/wordml" xmlns:w16cex="http://schemas.microsoft.com/office/word/2018/wordml/cex" xmlns:w16cid="http://schemas.microsoft.com/office/word/2016/wordml/cid" xmlns:w16="http://schemas.microsoft.com/office/word/2018/wordml" xmlns:w16du="http://schemas.microsoft.com/office/word/2023/wordml/word16du" xmlns:w16sdtdh="http://schemas.microsoft.com/office/word/2020/wordml/sdtdatahash" xmlns:w16sdtfl="http://schemas.microsoft.com/office/word/2024/wordml/sdtformatlock" xmlns:w16se="http://schemas.microsoft.com/office/word/2015/wordml/symex" xmlns:wpg="http://schemas.microsoft.com/office/word/2010/wordprocessingGroup" xmlns:wpi="http://schemas.microsoft.com/office/word/2010/wordprocessingInk" xmlns:wne="http://schemas.microsoft.com/office/word/2006/wordml" xmlns:wps="http://schemas.microsoft.com/office/word/2010/wordprocessingShape" mc:Ignorable="w14 w15 w16se w16cid w16 w16cex w16sdtdh w16sdtfl w16du wp14">
   <w16cid:commentId w16cid:paraId="57D2B23C" w16cid:durableId="1027EFAC"/>
-  <w16cid:commentId w16cid:paraId="5F63F689" w16cid:durableId="50C86736"/>
-  <w16cid:commentId w16cid:paraId="45834483" w16cid:durableId="012C4E6E"/>
   <w16cid:commentId w16cid:paraId="4347B15F" w16cid:durableId="0F4C449E"/>
-  <w16cid:commentId w16cid:paraId="57F929B1" w16cid:durableId="0A55F087"/>
   <w16cid:commentId w16cid:paraId="2FCF05AF" w16cid:durableId="782CA893"/>
   <w16cid:commentId w16cid:paraId="752169F3" w16cid:durableId="167E8668"/>
   <w16cid:commentId w16cid:paraId="4647A70C" w16cid:durableId="1014085E"/>

</xml_diff>

<commit_message>
updated data statement with the new doi and link
</commit_message>
<xml_diff>
--- a/Docs/Machine learning applied to otolith timeseries data to discriminate river of origin for Western Alaska Salmon.docx
+++ b/Docs/Machine learning applied to otolith timeseries data to discriminate river of origin for Western Alaska Salmon.docx
@@ -401,62 +401,72 @@
         <w:spacing w:line="480" w:lineRule="auto"/>
         <w:jc w:val="center"/>
         <w:rPr>
-          <w:rFonts w:ascii="Garamond" w:hAnsi="Garamond" w:cs="Times New Roman"/>
-          <w:sz w:val="22"/>
-          <w:szCs w:val="22"/>
-        </w:rPr>
-      </w:pPr>
-      <w:r>
-        <w:rPr>
-          <w:rFonts w:ascii="Garamond" w:hAnsi="Garamond" w:cs="Times New Roman"/>
-          <w:sz w:val="22"/>
-          <w:szCs w:val="22"/>
-        </w:rPr>
-        <w:t xml:space="preserve">Data and code </w:t>
-      </w:r>
-      <w:proofErr w:type="gramStart"/>
-      <w:r>
-        <w:rPr>
-          <w:rFonts w:ascii="Garamond" w:hAnsi="Garamond" w:cs="Times New Roman"/>
-          <w:sz w:val="22"/>
-          <w:szCs w:val="22"/>
-        </w:rPr>
-        <w:t>is</w:t>
-      </w:r>
-      <w:proofErr w:type="gramEnd"/>
-      <w:r>
-        <w:rPr>
-          <w:rFonts w:ascii="Garamond" w:hAnsi="Garamond" w:cs="Times New Roman"/>
-          <w:sz w:val="22"/>
-          <w:szCs w:val="22"/>
-        </w:rPr>
-        <w:t xml:space="preserve"> available </w:t>
-      </w:r>
-      <w:r>
-        <w:rPr>
-          <w:rFonts w:ascii="Garamond" w:hAnsi="Garamond" w:cs="Times New Roman"/>
-          <w:sz w:val="22"/>
-          <w:szCs w:val="22"/>
-        </w:rPr>
-        <w:t xml:space="preserve">in Zenodo: </w:t>
-      </w:r>
-      <w:r>
-        <w:rPr>
-          <w:rFonts w:ascii="Garamond" w:hAnsi="Garamond"/>
-          <w:sz w:val="22"/>
-          <w:szCs w:val="22"/>
-          <w:shd w:val="clear" w:color="auto" w:fill="FFFFFF"/>
-        </w:rPr>
-        <w:t>10.5281/zenodo.17546297</w:t>
+          <w:rFonts w:ascii="Times New Roman" w:hAnsi="Times New Roman" w:cs="Times New Roman"/>
+        </w:rPr>
+      </w:pPr>
+      <w:r>
+        <w:rPr>
+          <w:rFonts w:ascii="Times New Roman" w:hAnsi="Times New Roman" w:cs="Times New Roman"/>
+        </w:rPr>
+        <w:t xml:space="preserve">Data and code are available as private for peer review in a dryad repository : </w:t>
+      </w:r>
+      <w:hyperlink r:id="rId6" w:history="1">
+        <w:r>
+          <w:rPr>
+            <w:rStyle w:val="Hyperlink"/>
+            <w:rFonts w:ascii="Times New Roman" w:hAnsi="Times New Roman" w:cs="Times New Roman"/>
+          </w:rPr>
+          <w:t>https://datadryad.org/dataset/doi:10.5061/dryad.hdr7sqvxs</w:t>
+        </w:r>
+      </w:hyperlink>
+      <w:r>
+        <w:rPr>
+          <w:rFonts w:ascii="Times New Roman" w:hAnsi="Times New Roman" w:cs="Times New Roman"/>
+        </w:rPr>
+        <w:t xml:space="preserve">. Code and data are also available in a </w:t>
+      </w:r>
+      <w:proofErr w:type="spellStart"/>
+      <w:r>
+        <w:rPr>
+          <w:rFonts w:ascii="Times New Roman" w:hAnsi="Times New Roman" w:cs="Times New Roman"/>
+        </w:rPr>
+        <w:t>github</w:t>
+      </w:r>
+      <w:proofErr w:type="spellEnd"/>
+      <w:r>
+        <w:rPr>
+          <w:rFonts w:ascii="Times New Roman" w:hAnsi="Times New Roman" w:cs="Times New Roman"/>
+        </w:rPr>
+        <w:t xml:space="preserve"> repository with a </w:t>
+      </w:r>
+      <w:proofErr w:type="spellStart"/>
+      <w:r>
+        <w:rPr>
+          <w:rFonts w:ascii="Times New Roman" w:hAnsi="Times New Roman" w:cs="Times New Roman"/>
+        </w:rPr>
+        <w:t>zenodo</w:t>
+      </w:r>
+      <w:proofErr w:type="spellEnd"/>
+      <w:r>
+        <w:rPr>
+          <w:rFonts w:ascii="Times New Roman" w:hAnsi="Times New Roman" w:cs="Times New Roman"/>
+        </w:rPr>
+        <w:t xml:space="preserve"> DOI: </w:t>
+      </w:r>
+      <w:r>
+        <w:rPr>
+          <w:rFonts w:ascii="Times New Roman" w:hAnsi="Times New Roman" w:cs="Times New Roman"/>
+        </w:rPr>
+        <w:t>https://doi.org/10.5281/zenodo.17624850</w:t>
       </w:r>
     </w:p>
     <w:p>
       <w:pPr>
         <w:spacing w:line="480" w:lineRule="auto"/>
-        <w:rPr>
-          <w:rFonts w:ascii="Times New Roman" w:hAnsi="Times New Roman" w:cs="Times New Roman"/>
-          <w:sz w:val="22"/>
-          <w:szCs w:val="22"/>
+        <w:ind w:left="2880" w:firstLine="720"/>
+        <w:jc w:val="center"/>
+        <w:rPr>
+          <w:rFonts w:ascii="Times New Roman" w:hAnsi="Times New Roman" w:cs="Times New Roman"/>
         </w:rPr>
       </w:pPr>
     </w:p>
@@ -620,7 +630,6 @@
           <w:b/>
           <w:bCs/>
         </w:rPr>
-        <w:lastRenderedPageBreak/>
         <w:t xml:space="preserve">Abstract: </w:t>
       </w:r>
     </w:p>
@@ -757,17 +766,17 @@
         <w:t>decision analyses</w:t>
       </w:r>
       <w:r>
-        <w:t xml:space="preserve"> with explicit consideration of misclassification risk tolerance. The success of these models offers immediate utility for estimating marine mortality impacts across the region's three major river systems</w:t>
+        <w:t xml:space="preserve"> with explicit consideration of </w:t>
+      </w:r>
+      <w:r>
+        <w:lastRenderedPageBreak/>
+        <w:t>misclassification risk tolerance. The success of these models offers immediate utility for estimating marine mortality impacts across the region's three major river systems</w:t>
       </w:r>
       <w:r>
         <w:t xml:space="preserve"> as well as </w:t>
       </w:r>
       <w:r>
-        <w:t xml:space="preserve">an </w:t>
-      </w:r>
-      <w:r>
-        <w:lastRenderedPageBreak/>
-        <w:t xml:space="preserve">opportunity to understand </w:t>
+        <w:t xml:space="preserve">an opportunity to understand </w:t>
       </w:r>
       <w:r>
         <w:t>commercial fisheries impacts on individual populations</w:t>
@@ -1351,7 +1360,14 @@
         <w:rPr>
           <w:rFonts w:ascii="Times New Roman" w:hAnsi="Times New Roman" w:cs="Times New Roman"/>
         </w:rPr>
-        <w:t xml:space="preserve"> led to fishery restrictions and a crisis of food insecurity and cultural loss</w:t>
+        <w:t xml:space="preserve"> led to fishery </w:t>
+      </w:r>
+      <w:r>
+        <w:rPr>
+          <w:rFonts w:ascii="Times New Roman" w:hAnsi="Times New Roman" w:cs="Times New Roman"/>
+        </w:rPr>
+        <w:lastRenderedPageBreak/>
+        <w:t>restrictions and a crisis of food insecurity and cultural loss</w:t>
       </w:r>
       <w:r>
         <w:rPr>
@@ -1418,14 +1434,7 @@
         <w:rPr>
           <w:rFonts w:ascii="Times New Roman" w:hAnsi="Times New Roman" w:cs="Times New Roman"/>
         </w:rPr>
-        <w:t xml:space="preserve"> for declining population health </w:t>
-      </w:r>
-      <w:r>
-        <w:rPr>
-          <w:rFonts w:ascii="Times New Roman" w:hAnsi="Times New Roman" w:cs="Times New Roman"/>
-        </w:rPr>
-        <w:lastRenderedPageBreak/>
-        <w:t xml:space="preserve">including mortality due to changing environmental conditions or </w:t>
+        <w:t xml:space="preserve"> for declining population health including mortality due to changing environmental conditions or </w:t>
       </w:r>
       <w:r>
         <w:rPr>
@@ -2159,6 +2168,7 @@
         <w:rPr>
           <w:rFonts w:ascii="Times New Roman" w:hAnsi="Times New Roman" w:cs="Times New Roman"/>
         </w:rPr>
+        <w:lastRenderedPageBreak/>
         <w:t>they</w:t>
       </w:r>
       <w:r>
@@ -2250,7 +2260,6 @@
         <w:rPr>
           <w:rFonts w:ascii="Times New Roman" w:hAnsi="Times New Roman" w:cs="Times New Roman"/>
         </w:rPr>
-        <w:lastRenderedPageBreak/>
         <w:t>However</w:t>
       </w:r>
       <w:r>
@@ -2737,7 +2746,14 @@
         <w:rPr>
           <w:rFonts w:ascii="Times New Roman" w:hAnsi="Times New Roman" w:cs="Times New Roman"/>
         </w:rPr>
-        <w:t xml:space="preserve">methods, which are particularly well-suited to interpreting complex, multidimensional patterns in </w:t>
+        <w:t xml:space="preserve">methods, which </w:t>
+      </w:r>
+      <w:r>
+        <w:rPr>
+          <w:rFonts w:ascii="Times New Roman" w:hAnsi="Times New Roman" w:cs="Times New Roman"/>
+        </w:rPr>
+        <w:lastRenderedPageBreak/>
+        <w:t xml:space="preserve">are particularly well-suited to interpreting complex, multidimensional patterns in </w:t>
       </w:r>
       <w:r>
         <w:rPr>
@@ -2749,14 +2765,7 @@
         <w:rPr>
           <w:rFonts w:ascii="Times New Roman" w:hAnsi="Times New Roman" w:cs="Times New Roman"/>
         </w:rPr>
-        <w:t xml:space="preserve">, have only recently been applied to otolith chemical analysis. However, their limited applications have </w:t>
-      </w:r>
-      <w:r>
-        <w:rPr>
-          <w:rFonts w:ascii="Times New Roman" w:hAnsi="Times New Roman" w:cs="Times New Roman"/>
-        </w:rPr>
-        <w:lastRenderedPageBreak/>
-        <w:t xml:space="preserve">shown promising performance relative to traditional techniques </w:t>
+        <w:t xml:space="preserve">, have only recently been applied to otolith chemical analysis. However, their limited applications have shown promising performance relative to traditional techniques </w:t>
       </w:r>
       <w:r>
         <w:rPr>
@@ -3194,7 +3203,14 @@
         <w:rPr>
           <w:rFonts w:ascii="Times New Roman" w:hAnsi="Times New Roman" w:cs="Times New Roman"/>
         </w:rPr>
-        <w:t xml:space="preserve"> test fisheries near the downstream terminus of each river</w:t>
+        <w:t xml:space="preserve"> test fisheries near the </w:t>
+      </w:r>
+      <w:r>
+        <w:rPr>
+          <w:rFonts w:ascii="Times New Roman" w:hAnsi="Times New Roman" w:cs="Times New Roman"/>
+        </w:rPr>
+        <w:lastRenderedPageBreak/>
+        <w:t>downstream terminus of each river</w:t>
       </w:r>
       <w:r>
         <w:rPr>
@@ -3212,14 +3228,7 @@
         <w:rPr>
           <w:rFonts w:ascii="Times New Roman" w:hAnsi="Times New Roman" w:cs="Times New Roman"/>
         </w:rPr>
-        <w:t xml:space="preserve">with the Alaska Department of Fish and Game Lower Yukon Test Fishery (LYTF), Orutsararmiut </w:t>
-      </w:r>
-      <w:r>
-        <w:rPr>
-          <w:rFonts w:ascii="Times New Roman" w:hAnsi="Times New Roman" w:cs="Times New Roman"/>
-        </w:rPr>
-        <w:lastRenderedPageBreak/>
-        <w:t xml:space="preserve">Native Council at the Bethel Test Fishery, and </w:t>
+        <w:t xml:space="preserve">with the Alaska Department of Fish and Game Lower Yukon Test Fishery (LYTF), Orutsararmiut Native Council at the Bethel Test Fishery, and </w:t>
       </w:r>
       <w:r>
         <w:rPr>
@@ -3699,7 +3708,6 @@
           <w:bCs/>
           <w:u w:val="single"/>
         </w:rPr>
-        <w:lastRenderedPageBreak/>
         <w:t>Data pre</w:t>
       </w:r>
       <w:r>
@@ -4274,14 +4282,14 @@
         <w:rPr>
           <w:rFonts w:ascii="Times New Roman" w:hAnsi="Times New Roman" w:cs="Times New Roman"/>
         </w:rPr>
-        <w:t xml:space="preserve">The GAM was fitted using thin plate regression and penalized iteratively re-weighted least squares (P-IRLS) to maximize goodness of </w:t>
+        <w:t xml:space="preserve">The GAM was fitted using thin plate </w:t>
       </w:r>
       <w:r>
         <w:rPr>
           <w:rFonts w:ascii="Times New Roman" w:hAnsi="Times New Roman" w:cs="Times New Roman"/>
         </w:rPr>
         <w:lastRenderedPageBreak/>
-        <w:t xml:space="preserve">fit, with a generalized cross-validation (GCV) method </w:t>
+        <w:t xml:space="preserve">regression and penalized iteratively re-weighted least squares (P-IRLS) to maximize goodness of fit, with a generalized cross-validation (GCV) method </w:t>
       </w:r>
       <w:r>
         <w:rPr>
@@ -4927,7 +4935,6 @@
           <w:bCs/>
           <w:u w:val="single"/>
         </w:rPr>
-        <w:lastRenderedPageBreak/>
         <w:t xml:space="preserve">Machine Learning Classification Models </w:t>
       </w:r>
     </w:p>
@@ -5299,6 +5306,7 @@
           <w:b/>
           <w:bCs/>
         </w:rPr>
+        <w:lastRenderedPageBreak/>
         <w:t>Accuracy</w:t>
       </w:r>
       <w:r>
@@ -5311,7 +5319,6 @@
         <w:spacing w:line="480" w:lineRule="auto"/>
       </w:pPr>
       <w:r>
-        <w:lastRenderedPageBreak/>
         <w:t xml:space="preserve">The </w:t>
       </w:r>
       <w:r>
@@ -5592,7 +5599,11 @@
         <w:t xml:space="preserve">reliable </w:t>
       </w:r>
       <w:r>
-        <w:t>confidence values, we should expect that the observed proportion of individuals belonging to a given class aligns with the model’s assigned probability for that class. For example, if our model predicts individuals to have originated from the Kuskokwim watershed with 80% probability, then approximately 80% of those individuals should in fact be Kuskokwim fish.</w:t>
+        <w:t xml:space="preserve">confidence values, we should expect that the observed proportion of individuals belonging to a given class aligns with the model’s assigned probability for that class. For example, if our model predicts individuals to have originated from the Kuskokwim watershed with 80% probability, then approximately 80% of those individuals </w:t>
+      </w:r>
+      <w:r>
+        <w:lastRenderedPageBreak/>
+        <w:t>should in fact be Kuskokwim fish.</w:t>
       </w:r>
       <w:r>
         <w:t xml:space="preserve"> </w:t>
@@ -5601,11 +5612,7 @@
         <w:t xml:space="preserve">However, this assumption is oftentimes not met, limiting </w:t>
       </w:r>
       <w:r>
-        <w:t xml:space="preserve">the </w:t>
-      </w:r>
-      <w:r>
-        <w:lastRenderedPageBreak/>
-        <w:t xml:space="preserve">utility of these </w:t>
+        <w:t xml:space="preserve">the utility of these </w:t>
       </w:r>
       <w:r>
         <w:t xml:space="preserve">values </w:t>
@@ -5813,13 +5820,8 @@
       <w:r>
         <w:t xml:space="preserve"> correct </w:t>
       </w:r>
-      <w:proofErr w:type="spellStart"/>
-      <w:r>
-        <w:t xml:space="preserve">class </w:t>
-      </w:r>
-      <w:proofErr w:type="spellEnd"/>
-      <w:r>
-        <w:t>with a calibrated probability value at or above the given threshold</w:t>
+      <w:r>
+        <w:t>class with a calibrated probability value at or above the given threshold</w:t>
       </w:r>
       <w:r>
         <w:t xml:space="preserve">. This value was then compared to the total number of individual </w:t>
@@ -5905,17 +5907,17 @@
         <w:t>by watershed</w:t>
       </w:r>
       <w:r>
-        <w:t xml:space="preserve">. The first two principal components together captured 97.3% of the total variance in the dataset (PC1: 92.2%, PC2: 5.1%, Figure </w:t>
+        <w:t xml:space="preserve">. The first two principal components together captured 97.3% </w:t>
+      </w:r>
+      <w:r>
+        <w:lastRenderedPageBreak/>
+        <w:t xml:space="preserve">of the total variance in the dataset (PC1: 92.2%, PC2: 5.1%, Figure </w:t>
       </w:r>
       <w:r>
         <w:t>2</w:t>
       </w:r>
       <w:r>
-        <w:t xml:space="preserve">). Despite clear clustering </w:t>
-      </w:r>
-      <w:r>
-        <w:lastRenderedPageBreak/>
-        <w:t xml:space="preserve">patterns, some overlap remained among all three watersheds. Kuskokwim samples (Figure </w:t>
+        <w:t xml:space="preserve">). Despite clear clustering patterns, some overlap remained among all three watersheds. Kuskokwim samples (Figure </w:t>
       </w:r>
       <w:r>
         <w:t>2</w:t>
@@ -6269,7 +6271,14 @@
         <w:rPr>
           <w:rFonts w:ascii="Times New Roman" w:hAnsi="Times New Roman" w:cs="Times New Roman"/>
         </w:rPr>
-        <w:t xml:space="preserve"> to be driven by values at the very beginning of the </w:t>
+        <w:t xml:space="preserve"> to be driven by values at the very beginning </w:t>
+      </w:r>
+      <w:r>
+        <w:rPr>
+          <w:rFonts w:ascii="Times New Roman" w:hAnsi="Times New Roman" w:cs="Times New Roman"/>
+        </w:rPr>
+        <w:lastRenderedPageBreak/>
+        <w:t xml:space="preserve">of the </w:t>
       </w:r>
       <w:r>
         <w:rPr>
@@ -6281,14 +6290,7 @@
         <w:rPr>
           <w:rFonts w:ascii="Times New Roman" w:hAnsi="Times New Roman" w:cs="Times New Roman"/>
         </w:rPr>
-        <w:t xml:space="preserve"> corresponding to the start of the natal origin signature as well as some variation </w:t>
-      </w:r>
-      <w:r>
-        <w:rPr>
-          <w:rFonts w:ascii="Times New Roman" w:hAnsi="Times New Roman" w:cs="Times New Roman"/>
-        </w:rPr>
-        <w:lastRenderedPageBreak/>
-        <w:t>in values just before the mainstem</w:t>
+        <w:t xml:space="preserve"> corresponding to the start of the natal origin signature as well as some variation in values just before the mainstem</w:t>
       </w:r>
       <w:r>
         <w:rPr>
@@ -6708,14 +6710,14 @@
         <w:rPr>
           <w:rFonts w:ascii="Times New Roman" w:hAnsi="Times New Roman" w:cs="Times New Roman"/>
         </w:rPr>
-        <w:t xml:space="preserve">Kuskokwim (8.6% of Kuskokwim fish) followed by the inverse (5.6% of Nushagak fish). Interestingly, after </w:t>
+        <w:t xml:space="preserve">Kuskokwim </w:t>
       </w:r>
       <w:r>
         <w:rPr>
           <w:rFonts w:ascii="Times New Roman" w:hAnsi="Times New Roman" w:cs="Times New Roman"/>
         </w:rPr>
         <w:lastRenderedPageBreak/>
-        <w:t xml:space="preserve">removing the </w:t>
+        <w:t xml:space="preserve">(8.6% of Kuskokwim fish) followed by the inverse (5.6% of Nushagak fish). Interestingly, after removing the </w:t>
       </w:r>
       <w:r>
         <w:rPr>
@@ -6985,7 +6987,14 @@
         <w:rPr>
           <w:rFonts w:ascii="Times New Roman" w:hAnsi="Times New Roman" w:cs="Times New Roman"/>
         </w:rPr>
-        <w:t xml:space="preserve">accuracy ranged from 91 – 79% for the total testing set and from 89.5% to 78% for the </w:t>
+        <w:t xml:space="preserve">accuracy ranged from 91 – 79% for the total </w:t>
+      </w:r>
+      <w:r>
+        <w:rPr>
+          <w:rFonts w:ascii="Times New Roman" w:hAnsi="Times New Roman" w:cs="Times New Roman"/>
+        </w:rPr>
+        <w:lastRenderedPageBreak/>
+        <w:t xml:space="preserve">testing set and from 89.5% to 78% for the </w:t>
       </w:r>
       <w:r>
         <w:rPr>
@@ -7033,14 +7042,7 @@
         <w:rPr>
           <w:rFonts w:ascii="Times New Roman" w:hAnsi="Times New Roman" w:cs="Times New Roman"/>
         </w:rPr>
-        <w:t xml:space="preserve">This </w:t>
-      </w:r>
-      <w:r>
-        <w:rPr>
-          <w:rFonts w:ascii="Times New Roman" w:hAnsi="Times New Roman" w:cs="Times New Roman"/>
-        </w:rPr>
-        <w:lastRenderedPageBreak/>
-        <w:t xml:space="preserve">reflect the declining number of individuals which can be assigned be correct defined by the model with an added requirement of a high probability value. </w:t>
+        <w:t xml:space="preserve">This reflect the declining number of individuals which can be assigned be correct defined by the model with an added requirement of a high probability value. </w:t>
       </w:r>
       <w:r>
         <w:rPr>
@@ -7303,7 +7305,14 @@
         <w:rPr>
           <w:rFonts w:ascii="Times New Roman" w:hAnsi="Times New Roman" w:cs="Times New Roman"/>
         </w:rPr>
-        <w:t xml:space="preserve"> techniques to otolith LA datasets and suggests that even greater discriminatory power may be possible </w:t>
+        <w:t xml:space="preserve"> techniques to </w:t>
+      </w:r>
+      <w:r>
+        <w:rPr>
+          <w:rFonts w:ascii="Times New Roman" w:hAnsi="Times New Roman" w:cs="Times New Roman"/>
+        </w:rPr>
+        <w:lastRenderedPageBreak/>
+        <w:t xml:space="preserve">otolith LA datasets and suggests that even greater discriminatory power may be possible </w:t>
       </w:r>
       <w:r>
         <w:rPr>
@@ -7315,14 +7324,7 @@
         <w:rPr>
           <w:rFonts w:ascii="Times New Roman" w:hAnsi="Times New Roman" w:cs="Times New Roman"/>
         </w:rPr>
-        <w:t xml:space="preserve"> </w:t>
-      </w:r>
-      <w:r>
-        <w:rPr>
-          <w:rFonts w:ascii="Times New Roman" w:hAnsi="Times New Roman" w:cs="Times New Roman"/>
-        </w:rPr>
-        <w:lastRenderedPageBreak/>
-        <w:t>additional</w:t>
+        <w:t xml:space="preserve"> additional</w:t>
       </w:r>
       <w:r>
         <w:rPr>
@@ -7621,7 +7623,14 @@
         <w:rPr>
           <w:rFonts w:ascii="Times New Roman" w:hAnsi="Times New Roman" w:cs="Times New Roman"/>
         </w:rPr>
-        <w:t>decline likely reflects the removal of the most easily classified cases</w:t>
+        <w:t xml:space="preserve">decline likely </w:t>
+      </w:r>
+      <w:r>
+        <w:rPr>
+          <w:rFonts w:ascii="Times New Roman" w:hAnsi="Times New Roman" w:cs="Times New Roman"/>
+        </w:rPr>
+        <w:lastRenderedPageBreak/>
+        <w:t>reflects the removal of the most easily classified cases</w:t>
       </w:r>
       <w:r>
         <w:rPr>
@@ -7639,14 +7648,7 @@
         <w:rPr>
           <w:rFonts w:ascii="Times New Roman" w:hAnsi="Times New Roman" w:cs="Times New Roman"/>
         </w:rPr>
-        <w:t xml:space="preserve">higher </w:t>
-      </w:r>
-      <w:r>
-        <w:rPr>
-          <w:rFonts w:ascii="Times New Roman" w:hAnsi="Times New Roman" w:cs="Times New Roman"/>
-        </w:rPr>
-        <w:lastRenderedPageBreak/>
-        <w:t>misclassification rates among CWAK individuals compared to those from the middle and upper Yukon regions</w:t>
+        <w:t>higher misclassification rates among CWAK individuals compared to those from the middle and upper Yukon regions</w:t>
       </w:r>
       <w:r>
         <w:rPr>
@@ -10158,7 +10160,7 @@
                     <pic:cNvPicPr/>
                   </pic:nvPicPr>
                   <pic:blipFill>
-                    <a:blip r:embed="rId6" cstate="print">
+                    <a:blip r:embed="rId7" cstate="print">
                       <a:extLst>
                         <a:ext uri="{28A0092B-C50C-407E-A947-70E740481C1C}">
                           <a14:useLocalDpi xmlns:a14="http://schemas.microsoft.com/office/drawing/2010/main" val="0"/>
@@ -10317,7 +10319,7 @@
                     <pic:cNvPicPr/>
                   </pic:nvPicPr>
                   <pic:blipFill>
-                    <a:blip r:embed="rId7" cstate="print">
+                    <a:blip r:embed="rId8" cstate="print">
                       <a:extLst>
                         <a:ext uri="{28A0092B-C50C-407E-A947-70E740481C1C}">
                           <a14:useLocalDpi xmlns:a14="http://schemas.microsoft.com/office/drawing/2010/main" val="0"/>
@@ -10418,7 +10420,7 @@
                     <pic:cNvPicPr/>
                   </pic:nvPicPr>
                   <pic:blipFill>
-                    <a:blip r:embed="rId8" cstate="print">
+                    <a:blip r:embed="rId9" cstate="print">
                       <a:extLst>
                         <a:ext uri="{28A0092B-C50C-407E-A947-70E740481C1C}">
                           <a14:useLocalDpi xmlns:a14="http://schemas.microsoft.com/office/drawing/2010/main" val="0"/>
@@ -10568,7 +10570,7 @@
                     <pic:cNvPicPr/>
                   </pic:nvPicPr>
                   <pic:blipFill>
-                    <a:blip r:embed="rId9"/>
+                    <a:blip r:embed="rId10"/>
                     <a:stretch>
                       <a:fillRect/>
                     </a:stretch>
@@ -10762,7 +10764,7 @@
                     <pic:cNvPicPr/>
                   </pic:nvPicPr>
                   <pic:blipFill>
-                    <a:blip r:embed="rId10"/>
+                    <a:blip r:embed="rId11"/>
                     <a:stretch>
                       <a:fillRect/>
                     </a:stretch>
@@ -10937,7 +10939,7 @@
                     <pic:cNvPicPr/>
                   </pic:nvPicPr>
                   <pic:blipFill>
-                    <a:blip r:embed="rId11" cstate="print">
+                    <a:blip r:embed="rId12" cstate="print">
                       <a:extLst>
                         <a:ext uri="{28A0092B-C50C-407E-A947-70E740481C1C}">
                           <a14:useLocalDpi xmlns:a14="http://schemas.microsoft.com/office/drawing/2010/main" val="0"/>

</xml_diff>

<commit_message>
added a version meant for the preprint server
</commit_message>
<xml_diff>
--- a/Docs/Machine learning applied to otolith timeseries data to discriminate river of origin for Western Alaska Salmon.docx
+++ b/Docs/Machine learning applied to otolith timeseries data to discriminate river of origin for Western Alaska Salmon.docx
@@ -13041,6 +13041,18 @@
     <w:basedOn w:val="DefaultParagraphFont"/>
     <w:rsid w:val="00F050A0"/>
   </w:style>
+  <w:style w:type="character" w:styleId="FollowedHyperlink">
+    <w:name w:val="FollowedHyperlink"/>
+    <w:basedOn w:val="DefaultParagraphFont"/>
+    <w:uiPriority w:val="99"/>
+    <w:semiHidden/>
+    <w:unhideWhenUsed/>
+    <w:rsid w:val="00525EFC"/>
+    <w:rPr>
+      <w:color w:val="96607D" w:themeColor="followedHyperlink"/>
+      <w:u w:val="single"/>
+    </w:rPr>
+  </w:style>
 </w:styles>
 </file>
 

</xml_diff>

<commit_message>
updated british spelling and citation type
</commit_message>
<xml_diff>
--- a/Docs/Machine learning applied to otolith timeseries data to discriminate river of origin for Western Alaska Salmon.docx
+++ b/Docs/Machine learning applied to otolith timeseries data to discriminate river of origin for Western Alaska Salmon.docx
@@ -22,7 +22,7 @@
           <w:sz w:val="36"/>
           <w:szCs w:val="36"/>
         </w:rPr>
-        <w:t xml:space="preserve">Ecological Applications </w:t>
+        <w:t>ICES Journal of Marine Science</w:t>
       </w:r>
     </w:p>
     <w:p>
@@ -41,7 +41,7 @@
           <w:sz w:val="32"/>
           <w:szCs w:val="32"/>
         </w:rPr>
-        <w:t xml:space="preserve">Article </w:t>
+        <w:t>Original article</w:t>
       </w:r>
     </w:p>
     <w:p>
@@ -387,11 +387,13 @@
         <w:ind w:left="2880" w:firstLine="720"/>
         <w:rPr>
           <w:rFonts w:ascii="Times New Roman" w:hAnsi="Times New Roman" w:cs="Times New Roman"/>
-        </w:rPr>
-      </w:pPr>
-      <w:r>
-        <w:rPr>
-          <w:rFonts w:ascii="Times New Roman" w:hAnsi="Times New Roman" w:cs="Times New Roman"/>
+          <w:highlight w:val="yellow"/>
+        </w:rPr>
+      </w:pPr>
+      <w:r>
+        <w:rPr>
+          <w:rFonts w:ascii="Times New Roman" w:hAnsi="Times New Roman" w:cs="Times New Roman"/>
+          <w:highlight w:val="yellow"/>
         </w:rPr>
         <w:t xml:space="preserve">Open research statement: </w:t>
       </w:r>
@@ -407,6 +409,7 @@
       <w:r>
         <w:rPr>
           <w:rFonts w:ascii="Times New Roman" w:hAnsi="Times New Roman" w:cs="Times New Roman"/>
+          <w:highlight w:val="yellow"/>
         </w:rPr>
         <w:t xml:space="preserve">Data and code are available as private for peer review in a dryad repository : </w:t>
       </w:r>
@@ -415,6 +418,7 @@
           <w:rPr>
             <w:rStyle w:val="Hyperlink"/>
             <w:rFonts w:ascii="Times New Roman" w:hAnsi="Times New Roman" w:cs="Times New Roman"/>
+            <w:highlight w:val="yellow"/>
           </w:rPr>
           <w:t>https://datadryad.org/dataset/doi:10.5061/dryad.hdr7sqvxs</w:t>
         </w:r>
@@ -422,6 +426,7 @@
       <w:r>
         <w:rPr>
           <w:rFonts w:ascii="Times New Roman" w:hAnsi="Times New Roman" w:cs="Times New Roman"/>
+          <w:highlight w:val="yellow"/>
         </w:rPr>
         <w:t xml:space="preserve">. Code and data are also available in a </w:t>
       </w:r>
@@ -429,6 +434,7 @@
       <w:r>
         <w:rPr>
           <w:rFonts w:ascii="Times New Roman" w:hAnsi="Times New Roman" w:cs="Times New Roman"/>
+          <w:highlight w:val="yellow"/>
         </w:rPr>
         <w:t>github</w:t>
       </w:r>
@@ -436,6 +442,7 @@
       <w:r>
         <w:rPr>
           <w:rFonts w:ascii="Times New Roman" w:hAnsi="Times New Roman" w:cs="Times New Roman"/>
+          <w:highlight w:val="yellow"/>
         </w:rPr>
         <w:t xml:space="preserve"> repository with a </w:t>
       </w:r>
@@ -443,6 +450,7 @@
       <w:r>
         <w:rPr>
           <w:rFonts w:ascii="Times New Roman" w:hAnsi="Times New Roman" w:cs="Times New Roman"/>
+          <w:highlight w:val="yellow"/>
         </w:rPr>
         <w:t>zenodo</w:t>
       </w:r>
@@ -450,14 +458,9 @@
       <w:r>
         <w:rPr>
           <w:rFonts w:ascii="Times New Roman" w:hAnsi="Times New Roman" w:cs="Times New Roman"/>
-        </w:rPr>
-        <w:t xml:space="preserve"> DOI: </w:t>
-      </w:r>
-      <w:r>
-        <w:rPr>
-          <w:rFonts w:ascii="Times New Roman" w:hAnsi="Times New Roman" w:cs="Times New Roman"/>
-        </w:rPr>
-        <w:t>https://doi.org/10.5281/zenodo.17624850</w:t>
+          <w:highlight w:val="yellow"/>
+        </w:rPr>
+        <w:t xml:space="preserve"> DOI: https://doi.org/10.5281/zenodo.17624850</w:t>
       </w:r>
     </w:p>
     <w:p>
@@ -2195,7 +2198,13 @@
         <w:rPr>
           <w:rFonts w:ascii="Times New Roman" w:hAnsi="Times New Roman" w:cs="Times New Roman"/>
         </w:rPr>
-        <w:t xml:space="preserve">modeled </w:t>
+        <w:t>modelled</w:t>
+      </w:r>
+      <w:r>
+        <w:rPr>
+          <w:rFonts w:ascii="Times New Roman" w:hAnsi="Times New Roman" w:cs="Times New Roman"/>
+        </w:rPr>
+        <w:t xml:space="preserve"> </w:t>
       </w:r>
       <w:r>
         <w:rPr>
@@ -3923,7 +3932,21 @@
         <w:rPr>
           <w:rFonts w:ascii="Times New Roman" w:hAnsi="Times New Roman" w:cs="Times New Roman"/>
         </w:rPr>
-        <w:t>herefore, to maximize consistency among years we did not include the portion</w:t>
+        <w:t xml:space="preserve">herefore, to </w:t>
+      </w:r>
+      <w:proofErr w:type="spellStart"/>
+      <w:r>
+        <w:rPr>
+          <w:rFonts w:ascii="Times New Roman" w:hAnsi="Times New Roman" w:cs="Times New Roman"/>
+        </w:rPr>
+        <w:t>maximise</w:t>
+      </w:r>
+      <w:proofErr w:type="spellEnd"/>
+      <w:r>
+        <w:rPr>
+          <w:rFonts w:ascii="Times New Roman" w:hAnsi="Times New Roman" w:cs="Times New Roman"/>
+        </w:rPr>
+        <w:t xml:space="preserve"> consistency among years we did not include the portion</w:t>
       </w:r>
       <w:r>
         <w:rPr>
@@ -4268,7 +4291,21 @@
         <w:rPr>
           <w:rFonts w:ascii="Times New Roman" w:hAnsi="Times New Roman" w:cs="Times New Roman"/>
         </w:rPr>
-        <w:t xml:space="preserve">The GAM was fitted using thin plate regression and penalized iteratively re-weighted least squares (P-IRLS) to maximize goodness of </w:t>
+        <w:t xml:space="preserve">The GAM was fitted using thin plate regression and penalized iteratively re-weighted least squares (P-IRLS) to </w:t>
+      </w:r>
+      <w:proofErr w:type="spellStart"/>
+      <w:r>
+        <w:rPr>
+          <w:rFonts w:ascii="Times New Roman" w:hAnsi="Times New Roman" w:cs="Times New Roman"/>
+        </w:rPr>
+        <w:t>maximise</w:t>
+      </w:r>
+      <w:proofErr w:type="spellEnd"/>
+      <w:r>
+        <w:rPr>
+          <w:rFonts w:ascii="Times New Roman" w:hAnsi="Times New Roman" w:cs="Times New Roman"/>
+        </w:rPr>
+        <w:t xml:space="preserve"> goodness of </w:t>
       </w:r>
       <w:r>
         <w:rPr>
@@ -4287,7 +4324,21 @@
         <w:rPr>
           <w:rFonts w:ascii="Times New Roman" w:hAnsi="Times New Roman" w:cs="Times New Roman"/>
         </w:rPr>
-        <w:t xml:space="preserve">to minimize overfitting </w:t>
+        <w:t xml:space="preserve">to </w:t>
+      </w:r>
+      <w:proofErr w:type="spellStart"/>
+      <w:r>
+        <w:rPr>
+          <w:rFonts w:ascii="Times New Roman" w:hAnsi="Times New Roman" w:cs="Times New Roman"/>
+        </w:rPr>
+        <w:t>minimise</w:t>
+      </w:r>
+      <w:proofErr w:type="spellEnd"/>
+      <w:r>
+        <w:rPr>
+          <w:rFonts w:ascii="Times New Roman" w:hAnsi="Times New Roman" w:cs="Times New Roman"/>
+        </w:rPr>
+        <w:t xml:space="preserve"> overfitting </w:t>
       </w:r>
       <w:r>
         <w:rPr>
@@ -8136,8 +8187,13 @@
       <w:r>
         <w:t xml:space="preserve">, or deep learning approaches which can accommodate variation in time-series length and </w:t>
       </w:r>
-      <w:r>
-        <w:t>minimize the need for preprocessing</w:t>
+      <w:proofErr w:type="spellStart"/>
+      <w:r>
+        <w:t>minimise</w:t>
+      </w:r>
+      <w:proofErr w:type="spellEnd"/>
+      <w:r>
+        <w:t xml:space="preserve"> the need for preprocessing</w:t>
       </w:r>
       <w:r>
         <w:t xml:space="preserve"> steps which may warp timeseries. </w:t>
@@ -10500,7 +10556,47 @@
         <w:rPr>
           <w:rFonts w:ascii="Times New Roman" w:hAnsi="Times New Roman" w:cs="Times New Roman"/>
         </w:rPr>
-        <w:t xml:space="preserve"> of all three river-basins. Values range from 0.702 to 0.740, with darker colors indicate more enriched values whereas lighter colors indicate less enriched.  </w:t>
+        <w:t xml:space="preserve"> of all three river-basins. Values range from 0.702 to 0.740, with darker </w:t>
+      </w:r>
+      <w:proofErr w:type="spellStart"/>
+      <w:r>
+        <w:rPr>
+          <w:rFonts w:ascii="Times New Roman" w:hAnsi="Times New Roman" w:cs="Times New Roman"/>
+        </w:rPr>
+        <w:t>colour</w:t>
+      </w:r>
+      <w:r>
+        <w:rPr>
+          <w:rFonts w:ascii="Times New Roman" w:hAnsi="Times New Roman" w:cs="Times New Roman"/>
+        </w:rPr>
+        <w:t>s</w:t>
+      </w:r>
+      <w:proofErr w:type="spellEnd"/>
+      <w:r>
+        <w:rPr>
+          <w:rFonts w:ascii="Times New Roman" w:hAnsi="Times New Roman" w:cs="Times New Roman"/>
+        </w:rPr>
+        <w:t xml:space="preserve"> indicate more enriched values whereas lighter </w:t>
+      </w:r>
+      <w:proofErr w:type="spellStart"/>
+      <w:r>
+        <w:rPr>
+          <w:rFonts w:ascii="Times New Roman" w:hAnsi="Times New Roman" w:cs="Times New Roman"/>
+        </w:rPr>
+        <w:t>colour</w:t>
+      </w:r>
+      <w:r>
+        <w:rPr>
+          <w:rFonts w:ascii="Times New Roman" w:hAnsi="Times New Roman" w:cs="Times New Roman"/>
+        </w:rPr>
+        <w:t>s</w:t>
+      </w:r>
+      <w:proofErr w:type="spellEnd"/>
+      <w:r>
+        <w:rPr>
+          <w:rFonts w:ascii="Times New Roman" w:hAnsi="Times New Roman" w:cs="Times New Roman"/>
+        </w:rPr>
+        <w:t xml:space="preserve"> indicate less enriched.  </w:t>
       </w:r>
     </w:p>
     <w:p>
@@ -10702,7 +10798,25 @@
         <w:rPr>
           <w:rFonts w:ascii="Times New Roman" w:hAnsi="Times New Roman" w:cs="Times New Roman"/>
         </w:rPr>
-        <w:t>A) Principal component analysis of all samples with a natal origin ⁸⁷Sr/⁸⁶Sr of 0.7080 - 0.7085. Clustering among watersheds is evident between principal components 1 and 2 (68.39% of variance), as well as between principal components 2 and 3 (31.16% of variance). There is some overlap between all three watersheds in both cases. B) Sample otolith LA timeseries colored by the absolute value of the PCA loadings at associated timeseries indices. PC1 (top row) shows high loading on the middle section of the timeseries after the natal origin region. PC2 is driven by the region of the timeseries towards the marine entry, likely the result of mainstem migration to the ocean. Separation along PC3 is driven by the very beginning of the timeseries, which is the region associated with the natal origin. Notably, Yukon individuals from the CWAK region contain a less pronounces mainstem signal as compared to their counterpart from the upper or middle Yukon genetic groups.</w:t>
+        <w:t xml:space="preserve">A) Principal component analysis of all samples with a natal origin ⁸⁷Sr/⁸⁶Sr of 0.7080 - 0.7085. Clustering among watersheds is evident between principal components 1 and 2 (68.39% of variance), as well as between principal components 2 and 3 (31.16% of variance). There is some overlap between all three watersheds in both cases. B) Sample otolith LA timeseries </w:t>
+      </w:r>
+      <w:r>
+        <w:rPr>
+          <w:rFonts w:ascii="Times New Roman" w:hAnsi="Times New Roman" w:cs="Times New Roman"/>
+        </w:rPr>
+        <w:t>colore</w:t>
+      </w:r>
+      <w:r>
+        <w:rPr>
+          <w:rFonts w:ascii="Times New Roman" w:hAnsi="Times New Roman" w:cs="Times New Roman"/>
+        </w:rPr>
+        <w:t>d</w:t>
+      </w:r>
+      <w:r>
+        <w:rPr>
+          <w:rFonts w:ascii="Times New Roman" w:hAnsi="Times New Roman" w:cs="Times New Roman"/>
+        </w:rPr>
+        <w:t xml:space="preserve"> by the absolute value of the PCA loadings at associated timeseries indices. PC1 (top row) shows high loading on the middle section of the timeseries after the natal origin region. PC2 is driven by the region of the timeseries towards the marine entry, likely the result of mainstem migration to the ocean. Separation along PC3 is driven by the very beginning of the timeseries, which is the region associated with the natal origin. Notably, Yukon individuals from the CWAK region contain a less pronounces mainstem signal as compared to their counterpart from the upper or middle Yukon genetic groups.</w:t>
       </w:r>
     </w:p>
     <w:p>
@@ -10858,7 +10972,27 @@
         <w:rPr>
           <w:rFonts w:ascii="Times New Roman" w:hAnsi="Times New Roman" w:cs="Times New Roman"/>
         </w:rPr>
-        <w:t>). Darker green colors indicate higher scores.</w:t>
+        <w:t xml:space="preserve">). Darker green </w:t>
+      </w:r>
+      <w:proofErr w:type="spellStart"/>
+      <w:r>
+        <w:rPr>
+          <w:rFonts w:ascii="Times New Roman" w:hAnsi="Times New Roman" w:cs="Times New Roman"/>
+        </w:rPr>
+        <w:t>colour</w:t>
+      </w:r>
+      <w:r>
+        <w:rPr>
+          <w:rFonts w:ascii="Times New Roman" w:hAnsi="Times New Roman" w:cs="Times New Roman"/>
+        </w:rPr>
+        <w:t>s</w:t>
+      </w:r>
+      <w:proofErr w:type="spellEnd"/>
+      <w:r>
+        <w:rPr>
+          <w:rFonts w:ascii="Times New Roman" w:hAnsi="Times New Roman" w:cs="Times New Roman"/>
+        </w:rPr>
+        <w:t xml:space="preserve"> indicate higher scores.</w:t>
       </w:r>
     </w:p>
     <w:p>
@@ -11187,7 +11321,25 @@
         <w:rPr>
           <w:rFonts w:ascii="Times New Roman" w:hAnsi="Times New Roman" w:cs="Times New Roman"/>
         </w:rPr>
-        <w:t xml:space="preserve">Classification accuracy with different probability thresholds (60-90%). Points indicate the percentage of correctly classified individuals with a calibrated probability value above the given threshold value. Grey dashed lines represent the overall accuracy, whereas colored lines illustrate the class-specific probability at that threshold </w:t>
+        <w:t xml:space="preserve">Classification accuracy with different probability thresholds (60-90%). Points indicate the percentage of correctly classified individuals with a calibrated probability value above the given threshold value. Grey dashed lines represent the overall accuracy, whereas </w:t>
+      </w:r>
+      <w:r>
+        <w:rPr>
+          <w:rFonts w:ascii="Times New Roman" w:hAnsi="Times New Roman" w:cs="Times New Roman"/>
+        </w:rPr>
+        <w:t>colore</w:t>
+      </w:r>
+      <w:r>
+        <w:rPr>
+          <w:rFonts w:ascii="Times New Roman" w:hAnsi="Times New Roman" w:cs="Times New Roman"/>
+        </w:rPr>
+        <w:t>d</w:t>
+      </w:r>
+      <w:r>
+        <w:rPr>
+          <w:rFonts w:ascii="Times New Roman" w:hAnsi="Times New Roman" w:cs="Times New Roman"/>
+        </w:rPr>
+        <w:t xml:space="preserve"> lines illustrate the class-specific probability at that threshold </w:t>
       </w:r>
     </w:p>
     <w:p>

</xml_diff>